<commit_message>
feat(sys): add organization data foundation
</commit_message>
<xml_diff>
--- a/docs/99-output/MyERP_SDS.docx
+++ b/docs/99-output/MyERP_SDS.docx
@@ -592,14 +592,2185 @@
       </w:r>
     </w:p>
     <w:p>
-      <w:pPr/>
+      <w:pPr>
+        <w:jc w:val="center"/>
+      </w:pPr>
       <w:r>
         <w:rPr>
           <w:i/>
         </w:rPr>
-        <w:t xml:space="preserve">[Pending] The database has no business tables yet.</w:t>
-      </w:r>
-    </w:p>
+        <w:t xml:space="preserve">[Pending] Entity relationship diagram.</w:t>
+      </w:r>
+    </w:p>
+    <w:p>
+      <w:pPr>
+        <w:pStyle w:val="Caption"/>
+      </w:pPr>
+      <w:r>
+        <w:t xml:space="preserve">Figure 4.1.1 Entity Relationship Diagram (Part 1)</w:t>
+      </w:r>
+    </w:p>
+    <w:p>
+      <w:pPr/>
+      <w:r>
+        <w:t xml:space="preserve">Table Name: sys_branch</w:t>
+      </w:r>
+    </w:p>
+    <w:p>
+      <w:pPr/>
+      <w:r>
+        <w:t xml:space="preserve">Primary Key: id</w:t>
+      </w:r>
+    </w:p>
+    <w:p>
+      <w:pPr/>
+      <w:r>
+        <w:t xml:space="preserve">Branch master scoped to a company.</w:t>
+      </w:r>
+    </w:p>
+    <w:tbl>
+      <w:tblPr>
+        <w:tblStyle w:val="TableGrid"/>
+        <w:tblW w:w="8000" w:type="dxa"/>
+        <w:jc w:val="left"/>
+        <w:tblBorders>
+          <w:top w:val="single" w:color="000000" w:sz="4" w:space="0"/>
+          <w:left w:val="single" w:color="000000" w:sz="4" w:space="0"/>
+          <w:bottom w:val="single" w:color="000000" w:sz="4" w:space="0"/>
+          <w:right w:val="single" w:color="000000" w:sz="4" w:space="0"/>
+          <w:insideH w:val="single" w:color="000000" w:sz="4" w:space="0"/>
+          <w:insideV w:val="single" w:color="000000" w:sz="4" w:space="0"/>
+        </w:tblBorders>
+        <w:tblLayout w:type="fixed"/>
+        <w:tblCellMar>
+          <w:top w:w="100" w:type="dxa"/>
+          <w:left w:w="100" w:type="dxa"/>
+          <w:bottom w:w="100" w:type="dxa"/>
+          <w:right w:w="100" w:type="dxa"/>
+        </w:tblCellMar>
+      </w:tblPr>
+      <w:tblGrid>
+        <w:gridCol w:w="2000"/>
+        <w:gridCol w:w="2000"/>
+        <w:gridCol w:w="2000"/>
+        <w:gridCol w:w="2000"/>
+      </w:tblGrid>
+      <w:tr>
+        <w:trPr>
+          <w:trHeight w:val="530" w:hRule="atLeast"/>
+        </w:trPr>
+        <w:tc>
+          <w:tcPr>
+            <w:tcW w:w="2000" w:type="dxa"/>
+          </w:tcPr>
+          <w:p>
+            <w:pPr>
+              <w:jc w:val="center"/>
+            </w:pPr>
+            <w:r>
+              <w:rPr>
+                <w:b/>
+              </w:rPr>
+              <w:t xml:space="preserve">Name of Attribute</w:t>
+            </w:r>
+          </w:p>
+        </w:tc>
+        <w:tc>
+          <w:tcPr>
+            <w:tcW w:w="2000" w:type="dxa"/>
+          </w:tcPr>
+          <w:p>
+            <w:pPr>
+              <w:jc w:val="center"/>
+            </w:pPr>
+            <w:r>
+              <w:rPr>
+                <w:b/>
+              </w:rPr>
+              <w:t xml:space="preserve">Data Type</w:t>
+            </w:r>
+          </w:p>
+        </w:tc>
+        <w:tc>
+          <w:tcPr>
+            <w:tcW w:w="2000" w:type="dxa"/>
+          </w:tcPr>
+          <w:p>
+            <w:pPr>
+              <w:jc w:val="center"/>
+            </w:pPr>
+            <w:r>
+              <w:rPr>
+                <w:b/>
+              </w:rPr>
+              <w:t xml:space="preserve">Size</w:t>
+            </w:r>
+          </w:p>
+        </w:tc>
+        <w:tc>
+          <w:tcPr>
+            <w:tcW w:w="2000" w:type="dxa"/>
+          </w:tcPr>
+          <w:p>
+            <w:pPr>
+              <w:jc w:val="center"/>
+            </w:pPr>
+            <w:r>
+              <w:rPr>
+                <w:b/>
+              </w:rPr>
+              <w:t xml:space="preserve">PK/FK/IS NULL/ NOT NULL</w:t>
+            </w:r>
+          </w:p>
+        </w:tc>
+      </w:tr>
+      <w:tr>
+        <w:trPr>
+          <w:trHeight w:val="530" w:hRule="atLeast"/>
+        </w:trPr>
+        <w:tc>
+          <w:tcPr>
+            <w:tcW w:w="2000" w:type="dxa"/>
+          </w:tcPr>
+          <w:p>
+            <w:pPr/>
+            <w:r>
+              <w:t xml:space="preserve">id</w:t>
+            </w:r>
+          </w:p>
+        </w:tc>
+        <w:tc>
+          <w:tcPr>
+            <w:tcW w:w="2000" w:type="dxa"/>
+          </w:tcPr>
+          <w:p>
+            <w:pPr/>
+            <w:r>
+              <w:t xml:space="preserve">bigint</w:t>
+            </w:r>
+          </w:p>
+        </w:tc>
+        <w:tc>
+          <w:tcPr>
+            <w:tcW w:w="2000" w:type="dxa"/>
+          </w:tcPr>
+          <w:p>
+            <w:pPr/>
+            <w:r>
+              <w:t xml:space="preserve">-</w:t>
+            </w:r>
+          </w:p>
+        </w:tc>
+        <w:tc>
+          <w:tcPr>
+            <w:tcW w:w="2000" w:type="dxa"/>
+          </w:tcPr>
+          <w:p>
+            <w:pPr/>
+            <w:r>
+              <w:t xml:space="preserve">PK, NOT NULL</w:t>
+            </w:r>
+          </w:p>
+        </w:tc>
+      </w:tr>
+      <w:tr>
+        <w:trPr>
+          <w:trHeight w:val="530" w:hRule="atLeast"/>
+        </w:trPr>
+        <w:tc>
+          <w:tcPr>
+            <w:tcW w:w="2000" w:type="dxa"/>
+          </w:tcPr>
+          <w:p>
+            <w:pPr/>
+            <w:r>
+              <w:t xml:space="preserve">code</w:t>
+            </w:r>
+          </w:p>
+        </w:tc>
+        <w:tc>
+          <w:tcPr>
+            <w:tcW w:w="2000" w:type="dxa"/>
+          </w:tcPr>
+          <w:p>
+            <w:pPr/>
+            <w:r>
+              <w:t xml:space="preserve">varchar</w:t>
+            </w:r>
+          </w:p>
+        </w:tc>
+        <w:tc>
+          <w:tcPr>
+            <w:tcW w:w="2000" w:type="dxa"/>
+          </w:tcPr>
+          <w:p>
+            <w:pPr/>
+            <w:r>
+              <w:t xml:space="preserve">30</w:t>
+            </w:r>
+          </w:p>
+        </w:tc>
+        <w:tc>
+          <w:tcPr>
+            <w:tcW w:w="2000" w:type="dxa"/>
+          </w:tcPr>
+          <w:p>
+            <w:pPr/>
+            <w:r>
+              <w:t xml:space="preserve">NOT NULL</w:t>
+            </w:r>
+          </w:p>
+        </w:tc>
+      </w:tr>
+      <w:tr>
+        <w:trPr>
+          <w:trHeight w:val="530" w:hRule="atLeast"/>
+        </w:trPr>
+        <w:tc>
+          <w:tcPr>
+            <w:tcW w:w="2000" w:type="dxa"/>
+          </w:tcPr>
+          <w:p>
+            <w:pPr/>
+            <w:r>
+              <w:t xml:space="preserve">name</w:t>
+            </w:r>
+          </w:p>
+        </w:tc>
+        <w:tc>
+          <w:tcPr>
+            <w:tcW w:w="2000" w:type="dxa"/>
+          </w:tcPr>
+          <w:p>
+            <w:pPr/>
+            <w:r>
+              <w:t xml:space="preserve">nvarchar</w:t>
+            </w:r>
+          </w:p>
+        </w:tc>
+        <w:tc>
+          <w:tcPr>
+            <w:tcW w:w="2000" w:type="dxa"/>
+          </w:tcPr>
+          <w:p>
+            <w:pPr/>
+            <w:r>
+              <w:t xml:space="preserve">200</w:t>
+            </w:r>
+          </w:p>
+        </w:tc>
+        <w:tc>
+          <w:tcPr>
+            <w:tcW w:w="2000" w:type="dxa"/>
+          </w:tcPr>
+          <w:p>
+            <w:pPr/>
+            <w:r>
+              <w:t xml:space="preserve">NOT NULL</w:t>
+            </w:r>
+          </w:p>
+        </w:tc>
+      </w:tr>
+      <w:tr>
+        <w:trPr>
+          <w:trHeight w:val="530" w:hRule="atLeast"/>
+        </w:trPr>
+        <w:tc>
+          <w:tcPr>
+            <w:tcW w:w="2000" w:type="dxa"/>
+          </w:tcPr>
+          <w:p>
+            <w:pPr/>
+            <w:r>
+              <w:t xml:space="preserve">custom_fields</w:t>
+            </w:r>
+          </w:p>
+        </w:tc>
+        <w:tc>
+          <w:tcPr>
+            <w:tcW w:w="2000" w:type="dxa"/>
+          </w:tcPr>
+          <w:p>
+            <w:pPr/>
+            <w:r>
+              <w:t xml:space="preserve">nvarchar</w:t>
+            </w:r>
+          </w:p>
+        </w:tc>
+        <w:tc>
+          <w:tcPr>
+            <w:tcW w:w="2000" w:type="dxa"/>
+          </w:tcPr>
+          <w:p>
+            <w:pPr/>
+            <w:r>
+              <w:t xml:space="preserve">MAX</w:t>
+            </w:r>
+          </w:p>
+        </w:tc>
+        <w:tc>
+          <w:tcPr>
+            <w:tcW w:w="2000" w:type="dxa"/>
+          </w:tcPr>
+          <w:p>
+            <w:pPr/>
+            <w:r>
+              <w:t xml:space="preserve">IS NULL</w:t>
+            </w:r>
+          </w:p>
+        </w:tc>
+      </w:tr>
+      <w:tr>
+        <w:trPr>
+          <w:trHeight w:val="530" w:hRule="atLeast"/>
+        </w:trPr>
+        <w:tc>
+          <w:tcPr>
+            <w:tcW w:w="2000" w:type="dxa"/>
+          </w:tcPr>
+          <w:p>
+            <w:pPr/>
+            <w:r>
+              <w:t xml:space="preserve">company_id</w:t>
+            </w:r>
+          </w:p>
+        </w:tc>
+        <w:tc>
+          <w:tcPr>
+            <w:tcW w:w="2000" w:type="dxa"/>
+          </w:tcPr>
+          <w:p>
+            <w:pPr/>
+            <w:r>
+              <w:t xml:space="preserve">bigint</w:t>
+            </w:r>
+          </w:p>
+        </w:tc>
+        <w:tc>
+          <w:tcPr>
+            <w:tcW w:w="2000" w:type="dxa"/>
+          </w:tcPr>
+          <w:p>
+            <w:pPr/>
+            <w:r>
+              <w:t xml:space="preserve">-</w:t>
+            </w:r>
+          </w:p>
+        </w:tc>
+        <w:tc>
+          <w:tcPr>
+            <w:tcW w:w="2000" w:type="dxa"/>
+          </w:tcPr>
+          <w:p>
+            <w:pPr/>
+            <w:r>
+              <w:t xml:space="preserve">FK, NOT NULL</w:t>
+            </w:r>
+          </w:p>
+        </w:tc>
+      </w:tr>
+      <w:tr>
+        <w:trPr>
+          <w:trHeight w:val="530" w:hRule="atLeast"/>
+        </w:trPr>
+        <w:tc>
+          <w:tcPr>
+            <w:tcW w:w="2000" w:type="dxa"/>
+          </w:tcPr>
+          <w:p>
+            <w:pPr/>
+            <w:r>
+              <w:t xml:space="preserve">created_at</w:t>
+            </w:r>
+          </w:p>
+        </w:tc>
+        <w:tc>
+          <w:tcPr>
+            <w:tcW w:w="2000" w:type="dxa"/>
+          </w:tcPr>
+          <w:p>
+            <w:pPr/>
+            <w:r>
+              <w:t xml:space="preserve">datetime2</w:t>
+            </w:r>
+          </w:p>
+        </w:tc>
+        <w:tc>
+          <w:tcPr>
+            <w:tcW w:w="2000" w:type="dxa"/>
+          </w:tcPr>
+          <w:p>
+            <w:pPr/>
+            <w:r>
+              <w:t xml:space="preserve">(6)</w:t>
+            </w:r>
+          </w:p>
+        </w:tc>
+        <w:tc>
+          <w:tcPr>
+            <w:tcW w:w="2000" w:type="dxa"/>
+          </w:tcPr>
+          <w:p>
+            <w:pPr/>
+            <w:r>
+              <w:t xml:space="preserve">NOT NULL</w:t>
+            </w:r>
+          </w:p>
+        </w:tc>
+      </w:tr>
+      <w:tr>
+        <w:trPr>
+          <w:trHeight w:val="530" w:hRule="atLeast"/>
+        </w:trPr>
+        <w:tc>
+          <w:tcPr>
+            <w:tcW w:w="2000" w:type="dxa"/>
+          </w:tcPr>
+          <w:p>
+            <w:pPr/>
+            <w:r>
+              <w:t xml:space="preserve">created_by</w:t>
+            </w:r>
+          </w:p>
+        </w:tc>
+        <w:tc>
+          <w:tcPr>
+            <w:tcW w:w="2000" w:type="dxa"/>
+          </w:tcPr>
+          <w:p>
+            <w:pPr/>
+            <w:r>
+              <w:t xml:space="preserve">bigint</w:t>
+            </w:r>
+          </w:p>
+        </w:tc>
+        <w:tc>
+          <w:tcPr>
+            <w:tcW w:w="2000" w:type="dxa"/>
+          </w:tcPr>
+          <w:p>
+            <w:pPr/>
+            <w:r>
+              <w:t xml:space="preserve">-</w:t>
+            </w:r>
+          </w:p>
+        </w:tc>
+        <w:tc>
+          <w:tcPr>
+            <w:tcW w:w="2000" w:type="dxa"/>
+          </w:tcPr>
+          <w:p>
+            <w:pPr/>
+            <w:r>
+              <w:t xml:space="preserve">NOT NULL</w:t>
+            </w:r>
+          </w:p>
+        </w:tc>
+      </w:tr>
+      <w:tr>
+        <w:trPr>
+          <w:trHeight w:val="530" w:hRule="atLeast"/>
+        </w:trPr>
+        <w:tc>
+          <w:tcPr>
+            <w:tcW w:w="2000" w:type="dxa"/>
+          </w:tcPr>
+          <w:p>
+            <w:pPr/>
+            <w:r>
+              <w:t xml:space="preserve">updated_at</w:t>
+            </w:r>
+          </w:p>
+        </w:tc>
+        <w:tc>
+          <w:tcPr>
+            <w:tcW w:w="2000" w:type="dxa"/>
+          </w:tcPr>
+          <w:p>
+            <w:pPr/>
+            <w:r>
+              <w:t xml:space="preserve">datetime2</w:t>
+            </w:r>
+          </w:p>
+        </w:tc>
+        <w:tc>
+          <w:tcPr>
+            <w:tcW w:w="2000" w:type="dxa"/>
+          </w:tcPr>
+          <w:p>
+            <w:pPr/>
+            <w:r>
+              <w:t xml:space="preserve">(6)</w:t>
+            </w:r>
+          </w:p>
+        </w:tc>
+        <w:tc>
+          <w:tcPr>
+            <w:tcW w:w="2000" w:type="dxa"/>
+          </w:tcPr>
+          <w:p>
+            <w:pPr/>
+            <w:r>
+              <w:t xml:space="preserve">IS NULL</w:t>
+            </w:r>
+          </w:p>
+        </w:tc>
+      </w:tr>
+      <w:tr>
+        <w:trPr>
+          <w:trHeight w:val="530" w:hRule="atLeast"/>
+        </w:trPr>
+        <w:tc>
+          <w:tcPr>
+            <w:tcW w:w="2000" w:type="dxa"/>
+          </w:tcPr>
+          <w:p>
+            <w:pPr/>
+            <w:r>
+              <w:t xml:space="preserve">updated_by</w:t>
+            </w:r>
+          </w:p>
+        </w:tc>
+        <w:tc>
+          <w:tcPr>
+            <w:tcW w:w="2000" w:type="dxa"/>
+          </w:tcPr>
+          <w:p>
+            <w:pPr/>
+            <w:r>
+              <w:t xml:space="preserve">bigint</w:t>
+            </w:r>
+          </w:p>
+        </w:tc>
+        <w:tc>
+          <w:tcPr>
+            <w:tcW w:w="2000" w:type="dxa"/>
+          </w:tcPr>
+          <w:p>
+            <w:pPr/>
+            <w:r>
+              <w:t xml:space="preserve">-</w:t>
+            </w:r>
+          </w:p>
+        </w:tc>
+        <w:tc>
+          <w:tcPr>
+            <w:tcW w:w="2000" w:type="dxa"/>
+          </w:tcPr>
+          <w:p>
+            <w:pPr/>
+            <w:r>
+              <w:t xml:space="preserve">IS NULL</w:t>
+            </w:r>
+          </w:p>
+        </w:tc>
+      </w:tr>
+      <w:tr>
+        <w:trPr>
+          <w:trHeight w:val="530" w:hRule="atLeast"/>
+        </w:trPr>
+        <w:tc>
+          <w:tcPr>
+            <w:tcW w:w="2000" w:type="dxa"/>
+          </w:tcPr>
+          <w:p>
+            <w:pPr/>
+            <w:r>
+              <w:t xml:space="preserve">version</w:t>
+            </w:r>
+          </w:p>
+        </w:tc>
+        <w:tc>
+          <w:tcPr>
+            <w:tcW w:w="2000" w:type="dxa"/>
+          </w:tcPr>
+          <w:p>
+            <w:pPr/>
+            <w:r>
+              <w:t xml:space="preserve">int</w:t>
+            </w:r>
+          </w:p>
+        </w:tc>
+        <w:tc>
+          <w:tcPr>
+            <w:tcW w:w="2000" w:type="dxa"/>
+          </w:tcPr>
+          <w:p>
+            <w:pPr/>
+            <w:r>
+              <w:t xml:space="preserve">-</w:t>
+            </w:r>
+          </w:p>
+        </w:tc>
+        <w:tc>
+          <w:tcPr>
+            <w:tcW w:w="2000" w:type="dxa"/>
+          </w:tcPr>
+          <w:p>
+            <w:pPr/>
+            <w:r>
+              <w:t xml:space="preserve">NOT NULL</w:t>
+            </w:r>
+          </w:p>
+        </w:tc>
+      </w:tr>
+      <w:tr>
+        <w:trPr>
+          <w:trHeight w:val="530" w:hRule="atLeast"/>
+        </w:trPr>
+        <w:tc>
+          <w:tcPr>
+            <w:tcW w:w="2000" w:type="dxa"/>
+          </w:tcPr>
+          <w:p>
+            <w:pPr/>
+            <w:r>
+              <w:t xml:space="preserve">is_active</w:t>
+            </w:r>
+          </w:p>
+        </w:tc>
+        <w:tc>
+          <w:tcPr>
+            <w:tcW w:w="2000" w:type="dxa"/>
+          </w:tcPr>
+          <w:p>
+            <w:pPr/>
+            <w:r>
+              <w:t xml:space="preserve">bit</w:t>
+            </w:r>
+          </w:p>
+        </w:tc>
+        <w:tc>
+          <w:tcPr>
+            <w:tcW w:w="2000" w:type="dxa"/>
+          </w:tcPr>
+          <w:p>
+            <w:pPr/>
+            <w:r>
+              <w:t xml:space="preserve">-</w:t>
+            </w:r>
+          </w:p>
+        </w:tc>
+        <w:tc>
+          <w:tcPr>
+            <w:tcW w:w="2000" w:type="dxa"/>
+          </w:tcPr>
+          <w:p>
+            <w:pPr/>
+            <w:r>
+              <w:t xml:space="preserve">NOT NULL</w:t>
+            </w:r>
+          </w:p>
+        </w:tc>
+      </w:tr>
+      <w:tr>
+        <w:trPr>
+          <w:trHeight w:val="530" w:hRule="atLeast"/>
+        </w:trPr>
+        <w:tc>
+          <w:tcPr>
+            <w:tcW w:w="2000" w:type="dxa"/>
+          </w:tcPr>
+          <w:p>
+            <w:pPr/>
+            <w:r>
+              <w:t xml:space="preserve">is_deleted</w:t>
+            </w:r>
+          </w:p>
+        </w:tc>
+        <w:tc>
+          <w:tcPr>
+            <w:tcW w:w="2000" w:type="dxa"/>
+          </w:tcPr>
+          <w:p>
+            <w:pPr/>
+            <w:r>
+              <w:t xml:space="preserve">bit</w:t>
+            </w:r>
+          </w:p>
+        </w:tc>
+        <w:tc>
+          <w:tcPr>
+            <w:tcW w:w="2000" w:type="dxa"/>
+          </w:tcPr>
+          <w:p>
+            <w:pPr/>
+            <w:r>
+              <w:t xml:space="preserve">-</w:t>
+            </w:r>
+          </w:p>
+        </w:tc>
+        <w:tc>
+          <w:tcPr>
+            <w:tcW w:w="2000" w:type="dxa"/>
+          </w:tcPr>
+          <w:p>
+            <w:pPr/>
+            <w:r>
+              <w:t xml:space="preserve">NOT NULL</w:t>
+            </w:r>
+          </w:p>
+        </w:tc>
+      </w:tr>
+    </w:tbl>
+    <w:p/>
+    <w:p>
+      <w:pPr/>
+      <w:r>
+        <w:t xml:space="preserve">Table Name: sys_company</w:t>
+      </w:r>
+    </w:p>
+    <w:p>
+      <w:pPr/>
+      <w:r>
+        <w:t xml:space="preserve">Primary Key: id</w:t>
+      </w:r>
+    </w:p>
+    <w:p>
+      <w:pPr/>
+      <w:r>
+        <w:t xml:space="preserve">Company isolation root; globally unique code, audit, version and soft deletion.</w:t>
+      </w:r>
+    </w:p>
+    <w:tbl>
+      <w:tblPr>
+        <w:tblStyle w:val="TableGrid"/>
+        <w:tblW w:w="8000" w:type="dxa"/>
+        <w:jc w:val="left"/>
+        <w:tblBorders>
+          <w:top w:val="single" w:color="000000" w:sz="4" w:space="0"/>
+          <w:left w:val="single" w:color="000000" w:sz="4" w:space="0"/>
+          <w:bottom w:val="single" w:color="000000" w:sz="4" w:space="0"/>
+          <w:right w:val="single" w:color="000000" w:sz="4" w:space="0"/>
+          <w:insideH w:val="single" w:color="000000" w:sz="4" w:space="0"/>
+          <w:insideV w:val="single" w:color="000000" w:sz="4" w:space="0"/>
+        </w:tblBorders>
+        <w:tblLayout w:type="fixed"/>
+        <w:tblCellMar>
+          <w:top w:w="100" w:type="dxa"/>
+          <w:left w:w="100" w:type="dxa"/>
+          <w:bottom w:w="100" w:type="dxa"/>
+          <w:right w:w="100" w:type="dxa"/>
+        </w:tblCellMar>
+      </w:tblPr>
+      <w:tblGrid>
+        <w:gridCol w:w="2000"/>
+        <w:gridCol w:w="2000"/>
+        <w:gridCol w:w="2000"/>
+        <w:gridCol w:w="2000"/>
+      </w:tblGrid>
+      <w:tr>
+        <w:trPr>
+          <w:trHeight w:val="530" w:hRule="atLeast"/>
+        </w:trPr>
+        <w:tc>
+          <w:tcPr>
+            <w:tcW w:w="2000" w:type="dxa"/>
+          </w:tcPr>
+          <w:p>
+            <w:pPr>
+              <w:jc w:val="center"/>
+            </w:pPr>
+            <w:r>
+              <w:rPr>
+                <w:b/>
+              </w:rPr>
+              <w:t xml:space="preserve">Name of Attribute</w:t>
+            </w:r>
+          </w:p>
+        </w:tc>
+        <w:tc>
+          <w:tcPr>
+            <w:tcW w:w="2000" w:type="dxa"/>
+          </w:tcPr>
+          <w:p>
+            <w:pPr>
+              <w:jc w:val="center"/>
+            </w:pPr>
+            <w:r>
+              <w:rPr>
+                <w:b/>
+              </w:rPr>
+              <w:t xml:space="preserve">Data Type</w:t>
+            </w:r>
+          </w:p>
+        </w:tc>
+        <w:tc>
+          <w:tcPr>
+            <w:tcW w:w="2000" w:type="dxa"/>
+          </w:tcPr>
+          <w:p>
+            <w:pPr>
+              <w:jc w:val="center"/>
+            </w:pPr>
+            <w:r>
+              <w:rPr>
+                <w:b/>
+              </w:rPr>
+              <w:t xml:space="preserve">Size</w:t>
+            </w:r>
+          </w:p>
+        </w:tc>
+        <w:tc>
+          <w:tcPr>
+            <w:tcW w:w="2000" w:type="dxa"/>
+          </w:tcPr>
+          <w:p>
+            <w:pPr>
+              <w:jc w:val="center"/>
+            </w:pPr>
+            <w:r>
+              <w:rPr>
+                <w:b/>
+              </w:rPr>
+              <w:t xml:space="preserve">PK/FK/IS NULL/ NOT NULL</w:t>
+            </w:r>
+          </w:p>
+        </w:tc>
+      </w:tr>
+      <w:tr>
+        <w:trPr>
+          <w:trHeight w:val="530" w:hRule="atLeast"/>
+        </w:trPr>
+        <w:tc>
+          <w:tcPr>
+            <w:tcW w:w="2000" w:type="dxa"/>
+          </w:tcPr>
+          <w:p>
+            <w:pPr/>
+            <w:r>
+              <w:t xml:space="preserve">id</w:t>
+            </w:r>
+          </w:p>
+        </w:tc>
+        <w:tc>
+          <w:tcPr>
+            <w:tcW w:w="2000" w:type="dxa"/>
+          </w:tcPr>
+          <w:p>
+            <w:pPr/>
+            <w:r>
+              <w:t xml:space="preserve">bigint</w:t>
+            </w:r>
+          </w:p>
+        </w:tc>
+        <w:tc>
+          <w:tcPr>
+            <w:tcW w:w="2000" w:type="dxa"/>
+          </w:tcPr>
+          <w:p>
+            <w:pPr/>
+            <w:r>
+              <w:t xml:space="preserve">-</w:t>
+            </w:r>
+          </w:p>
+        </w:tc>
+        <w:tc>
+          <w:tcPr>
+            <w:tcW w:w="2000" w:type="dxa"/>
+          </w:tcPr>
+          <w:p>
+            <w:pPr/>
+            <w:r>
+              <w:t xml:space="preserve">PK, NOT NULL</w:t>
+            </w:r>
+          </w:p>
+        </w:tc>
+      </w:tr>
+      <w:tr>
+        <w:trPr>
+          <w:trHeight w:val="530" w:hRule="atLeast"/>
+        </w:trPr>
+        <w:tc>
+          <w:tcPr>
+            <w:tcW w:w="2000" w:type="dxa"/>
+          </w:tcPr>
+          <w:p>
+            <w:pPr/>
+            <w:r>
+              <w:t xml:space="preserve">code</w:t>
+            </w:r>
+          </w:p>
+        </w:tc>
+        <w:tc>
+          <w:tcPr>
+            <w:tcW w:w="2000" w:type="dxa"/>
+          </w:tcPr>
+          <w:p>
+            <w:pPr/>
+            <w:r>
+              <w:t xml:space="preserve">varchar</w:t>
+            </w:r>
+          </w:p>
+        </w:tc>
+        <w:tc>
+          <w:tcPr>
+            <w:tcW w:w="2000" w:type="dxa"/>
+          </w:tcPr>
+          <w:p>
+            <w:pPr/>
+            <w:r>
+              <w:t xml:space="preserve">30</w:t>
+            </w:r>
+          </w:p>
+        </w:tc>
+        <w:tc>
+          <w:tcPr>
+            <w:tcW w:w="2000" w:type="dxa"/>
+          </w:tcPr>
+          <w:p>
+            <w:pPr/>
+            <w:r>
+              <w:t xml:space="preserve">NOT NULL</w:t>
+            </w:r>
+          </w:p>
+        </w:tc>
+      </w:tr>
+      <w:tr>
+        <w:trPr>
+          <w:trHeight w:val="530" w:hRule="atLeast"/>
+        </w:trPr>
+        <w:tc>
+          <w:tcPr>
+            <w:tcW w:w="2000" w:type="dxa"/>
+          </w:tcPr>
+          <w:p>
+            <w:pPr/>
+            <w:r>
+              <w:t xml:space="preserve">name</w:t>
+            </w:r>
+          </w:p>
+        </w:tc>
+        <w:tc>
+          <w:tcPr>
+            <w:tcW w:w="2000" w:type="dxa"/>
+          </w:tcPr>
+          <w:p>
+            <w:pPr/>
+            <w:r>
+              <w:t xml:space="preserve">nvarchar</w:t>
+            </w:r>
+          </w:p>
+        </w:tc>
+        <w:tc>
+          <w:tcPr>
+            <w:tcW w:w="2000" w:type="dxa"/>
+          </w:tcPr>
+          <w:p>
+            <w:pPr/>
+            <w:r>
+              <w:t xml:space="preserve">200</w:t>
+            </w:r>
+          </w:p>
+        </w:tc>
+        <w:tc>
+          <w:tcPr>
+            <w:tcW w:w="2000" w:type="dxa"/>
+          </w:tcPr>
+          <w:p>
+            <w:pPr/>
+            <w:r>
+              <w:t xml:space="preserve">NOT NULL</w:t>
+            </w:r>
+          </w:p>
+        </w:tc>
+      </w:tr>
+      <w:tr>
+        <w:trPr>
+          <w:trHeight w:val="530" w:hRule="atLeast"/>
+        </w:trPr>
+        <w:tc>
+          <w:tcPr>
+            <w:tcW w:w="2000" w:type="dxa"/>
+          </w:tcPr>
+          <w:p>
+            <w:pPr/>
+            <w:r>
+              <w:t xml:space="preserve">custom_fields</w:t>
+            </w:r>
+          </w:p>
+        </w:tc>
+        <w:tc>
+          <w:tcPr>
+            <w:tcW w:w="2000" w:type="dxa"/>
+          </w:tcPr>
+          <w:p>
+            <w:pPr/>
+            <w:r>
+              <w:t xml:space="preserve">nvarchar</w:t>
+            </w:r>
+          </w:p>
+        </w:tc>
+        <w:tc>
+          <w:tcPr>
+            <w:tcW w:w="2000" w:type="dxa"/>
+          </w:tcPr>
+          <w:p>
+            <w:pPr/>
+            <w:r>
+              <w:t xml:space="preserve">MAX</w:t>
+            </w:r>
+          </w:p>
+        </w:tc>
+        <w:tc>
+          <w:tcPr>
+            <w:tcW w:w="2000" w:type="dxa"/>
+          </w:tcPr>
+          <w:p>
+            <w:pPr/>
+            <w:r>
+              <w:t xml:space="preserve">IS NULL</w:t>
+            </w:r>
+          </w:p>
+        </w:tc>
+      </w:tr>
+      <w:tr>
+        <w:trPr>
+          <w:trHeight w:val="530" w:hRule="atLeast"/>
+        </w:trPr>
+        <w:tc>
+          <w:tcPr>
+            <w:tcW w:w="2000" w:type="dxa"/>
+          </w:tcPr>
+          <w:p>
+            <w:pPr/>
+            <w:r>
+              <w:t xml:space="preserve">is_active</w:t>
+            </w:r>
+          </w:p>
+        </w:tc>
+        <w:tc>
+          <w:tcPr>
+            <w:tcW w:w="2000" w:type="dxa"/>
+          </w:tcPr>
+          <w:p>
+            <w:pPr/>
+            <w:r>
+              <w:t xml:space="preserve">bit</w:t>
+            </w:r>
+          </w:p>
+        </w:tc>
+        <w:tc>
+          <w:tcPr>
+            <w:tcW w:w="2000" w:type="dxa"/>
+          </w:tcPr>
+          <w:p>
+            <w:pPr/>
+            <w:r>
+              <w:t xml:space="preserve">-</w:t>
+            </w:r>
+          </w:p>
+        </w:tc>
+        <w:tc>
+          <w:tcPr>
+            <w:tcW w:w="2000" w:type="dxa"/>
+          </w:tcPr>
+          <w:p>
+            <w:pPr/>
+            <w:r>
+              <w:t xml:space="preserve">NOT NULL</w:t>
+            </w:r>
+          </w:p>
+        </w:tc>
+      </w:tr>
+      <w:tr>
+        <w:trPr>
+          <w:trHeight w:val="530" w:hRule="atLeast"/>
+        </w:trPr>
+        <w:tc>
+          <w:tcPr>
+            <w:tcW w:w="2000" w:type="dxa"/>
+          </w:tcPr>
+          <w:p>
+            <w:pPr/>
+            <w:r>
+              <w:t xml:space="preserve">is_deleted</w:t>
+            </w:r>
+          </w:p>
+        </w:tc>
+        <w:tc>
+          <w:tcPr>
+            <w:tcW w:w="2000" w:type="dxa"/>
+          </w:tcPr>
+          <w:p>
+            <w:pPr/>
+            <w:r>
+              <w:t xml:space="preserve">bit</w:t>
+            </w:r>
+          </w:p>
+        </w:tc>
+        <w:tc>
+          <w:tcPr>
+            <w:tcW w:w="2000" w:type="dxa"/>
+          </w:tcPr>
+          <w:p>
+            <w:pPr/>
+            <w:r>
+              <w:t xml:space="preserve">-</w:t>
+            </w:r>
+          </w:p>
+        </w:tc>
+        <w:tc>
+          <w:tcPr>
+            <w:tcW w:w="2000" w:type="dxa"/>
+          </w:tcPr>
+          <w:p>
+            <w:pPr/>
+            <w:r>
+              <w:t xml:space="preserve">NOT NULL</w:t>
+            </w:r>
+          </w:p>
+        </w:tc>
+      </w:tr>
+      <w:tr>
+        <w:trPr>
+          <w:trHeight w:val="530" w:hRule="atLeast"/>
+        </w:trPr>
+        <w:tc>
+          <w:tcPr>
+            <w:tcW w:w="2000" w:type="dxa"/>
+          </w:tcPr>
+          <w:p>
+            <w:pPr/>
+            <w:r>
+              <w:t xml:space="preserve">created_at</w:t>
+            </w:r>
+          </w:p>
+        </w:tc>
+        <w:tc>
+          <w:tcPr>
+            <w:tcW w:w="2000" w:type="dxa"/>
+          </w:tcPr>
+          <w:p>
+            <w:pPr/>
+            <w:r>
+              <w:t xml:space="preserve">datetime2</w:t>
+            </w:r>
+          </w:p>
+        </w:tc>
+        <w:tc>
+          <w:tcPr>
+            <w:tcW w:w="2000" w:type="dxa"/>
+          </w:tcPr>
+          <w:p>
+            <w:pPr/>
+            <w:r>
+              <w:t xml:space="preserve">(6)</w:t>
+            </w:r>
+          </w:p>
+        </w:tc>
+        <w:tc>
+          <w:tcPr>
+            <w:tcW w:w="2000" w:type="dxa"/>
+          </w:tcPr>
+          <w:p>
+            <w:pPr/>
+            <w:r>
+              <w:t xml:space="preserve">NOT NULL</w:t>
+            </w:r>
+          </w:p>
+        </w:tc>
+      </w:tr>
+      <w:tr>
+        <w:trPr>
+          <w:trHeight w:val="530" w:hRule="atLeast"/>
+        </w:trPr>
+        <w:tc>
+          <w:tcPr>
+            <w:tcW w:w="2000" w:type="dxa"/>
+          </w:tcPr>
+          <w:p>
+            <w:pPr/>
+            <w:r>
+              <w:t xml:space="preserve">created_by</w:t>
+            </w:r>
+          </w:p>
+        </w:tc>
+        <w:tc>
+          <w:tcPr>
+            <w:tcW w:w="2000" w:type="dxa"/>
+          </w:tcPr>
+          <w:p>
+            <w:pPr/>
+            <w:r>
+              <w:t xml:space="preserve">bigint</w:t>
+            </w:r>
+          </w:p>
+        </w:tc>
+        <w:tc>
+          <w:tcPr>
+            <w:tcW w:w="2000" w:type="dxa"/>
+          </w:tcPr>
+          <w:p>
+            <w:pPr/>
+            <w:r>
+              <w:t xml:space="preserve">-</w:t>
+            </w:r>
+          </w:p>
+        </w:tc>
+        <w:tc>
+          <w:tcPr>
+            <w:tcW w:w="2000" w:type="dxa"/>
+          </w:tcPr>
+          <w:p>
+            <w:pPr/>
+            <w:r>
+              <w:t xml:space="preserve">NOT NULL</w:t>
+            </w:r>
+          </w:p>
+        </w:tc>
+      </w:tr>
+      <w:tr>
+        <w:trPr>
+          <w:trHeight w:val="530" w:hRule="atLeast"/>
+        </w:trPr>
+        <w:tc>
+          <w:tcPr>
+            <w:tcW w:w="2000" w:type="dxa"/>
+          </w:tcPr>
+          <w:p>
+            <w:pPr/>
+            <w:r>
+              <w:t xml:space="preserve">updated_at</w:t>
+            </w:r>
+          </w:p>
+        </w:tc>
+        <w:tc>
+          <w:tcPr>
+            <w:tcW w:w="2000" w:type="dxa"/>
+          </w:tcPr>
+          <w:p>
+            <w:pPr/>
+            <w:r>
+              <w:t xml:space="preserve">datetime2</w:t>
+            </w:r>
+          </w:p>
+        </w:tc>
+        <w:tc>
+          <w:tcPr>
+            <w:tcW w:w="2000" w:type="dxa"/>
+          </w:tcPr>
+          <w:p>
+            <w:pPr/>
+            <w:r>
+              <w:t xml:space="preserve">(6)</w:t>
+            </w:r>
+          </w:p>
+        </w:tc>
+        <w:tc>
+          <w:tcPr>
+            <w:tcW w:w="2000" w:type="dxa"/>
+          </w:tcPr>
+          <w:p>
+            <w:pPr/>
+            <w:r>
+              <w:t xml:space="preserve">IS NULL</w:t>
+            </w:r>
+          </w:p>
+        </w:tc>
+      </w:tr>
+      <w:tr>
+        <w:trPr>
+          <w:trHeight w:val="530" w:hRule="atLeast"/>
+        </w:trPr>
+        <w:tc>
+          <w:tcPr>
+            <w:tcW w:w="2000" w:type="dxa"/>
+          </w:tcPr>
+          <w:p>
+            <w:pPr/>
+            <w:r>
+              <w:t xml:space="preserve">updated_by</w:t>
+            </w:r>
+          </w:p>
+        </w:tc>
+        <w:tc>
+          <w:tcPr>
+            <w:tcW w:w="2000" w:type="dxa"/>
+          </w:tcPr>
+          <w:p>
+            <w:pPr/>
+            <w:r>
+              <w:t xml:space="preserve">bigint</w:t>
+            </w:r>
+          </w:p>
+        </w:tc>
+        <w:tc>
+          <w:tcPr>
+            <w:tcW w:w="2000" w:type="dxa"/>
+          </w:tcPr>
+          <w:p>
+            <w:pPr/>
+            <w:r>
+              <w:t xml:space="preserve">-</w:t>
+            </w:r>
+          </w:p>
+        </w:tc>
+        <w:tc>
+          <w:tcPr>
+            <w:tcW w:w="2000" w:type="dxa"/>
+          </w:tcPr>
+          <w:p>
+            <w:pPr/>
+            <w:r>
+              <w:t xml:space="preserve">IS NULL</w:t>
+            </w:r>
+          </w:p>
+        </w:tc>
+      </w:tr>
+      <w:tr>
+        <w:trPr>
+          <w:trHeight w:val="530" w:hRule="atLeast"/>
+        </w:trPr>
+        <w:tc>
+          <w:tcPr>
+            <w:tcW w:w="2000" w:type="dxa"/>
+          </w:tcPr>
+          <w:p>
+            <w:pPr/>
+            <w:r>
+              <w:t xml:space="preserve">version</w:t>
+            </w:r>
+          </w:p>
+        </w:tc>
+        <w:tc>
+          <w:tcPr>
+            <w:tcW w:w="2000" w:type="dxa"/>
+          </w:tcPr>
+          <w:p>
+            <w:pPr/>
+            <w:r>
+              <w:t xml:space="preserve">int</w:t>
+            </w:r>
+          </w:p>
+        </w:tc>
+        <w:tc>
+          <w:tcPr>
+            <w:tcW w:w="2000" w:type="dxa"/>
+          </w:tcPr>
+          <w:p>
+            <w:pPr/>
+            <w:r>
+              <w:t xml:space="preserve">-</w:t>
+            </w:r>
+          </w:p>
+        </w:tc>
+        <w:tc>
+          <w:tcPr>
+            <w:tcW w:w="2000" w:type="dxa"/>
+          </w:tcPr>
+          <w:p>
+            <w:pPr/>
+            <w:r>
+              <w:t xml:space="preserve">NOT NULL</w:t>
+            </w:r>
+          </w:p>
+        </w:tc>
+      </w:tr>
+    </w:tbl>
+    <w:p/>
+    <w:p>
+      <w:pPr/>
+      <w:r>
+        <w:t xml:space="preserve">Table Name: sys_department</w:t>
+      </w:r>
+    </w:p>
+    <w:p>
+      <w:pPr/>
+      <w:r>
+        <w:t xml:space="preserve">Primary Key: id</w:t>
+      </w:r>
+    </w:p>
+    <w:p>
+      <w:pPr/>
+      <w:r>
+        <w:t xml:space="preserve">Department master scoped to a company, optionally linked to a branch and parent department.</w:t>
+      </w:r>
+    </w:p>
+    <w:tbl>
+      <w:tblPr>
+        <w:tblStyle w:val="TableGrid"/>
+        <w:tblW w:w="8000" w:type="dxa"/>
+        <w:jc w:val="left"/>
+        <w:tblBorders>
+          <w:top w:val="single" w:color="000000" w:sz="4" w:space="0"/>
+          <w:left w:val="single" w:color="000000" w:sz="4" w:space="0"/>
+          <w:bottom w:val="single" w:color="000000" w:sz="4" w:space="0"/>
+          <w:right w:val="single" w:color="000000" w:sz="4" w:space="0"/>
+          <w:insideH w:val="single" w:color="000000" w:sz="4" w:space="0"/>
+          <w:insideV w:val="single" w:color="000000" w:sz="4" w:space="0"/>
+        </w:tblBorders>
+        <w:tblLayout w:type="fixed"/>
+        <w:tblCellMar>
+          <w:top w:w="100" w:type="dxa"/>
+          <w:left w:w="100" w:type="dxa"/>
+          <w:bottom w:w="100" w:type="dxa"/>
+          <w:right w:w="100" w:type="dxa"/>
+        </w:tblCellMar>
+      </w:tblPr>
+      <w:tblGrid>
+        <w:gridCol w:w="2000"/>
+        <w:gridCol w:w="2000"/>
+        <w:gridCol w:w="2000"/>
+        <w:gridCol w:w="2000"/>
+      </w:tblGrid>
+      <w:tr>
+        <w:trPr>
+          <w:trHeight w:val="530" w:hRule="atLeast"/>
+        </w:trPr>
+        <w:tc>
+          <w:tcPr>
+            <w:tcW w:w="2000" w:type="dxa"/>
+          </w:tcPr>
+          <w:p>
+            <w:pPr>
+              <w:jc w:val="center"/>
+            </w:pPr>
+            <w:r>
+              <w:rPr>
+                <w:b/>
+              </w:rPr>
+              <w:t xml:space="preserve">Name of Attribute</w:t>
+            </w:r>
+          </w:p>
+        </w:tc>
+        <w:tc>
+          <w:tcPr>
+            <w:tcW w:w="2000" w:type="dxa"/>
+          </w:tcPr>
+          <w:p>
+            <w:pPr>
+              <w:jc w:val="center"/>
+            </w:pPr>
+            <w:r>
+              <w:rPr>
+                <w:b/>
+              </w:rPr>
+              <w:t xml:space="preserve">Data Type</w:t>
+            </w:r>
+          </w:p>
+        </w:tc>
+        <w:tc>
+          <w:tcPr>
+            <w:tcW w:w="2000" w:type="dxa"/>
+          </w:tcPr>
+          <w:p>
+            <w:pPr>
+              <w:jc w:val="center"/>
+            </w:pPr>
+            <w:r>
+              <w:rPr>
+                <w:b/>
+              </w:rPr>
+              <w:t xml:space="preserve">Size</w:t>
+            </w:r>
+          </w:p>
+        </w:tc>
+        <w:tc>
+          <w:tcPr>
+            <w:tcW w:w="2000" w:type="dxa"/>
+          </w:tcPr>
+          <w:p>
+            <w:pPr>
+              <w:jc w:val="center"/>
+            </w:pPr>
+            <w:r>
+              <w:rPr>
+                <w:b/>
+              </w:rPr>
+              <w:t xml:space="preserve">PK/FK/IS NULL/ NOT NULL</w:t>
+            </w:r>
+          </w:p>
+        </w:tc>
+      </w:tr>
+      <w:tr>
+        <w:trPr>
+          <w:trHeight w:val="530" w:hRule="atLeast"/>
+        </w:trPr>
+        <w:tc>
+          <w:tcPr>
+            <w:tcW w:w="2000" w:type="dxa"/>
+          </w:tcPr>
+          <w:p>
+            <w:pPr/>
+            <w:r>
+              <w:t xml:space="preserve">id</w:t>
+            </w:r>
+          </w:p>
+        </w:tc>
+        <w:tc>
+          <w:tcPr>
+            <w:tcW w:w="2000" w:type="dxa"/>
+          </w:tcPr>
+          <w:p>
+            <w:pPr/>
+            <w:r>
+              <w:t xml:space="preserve">bigint</w:t>
+            </w:r>
+          </w:p>
+        </w:tc>
+        <w:tc>
+          <w:tcPr>
+            <w:tcW w:w="2000" w:type="dxa"/>
+          </w:tcPr>
+          <w:p>
+            <w:pPr/>
+            <w:r>
+              <w:t xml:space="preserve">-</w:t>
+            </w:r>
+          </w:p>
+        </w:tc>
+        <w:tc>
+          <w:tcPr>
+            <w:tcW w:w="2000" w:type="dxa"/>
+          </w:tcPr>
+          <w:p>
+            <w:pPr/>
+            <w:r>
+              <w:t xml:space="preserve">PK, NOT NULL</w:t>
+            </w:r>
+          </w:p>
+        </w:tc>
+      </w:tr>
+      <w:tr>
+        <w:trPr>
+          <w:trHeight w:val="530" w:hRule="atLeast"/>
+        </w:trPr>
+        <w:tc>
+          <w:tcPr>
+            <w:tcW w:w="2000" w:type="dxa"/>
+          </w:tcPr>
+          <w:p>
+            <w:pPr/>
+            <w:r>
+              <w:t xml:space="preserve">code</w:t>
+            </w:r>
+          </w:p>
+        </w:tc>
+        <w:tc>
+          <w:tcPr>
+            <w:tcW w:w="2000" w:type="dxa"/>
+          </w:tcPr>
+          <w:p>
+            <w:pPr/>
+            <w:r>
+              <w:t xml:space="preserve">varchar</w:t>
+            </w:r>
+          </w:p>
+        </w:tc>
+        <w:tc>
+          <w:tcPr>
+            <w:tcW w:w="2000" w:type="dxa"/>
+          </w:tcPr>
+          <w:p>
+            <w:pPr/>
+            <w:r>
+              <w:t xml:space="preserve">30</w:t>
+            </w:r>
+          </w:p>
+        </w:tc>
+        <w:tc>
+          <w:tcPr>
+            <w:tcW w:w="2000" w:type="dxa"/>
+          </w:tcPr>
+          <w:p>
+            <w:pPr/>
+            <w:r>
+              <w:t xml:space="preserve">NOT NULL</w:t>
+            </w:r>
+          </w:p>
+        </w:tc>
+      </w:tr>
+      <w:tr>
+        <w:trPr>
+          <w:trHeight w:val="530" w:hRule="atLeast"/>
+        </w:trPr>
+        <w:tc>
+          <w:tcPr>
+            <w:tcW w:w="2000" w:type="dxa"/>
+          </w:tcPr>
+          <w:p>
+            <w:pPr/>
+            <w:r>
+              <w:t xml:space="preserve">name</w:t>
+            </w:r>
+          </w:p>
+        </w:tc>
+        <w:tc>
+          <w:tcPr>
+            <w:tcW w:w="2000" w:type="dxa"/>
+          </w:tcPr>
+          <w:p>
+            <w:pPr/>
+            <w:r>
+              <w:t xml:space="preserve">nvarchar</w:t>
+            </w:r>
+          </w:p>
+        </w:tc>
+        <w:tc>
+          <w:tcPr>
+            <w:tcW w:w="2000" w:type="dxa"/>
+          </w:tcPr>
+          <w:p>
+            <w:pPr/>
+            <w:r>
+              <w:t xml:space="preserve">200</w:t>
+            </w:r>
+          </w:p>
+        </w:tc>
+        <w:tc>
+          <w:tcPr>
+            <w:tcW w:w="2000" w:type="dxa"/>
+          </w:tcPr>
+          <w:p>
+            <w:pPr/>
+            <w:r>
+              <w:t xml:space="preserve">NOT NULL</w:t>
+            </w:r>
+          </w:p>
+        </w:tc>
+      </w:tr>
+      <w:tr>
+        <w:trPr>
+          <w:trHeight w:val="530" w:hRule="atLeast"/>
+        </w:trPr>
+        <w:tc>
+          <w:tcPr>
+            <w:tcW w:w="2000" w:type="dxa"/>
+          </w:tcPr>
+          <w:p>
+            <w:pPr/>
+            <w:r>
+              <w:t xml:space="preserve">branch_id</w:t>
+            </w:r>
+          </w:p>
+        </w:tc>
+        <w:tc>
+          <w:tcPr>
+            <w:tcW w:w="2000" w:type="dxa"/>
+          </w:tcPr>
+          <w:p>
+            <w:pPr/>
+            <w:r>
+              <w:t xml:space="preserve">bigint</w:t>
+            </w:r>
+          </w:p>
+        </w:tc>
+        <w:tc>
+          <w:tcPr>
+            <w:tcW w:w="2000" w:type="dxa"/>
+          </w:tcPr>
+          <w:p>
+            <w:pPr/>
+            <w:r>
+              <w:t xml:space="preserve">-</w:t>
+            </w:r>
+          </w:p>
+        </w:tc>
+        <w:tc>
+          <w:tcPr>
+            <w:tcW w:w="2000" w:type="dxa"/>
+          </w:tcPr>
+          <w:p>
+            <w:pPr/>
+            <w:r>
+              <w:t xml:space="preserve">FK, IS NULL</w:t>
+            </w:r>
+          </w:p>
+        </w:tc>
+      </w:tr>
+      <w:tr>
+        <w:trPr>
+          <w:trHeight w:val="530" w:hRule="atLeast"/>
+        </w:trPr>
+        <w:tc>
+          <w:tcPr>
+            <w:tcW w:w="2000" w:type="dxa"/>
+          </w:tcPr>
+          <w:p>
+            <w:pPr/>
+            <w:r>
+              <w:t xml:space="preserve">parent_department_id</w:t>
+            </w:r>
+          </w:p>
+        </w:tc>
+        <w:tc>
+          <w:tcPr>
+            <w:tcW w:w="2000" w:type="dxa"/>
+          </w:tcPr>
+          <w:p>
+            <w:pPr/>
+            <w:r>
+              <w:t xml:space="preserve">bigint</w:t>
+            </w:r>
+          </w:p>
+        </w:tc>
+        <w:tc>
+          <w:tcPr>
+            <w:tcW w:w="2000" w:type="dxa"/>
+          </w:tcPr>
+          <w:p>
+            <w:pPr/>
+            <w:r>
+              <w:t xml:space="preserve">-</w:t>
+            </w:r>
+          </w:p>
+        </w:tc>
+        <w:tc>
+          <w:tcPr>
+            <w:tcW w:w="2000" w:type="dxa"/>
+          </w:tcPr>
+          <w:p>
+            <w:pPr/>
+            <w:r>
+              <w:t xml:space="preserve">FK, IS NULL</w:t>
+            </w:r>
+          </w:p>
+        </w:tc>
+      </w:tr>
+      <w:tr>
+        <w:trPr>
+          <w:trHeight w:val="530" w:hRule="atLeast"/>
+        </w:trPr>
+        <w:tc>
+          <w:tcPr>
+            <w:tcW w:w="2000" w:type="dxa"/>
+          </w:tcPr>
+          <w:p>
+            <w:pPr/>
+            <w:r>
+              <w:t xml:space="preserve">custom_fields</w:t>
+            </w:r>
+          </w:p>
+        </w:tc>
+        <w:tc>
+          <w:tcPr>
+            <w:tcW w:w="2000" w:type="dxa"/>
+          </w:tcPr>
+          <w:p>
+            <w:pPr/>
+            <w:r>
+              <w:t xml:space="preserve">nvarchar</w:t>
+            </w:r>
+          </w:p>
+        </w:tc>
+        <w:tc>
+          <w:tcPr>
+            <w:tcW w:w="2000" w:type="dxa"/>
+          </w:tcPr>
+          <w:p>
+            <w:pPr/>
+            <w:r>
+              <w:t xml:space="preserve">MAX</w:t>
+            </w:r>
+          </w:p>
+        </w:tc>
+        <w:tc>
+          <w:tcPr>
+            <w:tcW w:w="2000" w:type="dxa"/>
+          </w:tcPr>
+          <w:p>
+            <w:pPr/>
+            <w:r>
+              <w:t xml:space="preserve">IS NULL</w:t>
+            </w:r>
+          </w:p>
+        </w:tc>
+      </w:tr>
+      <w:tr>
+        <w:trPr>
+          <w:trHeight w:val="530" w:hRule="atLeast"/>
+        </w:trPr>
+        <w:tc>
+          <w:tcPr>
+            <w:tcW w:w="2000" w:type="dxa"/>
+          </w:tcPr>
+          <w:p>
+            <w:pPr/>
+            <w:r>
+              <w:t xml:space="preserve">company_id</w:t>
+            </w:r>
+          </w:p>
+        </w:tc>
+        <w:tc>
+          <w:tcPr>
+            <w:tcW w:w="2000" w:type="dxa"/>
+          </w:tcPr>
+          <w:p>
+            <w:pPr/>
+            <w:r>
+              <w:t xml:space="preserve">bigint</w:t>
+            </w:r>
+          </w:p>
+        </w:tc>
+        <w:tc>
+          <w:tcPr>
+            <w:tcW w:w="2000" w:type="dxa"/>
+          </w:tcPr>
+          <w:p>
+            <w:pPr/>
+            <w:r>
+              <w:t xml:space="preserve">-</w:t>
+            </w:r>
+          </w:p>
+        </w:tc>
+        <w:tc>
+          <w:tcPr>
+            <w:tcW w:w="2000" w:type="dxa"/>
+          </w:tcPr>
+          <w:p>
+            <w:pPr/>
+            <w:r>
+              <w:t xml:space="preserve">FK, NOT NULL</w:t>
+            </w:r>
+          </w:p>
+        </w:tc>
+      </w:tr>
+      <w:tr>
+        <w:trPr>
+          <w:trHeight w:val="530" w:hRule="atLeast"/>
+        </w:trPr>
+        <w:tc>
+          <w:tcPr>
+            <w:tcW w:w="2000" w:type="dxa"/>
+          </w:tcPr>
+          <w:p>
+            <w:pPr/>
+            <w:r>
+              <w:t xml:space="preserve">created_at</w:t>
+            </w:r>
+          </w:p>
+        </w:tc>
+        <w:tc>
+          <w:tcPr>
+            <w:tcW w:w="2000" w:type="dxa"/>
+          </w:tcPr>
+          <w:p>
+            <w:pPr/>
+            <w:r>
+              <w:t xml:space="preserve">datetime2</w:t>
+            </w:r>
+          </w:p>
+        </w:tc>
+        <w:tc>
+          <w:tcPr>
+            <w:tcW w:w="2000" w:type="dxa"/>
+          </w:tcPr>
+          <w:p>
+            <w:pPr/>
+            <w:r>
+              <w:t xml:space="preserve">(6)</w:t>
+            </w:r>
+          </w:p>
+        </w:tc>
+        <w:tc>
+          <w:tcPr>
+            <w:tcW w:w="2000" w:type="dxa"/>
+          </w:tcPr>
+          <w:p>
+            <w:pPr/>
+            <w:r>
+              <w:t xml:space="preserve">NOT NULL</w:t>
+            </w:r>
+          </w:p>
+        </w:tc>
+      </w:tr>
+      <w:tr>
+        <w:trPr>
+          <w:trHeight w:val="530" w:hRule="atLeast"/>
+        </w:trPr>
+        <w:tc>
+          <w:tcPr>
+            <w:tcW w:w="2000" w:type="dxa"/>
+          </w:tcPr>
+          <w:p>
+            <w:pPr/>
+            <w:r>
+              <w:t xml:space="preserve">created_by</w:t>
+            </w:r>
+          </w:p>
+        </w:tc>
+        <w:tc>
+          <w:tcPr>
+            <w:tcW w:w="2000" w:type="dxa"/>
+          </w:tcPr>
+          <w:p>
+            <w:pPr/>
+            <w:r>
+              <w:t xml:space="preserve">bigint</w:t>
+            </w:r>
+          </w:p>
+        </w:tc>
+        <w:tc>
+          <w:tcPr>
+            <w:tcW w:w="2000" w:type="dxa"/>
+          </w:tcPr>
+          <w:p>
+            <w:pPr/>
+            <w:r>
+              <w:t xml:space="preserve">-</w:t>
+            </w:r>
+          </w:p>
+        </w:tc>
+        <w:tc>
+          <w:tcPr>
+            <w:tcW w:w="2000" w:type="dxa"/>
+          </w:tcPr>
+          <w:p>
+            <w:pPr/>
+            <w:r>
+              <w:t xml:space="preserve">NOT NULL</w:t>
+            </w:r>
+          </w:p>
+        </w:tc>
+      </w:tr>
+      <w:tr>
+        <w:trPr>
+          <w:trHeight w:val="530" w:hRule="atLeast"/>
+        </w:trPr>
+        <w:tc>
+          <w:tcPr>
+            <w:tcW w:w="2000" w:type="dxa"/>
+          </w:tcPr>
+          <w:p>
+            <w:pPr/>
+            <w:r>
+              <w:t xml:space="preserve">updated_at</w:t>
+            </w:r>
+          </w:p>
+        </w:tc>
+        <w:tc>
+          <w:tcPr>
+            <w:tcW w:w="2000" w:type="dxa"/>
+          </w:tcPr>
+          <w:p>
+            <w:pPr/>
+            <w:r>
+              <w:t xml:space="preserve">datetime2</w:t>
+            </w:r>
+          </w:p>
+        </w:tc>
+        <w:tc>
+          <w:tcPr>
+            <w:tcW w:w="2000" w:type="dxa"/>
+          </w:tcPr>
+          <w:p>
+            <w:pPr/>
+            <w:r>
+              <w:t xml:space="preserve">(6)</w:t>
+            </w:r>
+          </w:p>
+        </w:tc>
+        <w:tc>
+          <w:tcPr>
+            <w:tcW w:w="2000" w:type="dxa"/>
+          </w:tcPr>
+          <w:p>
+            <w:pPr/>
+            <w:r>
+              <w:t xml:space="preserve">IS NULL</w:t>
+            </w:r>
+          </w:p>
+        </w:tc>
+      </w:tr>
+      <w:tr>
+        <w:trPr>
+          <w:trHeight w:val="530" w:hRule="atLeast"/>
+        </w:trPr>
+        <w:tc>
+          <w:tcPr>
+            <w:tcW w:w="2000" w:type="dxa"/>
+          </w:tcPr>
+          <w:p>
+            <w:pPr/>
+            <w:r>
+              <w:t xml:space="preserve">updated_by</w:t>
+            </w:r>
+          </w:p>
+        </w:tc>
+        <w:tc>
+          <w:tcPr>
+            <w:tcW w:w="2000" w:type="dxa"/>
+          </w:tcPr>
+          <w:p>
+            <w:pPr/>
+            <w:r>
+              <w:t xml:space="preserve">bigint</w:t>
+            </w:r>
+          </w:p>
+        </w:tc>
+        <w:tc>
+          <w:tcPr>
+            <w:tcW w:w="2000" w:type="dxa"/>
+          </w:tcPr>
+          <w:p>
+            <w:pPr/>
+            <w:r>
+              <w:t xml:space="preserve">-</w:t>
+            </w:r>
+          </w:p>
+        </w:tc>
+        <w:tc>
+          <w:tcPr>
+            <w:tcW w:w="2000" w:type="dxa"/>
+          </w:tcPr>
+          <w:p>
+            <w:pPr/>
+            <w:r>
+              <w:t xml:space="preserve">IS NULL</w:t>
+            </w:r>
+          </w:p>
+        </w:tc>
+      </w:tr>
+      <w:tr>
+        <w:trPr>
+          <w:trHeight w:val="530" w:hRule="atLeast"/>
+        </w:trPr>
+        <w:tc>
+          <w:tcPr>
+            <w:tcW w:w="2000" w:type="dxa"/>
+          </w:tcPr>
+          <w:p>
+            <w:pPr/>
+            <w:r>
+              <w:t xml:space="preserve">version</w:t>
+            </w:r>
+          </w:p>
+        </w:tc>
+        <w:tc>
+          <w:tcPr>
+            <w:tcW w:w="2000" w:type="dxa"/>
+          </w:tcPr>
+          <w:p>
+            <w:pPr/>
+            <w:r>
+              <w:t xml:space="preserve">int</w:t>
+            </w:r>
+          </w:p>
+        </w:tc>
+        <w:tc>
+          <w:tcPr>
+            <w:tcW w:w="2000" w:type="dxa"/>
+          </w:tcPr>
+          <w:p>
+            <w:pPr/>
+            <w:r>
+              <w:t xml:space="preserve">-</w:t>
+            </w:r>
+          </w:p>
+        </w:tc>
+        <w:tc>
+          <w:tcPr>
+            <w:tcW w:w="2000" w:type="dxa"/>
+          </w:tcPr>
+          <w:p>
+            <w:pPr/>
+            <w:r>
+              <w:t xml:space="preserve">NOT NULL</w:t>
+            </w:r>
+          </w:p>
+        </w:tc>
+      </w:tr>
+      <w:tr>
+        <w:trPr>
+          <w:trHeight w:val="530" w:hRule="atLeast"/>
+        </w:trPr>
+        <w:tc>
+          <w:tcPr>
+            <w:tcW w:w="2000" w:type="dxa"/>
+          </w:tcPr>
+          <w:p>
+            <w:pPr/>
+            <w:r>
+              <w:t xml:space="preserve">is_active</w:t>
+            </w:r>
+          </w:p>
+        </w:tc>
+        <w:tc>
+          <w:tcPr>
+            <w:tcW w:w="2000" w:type="dxa"/>
+          </w:tcPr>
+          <w:p>
+            <w:pPr/>
+            <w:r>
+              <w:t xml:space="preserve">bit</w:t>
+            </w:r>
+          </w:p>
+        </w:tc>
+        <w:tc>
+          <w:tcPr>
+            <w:tcW w:w="2000" w:type="dxa"/>
+          </w:tcPr>
+          <w:p>
+            <w:pPr/>
+            <w:r>
+              <w:t xml:space="preserve">-</w:t>
+            </w:r>
+          </w:p>
+        </w:tc>
+        <w:tc>
+          <w:tcPr>
+            <w:tcW w:w="2000" w:type="dxa"/>
+          </w:tcPr>
+          <w:p>
+            <w:pPr/>
+            <w:r>
+              <w:t xml:space="preserve">NOT NULL</w:t>
+            </w:r>
+          </w:p>
+        </w:tc>
+      </w:tr>
+      <w:tr>
+        <w:trPr>
+          <w:trHeight w:val="530" w:hRule="atLeast"/>
+        </w:trPr>
+        <w:tc>
+          <w:tcPr>
+            <w:tcW w:w="2000" w:type="dxa"/>
+          </w:tcPr>
+          <w:p>
+            <w:pPr/>
+            <w:r>
+              <w:t xml:space="preserve">is_deleted</w:t>
+            </w:r>
+          </w:p>
+        </w:tc>
+        <w:tc>
+          <w:tcPr>
+            <w:tcW w:w="2000" w:type="dxa"/>
+          </w:tcPr>
+          <w:p>
+            <w:pPr/>
+            <w:r>
+              <w:t xml:space="preserve">bit</w:t>
+            </w:r>
+          </w:p>
+        </w:tc>
+        <w:tc>
+          <w:tcPr>
+            <w:tcW w:w="2000" w:type="dxa"/>
+          </w:tcPr>
+          <w:p>
+            <w:pPr/>
+            <w:r>
+              <w:t xml:space="preserve">-</w:t>
+            </w:r>
+          </w:p>
+        </w:tc>
+        <w:tc>
+          <w:tcPr>
+            <w:tcW w:w="2000" w:type="dxa"/>
+          </w:tcPr>
+          <w:p>
+            <w:pPr/>
+            <w:r>
+              <w:t xml:space="preserve">NOT NULL</w:t>
+            </w:r>
+          </w:p>
+        </w:tc>
+      </w:tr>
+    </w:tbl>
+    <w:p/>
     <w:p>
       <w:pPr>
         <w:pStyle w:val="Heading2"/>
@@ -617,16 +2788,72 @@
       </w:r>
     </w:p>
     <w:p>
-      <w:pPr/>
+      <w:pPr>
+        <w:pStyle w:val="Heading4"/>
+      </w:pPr>
+      <w:r>
+        <w:t xml:space="preserve">4.2.1.8 Settings Module</w:t>
+      </w:r>
+    </w:p>
+    <w:p>
+      <w:pPr>
+        <w:pStyle w:val="Heading5"/>
+      </w:pPr>
+      <w:r>
+        <w:t xml:space="preserve">4.2.1.8.58 Company View Interface</w:t>
+      </w:r>
+    </w:p>
+    <w:p>
+      <w:pPr>
+        <w:jc w:val="center"/>
+      </w:pPr>
       <w:r>
         <w:rPr>
           <w:i/>
         </w:rPr>
-        <w:t xml:space="preserve">[Pending] No user interfaces have been defined yet.</w:t>
+        <w:t xml:space="preserve">[Pending] System screenshot of Company View Interface.</w:t>
+      </w:r>
+    </w:p>
+    <w:p>
+      <w:pPr>
+        <w:pStyle w:val="Heading5"/>
+      </w:pPr>
+      <w:r>
+        <w:t xml:space="preserve">4.2.1.8.59 Branch View Interface</w:t>
+      </w:r>
+    </w:p>
+    <w:p>
+      <w:pPr>
+        <w:jc w:val="center"/>
+      </w:pPr>
+      <w:r>
+        <w:rPr>
+          <w:i/>
+        </w:rPr>
+        <w:t xml:space="preserve">[Pending] System screenshot of Branch View Interface.</w:t>
+      </w:r>
+    </w:p>
+    <w:p>
+      <w:pPr>
+        <w:pStyle w:val="Heading5"/>
+      </w:pPr>
+      <w:r>
+        <w:t xml:space="preserve">4.2.1.8.60 Department View Interface</w:t>
+      </w:r>
+    </w:p>
+    <w:p>
+      <w:pPr>
+        <w:jc w:val="center"/>
+      </w:pPr>
+      <w:r>
+        <w:rPr>
+          <w:i/>
+        </w:rPr>
+        <w:t xml:space="preserve">[Pending] System screenshot of Department View Interface.</w:t>
       </w:r>
     </w:p>
     <w:sectPr>
-      <w:footerReference xmlns:r="http://schemas.openxmlformats.org/officeDocument/2006/relationships" w:type="default" r:id="R2ed30ffe47ce4d41"/>
+      <w:footerReference xmlns:r="http://schemas.openxmlformats.org/officeDocument/2006/relationships" w:type="default" r:id="R900bf7aa4755472b"/>
       <w:pgSz w:w="11906" w:h="16838"/>
       <w:pgMar w:top="1440" w:right="1440" w:bottom="1440" w:left="1440" w:header="720" w:footer="720" w:gutter="0"/>
     </w:sectPr>

</xml_diff>

<commit_message>
feat(sys): add roles, permission codes, company access check and data scope
- sys_role, sys_role_permission, sys_user_company, sys_user_role (System_Authorization)
- [RequirePermission] dynamic policies, CompanyAccessMiddleware, 403 error codes
- role CRUD, permission catalog, user-company assignment, current authorization API
- DataScopeFilter for application queries; architecture test for action permissions
- frontend PermissionService, *erpHasPermission, permissionGuard, menu filtering
- ADR-014; fix docgen errors in SYS ui-spec and test-plan

Co-Authored-By: Claude Opus 5.5 <noreply@anthropic.com>
</commit_message>
<xml_diff>
--- a/docs/99-output/MyERP_SDS.docx
+++ b/docs/99-output/MyERP_SDS.docx
@@ -2772,6 +2772,3232 @@
     </w:tbl>
     <w:p/>
     <w:p>
+      <w:pPr/>
+      <w:r>
+        <w:t xml:space="preserve">Table Name: sys_role</w:t>
+      </w:r>
+    </w:p>
+    <w:p>
+      <w:pPr/>
+      <w:r>
+        <w:t xml:space="preserve">Primary Key: id</w:t>
+      </w:r>
+    </w:p>
+    <w:p>
+      <w:pPr/>
+      <w:r>
+        <w:t xml:space="preserve">System-wide role definitions with data scope, full-access flag, audit, version and soft deletion.</w:t>
+      </w:r>
+    </w:p>
+    <w:tbl>
+      <w:tblPr>
+        <w:tblStyle w:val="TableGrid"/>
+        <w:tblW w:w="8000" w:type="dxa"/>
+        <w:jc w:val="left"/>
+        <w:tblBorders>
+          <w:top w:val="single" w:color="000000" w:sz="4" w:space="0"/>
+          <w:left w:val="single" w:color="000000" w:sz="4" w:space="0"/>
+          <w:bottom w:val="single" w:color="000000" w:sz="4" w:space="0"/>
+          <w:right w:val="single" w:color="000000" w:sz="4" w:space="0"/>
+          <w:insideH w:val="single" w:color="000000" w:sz="4" w:space="0"/>
+          <w:insideV w:val="single" w:color="000000" w:sz="4" w:space="0"/>
+        </w:tblBorders>
+        <w:tblLayout w:type="fixed"/>
+        <w:tblCellMar>
+          <w:top w:w="100" w:type="dxa"/>
+          <w:left w:w="100" w:type="dxa"/>
+          <w:bottom w:w="100" w:type="dxa"/>
+          <w:right w:w="100" w:type="dxa"/>
+        </w:tblCellMar>
+      </w:tblPr>
+      <w:tblGrid>
+        <w:gridCol w:w="2000"/>
+        <w:gridCol w:w="2000"/>
+        <w:gridCol w:w="2000"/>
+        <w:gridCol w:w="2000"/>
+      </w:tblGrid>
+      <w:tr>
+        <w:trPr>
+          <w:trHeight w:val="530" w:hRule="atLeast"/>
+        </w:trPr>
+        <w:tc>
+          <w:tcPr>
+            <w:tcW w:w="2000" w:type="dxa"/>
+          </w:tcPr>
+          <w:p>
+            <w:pPr>
+              <w:jc w:val="center"/>
+            </w:pPr>
+            <w:r>
+              <w:rPr>
+                <w:b/>
+              </w:rPr>
+              <w:t xml:space="preserve">Name of Attribute</w:t>
+            </w:r>
+          </w:p>
+        </w:tc>
+        <w:tc>
+          <w:tcPr>
+            <w:tcW w:w="2000" w:type="dxa"/>
+          </w:tcPr>
+          <w:p>
+            <w:pPr>
+              <w:jc w:val="center"/>
+            </w:pPr>
+            <w:r>
+              <w:rPr>
+                <w:b/>
+              </w:rPr>
+              <w:t xml:space="preserve">Data Type</w:t>
+            </w:r>
+          </w:p>
+        </w:tc>
+        <w:tc>
+          <w:tcPr>
+            <w:tcW w:w="2000" w:type="dxa"/>
+          </w:tcPr>
+          <w:p>
+            <w:pPr>
+              <w:jc w:val="center"/>
+            </w:pPr>
+            <w:r>
+              <w:rPr>
+                <w:b/>
+              </w:rPr>
+              <w:t xml:space="preserve">Size</w:t>
+            </w:r>
+          </w:p>
+        </w:tc>
+        <w:tc>
+          <w:tcPr>
+            <w:tcW w:w="2000" w:type="dxa"/>
+          </w:tcPr>
+          <w:p>
+            <w:pPr>
+              <w:jc w:val="center"/>
+            </w:pPr>
+            <w:r>
+              <w:rPr>
+                <w:b/>
+              </w:rPr>
+              <w:t xml:space="preserve">PK/FK/IS NULL/ NOT NULL</w:t>
+            </w:r>
+          </w:p>
+        </w:tc>
+      </w:tr>
+      <w:tr>
+        <w:trPr>
+          <w:trHeight w:val="530" w:hRule="atLeast"/>
+        </w:trPr>
+        <w:tc>
+          <w:tcPr>
+            <w:tcW w:w="2000" w:type="dxa"/>
+          </w:tcPr>
+          <w:p>
+            <w:pPr/>
+            <w:r>
+              <w:t xml:space="preserve">id</w:t>
+            </w:r>
+          </w:p>
+        </w:tc>
+        <w:tc>
+          <w:tcPr>
+            <w:tcW w:w="2000" w:type="dxa"/>
+          </w:tcPr>
+          <w:p>
+            <w:pPr/>
+            <w:r>
+              <w:t xml:space="preserve">bigint</w:t>
+            </w:r>
+          </w:p>
+        </w:tc>
+        <w:tc>
+          <w:tcPr>
+            <w:tcW w:w="2000" w:type="dxa"/>
+          </w:tcPr>
+          <w:p>
+            <w:pPr/>
+            <w:r>
+              <w:t xml:space="preserve">-</w:t>
+            </w:r>
+          </w:p>
+        </w:tc>
+        <w:tc>
+          <w:tcPr>
+            <w:tcW w:w="2000" w:type="dxa"/>
+          </w:tcPr>
+          <w:p>
+            <w:pPr/>
+            <w:r>
+              <w:t xml:space="preserve">PK, NOT NULL</w:t>
+            </w:r>
+          </w:p>
+        </w:tc>
+      </w:tr>
+      <w:tr>
+        <w:trPr>
+          <w:trHeight w:val="530" w:hRule="atLeast"/>
+        </w:trPr>
+        <w:tc>
+          <w:tcPr>
+            <w:tcW w:w="2000" w:type="dxa"/>
+          </w:tcPr>
+          <w:p>
+            <w:pPr/>
+            <w:r>
+              <w:t xml:space="preserve">code</w:t>
+            </w:r>
+          </w:p>
+        </w:tc>
+        <w:tc>
+          <w:tcPr>
+            <w:tcW w:w="2000" w:type="dxa"/>
+          </w:tcPr>
+          <w:p>
+            <w:pPr/>
+            <w:r>
+              <w:t xml:space="preserve">varchar</w:t>
+            </w:r>
+          </w:p>
+        </w:tc>
+        <w:tc>
+          <w:tcPr>
+            <w:tcW w:w="2000" w:type="dxa"/>
+          </w:tcPr>
+          <w:p>
+            <w:pPr/>
+            <w:r>
+              <w:t xml:space="preserve">50</w:t>
+            </w:r>
+          </w:p>
+        </w:tc>
+        <w:tc>
+          <w:tcPr>
+            <w:tcW w:w="2000" w:type="dxa"/>
+          </w:tcPr>
+          <w:p>
+            <w:pPr/>
+            <w:r>
+              <w:t xml:space="preserve">NOT NULL</w:t>
+            </w:r>
+          </w:p>
+        </w:tc>
+      </w:tr>
+      <w:tr>
+        <w:trPr>
+          <w:trHeight w:val="530" w:hRule="atLeast"/>
+        </w:trPr>
+        <w:tc>
+          <w:tcPr>
+            <w:tcW w:w="2000" w:type="dxa"/>
+          </w:tcPr>
+          <w:p>
+            <w:pPr/>
+            <w:r>
+              <w:t xml:space="preserve">name</w:t>
+            </w:r>
+          </w:p>
+        </w:tc>
+        <w:tc>
+          <w:tcPr>
+            <w:tcW w:w="2000" w:type="dxa"/>
+          </w:tcPr>
+          <w:p>
+            <w:pPr/>
+            <w:r>
+              <w:t xml:space="preserve">nvarchar</w:t>
+            </w:r>
+          </w:p>
+        </w:tc>
+        <w:tc>
+          <w:tcPr>
+            <w:tcW w:w="2000" w:type="dxa"/>
+          </w:tcPr>
+          <w:p>
+            <w:pPr/>
+            <w:r>
+              <w:t xml:space="preserve">200</w:t>
+            </w:r>
+          </w:p>
+        </w:tc>
+        <w:tc>
+          <w:tcPr>
+            <w:tcW w:w="2000" w:type="dxa"/>
+          </w:tcPr>
+          <w:p>
+            <w:pPr/>
+            <w:r>
+              <w:t xml:space="preserve">NOT NULL</w:t>
+            </w:r>
+          </w:p>
+        </w:tc>
+      </w:tr>
+      <w:tr>
+        <w:trPr>
+          <w:trHeight w:val="530" w:hRule="atLeast"/>
+        </w:trPr>
+        <w:tc>
+          <w:tcPr>
+            <w:tcW w:w="2000" w:type="dxa"/>
+          </w:tcPr>
+          <w:p>
+            <w:pPr/>
+            <w:r>
+              <w:t xml:space="preserve">description</w:t>
+            </w:r>
+          </w:p>
+        </w:tc>
+        <w:tc>
+          <w:tcPr>
+            <w:tcW w:w="2000" w:type="dxa"/>
+          </w:tcPr>
+          <w:p>
+            <w:pPr/>
+            <w:r>
+              <w:t xml:space="preserve">nvarchar</w:t>
+            </w:r>
+          </w:p>
+        </w:tc>
+        <w:tc>
+          <w:tcPr>
+            <w:tcW w:w="2000" w:type="dxa"/>
+          </w:tcPr>
+          <w:p>
+            <w:pPr/>
+            <w:r>
+              <w:t xml:space="preserve">500</w:t>
+            </w:r>
+          </w:p>
+        </w:tc>
+        <w:tc>
+          <w:tcPr>
+            <w:tcW w:w="2000" w:type="dxa"/>
+          </w:tcPr>
+          <w:p>
+            <w:pPr/>
+            <w:r>
+              <w:t xml:space="preserve">IS NULL</w:t>
+            </w:r>
+          </w:p>
+        </w:tc>
+      </w:tr>
+      <w:tr>
+        <w:trPr>
+          <w:trHeight w:val="530" w:hRule="atLeast"/>
+        </w:trPr>
+        <w:tc>
+          <w:tcPr>
+            <w:tcW w:w="2000" w:type="dxa"/>
+          </w:tcPr>
+          <w:p>
+            <w:pPr/>
+            <w:r>
+              <w:t xml:space="preserve">data_scope</w:t>
+            </w:r>
+          </w:p>
+        </w:tc>
+        <w:tc>
+          <w:tcPr>
+            <w:tcW w:w="2000" w:type="dxa"/>
+          </w:tcPr>
+          <w:p>
+            <w:pPr/>
+            <w:r>
+              <w:t xml:space="preserve">varchar</w:t>
+            </w:r>
+          </w:p>
+        </w:tc>
+        <w:tc>
+          <w:tcPr>
+            <w:tcW w:w="2000" w:type="dxa"/>
+          </w:tcPr>
+          <w:p>
+            <w:pPr/>
+            <w:r>
+              <w:t xml:space="preserve">30</w:t>
+            </w:r>
+          </w:p>
+        </w:tc>
+        <w:tc>
+          <w:tcPr>
+            <w:tcW w:w="2000" w:type="dxa"/>
+          </w:tcPr>
+          <w:p>
+            <w:pPr/>
+            <w:r>
+              <w:t xml:space="preserve">NOT NULL</w:t>
+            </w:r>
+          </w:p>
+        </w:tc>
+      </w:tr>
+      <w:tr>
+        <w:trPr>
+          <w:trHeight w:val="530" w:hRule="atLeast"/>
+        </w:trPr>
+        <w:tc>
+          <w:tcPr>
+            <w:tcW w:w="2000" w:type="dxa"/>
+          </w:tcPr>
+          <w:p>
+            <w:pPr/>
+            <w:r>
+              <w:t xml:space="preserve">is_full_access</w:t>
+            </w:r>
+          </w:p>
+        </w:tc>
+        <w:tc>
+          <w:tcPr>
+            <w:tcW w:w="2000" w:type="dxa"/>
+          </w:tcPr>
+          <w:p>
+            <w:pPr/>
+            <w:r>
+              <w:t xml:space="preserve">bit</w:t>
+            </w:r>
+          </w:p>
+        </w:tc>
+        <w:tc>
+          <w:tcPr>
+            <w:tcW w:w="2000" w:type="dxa"/>
+          </w:tcPr>
+          <w:p>
+            <w:pPr/>
+            <w:r>
+              <w:t xml:space="preserve">-</w:t>
+            </w:r>
+          </w:p>
+        </w:tc>
+        <w:tc>
+          <w:tcPr>
+            <w:tcW w:w="2000" w:type="dxa"/>
+          </w:tcPr>
+          <w:p>
+            <w:pPr/>
+            <w:r>
+              <w:t xml:space="preserve">NOT NULL</w:t>
+            </w:r>
+          </w:p>
+        </w:tc>
+      </w:tr>
+      <w:tr>
+        <w:trPr>
+          <w:trHeight w:val="530" w:hRule="atLeast"/>
+        </w:trPr>
+        <w:tc>
+          <w:tcPr>
+            <w:tcW w:w="2000" w:type="dxa"/>
+          </w:tcPr>
+          <w:p>
+            <w:pPr/>
+            <w:r>
+              <w:t xml:space="preserve">is_active</w:t>
+            </w:r>
+          </w:p>
+        </w:tc>
+        <w:tc>
+          <w:tcPr>
+            <w:tcW w:w="2000" w:type="dxa"/>
+          </w:tcPr>
+          <w:p>
+            <w:pPr/>
+            <w:r>
+              <w:t xml:space="preserve">bit</w:t>
+            </w:r>
+          </w:p>
+        </w:tc>
+        <w:tc>
+          <w:tcPr>
+            <w:tcW w:w="2000" w:type="dxa"/>
+          </w:tcPr>
+          <w:p>
+            <w:pPr/>
+            <w:r>
+              <w:t xml:space="preserve">-</w:t>
+            </w:r>
+          </w:p>
+        </w:tc>
+        <w:tc>
+          <w:tcPr>
+            <w:tcW w:w="2000" w:type="dxa"/>
+          </w:tcPr>
+          <w:p>
+            <w:pPr/>
+            <w:r>
+              <w:t xml:space="preserve">NOT NULL</w:t>
+            </w:r>
+          </w:p>
+        </w:tc>
+      </w:tr>
+      <w:tr>
+        <w:trPr>
+          <w:trHeight w:val="530" w:hRule="atLeast"/>
+        </w:trPr>
+        <w:tc>
+          <w:tcPr>
+            <w:tcW w:w="2000" w:type="dxa"/>
+          </w:tcPr>
+          <w:p>
+            <w:pPr/>
+            <w:r>
+              <w:t xml:space="preserve">is_deleted</w:t>
+            </w:r>
+          </w:p>
+        </w:tc>
+        <w:tc>
+          <w:tcPr>
+            <w:tcW w:w="2000" w:type="dxa"/>
+          </w:tcPr>
+          <w:p>
+            <w:pPr/>
+            <w:r>
+              <w:t xml:space="preserve">bit</w:t>
+            </w:r>
+          </w:p>
+        </w:tc>
+        <w:tc>
+          <w:tcPr>
+            <w:tcW w:w="2000" w:type="dxa"/>
+          </w:tcPr>
+          <w:p>
+            <w:pPr/>
+            <w:r>
+              <w:t xml:space="preserve">-</w:t>
+            </w:r>
+          </w:p>
+        </w:tc>
+        <w:tc>
+          <w:tcPr>
+            <w:tcW w:w="2000" w:type="dxa"/>
+          </w:tcPr>
+          <w:p>
+            <w:pPr/>
+            <w:r>
+              <w:t xml:space="preserve">NOT NULL</w:t>
+            </w:r>
+          </w:p>
+        </w:tc>
+      </w:tr>
+      <w:tr>
+        <w:trPr>
+          <w:trHeight w:val="530" w:hRule="atLeast"/>
+        </w:trPr>
+        <w:tc>
+          <w:tcPr>
+            <w:tcW w:w="2000" w:type="dxa"/>
+          </w:tcPr>
+          <w:p>
+            <w:pPr/>
+            <w:r>
+              <w:t xml:space="preserve">created_at</w:t>
+            </w:r>
+          </w:p>
+        </w:tc>
+        <w:tc>
+          <w:tcPr>
+            <w:tcW w:w="2000" w:type="dxa"/>
+          </w:tcPr>
+          <w:p>
+            <w:pPr/>
+            <w:r>
+              <w:t xml:space="preserve">datetime2</w:t>
+            </w:r>
+          </w:p>
+        </w:tc>
+        <w:tc>
+          <w:tcPr>
+            <w:tcW w:w="2000" w:type="dxa"/>
+          </w:tcPr>
+          <w:p>
+            <w:pPr/>
+            <w:r>
+              <w:t xml:space="preserve">(6)</w:t>
+            </w:r>
+          </w:p>
+        </w:tc>
+        <w:tc>
+          <w:tcPr>
+            <w:tcW w:w="2000" w:type="dxa"/>
+          </w:tcPr>
+          <w:p>
+            <w:pPr/>
+            <w:r>
+              <w:t xml:space="preserve">NOT NULL</w:t>
+            </w:r>
+          </w:p>
+        </w:tc>
+      </w:tr>
+      <w:tr>
+        <w:trPr>
+          <w:trHeight w:val="530" w:hRule="atLeast"/>
+        </w:trPr>
+        <w:tc>
+          <w:tcPr>
+            <w:tcW w:w="2000" w:type="dxa"/>
+          </w:tcPr>
+          <w:p>
+            <w:pPr/>
+            <w:r>
+              <w:t xml:space="preserve">created_by</w:t>
+            </w:r>
+          </w:p>
+        </w:tc>
+        <w:tc>
+          <w:tcPr>
+            <w:tcW w:w="2000" w:type="dxa"/>
+          </w:tcPr>
+          <w:p>
+            <w:pPr/>
+            <w:r>
+              <w:t xml:space="preserve">bigint</w:t>
+            </w:r>
+          </w:p>
+        </w:tc>
+        <w:tc>
+          <w:tcPr>
+            <w:tcW w:w="2000" w:type="dxa"/>
+          </w:tcPr>
+          <w:p>
+            <w:pPr/>
+            <w:r>
+              <w:t xml:space="preserve">-</w:t>
+            </w:r>
+          </w:p>
+        </w:tc>
+        <w:tc>
+          <w:tcPr>
+            <w:tcW w:w="2000" w:type="dxa"/>
+          </w:tcPr>
+          <w:p>
+            <w:pPr/>
+            <w:r>
+              <w:t xml:space="preserve">NOT NULL</w:t>
+            </w:r>
+          </w:p>
+        </w:tc>
+      </w:tr>
+      <w:tr>
+        <w:trPr>
+          <w:trHeight w:val="530" w:hRule="atLeast"/>
+        </w:trPr>
+        <w:tc>
+          <w:tcPr>
+            <w:tcW w:w="2000" w:type="dxa"/>
+          </w:tcPr>
+          <w:p>
+            <w:pPr/>
+            <w:r>
+              <w:t xml:space="preserve">updated_at</w:t>
+            </w:r>
+          </w:p>
+        </w:tc>
+        <w:tc>
+          <w:tcPr>
+            <w:tcW w:w="2000" w:type="dxa"/>
+          </w:tcPr>
+          <w:p>
+            <w:pPr/>
+            <w:r>
+              <w:t xml:space="preserve">datetime2</w:t>
+            </w:r>
+          </w:p>
+        </w:tc>
+        <w:tc>
+          <w:tcPr>
+            <w:tcW w:w="2000" w:type="dxa"/>
+          </w:tcPr>
+          <w:p>
+            <w:pPr/>
+            <w:r>
+              <w:t xml:space="preserve">(6)</w:t>
+            </w:r>
+          </w:p>
+        </w:tc>
+        <w:tc>
+          <w:tcPr>
+            <w:tcW w:w="2000" w:type="dxa"/>
+          </w:tcPr>
+          <w:p>
+            <w:pPr/>
+            <w:r>
+              <w:t xml:space="preserve">IS NULL</w:t>
+            </w:r>
+          </w:p>
+        </w:tc>
+      </w:tr>
+      <w:tr>
+        <w:trPr>
+          <w:trHeight w:val="530" w:hRule="atLeast"/>
+        </w:trPr>
+        <w:tc>
+          <w:tcPr>
+            <w:tcW w:w="2000" w:type="dxa"/>
+          </w:tcPr>
+          <w:p>
+            <w:pPr/>
+            <w:r>
+              <w:t xml:space="preserve">updated_by</w:t>
+            </w:r>
+          </w:p>
+        </w:tc>
+        <w:tc>
+          <w:tcPr>
+            <w:tcW w:w="2000" w:type="dxa"/>
+          </w:tcPr>
+          <w:p>
+            <w:pPr/>
+            <w:r>
+              <w:t xml:space="preserve">bigint</w:t>
+            </w:r>
+          </w:p>
+        </w:tc>
+        <w:tc>
+          <w:tcPr>
+            <w:tcW w:w="2000" w:type="dxa"/>
+          </w:tcPr>
+          <w:p>
+            <w:pPr/>
+            <w:r>
+              <w:t xml:space="preserve">-</w:t>
+            </w:r>
+          </w:p>
+        </w:tc>
+        <w:tc>
+          <w:tcPr>
+            <w:tcW w:w="2000" w:type="dxa"/>
+          </w:tcPr>
+          <w:p>
+            <w:pPr/>
+            <w:r>
+              <w:t xml:space="preserve">IS NULL</w:t>
+            </w:r>
+          </w:p>
+        </w:tc>
+      </w:tr>
+      <w:tr>
+        <w:trPr>
+          <w:trHeight w:val="530" w:hRule="atLeast"/>
+        </w:trPr>
+        <w:tc>
+          <w:tcPr>
+            <w:tcW w:w="2000" w:type="dxa"/>
+          </w:tcPr>
+          <w:p>
+            <w:pPr/>
+            <w:r>
+              <w:t xml:space="preserve">version</w:t>
+            </w:r>
+          </w:p>
+        </w:tc>
+        <w:tc>
+          <w:tcPr>
+            <w:tcW w:w="2000" w:type="dxa"/>
+          </w:tcPr>
+          <w:p>
+            <w:pPr/>
+            <w:r>
+              <w:t xml:space="preserve">int</w:t>
+            </w:r>
+          </w:p>
+        </w:tc>
+        <w:tc>
+          <w:tcPr>
+            <w:tcW w:w="2000" w:type="dxa"/>
+          </w:tcPr>
+          <w:p>
+            <w:pPr/>
+            <w:r>
+              <w:t xml:space="preserve">-</w:t>
+            </w:r>
+          </w:p>
+        </w:tc>
+        <w:tc>
+          <w:tcPr>
+            <w:tcW w:w="2000" w:type="dxa"/>
+          </w:tcPr>
+          <w:p>
+            <w:pPr/>
+            <w:r>
+              <w:t xml:space="preserve">NOT NULL</w:t>
+            </w:r>
+          </w:p>
+        </w:tc>
+      </w:tr>
+    </w:tbl>
+    <w:p/>
+    <w:p>
+      <w:pPr/>
+      <w:r>
+        <w:t xml:space="preserve">Table Name: sys_role_permission</w:t>
+      </w:r>
+    </w:p>
+    <w:p>
+      <w:pPr/>
+      <w:r>
+        <w:t xml:space="preserve">Primary Key: id</w:t>
+      </w:r>
+    </w:p>
+    <w:p>
+      <w:pPr/>
+      <w:r>
+        <w:t xml:space="preserve">Permission codes granted by each role.</w:t>
+      </w:r>
+    </w:p>
+    <w:tbl>
+      <w:tblPr>
+        <w:tblStyle w:val="TableGrid"/>
+        <w:tblW w:w="8000" w:type="dxa"/>
+        <w:jc w:val="left"/>
+        <w:tblBorders>
+          <w:top w:val="single" w:color="000000" w:sz="4" w:space="0"/>
+          <w:left w:val="single" w:color="000000" w:sz="4" w:space="0"/>
+          <w:bottom w:val="single" w:color="000000" w:sz="4" w:space="0"/>
+          <w:right w:val="single" w:color="000000" w:sz="4" w:space="0"/>
+          <w:insideH w:val="single" w:color="000000" w:sz="4" w:space="0"/>
+          <w:insideV w:val="single" w:color="000000" w:sz="4" w:space="0"/>
+        </w:tblBorders>
+        <w:tblLayout w:type="fixed"/>
+        <w:tblCellMar>
+          <w:top w:w="100" w:type="dxa"/>
+          <w:left w:w="100" w:type="dxa"/>
+          <w:bottom w:w="100" w:type="dxa"/>
+          <w:right w:w="100" w:type="dxa"/>
+        </w:tblCellMar>
+      </w:tblPr>
+      <w:tblGrid>
+        <w:gridCol w:w="2000"/>
+        <w:gridCol w:w="2000"/>
+        <w:gridCol w:w="2000"/>
+        <w:gridCol w:w="2000"/>
+      </w:tblGrid>
+      <w:tr>
+        <w:trPr>
+          <w:trHeight w:val="530" w:hRule="atLeast"/>
+        </w:trPr>
+        <w:tc>
+          <w:tcPr>
+            <w:tcW w:w="2000" w:type="dxa"/>
+          </w:tcPr>
+          <w:p>
+            <w:pPr>
+              <w:jc w:val="center"/>
+            </w:pPr>
+            <w:r>
+              <w:rPr>
+                <w:b/>
+              </w:rPr>
+              <w:t xml:space="preserve">Name of Attribute</w:t>
+            </w:r>
+          </w:p>
+        </w:tc>
+        <w:tc>
+          <w:tcPr>
+            <w:tcW w:w="2000" w:type="dxa"/>
+          </w:tcPr>
+          <w:p>
+            <w:pPr>
+              <w:jc w:val="center"/>
+            </w:pPr>
+            <w:r>
+              <w:rPr>
+                <w:b/>
+              </w:rPr>
+              <w:t xml:space="preserve">Data Type</w:t>
+            </w:r>
+          </w:p>
+        </w:tc>
+        <w:tc>
+          <w:tcPr>
+            <w:tcW w:w="2000" w:type="dxa"/>
+          </w:tcPr>
+          <w:p>
+            <w:pPr>
+              <w:jc w:val="center"/>
+            </w:pPr>
+            <w:r>
+              <w:rPr>
+                <w:b/>
+              </w:rPr>
+              <w:t xml:space="preserve">Size</w:t>
+            </w:r>
+          </w:p>
+        </w:tc>
+        <w:tc>
+          <w:tcPr>
+            <w:tcW w:w="2000" w:type="dxa"/>
+          </w:tcPr>
+          <w:p>
+            <w:pPr>
+              <w:jc w:val="center"/>
+            </w:pPr>
+            <w:r>
+              <w:rPr>
+                <w:b/>
+              </w:rPr>
+              <w:t xml:space="preserve">PK/FK/IS NULL/ NOT NULL</w:t>
+            </w:r>
+          </w:p>
+        </w:tc>
+      </w:tr>
+      <w:tr>
+        <w:trPr>
+          <w:trHeight w:val="530" w:hRule="atLeast"/>
+        </w:trPr>
+        <w:tc>
+          <w:tcPr>
+            <w:tcW w:w="2000" w:type="dxa"/>
+          </w:tcPr>
+          <w:p>
+            <w:pPr/>
+            <w:r>
+              <w:t xml:space="preserve">id</w:t>
+            </w:r>
+          </w:p>
+        </w:tc>
+        <w:tc>
+          <w:tcPr>
+            <w:tcW w:w="2000" w:type="dxa"/>
+          </w:tcPr>
+          <w:p>
+            <w:pPr/>
+            <w:r>
+              <w:t xml:space="preserve">bigint</w:t>
+            </w:r>
+          </w:p>
+        </w:tc>
+        <w:tc>
+          <w:tcPr>
+            <w:tcW w:w="2000" w:type="dxa"/>
+          </w:tcPr>
+          <w:p>
+            <w:pPr/>
+            <w:r>
+              <w:t xml:space="preserve">-</w:t>
+            </w:r>
+          </w:p>
+        </w:tc>
+        <w:tc>
+          <w:tcPr>
+            <w:tcW w:w="2000" w:type="dxa"/>
+          </w:tcPr>
+          <w:p>
+            <w:pPr/>
+            <w:r>
+              <w:t xml:space="preserve">PK, NOT NULL</w:t>
+            </w:r>
+          </w:p>
+        </w:tc>
+      </w:tr>
+      <w:tr>
+        <w:trPr>
+          <w:trHeight w:val="530" w:hRule="atLeast"/>
+        </w:trPr>
+        <w:tc>
+          <w:tcPr>
+            <w:tcW w:w="2000" w:type="dxa"/>
+          </w:tcPr>
+          <w:p>
+            <w:pPr/>
+            <w:r>
+              <w:t xml:space="preserve">role_id</w:t>
+            </w:r>
+          </w:p>
+        </w:tc>
+        <w:tc>
+          <w:tcPr>
+            <w:tcW w:w="2000" w:type="dxa"/>
+          </w:tcPr>
+          <w:p>
+            <w:pPr/>
+            <w:r>
+              <w:t xml:space="preserve">bigint</w:t>
+            </w:r>
+          </w:p>
+        </w:tc>
+        <w:tc>
+          <w:tcPr>
+            <w:tcW w:w="2000" w:type="dxa"/>
+          </w:tcPr>
+          <w:p>
+            <w:pPr/>
+            <w:r>
+              <w:t xml:space="preserve">-</w:t>
+            </w:r>
+          </w:p>
+        </w:tc>
+        <w:tc>
+          <w:tcPr>
+            <w:tcW w:w="2000" w:type="dxa"/>
+          </w:tcPr>
+          <w:p>
+            <w:pPr/>
+            <w:r>
+              <w:t xml:space="preserve">FK, NOT NULL</w:t>
+            </w:r>
+          </w:p>
+        </w:tc>
+      </w:tr>
+      <w:tr>
+        <w:trPr>
+          <w:trHeight w:val="530" w:hRule="atLeast"/>
+        </w:trPr>
+        <w:tc>
+          <w:tcPr>
+            <w:tcW w:w="2000" w:type="dxa"/>
+          </w:tcPr>
+          <w:p>
+            <w:pPr/>
+            <w:r>
+              <w:t xml:space="preserve">permission_code</w:t>
+            </w:r>
+          </w:p>
+        </w:tc>
+        <w:tc>
+          <w:tcPr>
+            <w:tcW w:w="2000" w:type="dxa"/>
+          </w:tcPr>
+          <w:p>
+            <w:pPr/>
+            <w:r>
+              <w:t xml:space="preserve">varchar</w:t>
+            </w:r>
+          </w:p>
+        </w:tc>
+        <w:tc>
+          <w:tcPr>
+            <w:tcW w:w="2000" w:type="dxa"/>
+          </w:tcPr>
+          <w:p>
+            <w:pPr/>
+            <w:r>
+              <w:t xml:space="preserve">100</w:t>
+            </w:r>
+          </w:p>
+        </w:tc>
+        <w:tc>
+          <w:tcPr>
+            <w:tcW w:w="2000" w:type="dxa"/>
+          </w:tcPr>
+          <w:p>
+            <w:pPr/>
+            <w:r>
+              <w:t xml:space="preserve">NOT NULL</w:t>
+            </w:r>
+          </w:p>
+        </w:tc>
+      </w:tr>
+      <w:tr>
+        <w:trPr>
+          <w:trHeight w:val="530" w:hRule="atLeast"/>
+        </w:trPr>
+        <w:tc>
+          <w:tcPr>
+            <w:tcW w:w="2000" w:type="dxa"/>
+          </w:tcPr>
+          <w:p>
+            <w:pPr/>
+            <w:r>
+              <w:t xml:space="preserve">created_at</w:t>
+            </w:r>
+          </w:p>
+        </w:tc>
+        <w:tc>
+          <w:tcPr>
+            <w:tcW w:w="2000" w:type="dxa"/>
+          </w:tcPr>
+          <w:p>
+            <w:pPr/>
+            <w:r>
+              <w:t xml:space="preserve">datetime2</w:t>
+            </w:r>
+          </w:p>
+        </w:tc>
+        <w:tc>
+          <w:tcPr>
+            <w:tcW w:w="2000" w:type="dxa"/>
+          </w:tcPr>
+          <w:p>
+            <w:pPr/>
+            <w:r>
+              <w:t xml:space="preserve">(6)</w:t>
+            </w:r>
+          </w:p>
+        </w:tc>
+        <w:tc>
+          <w:tcPr>
+            <w:tcW w:w="2000" w:type="dxa"/>
+          </w:tcPr>
+          <w:p>
+            <w:pPr/>
+            <w:r>
+              <w:t xml:space="preserve">NOT NULL</w:t>
+            </w:r>
+          </w:p>
+        </w:tc>
+      </w:tr>
+      <w:tr>
+        <w:trPr>
+          <w:trHeight w:val="530" w:hRule="atLeast"/>
+        </w:trPr>
+        <w:tc>
+          <w:tcPr>
+            <w:tcW w:w="2000" w:type="dxa"/>
+          </w:tcPr>
+          <w:p>
+            <w:pPr/>
+            <w:r>
+              <w:t xml:space="preserve">created_by</w:t>
+            </w:r>
+          </w:p>
+        </w:tc>
+        <w:tc>
+          <w:tcPr>
+            <w:tcW w:w="2000" w:type="dxa"/>
+          </w:tcPr>
+          <w:p>
+            <w:pPr/>
+            <w:r>
+              <w:t xml:space="preserve">bigint</w:t>
+            </w:r>
+          </w:p>
+        </w:tc>
+        <w:tc>
+          <w:tcPr>
+            <w:tcW w:w="2000" w:type="dxa"/>
+          </w:tcPr>
+          <w:p>
+            <w:pPr/>
+            <w:r>
+              <w:t xml:space="preserve">-</w:t>
+            </w:r>
+          </w:p>
+        </w:tc>
+        <w:tc>
+          <w:tcPr>
+            <w:tcW w:w="2000" w:type="dxa"/>
+          </w:tcPr>
+          <w:p>
+            <w:pPr/>
+            <w:r>
+              <w:t xml:space="preserve">NOT NULL</w:t>
+            </w:r>
+          </w:p>
+        </w:tc>
+      </w:tr>
+      <w:tr>
+        <w:trPr>
+          <w:trHeight w:val="530" w:hRule="atLeast"/>
+        </w:trPr>
+        <w:tc>
+          <w:tcPr>
+            <w:tcW w:w="2000" w:type="dxa"/>
+          </w:tcPr>
+          <w:p>
+            <w:pPr/>
+            <w:r>
+              <w:t xml:space="preserve">updated_at</w:t>
+            </w:r>
+          </w:p>
+        </w:tc>
+        <w:tc>
+          <w:tcPr>
+            <w:tcW w:w="2000" w:type="dxa"/>
+          </w:tcPr>
+          <w:p>
+            <w:pPr/>
+            <w:r>
+              <w:t xml:space="preserve">datetime2</w:t>
+            </w:r>
+          </w:p>
+        </w:tc>
+        <w:tc>
+          <w:tcPr>
+            <w:tcW w:w="2000" w:type="dxa"/>
+          </w:tcPr>
+          <w:p>
+            <w:pPr/>
+            <w:r>
+              <w:t xml:space="preserve">(6)</w:t>
+            </w:r>
+          </w:p>
+        </w:tc>
+        <w:tc>
+          <w:tcPr>
+            <w:tcW w:w="2000" w:type="dxa"/>
+          </w:tcPr>
+          <w:p>
+            <w:pPr/>
+            <w:r>
+              <w:t xml:space="preserve">IS NULL</w:t>
+            </w:r>
+          </w:p>
+        </w:tc>
+      </w:tr>
+      <w:tr>
+        <w:trPr>
+          <w:trHeight w:val="530" w:hRule="atLeast"/>
+        </w:trPr>
+        <w:tc>
+          <w:tcPr>
+            <w:tcW w:w="2000" w:type="dxa"/>
+          </w:tcPr>
+          <w:p>
+            <w:pPr/>
+            <w:r>
+              <w:t xml:space="preserve">updated_by</w:t>
+            </w:r>
+          </w:p>
+        </w:tc>
+        <w:tc>
+          <w:tcPr>
+            <w:tcW w:w="2000" w:type="dxa"/>
+          </w:tcPr>
+          <w:p>
+            <w:pPr/>
+            <w:r>
+              <w:t xml:space="preserve">bigint</w:t>
+            </w:r>
+          </w:p>
+        </w:tc>
+        <w:tc>
+          <w:tcPr>
+            <w:tcW w:w="2000" w:type="dxa"/>
+          </w:tcPr>
+          <w:p>
+            <w:pPr/>
+            <w:r>
+              <w:t xml:space="preserve">-</w:t>
+            </w:r>
+          </w:p>
+        </w:tc>
+        <w:tc>
+          <w:tcPr>
+            <w:tcW w:w="2000" w:type="dxa"/>
+          </w:tcPr>
+          <w:p>
+            <w:pPr/>
+            <w:r>
+              <w:t xml:space="preserve">IS NULL</w:t>
+            </w:r>
+          </w:p>
+        </w:tc>
+      </w:tr>
+    </w:tbl>
+    <w:p/>
+    <w:p>
+      <w:pPr/>
+      <w:r>
+        <w:t xml:space="preserve">Table Name: sys_user</w:t>
+      </w:r>
+    </w:p>
+    <w:p>
+      <w:pPr/>
+      <w:r>
+        <w:t xml:space="preserve">Primary Key: id</w:t>
+      </w:r>
+    </w:p>
+    <w:p>
+      <w:pPr/>
+      <w:r>
+        <w:t xml:space="preserve">Global login identities with password hash, failure count, lockout and audit fields.</w:t>
+      </w:r>
+    </w:p>
+    <w:tbl>
+      <w:tblPr>
+        <w:tblStyle w:val="TableGrid"/>
+        <w:tblW w:w="8000" w:type="dxa"/>
+        <w:jc w:val="left"/>
+        <w:tblBorders>
+          <w:top w:val="single" w:color="000000" w:sz="4" w:space="0"/>
+          <w:left w:val="single" w:color="000000" w:sz="4" w:space="0"/>
+          <w:bottom w:val="single" w:color="000000" w:sz="4" w:space="0"/>
+          <w:right w:val="single" w:color="000000" w:sz="4" w:space="0"/>
+          <w:insideH w:val="single" w:color="000000" w:sz="4" w:space="0"/>
+          <w:insideV w:val="single" w:color="000000" w:sz="4" w:space="0"/>
+        </w:tblBorders>
+        <w:tblLayout w:type="fixed"/>
+        <w:tblCellMar>
+          <w:top w:w="100" w:type="dxa"/>
+          <w:left w:w="100" w:type="dxa"/>
+          <w:bottom w:w="100" w:type="dxa"/>
+          <w:right w:w="100" w:type="dxa"/>
+        </w:tblCellMar>
+      </w:tblPr>
+      <w:tblGrid>
+        <w:gridCol w:w="2000"/>
+        <w:gridCol w:w="2000"/>
+        <w:gridCol w:w="2000"/>
+        <w:gridCol w:w="2000"/>
+      </w:tblGrid>
+      <w:tr>
+        <w:trPr>
+          <w:trHeight w:val="530" w:hRule="atLeast"/>
+        </w:trPr>
+        <w:tc>
+          <w:tcPr>
+            <w:tcW w:w="2000" w:type="dxa"/>
+          </w:tcPr>
+          <w:p>
+            <w:pPr>
+              <w:jc w:val="center"/>
+            </w:pPr>
+            <w:r>
+              <w:rPr>
+                <w:b/>
+              </w:rPr>
+              <w:t xml:space="preserve">Name of Attribute</w:t>
+            </w:r>
+          </w:p>
+        </w:tc>
+        <w:tc>
+          <w:tcPr>
+            <w:tcW w:w="2000" w:type="dxa"/>
+          </w:tcPr>
+          <w:p>
+            <w:pPr>
+              <w:jc w:val="center"/>
+            </w:pPr>
+            <w:r>
+              <w:rPr>
+                <w:b/>
+              </w:rPr>
+              <w:t xml:space="preserve">Data Type</w:t>
+            </w:r>
+          </w:p>
+        </w:tc>
+        <w:tc>
+          <w:tcPr>
+            <w:tcW w:w="2000" w:type="dxa"/>
+          </w:tcPr>
+          <w:p>
+            <w:pPr>
+              <w:jc w:val="center"/>
+            </w:pPr>
+            <w:r>
+              <w:rPr>
+                <w:b/>
+              </w:rPr>
+              <w:t xml:space="preserve">Size</w:t>
+            </w:r>
+          </w:p>
+        </w:tc>
+        <w:tc>
+          <w:tcPr>
+            <w:tcW w:w="2000" w:type="dxa"/>
+          </w:tcPr>
+          <w:p>
+            <w:pPr>
+              <w:jc w:val="center"/>
+            </w:pPr>
+            <w:r>
+              <w:rPr>
+                <w:b/>
+              </w:rPr>
+              <w:t xml:space="preserve">PK/FK/IS NULL/ NOT NULL</w:t>
+            </w:r>
+          </w:p>
+        </w:tc>
+      </w:tr>
+      <w:tr>
+        <w:trPr>
+          <w:trHeight w:val="530" w:hRule="atLeast"/>
+        </w:trPr>
+        <w:tc>
+          <w:tcPr>
+            <w:tcW w:w="2000" w:type="dxa"/>
+          </w:tcPr>
+          <w:p>
+            <w:pPr/>
+            <w:r>
+              <w:t xml:space="preserve">id</w:t>
+            </w:r>
+          </w:p>
+        </w:tc>
+        <w:tc>
+          <w:tcPr>
+            <w:tcW w:w="2000" w:type="dxa"/>
+          </w:tcPr>
+          <w:p>
+            <w:pPr/>
+            <w:r>
+              <w:t xml:space="preserve">bigint</w:t>
+            </w:r>
+          </w:p>
+        </w:tc>
+        <w:tc>
+          <w:tcPr>
+            <w:tcW w:w="2000" w:type="dxa"/>
+          </w:tcPr>
+          <w:p>
+            <w:pPr/>
+            <w:r>
+              <w:t xml:space="preserve">-</w:t>
+            </w:r>
+          </w:p>
+        </w:tc>
+        <w:tc>
+          <w:tcPr>
+            <w:tcW w:w="2000" w:type="dxa"/>
+          </w:tcPr>
+          <w:p>
+            <w:pPr/>
+            <w:r>
+              <w:t xml:space="preserve">PK, NOT NULL</w:t>
+            </w:r>
+          </w:p>
+        </w:tc>
+      </w:tr>
+      <w:tr>
+        <w:trPr>
+          <w:trHeight w:val="530" w:hRule="atLeast"/>
+        </w:trPr>
+        <w:tc>
+          <w:tcPr>
+            <w:tcW w:w="2000" w:type="dxa"/>
+          </w:tcPr>
+          <w:p>
+            <w:pPr/>
+            <w:r>
+              <w:t xml:space="preserve">username</w:t>
+            </w:r>
+          </w:p>
+        </w:tc>
+        <w:tc>
+          <w:tcPr>
+            <w:tcW w:w="2000" w:type="dxa"/>
+          </w:tcPr>
+          <w:p>
+            <w:pPr/>
+            <w:r>
+              <w:t xml:space="preserve">varchar</w:t>
+            </w:r>
+          </w:p>
+        </w:tc>
+        <w:tc>
+          <w:tcPr>
+            <w:tcW w:w="2000" w:type="dxa"/>
+          </w:tcPr>
+          <w:p>
+            <w:pPr/>
+            <w:r>
+              <w:t xml:space="preserve">100</w:t>
+            </w:r>
+          </w:p>
+        </w:tc>
+        <w:tc>
+          <w:tcPr>
+            <w:tcW w:w="2000" w:type="dxa"/>
+          </w:tcPr>
+          <w:p>
+            <w:pPr/>
+            <w:r>
+              <w:t xml:space="preserve">NOT NULL</w:t>
+            </w:r>
+          </w:p>
+        </w:tc>
+      </w:tr>
+      <w:tr>
+        <w:trPr>
+          <w:trHeight w:val="530" w:hRule="atLeast"/>
+        </w:trPr>
+        <w:tc>
+          <w:tcPr>
+            <w:tcW w:w="2000" w:type="dxa"/>
+          </w:tcPr>
+          <w:p>
+            <w:pPr/>
+            <w:r>
+              <w:t xml:space="preserve">normalized_username</w:t>
+            </w:r>
+          </w:p>
+        </w:tc>
+        <w:tc>
+          <w:tcPr>
+            <w:tcW w:w="2000" w:type="dxa"/>
+          </w:tcPr>
+          <w:p>
+            <w:pPr/>
+            <w:r>
+              <w:t xml:space="preserve">varchar</w:t>
+            </w:r>
+          </w:p>
+        </w:tc>
+        <w:tc>
+          <w:tcPr>
+            <w:tcW w:w="2000" w:type="dxa"/>
+          </w:tcPr>
+          <w:p>
+            <w:pPr/>
+            <w:r>
+              <w:t xml:space="preserve">100</w:t>
+            </w:r>
+          </w:p>
+        </w:tc>
+        <w:tc>
+          <w:tcPr>
+            <w:tcW w:w="2000" w:type="dxa"/>
+          </w:tcPr>
+          <w:p>
+            <w:pPr/>
+            <w:r>
+              <w:t xml:space="preserve">NOT NULL</w:t>
+            </w:r>
+          </w:p>
+        </w:tc>
+      </w:tr>
+      <w:tr>
+        <w:trPr>
+          <w:trHeight w:val="530" w:hRule="atLeast"/>
+        </w:trPr>
+        <w:tc>
+          <w:tcPr>
+            <w:tcW w:w="2000" w:type="dxa"/>
+          </w:tcPr>
+          <w:p>
+            <w:pPr/>
+            <w:r>
+              <w:t xml:space="preserve">password_hash</w:t>
+            </w:r>
+          </w:p>
+        </w:tc>
+        <w:tc>
+          <w:tcPr>
+            <w:tcW w:w="2000" w:type="dxa"/>
+          </w:tcPr>
+          <w:p>
+            <w:pPr/>
+            <w:r>
+              <w:t xml:space="preserve">varchar</w:t>
+            </w:r>
+          </w:p>
+        </w:tc>
+        <w:tc>
+          <w:tcPr>
+            <w:tcW w:w="2000" w:type="dxa"/>
+          </w:tcPr>
+          <w:p>
+            <w:pPr/>
+            <w:r>
+              <w:t xml:space="preserve">1024</w:t>
+            </w:r>
+          </w:p>
+        </w:tc>
+        <w:tc>
+          <w:tcPr>
+            <w:tcW w:w="2000" w:type="dxa"/>
+          </w:tcPr>
+          <w:p>
+            <w:pPr/>
+            <w:r>
+              <w:t xml:space="preserve">NOT NULL</w:t>
+            </w:r>
+          </w:p>
+        </w:tc>
+      </w:tr>
+      <w:tr>
+        <w:trPr>
+          <w:trHeight w:val="530" w:hRule="atLeast"/>
+        </w:trPr>
+        <w:tc>
+          <w:tcPr>
+            <w:tcW w:w="2000" w:type="dxa"/>
+          </w:tcPr>
+          <w:p>
+            <w:pPr/>
+            <w:r>
+              <w:t xml:space="preserve">password_changed_at</w:t>
+            </w:r>
+          </w:p>
+        </w:tc>
+        <w:tc>
+          <w:tcPr>
+            <w:tcW w:w="2000" w:type="dxa"/>
+          </w:tcPr>
+          <w:p>
+            <w:pPr/>
+            <w:r>
+              <w:t xml:space="preserve">datetime2</w:t>
+            </w:r>
+          </w:p>
+        </w:tc>
+        <w:tc>
+          <w:tcPr>
+            <w:tcW w:w="2000" w:type="dxa"/>
+          </w:tcPr>
+          <w:p>
+            <w:pPr/>
+            <w:r>
+              <w:t xml:space="preserve">(6)</w:t>
+            </w:r>
+          </w:p>
+        </w:tc>
+        <w:tc>
+          <w:tcPr>
+            <w:tcW w:w="2000" w:type="dxa"/>
+          </w:tcPr>
+          <w:p>
+            <w:pPr/>
+            <w:r>
+              <w:t xml:space="preserve">NOT NULL</w:t>
+            </w:r>
+          </w:p>
+        </w:tc>
+      </w:tr>
+      <w:tr>
+        <w:trPr>
+          <w:trHeight w:val="530" w:hRule="atLeast"/>
+        </w:trPr>
+        <w:tc>
+          <w:tcPr>
+            <w:tcW w:w="2000" w:type="dxa"/>
+          </w:tcPr>
+          <w:p>
+            <w:pPr/>
+            <w:r>
+              <w:t xml:space="preserve">failed_login_count</w:t>
+            </w:r>
+          </w:p>
+        </w:tc>
+        <w:tc>
+          <w:tcPr>
+            <w:tcW w:w="2000" w:type="dxa"/>
+          </w:tcPr>
+          <w:p>
+            <w:pPr/>
+            <w:r>
+              <w:t xml:space="preserve">int</w:t>
+            </w:r>
+          </w:p>
+        </w:tc>
+        <w:tc>
+          <w:tcPr>
+            <w:tcW w:w="2000" w:type="dxa"/>
+          </w:tcPr>
+          <w:p>
+            <w:pPr/>
+            <w:r>
+              <w:t xml:space="preserve">-</w:t>
+            </w:r>
+          </w:p>
+        </w:tc>
+        <w:tc>
+          <w:tcPr>
+            <w:tcW w:w="2000" w:type="dxa"/>
+          </w:tcPr>
+          <w:p>
+            <w:pPr/>
+            <w:r>
+              <w:t xml:space="preserve">NOT NULL</w:t>
+            </w:r>
+          </w:p>
+        </w:tc>
+      </w:tr>
+      <w:tr>
+        <w:trPr>
+          <w:trHeight w:val="530" w:hRule="atLeast"/>
+        </w:trPr>
+        <w:tc>
+          <w:tcPr>
+            <w:tcW w:w="2000" w:type="dxa"/>
+          </w:tcPr>
+          <w:p>
+            <w:pPr/>
+            <w:r>
+              <w:t xml:space="preserve">lockout_end</w:t>
+            </w:r>
+          </w:p>
+        </w:tc>
+        <w:tc>
+          <w:tcPr>
+            <w:tcW w:w="2000" w:type="dxa"/>
+          </w:tcPr>
+          <w:p>
+            <w:pPr/>
+            <w:r>
+              <w:t xml:space="preserve">datetime2</w:t>
+            </w:r>
+          </w:p>
+        </w:tc>
+        <w:tc>
+          <w:tcPr>
+            <w:tcW w:w="2000" w:type="dxa"/>
+          </w:tcPr>
+          <w:p>
+            <w:pPr/>
+            <w:r>
+              <w:t xml:space="preserve">(6)</w:t>
+            </w:r>
+          </w:p>
+        </w:tc>
+        <w:tc>
+          <w:tcPr>
+            <w:tcW w:w="2000" w:type="dxa"/>
+          </w:tcPr>
+          <w:p>
+            <w:pPr/>
+            <w:r>
+              <w:t xml:space="preserve">IS NULL</w:t>
+            </w:r>
+          </w:p>
+        </w:tc>
+      </w:tr>
+      <w:tr>
+        <w:trPr>
+          <w:trHeight w:val="530" w:hRule="atLeast"/>
+        </w:trPr>
+        <w:tc>
+          <w:tcPr>
+            <w:tcW w:w="2000" w:type="dxa"/>
+          </w:tcPr>
+          <w:p>
+            <w:pPr/>
+            <w:r>
+              <w:t xml:space="preserve">is_active</w:t>
+            </w:r>
+          </w:p>
+        </w:tc>
+        <w:tc>
+          <w:tcPr>
+            <w:tcW w:w="2000" w:type="dxa"/>
+          </w:tcPr>
+          <w:p>
+            <w:pPr/>
+            <w:r>
+              <w:t xml:space="preserve">bit</w:t>
+            </w:r>
+          </w:p>
+        </w:tc>
+        <w:tc>
+          <w:tcPr>
+            <w:tcW w:w="2000" w:type="dxa"/>
+          </w:tcPr>
+          <w:p>
+            <w:pPr/>
+            <w:r>
+              <w:t xml:space="preserve">-</w:t>
+            </w:r>
+          </w:p>
+        </w:tc>
+        <w:tc>
+          <w:tcPr>
+            <w:tcW w:w="2000" w:type="dxa"/>
+          </w:tcPr>
+          <w:p>
+            <w:pPr/>
+            <w:r>
+              <w:t xml:space="preserve">NOT NULL</w:t>
+            </w:r>
+          </w:p>
+        </w:tc>
+      </w:tr>
+      <w:tr>
+        <w:trPr>
+          <w:trHeight w:val="530" w:hRule="atLeast"/>
+        </w:trPr>
+        <w:tc>
+          <w:tcPr>
+            <w:tcW w:w="2000" w:type="dxa"/>
+          </w:tcPr>
+          <w:p>
+            <w:pPr/>
+            <w:r>
+              <w:t xml:space="preserve">is_deleted</w:t>
+            </w:r>
+          </w:p>
+        </w:tc>
+        <w:tc>
+          <w:tcPr>
+            <w:tcW w:w="2000" w:type="dxa"/>
+          </w:tcPr>
+          <w:p>
+            <w:pPr/>
+            <w:r>
+              <w:t xml:space="preserve">bit</w:t>
+            </w:r>
+          </w:p>
+        </w:tc>
+        <w:tc>
+          <w:tcPr>
+            <w:tcW w:w="2000" w:type="dxa"/>
+          </w:tcPr>
+          <w:p>
+            <w:pPr/>
+            <w:r>
+              <w:t xml:space="preserve">-</w:t>
+            </w:r>
+          </w:p>
+        </w:tc>
+        <w:tc>
+          <w:tcPr>
+            <w:tcW w:w="2000" w:type="dxa"/>
+          </w:tcPr>
+          <w:p>
+            <w:pPr/>
+            <w:r>
+              <w:t xml:space="preserve">NOT NULL</w:t>
+            </w:r>
+          </w:p>
+        </w:tc>
+      </w:tr>
+      <w:tr>
+        <w:trPr>
+          <w:trHeight w:val="530" w:hRule="atLeast"/>
+        </w:trPr>
+        <w:tc>
+          <w:tcPr>
+            <w:tcW w:w="2000" w:type="dxa"/>
+          </w:tcPr>
+          <w:p>
+            <w:pPr/>
+            <w:r>
+              <w:t xml:space="preserve">created_at</w:t>
+            </w:r>
+          </w:p>
+        </w:tc>
+        <w:tc>
+          <w:tcPr>
+            <w:tcW w:w="2000" w:type="dxa"/>
+          </w:tcPr>
+          <w:p>
+            <w:pPr/>
+            <w:r>
+              <w:t xml:space="preserve">datetime2</w:t>
+            </w:r>
+          </w:p>
+        </w:tc>
+        <w:tc>
+          <w:tcPr>
+            <w:tcW w:w="2000" w:type="dxa"/>
+          </w:tcPr>
+          <w:p>
+            <w:pPr/>
+            <w:r>
+              <w:t xml:space="preserve">(6)</w:t>
+            </w:r>
+          </w:p>
+        </w:tc>
+        <w:tc>
+          <w:tcPr>
+            <w:tcW w:w="2000" w:type="dxa"/>
+          </w:tcPr>
+          <w:p>
+            <w:pPr/>
+            <w:r>
+              <w:t xml:space="preserve">NOT NULL</w:t>
+            </w:r>
+          </w:p>
+        </w:tc>
+      </w:tr>
+      <w:tr>
+        <w:trPr>
+          <w:trHeight w:val="530" w:hRule="atLeast"/>
+        </w:trPr>
+        <w:tc>
+          <w:tcPr>
+            <w:tcW w:w="2000" w:type="dxa"/>
+          </w:tcPr>
+          <w:p>
+            <w:pPr/>
+            <w:r>
+              <w:t xml:space="preserve">created_by</w:t>
+            </w:r>
+          </w:p>
+        </w:tc>
+        <w:tc>
+          <w:tcPr>
+            <w:tcW w:w="2000" w:type="dxa"/>
+          </w:tcPr>
+          <w:p>
+            <w:pPr/>
+            <w:r>
+              <w:t xml:space="preserve">bigint</w:t>
+            </w:r>
+          </w:p>
+        </w:tc>
+        <w:tc>
+          <w:tcPr>
+            <w:tcW w:w="2000" w:type="dxa"/>
+          </w:tcPr>
+          <w:p>
+            <w:pPr/>
+            <w:r>
+              <w:t xml:space="preserve">-</w:t>
+            </w:r>
+          </w:p>
+        </w:tc>
+        <w:tc>
+          <w:tcPr>
+            <w:tcW w:w="2000" w:type="dxa"/>
+          </w:tcPr>
+          <w:p>
+            <w:pPr/>
+            <w:r>
+              <w:t xml:space="preserve">NOT NULL</w:t>
+            </w:r>
+          </w:p>
+        </w:tc>
+      </w:tr>
+      <w:tr>
+        <w:trPr>
+          <w:trHeight w:val="530" w:hRule="atLeast"/>
+        </w:trPr>
+        <w:tc>
+          <w:tcPr>
+            <w:tcW w:w="2000" w:type="dxa"/>
+          </w:tcPr>
+          <w:p>
+            <w:pPr/>
+            <w:r>
+              <w:t xml:space="preserve">updated_at</w:t>
+            </w:r>
+          </w:p>
+        </w:tc>
+        <w:tc>
+          <w:tcPr>
+            <w:tcW w:w="2000" w:type="dxa"/>
+          </w:tcPr>
+          <w:p>
+            <w:pPr/>
+            <w:r>
+              <w:t xml:space="preserve">datetime2</w:t>
+            </w:r>
+          </w:p>
+        </w:tc>
+        <w:tc>
+          <w:tcPr>
+            <w:tcW w:w="2000" w:type="dxa"/>
+          </w:tcPr>
+          <w:p>
+            <w:pPr/>
+            <w:r>
+              <w:t xml:space="preserve">(6)</w:t>
+            </w:r>
+          </w:p>
+        </w:tc>
+        <w:tc>
+          <w:tcPr>
+            <w:tcW w:w="2000" w:type="dxa"/>
+          </w:tcPr>
+          <w:p>
+            <w:pPr/>
+            <w:r>
+              <w:t xml:space="preserve">IS NULL</w:t>
+            </w:r>
+          </w:p>
+        </w:tc>
+      </w:tr>
+      <w:tr>
+        <w:trPr>
+          <w:trHeight w:val="530" w:hRule="atLeast"/>
+        </w:trPr>
+        <w:tc>
+          <w:tcPr>
+            <w:tcW w:w="2000" w:type="dxa"/>
+          </w:tcPr>
+          <w:p>
+            <w:pPr/>
+            <w:r>
+              <w:t xml:space="preserve">updated_by</w:t>
+            </w:r>
+          </w:p>
+        </w:tc>
+        <w:tc>
+          <w:tcPr>
+            <w:tcW w:w="2000" w:type="dxa"/>
+          </w:tcPr>
+          <w:p>
+            <w:pPr/>
+            <w:r>
+              <w:t xml:space="preserve">bigint</w:t>
+            </w:r>
+          </w:p>
+        </w:tc>
+        <w:tc>
+          <w:tcPr>
+            <w:tcW w:w="2000" w:type="dxa"/>
+          </w:tcPr>
+          <w:p>
+            <w:pPr/>
+            <w:r>
+              <w:t xml:space="preserve">-</w:t>
+            </w:r>
+          </w:p>
+        </w:tc>
+        <w:tc>
+          <w:tcPr>
+            <w:tcW w:w="2000" w:type="dxa"/>
+          </w:tcPr>
+          <w:p>
+            <w:pPr/>
+            <w:r>
+              <w:t xml:space="preserve">IS NULL</w:t>
+            </w:r>
+          </w:p>
+        </w:tc>
+      </w:tr>
+      <w:tr>
+        <w:trPr>
+          <w:trHeight w:val="530" w:hRule="atLeast"/>
+        </w:trPr>
+        <w:tc>
+          <w:tcPr>
+            <w:tcW w:w="2000" w:type="dxa"/>
+          </w:tcPr>
+          <w:p>
+            <w:pPr/>
+            <w:r>
+              <w:t xml:space="preserve">version</w:t>
+            </w:r>
+          </w:p>
+        </w:tc>
+        <w:tc>
+          <w:tcPr>
+            <w:tcW w:w="2000" w:type="dxa"/>
+          </w:tcPr>
+          <w:p>
+            <w:pPr/>
+            <w:r>
+              <w:t xml:space="preserve">int</w:t>
+            </w:r>
+          </w:p>
+        </w:tc>
+        <w:tc>
+          <w:tcPr>
+            <w:tcW w:w="2000" w:type="dxa"/>
+          </w:tcPr>
+          <w:p>
+            <w:pPr/>
+            <w:r>
+              <w:t xml:space="preserve">-</w:t>
+            </w:r>
+          </w:p>
+        </w:tc>
+        <w:tc>
+          <w:tcPr>
+            <w:tcW w:w="2000" w:type="dxa"/>
+          </w:tcPr>
+          <w:p>
+            <w:pPr/>
+            <w:r>
+              <w:t xml:space="preserve">NOT NULL</w:t>
+            </w:r>
+          </w:p>
+        </w:tc>
+      </w:tr>
+    </w:tbl>
+    <w:p/>
+    <w:p>
+      <w:pPr/>
+      <w:r>
+        <w:t xml:space="preserve">Table Name: sys_user_company</w:t>
+      </w:r>
+    </w:p>
+    <w:p>
+      <w:pPr/>
+      <w:r>
+        <w:t xml:space="preserve">Primary Key: id</w:t>
+      </w:r>
+    </w:p>
+    <w:p>
+      <w:pPr/>
+      <w:r>
+        <w:t xml:space="preserve">Companies a user may access, with branch and department placement and the default company.</w:t>
+      </w:r>
+    </w:p>
+    <w:tbl>
+      <w:tblPr>
+        <w:tblStyle w:val="TableGrid"/>
+        <w:tblW w:w="8000" w:type="dxa"/>
+        <w:jc w:val="left"/>
+        <w:tblBorders>
+          <w:top w:val="single" w:color="000000" w:sz="4" w:space="0"/>
+          <w:left w:val="single" w:color="000000" w:sz="4" w:space="0"/>
+          <w:bottom w:val="single" w:color="000000" w:sz="4" w:space="0"/>
+          <w:right w:val="single" w:color="000000" w:sz="4" w:space="0"/>
+          <w:insideH w:val="single" w:color="000000" w:sz="4" w:space="0"/>
+          <w:insideV w:val="single" w:color="000000" w:sz="4" w:space="0"/>
+        </w:tblBorders>
+        <w:tblLayout w:type="fixed"/>
+        <w:tblCellMar>
+          <w:top w:w="100" w:type="dxa"/>
+          <w:left w:w="100" w:type="dxa"/>
+          <w:bottom w:w="100" w:type="dxa"/>
+          <w:right w:w="100" w:type="dxa"/>
+        </w:tblCellMar>
+      </w:tblPr>
+      <w:tblGrid>
+        <w:gridCol w:w="2000"/>
+        <w:gridCol w:w="2000"/>
+        <w:gridCol w:w="2000"/>
+        <w:gridCol w:w="2000"/>
+      </w:tblGrid>
+      <w:tr>
+        <w:trPr>
+          <w:trHeight w:val="530" w:hRule="atLeast"/>
+        </w:trPr>
+        <w:tc>
+          <w:tcPr>
+            <w:tcW w:w="2000" w:type="dxa"/>
+          </w:tcPr>
+          <w:p>
+            <w:pPr>
+              <w:jc w:val="center"/>
+            </w:pPr>
+            <w:r>
+              <w:rPr>
+                <w:b/>
+              </w:rPr>
+              <w:t xml:space="preserve">Name of Attribute</w:t>
+            </w:r>
+          </w:p>
+        </w:tc>
+        <w:tc>
+          <w:tcPr>
+            <w:tcW w:w="2000" w:type="dxa"/>
+          </w:tcPr>
+          <w:p>
+            <w:pPr>
+              <w:jc w:val="center"/>
+            </w:pPr>
+            <w:r>
+              <w:rPr>
+                <w:b/>
+              </w:rPr>
+              <w:t xml:space="preserve">Data Type</w:t>
+            </w:r>
+          </w:p>
+        </w:tc>
+        <w:tc>
+          <w:tcPr>
+            <w:tcW w:w="2000" w:type="dxa"/>
+          </w:tcPr>
+          <w:p>
+            <w:pPr>
+              <w:jc w:val="center"/>
+            </w:pPr>
+            <w:r>
+              <w:rPr>
+                <w:b/>
+              </w:rPr>
+              <w:t xml:space="preserve">Size</w:t>
+            </w:r>
+          </w:p>
+        </w:tc>
+        <w:tc>
+          <w:tcPr>
+            <w:tcW w:w="2000" w:type="dxa"/>
+          </w:tcPr>
+          <w:p>
+            <w:pPr>
+              <w:jc w:val="center"/>
+            </w:pPr>
+            <w:r>
+              <w:rPr>
+                <w:b/>
+              </w:rPr>
+              <w:t xml:space="preserve">PK/FK/IS NULL/ NOT NULL</w:t>
+            </w:r>
+          </w:p>
+        </w:tc>
+      </w:tr>
+      <w:tr>
+        <w:trPr>
+          <w:trHeight w:val="530" w:hRule="atLeast"/>
+        </w:trPr>
+        <w:tc>
+          <w:tcPr>
+            <w:tcW w:w="2000" w:type="dxa"/>
+          </w:tcPr>
+          <w:p>
+            <w:pPr/>
+            <w:r>
+              <w:t xml:space="preserve">id</w:t>
+            </w:r>
+          </w:p>
+        </w:tc>
+        <w:tc>
+          <w:tcPr>
+            <w:tcW w:w="2000" w:type="dxa"/>
+          </w:tcPr>
+          <w:p>
+            <w:pPr/>
+            <w:r>
+              <w:t xml:space="preserve">bigint</w:t>
+            </w:r>
+          </w:p>
+        </w:tc>
+        <w:tc>
+          <w:tcPr>
+            <w:tcW w:w="2000" w:type="dxa"/>
+          </w:tcPr>
+          <w:p>
+            <w:pPr/>
+            <w:r>
+              <w:t xml:space="preserve">-</w:t>
+            </w:r>
+          </w:p>
+        </w:tc>
+        <w:tc>
+          <w:tcPr>
+            <w:tcW w:w="2000" w:type="dxa"/>
+          </w:tcPr>
+          <w:p>
+            <w:pPr/>
+            <w:r>
+              <w:t xml:space="preserve">PK, NOT NULL</w:t>
+            </w:r>
+          </w:p>
+        </w:tc>
+      </w:tr>
+      <w:tr>
+        <w:trPr>
+          <w:trHeight w:val="530" w:hRule="atLeast"/>
+        </w:trPr>
+        <w:tc>
+          <w:tcPr>
+            <w:tcW w:w="2000" w:type="dxa"/>
+          </w:tcPr>
+          <w:p>
+            <w:pPr/>
+            <w:r>
+              <w:t xml:space="preserve">user_id</w:t>
+            </w:r>
+          </w:p>
+        </w:tc>
+        <w:tc>
+          <w:tcPr>
+            <w:tcW w:w="2000" w:type="dxa"/>
+          </w:tcPr>
+          <w:p>
+            <w:pPr/>
+            <w:r>
+              <w:t xml:space="preserve">bigint</w:t>
+            </w:r>
+          </w:p>
+        </w:tc>
+        <w:tc>
+          <w:tcPr>
+            <w:tcW w:w="2000" w:type="dxa"/>
+          </w:tcPr>
+          <w:p>
+            <w:pPr/>
+            <w:r>
+              <w:t xml:space="preserve">-</w:t>
+            </w:r>
+          </w:p>
+        </w:tc>
+        <w:tc>
+          <w:tcPr>
+            <w:tcW w:w="2000" w:type="dxa"/>
+          </w:tcPr>
+          <w:p>
+            <w:pPr/>
+            <w:r>
+              <w:t xml:space="preserve">FK, NOT NULL</w:t>
+            </w:r>
+          </w:p>
+        </w:tc>
+      </w:tr>
+      <w:tr>
+        <w:trPr>
+          <w:trHeight w:val="530" w:hRule="atLeast"/>
+        </w:trPr>
+        <w:tc>
+          <w:tcPr>
+            <w:tcW w:w="2000" w:type="dxa"/>
+          </w:tcPr>
+          <w:p>
+            <w:pPr/>
+            <w:r>
+              <w:t xml:space="preserve">company_id</w:t>
+            </w:r>
+          </w:p>
+        </w:tc>
+        <w:tc>
+          <w:tcPr>
+            <w:tcW w:w="2000" w:type="dxa"/>
+          </w:tcPr>
+          <w:p>
+            <w:pPr/>
+            <w:r>
+              <w:t xml:space="preserve">bigint</w:t>
+            </w:r>
+          </w:p>
+        </w:tc>
+        <w:tc>
+          <w:tcPr>
+            <w:tcW w:w="2000" w:type="dxa"/>
+          </w:tcPr>
+          <w:p>
+            <w:pPr/>
+            <w:r>
+              <w:t xml:space="preserve">-</w:t>
+            </w:r>
+          </w:p>
+        </w:tc>
+        <w:tc>
+          <w:tcPr>
+            <w:tcW w:w="2000" w:type="dxa"/>
+          </w:tcPr>
+          <w:p>
+            <w:pPr/>
+            <w:r>
+              <w:t xml:space="preserve">FK, NOT NULL</w:t>
+            </w:r>
+          </w:p>
+        </w:tc>
+      </w:tr>
+      <w:tr>
+        <w:trPr>
+          <w:trHeight w:val="530" w:hRule="atLeast"/>
+        </w:trPr>
+        <w:tc>
+          <w:tcPr>
+            <w:tcW w:w="2000" w:type="dxa"/>
+          </w:tcPr>
+          <w:p>
+            <w:pPr/>
+            <w:r>
+              <w:t xml:space="preserve">branch_id</w:t>
+            </w:r>
+          </w:p>
+        </w:tc>
+        <w:tc>
+          <w:tcPr>
+            <w:tcW w:w="2000" w:type="dxa"/>
+          </w:tcPr>
+          <w:p>
+            <w:pPr/>
+            <w:r>
+              <w:t xml:space="preserve">bigint</w:t>
+            </w:r>
+          </w:p>
+        </w:tc>
+        <w:tc>
+          <w:tcPr>
+            <w:tcW w:w="2000" w:type="dxa"/>
+          </w:tcPr>
+          <w:p>
+            <w:pPr/>
+            <w:r>
+              <w:t xml:space="preserve">-</w:t>
+            </w:r>
+          </w:p>
+        </w:tc>
+        <w:tc>
+          <w:tcPr>
+            <w:tcW w:w="2000" w:type="dxa"/>
+          </w:tcPr>
+          <w:p>
+            <w:pPr/>
+            <w:r>
+              <w:t xml:space="preserve">FK, IS NULL</w:t>
+            </w:r>
+          </w:p>
+        </w:tc>
+      </w:tr>
+      <w:tr>
+        <w:trPr>
+          <w:trHeight w:val="530" w:hRule="atLeast"/>
+        </w:trPr>
+        <w:tc>
+          <w:tcPr>
+            <w:tcW w:w="2000" w:type="dxa"/>
+          </w:tcPr>
+          <w:p>
+            <w:pPr/>
+            <w:r>
+              <w:t xml:space="preserve">department_id</w:t>
+            </w:r>
+          </w:p>
+        </w:tc>
+        <w:tc>
+          <w:tcPr>
+            <w:tcW w:w="2000" w:type="dxa"/>
+          </w:tcPr>
+          <w:p>
+            <w:pPr/>
+            <w:r>
+              <w:t xml:space="preserve">bigint</w:t>
+            </w:r>
+          </w:p>
+        </w:tc>
+        <w:tc>
+          <w:tcPr>
+            <w:tcW w:w="2000" w:type="dxa"/>
+          </w:tcPr>
+          <w:p>
+            <w:pPr/>
+            <w:r>
+              <w:t xml:space="preserve">-</w:t>
+            </w:r>
+          </w:p>
+        </w:tc>
+        <w:tc>
+          <w:tcPr>
+            <w:tcW w:w="2000" w:type="dxa"/>
+          </w:tcPr>
+          <w:p>
+            <w:pPr/>
+            <w:r>
+              <w:t xml:space="preserve">FK, IS NULL</w:t>
+            </w:r>
+          </w:p>
+        </w:tc>
+      </w:tr>
+      <w:tr>
+        <w:trPr>
+          <w:trHeight w:val="530" w:hRule="atLeast"/>
+        </w:trPr>
+        <w:tc>
+          <w:tcPr>
+            <w:tcW w:w="2000" w:type="dxa"/>
+          </w:tcPr>
+          <w:p>
+            <w:pPr/>
+            <w:r>
+              <w:t xml:space="preserve">is_default</w:t>
+            </w:r>
+          </w:p>
+        </w:tc>
+        <w:tc>
+          <w:tcPr>
+            <w:tcW w:w="2000" w:type="dxa"/>
+          </w:tcPr>
+          <w:p>
+            <w:pPr/>
+            <w:r>
+              <w:t xml:space="preserve">bit</w:t>
+            </w:r>
+          </w:p>
+        </w:tc>
+        <w:tc>
+          <w:tcPr>
+            <w:tcW w:w="2000" w:type="dxa"/>
+          </w:tcPr>
+          <w:p>
+            <w:pPr/>
+            <w:r>
+              <w:t xml:space="preserve">-</w:t>
+            </w:r>
+          </w:p>
+        </w:tc>
+        <w:tc>
+          <w:tcPr>
+            <w:tcW w:w="2000" w:type="dxa"/>
+          </w:tcPr>
+          <w:p>
+            <w:pPr/>
+            <w:r>
+              <w:t xml:space="preserve">NOT NULL</w:t>
+            </w:r>
+          </w:p>
+        </w:tc>
+      </w:tr>
+      <w:tr>
+        <w:trPr>
+          <w:trHeight w:val="530" w:hRule="atLeast"/>
+        </w:trPr>
+        <w:tc>
+          <w:tcPr>
+            <w:tcW w:w="2000" w:type="dxa"/>
+          </w:tcPr>
+          <w:p>
+            <w:pPr/>
+            <w:r>
+              <w:t xml:space="preserve">is_active</w:t>
+            </w:r>
+          </w:p>
+        </w:tc>
+        <w:tc>
+          <w:tcPr>
+            <w:tcW w:w="2000" w:type="dxa"/>
+          </w:tcPr>
+          <w:p>
+            <w:pPr/>
+            <w:r>
+              <w:t xml:space="preserve">bit</w:t>
+            </w:r>
+          </w:p>
+        </w:tc>
+        <w:tc>
+          <w:tcPr>
+            <w:tcW w:w="2000" w:type="dxa"/>
+          </w:tcPr>
+          <w:p>
+            <w:pPr/>
+            <w:r>
+              <w:t xml:space="preserve">-</w:t>
+            </w:r>
+          </w:p>
+        </w:tc>
+        <w:tc>
+          <w:tcPr>
+            <w:tcW w:w="2000" w:type="dxa"/>
+          </w:tcPr>
+          <w:p>
+            <w:pPr/>
+            <w:r>
+              <w:t xml:space="preserve">NOT NULL</w:t>
+            </w:r>
+          </w:p>
+        </w:tc>
+      </w:tr>
+      <w:tr>
+        <w:trPr>
+          <w:trHeight w:val="530" w:hRule="atLeast"/>
+        </w:trPr>
+        <w:tc>
+          <w:tcPr>
+            <w:tcW w:w="2000" w:type="dxa"/>
+          </w:tcPr>
+          <w:p>
+            <w:pPr/>
+            <w:r>
+              <w:t xml:space="preserve">created_at</w:t>
+            </w:r>
+          </w:p>
+        </w:tc>
+        <w:tc>
+          <w:tcPr>
+            <w:tcW w:w="2000" w:type="dxa"/>
+          </w:tcPr>
+          <w:p>
+            <w:pPr/>
+            <w:r>
+              <w:t xml:space="preserve">datetime2</w:t>
+            </w:r>
+          </w:p>
+        </w:tc>
+        <w:tc>
+          <w:tcPr>
+            <w:tcW w:w="2000" w:type="dxa"/>
+          </w:tcPr>
+          <w:p>
+            <w:pPr/>
+            <w:r>
+              <w:t xml:space="preserve">(6)</w:t>
+            </w:r>
+          </w:p>
+        </w:tc>
+        <w:tc>
+          <w:tcPr>
+            <w:tcW w:w="2000" w:type="dxa"/>
+          </w:tcPr>
+          <w:p>
+            <w:pPr/>
+            <w:r>
+              <w:t xml:space="preserve">NOT NULL</w:t>
+            </w:r>
+          </w:p>
+        </w:tc>
+      </w:tr>
+      <w:tr>
+        <w:trPr>
+          <w:trHeight w:val="530" w:hRule="atLeast"/>
+        </w:trPr>
+        <w:tc>
+          <w:tcPr>
+            <w:tcW w:w="2000" w:type="dxa"/>
+          </w:tcPr>
+          <w:p>
+            <w:pPr/>
+            <w:r>
+              <w:t xml:space="preserve">created_by</w:t>
+            </w:r>
+          </w:p>
+        </w:tc>
+        <w:tc>
+          <w:tcPr>
+            <w:tcW w:w="2000" w:type="dxa"/>
+          </w:tcPr>
+          <w:p>
+            <w:pPr/>
+            <w:r>
+              <w:t xml:space="preserve">bigint</w:t>
+            </w:r>
+          </w:p>
+        </w:tc>
+        <w:tc>
+          <w:tcPr>
+            <w:tcW w:w="2000" w:type="dxa"/>
+          </w:tcPr>
+          <w:p>
+            <w:pPr/>
+            <w:r>
+              <w:t xml:space="preserve">-</w:t>
+            </w:r>
+          </w:p>
+        </w:tc>
+        <w:tc>
+          <w:tcPr>
+            <w:tcW w:w="2000" w:type="dxa"/>
+          </w:tcPr>
+          <w:p>
+            <w:pPr/>
+            <w:r>
+              <w:t xml:space="preserve">NOT NULL</w:t>
+            </w:r>
+          </w:p>
+        </w:tc>
+      </w:tr>
+      <w:tr>
+        <w:trPr>
+          <w:trHeight w:val="530" w:hRule="atLeast"/>
+        </w:trPr>
+        <w:tc>
+          <w:tcPr>
+            <w:tcW w:w="2000" w:type="dxa"/>
+          </w:tcPr>
+          <w:p>
+            <w:pPr/>
+            <w:r>
+              <w:t xml:space="preserve">updated_at</w:t>
+            </w:r>
+          </w:p>
+        </w:tc>
+        <w:tc>
+          <w:tcPr>
+            <w:tcW w:w="2000" w:type="dxa"/>
+          </w:tcPr>
+          <w:p>
+            <w:pPr/>
+            <w:r>
+              <w:t xml:space="preserve">datetime2</w:t>
+            </w:r>
+          </w:p>
+        </w:tc>
+        <w:tc>
+          <w:tcPr>
+            <w:tcW w:w="2000" w:type="dxa"/>
+          </w:tcPr>
+          <w:p>
+            <w:pPr/>
+            <w:r>
+              <w:t xml:space="preserve">(6)</w:t>
+            </w:r>
+          </w:p>
+        </w:tc>
+        <w:tc>
+          <w:tcPr>
+            <w:tcW w:w="2000" w:type="dxa"/>
+          </w:tcPr>
+          <w:p>
+            <w:pPr/>
+            <w:r>
+              <w:t xml:space="preserve">IS NULL</w:t>
+            </w:r>
+          </w:p>
+        </w:tc>
+      </w:tr>
+      <w:tr>
+        <w:trPr>
+          <w:trHeight w:val="530" w:hRule="atLeast"/>
+        </w:trPr>
+        <w:tc>
+          <w:tcPr>
+            <w:tcW w:w="2000" w:type="dxa"/>
+          </w:tcPr>
+          <w:p>
+            <w:pPr/>
+            <w:r>
+              <w:t xml:space="preserve">updated_by</w:t>
+            </w:r>
+          </w:p>
+        </w:tc>
+        <w:tc>
+          <w:tcPr>
+            <w:tcW w:w="2000" w:type="dxa"/>
+          </w:tcPr>
+          <w:p>
+            <w:pPr/>
+            <w:r>
+              <w:t xml:space="preserve">bigint</w:t>
+            </w:r>
+          </w:p>
+        </w:tc>
+        <w:tc>
+          <w:tcPr>
+            <w:tcW w:w="2000" w:type="dxa"/>
+          </w:tcPr>
+          <w:p>
+            <w:pPr/>
+            <w:r>
+              <w:t xml:space="preserve">-</w:t>
+            </w:r>
+          </w:p>
+        </w:tc>
+        <w:tc>
+          <w:tcPr>
+            <w:tcW w:w="2000" w:type="dxa"/>
+          </w:tcPr>
+          <w:p>
+            <w:pPr/>
+            <w:r>
+              <w:t xml:space="preserve">IS NULL</w:t>
+            </w:r>
+          </w:p>
+        </w:tc>
+      </w:tr>
+      <w:tr>
+        <w:trPr>
+          <w:trHeight w:val="530" w:hRule="atLeast"/>
+        </w:trPr>
+        <w:tc>
+          <w:tcPr>
+            <w:tcW w:w="2000" w:type="dxa"/>
+          </w:tcPr>
+          <w:p>
+            <w:pPr/>
+            <w:r>
+              <w:t xml:space="preserve">version</w:t>
+            </w:r>
+          </w:p>
+        </w:tc>
+        <w:tc>
+          <w:tcPr>
+            <w:tcW w:w="2000" w:type="dxa"/>
+          </w:tcPr>
+          <w:p>
+            <w:pPr/>
+            <w:r>
+              <w:t xml:space="preserve">int</w:t>
+            </w:r>
+          </w:p>
+        </w:tc>
+        <w:tc>
+          <w:tcPr>
+            <w:tcW w:w="2000" w:type="dxa"/>
+          </w:tcPr>
+          <w:p>
+            <w:pPr/>
+            <w:r>
+              <w:t xml:space="preserve">-</w:t>
+            </w:r>
+          </w:p>
+        </w:tc>
+        <w:tc>
+          <w:tcPr>
+            <w:tcW w:w="2000" w:type="dxa"/>
+          </w:tcPr>
+          <w:p>
+            <w:pPr/>
+            <w:r>
+              <w:t xml:space="preserve">NOT NULL</w:t>
+            </w:r>
+          </w:p>
+        </w:tc>
+      </w:tr>
+    </w:tbl>
+    <w:p/>
+    <w:p>
+      <w:pPr/>
+      <w:r>
+        <w:t xml:space="preserve">Table Name: sys_user_role</w:t>
+      </w:r>
+    </w:p>
+    <w:p>
+      <w:pPr/>
+      <w:r>
+        <w:t xml:space="preserve">Primary Key: id</w:t>
+      </w:r>
+    </w:p>
+    <w:p>
+      <w:pPr/>
+      <w:r>
+        <w:t xml:space="preserve">Roles assigned to a user within a company.</w:t>
+      </w:r>
+    </w:p>
+    <w:tbl>
+      <w:tblPr>
+        <w:tblStyle w:val="TableGrid"/>
+        <w:tblW w:w="8000" w:type="dxa"/>
+        <w:jc w:val="left"/>
+        <w:tblBorders>
+          <w:top w:val="single" w:color="000000" w:sz="4" w:space="0"/>
+          <w:left w:val="single" w:color="000000" w:sz="4" w:space="0"/>
+          <w:bottom w:val="single" w:color="000000" w:sz="4" w:space="0"/>
+          <w:right w:val="single" w:color="000000" w:sz="4" w:space="0"/>
+          <w:insideH w:val="single" w:color="000000" w:sz="4" w:space="0"/>
+          <w:insideV w:val="single" w:color="000000" w:sz="4" w:space="0"/>
+        </w:tblBorders>
+        <w:tblLayout w:type="fixed"/>
+        <w:tblCellMar>
+          <w:top w:w="100" w:type="dxa"/>
+          <w:left w:w="100" w:type="dxa"/>
+          <w:bottom w:w="100" w:type="dxa"/>
+          <w:right w:w="100" w:type="dxa"/>
+        </w:tblCellMar>
+      </w:tblPr>
+      <w:tblGrid>
+        <w:gridCol w:w="2000"/>
+        <w:gridCol w:w="2000"/>
+        <w:gridCol w:w="2000"/>
+        <w:gridCol w:w="2000"/>
+      </w:tblGrid>
+      <w:tr>
+        <w:trPr>
+          <w:trHeight w:val="530" w:hRule="atLeast"/>
+        </w:trPr>
+        <w:tc>
+          <w:tcPr>
+            <w:tcW w:w="2000" w:type="dxa"/>
+          </w:tcPr>
+          <w:p>
+            <w:pPr>
+              <w:jc w:val="center"/>
+            </w:pPr>
+            <w:r>
+              <w:rPr>
+                <w:b/>
+              </w:rPr>
+              <w:t xml:space="preserve">Name of Attribute</w:t>
+            </w:r>
+          </w:p>
+        </w:tc>
+        <w:tc>
+          <w:tcPr>
+            <w:tcW w:w="2000" w:type="dxa"/>
+          </w:tcPr>
+          <w:p>
+            <w:pPr>
+              <w:jc w:val="center"/>
+            </w:pPr>
+            <w:r>
+              <w:rPr>
+                <w:b/>
+              </w:rPr>
+              <w:t xml:space="preserve">Data Type</w:t>
+            </w:r>
+          </w:p>
+        </w:tc>
+        <w:tc>
+          <w:tcPr>
+            <w:tcW w:w="2000" w:type="dxa"/>
+          </w:tcPr>
+          <w:p>
+            <w:pPr>
+              <w:jc w:val="center"/>
+            </w:pPr>
+            <w:r>
+              <w:rPr>
+                <w:b/>
+              </w:rPr>
+              <w:t xml:space="preserve">Size</w:t>
+            </w:r>
+          </w:p>
+        </w:tc>
+        <w:tc>
+          <w:tcPr>
+            <w:tcW w:w="2000" w:type="dxa"/>
+          </w:tcPr>
+          <w:p>
+            <w:pPr>
+              <w:jc w:val="center"/>
+            </w:pPr>
+            <w:r>
+              <w:rPr>
+                <w:b/>
+              </w:rPr>
+              <w:t xml:space="preserve">PK/FK/IS NULL/ NOT NULL</w:t>
+            </w:r>
+          </w:p>
+        </w:tc>
+      </w:tr>
+      <w:tr>
+        <w:trPr>
+          <w:trHeight w:val="530" w:hRule="atLeast"/>
+        </w:trPr>
+        <w:tc>
+          <w:tcPr>
+            <w:tcW w:w="2000" w:type="dxa"/>
+          </w:tcPr>
+          <w:p>
+            <w:pPr/>
+            <w:r>
+              <w:t xml:space="preserve">id</w:t>
+            </w:r>
+          </w:p>
+        </w:tc>
+        <w:tc>
+          <w:tcPr>
+            <w:tcW w:w="2000" w:type="dxa"/>
+          </w:tcPr>
+          <w:p>
+            <w:pPr/>
+            <w:r>
+              <w:t xml:space="preserve">bigint</w:t>
+            </w:r>
+          </w:p>
+        </w:tc>
+        <w:tc>
+          <w:tcPr>
+            <w:tcW w:w="2000" w:type="dxa"/>
+          </w:tcPr>
+          <w:p>
+            <w:pPr/>
+            <w:r>
+              <w:t xml:space="preserve">-</w:t>
+            </w:r>
+          </w:p>
+        </w:tc>
+        <w:tc>
+          <w:tcPr>
+            <w:tcW w:w="2000" w:type="dxa"/>
+          </w:tcPr>
+          <w:p>
+            <w:pPr/>
+            <w:r>
+              <w:t xml:space="preserve">PK, NOT NULL</w:t>
+            </w:r>
+          </w:p>
+        </w:tc>
+      </w:tr>
+      <w:tr>
+        <w:trPr>
+          <w:trHeight w:val="530" w:hRule="atLeast"/>
+        </w:trPr>
+        <w:tc>
+          <w:tcPr>
+            <w:tcW w:w="2000" w:type="dxa"/>
+          </w:tcPr>
+          <w:p>
+            <w:pPr/>
+            <w:r>
+              <w:t xml:space="preserve">user_id</w:t>
+            </w:r>
+          </w:p>
+        </w:tc>
+        <w:tc>
+          <w:tcPr>
+            <w:tcW w:w="2000" w:type="dxa"/>
+          </w:tcPr>
+          <w:p>
+            <w:pPr/>
+            <w:r>
+              <w:t xml:space="preserve">bigint</w:t>
+            </w:r>
+          </w:p>
+        </w:tc>
+        <w:tc>
+          <w:tcPr>
+            <w:tcW w:w="2000" w:type="dxa"/>
+          </w:tcPr>
+          <w:p>
+            <w:pPr/>
+            <w:r>
+              <w:t xml:space="preserve">-</w:t>
+            </w:r>
+          </w:p>
+        </w:tc>
+        <w:tc>
+          <w:tcPr>
+            <w:tcW w:w="2000" w:type="dxa"/>
+          </w:tcPr>
+          <w:p>
+            <w:pPr/>
+            <w:r>
+              <w:t xml:space="preserve">FK, NOT NULL</w:t>
+            </w:r>
+          </w:p>
+        </w:tc>
+      </w:tr>
+      <w:tr>
+        <w:trPr>
+          <w:trHeight w:val="530" w:hRule="atLeast"/>
+        </w:trPr>
+        <w:tc>
+          <w:tcPr>
+            <w:tcW w:w="2000" w:type="dxa"/>
+          </w:tcPr>
+          <w:p>
+            <w:pPr/>
+            <w:r>
+              <w:t xml:space="preserve">company_id</w:t>
+            </w:r>
+          </w:p>
+        </w:tc>
+        <w:tc>
+          <w:tcPr>
+            <w:tcW w:w="2000" w:type="dxa"/>
+          </w:tcPr>
+          <w:p>
+            <w:pPr/>
+            <w:r>
+              <w:t xml:space="preserve">bigint</w:t>
+            </w:r>
+          </w:p>
+        </w:tc>
+        <w:tc>
+          <w:tcPr>
+            <w:tcW w:w="2000" w:type="dxa"/>
+          </w:tcPr>
+          <w:p>
+            <w:pPr/>
+            <w:r>
+              <w:t xml:space="preserve">-</w:t>
+            </w:r>
+          </w:p>
+        </w:tc>
+        <w:tc>
+          <w:tcPr>
+            <w:tcW w:w="2000" w:type="dxa"/>
+          </w:tcPr>
+          <w:p>
+            <w:pPr/>
+            <w:r>
+              <w:t xml:space="preserve">FK, NOT NULL</w:t>
+            </w:r>
+          </w:p>
+        </w:tc>
+      </w:tr>
+      <w:tr>
+        <w:trPr>
+          <w:trHeight w:val="530" w:hRule="atLeast"/>
+        </w:trPr>
+        <w:tc>
+          <w:tcPr>
+            <w:tcW w:w="2000" w:type="dxa"/>
+          </w:tcPr>
+          <w:p>
+            <w:pPr/>
+            <w:r>
+              <w:t xml:space="preserve">role_id</w:t>
+            </w:r>
+          </w:p>
+        </w:tc>
+        <w:tc>
+          <w:tcPr>
+            <w:tcW w:w="2000" w:type="dxa"/>
+          </w:tcPr>
+          <w:p>
+            <w:pPr/>
+            <w:r>
+              <w:t xml:space="preserve">bigint</w:t>
+            </w:r>
+          </w:p>
+        </w:tc>
+        <w:tc>
+          <w:tcPr>
+            <w:tcW w:w="2000" w:type="dxa"/>
+          </w:tcPr>
+          <w:p>
+            <w:pPr/>
+            <w:r>
+              <w:t xml:space="preserve">-</w:t>
+            </w:r>
+          </w:p>
+        </w:tc>
+        <w:tc>
+          <w:tcPr>
+            <w:tcW w:w="2000" w:type="dxa"/>
+          </w:tcPr>
+          <w:p>
+            <w:pPr/>
+            <w:r>
+              <w:t xml:space="preserve">FK, NOT NULL</w:t>
+            </w:r>
+          </w:p>
+        </w:tc>
+      </w:tr>
+      <w:tr>
+        <w:trPr>
+          <w:trHeight w:val="530" w:hRule="atLeast"/>
+        </w:trPr>
+        <w:tc>
+          <w:tcPr>
+            <w:tcW w:w="2000" w:type="dxa"/>
+          </w:tcPr>
+          <w:p>
+            <w:pPr/>
+            <w:r>
+              <w:t xml:space="preserve">created_at</w:t>
+            </w:r>
+          </w:p>
+        </w:tc>
+        <w:tc>
+          <w:tcPr>
+            <w:tcW w:w="2000" w:type="dxa"/>
+          </w:tcPr>
+          <w:p>
+            <w:pPr/>
+            <w:r>
+              <w:t xml:space="preserve">datetime2</w:t>
+            </w:r>
+          </w:p>
+        </w:tc>
+        <w:tc>
+          <w:tcPr>
+            <w:tcW w:w="2000" w:type="dxa"/>
+          </w:tcPr>
+          <w:p>
+            <w:pPr/>
+            <w:r>
+              <w:t xml:space="preserve">(6)</w:t>
+            </w:r>
+          </w:p>
+        </w:tc>
+        <w:tc>
+          <w:tcPr>
+            <w:tcW w:w="2000" w:type="dxa"/>
+          </w:tcPr>
+          <w:p>
+            <w:pPr/>
+            <w:r>
+              <w:t xml:space="preserve">NOT NULL</w:t>
+            </w:r>
+          </w:p>
+        </w:tc>
+      </w:tr>
+      <w:tr>
+        <w:trPr>
+          <w:trHeight w:val="530" w:hRule="atLeast"/>
+        </w:trPr>
+        <w:tc>
+          <w:tcPr>
+            <w:tcW w:w="2000" w:type="dxa"/>
+          </w:tcPr>
+          <w:p>
+            <w:pPr/>
+            <w:r>
+              <w:t xml:space="preserve">created_by</w:t>
+            </w:r>
+          </w:p>
+        </w:tc>
+        <w:tc>
+          <w:tcPr>
+            <w:tcW w:w="2000" w:type="dxa"/>
+          </w:tcPr>
+          <w:p>
+            <w:pPr/>
+            <w:r>
+              <w:t xml:space="preserve">bigint</w:t>
+            </w:r>
+          </w:p>
+        </w:tc>
+        <w:tc>
+          <w:tcPr>
+            <w:tcW w:w="2000" w:type="dxa"/>
+          </w:tcPr>
+          <w:p>
+            <w:pPr/>
+            <w:r>
+              <w:t xml:space="preserve">-</w:t>
+            </w:r>
+          </w:p>
+        </w:tc>
+        <w:tc>
+          <w:tcPr>
+            <w:tcW w:w="2000" w:type="dxa"/>
+          </w:tcPr>
+          <w:p>
+            <w:pPr/>
+            <w:r>
+              <w:t xml:space="preserve">NOT NULL</w:t>
+            </w:r>
+          </w:p>
+        </w:tc>
+      </w:tr>
+      <w:tr>
+        <w:trPr>
+          <w:trHeight w:val="530" w:hRule="atLeast"/>
+        </w:trPr>
+        <w:tc>
+          <w:tcPr>
+            <w:tcW w:w="2000" w:type="dxa"/>
+          </w:tcPr>
+          <w:p>
+            <w:pPr/>
+            <w:r>
+              <w:t xml:space="preserve">updated_at</w:t>
+            </w:r>
+          </w:p>
+        </w:tc>
+        <w:tc>
+          <w:tcPr>
+            <w:tcW w:w="2000" w:type="dxa"/>
+          </w:tcPr>
+          <w:p>
+            <w:pPr/>
+            <w:r>
+              <w:t xml:space="preserve">datetime2</w:t>
+            </w:r>
+          </w:p>
+        </w:tc>
+        <w:tc>
+          <w:tcPr>
+            <w:tcW w:w="2000" w:type="dxa"/>
+          </w:tcPr>
+          <w:p>
+            <w:pPr/>
+            <w:r>
+              <w:t xml:space="preserve">(6)</w:t>
+            </w:r>
+          </w:p>
+        </w:tc>
+        <w:tc>
+          <w:tcPr>
+            <w:tcW w:w="2000" w:type="dxa"/>
+          </w:tcPr>
+          <w:p>
+            <w:pPr/>
+            <w:r>
+              <w:t xml:space="preserve">IS NULL</w:t>
+            </w:r>
+          </w:p>
+        </w:tc>
+      </w:tr>
+      <w:tr>
+        <w:trPr>
+          <w:trHeight w:val="530" w:hRule="atLeast"/>
+        </w:trPr>
+        <w:tc>
+          <w:tcPr>
+            <w:tcW w:w="2000" w:type="dxa"/>
+          </w:tcPr>
+          <w:p>
+            <w:pPr/>
+            <w:r>
+              <w:t xml:space="preserve">updated_by</w:t>
+            </w:r>
+          </w:p>
+        </w:tc>
+        <w:tc>
+          <w:tcPr>
+            <w:tcW w:w="2000" w:type="dxa"/>
+          </w:tcPr>
+          <w:p>
+            <w:pPr/>
+            <w:r>
+              <w:t xml:space="preserve">bigint</w:t>
+            </w:r>
+          </w:p>
+        </w:tc>
+        <w:tc>
+          <w:tcPr>
+            <w:tcW w:w="2000" w:type="dxa"/>
+          </w:tcPr>
+          <w:p>
+            <w:pPr/>
+            <w:r>
+              <w:t xml:space="preserve">-</w:t>
+            </w:r>
+          </w:p>
+        </w:tc>
+        <w:tc>
+          <w:tcPr>
+            <w:tcW w:w="2000" w:type="dxa"/>
+          </w:tcPr>
+          <w:p>
+            <w:pPr/>
+            <w:r>
+              <w:t xml:space="preserve">IS NULL</w:t>
+            </w:r>
+          </w:p>
+        </w:tc>
+      </w:tr>
+    </w:tbl>
+    <w:p/>
+    <w:p>
       <w:pPr>
         <w:pStyle w:val="Heading2"/>
       </w:pPr>
@@ -2852,8 +6078,46 @@
         <w:t xml:space="preserve">[Pending] System screenshot of Department View Interface.</w:t>
       </w:r>
     </w:p>
+    <w:p>
+      <w:pPr>
+        <w:pStyle w:val="Heading5"/>
+      </w:pPr>
+      <w:r>
+        <w:t xml:space="preserve">4.2.1.8.61 User Identity Create Interface</w:t>
+      </w:r>
+    </w:p>
+    <w:p>
+      <w:pPr>
+        <w:jc w:val="center"/>
+      </w:pPr>
+      <w:r>
+        <w:rPr>
+          <w:i/>
+        </w:rPr>
+        <w:t xml:space="preserve">[Pending] System screenshot of User Identity Create Interface.</w:t>
+      </w:r>
+    </w:p>
+    <w:p>
+      <w:pPr>
+        <w:pStyle w:val="Heading5"/>
+      </w:pPr>
+      <w:r>
+        <w:t xml:space="preserve">4.2.1.8.62 Login Interface</w:t>
+      </w:r>
+    </w:p>
+    <w:p>
+      <w:pPr>
+        <w:jc w:val="center"/>
+      </w:pPr>
+      <w:r>
+        <w:rPr>
+          <w:i/>
+        </w:rPr>
+        <w:t xml:space="preserve">[Pending] System screenshot of Login Interface.</w:t>
+      </w:r>
+    </w:p>
     <w:sectPr>
-      <w:footerReference xmlns:r="http://schemas.openxmlformats.org/officeDocument/2006/relationships" w:type="default" r:id="Rd9afeb06f9034c6b"/>
+      <w:footerReference xmlns:r="http://schemas.openxmlformats.org/officeDocument/2006/relationships" w:type="default" r:id="R1bde3bd821ce4053"/>
       <w:pgSz w:w="11906" w:h="16838"/>
       <w:pgMar w:top="1440" w:right="1440" w:bottom="1440" w:left="1440" w:header="720" w:footer="720" w:gutter="0"/>
     </w:sectPr>

</xml_diff>

<commit_message>
feat(sys): add trilingual user maintenance page
Complete WU-SYS-002 with the /sys/users page (interfaces 8.61, 8.63):
server-side paging, username search and sort, status/lock/expiry tags,
create and reset-password dialog with confirmation, activate/deactivate
and unlock, all gated by SYS.USER.* permissions with trilingual errors.
Adds 10 frontend unit tests and 5 Playwright specs, and fills the
REQ_F4118.23.5-8 data-structure trace gap.

Co-Authored-By: Claude Opus 5.5 <noreply@anthropic.com>
</commit_message>
<xml_diff>
--- a/docs/99-output/MyERP_SDS.docx
+++ b/docs/99-output/MyERP_SDS.docx
@@ -46,7 +46,7 @@
         <w:jc w:val="center"/>
       </w:pPr>
       <w:r>
-        <w:t xml:space="preserve">Date: 10 October 2026</w:t>
+        <w:t xml:space="preserve">Date: 11 October 2026</w:t>
       </w:r>
     </w:p>
     <w:p/>
@@ -6116,8 +6116,27 @@
         <w:t xml:space="preserve">[Pending] System screenshot of Login Interface.</w:t>
       </w:r>
     </w:p>
+    <w:p>
+      <w:pPr>
+        <w:pStyle w:val="Heading5"/>
+      </w:pPr>
+      <w:r>
+        <w:t xml:space="preserve">4.2.1.8.63 User Maintenance Interface</w:t>
+      </w:r>
+    </w:p>
+    <w:p>
+      <w:pPr>
+        <w:jc w:val="center"/>
+      </w:pPr>
+      <w:r>
+        <w:rPr>
+          <w:i/>
+        </w:rPr>
+        <w:t xml:space="preserve">[Pending] System screenshot of User Maintenance Interface.</w:t>
+      </w:r>
+    </w:p>
     <w:sectPr>
-      <w:footerReference xmlns:r="http://schemas.openxmlformats.org/officeDocument/2006/relationships" w:type="default" r:id="R4a2e33a83ae04344"/>
+      <w:footerReference xmlns:r="http://schemas.openxmlformats.org/officeDocument/2006/relationships" w:type="default" r:id="R5563b508336147d7"/>
       <w:pgSz w:w="11906" w:h="16838"/>
       <w:pgMar w:top="1440" w:right="1440" w:bottom="1440" w:left="1440" w:header="720" w:footer="720" w:gutter="0"/>
     </w:sectPr>

</xml_diff>

<commit_message>
docs(sys): document audit log page and complete WU-SYS-007
Co-Authored-By: Claude Opus 5.5 <noreply@anthropic.com>
</commit_message>
<xml_diff>
--- a/docs/99-output/MyERP_SDS.docx
+++ b/docs/99-output/MyERP_SDS.docx
@@ -776,8 +776,27 @@
         <w:t xml:space="preserve">[Pending] System screenshot of User Permission Edit Interface（BlueWhale 4.4.1.8.26）.</w:t>
       </w:r>
     </w:p>
+    <w:p>
+      <w:pPr>
+        <w:pStyle w:val="Heading5"/>
+      </w:pPr>
+      <w:r>
+        <w:t xml:space="preserve">4.2.1.8.66 Audit Log Query Interface</w:t>
+      </w:r>
+    </w:p>
+    <w:p>
+      <w:pPr>
+        <w:jc w:val="center"/>
+      </w:pPr>
+      <w:r>
+        <w:rPr>
+          <w:i/>
+        </w:rPr>
+        <w:t xml:space="preserve">[Pending] System screenshot of Audit Log Query Interface.</w:t>
+      </w:r>
+    </w:p>
     <w:sectPr>
-      <w:footerReference xmlns:r="http://schemas.openxmlformats.org/officeDocument/2006/relationships" w:type="default" r:id="Rbda02adcd97445c9"/>
+      <w:footerReference xmlns:r="http://schemas.openxmlformats.org/officeDocument/2006/relationships" w:type="default" r:id="R5459737e7ef549b1"/>
       <w:pgSz w:w="11906" w:h="16838"/>
       <w:pgMar w:top="1440" w:right="1440" w:bottom="1440" w:left="1440" w:header="720" w:footer="720" w:gutter="0"/>
     </w:sectPr>

</xml_diff>

<commit_message>
refactor(sys): require whole-number sequence length and document number rule page
- shared sequenceLengthValidators with integer check and step=1
- extra tests: decimal length, 404 and over-long name on edit
- ui-spec interface 8.67 (REQ_IO_A8.67.1-9), test-plan SYS-NUM-010/011,
  requirements, optimization log, trace REQ_F4118.28.6 to REQ_DS43.95
- regenerate docgen output (0 errors)

Co-Authored-By: Claude Opus 5.5 <noreply@anthropic.com>
</commit_message>
<xml_diff>
--- a/docs/99-output/MyERP_SDS.docx
+++ b/docs/99-output/MyERP_SDS.docx
@@ -795,8 +795,27 @@
         <w:t xml:space="preserve">[Pending] System screenshot of Audit Log Query Interface.</w:t>
       </w:r>
     </w:p>
+    <w:p>
+      <w:pPr>
+        <w:pStyle w:val="Heading5"/>
+      </w:pPr>
+      <w:r>
+        <w:t xml:space="preserve">4.2.1.8.67 Document Number Rule Interface</w:t>
+      </w:r>
+    </w:p>
+    <w:p>
+      <w:pPr>
+        <w:jc w:val="center"/>
+      </w:pPr>
+      <w:r>
+        <w:rPr>
+          <w:i/>
+        </w:rPr>
+        <w:t xml:space="preserve">[Pending] System screenshot of Document Number Rule Interface.</w:t>
+      </w:r>
+    </w:p>
     <w:sectPr>
-      <w:footerReference xmlns:r="http://schemas.openxmlformats.org/officeDocument/2006/relationships" w:type="default" r:id="Rb93bc44f917f43ba"/>
+      <w:footerReference xmlns:r="http://schemas.openxmlformats.org/officeDocument/2006/relationships" w:type="default" r:id="R8e934d6e991c4ad4"/>
       <w:pgSz w:w="11906" w:h="16838"/>
       <w:pgMar w:top="1440" w:right="1440" w:bottom="1440" w:left="1440" w:header="720" w:footer="720" w:gutter="0"/>
     </w:sectPr>

</xml_diff>

<commit_message>
feat(sys): add trilingual approval flow, delegation and inbox pages (WU-SYS-009 part 2)
Interfaces 8.68-8.70: multi-step flow editor with role/user approvers
and amount thresholds, delegation maintenance, and an approval inbox
with approve/reject and history. Menu items accept any of several
permissions; tasks now return the delegator username.

Co-Authored-By: Claude Opus 5.5 <noreply@anthropic.com>
</commit_message>
<xml_diff>
--- a/docs/99-output/MyERP_SDS.docx
+++ b/docs/99-output/MyERP_SDS.docx
@@ -814,8 +814,65 @@
         <w:t xml:space="preserve">[Pending] System screenshot of Document Number Rule Interface.</w:t>
       </w:r>
     </w:p>
+    <w:p>
+      <w:pPr>
+        <w:pStyle w:val="Heading5"/>
+      </w:pPr>
+      <w:r>
+        <w:t xml:space="preserve">4.2.1.8.68 Approval Flow Maintenance Interface</w:t>
+      </w:r>
+    </w:p>
+    <w:p>
+      <w:pPr>
+        <w:jc w:val="center"/>
+      </w:pPr>
+      <w:r>
+        <w:rPr>
+          <w:i/>
+        </w:rPr>
+        <w:t xml:space="preserve">[Pending] System screenshot of Approval Flow Maintenance Interface.</w:t>
+      </w:r>
+    </w:p>
+    <w:p>
+      <w:pPr>
+        <w:pStyle w:val="Heading5"/>
+      </w:pPr>
+      <w:r>
+        <w:t xml:space="preserve">4.2.1.8.69 Approval Delegation Interface</w:t>
+      </w:r>
+    </w:p>
+    <w:p>
+      <w:pPr>
+        <w:jc w:val="center"/>
+      </w:pPr>
+      <w:r>
+        <w:rPr>
+          <w:i/>
+        </w:rPr>
+        <w:t xml:space="preserve">[Pending] System screenshot of Approval Delegation Interface.</w:t>
+      </w:r>
+    </w:p>
+    <w:p>
+      <w:pPr>
+        <w:pStyle w:val="Heading5"/>
+      </w:pPr>
+      <w:r>
+        <w:t xml:space="preserve">4.2.1.8.70 Approval Inbox Interface</w:t>
+      </w:r>
+    </w:p>
+    <w:p>
+      <w:pPr>
+        <w:jc w:val="center"/>
+      </w:pPr>
+      <w:r>
+        <w:rPr>
+          <w:i/>
+        </w:rPr>
+        <w:t xml:space="preserve">[Pending] System screenshot of Approval Inbox Interface.</w:t>
+      </w:r>
+    </w:p>
     <w:sectPr>
-      <w:footerReference xmlns:r="http://schemas.openxmlformats.org/officeDocument/2006/relationships" w:type="default" r:id="R8e934d6e991c4ad4"/>
+      <w:footerReference xmlns:r="http://schemas.openxmlformats.org/officeDocument/2006/relationships" w:type="default" r:id="R2962f7f0433f4ba5"/>
       <w:pgSz w:w="11906" w:h="16838"/>
       <w:pgMar w:top="1440" w:right="1440" w:bottom="1440" w:left="1440" w:header="720" w:footer="720" w:gutter="0"/>
     </w:sectPr>

</xml_diff>

<commit_message>
feat(sys): add IP whitelist backend and access enforcement
</commit_message>
<xml_diff>
--- a/docs/99-output/MyERP_SDS.docx
+++ b/docs/99-output/MyERP_SDS.docx
@@ -7751,6 +7751,808 @@
             <w:pPr/>
             <w:r>
               <w:t xml:space="preserve">bit</w:t>
+            </w:r>
+          </w:p>
+        </w:tc>
+        <w:tc>
+          <w:tcPr>
+            <w:tcW w:w="2000" w:type="dxa"/>
+          </w:tcPr>
+          <w:p>
+            <w:pPr/>
+            <w:r>
+              <w:t xml:space="preserve">-</w:t>
+            </w:r>
+          </w:p>
+        </w:tc>
+        <w:tc>
+          <w:tcPr>
+            <w:tcW w:w="2000" w:type="dxa"/>
+          </w:tcPr>
+          <w:p>
+            <w:pPr/>
+            <w:r>
+              <w:t xml:space="preserve">NOT NULL</w:t>
+            </w:r>
+          </w:p>
+        </w:tc>
+      </w:tr>
+    </w:tbl>
+    <w:p/>
+    <w:p>
+      <w:pPr/>
+      <w:r>
+        <w:t xml:space="preserve">Table Name: sys_ip_whitelist</w:t>
+      </w:r>
+    </w:p>
+    <w:p>
+      <w:pPr/>
+      <w:r>
+        <w:t xml:space="preserve">Primary Key: id</w:t>
+      </w:r>
+    </w:p>
+    <w:p>
+      <w:pPr/>
+      <w:r>
+        <w:t xml:space="preserve">System-wide IP ranges scoped to the system, a role, or a user, with inclusive effective dates and audit/version fields.</w:t>
+      </w:r>
+    </w:p>
+    <w:tbl>
+      <w:tblPr>
+        <w:tblStyle w:val="TableGrid"/>
+        <w:tblW w:w="8000" w:type="dxa"/>
+        <w:jc w:val="left"/>
+        <w:tblBorders>
+          <w:top w:val="single" w:color="000000" w:sz="4" w:space="0"/>
+          <w:left w:val="single" w:color="000000" w:sz="4" w:space="0"/>
+          <w:bottom w:val="single" w:color="000000" w:sz="4" w:space="0"/>
+          <w:right w:val="single" w:color="000000" w:sz="4" w:space="0"/>
+          <w:insideH w:val="single" w:color="000000" w:sz="4" w:space="0"/>
+          <w:insideV w:val="single" w:color="000000" w:sz="4" w:space="0"/>
+        </w:tblBorders>
+        <w:tblLayout w:type="fixed"/>
+        <w:tblCellMar>
+          <w:top w:w="100" w:type="dxa"/>
+          <w:left w:w="100" w:type="dxa"/>
+          <w:bottom w:w="100" w:type="dxa"/>
+          <w:right w:w="100" w:type="dxa"/>
+        </w:tblCellMar>
+      </w:tblPr>
+      <w:tblGrid>
+        <w:gridCol w:w="2000"/>
+        <w:gridCol w:w="2000"/>
+        <w:gridCol w:w="2000"/>
+        <w:gridCol w:w="2000"/>
+      </w:tblGrid>
+      <w:tr>
+        <w:trPr>
+          <w:trHeight w:val="530" w:hRule="atLeast"/>
+        </w:trPr>
+        <w:tc>
+          <w:tcPr>
+            <w:tcW w:w="2000" w:type="dxa"/>
+          </w:tcPr>
+          <w:p>
+            <w:pPr>
+              <w:jc w:val="center"/>
+            </w:pPr>
+            <w:r>
+              <w:rPr>
+                <w:b/>
+              </w:rPr>
+              <w:t xml:space="preserve">Name of Attribute</w:t>
+            </w:r>
+          </w:p>
+        </w:tc>
+        <w:tc>
+          <w:tcPr>
+            <w:tcW w:w="2000" w:type="dxa"/>
+          </w:tcPr>
+          <w:p>
+            <w:pPr>
+              <w:jc w:val="center"/>
+            </w:pPr>
+            <w:r>
+              <w:rPr>
+                <w:b/>
+              </w:rPr>
+              <w:t xml:space="preserve">Data Type</w:t>
+            </w:r>
+          </w:p>
+        </w:tc>
+        <w:tc>
+          <w:tcPr>
+            <w:tcW w:w="2000" w:type="dxa"/>
+          </w:tcPr>
+          <w:p>
+            <w:pPr>
+              <w:jc w:val="center"/>
+            </w:pPr>
+            <w:r>
+              <w:rPr>
+                <w:b/>
+              </w:rPr>
+              <w:t xml:space="preserve">Size</w:t>
+            </w:r>
+          </w:p>
+        </w:tc>
+        <w:tc>
+          <w:tcPr>
+            <w:tcW w:w="2000" w:type="dxa"/>
+          </w:tcPr>
+          <w:p>
+            <w:pPr>
+              <w:jc w:val="center"/>
+            </w:pPr>
+            <w:r>
+              <w:rPr>
+                <w:b/>
+              </w:rPr>
+              <w:t xml:space="preserve">PK/FK/IS NULL/ NOT NULL</w:t>
+            </w:r>
+          </w:p>
+        </w:tc>
+      </w:tr>
+      <w:tr>
+        <w:trPr>
+          <w:trHeight w:val="530" w:hRule="atLeast"/>
+        </w:trPr>
+        <w:tc>
+          <w:tcPr>
+            <w:tcW w:w="2000" w:type="dxa"/>
+          </w:tcPr>
+          <w:p>
+            <w:pPr/>
+            <w:r>
+              <w:t xml:space="preserve">id</w:t>
+            </w:r>
+          </w:p>
+        </w:tc>
+        <w:tc>
+          <w:tcPr>
+            <w:tcW w:w="2000" w:type="dxa"/>
+          </w:tcPr>
+          <w:p>
+            <w:pPr/>
+            <w:r>
+              <w:t xml:space="preserve">bigint</w:t>
+            </w:r>
+          </w:p>
+        </w:tc>
+        <w:tc>
+          <w:tcPr>
+            <w:tcW w:w="2000" w:type="dxa"/>
+          </w:tcPr>
+          <w:p>
+            <w:pPr/>
+            <w:r>
+              <w:t xml:space="preserve">-</w:t>
+            </w:r>
+          </w:p>
+        </w:tc>
+        <w:tc>
+          <w:tcPr>
+            <w:tcW w:w="2000" w:type="dxa"/>
+          </w:tcPr>
+          <w:p>
+            <w:pPr/>
+            <w:r>
+              <w:t xml:space="preserve">PK, NOT NULL</w:t>
+            </w:r>
+          </w:p>
+        </w:tc>
+      </w:tr>
+      <w:tr>
+        <w:trPr>
+          <w:trHeight w:val="530" w:hRule="atLeast"/>
+        </w:trPr>
+        <w:tc>
+          <w:tcPr>
+            <w:tcW w:w="2000" w:type="dxa"/>
+          </w:tcPr>
+          <w:p>
+            <w:pPr/>
+            <w:r>
+              <w:t xml:space="preserve">scope</w:t>
+            </w:r>
+          </w:p>
+        </w:tc>
+        <w:tc>
+          <w:tcPr>
+            <w:tcW w:w="2000" w:type="dxa"/>
+          </w:tcPr>
+          <w:p>
+            <w:pPr/>
+            <w:r>
+              <w:t xml:space="preserve">varchar</w:t>
+            </w:r>
+          </w:p>
+        </w:tc>
+        <w:tc>
+          <w:tcPr>
+            <w:tcW w:w="2000" w:type="dxa"/>
+          </w:tcPr>
+          <w:p>
+            <w:pPr/>
+            <w:r>
+              <w:t xml:space="preserve">10</w:t>
+            </w:r>
+          </w:p>
+        </w:tc>
+        <w:tc>
+          <w:tcPr>
+            <w:tcW w:w="2000" w:type="dxa"/>
+          </w:tcPr>
+          <w:p>
+            <w:pPr/>
+            <w:r>
+              <w:t xml:space="preserve">NOT NULL</w:t>
+            </w:r>
+          </w:p>
+        </w:tc>
+      </w:tr>
+      <w:tr>
+        <w:trPr>
+          <w:trHeight w:val="530" w:hRule="atLeast"/>
+        </w:trPr>
+        <w:tc>
+          <w:tcPr>
+            <w:tcW w:w="2000" w:type="dxa"/>
+          </w:tcPr>
+          <w:p>
+            <w:pPr/>
+            <w:r>
+              <w:t xml:space="preserve">role_id</w:t>
+            </w:r>
+          </w:p>
+        </w:tc>
+        <w:tc>
+          <w:tcPr>
+            <w:tcW w:w="2000" w:type="dxa"/>
+          </w:tcPr>
+          <w:p>
+            <w:pPr/>
+            <w:r>
+              <w:t xml:space="preserve">bigint</w:t>
+            </w:r>
+          </w:p>
+        </w:tc>
+        <w:tc>
+          <w:tcPr>
+            <w:tcW w:w="2000" w:type="dxa"/>
+          </w:tcPr>
+          <w:p>
+            <w:pPr/>
+            <w:r>
+              <w:t xml:space="preserve">-</w:t>
+            </w:r>
+          </w:p>
+        </w:tc>
+        <w:tc>
+          <w:tcPr>
+            <w:tcW w:w="2000" w:type="dxa"/>
+          </w:tcPr>
+          <w:p>
+            <w:pPr/>
+            <w:r>
+              <w:t xml:space="preserve">FK, IS NULL</w:t>
+            </w:r>
+          </w:p>
+        </w:tc>
+      </w:tr>
+      <w:tr>
+        <w:trPr>
+          <w:trHeight w:val="530" w:hRule="atLeast"/>
+        </w:trPr>
+        <w:tc>
+          <w:tcPr>
+            <w:tcW w:w="2000" w:type="dxa"/>
+          </w:tcPr>
+          <w:p>
+            <w:pPr/>
+            <w:r>
+              <w:t xml:space="preserve">user_id</w:t>
+            </w:r>
+          </w:p>
+        </w:tc>
+        <w:tc>
+          <w:tcPr>
+            <w:tcW w:w="2000" w:type="dxa"/>
+          </w:tcPr>
+          <w:p>
+            <w:pPr/>
+            <w:r>
+              <w:t xml:space="preserve">bigint</w:t>
+            </w:r>
+          </w:p>
+        </w:tc>
+        <w:tc>
+          <w:tcPr>
+            <w:tcW w:w="2000" w:type="dxa"/>
+          </w:tcPr>
+          <w:p>
+            <w:pPr/>
+            <w:r>
+              <w:t xml:space="preserve">-</w:t>
+            </w:r>
+          </w:p>
+        </w:tc>
+        <w:tc>
+          <w:tcPr>
+            <w:tcW w:w="2000" w:type="dxa"/>
+          </w:tcPr>
+          <w:p>
+            <w:pPr/>
+            <w:r>
+              <w:t xml:space="preserve">FK, IS NULL</w:t>
+            </w:r>
+          </w:p>
+        </w:tc>
+      </w:tr>
+      <w:tr>
+        <w:trPr>
+          <w:trHeight w:val="530" w:hRule="atLeast"/>
+        </w:trPr>
+        <w:tc>
+          <w:tcPr>
+            <w:tcW w:w="2000" w:type="dxa"/>
+          </w:tcPr>
+          <w:p>
+            <w:pPr/>
+            <w:r>
+              <w:t xml:space="preserve">ip_range</w:t>
+            </w:r>
+          </w:p>
+        </w:tc>
+        <w:tc>
+          <w:tcPr>
+            <w:tcW w:w="2000" w:type="dxa"/>
+          </w:tcPr>
+          <w:p>
+            <w:pPr/>
+            <w:r>
+              <w:t xml:space="preserve">varchar</w:t>
+            </w:r>
+          </w:p>
+        </w:tc>
+        <w:tc>
+          <w:tcPr>
+            <w:tcW w:w="2000" w:type="dxa"/>
+          </w:tcPr>
+          <w:p>
+            <w:pPr/>
+            <w:r>
+              <w:t xml:space="preserve">43</w:t>
+            </w:r>
+          </w:p>
+        </w:tc>
+        <w:tc>
+          <w:tcPr>
+            <w:tcW w:w="2000" w:type="dxa"/>
+          </w:tcPr>
+          <w:p>
+            <w:pPr/>
+            <w:r>
+              <w:t xml:space="preserve">NOT NULL</w:t>
+            </w:r>
+          </w:p>
+        </w:tc>
+      </w:tr>
+      <w:tr>
+        <w:trPr>
+          <w:trHeight w:val="530" w:hRule="atLeast"/>
+        </w:trPr>
+        <w:tc>
+          <w:tcPr>
+            <w:tcW w:w="2000" w:type="dxa"/>
+          </w:tcPr>
+          <w:p>
+            <w:pPr/>
+            <w:r>
+              <w:t xml:space="preserve">description</w:t>
+            </w:r>
+          </w:p>
+        </w:tc>
+        <w:tc>
+          <w:tcPr>
+            <w:tcW w:w="2000" w:type="dxa"/>
+          </w:tcPr>
+          <w:p>
+            <w:pPr/>
+            <w:r>
+              <w:t xml:space="preserve">nvarchar</w:t>
+            </w:r>
+          </w:p>
+        </w:tc>
+        <w:tc>
+          <w:tcPr>
+            <w:tcW w:w="2000" w:type="dxa"/>
+          </w:tcPr>
+          <w:p>
+            <w:pPr/>
+            <w:r>
+              <w:t xml:space="preserve">200</w:t>
+            </w:r>
+          </w:p>
+        </w:tc>
+        <w:tc>
+          <w:tcPr>
+            <w:tcW w:w="2000" w:type="dxa"/>
+          </w:tcPr>
+          <w:p>
+            <w:pPr/>
+            <w:r>
+              <w:t xml:space="preserve">IS NULL</w:t>
+            </w:r>
+          </w:p>
+        </w:tc>
+      </w:tr>
+      <w:tr>
+        <w:trPr>
+          <w:trHeight w:val="530" w:hRule="atLeast"/>
+        </w:trPr>
+        <w:tc>
+          <w:tcPr>
+            <w:tcW w:w="2000" w:type="dxa"/>
+          </w:tcPr>
+          <w:p>
+            <w:pPr/>
+            <w:r>
+              <w:t xml:space="preserve">valid_from</w:t>
+            </w:r>
+          </w:p>
+        </w:tc>
+        <w:tc>
+          <w:tcPr>
+            <w:tcW w:w="2000" w:type="dxa"/>
+          </w:tcPr>
+          <w:p>
+            <w:pPr/>
+            <w:r>
+              <w:t xml:space="preserve">date</w:t>
+            </w:r>
+          </w:p>
+        </w:tc>
+        <w:tc>
+          <w:tcPr>
+            <w:tcW w:w="2000" w:type="dxa"/>
+          </w:tcPr>
+          <w:p>
+            <w:pPr/>
+            <w:r>
+              <w:t xml:space="preserve">-</w:t>
+            </w:r>
+          </w:p>
+        </w:tc>
+        <w:tc>
+          <w:tcPr>
+            <w:tcW w:w="2000" w:type="dxa"/>
+          </w:tcPr>
+          <w:p>
+            <w:pPr/>
+            <w:r>
+              <w:t xml:space="preserve">IS NULL</w:t>
+            </w:r>
+          </w:p>
+        </w:tc>
+      </w:tr>
+      <w:tr>
+        <w:trPr>
+          <w:trHeight w:val="530" w:hRule="atLeast"/>
+        </w:trPr>
+        <w:tc>
+          <w:tcPr>
+            <w:tcW w:w="2000" w:type="dxa"/>
+          </w:tcPr>
+          <w:p>
+            <w:pPr/>
+            <w:r>
+              <w:t xml:space="preserve">valid_to</w:t>
+            </w:r>
+          </w:p>
+        </w:tc>
+        <w:tc>
+          <w:tcPr>
+            <w:tcW w:w="2000" w:type="dxa"/>
+          </w:tcPr>
+          <w:p>
+            <w:pPr/>
+            <w:r>
+              <w:t xml:space="preserve">date</w:t>
+            </w:r>
+          </w:p>
+        </w:tc>
+        <w:tc>
+          <w:tcPr>
+            <w:tcW w:w="2000" w:type="dxa"/>
+          </w:tcPr>
+          <w:p>
+            <w:pPr/>
+            <w:r>
+              <w:t xml:space="preserve">-</w:t>
+            </w:r>
+          </w:p>
+        </w:tc>
+        <w:tc>
+          <w:tcPr>
+            <w:tcW w:w="2000" w:type="dxa"/>
+          </w:tcPr>
+          <w:p>
+            <w:pPr/>
+            <w:r>
+              <w:t xml:space="preserve">IS NULL</w:t>
+            </w:r>
+          </w:p>
+        </w:tc>
+      </w:tr>
+      <w:tr>
+        <w:trPr>
+          <w:trHeight w:val="530" w:hRule="atLeast"/>
+        </w:trPr>
+        <w:tc>
+          <w:tcPr>
+            <w:tcW w:w="2000" w:type="dxa"/>
+          </w:tcPr>
+          <w:p>
+            <w:pPr/>
+            <w:r>
+              <w:t xml:space="preserve">is_active</w:t>
+            </w:r>
+          </w:p>
+        </w:tc>
+        <w:tc>
+          <w:tcPr>
+            <w:tcW w:w="2000" w:type="dxa"/>
+          </w:tcPr>
+          <w:p>
+            <w:pPr/>
+            <w:r>
+              <w:t xml:space="preserve">bit</w:t>
+            </w:r>
+          </w:p>
+        </w:tc>
+        <w:tc>
+          <w:tcPr>
+            <w:tcW w:w="2000" w:type="dxa"/>
+          </w:tcPr>
+          <w:p>
+            <w:pPr/>
+            <w:r>
+              <w:t xml:space="preserve">-</w:t>
+            </w:r>
+          </w:p>
+        </w:tc>
+        <w:tc>
+          <w:tcPr>
+            <w:tcW w:w="2000" w:type="dxa"/>
+          </w:tcPr>
+          <w:p>
+            <w:pPr/>
+            <w:r>
+              <w:t xml:space="preserve">NOT NULL</w:t>
+            </w:r>
+          </w:p>
+        </w:tc>
+      </w:tr>
+      <w:tr>
+        <w:trPr>
+          <w:trHeight w:val="530" w:hRule="atLeast"/>
+        </w:trPr>
+        <w:tc>
+          <w:tcPr>
+            <w:tcW w:w="2000" w:type="dxa"/>
+          </w:tcPr>
+          <w:p>
+            <w:pPr/>
+            <w:r>
+              <w:t xml:space="preserve">created_at</w:t>
+            </w:r>
+          </w:p>
+        </w:tc>
+        <w:tc>
+          <w:tcPr>
+            <w:tcW w:w="2000" w:type="dxa"/>
+          </w:tcPr>
+          <w:p>
+            <w:pPr/>
+            <w:r>
+              <w:t xml:space="preserve">datetime2</w:t>
+            </w:r>
+          </w:p>
+        </w:tc>
+        <w:tc>
+          <w:tcPr>
+            <w:tcW w:w="2000" w:type="dxa"/>
+          </w:tcPr>
+          <w:p>
+            <w:pPr/>
+            <w:r>
+              <w:t xml:space="preserve">(6)</w:t>
+            </w:r>
+          </w:p>
+        </w:tc>
+        <w:tc>
+          <w:tcPr>
+            <w:tcW w:w="2000" w:type="dxa"/>
+          </w:tcPr>
+          <w:p>
+            <w:pPr/>
+            <w:r>
+              <w:t xml:space="preserve">NOT NULL</w:t>
+            </w:r>
+          </w:p>
+        </w:tc>
+      </w:tr>
+      <w:tr>
+        <w:trPr>
+          <w:trHeight w:val="530" w:hRule="atLeast"/>
+        </w:trPr>
+        <w:tc>
+          <w:tcPr>
+            <w:tcW w:w="2000" w:type="dxa"/>
+          </w:tcPr>
+          <w:p>
+            <w:pPr/>
+            <w:r>
+              <w:t xml:space="preserve">created_by</w:t>
+            </w:r>
+          </w:p>
+        </w:tc>
+        <w:tc>
+          <w:tcPr>
+            <w:tcW w:w="2000" w:type="dxa"/>
+          </w:tcPr>
+          <w:p>
+            <w:pPr/>
+            <w:r>
+              <w:t xml:space="preserve">bigint</w:t>
+            </w:r>
+          </w:p>
+        </w:tc>
+        <w:tc>
+          <w:tcPr>
+            <w:tcW w:w="2000" w:type="dxa"/>
+          </w:tcPr>
+          <w:p>
+            <w:pPr/>
+            <w:r>
+              <w:t xml:space="preserve">-</w:t>
+            </w:r>
+          </w:p>
+        </w:tc>
+        <w:tc>
+          <w:tcPr>
+            <w:tcW w:w="2000" w:type="dxa"/>
+          </w:tcPr>
+          <w:p>
+            <w:pPr/>
+            <w:r>
+              <w:t xml:space="preserve">NOT NULL</w:t>
+            </w:r>
+          </w:p>
+        </w:tc>
+      </w:tr>
+      <w:tr>
+        <w:trPr>
+          <w:trHeight w:val="530" w:hRule="atLeast"/>
+        </w:trPr>
+        <w:tc>
+          <w:tcPr>
+            <w:tcW w:w="2000" w:type="dxa"/>
+          </w:tcPr>
+          <w:p>
+            <w:pPr/>
+            <w:r>
+              <w:t xml:space="preserve">updated_at</w:t>
+            </w:r>
+          </w:p>
+        </w:tc>
+        <w:tc>
+          <w:tcPr>
+            <w:tcW w:w="2000" w:type="dxa"/>
+          </w:tcPr>
+          <w:p>
+            <w:pPr/>
+            <w:r>
+              <w:t xml:space="preserve">datetime2</w:t>
+            </w:r>
+          </w:p>
+        </w:tc>
+        <w:tc>
+          <w:tcPr>
+            <w:tcW w:w="2000" w:type="dxa"/>
+          </w:tcPr>
+          <w:p>
+            <w:pPr/>
+            <w:r>
+              <w:t xml:space="preserve">(6)</w:t>
+            </w:r>
+          </w:p>
+        </w:tc>
+        <w:tc>
+          <w:tcPr>
+            <w:tcW w:w="2000" w:type="dxa"/>
+          </w:tcPr>
+          <w:p>
+            <w:pPr/>
+            <w:r>
+              <w:t xml:space="preserve">IS NULL</w:t>
+            </w:r>
+          </w:p>
+        </w:tc>
+      </w:tr>
+      <w:tr>
+        <w:trPr>
+          <w:trHeight w:val="530" w:hRule="atLeast"/>
+        </w:trPr>
+        <w:tc>
+          <w:tcPr>
+            <w:tcW w:w="2000" w:type="dxa"/>
+          </w:tcPr>
+          <w:p>
+            <w:pPr/>
+            <w:r>
+              <w:t xml:space="preserve">updated_by</w:t>
+            </w:r>
+          </w:p>
+        </w:tc>
+        <w:tc>
+          <w:tcPr>
+            <w:tcW w:w="2000" w:type="dxa"/>
+          </w:tcPr>
+          <w:p>
+            <w:pPr/>
+            <w:r>
+              <w:t xml:space="preserve">bigint</w:t>
+            </w:r>
+          </w:p>
+        </w:tc>
+        <w:tc>
+          <w:tcPr>
+            <w:tcW w:w="2000" w:type="dxa"/>
+          </w:tcPr>
+          <w:p>
+            <w:pPr/>
+            <w:r>
+              <w:t xml:space="preserve">-</w:t>
+            </w:r>
+          </w:p>
+        </w:tc>
+        <w:tc>
+          <w:tcPr>
+            <w:tcW w:w="2000" w:type="dxa"/>
+          </w:tcPr>
+          <w:p>
+            <w:pPr/>
+            <w:r>
+              <w:t xml:space="preserve">IS NULL</w:t>
+            </w:r>
+          </w:p>
+        </w:tc>
+      </w:tr>
+      <w:tr>
+        <w:trPr>
+          <w:trHeight w:val="530" w:hRule="atLeast"/>
+        </w:trPr>
+        <w:tc>
+          <w:tcPr>
+            <w:tcW w:w="2000" w:type="dxa"/>
+          </w:tcPr>
+          <w:p>
+            <w:pPr/>
+            <w:r>
+              <w:t xml:space="preserve">version</w:t>
+            </w:r>
+          </w:p>
+        </w:tc>
+        <w:tc>
+          <w:tcPr>
+            <w:tcW w:w="2000" w:type="dxa"/>
+          </w:tcPr>
+          <w:p>
+            <w:pPr/>
+            <w:r>
+              <w:t xml:space="preserve">int</w:t>
             </w:r>
           </w:p>
         </w:tc>
@@ -12761,7 +13563,7 @@
       </w:r>
     </w:p>
     <w:sectPr>
-      <w:footerReference xmlns:r="http://schemas.openxmlformats.org/officeDocument/2006/relationships" w:type="default" r:id="R8a209513858042c1"/>
+      <w:footerReference xmlns:r="http://schemas.openxmlformats.org/officeDocument/2006/relationships" w:type="default" r:id="R860a9a1c04f3459d"/>
       <w:pgSz w:w="11906" w:h="16838"/>
       <w:pgMar w:top="1440" w:right="1440" w:bottom="1440" w:left="1440" w:header="720" w:footer="720" w:gutter="0"/>
     </w:sectPr>

</xml_diff>

<commit_message>
feat(sys): add self-service password change and refresh revocation
</commit_message>
<xml_diff>
--- a/docs/99-output/MyERP_SDS.docx
+++ b/docs/99-output/MyERP_SDS.docx
@@ -6980,6 +6980,808 @@
     <w:p>
       <w:pPr/>
       <w:r>
+        <w:t xml:space="preserve">Table Name: sys_company_image</w:t>
+      </w:r>
+    </w:p>
+    <w:p>
+      <w:pPr/>
+      <w:r>
+        <w:t xml:space="preserve">Primary Key: id</w:t>
+      </w:r>
+    </w:p>
+    <w:p>
+      <w:pPr/>
+      <w:r>
+        <w:t xml:space="preserve">Company logo and stamp images (one per kind per company) stored as binary with content-detected type, original file name, size, dimensions and audit/version fields.</w:t>
+      </w:r>
+    </w:p>
+    <w:tbl>
+      <w:tblPr>
+        <w:tblStyle w:val="TableGrid"/>
+        <w:tblW w:w="8000" w:type="dxa"/>
+        <w:jc w:val="left"/>
+        <w:tblBorders>
+          <w:top w:val="single" w:color="000000" w:sz="4" w:space="0"/>
+          <w:left w:val="single" w:color="000000" w:sz="4" w:space="0"/>
+          <w:bottom w:val="single" w:color="000000" w:sz="4" w:space="0"/>
+          <w:right w:val="single" w:color="000000" w:sz="4" w:space="0"/>
+          <w:insideH w:val="single" w:color="000000" w:sz="4" w:space="0"/>
+          <w:insideV w:val="single" w:color="000000" w:sz="4" w:space="0"/>
+        </w:tblBorders>
+        <w:tblLayout w:type="fixed"/>
+        <w:tblCellMar>
+          <w:top w:w="100" w:type="dxa"/>
+          <w:left w:w="100" w:type="dxa"/>
+          <w:bottom w:w="100" w:type="dxa"/>
+          <w:right w:w="100" w:type="dxa"/>
+        </w:tblCellMar>
+      </w:tblPr>
+      <w:tblGrid>
+        <w:gridCol w:w="2000"/>
+        <w:gridCol w:w="2000"/>
+        <w:gridCol w:w="2000"/>
+        <w:gridCol w:w="2000"/>
+      </w:tblGrid>
+      <w:tr>
+        <w:trPr>
+          <w:trHeight w:val="530" w:hRule="atLeast"/>
+        </w:trPr>
+        <w:tc>
+          <w:tcPr>
+            <w:tcW w:w="2000" w:type="dxa"/>
+          </w:tcPr>
+          <w:p>
+            <w:pPr>
+              <w:jc w:val="center"/>
+            </w:pPr>
+            <w:r>
+              <w:rPr>
+                <w:b/>
+              </w:rPr>
+              <w:t xml:space="preserve">Name of Attribute</w:t>
+            </w:r>
+          </w:p>
+        </w:tc>
+        <w:tc>
+          <w:tcPr>
+            <w:tcW w:w="2000" w:type="dxa"/>
+          </w:tcPr>
+          <w:p>
+            <w:pPr>
+              <w:jc w:val="center"/>
+            </w:pPr>
+            <w:r>
+              <w:rPr>
+                <w:b/>
+              </w:rPr>
+              <w:t xml:space="preserve">Data Type</w:t>
+            </w:r>
+          </w:p>
+        </w:tc>
+        <w:tc>
+          <w:tcPr>
+            <w:tcW w:w="2000" w:type="dxa"/>
+          </w:tcPr>
+          <w:p>
+            <w:pPr>
+              <w:jc w:val="center"/>
+            </w:pPr>
+            <w:r>
+              <w:rPr>
+                <w:b/>
+              </w:rPr>
+              <w:t xml:space="preserve">Size</w:t>
+            </w:r>
+          </w:p>
+        </w:tc>
+        <w:tc>
+          <w:tcPr>
+            <w:tcW w:w="2000" w:type="dxa"/>
+          </w:tcPr>
+          <w:p>
+            <w:pPr>
+              <w:jc w:val="center"/>
+            </w:pPr>
+            <w:r>
+              <w:rPr>
+                <w:b/>
+              </w:rPr>
+              <w:t xml:space="preserve">PK/FK/IS NULL/ NOT NULL</w:t>
+            </w:r>
+          </w:p>
+        </w:tc>
+      </w:tr>
+      <w:tr>
+        <w:trPr>
+          <w:trHeight w:val="530" w:hRule="atLeast"/>
+        </w:trPr>
+        <w:tc>
+          <w:tcPr>
+            <w:tcW w:w="2000" w:type="dxa"/>
+          </w:tcPr>
+          <w:p>
+            <w:pPr/>
+            <w:r>
+              <w:t xml:space="preserve">id</w:t>
+            </w:r>
+          </w:p>
+        </w:tc>
+        <w:tc>
+          <w:tcPr>
+            <w:tcW w:w="2000" w:type="dxa"/>
+          </w:tcPr>
+          <w:p>
+            <w:pPr/>
+            <w:r>
+              <w:t xml:space="preserve">bigint</w:t>
+            </w:r>
+          </w:p>
+        </w:tc>
+        <w:tc>
+          <w:tcPr>
+            <w:tcW w:w="2000" w:type="dxa"/>
+          </w:tcPr>
+          <w:p>
+            <w:pPr/>
+            <w:r>
+              <w:t xml:space="preserve">-</w:t>
+            </w:r>
+          </w:p>
+        </w:tc>
+        <w:tc>
+          <w:tcPr>
+            <w:tcW w:w="2000" w:type="dxa"/>
+          </w:tcPr>
+          <w:p>
+            <w:pPr/>
+            <w:r>
+              <w:t xml:space="preserve">PK, NOT NULL</w:t>
+            </w:r>
+          </w:p>
+        </w:tc>
+      </w:tr>
+      <w:tr>
+        <w:trPr>
+          <w:trHeight w:val="530" w:hRule="atLeast"/>
+        </w:trPr>
+        <w:tc>
+          <w:tcPr>
+            <w:tcW w:w="2000" w:type="dxa"/>
+          </w:tcPr>
+          <w:p>
+            <w:pPr/>
+            <w:r>
+              <w:t xml:space="preserve">image_kind</w:t>
+            </w:r>
+          </w:p>
+        </w:tc>
+        <w:tc>
+          <w:tcPr>
+            <w:tcW w:w="2000" w:type="dxa"/>
+          </w:tcPr>
+          <w:p>
+            <w:pPr/>
+            <w:r>
+              <w:t xml:space="preserve">varchar</w:t>
+            </w:r>
+          </w:p>
+        </w:tc>
+        <w:tc>
+          <w:tcPr>
+            <w:tcW w:w="2000" w:type="dxa"/>
+          </w:tcPr>
+          <w:p>
+            <w:pPr/>
+            <w:r>
+              <w:t xml:space="preserve">10</w:t>
+            </w:r>
+          </w:p>
+        </w:tc>
+        <w:tc>
+          <w:tcPr>
+            <w:tcW w:w="2000" w:type="dxa"/>
+          </w:tcPr>
+          <w:p>
+            <w:pPr/>
+            <w:r>
+              <w:t xml:space="preserve">NOT NULL</w:t>
+            </w:r>
+          </w:p>
+        </w:tc>
+      </w:tr>
+      <w:tr>
+        <w:trPr>
+          <w:trHeight w:val="530" w:hRule="atLeast"/>
+        </w:trPr>
+        <w:tc>
+          <w:tcPr>
+            <w:tcW w:w="2000" w:type="dxa"/>
+          </w:tcPr>
+          <w:p>
+            <w:pPr/>
+            <w:r>
+              <w:t xml:space="preserve">content_type</w:t>
+            </w:r>
+          </w:p>
+        </w:tc>
+        <w:tc>
+          <w:tcPr>
+            <w:tcW w:w="2000" w:type="dxa"/>
+          </w:tcPr>
+          <w:p>
+            <w:pPr/>
+            <w:r>
+              <w:t xml:space="preserve">varchar</w:t>
+            </w:r>
+          </w:p>
+        </w:tc>
+        <w:tc>
+          <w:tcPr>
+            <w:tcW w:w="2000" w:type="dxa"/>
+          </w:tcPr>
+          <w:p>
+            <w:pPr/>
+            <w:r>
+              <w:t xml:space="preserve">30</w:t>
+            </w:r>
+          </w:p>
+        </w:tc>
+        <w:tc>
+          <w:tcPr>
+            <w:tcW w:w="2000" w:type="dxa"/>
+          </w:tcPr>
+          <w:p>
+            <w:pPr/>
+            <w:r>
+              <w:t xml:space="preserve">NOT NULL</w:t>
+            </w:r>
+          </w:p>
+        </w:tc>
+      </w:tr>
+      <w:tr>
+        <w:trPr>
+          <w:trHeight w:val="530" w:hRule="atLeast"/>
+        </w:trPr>
+        <w:tc>
+          <w:tcPr>
+            <w:tcW w:w="2000" w:type="dxa"/>
+          </w:tcPr>
+          <w:p>
+            <w:pPr/>
+            <w:r>
+              <w:t xml:space="preserve">file_name</w:t>
+            </w:r>
+          </w:p>
+        </w:tc>
+        <w:tc>
+          <w:tcPr>
+            <w:tcW w:w="2000" w:type="dxa"/>
+          </w:tcPr>
+          <w:p>
+            <w:pPr/>
+            <w:r>
+              <w:t xml:space="preserve">nvarchar</w:t>
+            </w:r>
+          </w:p>
+        </w:tc>
+        <w:tc>
+          <w:tcPr>
+            <w:tcW w:w="2000" w:type="dxa"/>
+          </w:tcPr>
+          <w:p>
+            <w:pPr/>
+            <w:r>
+              <w:t xml:space="preserve">200</w:t>
+            </w:r>
+          </w:p>
+        </w:tc>
+        <w:tc>
+          <w:tcPr>
+            <w:tcW w:w="2000" w:type="dxa"/>
+          </w:tcPr>
+          <w:p>
+            <w:pPr/>
+            <w:r>
+              <w:t xml:space="preserve">NOT NULL</w:t>
+            </w:r>
+          </w:p>
+        </w:tc>
+      </w:tr>
+      <w:tr>
+        <w:trPr>
+          <w:trHeight w:val="530" w:hRule="atLeast"/>
+        </w:trPr>
+        <w:tc>
+          <w:tcPr>
+            <w:tcW w:w="2000" w:type="dxa"/>
+          </w:tcPr>
+          <w:p>
+            <w:pPr/>
+            <w:r>
+              <w:t xml:space="preserve">size_bytes</w:t>
+            </w:r>
+          </w:p>
+        </w:tc>
+        <w:tc>
+          <w:tcPr>
+            <w:tcW w:w="2000" w:type="dxa"/>
+          </w:tcPr>
+          <w:p>
+            <w:pPr/>
+            <w:r>
+              <w:t xml:space="preserve">int</w:t>
+            </w:r>
+          </w:p>
+        </w:tc>
+        <w:tc>
+          <w:tcPr>
+            <w:tcW w:w="2000" w:type="dxa"/>
+          </w:tcPr>
+          <w:p>
+            <w:pPr/>
+            <w:r>
+              <w:t xml:space="preserve">-</w:t>
+            </w:r>
+          </w:p>
+        </w:tc>
+        <w:tc>
+          <w:tcPr>
+            <w:tcW w:w="2000" w:type="dxa"/>
+          </w:tcPr>
+          <w:p>
+            <w:pPr/>
+            <w:r>
+              <w:t xml:space="preserve">NOT NULL</w:t>
+            </w:r>
+          </w:p>
+        </w:tc>
+      </w:tr>
+      <w:tr>
+        <w:trPr>
+          <w:trHeight w:val="530" w:hRule="atLeast"/>
+        </w:trPr>
+        <w:tc>
+          <w:tcPr>
+            <w:tcW w:w="2000" w:type="dxa"/>
+          </w:tcPr>
+          <w:p>
+            <w:pPr/>
+            <w:r>
+              <w:t xml:space="preserve">width</w:t>
+            </w:r>
+          </w:p>
+        </w:tc>
+        <w:tc>
+          <w:tcPr>
+            <w:tcW w:w="2000" w:type="dxa"/>
+          </w:tcPr>
+          <w:p>
+            <w:pPr/>
+            <w:r>
+              <w:t xml:space="preserve">int</w:t>
+            </w:r>
+          </w:p>
+        </w:tc>
+        <w:tc>
+          <w:tcPr>
+            <w:tcW w:w="2000" w:type="dxa"/>
+          </w:tcPr>
+          <w:p>
+            <w:pPr/>
+            <w:r>
+              <w:t xml:space="preserve">-</w:t>
+            </w:r>
+          </w:p>
+        </w:tc>
+        <w:tc>
+          <w:tcPr>
+            <w:tcW w:w="2000" w:type="dxa"/>
+          </w:tcPr>
+          <w:p>
+            <w:pPr/>
+            <w:r>
+              <w:t xml:space="preserve">NOT NULL</w:t>
+            </w:r>
+          </w:p>
+        </w:tc>
+      </w:tr>
+      <w:tr>
+        <w:trPr>
+          <w:trHeight w:val="530" w:hRule="atLeast"/>
+        </w:trPr>
+        <w:tc>
+          <w:tcPr>
+            <w:tcW w:w="2000" w:type="dxa"/>
+          </w:tcPr>
+          <w:p>
+            <w:pPr/>
+            <w:r>
+              <w:t xml:space="preserve">height</w:t>
+            </w:r>
+          </w:p>
+        </w:tc>
+        <w:tc>
+          <w:tcPr>
+            <w:tcW w:w="2000" w:type="dxa"/>
+          </w:tcPr>
+          <w:p>
+            <w:pPr/>
+            <w:r>
+              <w:t xml:space="preserve">int</w:t>
+            </w:r>
+          </w:p>
+        </w:tc>
+        <w:tc>
+          <w:tcPr>
+            <w:tcW w:w="2000" w:type="dxa"/>
+          </w:tcPr>
+          <w:p>
+            <w:pPr/>
+            <w:r>
+              <w:t xml:space="preserve">-</w:t>
+            </w:r>
+          </w:p>
+        </w:tc>
+        <w:tc>
+          <w:tcPr>
+            <w:tcW w:w="2000" w:type="dxa"/>
+          </w:tcPr>
+          <w:p>
+            <w:pPr/>
+            <w:r>
+              <w:t xml:space="preserve">NOT NULL</w:t>
+            </w:r>
+          </w:p>
+        </w:tc>
+      </w:tr>
+      <w:tr>
+        <w:trPr>
+          <w:trHeight w:val="530" w:hRule="atLeast"/>
+        </w:trPr>
+        <w:tc>
+          <w:tcPr>
+            <w:tcW w:w="2000" w:type="dxa"/>
+          </w:tcPr>
+          <w:p>
+            <w:pPr/>
+            <w:r>
+              <w:t xml:space="preserve">content</w:t>
+            </w:r>
+          </w:p>
+        </w:tc>
+        <w:tc>
+          <w:tcPr>
+            <w:tcW w:w="2000" w:type="dxa"/>
+          </w:tcPr>
+          <w:p>
+            <w:pPr/>
+            <w:r>
+              <w:t xml:space="preserve">varbinary</w:t>
+            </w:r>
+          </w:p>
+        </w:tc>
+        <w:tc>
+          <w:tcPr>
+            <w:tcW w:w="2000" w:type="dxa"/>
+          </w:tcPr>
+          <w:p>
+            <w:pPr/>
+            <w:r>
+              <w:t xml:space="preserve">MAX</w:t>
+            </w:r>
+          </w:p>
+        </w:tc>
+        <w:tc>
+          <w:tcPr>
+            <w:tcW w:w="2000" w:type="dxa"/>
+          </w:tcPr>
+          <w:p>
+            <w:pPr/>
+            <w:r>
+              <w:t xml:space="preserve">NOT NULL</w:t>
+            </w:r>
+          </w:p>
+        </w:tc>
+      </w:tr>
+      <w:tr>
+        <w:trPr>
+          <w:trHeight w:val="530" w:hRule="atLeast"/>
+        </w:trPr>
+        <w:tc>
+          <w:tcPr>
+            <w:tcW w:w="2000" w:type="dxa"/>
+          </w:tcPr>
+          <w:p>
+            <w:pPr/>
+            <w:r>
+              <w:t xml:space="preserve">company_id</w:t>
+            </w:r>
+          </w:p>
+        </w:tc>
+        <w:tc>
+          <w:tcPr>
+            <w:tcW w:w="2000" w:type="dxa"/>
+          </w:tcPr>
+          <w:p>
+            <w:pPr/>
+            <w:r>
+              <w:t xml:space="preserve">bigint</w:t>
+            </w:r>
+          </w:p>
+        </w:tc>
+        <w:tc>
+          <w:tcPr>
+            <w:tcW w:w="2000" w:type="dxa"/>
+          </w:tcPr>
+          <w:p>
+            <w:pPr/>
+            <w:r>
+              <w:t xml:space="preserve">-</w:t>
+            </w:r>
+          </w:p>
+        </w:tc>
+        <w:tc>
+          <w:tcPr>
+            <w:tcW w:w="2000" w:type="dxa"/>
+          </w:tcPr>
+          <w:p>
+            <w:pPr/>
+            <w:r>
+              <w:t xml:space="preserve">FK, NOT NULL</w:t>
+            </w:r>
+          </w:p>
+        </w:tc>
+      </w:tr>
+      <w:tr>
+        <w:trPr>
+          <w:trHeight w:val="530" w:hRule="atLeast"/>
+        </w:trPr>
+        <w:tc>
+          <w:tcPr>
+            <w:tcW w:w="2000" w:type="dxa"/>
+          </w:tcPr>
+          <w:p>
+            <w:pPr/>
+            <w:r>
+              <w:t xml:space="preserve">created_at</w:t>
+            </w:r>
+          </w:p>
+        </w:tc>
+        <w:tc>
+          <w:tcPr>
+            <w:tcW w:w="2000" w:type="dxa"/>
+          </w:tcPr>
+          <w:p>
+            <w:pPr/>
+            <w:r>
+              <w:t xml:space="preserve">datetime2</w:t>
+            </w:r>
+          </w:p>
+        </w:tc>
+        <w:tc>
+          <w:tcPr>
+            <w:tcW w:w="2000" w:type="dxa"/>
+          </w:tcPr>
+          <w:p>
+            <w:pPr/>
+            <w:r>
+              <w:t xml:space="preserve">(6)</w:t>
+            </w:r>
+          </w:p>
+        </w:tc>
+        <w:tc>
+          <w:tcPr>
+            <w:tcW w:w="2000" w:type="dxa"/>
+          </w:tcPr>
+          <w:p>
+            <w:pPr/>
+            <w:r>
+              <w:t xml:space="preserve">NOT NULL</w:t>
+            </w:r>
+          </w:p>
+        </w:tc>
+      </w:tr>
+      <w:tr>
+        <w:trPr>
+          <w:trHeight w:val="530" w:hRule="atLeast"/>
+        </w:trPr>
+        <w:tc>
+          <w:tcPr>
+            <w:tcW w:w="2000" w:type="dxa"/>
+          </w:tcPr>
+          <w:p>
+            <w:pPr/>
+            <w:r>
+              <w:t xml:space="preserve">created_by</w:t>
+            </w:r>
+          </w:p>
+        </w:tc>
+        <w:tc>
+          <w:tcPr>
+            <w:tcW w:w="2000" w:type="dxa"/>
+          </w:tcPr>
+          <w:p>
+            <w:pPr/>
+            <w:r>
+              <w:t xml:space="preserve">bigint</w:t>
+            </w:r>
+          </w:p>
+        </w:tc>
+        <w:tc>
+          <w:tcPr>
+            <w:tcW w:w="2000" w:type="dxa"/>
+          </w:tcPr>
+          <w:p>
+            <w:pPr/>
+            <w:r>
+              <w:t xml:space="preserve">-</w:t>
+            </w:r>
+          </w:p>
+        </w:tc>
+        <w:tc>
+          <w:tcPr>
+            <w:tcW w:w="2000" w:type="dxa"/>
+          </w:tcPr>
+          <w:p>
+            <w:pPr/>
+            <w:r>
+              <w:t xml:space="preserve">NOT NULL</w:t>
+            </w:r>
+          </w:p>
+        </w:tc>
+      </w:tr>
+      <w:tr>
+        <w:trPr>
+          <w:trHeight w:val="530" w:hRule="atLeast"/>
+        </w:trPr>
+        <w:tc>
+          <w:tcPr>
+            <w:tcW w:w="2000" w:type="dxa"/>
+          </w:tcPr>
+          <w:p>
+            <w:pPr/>
+            <w:r>
+              <w:t xml:space="preserve">updated_at</w:t>
+            </w:r>
+          </w:p>
+        </w:tc>
+        <w:tc>
+          <w:tcPr>
+            <w:tcW w:w="2000" w:type="dxa"/>
+          </w:tcPr>
+          <w:p>
+            <w:pPr/>
+            <w:r>
+              <w:t xml:space="preserve">datetime2</w:t>
+            </w:r>
+          </w:p>
+        </w:tc>
+        <w:tc>
+          <w:tcPr>
+            <w:tcW w:w="2000" w:type="dxa"/>
+          </w:tcPr>
+          <w:p>
+            <w:pPr/>
+            <w:r>
+              <w:t xml:space="preserve">(6)</w:t>
+            </w:r>
+          </w:p>
+        </w:tc>
+        <w:tc>
+          <w:tcPr>
+            <w:tcW w:w="2000" w:type="dxa"/>
+          </w:tcPr>
+          <w:p>
+            <w:pPr/>
+            <w:r>
+              <w:t xml:space="preserve">IS NULL</w:t>
+            </w:r>
+          </w:p>
+        </w:tc>
+      </w:tr>
+      <w:tr>
+        <w:trPr>
+          <w:trHeight w:val="530" w:hRule="atLeast"/>
+        </w:trPr>
+        <w:tc>
+          <w:tcPr>
+            <w:tcW w:w="2000" w:type="dxa"/>
+          </w:tcPr>
+          <w:p>
+            <w:pPr/>
+            <w:r>
+              <w:t xml:space="preserve">updated_by</w:t>
+            </w:r>
+          </w:p>
+        </w:tc>
+        <w:tc>
+          <w:tcPr>
+            <w:tcW w:w="2000" w:type="dxa"/>
+          </w:tcPr>
+          <w:p>
+            <w:pPr/>
+            <w:r>
+              <w:t xml:space="preserve">bigint</w:t>
+            </w:r>
+          </w:p>
+        </w:tc>
+        <w:tc>
+          <w:tcPr>
+            <w:tcW w:w="2000" w:type="dxa"/>
+          </w:tcPr>
+          <w:p>
+            <w:pPr/>
+            <w:r>
+              <w:t xml:space="preserve">-</w:t>
+            </w:r>
+          </w:p>
+        </w:tc>
+        <w:tc>
+          <w:tcPr>
+            <w:tcW w:w="2000" w:type="dxa"/>
+          </w:tcPr>
+          <w:p>
+            <w:pPr/>
+            <w:r>
+              <w:t xml:space="preserve">IS NULL</w:t>
+            </w:r>
+          </w:p>
+        </w:tc>
+      </w:tr>
+      <w:tr>
+        <w:trPr>
+          <w:trHeight w:val="530" w:hRule="atLeast"/>
+        </w:trPr>
+        <w:tc>
+          <w:tcPr>
+            <w:tcW w:w="2000" w:type="dxa"/>
+          </w:tcPr>
+          <w:p>
+            <w:pPr/>
+            <w:r>
+              <w:t xml:space="preserve">version</w:t>
+            </w:r>
+          </w:p>
+        </w:tc>
+        <w:tc>
+          <w:tcPr>
+            <w:tcW w:w="2000" w:type="dxa"/>
+          </w:tcPr>
+          <w:p>
+            <w:pPr/>
+            <w:r>
+              <w:t xml:space="preserve">int</w:t>
+            </w:r>
+          </w:p>
+        </w:tc>
+        <w:tc>
+          <w:tcPr>
+            <w:tcW w:w="2000" w:type="dxa"/>
+          </w:tcPr>
+          <w:p>
+            <w:pPr/>
+            <w:r>
+              <w:t xml:space="preserve">-</w:t>
+            </w:r>
+          </w:p>
+        </w:tc>
+        <w:tc>
+          <w:tcPr>
+            <w:tcW w:w="2000" w:type="dxa"/>
+          </w:tcPr>
+          <w:p>
+            <w:pPr/>
+            <w:r>
+              <w:t xml:space="preserve">NOT NULL</w:t>
+            </w:r>
+          </w:p>
+        </w:tc>
+      </w:tr>
+    </w:tbl>
+    <w:p/>
+    <w:p>
+      <w:pPr/>
+      <w:r>
         <w:t xml:space="preserve">Table Name: sys_department</w:t>
       </w:r>
     </w:p>
@@ -9992,6 +10794,563 @@
     <w:p>
       <w:pPr/>
       <w:r>
+        <w:t xml:space="preserve">Table Name: sys_parameter</w:t>
+      </w:r>
+    </w:p>
+    <w:p>
+      <w:pPr/>
+      <w:r>
+        <w:t xml:space="preserve">Primary Key: id</w:t>
+      </w:r>
+    </w:p>
+    <w:p>
+      <w:pPr/>
+      <w:r>
+        <w:t xml:space="preserve">Company-level values of module-declared system parameters; only changed values are stored, normalized as text, with audit/version fields.</w:t>
+      </w:r>
+    </w:p>
+    <w:tbl>
+      <w:tblPr>
+        <w:tblStyle w:val="TableGrid"/>
+        <w:tblW w:w="8000" w:type="dxa"/>
+        <w:jc w:val="left"/>
+        <w:tblBorders>
+          <w:top w:val="single" w:color="000000" w:sz="4" w:space="0"/>
+          <w:left w:val="single" w:color="000000" w:sz="4" w:space="0"/>
+          <w:bottom w:val="single" w:color="000000" w:sz="4" w:space="0"/>
+          <w:right w:val="single" w:color="000000" w:sz="4" w:space="0"/>
+          <w:insideH w:val="single" w:color="000000" w:sz="4" w:space="0"/>
+          <w:insideV w:val="single" w:color="000000" w:sz="4" w:space="0"/>
+        </w:tblBorders>
+        <w:tblLayout w:type="fixed"/>
+        <w:tblCellMar>
+          <w:top w:w="100" w:type="dxa"/>
+          <w:left w:w="100" w:type="dxa"/>
+          <w:bottom w:w="100" w:type="dxa"/>
+          <w:right w:w="100" w:type="dxa"/>
+        </w:tblCellMar>
+      </w:tblPr>
+      <w:tblGrid>
+        <w:gridCol w:w="2000"/>
+        <w:gridCol w:w="2000"/>
+        <w:gridCol w:w="2000"/>
+        <w:gridCol w:w="2000"/>
+      </w:tblGrid>
+      <w:tr>
+        <w:trPr>
+          <w:trHeight w:val="530" w:hRule="atLeast"/>
+        </w:trPr>
+        <w:tc>
+          <w:tcPr>
+            <w:tcW w:w="2000" w:type="dxa"/>
+          </w:tcPr>
+          <w:p>
+            <w:pPr>
+              <w:jc w:val="center"/>
+            </w:pPr>
+            <w:r>
+              <w:rPr>
+                <w:b/>
+              </w:rPr>
+              <w:t xml:space="preserve">Name of Attribute</w:t>
+            </w:r>
+          </w:p>
+        </w:tc>
+        <w:tc>
+          <w:tcPr>
+            <w:tcW w:w="2000" w:type="dxa"/>
+          </w:tcPr>
+          <w:p>
+            <w:pPr>
+              <w:jc w:val="center"/>
+            </w:pPr>
+            <w:r>
+              <w:rPr>
+                <w:b/>
+              </w:rPr>
+              <w:t xml:space="preserve">Data Type</w:t>
+            </w:r>
+          </w:p>
+        </w:tc>
+        <w:tc>
+          <w:tcPr>
+            <w:tcW w:w="2000" w:type="dxa"/>
+          </w:tcPr>
+          <w:p>
+            <w:pPr>
+              <w:jc w:val="center"/>
+            </w:pPr>
+            <w:r>
+              <w:rPr>
+                <w:b/>
+              </w:rPr>
+              <w:t xml:space="preserve">Size</w:t>
+            </w:r>
+          </w:p>
+        </w:tc>
+        <w:tc>
+          <w:tcPr>
+            <w:tcW w:w="2000" w:type="dxa"/>
+          </w:tcPr>
+          <w:p>
+            <w:pPr>
+              <w:jc w:val="center"/>
+            </w:pPr>
+            <w:r>
+              <w:rPr>
+                <w:b/>
+              </w:rPr>
+              <w:t xml:space="preserve">PK/FK/IS NULL/ NOT NULL</w:t>
+            </w:r>
+          </w:p>
+        </w:tc>
+      </w:tr>
+      <w:tr>
+        <w:trPr>
+          <w:trHeight w:val="530" w:hRule="atLeast"/>
+        </w:trPr>
+        <w:tc>
+          <w:tcPr>
+            <w:tcW w:w="2000" w:type="dxa"/>
+          </w:tcPr>
+          <w:p>
+            <w:pPr/>
+            <w:r>
+              <w:t xml:space="preserve">id</w:t>
+            </w:r>
+          </w:p>
+        </w:tc>
+        <w:tc>
+          <w:tcPr>
+            <w:tcW w:w="2000" w:type="dxa"/>
+          </w:tcPr>
+          <w:p>
+            <w:pPr/>
+            <w:r>
+              <w:t xml:space="preserve">bigint</w:t>
+            </w:r>
+          </w:p>
+        </w:tc>
+        <w:tc>
+          <w:tcPr>
+            <w:tcW w:w="2000" w:type="dxa"/>
+          </w:tcPr>
+          <w:p>
+            <w:pPr/>
+            <w:r>
+              <w:t xml:space="preserve">-</w:t>
+            </w:r>
+          </w:p>
+        </w:tc>
+        <w:tc>
+          <w:tcPr>
+            <w:tcW w:w="2000" w:type="dxa"/>
+          </w:tcPr>
+          <w:p>
+            <w:pPr/>
+            <w:r>
+              <w:t xml:space="preserve">PK, NOT NULL</w:t>
+            </w:r>
+          </w:p>
+        </w:tc>
+      </w:tr>
+      <w:tr>
+        <w:trPr>
+          <w:trHeight w:val="530" w:hRule="atLeast"/>
+        </w:trPr>
+        <w:tc>
+          <w:tcPr>
+            <w:tcW w:w="2000" w:type="dxa"/>
+          </w:tcPr>
+          <w:p>
+            <w:pPr/>
+            <w:r>
+              <w:t xml:space="preserve">param_key</w:t>
+            </w:r>
+          </w:p>
+        </w:tc>
+        <w:tc>
+          <w:tcPr>
+            <w:tcW w:w="2000" w:type="dxa"/>
+          </w:tcPr>
+          <w:p>
+            <w:pPr/>
+            <w:r>
+              <w:t xml:space="preserve">varchar</w:t>
+            </w:r>
+          </w:p>
+        </w:tc>
+        <w:tc>
+          <w:tcPr>
+            <w:tcW w:w="2000" w:type="dxa"/>
+          </w:tcPr>
+          <w:p>
+            <w:pPr/>
+            <w:r>
+              <w:t xml:space="preserve">80</w:t>
+            </w:r>
+          </w:p>
+        </w:tc>
+        <w:tc>
+          <w:tcPr>
+            <w:tcW w:w="2000" w:type="dxa"/>
+          </w:tcPr>
+          <w:p>
+            <w:pPr/>
+            <w:r>
+              <w:t xml:space="preserve">NOT NULL</w:t>
+            </w:r>
+          </w:p>
+        </w:tc>
+      </w:tr>
+      <w:tr>
+        <w:trPr>
+          <w:trHeight w:val="530" w:hRule="atLeast"/>
+        </w:trPr>
+        <w:tc>
+          <w:tcPr>
+            <w:tcW w:w="2000" w:type="dxa"/>
+          </w:tcPr>
+          <w:p>
+            <w:pPr/>
+            <w:r>
+              <w:t xml:space="preserve">param_value</w:t>
+            </w:r>
+          </w:p>
+        </w:tc>
+        <w:tc>
+          <w:tcPr>
+            <w:tcW w:w="2000" w:type="dxa"/>
+          </w:tcPr>
+          <w:p>
+            <w:pPr/>
+            <w:r>
+              <w:t xml:space="preserve">nvarchar</w:t>
+            </w:r>
+          </w:p>
+        </w:tc>
+        <w:tc>
+          <w:tcPr>
+            <w:tcW w:w="2000" w:type="dxa"/>
+          </w:tcPr>
+          <w:p>
+            <w:pPr/>
+            <w:r>
+              <w:t xml:space="preserve">500</w:t>
+            </w:r>
+          </w:p>
+        </w:tc>
+        <w:tc>
+          <w:tcPr>
+            <w:tcW w:w="2000" w:type="dxa"/>
+          </w:tcPr>
+          <w:p>
+            <w:pPr/>
+            <w:r>
+              <w:t xml:space="preserve">NOT NULL</w:t>
+            </w:r>
+          </w:p>
+        </w:tc>
+      </w:tr>
+      <w:tr>
+        <w:trPr>
+          <w:trHeight w:val="530" w:hRule="atLeast"/>
+        </w:trPr>
+        <w:tc>
+          <w:tcPr>
+            <w:tcW w:w="2000" w:type="dxa"/>
+          </w:tcPr>
+          <w:p>
+            <w:pPr/>
+            <w:r>
+              <w:t xml:space="preserve">company_id</w:t>
+            </w:r>
+          </w:p>
+        </w:tc>
+        <w:tc>
+          <w:tcPr>
+            <w:tcW w:w="2000" w:type="dxa"/>
+          </w:tcPr>
+          <w:p>
+            <w:pPr/>
+            <w:r>
+              <w:t xml:space="preserve">bigint</w:t>
+            </w:r>
+          </w:p>
+        </w:tc>
+        <w:tc>
+          <w:tcPr>
+            <w:tcW w:w="2000" w:type="dxa"/>
+          </w:tcPr>
+          <w:p>
+            <w:pPr/>
+            <w:r>
+              <w:t xml:space="preserve">-</w:t>
+            </w:r>
+          </w:p>
+        </w:tc>
+        <w:tc>
+          <w:tcPr>
+            <w:tcW w:w="2000" w:type="dxa"/>
+          </w:tcPr>
+          <w:p>
+            <w:pPr/>
+            <w:r>
+              <w:t xml:space="preserve">FK, NOT NULL</w:t>
+            </w:r>
+          </w:p>
+        </w:tc>
+      </w:tr>
+      <w:tr>
+        <w:trPr>
+          <w:trHeight w:val="530" w:hRule="atLeast"/>
+        </w:trPr>
+        <w:tc>
+          <w:tcPr>
+            <w:tcW w:w="2000" w:type="dxa"/>
+          </w:tcPr>
+          <w:p>
+            <w:pPr/>
+            <w:r>
+              <w:t xml:space="preserve">created_at</w:t>
+            </w:r>
+          </w:p>
+        </w:tc>
+        <w:tc>
+          <w:tcPr>
+            <w:tcW w:w="2000" w:type="dxa"/>
+          </w:tcPr>
+          <w:p>
+            <w:pPr/>
+            <w:r>
+              <w:t xml:space="preserve">datetime2</w:t>
+            </w:r>
+          </w:p>
+        </w:tc>
+        <w:tc>
+          <w:tcPr>
+            <w:tcW w:w="2000" w:type="dxa"/>
+          </w:tcPr>
+          <w:p>
+            <w:pPr/>
+            <w:r>
+              <w:t xml:space="preserve">(6)</w:t>
+            </w:r>
+          </w:p>
+        </w:tc>
+        <w:tc>
+          <w:tcPr>
+            <w:tcW w:w="2000" w:type="dxa"/>
+          </w:tcPr>
+          <w:p>
+            <w:pPr/>
+            <w:r>
+              <w:t xml:space="preserve">NOT NULL</w:t>
+            </w:r>
+          </w:p>
+        </w:tc>
+      </w:tr>
+      <w:tr>
+        <w:trPr>
+          <w:trHeight w:val="530" w:hRule="atLeast"/>
+        </w:trPr>
+        <w:tc>
+          <w:tcPr>
+            <w:tcW w:w="2000" w:type="dxa"/>
+          </w:tcPr>
+          <w:p>
+            <w:pPr/>
+            <w:r>
+              <w:t xml:space="preserve">created_by</w:t>
+            </w:r>
+          </w:p>
+        </w:tc>
+        <w:tc>
+          <w:tcPr>
+            <w:tcW w:w="2000" w:type="dxa"/>
+          </w:tcPr>
+          <w:p>
+            <w:pPr/>
+            <w:r>
+              <w:t xml:space="preserve">bigint</w:t>
+            </w:r>
+          </w:p>
+        </w:tc>
+        <w:tc>
+          <w:tcPr>
+            <w:tcW w:w="2000" w:type="dxa"/>
+          </w:tcPr>
+          <w:p>
+            <w:pPr/>
+            <w:r>
+              <w:t xml:space="preserve">-</w:t>
+            </w:r>
+          </w:p>
+        </w:tc>
+        <w:tc>
+          <w:tcPr>
+            <w:tcW w:w="2000" w:type="dxa"/>
+          </w:tcPr>
+          <w:p>
+            <w:pPr/>
+            <w:r>
+              <w:t xml:space="preserve">NOT NULL</w:t>
+            </w:r>
+          </w:p>
+        </w:tc>
+      </w:tr>
+      <w:tr>
+        <w:trPr>
+          <w:trHeight w:val="530" w:hRule="atLeast"/>
+        </w:trPr>
+        <w:tc>
+          <w:tcPr>
+            <w:tcW w:w="2000" w:type="dxa"/>
+          </w:tcPr>
+          <w:p>
+            <w:pPr/>
+            <w:r>
+              <w:t xml:space="preserve">updated_at</w:t>
+            </w:r>
+          </w:p>
+        </w:tc>
+        <w:tc>
+          <w:tcPr>
+            <w:tcW w:w="2000" w:type="dxa"/>
+          </w:tcPr>
+          <w:p>
+            <w:pPr/>
+            <w:r>
+              <w:t xml:space="preserve">datetime2</w:t>
+            </w:r>
+          </w:p>
+        </w:tc>
+        <w:tc>
+          <w:tcPr>
+            <w:tcW w:w="2000" w:type="dxa"/>
+          </w:tcPr>
+          <w:p>
+            <w:pPr/>
+            <w:r>
+              <w:t xml:space="preserve">(6)</w:t>
+            </w:r>
+          </w:p>
+        </w:tc>
+        <w:tc>
+          <w:tcPr>
+            <w:tcW w:w="2000" w:type="dxa"/>
+          </w:tcPr>
+          <w:p>
+            <w:pPr/>
+            <w:r>
+              <w:t xml:space="preserve">IS NULL</w:t>
+            </w:r>
+          </w:p>
+        </w:tc>
+      </w:tr>
+      <w:tr>
+        <w:trPr>
+          <w:trHeight w:val="530" w:hRule="atLeast"/>
+        </w:trPr>
+        <w:tc>
+          <w:tcPr>
+            <w:tcW w:w="2000" w:type="dxa"/>
+          </w:tcPr>
+          <w:p>
+            <w:pPr/>
+            <w:r>
+              <w:t xml:space="preserve">updated_by</w:t>
+            </w:r>
+          </w:p>
+        </w:tc>
+        <w:tc>
+          <w:tcPr>
+            <w:tcW w:w="2000" w:type="dxa"/>
+          </w:tcPr>
+          <w:p>
+            <w:pPr/>
+            <w:r>
+              <w:t xml:space="preserve">bigint</w:t>
+            </w:r>
+          </w:p>
+        </w:tc>
+        <w:tc>
+          <w:tcPr>
+            <w:tcW w:w="2000" w:type="dxa"/>
+          </w:tcPr>
+          <w:p>
+            <w:pPr/>
+            <w:r>
+              <w:t xml:space="preserve">-</w:t>
+            </w:r>
+          </w:p>
+        </w:tc>
+        <w:tc>
+          <w:tcPr>
+            <w:tcW w:w="2000" w:type="dxa"/>
+          </w:tcPr>
+          <w:p>
+            <w:pPr/>
+            <w:r>
+              <w:t xml:space="preserve">IS NULL</w:t>
+            </w:r>
+          </w:p>
+        </w:tc>
+      </w:tr>
+      <w:tr>
+        <w:trPr>
+          <w:trHeight w:val="530" w:hRule="atLeast"/>
+        </w:trPr>
+        <w:tc>
+          <w:tcPr>
+            <w:tcW w:w="2000" w:type="dxa"/>
+          </w:tcPr>
+          <w:p>
+            <w:pPr/>
+            <w:r>
+              <w:t xml:space="preserve">version</w:t>
+            </w:r>
+          </w:p>
+        </w:tc>
+        <w:tc>
+          <w:tcPr>
+            <w:tcW w:w="2000" w:type="dxa"/>
+          </w:tcPr>
+          <w:p>
+            <w:pPr/>
+            <w:r>
+              <w:t xml:space="preserve">int</w:t>
+            </w:r>
+          </w:p>
+        </w:tc>
+        <w:tc>
+          <w:tcPr>
+            <w:tcW w:w="2000" w:type="dxa"/>
+          </w:tcPr>
+          <w:p>
+            <w:pPr/>
+            <w:r>
+              <w:t xml:space="preserve">-</w:t>
+            </w:r>
+          </w:p>
+        </w:tc>
+        <w:tc>
+          <w:tcPr>
+            <w:tcW w:w="2000" w:type="dxa"/>
+          </w:tcPr>
+          <w:p>
+            <w:pPr/>
+            <w:r>
+              <w:t xml:space="preserve">NOT NULL</w:t>
+            </w:r>
+          </w:p>
+        </w:tc>
+      </w:tr>
+    </w:tbl>
+    <w:p/>
+    <w:p>
+      <w:pPr/>
+      <w:r>
         <w:t xml:space="preserve">Table Name: sys_role</w:t>
       </w:r>
     </w:p>
@@ -13237,6 +14596,63 @@
       </w:pPr>
       <w:r>
         <w:t xml:space="preserve">4.2.1.8 Settings Module</w:t>
+      </w:r>
+    </w:p>
+    <w:p>
+      <w:pPr>
+        <w:pStyle w:val="Heading5"/>
+      </w:pPr>
+      <w:r>
+        <w:t xml:space="preserve">4.2.1.8.55 Parameter Edit Interface</w:t>
+      </w:r>
+    </w:p>
+    <w:p>
+      <w:pPr>
+        <w:jc w:val="center"/>
+      </w:pPr>
+      <w:r>
+        <w:rPr>
+          <w:i/>
+        </w:rPr>
+        <w:t xml:space="preserve">[Pending] System screenshot of Parameter Edit Interface.</w:t>
+      </w:r>
+    </w:p>
+    <w:p>
+      <w:pPr>
+        <w:pStyle w:val="Heading5"/>
+      </w:pPr>
+      <w:r>
+        <w:t xml:space="preserve">4.2.1.8.56 Print Settings Edit Interface</w:t>
+      </w:r>
+    </w:p>
+    <w:p>
+      <w:pPr>
+        <w:jc w:val="center"/>
+      </w:pPr>
+      <w:r>
+        <w:rPr>
+          <w:i/>
+        </w:rPr>
+        <w:t xml:space="preserve">[Pending] System screenshot of Print Settings Edit Interface.</w:t>
+      </w:r>
+    </w:p>
+    <w:p>
+      <w:pPr>
+        <w:pStyle w:val="Heading5"/>
+      </w:pPr>
+      <w:r>
+        <w:t xml:space="preserve">4.2.1.8.57 Logo &amp; Stamp Edit Interface</w:t>
+      </w:r>
+    </w:p>
+    <w:p>
+      <w:pPr>
+        <w:jc w:val="center"/>
+      </w:pPr>
+      <w:r>
+        <w:rPr>
+          <w:i/>
+        </w:rPr>
+        <w:t xml:space="preserve">[Pending] System screenshot of Logo &amp; Stamp Edit Interface.</w:t>
       </w:r>
     </w:p>
     <w:p>
@@ -13562,8 +14978,27 @@
         <w:t xml:space="preserve">[Pending] System screenshot of Standard Document Page Template.</w:t>
       </w:r>
     </w:p>
+    <w:p>
+      <w:pPr>
+        <w:pStyle w:val="Heading5"/>
+      </w:pPr>
+      <w:r>
+        <w:t xml:space="preserve">4.2.1.8.75 IP Whitelist Interface</w:t>
+      </w:r>
+    </w:p>
+    <w:p>
+      <w:pPr>
+        <w:jc w:val="center"/>
+      </w:pPr>
+      <w:r>
+        <w:rPr>
+          <w:i/>
+        </w:rPr>
+        <w:t xml:space="preserve">[Pending] System screenshot of IP Whitelist Interface.</w:t>
+      </w:r>
+    </w:p>
     <w:sectPr>
-      <w:footerReference xmlns:r="http://schemas.openxmlformats.org/officeDocument/2006/relationships" w:type="default" r:id="R860a9a1c04f3459d"/>
+      <w:footerReference xmlns:r="http://schemas.openxmlformats.org/officeDocument/2006/relationships" w:type="default" r:id="Rc680327cda9e42bc"/>
       <w:pgSz w:w="11906" w:h="16838"/>
       <w:pgMar w:top="1440" w:right="1440" w:bottom="1440" w:left="1440" w:header="720" w:footer="720" w:gutter="0"/>
     </w:sectPr>

</xml_diff>

<commit_message>
feat(sys): complete user portal password and preferences
</commit_message>
<xml_diff>
--- a/docs/99-output/MyERP_SDS.docx
+++ b/docs/99-output/MyERP_SDS.docx
@@ -14588,6 +14588,71 @@
       </w:pPr>
       <w:r>
         <w:t xml:space="preserve">4.2.1 User Portal</w:t>
+      </w:r>
+    </w:p>
+    <w:p>
+      <w:pPr>
+        <w:pStyle w:val="Heading4"/>
+      </w:pPr>
+      <w:r>
+        <w:t xml:space="preserve">4.2.1.1 User Module</w:t>
+      </w:r>
+    </w:p>
+    <w:p>
+      <w:pPr>
+        <w:pStyle w:val="Heading5"/>
+      </w:pPr>
+      <w:r>
+        <w:t xml:space="preserve">4.2.1.1.2 Homepage Interface</w:t>
+      </w:r>
+    </w:p>
+    <w:p>
+      <w:pPr>
+        <w:jc w:val="center"/>
+      </w:pPr>
+      <w:r>
+        <w:rPr>
+          <w:i/>
+        </w:rPr>
+        <w:t xml:space="preserve">[Pending] System screenshot of Homepage Interface.</w:t>
+      </w:r>
+    </w:p>
+    <w:p>
+      <w:pPr>
+        <w:pStyle w:val="Heading5"/>
+      </w:pPr>
+      <w:r>
+        <w:t xml:space="preserve">4.2.1.1.3 Change Password Interface</w:t>
+      </w:r>
+    </w:p>
+    <w:p>
+      <w:pPr>
+        <w:jc w:val="center"/>
+      </w:pPr>
+      <w:r>
+        <w:rPr>
+          <w:i/>
+        </w:rPr>
+        <w:t xml:space="preserve">[Pending] System screenshot of Change Password Interface.</w:t>
+      </w:r>
+    </w:p>
+    <w:p>
+      <w:pPr>
+        <w:pStyle w:val="Heading5"/>
+      </w:pPr>
+      <w:r>
+        <w:t xml:space="preserve">4.2.1.1.4 Personal Settings Interface</w:t>
+      </w:r>
+    </w:p>
+    <w:p>
+      <w:pPr>
+        <w:jc w:val="center"/>
+      </w:pPr>
+      <w:r>
+        <w:rPr>
+          <w:i/>
+        </w:rPr>
+        <w:t xml:space="preserve">[Pending] System screenshot of Personal Settings Interface.</w:t>
       </w:r>
     </w:p>
     <w:p>
@@ -14998,7 +15063,7 @@
       </w:r>
     </w:p>
     <w:sectPr>
-      <w:footerReference xmlns:r="http://schemas.openxmlformats.org/officeDocument/2006/relationships" w:type="default" r:id="Rc680327cda9e42bc"/>
+      <w:footerReference xmlns:r="http://schemas.openxmlformats.org/officeDocument/2006/relationships" w:type="default" r:id="R102daea18f564c21"/>
       <w:pgSz w:w="11906" w:h="16838"/>
       <w:pgMar w:top="1440" w:right="1440" w:bottom="1440" w:left="1440" w:header="720" w:footer="720" w:gutter="0"/>
     </w:sectPr>

</xml_diff>

<commit_message>
feat(sys): add company-scoped notification publisher
</commit_message>
<xml_diff>
--- a/docs/99-output/MyERP_SDS.docx
+++ b/docs/99-output/MyERP_SDS.docx
@@ -9132,6 +9132,857 @@
             <w:pPr/>
             <w:r>
               <w:t xml:space="preserve">NOT NULL</w:t>
+            </w:r>
+          </w:p>
+        </w:tc>
+      </w:tr>
+      <w:tr>
+        <w:trPr>
+          <w:trHeight w:val="530" w:hRule="atLeast"/>
+        </w:trPr>
+        <w:tc>
+          <w:tcPr>
+            <w:tcW w:w="2000" w:type="dxa"/>
+          </w:tcPr>
+          <w:p>
+            <w:pPr/>
+            <w:r>
+              <w:t xml:space="preserve">created_at</w:t>
+            </w:r>
+          </w:p>
+        </w:tc>
+        <w:tc>
+          <w:tcPr>
+            <w:tcW w:w="2000" w:type="dxa"/>
+          </w:tcPr>
+          <w:p>
+            <w:pPr/>
+            <w:r>
+              <w:t xml:space="preserve">datetime2</w:t>
+            </w:r>
+          </w:p>
+        </w:tc>
+        <w:tc>
+          <w:tcPr>
+            <w:tcW w:w="2000" w:type="dxa"/>
+          </w:tcPr>
+          <w:p>
+            <w:pPr/>
+            <w:r>
+              <w:t xml:space="preserve">(6)</w:t>
+            </w:r>
+          </w:p>
+        </w:tc>
+        <w:tc>
+          <w:tcPr>
+            <w:tcW w:w="2000" w:type="dxa"/>
+          </w:tcPr>
+          <w:p>
+            <w:pPr/>
+            <w:r>
+              <w:t xml:space="preserve">NOT NULL</w:t>
+            </w:r>
+          </w:p>
+        </w:tc>
+      </w:tr>
+      <w:tr>
+        <w:trPr>
+          <w:trHeight w:val="530" w:hRule="atLeast"/>
+        </w:trPr>
+        <w:tc>
+          <w:tcPr>
+            <w:tcW w:w="2000" w:type="dxa"/>
+          </w:tcPr>
+          <w:p>
+            <w:pPr/>
+            <w:r>
+              <w:t xml:space="preserve">created_by</w:t>
+            </w:r>
+          </w:p>
+        </w:tc>
+        <w:tc>
+          <w:tcPr>
+            <w:tcW w:w="2000" w:type="dxa"/>
+          </w:tcPr>
+          <w:p>
+            <w:pPr/>
+            <w:r>
+              <w:t xml:space="preserve">bigint</w:t>
+            </w:r>
+          </w:p>
+        </w:tc>
+        <w:tc>
+          <w:tcPr>
+            <w:tcW w:w="2000" w:type="dxa"/>
+          </w:tcPr>
+          <w:p>
+            <w:pPr/>
+            <w:r>
+              <w:t xml:space="preserve">-</w:t>
+            </w:r>
+          </w:p>
+        </w:tc>
+        <w:tc>
+          <w:tcPr>
+            <w:tcW w:w="2000" w:type="dxa"/>
+          </w:tcPr>
+          <w:p>
+            <w:pPr/>
+            <w:r>
+              <w:t xml:space="preserve">NOT NULL</w:t>
+            </w:r>
+          </w:p>
+        </w:tc>
+      </w:tr>
+      <w:tr>
+        <w:trPr>
+          <w:trHeight w:val="530" w:hRule="atLeast"/>
+        </w:trPr>
+        <w:tc>
+          <w:tcPr>
+            <w:tcW w:w="2000" w:type="dxa"/>
+          </w:tcPr>
+          <w:p>
+            <w:pPr/>
+            <w:r>
+              <w:t xml:space="preserve">updated_at</w:t>
+            </w:r>
+          </w:p>
+        </w:tc>
+        <w:tc>
+          <w:tcPr>
+            <w:tcW w:w="2000" w:type="dxa"/>
+          </w:tcPr>
+          <w:p>
+            <w:pPr/>
+            <w:r>
+              <w:t xml:space="preserve">datetime2</w:t>
+            </w:r>
+          </w:p>
+        </w:tc>
+        <w:tc>
+          <w:tcPr>
+            <w:tcW w:w="2000" w:type="dxa"/>
+          </w:tcPr>
+          <w:p>
+            <w:pPr/>
+            <w:r>
+              <w:t xml:space="preserve">(6)</w:t>
+            </w:r>
+          </w:p>
+        </w:tc>
+        <w:tc>
+          <w:tcPr>
+            <w:tcW w:w="2000" w:type="dxa"/>
+          </w:tcPr>
+          <w:p>
+            <w:pPr/>
+            <w:r>
+              <w:t xml:space="preserve">IS NULL</w:t>
+            </w:r>
+          </w:p>
+        </w:tc>
+      </w:tr>
+      <w:tr>
+        <w:trPr>
+          <w:trHeight w:val="530" w:hRule="atLeast"/>
+        </w:trPr>
+        <w:tc>
+          <w:tcPr>
+            <w:tcW w:w="2000" w:type="dxa"/>
+          </w:tcPr>
+          <w:p>
+            <w:pPr/>
+            <w:r>
+              <w:t xml:space="preserve">updated_by</w:t>
+            </w:r>
+          </w:p>
+        </w:tc>
+        <w:tc>
+          <w:tcPr>
+            <w:tcW w:w="2000" w:type="dxa"/>
+          </w:tcPr>
+          <w:p>
+            <w:pPr/>
+            <w:r>
+              <w:t xml:space="preserve">bigint</w:t>
+            </w:r>
+          </w:p>
+        </w:tc>
+        <w:tc>
+          <w:tcPr>
+            <w:tcW w:w="2000" w:type="dxa"/>
+          </w:tcPr>
+          <w:p>
+            <w:pPr/>
+            <w:r>
+              <w:t xml:space="preserve">-</w:t>
+            </w:r>
+          </w:p>
+        </w:tc>
+        <w:tc>
+          <w:tcPr>
+            <w:tcW w:w="2000" w:type="dxa"/>
+          </w:tcPr>
+          <w:p>
+            <w:pPr/>
+            <w:r>
+              <w:t xml:space="preserve">IS NULL</w:t>
+            </w:r>
+          </w:p>
+        </w:tc>
+      </w:tr>
+      <w:tr>
+        <w:trPr>
+          <w:trHeight w:val="530" w:hRule="atLeast"/>
+        </w:trPr>
+        <w:tc>
+          <w:tcPr>
+            <w:tcW w:w="2000" w:type="dxa"/>
+          </w:tcPr>
+          <w:p>
+            <w:pPr/>
+            <w:r>
+              <w:t xml:space="preserve">version</w:t>
+            </w:r>
+          </w:p>
+        </w:tc>
+        <w:tc>
+          <w:tcPr>
+            <w:tcW w:w="2000" w:type="dxa"/>
+          </w:tcPr>
+          <w:p>
+            <w:pPr/>
+            <w:r>
+              <w:t xml:space="preserve">int</w:t>
+            </w:r>
+          </w:p>
+        </w:tc>
+        <w:tc>
+          <w:tcPr>
+            <w:tcW w:w="2000" w:type="dxa"/>
+          </w:tcPr>
+          <w:p>
+            <w:pPr/>
+            <w:r>
+              <w:t xml:space="preserve">-</w:t>
+            </w:r>
+          </w:p>
+        </w:tc>
+        <w:tc>
+          <w:tcPr>
+            <w:tcW w:w="2000" w:type="dxa"/>
+          </w:tcPr>
+          <w:p>
+            <w:pPr/>
+            <w:r>
+              <w:t xml:space="preserve">NOT NULL</w:t>
+            </w:r>
+          </w:p>
+        </w:tc>
+      </w:tr>
+    </w:tbl>
+    <w:p/>
+    <w:p>
+      <w:pPr/>
+      <w:r>
+        <w:t xml:space="preserve">Table Name: sys_notification</w:t>
+      </w:r>
+    </w:p>
+    <w:p>
+      <w:pPr/>
+      <w:r>
+        <w:t xml:space="preserve">Primary Key: id</w:t>
+      </w:r>
+    </w:p>
+    <w:p>
+      <w:pPr/>
+      <w:r>
+        <w:t xml:space="preserve">One recipient's company-scoped notification, source identity, read time and expiry.</w:t>
+      </w:r>
+    </w:p>
+    <w:tbl>
+      <w:tblPr>
+        <w:tblStyle w:val="TableGrid"/>
+        <w:tblW w:w="8000" w:type="dxa"/>
+        <w:jc w:val="left"/>
+        <w:tblBorders>
+          <w:top w:val="single" w:color="000000" w:sz="4" w:space="0"/>
+          <w:left w:val="single" w:color="000000" w:sz="4" w:space="0"/>
+          <w:bottom w:val="single" w:color="000000" w:sz="4" w:space="0"/>
+          <w:right w:val="single" w:color="000000" w:sz="4" w:space="0"/>
+          <w:insideH w:val="single" w:color="000000" w:sz="4" w:space="0"/>
+          <w:insideV w:val="single" w:color="000000" w:sz="4" w:space="0"/>
+        </w:tblBorders>
+        <w:tblLayout w:type="fixed"/>
+        <w:tblCellMar>
+          <w:top w:w="100" w:type="dxa"/>
+          <w:left w:w="100" w:type="dxa"/>
+          <w:bottom w:w="100" w:type="dxa"/>
+          <w:right w:w="100" w:type="dxa"/>
+        </w:tblCellMar>
+      </w:tblPr>
+      <w:tblGrid>
+        <w:gridCol w:w="2000"/>
+        <w:gridCol w:w="2000"/>
+        <w:gridCol w:w="2000"/>
+        <w:gridCol w:w="2000"/>
+      </w:tblGrid>
+      <w:tr>
+        <w:trPr>
+          <w:trHeight w:val="530" w:hRule="atLeast"/>
+        </w:trPr>
+        <w:tc>
+          <w:tcPr>
+            <w:tcW w:w="2000" w:type="dxa"/>
+          </w:tcPr>
+          <w:p>
+            <w:pPr>
+              <w:jc w:val="center"/>
+            </w:pPr>
+            <w:r>
+              <w:rPr>
+                <w:b/>
+              </w:rPr>
+              <w:t xml:space="preserve">Name of Attribute</w:t>
+            </w:r>
+          </w:p>
+        </w:tc>
+        <w:tc>
+          <w:tcPr>
+            <w:tcW w:w="2000" w:type="dxa"/>
+          </w:tcPr>
+          <w:p>
+            <w:pPr>
+              <w:jc w:val="center"/>
+            </w:pPr>
+            <w:r>
+              <w:rPr>
+                <w:b/>
+              </w:rPr>
+              <w:t xml:space="preserve">Data Type</w:t>
+            </w:r>
+          </w:p>
+        </w:tc>
+        <w:tc>
+          <w:tcPr>
+            <w:tcW w:w="2000" w:type="dxa"/>
+          </w:tcPr>
+          <w:p>
+            <w:pPr>
+              <w:jc w:val="center"/>
+            </w:pPr>
+            <w:r>
+              <w:rPr>
+                <w:b/>
+              </w:rPr>
+              <w:t xml:space="preserve">Size</w:t>
+            </w:r>
+          </w:p>
+        </w:tc>
+        <w:tc>
+          <w:tcPr>
+            <w:tcW w:w="2000" w:type="dxa"/>
+          </w:tcPr>
+          <w:p>
+            <w:pPr>
+              <w:jc w:val="center"/>
+            </w:pPr>
+            <w:r>
+              <w:rPr>
+                <w:b/>
+              </w:rPr>
+              <w:t xml:space="preserve">PK/FK/IS NULL/ NOT NULL</w:t>
+            </w:r>
+          </w:p>
+        </w:tc>
+      </w:tr>
+      <w:tr>
+        <w:trPr>
+          <w:trHeight w:val="530" w:hRule="atLeast"/>
+        </w:trPr>
+        <w:tc>
+          <w:tcPr>
+            <w:tcW w:w="2000" w:type="dxa"/>
+          </w:tcPr>
+          <w:p>
+            <w:pPr/>
+            <w:r>
+              <w:t xml:space="preserve">id</w:t>
+            </w:r>
+          </w:p>
+        </w:tc>
+        <w:tc>
+          <w:tcPr>
+            <w:tcW w:w="2000" w:type="dxa"/>
+          </w:tcPr>
+          <w:p>
+            <w:pPr/>
+            <w:r>
+              <w:t xml:space="preserve">bigint</w:t>
+            </w:r>
+          </w:p>
+        </w:tc>
+        <w:tc>
+          <w:tcPr>
+            <w:tcW w:w="2000" w:type="dxa"/>
+          </w:tcPr>
+          <w:p>
+            <w:pPr/>
+            <w:r>
+              <w:t xml:space="preserve">-</w:t>
+            </w:r>
+          </w:p>
+        </w:tc>
+        <w:tc>
+          <w:tcPr>
+            <w:tcW w:w="2000" w:type="dxa"/>
+          </w:tcPr>
+          <w:p>
+            <w:pPr/>
+            <w:r>
+              <w:t xml:space="preserve">PK, NOT NULL</w:t>
+            </w:r>
+          </w:p>
+        </w:tc>
+      </w:tr>
+      <w:tr>
+        <w:trPr>
+          <w:trHeight w:val="530" w:hRule="atLeast"/>
+        </w:trPr>
+        <w:tc>
+          <w:tcPr>
+            <w:tcW w:w="2000" w:type="dxa"/>
+          </w:tcPr>
+          <w:p>
+            <w:pPr/>
+            <w:r>
+              <w:t xml:space="preserve">recipient_user_id</w:t>
+            </w:r>
+          </w:p>
+        </w:tc>
+        <w:tc>
+          <w:tcPr>
+            <w:tcW w:w="2000" w:type="dxa"/>
+          </w:tcPr>
+          <w:p>
+            <w:pPr/>
+            <w:r>
+              <w:t xml:space="preserve">bigint</w:t>
+            </w:r>
+          </w:p>
+        </w:tc>
+        <w:tc>
+          <w:tcPr>
+            <w:tcW w:w="2000" w:type="dxa"/>
+          </w:tcPr>
+          <w:p>
+            <w:pPr/>
+            <w:r>
+              <w:t xml:space="preserve">-</w:t>
+            </w:r>
+          </w:p>
+        </w:tc>
+        <w:tc>
+          <w:tcPr>
+            <w:tcW w:w="2000" w:type="dxa"/>
+          </w:tcPr>
+          <w:p>
+            <w:pPr/>
+            <w:r>
+              <w:t xml:space="preserve">FK, NOT NULL</w:t>
+            </w:r>
+          </w:p>
+        </w:tc>
+      </w:tr>
+      <w:tr>
+        <w:trPr>
+          <w:trHeight w:val="530" w:hRule="atLeast"/>
+        </w:trPr>
+        <w:tc>
+          <w:tcPr>
+            <w:tcW w:w="2000" w:type="dxa"/>
+          </w:tcPr>
+          <w:p>
+            <w:pPr/>
+            <w:r>
+              <w:t xml:space="preserve">category</w:t>
+            </w:r>
+          </w:p>
+        </w:tc>
+        <w:tc>
+          <w:tcPr>
+            <w:tcW w:w="2000" w:type="dxa"/>
+          </w:tcPr>
+          <w:p>
+            <w:pPr/>
+            <w:r>
+              <w:t xml:space="preserve">varchar</w:t>
+            </w:r>
+          </w:p>
+        </w:tc>
+        <w:tc>
+          <w:tcPr>
+            <w:tcW w:w="2000" w:type="dxa"/>
+          </w:tcPr>
+          <w:p>
+            <w:pPr/>
+            <w:r>
+              <w:t xml:space="preserve">40</w:t>
+            </w:r>
+          </w:p>
+        </w:tc>
+        <w:tc>
+          <w:tcPr>
+            <w:tcW w:w="2000" w:type="dxa"/>
+          </w:tcPr>
+          <w:p>
+            <w:pPr/>
+            <w:r>
+              <w:t xml:space="preserve">NOT NULL</w:t>
+            </w:r>
+          </w:p>
+        </w:tc>
+      </w:tr>
+      <w:tr>
+        <w:trPr>
+          <w:trHeight w:val="530" w:hRule="atLeast"/>
+        </w:trPr>
+        <w:tc>
+          <w:tcPr>
+            <w:tcW w:w="2000" w:type="dxa"/>
+          </w:tcPr>
+          <w:p>
+            <w:pPr/>
+            <w:r>
+              <w:t xml:space="preserve">title</w:t>
+            </w:r>
+          </w:p>
+        </w:tc>
+        <w:tc>
+          <w:tcPr>
+            <w:tcW w:w="2000" w:type="dxa"/>
+          </w:tcPr>
+          <w:p>
+            <w:pPr/>
+            <w:r>
+              <w:t xml:space="preserve">nvarchar</w:t>
+            </w:r>
+          </w:p>
+        </w:tc>
+        <w:tc>
+          <w:tcPr>
+            <w:tcW w:w="2000" w:type="dxa"/>
+          </w:tcPr>
+          <w:p>
+            <w:pPr/>
+            <w:r>
+              <w:t xml:space="preserve">160</w:t>
+            </w:r>
+          </w:p>
+        </w:tc>
+        <w:tc>
+          <w:tcPr>
+            <w:tcW w:w="2000" w:type="dxa"/>
+          </w:tcPr>
+          <w:p>
+            <w:pPr/>
+            <w:r>
+              <w:t xml:space="preserve">NOT NULL</w:t>
+            </w:r>
+          </w:p>
+        </w:tc>
+      </w:tr>
+      <w:tr>
+        <w:trPr>
+          <w:trHeight w:val="530" w:hRule="atLeast"/>
+        </w:trPr>
+        <w:tc>
+          <w:tcPr>
+            <w:tcW w:w="2000" w:type="dxa"/>
+          </w:tcPr>
+          <w:p>
+            <w:pPr/>
+            <w:r>
+              <w:t xml:space="preserve">body</w:t>
+            </w:r>
+          </w:p>
+        </w:tc>
+        <w:tc>
+          <w:tcPr>
+            <w:tcW w:w="2000" w:type="dxa"/>
+          </w:tcPr>
+          <w:p>
+            <w:pPr/>
+            <w:r>
+              <w:t xml:space="preserve">nvarchar</w:t>
+            </w:r>
+          </w:p>
+        </w:tc>
+        <w:tc>
+          <w:tcPr>
+            <w:tcW w:w="2000" w:type="dxa"/>
+          </w:tcPr>
+          <w:p>
+            <w:pPr/>
+            <w:r>
+              <w:t xml:space="preserve">2000</w:t>
+            </w:r>
+          </w:p>
+        </w:tc>
+        <w:tc>
+          <w:tcPr>
+            <w:tcW w:w="2000" w:type="dxa"/>
+          </w:tcPr>
+          <w:p>
+            <w:pPr/>
+            <w:r>
+              <w:t xml:space="preserve">NOT NULL</w:t>
+            </w:r>
+          </w:p>
+        </w:tc>
+      </w:tr>
+      <w:tr>
+        <w:trPr>
+          <w:trHeight w:val="530" w:hRule="atLeast"/>
+        </w:trPr>
+        <w:tc>
+          <w:tcPr>
+            <w:tcW w:w="2000" w:type="dxa"/>
+          </w:tcPr>
+          <w:p>
+            <w:pPr/>
+            <w:r>
+              <w:t xml:space="preserve">target_path</w:t>
+            </w:r>
+          </w:p>
+        </w:tc>
+        <w:tc>
+          <w:tcPr>
+            <w:tcW w:w="2000" w:type="dxa"/>
+          </w:tcPr>
+          <w:p>
+            <w:pPr/>
+            <w:r>
+              <w:t xml:space="preserve">nvarchar</w:t>
+            </w:r>
+          </w:p>
+        </w:tc>
+        <w:tc>
+          <w:tcPr>
+            <w:tcW w:w="2000" w:type="dxa"/>
+          </w:tcPr>
+          <w:p>
+            <w:pPr/>
+            <w:r>
+              <w:t xml:space="preserve">500</w:t>
+            </w:r>
+          </w:p>
+        </w:tc>
+        <w:tc>
+          <w:tcPr>
+            <w:tcW w:w="2000" w:type="dxa"/>
+          </w:tcPr>
+          <w:p>
+            <w:pPr/>
+            <w:r>
+              <w:t xml:space="preserve">IS NULL</w:t>
+            </w:r>
+          </w:p>
+        </w:tc>
+      </w:tr>
+      <w:tr>
+        <w:trPr>
+          <w:trHeight w:val="530" w:hRule="atLeast"/>
+        </w:trPr>
+        <w:tc>
+          <w:tcPr>
+            <w:tcW w:w="2000" w:type="dxa"/>
+          </w:tcPr>
+          <w:p>
+            <w:pPr/>
+            <w:r>
+              <w:t xml:space="preserve">source_key</w:t>
+            </w:r>
+          </w:p>
+        </w:tc>
+        <w:tc>
+          <w:tcPr>
+            <w:tcW w:w="2000" w:type="dxa"/>
+          </w:tcPr>
+          <w:p>
+            <w:pPr/>
+            <w:r>
+              <w:t xml:space="preserve">varchar</w:t>
+            </w:r>
+          </w:p>
+        </w:tc>
+        <w:tc>
+          <w:tcPr>
+            <w:tcW w:w="2000" w:type="dxa"/>
+          </w:tcPr>
+          <w:p>
+            <w:pPr/>
+            <w:r>
+              <w:t xml:space="preserve">160</w:t>
+            </w:r>
+          </w:p>
+        </w:tc>
+        <w:tc>
+          <w:tcPr>
+            <w:tcW w:w="2000" w:type="dxa"/>
+          </w:tcPr>
+          <w:p>
+            <w:pPr/>
+            <w:r>
+              <w:t xml:space="preserve">NOT NULL</w:t>
+            </w:r>
+          </w:p>
+        </w:tc>
+      </w:tr>
+      <w:tr>
+        <w:trPr>
+          <w:trHeight w:val="530" w:hRule="atLeast"/>
+        </w:trPr>
+        <w:tc>
+          <w:tcPr>
+            <w:tcW w:w="2000" w:type="dxa"/>
+          </w:tcPr>
+          <w:p>
+            <w:pPr/>
+            <w:r>
+              <w:t xml:space="preserve">read_at</w:t>
+            </w:r>
+          </w:p>
+        </w:tc>
+        <w:tc>
+          <w:tcPr>
+            <w:tcW w:w="2000" w:type="dxa"/>
+          </w:tcPr>
+          <w:p>
+            <w:pPr/>
+            <w:r>
+              <w:t xml:space="preserve">datetime2</w:t>
+            </w:r>
+          </w:p>
+        </w:tc>
+        <w:tc>
+          <w:tcPr>
+            <w:tcW w:w="2000" w:type="dxa"/>
+          </w:tcPr>
+          <w:p>
+            <w:pPr/>
+            <w:r>
+              <w:t xml:space="preserve">(6)</w:t>
+            </w:r>
+          </w:p>
+        </w:tc>
+        <w:tc>
+          <w:tcPr>
+            <w:tcW w:w="2000" w:type="dxa"/>
+          </w:tcPr>
+          <w:p>
+            <w:pPr/>
+            <w:r>
+              <w:t xml:space="preserve">IS NULL</w:t>
+            </w:r>
+          </w:p>
+        </w:tc>
+      </w:tr>
+      <w:tr>
+        <w:trPr>
+          <w:trHeight w:val="530" w:hRule="atLeast"/>
+        </w:trPr>
+        <w:tc>
+          <w:tcPr>
+            <w:tcW w:w="2000" w:type="dxa"/>
+          </w:tcPr>
+          <w:p>
+            <w:pPr/>
+            <w:r>
+              <w:t xml:space="preserve">expires_at</w:t>
+            </w:r>
+          </w:p>
+        </w:tc>
+        <w:tc>
+          <w:tcPr>
+            <w:tcW w:w="2000" w:type="dxa"/>
+          </w:tcPr>
+          <w:p>
+            <w:pPr/>
+            <w:r>
+              <w:t xml:space="preserve">datetime2</w:t>
+            </w:r>
+          </w:p>
+        </w:tc>
+        <w:tc>
+          <w:tcPr>
+            <w:tcW w:w="2000" w:type="dxa"/>
+          </w:tcPr>
+          <w:p>
+            <w:pPr/>
+            <w:r>
+              <w:t xml:space="preserve">(6)</w:t>
+            </w:r>
+          </w:p>
+        </w:tc>
+        <w:tc>
+          <w:tcPr>
+            <w:tcW w:w="2000" w:type="dxa"/>
+          </w:tcPr>
+          <w:p>
+            <w:pPr/>
+            <w:r>
+              <w:t xml:space="preserve">NOT NULL</w:t>
+            </w:r>
+          </w:p>
+        </w:tc>
+      </w:tr>
+      <w:tr>
+        <w:trPr>
+          <w:trHeight w:val="530" w:hRule="atLeast"/>
+        </w:trPr>
+        <w:tc>
+          <w:tcPr>
+            <w:tcW w:w="2000" w:type="dxa"/>
+          </w:tcPr>
+          <w:p>
+            <w:pPr/>
+            <w:r>
+              <w:t xml:space="preserve">company_id</w:t>
+            </w:r>
+          </w:p>
+        </w:tc>
+        <w:tc>
+          <w:tcPr>
+            <w:tcW w:w="2000" w:type="dxa"/>
+          </w:tcPr>
+          <w:p>
+            <w:pPr/>
+            <w:r>
+              <w:t xml:space="preserve">bigint</w:t>
+            </w:r>
+          </w:p>
+        </w:tc>
+        <w:tc>
+          <w:tcPr>
+            <w:tcW w:w="2000" w:type="dxa"/>
+          </w:tcPr>
+          <w:p>
+            <w:pPr/>
+            <w:r>
+              <w:t xml:space="preserve">-</w:t>
+            </w:r>
+          </w:p>
+        </w:tc>
+        <w:tc>
+          <w:tcPr>
+            <w:tcW w:w="2000" w:type="dxa"/>
+          </w:tcPr>
+          <w:p>
+            <w:pPr/>
+            <w:r>
+              <w:t xml:space="preserve">FK, NOT NULL</w:t>
             </w:r>
           </w:p>
         </w:tc>
@@ -15063,7 +15914,7 @@
       </w:r>
     </w:p>
     <w:sectPr>
-      <w:footerReference xmlns:r="http://schemas.openxmlformats.org/officeDocument/2006/relationships" w:type="default" r:id="R102daea18f564c21"/>
+      <w:footerReference xmlns:r="http://schemas.openxmlformats.org/officeDocument/2006/relationships" w:type="default" r:id="R18b43f47c5ae4e3b"/>
       <w:pgSz w:w="11906" w:h="16838"/>
       <w:pgMar w:top="1440" w:right="1440" w:bottom="1440" w:left="1440" w:header="720" w:footer="720" w:gutter="0"/>
     </w:sectPr>

</xml_diff>

<commit_message>
feat(sys): add notification inbox, unread badge and expiry cleanup
- GET /api/v1/sys/notifications (paged, unread filter), unread-count,
  single and read-all endpoints scoped to the current user and company
- daily background cleanup of expired notifications
- header bell badge and trilingual /sys/notifications inbox
- seed roles get personal notification permissions
- API integration, frontend unit and E2E coverage (SYS-NOTIFY-004..007)
- stabilise approval delegation E2E dropdown selection

Co-Authored-By: Claude Opus 5.5 <noreply@anthropic.com>
</commit_message>
<xml_diff>
--- a/docs/99-output/MyERP_SDS.docx
+++ b/docs/99-output/MyERP_SDS.docx
@@ -15913,8 +15913,27 @@
         <w:t xml:space="preserve">[Pending] System screenshot of IP Whitelist Interface.</w:t>
       </w:r>
     </w:p>
+    <w:p>
+      <w:pPr>
+        <w:pStyle w:val="Heading5"/>
+      </w:pPr>
+      <w:r>
+        <w:t xml:space="preserve">4.2.1.8.76 Notification View Interface</w:t>
+      </w:r>
+    </w:p>
+    <w:p>
+      <w:pPr>
+        <w:jc w:val="center"/>
+      </w:pPr>
+      <w:r>
+        <w:rPr>
+          <w:i/>
+        </w:rPr>
+        <w:t xml:space="preserve">[Pending] System screenshot of Notification View Interface.</w:t>
+      </w:r>
+    </w:p>
     <w:sectPr>
-      <w:footerReference xmlns:r="http://schemas.openxmlformats.org/officeDocument/2006/relationships" w:type="default" r:id="R18b43f47c5ae4e3b"/>
+      <w:footerReference xmlns:r="http://schemas.openxmlformats.org/officeDocument/2006/relationships" w:type="default" r:id="Rcbc71a31562e4343"/>
       <w:pgSz w:w="11906" w:h="16838"/>
       <w:pgMar w:top="1440" w:right="1440" w:bottom="1440" w:left="1440" w:header="720" w:footer="720" w:gutter="0"/>
     </w:sectPr>

</xml_diff>

<commit_message>
feat(md): add company-scoped customer categories
</commit_message>
<xml_diff>
--- a/docs/99-output/MyERP_SDS.docx
+++ b/docs/99-output/MyERP_SDS.docx
@@ -46,7 +46,7 @@
         <w:jc w:val="center"/>
       </w:pPr>
       <w:r>
-        <w:t xml:space="preserve">Date: 11 October 2026</w:t>
+        <w:t xml:space="preserve">Date: 12 October 2026</w:t>
       </w:r>
     </w:p>
     <w:p/>
@@ -613,6 +613,710 @@
     <w:p>
       <w:pPr/>
       <w:r>
+        <w:t xml:space="preserve">Table Name: md_customer_category</w:t>
+      </w:r>
+    </w:p>
+    <w:p>
+      <w:pPr/>
+      <w:r>
+        <w:t xml:space="preserve">Primary Key: id</w:t>
+      </w:r>
+    </w:p>
+    <w:p>
+      <w:pPr/>
+      <w:r>
+        <w:t xml:space="preserve">This table stores customer categories within a company.</w:t>
+      </w:r>
+    </w:p>
+    <w:tbl>
+      <w:tblPr>
+        <w:tblStyle w:val="TableGrid"/>
+        <w:tblW w:w="8000" w:type="dxa"/>
+        <w:jc w:val="left"/>
+        <w:tblBorders>
+          <w:top w:val="single" w:color="000000" w:sz="4" w:space="0"/>
+          <w:left w:val="single" w:color="000000" w:sz="4" w:space="0"/>
+          <w:bottom w:val="single" w:color="000000" w:sz="4" w:space="0"/>
+          <w:right w:val="single" w:color="000000" w:sz="4" w:space="0"/>
+          <w:insideH w:val="single" w:color="000000" w:sz="4" w:space="0"/>
+          <w:insideV w:val="single" w:color="000000" w:sz="4" w:space="0"/>
+        </w:tblBorders>
+        <w:tblLayout w:type="fixed"/>
+        <w:tblCellMar>
+          <w:top w:w="100" w:type="dxa"/>
+          <w:left w:w="100" w:type="dxa"/>
+          <w:bottom w:w="100" w:type="dxa"/>
+          <w:right w:w="100" w:type="dxa"/>
+        </w:tblCellMar>
+      </w:tblPr>
+      <w:tblGrid>
+        <w:gridCol w:w="2000"/>
+        <w:gridCol w:w="2000"/>
+        <w:gridCol w:w="2000"/>
+        <w:gridCol w:w="2000"/>
+      </w:tblGrid>
+      <w:tr>
+        <w:trPr>
+          <w:trHeight w:val="530" w:hRule="atLeast"/>
+        </w:trPr>
+        <w:tc>
+          <w:tcPr>
+            <w:tcW w:w="2000" w:type="dxa"/>
+          </w:tcPr>
+          <w:p>
+            <w:pPr>
+              <w:jc w:val="center"/>
+            </w:pPr>
+            <w:r>
+              <w:rPr>
+                <w:b/>
+              </w:rPr>
+              <w:t xml:space="preserve">Name of Attribute</w:t>
+            </w:r>
+          </w:p>
+        </w:tc>
+        <w:tc>
+          <w:tcPr>
+            <w:tcW w:w="2000" w:type="dxa"/>
+          </w:tcPr>
+          <w:p>
+            <w:pPr>
+              <w:jc w:val="center"/>
+            </w:pPr>
+            <w:r>
+              <w:rPr>
+                <w:b/>
+              </w:rPr>
+              <w:t xml:space="preserve">Data Type</w:t>
+            </w:r>
+          </w:p>
+        </w:tc>
+        <w:tc>
+          <w:tcPr>
+            <w:tcW w:w="2000" w:type="dxa"/>
+          </w:tcPr>
+          <w:p>
+            <w:pPr>
+              <w:jc w:val="center"/>
+            </w:pPr>
+            <w:r>
+              <w:rPr>
+                <w:b/>
+              </w:rPr>
+              <w:t xml:space="preserve">Size</w:t>
+            </w:r>
+          </w:p>
+        </w:tc>
+        <w:tc>
+          <w:tcPr>
+            <w:tcW w:w="2000" w:type="dxa"/>
+          </w:tcPr>
+          <w:p>
+            <w:pPr>
+              <w:jc w:val="center"/>
+            </w:pPr>
+            <w:r>
+              <w:rPr>
+                <w:b/>
+              </w:rPr>
+              <w:t xml:space="preserve">PK/FK/IS NULL/ NOT NULL</w:t>
+            </w:r>
+          </w:p>
+        </w:tc>
+      </w:tr>
+      <w:tr>
+        <w:trPr>
+          <w:trHeight w:val="530" w:hRule="atLeast"/>
+        </w:trPr>
+        <w:tc>
+          <w:tcPr>
+            <w:tcW w:w="2000" w:type="dxa"/>
+          </w:tcPr>
+          <w:p>
+            <w:pPr/>
+            <w:r>
+              <w:t xml:space="preserve">id</w:t>
+            </w:r>
+          </w:p>
+        </w:tc>
+        <w:tc>
+          <w:tcPr>
+            <w:tcW w:w="2000" w:type="dxa"/>
+          </w:tcPr>
+          <w:p>
+            <w:pPr/>
+            <w:r>
+              <w:t xml:space="preserve">bigint</w:t>
+            </w:r>
+          </w:p>
+        </w:tc>
+        <w:tc>
+          <w:tcPr>
+            <w:tcW w:w="2000" w:type="dxa"/>
+          </w:tcPr>
+          <w:p>
+            <w:pPr/>
+            <w:r>
+              <w:t xml:space="preserve">-</w:t>
+            </w:r>
+          </w:p>
+        </w:tc>
+        <w:tc>
+          <w:tcPr>
+            <w:tcW w:w="2000" w:type="dxa"/>
+          </w:tcPr>
+          <w:p>
+            <w:pPr/>
+            <w:r>
+              <w:t xml:space="preserve">PK, NOT NULL</w:t>
+            </w:r>
+          </w:p>
+        </w:tc>
+      </w:tr>
+      <w:tr>
+        <w:trPr>
+          <w:trHeight w:val="530" w:hRule="atLeast"/>
+        </w:trPr>
+        <w:tc>
+          <w:tcPr>
+            <w:tcW w:w="2000" w:type="dxa"/>
+          </w:tcPr>
+          <w:p>
+            <w:pPr/>
+            <w:r>
+              <w:t xml:space="preserve">code</w:t>
+            </w:r>
+          </w:p>
+        </w:tc>
+        <w:tc>
+          <w:tcPr>
+            <w:tcW w:w="2000" w:type="dxa"/>
+          </w:tcPr>
+          <w:p>
+            <w:pPr/>
+            <w:r>
+              <w:t xml:space="preserve">varchar</w:t>
+            </w:r>
+          </w:p>
+        </w:tc>
+        <w:tc>
+          <w:tcPr>
+            <w:tcW w:w="2000" w:type="dxa"/>
+          </w:tcPr>
+          <w:p>
+            <w:pPr/>
+            <w:r>
+              <w:t xml:space="preserve">30</w:t>
+            </w:r>
+          </w:p>
+        </w:tc>
+        <w:tc>
+          <w:tcPr>
+            <w:tcW w:w="2000" w:type="dxa"/>
+          </w:tcPr>
+          <w:p>
+            <w:pPr/>
+            <w:r>
+              <w:t xml:space="preserve">NOT NULL</w:t>
+            </w:r>
+          </w:p>
+        </w:tc>
+      </w:tr>
+      <w:tr>
+        <w:trPr>
+          <w:trHeight w:val="530" w:hRule="atLeast"/>
+        </w:trPr>
+        <w:tc>
+          <w:tcPr>
+            <w:tcW w:w="2000" w:type="dxa"/>
+          </w:tcPr>
+          <w:p>
+            <w:pPr/>
+            <w:r>
+              <w:t xml:space="preserve">name</w:t>
+            </w:r>
+          </w:p>
+        </w:tc>
+        <w:tc>
+          <w:tcPr>
+            <w:tcW w:w="2000" w:type="dxa"/>
+          </w:tcPr>
+          <w:p>
+            <w:pPr/>
+            <w:r>
+              <w:t xml:space="preserve">nvarchar</w:t>
+            </w:r>
+          </w:p>
+        </w:tc>
+        <w:tc>
+          <w:tcPr>
+            <w:tcW w:w="2000" w:type="dxa"/>
+          </w:tcPr>
+          <w:p>
+            <w:pPr/>
+            <w:r>
+              <w:t xml:space="preserve">200</w:t>
+            </w:r>
+          </w:p>
+        </w:tc>
+        <w:tc>
+          <w:tcPr>
+            <w:tcW w:w="2000" w:type="dxa"/>
+          </w:tcPr>
+          <w:p>
+            <w:pPr/>
+            <w:r>
+              <w:t xml:space="preserve">NOT NULL</w:t>
+            </w:r>
+          </w:p>
+        </w:tc>
+      </w:tr>
+      <w:tr>
+        <w:trPr>
+          <w:trHeight w:val="530" w:hRule="atLeast"/>
+        </w:trPr>
+        <w:tc>
+          <w:tcPr>
+            <w:tcW w:w="2000" w:type="dxa"/>
+          </w:tcPr>
+          <w:p>
+            <w:pPr/>
+            <w:r>
+              <w:t xml:space="preserve">custom_fields</w:t>
+            </w:r>
+          </w:p>
+        </w:tc>
+        <w:tc>
+          <w:tcPr>
+            <w:tcW w:w="2000" w:type="dxa"/>
+          </w:tcPr>
+          <w:p>
+            <w:pPr/>
+            <w:r>
+              <w:t xml:space="preserve">nvarchar</w:t>
+            </w:r>
+          </w:p>
+        </w:tc>
+        <w:tc>
+          <w:tcPr>
+            <w:tcW w:w="2000" w:type="dxa"/>
+          </w:tcPr>
+          <w:p>
+            <w:pPr/>
+            <w:r>
+              <w:t xml:space="preserve">MAX</w:t>
+            </w:r>
+          </w:p>
+        </w:tc>
+        <w:tc>
+          <w:tcPr>
+            <w:tcW w:w="2000" w:type="dxa"/>
+          </w:tcPr>
+          <w:p>
+            <w:pPr/>
+            <w:r>
+              <w:t xml:space="preserve">IS NULL</w:t>
+            </w:r>
+          </w:p>
+        </w:tc>
+      </w:tr>
+      <w:tr>
+        <w:trPr>
+          <w:trHeight w:val="530" w:hRule="atLeast"/>
+        </w:trPr>
+        <w:tc>
+          <w:tcPr>
+            <w:tcW w:w="2000" w:type="dxa"/>
+          </w:tcPr>
+          <w:p>
+            <w:pPr/>
+            <w:r>
+              <w:t xml:space="preserve">company_id</w:t>
+            </w:r>
+          </w:p>
+        </w:tc>
+        <w:tc>
+          <w:tcPr>
+            <w:tcW w:w="2000" w:type="dxa"/>
+          </w:tcPr>
+          <w:p>
+            <w:pPr/>
+            <w:r>
+              <w:t xml:space="preserve">bigint</w:t>
+            </w:r>
+          </w:p>
+        </w:tc>
+        <w:tc>
+          <w:tcPr>
+            <w:tcW w:w="2000" w:type="dxa"/>
+          </w:tcPr>
+          <w:p>
+            <w:pPr/>
+            <w:r>
+              <w:t xml:space="preserve">-</w:t>
+            </w:r>
+          </w:p>
+        </w:tc>
+        <w:tc>
+          <w:tcPr>
+            <w:tcW w:w="2000" w:type="dxa"/>
+          </w:tcPr>
+          <w:p>
+            <w:pPr/>
+            <w:r>
+              <w:t xml:space="preserve">NOT NULL</w:t>
+            </w:r>
+          </w:p>
+        </w:tc>
+      </w:tr>
+      <w:tr>
+        <w:trPr>
+          <w:trHeight w:val="530" w:hRule="atLeast"/>
+        </w:trPr>
+        <w:tc>
+          <w:tcPr>
+            <w:tcW w:w="2000" w:type="dxa"/>
+          </w:tcPr>
+          <w:p>
+            <w:pPr/>
+            <w:r>
+              <w:t xml:space="preserve">created_at</w:t>
+            </w:r>
+          </w:p>
+        </w:tc>
+        <w:tc>
+          <w:tcPr>
+            <w:tcW w:w="2000" w:type="dxa"/>
+          </w:tcPr>
+          <w:p>
+            <w:pPr/>
+            <w:r>
+              <w:t xml:space="preserve">datetime2</w:t>
+            </w:r>
+          </w:p>
+        </w:tc>
+        <w:tc>
+          <w:tcPr>
+            <w:tcW w:w="2000" w:type="dxa"/>
+          </w:tcPr>
+          <w:p>
+            <w:pPr/>
+            <w:r>
+              <w:t xml:space="preserve">(6)</w:t>
+            </w:r>
+          </w:p>
+        </w:tc>
+        <w:tc>
+          <w:tcPr>
+            <w:tcW w:w="2000" w:type="dxa"/>
+          </w:tcPr>
+          <w:p>
+            <w:pPr/>
+            <w:r>
+              <w:t xml:space="preserve">NOT NULL</w:t>
+            </w:r>
+          </w:p>
+        </w:tc>
+      </w:tr>
+      <w:tr>
+        <w:trPr>
+          <w:trHeight w:val="530" w:hRule="atLeast"/>
+        </w:trPr>
+        <w:tc>
+          <w:tcPr>
+            <w:tcW w:w="2000" w:type="dxa"/>
+          </w:tcPr>
+          <w:p>
+            <w:pPr/>
+            <w:r>
+              <w:t xml:space="preserve">created_by</w:t>
+            </w:r>
+          </w:p>
+        </w:tc>
+        <w:tc>
+          <w:tcPr>
+            <w:tcW w:w="2000" w:type="dxa"/>
+          </w:tcPr>
+          <w:p>
+            <w:pPr/>
+            <w:r>
+              <w:t xml:space="preserve">bigint</w:t>
+            </w:r>
+          </w:p>
+        </w:tc>
+        <w:tc>
+          <w:tcPr>
+            <w:tcW w:w="2000" w:type="dxa"/>
+          </w:tcPr>
+          <w:p>
+            <w:pPr/>
+            <w:r>
+              <w:t xml:space="preserve">-</w:t>
+            </w:r>
+          </w:p>
+        </w:tc>
+        <w:tc>
+          <w:tcPr>
+            <w:tcW w:w="2000" w:type="dxa"/>
+          </w:tcPr>
+          <w:p>
+            <w:pPr/>
+            <w:r>
+              <w:t xml:space="preserve">NOT NULL</w:t>
+            </w:r>
+          </w:p>
+        </w:tc>
+      </w:tr>
+      <w:tr>
+        <w:trPr>
+          <w:trHeight w:val="530" w:hRule="atLeast"/>
+        </w:trPr>
+        <w:tc>
+          <w:tcPr>
+            <w:tcW w:w="2000" w:type="dxa"/>
+          </w:tcPr>
+          <w:p>
+            <w:pPr/>
+            <w:r>
+              <w:t xml:space="preserve">updated_at</w:t>
+            </w:r>
+          </w:p>
+        </w:tc>
+        <w:tc>
+          <w:tcPr>
+            <w:tcW w:w="2000" w:type="dxa"/>
+          </w:tcPr>
+          <w:p>
+            <w:pPr/>
+            <w:r>
+              <w:t xml:space="preserve">datetime2</w:t>
+            </w:r>
+          </w:p>
+        </w:tc>
+        <w:tc>
+          <w:tcPr>
+            <w:tcW w:w="2000" w:type="dxa"/>
+          </w:tcPr>
+          <w:p>
+            <w:pPr/>
+            <w:r>
+              <w:t xml:space="preserve">(6)</w:t>
+            </w:r>
+          </w:p>
+        </w:tc>
+        <w:tc>
+          <w:tcPr>
+            <w:tcW w:w="2000" w:type="dxa"/>
+          </w:tcPr>
+          <w:p>
+            <w:pPr/>
+            <w:r>
+              <w:t xml:space="preserve">IS NULL</w:t>
+            </w:r>
+          </w:p>
+        </w:tc>
+      </w:tr>
+      <w:tr>
+        <w:trPr>
+          <w:trHeight w:val="530" w:hRule="atLeast"/>
+        </w:trPr>
+        <w:tc>
+          <w:tcPr>
+            <w:tcW w:w="2000" w:type="dxa"/>
+          </w:tcPr>
+          <w:p>
+            <w:pPr/>
+            <w:r>
+              <w:t xml:space="preserve">updated_by</w:t>
+            </w:r>
+          </w:p>
+        </w:tc>
+        <w:tc>
+          <w:tcPr>
+            <w:tcW w:w="2000" w:type="dxa"/>
+          </w:tcPr>
+          <w:p>
+            <w:pPr/>
+            <w:r>
+              <w:t xml:space="preserve">bigint</w:t>
+            </w:r>
+          </w:p>
+        </w:tc>
+        <w:tc>
+          <w:tcPr>
+            <w:tcW w:w="2000" w:type="dxa"/>
+          </w:tcPr>
+          <w:p>
+            <w:pPr/>
+            <w:r>
+              <w:t xml:space="preserve">-</w:t>
+            </w:r>
+          </w:p>
+        </w:tc>
+        <w:tc>
+          <w:tcPr>
+            <w:tcW w:w="2000" w:type="dxa"/>
+          </w:tcPr>
+          <w:p>
+            <w:pPr/>
+            <w:r>
+              <w:t xml:space="preserve">IS NULL</w:t>
+            </w:r>
+          </w:p>
+        </w:tc>
+      </w:tr>
+      <w:tr>
+        <w:trPr>
+          <w:trHeight w:val="530" w:hRule="atLeast"/>
+        </w:trPr>
+        <w:tc>
+          <w:tcPr>
+            <w:tcW w:w="2000" w:type="dxa"/>
+          </w:tcPr>
+          <w:p>
+            <w:pPr/>
+            <w:r>
+              <w:t xml:space="preserve">version</w:t>
+            </w:r>
+          </w:p>
+        </w:tc>
+        <w:tc>
+          <w:tcPr>
+            <w:tcW w:w="2000" w:type="dxa"/>
+          </w:tcPr>
+          <w:p>
+            <w:pPr/>
+            <w:r>
+              <w:t xml:space="preserve">int</w:t>
+            </w:r>
+          </w:p>
+        </w:tc>
+        <w:tc>
+          <w:tcPr>
+            <w:tcW w:w="2000" w:type="dxa"/>
+          </w:tcPr>
+          <w:p>
+            <w:pPr/>
+            <w:r>
+              <w:t xml:space="preserve">-</w:t>
+            </w:r>
+          </w:p>
+        </w:tc>
+        <w:tc>
+          <w:tcPr>
+            <w:tcW w:w="2000" w:type="dxa"/>
+          </w:tcPr>
+          <w:p>
+            <w:pPr/>
+            <w:r>
+              <w:t xml:space="preserve">NOT NULL</w:t>
+            </w:r>
+          </w:p>
+        </w:tc>
+      </w:tr>
+      <w:tr>
+        <w:trPr>
+          <w:trHeight w:val="530" w:hRule="atLeast"/>
+        </w:trPr>
+        <w:tc>
+          <w:tcPr>
+            <w:tcW w:w="2000" w:type="dxa"/>
+          </w:tcPr>
+          <w:p>
+            <w:pPr/>
+            <w:r>
+              <w:t xml:space="preserve">is_active</w:t>
+            </w:r>
+          </w:p>
+        </w:tc>
+        <w:tc>
+          <w:tcPr>
+            <w:tcW w:w="2000" w:type="dxa"/>
+          </w:tcPr>
+          <w:p>
+            <w:pPr/>
+            <w:r>
+              <w:t xml:space="preserve">bit</w:t>
+            </w:r>
+          </w:p>
+        </w:tc>
+        <w:tc>
+          <w:tcPr>
+            <w:tcW w:w="2000" w:type="dxa"/>
+          </w:tcPr>
+          <w:p>
+            <w:pPr/>
+            <w:r>
+              <w:t xml:space="preserve">-</w:t>
+            </w:r>
+          </w:p>
+        </w:tc>
+        <w:tc>
+          <w:tcPr>
+            <w:tcW w:w="2000" w:type="dxa"/>
+          </w:tcPr>
+          <w:p>
+            <w:pPr/>
+            <w:r>
+              <w:t xml:space="preserve">NOT NULL</w:t>
+            </w:r>
+          </w:p>
+        </w:tc>
+      </w:tr>
+      <w:tr>
+        <w:trPr>
+          <w:trHeight w:val="530" w:hRule="atLeast"/>
+        </w:trPr>
+        <w:tc>
+          <w:tcPr>
+            <w:tcW w:w="2000" w:type="dxa"/>
+          </w:tcPr>
+          <w:p>
+            <w:pPr/>
+            <w:r>
+              <w:t xml:space="preserve">is_deleted</w:t>
+            </w:r>
+          </w:p>
+        </w:tc>
+        <w:tc>
+          <w:tcPr>
+            <w:tcW w:w="2000" w:type="dxa"/>
+          </w:tcPr>
+          <w:p>
+            <w:pPr/>
+            <w:r>
+              <w:t xml:space="preserve">bit</w:t>
+            </w:r>
+          </w:p>
+        </w:tc>
+        <w:tc>
+          <w:tcPr>
+            <w:tcW w:w="2000" w:type="dxa"/>
+          </w:tcPr>
+          <w:p>
+            <w:pPr/>
+            <w:r>
+              <w:t xml:space="preserve">-</w:t>
+            </w:r>
+          </w:p>
+        </w:tc>
+        <w:tc>
+          <w:tcPr>
+            <w:tcW w:w="2000" w:type="dxa"/>
+          </w:tcPr>
+          <w:p>
+            <w:pPr/>
+            <w:r>
+              <w:t xml:space="preserve">NOT NULL</w:t>
+            </w:r>
+          </w:p>
+        </w:tc>
+      </w:tr>
+    </w:tbl>
+    <w:p/>
+    <w:p>
+      <w:pPr/>
+      <w:r>
         <w:t xml:space="preserve">Table Name: sys_approval_delegation</w:t>
       </w:r>
     </w:p>
@@ -15512,6 +16216,63 @@
       </w:pPr>
       <w:r>
         <w:t xml:space="preserve">4.2.1.8 Settings Module</w:t>
+      </w:r>
+    </w:p>
+    <w:p>
+      <w:pPr>
+        <w:pStyle w:val="Heading5"/>
+      </w:pPr>
+      <w:r>
+        <w:t xml:space="preserve">4.2.1.8.30 Client Category View Interface</w:t>
+      </w:r>
+    </w:p>
+    <w:p>
+      <w:pPr>
+        <w:jc w:val="center"/>
+      </w:pPr>
+      <w:r>
+        <w:rPr>
+          <w:i/>
+        </w:rPr>
+        <w:t xml:space="preserve">[Pending] System screenshot of Client Category View Interface.</w:t>
+      </w:r>
+    </w:p>
+    <w:p>
+      <w:pPr>
+        <w:pStyle w:val="Heading5"/>
+      </w:pPr>
+      <w:r>
+        <w:t xml:space="preserve">4.2.1.8.31 Client Category Create Interface</w:t>
+      </w:r>
+    </w:p>
+    <w:p>
+      <w:pPr>
+        <w:jc w:val="center"/>
+      </w:pPr>
+      <w:r>
+        <w:rPr>
+          <w:i/>
+        </w:rPr>
+        <w:t xml:space="preserve">[Pending] System screenshot of Client Category Create Interface.</w:t>
+      </w:r>
+    </w:p>
+    <w:p>
+      <w:pPr>
+        <w:pStyle w:val="Heading5"/>
+      </w:pPr>
+      <w:r>
+        <w:t xml:space="preserve">4.2.1.8.32 Client Category Edit Interface</w:t>
+      </w:r>
+    </w:p>
+    <w:p>
+      <w:pPr>
+        <w:jc w:val="center"/>
+      </w:pPr>
+      <w:r>
+        <w:rPr>
+          <w:i/>
+        </w:rPr>
+        <w:t xml:space="preserve">[Pending] System screenshot of Client Category Edit Interface.</w:t>
       </w:r>
     </w:p>
     <w:p>
@@ -15933,7 +16694,7 @@
       </w:r>
     </w:p>
     <w:sectPr>
-      <w:footerReference xmlns:r="http://schemas.openxmlformats.org/officeDocument/2006/relationships" w:type="default" r:id="R62a5dccb302046ee"/>
+      <w:footerReference xmlns:r="http://schemas.openxmlformats.org/officeDocument/2006/relationships" w:type="default" r:id="Ra938b4cca5e9442d"/>
       <w:pgSz w:w="11906" w:h="16838"/>
       <w:pgMar w:top="1440" w:right="1440" w:bottom="1440" w:left="1440" w:header="720" w:footer="720" w:gutter="0"/>
     </w:sectPr>

</xml_diff>

<commit_message>
feat(md): add company-scoped customer master
- md_customer (REQ_DS43.106) with same-company composite FK to categories
- /api/v1/md/customers list/create/update with MD.CUSTOMER.* permissions
- block deleting categories referenced by customers (MD.CUSTOMER_CATEGORY.IN_USE)
- trilingual /md/customers page, component spec and E2E
- docs, traceability, backlog (WU-MD-023 for approve/reject/delete)

Co-Authored-By: Claude Opus 5.5 <noreply@anthropic.com>
</commit_message>
<xml_diff>
--- a/docs/99-output/MyERP_SDS.docx
+++ b/docs/99-output/MyERP_SDS.docx
@@ -613,6 +613,759 @@
     <w:p>
       <w:pPr/>
       <w:r>
+        <w:t xml:space="preserve">Table Name: md_customer</w:t>
+      </w:r>
+    </w:p>
+    <w:p>
+      <w:pPr/>
+      <w:r>
+        <w:t xml:space="preserve">Primary Key: id</w:t>
+      </w:r>
+    </w:p>
+    <w:p>
+      <w:pPr/>
+      <w:r>
+        <w:t xml:space="preserve">This table stores customer master records within a company.</w:t>
+      </w:r>
+    </w:p>
+    <w:tbl>
+      <w:tblPr>
+        <w:tblStyle w:val="TableGrid"/>
+        <w:tblW w:w="8000" w:type="dxa"/>
+        <w:jc w:val="left"/>
+        <w:tblBorders>
+          <w:top w:val="single" w:color="000000" w:sz="4" w:space="0"/>
+          <w:left w:val="single" w:color="000000" w:sz="4" w:space="0"/>
+          <w:bottom w:val="single" w:color="000000" w:sz="4" w:space="0"/>
+          <w:right w:val="single" w:color="000000" w:sz="4" w:space="0"/>
+          <w:insideH w:val="single" w:color="000000" w:sz="4" w:space="0"/>
+          <w:insideV w:val="single" w:color="000000" w:sz="4" w:space="0"/>
+        </w:tblBorders>
+        <w:tblLayout w:type="fixed"/>
+        <w:tblCellMar>
+          <w:top w:w="100" w:type="dxa"/>
+          <w:left w:w="100" w:type="dxa"/>
+          <w:bottom w:w="100" w:type="dxa"/>
+          <w:right w:w="100" w:type="dxa"/>
+        </w:tblCellMar>
+      </w:tblPr>
+      <w:tblGrid>
+        <w:gridCol w:w="2000"/>
+        <w:gridCol w:w="2000"/>
+        <w:gridCol w:w="2000"/>
+        <w:gridCol w:w="2000"/>
+      </w:tblGrid>
+      <w:tr>
+        <w:trPr>
+          <w:trHeight w:val="530" w:hRule="atLeast"/>
+        </w:trPr>
+        <w:tc>
+          <w:tcPr>
+            <w:tcW w:w="2000" w:type="dxa"/>
+          </w:tcPr>
+          <w:p>
+            <w:pPr>
+              <w:jc w:val="center"/>
+            </w:pPr>
+            <w:r>
+              <w:rPr>
+                <w:b/>
+              </w:rPr>
+              <w:t xml:space="preserve">Name of Attribute</w:t>
+            </w:r>
+          </w:p>
+        </w:tc>
+        <w:tc>
+          <w:tcPr>
+            <w:tcW w:w="2000" w:type="dxa"/>
+          </w:tcPr>
+          <w:p>
+            <w:pPr>
+              <w:jc w:val="center"/>
+            </w:pPr>
+            <w:r>
+              <w:rPr>
+                <w:b/>
+              </w:rPr>
+              <w:t xml:space="preserve">Data Type</w:t>
+            </w:r>
+          </w:p>
+        </w:tc>
+        <w:tc>
+          <w:tcPr>
+            <w:tcW w:w="2000" w:type="dxa"/>
+          </w:tcPr>
+          <w:p>
+            <w:pPr>
+              <w:jc w:val="center"/>
+            </w:pPr>
+            <w:r>
+              <w:rPr>
+                <w:b/>
+              </w:rPr>
+              <w:t xml:space="preserve">Size</w:t>
+            </w:r>
+          </w:p>
+        </w:tc>
+        <w:tc>
+          <w:tcPr>
+            <w:tcW w:w="2000" w:type="dxa"/>
+          </w:tcPr>
+          <w:p>
+            <w:pPr>
+              <w:jc w:val="center"/>
+            </w:pPr>
+            <w:r>
+              <w:rPr>
+                <w:b/>
+              </w:rPr>
+              <w:t xml:space="preserve">PK/FK/IS NULL/ NOT NULL</w:t>
+            </w:r>
+          </w:p>
+        </w:tc>
+      </w:tr>
+      <w:tr>
+        <w:trPr>
+          <w:trHeight w:val="530" w:hRule="atLeast"/>
+        </w:trPr>
+        <w:tc>
+          <w:tcPr>
+            <w:tcW w:w="2000" w:type="dxa"/>
+          </w:tcPr>
+          <w:p>
+            <w:pPr/>
+            <w:r>
+              <w:t xml:space="preserve">id</w:t>
+            </w:r>
+          </w:p>
+        </w:tc>
+        <w:tc>
+          <w:tcPr>
+            <w:tcW w:w="2000" w:type="dxa"/>
+          </w:tcPr>
+          <w:p>
+            <w:pPr/>
+            <w:r>
+              <w:t xml:space="preserve">bigint</w:t>
+            </w:r>
+          </w:p>
+        </w:tc>
+        <w:tc>
+          <w:tcPr>
+            <w:tcW w:w="2000" w:type="dxa"/>
+          </w:tcPr>
+          <w:p>
+            <w:pPr/>
+            <w:r>
+              <w:t xml:space="preserve">-</w:t>
+            </w:r>
+          </w:p>
+        </w:tc>
+        <w:tc>
+          <w:tcPr>
+            <w:tcW w:w="2000" w:type="dxa"/>
+          </w:tcPr>
+          <w:p>
+            <w:pPr/>
+            <w:r>
+              <w:t xml:space="preserve">PK, NOT NULL</w:t>
+            </w:r>
+          </w:p>
+        </w:tc>
+      </w:tr>
+      <w:tr>
+        <w:trPr>
+          <w:trHeight w:val="530" w:hRule="atLeast"/>
+        </w:trPr>
+        <w:tc>
+          <w:tcPr>
+            <w:tcW w:w="2000" w:type="dxa"/>
+          </w:tcPr>
+          <w:p>
+            <w:pPr/>
+            <w:r>
+              <w:t xml:space="preserve">code</w:t>
+            </w:r>
+          </w:p>
+        </w:tc>
+        <w:tc>
+          <w:tcPr>
+            <w:tcW w:w="2000" w:type="dxa"/>
+          </w:tcPr>
+          <w:p>
+            <w:pPr/>
+            <w:r>
+              <w:t xml:space="preserve">varchar</w:t>
+            </w:r>
+          </w:p>
+        </w:tc>
+        <w:tc>
+          <w:tcPr>
+            <w:tcW w:w="2000" w:type="dxa"/>
+          </w:tcPr>
+          <w:p>
+            <w:pPr/>
+            <w:r>
+              <w:t xml:space="preserve">30</w:t>
+            </w:r>
+          </w:p>
+        </w:tc>
+        <w:tc>
+          <w:tcPr>
+            <w:tcW w:w="2000" w:type="dxa"/>
+          </w:tcPr>
+          <w:p>
+            <w:pPr/>
+            <w:r>
+              <w:t xml:space="preserve">NOT NULL</w:t>
+            </w:r>
+          </w:p>
+        </w:tc>
+      </w:tr>
+      <w:tr>
+        <w:trPr>
+          <w:trHeight w:val="530" w:hRule="atLeast"/>
+        </w:trPr>
+        <w:tc>
+          <w:tcPr>
+            <w:tcW w:w="2000" w:type="dxa"/>
+          </w:tcPr>
+          <w:p>
+            <w:pPr/>
+            <w:r>
+              <w:t xml:space="preserve">name</w:t>
+            </w:r>
+          </w:p>
+        </w:tc>
+        <w:tc>
+          <w:tcPr>
+            <w:tcW w:w="2000" w:type="dxa"/>
+          </w:tcPr>
+          <w:p>
+            <w:pPr/>
+            <w:r>
+              <w:t xml:space="preserve">nvarchar</w:t>
+            </w:r>
+          </w:p>
+        </w:tc>
+        <w:tc>
+          <w:tcPr>
+            <w:tcW w:w="2000" w:type="dxa"/>
+          </w:tcPr>
+          <w:p>
+            <w:pPr/>
+            <w:r>
+              <w:t xml:space="preserve">200</w:t>
+            </w:r>
+          </w:p>
+        </w:tc>
+        <w:tc>
+          <w:tcPr>
+            <w:tcW w:w="2000" w:type="dxa"/>
+          </w:tcPr>
+          <w:p>
+            <w:pPr/>
+            <w:r>
+              <w:t xml:space="preserve">NOT NULL</w:t>
+            </w:r>
+          </w:p>
+        </w:tc>
+      </w:tr>
+      <w:tr>
+        <w:trPr>
+          <w:trHeight w:val="530" w:hRule="atLeast"/>
+        </w:trPr>
+        <w:tc>
+          <w:tcPr>
+            <w:tcW w:w="2000" w:type="dxa"/>
+          </w:tcPr>
+          <w:p>
+            <w:pPr/>
+            <w:r>
+              <w:t xml:space="preserve">category_id</w:t>
+            </w:r>
+          </w:p>
+        </w:tc>
+        <w:tc>
+          <w:tcPr>
+            <w:tcW w:w="2000" w:type="dxa"/>
+          </w:tcPr>
+          <w:p>
+            <w:pPr/>
+            <w:r>
+              <w:t xml:space="preserve">bigint</w:t>
+            </w:r>
+          </w:p>
+        </w:tc>
+        <w:tc>
+          <w:tcPr>
+            <w:tcW w:w="2000" w:type="dxa"/>
+          </w:tcPr>
+          <w:p>
+            <w:pPr/>
+            <w:r>
+              <w:t xml:space="preserve">-</w:t>
+            </w:r>
+          </w:p>
+        </w:tc>
+        <w:tc>
+          <w:tcPr>
+            <w:tcW w:w="2000" w:type="dxa"/>
+          </w:tcPr>
+          <w:p>
+            <w:pPr/>
+            <w:r>
+              <w:t xml:space="preserve">FK, IS NULL</w:t>
+            </w:r>
+          </w:p>
+        </w:tc>
+      </w:tr>
+      <w:tr>
+        <w:trPr>
+          <w:trHeight w:val="530" w:hRule="atLeast"/>
+        </w:trPr>
+        <w:tc>
+          <w:tcPr>
+            <w:tcW w:w="2000" w:type="dxa"/>
+          </w:tcPr>
+          <w:p>
+            <w:pPr/>
+            <w:r>
+              <w:t xml:space="preserve">custom_fields</w:t>
+            </w:r>
+          </w:p>
+        </w:tc>
+        <w:tc>
+          <w:tcPr>
+            <w:tcW w:w="2000" w:type="dxa"/>
+          </w:tcPr>
+          <w:p>
+            <w:pPr/>
+            <w:r>
+              <w:t xml:space="preserve">nvarchar</w:t>
+            </w:r>
+          </w:p>
+        </w:tc>
+        <w:tc>
+          <w:tcPr>
+            <w:tcW w:w="2000" w:type="dxa"/>
+          </w:tcPr>
+          <w:p>
+            <w:pPr/>
+            <w:r>
+              <w:t xml:space="preserve">MAX</w:t>
+            </w:r>
+          </w:p>
+        </w:tc>
+        <w:tc>
+          <w:tcPr>
+            <w:tcW w:w="2000" w:type="dxa"/>
+          </w:tcPr>
+          <w:p>
+            <w:pPr/>
+            <w:r>
+              <w:t xml:space="preserve">IS NULL</w:t>
+            </w:r>
+          </w:p>
+        </w:tc>
+      </w:tr>
+      <w:tr>
+        <w:trPr>
+          <w:trHeight w:val="530" w:hRule="atLeast"/>
+        </w:trPr>
+        <w:tc>
+          <w:tcPr>
+            <w:tcW w:w="2000" w:type="dxa"/>
+          </w:tcPr>
+          <w:p>
+            <w:pPr/>
+            <w:r>
+              <w:t xml:space="preserve">company_id</w:t>
+            </w:r>
+          </w:p>
+        </w:tc>
+        <w:tc>
+          <w:tcPr>
+            <w:tcW w:w="2000" w:type="dxa"/>
+          </w:tcPr>
+          <w:p>
+            <w:pPr/>
+            <w:r>
+              <w:t xml:space="preserve">bigint</w:t>
+            </w:r>
+          </w:p>
+        </w:tc>
+        <w:tc>
+          <w:tcPr>
+            <w:tcW w:w="2000" w:type="dxa"/>
+          </w:tcPr>
+          <w:p>
+            <w:pPr/>
+            <w:r>
+              <w:t xml:space="preserve">-</w:t>
+            </w:r>
+          </w:p>
+        </w:tc>
+        <w:tc>
+          <w:tcPr>
+            <w:tcW w:w="2000" w:type="dxa"/>
+          </w:tcPr>
+          <w:p>
+            <w:pPr/>
+            <w:r>
+              <w:t xml:space="preserve">FK, NOT NULL</w:t>
+            </w:r>
+          </w:p>
+        </w:tc>
+      </w:tr>
+      <w:tr>
+        <w:trPr>
+          <w:trHeight w:val="530" w:hRule="atLeast"/>
+        </w:trPr>
+        <w:tc>
+          <w:tcPr>
+            <w:tcW w:w="2000" w:type="dxa"/>
+          </w:tcPr>
+          <w:p>
+            <w:pPr/>
+            <w:r>
+              <w:t xml:space="preserve">created_at</w:t>
+            </w:r>
+          </w:p>
+        </w:tc>
+        <w:tc>
+          <w:tcPr>
+            <w:tcW w:w="2000" w:type="dxa"/>
+          </w:tcPr>
+          <w:p>
+            <w:pPr/>
+            <w:r>
+              <w:t xml:space="preserve">datetime2</w:t>
+            </w:r>
+          </w:p>
+        </w:tc>
+        <w:tc>
+          <w:tcPr>
+            <w:tcW w:w="2000" w:type="dxa"/>
+          </w:tcPr>
+          <w:p>
+            <w:pPr/>
+            <w:r>
+              <w:t xml:space="preserve">(6)</w:t>
+            </w:r>
+          </w:p>
+        </w:tc>
+        <w:tc>
+          <w:tcPr>
+            <w:tcW w:w="2000" w:type="dxa"/>
+          </w:tcPr>
+          <w:p>
+            <w:pPr/>
+            <w:r>
+              <w:t xml:space="preserve">NOT NULL</w:t>
+            </w:r>
+          </w:p>
+        </w:tc>
+      </w:tr>
+      <w:tr>
+        <w:trPr>
+          <w:trHeight w:val="530" w:hRule="atLeast"/>
+        </w:trPr>
+        <w:tc>
+          <w:tcPr>
+            <w:tcW w:w="2000" w:type="dxa"/>
+          </w:tcPr>
+          <w:p>
+            <w:pPr/>
+            <w:r>
+              <w:t xml:space="preserve">created_by</w:t>
+            </w:r>
+          </w:p>
+        </w:tc>
+        <w:tc>
+          <w:tcPr>
+            <w:tcW w:w="2000" w:type="dxa"/>
+          </w:tcPr>
+          <w:p>
+            <w:pPr/>
+            <w:r>
+              <w:t xml:space="preserve">bigint</w:t>
+            </w:r>
+          </w:p>
+        </w:tc>
+        <w:tc>
+          <w:tcPr>
+            <w:tcW w:w="2000" w:type="dxa"/>
+          </w:tcPr>
+          <w:p>
+            <w:pPr/>
+            <w:r>
+              <w:t xml:space="preserve">-</w:t>
+            </w:r>
+          </w:p>
+        </w:tc>
+        <w:tc>
+          <w:tcPr>
+            <w:tcW w:w="2000" w:type="dxa"/>
+          </w:tcPr>
+          <w:p>
+            <w:pPr/>
+            <w:r>
+              <w:t xml:space="preserve">NOT NULL</w:t>
+            </w:r>
+          </w:p>
+        </w:tc>
+      </w:tr>
+      <w:tr>
+        <w:trPr>
+          <w:trHeight w:val="530" w:hRule="atLeast"/>
+        </w:trPr>
+        <w:tc>
+          <w:tcPr>
+            <w:tcW w:w="2000" w:type="dxa"/>
+          </w:tcPr>
+          <w:p>
+            <w:pPr/>
+            <w:r>
+              <w:t xml:space="preserve">updated_at</w:t>
+            </w:r>
+          </w:p>
+        </w:tc>
+        <w:tc>
+          <w:tcPr>
+            <w:tcW w:w="2000" w:type="dxa"/>
+          </w:tcPr>
+          <w:p>
+            <w:pPr/>
+            <w:r>
+              <w:t xml:space="preserve">datetime2</w:t>
+            </w:r>
+          </w:p>
+        </w:tc>
+        <w:tc>
+          <w:tcPr>
+            <w:tcW w:w="2000" w:type="dxa"/>
+          </w:tcPr>
+          <w:p>
+            <w:pPr/>
+            <w:r>
+              <w:t xml:space="preserve">(6)</w:t>
+            </w:r>
+          </w:p>
+        </w:tc>
+        <w:tc>
+          <w:tcPr>
+            <w:tcW w:w="2000" w:type="dxa"/>
+          </w:tcPr>
+          <w:p>
+            <w:pPr/>
+            <w:r>
+              <w:t xml:space="preserve">IS NULL</w:t>
+            </w:r>
+          </w:p>
+        </w:tc>
+      </w:tr>
+      <w:tr>
+        <w:trPr>
+          <w:trHeight w:val="530" w:hRule="atLeast"/>
+        </w:trPr>
+        <w:tc>
+          <w:tcPr>
+            <w:tcW w:w="2000" w:type="dxa"/>
+          </w:tcPr>
+          <w:p>
+            <w:pPr/>
+            <w:r>
+              <w:t xml:space="preserve">updated_by</w:t>
+            </w:r>
+          </w:p>
+        </w:tc>
+        <w:tc>
+          <w:tcPr>
+            <w:tcW w:w="2000" w:type="dxa"/>
+          </w:tcPr>
+          <w:p>
+            <w:pPr/>
+            <w:r>
+              <w:t xml:space="preserve">bigint</w:t>
+            </w:r>
+          </w:p>
+        </w:tc>
+        <w:tc>
+          <w:tcPr>
+            <w:tcW w:w="2000" w:type="dxa"/>
+          </w:tcPr>
+          <w:p>
+            <w:pPr/>
+            <w:r>
+              <w:t xml:space="preserve">-</w:t>
+            </w:r>
+          </w:p>
+        </w:tc>
+        <w:tc>
+          <w:tcPr>
+            <w:tcW w:w="2000" w:type="dxa"/>
+          </w:tcPr>
+          <w:p>
+            <w:pPr/>
+            <w:r>
+              <w:t xml:space="preserve">IS NULL</w:t>
+            </w:r>
+          </w:p>
+        </w:tc>
+      </w:tr>
+      <w:tr>
+        <w:trPr>
+          <w:trHeight w:val="530" w:hRule="atLeast"/>
+        </w:trPr>
+        <w:tc>
+          <w:tcPr>
+            <w:tcW w:w="2000" w:type="dxa"/>
+          </w:tcPr>
+          <w:p>
+            <w:pPr/>
+            <w:r>
+              <w:t xml:space="preserve">version</w:t>
+            </w:r>
+          </w:p>
+        </w:tc>
+        <w:tc>
+          <w:tcPr>
+            <w:tcW w:w="2000" w:type="dxa"/>
+          </w:tcPr>
+          <w:p>
+            <w:pPr/>
+            <w:r>
+              <w:t xml:space="preserve">int</w:t>
+            </w:r>
+          </w:p>
+        </w:tc>
+        <w:tc>
+          <w:tcPr>
+            <w:tcW w:w="2000" w:type="dxa"/>
+          </w:tcPr>
+          <w:p>
+            <w:pPr/>
+            <w:r>
+              <w:t xml:space="preserve">-</w:t>
+            </w:r>
+          </w:p>
+        </w:tc>
+        <w:tc>
+          <w:tcPr>
+            <w:tcW w:w="2000" w:type="dxa"/>
+          </w:tcPr>
+          <w:p>
+            <w:pPr/>
+            <w:r>
+              <w:t xml:space="preserve">NOT NULL</w:t>
+            </w:r>
+          </w:p>
+        </w:tc>
+      </w:tr>
+      <w:tr>
+        <w:trPr>
+          <w:trHeight w:val="530" w:hRule="atLeast"/>
+        </w:trPr>
+        <w:tc>
+          <w:tcPr>
+            <w:tcW w:w="2000" w:type="dxa"/>
+          </w:tcPr>
+          <w:p>
+            <w:pPr/>
+            <w:r>
+              <w:t xml:space="preserve">is_active</w:t>
+            </w:r>
+          </w:p>
+        </w:tc>
+        <w:tc>
+          <w:tcPr>
+            <w:tcW w:w="2000" w:type="dxa"/>
+          </w:tcPr>
+          <w:p>
+            <w:pPr/>
+            <w:r>
+              <w:t xml:space="preserve">bit</w:t>
+            </w:r>
+          </w:p>
+        </w:tc>
+        <w:tc>
+          <w:tcPr>
+            <w:tcW w:w="2000" w:type="dxa"/>
+          </w:tcPr>
+          <w:p>
+            <w:pPr/>
+            <w:r>
+              <w:t xml:space="preserve">-</w:t>
+            </w:r>
+          </w:p>
+        </w:tc>
+        <w:tc>
+          <w:tcPr>
+            <w:tcW w:w="2000" w:type="dxa"/>
+          </w:tcPr>
+          <w:p>
+            <w:pPr/>
+            <w:r>
+              <w:t xml:space="preserve">NOT NULL</w:t>
+            </w:r>
+          </w:p>
+        </w:tc>
+      </w:tr>
+      <w:tr>
+        <w:trPr>
+          <w:trHeight w:val="530" w:hRule="atLeast"/>
+        </w:trPr>
+        <w:tc>
+          <w:tcPr>
+            <w:tcW w:w="2000" w:type="dxa"/>
+          </w:tcPr>
+          <w:p>
+            <w:pPr/>
+            <w:r>
+              <w:t xml:space="preserve">is_deleted</w:t>
+            </w:r>
+          </w:p>
+        </w:tc>
+        <w:tc>
+          <w:tcPr>
+            <w:tcW w:w="2000" w:type="dxa"/>
+          </w:tcPr>
+          <w:p>
+            <w:pPr/>
+            <w:r>
+              <w:t xml:space="preserve">bit</w:t>
+            </w:r>
+          </w:p>
+        </w:tc>
+        <w:tc>
+          <w:tcPr>
+            <w:tcW w:w="2000" w:type="dxa"/>
+          </w:tcPr>
+          <w:p>
+            <w:pPr/>
+            <w:r>
+              <w:t xml:space="preserve">-</w:t>
+            </w:r>
+          </w:p>
+        </w:tc>
+        <w:tc>
+          <w:tcPr>
+            <w:tcW w:w="2000" w:type="dxa"/>
+          </w:tcPr>
+          <w:p>
+            <w:pPr/>
+            <w:r>
+              <w:t xml:space="preserve">NOT NULL</w:t>
+            </w:r>
+          </w:p>
+        </w:tc>
+      </w:tr>
+    </w:tbl>
+    <w:p/>
+    <w:p>
+      <w:pPr/>
+      <w:r>
         <w:t xml:space="preserve">Table Name: md_customer_category</w:t>
       </w:r>
     </w:p>
@@ -16216,6 +16969,63 @@
       </w:pPr>
       <w:r>
         <w:t xml:space="preserve">4.2.1.8 Settings Module</w:t>
+      </w:r>
+    </w:p>
+    <w:p>
+      <w:pPr>
+        <w:pStyle w:val="Heading5"/>
+      </w:pPr>
+      <w:r>
+        <w:t xml:space="preserve">4.2.1.8.1 Client View Interface</w:t>
+      </w:r>
+    </w:p>
+    <w:p>
+      <w:pPr>
+        <w:jc w:val="center"/>
+      </w:pPr>
+      <w:r>
+        <w:rPr>
+          <w:i/>
+        </w:rPr>
+        <w:t xml:space="preserve">[Pending] System screenshot of Client View Interface.</w:t>
+      </w:r>
+    </w:p>
+    <w:p>
+      <w:pPr>
+        <w:pStyle w:val="Heading5"/>
+      </w:pPr>
+      <w:r>
+        <w:t xml:space="preserve">4.2.1.8.2 Client Create Interface</w:t>
+      </w:r>
+    </w:p>
+    <w:p>
+      <w:pPr>
+        <w:jc w:val="center"/>
+      </w:pPr>
+      <w:r>
+        <w:rPr>
+          <w:i/>
+        </w:rPr>
+        <w:t xml:space="preserve">[Pending] System screenshot of Client Create Interface.</w:t>
+      </w:r>
+    </w:p>
+    <w:p>
+      <w:pPr>
+        <w:pStyle w:val="Heading5"/>
+      </w:pPr>
+      <w:r>
+        <w:t xml:space="preserve">4.2.1.8.3 Client Edit Interface</w:t>
+      </w:r>
+    </w:p>
+    <w:p>
+      <w:pPr>
+        <w:jc w:val="center"/>
+      </w:pPr>
+      <w:r>
+        <w:rPr>
+          <w:i/>
+        </w:rPr>
+        <w:t xml:space="preserve">[Pending] System screenshot of Client Edit Interface.</w:t>
       </w:r>
     </w:p>
     <w:p>
@@ -16694,7 +17504,7 @@
       </w:r>
     </w:p>
     <w:sectPr>
-      <w:footerReference xmlns:r="http://schemas.openxmlformats.org/officeDocument/2006/relationships" w:type="default" r:id="Ra938b4cca5e9442d"/>
+      <w:footerReference xmlns:r="http://schemas.openxmlformats.org/officeDocument/2006/relationships" w:type="default" r:id="R305409763bb54bf2"/>
       <w:pgSz w:w="11906" w:h="16838"/>
       <w:pgMar w:top="1440" w:right="1440" w:bottom="1440" w:left="1440" w:header="720" w:footer="720" w:gutter="0"/>
     </w:sectPr>

</xml_diff>

<commit_message>
feat(md): add company-scoped supplier categories
- md_supplier_category (REQ_DS43.107) with (company_id, id) unique key for supplier FKs
- /api/v1/md/supplier-categories CRUD with MD.SUPPLIER_CATEGORY.* permissions
- share category domain/model/service (MasterCategoryService<T>) with customer categories
- shared CategoryList page configured per route; trilingual /md/supplier-categories and menu
- register md i18n scope in test fixtures; integration, unit and E2E tests
- docs, traceability, docgen output, state

Co-Authored-By: Claude Opus 5.5 <noreply@anthropic.com>
</commit_message>
<xml_diff>
--- a/docs/99-output/MyERP_SDS.docx
+++ b/docs/99-output/MyERP_SDS.docx
@@ -2070,6 +2070,710 @@
     <w:p>
       <w:pPr/>
       <w:r>
+        <w:t xml:space="preserve">Table Name: md_supplier_category</w:t>
+      </w:r>
+    </w:p>
+    <w:p>
+      <w:pPr/>
+      <w:r>
+        <w:t xml:space="preserve">Primary Key: id</w:t>
+      </w:r>
+    </w:p>
+    <w:p>
+      <w:pPr/>
+      <w:r>
+        <w:t xml:space="preserve">This table stores supplier categories within a company.</w:t>
+      </w:r>
+    </w:p>
+    <w:tbl>
+      <w:tblPr>
+        <w:tblStyle w:val="TableGrid"/>
+        <w:tblW w:w="8000" w:type="dxa"/>
+        <w:jc w:val="left"/>
+        <w:tblBorders>
+          <w:top w:val="single" w:color="000000" w:sz="4" w:space="0"/>
+          <w:left w:val="single" w:color="000000" w:sz="4" w:space="0"/>
+          <w:bottom w:val="single" w:color="000000" w:sz="4" w:space="0"/>
+          <w:right w:val="single" w:color="000000" w:sz="4" w:space="0"/>
+          <w:insideH w:val="single" w:color="000000" w:sz="4" w:space="0"/>
+          <w:insideV w:val="single" w:color="000000" w:sz="4" w:space="0"/>
+        </w:tblBorders>
+        <w:tblLayout w:type="fixed"/>
+        <w:tblCellMar>
+          <w:top w:w="100" w:type="dxa"/>
+          <w:left w:w="100" w:type="dxa"/>
+          <w:bottom w:w="100" w:type="dxa"/>
+          <w:right w:w="100" w:type="dxa"/>
+        </w:tblCellMar>
+      </w:tblPr>
+      <w:tblGrid>
+        <w:gridCol w:w="2000"/>
+        <w:gridCol w:w="2000"/>
+        <w:gridCol w:w="2000"/>
+        <w:gridCol w:w="2000"/>
+      </w:tblGrid>
+      <w:tr>
+        <w:trPr>
+          <w:trHeight w:val="530" w:hRule="atLeast"/>
+        </w:trPr>
+        <w:tc>
+          <w:tcPr>
+            <w:tcW w:w="2000" w:type="dxa"/>
+          </w:tcPr>
+          <w:p>
+            <w:pPr>
+              <w:jc w:val="center"/>
+            </w:pPr>
+            <w:r>
+              <w:rPr>
+                <w:b/>
+              </w:rPr>
+              <w:t xml:space="preserve">Name of Attribute</w:t>
+            </w:r>
+          </w:p>
+        </w:tc>
+        <w:tc>
+          <w:tcPr>
+            <w:tcW w:w="2000" w:type="dxa"/>
+          </w:tcPr>
+          <w:p>
+            <w:pPr>
+              <w:jc w:val="center"/>
+            </w:pPr>
+            <w:r>
+              <w:rPr>
+                <w:b/>
+              </w:rPr>
+              <w:t xml:space="preserve">Data Type</w:t>
+            </w:r>
+          </w:p>
+        </w:tc>
+        <w:tc>
+          <w:tcPr>
+            <w:tcW w:w="2000" w:type="dxa"/>
+          </w:tcPr>
+          <w:p>
+            <w:pPr>
+              <w:jc w:val="center"/>
+            </w:pPr>
+            <w:r>
+              <w:rPr>
+                <w:b/>
+              </w:rPr>
+              <w:t xml:space="preserve">Size</w:t>
+            </w:r>
+          </w:p>
+        </w:tc>
+        <w:tc>
+          <w:tcPr>
+            <w:tcW w:w="2000" w:type="dxa"/>
+          </w:tcPr>
+          <w:p>
+            <w:pPr>
+              <w:jc w:val="center"/>
+            </w:pPr>
+            <w:r>
+              <w:rPr>
+                <w:b/>
+              </w:rPr>
+              <w:t xml:space="preserve">PK/FK/IS NULL/ NOT NULL</w:t>
+            </w:r>
+          </w:p>
+        </w:tc>
+      </w:tr>
+      <w:tr>
+        <w:trPr>
+          <w:trHeight w:val="530" w:hRule="atLeast"/>
+        </w:trPr>
+        <w:tc>
+          <w:tcPr>
+            <w:tcW w:w="2000" w:type="dxa"/>
+          </w:tcPr>
+          <w:p>
+            <w:pPr/>
+            <w:r>
+              <w:t xml:space="preserve">id</w:t>
+            </w:r>
+          </w:p>
+        </w:tc>
+        <w:tc>
+          <w:tcPr>
+            <w:tcW w:w="2000" w:type="dxa"/>
+          </w:tcPr>
+          <w:p>
+            <w:pPr/>
+            <w:r>
+              <w:t xml:space="preserve">bigint</w:t>
+            </w:r>
+          </w:p>
+        </w:tc>
+        <w:tc>
+          <w:tcPr>
+            <w:tcW w:w="2000" w:type="dxa"/>
+          </w:tcPr>
+          <w:p>
+            <w:pPr/>
+            <w:r>
+              <w:t xml:space="preserve">-</w:t>
+            </w:r>
+          </w:p>
+        </w:tc>
+        <w:tc>
+          <w:tcPr>
+            <w:tcW w:w="2000" w:type="dxa"/>
+          </w:tcPr>
+          <w:p>
+            <w:pPr/>
+            <w:r>
+              <w:t xml:space="preserve">PK, NOT NULL</w:t>
+            </w:r>
+          </w:p>
+        </w:tc>
+      </w:tr>
+      <w:tr>
+        <w:trPr>
+          <w:trHeight w:val="530" w:hRule="atLeast"/>
+        </w:trPr>
+        <w:tc>
+          <w:tcPr>
+            <w:tcW w:w="2000" w:type="dxa"/>
+          </w:tcPr>
+          <w:p>
+            <w:pPr/>
+            <w:r>
+              <w:t xml:space="preserve">company_id</w:t>
+            </w:r>
+          </w:p>
+        </w:tc>
+        <w:tc>
+          <w:tcPr>
+            <w:tcW w:w="2000" w:type="dxa"/>
+          </w:tcPr>
+          <w:p>
+            <w:pPr/>
+            <w:r>
+              <w:t xml:space="preserve">bigint</w:t>
+            </w:r>
+          </w:p>
+        </w:tc>
+        <w:tc>
+          <w:tcPr>
+            <w:tcW w:w="2000" w:type="dxa"/>
+          </w:tcPr>
+          <w:p>
+            <w:pPr/>
+            <w:r>
+              <w:t xml:space="preserve">-</w:t>
+            </w:r>
+          </w:p>
+        </w:tc>
+        <w:tc>
+          <w:tcPr>
+            <w:tcW w:w="2000" w:type="dxa"/>
+          </w:tcPr>
+          <w:p>
+            <w:pPr/>
+            <w:r>
+              <w:t xml:space="preserve">NOT NULL</w:t>
+            </w:r>
+          </w:p>
+        </w:tc>
+      </w:tr>
+      <w:tr>
+        <w:trPr>
+          <w:trHeight w:val="530" w:hRule="atLeast"/>
+        </w:trPr>
+        <w:tc>
+          <w:tcPr>
+            <w:tcW w:w="2000" w:type="dxa"/>
+          </w:tcPr>
+          <w:p>
+            <w:pPr/>
+            <w:r>
+              <w:t xml:space="preserve">created_at</w:t>
+            </w:r>
+          </w:p>
+        </w:tc>
+        <w:tc>
+          <w:tcPr>
+            <w:tcW w:w="2000" w:type="dxa"/>
+          </w:tcPr>
+          <w:p>
+            <w:pPr/>
+            <w:r>
+              <w:t xml:space="preserve">datetime2</w:t>
+            </w:r>
+          </w:p>
+        </w:tc>
+        <w:tc>
+          <w:tcPr>
+            <w:tcW w:w="2000" w:type="dxa"/>
+          </w:tcPr>
+          <w:p>
+            <w:pPr/>
+            <w:r>
+              <w:t xml:space="preserve">(6)</w:t>
+            </w:r>
+          </w:p>
+        </w:tc>
+        <w:tc>
+          <w:tcPr>
+            <w:tcW w:w="2000" w:type="dxa"/>
+          </w:tcPr>
+          <w:p>
+            <w:pPr/>
+            <w:r>
+              <w:t xml:space="preserve">NOT NULL</w:t>
+            </w:r>
+          </w:p>
+        </w:tc>
+      </w:tr>
+      <w:tr>
+        <w:trPr>
+          <w:trHeight w:val="530" w:hRule="atLeast"/>
+        </w:trPr>
+        <w:tc>
+          <w:tcPr>
+            <w:tcW w:w="2000" w:type="dxa"/>
+          </w:tcPr>
+          <w:p>
+            <w:pPr/>
+            <w:r>
+              <w:t xml:space="preserve">created_by</w:t>
+            </w:r>
+          </w:p>
+        </w:tc>
+        <w:tc>
+          <w:tcPr>
+            <w:tcW w:w="2000" w:type="dxa"/>
+          </w:tcPr>
+          <w:p>
+            <w:pPr/>
+            <w:r>
+              <w:t xml:space="preserve">bigint</w:t>
+            </w:r>
+          </w:p>
+        </w:tc>
+        <w:tc>
+          <w:tcPr>
+            <w:tcW w:w="2000" w:type="dxa"/>
+          </w:tcPr>
+          <w:p>
+            <w:pPr/>
+            <w:r>
+              <w:t xml:space="preserve">-</w:t>
+            </w:r>
+          </w:p>
+        </w:tc>
+        <w:tc>
+          <w:tcPr>
+            <w:tcW w:w="2000" w:type="dxa"/>
+          </w:tcPr>
+          <w:p>
+            <w:pPr/>
+            <w:r>
+              <w:t xml:space="preserve">NOT NULL</w:t>
+            </w:r>
+          </w:p>
+        </w:tc>
+      </w:tr>
+      <w:tr>
+        <w:trPr>
+          <w:trHeight w:val="530" w:hRule="atLeast"/>
+        </w:trPr>
+        <w:tc>
+          <w:tcPr>
+            <w:tcW w:w="2000" w:type="dxa"/>
+          </w:tcPr>
+          <w:p>
+            <w:pPr/>
+            <w:r>
+              <w:t xml:space="preserve">updated_at</w:t>
+            </w:r>
+          </w:p>
+        </w:tc>
+        <w:tc>
+          <w:tcPr>
+            <w:tcW w:w="2000" w:type="dxa"/>
+          </w:tcPr>
+          <w:p>
+            <w:pPr/>
+            <w:r>
+              <w:t xml:space="preserve">datetime2</w:t>
+            </w:r>
+          </w:p>
+        </w:tc>
+        <w:tc>
+          <w:tcPr>
+            <w:tcW w:w="2000" w:type="dxa"/>
+          </w:tcPr>
+          <w:p>
+            <w:pPr/>
+            <w:r>
+              <w:t xml:space="preserve">(6)</w:t>
+            </w:r>
+          </w:p>
+        </w:tc>
+        <w:tc>
+          <w:tcPr>
+            <w:tcW w:w="2000" w:type="dxa"/>
+          </w:tcPr>
+          <w:p>
+            <w:pPr/>
+            <w:r>
+              <w:t xml:space="preserve">IS NULL</w:t>
+            </w:r>
+          </w:p>
+        </w:tc>
+      </w:tr>
+      <w:tr>
+        <w:trPr>
+          <w:trHeight w:val="530" w:hRule="atLeast"/>
+        </w:trPr>
+        <w:tc>
+          <w:tcPr>
+            <w:tcW w:w="2000" w:type="dxa"/>
+          </w:tcPr>
+          <w:p>
+            <w:pPr/>
+            <w:r>
+              <w:t xml:space="preserve">updated_by</w:t>
+            </w:r>
+          </w:p>
+        </w:tc>
+        <w:tc>
+          <w:tcPr>
+            <w:tcW w:w="2000" w:type="dxa"/>
+          </w:tcPr>
+          <w:p>
+            <w:pPr/>
+            <w:r>
+              <w:t xml:space="preserve">bigint</w:t>
+            </w:r>
+          </w:p>
+        </w:tc>
+        <w:tc>
+          <w:tcPr>
+            <w:tcW w:w="2000" w:type="dxa"/>
+          </w:tcPr>
+          <w:p>
+            <w:pPr/>
+            <w:r>
+              <w:t xml:space="preserve">-</w:t>
+            </w:r>
+          </w:p>
+        </w:tc>
+        <w:tc>
+          <w:tcPr>
+            <w:tcW w:w="2000" w:type="dxa"/>
+          </w:tcPr>
+          <w:p>
+            <w:pPr/>
+            <w:r>
+              <w:t xml:space="preserve">IS NULL</w:t>
+            </w:r>
+          </w:p>
+        </w:tc>
+      </w:tr>
+      <w:tr>
+        <w:trPr>
+          <w:trHeight w:val="530" w:hRule="atLeast"/>
+        </w:trPr>
+        <w:tc>
+          <w:tcPr>
+            <w:tcW w:w="2000" w:type="dxa"/>
+          </w:tcPr>
+          <w:p>
+            <w:pPr/>
+            <w:r>
+              <w:t xml:space="preserve">version</w:t>
+            </w:r>
+          </w:p>
+        </w:tc>
+        <w:tc>
+          <w:tcPr>
+            <w:tcW w:w="2000" w:type="dxa"/>
+          </w:tcPr>
+          <w:p>
+            <w:pPr/>
+            <w:r>
+              <w:t xml:space="preserve">int</w:t>
+            </w:r>
+          </w:p>
+        </w:tc>
+        <w:tc>
+          <w:tcPr>
+            <w:tcW w:w="2000" w:type="dxa"/>
+          </w:tcPr>
+          <w:p>
+            <w:pPr/>
+            <w:r>
+              <w:t xml:space="preserve">-</w:t>
+            </w:r>
+          </w:p>
+        </w:tc>
+        <w:tc>
+          <w:tcPr>
+            <w:tcW w:w="2000" w:type="dxa"/>
+          </w:tcPr>
+          <w:p>
+            <w:pPr/>
+            <w:r>
+              <w:t xml:space="preserve">NOT NULL</w:t>
+            </w:r>
+          </w:p>
+        </w:tc>
+      </w:tr>
+      <w:tr>
+        <w:trPr>
+          <w:trHeight w:val="530" w:hRule="atLeast"/>
+        </w:trPr>
+        <w:tc>
+          <w:tcPr>
+            <w:tcW w:w="2000" w:type="dxa"/>
+          </w:tcPr>
+          <w:p>
+            <w:pPr/>
+            <w:r>
+              <w:t xml:space="preserve">is_active</w:t>
+            </w:r>
+          </w:p>
+        </w:tc>
+        <w:tc>
+          <w:tcPr>
+            <w:tcW w:w="2000" w:type="dxa"/>
+          </w:tcPr>
+          <w:p>
+            <w:pPr/>
+            <w:r>
+              <w:t xml:space="preserve">bit</w:t>
+            </w:r>
+          </w:p>
+        </w:tc>
+        <w:tc>
+          <w:tcPr>
+            <w:tcW w:w="2000" w:type="dxa"/>
+          </w:tcPr>
+          <w:p>
+            <w:pPr/>
+            <w:r>
+              <w:t xml:space="preserve">-</w:t>
+            </w:r>
+          </w:p>
+        </w:tc>
+        <w:tc>
+          <w:tcPr>
+            <w:tcW w:w="2000" w:type="dxa"/>
+          </w:tcPr>
+          <w:p>
+            <w:pPr/>
+            <w:r>
+              <w:t xml:space="preserve">NOT NULL</w:t>
+            </w:r>
+          </w:p>
+        </w:tc>
+      </w:tr>
+      <w:tr>
+        <w:trPr>
+          <w:trHeight w:val="530" w:hRule="atLeast"/>
+        </w:trPr>
+        <w:tc>
+          <w:tcPr>
+            <w:tcW w:w="2000" w:type="dxa"/>
+          </w:tcPr>
+          <w:p>
+            <w:pPr/>
+            <w:r>
+              <w:t xml:space="preserve">is_deleted</w:t>
+            </w:r>
+          </w:p>
+        </w:tc>
+        <w:tc>
+          <w:tcPr>
+            <w:tcW w:w="2000" w:type="dxa"/>
+          </w:tcPr>
+          <w:p>
+            <w:pPr/>
+            <w:r>
+              <w:t xml:space="preserve">bit</w:t>
+            </w:r>
+          </w:p>
+        </w:tc>
+        <w:tc>
+          <w:tcPr>
+            <w:tcW w:w="2000" w:type="dxa"/>
+          </w:tcPr>
+          <w:p>
+            <w:pPr/>
+            <w:r>
+              <w:t xml:space="preserve">-</w:t>
+            </w:r>
+          </w:p>
+        </w:tc>
+        <w:tc>
+          <w:tcPr>
+            <w:tcW w:w="2000" w:type="dxa"/>
+          </w:tcPr>
+          <w:p>
+            <w:pPr/>
+            <w:r>
+              <w:t xml:space="preserve">NOT NULL</w:t>
+            </w:r>
+          </w:p>
+        </w:tc>
+      </w:tr>
+      <w:tr>
+        <w:trPr>
+          <w:trHeight w:val="530" w:hRule="atLeast"/>
+        </w:trPr>
+        <w:tc>
+          <w:tcPr>
+            <w:tcW w:w="2000" w:type="dxa"/>
+          </w:tcPr>
+          <w:p>
+            <w:pPr/>
+            <w:r>
+              <w:t xml:space="preserve">code</w:t>
+            </w:r>
+          </w:p>
+        </w:tc>
+        <w:tc>
+          <w:tcPr>
+            <w:tcW w:w="2000" w:type="dxa"/>
+          </w:tcPr>
+          <w:p>
+            <w:pPr/>
+            <w:r>
+              <w:t xml:space="preserve">varchar</w:t>
+            </w:r>
+          </w:p>
+        </w:tc>
+        <w:tc>
+          <w:tcPr>
+            <w:tcW w:w="2000" w:type="dxa"/>
+          </w:tcPr>
+          <w:p>
+            <w:pPr/>
+            <w:r>
+              <w:t xml:space="preserve">30</w:t>
+            </w:r>
+          </w:p>
+        </w:tc>
+        <w:tc>
+          <w:tcPr>
+            <w:tcW w:w="2000" w:type="dxa"/>
+          </w:tcPr>
+          <w:p>
+            <w:pPr/>
+            <w:r>
+              <w:t xml:space="preserve">NOT NULL</w:t>
+            </w:r>
+          </w:p>
+        </w:tc>
+      </w:tr>
+      <w:tr>
+        <w:trPr>
+          <w:trHeight w:val="530" w:hRule="atLeast"/>
+        </w:trPr>
+        <w:tc>
+          <w:tcPr>
+            <w:tcW w:w="2000" w:type="dxa"/>
+          </w:tcPr>
+          <w:p>
+            <w:pPr/>
+            <w:r>
+              <w:t xml:space="preserve">name</w:t>
+            </w:r>
+          </w:p>
+        </w:tc>
+        <w:tc>
+          <w:tcPr>
+            <w:tcW w:w="2000" w:type="dxa"/>
+          </w:tcPr>
+          <w:p>
+            <w:pPr/>
+            <w:r>
+              <w:t xml:space="preserve">nvarchar</w:t>
+            </w:r>
+          </w:p>
+        </w:tc>
+        <w:tc>
+          <w:tcPr>
+            <w:tcW w:w="2000" w:type="dxa"/>
+          </w:tcPr>
+          <w:p>
+            <w:pPr/>
+            <w:r>
+              <w:t xml:space="preserve">200</w:t>
+            </w:r>
+          </w:p>
+        </w:tc>
+        <w:tc>
+          <w:tcPr>
+            <w:tcW w:w="2000" w:type="dxa"/>
+          </w:tcPr>
+          <w:p>
+            <w:pPr/>
+            <w:r>
+              <w:t xml:space="preserve">NOT NULL</w:t>
+            </w:r>
+          </w:p>
+        </w:tc>
+      </w:tr>
+      <w:tr>
+        <w:trPr>
+          <w:trHeight w:val="530" w:hRule="atLeast"/>
+        </w:trPr>
+        <w:tc>
+          <w:tcPr>
+            <w:tcW w:w="2000" w:type="dxa"/>
+          </w:tcPr>
+          <w:p>
+            <w:pPr/>
+            <w:r>
+              <w:t xml:space="preserve">custom_fields</w:t>
+            </w:r>
+          </w:p>
+        </w:tc>
+        <w:tc>
+          <w:tcPr>
+            <w:tcW w:w="2000" w:type="dxa"/>
+          </w:tcPr>
+          <w:p>
+            <w:pPr/>
+            <w:r>
+              <w:t xml:space="preserve">nvarchar</w:t>
+            </w:r>
+          </w:p>
+        </w:tc>
+        <w:tc>
+          <w:tcPr>
+            <w:tcW w:w="2000" w:type="dxa"/>
+          </w:tcPr>
+          <w:p>
+            <w:pPr/>
+            <w:r>
+              <w:t xml:space="preserve">MAX</w:t>
+            </w:r>
+          </w:p>
+        </w:tc>
+        <w:tc>
+          <w:tcPr>
+            <w:tcW w:w="2000" w:type="dxa"/>
+          </w:tcPr>
+          <w:p>
+            <w:pPr/>
+            <w:r>
+              <w:t xml:space="preserve">IS NULL</w:t>
+            </w:r>
+          </w:p>
+        </w:tc>
+      </w:tr>
+    </w:tbl>
+    <w:p/>
+    <w:p>
+      <w:pPr/>
+      <w:r>
         <w:t xml:space="preserve">Table Name: sys_approval_delegation</w:t>
       </w:r>
     </w:p>
@@ -17083,6 +17787,63 @@
           <w:i/>
         </w:rPr>
         <w:t xml:space="preserve">[Pending] System screenshot of Client Category Edit Interface.</w:t>
+      </w:r>
+    </w:p>
+    <w:p>
+      <w:pPr>
+        <w:pStyle w:val="Heading5"/>
+      </w:pPr>
+      <w:r>
+        <w:t xml:space="preserve">4.2.1.8.33 Supplier Category View Interface</w:t>
+      </w:r>
+    </w:p>
+    <w:p>
+      <w:pPr>
+        <w:jc w:val="center"/>
+      </w:pPr>
+      <w:r>
+        <w:rPr>
+          <w:i/>
+        </w:rPr>
+        <w:t xml:space="preserve">[Pending] System screenshot of Supplier Category View Interface.</w:t>
+      </w:r>
+    </w:p>
+    <w:p>
+      <w:pPr>
+        <w:pStyle w:val="Heading5"/>
+      </w:pPr>
+      <w:r>
+        <w:t xml:space="preserve">4.2.1.8.34 Supplier Category Create Interface</w:t>
+      </w:r>
+    </w:p>
+    <w:p>
+      <w:pPr>
+        <w:jc w:val="center"/>
+      </w:pPr>
+      <w:r>
+        <w:rPr>
+          <w:i/>
+        </w:rPr>
+        <w:t xml:space="preserve">[Pending] System screenshot of Supplier Category Create Interface.</w:t>
+      </w:r>
+    </w:p>
+    <w:p>
+      <w:pPr>
+        <w:pStyle w:val="Heading5"/>
+      </w:pPr>
+      <w:r>
+        <w:t xml:space="preserve">4.2.1.8.35 Supplier Category Edit Interface</w:t>
+      </w:r>
+    </w:p>
+    <w:p>
+      <w:pPr>
+        <w:jc w:val="center"/>
+      </w:pPr>
+      <w:r>
+        <w:rPr>
+          <w:i/>
+        </w:rPr>
+        <w:t xml:space="preserve">[Pending] System screenshot of Supplier Category Edit Interface.</w:t>
       </w:r>
     </w:p>
     <w:p>
@@ -17504,7 +18265,7 @@
       </w:r>
     </w:p>
     <w:sectPr>
-      <w:footerReference xmlns:r="http://schemas.openxmlformats.org/officeDocument/2006/relationships" w:type="default" r:id="R305409763bb54bf2"/>
+      <w:footerReference xmlns:r="http://schemas.openxmlformats.org/officeDocument/2006/relationships" w:type="default" r:id="R018808c4f18342bf"/>
       <w:pgSz w:w="11906" w:h="16838"/>
       <w:pgMar w:top="1440" w:right="1440" w:bottom="1440" w:left="1440" w:header="720" w:footer="720" w:gutter="0"/>
     </w:sectPr>

</xml_diff>

<commit_message>
feat(md): add company-scoped supplier master
- md_supplier (REQ_DS43.108) with same-company composite FK to supplier categories
- /api/v1/md/suppliers list/create/update with MD.SUPPLIER.* permissions
- block deleting supplier categories referenced by suppliers (MD.SUPPLIER_CATEGORY.IN_USE)
- share BusinessPartner base/service/EF model and frontend PartnerList with customers
- trilingual /md/suppliers page, menu item, component specs and E2E
- docs, traceability, backlog (WU-MD-024 for approve/reject/delete)

Co-Authored-By: Claude Opus 5.5 <noreply@anthropic.com>
</commit_message>
<xml_diff>
--- a/docs/99-output/MyERP_SDS.docx
+++ b/docs/99-output/MyERP_SDS.docx
@@ -2070,6 +2070,759 @@
     <w:p>
       <w:pPr/>
       <w:r>
+        <w:t xml:space="preserve">Table Name: md_supplier</w:t>
+      </w:r>
+    </w:p>
+    <w:p>
+      <w:pPr/>
+      <w:r>
+        <w:t xml:space="preserve">Primary Key: id</w:t>
+      </w:r>
+    </w:p>
+    <w:p>
+      <w:pPr/>
+      <w:r>
+        <w:t xml:space="preserve">This table stores supplier master records within a company.</w:t>
+      </w:r>
+    </w:p>
+    <w:tbl>
+      <w:tblPr>
+        <w:tblStyle w:val="TableGrid"/>
+        <w:tblW w:w="8000" w:type="dxa"/>
+        <w:jc w:val="left"/>
+        <w:tblBorders>
+          <w:top w:val="single" w:color="000000" w:sz="4" w:space="0"/>
+          <w:left w:val="single" w:color="000000" w:sz="4" w:space="0"/>
+          <w:bottom w:val="single" w:color="000000" w:sz="4" w:space="0"/>
+          <w:right w:val="single" w:color="000000" w:sz="4" w:space="0"/>
+          <w:insideH w:val="single" w:color="000000" w:sz="4" w:space="0"/>
+          <w:insideV w:val="single" w:color="000000" w:sz="4" w:space="0"/>
+        </w:tblBorders>
+        <w:tblLayout w:type="fixed"/>
+        <w:tblCellMar>
+          <w:top w:w="100" w:type="dxa"/>
+          <w:left w:w="100" w:type="dxa"/>
+          <w:bottom w:w="100" w:type="dxa"/>
+          <w:right w:w="100" w:type="dxa"/>
+        </w:tblCellMar>
+      </w:tblPr>
+      <w:tblGrid>
+        <w:gridCol w:w="2000"/>
+        <w:gridCol w:w="2000"/>
+        <w:gridCol w:w="2000"/>
+        <w:gridCol w:w="2000"/>
+      </w:tblGrid>
+      <w:tr>
+        <w:trPr>
+          <w:trHeight w:val="530" w:hRule="atLeast"/>
+        </w:trPr>
+        <w:tc>
+          <w:tcPr>
+            <w:tcW w:w="2000" w:type="dxa"/>
+          </w:tcPr>
+          <w:p>
+            <w:pPr>
+              <w:jc w:val="center"/>
+            </w:pPr>
+            <w:r>
+              <w:rPr>
+                <w:b/>
+              </w:rPr>
+              <w:t xml:space="preserve">Name of Attribute</w:t>
+            </w:r>
+          </w:p>
+        </w:tc>
+        <w:tc>
+          <w:tcPr>
+            <w:tcW w:w="2000" w:type="dxa"/>
+          </w:tcPr>
+          <w:p>
+            <w:pPr>
+              <w:jc w:val="center"/>
+            </w:pPr>
+            <w:r>
+              <w:rPr>
+                <w:b/>
+              </w:rPr>
+              <w:t xml:space="preserve">Data Type</w:t>
+            </w:r>
+          </w:p>
+        </w:tc>
+        <w:tc>
+          <w:tcPr>
+            <w:tcW w:w="2000" w:type="dxa"/>
+          </w:tcPr>
+          <w:p>
+            <w:pPr>
+              <w:jc w:val="center"/>
+            </w:pPr>
+            <w:r>
+              <w:rPr>
+                <w:b/>
+              </w:rPr>
+              <w:t xml:space="preserve">Size</w:t>
+            </w:r>
+          </w:p>
+        </w:tc>
+        <w:tc>
+          <w:tcPr>
+            <w:tcW w:w="2000" w:type="dxa"/>
+          </w:tcPr>
+          <w:p>
+            <w:pPr>
+              <w:jc w:val="center"/>
+            </w:pPr>
+            <w:r>
+              <w:rPr>
+                <w:b/>
+              </w:rPr>
+              <w:t xml:space="preserve">PK/FK/IS NULL/ NOT NULL</w:t>
+            </w:r>
+          </w:p>
+        </w:tc>
+      </w:tr>
+      <w:tr>
+        <w:trPr>
+          <w:trHeight w:val="530" w:hRule="atLeast"/>
+        </w:trPr>
+        <w:tc>
+          <w:tcPr>
+            <w:tcW w:w="2000" w:type="dxa"/>
+          </w:tcPr>
+          <w:p>
+            <w:pPr/>
+            <w:r>
+              <w:t xml:space="preserve">id</w:t>
+            </w:r>
+          </w:p>
+        </w:tc>
+        <w:tc>
+          <w:tcPr>
+            <w:tcW w:w="2000" w:type="dxa"/>
+          </w:tcPr>
+          <w:p>
+            <w:pPr/>
+            <w:r>
+              <w:t xml:space="preserve">bigint</w:t>
+            </w:r>
+          </w:p>
+        </w:tc>
+        <w:tc>
+          <w:tcPr>
+            <w:tcW w:w="2000" w:type="dxa"/>
+          </w:tcPr>
+          <w:p>
+            <w:pPr/>
+            <w:r>
+              <w:t xml:space="preserve">-</w:t>
+            </w:r>
+          </w:p>
+        </w:tc>
+        <w:tc>
+          <w:tcPr>
+            <w:tcW w:w="2000" w:type="dxa"/>
+          </w:tcPr>
+          <w:p>
+            <w:pPr/>
+            <w:r>
+              <w:t xml:space="preserve">PK, NOT NULL</w:t>
+            </w:r>
+          </w:p>
+        </w:tc>
+      </w:tr>
+      <w:tr>
+        <w:trPr>
+          <w:trHeight w:val="530" w:hRule="atLeast"/>
+        </w:trPr>
+        <w:tc>
+          <w:tcPr>
+            <w:tcW w:w="2000" w:type="dxa"/>
+          </w:tcPr>
+          <w:p>
+            <w:pPr/>
+            <w:r>
+              <w:t xml:space="preserve">company_id</w:t>
+            </w:r>
+          </w:p>
+        </w:tc>
+        <w:tc>
+          <w:tcPr>
+            <w:tcW w:w="2000" w:type="dxa"/>
+          </w:tcPr>
+          <w:p>
+            <w:pPr/>
+            <w:r>
+              <w:t xml:space="preserve">bigint</w:t>
+            </w:r>
+          </w:p>
+        </w:tc>
+        <w:tc>
+          <w:tcPr>
+            <w:tcW w:w="2000" w:type="dxa"/>
+          </w:tcPr>
+          <w:p>
+            <w:pPr/>
+            <w:r>
+              <w:t xml:space="preserve">-</w:t>
+            </w:r>
+          </w:p>
+        </w:tc>
+        <w:tc>
+          <w:tcPr>
+            <w:tcW w:w="2000" w:type="dxa"/>
+          </w:tcPr>
+          <w:p>
+            <w:pPr/>
+            <w:r>
+              <w:t xml:space="preserve">FK, NOT NULL</w:t>
+            </w:r>
+          </w:p>
+        </w:tc>
+      </w:tr>
+      <w:tr>
+        <w:trPr>
+          <w:trHeight w:val="530" w:hRule="atLeast"/>
+        </w:trPr>
+        <w:tc>
+          <w:tcPr>
+            <w:tcW w:w="2000" w:type="dxa"/>
+          </w:tcPr>
+          <w:p>
+            <w:pPr/>
+            <w:r>
+              <w:t xml:space="preserve">created_at</w:t>
+            </w:r>
+          </w:p>
+        </w:tc>
+        <w:tc>
+          <w:tcPr>
+            <w:tcW w:w="2000" w:type="dxa"/>
+          </w:tcPr>
+          <w:p>
+            <w:pPr/>
+            <w:r>
+              <w:t xml:space="preserve">datetime2</w:t>
+            </w:r>
+          </w:p>
+        </w:tc>
+        <w:tc>
+          <w:tcPr>
+            <w:tcW w:w="2000" w:type="dxa"/>
+          </w:tcPr>
+          <w:p>
+            <w:pPr/>
+            <w:r>
+              <w:t xml:space="preserve">(6)</w:t>
+            </w:r>
+          </w:p>
+        </w:tc>
+        <w:tc>
+          <w:tcPr>
+            <w:tcW w:w="2000" w:type="dxa"/>
+          </w:tcPr>
+          <w:p>
+            <w:pPr/>
+            <w:r>
+              <w:t xml:space="preserve">NOT NULL</w:t>
+            </w:r>
+          </w:p>
+        </w:tc>
+      </w:tr>
+      <w:tr>
+        <w:trPr>
+          <w:trHeight w:val="530" w:hRule="atLeast"/>
+        </w:trPr>
+        <w:tc>
+          <w:tcPr>
+            <w:tcW w:w="2000" w:type="dxa"/>
+          </w:tcPr>
+          <w:p>
+            <w:pPr/>
+            <w:r>
+              <w:t xml:space="preserve">created_by</w:t>
+            </w:r>
+          </w:p>
+        </w:tc>
+        <w:tc>
+          <w:tcPr>
+            <w:tcW w:w="2000" w:type="dxa"/>
+          </w:tcPr>
+          <w:p>
+            <w:pPr/>
+            <w:r>
+              <w:t xml:space="preserve">bigint</w:t>
+            </w:r>
+          </w:p>
+        </w:tc>
+        <w:tc>
+          <w:tcPr>
+            <w:tcW w:w="2000" w:type="dxa"/>
+          </w:tcPr>
+          <w:p>
+            <w:pPr/>
+            <w:r>
+              <w:t xml:space="preserve">-</w:t>
+            </w:r>
+          </w:p>
+        </w:tc>
+        <w:tc>
+          <w:tcPr>
+            <w:tcW w:w="2000" w:type="dxa"/>
+          </w:tcPr>
+          <w:p>
+            <w:pPr/>
+            <w:r>
+              <w:t xml:space="preserve">NOT NULL</w:t>
+            </w:r>
+          </w:p>
+        </w:tc>
+      </w:tr>
+      <w:tr>
+        <w:trPr>
+          <w:trHeight w:val="530" w:hRule="atLeast"/>
+        </w:trPr>
+        <w:tc>
+          <w:tcPr>
+            <w:tcW w:w="2000" w:type="dxa"/>
+          </w:tcPr>
+          <w:p>
+            <w:pPr/>
+            <w:r>
+              <w:t xml:space="preserve">updated_at</w:t>
+            </w:r>
+          </w:p>
+        </w:tc>
+        <w:tc>
+          <w:tcPr>
+            <w:tcW w:w="2000" w:type="dxa"/>
+          </w:tcPr>
+          <w:p>
+            <w:pPr/>
+            <w:r>
+              <w:t xml:space="preserve">datetime2</w:t>
+            </w:r>
+          </w:p>
+        </w:tc>
+        <w:tc>
+          <w:tcPr>
+            <w:tcW w:w="2000" w:type="dxa"/>
+          </w:tcPr>
+          <w:p>
+            <w:pPr/>
+            <w:r>
+              <w:t xml:space="preserve">(6)</w:t>
+            </w:r>
+          </w:p>
+        </w:tc>
+        <w:tc>
+          <w:tcPr>
+            <w:tcW w:w="2000" w:type="dxa"/>
+          </w:tcPr>
+          <w:p>
+            <w:pPr/>
+            <w:r>
+              <w:t xml:space="preserve">IS NULL</w:t>
+            </w:r>
+          </w:p>
+        </w:tc>
+      </w:tr>
+      <w:tr>
+        <w:trPr>
+          <w:trHeight w:val="530" w:hRule="atLeast"/>
+        </w:trPr>
+        <w:tc>
+          <w:tcPr>
+            <w:tcW w:w="2000" w:type="dxa"/>
+          </w:tcPr>
+          <w:p>
+            <w:pPr/>
+            <w:r>
+              <w:t xml:space="preserve">updated_by</w:t>
+            </w:r>
+          </w:p>
+        </w:tc>
+        <w:tc>
+          <w:tcPr>
+            <w:tcW w:w="2000" w:type="dxa"/>
+          </w:tcPr>
+          <w:p>
+            <w:pPr/>
+            <w:r>
+              <w:t xml:space="preserve">bigint</w:t>
+            </w:r>
+          </w:p>
+        </w:tc>
+        <w:tc>
+          <w:tcPr>
+            <w:tcW w:w="2000" w:type="dxa"/>
+          </w:tcPr>
+          <w:p>
+            <w:pPr/>
+            <w:r>
+              <w:t xml:space="preserve">-</w:t>
+            </w:r>
+          </w:p>
+        </w:tc>
+        <w:tc>
+          <w:tcPr>
+            <w:tcW w:w="2000" w:type="dxa"/>
+          </w:tcPr>
+          <w:p>
+            <w:pPr/>
+            <w:r>
+              <w:t xml:space="preserve">IS NULL</w:t>
+            </w:r>
+          </w:p>
+        </w:tc>
+      </w:tr>
+      <w:tr>
+        <w:trPr>
+          <w:trHeight w:val="530" w:hRule="atLeast"/>
+        </w:trPr>
+        <w:tc>
+          <w:tcPr>
+            <w:tcW w:w="2000" w:type="dxa"/>
+          </w:tcPr>
+          <w:p>
+            <w:pPr/>
+            <w:r>
+              <w:t xml:space="preserve">version</w:t>
+            </w:r>
+          </w:p>
+        </w:tc>
+        <w:tc>
+          <w:tcPr>
+            <w:tcW w:w="2000" w:type="dxa"/>
+          </w:tcPr>
+          <w:p>
+            <w:pPr/>
+            <w:r>
+              <w:t xml:space="preserve">int</w:t>
+            </w:r>
+          </w:p>
+        </w:tc>
+        <w:tc>
+          <w:tcPr>
+            <w:tcW w:w="2000" w:type="dxa"/>
+          </w:tcPr>
+          <w:p>
+            <w:pPr/>
+            <w:r>
+              <w:t xml:space="preserve">-</w:t>
+            </w:r>
+          </w:p>
+        </w:tc>
+        <w:tc>
+          <w:tcPr>
+            <w:tcW w:w="2000" w:type="dxa"/>
+          </w:tcPr>
+          <w:p>
+            <w:pPr/>
+            <w:r>
+              <w:t xml:space="preserve">NOT NULL</w:t>
+            </w:r>
+          </w:p>
+        </w:tc>
+      </w:tr>
+      <w:tr>
+        <w:trPr>
+          <w:trHeight w:val="530" w:hRule="atLeast"/>
+        </w:trPr>
+        <w:tc>
+          <w:tcPr>
+            <w:tcW w:w="2000" w:type="dxa"/>
+          </w:tcPr>
+          <w:p>
+            <w:pPr/>
+            <w:r>
+              <w:t xml:space="preserve">is_active</w:t>
+            </w:r>
+          </w:p>
+        </w:tc>
+        <w:tc>
+          <w:tcPr>
+            <w:tcW w:w="2000" w:type="dxa"/>
+          </w:tcPr>
+          <w:p>
+            <w:pPr/>
+            <w:r>
+              <w:t xml:space="preserve">bit</w:t>
+            </w:r>
+          </w:p>
+        </w:tc>
+        <w:tc>
+          <w:tcPr>
+            <w:tcW w:w="2000" w:type="dxa"/>
+          </w:tcPr>
+          <w:p>
+            <w:pPr/>
+            <w:r>
+              <w:t xml:space="preserve">-</w:t>
+            </w:r>
+          </w:p>
+        </w:tc>
+        <w:tc>
+          <w:tcPr>
+            <w:tcW w:w="2000" w:type="dxa"/>
+          </w:tcPr>
+          <w:p>
+            <w:pPr/>
+            <w:r>
+              <w:t xml:space="preserve">NOT NULL</w:t>
+            </w:r>
+          </w:p>
+        </w:tc>
+      </w:tr>
+      <w:tr>
+        <w:trPr>
+          <w:trHeight w:val="530" w:hRule="atLeast"/>
+        </w:trPr>
+        <w:tc>
+          <w:tcPr>
+            <w:tcW w:w="2000" w:type="dxa"/>
+          </w:tcPr>
+          <w:p>
+            <w:pPr/>
+            <w:r>
+              <w:t xml:space="preserve">is_deleted</w:t>
+            </w:r>
+          </w:p>
+        </w:tc>
+        <w:tc>
+          <w:tcPr>
+            <w:tcW w:w="2000" w:type="dxa"/>
+          </w:tcPr>
+          <w:p>
+            <w:pPr/>
+            <w:r>
+              <w:t xml:space="preserve">bit</w:t>
+            </w:r>
+          </w:p>
+        </w:tc>
+        <w:tc>
+          <w:tcPr>
+            <w:tcW w:w="2000" w:type="dxa"/>
+          </w:tcPr>
+          <w:p>
+            <w:pPr/>
+            <w:r>
+              <w:t xml:space="preserve">-</w:t>
+            </w:r>
+          </w:p>
+        </w:tc>
+        <w:tc>
+          <w:tcPr>
+            <w:tcW w:w="2000" w:type="dxa"/>
+          </w:tcPr>
+          <w:p>
+            <w:pPr/>
+            <w:r>
+              <w:t xml:space="preserve">NOT NULL</w:t>
+            </w:r>
+          </w:p>
+        </w:tc>
+      </w:tr>
+      <w:tr>
+        <w:trPr>
+          <w:trHeight w:val="530" w:hRule="atLeast"/>
+        </w:trPr>
+        <w:tc>
+          <w:tcPr>
+            <w:tcW w:w="2000" w:type="dxa"/>
+          </w:tcPr>
+          <w:p>
+            <w:pPr/>
+            <w:r>
+              <w:t xml:space="preserve">code</w:t>
+            </w:r>
+          </w:p>
+        </w:tc>
+        <w:tc>
+          <w:tcPr>
+            <w:tcW w:w="2000" w:type="dxa"/>
+          </w:tcPr>
+          <w:p>
+            <w:pPr/>
+            <w:r>
+              <w:t xml:space="preserve">varchar</w:t>
+            </w:r>
+          </w:p>
+        </w:tc>
+        <w:tc>
+          <w:tcPr>
+            <w:tcW w:w="2000" w:type="dxa"/>
+          </w:tcPr>
+          <w:p>
+            <w:pPr/>
+            <w:r>
+              <w:t xml:space="preserve">30</w:t>
+            </w:r>
+          </w:p>
+        </w:tc>
+        <w:tc>
+          <w:tcPr>
+            <w:tcW w:w="2000" w:type="dxa"/>
+          </w:tcPr>
+          <w:p>
+            <w:pPr/>
+            <w:r>
+              <w:t xml:space="preserve">NOT NULL</w:t>
+            </w:r>
+          </w:p>
+        </w:tc>
+      </w:tr>
+      <w:tr>
+        <w:trPr>
+          <w:trHeight w:val="530" w:hRule="atLeast"/>
+        </w:trPr>
+        <w:tc>
+          <w:tcPr>
+            <w:tcW w:w="2000" w:type="dxa"/>
+          </w:tcPr>
+          <w:p>
+            <w:pPr/>
+            <w:r>
+              <w:t xml:space="preserve">name</w:t>
+            </w:r>
+          </w:p>
+        </w:tc>
+        <w:tc>
+          <w:tcPr>
+            <w:tcW w:w="2000" w:type="dxa"/>
+          </w:tcPr>
+          <w:p>
+            <w:pPr/>
+            <w:r>
+              <w:t xml:space="preserve">nvarchar</w:t>
+            </w:r>
+          </w:p>
+        </w:tc>
+        <w:tc>
+          <w:tcPr>
+            <w:tcW w:w="2000" w:type="dxa"/>
+          </w:tcPr>
+          <w:p>
+            <w:pPr/>
+            <w:r>
+              <w:t xml:space="preserve">200</w:t>
+            </w:r>
+          </w:p>
+        </w:tc>
+        <w:tc>
+          <w:tcPr>
+            <w:tcW w:w="2000" w:type="dxa"/>
+          </w:tcPr>
+          <w:p>
+            <w:pPr/>
+            <w:r>
+              <w:t xml:space="preserve">NOT NULL</w:t>
+            </w:r>
+          </w:p>
+        </w:tc>
+      </w:tr>
+      <w:tr>
+        <w:trPr>
+          <w:trHeight w:val="530" w:hRule="atLeast"/>
+        </w:trPr>
+        <w:tc>
+          <w:tcPr>
+            <w:tcW w:w="2000" w:type="dxa"/>
+          </w:tcPr>
+          <w:p>
+            <w:pPr/>
+            <w:r>
+              <w:t xml:space="preserve">category_id</w:t>
+            </w:r>
+          </w:p>
+        </w:tc>
+        <w:tc>
+          <w:tcPr>
+            <w:tcW w:w="2000" w:type="dxa"/>
+          </w:tcPr>
+          <w:p>
+            <w:pPr/>
+            <w:r>
+              <w:t xml:space="preserve">bigint</w:t>
+            </w:r>
+          </w:p>
+        </w:tc>
+        <w:tc>
+          <w:tcPr>
+            <w:tcW w:w="2000" w:type="dxa"/>
+          </w:tcPr>
+          <w:p>
+            <w:pPr/>
+            <w:r>
+              <w:t xml:space="preserve">-</w:t>
+            </w:r>
+          </w:p>
+        </w:tc>
+        <w:tc>
+          <w:tcPr>
+            <w:tcW w:w="2000" w:type="dxa"/>
+          </w:tcPr>
+          <w:p>
+            <w:pPr/>
+            <w:r>
+              <w:t xml:space="preserve">FK, IS NULL</w:t>
+            </w:r>
+          </w:p>
+        </w:tc>
+      </w:tr>
+      <w:tr>
+        <w:trPr>
+          <w:trHeight w:val="530" w:hRule="atLeast"/>
+        </w:trPr>
+        <w:tc>
+          <w:tcPr>
+            <w:tcW w:w="2000" w:type="dxa"/>
+          </w:tcPr>
+          <w:p>
+            <w:pPr/>
+            <w:r>
+              <w:t xml:space="preserve">custom_fields</w:t>
+            </w:r>
+          </w:p>
+        </w:tc>
+        <w:tc>
+          <w:tcPr>
+            <w:tcW w:w="2000" w:type="dxa"/>
+          </w:tcPr>
+          <w:p>
+            <w:pPr/>
+            <w:r>
+              <w:t xml:space="preserve">nvarchar</w:t>
+            </w:r>
+          </w:p>
+        </w:tc>
+        <w:tc>
+          <w:tcPr>
+            <w:tcW w:w="2000" w:type="dxa"/>
+          </w:tcPr>
+          <w:p>
+            <w:pPr/>
+            <w:r>
+              <w:t xml:space="preserve">MAX</w:t>
+            </w:r>
+          </w:p>
+        </w:tc>
+        <w:tc>
+          <w:tcPr>
+            <w:tcW w:w="2000" w:type="dxa"/>
+          </w:tcPr>
+          <w:p>
+            <w:pPr/>
+            <w:r>
+              <w:t xml:space="preserve">IS NULL</w:t>
+            </w:r>
+          </w:p>
+        </w:tc>
+      </w:tr>
+    </w:tbl>
+    <w:p/>
+    <w:p>
+      <w:pPr/>
+      <w:r>
         <w:t xml:space="preserve">Table Name: md_supplier_category</w:t>
       </w:r>
     </w:p>
@@ -17730,6 +18483,63 @@
           <w:i/>
         </w:rPr>
         <w:t xml:space="preserve">[Pending] System screenshot of Client Edit Interface.</w:t>
+      </w:r>
+    </w:p>
+    <w:p>
+      <w:pPr>
+        <w:pStyle w:val="Heading5"/>
+      </w:pPr>
+      <w:r>
+        <w:t xml:space="preserve">4.2.1.8.6 Supplier View Interface</w:t>
+      </w:r>
+    </w:p>
+    <w:p>
+      <w:pPr>
+        <w:jc w:val="center"/>
+      </w:pPr>
+      <w:r>
+        <w:rPr>
+          <w:i/>
+        </w:rPr>
+        <w:t xml:space="preserve">[Pending] System screenshot of Supplier View Interface.</w:t>
+      </w:r>
+    </w:p>
+    <w:p>
+      <w:pPr>
+        <w:pStyle w:val="Heading5"/>
+      </w:pPr>
+      <w:r>
+        <w:t xml:space="preserve">4.2.1.8.7 Supplier Create Interface</w:t>
+      </w:r>
+    </w:p>
+    <w:p>
+      <w:pPr>
+        <w:jc w:val="center"/>
+      </w:pPr>
+      <w:r>
+        <w:rPr>
+          <w:i/>
+        </w:rPr>
+        <w:t xml:space="preserve">[Pending] System screenshot of Supplier Create Interface.</w:t>
+      </w:r>
+    </w:p>
+    <w:p>
+      <w:pPr>
+        <w:pStyle w:val="Heading5"/>
+      </w:pPr>
+      <w:r>
+        <w:t xml:space="preserve">4.2.1.8.8 Supplier Edit Interface</w:t>
+      </w:r>
+    </w:p>
+    <w:p>
+      <w:pPr>
+        <w:jc w:val="center"/>
+      </w:pPr>
+      <w:r>
+        <w:rPr>
+          <w:i/>
+        </w:rPr>
+        <w:t xml:space="preserve">[Pending] System screenshot of Supplier Edit Interface.</w:t>
       </w:r>
     </w:p>
     <w:p>
@@ -18265,7 +19075,7 @@
       </w:r>
     </w:p>
     <w:sectPr>
-      <w:footerReference xmlns:r="http://schemas.openxmlformats.org/officeDocument/2006/relationships" w:type="default" r:id="R018808c4f18342bf"/>
+      <w:footerReference xmlns:r="http://schemas.openxmlformats.org/officeDocument/2006/relationships" w:type="default" r:id="R9a3604af1772468e"/>
       <w:pgSz w:w="11906" w:h="16838"/>
       <w:pgMar w:top="1440" w:right="1440" w:bottom="1440" w:left="1440" w:header="720" w:footer="720" w:gutter="0"/>
     </w:sectPr>

</xml_diff>

<commit_message>
feat(md): add units of measure and conversions
- md_uom (REQ_DS43.109) on the shared category base with 0-6 decimal places
- md_uom_conversion (REQ_DS43.110): decimal(15,6) factor, same-company composite FKs,
  at most one conversion path between two units (no self/reverse/cyclic), applock-serialized
- decimal path conversion rounded to the target unit; IUomConverter contract for other modules
- /api/v1/md/uoms and /api/v1/md/uom-conversions (incl. convert) with MD.UOM.* permissions
- trilingual /md/uoms page (units, conversions, calculator), menu item, specs and E2E
- ADR-034, docs, traceability, docgen outputs

Co-Authored-By: Claude Opus 5.5 <noreply@anthropic.com>
</commit_message>
<xml_diff>
--- a/docs/99-output/MyERP_SDS.docx
+++ b/docs/99-output/MyERP_SDS.docx
@@ -3527,6 +3527,1414 @@
     <w:p>
       <w:pPr/>
       <w:r>
+        <w:t xml:space="preserve">Table Name: md_uom</w:t>
+      </w:r>
+    </w:p>
+    <w:p>
+      <w:pPr/>
+      <w:r>
+        <w:t xml:space="preserve">Primary Key: id</w:t>
+      </w:r>
+    </w:p>
+    <w:p>
+      <w:pPr/>
+      <w:r>
+        <w:t xml:space="preserve">This table stores units of measurement within a company.</w:t>
+      </w:r>
+    </w:p>
+    <w:tbl>
+      <w:tblPr>
+        <w:tblStyle w:val="TableGrid"/>
+        <w:tblW w:w="8000" w:type="dxa"/>
+        <w:jc w:val="left"/>
+        <w:tblBorders>
+          <w:top w:val="single" w:color="000000" w:sz="4" w:space="0"/>
+          <w:left w:val="single" w:color="000000" w:sz="4" w:space="0"/>
+          <w:bottom w:val="single" w:color="000000" w:sz="4" w:space="0"/>
+          <w:right w:val="single" w:color="000000" w:sz="4" w:space="0"/>
+          <w:insideH w:val="single" w:color="000000" w:sz="4" w:space="0"/>
+          <w:insideV w:val="single" w:color="000000" w:sz="4" w:space="0"/>
+        </w:tblBorders>
+        <w:tblLayout w:type="fixed"/>
+        <w:tblCellMar>
+          <w:top w:w="100" w:type="dxa"/>
+          <w:left w:w="100" w:type="dxa"/>
+          <w:bottom w:w="100" w:type="dxa"/>
+          <w:right w:w="100" w:type="dxa"/>
+        </w:tblCellMar>
+      </w:tblPr>
+      <w:tblGrid>
+        <w:gridCol w:w="2000"/>
+        <w:gridCol w:w="2000"/>
+        <w:gridCol w:w="2000"/>
+        <w:gridCol w:w="2000"/>
+      </w:tblGrid>
+      <w:tr>
+        <w:trPr>
+          <w:trHeight w:val="530" w:hRule="atLeast"/>
+        </w:trPr>
+        <w:tc>
+          <w:tcPr>
+            <w:tcW w:w="2000" w:type="dxa"/>
+          </w:tcPr>
+          <w:p>
+            <w:pPr>
+              <w:jc w:val="center"/>
+            </w:pPr>
+            <w:r>
+              <w:rPr>
+                <w:b/>
+              </w:rPr>
+              <w:t xml:space="preserve">Name of Attribute</w:t>
+            </w:r>
+          </w:p>
+        </w:tc>
+        <w:tc>
+          <w:tcPr>
+            <w:tcW w:w="2000" w:type="dxa"/>
+          </w:tcPr>
+          <w:p>
+            <w:pPr>
+              <w:jc w:val="center"/>
+            </w:pPr>
+            <w:r>
+              <w:rPr>
+                <w:b/>
+              </w:rPr>
+              <w:t xml:space="preserve">Data Type</w:t>
+            </w:r>
+          </w:p>
+        </w:tc>
+        <w:tc>
+          <w:tcPr>
+            <w:tcW w:w="2000" w:type="dxa"/>
+          </w:tcPr>
+          <w:p>
+            <w:pPr>
+              <w:jc w:val="center"/>
+            </w:pPr>
+            <w:r>
+              <w:rPr>
+                <w:b/>
+              </w:rPr>
+              <w:t xml:space="preserve">Size</w:t>
+            </w:r>
+          </w:p>
+        </w:tc>
+        <w:tc>
+          <w:tcPr>
+            <w:tcW w:w="2000" w:type="dxa"/>
+          </w:tcPr>
+          <w:p>
+            <w:pPr>
+              <w:jc w:val="center"/>
+            </w:pPr>
+            <w:r>
+              <w:rPr>
+                <w:b/>
+              </w:rPr>
+              <w:t xml:space="preserve">PK/FK/IS NULL/ NOT NULL</w:t>
+            </w:r>
+          </w:p>
+        </w:tc>
+      </w:tr>
+      <w:tr>
+        <w:trPr>
+          <w:trHeight w:val="530" w:hRule="atLeast"/>
+        </w:trPr>
+        <w:tc>
+          <w:tcPr>
+            <w:tcW w:w="2000" w:type="dxa"/>
+          </w:tcPr>
+          <w:p>
+            <w:pPr/>
+            <w:r>
+              <w:t xml:space="preserve">id</w:t>
+            </w:r>
+          </w:p>
+        </w:tc>
+        <w:tc>
+          <w:tcPr>
+            <w:tcW w:w="2000" w:type="dxa"/>
+          </w:tcPr>
+          <w:p>
+            <w:pPr/>
+            <w:r>
+              <w:t xml:space="preserve">bigint</w:t>
+            </w:r>
+          </w:p>
+        </w:tc>
+        <w:tc>
+          <w:tcPr>
+            <w:tcW w:w="2000" w:type="dxa"/>
+          </w:tcPr>
+          <w:p>
+            <w:pPr/>
+            <w:r>
+              <w:t xml:space="preserve">-</w:t>
+            </w:r>
+          </w:p>
+        </w:tc>
+        <w:tc>
+          <w:tcPr>
+            <w:tcW w:w="2000" w:type="dxa"/>
+          </w:tcPr>
+          <w:p>
+            <w:pPr/>
+            <w:r>
+              <w:t xml:space="preserve">PK, NOT NULL</w:t>
+            </w:r>
+          </w:p>
+        </w:tc>
+      </w:tr>
+      <w:tr>
+        <w:trPr>
+          <w:trHeight w:val="530" w:hRule="atLeast"/>
+        </w:trPr>
+        <w:tc>
+          <w:tcPr>
+            <w:tcW w:w="2000" w:type="dxa"/>
+          </w:tcPr>
+          <w:p>
+            <w:pPr/>
+            <w:r>
+              <w:t xml:space="preserve">decimal_places</w:t>
+            </w:r>
+          </w:p>
+        </w:tc>
+        <w:tc>
+          <w:tcPr>
+            <w:tcW w:w="2000" w:type="dxa"/>
+          </w:tcPr>
+          <w:p>
+            <w:pPr/>
+            <w:r>
+              <w:t xml:space="preserve">int</w:t>
+            </w:r>
+          </w:p>
+        </w:tc>
+        <w:tc>
+          <w:tcPr>
+            <w:tcW w:w="2000" w:type="dxa"/>
+          </w:tcPr>
+          <w:p>
+            <w:pPr/>
+            <w:r>
+              <w:t xml:space="preserve">-</w:t>
+            </w:r>
+          </w:p>
+        </w:tc>
+        <w:tc>
+          <w:tcPr>
+            <w:tcW w:w="2000" w:type="dxa"/>
+          </w:tcPr>
+          <w:p>
+            <w:pPr/>
+            <w:r>
+              <w:t xml:space="preserve">NOT NULL</w:t>
+            </w:r>
+          </w:p>
+        </w:tc>
+      </w:tr>
+      <w:tr>
+        <w:trPr>
+          <w:trHeight w:val="530" w:hRule="atLeast"/>
+        </w:trPr>
+        <w:tc>
+          <w:tcPr>
+            <w:tcW w:w="2000" w:type="dxa"/>
+          </w:tcPr>
+          <w:p>
+            <w:pPr/>
+            <w:r>
+              <w:t xml:space="preserve">company_id</w:t>
+            </w:r>
+          </w:p>
+        </w:tc>
+        <w:tc>
+          <w:tcPr>
+            <w:tcW w:w="2000" w:type="dxa"/>
+          </w:tcPr>
+          <w:p>
+            <w:pPr/>
+            <w:r>
+              <w:t xml:space="preserve">bigint</w:t>
+            </w:r>
+          </w:p>
+        </w:tc>
+        <w:tc>
+          <w:tcPr>
+            <w:tcW w:w="2000" w:type="dxa"/>
+          </w:tcPr>
+          <w:p>
+            <w:pPr/>
+            <w:r>
+              <w:t xml:space="preserve">-</w:t>
+            </w:r>
+          </w:p>
+        </w:tc>
+        <w:tc>
+          <w:tcPr>
+            <w:tcW w:w="2000" w:type="dxa"/>
+          </w:tcPr>
+          <w:p>
+            <w:pPr/>
+            <w:r>
+              <w:t xml:space="preserve">NOT NULL</w:t>
+            </w:r>
+          </w:p>
+        </w:tc>
+      </w:tr>
+      <w:tr>
+        <w:trPr>
+          <w:trHeight w:val="530" w:hRule="atLeast"/>
+        </w:trPr>
+        <w:tc>
+          <w:tcPr>
+            <w:tcW w:w="2000" w:type="dxa"/>
+          </w:tcPr>
+          <w:p>
+            <w:pPr/>
+            <w:r>
+              <w:t xml:space="preserve">created_at</w:t>
+            </w:r>
+          </w:p>
+        </w:tc>
+        <w:tc>
+          <w:tcPr>
+            <w:tcW w:w="2000" w:type="dxa"/>
+          </w:tcPr>
+          <w:p>
+            <w:pPr/>
+            <w:r>
+              <w:t xml:space="preserve">datetime2</w:t>
+            </w:r>
+          </w:p>
+        </w:tc>
+        <w:tc>
+          <w:tcPr>
+            <w:tcW w:w="2000" w:type="dxa"/>
+          </w:tcPr>
+          <w:p>
+            <w:pPr/>
+            <w:r>
+              <w:t xml:space="preserve">(6)</w:t>
+            </w:r>
+          </w:p>
+        </w:tc>
+        <w:tc>
+          <w:tcPr>
+            <w:tcW w:w="2000" w:type="dxa"/>
+          </w:tcPr>
+          <w:p>
+            <w:pPr/>
+            <w:r>
+              <w:t xml:space="preserve">NOT NULL</w:t>
+            </w:r>
+          </w:p>
+        </w:tc>
+      </w:tr>
+      <w:tr>
+        <w:trPr>
+          <w:trHeight w:val="530" w:hRule="atLeast"/>
+        </w:trPr>
+        <w:tc>
+          <w:tcPr>
+            <w:tcW w:w="2000" w:type="dxa"/>
+          </w:tcPr>
+          <w:p>
+            <w:pPr/>
+            <w:r>
+              <w:t xml:space="preserve">created_by</w:t>
+            </w:r>
+          </w:p>
+        </w:tc>
+        <w:tc>
+          <w:tcPr>
+            <w:tcW w:w="2000" w:type="dxa"/>
+          </w:tcPr>
+          <w:p>
+            <w:pPr/>
+            <w:r>
+              <w:t xml:space="preserve">bigint</w:t>
+            </w:r>
+          </w:p>
+        </w:tc>
+        <w:tc>
+          <w:tcPr>
+            <w:tcW w:w="2000" w:type="dxa"/>
+          </w:tcPr>
+          <w:p>
+            <w:pPr/>
+            <w:r>
+              <w:t xml:space="preserve">-</w:t>
+            </w:r>
+          </w:p>
+        </w:tc>
+        <w:tc>
+          <w:tcPr>
+            <w:tcW w:w="2000" w:type="dxa"/>
+          </w:tcPr>
+          <w:p>
+            <w:pPr/>
+            <w:r>
+              <w:t xml:space="preserve">NOT NULL</w:t>
+            </w:r>
+          </w:p>
+        </w:tc>
+      </w:tr>
+      <w:tr>
+        <w:trPr>
+          <w:trHeight w:val="530" w:hRule="atLeast"/>
+        </w:trPr>
+        <w:tc>
+          <w:tcPr>
+            <w:tcW w:w="2000" w:type="dxa"/>
+          </w:tcPr>
+          <w:p>
+            <w:pPr/>
+            <w:r>
+              <w:t xml:space="preserve">updated_at</w:t>
+            </w:r>
+          </w:p>
+        </w:tc>
+        <w:tc>
+          <w:tcPr>
+            <w:tcW w:w="2000" w:type="dxa"/>
+          </w:tcPr>
+          <w:p>
+            <w:pPr/>
+            <w:r>
+              <w:t xml:space="preserve">datetime2</w:t>
+            </w:r>
+          </w:p>
+        </w:tc>
+        <w:tc>
+          <w:tcPr>
+            <w:tcW w:w="2000" w:type="dxa"/>
+          </w:tcPr>
+          <w:p>
+            <w:pPr/>
+            <w:r>
+              <w:t xml:space="preserve">(6)</w:t>
+            </w:r>
+          </w:p>
+        </w:tc>
+        <w:tc>
+          <w:tcPr>
+            <w:tcW w:w="2000" w:type="dxa"/>
+          </w:tcPr>
+          <w:p>
+            <w:pPr/>
+            <w:r>
+              <w:t xml:space="preserve">IS NULL</w:t>
+            </w:r>
+          </w:p>
+        </w:tc>
+      </w:tr>
+      <w:tr>
+        <w:trPr>
+          <w:trHeight w:val="530" w:hRule="atLeast"/>
+        </w:trPr>
+        <w:tc>
+          <w:tcPr>
+            <w:tcW w:w="2000" w:type="dxa"/>
+          </w:tcPr>
+          <w:p>
+            <w:pPr/>
+            <w:r>
+              <w:t xml:space="preserve">updated_by</w:t>
+            </w:r>
+          </w:p>
+        </w:tc>
+        <w:tc>
+          <w:tcPr>
+            <w:tcW w:w="2000" w:type="dxa"/>
+          </w:tcPr>
+          <w:p>
+            <w:pPr/>
+            <w:r>
+              <w:t xml:space="preserve">bigint</w:t>
+            </w:r>
+          </w:p>
+        </w:tc>
+        <w:tc>
+          <w:tcPr>
+            <w:tcW w:w="2000" w:type="dxa"/>
+          </w:tcPr>
+          <w:p>
+            <w:pPr/>
+            <w:r>
+              <w:t xml:space="preserve">-</w:t>
+            </w:r>
+          </w:p>
+        </w:tc>
+        <w:tc>
+          <w:tcPr>
+            <w:tcW w:w="2000" w:type="dxa"/>
+          </w:tcPr>
+          <w:p>
+            <w:pPr/>
+            <w:r>
+              <w:t xml:space="preserve">IS NULL</w:t>
+            </w:r>
+          </w:p>
+        </w:tc>
+      </w:tr>
+      <w:tr>
+        <w:trPr>
+          <w:trHeight w:val="530" w:hRule="atLeast"/>
+        </w:trPr>
+        <w:tc>
+          <w:tcPr>
+            <w:tcW w:w="2000" w:type="dxa"/>
+          </w:tcPr>
+          <w:p>
+            <w:pPr/>
+            <w:r>
+              <w:t xml:space="preserve">version</w:t>
+            </w:r>
+          </w:p>
+        </w:tc>
+        <w:tc>
+          <w:tcPr>
+            <w:tcW w:w="2000" w:type="dxa"/>
+          </w:tcPr>
+          <w:p>
+            <w:pPr/>
+            <w:r>
+              <w:t xml:space="preserve">int</w:t>
+            </w:r>
+          </w:p>
+        </w:tc>
+        <w:tc>
+          <w:tcPr>
+            <w:tcW w:w="2000" w:type="dxa"/>
+          </w:tcPr>
+          <w:p>
+            <w:pPr/>
+            <w:r>
+              <w:t xml:space="preserve">-</w:t>
+            </w:r>
+          </w:p>
+        </w:tc>
+        <w:tc>
+          <w:tcPr>
+            <w:tcW w:w="2000" w:type="dxa"/>
+          </w:tcPr>
+          <w:p>
+            <w:pPr/>
+            <w:r>
+              <w:t xml:space="preserve">NOT NULL</w:t>
+            </w:r>
+          </w:p>
+        </w:tc>
+      </w:tr>
+      <w:tr>
+        <w:trPr>
+          <w:trHeight w:val="530" w:hRule="atLeast"/>
+        </w:trPr>
+        <w:tc>
+          <w:tcPr>
+            <w:tcW w:w="2000" w:type="dxa"/>
+          </w:tcPr>
+          <w:p>
+            <w:pPr/>
+            <w:r>
+              <w:t xml:space="preserve">is_active</w:t>
+            </w:r>
+          </w:p>
+        </w:tc>
+        <w:tc>
+          <w:tcPr>
+            <w:tcW w:w="2000" w:type="dxa"/>
+          </w:tcPr>
+          <w:p>
+            <w:pPr/>
+            <w:r>
+              <w:t xml:space="preserve">bit</w:t>
+            </w:r>
+          </w:p>
+        </w:tc>
+        <w:tc>
+          <w:tcPr>
+            <w:tcW w:w="2000" w:type="dxa"/>
+          </w:tcPr>
+          <w:p>
+            <w:pPr/>
+            <w:r>
+              <w:t xml:space="preserve">-</w:t>
+            </w:r>
+          </w:p>
+        </w:tc>
+        <w:tc>
+          <w:tcPr>
+            <w:tcW w:w="2000" w:type="dxa"/>
+          </w:tcPr>
+          <w:p>
+            <w:pPr/>
+            <w:r>
+              <w:t xml:space="preserve">NOT NULL</w:t>
+            </w:r>
+          </w:p>
+        </w:tc>
+      </w:tr>
+      <w:tr>
+        <w:trPr>
+          <w:trHeight w:val="530" w:hRule="atLeast"/>
+        </w:trPr>
+        <w:tc>
+          <w:tcPr>
+            <w:tcW w:w="2000" w:type="dxa"/>
+          </w:tcPr>
+          <w:p>
+            <w:pPr/>
+            <w:r>
+              <w:t xml:space="preserve">is_deleted</w:t>
+            </w:r>
+          </w:p>
+        </w:tc>
+        <w:tc>
+          <w:tcPr>
+            <w:tcW w:w="2000" w:type="dxa"/>
+          </w:tcPr>
+          <w:p>
+            <w:pPr/>
+            <w:r>
+              <w:t xml:space="preserve">bit</w:t>
+            </w:r>
+          </w:p>
+        </w:tc>
+        <w:tc>
+          <w:tcPr>
+            <w:tcW w:w="2000" w:type="dxa"/>
+          </w:tcPr>
+          <w:p>
+            <w:pPr/>
+            <w:r>
+              <w:t xml:space="preserve">-</w:t>
+            </w:r>
+          </w:p>
+        </w:tc>
+        <w:tc>
+          <w:tcPr>
+            <w:tcW w:w="2000" w:type="dxa"/>
+          </w:tcPr>
+          <w:p>
+            <w:pPr/>
+            <w:r>
+              <w:t xml:space="preserve">NOT NULL</w:t>
+            </w:r>
+          </w:p>
+        </w:tc>
+      </w:tr>
+      <w:tr>
+        <w:trPr>
+          <w:trHeight w:val="530" w:hRule="atLeast"/>
+        </w:trPr>
+        <w:tc>
+          <w:tcPr>
+            <w:tcW w:w="2000" w:type="dxa"/>
+          </w:tcPr>
+          <w:p>
+            <w:pPr/>
+            <w:r>
+              <w:t xml:space="preserve">code</w:t>
+            </w:r>
+          </w:p>
+        </w:tc>
+        <w:tc>
+          <w:tcPr>
+            <w:tcW w:w="2000" w:type="dxa"/>
+          </w:tcPr>
+          <w:p>
+            <w:pPr/>
+            <w:r>
+              <w:t xml:space="preserve">varchar</w:t>
+            </w:r>
+          </w:p>
+        </w:tc>
+        <w:tc>
+          <w:tcPr>
+            <w:tcW w:w="2000" w:type="dxa"/>
+          </w:tcPr>
+          <w:p>
+            <w:pPr/>
+            <w:r>
+              <w:t xml:space="preserve">30</w:t>
+            </w:r>
+          </w:p>
+        </w:tc>
+        <w:tc>
+          <w:tcPr>
+            <w:tcW w:w="2000" w:type="dxa"/>
+          </w:tcPr>
+          <w:p>
+            <w:pPr/>
+            <w:r>
+              <w:t xml:space="preserve">NOT NULL</w:t>
+            </w:r>
+          </w:p>
+        </w:tc>
+      </w:tr>
+      <w:tr>
+        <w:trPr>
+          <w:trHeight w:val="530" w:hRule="atLeast"/>
+        </w:trPr>
+        <w:tc>
+          <w:tcPr>
+            <w:tcW w:w="2000" w:type="dxa"/>
+          </w:tcPr>
+          <w:p>
+            <w:pPr/>
+            <w:r>
+              <w:t xml:space="preserve">name</w:t>
+            </w:r>
+          </w:p>
+        </w:tc>
+        <w:tc>
+          <w:tcPr>
+            <w:tcW w:w="2000" w:type="dxa"/>
+          </w:tcPr>
+          <w:p>
+            <w:pPr/>
+            <w:r>
+              <w:t xml:space="preserve">nvarchar</w:t>
+            </w:r>
+          </w:p>
+        </w:tc>
+        <w:tc>
+          <w:tcPr>
+            <w:tcW w:w="2000" w:type="dxa"/>
+          </w:tcPr>
+          <w:p>
+            <w:pPr/>
+            <w:r>
+              <w:t xml:space="preserve">200</w:t>
+            </w:r>
+          </w:p>
+        </w:tc>
+        <w:tc>
+          <w:tcPr>
+            <w:tcW w:w="2000" w:type="dxa"/>
+          </w:tcPr>
+          <w:p>
+            <w:pPr/>
+            <w:r>
+              <w:t xml:space="preserve">NOT NULL</w:t>
+            </w:r>
+          </w:p>
+        </w:tc>
+      </w:tr>
+      <w:tr>
+        <w:trPr>
+          <w:trHeight w:val="530" w:hRule="atLeast"/>
+        </w:trPr>
+        <w:tc>
+          <w:tcPr>
+            <w:tcW w:w="2000" w:type="dxa"/>
+          </w:tcPr>
+          <w:p>
+            <w:pPr/>
+            <w:r>
+              <w:t xml:space="preserve">custom_fields</w:t>
+            </w:r>
+          </w:p>
+        </w:tc>
+        <w:tc>
+          <w:tcPr>
+            <w:tcW w:w="2000" w:type="dxa"/>
+          </w:tcPr>
+          <w:p>
+            <w:pPr/>
+            <w:r>
+              <w:t xml:space="preserve">nvarchar</w:t>
+            </w:r>
+          </w:p>
+        </w:tc>
+        <w:tc>
+          <w:tcPr>
+            <w:tcW w:w="2000" w:type="dxa"/>
+          </w:tcPr>
+          <w:p>
+            <w:pPr/>
+            <w:r>
+              <w:t xml:space="preserve">MAX</w:t>
+            </w:r>
+          </w:p>
+        </w:tc>
+        <w:tc>
+          <w:tcPr>
+            <w:tcW w:w="2000" w:type="dxa"/>
+          </w:tcPr>
+          <w:p>
+            <w:pPr/>
+            <w:r>
+              <w:t xml:space="preserve">IS NULL</w:t>
+            </w:r>
+          </w:p>
+        </w:tc>
+      </w:tr>
+    </w:tbl>
+    <w:p/>
+    <w:p>
+      <w:pPr/>
+      <w:r>
+        <w:t xml:space="preserve">Table Name: md_uom_conversion</w:t>
+      </w:r>
+    </w:p>
+    <w:p>
+      <w:pPr/>
+      <w:r>
+        <w:t xml:space="preserve">Primary Key: id</w:t>
+      </w:r>
+    </w:p>
+    <w:p>
+      <w:pPr/>
+      <w:r>
+        <w:t xml:space="preserve">This table stores conversion factors between units of measurement within a company.</w:t>
+      </w:r>
+    </w:p>
+    <w:tbl>
+      <w:tblPr>
+        <w:tblStyle w:val="TableGrid"/>
+        <w:tblW w:w="8000" w:type="dxa"/>
+        <w:jc w:val="left"/>
+        <w:tblBorders>
+          <w:top w:val="single" w:color="000000" w:sz="4" w:space="0"/>
+          <w:left w:val="single" w:color="000000" w:sz="4" w:space="0"/>
+          <w:bottom w:val="single" w:color="000000" w:sz="4" w:space="0"/>
+          <w:right w:val="single" w:color="000000" w:sz="4" w:space="0"/>
+          <w:insideH w:val="single" w:color="000000" w:sz="4" w:space="0"/>
+          <w:insideV w:val="single" w:color="000000" w:sz="4" w:space="0"/>
+        </w:tblBorders>
+        <w:tblLayout w:type="fixed"/>
+        <w:tblCellMar>
+          <w:top w:w="100" w:type="dxa"/>
+          <w:left w:w="100" w:type="dxa"/>
+          <w:bottom w:w="100" w:type="dxa"/>
+          <w:right w:w="100" w:type="dxa"/>
+        </w:tblCellMar>
+      </w:tblPr>
+      <w:tblGrid>
+        <w:gridCol w:w="2000"/>
+        <w:gridCol w:w="2000"/>
+        <w:gridCol w:w="2000"/>
+        <w:gridCol w:w="2000"/>
+      </w:tblGrid>
+      <w:tr>
+        <w:trPr>
+          <w:trHeight w:val="530" w:hRule="atLeast"/>
+        </w:trPr>
+        <w:tc>
+          <w:tcPr>
+            <w:tcW w:w="2000" w:type="dxa"/>
+          </w:tcPr>
+          <w:p>
+            <w:pPr>
+              <w:jc w:val="center"/>
+            </w:pPr>
+            <w:r>
+              <w:rPr>
+                <w:b/>
+              </w:rPr>
+              <w:t xml:space="preserve">Name of Attribute</w:t>
+            </w:r>
+          </w:p>
+        </w:tc>
+        <w:tc>
+          <w:tcPr>
+            <w:tcW w:w="2000" w:type="dxa"/>
+          </w:tcPr>
+          <w:p>
+            <w:pPr>
+              <w:jc w:val="center"/>
+            </w:pPr>
+            <w:r>
+              <w:rPr>
+                <w:b/>
+              </w:rPr>
+              <w:t xml:space="preserve">Data Type</w:t>
+            </w:r>
+          </w:p>
+        </w:tc>
+        <w:tc>
+          <w:tcPr>
+            <w:tcW w:w="2000" w:type="dxa"/>
+          </w:tcPr>
+          <w:p>
+            <w:pPr>
+              <w:jc w:val="center"/>
+            </w:pPr>
+            <w:r>
+              <w:rPr>
+                <w:b/>
+              </w:rPr>
+              <w:t xml:space="preserve">Size</w:t>
+            </w:r>
+          </w:p>
+        </w:tc>
+        <w:tc>
+          <w:tcPr>
+            <w:tcW w:w="2000" w:type="dxa"/>
+          </w:tcPr>
+          <w:p>
+            <w:pPr>
+              <w:jc w:val="center"/>
+            </w:pPr>
+            <w:r>
+              <w:rPr>
+                <w:b/>
+              </w:rPr>
+              <w:t xml:space="preserve">PK/FK/IS NULL/ NOT NULL</w:t>
+            </w:r>
+          </w:p>
+        </w:tc>
+      </w:tr>
+      <w:tr>
+        <w:trPr>
+          <w:trHeight w:val="530" w:hRule="atLeast"/>
+        </w:trPr>
+        <w:tc>
+          <w:tcPr>
+            <w:tcW w:w="2000" w:type="dxa"/>
+          </w:tcPr>
+          <w:p>
+            <w:pPr/>
+            <w:r>
+              <w:t xml:space="preserve">id</w:t>
+            </w:r>
+          </w:p>
+        </w:tc>
+        <w:tc>
+          <w:tcPr>
+            <w:tcW w:w="2000" w:type="dxa"/>
+          </w:tcPr>
+          <w:p>
+            <w:pPr/>
+            <w:r>
+              <w:t xml:space="preserve">bigint</w:t>
+            </w:r>
+          </w:p>
+        </w:tc>
+        <w:tc>
+          <w:tcPr>
+            <w:tcW w:w="2000" w:type="dxa"/>
+          </w:tcPr>
+          <w:p>
+            <w:pPr/>
+            <w:r>
+              <w:t xml:space="preserve">-</w:t>
+            </w:r>
+          </w:p>
+        </w:tc>
+        <w:tc>
+          <w:tcPr>
+            <w:tcW w:w="2000" w:type="dxa"/>
+          </w:tcPr>
+          <w:p>
+            <w:pPr/>
+            <w:r>
+              <w:t xml:space="preserve">PK, NOT NULL</w:t>
+            </w:r>
+          </w:p>
+        </w:tc>
+      </w:tr>
+      <w:tr>
+        <w:trPr>
+          <w:trHeight w:val="530" w:hRule="atLeast"/>
+        </w:trPr>
+        <w:tc>
+          <w:tcPr>
+            <w:tcW w:w="2000" w:type="dxa"/>
+          </w:tcPr>
+          <w:p>
+            <w:pPr/>
+            <w:r>
+              <w:t xml:space="preserve">from_uom_id</w:t>
+            </w:r>
+          </w:p>
+        </w:tc>
+        <w:tc>
+          <w:tcPr>
+            <w:tcW w:w="2000" w:type="dxa"/>
+          </w:tcPr>
+          <w:p>
+            <w:pPr/>
+            <w:r>
+              <w:t xml:space="preserve">bigint</w:t>
+            </w:r>
+          </w:p>
+        </w:tc>
+        <w:tc>
+          <w:tcPr>
+            <w:tcW w:w="2000" w:type="dxa"/>
+          </w:tcPr>
+          <w:p>
+            <w:pPr/>
+            <w:r>
+              <w:t xml:space="preserve">-</w:t>
+            </w:r>
+          </w:p>
+        </w:tc>
+        <w:tc>
+          <w:tcPr>
+            <w:tcW w:w="2000" w:type="dxa"/>
+          </w:tcPr>
+          <w:p>
+            <w:pPr/>
+            <w:r>
+              <w:t xml:space="preserve">FK, NOT NULL</w:t>
+            </w:r>
+          </w:p>
+        </w:tc>
+      </w:tr>
+      <w:tr>
+        <w:trPr>
+          <w:trHeight w:val="530" w:hRule="atLeast"/>
+        </w:trPr>
+        <w:tc>
+          <w:tcPr>
+            <w:tcW w:w="2000" w:type="dxa"/>
+          </w:tcPr>
+          <w:p>
+            <w:pPr/>
+            <w:r>
+              <w:t xml:space="preserve">to_uom_id</w:t>
+            </w:r>
+          </w:p>
+        </w:tc>
+        <w:tc>
+          <w:tcPr>
+            <w:tcW w:w="2000" w:type="dxa"/>
+          </w:tcPr>
+          <w:p>
+            <w:pPr/>
+            <w:r>
+              <w:t xml:space="preserve">bigint</w:t>
+            </w:r>
+          </w:p>
+        </w:tc>
+        <w:tc>
+          <w:tcPr>
+            <w:tcW w:w="2000" w:type="dxa"/>
+          </w:tcPr>
+          <w:p>
+            <w:pPr/>
+            <w:r>
+              <w:t xml:space="preserve">-</w:t>
+            </w:r>
+          </w:p>
+        </w:tc>
+        <w:tc>
+          <w:tcPr>
+            <w:tcW w:w="2000" w:type="dxa"/>
+          </w:tcPr>
+          <w:p>
+            <w:pPr/>
+            <w:r>
+              <w:t xml:space="preserve">FK, NOT NULL</w:t>
+            </w:r>
+          </w:p>
+        </w:tc>
+      </w:tr>
+      <w:tr>
+        <w:trPr>
+          <w:trHeight w:val="530" w:hRule="atLeast"/>
+        </w:trPr>
+        <w:tc>
+          <w:tcPr>
+            <w:tcW w:w="2000" w:type="dxa"/>
+          </w:tcPr>
+          <w:p>
+            <w:pPr/>
+            <w:r>
+              <w:t xml:space="preserve">factor</w:t>
+            </w:r>
+          </w:p>
+        </w:tc>
+        <w:tc>
+          <w:tcPr>
+            <w:tcW w:w="2000" w:type="dxa"/>
+          </w:tcPr>
+          <w:p>
+            <w:pPr/>
+            <w:r>
+              <w:t xml:space="preserve">decimal</w:t>
+            </w:r>
+          </w:p>
+        </w:tc>
+        <w:tc>
+          <w:tcPr>
+            <w:tcW w:w="2000" w:type="dxa"/>
+          </w:tcPr>
+          <w:p>
+            <w:pPr/>
+            <w:r>
+              <w:t xml:space="preserve">(15,6)</w:t>
+            </w:r>
+          </w:p>
+        </w:tc>
+        <w:tc>
+          <w:tcPr>
+            <w:tcW w:w="2000" w:type="dxa"/>
+          </w:tcPr>
+          <w:p>
+            <w:pPr/>
+            <w:r>
+              <w:t xml:space="preserve">NOT NULL</w:t>
+            </w:r>
+          </w:p>
+        </w:tc>
+      </w:tr>
+      <w:tr>
+        <w:trPr>
+          <w:trHeight w:val="530" w:hRule="atLeast"/>
+        </w:trPr>
+        <w:tc>
+          <w:tcPr>
+            <w:tcW w:w="2000" w:type="dxa"/>
+          </w:tcPr>
+          <w:p>
+            <w:pPr/>
+            <w:r>
+              <w:t xml:space="preserve">is_deleted</w:t>
+            </w:r>
+          </w:p>
+        </w:tc>
+        <w:tc>
+          <w:tcPr>
+            <w:tcW w:w="2000" w:type="dxa"/>
+          </w:tcPr>
+          <w:p>
+            <w:pPr/>
+            <w:r>
+              <w:t xml:space="preserve">bit</w:t>
+            </w:r>
+          </w:p>
+        </w:tc>
+        <w:tc>
+          <w:tcPr>
+            <w:tcW w:w="2000" w:type="dxa"/>
+          </w:tcPr>
+          <w:p>
+            <w:pPr/>
+            <w:r>
+              <w:t xml:space="preserve">-</w:t>
+            </w:r>
+          </w:p>
+        </w:tc>
+        <w:tc>
+          <w:tcPr>
+            <w:tcW w:w="2000" w:type="dxa"/>
+          </w:tcPr>
+          <w:p>
+            <w:pPr/>
+            <w:r>
+              <w:t xml:space="preserve">NOT NULL</w:t>
+            </w:r>
+          </w:p>
+        </w:tc>
+      </w:tr>
+      <w:tr>
+        <w:trPr>
+          <w:trHeight w:val="530" w:hRule="atLeast"/>
+        </w:trPr>
+        <w:tc>
+          <w:tcPr>
+            <w:tcW w:w="2000" w:type="dxa"/>
+          </w:tcPr>
+          <w:p>
+            <w:pPr/>
+            <w:r>
+              <w:t xml:space="preserve">company_id</w:t>
+            </w:r>
+          </w:p>
+        </w:tc>
+        <w:tc>
+          <w:tcPr>
+            <w:tcW w:w="2000" w:type="dxa"/>
+          </w:tcPr>
+          <w:p>
+            <w:pPr/>
+            <w:r>
+              <w:t xml:space="preserve">bigint</w:t>
+            </w:r>
+          </w:p>
+        </w:tc>
+        <w:tc>
+          <w:tcPr>
+            <w:tcW w:w="2000" w:type="dxa"/>
+          </w:tcPr>
+          <w:p>
+            <w:pPr/>
+            <w:r>
+              <w:t xml:space="preserve">-</w:t>
+            </w:r>
+          </w:p>
+        </w:tc>
+        <w:tc>
+          <w:tcPr>
+            <w:tcW w:w="2000" w:type="dxa"/>
+          </w:tcPr>
+          <w:p>
+            <w:pPr/>
+            <w:r>
+              <w:t xml:space="preserve">FK, NOT NULL</w:t>
+            </w:r>
+          </w:p>
+        </w:tc>
+      </w:tr>
+      <w:tr>
+        <w:trPr>
+          <w:trHeight w:val="530" w:hRule="atLeast"/>
+        </w:trPr>
+        <w:tc>
+          <w:tcPr>
+            <w:tcW w:w="2000" w:type="dxa"/>
+          </w:tcPr>
+          <w:p>
+            <w:pPr/>
+            <w:r>
+              <w:t xml:space="preserve">created_at</w:t>
+            </w:r>
+          </w:p>
+        </w:tc>
+        <w:tc>
+          <w:tcPr>
+            <w:tcW w:w="2000" w:type="dxa"/>
+          </w:tcPr>
+          <w:p>
+            <w:pPr/>
+            <w:r>
+              <w:t xml:space="preserve">datetime2</w:t>
+            </w:r>
+          </w:p>
+        </w:tc>
+        <w:tc>
+          <w:tcPr>
+            <w:tcW w:w="2000" w:type="dxa"/>
+          </w:tcPr>
+          <w:p>
+            <w:pPr/>
+            <w:r>
+              <w:t xml:space="preserve">(6)</w:t>
+            </w:r>
+          </w:p>
+        </w:tc>
+        <w:tc>
+          <w:tcPr>
+            <w:tcW w:w="2000" w:type="dxa"/>
+          </w:tcPr>
+          <w:p>
+            <w:pPr/>
+            <w:r>
+              <w:t xml:space="preserve">NOT NULL</w:t>
+            </w:r>
+          </w:p>
+        </w:tc>
+      </w:tr>
+      <w:tr>
+        <w:trPr>
+          <w:trHeight w:val="530" w:hRule="atLeast"/>
+        </w:trPr>
+        <w:tc>
+          <w:tcPr>
+            <w:tcW w:w="2000" w:type="dxa"/>
+          </w:tcPr>
+          <w:p>
+            <w:pPr/>
+            <w:r>
+              <w:t xml:space="preserve">created_by</w:t>
+            </w:r>
+          </w:p>
+        </w:tc>
+        <w:tc>
+          <w:tcPr>
+            <w:tcW w:w="2000" w:type="dxa"/>
+          </w:tcPr>
+          <w:p>
+            <w:pPr/>
+            <w:r>
+              <w:t xml:space="preserve">bigint</w:t>
+            </w:r>
+          </w:p>
+        </w:tc>
+        <w:tc>
+          <w:tcPr>
+            <w:tcW w:w="2000" w:type="dxa"/>
+          </w:tcPr>
+          <w:p>
+            <w:pPr/>
+            <w:r>
+              <w:t xml:space="preserve">-</w:t>
+            </w:r>
+          </w:p>
+        </w:tc>
+        <w:tc>
+          <w:tcPr>
+            <w:tcW w:w="2000" w:type="dxa"/>
+          </w:tcPr>
+          <w:p>
+            <w:pPr/>
+            <w:r>
+              <w:t xml:space="preserve">NOT NULL</w:t>
+            </w:r>
+          </w:p>
+        </w:tc>
+      </w:tr>
+      <w:tr>
+        <w:trPr>
+          <w:trHeight w:val="530" w:hRule="atLeast"/>
+        </w:trPr>
+        <w:tc>
+          <w:tcPr>
+            <w:tcW w:w="2000" w:type="dxa"/>
+          </w:tcPr>
+          <w:p>
+            <w:pPr/>
+            <w:r>
+              <w:t xml:space="preserve">updated_at</w:t>
+            </w:r>
+          </w:p>
+        </w:tc>
+        <w:tc>
+          <w:tcPr>
+            <w:tcW w:w="2000" w:type="dxa"/>
+          </w:tcPr>
+          <w:p>
+            <w:pPr/>
+            <w:r>
+              <w:t xml:space="preserve">datetime2</w:t>
+            </w:r>
+          </w:p>
+        </w:tc>
+        <w:tc>
+          <w:tcPr>
+            <w:tcW w:w="2000" w:type="dxa"/>
+          </w:tcPr>
+          <w:p>
+            <w:pPr/>
+            <w:r>
+              <w:t xml:space="preserve">(6)</w:t>
+            </w:r>
+          </w:p>
+        </w:tc>
+        <w:tc>
+          <w:tcPr>
+            <w:tcW w:w="2000" w:type="dxa"/>
+          </w:tcPr>
+          <w:p>
+            <w:pPr/>
+            <w:r>
+              <w:t xml:space="preserve">IS NULL</w:t>
+            </w:r>
+          </w:p>
+        </w:tc>
+      </w:tr>
+      <w:tr>
+        <w:trPr>
+          <w:trHeight w:val="530" w:hRule="atLeast"/>
+        </w:trPr>
+        <w:tc>
+          <w:tcPr>
+            <w:tcW w:w="2000" w:type="dxa"/>
+          </w:tcPr>
+          <w:p>
+            <w:pPr/>
+            <w:r>
+              <w:t xml:space="preserve">updated_by</w:t>
+            </w:r>
+          </w:p>
+        </w:tc>
+        <w:tc>
+          <w:tcPr>
+            <w:tcW w:w="2000" w:type="dxa"/>
+          </w:tcPr>
+          <w:p>
+            <w:pPr/>
+            <w:r>
+              <w:t xml:space="preserve">bigint</w:t>
+            </w:r>
+          </w:p>
+        </w:tc>
+        <w:tc>
+          <w:tcPr>
+            <w:tcW w:w="2000" w:type="dxa"/>
+          </w:tcPr>
+          <w:p>
+            <w:pPr/>
+            <w:r>
+              <w:t xml:space="preserve">-</w:t>
+            </w:r>
+          </w:p>
+        </w:tc>
+        <w:tc>
+          <w:tcPr>
+            <w:tcW w:w="2000" w:type="dxa"/>
+          </w:tcPr>
+          <w:p>
+            <w:pPr/>
+            <w:r>
+              <w:t xml:space="preserve">IS NULL</w:t>
+            </w:r>
+          </w:p>
+        </w:tc>
+      </w:tr>
+      <w:tr>
+        <w:trPr>
+          <w:trHeight w:val="530" w:hRule="atLeast"/>
+        </w:trPr>
+        <w:tc>
+          <w:tcPr>
+            <w:tcW w:w="2000" w:type="dxa"/>
+          </w:tcPr>
+          <w:p>
+            <w:pPr/>
+            <w:r>
+              <w:t xml:space="preserve">version</w:t>
+            </w:r>
+          </w:p>
+        </w:tc>
+        <w:tc>
+          <w:tcPr>
+            <w:tcW w:w="2000" w:type="dxa"/>
+          </w:tcPr>
+          <w:p>
+            <w:pPr/>
+            <w:r>
+              <w:t xml:space="preserve">int</w:t>
+            </w:r>
+          </w:p>
+        </w:tc>
+        <w:tc>
+          <w:tcPr>
+            <w:tcW w:w="2000" w:type="dxa"/>
+          </w:tcPr>
+          <w:p>
+            <w:pPr/>
+            <w:r>
+              <w:t xml:space="preserve">-</w:t>
+            </w:r>
+          </w:p>
+        </w:tc>
+        <w:tc>
+          <w:tcPr>
+            <w:tcW w:w="2000" w:type="dxa"/>
+          </w:tcPr>
+          <w:p>
+            <w:pPr/>
+            <w:r>
+              <w:t xml:space="preserve">NOT NULL</w:t>
+            </w:r>
+          </w:p>
+        </w:tc>
+      </w:tr>
+    </w:tbl>
+    <w:p/>
+    <w:p>
+      <w:pPr/>
+      <w:r>
         <w:t xml:space="preserve">Table Name: sys_approval_delegation</w:t>
       </w:r>
     </w:p>
@@ -18654,6 +20062,63 @@
           <w:i/>
         </w:rPr>
         <w:t xml:space="preserve">[Pending] System screenshot of Supplier Category Edit Interface.</w:t>
+      </w:r>
+    </w:p>
+    <w:p>
+      <w:pPr>
+        <w:pStyle w:val="Heading5"/>
+      </w:pPr>
+      <w:r>
+        <w:t xml:space="preserve">4.2.1.8.45 Unit of Measurement View Interface</w:t>
+      </w:r>
+    </w:p>
+    <w:p>
+      <w:pPr>
+        <w:jc w:val="center"/>
+      </w:pPr>
+      <w:r>
+        <w:rPr>
+          <w:i/>
+        </w:rPr>
+        <w:t xml:space="preserve">[Pending] System screenshot of Unit of Measurement View Interface.</w:t>
+      </w:r>
+    </w:p>
+    <w:p>
+      <w:pPr>
+        <w:pStyle w:val="Heading5"/>
+      </w:pPr>
+      <w:r>
+        <w:t xml:space="preserve">4.2.1.8.46 Unit of Measurement Create Interface</w:t>
+      </w:r>
+    </w:p>
+    <w:p>
+      <w:pPr>
+        <w:jc w:val="center"/>
+      </w:pPr>
+      <w:r>
+        <w:rPr>
+          <w:i/>
+        </w:rPr>
+        <w:t xml:space="preserve">[Pending] System screenshot of Unit of Measurement Create Interface.</w:t>
+      </w:r>
+    </w:p>
+    <w:p>
+      <w:pPr>
+        <w:pStyle w:val="Heading5"/>
+      </w:pPr>
+      <w:r>
+        <w:t xml:space="preserve">4.2.1.8.47 Unit of Measurement Edit Interface</w:t>
+      </w:r>
+    </w:p>
+    <w:p>
+      <w:pPr>
+        <w:jc w:val="center"/>
+      </w:pPr>
+      <w:r>
+        <w:rPr>
+          <w:i/>
+        </w:rPr>
+        <w:t xml:space="preserve">[Pending] System screenshot of Unit of Measurement Edit Interface.</w:t>
       </w:r>
     </w:p>
     <w:p>
@@ -19075,7 +20540,7 @@
       </w:r>
     </w:p>
     <w:sectPr>
-      <w:footerReference xmlns:r="http://schemas.openxmlformats.org/officeDocument/2006/relationships" w:type="default" r:id="R9a3604af1772468e"/>
+      <w:footerReference xmlns:r="http://schemas.openxmlformats.org/officeDocument/2006/relationships" w:type="default" r:id="R7d301c66f2bc4abc"/>
       <w:pgSz w:w="11906" w:h="16838"/>
       <w:pgMar w:top="1440" w:right="1440" w:bottom="1440" w:left="1440" w:header="720" w:footer="720" w:gutter="0"/>
     </w:sectPr>

</xml_diff>

<commit_message>
feat(md): add item brand and item category backend
- md_item_brand (REQ_DS43.111, merges BlueWhale Brand/GoodsBrand) on the shared category base
- md_item_category (REQ_DS43.112): tree up to 5 levels, same-company composite parent FK,
  active-parent / no-cycle / subtree-depth checks, cannot delete with children
- category writes serialized by company applock (CompanyLock.RunAsync, now shared with UoM conversions)
- /api/v1/md/item-brands and /api/v1/md/item-categories with MD.ITEM_BRAND.* / MD.ITEM_CATEGORY.*
- migration MasterData_ItemBrandCategory, 9 integration tests, docs and docgen outputs
- frontend pages follow in WU-MD-011 part 2

Co-Authored-By: Claude Opus 5.5 <noreply@anthropic.com>
</commit_message>
<xml_diff>
--- a/docs/99-output/MyERP_SDS.docx
+++ b/docs/99-output/MyERP_SDS.docx
@@ -2061,6 +2061,1463 @@
             <w:pPr/>
             <w:r>
               <w:t xml:space="preserve">NOT NULL</w:t>
+            </w:r>
+          </w:p>
+        </w:tc>
+      </w:tr>
+    </w:tbl>
+    <w:p/>
+    <w:p>
+      <w:pPr/>
+      <w:r>
+        <w:t xml:space="preserve">Table Name: md_item_brand</w:t>
+      </w:r>
+    </w:p>
+    <w:p>
+      <w:pPr/>
+      <w:r>
+        <w:t xml:space="preserve">Primary Key: id</w:t>
+      </w:r>
+    </w:p>
+    <w:p>
+      <w:pPr/>
+      <w:r>
+        <w:t xml:space="preserve">This table stores item brands within a company.</w:t>
+      </w:r>
+    </w:p>
+    <w:tbl>
+      <w:tblPr>
+        <w:tblStyle w:val="TableGrid"/>
+        <w:tblW w:w="8000" w:type="dxa"/>
+        <w:jc w:val="left"/>
+        <w:tblBorders>
+          <w:top w:val="single" w:color="000000" w:sz="4" w:space="0"/>
+          <w:left w:val="single" w:color="000000" w:sz="4" w:space="0"/>
+          <w:bottom w:val="single" w:color="000000" w:sz="4" w:space="0"/>
+          <w:right w:val="single" w:color="000000" w:sz="4" w:space="0"/>
+          <w:insideH w:val="single" w:color="000000" w:sz="4" w:space="0"/>
+          <w:insideV w:val="single" w:color="000000" w:sz="4" w:space="0"/>
+        </w:tblBorders>
+        <w:tblLayout w:type="fixed"/>
+        <w:tblCellMar>
+          <w:top w:w="100" w:type="dxa"/>
+          <w:left w:w="100" w:type="dxa"/>
+          <w:bottom w:w="100" w:type="dxa"/>
+          <w:right w:w="100" w:type="dxa"/>
+        </w:tblCellMar>
+      </w:tblPr>
+      <w:tblGrid>
+        <w:gridCol w:w="2000"/>
+        <w:gridCol w:w="2000"/>
+        <w:gridCol w:w="2000"/>
+        <w:gridCol w:w="2000"/>
+      </w:tblGrid>
+      <w:tr>
+        <w:trPr>
+          <w:trHeight w:val="530" w:hRule="atLeast"/>
+        </w:trPr>
+        <w:tc>
+          <w:tcPr>
+            <w:tcW w:w="2000" w:type="dxa"/>
+          </w:tcPr>
+          <w:p>
+            <w:pPr>
+              <w:jc w:val="center"/>
+            </w:pPr>
+            <w:r>
+              <w:rPr>
+                <w:b/>
+              </w:rPr>
+              <w:t xml:space="preserve">Name of Attribute</w:t>
+            </w:r>
+          </w:p>
+        </w:tc>
+        <w:tc>
+          <w:tcPr>
+            <w:tcW w:w="2000" w:type="dxa"/>
+          </w:tcPr>
+          <w:p>
+            <w:pPr>
+              <w:jc w:val="center"/>
+            </w:pPr>
+            <w:r>
+              <w:rPr>
+                <w:b/>
+              </w:rPr>
+              <w:t xml:space="preserve">Data Type</w:t>
+            </w:r>
+          </w:p>
+        </w:tc>
+        <w:tc>
+          <w:tcPr>
+            <w:tcW w:w="2000" w:type="dxa"/>
+          </w:tcPr>
+          <w:p>
+            <w:pPr>
+              <w:jc w:val="center"/>
+            </w:pPr>
+            <w:r>
+              <w:rPr>
+                <w:b/>
+              </w:rPr>
+              <w:t xml:space="preserve">Size</w:t>
+            </w:r>
+          </w:p>
+        </w:tc>
+        <w:tc>
+          <w:tcPr>
+            <w:tcW w:w="2000" w:type="dxa"/>
+          </w:tcPr>
+          <w:p>
+            <w:pPr>
+              <w:jc w:val="center"/>
+            </w:pPr>
+            <w:r>
+              <w:rPr>
+                <w:b/>
+              </w:rPr>
+              <w:t xml:space="preserve">PK/FK/IS NULL/ NOT NULL</w:t>
+            </w:r>
+          </w:p>
+        </w:tc>
+      </w:tr>
+      <w:tr>
+        <w:trPr>
+          <w:trHeight w:val="530" w:hRule="atLeast"/>
+        </w:trPr>
+        <w:tc>
+          <w:tcPr>
+            <w:tcW w:w="2000" w:type="dxa"/>
+          </w:tcPr>
+          <w:p>
+            <w:pPr/>
+            <w:r>
+              <w:t xml:space="preserve">id</w:t>
+            </w:r>
+          </w:p>
+        </w:tc>
+        <w:tc>
+          <w:tcPr>
+            <w:tcW w:w="2000" w:type="dxa"/>
+          </w:tcPr>
+          <w:p>
+            <w:pPr/>
+            <w:r>
+              <w:t xml:space="preserve">bigint</w:t>
+            </w:r>
+          </w:p>
+        </w:tc>
+        <w:tc>
+          <w:tcPr>
+            <w:tcW w:w="2000" w:type="dxa"/>
+          </w:tcPr>
+          <w:p>
+            <w:pPr/>
+            <w:r>
+              <w:t xml:space="preserve">-</w:t>
+            </w:r>
+          </w:p>
+        </w:tc>
+        <w:tc>
+          <w:tcPr>
+            <w:tcW w:w="2000" w:type="dxa"/>
+          </w:tcPr>
+          <w:p>
+            <w:pPr/>
+            <w:r>
+              <w:t xml:space="preserve">PK, NOT NULL</w:t>
+            </w:r>
+          </w:p>
+        </w:tc>
+      </w:tr>
+      <w:tr>
+        <w:trPr>
+          <w:trHeight w:val="530" w:hRule="atLeast"/>
+        </w:trPr>
+        <w:tc>
+          <w:tcPr>
+            <w:tcW w:w="2000" w:type="dxa"/>
+          </w:tcPr>
+          <w:p>
+            <w:pPr/>
+            <w:r>
+              <w:t xml:space="preserve">company_id</w:t>
+            </w:r>
+          </w:p>
+        </w:tc>
+        <w:tc>
+          <w:tcPr>
+            <w:tcW w:w="2000" w:type="dxa"/>
+          </w:tcPr>
+          <w:p>
+            <w:pPr/>
+            <w:r>
+              <w:t xml:space="preserve">bigint</w:t>
+            </w:r>
+          </w:p>
+        </w:tc>
+        <w:tc>
+          <w:tcPr>
+            <w:tcW w:w="2000" w:type="dxa"/>
+          </w:tcPr>
+          <w:p>
+            <w:pPr/>
+            <w:r>
+              <w:t xml:space="preserve">-</w:t>
+            </w:r>
+          </w:p>
+        </w:tc>
+        <w:tc>
+          <w:tcPr>
+            <w:tcW w:w="2000" w:type="dxa"/>
+          </w:tcPr>
+          <w:p>
+            <w:pPr/>
+            <w:r>
+              <w:t xml:space="preserve">NOT NULL</w:t>
+            </w:r>
+          </w:p>
+        </w:tc>
+      </w:tr>
+      <w:tr>
+        <w:trPr>
+          <w:trHeight w:val="530" w:hRule="atLeast"/>
+        </w:trPr>
+        <w:tc>
+          <w:tcPr>
+            <w:tcW w:w="2000" w:type="dxa"/>
+          </w:tcPr>
+          <w:p>
+            <w:pPr/>
+            <w:r>
+              <w:t xml:space="preserve">created_at</w:t>
+            </w:r>
+          </w:p>
+        </w:tc>
+        <w:tc>
+          <w:tcPr>
+            <w:tcW w:w="2000" w:type="dxa"/>
+          </w:tcPr>
+          <w:p>
+            <w:pPr/>
+            <w:r>
+              <w:t xml:space="preserve">datetime2</w:t>
+            </w:r>
+          </w:p>
+        </w:tc>
+        <w:tc>
+          <w:tcPr>
+            <w:tcW w:w="2000" w:type="dxa"/>
+          </w:tcPr>
+          <w:p>
+            <w:pPr/>
+            <w:r>
+              <w:t xml:space="preserve">(6)</w:t>
+            </w:r>
+          </w:p>
+        </w:tc>
+        <w:tc>
+          <w:tcPr>
+            <w:tcW w:w="2000" w:type="dxa"/>
+          </w:tcPr>
+          <w:p>
+            <w:pPr/>
+            <w:r>
+              <w:t xml:space="preserve">NOT NULL</w:t>
+            </w:r>
+          </w:p>
+        </w:tc>
+      </w:tr>
+      <w:tr>
+        <w:trPr>
+          <w:trHeight w:val="530" w:hRule="atLeast"/>
+        </w:trPr>
+        <w:tc>
+          <w:tcPr>
+            <w:tcW w:w="2000" w:type="dxa"/>
+          </w:tcPr>
+          <w:p>
+            <w:pPr/>
+            <w:r>
+              <w:t xml:space="preserve">created_by</w:t>
+            </w:r>
+          </w:p>
+        </w:tc>
+        <w:tc>
+          <w:tcPr>
+            <w:tcW w:w="2000" w:type="dxa"/>
+          </w:tcPr>
+          <w:p>
+            <w:pPr/>
+            <w:r>
+              <w:t xml:space="preserve">bigint</w:t>
+            </w:r>
+          </w:p>
+        </w:tc>
+        <w:tc>
+          <w:tcPr>
+            <w:tcW w:w="2000" w:type="dxa"/>
+          </w:tcPr>
+          <w:p>
+            <w:pPr/>
+            <w:r>
+              <w:t xml:space="preserve">-</w:t>
+            </w:r>
+          </w:p>
+        </w:tc>
+        <w:tc>
+          <w:tcPr>
+            <w:tcW w:w="2000" w:type="dxa"/>
+          </w:tcPr>
+          <w:p>
+            <w:pPr/>
+            <w:r>
+              <w:t xml:space="preserve">NOT NULL</w:t>
+            </w:r>
+          </w:p>
+        </w:tc>
+      </w:tr>
+      <w:tr>
+        <w:trPr>
+          <w:trHeight w:val="530" w:hRule="atLeast"/>
+        </w:trPr>
+        <w:tc>
+          <w:tcPr>
+            <w:tcW w:w="2000" w:type="dxa"/>
+          </w:tcPr>
+          <w:p>
+            <w:pPr/>
+            <w:r>
+              <w:t xml:space="preserve">updated_at</w:t>
+            </w:r>
+          </w:p>
+        </w:tc>
+        <w:tc>
+          <w:tcPr>
+            <w:tcW w:w="2000" w:type="dxa"/>
+          </w:tcPr>
+          <w:p>
+            <w:pPr/>
+            <w:r>
+              <w:t xml:space="preserve">datetime2</w:t>
+            </w:r>
+          </w:p>
+        </w:tc>
+        <w:tc>
+          <w:tcPr>
+            <w:tcW w:w="2000" w:type="dxa"/>
+          </w:tcPr>
+          <w:p>
+            <w:pPr/>
+            <w:r>
+              <w:t xml:space="preserve">(6)</w:t>
+            </w:r>
+          </w:p>
+        </w:tc>
+        <w:tc>
+          <w:tcPr>
+            <w:tcW w:w="2000" w:type="dxa"/>
+          </w:tcPr>
+          <w:p>
+            <w:pPr/>
+            <w:r>
+              <w:t xml:space="preserve">IS NULL</w:t>
+            </w:r>
+          </w:p>
+        </w:tc>
+      </w:tr>
+      <w:tr>
+        <w:trPr>
+          <w:trHeight w:val="530" w:hRule="atLeast"/>
+        </w:trPr>
+        <w:tc>
+          <w:tcPr>
+            <w:tcW w:w="2000" w:type="dxa"/>
+          </w:tcPr>
+          <w:p>
+            <w:pPr/>
+            <w:r>
+              <w:t xml:space="preserve">updated_by</w:t>
+            </w:r>
+          </w:p>
+        </w:tc>
+        <w:tc>
+          <w:tcPr>
+            <w:tcW w:w="2000" w:type="dxa"/>
+          </w:tcPr>
+          <w:p>
+            <w:pPr/>
+            <w:r>
+              <w:t xml:space="preserve">bigint</w:t>
+            </w:r>
+          </w:p>
+        </w:tc>
+        <w:tc>
+          <w:tcPr>
+            <w:tcW w:w="2000" w:type="dxa"/>
+          </w:tcPr>
+          <w:p>
+            <w:pPr/>
+            <w:r>
+              <w:t xml:space="preserve">-</w:t>
+            </w:r>
+          </w:p>
+        </w:tc>
+        <w:tc>
+          <w:tcPr>
+            <w:tcW w:w="2000" w:type="dxa"/>
+          </w:tcPr>
+          <w:p>
+            <w:pPr/>
+            <w:r>
+              <w:t xml:space="preserve">IS NULL</w:t>
+            </w:r>
+          </w:p>
+        </w:tc>
+      </w:tr>
+      <w:tr>
+        <w:trPr>
+          <w:trHeight w:val="530" w:hRule="atLeast"/>
+        </w:trPr>
+        <w:tc>
+          <w:tcPr>
+            <w:tcW w:w="2000" w:type="dxa"/>
+          </w:tcPr>
+          <w:p>
+            <w:pPr/>
+            <w:r>
+              <w:t xml:space="preserve">version</w:t>
+            </w:r>
+          </w:p>
+        </w:tc>
+        <w:tc>
+          <w:tcPr>
+            <w:tcW w:w="2000" w:type="dxa"/>
+          </w:tcPr>
+          <w:p>
+            <w:pPr/>
+            <w:r>
+              <w:t xml:space="preserve">int</w:t>
+            </w:r>
+          </w:p>
+        </w:tc>
+        <w:tc>
+          <w:tcPr>
+            <w:tcW w:w="2000" w:type="dxa"/>
+          </w:tcPr>
+          <w:p>
+            <w:pPr/>
+            <w:r>
+              <w:t xml:space="preserve">-</w:t>
+            </w:r>
+          </w:p>
+        </w:tc>
+        <w:tc>
+          <w:tcPr>
+            <w:tcW w:w="2000" w:type="dxa"/>
+          </w:tcPr>
+          <w:p>
+            <w:pPr/>
+            <w:r>
+              <w:t xml:space="preserve">NOT NULL</w:t>
+            </w:r>
+          </w:p>
+        </w:tc>
+      </w:tr>
+      <w:tr>
+        <w:trPr>
+          <w:trHeight w:val="530" w:hRule="atLeast"/>
+        </w:trPr>
+        <w:tc>
+          <w:tcPr>
+            <w:tcW w:w="2000" w:type="dxa"/>
+          </w:tcPr>
+          <w:p>
+            <w:pPr/>
+            <w:r>
+              <w:t xml:space="preserve">is_active</w:t>
+            </w:r>
+          </w:p>
+        </w:tc>
+        <w:tc>
+          <w:tcPr>
+            <w:tcW w:w="2000" w:type="dxa"/>
+          </w:tcPr>
+          <w:p>
+            <w:pPr/>
+            <w:r>
+              <w:t xml:space="preserve">bit</w:t>
+            </w:r>
+          </w:p>
+        </w:tc>
+        <w:tc>
+          <w:tcPr>
+            <w:tcW w:w="2000" w:type="dxa"/>
+          </w:tcPr>
+          <w:p>
+            <w:pPr/>
+            <w:r>
+              <w:t xml:space="preserve">-</w:t>
+            </w:r>
+          </w:p>
+        </w:tc>
+        <w:tc>
+          <w:tcPr>
+            <w:tcW w:w="2000" w:type="dxa"/>
+          </w:tcPr>
+          <w:p>
+            <w:pPr/>
+            <w:r>
+              <w:t xml:space="preserve">NOT NULL</w:t>
+            </w:r>
+          </w:p>
+        </w:tc>
+      </w:tr>
+      <w:tr>
+        <w:trPr>
+          <w:trHeight w:val="530" w:hRule="atLeast"/>
+        </w:trPr>
+        <w:tc>
+          <w:tcPr>
+            <w:tcW w:w="2000" w:type="dxa"/>
+          </w:tcPr>
+          <w:p>
+            <w:pPr/>
+            <w:r>
+              <w:t xml:space="preserve">is_deleted</w:t>
+            </w:r>
+          </w:p>
+        </w:tc>
+        <w:tc>
+          <w:tcPr>
+            <w:tcW w:w="2000" w:type="dxa"/>
+          </w:tcPr>
+          <w:p>
+            <w:pPr/>
+            <w:r>
+              <w:t xml:space="preserve">bit</w:t>
+            </w:r>
+          </w:p>
+        </w:tc>
+        <w:tc>
+          <w:tcPr>
+            <w:tcW w:w="2000" w:type="dxa"/>
+          </w:tcPr>
+          <w:p>
+            <w:pPr/>
+            <w:r>
+              <w:t xml:space="preserve">-</w:t>
+            </w:r>
+          </w:p>
+        </w:tc>
+        <w:tc>
+          <w:tcPr>
+            <w:tcW w:w="2000" w:type="dxa"/>
+          </w:tcPr>
+          <w:p>
+            <w:pPr/>
+            <w:r>
+              <w:t xml:space="preserve">NOT NULL</w:t>
+            </w:r>
+          </w:p>
+        </w:tc>
+      </w:tr>
+      <w:tr>
+        <w:trPr>
+          <w:trHeight w:val="530" w:hRule="atLeast"/>
+        </w:trPr>
+        <w:tc>
+          <w:tcPr>
+            <w:tcW w:w="2000" w:type="dxa"/>
+          </w:tcPr>
+          <w:p>
+            <w:pPr/>
+            <w:r>
+              <w:t xml:space="preserve">code</w:t>
+            </w:r>
+          </w:p>
+        </w:tc>
+        <w:tc>
+          <w:tcPr>
+            <w:tcW w:w="2000" w:type="dxa"/>
+          </w:tcPr>
+          <w:p>
+            <w:pPr/>
+            <w:r>
+              <w:t xml:space="preserve">varchar</w:t>
+            </w:r>
+          </w:p>
+        </w:tc>
+        <w:tc>
+          <w:tcPr>
+            <w:tcW w:w="2000" w:type="dxa"/>
+          </w:tcPr>
+          <w:p>
+            <w:pPr/>
+            <w:r>
+              <w:t xml:space="preserve">30</w:t>
+            </w:r>
+          </w:p>
+        </w:tc>
+        <w:tc>
+          <w:tcPr>
+            <w:tcW w:w="2000" w:type="dxa"/>
+          </w:tcPr>
+          <w:p>
+            <w:pPr/>
+            <w:r>
+              <w:t xml:space="preserve">NOT NULL</w:t>
+            </w:r>
+          </w:p>
+        </w:tc>
+      </w:tr>
+      <w:tr>
+        <w:trPr>
+          <w:trHeight w:val="530" w:hRule="atLeast"/>
+        </w:trPr>
+        <w:tc>
+          <w:tcPr>
+            <w:tcW w:w="2000" w:type="dxa"/>
+          </w:tcPr>
+          <w:p>
+            <w:pPr/>
+            <w:r>
+              <w:t xml:space="preserve">name</w:t>
+            </w:r>
+          </w:p>
+        </w:tc>
+        <w:tc>
+          <w:tcPr>
+            <w:tcW w:w="2000" w:type="dxa"/>
+          </w:tcPr>
+          <w:p>
+            <w:pPr/>
+            <w:r>
+              <w:t xml:space="preserve">nvarchar</w:t>
+            </w:r>
+          </w:p>
+        </w:tc>
+        <w:tc>
+          <w:tcPr>
+            <w:tcW w:w="2000" w:type="dxa"/>
+          </w:tcPr>
+          <w:p>
+            <w:pPr/>
+            <w:r>
+              <w:t xml:space="preserve">200</w:t>
+            </w:r>
+          </w:p>
+        </w:tc>
+        <w:tc>
+          <w:tcPr>
+            <w:tcW w:w="2000" w:type="dxa"/>
+          </w:tcPr>
+          <w:p>
+            <w:pPr/>
+            <w:r>
+              <w:t xml:space="preserve">NOT NULL</w:t>
+            </w:r>
+          </w:p>
+        </w:tc>
+      </w:tr>
+      <w:tr>
+        <w:trPr>
+          <w:trHeight w:val="530" w:hRule="atLeast"/>
+        </w:trPr>
+        <w:tc>
+          <w:tcPr>
+            <w:tcW w:w="2000" w:type="dxa"/>
+          </w:tcPr>
+          <w:p>
+            <w:pPr/>
+            <w:r>
+              <w:t xml:space="preserve">custom_fields</w:t>
+            </w:r>
+          </w:p>
+        </w:tc>
+        <w:tc>
+          <w:tcPr>
+            <w:tcW w:w="2000" w:type="dxa"/>
+          </w:tcPr>
+          <w:p>
+            <w:pPr/>
+            <w:r>
+              <w:t xml:space="preserve">nvarchar</w:t>
+            </w:r>
+          </w:p>
+        </w:tc>
+        <w:tc>
+          <w:tcPr>
+            <w:tcW w:w="2000" w:type="dxa"/>
+          </w:tcPr>
+          <w:p>
+            <w:pPr/>
+            <w:r>
+              <w:t xml:space="preserve">MAX</w:t>
+            </w:r>
+          </w:p>
+        </w:tc>
+        <w:tc>
+          <w:tcPr>
+            <w:tcW w:w="2000" w:type="dxa"/>
+          </w:tcPr>
+          <w:p>
+            <w:pPr/>
+            <w:r>
+              <w:t xml:space="preserve">IS NULL</w:t>
+            </w:r>
+          </w:p>
+        </w:tc>
+      </w:tr>
+    </w:tbl>
+    <w:p/>
+    <w:p>
+      <w:pPr/>
+      <w:r>
+        <w:t xml:space="preserve">Table Name: md_item_category</w:t>
+      </w:r>
+    </w:p>
+    <w:p>
+      <w:pPr/>
+      <w:r>
+        <w:t xml:space="preserve">Primary Key: id</w:t>
+      </w:r>
+    </w:p>
+    <w:p>
+      <w:pPr/>
+      <w:r>
+        <w:t xml:space="preserve">This table stores the item category tree within a company.</w:t>
+      </w:r>
+    </w:p>
+    <w:tbl>
+      <w:tblPr>
+        <w:tblStyle w:val="TableGrid"/>
+        <w:tblW w:w="8000" w:type="dxa"/>
+        <w:jc w:val="left"/>
+        <w:tblBorders>
+          <w:top w:val="single" w:color="000000" w:sz="4" w:space="0"/>
+          <w:left w:val="single" w:color="000000" w:sz="4" w:space="0"/>
+          <w:bottom w:val="single" w:color="000000" w:sz="4" w:space="0"/>
+          <w:right w:val="single" w:color="000000" w:sz="4" w:space="0"/>
+          <w:insideH w:val="single" w:color="000000" w:sz="4" w:space="0"/>
+          <w:insideV w:val="single" w:color="000000" w:sz="4" w:space="0"/>
+        </w:tblBorders>
+        <w:tblLayout w:type="fixed"/>
+        <w:tblCellMar>
+          <w:top w:w="100" w:type="dxa"/>
+          <w:left w:w="100" w:type="dxa"/>
+          <w:bottom w:w="100" w:type="dxa"/>
+          <w:right w:w="100" w:type="dxa"/>
+        </w:tblCellMar>
+      </w:tblPr>
+      <w:tblGrid>
+        <w:gridCol w:w="2000"/>
+        <w:gridCol w:w="2000"/>
+        <w:gridCol w:w="2000"/>
+        <w:gridCol w:w="2000"/>
+      </w:tblGrid>
+      <w:tr>
+        <w:trPr>
+          <w:trHeight w:val="530" w:hRule="atLeast"/>
+        </w:trPr>
+        <w:tc>
+          <w:tcPr>
+            <w:tcW w:w="2000" w:type="dxa"/>
+          </w:tcPr>
+          <w:p>
+            <w:pPr>
+              <w:jc w:val="center"/>
+            </w:pPr>
+            <w:r>
+              <w:rPr>
+                <w:b/>
+              </w:rPr>
+              <w:t xml:space="preserve">Name of Attribute</w:t>
+            </w:r>
+          </w:p>
+        </w:tc>
+        <w:tc>
+          <w:tcPr>
+            <w:tcW w:w="2000" w:type="dxa"/>
+          </w:tcPr>
+          <w:p>
+            <w:pPr>
+              <w:jc w:val="center"/>
+            </w:pPr>
+            <w:r>
+              <w:rPr>
+                <w:b/>
+              </w:rPr>
+              <w:t xml:space="preserve">Data Type</w:t>
+            </w:r>
+          </w:p>
+        </w:tc>
+        <w:tc>
+          <w:tcPr>
+            <w:tcW w:w="2000" w:type="dxa"/>
+          </w:tcPr>
+          <w:p>
+            <w:pPr>
+              <w:jc w:val="center"/>
+            </w:pPr>
+            <w:r>
+              <w:rPr>
+                <w:b/>
+              </w:rPr>
+              <w:t xml:space="preserve">Size</w:t>
+            </w:r>
+          </w:p>
+        </w:tc>
+        <w:tc>
+          <w:tcPr>
+            <w:tcW w:w="2000" w:type="dxa"/>
+          </w:tcPr>
+          <w:p>
+            <w:pPr>
+              <w:jc w:val="center"/>
+            </w:pPr>
+            <w:r>
+              <w:rPr>
+                <w:b/>
+              </w:rPr>
+              <w:t xml:space="preserve">PK/FK/IS NULL/ NOT NULL</w:t>
+            </w:r>
+          </w:p>
+        </w:tc>
+      </w:tr>
+      <w:tr>
+        <w:trPr>
+          <w:trHeight w:val="530" w:hRule="atLeast"/>
+        </w:trPr>
+        <w:tc>
+          <w:tcPr>
+            <w:tcW w:w="2000" w:type="dxa"/>
+          </w:tcPr>
+          <w:p>
+            <w:pPr/>
+            <w:r>
+              <w:t xml:space="preserve">id</w:t>
+            </w:r>
+          </w:p>
+        </w:tc>
+        <w:tc>
+          <w:tcPr>
+            <w:tcW w:w="2000" w:type="dxa"/>
+          </w:tcPr>
+          <w:p>
+            <w:pPr/>
+            <w:r>
+              <w:t xml:space="preserve">bigint</w:t>
+            </w:r>
+          </w:p>
+        </w:tc>
+        <w:tc>
+          <w:tcPr>
+            <w:tcW w:w="2000" w:type="dxa"/>
+          </w:tcPr>
+          <w:p>
+            <w:pPr/>
+            <w:r>
+              <w:t xml:space="preserve">-</w:t>
+            </w:r>
+          </w:p>
+        </w:tc>
+        <w:tc>
+          <w:tcPr>
+            <w:tcW w:w="2000" w:type="dxa"/>
+          </w:tcPr>
+          <w:p>
+            <w:pPr/>
+            <w:r>
+              <w:t xml:space="preserve">PK, NOT NULL</w:t>
+            </w:r>
+          </w:p>
+        </w:tc>
+      </w:tr>
+      <w:tr>
+        <w:trPr>
+          <w:trHeight w:val="530" w:hRule="atLeast"/>
+        </w:trPr>
+        <w:tc>
+          <w:tcPr>
+            <w:tcW w:w="2000" w:type="dxa"/>
+          </w:tcPr>
+          <w:p>
+            <w:pPr/>
+            <w:r>
+              <w:t xml:space="preserve">parent_id</w:t>
+            </w:r>
+          </w:p>
+        </w:tc>
+        <w:tc>
+          <w:tcPr>
+            <w:tcW w:w="2000" w:type="dxa"/>
+          </w:tcPr>
+          <w:p>
+            <w:pPr/>
+            <w:r>
+              <w:t xml:space="preserve">bigint</w:t>
+            </w:r>
+          </w:p>
+        </w:tc>
+        <w:tc>
+          <w:tcPr>
+            <w:tcW w:w="2000" w:type="dxa"/>
+          </w:tcPr>
+          <w:p>
+            <w:pPr/>
+            <w:r>
+              <w:t xml:space="preserve">-</w:t>
+            </w:r>
+          </w:p>
+        </w:tc>
+        <w:tc>
+          <w:tcPr>
+            <w:tcW w:w="2000" w:type="dxa"/>
+          </w:tcPr>
+          <w:p>
+            <w:pPr/>
+            <w:r>
+              <w:t xml:space="preserve">FK, IS NULL</w:t>
+            </w:r>
+          </w:p>
+        </w:tc>
+      </w:tr>
+      <w:tr>
+        <w:trPr>
+          <w:trHeight w:val="530" w:hRule="atLeast"/>
+        </w:trPr>
+        <w:tc>
+          <w:tcPr>
+            <w:tcW w:w="2000" w:type="dxa"/>
+          </w:tcPr>
+          <w:p>
+            <w:pPr/>
+            <w:r>
+              <w:t xml:space="preserve">company_id</w:t>
+            </w:r>
+          </w:p>
+        </w:tc>
+        <w:tc>
+          <w:tcPr>
+            <w:tcW w:w="2000" w:type="dxa"/>
+          </w:tcPr>
+          <w:p>
+            <w:pPr/>
+            <w:r>
+              <w:t xml:space="preserve">bigint</w:t>
+            </w:r>
+          </w:p>
+        </w:tc>
+        <w:tc>
+          <w:tcPr>
+            <w:tcW w:w="2000" w:type="dxa"/>
+          </w:tcPr>
+          <w:p>
+            <w:pPr/>
+            <w:r>
+              <w:t xml:space="preserve">-</w:t>
+            </w:r>
+          </w:p>
+        </w:tc>
+        <w:tc>
+          <w:tcPr>
+            <w:tcW w:w="2000" w:type="dxa"/>
+          </w:tcPr>
+          <w:p>
+            <w:pPr/>
+            <w:r>
+              <w:t xml:space="preserve">FK, NOT NULL</w:t>
+            </w:r>
+          </w:p>
+        </w:tc>
+      </w:tr>
+      <w:tr>
+        <w:trPr>
+          <w:trHeight w:val="530" w:hRule="atLeast"/>
+        </w:trPr>
+        <w:tc>
+          <w:tcPr>
+            <w:tcW w:w="2000" w:type="dxa"/>
+          </w:tcPr>
+          <w:p>
+            <w:pPr/>
+            <w:r>
+              <w:t xml:space="preserve">created_at</w:t>
+            </w:r>
+          </w:p>
+        </w:tc>
+        <w:tc>
+          <w:tcPr>
+            <w:tcW w:w="2000" w:type="dxa"/>
+          </w:tcPr>
+          <w:p>
+            <w:pPr/>
+            <w:r>
+              <w:t xml:space="preserve">datetime2</w:t>
+            </w:r>
+          </w:p>
+        </w:tc>
+        <w:tc>
+          <w:tcPr>
+            <w:tcW w:w="2000" w:type="dxa"/>
+          </w:tcPr>
+          <w:p>
+            <w:pPr/>
+            <w:r>
+              <w:t xml:space="preserve">(6)</w:t>
+            </w:r>
+          </w:p>
+        </w:tc>
+        <w:tc>
+          <w:tcPr>
+            <w:tcW w:w="2000" w:type="dxa"/>
+          </w:tcPr>
+          <w:p>
+            <w:pPr/>
+            <w:r>
+              <w:t xml:space="preserve">NOT NULL</w:t>
+            </w:r>
+          </w:p>
+        </w:tc>
+      </w:tr>
+      <w:tr>
+        <w:trPr>
+          <w:trHeight w:val="530" w:hRule="atLeast"/>
+        </w:trPr>
+        <w:tc>
+          <w:tcPr>
+            <w:tcW w:w="2000" w:type="dxa"/>
+          </w:tcPr>
+          <w:p>
+            <w:pPr/>
+            <w:r>
+              <w:t xml:space="preserve">created_by</w:t>
+            </w:r>
+          </w:p>
+        </w:tc>
+        <w:tc>
+          <w:tcPr>
+            <w:tcW w:w="2000" w:type="dxa"/>
+          </w:tcPr>
+          <w:p>
+            <w:pPr/>
+            <w:r>
+              <w:t xml:space="preserve">bigint</w:t>
+            </w:r>
+          </w:p>
+        </w:tc>
+        <w:tc>
+          <w:tcPr>
+            <w:tcW w:w="2000" w:type="dxa"/>
+          </w:tcPr>
+          <w:p>
+            <w:pPr/>
+            <w:r>
+              <w:t xml:space="preserve">-</w:t>
+            </w:r>
+          </w:p>
+        </w:tc>
+        <w:tc>
+          <w:tcPr>
+            <w:tcW w:w="2000" w:type="dxa"/>
+          </w:tcPr>
+          <w:p>
+            <w:pPr/>
+            <w:r>
+              <w:t xml:space="preserve">NOT NULL</w:t>
+            </w:r>
+          </w:p>
+        </w:tc>
+      </w:tr>
+      <w:tr>
+        <w:trPr>
+          <w:trHeight w:val="530" w:hRule="atLeast"/>
+        </w:trPr>
+        <w:tc>
+          <w:tcPr>
+            <w:tcW w:w="2000" w:type="dxa"/>
+          </w:tcPr>
+          <w:p>
+            <w:pPr/>
+            <w:r>
+              <w:t xml:space="preserve">updated_at</w:t>
+            </w:r>
+          </w:p>
+        </w:tc>
+        <w:tc>
+          <w:tcPr>
+            <w:tcW w:w="2000" w:type="dxa"/>
+          </w:tcPr>
+          <w:p>
+            <w:pPr/>
+            <w:r>
+              <w:t xml:space="preserve">datetime2</w:t>
+            </w:r>
+          </w:p>
+        </w:tc>
+        <w:tc>
+          <w:tcPr>
+            <w:tcW w:w="2000" w:type="dxa"/>
+          </w:tcPr>
+          <w:p>
+            <w:pPr/>
+            <w:r>
+              <w:t xml:space="preserve">(6)</w:t>
+            </w:r>
+          </w:p>
+        </w:tc>
+        <w:tc>
+          <w:tcPr>
+            <w:tcW w:w="2000" w:type="dxa"/>
+          </w:tcPr>
+          <w:p>
+            <w:pPr/>
+            <w:r>
+              <w:t xml:space="preserve">IS NULL</w:t>
+            </w:r>
+          </w:p>
+        </w:tc>
+      </w:tr>
+      <w:tr>
+        <w:trPr>
+          <w:trHeight w:val="530" w:hRule="atLeast"/>
+        </w:trPr>
+        <w:tc>
+          <w:tcPr>
+            <w:tcW w:w="2000" w:type="dxa"/>
+          </w:tcPr>
+          <w:p>
+            <w:pPr/>
+            <w:r>
+              <w:t xml:space="preserve">updated_by</w:t>
+            </w:r>
+          </w:p>
+        </w:tc>
+        <w:tc>
+          <w:tcPr>
+            <w:tcW w:w="2000" w:type="dxa"/>
+          </w:tcPr>
+          <w:p>
+            <w:pPr/>
+            <w:r>
+              <w:t xml:space="preserve">bigint</w:t>
+            </w:r>
+          </w:p>
+        </w:tc>
+        <w:tc>
+          <w:tcPr>
+            <w:tcW w:w="2000" w:type="dxa"/>
+          </w:tcPr>
+          <w:p>
+            <w:pPr/>
+            <w:r>
+              <w:t xml:space="preserve">-</w:t>
+            </w:r>
+          </w:p>
+        </w:tc>
+        <w:tc>
+          <w:tcPr>
+            <w:tcW w:w="2000" w:type="dxa"/>
+          </w:tcPr>
+          <w:p>
+            <w:pPr/>
+            <w:r>
+              <w:t xml:space="preserve">IS NULL</w:t>
+            </w:r>
+          </w:p>
+        </w:tc>
+      </w:tr>
+      <w:tr>
+        <w:trPr>
+          <w:trHeight w:val="530" w:hRule="atLeast"/>
+        </w:trPr>
+        <w:tc>
+          <w:tcPr>
+            <w:tcW w:w="2000" w:type="dxa"/>
+          </w:tcPr>
+          <w:p>
+            <w:pPr/>
+            <w:r>
+              <w:t xml:space="preserve">version</w:t>
+            </w:r>
+          </w:p>
+        </w:tc>
+        <w:tc>
+          <w:tcPr>
+            <w:tcW w:w="2000" w:type="dxa"/>
+          </w:tcPr>
+          <w:p>
+            <w:pPr/>
+            <w:r>
+              <w:t xml:space="preserve">int</w:t>
+            </w:r>
+          </w:p>
+        </w:tc>
+        <w:tc>
+          <w:tcPr>
+            <w:tcW w:w="2000" w:type="dxa"/>
+          </w:tcPr>
+          <w:p>
+            <w:pPr/>
+            <w:r>
+              <w:t xml:space="preserve">-</w:t>
+            </w:r>
+          </w:p>
+        </w:tc>
+        <w:tc>
+          <w:tcPr>
+            <w:tcW w:w="2000" w:type="dxa"/>
+          </w:tcPr>
+          <w:p>
+            <w:pPr/>
+            <w:r>
+              <w:t xml:space="preserve">NOT NULL</w:t>
+            </w:r>
+          </w:p>
+        </w:tc>
+      </w:tr>
+      <w:tr>
+        <w:trPr>
+          <w:trHeight w:val="530" w:hRule="atLeast"/>
+        </w:trPr>
+        <w:tc>
+          <w:tcPr>
+            <w:tcW w:w="2000" w:type="dxa"/>
+          </w:tcPr>
+          <w:p>
+            <w:pPr/>
+            <w:r>
+              <w:t xml:space="preserve">is_active</w:t>
+            </w:r>
+          </w:p>
+        </w:tc>
+        <w:tc>
+          <w:tcPr>
+            <w:tcW w:w="2000" w:type="dxa"/>
+          </w:tcPr>
+          <w:p>
+            <w:pPr/>
+            <w:r>
+              <w:t xml:space="preserve">bit</w:t>
+            </w:r>
+          </w:p>
+        </w:tc>
+        <w:tc>
+          <w:tcPr>
+            <w:tcW w:w="2000" w:type="dxa"/>
+          </w:tcPr>
+          <w:p>
+            <w:pPr/>
+            <w:r>
+              <w:t xml:space="preserve">-</w:t>
+            </w:r>
+          </w:p>
+        </w:tc>
+        <w:tc>
+          <w:tcPr>
+            <w:tcW w:w="2000" w:type="dxa"/>
+          </w:tcPr>
+          <w:p>
+            <w:pPr/>
+            <w:r>
+              <w:t xml:space="preserve">NOT NULL</w:t>
+            </w:r>
+          </w:p>
+        </w:tc>
+      </w:tr>
+      <w:tr>
+        <w:trPr>
+          <w:trHeight w:val="530" w:hRule="atLeast"/>
+        </w:trPr>
+        <w:tc>
+          <w:tcPr>
+            <w:tcW w:w="2000" w:type="dxa"/>
+          </w:tcPr>
+          <w:p>
+            <w:pPr/>
+            <w:r>
+              <w:t xml:space="preserve">is_deleted</w:t>
+            </w:r>
+          </w:p>
+        </w:tc>
+        <w:tc>
+          <w:tcPr>
+            <w:tcW w:w="2000" w:type="dxa"/>
+          </w:tcPr>
+          <w:p>
+            <w:pPr/>
+            <w:r>
+              <w:t xml:space="preserve">bit</w:t>
+            </w:r>
+          </w:p>
+        </w:tc>
+        <w:tc>
+          <w:tcPr>
+            <w:tcW w:w="2000" w:type="dxa"/>
+          </w:tcPr>
+          <w:p>
+            <w:pPr/>
+            <w:r>
+              <w:t xml:space="preserve">-</w:t>
+            </w:r>
+          </w:p>
+        </w:tc>
+        <w:tc>
+          <w:tcPr>
+            <w:tcW w:w="2000" w:type="dxa"/>
+          </w:tcPr>
+          <w:p>
+            <w:pPr/>
+            <w:r>
+              <w:t xml:space="preserve">NOT NULL</w:t>
+            </w:r>
+          </w:p>
+        </w:tc>
+      </w:tr>
+      <w:tr>
+        <w:trPr>
+          <w:trHeight w:val="530" w:hRule="atLeast"/>
+        </w:trPr>
+        <w:tc>
+          <w:tcPr>
+            <w:tcW w:w="2000" w:type="dxa"/>
+          </w:tcPr>
+          <w:p>
+            <w:pPr/>
+            <w:r>
+              <w:t xml:space="preserve">code</w:t>
+            </w:r>
+          </w:p>
+        </w:tc>
+        <w:tc>
+          <w:tcPr>
+            <w:tcW w:w="2000" w:type="dxa"/>
+          </w:tcPr>
+          <w:p>
+            <w:pPr/>
+            <w:r>
+              <w:t xml:space="preserve">varchar</w:t>
+            </w:r>
+          </w:p>
+        </w:tc>
+        <w:tc>
+          <w:tcPr>
+            <w:tcW w:w="2000" w:type="dxa"/>
+          </w:tcPr>
+          <w:p>
+            <w:pPr/>
+            <w:r>
+              <w:t xml:space="preserve">30</w:t>
+            </w:r>
+          </w:p>
+        </w:tc>
+        <w:tc>
+          <w:tcPr>
+            <w:tcW w:w="2000" w:type="dxa"/>
+          </w:tcPr>
+          <w:p>
+            <w:pPr/>
+            <w:r>
+              <w:t xml:space="preserve">NOT NULL</w:t>
+            </w:r>
+          </w:p>
+        </w:tc>
+      </w:tr>
+      <w:tr>
+        <w:trPr>
+          <w:trHeight w:val="530" w:hRule="atLeast"/>
+        </w:trPr>
+        <w:tc>
+          <w:tcPr>
+            <w:tcW w:w="2000" w:type="dxa"/>
+          </w:tcPr>
+          <w:p>
+            <w:pPr/>
+            <w:r>
+              <w:t xml:space="preserve">name</w:t>
+            </w:r>
+          </w:p>
+        </w:tc>
+        <w:tc>
+          <w:tcPr>
+            <w:tcW w:w="2000" w:type="dxa"/>
+          </w:tcPr>
+          <w:p>
+            <w:pPr/>
+            <w:r>
+              <w:t xml:space="preserve">nvarchar</w:t>
+            </w:r>
+          </w:p>
+        </w:tc>
+        <w:tc>
+          <w:tcPr>
+            <w:tcW w:w="2000" w:type="dxa"/>
+          </w:tcPr>
+          <w:p>
+            <w:pPr/>
+            <w:r>
+              <w:t xml:space="preserve">200</w:t>
+            </w:r>
+          </w:p>
+        </w:tc>
+        <w:tc>
+          <w:tcPr>
+            <w:tcW w:w="2000" w:type="dxa"/>
+          </w:tcPr>
+          <w:p>
+            <w:pPr/>
+            <w:r>
+              <w:t xml:space="preserve">NOT NULL</w:t>
+            </w:r>
+          </w:p>
+        </w:tc>
+      </w:tr>
+      <w:tr>
+        <w:trPr>
+          <w:trHeight w:val="530" w:hRule="atLeast"/>
+        </w:trPr>
+        <w:tc>
+          <w:tcPr>
+            <w:tcW w:w="2000" w:type="dxa"/>
+          </w:tcPr>
+          <w:p>
+            <w:pPr/>
+            <w:r>
+              <w:t xml:space="preserve">custom_fields</w:t>
+            </w:r>
+          </w:p>
+        </w:tc>
+        <w:tc>
+          <w:tcPr>
+            <w:tcW w:w="2000" w:type="dxa"/>
+          </w:tcPr>
+          <w:p>
+            <w:pPr/>
+            <w:r>
+              <w:t xml:space="preserve">nvarchar</w:t>
+            </w:r>
+          </w:p>
+        </w:tc>
+        <w:tc>
+          <w:tcPr>
+            <w:tcW w:w="2000" w:type="dxa"/>
+          </w:tcPr>
+          <w:p>
+            <w:pPr/>
+            <w:r>
+              <w:t xml:space="preserve">MAX</w:t>
+            </w:r>
+          </w:p>
+        </w:tc>
+        <w:tc>
+          <w:tcPr>
+            <w:tcW w:w="2000" w:type="dxa"/>
+          </w:tcPr>
+          <w:p>
+            <w:pPr/>
+            <w:r>
+              <w:t xml:space="preserve">IS NULL</w:t>
             </w:r>
           </w:p>
         </w:tc>
@@ -20540,7 +21997,7 @@
       </w:r>
     </w:p>
     <w:sectPr>
-      <w:footerReference xmlns:r="http://schemas.openxmlformats.org/officeDocument/2006/relationships" w:type="default" r:id="R7d301c66f2bc4abc"/>
+      <w:footerReference xmlns:r="http://schemas.openxmlformats.org/officeDocument/2006/relationships" w:type="default" r:id="R1e6f6f40e85e4936"/>
       <w:pgSz w:w="11906" w:h="16838"/>
       <w:pgMar w:top="1440" w:right="1440" w:bottom="1440" w:left="1440" w:header="720" w:footer="720" w:gutter="0"/>
     </w:sectPr>

</xml_diff>

<commit_message>
feat(md): add item brand and item category tree pages
- /md/item-brands reuses CategoryList via ITEM_BRAND_PAGE
- /md/item-categories builds the tree client-side, filters search with ancestors,
  limits parent choices (active, outside subtree, max 5 levels)
- trilingual texts, menu entries, tree rule error messages
- Vitest and Playwright specs; ui-spec 8.36-8.41, test plan, trace notes

Co-Authored-By: Claude Opus 5.5 <noreply@anthropic.com>
</commit_message>
<xml_diff>
--- a/docs/99-output/MyERP_SDS.docx
+++ b/docs/99-output/MyERP_SDS.docx
@@ -21519,6 +21519,120 @@
           <w:i/>
         </w:rPr>
         <w:t xml:space="preserve">[Pending] System screenshot of Supplier Category Edit Interface.</w:t>
+      </w:r>
+    </w:p>
+    <w:p>
+      <w:pPr>
+        <w:pStyle w:val="Heading5"/>
+      </w:pPr>
+      <w:r>
+        <w:t xml:space="preserve">4.2.1.8.36 Item Category View Interface</w:t>
+      </w:r>
+    </w:p>
+    <w:p>
+      <w:pPr>
+        <w:jc w:val="center"/>
+      </w:pPr>
+      <w:r>
+        <w:rPr>
+          <w:i/>
+        </w:rPr>
+        <w:t xml:space="preserve">[Pending] System screenshot of Item Category View Interface.</w:t>
+      </w:r>
+    </w:p>
+    <w:p>
+      <w:pPr>
+        <w:pStyle w:val="Heading5"/>
+      </w:pPr>
+      <w:r>
+        <w:t xml:space="preserve">4.2.1.8.37 Item Category Create Interface</w:t>
+      </w:r>
+    </w:p>
+    <w:p>
+      <w:pPr>
+        <w:jc w:val="center"/>
+      </w:pPr>
+      <w:r>
+        <w:rPr>
+          <w:i/>
+        </w:rPr>
+        <w:t xml:space="preserve">[Pending] System screenshot of Item Category Create Interface.</w:t>
+      </w:r>
+    </w:p>
+    <w:p>
+      <w:pPr>
+        <w:pStyle w:val="Heading5"/>
+      </w:pPr>
+      <w:r>
+        <w:t xml:space="preserve">4.2.1.8.38 Item Category Edit Interface</w:t>
+      </w:r>
+    </w:p>
+    <w:p>
+      <w:pPr>
+        <w:jc w:val="center"/>
+      </w:pPr>
+      <w:r>
+        <w:rPr>
+          <w:i/>
+        </w:rPr>
+        <w:t xml:space="preserve">[Pending] System screenshot of Item Category Edit Interface.</w:t>
+      </w:r>
+    </w:p>
+    <w:p>
+      <w:pPr>
+        <w:pStyle w:val="Heading5"/>
+      </w:pPr>
+      <w:r>
+        <w:t xml:space="preserve">4.2.1.8.39 Item Brand View Interface</w:t>
+      </w:r>
+    </w:p>
+    <w:p>
+      <w:pPr>
+        <w:jc w:val="center"/>
+      </w:pPr>
+      <w:r>
+        <w:rPr>
+          <w:i/>
+        </w:rPr>
+        <w:t xml:space="preserve">[Pending] System screenshot of Item Brand View Interface.</w:t>
+      </w:r>
+    </w:p>
+    <w:p>
+      <w:pPr>
+        <w:pStyle w:val="Heading5"/>
+      </w:pPr>
+      <w:r>
+        <w:t xml:space="preserve">4.2.1.8.40 Item Brand Create Interface</w:t>
+      </w:r>
+    </w:p>
+    <w:p>
+      <w:pPr>
+        <w:jc w:val="center"/>
+      </w:pPr>
+      <w:r>
+        <w:rPr>
+          <w:i/>
+        </w:rPr>
+        <w:t xml:space="preserve">[Pending] System screenshot of Item Brand Create Interface.</w:t>
+      </w:r>
+    </w:p>
+    <w:p>
+      <w:pPr>
+        <w:pStyle w:val="Heading5"/>
+      </w:pPr>
+      <w:r>
+        <w:t xml:space="preserve">4.2.1.8.41 Item Brand Edit Interface</w:t>
+      </w:r>
+    </w:p>
+    <w:p>
+      <w:pPr>
+        <w:jc w:val="center"/>
+      </w:pPr>
+      <w:r>
+        <w:rPr>
+          <w:i/>
+        </w:rPr>
+        <w:t xml:space="preserve">[Pending] System screenshot of Item Brand Edit Interface.</w:t>
       </w:r>
     </w:p>
     <w:p>
@@ -21997,7 +22111,7 @@
       </w:r>
     </w:p>
     <w:sectPr>
-      <w:footerReference xmlns:r="http://schemas.openxmlformats.org/officeDocument/2006/relationships" w:type="default" r:id="R1e6f6f40e85e4936"/>
+      <w:footerReference xmlns:r="http://schemas.openxmlformats.org/officeDocument/2006/relationships" w:type="default" r:id="Rcf27ae7d1a0c43b4"/>
       <w:pgSz w:w="11906" w:h="16838"/>
       <w:pgMar w:top="1440" w:right="1440" w:bottom="1440" w:left="1440" w:header="720" w:footer="720" w:gutter="0"/>
     </w:sectPr>

</xml_diff>

<commit_message>
feat(md): add company scoped item master backend
</commit_message>
<xml_diff>
--- a/docs/99-output/MyERP_SDS.docx
+++ b/docs/99-output/MyERP_SDS.docx
@@ -1718,6 +1718,857 @@
             <w:pPr/>
             <w:r>
               <w:t xml:space="preserve">NOT NULL</w:t>
+            </w:r>
+          </w:p>
+        </w:tc>
+      </w:tr>
+      <w:tr>
+        <w:trPr>
+          <w:trHeight w:val="530" w:hRule="atLeast"/>
+        </w:trPr>
+        <w:tc>
+          <w:tcPr>
+            <w:tcW w:w="2000" w:type="dxa"/>
+          </w:tcPr>
+          <w:p>
+            <w:pPr/>
+            <w:r>
+              <w:t xml:space="preserve">created_at</w:t>
+            </w:r>
+          </w:p>
+        </w:tc>
+        <w:tc>
+          <w:tcPr>
+            <w:tcW w:w="2000" w:type="dxa"/>
+          </w:tcPr>
+          <w:p>
+            <w:pPr/>
+            <w:r>
+              <w:t xml:space="preserve">datetime2</w:t>
+            </w:r>
+          </w:p>
+        </w:tc>
+        <w:tc>
+          <w:tcPr>
+            <w:tcW w:w="2000" w:type="dxa"/>
+          </w:tcPr>
+          <w:p>
+            <w:pPr/>
+            <w:r>
+              <w:t xml:space="preserve">(6)</w:t>
+            </w:r>
+          </w:p>
+        </w:tc>
+        <w:tc>
+          <w:tcPr>
+            <w:tcW w:w="2000" w:type="dxa"/>
+          </w:tcPr>
+          <w:p>
+            <w:pPr/>
+            <w:r>
+              <w:t xml:space="preserve">NOT NULL</w:t>
+            </w:r>
+          </w:p>
+        </w:tc>
+      </w:tr>
+      <w:tr>
+        <w:trPr>
+          <w:trHeight w:val="530" w:hRule="atLeast"/>
+        </w:trPr>
+        <w:tc>
+          <w:tcPr>
+            <w:tcW w:w="2000" w:type="dxa"/>
+          </w:tcPr>
+          <w:p>
+            <w:pPr/>
+            <w:r>
+              <w:t xml:space="preserve">created_by</w:t>
+            </w:r>
+          </w:p>
+        </w:tc>
+        <w:tc>
+          <w:tcPr>
+            <w:tcW w:w="2000" w:type="dxa"/>
+          </w:tcPr>
+          <w:p>
+            <w:pPr/>
+            <w:r>
+              <w:t xml:space="preserve">bigint</w:t>
+            </w:r>
+          </w:p>
+        </w:tc>
+        <w:tc>
+          <w:tcPr>
+            <w:tcW w:w="2000" w:type="dxa"/>
+          </w:tcPr>
+          <w:p>
+            <w:pPr/>
+            <w:r>
+              <w:t xml:space="preserve">-</w:t>
+            </w:r>
+          </w:p>
+        </w:tc>
+        <w:tc>
+          <w:tcPr>
+            <w:tcW w:w="2000" w:type="dxa"/>
+          </w:tcPr>
+          <w:p>
+            <w:pPr/>
+            <w:r>
+              <w:t xml:space="preserve">NOT NULL</w:t>
+            </w:r>
+          </w:p>
+        </w:tc>
+      </w:tr>
+      <w:tr>
+        <w:trPr>
+          <w:trHeight w:val="530" w:hRule="atLeast"/>
+        </w:trPr>
+        <w:tc>
+          <w:tcPr>
+            <w:tcW w:w="2000" w:type="dxa"/>
+          </w:tcPr>
+          <w:p>
+            <w:pPr/>
+            <w:r>
+              <w:t xml:space="preserve">updated_at</w:t>
+            </w:r>
+          </w:p>
+        </w:tc>
+        <w:tc>
+          <w:tcPr>
+            <w:tcW w:w="2000" w:type="dxa"/>
+          </w:tcPr>
+          <w:p>
+            <w:pPr/>
+            <w:r>
+              <w:t xml:space="preserve">datetime2</w:t>
+            </w:r>
+          </w:p>
+        </w:tc>
+        <w:tc>
+          <w:tcPr>
+            <w:tcW w:w="2000" w:type="dxa"/>
+          </w:tcPr>
+          <w:p>
+            <w:pPr/>
+            <w:r>
+              <w:t xml:space="preserve">(6)</w:t>
+            </w:r>
+          </w:p>
+        </w:tc>
+        <w:tc>
+          <w:tcPr>
+            <w:tcW w:w="2000" w:type="dxa"/>
+          </w:tcPr>
+          <w:p>
+            <w:pPr/>
+            <w:r>
+              <w:t xml:space="preserve">IS NULL</w:t>
+            </w:r>
+          </w:p>
+        </w:tc>
+      </w:tr>
+      <w:tr>
+        <w:trPr>
+          <w:trHeight w:val="530" w:hRule="atLeast"/>
+        </w:trPr>
+        <w:tc>
+          <w:tcPr>
+            <w:tcW w:w="2000" w:type="dxa"/>
+          </w:tcPr>
+          <w:p>
+            <w:pPr/>
+            <w:r>
+              <w:t xml:space="preserve">updated_by</w:t>
+            </w:r>
+          </w:p>
+        </w:tc>
+        <w:tc>
+          <w:tcPr>
+            <w:tcW w:w="2000" w:type="dxa"/>
+          </w:tcPr>
+          <w:p>
+            <w:pPr/>
+            <w:r>
+              <w:t xml:space="preserve">bigint</w:t>
+            </w:r>
+          </w:p>
+        </w:tc>
+        <w:tc>
+          <w:tcPr>
+            <w:tcW w:w="2000" w:type="dxa"/>
+          </w:tcPr>
+          <w:p>
+            <w:pPr/>
+            <w:r>
+              <w:t xml:space="preserve">-</w:t>
+            </w:r>
+          </w:p>
+        </w:tc>
+        <w:tc>
+          <w:tcPr>
+            <w:tcW w:w="2000" w:type="dxa"/>
+          </w:tcPr>
+          <w:p>
+            <w:pPr/>
+            <w:r>
+              <w:t xml:space="preserve">IS NULL</w:t>
+            </w:r>
+          </w:p>
+        </w:tc>
+      </w:tr>
+      <w:tr>
+        <w:trPr>
+          <w:trHeight w:val="530" w:hRule="atLeast"/>
+        </w:trPr>
+        <w:tc>
+          <w:tcPr>
+            <w:tcW w:w="2000" w:type="dxa"/>
+          </w:tcPr>
+          <w:p>
+            <w:pPr/>
+            <w:r>
+              <w:t xml:space="preserve">version</w:t>
+            </w:r>
+          </w:p>
+        </w:tc>
+        <w:tc>
+          <w:tcPr>
+            <w:tcW w:w="2000" w:type="dxa"/>
+          </w:tcPr>
+          <w:p>
+            <w:pPr/>
+            <w:r>
+              <w:t xml:space="preserve">int</w:t>
+            </w:r>
+          </w:p>
+        </w:tc>
+        <w:tc>
+          <w:tcPr>
+            <w:tcW w:w="2000" w:type="dxa"/>
+          </w:tcPr>
+          <w:p>
+            <w:pPr/>
+            <w:r>
+              <w:t xml:space="preserve">-</w:t>
+            </w:r>
+          </w:p>
+        </w:tc>
+        <w:tc>
+          <w:tcPr>
+            <w:tcW w:w="2000" w:type="dxa"/>
+          </w:tcPr>
+          <w:p>
+            <w:pPr/>
+            <w:r>
+              <w:t xml:space="preserve">NOT NULL</w:t>
+            </w:r>
+          </w:p>
+        </w:tc>
+      </w:tr>
+      <w:tr>
+        <w:trPr>
+          <w:trHeight w:val="530" w:hRule="atLeast"/>
+        </w:trPr>
+        <w:tc>
+          <w:tcPr>
+            <w:tcW w:w="2000" w:type="dxa"/>
+          </w:tcPr>
+          <w:p>
+            <w:pPr/>
+            <w:r>
+              <w:t xml:space="preserve">is_active</w:t>
+            </w:r>
+          </w:p>
+        </w:tc>
+        <w:tc>
+          <w:tcPr>
+            <w:tcW w:w="2000" w:type="dxa"/>
+          </w:tcPr>
+          <w:p>
+            <w:pPr/>
+            <w:r>
+              <w:t xml:space="preserve">bit</w:t>
+            </w:r>
+          </w:p>
+        </w:tc>
+        <w:tc>
+          <w:tcPr>
+            <w:tcW w:w="2000" w:type="dxa"/>
+          </w:tcPr>
+          <w:p>
+            <w:pPr/>
+            <w:r>
+              <w:t xml:space="preserve">-</w:t>
+            </w:r>
+          </w:p>
+        </w:tc>
+        <w:tc>
+          <w:tcPr>
+            <w:tcW w:w="2000" w:type="dxa"/>
+          </w:tcPr>
+          <w:p>
+            <w:pPr/>
+            <w:r>
+              <w:t xml:space="preserve">NOT NULL</w:t>
+            </w:r>
+          </w:p>
+        </w:tc>
+      </w:tr>
+      <w:tr>
+        <w:trPr>
+          <w:trHeight w:val="530" w:hRule="atLeast"/>
+        </w:trPr>
+        <w:tc>
+          <w:tcPr>
+            <w:tcW w:w="2000" w:type="dxa"/>
+          </w:tcPr>
+          <w:p>
+            <w:pPr/>
+            <w:r>
+              <w:t xml:space="preserve">is_deleted</w:t>
+            </w:r>
+          </w:p>
+        </w:tc>
+        <w:tc>
+          <w:tcPr>
+            <w:tcW w:w="2000" w:type="dxa"/>
+          </w:tcPr>
+          <w:p>
+            <w:pPr/>
+            <w:r>
+              <w:t xml:space="preserve">bit</w:t>
+            </w:r>
+          </w:p>
+        </w:tc>
+        <w:tc>
+          <w:tcPr>
+            <w:tcW w:w="2000" w:type="dxa"/>
+          </w:tcPr>
+          <w:p>
+            <w:pPr/>
+            <w:r>
+              <w:t xml:space="preserve">-</w:t>
+            </w:r>
+          </w:p>
+        </w:tc>
+        <w:tc>
+          <w:tcPr>
+            <w:tcW w:w="2000" w:type="dxa"/>
+          </w:tcPr>
+          <w:p>
+            <w:pPr/>
+            <w:r>
+              <w:t xml:space="preserve">NOT NULL</w:t>
+            </w:r>
+          </w:p>
+        </w:tc>
+      </w:tr>
+    </w:tbl>
+    <w:p/>
+    <w:p>
+      <w:pPr/>
+      <w:r>
+        <w:t xml:space="preserve">Table Name: md_item</w:t>
+      </w:r>
+    </w:p>
+    <w:p>
+      <w:pPr/>
+      <w:r>
+        <w:t xml:space="preserve">Primary Key: id</w:t>
+      </w:r>
+    </w:p>
+    <w:p>
+      <w:pPr/>
+      <w:r>
+        <w:t xml:space="preserve">This table stores company item masters without inventory balances.</w:t>
+      </w:r>
+    </w:p>
+    <w:tbl>
+      <w:tblPr>
+        <w:tblStyle w:val="TableGrid"/>
+        <w:tblW w:w="8000" w:type="dxa"/>
+        <w:jc w:val="left"/>
+        <w:tblBorders>
+          <w:top w:val="single" w:color="000000" w:sz="4" w:space="0"/>
+          <w:left w:val="single" w:color="000000" w:sz="4" w:space="0"/>
+          <w:bottom w:val="single" w:color="000000" w:sz="4" w:space="0"/>
+          <w:right w:val="single" w:color="000000" w:sz="4" w:space="0"/>
+          <w:insideH w:val="single" w:color="000000" w:sz="4" w:space="0"/>
+          <w:insideV w:val="single" w:color="000000" w:sz="4" w:space="0"/>
+        </w:tblBorders>
+        <w:tblLayout w:type="fixed"/>
+        <w:tblCellMar>
+          <w:top w:w="100" w:type="dxa"/>
+          <w:left w:w="100" w:type="dxa"/>
+          <w:bottom w:w="100" w:type="dxa"/>
+          <w:right w:w="100" w:type="dxa"/>
+        </w:tblCellMar>
+      </w:tblPr>
+      <w:tblGrid>
+        <w:gridCol w:w="2000"/>
+        <w:gridCol w:w="2000"/>
+        <w:gridCol w:w="2000"/>
+        <w:gridCol w:w="2000"/>
+      </w:tblGrid>
+      <w:tr>
+        <w:trPr>
+          <w:trHeight w:val="530" w:hRule="atLeast"/>
+        </w:trPr>
+        <w:tc>
+          <w:tcPr>
+            <w:tcW w:w="2000" w:type="dxa"/>
+          </w:tcPr>
+          <w:p>
+            <w:pPr>
+              <w:jc w:val="center"/>
+            </w:pPr>
+            <w:r>
+              <w:rPr>
+                <w:b/>
+              </w:rPr>
+              <w:t xml:space="preserve">Name of Attribute</w:t>
+            </w:r>
+          </w:p>
+        </w:tc>
+        <w:tc>
+          <w:tcPr>
+            <w:tcW w:w="2000" w:type="dxa"/>
+          </w:tcPr>
+          <w:p>
+            <w:pPr>
+              <w:jc w:val="center"/>
+            </w:pPr>
+            <w:r>
+              <w:rPr>
+                <w:b/>
+              </w:rPr>
+              <w:t xml:space="preserve">Data Type</w:t>
+            </w:r>
+          </w:p>
+        </w:tc>
+        <w:tc>
+          <w:tcPr>
+            <w:tcW w:w="2000" w:type="dxa"/>
+          </w:tcPr>
+          <w:p>
+            <w:pPr>
+              <w:jc w:val="center"/>
+            </w:pPr>
+            <w:r>
+              <w:rPr>
+                <w:b/>
+              </w:rPr>
+              <w:t xml:space="preserve">Size</w:t>
+            </w:r>
+          </w:p>
+        </w:tc>
+        <w:tc>
+          <w:tcPr>
+            <w:tcW w:w="2000" w:type="dxa"/>
+          </w:tcPr>
+          <w:p>
+            <w:pPr>
+              <w:jc w:val="center"/>
+            </w:pPr>
+            <w:r>
+              <w:rPr>
+                <w:b/>
+              </w:rPr>
+              <w:t xml:space="preserve">PK/FK/IS NULL/ NOT NULL</w:t>
+            </w:r>
+          </w:p>
+        </w:tc>
+      </w:tr>
+      <w:tr>
+        <w:trPr>
+          <w:trHeight w:val="530" w:hRule="atLeast"/>
+        </w:trPr>
+        <w:tc>
+          <w:tcPr>
+            <w:tcW w:w="2000" w:type="dxa"/>
+          </w:tcPr>
+          <w:p>
+            <w:pPr/>
+            <w:r>
+              <w:t xml:space="preserve">id</w:t>
+            </w:r>
+          </w:p>
+        </w:tc>
+        <w:tc>
+          <w:tcPr>
+            <w:tcW w:w="2000" w:type="dxa"/>
+          </w:tcPr>
+          <w:p>
+            <w:pPr/>
+            <w:r>
+              <w:t xml:space="preserve">bigint</w:t>
+            </w:r>
+          </w:p>
+        </w:tc>
+        <w:tc>
+          <w:tcPr>
+            <w:tcW w:w="2000" w:type="dxa"/>
+          </w:tcPr>
+          <w:p>
+            <w:pPr/>
+            <w:r>
+              <w:t xml:space="preserve">-</w:t>
+            </w:r>
+          </w:p>
+        </w:tc>
+        <w:tc>
+          <w:tcPr>
+            <w:tcW w:w="2000" w:type="dxa"/>
+          </w:tcPr>
+          <w:p>
+            <w:pPr/>
+            <w:r>
+              <w:t xml:space="preserve">PK, NOT NULL</w:t>
+            </w:r>
+          </w:p>
+        </w:tc>
+      </w:tr>
+      <w:tr>
+        <w:trPr>
+          <w:trHeight w:val="530" w:hRule="atLeast"/>
+        </w:trPr>
+        <w:tc>
+          <w:tcPr>
+            <w:tcW w:w="2000" w:type="dxa"/>
+          </w:tcPr>
+          <w:p>
+            <w:pPr/>
+            <w:r>
+              <w:t xml:space="preserve">code</w:t>
+            </w:r>
+          </w:p>
+        </w:tc>
+        <w:tc>
+          <w:tcPr>
+            <w:tcW w:w="2000" w:type="dxa"/>
+          </w:tcPr>
+          <w:p>
+            <w:pPr/>
+            <w:r>
+              <w:t xml:space="preserve">varchar</w:t>
+            </w:r>
+          </w:p>
+        </w:tc>
+        <w:tc>
+          <w:tcPr>
+            <w:tcW w:w="2000" w:type="dxa"/>
+          </w:tcPr>
+          <w:p>
+            <w:pPr/>
+            <w:r>
+              <w:t xml:space="preserve">30</w:t>
+            </w:r>
+          </w:p>
+        </w:tc>
+        <w:tc>
+          <w:tcPr>
+            <w:tcW w:w="2000" w:type="dxa"/>
+          </w:tcPr>
+          <w:p>
+            <w:pPr/>
+            <w:r>
+              <w:t xml:space="preserve">NOT NULL</w:t>
+            </w:r>
+          </w:p>
+        </w:tc>
+      </w:tr>
+      <w:tr>
+        <w:trPr>
+          <w:trHeight w:val="530" w:hRule="atLeast"/>
+        </w:trPr>
+        <w:tc>
+          <w:tcPr>
+            <w:tcW w:w="2000" w:type="dxa"/>
+          </w:tcPr>
+          <w:p>
+            <w:pPr/>
+            <w:r>
+              <w:t xml:space="preserve">name</w:t>
+            </w:r>
+          </w:p>
+        </w:tc>
+        <w:tc>
+          <w:tcPr>
+            <w:tcW w:w="2000" w:type="dxa"/>
+          </w:tcPr>
+          <w:p>
+            <w:pPr/>
+            <w:r>
+              <w:t xml:space="preserve">nvarchar</w:t>
+            </w:r>
+          </w:p>
+        </w:tc>
+        <w:tc>
+          <w:tcPr>
+            <w:tcW w:w="2000" w:type="dxa"/>
+          </w:tcPr>
+          <w:p>
+            <w:pPr/>
+            <w:r>
+              <w:t xml:space="preserve">200</w:t>
+            </w:r>
+          </w:p>
+        </w:tc>
+        <w:tc>
+          <w:tcPr>
+            <w:tcW w:w="2000" w:type="dxa"/>
+          </w:tcPr>
+          <w:p>
+            <w:pPr/>
+            <w:r>
+              <w:t xml:space="preserve">NOT NULL</w:t>
+            </w:r>
+          </w:p>
+        </w:tc>
+      </w:tr>
+      <w:tr>
+        <w:trPr>
+          <w:trHeight w:val="530" w:hRule="atLeast"/>
+        </w:trPr>
+        <w:tc>
+          <w:tcPr>
+            <w:tcW w:w="2000" w:type="dxa"/>
+          </w:tcPr>
+          <w:p>
+            <w:pPr/>
+            <w:r>
+              <w:t xml:space="preserve">specification</w:t>
+            </w:r>
+          </w:p>
+        </w:tc>
+        <w:tc>
+          <w:tcPr>
+            <w:tcW w:w="2000" w:type="dxa"/>
+          </w:tcPr>
+          <w:p>
+            <w:pPr/>
+            <w:r>
+              <w:t xml:space="preserve">nvarchar</w:t>
+            </w:r>
+          </w:p>
+        </w:tc>
+        <w:tc>
+          <w:tcPr>
+            <w:tcW w:w="2000" w:type="dxa"/>
+          </w:tcPr>
+          <w:p>
+            <w:pPr/>
+            <w:r>
+              <w:t xml:space="preserve">500</w:t>
+            </w:r>
+          </w:p>
+        </w:tc>
+        <w:tc>
+          <w:tcPr>
+            <w:tcW w:w="2000" w:type="dxa"/>
+          </w:tcPr>
+          <w:p>
+            <w:pPr/>
+            <w:r>
+              <w:t xml:space="preserve">IS NULL</w:t>
+            </w:r>
+          </w:p>
+        </w:tc>
+      </w:tr>
+      <w:tr>
+        <w:trPr>
+          <w:trHeight w:val="530" w:hRule="atLeast"/>
+        </w:trPr>
+        <w:tc>
+          <w:tcPr>
+            <w:tcW w:w="2000" w:type="dxa"/>
+          </w:tcPr>
+          <w:p>
+            <w:pPr/>
+            <w:r>
+              <w:t xml:space="preserve">base_uom_id</w:t>
+            </w:r>
+          </w:p>
+        </w:tc>
+        <w:tc>
+          <w:tcPr>
+            <w:tcW w:w="2000" w:type="dxa"/>
+          </w:tcPr>
+          <w:p>
+            <w:pPr/>
+            <w:r>
+              <w:t xml:space="preserve">bigint</w:t>
+            </w:r>
+          </w:p>
+        </w:tc>
+        <w:tc>
+          <w:tcPr>
+            <w:tcW w:w="2000" w:type="dxa"/>
+          </w:tcPr>
+          <w:p>
+            <w:pPr/>
+            <w:r>
+              <w:t xml:space="preserve">-</w:t>
+            </w:r>
+          </w:p>
+        </w:tc>
+        <w:tc>
+          <w:tcPr>
+            <w:tcW w:w="2000" w:type="dxa"/>
+          </w:tcPr>
+          <w:p>
+            <w:pPr/>
+            <w:r>
+              <w:t xml:space="preserve">FK, NOT NULL</w:t>
+            </w:r>
+          </w:p>
+        </w:tc>
+      </w:tr>
+      <w:tr>
+        <w:trPr>
+          <w:trHeight w:val="530" w:hRule="atLeast"/>
+        </w:trPr>
+        <w:tc>
+          <w:tcPr>
+            <w:tcW w:w="2000" w:type="dxa"/>
+          </w:tcPr>
+          <w:p>
+            <w:pPr/>
+            <w:r>
+              <w:t xml:space="preserve">brand_id</w:t>
+            </w:r>
+          </w:p>
+        </w:tc>
+        <w:tc>
+          <w:tcPr>
+            <w:tcW w:w="2000" w:type="dxa"/>
+          </w:tcPr>
+          <w:p>
+            <w:pPr/>
+            <w:r>
+              <w:t xml:space="preserve">bigint</w:t>
+            </w:r>
+          </w:p>
+        </w:tc>
+        <w:tc>
+          <w:tcPr>
+            <w:tcW w:w="2000" w:type="dxa"/>
+          </w:tcPr>
+          <w:p>
+            <w:pPr/>
+            <w:r>
+              <w:t xml:space="preserve">-</w:t>
+            </w:r>
+          </w:p>
+        </w:tc>
+        <w:tc>
+          <w:tcPr>
+            <w:tcW w:w="2000" w:type="dxa"/>
+          </w:tcPr>
+          <w:p>
+            <w:pPr/>
+            <w:r>
+              <w:t xml:space="preserve">FK, IS NULL</w:t>
+            </w:r>
+          </w:p>
+        </w:tc>
+      </w:tr>
+      <w:tr>
+        <w:trPr>
+          <w:trHeight w:val="530" w:hRule="atLeast"/>
+        </w:trPr>
+        <w:tc>
+          <w:tcPr>
+            <w:tcW w:w="2000" w:type="dxa"/>
+          </w:tcPr>
+          <w:p>
+            <w:pPr/>
+            <w:r>
+              <w:t xml:space="preserve">category_id</w:t>
+            </w:r>
+          </w:p>
+        </w:tc>
+        <w:tc>
+          <w:tcPr>
+            <w:tcW w:w="2000" w:type="dxa"/>
+          </w:tcPr>
+          <w:p>
+            <w:pPr/>
+            <w:r>
+              <w:t xml:space="preserve">bigint</w:t>
+            </w:r>
+          </w:p>
+        </w:tc>
+        <w:tc>
+          <w:tcPr>
+            <w:tcW w:w="2000" w:type="dxa"/>
+          </w:tcPr>
+          <w:p>
+            <w:pPr/>
+            <w:r>
+              <w:t xml:space="preserve">-</w:t>
+            </w:r>
+          </w:p>
+        </w:tc>
+        <w:tc>
+          <w:tcPr>
+            <w:tcW w:w="2000" w:type="dxa"/>
+          </w:tcPr>
+          <w:p>
+            <w:pPr/>
+            <w:r>
+              <w:t xml:space="preserve">FK, IS NULL</w:t>
+            </w:r>
+          </w:p>
+        </w:tc>
+      </w:tr>
+      <w:tr>
+        <w:trPr>
+          <w:trHeight w:val="530" w:hRule="atLeast"/>
+        </w:trPr>
+        <w:tc>
+          <w:tcPr>
+            <w:tcW w:w="2000" w:type="dxa"/>
+          </w:tcPr>
+          <w:p>
+            <w:pPr/>
+            <w:r>
+              <w:t xml:space="preserve">company_id</w:t>
+            </w:r>
+          </w:p>
+        </w:tc>
+        <w:tc>
+          <w:tcPr>
+            <w:tcW w:w="2000" w:type="dxa"/>
+          </w:tcPr>
+          <w:p>
+            <w:pPr/>
+            <w:r>
+              <w:t xml:space="preserve">bigint</w:t>
+            </w:r>
+          </w:p>
+        </w:tc>
+        <w:tc>
+          <w:tcPr>
+            <w:tcW w:w="2000" w:type="dxa"/>
+          </w:tcPr>
+          <w:p>
+            <w:pPr/>
+            <w:r>
+              <w:t xml:space="preserve">-</w:t>
+            </w:r>
+          </w:p>
+        </w:tc>
+        <w:tc>
+          <w:tcPr>
+            <w:tcW w:w="2000" w:type="dxa"/>
+          </w:tcPr>
+          <w:p>
+            <w:pPr/>
+            <w:r>
+              <w:t xml:space="preserve">FK, NOT NULL</w:t>
             </w:r>
           </w:p>
         </w:tc>
@@ -22111,7 +22962,7 @@
       </w:r>
     </w:p>
     <w:sectPr>
-      <w:footerReference xmlns:r="http://schemas.openxmlformats.org/officeDocument/2006/relationships" w:type="default" r:id="Rcf27ae7d1a0c43b4"/>
+      <w:footerReference xmlns:r="http://schemas.openxmlformats.org/officeDocument/2006/relationships" w:type="default" r:id="R60d8de56e8ec4531"/>
       <w:pgSz w:w="11906" w:h="16838"/>
       <w:pgMar w:top="1440" w:right="1440" w:bottom="1440" w:left="1440" w:header="720" w:footer="720" w:gutter="0"/>
     </w:sectPr>

</xml_diff>

<commit_message>
feat(md): add multilingual item management page
</commit_message>
<xml_diff>
--- a/docs/99-output/MyERP_SDS.docx
+++ b/docs/99-output/MyERP_SDS.docx
@@ -22256,6 +22256,63 @@
           <w:i/>
         </w:rPr>
         <w:t xml:space="preserve">[Pending] System screenshot of Supplier Edit Interface.</w:t>
+      </w:r>
+    </w:p>
+    <w:p>
+      <w:pPr>
+        <w:pStyle w:val="Heading5"/>
+      </w:pPr>
+      <w:r>
+        <w:t xml:space="preserve">4.2.1.8.11 Item View Interface</w:t>
+      </w:r>
+    </w:p>
+    <w:p>
+      <w:pPr>
+        <w:jc w:val="center"/>
+      </w:pPr>
+      <w:r>
+        <w:rPr>
+          <w:i/>
+        </w:rPr>
+        <w:t xml:space="preserve">[Pending] System screenshot of Item View Interface.</w:t>
+      </w:r>
+    </w:p>
+    <w:p>
+      <w:pPr>
+        <w:pStyle w:val="Heading5"/>
+      </w:pPr>
+      <w:r>
+        <w:t xml:space="preserve">4.2.1.8.12 Item Create Interface</w:t>
+      </w:r>
+    </w:p>
+    <w:p>
+      <w:pPr>
+        <w:jc w:val="center"/>
+      </w:pPr>
+      <w:r>
+        <w:rPr>
+          <w:i/>
+        </w:rPr>
+        <w:t xml:space="preserve">[Pending] System screenshot of Item Create Interface.</w:t>
+      </w:r>
+    </w:p>
+    <w:p>
+      <w:pPr>
+        <w:pStyle w:val="Heading5"/>
+      </w:pPr>
+      <w:r>
+        <w:t xml:space="preserve">4.2.1.8.13 Item Edit Interface</w:t>
+      </w:r>
+    </w:p>
+    <w:p>
+      <w:pPr>
+        <w:jc w:val="center"/>
+      </w:pPr>
+      <w:r>
+        <w:rPr>
+          <w:i/>
+        </w:rPr>
+        <w:t xml:space="preserve">[Pending] System screenshot of Item Edit Interface.</w:t>
       </w:r>
     </w:p>
     <w:p>
@@ -22962,7 +23019,7 @@
       </w:r>
     </w:p>
     <w:sectPr>
-      <w:footerReference xmlns:r="http://schemas.openxmlformats.org/officeDocument/2006/relationships" w:type="default" r:id="R60d8de56e8ec4531"/>
+      <w:footerReference xmlns:r="http://schemas.openxmlformats.org/officeDocument/2006/relationships" w:type="default" r:id="Ra7de1b372e4e4c1e"/>
       <w:pgSz w:w="11906" w:h="16838"/>
       <w:pgMar w:top="1440" w:right="1440" w:bottom="1440" w:left="1440" w:header="720" w:footer="720" w:gutter="0"/>
     </w:sectPr>

</xml_diff>

<commit_message>
feat(md): add item-specific unit conversions
- ADR-035: item conversions are a star around the base unit, override
  company conversions for the same unit and fall back to company paths
- md_item_uom_conversion (REQ_DS43.114) with company-scoped keys
- IUomConverter.ConvertForItemAsync and nested item conversion API
- base unit locked while item conversions exist (MD.ITEM.BASE_UOM_LOCKED)
- trilingual item conversion dialog (interface 8.77) with calculator
- correct item requirement IDs to REQ_F4118.3.x (Product Management)

Co-Authored-By: Claude Opus 5.5 <noreply@anthropic.com>
</commit_message>
<xml_diff>
--- a/docs/99-output/MyERP_SDS.docx
+++ b/docs/99-output/MyERP_SDS.docx
@@ -4369,6 +4369,661 @@
             <w:pPr/>
             <w:r>
               <w:t xml:space="preserve">IS NULL</w:t>
+            </w:r>
+          </w:p>
+        </w:tc>
+      </w:tr>
+    </w:tbl>
+    <w:p/>
+    <w:p>
+      <w:pPr/>
+      <w:r>
+        <w:t xml:space="preserve">Table Name: md_item_uom_conversion</w:t>
+      </w:r>
+    </w:p>
+    <w:p>
+      <w:pPr/>
+      <w:r>
+        <w:t xml:space="preserve">Primary Key: id</w:t>
+      </w:r>
+    </w:p>
+    <w:p>
+      <w:pPr/>
+      <w:r>
+        <w:t xml:space="preserve">This table stores item-specific conversion factors from alternate units to the item base unit within a company.</w:t>
+      </w:r>
+    </w:p>
+    <w:tbl>
+      <w:tblPr>
+        <w:tblStyle w:val="TableGrid"/>
+        <w:tblW w:w="8000" w:type="dxa"/>
+        <w:jc w:val="left"/>
+        <w:tblBorders>
+          <w:top w:val="single" w:color="000000" w:sz="4" w:space="0"/>
+          <w:left w:val="single" w:color="000000" w:sz="4" w:space="0"/>
+          <w:bottom w:val="single" w:color="000000" w:sz="4" w:space="0"/>
+          <w:right w:val="single" w:color="000000" w:sz="4" w:space="0"/>
+          <w:insideH w:val="single" w:color="000000" w:sz="4" w:space="0"/>
+          <w:insideV w:val="single" w:color="000000" w:sz="4" w:space="0"/>
+        </w:tblBorders>
+        <w:tblLayout w:type="fixed"/>
+        <w:tblCellMar>
+          <w:top w:w="100" w:type="dxa"/>
+          <w:left w:w="100" w:type="dxa"/>
+          <w:bottom w:w="100" w:type="dxa"/>
+          <w:right w:w="100" w:type="dxa"/>
+        </w:tblCellMar>
+      </w:tblPr>
+      <w:tblGrid>
+        <w:gridCol w:w="2000"/>
+        <w:gridCol w:w="2000"/>
+        <w:gridCol w:w="2000"/>
+        <w:gridCol w:w="2000"/>
+      </w:tblGrid>
+      <w:tr>
+        <w:trPr>
+          <w:trHeight w:val="530" w:hRule="atLeast"/>
+        </w:trPr>
+        <w:tc>
+          <w:tcPr>
+            <w:tcW w:w="2000" w:type="dxa"/>
+          </w:tcPr>
+          <w:p>
+            <w:pPr>
+              <w:jc w:val="center"/>
+            </w:pPr>
+            <w:r>
+              <w:rPr>
+                <w:b/>
+              </w:rPr>
+              <w:t xml:space="preserve">Name of Attribute</w:t>
+            </w:r>
+          </w:p>
+        </w:tc>
+        <w:tc>
+          <w:tcPr>
+            <w:tcW w:w="2000" w:type="dxa"/>
+          </w:tcPr>
+          <w:p>
+            <w:pPr>
+              <w:jc w:val="center"/>
+            </w:pPr>
+            <w:r>
+              <w:rPr>
+                <w:b/>
+              </w:rPr>
+              <w:t xml:space="preserve">Data Type</w:t>
+            </w:r>
+          </w:p>
+        </w:tc>
+        <w:tc>
+          <w:tcPr>
+            <w:tcW w:w="2000" w:type="dxa"/>
+          </w:tcPr>
+          <w:p>
+            <w:pPr>
+              <w:jc w:val="center"/>
+            </w:pPr>
+            <w:r>
+              <w:rPr>
+                <w:b/>
+              </w:rPr>
+              <w:t xml:space="preserve">Size</w:t>
+            </w:r>
+          </w:p>
+        </w:tc>
+        <w:tc>
+          <w:tcPr>
+            <w:tcW w:w="2000" w:type="dxa"/>
+          </w:tcPr>
+          <w:p>
+            <w:pPr>
+              <w:jc w:val="center"/>
+            </w:pPr>
+            <w:r>
+              <w:rPr>
+                <w:b/>
+              </w:rPr>
+              <w:t xml:space="preserve">PK/FK/IS NULL/ NOT NULL</w:t>
+            </w:r>
+          </w:p>
+        </w:tc>
+      </w:tr>
+      <w:tr>
+        <w:trPr>
+          <w:trHeight w:val="530" w:hRule="atLeast"/>
+        </w:trPr>
+        <w:tc>
+          <w:tcPr>
+            <w:tcW w:w="2000" w:type="dxa"/>
+          </w:tcPr>
+          <w:p>
+            <w:pPr/>
+            <w:r>
+              <w:t xml:space="preserve">id</w:t>
+            </w:r>
+          </w:p>
+        </w:tc>
+        <w:tc>
+          <w:tcPr>
+            <w:tcW w:w="2000" w:type="dxa"/>
+          </w:tcPr>
+          <w:p>
+            <w:pPr/>
+            <w:r>
+              <w:t xml:space="preserve">bigint</w:t>
+            </w:r>
+          </w:p>
+        </w:tc>
+        <w:tc>
+          <w:tcPr>
+            <w:tcW w:w="2000" w:type="dxa"/>
+          </w:tcPr>
+          <w:p>
+            <w:pPr/>
+            <w:r>
+              <w:t xml:space="preserve">-</w:t>
+            </w:r>
+          </w:p>
+        </w:tc>
+        <w:tc>
+          <w:tcPr>
+            <w:tcW w:w="2000" w:type="dxa"/>
+          </w:tcPr>
+          <w:p>
+            <w:pPr/>
+            <w:r>
+              <w:t xml:space="preserve">PK, NOT NULL</w:t>
+            </w:r>
+          </w:p>
+        </w:tc>
+      </w:tr>
+      <w:tr>
+        <w:trPr>
+          <w:trHeight w:val="530" w:hRule="atLeast"/>
+        </w:trPr>
+        <w:tc>
+          <w:tcPr>
+            <w:tcW w:w="2000" w:type="dxa"/>
+          </w:tcPr>
+          <w:p>
+            <w:pPr/>
+            <w:r>
+              <w:t xml:space="preserve">item_id</w:t>
+            </w:r>
+          </w:p>
+        </w:tc>
+        <w:tc>
+          <w:tcPr>
+            <w:tcW w:w="2000" w:type="dxa"/>
+          </w:tcPr>
+          <w:p>
+            <w:pPr/>
+            <w:r>
+              <w:t xml:space="preserve">bigint</w:t>
+            </w:r>
+          </w:p>
+        </w:tc>
+        <w:tc>
+          <w:tcPr>
+            <w:tcW w:w="2000" w:type="dxa"/>
+          </w:tcPr>
+          <w:p>
+            <w:pPr/>
+            <w:r>
+              <w:t xml:space="preserve">-</w:t>
+            </w:r>
+          </w:p>
+        </w:tc>
+        <w:tc>
+          <w:tcPr>
+            <w:tcW w:w="2000" w:type="dxa"/>
+          </w:tcPr>
+          <w:p>
+            <w:pPr/>
+            <w:r>
+              <w:t xml:space="preserve">FK, NOT NULL</w:t>
+            </w:r>
+          </w:p>
+        </w:tc>
+      </w:tr>
+      <w:tr>
+        <w:trPr>
+          <w:trHeight w:val="530" w:hRule="atLeast"/>
+        </w:trPr>
+        <w:tc>
+          <w:tcPr>
+            <w:tcW w:w="2000" w:type="dxa"/>
+          </w:tcPr>
+          <w:p>
+            <w:pPr/>
+            <w:r>
+              <w:t xml:space="preserve">uom_id</w:t>
+            </w:r>
+          </w:p>
+        </w:tc>
+        <w:tc>
+          <w:tcPr>
+            <w:tcW w:w="2000" w:type="dxa"/>
+          </w:tcPr>
+          <w:p>
+            <w:pPr/>
+            <w:r>
+              <w:t xml:space="preserve">bigint</w:t>
+            </w:r>
+          </w:p>
+        </w:tc>
+        <w:tc>
+          <w:tcPr>
+            <w:tcW w:w="2000" w:type="dxa"/>
+          </w:tcPr>
+          <w:p>
+            <w:pPr/>
+            <w:r>
+              <w:t xml:space="preserve">-</w:t>
+            </w:r>
+          </w:p>
+        </w:tc>
+        <w:tc>
+          <w:tcPr>
+            <w:tcW w:w="2000" w:type="dxa"/>
+          </w:tcPr>
+          <w:p>
+            <w:pPr/>
+            <w:r>
+              <w:t xml:space="preserve">FK, NOT NULL</w:t>
+            </w:r>
+          </w:p>
+        </w:tc>
+      </w:tr>
+      <w:tr>
+        <w:trPr>
+          <w:trHeight w:val="530" w:hRule="atLeast"/>
+        </w:trPr>
+        <w:tc>
+          <w:tcPr>
+            <w:tcW w:w="2000" w:type="dxa"/>
+          </w:tcPr>
+          <w:p>
+            <w:pPr/>
+            <w:r>
+              <w:t xml:space="preserve">factor</w:t>
+            </w:r>
+          </w:p>
+        </w:tc>
+        <w:tc>
+          <w:tcPr>
+            <w:tcW w:w="2000" w:type="dxa"/>
+          </w:tcPr>
+          <w:p>
+            <w:pPr/>
+            <w:r>
+              <w:t xml:space="preserve">decimal</w:t>
+            </w:r>
+          </w:p>
+        </w:tc>
+        <w:tc>
+          <w:tcPr>
+            <w:tcW w:w="2000" w:type="dxa"/>
+          </w:tcPr>
+          <w:p>
+            <w:pPr/>
+            <w:r>
+              <w:t xml:space="preserve">(15,6)</w:t>
+            </w:r>
+          </w:p>
+        </w:tc>
+        <w:tc>
+          <w:tcPr>
+            <w:tcW w:w="2000" w:type="dxa"/>
+          </w:tcPr>
+          <w:p>
+            <w:pPr/>
+            <w:r>
+              <w:t xml:space="preserve">NOT NULL</w:t>
+            </w:r>
+          </w:p>
+        </w:tc>
+      </w:tr>
+      <w:tr>
+        <w:trPr>
+          <w:trHeight w:val="530" w:hRule="atLeast"/>
+        </w:trPr>
+        <w:tc>
+          <w:tcPr>
+            <w:tcW w:w="2000" w:type="dxa"/>
+          </w:tcPr>
+          <w:p>
+            <w:pPr/>
+            <w:r>
+              <w:t xml:space="preserve">is_deleted</w:t>
+            </w:r>
+          </w:p>
+        </w:tc>
+        <w:tc>
+          <w:tcPr>
+            <w:tcW w:w="2000" w:type="dxa"/>
+          </w:tcPr>
+          <w:p>
+            <w:pPr/>
+            <w:r>
+              <w:t xml:space="preserve">bit</w:t>
+            </w:r>
+          </w:p>
+        </w:tc>
+        <w:tc>
+          <w:tcPr>
+            <w:tcW w:w="2000" w:type="dxa"/>
+          </w:tcPr>
+          <w:p>
+            <w:pPr/>
+            <w:r>
+              <w:t xml:space="preserve">-</w:t>
+            </w:r>
+          </w:p>
+        </w:tc>
+        <w:tc>
+          <w:tcPr>
+            <w:tcW w:w="2000" w:type="dxa"/>
+          </w:tcPr>
+          <w:p>
+            <w:pPr/>
+            <w:r>
+              <w:t xml:space="preserve">NOT NULL</w:t>
+            </w:r>
+          </w:p>
+        </w:tc>
+      </w:tr>
+      <w:tr>
+        <w:trPr>
+          <w:trHeight w:val="530" w:hRule="atLeast"/>
+        </w:trPr>
+        <w:tc>
+          <w:tcPr>
+            <w:tcW w:w="2000" w:type="dxa"/>
+          </w:tcPr>
+          <w:p>
+            <w:pPr/>
+            <w:r>
+              <w:t xml:space="preserve">company_id</w:t>
+            </w:r>
+          </w:p>
+        </w:tc>
+        <w:tc>
+          <w:tcPr>
+            <w:tcW w:w="2000" w:type="dxa"/>
+          </w:tcPr>
+          <w:p>
+            <w:pPr/>
+            <w:r>
+              <w:t xml:space="preserve">bigint</w:t>
+            </w:r>
+          </w:p>
+        </w:tc>
+        <w:tc>
+          <w:tcPr>
+            <w:tcW w:w="2000" w:type="dxa"/>
+          </w:tcPr>
+          <w:p>
+            <w:pPr/>
+            <w:r>
+              <w:t xml:space="preserve">-</w:t>
+            </w:r>
+          </w:p>
+        </w:tc>
+        <w:tc>
+          <w:tcPr>
+            <w:tcW w:w="2000" w:type="dxa"/>
+          </w:tcPr>
+          <w:p>
+            <w:pPr/>
+            <w:r>
+              <w:t xml:space="preserve">FK, NOT NULL</w:t>
+            </w:r>
+          </w:p>
+        </w:tc>
+      </w:tr>
+      <w:tr>
+        <w:trPr>
+          <w:trHeight w:val="530" w:hRule="atLeast"/>
+        </w:trPr>
+        <w:tc>
+          <w:tcPr>
+            <w:tcW w:w="2000" w:type="dxa"/>
+          </w:tcPr>
+          <w:p>
+            <w:pPr/>
+            <w:r>
+              <w:t xml:space="preserve">created_at</w:t>
+            </w:r>
+          </w:p>
+        </w:tc>
+        <w:tc>
+          <w:tcPr>
+            <w:tcW w:w="2000" w:type="dxa"/>
+          </w:tcPr>
+          <w:p>
+            <w:pPr/>
+            <w:r>
+              <w:t xml:space="preserve">datetime2</w:t>
+            </w:r>
+          </w:p>
+        </w:tc>
+        <w:tc>
+          <w:tcPr>
+            <w:tcW w:w="2000" w:type="dxa"/>
+          </w:tcPr>
+          <w:p>
+            <w:pPr/>
+            <w:r>
+              <w:t xml:space="preserve">(6)</w:t>
+            </w:r>
+          </w:p>
+        </w:tc>
+        <w:tc>
+          <w:tcPr>
+            <w:tcW w:w="2000" w:type="dxa"/>
+          </w:tcPr>
+          <w:p>
+            <w:pPr/>
+            <w:r>
+              <w:t xml:space="preserve">NOT NULL</w:t>
+            </w:r>
+          </w:p>
+        </w:tc>
+      </w:tr>
+      <w:tr>
+        <w:trPr>
+          <w:trHeight w:val="530" w:hRule="atLeast"/>
+        </w:trPr>
+        <w:tc>
+          <w:tcPr>
+            <w:tcW w:w="2000" w:type="dxa"/>
+          </w:tcPr>
+          <w:p>
+            <w:pPr/>
+            <w:r>
+              <w:t xml:space="preserve">created_by</w:t>
+            </w:r>
+          </w:p>
+        </w:tc>
+        <w:tc>
+          <w:tcPr>
+            <w:tcW w:w="2000" w:type="dxa"/>
+          </w:tcPr>
+          <w:p>
+            <w:pPr/>
+            <w:r>
+              <w:t xml:space="preserve">bigint</w:t>
+            </w:r>
+          </w:p>
+        </w:tc>
+        <w:tc>
+          <w:tcPr>
+            <w:tcW w:w="2000" w:type="dxa"/>
+          </w:tcPr>
+          <w:p>
+            <w:pPr/>
+            <w:r>
+              <w:t xml:space="preserve">-</w:t>
+            </w:r>
+          </w:p>
+        </w:tc>
+        <w:tc>
+          <w:tcPr>
+            <w:tcW w:w="2000" w:type="dxa"/>
+          </w:tcPr>
+          <w:p>
+            <w:pPr/>
+            <w:r>
+              <w:t xml:space="preserve">NOT NULL</w:t>
+            </w:r>
+          </w:p>
+        </w:tc>
+      </w:tr>
+      <w:tr>
+        <w:trPr>
+          <w:trHeight w:val="530" w:hRule="atLeast"/>
+        </w:trPr>
+        <w:tc>
+          <w:tcPr>
+            <w:tcW w:w="2000" w:type="dxa"/>
+          </w:tcPr>
+          <w:p>
+            <w:pPr/>
+            <w:r>
+              <w:t xml:space="preserve">updated_at</w:t>
+            </w:r>
+          </w:p>
+        </w:tc>
+        <w:tc>
+          <w:tcPr>
+            <w:tcW w:w="2000" w:type="dxa"/>
+          </w:tcPr>
+          <w:p>
+            <w:pPr/>
+            <w:r>
+              <w:t xml:space="preserve">datetime2</w:t>
+            </w:r>
+          </w:p>
+        </w:tc>
+        <w:tc>
+          <w:tcPr>
+            <w:tcW w:w="2000" w:type="dxa"/>
+          </w:tcPr>
+          <w:p>
+            <w:pPr/>
+            <w:r>
+              <w:t xml:space="preserve">(6)</w:t>
+            </w:r>
+          </w:p>
+        </w:tc>
+        <w:tc>
+          <w:tcPr>
+            <w:tcW w:w="2000" w:type="dxa"/>
+          </w:tcPr>
+          <w:p>
+            <w:pPr/>
+            <w:r>
+              <w:t xml:space="preserve">IS NULL</w:t>
+            </w:r>
+          </w:p>
+        </w:tc>
+      </w:tr>
+      <w:tr>
+        <w:trPr>
+          <w:trHeight w:val="530" w:hRule="atLeast"/>
+        </w:trPr>
+        <w:tc>
+          <w:tcPr>
+            <w:tcW w:w="2000" w:type="dxa"/>
+          </w:tcPr>
+          <w:p>
+            <w:pPr/>
+            <w:r>
+              <w:t xml:space="preserve">updated_by</w:t>
+            </w:r>
+          </w:p>
+        </w:tc>
+        <w:tc>
+          <w:tcPr>
+            <w:tcW w:w="2000" w:type="dxa"/>
+          </w:tcPr>
+          <w:p>
+            <w:pPr/>
+            <w:r>
+              <w:t xml:space="preserve">bigint</w:t>
+            </w:r>
+          </w:p>
+        </w:tc>
+        <w:tc>
+          <w:tcPr>
+            <w:tcW w:w="2000" w:type="dxa"/>
+          </w:tcPr>
+          <w:p>
+            <w:pPr/>
+            <w:r>
+              <w:t xml:space="preserve">-</w:t>
+            </w:r>
+          </w:p>
+        </w:tc>
+        <w:tc>
+          <w:tcPr>
+            <w:tcW w:w="2000" w:type="dxa"/>
+          </w:tcPr>
+          <w:p>
+            <w:pPr/>
+            <w:r>
+              <w:t xml:space="preserve">IS NULL</w:t>
+            </w:r>
+          </w:p>
+        </w:tc>
+      </w:tr>
+      <w:tr>
+        <w:trPr>
+          <w:trHeight w:val="530" w:hRule="atLeast"/>
+        </w:trPr>
+        <w:tc>
+          <w:tcPr>
+            <w:tcW w:w="2000" w:type="dxa"/>
+          </w:tcPr>
+          <w:p>
+            <w:pPr/>
+            <w:r>
+              <w:t xml:space="preserve">version</w:t>
+            </w:r>
+          </w:p>
+        </w:tc>
+        <w:tc>
+          <w:tcPr>
+            <w:tcW w:w="2000" w:type="dxa"/>
+          </w:tcPr>
+          <w:p>
+            <w:pPr/>
+            <w:r>
+              <w:t xml:space="preserve">int</w:t>
+            </w:r>
+          </w:p>
+        </w:tc>
+        <w:tc>
+          <w:tcPr>
+            <w:tcW w:w="2000" w:type="dxa"/>
+          </w:tcPr>
+          <w:p>
+            <w:pPr/>
+            <w:r>
+              <w:t xml:space="preserve">-</w:t>
+            </w:r>
+          </w:p>
+        </w:tc>
+        <w:tc>
+          <w:tcPr>
+            <w:tcW w:w="2000" w:type="dxa"/>
+          </w:tcPr>
+          <w:p>
+            <w:pPr/>
+            <w:r>
+              <w:t xml:space="preserve">NOT NULL</w:t>
             </w:r>
           </w:p>
         </w:tc>
@@ -23018,8 +23673,27 @@
         <w:t xml:space="preserve">[Pending] System screenshot of Notification View Interface.</w:t>
       </w:r>
     </w:p>
+    <w:p>
+      <w:pPr>
+        <w:pStyle w:val="Heading5"/>
+      </w:pPr>
+      <w:r>
+        <w:t xml:space="preserve">4.2.1.8.77 Item Unit Conversion Interface</w:t>
+      </w:r>
+    </w:p>
+    <w:p>
+      <w:pPr>
+        <w:jc w:val="center"/>
+      </w:pPr>
+      <w:r>
+        <w:rPr>
+          <w:i/>
+        </w:rPr>
+        <w:t xml:space="preserve">[Pending] System screenshot of Item Unit Conversion Interface.</w:t>
+      </w:r>
+    </w:p>
     <w:sectPr>
-      <w:footerReference xmlns:r="http://schemas.openxmlformats.org/officeDocument/2006/relationships" w:type="default" r:id="Ra7de1b372e4e4c1e"/>
+      <w:footerReference xmlns:r="http://schemas.openxmlformats.org/officeDocument/2006/relationships" w:type="default" r:id="R3be03ed0a9924736"/>
       <w:pgSz w:w="11906" w:h="16838"/>
       <w:pgMar w:top="1440" w:right="1440" w:bottom="1440" w:left="1440" w:header="720" w:footer="720" w:gutter="0"/>
     </w:sectPr>

</xml_diff>

<commit_message>
feat(md): add multilingual warehouse and storage location pages
- /md/warehouses page (interfaces 8.17-8.19) with search, versioned
  edit and delete confirmation showing HAS_LOCATIONS
- storage location dialog (interface 8.78) with paging, search and
  inactive-warehouse guard; read-only users see locations only
- menu entry, trilingual md/errors/layout texts, Vitest and Playwright
- reuse MasterDataInput in item and business partner services
- requirement/interface traceability, test plan and status updates

Co-Authored-By: Claude Opus 5.5 <noreply@anthropic.com>
</commit_message>
<xml_diff>
--- a/docs/99-output/MyERP_SDS.docx
+++ b/docs/99-output/MyERP_SDS.docx
@@ -5033,6 +5033,710 @@
     <w:p>
       <w:pPr/>
       <w:r>
+        <w:t xml:space="preserve">Table Name: md_storage_location</w:t>
+      </w:r>
+    </w:p>
+    <w:p>
+      <w:pPr/>
+      <w:r>
+        <w:t xml:space="preserve">Primary Key: id</w:t>
+      </w:r>
+    </w:p>
+    <w:p>
+      <w:pPr/>
+      <w:r>
+        <w:t xml:space="preserve">This table stores storage locations (bins) within a warehouse.</w:t>
+      </w:r>
+    </w:p>
+    <w:tbl>
+      <w:tblPr>
+        <w:tblStyle w:val="TableGrid"/>
+        <w:tblW w:w="8000" w:type="dxa"/>
+        <w:jc w:val="left"/>
+        <w:tblBorders>
+          <w:top w:val="single" w:color="000000" w:sz="4" w:space="0"/>
+          <w:left w:val="single" w:color="000000" w:sz="4" w:space="0"/>
+          <w:bottom w:val="single" w:color="000000" w:sz="4" w:space="0"/>
+          <w:right w:val="single" w:color="000000" w:sz="4" w:space="0"/>
+          <w:insideH w:val="single" w:color="000000" w:sz="4" w:space="0"/>
+          <w:insideV w:val="single" w:color="000000" w:sz="4" w:space="0"/>
+        </w:tblBorders>
+        <w:tblLayout w:type="fixed"/>
+        <w:tblCellMar>
+          <w:top w:w="100" w:type="dxa"/>
+          <w:left w:w="100" w:type="dxa"/>
+          <w:bottom w:w="100" w:type="dxa"/>
+          <w:right w:w="100" w:type="dxa"/>
+        </w:tblCellMar>
+      </w:tblPr>
+      <w:tblGrid>
+        <w:gridCol w:w="2000"/>
+        <w:gridCol w:w="2000"/>
+        <w:gridCol w:w="2000"/>
+        <w:gridCol w:w="2000"/>
+      </w:tblGrid>
+      <w:tr>
+        <w:trPr>
+          <w:trHeight w:val="530" w:hRule="atLeast"/>
+        </w:trPr>
+        <w:tc>
+          <w:tcPr>
+            <w:tcW w:w="2000" w:type="dxa"/>
+          </w:tcPr>
+          <w:p>
+            <w:pPr>
+              <w:jc w:val="center"/>
+            </w:pPr>
+            <w:r>
+              <w:rPr>
+                <w:b/>
+              </w:rPr>
+              <w:t xml:space="preserve">Name of Attribute</w:t>
+            </w:r>
+          </w:p>
+        </w:tc>
+        <w:tc>
+          <w:tcPr>
+            <w:tcW w:w="2000" w:type="dxa"/>
+          </w:tcPr>
+          <w:p>
+            <w:pPr>
+              <w:jc w:val="center"/>
+            </w:pPr>
+            <w:r>
+              <w:rPr>
+                <w:b/>
+              </w:rPr>
+              <w:t xml:space="preserve">Data Type</w:t>
+            </w:r>
+          </w:p>
+        </w:tc>
+        <w:tc>
+          <w:tcPr>
+            <w:tcW w:w="2000" w:type="dxa"/>
+          </w:tcPr>
+          <w:p>
+            <w:pPr>
+              <w:jc w:val="center"/>
+            </w:pPr>
+            <w:r>
+              <w:rPr>
+                <w:b/>
+              </w:rPr>
+              <w:t xml:space="preserve">Size</w:t>
+            </w:r>
+          </w:p>
+        </w:tc>
+        <w:tc>
+          <w:tcPr>
+            <w:tcW w:w="2000" w:type="dxa"/>
+          </w:tcPr>
+          <w:p>
+            <w:pPr>
+              <w:jc w:val="center"/>
+            </w:pPr>
+            <w:r>
+              <w:rPr>
+                <w:b/>
+              </w:rPr>
+              <w:t xml:space="preserve">PK/FK/IS NULL/ NOT NULL</w:t>
+            </w:r>
+          </w:p>
+        </w:tc>
+      </w:tr>
+      <w:tr>
+        <w:trPr>
+          <w:trHeight w:val="530" w:hRule="atLeast"/>
+        </w:trPr>
+        <w:tc>
+          <w:tcPr>
+            <w:tcW w:w="2000" w:type="dxa"/>
+          </w:tcPr>
+          <w:p>
+            <w:pPr/>
+            <w:r>
+              <w:t xml:space="preserve">id</w:t>
+            </w:r>
+          </w:p>
+        </w:tc>
+        <w:tc>
+          <w:tcPr>
+            <w:tcW w:w="2000" w:type="dxa"/>
+          </w:tcPr>
+          <w:p>
+            <w:pPr/>
+            <w:r>
+              <w:t xml:space="preserve">bigint</w:t>
+            </w:r>
+          </w:p>
+        </w:tc>
+        <w:tc>
+          <w:tcPr>
+            <w:tcW w:w="2000" w:type="dxa"/>
+          </w:tcPr>
+          <w:p>
+            <w:pPr/>
+            <w:r>
+              <w:t xml:space="preserve">-</w:t>
+            </w:r>
+          </w:p>
+        </w:tc>
+        <w:tc>
+          <w:tcPr>
+            <w:tcW w:w="2000" w:type="dxa"/>
+          </w:tcPr>
+          <w:p>
+            <w:pPr/>
+            <w:r>
+              <w:t xml:space="preserve">PK, NOT NULL</w:t>
+            </w:r>
+          </w:p>
+        </w:tc>
+      </w:tr>
+      <w:tr>
+        <w:trPr>
+          <w:trHeight w:val="530" w:hRule="atLeast"/>
+        </w:trPr>
+        <w:tc>
+          <w:tcPr>
+            <w:tcW w:w="2000" w:type="dxa"/>
+          </w:tcPr>
+          <w:p>
+            <w:pPr/>
+            <w:r>
+              <w:t xml:space="preserve">warehouse_id</w:t>
+            </w:r>
+          </w:p>
+        </w:tc>
+        <w:tc>
+          <w:tcPr>
+            <w:tcW w:w="2000" w:type="dxa"/>
+          </w:tcPr>
+          <w:p>
+            <w:pPr/>
+            <w:r>
+              <w:t xml:space="preserve">bigint</w:t>
+            </w:r>
+          </w:p>
+        </w:tc>
+        <w:tc>
+          <w:tcPr>
+            <w:tcW w:w="2000" w:type="dxa"/>
+          </w:tcPr>
+          <w:p>
+            <w:pPr/>
+            <w:r>
+              <w:t xml:space="preserve">-</w:t>
+            </w:r>
+          </w:p>
+        </w:tc>
+        <w:tc>
+          <w:tcPr>
+            <w:tcW w:w="2000" w:type="dxa"/>
+          </w:tcPr>
+          <w:p>
+            <w:pPr/>
+            <w:r>
+              <w:t xml:space="preserve">FK, NOT NULL</w:t>
+            </w:r>
+          </w:p>
+        </w:tc>
+      </w:tr>
+      <w:tr>
+        <w:trPr>
+          <w:trHeight w:val="530" w:hRule="atLeast"/>
+        </w:trPr>
+        <w:tc>
+          <w:tcPr>
+            <w:tcW w:w="2000" w:type="dxa"/>
+          </w:tcPr>
+          <w:p>
+            <w:pPr/>
+            <w:r>
+              <w:t xml:space="preserve">code</w:t>
+            </w:r>
+          </w:p>
+        </w:tc>
+        <w:tc>
+          <w:tcPr>
+            <w:tcW w:w="2000" w:type="dxa"/>
+          </w:tcPr>
+          <w:p>
+            <w:pPr/>
+            <w:r>
+              <w:t xml:space="preserve">varchar</w:t>
+            </w:r>
+          </w:p>
+        </w:tc>
+        <w:tc>
+          <w:tcPr>
+            <w:tcW w:w="2000" w:type="dxa"/>
+          </w:tcPr>
+          <w:p>
+            <w:pPr/>
+            <w:r>
+              <w:t xml:space="preserve">30</w:t>
+            </w:r>
+          </w:p>
+        </w:tc>
+        <w:tc>
+          <w:tcPr>
+            <w:tcW w:w="2000" w:type="dxa"/>
+          </w:tcPr>
+          <w:p>
+            <w:pPr/>
+            <w:r>
+              <w:t xml:space="preserve">NOT NULL</w:t>
+            </w:r>
+          </w:p>
+        </w:tc>
+      </w:tr>
+      <w:tr>
+        <w:trPr>
+          <w:trHeight w:val="530" w:hRule="atLeast"/>
+        </w:trPr>
+        <w:tc>
+          <w:tcPr>
+            <w:tcW w:w="2000" w:type="dxa"/>
+          </w:tcPr>
+          <w:p>
+            <w:pPr/>
+            <w:r>
+              <w:t xml:space="preserve">name</w:t>
+            </w:r>
+          </w:p>
+        </w:tc>
+        <w:tc>
+          <w:tcPr>
+            <w:tcW w:w="2000" w:type="dxa"/>
+          </w:tcPr>
+          <w:p>
+            <w:pPr/>
+            <w:r>
+              <w:t xml:space="preserve">nvarchar</w:t>
+            </w:r>
+          </w:p>
+        </w:tc>
+        <w:tc>
+          <w:tcPr>
+            <w:tcW w:w="2000" w:type="dxa"/>
+          </w:tcPr>
+          <w:p>
+            <w:pPr/>
+            <w:r>
+              <w:t xml:space="preserve">200</w:t>
+            </w:r>
+          </w:p>
+        </w:tc>
+        <w:tc>
+          <w:tcPr>
+            <w:tcW w:w="2000" w:type="dxa"/>
+          </w:tcPr>
+          <w:p>
+            <w:pPr/>
+            <w:r>
+              <w:t xml:space="preserve">NOT NULL</w:t>
+            </w:r>
+          </w:p>
+        </w:tc>
+      </w:tr>
+      <w:tr>
+        <w:trPr>
+          <w:trHeight w:val="530" w:hRule="atLeast"/>
+        </w:trPr>
+        <w:tc>
+          <w:tcPr>
+            <w:tcW w:w="2000" w:type="dxa"/>
+          </w:tcPr>
+          <w:p>
+            <w:pPr/>
+            <w:r>
+              <w:t xml:space="preserve">company_id</w:t>
+            </w:r>
+          </w:p>
+        </w:tc>
+        <w:tc>
+          <w:tcPr>
+            <w:tcW w:w="2000" w:type="dxa"/>
+          </w:tcPr>
+          <w:p>
+            <w:pPr/>
+            <w:r>
+              <w:t xml:space="preserve">bigint</w:t>
+            </w:r>
+          </w:p>
+        </w:tc>
+        <w:tc>
+          <w:tcPr>
+            <w:tcW w:w="2000" w:type="dxa"/>
+          </w:tcPr>
+          <w:p>
+            <w:pPr/>
+            <w:r>
+              <w:t xml:space="preserve">-</w:t>
+            </w:r>
+          </w:p>
+        </w:tc>
+        <w:tc>
+          <w:tcPr>
+            <w:tcW w:w="2000" w:type="dxa"/>
+          </w:tcPr>
+          <w:p>
+            <w:pPr/>
+            <w:r>
+              <w:t xml:space="preserve">FK, NOT NULL</w:t>
+            </w:r>
+          </w:p>
+        </w:tc>
+      </w:tr>
+      <w:tr>
+        <w:trPr>
+          <w:trHeight w:val="530" w:hRule="atLeast"/>
+        </w:trPr>
+        <w:tc>
+          <w:tcPr>
+            <w:tcW w:w="2000" w:type="dxa"/>
+          </w:tcPr>
+          <w:p>
+            <w:pPr/>
+            <w:r>
+              <w:t xml:space="preserve">created_at</w:t>
+            </w:r>
+          </w:p>
+        </w:tc>
+        <w:tc>
+          <w:tcPr>
+            <w:tcW w:w="2000" w:type="dxa"/>
+          </w:tcPr>
+          <w:p>
+            <w:pPr/>
+            <w:r>
+              <w:t xml:space="preserve">datetime2</w:t>
+            </w:r>
+          </w:p>
+        </w:tc>
+        <w:tc>
+          <w:tcPr>
+            <w:tcW w:w="2000" w:type="dxa"/>
+          </w:tcPr>
+          <w:p>
+            <w:pPr/>
+            <w:r>
+              <w:t xml:space="preserve">(6)</w:t>
+            </w:r>
+          </w:p>
+        </w:tc>
+        <w:tc>
+          <w:tcPr>
+            <w:tcW w:w="2000" w:type="dxa"/>
+          </w:tcPr>
+          <w:p>
+            <w:pPr/>
+            <w:r>
+              <w:t xml:space="preserve">NOT NULL</w:t>
+            </w:r>
+          </w:p>
+        </w:tc>
+      </w:tr>
+      <w:tr>
+        <w:trPr>
+          <w:trHeight w:val="530" w:hRule="atLeast"/>
+        </w:trPr>
+        <w:tc>
+          <w:tcPr>
+            <w:tcW w:w="2000" w:type="dxa"/>
+          </w:tcPr>
+          <w:p>
+            <w:pPr/>
+            <w:r>
+              <w:t xml:space="preserve">created_by</w:t>
+            </w:r>
+          </w:p>
+        </w:tc>
+        <w:tc>
+          <w:tcPr>
+            <w:tcW w:w="2000" w:type="dxa"/>
+          </w:tcPr>
+          <w:p>
+            <w:pPr/>
+            <w:r>
+              <w:t xml:space="preserve">bigint</w:t>
+            </w:r>
+          </w:p>
+        </w:tc>
+        <w:tc>
+          <w:tcPr>
+            <w:tcW w:w="2000" w:type="dxa"/>
+          </w:tcPr>
+          <w:p>
+            <w:pPr/>
+            <w:r>
+              <w:t xml:space="preserve">-</w:t>
+            </w:r>
+          </w:p>
+        </w:tc>
+        <w:tc>
+          <w:tcPr>
+            <w:tcW w:w="2000" w:type="dxa"/>
+          </w:tcPr>
+          <w:p>
+            <w:pPr/>
+            <w:r>
+              <w:t xml:space="preserve">NOT NULL</w:t>
+            </w:r>
+          </w:p>
+        </w:tc>
+      </w:tr>
+      <w:tr>
+        <w:trPr>
+          <w:trHeight w:val="530" w:hRule="atLeast"/>
+        </w:trPr>
+        <w:tc>
+          <w:tcPr>
+            <w:tcW w:w="2000" w:type="dxa"/>
+          </w:tcPr>
+          <w:p>
+            <w:pPr/>
+            <w:r>
+              <w:t xml:space="preserve">updated_at</w:t>
+            </w:r>
+          </w:p>
+        </w:tc>
+        <w:tc>
+          <w:tcPr>
+            <w:tcW w:w="2000" w:type="dxa"/>
+          </w:tcPr>
+          <w:p>
+            <w:pPr/>
+            <w:r>
+              <w:t xml:space="preserve">datetime2</w:t>
+            </w:r>
+          </w:p>
+        </w:tc>
+        <w:tc>
+          <w:tcPr>
+            <w:tcW w:w="2000" w:type="dxa"/>
+          </w:tcPr>
+          <w:p>
+            <w:pPr/>
+            <w:r>
+              <w:t xml:space="preserve">(6)</w:t>
+            </w:r>
+          </w:p>
+        </w:tc>
+        <w:tc>
+          <w:tcPr>
+            <w:tcW w:w="2000" w:type="dxa"/>
+          </w:tcPr>
+          <w:p>
+            <w:pPr/>
+            <w:r>
+              <w:t xml:space="preserve">IS NULL</w:t>
+            </w:r>
+          </w:p>
+        </w:tc>
+      </w:tr>
+      <w:tr>
+        <w:trPr>
+          <w:trHeight w:val="530" w:hRule="atLeast"/>
+        </w:trPr>
+        <w:tc>
+          <w:tcPr>
+            <w:tcW w:w="2000" w:type="dxa"/>
+          </w:tcPr>
+          <w:p>
+            <w:pPr/>
+            <w:r>
+              <w:t xml:space="preserve">updated_by</w:t>
+            </w:r>
+          </w:p>
+        </w:tc>
+        <w:tc>
+          <w:tcPr>
+            <w:tcW w:w="2000" w:type="dxa"/>
+          </w:tcPr>
+          <w:p>
+            <w:pPr/>
+            <w:r>
+              <w:t xml:space="preserve">bigint</w:t>
+            </w:r>
+          </w:p>
+        </w:tc>
+        <w:tc>
+          <w:tcPr>
+            <w:tcW w:w="2000" w:type="dxa"/>
+          </w:tcPr>
+          <w:p>
+            <w:pPr/>
+            <w:r>
+              <w:t xml:space="preserve">-</w:t>
+            </w:r>
+          </w:p>
+        </w:tc>
+        <w:tc>
+          <w:tcPr>
+            <w:tcW w:w="2000" w:type="dxa"/>
+          </w:tcPr>
+          <w:p>
+            <w:pPr/>
+            <w:r>
+              <w:t xml:space="preserve">IS NULL</w:t>
+            </w:r>
+          </w:p>
+        </w:tc>
+      </w:tr>
+      <w:tr>
+        <w:trPr>
+          <w:trHeight w:val="530" w:hRule="atLeast"/>
+        </w:trPr>
+        <w:tc>
+          <w:tcPr>
+            <w:tcW w:w="2000" w:type="dxa"/>
+          </w:tcPr>
+          <w:p>
+            <w:pPr/>
+            <w:r>
+              <w:t xml:space="preserve">version</w:t>
+            </w:r>
+          </w:p>
+        </w:tc>
+        <w:tc>
+          <w:tcPr>
+            <w:tcW w:w="2000" w:type="dxa"/>
+          </w:tcPr>
+          <w:p>
+            <w:pPr/>
+            <w:r>
+              <w:t xml:space="preserve">int</w:t>
+            </w:r>
+          </w:p>
+        </w:tc>
+        <w:tc>
+          <w:tcPr>
+            <w:tcW w:w="2000" w:type="dxa"/>
+          </w:tcPr>
+          <w:p>
+            <w:pPr/>
+            <w:r>
+              <w:t xml:space="preserve">-</w:t>
+            </w:r>
+          </w:p>
+        </w:tc>
+        <w:tc>
+          <w:tcPr>
+            <w:tcW w:w="2000" w:type="dxa"/>
+          </w:tcPr>
+          <w:p>
+            <w:pPr/>
+            <w:r>
+              <w:t xml:space="preserve">NOT NULL</w:t>
+            </w:r>
+          </w:p>
+        </w:tc>
+      </w:tr>
+      <w:tr>
+        <w:trPr>
+          <w:trHeight w:val="530" w:hRule="atLeast"/>
+        </w:trPr>
+        <w:tc>
+          <w:tcPr>
+            <w:tcW w:w="2000" w:type="dxa"/>
+          </w:tcPr>
+          <w:p>
+            <w:pPr/>
+            <w:r>
+              <w:t xml:space="preserve">is_active</w:t>
+            </w:r>
+          </w:p>
+        </w:tc>
+        <w:tc>
+          <w:tcPr>
+            <w:tcW w:w="2000" w:type="dxa"/>
+          </w:tcPr>
+          <w:p>
+            <w:pPr/>
+            <w:r>
+              <w:t xml:space="preserve">bit</w:t>
+            </w:r>
+          </w:p>
+        </w:tc>
+        <w:tc>
+          <w:tcPr>
+            <w:tcW w:w="2000" w:type="dxa"/>
+          </w:tcPr>
+          <w:p>
+            <w:pPr/>
+            <w:r>
+              <w:t xml:space="preserve">-</w:t>
+            </w:r>
+          </w:p>
+        </w:tc>
+        <w:tc>
+          <w:tcPr>
+            <w:tcW w:w="2000" w:type="dxa"/>
+          </w:tcPr>
+          <w:p>
+            <w:pPr/>
+            <w:r>
+              <w:t xml:space="preserve">NOT NULL</w:t>
+            </w:r>
+          </w:p>
+        </w:tc>
+      </w:tr>
+      <w:tr>
+        <w:trPr>
+          <w:trHeight w:val="530" w:hRule="atLeast"/>
+        </w:trPr>
+        <w:tc>
+          <w:tcPr>
+            <w:tcW w:w="2000" w:type="dxa"/>
+          </w:tcPr>
+          <w:p>
+            <w:pPr/>
+            <w:r>
+              <w:t xml:space="preserve">is_deleted</w:t>
+            </w:r>
+          </w:p>
+        </w:tc>
+        <w:tc>
+          <w:tcPr>
+            <w:tcW w:w="2000" w:type="dxa"/>
+          </w:tcPr>
+          <w:p>
+            <w:pPr/>
+            <w:r>
+              <w:t xml:space="preserve">bit</w:t>
+            </w:r>
+          </w:p>
+        </w:tc>
+        <w:tc>
+          <w:tcPr>
+            <w:tcW w:w="2000" w:type="dxa"/>
+          </w:tcPr>
+          <w:p>
+            <w:pPr/>
+            <w:r>
+              <w:t xml:space="preserve">-</w:t>
+            </w:r>
+          </w:p>
+        </w:tc>
+        <w:tc>
+          <w:tcPr>
+            <w:tcW w:w="2000" w:type="dxa"/>
+          </w:tcPr>
+          <w:p>
+            <w:pPr/>
+            <w:r>
+              <w:t xml:space="preserve">NOT NULL</w:t>
+            </w:r>
+          </w:p>
+        </w:tc>
+      </w:tr>
+    </w:tbl>
+    <w:p/>
+    <w:p>
+      <w:pPr/>
+      <w:r>
         <w:t xml:space="preserve">Table Name: md_supplier</w:t>
       </w:r>
     </w:p>
@@ -7889,6 +8593,857 @@
             <w:pPr/>
             <w:r>
               <w:t xml:space="preserve">NOT NULL</w:t>
+            </w:r>
+          </w:p>
+        </w:tc>
+      </w:tr>
+    </w:tbl>
+    <w:p/>
+    <w:p>
+      <w:pPr/>
+      <w:r>
+        <w:t xml:space="preserve">Table Name: md_warehouse</w:t>
+      </w:r>
+    </w:p>
+    <w:p>
+      <w:pPr/>
+      <w:r>
+        <w:t xml:space="preserve">Primary Key: id</w:t>
+      </w:r>
+    </w:p>
+    <w:p>
+      <w:pPr/>
+      <w:r>
+        <w:t xml:space="preserve">This table stores warehouses within a company.</w:t>
+      </w:r>
+    </w:p>
+    <w:tbl>
+      <w:tblPr>
+        <w:tblStyle w:val="TableGrid"/>
+        <w:tblW w:w="8000" w:type="dxa"/>
+        <w:jc w:val="left"/>
+        <w:tblBorders>
+          <w:top w:val="single" w:color="000000" w:sz="4" w:space="0"/>
+          <w:left w:val="single" w:color="000000" w:sz="4" w:space="0"/>
+          <w:bottom w:val="single" w:color="000000" w:sz="4" w:space="0"/>
+          <w:right w:val="single" w:color="000000" w:sz="4" w:space="0"/>
+          <w:insideH w:val="single" w:color="000000" w:sz="4" w:space="0"/>
+          <w:insideV w:val="single" w:color="000000" w:sz="4" w:space="0"/>
+        </w:tblBorders>
+        <w:tblLayout w:type="fixed"/>
+        <w:tblCellMar>
+          <w:top w:w="100" w:type="dxa"/>
+          <w:left w:w="100" w:type="dxa"/>
+          <w:bottom w:w="100" w:type="dxa"/>
+          <w:right w:w="100" w:type="dxa"/>
+        </w:tblCellMar>
+      </w:tblPr>
+      <w:tblGrid>
+        <w:gridCol w:w="2000"/>
+        <w:gridCol w:w="2000"/>
+        <w:gridCol w:w="2000"/>
+        <w:gridCol w:w="2000"/>
+      </w:tblGrid>
+      <w:tr>
+        <w:trPr>
+          <w:trHeight w:val="530" w:hRule="atLeast"/>
+        </w:trPr>
+        <w:tc>
+          <w:tcPr>
+            <w:tcW w:w="2000" w:type="dxa"/>
+          </w:tcPr>
+          <w:p>
+            <w:pPr>
+              <w:jc w:val="center"/>
+            </w:pPr>
+            <w:r>
+              <w:rPr>
+                <w:b/>
+              </w:rPr>
+              <w:t xml:space="preserve">Name of Attribute</w:t>
+            </w:r>
+          </w:p>
+        </w:tc>
+        <w:tc>
+          <w:tcPr>
+            <w:tcW w:w="2000" w:type="dxa"/>
+          </w:tcPr>
+          <w:p>
+            <w:pPr>
+              <w:jc w:val="center"/>
+            </w:pPr>
+            <w:r>
+              <w:rPr>
+                <w:b/>
+              </w:rPr>
+              <w:t xml:space="preserve">Data Type</w:t>
+            </w:r>
+          </w:p>
+        </w:tc>
+        <w:tc>
+          <w:tcPr>
+            <w:tcW w:w="2000" w:type="dxa"/>
+          </w:tcPr>
+          <w:p>
+            <w:pPr>
+              <w:jc w:val="center"/>
+            </w:pPr>
+            <w:r>
+              <w:rPr>
+                <w:b/>
+              </w:rPr>
+              <w:t xml:space="preserve">Size</w:t>
+            </w:r>
+          </w:p>
+        </w:tc>
+        <w:tc>
+          <w:tcPr>
+            <w:tcW w:w="2000" w:type="dxa"/>
+          </w:tcPr>
+          <w:p>
+            <w:pPr>
+              <w:jc w:val="center"/>
+            </w:pPr>
+            <w:r>
+              <w:rPr>
+                <w:b/>
+              </w:rPr>
+              <w:t xml:space="preserve">PK/FK/IS NULL/ NOT NULL</w:t>
+            </w:r>
+          </w:p>
+        </w:tc>
+      </w:tr>
+      <w:tr>
+        <w:trPr>
+          <w:trHeight w:val="530" w:hRule="atLeast"/>
+        </w:trPr>
+        <w:tc>
+          <w:tcPr>
+            <w:tcW w:w="2000" w:type="dxa"/>
+          </w:tcPr>
+          <w:p>
+            <w:pPr/>
+            <w:r>
+              <w:t xml:space="preserve">id</w:t>
+            </w:r>
+          </w:p>
+        </w:tc>
+        <w:tc>
+          <w:tcPr>
+            <w:tcW w:w="2000" w:type="dxa"/>
+          </w:tcPr>
+          <w:p>
+            <w:pPr/>
+            <w:r>
+              <w:t xml:space="preserve">bigint</w:t>
+            </w:r>
+          </w:p>
+        </w:tc>
+        <w:tc>
+          <w:tcPr>
+            <w:tcW w:w="2000" w:type="dxa"/>
+          </w:tcPr>
+          <w:p>
+            <w:pPr/>
+            <w:r>
+              <w:t xml:space="preserve">-</w:t>
+            </w:r>
+          </w:p>
+        </w:tc>
+        <w:tc>
+          <w:tcPr>
+            <w:tcW w:w="2000" w:type="dxa"/>
+          </w:tcPr>
+          <w:p>
+            <w:pPr/>
+            <w:r>
+              <w:t xml:space="preserve">PK, NOT NULL</w:t>
+            </w:r>
+          </w:p>
+        </w:tc>
+      </w:tr>
+      <w:tr>
+        <w:trPr>
+          <w:trHeight w:val="530" w:hRule="atLeast"/>
+        </w:trPr>
+        <w:tc>
+          <w:tcPr>
+            <w:tcW w:w="2000" w:type="dxa"/>
+          </w:tcPr>
+          <w:p>
+            <w:pPr/>
+            <w:r>
+              <w:t xml:space="preserve">address</w:t>
+            </w:r>
+          </w:p>
+        </w:tc>
+        <w:tc>
+          <w:tcPr>
+            <w:tcW w:w="2000" w:type="dxa"/>
+          </w:tcPr>
+          <w:p>
+            <w:pPr/>
+            <w:r>
+              <w:t xml:space="preserve">nvarchar</w:t>
+            </w:r>
+          </w:p>
+        </w:tc>
+        <w:tc>
+          <w:tcPr>
+            <w:tcW w:w="2000" w:type="dxa"/>
+          </w:tcPr>
+          <w:p>
+            <w:pPr/>
+            <w:r>
+              <w:t xml:space="preserve">300</w:t>
+            </w:r>
+          </w:p>
+        </w:tc>
+        <w:tc>
+          <w:tcPr>
+            <w:tcW w:w="2000" w:type="dxa"/>
+          </w:tcPr>
+          <w:p>
+            <w:pPr/>
+            <w:r>
+              <w:t xml:space="preserve">IS NULL</w:t>
+            </w:r>
+          </w:p>
+        </w:tc>
+      </w:tr>
+      <w:tr>
+        <w:trPr>
+          <w:trHeight w:val="530" w:hRule="atLeast"/>
+        </w:trPr>
+        <w:tc>
+          <w:tcPr>
+            <w:tcW w:w="2000" w:type="dxa"/>
+          </w:tcPr>
+          <w:p>
+            <w:pPr/>
+            <w:r>
+              <w:t xml:space="preserve">contact_name</w:t>
+            </w:r>
+          </w:p>
+        </w:tc>
+        <w:tc>
+          <w:tcPr>
+            <w:tcW w:w="2000" w:type="dxa"/>
+          </w:tcPr>
+          <w:p>
+            <w:pPr/>
+            <w:r>
+              <w:t xml:space="preserve">nvarchar</w:t>
+            </w:r>
+          </w:p>
+        </w:tc>
+        <w:tc>
+          <w:tcPr>
+            <w:tcW w:w="2000" w:type="dxa"/>
+          </w:tcPr>
+          <w:p>
+            <w:pPr/>
+            <w:r>
+              <w:t xml:space="preserve">100</w:t>
+            </w:r>
+          </w:p>
+        </w:tc>
+        <w:tc>
+          <w:tcPr>
+            <w:tcW w:w="2000" w:type="dxa"/>
+          </w:tcPr>
+          <w:p>
+            <w:pPr/>
+            <w:r>
+              <w:t xml:space="preserve">IS NULL</w:t>
+            </w:r>
+          </w:p>
+        </w:tc>
+      </w:tr>
+      <w:tr>
+        <w:trPr>
+          <w:trHeight w:val="530" w:hRule="atLeast"/>
+        </w:trPr>
+        <w:tc>
+          <w:tcPr>
+            <w:tcW w:w="2000" w:type="dxa"/>
+          </w:tcPr>
+          <w:p>
+            <w:pPr/>
+            <w:r>
+              <w:t xml:space="preserve">phone</w:t>
+            </w:r>
+          </w:p>
+        </w:tc>
+        <w:tc>
+          <w:tcPr>
+            <w:tcW w:w="2000" w:type="dxa"/>
+          </w:tcPr>
+          <w:p>
+            <w:pPr/>
+            <w:r>
+              <w:t xml:space="preserve">nvarchar</w:t>
+            </w:r>
+          </w:p>
+        </w:tc>
+        <w:tc>
+          <w:tcPr>
+            <w:tcW w:w="2000" w:type="dxa"/>
+          </w:tcPr>
+          <w:p>
+            <w:pPr/>
+            <w:r>
+              <w:t xml:space="preserve">50</w:t>
+            </w:r>
+          </w:p>
+        </w:tc>
+        <w:tc>
+          <w:tcPr>
+            <w:tcW w:w="2000" w:type="dxa"/>
+          </w:tcPr>
+          <w:p>
+            <w:pPr/>
+            <w:r>
+              <w:t xml:space="preserve">IS NULL</w:t>
+            </w:r>
+          </w:p>
+        </w:tc>
+      </w:tr>
+      <w:tr>
+        <w:trPr>
+          <w:trHeight w:val="530" w:hRule="atLeast"/>
+        </w:trPr>
+        <w:tc>
+          <w:tcPr>
+            <w:tcW w:w="2000" w:type="dxa"/>
+          </w:tcPr>
+          <w:p>
+            <w:pPr/>
+            <w:r>
+              <w:t xml:space="preserve">company_id</w:t>
+            </w:r>
+          </w:p>
+        </w:tc>
+        <w:tc>
+          <w:tcPr>
+            <w:tcW w:w="2000" w:type="dxa"/>
+          </w:tcPr>
+          <w:p>
+            <w:pPr/>
+            <w:r>
+              <w:t xml:space="preserve">bigint</w:t>
+            </w:r>
+          </w:p>
+        </w:tc>
+        <w:tc>
+          <w:tcPr>
+            <w:tcW w:w="2000" w:type="dxa"/>
+          </w:tcPr>
+          <w:p>
+            <w:pPr/>
+            <w:r>
+              <w:t xml:space="preserve">-</w:t>
+            </w:r>
+          </w:p>
+        </w:tc>
+        <w:tc>
+          <w:tcPr>
+            <w:tcW w:w="2000" w:type="dxa"/>
+          </w:tcPr>
+          <w:p>
+            <w:pPr/>
+            <w:r>
+              <w:t xml:space="preserve">NOT NULL</w:t>
+            </w:r>
+          </w:p>
+        </w:tc>
+      </w:tr>
+      <w:tr>
+        <w:trPr>
+          <w:trHeight w:val="530" w:hRule="atLeast"/>
+        </w:trPr>
+        <w:tc>
+          <w:tcPr>
+            <w:tcW w:w="2000" w:type="dxa"/>
+          </w:tcPr>
+          <w:p>
+            <w:pPr/>
+            <w:r>
+              <w:t xml:space="preserve">created_at</w:t>
+            </w:r>
+          </w:p>
+        </w:tc>
+        <w:tc>
+          <w:tcPr>
+            <w:tcW w:w="2000" w:type="dxa"/>
+          </w:tcPr>
+          <w:p>
+            <w:pPr/>
+            <w:r>
+              <w:t xml:space="preserve">datetime2</w:t>
+            </w:r>
+          </w:p>
+        </w:tc>
+        <w:tc>
+          <w:tcPr>
+            <w:tcW w:w="2000" w:type="dxa"/>
+          </w:tcPr>
+          <w:p>
+            <w:pPr/>
+            <w:r>
+              <w:t xml:space="preserve">(6)</w:t>
+            </w:r>
+          </w:p>
+        </w:tc>
+        <w:tc>
+          <w:tcPr>
+            <w:tcW w:w="2000" w:type="dxa"/>
+          </w:tcPr>
+          <w:p>
+            <w:pPr/>
+            <w:r>
+              <w:t xml:space="preserve">NOT NULL</w:t>
+            </w:r>
+          </w:p>
+        </w:tc>
+      </w:tr>
+      <w:tr>
+        <w:trPr>
+          <w:trHeight w:val="530" w:hRule="atLeast"/>
+        </w:trPr>
+        <w:tc>
+          <w:tcPr>
+            <w:tcW w:w="2000" w:type="dxa"/>
+          </w:tcPr>
+          <w:p>
+            <w:pPr/>
+            <w:r>
+              <w:t xml:space="preserve">created_by</w:t>
+            </w:r>
+          </w:p>
+        </w:tc>
+        <w:tc>
+          <w:tcPr>
+            <w:tcW w:w="2000" w:type="dxa"/>
+          </w:tcPr>
+          <w:p>
+            <w:pPr/>
+            <w:r>
+              <w:t xml:space="preserve">bigint</w:t>
+            </w:r>
+          </w:p>
+        </w:tc>
+        <w:tc>
+          <w:tcPr>
+            <w:tcW w:w="2000" w:type="dxa"/>
+          </w:tcPr>
+          <w:p>
+            <w:pPr/>
+            <w:r>
+              <w:t xml:space="preserve">-</w:t>
+            </w:r>
+          </w:p>
+        </w:tc>
+        <w:tc>
+          <w:tcPr>
+            <w:tcW w:w="2000" w:type="dxa"/>
+          </w:tcPr>
+          <w:p>
+            <w:pPr/>
+            <w:r>
+              <w:t xml:space="preserve">NOT NULL</w:t>
+            </w:r>
+          </w:p>
+        </w:tc>
+      </w:tr>
+      <w:tr>
+        <w:trPr>
+          <w:trHeight w:val="530" w:hRule="atLeast"/>
+        </w:trPr>
+        <w:tc>
+          <w:tcPr>
+            <w:tcW w:w="2000" w:type="dxa"/>
+          </w:tcPr>
+          <w:p>
+            <w:pPr/>
+            <w:r>
+              <w:t xml:space="preserve">updated_at</w:t>
+            </w:r>
+          </w:p>
+        </w:tc>
+        <w:tc>
+          <w:tcPr>
+            <w:tcW w:w="2000" w:type="dxa"/>
+          </w:tcPr>
+          <w:p>
+            <w:pPr/>
+            <w:r>
+              <w:t xml:space="preserve">datetime2</w:t>
+            </w:r>
+          </w:p>
+        </w:tc>
+        <w:tc>
+          <w:tcPr>
+            <w:tcW w:w="2000" w:type="dxa"/>
+          </w:tcPr>
+          <w:p>
+            <w:pPr/>
+            <w:r>
+              <w:t xml:space="preserve">(6)</w:t>
+            </w:r>
+          </w:p>
+        </w:tc>
+        <w:tc>
+          <w:tcPr>
+            <w:tcW w:w="2000" w:type="dxa"/>
+          </w:tcPr>
+          <w:p>
+            <w:pPr/>
+            <w:r>
+              <w:t xml:space="preserve">IS NULL</w:t>
+            </w:r>
+          </w:p>
+        </w:tc>
+      </w:tr>
+      <w:tr>
+        <w:trPr>
+          <w:trHeight w:val="530" w:hRule="atLeast"/>
+        </w:trPr>
+        <w:tc>
+          <w:tcPr>
+            <w:tcW w:w="2000" w:type="dxa"/>
+          </w:tcPr>
+          <w:p>
+            <w:pPr/>
+            <w:r>
+              <w:t xml:space="preserve">updated_by</w:t>
+            </w:r>
+          </w:p>
+        </w:tc>
+        <w:tc>
+          <w:tcPr>
+            <w:tcW w:w="2000" w:type="dxa"/>
+          </w:tcPr>
+          <w:p>
+            <w:pPr/>
+            <w:r>
+              <w:t xml:space="preserve">bigint</w:t>
+            </w:r>
+          </w:p>
+        </w:tc>
+        <w:tc>
+          <w:tcPr>
+            <w:tcW w:w="2000" w:type="dxa"/>
+          </w:tcPr>
+          <w:p>
+            <w:pPr/>
+            <w:r>
+              <w:t xml:space="preserve">-</w:t>
+            </w:r>
+          </w:p>
+        </w:tc>
+        <w:tc>
+          <w:tcPr>
+            <w:tcW w:w="2000" w:type="dxa"/>
+          </w:tcPr>
+          <w:p>
+            <w:pPr/>
+            <w:r>
+              <w:t xml:space="preserve">IS NULL</w:t>
+            </w:r>
+          </w:p>
+        </w:tc>
+      </w:tr>
+      <w:tr>
+        <w:trPr>
+          <w:trHeight w:val="530" w:hRule="atLeast"/>
+        </w:trPr>
+        <w:tc>
+          <w:tcPr>
+            <w:tcW w:w="2000" w:type="dxa"/>
+          </w:tcPr>
+          <w:p>
+            <w:pPr/>
+            <w:r>
+              <w:t xml:space="preserve">version</w:t>
+            </w:r>
+          </w:p>
+        </w:tc>
+        <w:tc>
+          <w:tcPr>
+            <w:tcW w:w="2000" w:type="dxa"/>
+          </w:tcPr>
+          <w:p>
+            <w:pPr/>
+            <w:r>
+              <w:t xml:space="preserve">int</w:t>
+            </w:r>
+          </w:p>
+        </w:tc>
+        <w:tc>
+          <w:tcPr>
+            <w:tcW w:w="2000" w:type="dxa"/>
+          </w:tcPr>
+          <w:p>
+            <w:pPr/>
+            <w:r>
+              <w:t xml:space="preserve">-</w:t>
+            </w:r>
+          </w:p>
+        </w:tc>
+        <w:tc>
+          <w:tcPr>
+            <w:tcW w:w="2000" w:type="dxa"/>
+          </w:tcPr>
+          <w:p>
+            <w:pPr/>
+            <w:r>
+              <w:t xml:space="preserve">NOT NULL</w:t>
+            </w:r>
+          </w:p>
+        </w:tc>
+      </w:tr>
+      <w:tr>
+        <w:trPr>
+          <w:trHeight w:val="530" w:hRule="atLeast"/>
+        </w:trPr>
+        <w:tc>
+          <w:tcPr>
+            <w:tcW w:w="2000" w:type="dxa"/>
+          </w:tcPr>
+          <w:p>
+            <w:pPr/>
+            <w:r>
+              <w:t xml:space="preserve">is_active</w:t>
+            </w:r>
+          </w:p>
+        </w:tc>
+        <w:tc>
+          <w:tcPr>
+            <w:tcW w:w="2000" w:type="dxa"/>
+          </w:tcPr>
+          <w:p>
+            <w:pPr/>
+            <w:r>
+              <w:t xml:space="preserve">bit</w:t>
+            </w:r>
+          </w:p>
+        </w:tc>
+        <w:tc>
+          <w:tcPr>
+            <w:tcW w:w="2000" w:type="dxa"/>
+          </w:tcPr>
+          <w:p>
+            <w:pPr/>
+            <w:r>
+              <w:t xml:space="preserve">-</w:t>
+            </w:r>
+          </w:p>
+        </w:tc>
+        <w:tc>
+          <w:tcPr>
+            <w:tcW w:w="2000" w:type="dxa"/>
+          </w:tcPr>
+          <w:p>
+            <w:pPr/>
+            <w:r>
+              <w:t xml:space="preserve">NOT NULL</w:t>
+            </w:r>
+          </w:p>
+        </w:tc>
+      </w:tr>
+      <w:tr>
+        <w:trPr>
+          <w:trHeight w:val="530" w:hRule="atLeast"/>
+        </w:trPr>
+        <w:tc>
+          <w:tcPr>
+            <w:tcW w:w="2000" w:type="dxa"/>
+          </w:tcPr>
+          <w:p>
+            <w:pPr/>
+            <w:r>
+              <w:t xml:space="preserve">is_deleted</w:t>
+            </w:r>
+          </w:p>
+        </w:tc>
+        <w:tc>
+          <w:tcPr>
+            <w:tcW w:w="2000" w:type="dxa"/>
+          </w:tcPr>
+          <w:p>
+            <w:pPr/>
+            <w:r>
+              <w:t xml:space="preserve">bit</w:t>
+            </w:r>
+          </w:p>
+        </w:tc>
+        <w:tc>
+          <w:tcPr>
+            <w:tcW w:w="2000" w:type="dxa"/>
+          </w:tcPr>
+          <w:p>
+            <w:pPr/>
+            <w:r>
+              <w:t xml:space="preserve">-</w:t>
+            </w:r>
+          </w:p>
+        </w:tc>
+        <w:tc>
+          <w:tcPr>
+            <w:tcW w:w="2000" w:type="dxa"/>
+          </w:tcPr>
+          <w:p>
+            <w:pPr/>
+            <w:r>
+              <w:t xml:space="preserve">NOT NULL</w:t>
+            </w:r>
+          </w:p>
+        </w:tc>
+      </w:tr>
+      <w:tr>
+        <w:trPr>
+          <w:trHeight w:val="530" w:hRule="atLeast"/>
+        </w:trPr>
+        <w:tc>
+          <w:tcPr>
+            <w:tcW w:w="2000" w:type="dxa"/>
+          </w:tcPr>
+          <w:p>
+            <w:pPr/>
+            <w:r>
+              <w:t xml:space="preserve">code</w:t>
+            </w:r>
+          </w:p>
+        </w:tc>
+        <w:tc>
+          <w:tcPr>
+            <w:tcW w:w="2000" w:type="dxa"/>
+          </w:tcPr>
+          <w:p>
+            <w:pPr/>
+            <w:r>
+              <w:t xml:space="preserve">varchar</w:t>
+            </w:r>
+          </w:p>
+        </w:tc>
+        <w:tc>
+          <w:tcPr>
+            <w:tcW w:w="2000" w:type="dxa"/>
+          </w:tcPr>
+          <w:p>
+            <w:pPr/>
+            <w:r>
+              <w:t xml:space="preserve">30</w:t>
+            </w:r>
+          </w:p>
+        </w:tc>
+        <w:tc>
+          <w:tcPr>
+            <w:tcW w:w="2000" w:type="dxa"/>
+          </w:tcPr>
+          <w:p>
+            <w:pPr/>
+            <w:r>
+              <w:t xml:space="preserve">NOT NULL</w:t>
+            </w:r>
+          </w:p>
+        </w:tc>
+      </w:tr>
+      <w:tr>
+        <w:trPr>
+          <w:trHeight w:val="530" w:hRule="atLeast"/>
+        </w:trPr>
+        <w:tc>
+          <w:tcPr>
+            <w:tcW w:w="2000" w:type="dxa"/>
+          </w:tcPr>
+          <w:p>
+            <w:pPr/>
+            <w:r>
+              <w:t xml:space="preserve">name</w:t>
+            </w:r>
+          </w:p>
+        </w:tc>
+        <w:tc>
+          <w:tcPr>
+            <w:tcW w:w="2000" w:type="dxa"/>
+          </w:tcPr>
+          <w:p>
+            <w:pPr/>
+            <w:r>
+              <w:t xml:space="preserve">nvarchar</w:t>
+            </w:r>
+          </w:p>
+        </w:tc>
+        <w:tc>
+          <w:tcPr>
+            <w:tcW w:w="2000" w:type="dxa"/>
+          </w:tcPr>
+          <w:p>
+            <w:pPr/>
+            <w:r>
+              <w:t xml:space="preserve">200</w:t>
+            </w:r>
+          </w:p>
+        </w:tc>
+        <w:tc>
+          <w:tcPr>
+            <w:tcW w:w="2000" w:type="dxa"/>
+          </w:tcPr>
+          <w:p>
+            <w:pPr/>
+            <w:r>
+              <w:t xml:space="preserve">NOT NULL</w:t>
+            </w:r>
+          </w:p>
+        </w:tc>
+      </w:tr>
+      <w:tr>
+        <w:trPr>
+          <w:trHeight w:val="530" w:hRule="atLeast"/>
+        </w:trPr>
+        <w:tc>
+          <w:tcPr>
+            <w:tcW w:w="2000" w:type="dxa"/>
+          </w:tcPr>
+          <w:p>
+            <w:pPr/>
+            <w:r>
+              <w:t xml:space="preserve">custom_fields</w:t>
+            </w:r>
+          </w:p>
+        </w:tc>
+        <w:tc>
+          <w:tcPr>
+            <w:tcW w:w="2000" w:type="dxa"/>
+          </w:tcPr>
+          <w:p>
+            <w:pPr/>
+            <w:r>
+              <w:t xml:space="preserve">nvarchar</w:t>
+            </w:r>
+          </w:p>
+        </w:tc>
+        <w:tc>
+          <w:tcPr>
+            <w:tcW w:w="2000" w:type="dxa"/>
+          </w:tcPr>
+          <w:p>
+            <w:pPr/>
+            <w:r>
+              <w:t xml:space="preserve">MAX</w:t>
+            </w:r>
+          </w:p>
+        </w:tc>
+        <w:tc>
+          <w:tcPr>
+            <w:tcW w:w="2000" w:type="dxa"/>
+          </w:tcPr>
+          <w:p>
+            <w:pPr/>
+            <w:r>
+              <w:t xml:space="preserve">IS NULL</w:t>
             </w:r>
           </w:p>
         </w:tc>
@@ -22968,6 +24523,63 @@
           <w:i/>
         </w:rPr>
         <w:t xml:space="preserve">[Pending] System screenshot of Item Edit Interface.</w:t>
+      </w:r>
+    </w:p>
+    <w:p>
+      <w:pPr>
+        <w:pStyle w:val="Heading5"/>
+      </w:pPr>
+      <w:r>
+        <w:t xml:space="preserve">4.2.1.8.17 Warehouse View Interface</w:t>
+      </w:r>
+    </w:p>
+    <w:p>
+      <w:pPr>
+        <w:jc w:val="center"/>
+      </w:pPr>
+      <w:r>
+        <w:rPr>
+          <w:i/>
+        </w:rPr>
+        <w:t xml:space="preserve">[Pending] System screenshot of Warehouse View Interface.</w:t>
+      </w:r>
+    </w:p>
+    <w:p>
+      <w:pPr>
+        <w:pStyle w:val="Heading5"/>
+      </w:pPr>
+      <w:r>
+        <w:t xml:space="preserve">4.2.1.8.18 Warehouse Create Interface</w:t>
+      </w:r>
+    </w:p>
+    <w:p>
+      <w:pPr>
+        <w:jc w:val="center"/>
+      </w:pPr>
+      <w:r>
+        <w:rPr>
+          <w:i/>
+        </w:rPr>
+        <w:t xml:space="preserve">[Pending] System screenshot of Warehouse Create Interface.</w:t>
+      </w:r>
+    </w:p>
+    <w:p>
+      <w:pPr>
+        <w:pStyle w:val="Heading5"/>
+      </w:pPr>
+      <w:r>
+        <w:t xml:space="preserve">4.2.1.8.19 Warehouse Edit Interface</w:t>
+      </w:r>
+    </w:p>
+    <w:p>
+      <w:pPr>
+        <w:jc w:val="center"/>
+      </w:pPr>
+      <w:r>
+        <w:rPr>
+          <w:i/>
+        </w:rPr>
+        <w:t xml:space="preserve">[Pending] System screenshot of Warehouse Edit Interface.</w:t>
       </w:r>
     </w:p>
     <w:p>
@@ -23692,8 +25304,27 @@
         <w:t xml:space="preserve">[Pending] System screenshot of Item Unit Conversion Interface.</w:t>
       </w:r>
     </w:p>
+    <w:p>
+      <w:pPr>
+        <w:pStyle w:val="Heading5"/>
+      </w:pPr>
+      <w:r>
+        <w:t xml:space="preserve">4.2.1.8.78 Storage Location Interface</w:t>
+      </w:r>
+    </w:p>
+    <w:p>
+      <w:pPr>
+        <w:jc w:val="center"/>
+      </w:pPr>
+      <w:r>
+        <w:rPr>
+          <w:i/>
+        </w:rPr>
+        <w:t xml:space="preserve">[Pending] System screenshot of Storage Location Interface.</w:t>
+      </w:r>
+    </w:p>
     <w:sectPr>
-      <w:footerReference xmlns:r="http://schemas.openxmlformats.org/officeDocument/2006/relationships" w:type="default" r:id="R3be03ed0a9924736"/>
+      <w:footerReference xmlns:r="http://schemas.openxmlformats.org/officeDocument/2006/relationships" w:type="default" r:id="R6eb916cbd015430f"/>
       <w:pgSz w:w="11906" w:h="16838"/>
       <w:pgMar w:top="1440" w:right="1440" w:bottom="1440" w:left="1440" w:header="720" w:footer="720" w:gutter="0"/>
     </w:sectPr>

</xml_diff>

<commit_message>
feat(md): add multilingual currency and exchange rate pages
- /md/currencies page (interfaces 8.79-8.81) with base currency tag,
  ISO code and decimal validation, locked base checkbox and versioned
  edit/delete showing BASE_LOCKED / IN_USE
- exchange rate dialog (interface 8.82) with effective-on filter,
  period and 6+8 digit rate validation, OVERLAP message and
  inactive-currency guard; read-only users see rates only
- menu entry, trilingual md/errors/layout texts, Vitest and Playwright
- ui-spec, test plan, optimization log, docgen outputs and status

Co-Authored-By: Claude Opus 5.5 <noreply@anthropic.com>
</commit_message>
<xml_diff>
--- a/docs/99-output/MyERP_SDS.docx
+++ b/docs/99-output/MyERP_SDS.docx
@@ -613,6 +613,857 @@
     <w:p>
       <w:pPr/>
       <w:r>
+        <w:t xml:space="preserve">Table Name: md_currency</w:t>
+      </w:r>
+    </w:p>
+    <w:p>
+      <w:pPr/>
+      <w:r>
+        <w:t xml:space="preserve">Primary Key: id</w:t>
+      </w:r>
+    </w:p>
+    <w:p>
+      <w:pPr/>
+      <w:r>
+        <w:t xml:space="preserve">This table stores currencies and the base currency of a company.</w:t>
+      </w:r>
+    </w:p>
+    <w:tbl>
+      <w:tblPr>
+        <w:tblStyle w:val="TableGrid"/>
+        <w:tblW w:w="8000" w:type="dxa"/>
+        <w:jc w:val="left"/>
+        <w:tblBorders>
+          <w:top w:val="single" w:color="000000" w:sz="4" w:space="0"/>
+          <w:left w:val="single" w:color="000000" w:sz="4" w:space="0"/>
+          <w:bottom w:val="single" w:color="000000" w:sz="4" w:space="0"/>
+          <w:right w:val="single" w:color="000000" w:sz="4" w:space="0"/>
+          <w:insideH w:val="single" w:color="000000" w:sz="4" w:space="0"/>
+          <w:insideV w:val="single" w:color="000000" w:sz="4" w:space="0"/>
+        </w:tblBorders>
+        <w:tblLayout w:type="fixed"/>
+        <w:tblCellMar>
+          <w:top w:w="100" w:type="dxa"/>
+          <w:left w:w="100" w:type="dxa"/>
+          <w:bottom w:w="100" w:type="dxa"/>
+          <w:right w:w="100" w:type="dxa"/>
+        </w:tblCellMar>
+      </w:tblPr>
+      <w:tblGrid>
+        <w:gridCol w:w="2000"/>
+        <w:gridCol w:w="2000"/>
+        <w:gridCol w:w="2000"/>
+        <w:gridCol w:w="2000"/>
+      </w:tblGrid>
+      <w:tr>
+        <w:trPr>
+          <w:trHeight w:val="530" w:hRule="atLeast"/>
+        </w:trPr>
+        <w:tc>
+          <w:tcPr>
+            <w:tcW w:w="2000" w:type="dxa"/>
+          </w:tcPr>
+          <w:p>
+            <w:pPr>
+              <w:jc w:val="center"/>
+            </w:pPr>
+            <w:r>
+              <w:rPr>
+                <w:b/>
+              </w:rPr>
+              <w:t xml:space="preserve">Name of Attribute</w:t>
+            </w:r>
+          </w:p>
+        </w:tc>
+        <w:tc>
+          <w:tcPr>
+            <w:tcW w:w="2000" w:type="dxa"/>
+          </w:tcPr>
+          <w:p>
+            <w:pPr>
+              <w:jc w:val="center"/>
+            </w:pPr>
+            <w:r>
+              <w:rPr>
+                <w:b/>
+              </w:rPr>
+              <w:t xml:space="preserve">Data Type</w:t>
+            </w:r>
+          </w:p>
+        </w:tc>
+        <w:tc>
+          <w:tcPr>
+            <w:tcW w:w="2000" w:type="dxa"/>
+          </w:tcPr>
+          <w:p>
+            <w:pPr>
+              <w:jc w:val="center"/>
+            </w:pPr>
+            <w:r>
+              <w:rPr>
+                <w:b/>
+              </w:rPr>
+              <w:t xml:space="preserve">Size</w:t>
+            </w:r>
+          </w:p>
+        </w:tc>
+        <w:tc>
+          <w:tcPr>
+            <w:tcW w:w="2000" w:type="dxa"/>
+          </w:tcPr>
+          <w:p>
+            <w:pPr>
+              <w:jc w:val="center"/>
+            </w:pPr>
+            <w:r>
+              <w:rPr>
+                <w:b/>
+              </w:rPr>
+              <w:t xml:space="preserve">PK/FK/IS NULL/ NOT NULL</w:t>
+            </w:r>
+          </w:p>
+        </w:tc>
+      </w:tr>
+      <w:tr>
+        <w:trPr>
+          <w:trHeight w:val="530" w:hRule="atLeast"/>
+        </w:trPr>
+        <w:tc>
+          <w:tcPr>
+            <w:tcW w:w="2000" w:type="dxa"/>
+          </w:tcPr>
+          <w:p>
+            <w:pPr/>
+            <w:r>
+              <w:t xml:space="preserve">id</w:t>
+            </w:r>
+          </w:p>
+        </w:tc>
+        <w:tc>
+          <w:tcPr>
+            <w:tcW w:w="2000" w:type="dxa"/>
+          </w:tcPr>
+          <w:p>
+            <w:pPr/>
+            <w:r>
+              <w:t xml:space="preserve">bigint</w:t>
+            </w:r>
+          </w:p>
+        </w:tc>
+        <w:tc>
+          <w:tcPr>
+            <w:tcW w:w="2000" w:type="dxa"/>
+          </w:tcPr>
+          <w:p>
+            <w:pPr/>
+            <w:r>
+              <w:t xml:space="preserve">-</w:t>
+            </w:r>
+          </w:p>
+        </w:tc>
+        <w:tc>
+          <w:tcPr>
+            <w:tcW w:w="2000" w:type="dxa"/>
+          </w:tcPr>
+          <w:p>
+            <w:pPr/>
+            <w:r>
+              <w:t xml:space="preserve">PK, NOT NULL</w:t>
+            </w:r>
+          </w:p>
+        </w:tc>
+      </w:tr>
+      <w:tr>
+        <w:trPr>
+          <w:trHeight w:val="530" w:hRule="atLeast"/>
+        </w:trPr>
+        <w:tc>
+          <w:tcPr>
+            <w:tcW w:w="2000" w:type="dxa"/>
+          </w:tcPr>
+          <w:p>
+            <w:pPr/>
+            <w:r>
+              <w:t xml:space="preserve">symbol</w:t>
+            </w:r>
+          </w:p>
+        </w:tc>
+        <w:tc>
+          <w:tcPr>
+            <w:tcW w:w="2000" w:type="dxa"/>
+          </w:tcPr>
+          <w:p>
+            <w:pPr/>
+            <w:r>
+              <w:t xml:space="preserve">nvarchar</w:t>
+            </w:r>
+          </w:p>
+        </w:tc>
+        <w:tc>
+          <w:tcPr>
+            <w:tcW w:w="2000" w:type="dxa"/>
+          </w:tcPr>
+          <w:p>
+            <w:pPr/>
+            <w:r>
+              <w:t xml:space="preserve">10</w:t>
+            </w:r>
+          </w:p>
+        </w:tc>
+        <w:tc>
+          <w:tcPr>
+            <w:tcW w:w="2000" w:type="dxa"/>
+          </w:tcPr>
+          <w:p>
+            <w:pPr/>
+            <w:r>
+              <w:t xml:space="preserve">IS NULL</w:t>
+            </w:r>
+          </w:p>
+        </w:tc>
+      </w:tr>
+      <w:tr>
+        <w:trPr>
+          <w:trHeight w:val="530" w:hRule="atLeast"/>
+        </w:trPr>
+        <w:tc>
+          <w:tcPr>
+            <w:tcW w:w="2000" w:type="dxa"/>
+          </w:tcPr>
+          <w:p>
+            <w:pPr/>
+            <w:r>
+              <w:t xml:space="preserve">decimal_places</w:t>
+            </w:r>
+          </w:p>
+        </w:tc>
+        <w:tc>
+          <w:tcPr>
+            <w:tcW w:w="2000" w:type="dxa"/>
+          </w:tcPr>
+          <w:p>
+            <w:pPr/>
+            <w:r>
+              <w:t xml:space="preserve">int</w:t>
+            </w:r>
+          </w:p>
+        </w:tc>
+        <w:tc>
+          <w:tcPr>
+            <w:tcW w:w="2000" w:type="dxa"/>
+          </w:tcPr>
+          <w:p>
+            <w:pPr/>
+            <w:r>
+              <w:t xml:space="preserve">-</w:t>
+            </w:r>
+          </w:p>
+        </w:tc>
+        <w:tc>
+          <w:tcPr>
+            <w:tcW w:w="2000" w:type="dxa"/>
+          </w:tcPr>
+          <w:p>
+            <w:pPr/>
+            <w:r>
+              <w:t xml:space="preserve">NOT NULL</w:t>
+            </w:r>
+          </w:p>
+        </w:tc>
+      </w:tr>
+      <w:tr>
+        <w:trPr>
+          <w:trHeight w:val="530" w:hRule="atLeast"/>
+        </w:trPr>
+        <w:tc>
+          <w:tcPr>
+            <w:tcW w:w="2000" w:type="dxa"/>
+          </w:tcPr>
+          <w:p>
+            <w:pPr/>
+            <w:r>
+              <w:t xml:space="preserve">is_base</w:t>
+            </w:r>
+          </w:p>
+        </w:tc>
+        <w:tc>
+          <w:tcPr>
+            <w:tcW w:w="2000" w:type="dxa"/>
+          </w:tcPr>
+          <w:p>
+            <w:pPr/>
+            <w:r>
+              <w:t xml:space="preserve">bit</w:t>
+            </w:r>
+          </w:p>
+        </w:tc>
+        <w:tc>
+          <w:tcPr>
+            <w:tcW w:w="2000" w:type="dxa"/>
+          </w:tcPr>
+          <w:p>
+            <w:pPr/>
+            <w:r>
+              <w:t xml:space="preserve">-</w:t>
+            </w:r>
+          </w:p>
+        </w:tc>
+        <w:tc>
+          <w:tcPr>
+            <w:tcW w:w="2000" w:type="dxa"/>
+          </w:tcPr>
+          <w:p>
+            <w:pPr/>
+            <w:r>
+              <w:t xml:space="preserve">NOT NULL</w:t>
+            </w:r>
+          </w:p>
+        </w:tc>
+      </w:tr>
+      <w:tr>
+        <w:trPr>
+          <w:trHeight w:val="530" w:hRule="atLeast"/>
+        </w:trPr>
+        <w:tc>
+          <w:tcPr>
+            <w:tcW w:w="2000" w:type="dxa"/>
+          </w:tcPr>
+          <w:p>
+            <w:pPr/>
+            <w:r>
+              <w:t xml:space="preserve">company_id</w:t>
+            </w:r>
+          </w:p>
+        </w:tc>
+        <w:tc>
+          <w:tcPr>
+            <w:tcW w:w="2000" w:type="dxa"/>
+          </w:tcPr>
+          <w:p>
+            <w:pPr/>
+            <w:r>
+              <w:t xml:space="preserve">bigint</w:t>
+            </w:r>
+          </w:p>
+        </w:tc>
+        <w:tc>
+          <w:tcPr>
+            <w:tcW w:w="2000" w:type="dxa"/>
+          </w:tcPr>
+          <w:p>
+            <w:pPr/>
+            <w:r>
+              <w:t xml:space="preserve">-</w:t>
+            </w:r>
+          </w:p>
+        </w:tc>
+        <w:tc>
+          <w:tcPr>
+            <w:tcW w:w="2000" w:type="dxa"/>
+          </w:tcPr>
+          <w:p>
+            <w:pPr/>
+            <w:r>
+              <w:t xml:space="preserve">NOT NULL</w:t>
+            </w:r>
+          </w:p>
+        </w:tc>
+      </w:tr>
+      <w:tr>
+        <w:trPr>
+          <w:trHeight w:val="530" w:hRule="atLeast"/>
+        </w:trPr>
+        <w:tc>
+          <w:tcPr>
+            <w:tcW w:w="2000" w:type="dxa"/>
+          </w:tcPr>
+          <w:p>
+            <w:pPr/>
+            <w:r>
+              <w:t xml:space="preserve">created_at</w:t>
+            </w:r>
+          </w:p>
+        </w:tc>
+        <w:tc>
+          <w:tcPr>
+            <w:tcW w:w="2000" w:type="dxa"/>
+          </w:tcPr>
+          <w:p>
+            <w:pPr/>
+            <w:r>
+              <w:t xml:space="preserve">datetime2</w:t>
+            </w:r>
+          </w:p>
+        </w:tc>
+        <w:tc>
+          <w:tcPr>
+            <w:tcW w:w="2000" w:type="dxa"/>
+          </w:tcPr>
+          <w:p>
+            <w:pPr/>
+            <w:r>
+              <w:t xml:space="preserve">(6)</w:t>
+            </w:r>
+          </w:p>
+        </w:tc>
+        <w:tc>
+          <w:tcPr>
+            <w:tcW w:w="2000" w:type="dxa"/>
+          </w:tcPr>
+          <w:p>
+            <w:pPr/>
+            <w:r>
+              <w:t xml:space="preserve">NOT NULL</w:t>
+            </w:r>
+          </w:p>
+        </w:tc>
+      </w:tr>
+      <w:tr>
+        <w:trPr>
+          <w:trHeight w:val="530" w:hRule="atLeast"/>
+        </w:trPr>
+        <w:tc>
+          <w:tcPr>
+            <w:tcW w:w="2000" w:type="dxa"/>
+          </w:tcPr>
+          <w:p>
+            <w:pPr/>
+            <w:r>
+              <w:t xml:space="preserve">created_by</w:t>
+            </w:r>
+          </w:p>
+        </w:tc>
+        <w:tc>
+          <w:tcPr>
+            <w:tcW w:w="2000" w:type="dxa"/>
+          </w:tcPr>
+          <w:p>
+            <w:pPr/>
+            <w:r>
+              <w:t xml:space="preserve">bigint</w:t>
+            </w:r>
+          </w:p>
+        </w:tc>
+        <w:tc>
+          <w:tcPr>
+            <w:tcW w:w="2000" w:type="dxa"/>
+          </w:tcPr>
+          <w:p>
+            <w:pPr/>
+            <w:r>
+              <w:t xml:space="preserve">-</w:t>
+            </w:r>
+          </w:p>
+        </w:tc>
+        <w:tc>
+          <w:tcPr>
+            <w:tcW w:w="2000" w:type="dxa"/>
+          </w:tcPr>
+          <w:p>
+            <w:pPr/>
+            <w:r>
+              <w:t xml:space="preserve">NOT NULL</w:t>
+            </w:r>
+          </w:p>
+        </w:tc>
+      </w:tr>
+      <w:tr>
+        <w:trPr>
+          <w:trHeight w:val="530" w:hRule="atLeast"/>
+        </w:trPr>
+        <w:tc>
+          <w:tcPr>
+            <w:tcW w:w="2000" w:type="dxa"/>
+          </w:tcPr>
+          <w:p>
+            <w:pPr/>
+            <w:r>
+              <w:t xml:space="preserve">updated_at</w:t>
+            </w:r>
+          </w:p>
+        </w:tc>
+        <w:tc>
+          <w:tcPr>
+            <w:tcW w:w="2000" w:type="dxa"/>
+          </w:tcPr>
+          <w:p>
+            <w:pPr/>
+            <w:r>
+              <w:t xml:space="preserve">datetime2</w:t>
+            </w:r>
+          </w:p>
+        </w:tc>
+        <w:tc>
+          <w:tcPr>
+            <w:tcW w:w="2000" w:type="dxa"/>
+          </w:tcPr>
+          <w:p>
+            <w:pPr/>
+            <w:r>
+              <w:t xml:space="preserve">(6)</w:t>
+            </w:r>
+          </w:p>
+        </w:tc>
+        <w:tc>
+          <w:tcPr>
+            <w:tcW w:w="2000" w:type="dxa"/>
+          </w:tcPr>
+          <w:p>
+            <w:pPr/>
+            <w:r>
+              <w:t xml:space="preserve">IS NULL</w:t>
+            </w:r>
+          </w:p>
+        </w:tc>
+      </w:tr>
+      <w:tr>
+        <w:trPr>
+          <w:trHeight w:val="530" w:hRule="atLeast"/>
+        </w:trPr>
+        <w:tc>
+          <w:tcPr>
+            <w:tcW w:w="2000" w:type="dxa"/>
+          </w:tcPr>
+          <w:p>
+            <w:pPr/>
+            <w:r>
+              <w:t xml:space="preserve">updated_by</w:t>
+            </w:r>
+          </w:p>
+        </w:tc>
+        <w:tc>
+          <w:tcPr>
+            <w:tcW w:w="2000" w:type="dxa"/>
+          </w:tcPr>
+          <w:p>
+            <w:pPr/>
+            <w:r>
+              <w:t xml:space="preserve">bigint</w:t>
+            </w:r>
+          </w:p>
+        </w:tc>
+        <w:tc>
+          <w:tcPr>
+            <w:tcW w:w="2000" w:type="dxa"/>
+          </w:tcPr>
+          <w:p>
+            <w:pPr/>
+            <w:r>
+              <w:t xml:space="preserve">-</w:t>
+            </w:r>
+          </w:p>
+        </w:tc>
+        <w:tc>
+          <w:tcPr>
+            <w:tcW w:w="2000" w:type="dxa"/>
+          </w:tcPr>
+          <w:p>
+            <w:pPr/>
+            <w:r>
+              <w:t xml:space="preserve">IS NULL</w:t>
+            </w:r>
+          </w:p>
+        </w:tc>
+      </w:tr>
+      <w:tr>
+        <w:trPr>
+          <w:trHeight w:val="530" w:hRule="atLeast"/>
+        </w:trPr>
+        <w:tc>
+          <w:tcPr>
+            <w:tcW w:w="2000" w:type="dxa"/>
+          </w:tcPr>
+          <w:p>
+            <w:pPr/>
+            <w:r>
+              <w:t xml:space="preserve">version</w:t>
+            </w:r>
+          </w:p>
+        </w:tc>
+        <w:tc>
+          <w:tcPr>
+            <w:tcW w:w="2000" w:type="dxa"/>
+          </w:tcPr>
+          <w:p>
+            <w:pPr/>
+            <w:r>
+              <w:t xml:space="preserve">int</w:t>
+            </w:r>
+          </w:p>
+        </w:tc>
+        <w:tc>
+          <w:tcPr>
+            <w:tcW w:w="2000" w:type="dxa"/>
+          </w:tcPr>
+          <w:p>
+            <w:pPr/>
+            <w:r>
+              <w:t xml:space="preserve">-</w:t>
+            </w:r>
+          </w:p>
+        </w:tc>
+        <w:tc>
+          <w:tcPr>
+            <w:tcW w:w="2000" w:type="dxa"/>
+          </w:tcPr>
+          <w:p>
+            <w:pPr/>
+            <w:r>
+              <w:t xml:space="preserve">NOT NULL</w:t>
+            </w:r>
+          </w:p>
+        </w:tc>
+      </w:tr>
+      <w:tr>
+        <w:trPr>
+          <w:trHeight w:val="530" w:hRule="atLeast"/>
+        </w:trPr>
+        <w:tc>
+          <w:tcPr>
+            <w:tcW w:w="2000" w:type="dxa"/>
+          </w:tcPr>
+          <w:p>
+            <w:pPr/>
+            <w:r>
+              <w:t xml:space="preserve">is_active</w:t>
+            </w:r>
+          </w:p>
+        </w:tc>
+        <w:tc>
+          <w:tcPr>
+            <w:tcW w:w="2000" w:type="dxa"/>
+          </w:tcPr>
+          <w:p>
+            <w:pPr/>
+            <w:r>
+              <w:t xml:space="preserve">bit</w:t>
+            </w:r>
+          </w:p>
+        </w:tc>
+        <w:tc>
+          <w:tcPr>
+            <w:tcW w:w="2000" w:type="dxa"/>
+          </w:tcPr>
+          <w:p>
+            <w:pPr/>
+            <w:r>
+              <w:t xml:space="preserve">-</w:t>
+            </w:r>
+          </w:p>
+        </w:tc>
+        <w:tc>
+          <w:tcPr>
+            <w:tcW w:w="2000" w:type="dxa"/>
+          </w:tcPr>
+          <w:p>
+            <w:pPr/>
+            <w:r>
+              <w:t xml:space="preserve">NOT NULL</w:t>
+            </w:r>
+          </w:p>
+        </w:tc>
+      </w:tr>
+      <w:tr>
+        <w:trPr>
+          <w:trHeight w:val="530" w:hRule="atLeast"/>
+        </w:trPr>
+        <w:tc>
+          <w:tcPr>
+            <w:tcW w:w="2000" w:type="dxa"/>
+          </w:tcPr>
+          <w:p>
+            <w:pPr/>
+            <w:r>
+              <w:t xml:space="preserve">is_deleted</w:t>
+            </w:r>
+          </w:p>
+        </w:tc>
+        <w:tc>
+          <w:tcPr>
+            <w:tcW w:w="2000" w:type="dxa"/>
+          </w:tcPr>
+          <w:p>
+            <w:pPr/>
+            <w:r>
+              <w:t xml:space="preserve">bit</w:t>
+            </w:r>
+          </w:p>
+        </w:tc>
+        <w:tc>
+          <w:tcPr>
+            <w:tcW w:w="2000" w:type="dxa"/>
+          </w:tcPr>
+          <w:p>
+            <w:pPr/>
+            <w:r>
+              <w:t xml:space="preserve">-</w:t>
+            </w:r>
+          </w:p>
+        </w:tc>
+        <w:tc>
+          <w:tcPr>
+            <w:tcW w:w="2000" w:type="dxa"/>
+          </w:tcPr>
+          <w:p>
+            <w:pPr/>
+            <w:r>
+              <w:t xml:space="preserve">NOT NULL</w:t>
+            </w:r>
+          </w:p>
+        </w:tc>
+      </w:tr>
+      <w:tr>
+        <w:trPr>
+          <w:trHeight w:val="530" w:hRule="atLeast"/>
+        </w:trPr>
+        <w:tc>
+          <w:tcPr>
+            <w:tcW w:w="2000" w:type="dxa"/>
+          </w:tcPr>
+          <w:p>
+            <w:pPr/>
+            <w:r>
+              <w:t xml:space="preserve">code</w:t>
+            </w:r>
+          </w:p>
+        </w:tc>
+        <w:tc>
+          <w:tcPr>
+            <w:tcW w:w="2000" w:type="dxa"/>
+          </w:tcPr>
+          <w:p>
+            <w:pPr/>
+            <w:r>
+              <w:t xml:space="preserve">char</w:t>
+            </w:r>
+          </w:p>
+        </w:tc>
+        <w:tc>
+          <w:tcPr>
+            <w:tcW w:w="2000" w:type="dxa"/>
+          </w:tcPr>
+          <w:p>
+            <w:pPr/>
+            <w:r>
+              <w:t xml:space="preserve">3</w:t>
+            </w:r>
+          </w:p>
+        </w:tc>
+        <w:tc>
+          <w:tcPr>
+            <w:tcW w:w="2000" w:type="dxa"/>
+          </w:tcPr>
+          <w:p>
+            <w:pPr/>
+            <w:r>
+              <w:t xml:space="preserve">NOT NULL</w:t>
+            </w:r>
+          </w:p>
+        </w:tc>
+      </w:tr>
+      <w:tr>
+        <w:trPr>
+          <w:trHeight w:val="530" w:hRule="atLeast"/>
+        </w:trPr>
+        <w:tc>
+          <w:tcPr>
+            <w:tcW w:w="2000" w:type="dxa"/>
+          </w:tcPr>
+          <w:p>
+            <w:pPr/>
+            <w:r>
+              <w:t xml:space="preserve">name</w:t>
+            </w:r>
+          </w:p>
+        </w:tc>
+        <w:tc>
+          <w:tcPr>
+            <w:tcW w:w="2000" w:type="dxa"/>
+          </w:tcPr>
+          <w:p>
+            <w:pPr/>
+            <w:r>
+              <w:t xml:space="preserve">nvarchar</w:t>
+            </w:r>
+          </w:p>
+        </w:tc>
+        <w:tc>
+          <w:tcPr>
+            <w:tcW w:w="2000" w:type="dxa"/>
+          </w:tcPr>
+          <w:p>
+            <w:pPr/>
+            <w:r>
+              <w:t xml:space="preserve">200</w:t>
+            </w:r>
+          </w:p>
+        </w:tc>
+        <w:tc>
+          <w:tcPr>
+            <w:tcW w:w="2000" w:type="dxa"/>
+          </w:tcPr>
+          <w:p>
+            <w:pPr/>
+            <w:r>
+              <w:t xml:space="preserve">NOT NULL</w:t>
+            </w:r>
+          </w:p>
+        </w:tc>
+      </w:tr>
+      <w:tr>
+        <w:trPr>
+          <w:trHeight w:val="530" w:hRule="atLeast"/>
+        </w:trPr>
+        <w:tc>
+          <w:tcPr>
+            <w:tcW w:w="2000" w:type="dxa"/>
+          </w:tcPr>
+          <w:p>
+            <w:pPr/>
+            <w:r>
+              <w:t xml:space="preserve">custom_fields</w:t>
+            </w:r>
+          </w:p>
+        </w:tc>
+        <w:tc>
+          <w:tcPr>
+            <w:tcW w:w="2000" w:type="dxa"/>
+          </w:tcPr>
+          <w:p>
+            <w:pPr/>
+            <w:r>
+              <w:t xml:space="preserve">nvarchar</w:t>
+            </w:r>
+          </w:p>
+        </w:tc>
+        <w:tc>
+          <w:tcPr>
+            <w:tcW w:w="2000" w:type="dxa"/>
+          </w:tcPr>
+          <w:p>
+            <w:pPr/>
+            <w:r>
+              <w:t xml:space="preserve">MAX</w:t>
+            </w:r>
+          </w:p>
+        </w:tc>
+        <w:tc>
+          <w:tcPr>
+            <w:tcW w:w="2000" w:type="dxa"/>
+          </w:tcPr>
+          <w:p>
+            <w:pPr/>
+            <w:r>
+              <w:t xml:space="preserve">IS NULL</w:t>
+            </w:r>
+          </w:p>
+        </w:tc>
+      </w:tr>
+    </w:tbl>
+    <w:p/>
+    <w:p>
+      <w:pPr/>
+      <w:r>
         <w:t xml:space="preserve">Table Name: md_customer</w:t>
       </w:r>
     </w:p>
@@ -2039,6 +2890,710 @@
             <w:pPr/>
             <w:r>
               <w:t xml:space="preserve">bit</w:t>
+            </w:r>
+          </w:p>
+        </w:tc>
+        <w:tc>
+          <w:tcPr>
+            <w:tcW w:w="2000" w:type="dxa"/>
+          </w:tcPr>
+          <w:p>
+            <w:pPr/>
+            <w:r>
+              <w:t xml:space="preserve">-</w:t>
+            </w:r>
+          </w:p>
+        </w:tc>
+        <w:tc>
+          <w:tcPr>
+            <w:tcW w:w="2000" w:type="dxa"/>
+          </w:tcPr>
+          <w:p>
+            <w:pPr/>
+            <w:r>
+              <w:t xml:space="preserve">NOT NULL</w:t>
+            </w:r>
+          </w:p>
+        </w:tc>
+      </w:tr>
+    </w:tbl>
+    <w:p/>
+    <w:p>
+      <w:pPr/>
+      <w:r>
+        <w:t xml:space="preserve">Table Name: md_exchange_rate</w:t>
+      </w:r>
+    </w:p>
+    <w:p>
+      <w:pPr/>
+      <w:r>
+        <w:t xml:space="preserve">Primary Key: id</w:t>
+      </w:r>
+    </w:p>
+    <w:p>
+      <w:pPr/>
+      <w:r>
+        <w:t xml:space="preserve">This table stores exchange rates of foreign currencies against the base currency.</w:t>
+      </w:r>
+    </w:p>
+    <w:tbl>
+      <w:tblPr>
+        <w:tblStyle w:val="TableGrid"/>
+        <w:tblW w:w="8000" w:type="dxa"/>
+        <w:jc w:val="left"/>
+        <w:tblBorders>
+          <w:top w:val="single" w:color="000000" w:sz="4" w:space="0"/>
+          <w:left w:val="single" w:color="000000" w:sz="4" w:space="0"/>
+          <w:bottom w:val="single" w:color="000000" w:sz="4" w:space="0"/>
+          <w:right w:val="single" w:color="000000" w:sz="4" w:space="0"/>
+          <w:insideH w:val="single" w:color="000000" w:sz="4" w:space="0"/>
+          <w:insideV w:val="single" w:color="000000" w:sz="4" w:space="0"/>
+        </w:tblBorders>
+        <w:tblLayout w:type="fixed"/>
+        <w:tblCellMar>
+          <w:top w:w="100" w:type="dxa"/>
+          <w:left w:w="100" w:type="dxa"/>
+          <w:bottom w:w="100" w:type="dxa"/>
+          <w:right w:w="100" w:type="dxa"/>
+        </w:tblCellMar>
+      </w:tblPr>
+      <w:tblGrid>
+        <w:gridCol w:w="2000"/>
+        <w:gridCol w:w="2000"/>
+        <w:gridCol w:w="2000"/>
+        <w:gridCol w:w="2000"/>
+      </w:tblGrid>
+      <w:tr>
+        <w:trPr>
+          <w:trHeight w:val="530" w:hRule="atLeast"/>
+        </w:trPr>
+        <w:tc>
+          <w:tcPr>
+            <w:tcW w:w="2000" w:type="dxa"/>
+          </w:tcPr>
+          <w:p>
+            <w:pPr>
+              <w:jc w:val="center"/>
+            </w:pPr>
+            <w:r>
+              <w:rPr>
+                <w:b/>
+              </w:rPr>
+              <w:t xml:space="preserve">Name of Attribute</w:t>
+            </w:r>
+          </w:p>
+        </w:tc>
+        <w:tc>
+          <w:tcPr>
+            <w:tcW w:w="2000" w:type="dxa"/>
+          </w:tcPr>
+          <w:p>
+            <w:pPr>
+              <w:jc w:val="center"/>
+            </w:pPr>
+            <w:r>
+              <w:rPr>
+                <w:b/>
+              </w:rPr>
+              <w:t xml:space="preserve">Data Type</w:t>
+            </w:r>
+          </w:p>
+        </w:tc>
+        <w:tc>
+          <w:tcPr>
+            <w:tcW w:w="2000" w:type="dxa"/>
+          </w:tcPr>
+          <w:p>
+            <w:pPr>
+              <w:jc w:val="center"/>
+            </w:pPr>
+            <w:r>
+              <w:rPr>
+                <w:b/>
+              </w:rPr>
+              <w:t xml:space="preserve">Size</w:t>
+            </w:r>
+          </w:p>
+        </w:tc>
+        <w:tc>
+          <w:tcPr>
+            <w:tcW w:w="2000" w:type="dxa"/>
+          </w:tcPr>
+          <w:p>
+            <w:pPr>
+              <w:jc w:val="center"/>
+            </w:pPr>
+            <w:r>
+              <w:rPr>
+                <w:b/>
+              </w:rPr>
+              <w:t xml:space="preserve">PK/FK/IS NULL/ NOT NULL</w:t>
+            </w:r>
+          </w:p>
+        </w:tc>
+      </w:tr>
+      <w:tr>
+        <w:trPr>
+          <w:trHeight w:val="530" w:hRule="atLeast"/>
+        </w:trPr>
+        <w:tc>
+          <w:tcPr>
+            <w:tcW w:w="2000" w:type="dxa"/>
+          </w:tcPr>
+          <w:p>
+            <w:pPr/>
+            <w:r>
+              <w:t xml:space="preserve">id</w:t>
+            </w:r>
+          </w:p>
+        </w:tc>
+        <w:tc>
+          <w:tcPr>
+            <w:tcW w:w="2000" w:type="dxa"/>
+          </w:tcPr>
+          <w:p>
+            <w:pPr/>
+            <w:r>
+              <w:t xml:space="preserve">bigint</w:t>
+            </w:r>
+          </w:p>
+        </w:tc>
+        <w:tc>
+          <w:tcPr>
+            <w:tcW w:w="2000" w:type="dxa"/>
+          </w:tcPr>
+          <w:p>
+            <w:pPr/>
+            <w:r>
+              <w:t xml:space="preserve">-</w:t>
+            </w:r>
+          </w:p>
+        </w:tc>
+        <w:tc>
+          <w:tcPr>
+            <w:tcW w:w="2000" w:type="dxa"/>
+          </w:tcPr>
+          <w:p>
+            <w:pPr/>
+            <w:r>
+              <w:t xml:space="preserve">PK, NOT NULL</w:t>
+            </w:r>
+          </w:p>
+        </w:tc>
+      </w:tr>
+      <w:tr>
+        <w:trPr>
+          <w:trHeight w:val="530" w:hRule="atLeast"/>
+        </w:trPr>
+        <w:tc>
+          <w:tcPr>
+            <w:tcW w:w="2000" w:type="dxa"/>
+          </w:tcPr>
+          <w:p>
+            <w:pPr/>
+            <w:r>
+              <w:t xml:space="preserve">currency_id</w:t>
+            </w:r>
+          </w:p>
+        </w:tc>
+        <w:tc>
+          <w:tcPr>
+            <w:tcW w:w="2000" w:type="dxa"/>
+          </w:tcPr>
+          <w:p>
+            <w:pPr/>
+            <w:r>
+              <w:t xml:space="preserve">bigint</w:t>
+            </w:r>
+          </w:p>
+        </w:tc>
+        <w:tc>
+          <w:tcPr>
+            <w:tcW w:w="2000" w:type="dxa"/>
+          </w:tcPr>
+          <w:p>
+            <w:pPr/>
+            <w:r>
+              <w:t xml:space="preserve">-</w:t>
+            </w:r>
+          </w:p>
+        </w:tc>
+        <w:tc>
+          <w:tcPr>
+            <w:tcW w:w="2000" w:type="dxa"/>
+          </w:tcPr>
+          <w:p>
+            <w:pPr/>
+            <w:r>
+              <w:t xml:space="preserve">FK, NOT NULL</w:t>
+            </w:r>
+          </w:p>
+        </w:tc>
+      </w:tr>
+      <w:tr>
+        <w:trPr>
+          <w:trHeight w:val="530" w:hRule="atLeast"/>
+        </w:trPr>
+        <w:tc>
+          <w:tcPr>
+            <w:tcW w:w="2000" w:type="dxa"/>
+          </w:tcPr>
+          <w:p>
+            <w:pPr/>
+            <w:r>
+              <w:t xml:space="preserve">effective_from</w:t>
+            </w:r>
+          </w:p>
+        </w:tc>
+        <w:tc>
+          <w:tcPr>
+            <w:tcW w:w="2000" w:type="dxa"/>
+          </w:tcPr>
+          <w:p>
+            <w:pPr/>
+            <w:r>
+              <w:t xml:space="preserve">date</w:t>
+            </w:r>
+          </w:p>
+        </w:tc>
+        <w:tc>
+          <w:tcPr>
+            <w:tcW w:w="2000" w:type="dxa"/>
+          </w:tcPr>
+          <w:p>
+            <w:pPr/>
+            <w:r>
+              <w:t xml:space="preserve">-</w:t>
+            </w:r>
+          </w:p>
+        </w:tc>
+        <w:tc>
+          <w:tcPr>
+            <w:tcW w:w="2000" w:type="dxa"/>
+          </w:tcPr>
+          <w:p>
+            <w:pPr/>
+            <w:r>
+              <w:t xml:space="preserve">NOT NULL</w:t>
+            </w:r>
+          </w:p>
+        </w:tc>
+      </w:tr>
+      <w:tr>
+        <w:trPr>
+          <w:trHeight w:val="530" w:hRule="atLeast"/>
+        </w:trPr>
+        <w:tc>
+          <w:tcPr>
+            <w:tcW w:w="2000" w:type="dxa"/>
+          </w:tcPr>
+          <w:p>
+            <w:pPr/>
+            <w:r>
+              <w:t xml:space="preserve">effective_to</w:t>
+            </w:r>
+          </w:p>
+        </w:tc>
+        <w:tc>
+          <w:tcPr>
+            <w:tcW w:w="2000" w:type="dxa"/>
+          </w:tcPr>
+          <w:p>
+            <w:pPr/>
+            <w:r>
+              <w:t xml:space="preserve">date</w:t>
+            </w:r>
+          </w:p>
+        </w:tc>
+        <w:tc>
+          <w:tcPr>
+            <w:tcW w:w="2000" w:type="dxa"/>
+          </w:tcPr>
+          <w:p>
+            <w:pPr/>
+            <w:r>
+              <w:t xml:space="preserve">-</w:t>
+            </w:r>
+          </w:p>
+        </w:tc>
+        <w:tc>
+          <w:tcPr>
+            <w:tcW w:w="2000" w:type="dxa"/>
+          </w:tcPr>
+          <w:p>
+            <w:pPr/>
+            <w:r>
+              <w:t xml:space="preserve">IS NULL</w:t>
+            </w:r>
+          </w:p>
+        </w:tc>
+      </w:tr>
+      <w:tr>
+        <w:trPr>
+          <w:trHeight w:val="530" w:hRule="atLeast"/>
+        </w:trPr>
+        <w:tc>
+          <w:tcPr>
+            <w:tcW w:w="2000" w:type="dxa"/>
+          </w:tcPr>
+          <w:p>
+            <w:pPr/>
+            <w:r>
+              <w:t xml:space="preserve">rate</w:t>
+            </w:r>
+          </w:p>
+        </w:tc>
+        <w:tc>
+          <w:tcPr>
+            <w:tcW w:w="2000" w:type="dxa"/>
+          </w:tcPr>
+          <w:p>
+            <w:pPr/>
+            <w:r>
+              <w:t xml:space="preserve">decimal</w:t>
+            </w:r>
+          </w:p>
+        </w:tc>
+        <w:tc>
+          <w:tcPr>
+            <w:tcW w:w="2000" w:type="dxa"/>
+          </w:tcPr>
+          <w:p>
+            <w:pPr/>
+            <w:r>
+              <w:t xml:space="preserve">(19,8)</w:t>
+            </w:r>
+          </w:p>
+        </w:tc>
+        <w:tc>
+          <w:tcPr>
+            <w:tcW w:w="2000" w:type="dxa"/>
+          </w:tcPr>
+          <w:p>
+            <w:pPr/>
+            <w:r>
+              <w:t xml:space="preserve">NOT NULL</w:t>
+            </w:r>
+          </w:p>
+        </w:tc>
+      </w:tr>
+      <w:tr>
+        <w:trPr>
+          <w:trHeight w:val="530" w:hRule="atLeast"/>
+        </w:trPr>
+        <w:tc>
+          <w:tcPr>
+            <w:tcW w:w="2000" w:type="dxa"/>
+          </w:tcPr>
+          <w:p>
+            <w:pPr/>
+            <w:r>
+              <w:t xml:space="preserve">is_deleted</w:t>
+            </w:r>
+          </w:p>
+        </w:tc>
+        <w:tc>
+          <w:tcPr>
+            <w:tcW w:w="2000" w:type="dxa"/>
+          </w:tcPr>
+          <w:p>
+            <w:pPr/>
+            <w:r>
+              <w:t xml:space="preserve">bit</w:t>
+            </w:r>
+          </w:p>
+        </w:tc>
+        <w:tc>
+          <w:tcPr>
+            <w:tcW w:w="2000" w:type="dxa"/>
+          </w:tcPr>
+          <w:p>
+            <w:pPr/>
+            <w:r>
+              <w:t xml:space="preserve">-</w:t>
+            </w:r>
+          </w:p>
+        </w:tc>
+        <w:tc>
+          <w:tcPr>
+            <w:tcW w:w="2000" w:type="dxa"/>
+          </w:tcPr>
+          <w:p>
+            <w:pPr/>
+            <w:r>
+              <w:t xml:space="preserve">NOT NULL</w:t>
+            </w:r>
+          </w:p>
+        </w:tc>
+      </w:tr>
+      <w:tr>
+        <w:trPr>
+          <w:trHeight w:val="530" w:hRule="atLeast"/>
+        </w:trPr>
+        <w:tc>
+          <w:tcPr>
+            <w:tcW w:w="2000" w:type="dxa"/>
+          </w:tcPr>
+          <w:p>
+            <w:pPr/>
+            <w:r>
+              <w:t xml:space="preserve">company_id</w:t>
+            </w:r>
+          </w:p>
+        </w:tc>
+        <w:tc>
+          <w:tcPr>
+            <w:tcW w:w="2000" w:type="dxa"/>
+          </w:tcPr>
+          <w:p>
+            <w:pPr/>
+            <w:r>
+              <w:t xml:space="preserve">bigint</w:t>
+            </w:r>
+          </w:p>
+        </w:tc>
+        <w:tc>
+          <w:tcPr>
+            <w:tcW w:w="2000" w:type="dxa"/>
+          </w:tcPr>
+          <w:p>
+            <w:pPr/>
+            <w:r>
+              <w:t xml:space="preserve">-</w:t>
+            </w:r>
+          </w:p>
+        </w:tc>
+        <w:tc>
+          <w:tcPr>
+            <w:tcW w:w="2000" w:type="dxa"/>
+          </w:tcPr>
+          <w:p>
+            <w:pPr/>
+            <w:r>
+              <w:t xml:space="preserve">FK, NOT NULL</w:t>
+            </w:r>
+          </w:p>
+        </w:tc>
+      </w:tr>
+      <w:tr>
+        <w:trPr>
+          <w:trHeight w:val="530" w:hRule="atLeast"/>
+        </w:trPr>
+        <w:tc>
+          <w:tcPr>
+            <w:tcW w:w="2000" w:type="dxa"/>
+          </w:tcPr>
+          <w:p>
+            <w:pPr/>
+            <w:r>
+              <w:t xml:space="preserve">created_at</w:t>
+            </w:r>
+          </w:p>
+        </w:tc>
+        <w:tc>
+          <w:tcPr>
+            <w:tcW w:w="2000" w:type="dxa"/>
+          </w:tcPr>
+          <w:p>
+            <w:pPr/>
+            <w:r>
+              <w:t xml:space="preserve">datetime2</w:t>
+            </w:r>
+          </w:p>
+        </w:tc>
+        <w:tc>
+          <w:tcPr>
+            <w:tcW w:w="2000" w:type="dxa"/>
+          </w:tcPr>
+          <w:p>
+            <w:pPr/>
+            <w:r>
+              <w:t xml:space="preserve">(6)</w:t>
+            </w:r>
+          </w:p>
+        </w:tc>
+        <w:tc>
+          <w:tcPr>
+            <w:tcW w:w="2000" w:type="dxa"/>
+          </w:tcPr>
+          <w:p>
+            <w:pPr/>
+            <w:r>
+              <w:t xml:space="preserve">NOT NULL</w:t>
+            </w:r>
+          </w:p>
+        </w:tc>
+      </w:tr>
+      <w:tr>
+        <w:trPr>
+          <w:trHeight w:val="530" w:hRule="atLeast"/>
+        </w:trPr>
+        <w:tc>
+          <w:tcPr>
+            <w:tcW w:w="2000" w:type="dxa"/>
+          </w:tcPr>
+          <w:p>
+            <w:pPr/>
+            <w:r>
+              <w:t xml:space="preserve">created_by</w:t>
+            </w:r>
+          </w:p>
+        </w:tc>
+        <w:tc>
+          <w:tcPr>
+            <w:tcW w:w="2000" w:type="dxa"/>
+          </w:tcPr>
+          <w:p>
+            <w:pPr/>
+            <w:r>
+              <w:t xml:space="preserve">bigint</w:t>
+            </w:r>
+          </w:p>
+        </w:tc>
+        <w:tc>
+          <w:tcPr>
+            <w:tcW w:w="2000" w:type="dxa"/>
+          </w:tcPr>
+          <w:p>
+            <w:pPr/>
+            <w:r>
+              <w:t xml:space="preserve">-</w:t>
+            </w:r>
+          </w:p>
+        </w:tc>
+        <w:tc>
+          <w:tcPr>
+            <w:tcW w:w="2000" w:type="dxa"/>
+          </w:tcPr>
+          <w:p>
+            <w:pPr/>
+            <w:r>
+              <w:t xml:space="preserve">NOT NULL</w:t>
+            </w:r>
+          </w:p>
+        </w:tc>
+      </w:tr>
+      <w:tr>
+        <w:trPr>
+          <w:trHeight w:val="530" w:hRule="atLeast"/>
+        </w:trPr>
+        <w:tc>
+          <w:tcPr>
+            <w:tcW w:w="2000" w:type="dxa"/>
+          </w:tcPr>
+          <w:p>
+            <w:pPr/>
+            <w:r>
+              <w:t xml:space="preserve">updated_at</w:t>
+            </w:r>
+          </w:p>
+        </w:tc>
+        <w:tc>
+          <w:tcPr>
+            <w:tcW w:w="2000" w:type="dxa"/>
+          </w:tcPr>
+          <w:p>
+            <w:pPr/>
+            <w:r>
+              <w:t xml:space="preserve">datetime2</w:t>
+            </w:r>
+          </w:p>
+        </w:tc>
+        <w:tc>
+          <w:tcPr>
+            <w:tcW w:w="2000" w:type="dxa"/>
+          </w:tcPr>
+          <w:p>
+            <w:pPr/>
+            <w:r>
+              <w:t xml:space="preserve">(6)</w:t>
+            </w:r>
+          </w:p>
+        </w:tc>
+        <w:tc>
+          <w:tcPr>
+            <w:tcW w:w="2000" w:type="dxa"/>
+          </w:tcPr>
+          <w:p>
+            <w:pPr/>
+            <w:r>
+              <w:t xml:space="preserve">IS NULL</w:t>
+            </w:r>
+          </w:p>
+        </w:tc>
+      </w:tr>
+      <w:tr>
+        <w:trPr>
+          <w:trHeight w:val="530" w:hRule="atLeast"/>
+        </w:trPr>
+        <w:tc>
+          <w:tcPr>
+            <w:tcW w:w="2000" w:type="dxa"/>
+          </w:tcPr>
+          <w:p>
+            <w:pPr/>
+            <w:r>
+              <w:t xml:space="preserve">updated_by</w:t>
+            </w:r>
+          </w:p>
+        </w:tc>
+        <w:tc>
+          <w:tcPr>
+            <w:tcW w:w="2000" w:type="dxa"/>
+          </w:tcPr>
+          <w:p>
+            <w:pPr/>
+            <w:r>
+              <w:t xml:space="preserve">bigint</w:t>
+            </w:r>
+          </w:p>
+        </w:tc>
+        <w:tc>
+          <w:tcPr>
+            <w:tcW w:w="2000" w:type="dxa"/>
+          </w:tcPr>
+          <w:p>
+            <w:pPr/>
+            <w:r>
+              <w:t xml:space="preserve">-</w:t>
+            </w:r>
+          </w:p>
+        </w:tc>
+        <w:tc>
+          <w:tcPr>
+            <w:tcW w:w="2000" w:type="dxa"/>
+          </w:tcPr>
+          <w:p>
+            <w:pPr/>
+            <w:r>
+              <w:t xml:space="preserve">IS NULL</w:t>
+            </w:r>
+          </w:p>
+        </w:tc>
+      </w:tr>
+      <w:tr>
+        <w:trPr>
+          <w:trHeight w:val="530" w:hRule="atLeast"/>
+        </w:trPr>
+        <w:tc>
+          <w:tcPr>
+            <w:tcW w:w="2000" w:type="dxa"/>
+          </w:tcPr>
+          <w:p>
+            <w:pPr/>
+            <w:r>
+              <w:t xml:space="preserve">version</w:t>
+            </w:r>
+          </w:p>
+        </w:tc>
+        <w:tc>
+          <w:tcPr>
+            <w:tcW w:w="2000" w:type="dxa"/>
+          </w:tcPr>
+          <w:p>
+            <w:pPr/>
+            <w:r>
+              <w:t xml:space="preserve">int</w:t>
             </w:r>
           </w:p>
         </w:tc>
@@ -25323,8 +26878,84 @@
         <w:t xml:space="preserve">[Pending] System screenshot of Storage Location Interface.</w:t>
       </w:r>
     </w:p>
+    <w:p>
+      <w:pPr>
+        <w:pStyle w:val="Heading5"/>
+      </w:pPr>
+      <w:r>
+        <w:t xml:space="preserve">4.2.1.8.79 Currency View Interface</w:t>
+      </w:r>
+    </w:p>
+    <w:p>
+      <w:pPr>
+        <w:jc w:val="center"/>
+      </w:pPr>
+      <w:r>
+        <w:rPr>
+          <w:i/>
+        </w:rPr>
+        <w:t xml:space="preserve">[Pending] System screenshot of Currency View Interface.</w:t>
+      </w:r>
+    </w:p>
+    <w:p>
+      <w:pPr>
+        <w:pStyle w:val="Heading5"/>
+      </w:pPr>
+      <w:r>
+        <w:t xml:space="preserve">4.2.1.8.80 Currency Create Interface</w:t>
+      </w:r>
+    </w:p>
+    <w:p>
+      <w:pPr>
+        <w:jc w:val="center"/>
+      </w:pPr>
+      <w:r>
+        <w:rPr>
+          <w:i/>
+        </w:rPr>
+        <w:t xml:space="preserve">[Pending] System screenshot of Currency Create Interface.</w:t>
+      </w:r>
+    </w:p>
+    <w:p>
+      <w:pPr>
+        <w:pStyle w:val="Heading5"/>
+      </w:pPr>
+      <w:r>
+        <w:t xml:space="preserve">4.2.1.8.81 Currency Edit Interface</w:t>
+      </w:r>
+    </w:p>
+    <w:p>
+      <w:pPr>
+        <w:jc w:val="center"/>
+      </w:pPr>
+      <w:r>
+        <w:rPr>
+          <w:i/>
+        </w:rPr>
+        <w:t xml:space="preserve">[Pending] System screenshot of Currency Edit Interface.</w:t>
+      </w:r>
+    </w:p>
+    <w:p>
+      <w:pPr>
+        <w:pStyle w:val="Heading5"/>
+      </w:pPr>
+      <w:r>
+        <w:t xml:space="preserve">4.2.1.8.82 Exchange Rate Interface</w:t>
+      </w:r>
+    </w:p>
+    <w:p>
+      <w:pPr>
+        <w:jc w:val="center"/>
+      </w:pPr>
+      <w:r>
+        <w:rPr>
+          <w:i/>
+        </w:rPr>
+        <w:t xml:space="preserve">[Pending] System screenshot of Exchange Rate Interface.</w:t>
+      </w:r>
+    </w:p>
     <w:sectPr>
-      <w:footerReference xmlns:r="http://schemas.openxmlformats.org/officeDocument/2006/relationships" w:type="default" r:id="R6eb916cbd015430f"/>
+      <w:footerReference xmlns:r="http://schemas.openxmlformats.org/officeDocument/2006/relationships" w:type="default" r:id="R813e4f955b6747a5"/>
       <w:pgSz w:w="11906" w:h="16838"/>
       <w:pgMar w:top="1440" w:right="1440" w:bottom="1440" w:left="1440" w:header="720" w:footer="720" w:gutter="0"/>
     </w:sectPr>

</xml_diff>

<commit_message>
feat(md): add multilingual tax code, tax rate and tax calculation pages
- /md/tax-codes page (interfaces 8.83-8.86) with tax rate dialog and
  line tax calculator; menu, route, i18n in three languages
- TaxDirection serialized by name (Output/Input) in JSON
- Vitest +13, Playwright +3; WU-MD-017 done

Co-Authored-By: Claude Opus 5.5 <noreply@anthropic.com>
</commit_message>
<xml_diff>
--- a/docs/99-output/MyERP_SDS.docx
+++ b/docs/99-output/MyERP_SDS.docx
@@ -8740,6 +8740,1463 @@
             <w:pPr/>
             <w:r>
               <w:t xml:space="preserve">IS NULL</w:t>
+            </w:r>
+          </w:p>
+        </w:tc>
+      </w:tr>
+    </w:tbl>
+    <w:p/>
+    <w:p>
+      <w:pPr/>
+      <w:r>
+        <w:t xml:space="preserve">Table Name: md_tax_code</w:t>
+      </w:r>
+    </w:p>
+    <w:p>
+      <w:pPr/>
+      <w:r>
+        <w:t xml:space="preserve">Primary Key: id</w:t>
+      </w:r>
+    </w:p>
+    <w:p>
+      <w:pPr/>
+      <w:r>
+        <w:t xml:space="preserve">This table stores tax codes and whether they apply to output tax, input tax or both.</w:t>
+      </w:r>
+    </w:p>
+    <w:tbl>
+      <w:tblPr>
+        <w:tblStyle w:val="TableGrid"/>
+        <w:tblW w:w="8000" w:type="dxa"/>
+        <w:jc w:val="left"/>
+        <w:tblBorders>
+          <w:top w:val="single" w:color="000000" w:sz="4" w:space="0"/>
+          <w:left w:val="single" w:color="000000" w:sz="4" w:space="0"/>
+          <w:bottom w:val="single" w:color="000000" w:sz="4" w:space="0"/>
+          <w:right w:val="single" w:color="000000" w:sz="4" w:space="0"/>
+          <w:insideH w:val="single" w:color="000000" w:sz="4" w:space="0"/>
+          <w:insideV w:val="single" w:color="000000" w:sz="4" w:space="0"/>
+        </w:tblBorders>
+        <w:tblLayout w:type="fixed"/>
+        <w:tblCellMar>
+          <w:top w:w="100" w:type="dxa"/>
+          <w:left w:w="100" w:type="dxa"/>
+          <w:bottom w:w="100" w:type="dxa"/>
+          <w:right w:w="100" w:type="dxa"/>
+        </w:tblCellMar>
+      </w:tblPr>
+      <w:tblGrid>
+        <w:gridCol w:w="2000"/>
+        <w:gridCol w:w="2000"/>
+        <w:gridCol w:w="2000"/>
+        <w:gridCol w:w="2000"/>
+      </w:tblGrid>
+      <w:tr>
+        <w:trPr>
+          <w:trHeight w:val="530" w:hRule="atLeast"/>
+        </w:trPr>
+        <w:tc>
+          <w:tcPr>
+            <w:tcW w:w="2000" w:type="dxa"/>
+          </w:tcPr>
+          <w:p>
+            <w:pPr>
+              <w:jc w:val="center"/>
+            </w:pPr>
+            <w:r>
+              <w:rPr>
+                <w:b/>
+              </w:rPr>
+              <w:t xml:space="preserve">Name of Attribute</w:t>
+            </w:r>
+          </w:p>
+        </w:tc>
+        <w:tc>
+          <w:tcPr>
+            <w:tcW w:w="2000" w:type="dxa"/>
+          </w:tcPr>
+          <w:p>
+            <w:pPr>
+              <w:jc w:val="center"/>
+            </w:pPr>
+            <w:r>
+              <w:rPr>
+                <w:b/>
+              </w:rPr>
+              <w:t xml:space="preserve">Data Type</w:t>
+            </w:r>
+          </w:p>
+        </w:tc>
+        <w:tc>
+          <w:tcPr>
+            <w:tcW w:w="2000" w:type="dxa"/>
+          </w:tcPr>
+          <w:p>
+            <w:pPr>
+              <w:jc w:val="center"/>
+            </w:pPr>
+            <w:r>
+              <w:rPr>
+                <w:b/>
+              </w:rPr>
+              <w:t xml:space="preserve">Size</w:t>
+            </w:r>
+          </w:p>
+        </w:tc>
+        <w:tc>
+          <w:tcPr>
+            <w:tcW w:w="2000" w:type="dxa"/>
+          </w:tcPr>
+          <w:p>
+            <w:pPr>
+              <w:jc w:val="center"/>
+            </w:pPr>
+            <w:r>
+              <w:rPr>
+                <w:b/>
+              </w:rPr>
+              <w:t xml:space="preserve">PK/FK/IS NULL/ NOT NULL</w:t>
+            </w:r>
+          </w:p>
+        </w:tc>
+      </w:tr>
+      <w:tr>
+        <w:trPr>
+          <w:trHeight w:val="530" w:hRule="atLeast"/>
+        </w:trPr>
+        <w:tc>
+          <w:tcPr>
+            <w:tcW w:w="2000" w:type="dxa"/>
+          </w:tcPr>
+          <w:p>
+            <w:pPr/>
+            <w:r>
+              <w:t xml:space="preserve">id</w:t>
+            </w:r>
+          </w:p>
+        </w:tc>
+        <w:tc>
+          <w:tcPr>
+            <w:tcW w:w="2000" w:type="dxa"/>
+          </w:tcPr>
+          <w:p>
+            <w:pPr/>
+            <w:r>
+              <w:t xml:space="preserve">bigint</w:t>
+            </w:r>
+          </w:p>
+        </w:tc>
+        <w:tc>
+          <w:tcPr>
+            <w:tcW w:w="2000" w:type="dxa"/>
+          </w:tcPr>
+          <w:p>
+            <w:pPr/>
+            <w:r>
+              <w:t xml:space="preserve">-</w:t>
+            </w:r>
+          </w:p>
+        </w:tc>
+        <w:tc>
+          <w:tcPr>
+            <w:tcW w:w="2000" w:type="dxa"/>
+          </w:tcPr>
+          <w:p>
+            <w:pPr/>
+            <w:r>
+              <w:t xml:space="preserve">PK, NOT NULL</w:t>
+            </w:r>
+          </w:p>
+        </w:tc>
+      </w:tr>
+      <w:tr>
+        <w:trPr>
+          <w:trHeight w:val="530" w:hRule="atLeast"/>
+        </w:trPr>
+        <w:tc>
+          <w:tcPr>
+            <w:tcW w:w="2000" w:type="dxa"/>
+          </w:tcPr>
+          <w:p>
+            <w:pPr/>
+            <w:r>
+              <w:t xml:space="preserve">tax_type</w:t>
+            </w:r>
+          </w:p>
+        </w:tc>
+        <w:tc>
+          <w:tcPr>
+            <w:tcW w:w="2000" w:type="dxa"/>
+          </w:tcPr>
+          <w:p>
+            <w:pPr/>
+            <w:r>
+              <w:t xml:space="preserve">varchar</w:t>
+            </w:r>
+          </w:p>
+        </w:tc>
+        <w:tc>
+          <w:tcPr>
+            <w:tcW w:w="2000" w:type="dxa"/>
+          </w:tcPr>
+          <w:p>
+            <w:pPr/>
+            <w:r>
+              <w:t xml:space="preserve">30</w:t>
+            </w:r>
+          </w:p>
+        </w:tc>
+        <w:tc>
+          <w:tcPr>
+            <w:tcW w:w="2000" w:type="dxa"/>
+          </w:tcPr>
+          <w:p>
+            <w:pPr/>
+            <w:r>
+              <w:t xml:space="preserve">NOT NULL</w:t>
+            </w:r>
+          </w:p>
+        </w:tc>
+      </w:tr>
+      <w:tr>
+        <w:trPr>
+          <w:trHeight w:val="530" w:hRule="atLeast"/>
+        </w:trPr>
+        <w:tc>
+          <w:tcPr>
+            <w:tcW w:w="2000" w:type="dxa"/>
+          </w:tcPr>
+          <w:p>
+            <w:pPr/>
+            <w:r>
+              <w:t xml:space="preserve">company_id</w:t>
+            </w:r>
+          </w:p>
+        </w:tc>
+        <w:tc>
+          <w:tcPr>
+            <w:tcW w:w="2000" w:type="dxa"/>
+          </w:tcPr>
+          <w:p>
+            <w:pPr/>
+            <w:r>
+              <w:t xml:space="preserve">bigint</w:t>
+            </w:r>
+          </w:p>
+        </w:tc>
+        <w:tc>
+          <w:tcPr>
+            <w:tcW w:w="2000" w:type="dxa"/>
+          </w:tcPr>
+          <w:p>
+            <w:pPr/>
+            <w:r>
+              <w:t xml:space="preserve">-</w:t>
+            </w:r>
+          </w:p>
+        </w:tc>
+        <w:tc>
+          <w:tcPr>
+            <w:tcW w:w="2000" w:type="dxa"/>
+          </w:tcPr>
+          <w:p>
+            <w:pPr/>
+            <w:r>
+              <w:t xml:space="preserve">NOT NULL</w:t>
+            </w:r>
+          </w:p>
+        </w:tc>
+      </w:tr>
+      <w:tr>
+        <w:trPr>
+          <w:trHeight w:val="530" w:hRule="atLeast"/>
+        </w:trPr>
+        <w:tc>
+          <w:tcPr>
+            <w:tcW w:w="2000" w:type="dxa"/>
+          </w:tcPr>
+          <w:p>
+            <w:pPr/>
+            <w:r>
+              <w:t xml:space="preserve">created_at</w:t>
+            </w:r>
+          </w:p>
+        </w:tc>
+        <w:tc>
+          <w:tcPr>
+            <w:tcW w:w="2000" w:type="dxa"/>
+          </w:tcPr>
+          <w:p>
+            <w:pPr/>
+            <w:r>
+              <w:t xml:space="preserve">datetime2</w:t>
+            </w:r>
+          </w:p>
+        </w:tc>
+        <w:tc>
+          <w:tcPr>
+            <w:tcW w:w="2000" w:type="dxa"/>
+          </w:tcPr>
+          <w:p>
+            <w:pPr/>
+            <w:r>
+              <w:t xml:space="preserve">(6)</w:t>
+            </w:r>
+          </w:p>
+        </w:tc>
+        <w:tc>
+          <w:tcPr>
+            <w:tcW w:w="2000" w:type="dxa"/>
+          </w:tcPr>
+          <w:p>
+            <w:pPr/>
+            <w:r>
+              <w:t xml:space="preserve">NOT NULL</w:t>
+            </w:r>
+          </w:p>
+        </w:tc>
+      </w:tr>
+      <w:tr>
+        <w:trPr>
+          <w:trHeight w:val="530" w:hRule="atLeast"/>
+        </w:trPr>
+        <w:tc>
+          <w:tcPr>
+            <w:tcW w:w="2000" w:type="dxa"/>
+          </w:tcPr>
+          <w:p>
+            <w:pPr/>
+            <w:r>
+              <w:t xml:space="preserve">created_by</w:t>
+            </w:r>
+          </w:p>
+        </w:tc>
+        <w:tc>
+          <w:tcPr>
+            <w:tcW w:w="2000" w:type="dxa"/>
+          </w:tcPr>
+          <w:p>
+            <w:pPr/>
+            <w:r>
+              <w:t xml:space="preserve">bigint</w:t>
+            </w:r>
+          </w:p>
+        </w:tc>
+        <w:tc>
+          <w:tcPr>
+            <w:tcW w:w="2000" w:type="dxa"/>
+          </w:tcPr>
+          <w:p>
+            <w:pPr/>
+            <w:r>
+              <w:t xml:space="preserve">-</w:t>
+            </w:r>
+          </w:p>
+        </w:tc>
+        <w:tc>
+          <w:tcPr>
+            <w:tcW w:w="2000" w:type="dxa"/>
+          </w:tcPr>
+          <w:p>
+            <w:pPr/>
+            <w:r>
+              <w:t xml:space="preserve">NOT NULL</w:t>
+            </w:r>
+          </w:p>
+        </w:tc>
+      </w:tr>
+      <w:tr>
+        <w:trPr>
+          <w:trHeight w:val="530" w:hRule="atLeast"/>
+        </w:trPr>
+        <w:tc>
+          <w:tcPr>
+            <w:tcW w:w="2000" w:type="dxa"/>
+          </w:tcPr>
+          <w:p>
+            <w:pPr/>
+            <w:r>
+              <w:t xml:space="preserve">updated_at</w:t>
+            </w:r>
+          </w:p>
+        </w:tc>
+        <w:tc>
+          <w:tcPr>
+            <w:tcW w:w="2000" w:type="dxa"/>
+          </w:tcPr>
+          <w:p>
+            <w:pPr/>
+            <w:r>
+              <w:t xml:space="preserve">datetime2</w:t>
+            </w:r>
+          </w:p>
+        </w:tc>
+        <w:tc>
+          <w:tcPr>
+            <w:tcW w:w="2000" w:type="dxa"/>
+          </w:tcPr>
+          <w:p>
+            <w:pPr/>
+            <w:r>
+              <w:t xml:space="preserve">(6)</w:t>
+            </w:r>
+          </w:p>
+        </w:tc>
+        <w:tc>
+          <w:tcPr>
+            <w:tcW w:w="2000" w:type="dxa"/>
+          </w:tcPr>
+          <w:p>
+            <w:pPr/>
+            <w:r>
+              <w:t xml:space="preserve">IS NULL</w:t>
+            </w:r>
+          </w:p>
+        </w:tc>
+      </w:tr>
+      <w:tr>
+        <w:trPr>
+          <w:trHeight w:val="530" w:hRule="atLeast"/>
+        </w:trPr>
+        <w:tc>
+          <w:tcPr>
+            <w:tcW w:w="2000" w:type="dxa"/>
+          </w:tcPr>
+          <w:p>
+            <w:pPr/>
+            <w:r>
+              <w:t xml:space="preserve">updated_by</w:t>
+            </w:r>
+          </w:p>
+        </w:tc>
+        <w:tc>
+          <w:tcPr>
+            <w:tcW w:w="2000" w:type="dxa"/>
+          </w:tcPr>
+          <w:p>
+            <w:pPr/>
+            <w:r>
+              <w:t xml:space="preserve">bigint</w:t>
+            </w:r>
+          </w:p>
+        </w:tc>
+        <w:tc>
+          <w:tcPr>
+            <w:tcW w:w="2000" w:type="dxa"/>
+          </w:tcPr>
+          <w:p>
+            <w:pPr/>
+            <w:r>
+              <w:t xml:space="preserve">-</w:t>
+            </w:r>
+          </w:p>
+        </w:tc>
+        <w:tc>
+          <w:tcPr>
+            <w:tcW w:w="2000" w:type="dxa"/>
+          </w:tcPr>
+          <w:p>
+            <w:pPr/>
+            <w:r>
+              <w:t xml:space="preserve">IS NULL</w:t>
+            </w:r>
+          </w:p>
+        </w:tc>
+      </w:tr>
+      <w:tr>
+        <w:trPr>
+          <w:trHeight w:val="530" w:hRule="atLeast"/>
+        </w:trPr>
+        <w:tc>
+          <w:tcPr>
+            <w:tcW w:w="2000" w:type="dxa"/>
+          </w:tcPr>
+          <w:p>
+            <w:pPr/>
+            <w:r>
+              <w:t xml:space="preserve">version</w:t>
+            </w:r>
+          </w:p>
+        </w:tc>
+        <w:tc>
+          <w:tcPr>
+            <w:tcW w:w="2000" w:type="dxa"/>
+          </w:tcPr>
+          <w:p>
+            <w:pPr/>
+            <w:r>
+              <w:t xml:space="preserve">int</w:t>
+            </w:r>
+          </w:p>
+        </w:tc>
+        <w:tc>
+          <w:tcPr>
+            <w:tcW w:w="2000" w:type="dxa"/>
+          </w:tcPr>
+          <w:p>
+            <w:pPr/>
+            <w:r>
+              <w:t xml:space="preserve">-</w:t>
+            </w:r>
+          </w:p>
+        </w:tc>
+        <w:tc>
+          <w:tcPr>
+            <w:tcW w:w="2000" w:type="dxa"/>
+          </w:tcPr>
+          <w:p>
+            <w:pPr/>
+            <w:r>
+              <w:t xml:space="preserve">NOT NULL</w:t>
+            </w:r>
+          </w:p>
+        </w:tc>
+      </w:tr>
+      <w:tr>
+        <w:trPr>
+          <w:trHeight w:val="530" w:hRule="atLeast"/>
+        </w:trPr>
+        <w:tc>
+          <w:tcPr>
+            <w:tcW w:w="2000" w:type="dxa"/>
+          </w:tcPr>
+          <w:p>
+            <w:pPr/>
+            <w:r>
+              <w:t xml:space="preserve">is_active</w:t>
+            </w:r>
+          </w:p>
+        </w:tc>
+        <w:tc>
+          <w:tcPr>
+            <w:tcW w:w="2000" w:type="dxa"/>
+          </w:tcPr>
+          <w:p>
+            <w:pPr/>
+            <w:r>
+              <w:t xml:space="preserve">bit</w:t>
+            </w:r>
+          </w:p>
+        </w:tc>
+        <w:tc>
+          <w:tcPr>
+            <w:tcW w:w="2000" w:type="dxa"/>
+          </w:tcPr>
+          <w:p>
+            <w:pPr/>
+            <w:r>
+              <w:t xml:space="preserve">-</w:t>
+            </w:r>
+          </w:p>
+        </w:tc>
+        <w:tc>
+          <w:tcPr>
+            <w:tcW w:w="2000" w:type="dxa"/>
+          </w:tcPr>
+          <w:p>
+            <w:pPr/>
+            <w:r>
+              <w:t xml:space="preserve">NOT NULL</w:t>
+            </w:r>
+          </w:p>
+        </w:tc>
+      </w:tr>
+      <w:tr>
+        <w:trPr>
+          <w:trHeight w:val="530" w:hRule="atLeast"/>
+        </w:trPr>
+        <w:tc>
+          <w:tcPr>
+            <w:tcW w:w="2000" w:type="dxa"/>
+          </w:tcPr>
+          <w:p>
+            <w:pPr/>
+            <w:r>
+              <w:t xml:space="preserve">is_deleted</w:t>
+            </w:r>
+          </w:p>
+        </w:tc>
+        <w:tc>
+          <w:tcPr>
+            <w:tcW w:w="2000" w:type="dxa"/>
+          </w:tcPr>
+          <w:p>
+            <w:pPr/>
+            <w:r>
+              <w:t xml:space="preserve">bit</w:t>
+            </w:r>
+          </w:p>
+        </w:tc>
+        <w:tc>
+          <w:tcPr>
+            <w:tcW w:w="2000" w:type="dxa"/>
+          </w:tcPr>
+          <w:p>
+            <w:pPr/>
+            <w:r>
+              <w:t xml:space="preserve">-</w:t>
+            </w:r>
+          </w:p>
+        </w:tc>
+        <w:tc>
+          <w:tcPr>
+            <w:tcW w:w="2000" w:type="dxa"/>
+          </w:tcPr>
+          <w:p>
+            <w:pPr/>
+            <w:r>
+              <w:t xml:space="preserve">NOT NULL</w:t>
+            </w:r>
+          </w:p>
+        </w:tc>
+      </w:tr>
+      <w:tr>
+        <w:trPr>
+          <w:trHeight w:val="530" w:hRule="atLeast"/>
+        </w:trPr>
+        <w:tc>
+          <w:tcPr>
+            <w:tcW w:w="2000" w:type="dxa"/>
+          </w:tcPr>
+          <w:p>
+            <w:pPr/>
+            <w:r>
+              <w:t xml:space="preserve">code</w:t>
+            </w:r>
+          </w:p>
+        </w:tc>
+        <w:tc>
+          <w:tcPr>
+            <w:tcW w:w="2000" w:type="dxa"/>
+          </w:tcPr>
+          <w:p>
+            <w:pPr/>
+            <w:r>
+              <w:t xml:space="preserve">varchar</w:t>
+            </w:r>
+          </w:p>
+        </w:tc>
+        <w:tc>
+          <w:tcPr>
+            <w:tcW w:w="2000" w:type="dxa"/>
+          </w:tcPr>
+          <w:p>
+            <w:pPr/>
+            <w:r>
+              <w:t xml:space="preserve">30</w:t>
+            </w:r>
+          </w:p>
+        </w:tc>
+        <w:tc>
+          <w:tcPr>
+            <w:tcW w:w="2000" w:type="dxa"/>
+          </w:tcPr>
+          <w:p>
+            <w:pPr/>
+            <w:r>
+              <w:t xml:space="preserve">NOT NULL</w:t>
+            </w:r>
+          </w:p>
+        </w:tc>
+      </w:tr>
+      <w:tr>
+        <w:trPr>
+          <w:trHeight w:val="530" w:hRule="atLeast"/>
+        </w:trPr>
+        <w:tc>
+          <w:tcPr>
+            <w:tcW w:w="2000" w:type="dxa"/>
+          </w:tcPr>
+          <w:p>
+            <w:pPr/>
+            <w:r>
+              <w:t xml:space="preserve">name</w:t>
+            </w:r>
+          </w:p>
+        </w:tc>
+        <w:tc>
+          <w:tcPr>
+            <w:tcW w:w="2000" w:type="dxa"/>
+          </w:tcPr>
+          <w:p>
+            <w:pPr/>
+            <w:r>
+              <w:t xml:space="preserve">nvarchar</w:t>
+            </w:r>
+          </w:p>
+        </w:tc>
+        <w:tc>
+          <w:tcPr>
+            <w:tcW w:w="2000" w:type="dxa"/>
+          </w:tcPr>
+          <w:p>
+            <w:pPr/>
+            <w:r>
+              <w:t xml:space="preserve">200</w:t>
+            </w:r>
+          </w:p>
+        </w:tc>
+        <w:tc>
+          <w:tcPr>
+            <w:tcW w:w="2000" w:type="dxa"/>
+          </w:tcPr>
+          <w:p>
+            <w:pPr/>
+            <w:r>
+              <w:t xml:space="preserve">NOT NULL</w:t>
+            </w:r>
+          </w:p>
+        </w:tc>
+      </w:tr>
+      <w:tr>
+        <w:trPr>
+          <w:trHeight w:val="530" w:hRule="atLeast"/>
+        </w:trPr>
+        <w:tc>
+          <w:tcPr>
+            <w:tcW w:w="2000" w:type="dxa"/>
+          </w:tcPr>
+          <w:p>
+            <w:pPr/>
+            <w:r>
+              <w:t xml:space="preserve">custom_fields</w:t>
+            </w:r>
+          </w:p>
+        </w:tc>
+        <w:tc>
+          <w:tcPr>
+            <w:tcW w:w="2000" w:type="dxa"/>
+          </w:tcPr>
+          <w:p>
+            <w:pPr/>
+            <w:r>
+              <w:t xml:space="preserve">nvarchar</w:t>
+            </w:r>
+          </w:p>
+        </w:tc>
+        <w:tc>
+          <w:tcPr>
+            <w:tcW w:w="2000" w:type="dxa"/>
+          </w:tcPr>
+          <w:p>
+            <w:pPr/>
+            <w:r>
+              <w:t xml:space="preserve">MAX</w:t>
+            </w:r>
+          </w:p>
+        </w:tc>
+        <w:tc>
+          <w:tcPr>
+            <w:tcW w:w="2000" w:type="dxa"/>
+          </w:tcPr>
+          <w:p>
+            <w:pPr/>
+            <w:r>
+              <w:t xml:space="preserve">IS NULL</w:t>
+            </w:r>
+          </w:p>
+        </w:tc>
+      </w:tr>
+    </w:tbl>
+    <w:p/>
+    <w:p>
+      <w:pPr/>
+      <w:r>
+        <w:t xml:space="preserve">Table Name: md_tax_rate</w:t>
+      </w:r>
+    </w:p>
+    <w:p>
+      <w:pPr/>
+      <w:r>
+        <w:t xml:space="preserve">Primary Key: id</w:t>
+      </w:r>
+    </w:p>
+    <w:p>
+      <w:pPr/>
+      <w:r>
+        <w:t xml:space="preserve">This table stores the effective periods and percentages of tax codes.</w:t>
+      </w:r>
+    </w:p>
+    <w:tbl>
+      <w:tblPr>
+        <w:tblStyle w:val="TableGrid"/>
+        <w:tblW w:w="8000" w:type="dxa"/>
+        <w:jc w:val="left"/>
+        <w:tblBorders>
+          <w:top w:val="single" w:color="000000" w:sz="4" w:space="0"/>
+          <w:left w:val="single" w:color="000000" w:sz="4" w:space="0"/>
+          <w:bottom w:val="single" w:color="000000" w:sz="4" w:space="0"/>
+          <w:right w:val="single" w:color="000000" w:sz="4" w:space="0"/>
+          <w:insideH w:val="single" w:color="000000" w:sz="4" w:space="0"/>
+          <w:insideV w:val="single" w:color="000000" w:sz="4" w:space="0"/>
+        </w:tblBorders>
+        <w:tblLayout w:type="fixed"/>
+        <w:tblCellMar>
+          <w:top w:w="100" w:type="dxa"/>
+          <w:left w:w="100" w:type="dxa"/>
+          <w:bottom w:w="100" w:type="dxa"/>
+          <w:right w:w="100" w:type="dxa"/>
+        </w:tblCellMar>
+      </w:tblPr>
+      <w:tblGrid>
+        <w:gridCol w:w="2000"/>
+        <w:gridCol w:w="2000"/>
+        <w:gridCol w:w="2000"/>
+        <w:gridCol w:w="2000"/>
+      </w:tblGrid>
+      <w:tr>
+        <w:trPr>
+          <w:trHeight w:val="530" w:hRule="atLeast"/>
+        </w:trPr>
+        <w:tc>
+          <w:tcPr>
+            <w:tcW w:w="2000" w:type="dxa"/>
+          </w:tcPr>
+          <w:p>
+            <w:pPr>
+              <w:jc w:val="center"/>
+            </w:pPr>
+            <w:r>
+              <w:rPr>
+                <w:b/>
+              </w:rPr>
+              <w:t xml:space="preserve">Name of Attribute</w:t>
+            </w:r>
+          </w:p>
+        </w:tc>
+        <w:tc>
+          <w:tcPr>
+            <w:tcW w:w="2000" w:type="dxa"/>
+          </w:tcPr>
+          <w:p>
+            <w:pPr>
+              <w:jc w:val="center"/>
+            </w:pPr>
+            <w:r>
+              <w:rPr>
+                <w:b/>
+              </w:rPr>
+              <w:t xml:space="preserve">Data Type</w:t>
+            </w:r>
+          </w:p>
+        </w:tc>
+        <w:tc>
+          <w:tcPr>
+            <w:tcW w:w="2000" w:type="dxa"/>
+          </w:tcPr>
+          <w:p>
+            <w:pPr>
+              <w:jc w:val="center"/>
+            </w:pPr>
+            <w:r>
+              <w:rPr>
+                <w:b/>
+              </w:rPr>
+              <w:t xml:space="preserve">Size</w:t>
+            </w:r>
+          </w:p>
+        </w:tc>
+        <w:tc>
+          <w:tcPr>
+            <w:tcW w:w="2000" w:type="dxa"/>
+          </w:tcPr>
+          <w:p>
+            <w:pPr>
+              <w:jc w:val="center"/>
+            </w:pPr>
+            <w:r>
+              <w:rPr>
+                <w:b/>
+              </w:rPr>
+              <w:t xml:space="preserve">PK/FK/IS NULL/ NOT NULL</w:t>
+            </w:r>
+          </w:p>
+        </w:tc>
+      </w:tr>
+      <w:tr>
+        <w:trPr>
+          <w:trHeight w:val="530" w:hRule="atLeast"/>
+        </w:trPr>
+        <w:tc>
+          <w:tcPr>
+            <w:tcW w:w="2000" w:type="dxa"/>
+          </w:tcPr>
+          <w:p>
+            <w:pPr/>
+            <w:r>
+              <w:t xml:space="preserve">id</w:t>
+            </w:r>
+          </w:p>
+        </w:tc>
+        <w:tc>
+          <w:tcPr>
+            <w:tcW w:w="2000" w:type="dxa"/>
+          </w:tcPr>
+          <w:p>
+            <w:pPr/>
+            <w:r>
+              <w:t xml:space="preserve">bigint</w:t>
+            </w:r>
+          </w:p>
+        </w:tc>
+        <w:tc>
+          <w:tcPr>
+            <w:tcW w:w="2000" w:type="dxa"/>
+          </w:tcPr>
+          <w:p>
+            <w:pPr/>
+            <w:r>
+              <w:t xml:space="preserve">-</w:t>
+            </w:r>
+          </w:p>
+        </w:tc>
+        <w:tc>
+          <w:tcPr>
+            <w:tcW w:w="2000" w:type="dxa"/>
+          </w:tcPr>
+          <w:p>
+            <w:pPr/>
+            <w:r>
+              <w:t xml:space="preserve">PK, NOT NULL</w:t>
+            </w:r>
+          </w:p>
+        </w:tc>
+      </w:tr>
+      <w:tr>
+        <w:trPr>
+          <w:trHeight w:val="530" w:hRule="atLeast"/>
+        </w:trPr>
+        <w:tc>
+          <w:tcPr>
+            <w:tcW w:w="2000" w:type="dxa"/>
+          </w:tcPr>
+          <w:p>
+            <w:pPr/>
+            <w:r>
+              <w:t xml:space="preserve">tax_code_id</w:t>
+            </w:r>
+          </w:p>
+        </w:tc>
+        <w:tc>
+          <w:tcPr>
+            <w:tcW w:w="2000" w:type="dxa"/>
+          </w:tcPr>
+          <w:p>
+            <w:pPr/>
+            <w:r>
+              <w:t xml:space="preserve">bigint</w:t>
+            </w:r>
+          </w:p>
+        </w:tc>
+        <w:tc>
+          <w:tcPr>
+            <w:tcW w:w="2000" w:type="dxa"/>
+          </w:tcPr>
+          <w:p>
+            <w:pPr/>
+            <w:r>
+              <w:t xml:space="preserve">-</w:t>
+            </w:r>
+          </w:p>
+        </w:tc>
+        <w:tc>
+          <w:tcPr>
+            <w:tcW w:w="2000" w:type="dxa"/>
+          </w:tcPr>
+          <w:p>
+            <w:pPr/>
+            <w:r>
+              <w:t xml:space="preserve">FK, NOT NULL</w:t>
+            </w:r>
+          </w:p>
+        </w:tc>
+      </w:tr>
+      <w:tr>
+        <w:trPr>
+          <w:trHeight w:val="530" w:hRule="atLeast"/>
+        </w:trPr>
+        <w:tc>
+          <w:tcPr>
+            <w:tcW w:w="2000" w:type="dxa"/>
+          </w:tcPr>
+          <w:p>
+            <w:pPr/>
+            <w:r>
+              <w:t xml:space="preserve">effective_from</w:t>
+            </w:r>
+          </w:p>
+        </w:tc>
+        <w:tc>
+          <w:tcPr>
+            <w:tcW w:w="2000" w:type="dxa"/>
+          </w:tcPr>
+          <w:p>
+            <w:pPr/>
+            <w:r>
+              <w:t xml:space="preserve">date</w:t>
+            </w:r>
+          </w:p>
+        </w:tc>
+        <w:tc>
+          <w:tcPr>
+            <w:tcW w:w="2000" w:type="dxa"/>
+          </w:tcPr>
+          <w:p>
+            <w:pPr/>
+            <w:r>
+              <w:t xml:space="preserve">-</w:t>
+            </w:r>
+          </w:p>
+        </w:tc>
+        <w:tc>
+          <w:tcPr>
+            <w:tcW w:w="2000" w:type="dxa"/>
+          </w:tcPr>
+          <w:p>
+            <w:pPr/>
+            <w:r>
+              <w:t xml:space="preserve">NOT NULL</w:t>
+            </w:r>
+          </w:p>
+        </w:tc>
+      </w:tr>
+      <w:tr>
+        <w:trPr>
+          <w:trHeight w:val="530" w:hRule="atLeast"/>
+        </w:trPr>
+        <w:tc>
+          <w:tcPr>
+            <w:tcW w:w="2000" w:type="dxa"/>
+          </w:tcPr>
+          <w:p>
+            <w:pPr/>
+            <w:r>
+              <w:t xml:space="preserve">effective_to</w:t>
+            </w:r>
+          </w:p>
+        </w:tc>
+        <w:tc>
+          <w:tcPr>
+            <w:tcW w:w="2000" w:type="dxa"/>
+          </w:tcPr>
+          <w:p>
+            <w:pPr/>
+            <w:r>
+              <w:t xml:space="preserve">date</w:t>
+            </w:r>
+          </w:p>
+        </w:tc>
+        <w:tc>
+          <w:tcPr>
+            <w:tcW w:w="2000" w:type="dxa"/>
+          </w:tcPr>
+          <w:p>
+            <w:pPr/>
+            <w:r>
+              <w:t xml:space="preserve">-</w:t>
+            </w:r>
+          </w:p>
+        </w:tc>
+        <w:tc>
+          <w:tcPr>
+            <w:tcW w:w="2000" w:type="dxa"/>
+          </w:tcPr>
+          <w:p>
+            <w:pPr/>
+            <w:r>
+              <w:t xml:space="preserve">IS NULL</w:t>
+            </w:r>
+          </w:p>
+        </w:tc>
+      </w:tr>
+      <w:tr>
+        <w:trPr>
+          <w:trHeight w:val="530" w:hRule="atLeast"/>
+        </w:trPr>
+        <w:tc>
+          <w:tcPr>
+            <w:tcW w:w="2000" w:type="dxa"/>
+          </w:tcPr>
+          <w:p>
+            <w:pPr/>
+            <w:r>
+              <w:t xml:space="preserve">rate_percent</w:t>
+            </w:r>
+          </w:p>
+        </w:tc>
+        <w:tc>
+          <w:tcPr>
+            <w:tcW w:w="2000" w:type="dxa"/>
+          </w:tcPr>
+          <w:p>
+            <w:pPr/>
+            <w:r>
+              <w:t xml:space="preserve">decimal</w:t>
+            </w:r>
+          </w:p>
+        </w:tc>
+        <w:tc>
+          <w:tcPr>
+            <w:tcW w:w="2000" w:type="dxa"/>
+          </w:tcPr>
+          <w:p>
+            <w:pPr/>
+            <w:r>
+              <w:t xml:space="preserve">(7,4)</w:t>
+            </w:r>
+          </w:p>
+        </w:tc>
+        <w:tc>
+          <w:tcPr>
+            <w:tcW w:w="2000" w:type="dxa"/>
+          </w:tcPr>
+          <w:p>
+            <w:pPr/>
+            <w:r>
+              <w:t xml:space="preserve">NOT NULL</w:t>
+            </w:r>
+          </w:p>
+        </w:tc>
+      </w:tr>
+      <w:tr>
+        <w:trPr>
+          <w:trHeight w:val="530" w:hRule="atLeast"/>
+        </w:trPr>
+        <w:tc>
+          <w:tcPr>
+            <w:tcW w:w="2000" w:type="dxa"/>
+          </w:tcPr>
+          <w:p>
+            <w:pPr/>
+            <w:r>
+              <w:t xml:space="preserve">is_deleted</w:t>
+            </w:r>
+          </w:p>
+        </w:tc>
+        <w:tc>
+          <w:tcPr>
+            <w:tcW w:w="2000" w:type="dxa"/>
+          </w:tcPr>
+          <w:p>
+            <w:pPr/>
+            <w:r>
+              <w:t xml:space="preserve">bit</w:t>
+            </w:r>
+          </w:p>
+        </w:tc>
+        <w:tc>
+          <w:tcPr>
+            <w:tcW w:w="2000" w:type="dxa"/>
+          </w:tcPr>
+          <w:p>
+            <w:pPr/>
+            <w:r>
+              <w:t xml:space="preserve">-</w:t>
+            </w:r>
+          </w:p>
+        </w:tc>
+        <w:tc>
+          <w:tcPr>
+            <w:tcW w:w="2000" w:type="dxa"/>
+          </w:tcPr>
+          <w:p>
+            <w:pPr/>
+            <w:r>
+              <w:t xml:space="preserve">NOT NULL</w:t>
+            </w:r>
+          </w:p>
+        </w:tc>
+      </w:tr>
+      <w:tr>
+        <w:trPr>
+          <w:trHeight w:val="530" w:hRule="atLeast"/>
+        </w:trPr>
+        <w:tc>
+          <w:tcPr>
+            <w:tcW w:w="2000" w:type="dxa"/>
+          </w:tcPr>
+          <w:p>
+            <w:pPr/>
+            <w:r>
+              <w:t xml:space="preserve">company_id</w:t>
+            </w:r>
+          </w:p>
+        </w:tc>
+        <w:tc>
+          <w:tcPr>
+            <w:tcW w:w="2000" w:type="dxa"/>
+          </w:tcPr>
+          <w:p>
+            <w:pPr/>
+            <w:r>
+              <w:t xml:space="preserve">bigint</w:t>
+            </w:r>
+          </w:p>
+        </w:tc>
+        <w:tc>
+          <w:tcPr>
+            <w:tcW w:w="2000" w:type="dxa"/>
+          </w:tcPr>
+          <w:p>
+            <w:pPr/>
+            <w:r>
+              <w:t xml:space="preserve">-</w:t>
+            </w:r>
+          </w:p>
+        </w:tc>
+        <w:tc>
+          <w:tcPr>
+            <w:tcW w:w="2000" w:type="dxa"/>
+          </w:tcPr>
+          <w:p>
+            <w:pPr/>
+            <w:r>
+              <w:t xml:space="preserve">FK, NOT NULL</w:t>
+            </w:r>
+          </w:p>
+        </w:tc>
+      </w:tr>
+      <w:tr>
+        <w:trPr>
+          <w:trHeight w:val="530" w:hRule="atLeast"/>
+        </w:trPr>
+        <w:tc>
+          <w:tcPr>
+            <w:tcW w:w="2000" w:type="dxa"/>
+          </w:tcPr>
+          <w:p>
+            <w:pPr/>
+            <w:r>
+              <w:t xml:space="preserve">created_at</w:t>
+            </w:r>
+          </w:p>
+        </w:tc>
+        <w:tc>
+          <w:tcPr>
+            <w:tcW w:w="2000" w:type="dxa"/>
+          </w:tcPr>
+          <w:p>
+            <w:pPr/>
+            <w:r>
+              <w:t xml:space="preserve">datetime2</w:t>
+            </w:r>
+          </w:p>
+        </w:tc>
+        <w:tc>
+          <w:tcPr>
+            <w:tcW w:w="2000" w:type="dxa"/>
+          </w:tcPr>
+          <w:p>
+            <w:pPr/>
+            <w:r>
+              <w:t xml:space="preserve">(6)</w:t>
+            </w:r>
+          </w:p>
+        </w:tc>
+        <w:tc>
+          <w:tcPr>
+            <w:tcW w:w="2000" w:type="dxa"/>
+          </w:tcPr>
+          <w:p>
+            <w:pPr/>
+            <w:r>
+              <w:t xml:space="preserve">NOT NULL</w:t>
+            </w:r>
+          </w:p>
+        </w:tc>
+      </w:tr>
+      <w:tr>
+        <w:trPr>
+          <w:trHeight w:val="530" w:hRule="atLeast"/>
+        </w:trPr>
+        <w:tc>
+          <w:tcPr>
+            <w:tcW w:w="2000" w:type="dxa"/>
+          </w:tcPr>
+          <w:p>
+            <w:pPr/>
+            <w:r>
+              <w:t xml:space="preserve">created_by</w:t>
+            </w:r>
+          </w:p>
+        </w:tc>
+        <w:tc>
+          <w:tcPr>
+            <w:tcW w:w="2000" w:type="dxa"/>
+          </w:tcPr>
+          <w:p>
+            <w:pPr/>
+            <w:r>
+              <w:t xml:space="preserve">bigint</w:t>
+            </w:r>
+          </w:p>
+        </w:tc>
+        <w:tc>
+          <w:tcPr>
+            <w:tcW w:w="2000" w:type="dxa"/>
+          </w:tcPr>
+          <w:p>
+            <w:pPr/>
+            <w:r>
+              <w:t xml:space="preserve">-</w:t>
+            </w:r>
+          </w:p>
+        </w:tc>
+        <w:tc>
+          <w:tcPr>
+            <w:tcW w:w="2000" w:type="dxa"/>
+          </w:tcPr>
+          <w:p>
+            <w:pPr/>
+            <w:r>
+              <w:t xml:space="preserve">NOT NULL</w:t>
+            </w:r>
+          </w:p>
+        </w:tc>
+      </w:tr>
+      <w:tr>
+        <w:trPr>
+          <w:trHeight w:val="530" w:hRule="atLeast"/>
+        </w:trPr>
+        <w:tc>
+          <w:tcPr>
+            <w:tcW w:w="2000" w:type="dxa"/>
+          </w:tcPr>
+          <w:p>
+            <w:pPr/>
+            <w:r>
+              <w:t xml:space="preserve">updated_at</w:t>
+            </w:r>
+          </w:p>
+        </w:tc>
+        <w:tc>
+          <w:tcPr>
+            <w:tcW w:w="2000" w:type="dxa"/>
+          </w:tcPr>
+          <w:p>
+            <w:pPr/>
+            <w:r>
+              <w:t xml:space="preserve">datetime2</w:t>
+            </w:r>
+          </w:p>
+        </w:tc>
+        <w:tc>
+          <w:tcPr>
+            <w:tcW w:w="2000" w:type="dxa"/>
+          </w:tcPr>
+          <w:p>
+            <w:pPr/>
+            <w:r>
+              <w:t xml:space="preserve">(6)</w:t>
+            </w:r>
+          </w:p>
+        </w:tc>
+        <w:tc>
+          <w:tcPr>
+            <w:tcW w:w="2000" w:type="dxa"/>
+          </w:tcPr>
+          <w:p>
+            <w:pPr/>
+            <w:r>
+              <w:t xml:space="preserve">IS NULL</w:t>
+            </w:r>
+          </w:p>
+        </w:tc>
+      </w:tr>
+      <w:tr>
+        <w:trPr>
+          <w:trHeight w:val="530" w:hRule="atLeast"/>
+        </w:trPr>
+        <w:tc>
+          <w:tcPr>
+            <w:tcW w:w="2000" w:type="dxa"/>
+          </w:tcPr>
+          <w:p>
+            <w:pPr/>
+            <w:r>
+              <w:t xml:space="preserve">updated_by</w:t>
+            </w:r>
+          </w:p>
+        </w:tc>
+        <w:tc>
+          <w:tcPr>
+            <w:tcW w:w="2000" w:type="dxa"/>
+          </w:tcPr>
+          <w:p>
+            <w:pPr/>
+            <w:r>
+              <w:t xml:space="preserve">bigint</w:t>
+            </w:r>
+          </w:p>
+        </w:tc>
+        <w:tc>
+          <w:tcPr>
+            <w:tcW w:w="2000" w:type="dxa"/>
+          </w:tcPr>
+          <w:p>
+            <w:pPr/>
+            <w:r>
+              <w:t xml:space="preserve">-</w:t>
+            </w:r>
+          </w:p>
+        </w:tc>
+        <w:tc>
+          <w:tcPr>
+            <w:tcW w:w="2000" w:type="dxa"/>
+          </w:tcPr>
+          <w:p>
+            <w:pPr/>
+            <w:r>
+              <w:t xml:space="preserve">IS NULL</w:t>
+            </w:r>
+          </w:p>
+        </w:tc>
+      </w:tr>
+      <w:tr>
+        <w:trPr>
+          <w:trHeight w:val="530" w:hRule="atLeast"/>
+        </w:trPr>
+        <w:tc>
+          <w:tcPr>
+            <w:tcW w:w="2000" w:type="dxa"/>
+          </w:tcPr>
+          <w:p>
+            <w:pPr/>
+            <w:r>
+              <w:t xml:space="preserve">version</w:t>
+            </w:r>
+          </w:p>
+        </w:tc>
+        <w:tc>
+          <w:tcPr>
+            <w:tcW w:w="2000" w:type="dxa"/>
+          </w:tcPr>
+          <w:p>
+            <w:pPr/>
+            <w:r>
+              <w:t xml:space="preserve">int</w:t>
+            </w:r>
+          </w:p>
+        </w:tc>
+        <w:tc>
+          <w:tcPr>
+            <w:tcW w:w="2000" w:type="dxa"/>
+          </w:tcPr>
+          <w:p>
+            <w:pPr/>
+            <w:r>
+              <w:t xml:space="preserve">-</w:t>
+            </w:r>
+          </w:p>
+        </w:tc>
+        <w:tc>
+          <w:tcPr>
+            <w:tcW w:w="2000" w:type="dxa"/>
+          </w:tcPr>
+          <w:p>
+            <w:pPr/>
+            <w:r>
+              <w:t xml:space="preserve">NOT NULL</w:t>
             </w:r>
           </w:p>
         </w:tc>
@@ -26954,8 +28411,84 @@
         <w:t xml:space="preserve">[Pending] System screenshot of Exchange Rate Interface.</w:t>
       </w:r>
     </w:p>
+    <w:p>
+      <w:pPr>
+        <w:pStyle w:val="Heading5"/>
+      </w:pPr>
+      <w:r>
+        <w:t xml:space="preserve">4.2.1.8.83 Tax Code View Interface</w:t>
+      </w:r>
+    </w:p>
+    <w:p>
+      <w:pPr>
+        <w:jc w:val="center"/>
+      </w:pPr>
+      <w:r>
+        <w:rPr>
+          <w:i/>
+        </w:rPr>
+        <w:t xml:space="preserve">[Pending] System screenshot of Tax Code View Interface.</w:t>
+      </w:r>
+    </w:p>
+    <w:p>
+      <w:pPr>
+        <w:pStyle w:val="Heading5"/>
+      </w:pPr>
+      <w:r>
+        <w:t xml:space="preserve">4.2.1.8.84 Tax Code Edit Interface</w:t>
+      </w:r>
+    </w:p>
+    <w:p>
+      <w:pPr>
+        <w:jc w:val="center"/>
+      </w:pPr>
+      <w:r>
+        <w:rPr>
+          <w:i/>
+        </w:rPr>
+        <w:t xml:space="preserve">[Pending] System screenshot of Tax Code Edit Interface.</w:t>
+      </w:r>
+    </w:p>
+    <w:p>
+      <w:pPr>
+        <w:pStyle w:val="Heading5"/>
+      </w:pPr>
+      <w:r>
+        <w:t xml:space="preserve">4.2.1.8.85 Tax Rate Interface</w:t>
+      </w:r>
+    </w:p>
+    <w:p>
+      <w:pPr>
+        <w:jc w:val="center"/>
+      </w:pPr>
+      <w:r>
+        <w:rPr>
+          <w:i/>
+        </w:rPr>
+        <w:t xml:space="preserve">[Pending] System screenshot of Tax Rate Interface.</w:t>
+      </w:r>
+    </w:p>
+    <w:p>
+      <w:pPr>
+        <w:pStyle w:val="Heading5"/>
+      </w:pPr>
+      <w:r>
+        <w:t xml:space="preserve">4.2.1.8.86 Tax Calculation Interface</w:t>
+      </w:r>
+    </w:p>
+    <w:p>
+      <w:pPr>
+        <w:jc w:val="center"/>
+      </w:pPr>
+      <w:r>
+        <w:rPr>
+          <w:i/>
+        </w:rPr>
+        <w:t xml:space="preserve">[Pending] System screenshot of Tax Calculation Interface.</w:t>
+      </w:r>
+    </w:p>
     <w:sectPr>
-      <w:footerReference xmlns:r="http://schemas.openxmlformats.org/officeDocument/2006/relationships" w:type="default" r:id="R813e4f955b6747a5"/>
+      <w:footerReference xmlns:r="http://schemas.openxmlformats.org/officeDocument/2006/relationships" w:type="default" r:id="R3eee26cca1ec43f6"/>
       <w:pgSz w:w="11906" w:h="16838"/>
       <w:pgMar w:top="1440" w:right="1440" w:bottom="1440" w:left="1440" w:header="720" w:footer="720" w:gutter="0"/>
     </w:sectPr>

</xml_diff>

<commit_message>
feat(md): add multilingual chart of accounts page
- /md/accounts tree page (interfaces 8.87-8.88): add top-level account
  with type default direction, add subaccount with parent code prefix
  and inherited read-only type, edit name/direction/status, delete
- Generic tree helpers shared with item categories
- MD.ACCOUNT.* error codes in three languages; menu and route
- Vitest +11, Playwright +2; WU-MD-019 done

Co-Authored-By: Claude Opus 5.5 <noreply@anthropic.com>
</commit_message>
<xml_diff>
--- a/docs/99-output/MyERP_SDS.docx
+++ b/docs/99-output/MyERP_SDS.docx
@@ -610,6 +610,857 @@
         <w:t xml:space="preserve">Figure 4.1.1 Entity Relationship Diagram (Part 1)</w:t>
       </w:r>
     </w:p>
+    <w:p>
+      <w:pPr/>
+      <w:r>
+        <w:t xml:space="preserve">Table Name: md_account</w:t>
+      </w:r>
+    </w:p>
+    <w:p>
+      <w:pPr/>
+      <w:r>
+        <w:t xml:space="preserve">Primary Key: id</w:t>
+      </w:r>
+    </w:p>
+    <w:p>
+      <w:pPr/>
+      <w:r>
+        <w:t xml:space="preserve">This table stores the chart of accounts with parent accounts, account types and normal balance directions.</w:t>
+      </w:r>
+    </w:p>
+    <w:tbl>
+      <w:tblPr>
+        <w:tblStyle w:val="TableGrid"/>
+        <w:tblW w:w="8000" w:type="dxa"/>
+        <w:jc w:val="left"/>
+        <w:tblBorders>
+          <w:top w:val="single" w:color="000000" w:sz="4" w:space="0"/>
+          <w:left w:val="single" w:color="000000" w:sz="4" w:space="0"/>
+          <w:bottom w:val="single" w:color="000000" w:sz="4" w:space="0"/>
+          <w:right w:val="single" w:color="000000" w:sz="4" w:space="0"/>
+          <w:insideH w:val="single" w:color="000000" w:sz="4" w:space="0"/>
+          <w:insideV w:val="single" w:color="000000" w:sz="4" w:space="0"/>
+        </w:tblBorders>
+        <w:tblLayout w:type="fixed"/>
+        <w:tblCellMar>
+          <w:top w:w="100" w:type="dxa"/>
+          <w:left w:w="100" w:type="dxa"/>
+          <w:bottom w:w="100" w:type="dxa"/>
+          <w:right w:w="100" w:type="dxa"/>
+        </w:tblCellMar>
+      </w:tblPr>
+      <w:tblGrid>
+        <w:gridCol w:w="2000"/>
+        <w:gridCol w:w="2000"/>
+        <w:gridCol w:w="2000"/>
+        <w:gridCol w:w="2000"/>
+      </w:tblGrid>
+      <w:tr>
+        <w:trPr>
+          <w:trHeight w:val="530" w:hRule="atLeast"/>
+        </w:trPr>
+        <w:tc>
+          <w:tcPr>
+            <w:tcW w:w="2000" w:type="dxa"/>
+          </w:tcPr>
+          <w:p>
+            <w:pPr>
+              <w:jc w:val="center"/>
+            </w:pPr>
+            <w:r>
+              <w:rPr>
+                <w:b/>
+              </w:rPr>
+              <w:t xml:space="preserve">Name of Attribute</w:t>
+            </w:r>
+          </w:p>
+        </w:tc>
+        <w:tc>
+          <w:tcPr>
+            <w:tcW w:w="2000" w:type="dxa"/>
+          </w:tcPr>
+          <w:p>
+            <w:pPr>
+              <w:jc w:val="center"/>
+            </w:pPr>
+            <w:r>
+              <w:rPr>
+                <w:b/>
+              </w:rPr>
+              <w:t xml:space="preserve">Data Type</w:t>
+            </w:r>
+          </w:p>
+        </w:tc>
+        <w:tc>
+          <w:tcPr>
+            <w:tcW w:w="2000" w:type="dxa"/>
+          </w:tcPr>
+          <w:p>
+            <w:pPr>
+              <w:jc w:val="center"/>
+            </w:pPr>
+            <w:r>
+              <w:rPr>
+                <w:b/>
+              </w:rPr>
+              <w:t xml:space="preserve">Size</w:t>
+            </w:r>
+          </w:p>
+        </w:tc>
+        <w:tc>
+          <w:tcPr>
+            <w:tcW w:w="2000" w:type="dxa"/>
+          </w:tcPr>
+          <w:p>
+            <w:pPr>
+              <w:jc w:val="center"/>
+            </w:pPr>
+            <w:r>
+              <w:rPr>
+                <w:b/>
+              </w:rPr>
+              <w:t xml:space="preserve">PK/FK/IS NULL/ NOT NULL</w:t>
+            </w:r>
+          </w:p>
+        </w:tc>
+      </w:tr>
+      <w:tr>
+        <w:trPr>
+          <w:trHeight w:val="530" w:hRule="atLeast"/>
+        </w:trPr>
+        <w:tc>
+          <w:tcPr>
+            <w:tcW w:w="2000" w:type="dxa"/>
+          </w:tcPr>
+          <w:p>
+            <w:pPr/>
+            <w:r>
+              <w:t xml:space="preserve">id</w:t>
+            </w:r>
+          </w:p>
+        </w:tc>
+        <w:tc>
+          <w:tcPr>
+            <w:tcW w:w="2000" w:type="dxa"/>
+          </w:tcPr>
+          <w:p>
+            <w:pPr/>
+            <w:r>
+              <w:t xml:space="preserve">bigint</w:t>
+            </w:r>
+          </w:p>
+        </w:tc>
+        <w:tc>
+          <w:tcPr>
+            <w:tcW w:w="2000" w:type="dxa"/>
+          </w:tcPr>
+          <w:p>
+            <w:pPr/>
+            <w:r>
+              <w:t xml:space="preserve">-</w:t>
+            </w:r>
+          </w:p>
+        </w:tc>
+        <w:tc>
+          <w:tcPr>
+            <w:tcW w:w="2000" w:type="dxa"/>
+          </w:tcPr>
+          <w:p>
+            <w:pPr/>
+            <w:r>
+              <w:t xml:space="preserve">PK, NOT NULL</w:t>
+            </w:r>
+          </w:p>
+        </w:tc>
+      </w:tr>
+      <w:tr>
+        <w:trPr>
+          <w:trHeight w:val="530" w:hRule="atLeast"/>
+        </w:trPr>
+        <w:tc>
+          <w:tcPr>
+            <w:tcW w:w="2000" w:type="dxa"/>
+          </w:tcPr>
+          <w:p>
+            <w:pPr/>
+            <w:r>
+              <w:t xml:space="preserve">parent_id</w:t>
+            </w:r>
+          </w:p>
+        </w:tc>
+        <w:tc>
+          <w:tcPr>
+            <w:tcW w:w="2000" w:type="dxa"/>
+          </w:tcPr>
+          <w:p>
+            <w:pPr/>
+            <w:r>
+              <w:t xml:space="preserve">bigint</w:t>
+            </w:r>
+          </w:p>
+        </w:tc>
+        <w:tc>
+          <w:tcPr>
+            <w:tcW w:w="2000" w:type="dxa"/>
+          </w:tcPr>
+          <w:p>
+            <w:pPr/>
+            <w:r>
+              <w:t xml:space="preserve">-</w:t>
+            </w:r>
+          </w:p>
+        </w:tc>
+        <w:tc>
+          <w:tcPr>
+            <w:tcW w:w="2000" w:type="dxa"/>
+          </w:tcPr>
+          <w:p>
+            <w:pPr/>
+            <w:r>
+              <w:t xml:space="preserve">FK, IS NULL</w:t>
+            </w:r>
+          </w:p>
+        </w:tc>
+      </w:tr>
+      <w:tr>
+        <w:trPr>
+          <w:trHeight w:val="530" w:hRule="atLeast"/>
+        </w:trPr>
+        <w:tc>
+          <w:tcPr>
+            <w:tcW w:w="2000" w:type="dxa"/>
+          </w:tcPr>
+          <w:p>
+            <w:pPr/>
+            <w:r>
+              <w:t xml:space="preserve">account_type</w:t>
+            </w:r>
+          </w:p>
+        </w:tc>
+        <w:tc>
+          <w:tcPr>
+            <w:tcW w:w="2000" w:type="dxa"/>
+          </w:tcPr>
+          <w:p>
+            <w:pPr/>
+            <w:r>
+              <w:t xml:space="preserve">varchar</w:t>
+            </w:r>
+          </w:p>
+        </w:tc>
+        <w:tc>
+          <w:tcPr>
+            <w:tcW w:w="2000" w:type="dxa"/>
+          </w:tcPr>
+          <w:p>
+            <w:pPr/>
+            <w:r>
+              <w:t xml:space="preserve">30</w:t>
+            </w:r>
+          </w:p>
+        </w:tc>
+        <w:tc>
+          <w:tcPr>
+            <w:tcW w:w="2000" w:type="dxa"/>
+          </w:tcPr>
+          <w:p>
+            <w:pPr/>
+            <w:r>
+              <w:t xml:space="preserve">NOT NULL</w:t>
+            </w:r>
+          </w:p>
+        </w:tc>
+      </w:tr>
+      <w:tr>
+        <w:trPr>
+          <w:trHeight w:val="530" w:hRule="atLeast"/>
+        </w:trPr>
+        <w:tc>
+          <w:tcPr>
+            <w:tcW w:w="2000" w:type="dxa"/>
+          </w:tcPr>
+          <w:p>
+            <w:pPr/>
+            <w:r>
+              <w:t xml:space="preserve">balance_direction</w:t>
+            </w:r>
+          </w:p>
+        </w:tc>
+        <w:tc>
+          <w:tcPr>
+            <w:tcW w:w="2000" w:type="dxa"/>
+          </w:tcPr>
+          <w:p>
+            <w:pPr/>
+            <w:r>
+              <w:t xml:space="preserve">varchar</w:t>
+            </w:r>
+          </w:p>
+        </w:tc>
+        <w:tc>
+          <w:tcPr>
+            <w:tcW w:w="2000" w:type="dxa"/>
+          </w:tcPr>
+          <w:p>
+            <w:pPr/>
+            <w:r>
+              <w:t xml:space="preserve">10</w:t>
+            </w:r>
+          </w:p>
+        </w:tc>
+        <w:tc>
+          <w:tcPr>
+            <w:tcW w:w="2000" w:type="dxa"/>
+          </w:tcPr>
+          <w:p>
+            <w:pPr/>
+            <w:r>
+              <w:t xml:space="preserve">NOT NULL</w:t>
+            </w:r>
+          </w:p>
+        </w:tc>
+      </w:tr>
+      <w:tr>
+        <w:trPr>
+          <w:trHeight w:val="530" w:hRule="atLeast"/>
+        </w:trPr>
+        <w:tc>
+          <w:tcPr>
+            <w:tcW w:w="2000" w:type="dxa"/>
+          </w:tcPr>
+          <w:p>
+            <w:pPr/>
+            <w:r>
+              <w:t xml:space="preserve">company_id</w:t>
+            </w:r>
+          </w:p>
+        </w:tc>
+        <w:tc>
+          <w:tcPr>
+            <w:tcW w:w="2000" w:type="dxa"/>
+          </w:tcPr>
+          <w:p>
+            <w:pPr/>
+            <w:r>
+              <w:t xml:space="preserve">bigint</w:t>
+            </w:r>
+          </w:p>
+        </w:tc>
+        <w:tc>
+          <w:tcPr>
+            <w:tcW w:w="2000" w:type="dxa"/>
+          </w:tcPr>
+          <w:p>
+            <w:pPr/>
+            <w:r>
+              <w:t xml:space="preserve">-</w:t>
+            </w:r>
+          </w:p>
+        </w:tc>
+        <w:tc>
+          <w:tcPr>
+            <w:tcW w:w="2000" w:type="dxa"/>
+          </w:tcPr>
+          <w:p>
+            <w:pPr/>
+            <w:r>
+              <w:t xml:space="preserve">FK, NOT NULL</w:t>
+            </w:r>
+          </w:p>
+        </w:tc>
+      </w:tr>
+      <w:tr>
+        <w:trPr>
+          <w:trHeight w:val="530" w:hRule="atLeast"/>
+        </w:trPr>
+        <w:tc>
+          <w:tcPr>
+            <w:tcW w:w="2000" w:type="dxa"/>
+          </w:tcPr>
+          <w:p>
+            <w:pPr/>
+            <w:r>
+              <w:t xml:space="preserve">created_at</w:t>
+            </w:r>
+          </w:p>
+        </w:tc>
+        <w:tc>
+          <w:tcPr>
+            <w:tcW w:w="2000" w:type="dxa"/>
+          </w:tcPr>
+          <w:p>
+            <w:pPr/>
+            <w:r>
+              <w:t xml:space="preserve">datetime2</w:t>
+            </w:r>
+          </w:p>
+        </w:tc>
+        <w:tc>
+          <w:tcPr>
+            <w:tcW w:w="2000" w:type="dxa"/>
+          </w:tcPr>
+          <w:p>
+            <w:pPr/>
+            <w:r>
+              <w:t xml:space="preserve">(6)</w:t>
+            </w:r>
+          </w:p>
+        </w:tc>
+        <w:tc>
+          <w:tcPr>
+            <w:tcW w:w="2000" w:type="dxa"/>
+          </w:tcPr>
+          <w:p>
+            <w:pPr/>
+            <w:r>
+              <w:t xml:space="preserve">NOT NULL</w:t>
+            </w:r>
+          </w:p>
+        </w:tc>
+      </w:tr>
+      <w:tr>
+        <w:trPr>
+          <w:trHeight w:val="530" w:hRule="atLeast"/>
+        </w:trPr>
+        <w:tc>
+          <w:tcPr>
+            <w:tcW w:w="2000" w:type="dxa"/>
+          </w:tcPr>
+          <w:p>
+            <w:pPr/>
+            <w:r>
+              <w:t xml:space="preserve">created_by</w:t>
+            </w:r>
+          </w:p>
+        </w:tc>
+        <w:tc>
+          <w:tcPr>
+            <w:tcW w:w="2000" w:type="dxa"/>
+          </w:tcPr>
+          <w:p>
+            <w:pPr/>
+            <w:r>
+              <w:t xml:space="preserve">bigint</w:t>
+            </w:r>
+          </w:p>
+        </w:tc>
+        <w:tc>
+          <w:tcPr>
+            <w:tcW w:w="2000" w:type="dxa"/>
+          </w:tcPr>
+          <w:p>
+            <w:pPr/>
+            <w:r>
+              <w:t xml:space="preserve">-</w:t>
+            </w:r>
+          </w:p>
+        </w:tc>
+        <w:tc>
+          <w:tcPr>
+            <w:tcW w:w="2000" w:type="dxa"/>
+          </w:tcPr>
+          <w:p>
+            <w:pPr/>
+            <w:r>
+              <w:t xml:space="preserve">NOT NULL</w:t>
+            </w:r>
+          </w:p>
+        </w:tc>
+      </w:tr>
+      <w:tr>
+        <w:trPr>
+          <w:trHeight w:val="530" w:hRule="atLeast"/>
+        </w:trPr>
+        <w:tc>
+          <w:tcPr>
+            <w:tcW w:w="2000" w:type="dxa"/>
+          </w:tcPr>
+          <w:p>
+            <w:pPr/>
+            <w:r>
+              <w:t xml:space="preserve">updated_at</w:t>
+            </w:r>
+          </w:p>
+        </w:tc>
+        <w:tc>
+          <w:tcPr>
+            <w:tcW w:w="2000" w:type="dxa"/>
+          </w:tcPr>
+          <w:p>
+            <w:pPr/>
+            <w:r>
+              <w:t xml:space="preserve">datetime2</w:t>
+            </w:r>
+          </w:p>
+        </w:tc>
+        <w:tc>
+          <w:tcPr>
+            <w:tcW w:w="2000" w:type="dxa"/>
+          </w:tcPr>
+          <w:p>
+            <w:pPr/>
+            <w:r>
+              <w:t xml:space="preserve">(6)</w:t>
+            </w:r>
+          </w:p>
+        </w:tc>
+        <w:tc>
+          <w:tcPr>
+            <w:tcW w:w="2000" w:type="dxa"/>
+          </w:tcPr>
+          <w:p>
+            <w:pPr/>
+            <w:r>
+              <w:t xml:space="preserve">IS NULL</w:t>
+            </w:r>
+          </w:p>
+        </w:tc>
+      </w:tr>
+      <w:tr>
+        <w:trPr>
+          <w:trHeight w:val="530" w:hRule="atLeast"/>
+        </w:trPr>
+        <w:tc>
+          <w:tcPr>
+            <w:tcW w:w="2000" w:type="dxa"/>
+          </w:tcPr>
+          <w:p>
+            <w:pPr/>
+            <w:r>
+              <w:t xml:space="preserve">updated_by</w:t>
+            </w:r>
+          </w:p>
+        </w:tc>
+        <w:tc>
+          <w:tcPr>
+            <w:tcW w:w="2000" w:type="dxa"/>
+          </w:tcPr>
+          <w:p>
+            <w:pPr/>
+            <w:r>
+              <w:t xml:space="preserve">bigint</w:t>
+            </w:r>
+          </w:p>
+        </w:tc>
+        <w:tc>
+          <w:tcPr>
+            <w:tcW w:w="2000" w:type="dxa"/>
+          </w:tcPr>
+          <w:p>
+            <w:pPr/>
+            <w:r>
+              <w:t xml:space="preserve">-</w:t>
+            </w:r>
+          </w:p>
+        </w:tc>
+        <w:tc>
+          <w:tcPr>
+            <w:tcW w:w="2000" w:type="dxa"/>
+          </w:tcPr>
+          <w:p>
+            <w:pPr/>
+            <w:r>
+              <w:t xml:space="preserve">IS NULL</w:t>
+            </w:r>
+          </w:p>
+        </w:tc>
+      </w:tr>
+      <w:tr>
+        <w:trPr>
+          <w:trHeight w:val="530" w:hRule="atLeast"/>
+        </w:trPr>
+        <w:tc>
+          <w:tcPr>
+            <w:tcW w:w="2000" w:type="dxa"/>
+          </w:tcPr>
+          <w:p>
+            <w:pPr/>
+            <w:r>
+              <w:t xml:space="preserve">version</w:t>
+            </w:r>
+          </w:p>
+        </w:tc>
+        <w:tc>
+          <w:tcPr>
+            <w:tcW w:w="2000" w:type="dxa"/>
+          </w:tcPr>
+          <w:p>
+            <w:pPr/>
+            <w:r>
+              <w:t xml:space="preserve">int</w:t>
+            </w:r>
+          </w:p>
+        </w:tc>
+        <w:tc>
+          <w:tcPr>
+            <w:tcW w:w="2000" w:type="dxa"/>
+          </w:tcPr>
+          <w:p>
+            <w:pPr/>
+            <w:r>
+              <w:t xml:space="preserve">-</w:t>
+            </w:r>
+          </w:p>
+        </w:tc>
+        <w:tc>
+          <w:tcPr>
+            <w:tcW w:w="2000" w:type="dxa"/>
+          </w:tcPr>
+          <w:p>
+            <w:pPr/>
+            <w:r>
+              <w:t xml:space="preserve">NOT NULL</w:t>
+            </w:r>
+          </w:p>
+        </w:tc>
+      </w:tr>
+      <w:tr>
+        <w:trPr>
+          <w:trHeight w:val="530" w:hRule="atLeast"/>
+        </w:trPr>
+        <w:tc>
+          <w:tcPr>
+            <w:tcW w:w="2000" w:type="dxa"/>
+          </w:tcPr>
+          <w:p>
+            <w:pPr/>
+            <w:r>
+              <w:t xml:space="preserve">is_active</w:t>
+            </w:r>
+          </w:p>
+        </w:tc>
+        <w:tc>
+          <w:tcPr>
+            <w:tcW w:w="2000" w:type="dxa"/>
+          </w:tcPr>
+          <w:p>
+            <w:pPr/>
+            <w:r>
+              <w:t xml:space="preserve">bit</w:t>
+            </w:r>
+          </w:p>
+        </w:tc>
+        <w:tc>
+          <w:tcPr>
+            <w:tcW w:w="2000" w:type="dxa"/>
+          </w:tcPr>
+          <w:p>
+            <w:pPr/>
+            <w:r>
+              <w:t xml:space="preserve">-</w:t>
+            </w:r>
+          </w:p>
+        </w:tc>
+        <w:tc>
+          <w:tcPr>
+            <w:tcW w:w="2000" w:type="dxa"/>
+          </w:tcPr>
+          <w:p>
+            <w:pPr/>
+            <w:r>
+              <w:t xml:space="preserve">NOT NULL</w:t>
+            </w:r>
+          </w:p>
+        </w:tc>
+      </w:tr>
+      <w:tr>
+        <w:trPr>
+          <w:trHeight w:val="530" w:hRule="atLeast"/>
+        </w:trPr>
+        <w:tc>
+          <w:tcPr>
+            <w:tcW w:w="2000" w:type="dxa"/>
+          </w:tcPr>
+          <w:p>
+            <w:pPr/>
+            <w:r>
+              <w:t xml:space="preserve">is_deleted</w:t>
+            </w:r>
+          </w:p>
+        </w:tc>
+        <w:tc>
+          <w:tcPr>
+            <w:tcW w:w="2000" w:type="dxa"/>
+          </w:tcPr>
+          <w:p>
+            <w:pPr/>
+            <w:r>
+              <w:t xml:space="preserve">bit</w:t>
+            </w:r>
+          </w:p>
+        </w:tc>
+        <w:tc>
+          <w:tcPr>
+            <w:tcW w:w="2000" w:type="dxa"/>
+          </w:tcPr>
+          <w:p>
+            <w:pPr/>
+            <w:r>
+              <w:t xml:space="preserve">-</w:t>
+            </w:r>
+          </w:p>
+        </w:tc>
+        <w:tc>
+          <w:tcPr>
+            <w:tcW w:w="2000" w:type="dxa"/>
+          </w:tcPr>
+          <w:p>
+            <w:pPr/>
+            <w:r>
+              <w:t xml:space="preserve">NOT NULL</w:t>
+            </w:r>
+          </w:p>
+        </w:tc>
+      </w:tr>
+      <w:tr>
+        <w:trPr>
+          <w:trHeight w:val="530" w:hRule="atLeast"/>
+        </w:trPr>
+        <w:tc>
+          <w:tcPr>
+            <w:tcW w:w="2000" w:type="dxa"/>
+          </w:tcPr>
+          <w:p>
+            <w:pPr/>
+            <w:r>
+              <w:t xml:space="preserve">code</w:t>
+            </w:r>
+          </w:p>
+        </w:tc>
+        <w:tc>
+          <w:tcPr>
+            <w:tcW w:w="2000" w:type="dxa"/>
+          </w:tcPr>
+          <w:p>
+            <w:pPr/>
+            <w:r>
+              <w:t xml:space="preserve">varchar</w:t>
+            </w:r>
+          </w:p>
+        </w:tc>
+        <w:tc>
+          <w:tcPr>
+            <w:tcW w:w="2000" w:type="dxa"/>
+          </w:tcPr>
+          <w:p>
+            <w:pPr/>
+            <w:r>
+              <w:t xml:space="preserve">30</w:t>
+            </w:r>
+          </w:p>
+        </w:tc>
+        <w:tc>
+          <w:tcPr>
+            <w:tcW w:w="2000" w:type="dxa"/>
+          </w:tcPr>
+          <w:p>
+            <w:pPr/>
+            <w:r>
+              <w:t xml:space="preserve">NOT NULL</w:t>
+            </w:r>
+          </w:p>
+        </w:tc>
+      </w:tr>
+      <w:tr>
+        <w:trPr>
+          <w:trHeight w:val="530" w:hRule="atLeast"/>
+        </w:trPr>
+        <w:tc>
+          <w:tcPr>
+            <w:tcW w:w="2000" w:type="dxa"/>
+          </w:tcPr>
+          <w:p>
+            <w:pPr/>
+            <w:r>
+              <w:t xml:space="preserve">name</w:t>
+            </w:r>
+          </w:p>
+        </w:tc>
+        <w:tc>
+          <w:tcPr>
+            <w:tcW w:w="2000" w:type="dxa"/>
+          </w:tcPr>
+          <w:p>
+            <w:pPr/>
+            <w:r>
+              <w:t xml:space="preserve">nvarchar</w:t>
+            </w:r>
+          </w:p>
+        </w:tc>
+        <w:tc>
+          <w:tcPr>
+            <w:tcW w:w="2000" w:type="dxa"/>
+          </w:tcPr>
+          <w:p>
+            <w:pPr/>
+            <w:r>
+              <w:t xml:space="preserve">200</w:t>
+            </w:r>
+          </w:p>
+        </w:tc>
+        <w:tc>
+          <w:tcPr>
+            <w:tcW w:w="2000" w:type="dxa"/>
+          </w:tcPr>
+          <w:p>
+            <w:pPr/>
+            <w:r>
+              <w:t xml:space="preserve">NOT NULL</w:t>
+            </w:r>
+          </w:p>
+        </w:tc>
+      </w:tr>
+      <w:tr>
+        <w:trPr>
+          <w:trHeight w:val="530" w:hRule="atLeast"/>
+        </w:trPr>
+        <w:tc>
+          <w:tcPr>
+            <w:tcW w:w="2000" w:type="dxa"/>
+          </w:tcPr>
+          <w:p>
+            <w:pPr/>
+            <w:r>
+              <w:t xml:space="preserve">custom_fields</w:t>
+            </w:r>
+          </w:p>
+        </w:tc>
+        <w:tc>
+          <w:tcPr>
+            <w:tcW w:w="2000" w:type="dxa"/>
+          </w:tcPr>
+          <w:p>
+            <w:pPr/>
+            <w:r>
+              <w:t xml:space="preserve">nvarchar</w:t>
+            </w:r>
+          </w:p>
+        </w:tc>
+        <w:tc>
+          <w:tcPr>
+            <w:tcW w:w="2000" w:type="dxa"/>
+          </w:tcPr>
+          <w:p>
+            <w:pPr/>
+            <w:r>
+              <w:t xml:space="preserve">MAX</w:t>
+            </w:r>
+          </w:p>
+        </w:tc>
+        <w:tc>
+          <w:tcPr>
+            <w:tcW w:w="2000" w:type="dxa"/>
+          </w:tcPr>
+          <w:p>
+            <w:pPr/>
+            <w:r>
+              <w:t xml:space="preserve">IS NULL</w:t>
+            </w:r>
+          </w:p>
+        </w:tc>
+      </w:tr>
+    </w:tbl>
+    <w:p/>
     <w:p>
       <w:pPr/>
       <w:r>
@@ -28487,8 +29338,46 @@
         <w:t xml:space="preserve">[Pending] System screenshot of Tax Calculation Interface.</w:t>
       </w:r>
     </w:p>
+    <w:p>
+      <w:pPr>
+        <w:pStyle w:val="Heading5"/>
+      </w:pPr>
+      <w:r>
+        <w:t xml:space="preserve">4.2.1.8.87 Account View Interface</w:t>
+      </w:r>
+    </w:p>
+    <w:p>
+      <w:pPr>
+        <w:jc w:val="center"/>
+      </w:pPr>
+      <w:r>
+        <w:rPr>
+          <w:i/>
+        </w:rPr>
+        <w:t xml:space="preserve">[Pending] System screenshot of Account View Interface.</w:t>
+      </w:r>
+    </w:p>
+    <w:p>
+      <w:pPr>
+        <w:pStyle w:val="Heading5"/>
+      </w:pPr>
+      <w:r>
+        <w:t xml:space="preserve">4.2.1.8.88 Account Edit Interface</w:t>
+      </w:r>
+    </w:p>
+    <w:p>
+      <w:pPr>
+        <w:jc w:val="center"/>
+      </w:pPr>
+      <w:r>
+        <w:rPr>
+          <w:i/>
+        </w:rPr>
+        <w:t xml:space="preserve">[Pending] System screenshot of Account Edit Interface.</w:t>
+      </w:r>
+    </w:p>
     <w:sectPr>
-      <w:footerReference xmlns:r="http://schemas.openxmlformats.org/officeDocument/2006/relationships" w:type="default" r:id="R3eee26cca1ec43f6"/>
+      <w:footerReference xmlns:r="http://schemas.openxmlformats.org/officeDocument/2006/relationships" w:type="default" r:id="Rbcb97e1d6b8840a1"/>
       <w:pgSz w:w="11906" w:h="16838"/>
       <w:pgMar w:top="1440" w:right="1440" w:bottom="1440" w:left="1440" w:header="720" w:footer="720" w:gutter="0"/>
     </w:sectPr>

</xml_diff>

<commit_message>
feat(md): add settlement method and payment term pages
</commit_message>
<xml_diff>
--- a/docs/99-output/MyERP_SDS.docx
+++ b/docs/99-output/MyERP_SDS.docx
@@ -7430,6 +7430,1659 @@
             <w:pPr/>
             <w:r>
               <w:t xml:space="preserve">NOT NULL</w:t>
+            </w:r>
+          </w:p>
+        </w:tc>
+      </w:tr>
+    </w:tbl>
+    <w:p/>
+    <w:p>
+      <w:pPr/>
+      <w:r>
+        <w:t xml:space="preserve">Table Name: md_payment_term</w:t>
+      </w:r>
+    </w:p>
+    <w:p>
+      <w:pPr/>
+      <w:r>
+        <w:t xml:space="preserve">Primary Key: id</w:t>
+      </w:r>
+    </w:p>
+    <w:p>
+      <w:pPr/>
+      <w:r>
+        <w:t xml:space="preserve">This table stores payment terms and the rules for calculating due dates.</w:t>
+      </w:r>
+    </w:p>
+    <w:tbl>
+      <w:tblPr>
+        <w:tblStyle w:val="TableGrid"/>
+        <w:tblW w:w="8000" w:type="dxa"/>
+        <w:jc w:val="left"/>
+        <w:tblBorders>
+          <w:top w:val="single" w:color="000000" w:sz="4" w:space="0"/>
+          <w:left w:val="single" w:color="000000" w:sz="4" w:space="0"/>
+          <w:bottom w:val="single" w:color="000000" w:sz="4" w:space="0"/>
+          <w:right w:val="single" w:color="000000" w:sz="4" w:space="0"/>
+          <w:insideH w:val="single" w:color="000000" w:sz="4" w:space="0"/>
+          <w:insideV w:val="single" w:color="000000" w:sz="4" w:space="0"/>
+        </w:tblBorders>
+        <w:tblLayout w:type="fixed"/>
+        <w:tblCellMar>
+          <w:top w:w="100" w:type="dxa"/>
+          <w:left w:w="100" w:type="dxa"/>
+          <w:bottom w:w="100" w:type="dxa"/>
+          <w:right w:w="100" w:type="dxa"/>
+        </w:tblCellMar>
+      </w:tblPr>
+      <w:tblGrid>
+        <w:gridCol w:w="2000"/>
+        <w:gridCol w:w="2000"/>
+        <w:gridCol w:w="2000"/>
+        <w:gridCol w:w="2000"/>
+      </w:tblGrid>
+      <w:tr>
+        <w:trPr>
+          <w:trHeight w:val="530" w:hRule="atLeast"/>
+        </w:trPr>
+        <w:tc>
+          <w:tcPr>
+            <w:tcW w:w="2000" w:type="dxa"/>
+          </w:tcPr>
+          <w:p>
+            <w:pPr>
+              <w:jc w:val="center"/>
+            </w:pPr>
+            <w:r>
+              <w:rPr>
+                <w:b/>
+              </w:rPr>
+              <w:t xml:space="preserve">Name of Attribute</w:t>
+            </w:r>
+          </w:p>
+        </w:tc>
+        <w:tc>
+          <w:tcPr>
+            <w:tcW w:w="2000" w:type="dxa"/>
+          </w:tcPr>
+          <w:p>
+            <w:pPr>
+              <w:jc w:val="center"/>
+            </w:pPr>
+            <w:r>
+              <w:rPr>
+                <w:b/>
+              </w:rPr>
+              <w:t xml:space="preserve">Data Type</w:t>
+            </w:r>
+          </w:p>
+        </w:tc>
+        <w:tc>
+          <w:tcPr>
+            <w:tcW w:w="2000" w:type="dxa"/>
+          </w:tcPr>
+          <w:p>
+            <w:pPr>
+              <w:jc w:val="center"/>
+            </w:pPr>
+            <w:r>
+              <w:rPr>
+                <w:b/>
+              </w:rPr>
+              <w:t xml:space="preserve">Size</w:t>
+            </w:r>
+          </w:p>
+        </w:tc>
+        <w:tc>
+          <w:tcPr>
+            <w:tcW w:w="2000" w:type="dxa"/>
+          </w:tcPr>
+          <w:p>
+            <w:pPr>
+              <w:jc w:val="center"/>
+            </w:pPr>
+            <w:r>
+              <w:rPr>
+                <w:b/>
+              </w:rPr>
+              <w:t xml:space="preserve">PK/FK/IS NULL/ NOT NULL</w:t>
+            </w:r>
+          </w:p>
+        </w:tc>
+      </w:tr>
+      <w:tr>
+        <w:trPr>
+          <w:trHeight w:val="530" w:hRule="atLeast"/>
+        </w:trPr>
+        <w:tc>
+          <w:tcPr>
+            <w:tcW w:w="2000" w:type="dxa"/>
+          </w:tcPr>
+          <w:p>
+            <w:pPr/>
+            <w:r>
+              <w:t xml:space="preserve">id</w:t>
+            </w:r>
+          </w:p>
+        </w:tc>
+        <w:tc>
+          <w:tcPr>
+            <w:tcW w:w="2000" w:type="dxa"/>
+          </w:tcPr>
+          <w:p>
+            <w:pPr/>
+            <w:r>
+              <w:t xml:space="preserve">bigint</w:t>
+            </w:r>
+          </w:p>
+        </w:tc>
+        <w:tc>
+          <w:tcPr>
+            <w:tcW w:w="2000" w:type="dxa"/>
+          </w:tcPr>
+          <w:p>
+            <w:pPr/>
+            <w:r>
+              <w:t xml:space="preserve">-</w:t>
+            </w:r>
+          </w:p>
+        </w:tc>
+        <w:tc>
+          <w:tcPr>
+            <w:tcW w:w="2000" w:type="dxa"/>
+          </w:tcPr>
+          <w:p>
+            <w:pPr/>
+            <w:r>
+              <w:t xml:space="preserve">PK, NOT NULL</w:t>
+            </w:r>
+          </w:p>
+        </w:tc>
+      </w:tr>
+      <w:tr>
+        <w:trPr>
+          <w:trHeight w:val="530" w:hRule="atLeast"/>
+        </w:trPr>
+        <w:tc>
+          <w:tcPr>
+            <w:tcW w:w="2000" w:type="dxa"/>
+          </w:tcPr>
+          <w:p>
+            <w:pPr/>
+            <w:r>
+              <w:t xml:space="preserve">due_type</w:t>
+            </w:r>
+          </w:p>
+        </w:tc>
+        <w:tc>
+          <w:tcPr>
+            <w:tcW w:w="2000" w:type="dxa"/>
+          </w:tcPr>
+          <w:p>
+            <w:pPr/>
+            <w:r>
+              <w:t xml:space="preserve">varchar</w:t>
+            </w:r>
+          </w:p>
+        </w:tc>
+        <w:tc>
+          <w:tcPr>
+            <w:tcW w:w="2000" w:type="dxa"/>
+          </w:tcPr>
+          <w:p>
+            <w:pPr/>
+            <w:r>
+              <w:t xml:space="preserve">20</w:t>
+            </w:r>
+          </w:p>
+        </w:tc>
+        <w:tc>
+          <w:tcPr>
+            <w:tcW w:w="2000" w:type="dxa"/>
+          </w:tcPr>
+          <w:p>
+            <w:pPr/>
+            <w:r>
+              <w:t xml:space="preserve">NOT NULL</w:t>
+            </w:r>
+          </w:p>
+        </w:tc>
+      </w:tr>
+      <w:tr>
+        <w:trPr>
+          <w:trHeight w:val="530" w:hRule="atLeast"/>
+        </w:trPr>
+        <w:tc>
+          <w:tcPr>
+            <w:tcW w:w="2000" w:type="dxa"/>
+          </w:tcPr>
+          <w:p>
+            <w:pPr/>
+            <w:r>
+              <w:t xml:space="preserve">days</w:t>
+            </w:r>
+          </w:p>
+        </w:tc>
+        <w:tc>
+          <w:tcPr>
+            <w:tcW w:w="2000" w:type="dxa"/>
+          </w:tcPr>
+          <w:p>
+            <w:pPr/>
+            <w:r>
+              <w:t xml:space="preserve">int</w:t>
+            </w:r>
+          </w:p>
+        </w:tc>
+        <w:tc>
+          <w:tcPr>
+            <w:tcW w:w="2000" w:type="dxa"/>
+          </w:tcPr>
+          <w:p>
+            <w:pPr/>
+            <w:r>
+              <w:t xml:space="preserve">-</w:t>
+            </w:r>
+          </w:p>
+        </w:tc>
+        <w:tc>
+          <w:tcPr>
+            <w:tcW w:w="2000" w:type="dxa"/>
+          </w:tcPr>
+          <w:p>
+            <w:pPr/>
+            <w:r>
+              <w:t xml:space="preserve">IS NULL</w:t>
+            </w:r>
+          </w:p>
+        </w:tc>
+      </w:tr>
+      <w:tr>
+        <w:trPr>
+          <w:trHeight w:val="530" w:hRule="atLeast"/>
+        </w:trPr>
+        <w:tc>
+          <w:tcPr>
+            <w:tcW w:w="2000" w:type="dxa"/>
+          </w:tcPr>
+          <w:p>
+            <w:pPr/>
+            <w:r>
+              <w:t xml:space="preserve">closing_day</w:t>
+            </w:r>
+          </w:p>
+        </w:tc>
+        <w:tc>
+          <w:tcPr>
+            <w:tcW w:w="2000" w:type="dxa"/>
+          </w:tcPr>
+          <w:p>
+            <w:pPr/>
+            <w:r>
+              <w:t xml:space="preserve">int</w:t>
+            </w:r>
+          </w:p>
+        </w:tc>
+        <w:tc>
+          <w:tcPr>
+            <w:tcW w:w="2000" w:type="dxa"/>
+          </w:tcPr>
+          <w:p>
+            <w:pPr/>
+            <w:r>
+              <w:t xml:space="preserve">-</w:t>
+            </w:r>
+          </w:p>
+        </w:tc>
+        <w:tc>
+          <w:tcPr>
+            <w:tcW w:w="2000" w:type="dxa"/>
+          </w:tcPr>
+          <w:p>
+            <w:pPr/>
+            <w:r>
+              <w:t xml:space="preserve">IS NULL</w:t>
+            </w:r>
+          </w:p>
+        </w:tc>
+      </w:tr>
+      <w:tr>
+        <w:trPr>
+          <w:trHeight w:val="530" w:hRule="atLeast"/>
+        </w:trPr>
+        <w:tc>
+          <w:tcPr>
+            <w:tcW w:w="2000" w:type="dxa"/>
+          </w:tcPr>
+          <w:p>
+            <w:pPr/>
+            <w:r>
+              <w:t xml:space="preserve">months</w:t>
+            </w:r>
+          </w:p>
+        </w:tc>
+        <w:tc>
+          <w:tcPr>
+            <w:tcW w:w="2000" w:type="dxa"/>
+          </w:tcPr>
+          <w:p>
+            <w:pPr/>
+            <w:r>
+              <w:t xml:space="preserve">int</w:t>
+            </w:r>
+          </w:p>
+        </w:tc>
+        <w:tc>
+          <w:tcPr>
+            <w:tcW w:w="2000" w:type="dxa"/>
+          </w:tcPr>
+          <w:p>
+            <w:pPr/>
+            <w:r>
+              <w:t xml:space="preserve">-</w:t>
+            </w:r>
+          </w:p>
+        </w:tc>
+        <w:tc>
+          <w:tcPr>
+            <w:tcW w:w="2000" w:type="dxa"/>
+          </w:tcPr>
+          <w:p>
+            <w:pPr/>
+            <w:r>
+              <w:t xml:space="preserve">IS NULL</w:t>
+            </w:r>
+          </w:p>
+        </w:tc>
+      </w:tr>
+      <w:tr>
+        <w:trPr>
+          <w:trHeight w:val="530" w:hRule="atLeast"/>
+        </w:trPr>
+        <w:tc>
+          <w:tcPr>
+            <w:tcW w:w="2000" w:type="dxa"/>
+          </w:tcPr>
+          <w:p>
+            <w:pPr/>
+            <w:r>
+              <w:t xml:space="preserve">payment_day</w:t>
+            </w:r>
+          </w:p>
+        </w:tc>
+        <w:tc>
+          <w:tcPr>
+            <w:tcW w:w="2000" w:type="dxa"/>
+          </w:tcPr>
+          <w:p>
+            <w:pPr/>
+            <w:r>
+              <w:t xml:space="preserve">int</w:t>
+            </w:r>
+          </w:p>
+        </w:tc>
+        <w:tc>
+          <w:tcPr>
+            <w:tcW w:w="2000" w:type="dxa"/>
+          </w:tcPr>
+          <w:p>
+            <w:pPr/>
+            <w:r>
+              <w:t xml:space="preserve">-</w:t>
+            </w:r>
+          </w:p>
+        </w:tc>
+        <w:tc>
+          <w:tcPr>
+            <w:tcW w:w="2000" w:type="dxa"/>
+          </w:tcPr>
+          <w:p>
+            <w:pPr/>
+            <w:r>
+              <w:t xml:space="preserve">IS NULL</w:t>
+            </w:r>
+          </w:p>
+        </w:tc>
+      </w:tr>
+      <w:tr>
+        <w:trPr>
+          <w:trHeight w:val="530" w:hRule="atLeast"/>
+        </w:trPr>
+        <w:tc>
+          <w:tcPr>
+            <w:tcW w:w="2000" w:type="dxa"/>
+          </w:tcPr>
+          <w:p>
+            <w:pPr/>
+            <w:r>
+              <w:t xml:space="preserve">company_id</w:t>
+            </w:r>
+          </w:p>
+        </w:tc>
+        <w:tc>
+          <w:tcPr>
+            <w:tcW w:w="2000" w:type="dxa"/>
+          </w:tcPr>
+          <w:p>
+            <w:pPr/>
+            <w:r>
+              <w:t xml:space="preserve">bigint</w:t>
+            </w:r>
+          </w:p>
+        </w:tc>
+        <w:tc>
+          <w:tcPr>
+            <w:tcW w:w="2000" w:type="dxa"/>
+          </w:tcPr>
+          <w:p>
+            <w:pPr/>
+            <w:r>
+              <w:t xml:space="preserve">-</w:t>
+            </w:r>
+          </w:p>
+        </w:tc>
+        <w:tc>
+          <w:tcPr>
+            <w:tcW w:w="2000" w:type="dxa"/>
+          </w:tcPr>
+          <w:p>
+            <w:pPr/>
+            <w:r>
+              <w:t xml:space="preserve">NOT NULL</w:t>
+            </w:r>
+          </w:p>
+        </w:tc>
+      </w:tr>
+      <w:tr>
+        <w:trPr>
+          <w:trHeight w:val="530" w:hRule="atLeast"/>
+        </w:trPr>
+        <w:tc>
+          <w:tcPr>
+            <w:tcW w:w="2000" w:type="dxa"/>
+          </w:tcPr>
+          <w:p>
+            <w:pPr/>
+            <w:r>
+              <w:t xml:space="preserve">created_at</w:t>
+            </w:r>
+          </w:p>
+        </w:tc>
+        <w:tc>
+          <w:tcPr>
+            <w:tcW w:w="2000" w:type="dxa"/>
+          </w:tcPr>
+          <w:p>
+            <w:pPr/>
+            <w:r>
+              <w:t xml:space="preserve">datetime2</w:t>
+            </w:r>
+          </w:p>
+        </w:tc>
+        <w:tc>
+          <w:tcPr>
+            <w:tcW w:w="2000" w:type="dxa"/>
+          </w:tcPr>
+          <w:p>
+            <w:pPr/>
+            <w:r>
+              <w:t xml:space="preserve">(6)</w:t>
+            </w:r>
+          </w:p>
+        </w:tc>
+        <w:tc>
+          <w:tcPr>
+            <w:tcW w:w="2000" w:type="dxa"/>
+          </w:tcPr>
+          <w:p>
+            <w:pPr/>
+            <w:r>
+              <w:t xml:space="preserve">NOT NULL</w:t>
+            </w:r>
+          </w:p>
+        </w:tc>
+      </w:tr>
+      <w:tr>
+        <w:trPr>
+          <w:trHeight w:val="530" w:hRule="atLeast"/>
+        </w:trPr>
+        <w:tc>
+          <w:tcPr>
+            <w:tcW w:w="2000" w:type="dxa"/>
+          </w:tcPr>
+          <w:p>
+            <w:pPr/>
+            <w:r>
+              <w:t xml:space="preserve">created_by</w:t>
+            </w:r>
+          </w:p>
+        </w:tc>
+        <w:tc>
+          <w:tcPr>
+            <w:tcW w:w="2000" w:type="dxa"/>
+          </w:tcPr>
+          <w:p>
+            <w:pPr/>
+            <w:r>
+              <w:t xml:space="preserve">bigint</w:t>
+            </w:r>
+          </w:p>
+        </w:tc>
+        <w:tc>
+          <w:tcPr>
+            <w:tcW w:w="2000" w:type="dxa"/>
+          </w:tcPr>
+          <w:p>
+            <w:pPr/>
+            <w:r>
+              <w:t xml:space="preserve">-</w:t>
+            </w:r>
+          </w:p>
+        </w:tc>
+        <w:tc>
+          <w:tcPr>
+            <w:tcW w:w="2000" w:type="dxa"/>
+          </w:tcPr>
+          <w:p>
+            <w:pPr/>
+            <w:r>
+              <w:t xml:space="preserve">NOT NULL</w:t>
+            </w:r>
+          </w:p>
+        </w:tc>
+      </w:tr>
+      <w:tr>
+        <w:trPr>
+          <w:trHeight w:val="530" w:hRule="atLeast"/>
+        </w:trPr>
+        <w:tc>
+          <w:tcPr>
+            <w:tcW w:w="2000" w:type="dxa"/>
+          </w:tcPr>
+          <w:p>
+            <w:pPr/>
+            <w:r>
+              <w:t xml:space="preserve">updated_at</w:t>
+            </w:r>
+          </w:p>
+        </w:tc>
+        <w:tc>
+          <w:tcPr>
+            <w:tcW w:w="2000" w:type="dxa"/>
+          </w:tcPr>
+          <w:p>
+            <w:pPr/>
+            <w:r>
+              <w:t xml:space="preserve">datetime2</w:t>
+            </w:r>
+          </w:p>
+        </w:tc>
+        <w:tc>
+          <w:tcPr>
+            <w:tcW w:w="2000" w:type="dxa"/>
+          </w:tcPr>
+          <w:p>
+            <w:pPr/>
+            <w:r>
+              <w:t xml:space="preserve">(6)</w:t>
+            </w:r>
+          </w:p>
+        </w:tc>
+        <w:tc>
+          <w:tcPr>
+            <w:tcW w:w="2000" w:type="dxa"/>
+          </w:tcPr>
+          <w:p>
+            <w:pPr/>
+            <w:r>
+              <w:t xml:space="preserve">IS NULL</w:t>
+            </w:r>
+          </w:p>
+        </w:tc>
+      </w:tr>
+      <w:tr>
+        <w:trPr>
+          <w:trHeight w:val="530" w:hRule="atLeast"/>
+        </w:trPr>
+        <w:tc>
+          <w:tcPr>
+            <w:tcW w:w="2000" w:type="dxa"/>
+          </w:tcPr>
+          <w:p>
+            <w:pPr/>
+            <w:r>
+              <w:t xml:space="preserve">updated_by</w:t>
+            </w:r>
+          </w:p>
+        </w:tc>
+        <w:tc>
+          <w:tcPr>
+            <w:tcW w:w="2000" w:type="dxa"/>
+          </w:tcPr>
+          <w:p>
+            <w:pPr/>
+            <w:r>
+              <w:t xml:space="preserve">bigint</w:t>
+            </w:r>
+          </w:p>
+        </w:tc>
+        <w:tc>
+          <w:tcPr>
+            <w:tcW w:w="2000" w:type="dxa"/>
+          </w:tcPr>
+          <w:p>
+            <w:pPr/>
+            <w:r>
+              <w:t xml:space="preserve">-</w:t>
+            </w:r>
+          </w:p>
+        </w:tc>
+        <w:tc>
+          <w:tcPr>
+            <w:tcW w:w="2000" w:type="dxa"/>
+          </w:tcPr>
+          <w:p>
+            <w:pPr/>
+            <w:r>
+              <w:t xml:space="preserve">IS NULL</w:t>
+            </w:r>
+          </w:p>
+        </w:tc>
+      </w:tr>
+      <w:tr>
+        <w:trPr>
+          <w:trHeight w:val="530" w:hRule="atLeast"/>
+        </w:trPr>
+        <w:tc>
+          <w:tcPr>
+            <w:tcW w:w="2000" w:type="dxa"/>
+          </w:tcPr>
+          <w:p>
+            <w:pPr/>
+            <w:r>
+              <w:t xml:space="preserve">version</w:t>
+            </w:r>
+          </w:p>
+        </w:tc>
+        <w:tc>
+          <w:tcPr>
+            <w:tcW w:w="2000" w:type="dxa"/>
+          </w:tcPr>
+          <w:p>
+            <w:pPr/>
+            <w:r>
+              <w:t xml:space="preserve">int</w:t>
+            </w:r>
+          </w:p>
+        </w:tc>
+        <w:tc>
+          <w:tcPr>
+            <w:tcW w:w="2000" w:type="dxa"/>
+          </w:tcPr>
+          <w:p>
+            <w:pPr/>
+            <w:r>
+              <w:t xml:space="preserve">-</w:t>
+            </w:r>
+          </w:p>
+        </w:tc>
+        <w:tc>
+          <w:tcPr>
+            <w:tcW w:w="2000" w:type="dxa"/>
+          </w:tcPr>
+          <w:p>
+            <w:pPr/>
+            <w:r>
+              <w:t xml:space="preserve">NOT NULL</w:t>
+            </w:r>
+          </w:p>
+        </w:tc>
+      </w:tr>
+      <w:tr>
+        <w:trPr>
+          <w:trHeight w:val="530" w:hRule="atLeast"/>
+        </w:trPr>
+        <w:tc>
+          <w:tcPr>
+            <w:tcW w:w="2000" w:type="dxa"/>
+          </w:tcPr>
+          <w:p>
+            <w:pPr/>
+            <w:r>
+              <w:t xml:space="preserve">is_active</w:t>
+            </w:r>
+          </w:p>
+        </w:tc>
+        <w:tc>
+          <w:tcPr>
+            <w:tcW w:w="2000" w:type="dxa"/>
+          </w:tcPr>
+          <w:p>
+            <w:pPr/>
+            <w:r>
+              <w:t xml:space="preserve">bit</w:t>
+            </w:r>
+          </w:p>
+        </w:tc>
+        <w:tc>
+          <w:tcPr>
+            <w:tcW w:w="2000" w:type="dxa"/>
+          </w:tcPr>
+          <w:p>
+            <w:pPr/>
+            <w:r>
+              <w:t xml:space="preserve">-</w:t>
+            </w:r>
+          </w:p>
+        </w:tc>
+        <w:tc>
+          <w:tcPr>
+            <w:tcW w:w="2000" w:type="dxa"/>
+          </w:tcPr>
+          <w:p>
+            <w:pPr/>
+            <w:r>
+              <w:t xml:space="preserve">NOT NULL</w:t>
+            </w:r>
+          </w:p>
+        </w:tc>
+      </w:tr>
+      <w:tr>
+        <w:trPr>
+          <w:trHeight w:val="530" w:hRule="atLeast"/>
+        </w:trPr>
+        <w:tc>
+          <w:tcPr>
+            <w:tcW w:w="2000" w:type="dxa"/>
+          </w:tcPr>
+          <w:p>
+            <w:pPr/>
+            <w:r>
+              <w:t xml:space="preserve">is_deleted</w:t>
+            </w:r>
+          </w:p>
+        </w:tc>
+        <w:tc>
+          <w:tcPr>
+            <w:tcW w:w="2000" w:type="dxa"/>
+          </w:tcPr>
+          <w:p>
+            <w:pPr/>
+            <w:r>
+              <w:t xml:space="preserve">bit</w:t>
+            </w:r>
+          </w:p>
+        </w:tc>
+        <w:tc>
+          <w:tcPr>
+            <w:tcW w:w="2000" w:type="dxa"/>
+          </w:tcPr>
+          <w:p>
+            <w:pPr/>
+            <w:r>
+              <w:t xml:space="preserve">-</w:t>
+            </w:r>
+          </w:p>
+        </w:tc>
+        <w:tc>
+          <w:tcPr>
+            <w:tcW w:w="2000" w:type="dxa"/>
+          </w:tcPr>
+          <w:p>
+            <w:pPr/>
+            <w:r>
+              <w:t xml:space="preserve">NOT NULL</w:t>
+            </w:r>
+          </w:p>
+        </w:tc>
+      </w:tr>
+      <w:tr>
+        <w:trPr>
+          <w:trHeight w:val="530" w:hRule="atLeast"/>
+        </w:trPr>
+        <w:tc>
+          <w:tcPr>
+            <w:tcW w:w="2000" w:type="dxa"/>
+          </w:tcPr>
+          <w:p>
+            <w:pPr/>
+            <w:r>
+              <w:t xml:space="preserve">code</w:t>
+            </w:r>
+          </w:p>
+        </w:tc>
+        <w:tc>
+          <w:tcPr>
+            <w:tcW w:w="2000" w:type="dxa"/>
+          </w:tcPr>
+          <w:p>
+            <w:pPr/>
+            <w:r>
+              <w:t xml:space="preserve">varchar</w:t>
+            </w:r>
+          </w:p>
+        </w:tc>
+        <w:tc>
+          <w:tcPr>
+            <w:tcW w:w="2000" w:type="dxa"/>
+          </w:tcPr>
+          <w:p>
+            <w:pPr/>
+            <w:r>
+              <w:t xml:space="preserve">30</w:t>
+            </w:r>
+          </w:p>
+        </w:tc>
+        <w:tc>
+          <w:tcPr>
+            <w:tcW w:w="2000" w:type="dxa"/>
+          </w:tcPr>
+          <w:p>
+            <w:pPr/>
+            <w:r>
+              <w:t xml:space="preserve">NOT NULL</w:t>
+            </w:r>
+          </w:p>
+        </w:tc>
+      </w:tr>
+      <w:tr>
+        <w:trPr>
+          <w:trHeight w:val="530" w:hRule="atLeast"/>
+        </w:trPr>
+        <w:tc>
+          <w:tcPr>
+            <w:tcW w:w="2000" w:type="dxa"/>
+          </w:tcPr>
+          <w:p>
+            <w:pPr/>
+            <w:r>
+              <w:t xml:space="preserve">name</w:t>
+            </w:r>
+          </w:p>
+        </w:tc>
+        <w:tc>
+          <w:tcPr>
+            <w:tcW w:w="2000" w:type="dxa"/>
+          </w:tcPr>
+          <w:p>
+            <w:pPr/>
+            <w:r>
+              <w:t xml:space="preserve">nvarchar</w:t>
+            </w:r>
+          </w:p>
+        </w:tc>
+        <w:tc>
+          <w:tcPr>
+            <w:tcW w:w="2000" w:type="dxa"/>
+          </w:tcPr>
+          <w:p>
+            <w:pPr/>
+            <w:r>
+              <w:t xml:space="preserve">200</w:t>
+            </w:r>
+          </w:p>
+        </w:tc>
+        <w:tc>
+          <w:tcPr>
+            <w:tcW w:w="2000" w:type="dxa"/>
+          </w:tcPr>
+          <w:p>
+            <w:pPr/>
+            <w:r>
+              <w:t xml:space="preserve">NOT NULL</w:t>
+            </w:r>
+          </w:p>
+        </w:tc>
+      </w:tr>
+      <w:tr>
+        <w:trPr>
+          <w:trHeight w:val="530" w:hRule="atLeast"/>
+        </w:trPr>
+        <w:tc>
+          <w:tcPr>
+            <w:tcW w:w="2000" w:type="dxa"/>
+          </w:tcPr>
+          <w:p>
+            <w:pPr/>
+            <w:r>
+              <w:t xml:space="preserve">custom_fields</w:t>
+            </w:r>
+          </w:p>
+        </w:tc>
+        <w:tc>
+          <w:tcPr>
+            <w:tcW w:w="2000" w:type="dxa"/>
+          </w:tcPr>
+          <w:p>
+            <w:pPr/>
+            <w:r>
+              <w:t xml:space="preserve">nvarchar</w:t>
+            </w:r>
+          </w:p>
+        </w:tc>
+        <w:tc>
+          <w:tcPr>
+            <w:tcW w:w="2000" w:type="dxa"/>
+          </w:tcPr>
+          <w:p>
+            <w:pPr/>
+            <w:r>
+              <w:t xml:space="preserve">MAX</w:t>
+            </w:r>
+          </w:p>
+        </w:tc>
+        <w:tc>
+          <w:tcPr>
+            <w:tcW w:w="2000" w:type="dxa"/>
+          </w:tcPr>
+          <w:p>
+            <w:pPr/>
+            <w:r>
+              <w:t xml:space="preserve">IS NULL</w:t>
+            </w:r>
+          </w:p>
+        </w:tc>
+      </w:tr>
+    </w:tbl>
+    <w:p/>
+    <w:p>
+      <w:pPr/>
+      <w:r>
+        <w:t xml:space="preserve">Table Name: md_settlement_method</w:t>
+      </w:r>
+    </w:p>
+    <w:p>
+      <w:pPr/>
+      <w:r>
+        <w:t xml:space="preserve">Primary Key: id</w:t>
+      </w:r>
+    </w:p>
+    <w:p>
+      <w:pPr/>
+      <w:r>
+        <w:t xml:space="preserve">This table stores the settlement methods used by receipts and payments.</w:t>
+      </w:r>
+    </w:p>
+    <w:tbl>
+      <w:tblPr>
+        <w:tblStyle w:val="TableGrid"/>
+        <w:tblW w:w="8000" w:type="dxa"/>
+        <w:jc w:val="left"/>
+        <w:tblBorders>
+          <w:top w:val="single" w:color="000000" w:sz="4" w:space="0"/>
+          <w:left w:val="single" w:color="000000" w:sz="4" w:space="0"/>
+          <w:bottom w:val="single" w:color="000000" w:sz="4" w:space="0"/>
+          <w:right w:val="single" w:color="000000" w:sz="4" w:space="0"/>
+          <w:insideH w:val="single" w:color="000000" w:sz="4" w:space="0"/>
+          <w:insideV w:val="single" w:color="000000" w:sz="4" w:space="0"/>
+        </w:tblBorders>
+        <w:tblLayout w:type="fixed"/>
+        <w:tblCellMar>
+          <w:top w:w="100" w:type="dxa"/>
+          <w:left w:w="100" w:type="dxa"/>
+          <w:bottom w:w="100" w:type="dxa"/>
+          <w:right w:w="100" w:type="dxa"/>
+        </w:tblCellMar>
+      </w:tblPr>
+      <w:tblGrid>
+        <w:gridCol w:w="2000"/>
+        <w:gridCol w:w="2000"/>
+        <w:gridCol w:w="2000"/>
+        <w:gridCol w:w="2000"/>
+      </w:tblGrid>
+      <w:tr>
+        <w:trPr>
+          <w:trHeight w:val="530" w:hRule="atLeast"/>
+        </w:trPr>
+        <w:tc>
+          <w:tcPr>
+            <w:tcW w:w="2000" w:type="dxa"/>
+          </w:tcPr>
+          <w:p>
+            <w:pPr>
+              <w:jc w:val="center"/>
+            </w:pPr>
+            <w:r>
+              <w:rPr>
+                <w:b/>
+              </w:rPr>
+              <w:t xml:space="preserve">Name of Attribute</w:t>
+            </w:r>
+          </w:p>
+        </w:tc>
+        <w:tc>
+          <w:tcPr>
+            <w:tcW w:w="2000" w:type="dxa"/>
+          </w:tcPr>
+          <w:p>
+            <w:pPr>
+              <w:jc w:val="center"/>
+            </w:pPr>
+            <w:r>
+              <w:rPr>
+                <w:b/>
+              </w:rPr>
+              <w:t xml:space="preserve">Data Type</w:t>
+            </w:r>
+          </w:p>
+        </w:tc>
+        <w:tc>
+          <w:tcPr>
+            <w:tcW w:w="2000" w:type="dxa"/>
+          </w:tcPr>
+          <w:p>
+            <w:pPr>
+              <w:jc w:val="center"/>
+            </w:pPr>
+            <w:r>
+              <w:rPr>
+                <w:b/>
+              </w:rPr>
+              <w:t xml:space="preserve">Size</w:t>
+            </w:r>
+          </w:p>
+        </w:tc>
+        <w:tc>
+          <w:tcPr>
+            <w:tcW w:w="2000" w:type="dxa"/>
+          </w:tcPr>
+          <w:p>
+            <w:pPr>
+              <w:jc w:val="center"/>
+            </w:pPr>
+            <w:r>
+              <w:rPr>
+                <w:b/>
+              </w:rPr>
+              <w:t xml:space="preserve">PK/FK/IS NULL/ NOT NULL</w:t>
+            </w:r>
+          </w:p>
+        </w:tc>
+      </w:tr>
+      <w:tr>
+        <w:trPr>
+          <w:trHeight w:val="530" w:hRule="atLeast"/>
+        </w:trPr>
+        <w:tc>
+          <w:tcPr>
+            <w:tcW w:w="2000" w:type="dxa"/>
+          </w:tcPr>
+          <w:p>
+            <w:pPr/>
+            <w:r>
+              <w:t xml:space="preserve">id</w:t>
+            </w:r>
+          </w:p>
+        </w:tc>
+        <w:tc>
+          <w:tcPr>
+            <w:tcW w:w="2000" w:type="dxa"/>
+          </w:tcPr>
+          <w:p>
+            <w:pPr/>
+            <w:r>
+              <w:t xml:space="preserve">bigint</w:t>
+            </w:r>
+          </w:p>
+        </w:tc>
+        <w:tc>
+          <w:tcPr>
+            <w:tcW w:w="2000" w:type="dxa"/>
+          </w:tcPr>
+          <w:p>
+            <w:pPr/>
+            <w:r>
+              <w:t xml:space="preserve">-</w:t>
+            </w:r>
+          </w:p>
+        </w:tc>
+        <w:tc>
+          <w:tcPr>
+            <w:tcW w:w="2000" w:type="dxa"/>
+          </w:tcPr>
+          <w:p>
+            <w:pPr/>
+            <w:r>
+              <w:t xml:space="preserve">PK, NOT NULL</w:t>
+            </w:r>
+          </w:p>
+        </w:tc>
+      </w:tr>
+      <w:tr>
+        <w:trPr>
+          <w:trHeight w:val="530" w:hRule="atLeast"/>
+        </w:trPr>
+        <w:tc>
+          <w:tcPr>
+            <w:tcW w:w="2000" w:type="dxa"/>
+          </w:tcPr>
+          <w:p>
+            <w:pPr/>
+            <w:r>
+              <w:t xml:space="preserve">company_id</w:t>
+            </w:r>
+          </w:p>
+        </w:tc>
+        <w:tc>
+          <w:tcPr>
+            <w:tcW w:w="2000" w:type="dxa"/>
+          </w:tcPr>
+          <w:p>
+            <w:pPr/>
+            <w:r>
+              <w:t xml:space="preserve">bigint</w:t>
+            </w:r>
+          </w:p>
+        </w:tc>
+        <w:tc>
+          <w:tcPr>
+            <w:tcW w:w="2000" w:type="dxa"/>
+          </w:tcPr>
+          <w:p>
+            <w:pPr/>
+            <w:r>
+              <w:t xml:space="preserve">-</w:t>
+            </w:r>
+          </w:p>
+        </w:tc>
+        <w:tc>
+          <w:tcPr>
+            <w:tcW w:w="2000" w:type="dxa"/>
+          </w:tcPr>
+          <w:p>
+            <w:pPr/>
+            <w:r>
+              <w:t xml:space="preserve">NOT NULL</w:t>
+            </w:r>
+          </w:p>
+        </w:tc>
+      </w:tr>
+      <w:tr>
+        <w:trPr>
+          <w:trHeight w:val="530" w:hRule="atLeast"/>
+        </w:trPr>
+        <w:tc>
+          <w:tcPr>
+            <w:tcW w:w="2000" w:type="dxa"/>
+          </w:tcPr>
+          <w:p>
+            <w:pPr/>
+            <w:r>
+              <w:t xml:space="preserve">created_at</w:t>
+            </w:r>
+          </w:p>
+        </w:tc>
+        <w:tc>
+          <w:tcPr>
+            <w:tcW w:w="2000" w:type="dxa"/>
+          </w:tcPr>
+          <w:p>
+            <w:pPr/>
+            <w:r>
+              <w:t xml:space="preserve">datetime2</w:t>
+            </w:r>
+          </w:p>
+        </w:tc>
+        <w:tc>
+          <w:tcPr>
+            <w:tcW w:w="2000" w:type="dxa"/>
+          </w:tcPr>
+          <w:p>
+            <w:pPr/>
+            <w:r>
+              <w:t xml:space="preserve">(6)</w:t>
+            </w:r>
+          </w:p>
+        </w:tc>
+        <w:tc>
+          <w:tcPr>
+            <w:tcW w:w="2000" w:type="dxa"/>
+          </w:tcPr>
+          <w:p>
+            <w:pPr/>
+            <w:r>
+              <w:t xml:space="preserve">NOT NULL</w:t>
+            </w:r>
+          </w:p>
+        </w:tc>
+      </w:tr>
+      <w:tr>
+        <w:trPr>
+          <w:trHeight w:val="530" w:hRule="atLeast"/>
+        </w:trPr>
+        <w:tc>
+          <w:tcPr>
+            <w:tcW w:w="2000" w:type="dxa"/>
+          </w:tcPr>
+          <w:p>
+            <w:pPr/>
+            <w:r>
+              <w:t xml:space="preserve">created_by</w:t>
+            </w:r>
+          </w:p>
+        </w:tc>
+        <w:tc>
+          <w:tcPr>
+            <w:tcW w:w="2000" w:type="dxa"/>
+          </w:tcPr>
+          <w:p>
+            <w:pPr/>
+            <w:r>
+              <w:t xml:space="preserve">bigint</w:t>
+            </w:r>
+          </w:p>
+        </w:tc>
+        <w:tc>
+          <w:tcPr>
+            <w:tcW w:w="2000" w:type="dxa"/>
+          </w:tcPr>
+          <w:p>
+            <w:pPr/>
+            <w:r>
+              <w:t xml:space="preserve">-</w:t>
+            </w:r>
+          </w:p>
+        </w:tc>
+        <w:tc>
+          <w:tcPr>
+            <w:tcW w:w="2000" w:type="dxa"/>
+          </w:tcPr>
+          <w:p>
+            <w:pPr/>
+            <w:r>
+              <w:t xml:space="preserve">NOT NULL</w:t>
+            </w:r>
+          </w:p>
+        </w:tc>
+      </w:tr>
+      <w:tr>
+        <w:trPr>
+          <w:trHeight w:val="530" w:hRule="atLeast"/>
+        </w:trPr>
+        <w:tc>
+          <w:tcPr>
+            <w:tcW w:w="2000" w:type="dxa"/>
+          </w:tcPr>
+          <w:p>
+            <w:pPr/>
+            <w:r>
+              <w:t xml:space="preserve">updated_at</w:t>
+            </w:r>
+          </w:p>
+        </w:tc>
+        <w:tc>
+          <w:tcPr>
+            <w:tcW w:w="2000" w:type="dxa"/>
+          </w:tcPr>
+          <w:p>
+            <w:pPr/>
+            <w:r>
+              <w:t xml:space="preserve">datetime2</w:t>
+            </w:r>
+          </w:p>
+        </w:tc>
+        <w:tc>
+          <w:tcPr>
+            <w:tcW w:w="2000" w:type="dxa"/>
+          </w:tcPr>
+          <w:p>
+            <w:pPr/>
+            <w:r>
+              <w:t xml:space="preserve">(6)</w:t>
+            </w:r>
+          </w:p>
+        </w:tc>
+        <w:tc>
+          <w:tcPr>
+            <w:tcW w:w="2000" w:type="dxa"/>
+          </w:tcPr>
+          <w:p>
+            <w:pPr/>
+            <w:r>
+              <w:t xml:space="preserve">IS NULL</w:t>
+            </w:r>
+          </w:p>
+        </w:tc>
+      </w:tr>
+      <w:tr>
+        <w:trPr>
+          <w:trHeight w:val="530" w:hRule="atLeast"/>
+        </w:trPr>
+        <w:tc>
+          <w:tcPr>
+            <w:tcW w:w="2000" w:type="dxa"/>
+          </w:tcPr>
+          <w:p>
+            <w:pPr/>
+            <w:r>
+              <w:t xml:space="preserve">updated_by</w:t>
+            </w:r>
+          </w:p>
+        </w:tc>
+        <w:tc>
+          <w:tcPr>
+            <w:tcW w:w="2000" w:type="dxa"/>
+          </w:tcPr>
+          <w:p>
+            <w:pPr/>
+            <w:r>
+              <w:t xml:space="preserve">bigint</w:t>
+            </w:r>
+          </w:p>
+        </w:tc>
+        <w:tc>
+          <w:tcPr>
+            <w:tcW w:w="2000" w:type="dxa"/>
+          </w:tcPr>
+          <w:p>
+            <w:pPr/>
+            <w:r>
+              <w:t xml:space="preserve">-</w:t>
+            </w:r>
+          </w:p>
+        </w:tc>
+        <w:tc>
+          <w:tcPr>
+            <w:tcW w:w="2000" w:type="dxa"/>
+          </w:tcPr>
+          <w:p>
+            <w:pPr/>
+            <w:r>
+              <w:t xml:space="preserve">IS NULL</w:t>
+            </w:r>
+          </w:p>
+        </w:tc>
+      </w:tr>
+      <w:tr>
+        <w:trPr>
+          <w:trHeight w:val="530" w:hRule="atLeast"/>
+        </w:trPr>
+        <w:tc>
+          <w:tcPr>
+            <w:tcW w:w="2000" w:type="dxa"/>
+          </w:tcPr>
+          <w:p>
+            <w:pPr/>
+            <w:r>
+              <w:t xml:space="preserve">version</w:t>
+            </w:r>
+          </w:p>
+        </w:tc>
+        <w:tc>
+          <w:tcPr>
+            <w:tcW w:w="2000" w:type="dxa"/>
+          </w:tcPr>
+          <w:p>
+            <w:pPr/>
+            <w:r>
+              <w:t xml:space="preserve">int</w:t>
+            </w:r>
+          </w:p>
+        </w:tc>
+        <w:tc>
+          <w:tcPr>
+            <w:tcW w:w="2000" w:type="dxa"/>
+          </w:tcPr>
+          <w:p>
+            <w:pPr/>
+            <w:r>
+              <w:t xml:space="preserve">-</w:t>
+            </w:r>
+          </w:p>
+        </w:tc>
+        <w:tc>
+          <w:tcPr>
+            <w:tcW w:w="2000" w:type="dxa"/>
+          </w:tcPr>
+          <w:p>
+            <w:pPr/>
+            <w:r>
+              <w:t xml:space="preserve">NOT NULL</w:t>
+            </w:r>
+          </w:p>
+        </w:tc>
+      </w:tr>
+      <w:tr>
+        <w:trPr>
+          <w:trHeight w:val="530" w:hRule="atLeast"/>
+        </w:trPr>
+        <w:tc>
+          <w:tcPr>
+            <w:tcW w:w="2000" w:type="dxa"/>
+          </w:tcPr>
+          <w:p>
+            <w:pPr/>
+            <w:r>
+              <w:t xml:space="preserve">is_active</w:t>
+            </w:r>
+          </w:p>
+        </w:tc>
+        <w:tc>
+          <w:tcPr>
+            <w:tcW w:w="2000" w:type="dxa"/>
+          </w:tcPr>
+          <w:p>
+            <w:pPr/>
+            <w:r>
+              <w:t xml:space="preserve">bit</w:t>
+            </w:r>
+          </w:p>
+        </w:tc>
+        <w:tc>
+          <w:tcPr>
+            <w:tcW w:w="2000" w:type="dxa"/>
+          </w:tcPr>
+          <w:p>
+            <w:pPr/>
+            <w:r>
+              <w:t xml:space="preserve">-</w:t>
+            </w:r>
+          </w:p>
+        </w:tc>
+        <w:tc>
+          <w:tcPr>
+            <w:tcW w:w="2000" w:type="dxa"/>
+          </w:tcPr>
+          <w:p>
+            <w:pPr/>
+            <w:r>
+              <w:t xml:space="preserve">NOT NULL</w:t>
+            </w:r>
+          </w:p>
+        </w:tc>
+      </w:tr>
+      <w:tr>
+        <w:trPr>
+          <w:trHeight w:val="530" w:hRule="atLeast"/>
+        </w:trPr>
+        <w:tc>
+          <w:tcPr>
+            <w:tcW w:w="2000" w:type="dxa"/>
+          </w:tcPr>
+          <w:p>
+            <w:pPr/>
+            <w:r>
+              <w:t xml:space="preserve">is_deleted</w:t>
+            </w:r>
+          </w:p>
+        </w:tc>
+        <w:tc>
+          <w:tcPr>
+            <w:tcW w:w="2000" w:type="dxa"/>
+          </w:tcPr>
+          <w:p>
+            <w:pPr/>
+            <w:r>
+              <w:t xml:space="preserve">bit</w:t>
+            </w:r>
+          </w:p>
+        </w:tc>
+        <w:tc>
+          <w:tcPr>
+            <w:tcW w:w="2000" w:type="dxa"/>
+          </w:tcPr>
+          <w:p>
+            <w:pPr/>
+            <w:r>
+              <w:t xml:space="preserve">-</w:t>
+            </w:r>
+          </w:p>
+        </w:tc>
+        <w:tc>
+          <w:tcPr>
+            <w:tcW w:w="2000" w:type="dxa"/>
+          </w:tcPr>
+          <w:p>
+            <w:pPr/>
+            <w:r>
+              <w:t xml:space="preserve">NOT NULL</w:t>
+            </w:r>
+          </w:p>
+        </w:tc>
+      </w:tr>
+      <w:tr>
+        <w:trPr>
+          <w:trHeight w:val="530" w:hRule="atLeast"/>
+        </w:trPr>
+        <w:tc>
+          <w:tcPr>
+            <w:tcW w:w="2000" w:type="dxa"/>
+          </w:tcPr>
+          <w:p>
+            <w:pPr/>
+            <w:r>
+              <w:t xml:space="preserve">code</w:t>
+            </w:r>
+          </w:p>
+        </w:tc>
+        <w:tc>
+          <w:tcPr>
+            <w:tcW w:w="2000" w:type="dxa"/>
+          </w:tcPr>
+          <w:p>
+            <w:pPr/>
+            <w:r>
+              <w:t xml:space="preserve">varchar</w:t>
+            </w:r>
+          </w:p>
+        </w:tc>
+        <w:tc>
+          <w:tcPr>
+            <w:tcW w:w="2000" w:type="dxa"/>
+          </w:tcPr>
+          <w:p>
+            <w:pPr/>
+            <w:r>
+              <w:t xml:space="preserve">30</w:t>
+            </w:r>
+          </w:p>
+        </w:tc>
+        <w:tc>
+          <w:tcPr>
+            <w:tcW w:w="2000" w:type="dxa"/>
+          </w:tcPr>
+          <w:p>
+            <w:pPr/>
+            <w:r>
+              <w:t xml:space="preserve">NOT NULL</w:t>
+            </w:r>
+          </w:p>
+        </w:tc>
+      </w:tr>
+      <w:tr>
+        <w:trPr>
+          <w:trHeight w:val="530" w:hRule="atLeast"/>
+        </w:trPr>
+        <w:tc>
+          <w:tcPr>
+            <w:tcW w:w="2000" w:type="dxa"/>
+          </w:tcPr>
+          <w:p>
+            <w:pPr/>
+            <w:r>
+              <w:t xml:space="preserve">name</w:t>
+            </w:r>
+          </w:p>
+        </w:tc>
+        <w:tc>
+          <w:tcPr>
+            <w:tcW w:w="2000" w:type="dxa"/>
+          </w:tcPr>
+          <w:p>
+            <w:pPr/>
+            <w:r>
+              <w:t xml:space="preserve">nvarchar</w:t>
+            </w:r>
+          </w:p>
+        </w:tc>
+        <w:tc>
+          <w:tcPr>
+            <w:tcW w:w="2000" w:type="dxa"/>
+          </w:tcPr>
+          <w:p>
+            <w:pPr/>
+            <w:r>
+              <w:t xml:space="preserve">200</w:t>
+            </w:r>
+          </w:p>
+        </w:tc>
+        <w:tc>
+          <w:tcPr>
+            <w:tcW w:w="2000" w:type="dxa"/>
+          </w:tcPr>
+          <w:p>
+            <w:pPr/>
+            <w:r>
+              <w:t xml:space="preserve">NOT NULL</w:t>
+            </w:r>
+          </w:p>
+        </w:tc>
+      </w:tr>
+      <w:tr>
+        <w:trPr>
+          <w:trHeight w:val="530" w:hRule="atLeast"/>
+        </w:trPr>
+        <w:tc>
+          <w:tcPr>
+            <w:tcW w:w="2000" w:type="dxa"/>
+          </w:tcPr>
+          <w:p>
+            <w:pPr/>
+            <w:r>
+              <w:t xml:space="preserve">custom_fields</w:t>
+            </w:r>
+          </w:p>
+        </w:tc>
+        <w:tc>
+          <w:tcPr>
+            <w:tcW w:w="2000" w:type="dxa"/>
+          </w:tcPr>
+          <w:p>
+            <w:pPr/>
+            <w:r>
+              <w:t xml:space="preserve">nvarchar</w:t>
+            </w:r>
+          </w:p>
+        </w:tc>
+        <w:tc>
+          <w:tcPr>
+            <w:tcW w:w="2000" w:type="dxa"/>
+          </w:tcPr>
+          <w:p>
+            <w:pPr/>
+            <w:r>
+              <w:t xml:space="preserve">MAX</w:t>
+            </w:r>
+          </w:p>
+        </w:tc>
+        <w:tc>
+          <w:tcPr>
+            <w:tcW w:w="2000" w:type="dxa"/>
+          </w:tcPr>
+          <w:p>
+            <w:pPr/>
+            <w:r>
+              <w:t xml:space="preserve">IS NULL</w:t>
             </w:r>
           </w:p>
         </w:tc>
@@ -28728,6 +30381,63 @@
           <w:i/>
         </w:rPr>
         <w:t xml:space="preserve">[Pending] System screenshot of Unit of Measurement Edit Interface.</w:t>
+      </w:r>
+    </w:p>
+    <w:p>
+      <w:pPr>
+        <w:pStyle w:val="Heading5"/>
+      </w:pPr>
+      <w:r>
+        <w:t xml:space="preserve">4.2.1.8.48 Settlement Method View Interface</w:t>
+      </w:r>
+    </w:p>
+    <w:p>
+      <w:pPr>
+        <w:jc w:val="center"/>
+      </w:pPr>
+      <w:r>
+        <w:rPr>
+          <w:i/>
+        </w:rPr>
+        <w:t xml:space="preserve">[Pending] System screenshot of Settlement Method View Interface.</w:t>
+      </w:r>
+    </w:p>
+    <w:p>
+      <w:pPr>
+        <w:pStyle w:val="Heading5"/>
+      </w:pPr>
+      <w:r>
+        <w:t xml:space="preserve">4.2.1.8.49 Settlement Method Create Interface</w:t>
+      </w:r>
+    </w:p>
+    <w:p>
+      <w:pPr>
+        <w:jc w:val="center"/>
+      </w:pPr>
+      <w:r>
+        <w:rPr>
+          <w:i/>
+        </w:rPr>
+        <w:t xml:space="preserve">[Pending] System screenshot of Settlement Method Create Interface.</w:t>
+      </w:r>
+    </w:p>
+    <w:p>
+      <w:pPr>
+        <w:pStyle w:val="Heading5"/>
+      </w:pPr>
+      <w:r>
+        <w:t xml:space="preserve">4.2.1.8.50 Settlement Method Edit Interface</w:t>
+      </w:r>
+    </w:p>
+    <w:p>
+      <w:pPr>
+        <w:jc w:val="center"/>
+      </w:pPr>
+      <w:r>
+        <w:rPr>
+          <w:i/>
+        </w:rPr>
+        <w:t xml:space="preserve">[Pending] System screenshot of Settlement Method Edit Interface.</w:t>
       </w:r>
     </w:p>
     <w:p>
@@ -29376,8 +31086,65 @@
         <w:t xml:space="preserve">[Pending] System screenshot of Account Edit Interface.</w:t>
       </w:r>
     </w:p>
+    <w:p>
+      <w:pPr>
+        <w:pStyle w:val="Heading5"/>
+      </w:pPr>
+      <w:r>
+        <w:t xml:space="preserve">4.2.1.8.89 Payment Term View Interface</w:t>
+      </w:r>
+    </w:p>
+    <w:p>
+      <w:pPr>
+        <w:jc w:val="center"/>
+      </w:pPr>
+      <w:r>
+        <w:rPr>
+          <w:i/>
+        </w:rPr>
+        <w:t xml:space="preserve">[Pending] System screenshot of Payment Term View Interface.</w:t>
+      </w:r>
+    </w:p>
+    <w:p>
+      <w:pPr>
+        <w:pStyle w:val="Heading5"/>
+      </w:pPr>
+      <w:r>
+        <w:t xml:space="preserve">4.2.1.8.90 Payment Term Create Interface</w:t>
+      </w:r>
+    </w:p>
+    <w:p>
+      <w:pPr>
+        <w:jc w:val="center"/>
+      </w:pPr>
+      <w:r>
+        <w:rPr>
+          <w:i/>
+        </w:rPr>
+        <w:t xml:space="preserve">[Pending] System screenshot of Payment Term Create Interface.</w:t>
+      </w:r>
+    </w:p>
+    <w:p>
+      <w:pPr>
+        <w:pStyle w:val="Heading5"/>
+      </w:pPr>
+      <w:r>
+        <w:t xml:space="preserve">4.2.1.8.91 Payment Term Edit Interface</w:t>
+      </w:r>
+    </w:p>
+    <w:p>
+      <w:pPr>
+        <w:jc w:val="center"/>
+      </w:pPr>
+      <w:r>
+        <w:rPr>
+          <w:i/>
+        </w:rPr>
+        <w:t xml:space="preserve">[Pending] System screenshot of Payment Term Edit Interface.</w:t>
+      </w:r>
+    </w:p>
     <w:sectPr>
-      <w:footerReference xmlns:r="http://schemas.openxmlformats.org/officeDocument/2006/relationships" w:type="default" r:id="Rbcb97e1d6b8840a1"/>
+      <w:footerReference xmlns:r="http://schemas.openxmlformats.org/officeDocument/2006/relationships" w:type="default" r:id="Rddedd212df834b47"/>
       <w:pgSz w:w="11906" w:h="16838"/>
       <w:pgMar w:top="1440" w:right="1440" w:bottom="1440" w:left="1440" w:header="720" w:footer="720" w:gutter="0"/>
     </w:sectPr>

</xml_diff>

<commit_message>
feat(md): add fund account and income expense category backend
</commit_message>
<xml_diff>
--- a/docs/99-output/MyERP_SDS.docx
+++ b/docs/99-output/MyERP_SDS.docx
@@ -4467,6 +4467,1757 @@
             <w:pPr/>
             <w:r>
               <w:t xml:space="preserve">NOT NULL</w:t>
+            </w:r>
+          </w:p>
+        </w:tc>
+      </w:tr>
+    </w:tbl>
+    <w:p/>
+    <w:p>
+      <w:pPr/>
+      <w:r>
+        <w:t xml:space="preserve">Table Name: md_fund_account</w:t>
+      </w:r>
+    </w:p>
+    <w:p>
+      <w:pPr/>
+      <w:r>
+        <w:t xml:space="preserve">Primary Key: id</w:t>
+      </w:r>
+    </w:p>
+    <w:p>
+      <w:pPr/>
+      <w:r>
+        <w:t xml:space="preserve">This table stores the cash and bank fund account definitions.</w:t>
+      </w:r>
+    </w:p>
+    <w:tbl>
+      <w:tblPr>
+        <w:tblStyle w:val="TableGrid"/>
+        <w:tblW w:w="8000" w:type="dxa"/>
+        <w:jc w:val="left"/>
+        <w:tblBorders>
+          <w:top w:val="single" w:color="000000" w:sz="4" w:space="0"/>
+          <w:left w:val="single" w:color="000000" w:sz="4" w:space="0"/>
+          <w:bottom w:val="single" w:color="000000" w:sz="4" w:space="0"/>
+          <w:right w:val="single" w:color="000000" w:sz="4" w:space="0"/>
+          <w:insideH w:val="single" w:color="000000" w:sz="4" w:space="0"/>
+          <w:insideV w:val="single" w:color="000000" w:sz="4" w:space="0"/>
+        </w:tblBorders>
+        <w:tblLayout w:type="fixed"/>
+        <w:tblCellMar>
+          <w:top w:w="100" w:type="dxa"/>
+          <w:left w:w="100" w:type="dxa"/>
+          <w:bottom w:w="100" w:type="dxa"/>
+          <w:right w:w="100" w:type="dxa"/>
+        </w:tblCellMar>
+      </w:tblPr>
+      <w:tblGrid>
+        <w:gridCol w:w="2000"/>
+        <w:gridCol w:w="2000"/>
+        <w:gridCol w:w="2000"/>
+        <w:gridCol w:w="2000"/>
+      </w:tblGrid>
+      <w:tr>
+        <w:trPr>
+          <w:trHeight w:val="530" w:hRule="atLeast"/>
+        </w:trPr>
+        <w:tc>
+          <w:tcPr>
+            <w:tcW w:w="2000" w:type="dxa"/>
+          </w:tcPr>
+          <w:p>
+            <w:pPr>
+              <w:jc w:val="center"/>
+            </w:pPr>
+            <w:r>
+              <w:rPr>
+                <w:b/>
+              </w:rPr>
+              <w:t xml:space="preserve">Name of Attribute</w:t>
+            </w:r>
+          </w:p>
+        </w:tc>
+        <w:tc>
+          <w:tcPr>
+            <w:tcW w:w="2000" w:type="dxa"/>
+          </w:tcPr>
+          <w:p>
+            <w:pPr>
+              <w:jc w:val="center"/>
+            </w:pPr>
+            <w:r>
+              <w:rPr>
+                <w:b/>
+              </w:rPr>
+              <w:t xml:space="preserve">Data Type</w:t>
+            </w:r>
+          </w:p>
+        </w:tc>
+        <w:tc>
+          <w:tcPr>
+            <w:tcW w:w="2000" w:type="dxa"/>
+          </w:tcPr>
+          <w:p>
+            <w:pPr>
+              <w:jc w:val="center"/>
+            </w:pPr>
+            <w:r>
+              <w:rPr>
+                <w:b/>
+              </w:rPr>
+              <w:t xml:space="preserve">Size</w:t>
+            </w:r>
+          </w:p>
+        </w:tc>
+        <w:tc>
+          <w:tcPr>
+            <w:tcW w:w="2000" w:type="dxa"/>
+          </w:tcPr>
+          <w:p>
+            <w:pPr>
+              <w:jc w:val="center"/>
+            </w:pPr>
+            <w:r>
+              <w:rPr>
+                <w:b/>
+              </w:rPr>
+              <w:t xml:space="preserve">PK/FK/IS NULL/ NOT NULL</w:t>
+            </w:r>
+          </w:p>
+        </w:tc>
+      </w:tr>
+      <w:tr>
+        <w:trPr>
+          <w:trHeight w:val="530" w:hRule="atLeast"/>
+        </w:trPr>
+        <w:tc>
+          <w:tcPr>
+            <w:tcW w:w="2000" w:type="dxa"/>
+          </w:tcPr>
+          <w:p>
+            <w:pPr/>
+            <w:r>
+              <w:t xml:space="preserve">id</w:t>
+            </w:r>
+          </w:p>
+        </w:tc>
+        <w:tc>
+          <w:tcPr>
+            <w:tcW w:w="2000" w:type="dxa"/>
+          </w:tcPr>
+          <w:p>
+            <w:pPr/>
+            <w:r>
+              <w:t xml:space="preserve">bigint</w:t>
+            </w:r>
+          </w:p>
+        </w:tc>
+        <w:tc>
+          <w:tcPr>
+            <w:tcW w:w="2000" w:type="dxa"/>
+          </w:tcPr>
+          <w:p>
+            <w:pPr/>
+            <w:r>
+              <w:t xml:space="preserve">-</w:t>
+            </w:r>
+          </w:p>
+        </w:tc>
+        <w:tc>
+          <w:tcPr>
+            <w:tcW w:w="2000" w:type="dxa"/>
+          </w:tcPr>
+          <w:p>
+            <w:pPr/>
+            <w:r>
+              <w:t xml:space="preserve">PK, NOT NULL</w:t>
+            </w:r>
+          </w:p>
+        </w:tc>
+      </w:tr>
+      <w:tr>
+        <w:trPr>
+          <w:trHeight w:val="530" w:hRule="atLeast"/>
+        </w:trPr>
+        <w:tc>
+          <w:tcPr>
+            <w:tcW w:w="2000" w:type="dxa"/>
+          </w:tcPr>
+          <w:p>
+            <w:pPr/>
+            <w:r>
+              <w:t xml:space="preserve">fund_type</w:t>
+            </w:r>
+          </w:p>
+        </w:tc>
+        <w:tc>
+          <w:tcPr>
+            <w:tcW w:w="2000" w:type="dxa"/>
+          </w:tcPr>
+          <w:p>
+            <w:pPr/>
+            <w:r>
+              <w:t xml:space="preserve">varchar</w:t>
+            </w:r>
+          </w:p>
+        </w:tc>
+        <w:tc>
+          <w:tcPr>
+            <w:tcW w:w="2000" w:type="dxa"/>
+          </w:tcPr>
+          <w:p>
+            <w:pPr/>
+            <w:r>
+              <w:t xml:space="preserve">10</w:t>
+            </w:r>
+          </w:p>
+        </w:tc>
+        <w:tc>
+          <w:tcPr>
+            <w:tcW w:w="2000" w:type="dxa"/>
+          </w:tcPr>
+          <w:p>
+            <w:pPr/>
+            <w:r>
+              <w:t xml:space="preserve">NOT NULL</w:t>
+            </w:r>
+          </w:p>
+        </w:tc>
+      </w:tr>
+      <w:tr>
+        <w:trPr>
+          <w:trHeight w:val="530" w:hRule="atLeast"/>
+        </w:trPr>
+        <w:tc>
+          <w:tcPr>
+            <w:tcW w:w="2000" w:type="dxa"/>
+          </w:tcPr>
+          <w:p>
+            <w:pPr/>
+            <w:r>
+              <w:t xml:space="preserve">currency_id</w:t>
+            </w:r>
+          </w:p>
+        </w:tc>
+        <w:tc>
+          <w:tcPr>
+            <w:tcW w:w="2000" w:type="dxa"/>
+          </w:tcPr>
+          <w:p>
+            <w:pPr/>
+            <w:r>
+              <w:t xml:space="preserve">bigint</w:t>
+            </w:r>
+          </w:p>
+        </w:tc>
+        <w:tc>
+          <w:tcPr>
+            <w:tcW w:w="2000" w:type="dxa"/>
+          </w:tcPr>
+          <w:p>
+            <w:pPr/>
+            <w:r>
+              <w:t xml:space="preserve">-</w:t>
+            </w:r>
+          </w:p>
+        </w:tc>
+        <w:tc>
+          <w:tcPr>
+            <w:tcW w:w="2000" w:type="dxa"/>
+          </w:tcPr>
+          <w:p>
+            <w:pPr/>
+            <w:r>
+              <w:t xml:space="preserve">FK, NOT NULL</w:t>
+            </w:r>
+          </w:p>
+        </w:tc>
+      </w:tr>
+      <w:tr>
+        <w:trPr>
+          <w:trHeight w:val="530" w:hRule="atLeast"/>
+        </w:trPr>
+        <w:tc>
+          <w:tcPr>
+            <w:tcW w:w="2000" w:type="dxa"/>
+          </w:tcPr>
+          <w:p>
+            <w:pPr/>
+            <w:r>
+              <w:t xml:space="preserve">bank_name</w:t>
+            </w:r>
+          </w:p>
+        </w:tc>
+        <w:tc>
+          <w:tcPr>
+            <w:tcW w:w="2000" w:type="dxa"/>
+          </w:tcPr>
+          <w:p>
+            <w:pPr/>
+            <w:r>
+              <w:t xml:space="preserve">nvarchar</w:t>
+            </w:r>
+          </w:p>
+        </w:tc>
+        <w:tc>
+          <w:tcPr>
+            <w:tcW w:w="2000" w:type="dxa"/>
+          </w:tcPr>
+          <w:p>
+            <w:pPr/>
+            <w:r>
+              <w:t xml:space="preserve">200</w:t>
+            </w:r>
+          </w:p>
+        </w:tc>
+        <w:tc>
+          <w:tcPr>
+            <w:tcW w:w="2000" w:type="dxa"/>
+          </w:tcPr>
+          <w:p>
+            <w:pPr/>
+            <w:r>
+              <w:t xml:space="preserve">IS NULL</w:t>
+            </w:r>
+          </w:p>
+        </w:tc>
+      </w:tr>
+      <w:tr>
+        <w:trPr>
+          <w:trHeight w:val="530" w:hRule="atLeast"/>
+        </w:trPr>
+        <w:tc>
+          <w:tcPr>
+            <w:tcW w:w="2000" w:type="dxa"/>
+          </w:tcPr>
+          <w:p>
+            <w:pPr/>
+            <w:r>
+              <w:t xml:space="preserve">bank_account_no</w:t>
+            </w:r>
+          </w:p>
+        </w:tc>
+        <w:tc>
+          <w:tcPr>
+            <w:tcW w:w="2000" w:type="dxa"/>
+          </w:tcPr>
+          <w:p>
+            <w:pPr/>
+            <w:r>
+              <w:t xml:space="preserve">varchar</w:t>
+            </w:r>
+          </w:p>
+        </w:tc>
+        <w:tc>
+          <w:tcPr>
+            <w:tcW w:w="2000" w:type="dxa"/>
+          </w:tcPr>
+          <w:p>
+            <w:pPr/>
+            <w:r>
+              <w:t xml:space="preserve">50</w:t>
+            </w:r>
+          </w:p>
+        </w:tc>
+        <w:tc>
+          <w:tcPr>
+            <w:tcW w:w="2000" w:type="dxa"/>
+          </w:tcPr>
+          <w:p>
+            <w:pPr/>
+            <w:r>
+              <w:t xml:space="preserve">IS NULL</w:t>
+            </w:r>
+          </w:p>
+        </w:tc>
+      </w:tr>
+      <w:tr>
+        <w:trPr>
+          <w:trHeight w:val="530" w:hRule="atLeast"/>
+        </w:trPr>
+        <w:tc>
+          <w:tcPr>
+            <w:tcW w:w="2000" w:type="dxa"/>
+          </w:tcPr>
+          <w:p>
+            <w:pPr/>
+            <w:r>
+              <w:t xml:space="preserve">ledger_account_id</w:t>
+            </w:r>
+          </w:p>
+        </w:tc>
+        <w:tc>
+          <w:tcPr>
+            <w:tcW w:w="2000" w:type="dxa"/>
+          </w:tcPr>
+          <w:p>
+            <w:pPr/>
+            <w:r>
+              <w:t xml:space="preserve">bigint</w:t>
+            </w:r>
+          </w:p>
+        </w:tc>
+        <w:tc>
+          <w:tcPr>
+            <w:tcW w:w="2000" w:type="dxa"/>
+          </w:tcPr>
+          <w:p>
+            <w:pPr/>
+            <w:r>
+              <w:t xml:space="preserve">-</w:t>
+            </w:r>
+          </w:p>
+        </w:tc>
+        <w:tc>
+          <w:tcPr>
+            <w:tcW w:w="2000" w:type="dxa"/>
+          </w:tcPr>
+          <w:p>
+            <w:pPr/>
+            <w:r>
+              <w:t xml:space="preserve">FK, IS NULL</w:t>
+            </w:r>
+          </w:p>
+        </w:tc>
+      </w:tr>
+      <w:tr>
+        <w:trPr>
+          <w:trHeight w:val="530" w:hRule="atLeast"/>
+        </w:trPr>
+        <w:tc>
+          <w:tcPr>
+            <w:tcW w:w="2000" w:type="dxa"/>
+          </w:tcPr>
+          <w:p>
+            <w:pPr/>
+            <w:r>
+              <w:t xml:space="preserve">company_id</w:t>
+            </w:r>
+          </w:p>
+        </w:tc>
+        <w:tc>
+          <w:tcPr>
+            <w:tcW w:w="2000" w:type="dxa"/>
+          </w:tcPr>
+          <w:p>
+            <w:pPr/>
+            <w:r>
+              <w:t xml:space="preserve">bigint</w:t>
+            </w:r>
+          </w:p>
+        </w:tc>
+        <w:tc>
+          <w:tcPr>
+            <w:tcW w:w="2000" w:type="dxa"/>
+          </w:tcPr>
+          <w:p>
+            <w:pPr/>
+            <w:r>
+              <w:t xml:space="preserve">-</w:t>
+            </w:r>
+          </w:p>
+        </w:tc>
+        <w:tc>
+          <w:tcPr>
+            <w:tcW w:w="2000" w:type="dxa"/>
+          </w:tcPr>
+          <w:p>
+            <w:pPr/>
+            <w:r>
+              <w:t xml:space="preserve">FK, NOT NULL</w:t>
+            </w:r>
+          </w:p>
+        </w:tc>
+      </w:tr>
+      <w:tr>
+        <w:trPr>
+          <w:trHeight w:val="530" w:hRule="atLeast"/>
+        </w:trPr>
+        <w:tc>
+          <w:tcPr>
+            <w:tcW w:w="2000" w:type="dxa"/>
+          </w:tcPr>
+          <w:p>
+            <w:pPr/>
+            <w:r>
+              <w:t xml:space="preserve">created_at</w:t>
+            </w:r>
+          </w:p>
+        </w:tc>
+        <w:tc>
+          <w:tcPr>
+            <w:tcW w:w="2000" w:type="dxa"/>
+          </w:tcPr>
+          <w:p>
+            <w:pPr/>
+            <w:r>
+              <w:t xml:space="preserve">datetime2</w:t>
+            </w:r>
+          </w:p>
+        </w:tc>
+        <w:tc>
+          <w:tcPr>
+            <w:tcW w:w="2000" w:type="dxa"/>
+          </w:tcPr>
+          <w:p>
+            <w:pPr/>
+            <w:r>
+              <w:t xml:space="preserve">(6)</w:t>
+            </w:r>
+          </w:p>
+        </w:tc>
+        <w:tc>
+          <w:tcPr>
+            <w:tcW w:w="2000" w:type="dxa"/>
+          </w:tcPr>
+          <w:p>
+            <w:pPr/>
+            <w:r>
+              <w:t xml:space="preserve">NOT NULL</w:t>
+            </w:r>
+          </w:p>
+        </w:tc>
+      </w:tr>
+      <w:tr>
+        <w:trPr>
+          <w:trHeight w:val="530" w:hRule="atLeast"/>
+        </w:trPr>
+        <w:tc>
+          <w:tcPr>
+            <w:tcW w:w="2000" w:type="dxa"/>
+          </w:tcPr>
+          <w:p>
+            <w:pPr/>
+            <w:r>
+              <w:t xml:space="preserve">created_by</w:t>
+            </w:r>
+          </w:p>
+        </w:tc>
+        <w:tc>
+          <w:tcPr>
+            <w:tcW w:w="2000" w:type="dxa"/>
+          </w:tcPr>
+          <w:p>
+            <w:pPr/>
+            <w:r>
+              <w:t xml:space="preserve">bigint</w:t>
+            </w:r>
+          </w:p>
+        </w:tc>
+        <w:tc>
+          <w:tcPr>
+            <w:tcW w:w="2000" w:type="dxa"/>
+          </w:tcPr>
+          <w:p>
+            <w:pPr/>
+            <w:r>
+              <w:t xml:space="preserve">-</w:t>
+            </w:r>
+          </w:p>
+        </w:tc>
+        <w:tc>
+          <w:tcPr>
+            <w:tcW w:w="2000" w:type="dxa"/>
+          </w:tcPr>
+          <w:p>
+            <w:pPr/>
+            <w:r>
+              <w:t xml:space="preserve">NOT NULL</w:t>
+            </w:r>
+          </w:p>
+        </w:tc>
+      </w:tr>
+      <w:tr>
+        <w:trPr>
+          <w:trHeight w:val="530" w:hRule="atLeast"/>
+        </w:trPr>
+        <w:tc>
+          <w:tcPr>
+            <w:tcW w:w="2000" w:type="dxa"/>
+          </w:tcPr>
+          <w:p>
+            <w:pPr/>
+            <w:r>
+              <w:t xml:space="preserve">updated_at</w:t>
+            </w:r>
+          </w:p>
+        </w:tc>
+        <w:tc>
+          <w:tcPr>
+            <w:tcW w:w="2000" w:type="dxa"/>
+          </w:tcPr>
+          <w:p>
+            <w:pPr/>
+            <w:r>
+              <w:t xml:space="preserve">datetime2</w:t>
+            </w:r>
+          </w:p>
+        </w:tc>
+        <w:tc>
+          <w:tcPr>
+            <w:tcW w:w="2000" w:type="dxa"/>
+          </w:tcPr>
+          <w:p>
+            <w:pPr/>
+            <w:r>
+              <w:t xml:space="preserve">(6)</w:t>
+            </w:r>
+          </w:p>
+        </w:tc>
+        <w:tc>
+          <w:tcPr>
+            <w:tcW w:w="2000" w:type="dxa"/>
+          </w:tcPr>
+          <w:p>
+            <w:pPr/>
+            <w:r>
+              <w:t xml:space="preserve">IS NULL</w:t>
+            </w:r>
+          </w:p>
+        </w:tc>
+      </w:tr>
+      <w:tr>
+        <w:trPr>
+          <w:trHeight w:val="530" w:hRule="atLeast"/>
+        </w:trPr>
+        <w:tc>
+          <w:tcPr>
+            <w:tcW w:w="2000" w:type="dxa"/>
+          </w:tcPr>
+          <w:p>
+            <w:pPr/>
+            <w:r>
+              <w:t xml:space="preserve">updated_by</w:t>
+            </w:r>
+          </w:p>
+        </w:tc>
+        <w:tc>
+          <w:tcPr>
+            <w:tcW w:w="2000" w:type="dxa"/>
+          </w:tcPr>
+          <w:p>
+            <w:pPr/>
+            <w:r>
+              <w:t xml:space="preserve">bigint</w:t>
+            </w:r>
+          </w:p>
+        </w:tc>
+        <w:tc>
+          <w:tcPr>
+            <w:tcW w:w="2000" w:type="dxa"/>
+          </w:tcPr>
+          <w:p>
+            <w:pPr/>
+            <w:r>
+              <w:t xml:space="preserve">-</w:t>
+            </w:r>
+          </w:p>
+        </w:tc>
+        <w:tc>
+          <w:tcPr>
+            <w:tcW w:w="2000" w:type="dxa"/>
+          </w:tcPr>
+          <w:p>
+            <w:pPr/>
+            <w:r>
+              <w:t xml:space="preserve">IS NULL</w:t>
+            </w:r>
+          </w:p>
+        </w:tc>
+      </w:tr>
+      <w:tr>
+        <w:trPr>
+          <w:trHeight w:val="530" w:hRule="atLeast"/>
+        </w:trPr>
+        <w:tc>
+          <w:tcPr>
+            <w:tcW w:w="2000" w:type="dxa"/>
+          </w:tcPr>
+          <w:p>
+            <w:pPr/>
+            <w:r>
+              <w:t xml:space="preserve">version</w:t>
+            </w:r>
+          </w:p>
+        </w:tc>
+        <w:tc>
+          <w:tcPr>
+            <w:tcW w:w="2000" w:type="dxa"/>
+          </w:tcPr>
+          <w:p>
+            <w:pPr/>
+            <w:r>
+              <w:t xml:space="preserve">int</w:t>
+            </w:r>
+          </w:p>
+        </w:tc>
+        <w:tc>
+          <w:tcPr>
+            <w:tcW w:w="2000" w:type="dxa"/>
+          </w:tcPr>
+          <w:p>
+            <w:pPr/>
+            <w:r>
+              <w:t xml:space="preserve">-</w:t>
+            </w:r>
+          </w:p>
+        </w:tc>
+        <w:tc>
+          <w:tcPr>
+            <w:tcW w:w="2000" w:type="dxa"/>
+          </w:tcPr>
+          <w:p>
+            <w:pPr/>
+            <w:r>
+              <w:t xml:space="preserve">NOT NULL</w:t>
+            </w:r>
+          </w:p>
+        </w:tc>
+      </w:tr>
+      <w:tr>
+        <w:trPr>
+          <w:trHeight w:val="530" w:hRule="atLeast"/>
+        </w:trPr>
+        <w:tc>
+          <w:tcPr>
+            <w:tcW w:w="2000" w:type="dxa"/>
+          </w:tcPr>
+          <w:p>
+            <w:pPr/>
+            <w:r>
+              <w:t xml:space="preserve">is_active</w:t>
+            </w:r>
+          </w:p>
+        </w:tc>
+        <w:tc>
+          <w:tcPr>
+            <w:tcW w:w="2000" w:type="dxa"/>
+          </w:tcPr>
+          <w:p>
+            <w:pPr/>
+            <w:r>
+              <w:t xml:space="preserve">bit</w:t>
+            </w:r>
+          </w:p>
+        </w:tc>
+        <w:tc>
+          <w:tcPr>
+            <w:tcW w:w="2000" w:type="dxa"/>
+          </w:tcPr>
+          <w:p>
+            <w:pPr/>
+            <w:r>
+              <w:t xml:space="preserve">-</w:t>
+            </w:r>
+          </w:p>
+        </w:tc>
+        <w:tc>
+          <w:tcPr>
+            <w:tcW w:w="2000" w:type="dxa"/>
+          </w:tcPr>
+          <w:p>
+            <w:pPr/>
+            <w:r>
+              <w:t xml:space="preserve">NOT NULL</w:t>
+            </w:r>
+          </w:p>
+        </w:tc>
+      </w:tr>
+      <w:tr>
+        <w:trPr>
+          <w:trHeight w:val="530" w:hRule="atLeast"/>
+        </w:trPr>
+        <w:tc>
+          <w:tcPr>
+            <w:tcW w:w="2000" w:type="dxa"/>
+          </w:tcPr>
+          <w:p>
+            <w:pPr/>
+            <w:r>
+              <w:t xml:space="preserve">is_deleted</w:t>
+            </w:r>
+          </w:p>
+        </w:tc>
+        <w:tc>
+          <w:tcPr>
+            <w:tcW w:w="2000" w:type="dxa"/>
+          </w:tcPr>
+          <w:p>
+            <w:pPr/>
+            <w:r>
+              <w:t xml:space="preserve">bit</w:t>
+            </w:r>
+          </w:p>
+        </w:tc>
+        <w:tc>
+          <w:tcPr>
+            <w:tcW w:w="2000" w:type="dxa"/>
+          </w:tcPr>
+          <w:p>
+            <w:pPr/>
+            <w:r>
+              <w:t xml:space="preserve">-</w:t>
+            </w:r>
+          </w:p>
+        </w:tc>
+        <w:tc>
+          <w:tcPr>
+            <w:tcW w:w="2000" w:type="dxa"/>
+          </w:tcPr>
+          <w:p>
+            <w:pPr/>
+            <w:r>
+              <w:t xml:space="preserve">NOT NULL</w:t>
+            </w:r>
+          </w:p>
+        </w:tc>
+      </w:tr>
+      <w:tr>
+        <w:trPr>
+          <w:trHeight w:val="530" w:hRule="atLeast"/>
+        </w:trPr>
+        <w:tc>
+          <w:tcPr>
+            <w:tcW w:w="2000" w:type="dxa"/>
+          </w:tcPr>
+          <w:p>
+            <w:pPr/>
+            <w:r>
+              <w:t xml:space="preserve">code</w:t>
+            </w:r>
+          </w:p>
+        </w:tc>
+        <w:tc>
+          <w:tcPr>
+            <w:tcW w:w="2000" w:type="dxa"/>
+          </w:tcPr>
+          <w:p>
+            <w:pPr/>
+            <w:r>
+              <w:t xml:space="preserve">varchar</w:t>
+            </w:r>
+          </w:p>
+        </w:tc>
+        <w:tc>
+          <w:tcPr>
+            <w:tcW w:w="2000" w:type="dxa"/>
+          </w:tcPr>
+          <w:p>
+            <w:pPr/>
+            <w:r>
+              <w:t xml:space="preserve">30</w:t>
+            </w:r>
+          </w:p>
+        </w:tc>
+        <w:tc>
+          <w:tcPr>
+            <w:tcW w:w="2000" w:type="dxa"/>
+          </w:tcPr>
+          <w:p>
+            <w:pPr/>
+            <w:r>
+              <w:t xml:space="preserve">NOT NULL</w:t>
+            </w:r>
+          </w:p>
+        </w:tc>
+      </w:tr>
+      <w:tr>
+        <w:trPr>
+          <w:trHeight w:val="530" w:hRule="atLeast"/>
+        </w:trPr>
+        <w:tc>
+          <w:tcPr>
+            <w:tcW w:w="2000" w:type="dxa"/>
+          </w:tcPr>
+          <w:p>
+            <w:pPr/>
+            <w:r>
+              <w:t xml:space="preserve">name</w:t>
+            </w:r>
+          </w:p>
+        </w:tc>
+        <w:tc>
+          <w:tcPr>
+            <w:tcW w:w="2000" w:type="dxa"/>
+          </w:tcPr>
+          <w:p>
+            <w:pPr/>
+            <w:r>
+              <w:t xml:space="preserve">nvarchar</w:t>
+            </w:r>
+          </w:p>
+        </w:tc>
+        <w:tc>
+          <w:tcPr>
+            <w:tcW w:w="2000" w:type="dxa"/>
+          </w:tcPr>
+          <w:p>
+            <w:pPr/>
+            <w:r>
+              <w:t xml:space="preserve">200</w:t>
+            </w:r>
+          </w:p>
+        </w:tc>
+        <w:tc>
+          <w:tcPr>
+            <w:tcW w:w="2000" w:type="dxa"/>
+          </w:tcPr>
+          <w:p>
+            <w:pPr/>
+            <w:r>
+              <w:t xml:space="preserve">NOT NULL</w:t>
+            </w:r>
+          </w:p>
+        </w:tc>
+      </w:tr>
+      <w:tr>
+        <w:trPr>
+          <w:trHeight w:val="530" w:hRule="atLeast"/>
+        </w:trPr>
+        <w:tc>
+          <w:tcPr>
+            <w:tcW w:w="2000" w:type="dxa"/>
+          </w:tcPr>
+          <w:p>
+            <w:pPr/>
+            <w:r>
+              <w:t xml:space="preserve">custom_fields</w:t>
+            </w:r>
+          </w:p>
+        </w:tc>
+        <w:tc>
+          <w:tcPr>
+            <w:tcW w:w="2000" w:type="dxa"/>
+          </w:tcPr>
+          <w:p>
+            <w:pPr/>
+            <w:r>
+              <w:t xml:space="preserve">nvarchar</w:t>
+            </w:r>
+          </w:p>
+        </w:tc>
+        <w:tc>
+          <w:tcPr>
+            <w:tcW w:w="2000" w:type="dxa"/>
+          </w:tcPr>
+          <w:p>
+            <w:pPr/>
+            <w:r>
+              <w:t xml:space="preserve">MAX</w:t>
+            </w:r>
+          </w:p>
+        </w:tc>
+        <w:tc>
+          <w:tcPr>
+            <w:tcW w:w="2000" w:type="dxa"/>
+          </w:tcPr>
+          <w:p>
+            <w:pPr/>
+            <w:r>
+              <w:t xml:space="preserve">IS NULL</w:t>
+            </w:r>
+          </w:p>
+        </w:tc>
+      </w:tr>
+    </w:tbl>
+    <w:p/>
+    <w:p>
+      <w:pPr/>
+      <w:r>
+        <w:t xml:space="preserve">Table Name: md_income_expense_category</w:t>
+      </w:r>
+    </w:p>
+    <w:p>
+      <w:pPr/>
+      <w:r>
+        <w:t xml:space="preserve">Primary Key: id</w:t>
+      </w:r>
+    </w:p>
+    <w:p>
+      <w:pPr/>
+      <w:r>
+        <w:t xml:space="preserve">This table stores the income and expense categories used by other transactions.</w:t>
+      </w:r>
+    </w:p>
+    <w:tbl>
+      <w:tblPr>
+        <w:tblStyle w:val="TableGrid"/>
+        <w:tblW w:w="8000" w:type="dxa"/>
+        <w:jc w:val="left"/>
+        <w:tblBorders>
+          <w:top w:val="single" w:color="000000" w:sz="4" w:space="0"/>
+          <w:left w:val="single" w:color="000000" w:sz="4" w:space="0"/>
+          <w:bottom w:val="single" w:color="000000" w:sz="4" w:space="0"/>
+          <w:right w:val="single" w:color="000000" w:sz="4" w:space="0"/>
+          <w:insideH w:val="single" w:color="000000" w:sz="4" w:space="0"/>
+          <w:insideV w:val="single" w:color="000000" w:sz="4" w:space="0"/>
+        </w:tblBorders>
+        <w:tblLayout w:type="fixed"/>
+        <w:tblCellMar>
+          <w:top w:w="100" w:type="dxa"/>
+          <w:left w:w="100" w:type="dxa"/>
+          <w:bottom w:w="100" w:type="dxa"/>
+          <w:right w:w="100" w:type="dxa"/>
+        </w:tblCellMar>
+      </w:tblPr>
+      <w:tblGrid>
+        <w:gridCol w:w="2000"/>
+        <w:gridCol w:w="2000"/>
+        <w:gridCol w:w="2000"/>
+        <w:gridCol w:w="2000"/>
+      </w:tblGrid>
+      <w:tr>
+        <w:trPr>
+          <w:trHeight w:val="530" w:hRule="atLeast"/>
+        </w:trPr>
+        <w:tc>
+          <w:tcPr>
+            <w:tcW w:w="2000" w:type="dxa"/>
+          </w:tcPr>
+          <w:p>
+            <w:pPr>
+              <w:jc w:val="center"/>
+            </w:pPr>
+            <w:r>
+              <w:rPr>
+                <w:b/>
+              </w:rPr>
+              <w:t xml:space="preserve">Name of Attribute</w:t>
+            </w:r>
+          </w:p>
+        </w:tc>
+        <w:tc>
+          <w:tcPr>
+            <w:tcW w:w="2000" w:type="dxa"/>
+          </w:tcPr>
+          <w:p>
+            <w:pPr>
+              <w:jc w:val="center"/>
+            </w:pPr>
+            <w:r>
+              <w:rPr>
+                <w:b/>
+              </w:rPr>
+              <w:t xml:space="preserve">Data Type</w:t>
+            </w:r>
+          </w:p>
+        </w:tc>
+        <w:tc>
+          <w:tcPr>
+            <w:tcW w:w="2000" w:type="dxa"/>
+          </w:tcPr>
+          <w:p>
+            <w:pPr>
+              <w:jc w:val="center"/>
+            </w:pPr>
+            <w:r>
+              <w:rPr>
+                <w:b/>
+              </w:rPr>
+              <w:t xml:space="preserve">Size</w:t>
+            </w:r>
+          </w:p>
+        </w:tc>
+        <w:tc>
+          <w:tcPr>
+            <w:tcW w:w="2000" w:type="dxa"/>
+          </w:tcPr>
+          <w:p>
+            <w:pPr>
+              <w:jc w:val="center"/>
+            </w:pPr>
+            <w:r>
+              <w:rPr>
+                <w:b/>
+              </w:rPr>
+              <w:t xml:space="preserve">PK/FK/IS NULL/ NOT NULL</w:t>
+            </w:r>
+          </w:p>
+        </w:tc>
+      </w:tr>
+      <w:tr>
+        <w:trPr>
+          <w:trHeight w:val="530" w:hRule="atLeast"/>
+        </w:trPr>
+        <w:tc>
+          <w:tcPr>
+            <w:tcW w:w="2000" w:type="dxa"/>
+          </w:tcPr>
+          <w:p>
+            <w:pPr/>
+            <w:r>
+              <w:t xml:space="preserve">id</w:t>
+            </w:r>
+          </w:p>
+        </w:tc>
+        <w:tc>
+          <w:tcPr>
+            <w:tcW w:w="2000" w:type="dxa"/>
+          </w:tcPr>
+          <w:p>
+            <w:pPr/>
+            <w:r>
+              <w:t xml:space="preserve">bigint</w:t>
+            </w:r>
+          </w:p>
+        </w:tc>
+        <w:tc>
+          <w:tcPr>
+            <w:tcW w:w="2000" w:type="dxa"/>
+          </w:tcPr>
+          <w:p>
+            <w:pPr/>
+            <w:r>
+              <w:t xml:space="preserve">-</w:t>
+            </w:r>
+          </w:p>
+        </w:tc>
+        <w:tc>
+          <w:tcPr>
+            <w:tcW w:w="2000" w:type="dxa"/>
+          </w:tcPr>
+          <w:p>
+            <w:pPr/>
+            <w:r>
+              <w:t xml:space="preserve">PK, NOT NULL</w:t>
+            </w:r>
+          </w:p>
+        </w:tc>
+      </w:tr>
+      <w:tr>
+        <w:trPr>
+          <w:trHeight w:val="530" w:hRule="atLeast"/>
+        </w:trPr>
+        <w:tc>
+          <w:tcPr>
+            <w:tcW w:w="2000" w:type="dxa"/>
+          </w:tcPr>
+          <w:p>
+            <w:pPr/>
+            <w:r>
+              <w:t xml:space="preserve">direction</w:t>
+            </w:r>
+          </w:p>
+        </w:tc>
+        <w:tc>
+          <w:tcPr>
+            <w:tcW w:w="2000" w:type="dxa"/>
+          </w:tcPr>
+          <w:p>
+            <w:pPr/>
+            <w:r>
+              <w:t xml:space="preserve">varchar</w:t>
+            </w:r>
+          </w:p>
+        </w:tc>
+        <w:tc>
+          <w:tcPr>
+            <w:tcW w:w="2000" w:type="dxa"/>
+          </w:tcPr>
+          <w:p>
+            <w:pPr/>
+            <w:r>
+              <w:t xml:space="preserve">10</w:t>
+            </w:r>
+          </w:p>
+        </w:tc>
+        <w:tc>
+          <w:tcPr>
+            <w:tcW w:w="2000" w:type="dxa"/>
+          </w:tcPr>
+          <w:p>
+            <w:pPr/>
+            <w:r>
+              <w:t xml:space="preserve">NOT NULL</w:t>
+            </w:r>
+          </w:p>
+        </w:tc>
+      </w:tr>
+      <w:tr>
+        <w:trPr>
+          <w:trHeight w:val="530" w:hRule="atLeast"/>
+        </w:trPr>
+        <w:tc>
+          <w:tcPr>
+            <w:tcW w:w="2000" w:type="dxa"/>
+          </w:tcPr>
+          <w:p>
+            <w:pPr/>
+            <w:r>
+              <w:t xml:space="preserve">ledger_account_id</w:t>
+            </w:r>
+          </w:p>
+        </w:tc>
+        <w:tc>
+          <w:tcPr>
+            <w:tcW w:w="2000" w:type="dxa"/>
+          </w:tcPr>
+          <w:p>
+            <w:pPr/>
+            <w:r>
+              <w:t xml:space="preserve">bigint</w:t>
+            </w:r>
+          </w:p>
+        </w:tc>
+        <w:tc>
+          <w:tcPr>
+            <w:tcW w:w="2000" w:type="dxa"/>
+          </w:tcPr>
+          <w:p>
+            <w:pPr/>
+            <w:r>
+              <w:t xml:space="preserve">-</w:t>
+            </w:r>
+          </w:p>
+        </w:tc>
+        <w:tc>
+          <w:tcPr>
+            <w:tcW w:w="2000" w:type="dxa"/>
+          </w:tcPr>
+          <w:p>
+            <w:pPr/>
+            <w:r>
+              <w:t xml:space="preserve">FK, IS NULL</w:t>
+            </w:r>
+          </w:p>
+        </w:tc>
+      </w:tr>
+      <w:tr>
+        <w:trPr>
+          <w:trHeight w:val="530" w:hRule="atLeast"/>
+        </w:trPr>
+        <w:tc>
+          <w:tcPr>
+            <w:tcW w:w="2000" w:type="dxa"/>
+          </w:tcPr>
+          <w:p>
+            <w:pPr/>
+            <w:r>
+              <w:t xml:space="preserve">company_id</w:t>
+            </w:r>
+          </w:p>
+        </w:tc>
+        <w:tc>
+          <w:tcPr>
+            <w:tcW w:w="2000" w:type="dxa"/>
+          </w:tcPr>
+          <w:p>
+            <w:pPr/>
+            <w:r>
+              <w:t xml:space="preserve">bigint</w:t>
+            </w:r>
+          </w:p>
+        </w:tc>
+        <w:tc>
+          <w:tcPr>
+            <w:tcW w:w="2000" w:type="dxa"/>
+          </w:tcPr>
+          <w:p>
+            <w:pPr/>
+            <w:r>
+              <w:t xml:space="preserve">-</w:t>
+            </w:r>
+          </w:p>
+        </w:tc>
+        <w:tc>
+          <w:tcPr>
+            <w:tcW w:w="2000" w:type="dxa"/>
+          </w:tcPr>
+          <w:p>
+            <w:pPr/>
+            <w:r>
+              <w:t xml:space="preserve">FK, NOT NULL</w:t>
+            </w:r>
+          </w:p>
+        </w:tc>
+      </w:tr>
+      <w:tr>
+        <w:trPr>
+          <w:trHeight w:val="530" w:hRule="atLeast"/>
+        </w:trPr>
+        <w:tc>
+          <w:tcPr>
+            <w:tcW w:w="2000" w:type="dxa"/>
+          </w:tcPr>
+          <w:p>
+            <w:pPr/>
+            <w:r>
+              <w:t xml:space="preserve">created_at</w:t>
+            </w:r>
+          </w:p>
+        </w:tc>
+        <w:tc>
+          <w:tcPr>
+            <w:tcW w:w="2000" w:type="dxa"/>
+          </w:tcPr>
+          <w:p>
+            <w:pPr/>
+            <w:r>
+              <w:t xml:space="preserve">datetime2</w:t>
+            </w:r>
+          </w:p>
+        </w:tc>
+        <w:tc>
+          <w:tcPr>
+            <w:tcW w:w="2000" w:type="dxa"/>
+          </w:tcPr>
+          <w:p>
+            <w:pPr/>
+            <w:r>
+              <w:t xml:space="preserve">(6)</w:t>
+            </w:r>
+          </w:p>
+        </w:tc>
+        <w:tc>
+          <w:tcPr>
+            <w:tcW w:w="2000" w:type="dxa"/>
+          </w:tcPr>
+          <w:p>
+            <w:pPr/>
+            <w:r>
+              <w:t xml:space="preserve">NOT NULL</w:t>
+            </w:r>
+          </w:p>
+        </w:tc>
+      </w:tr>
+      <w:tr>
+        <w:trPr>
+          <w:trHeight w:val="530" w:hRule="atLeast"/>
+        </w:trPr>
+        <w:tc>
+          <w:tcPr>
+            <w:tcW w:w="2000" w:type="dxa"/>
+          </w:tcPr>
+          <w:p>
+            <w:pPr/>
+            <w:r>
+              <w:t xml:space="preserve">created_by</w:t>
+            </w:r>
+          </w:p>
+        </w:tc>
+        <w:tc>
+          <w:tcPr>
+            <w:tcW w:w="2000" w:type="dxa"/>
+          </w:tcPr>
+          <w:p>
+            <w:pPr/>
+            <w:r>
+              <w:t xml:space="preserve">bigint</w:t>
+            </w:r>
+          </w:p>
+        </w:tc>
+        <w:tc>
+          <w:tcPr>
+            <w:tcW w:w="2000" w:type="dxa"/>
+          </w:tcPr>
+          <w:p>
+            <w:pPr/>
+            <w:r>
+              <w:t xml:space="preserve">-</w:t>
+            </w:r>
+          </w:p>
+        </w:tc>
+        <w:tc>
+          <w:tcPr>
+            <w:tcW w:w="2000" w:type="dxa"/>
+          </w:tcPr>
+          <w:p>
+            <w:pPr/>
+            <w:r>
+              <w:t xml:space="preserve">NOT NULL</w:t>
+            </w:r>
+          </w:p>
+        </w:tc>
+      </w:tr>
+      <w:tr>
+        <w:trPr>
+          <w:trHeight w:val="530" w:hRule="atLeast"/>
+        </w:trPr>
+        <w:tc>
+          <w:tcPr>
+            <w:tcW w:w="2000" w:type="dxa"/>
+          </w:tcPr>
+          <w:p>
+            <w:pPr/>
+            <w:r>
+              <w:t xml:space="preserve">updated_at</w:t>
+            </w:r>
+          </w:p>
+        </w:tc>
+        <w:tc>
+          <w:tcPr>
+            <w:tcW w:w="2000" w:type="dxa"/>
+          </w:tcPr>
+          <w:p>
+            <w:pPr/>
+            <w:r>
+              <w:t xml:space="preserve">datetime2</w:t>
+            </w:r>
+          </w:p>
+        </w:tc>
+        <w:tc>
+          <w:tcPr>
+            <w:tcW w:w="2000" w:type="dxa"/>
+          </w:tcPr>
+          <w:p>
+            <w:pPr/>
+            <w:r>
+              <w:t xml:space="preserve">(6)</w:t>
+            </w:r>
+          </w:p>
+        </w:tc>
+        <w:tc>
+          <w:tcPr>
+            <w:tcW w:w="2000" w:type="dxa"/>
+          </w:tcPr>
+          <w:p>
+            <w:pPr/>
+            <w:r>
+              <w:t xml:space="preserve">IS NULL</w:t>
+            </w:r>
+          </w:p>
+        </w:tc>
+      </w:tr>
+      <w:tr>
+        <w:trPr>
+          <w:trHeight w:val="530" w:hRule="atLeast"/>
+        </w:trPr>
+        <w:tc>
+          <w:tcPr>
+            <w:tcW w:w="2000" w:type="dxa"/>
+          </w:tcPr>
+          <w:p>
+            <w:pPr/>
+            <w:r>
+              <w:t xml:space="preserve">updated_by</w:t>
+            </w:r>
+          </w:p>
+        </w:tc>
+        <w:tc>
+          <w:tcPr>
+            <w:tcW w:w="2000" w:type="dxa"/>
+          </w:tcPr>
+          <w:p>
+            <w:pPr/>
+            <w:r>
+              <w:t xml:space="preserve">bigint</w:t>
+            </w:r>
+          </w:p>
+        </w:tc>
+        <w:tc>
+          <w:tcPr>
+            <w:tcW w:w="2000" w:type="dxa"/>
+          </w:tcPr>
+          <w:p>
+            <w:pPr/>
+            <w:r>
+              <w:t xml:space="preserve">-</w:t>
+            </w:r>
+          </w:p>
+        </w:tc>
+        <w:tc>
+          <w:tcPr>
+            <w:tcW w:w="2000" w:type="dxa"/>
+          </w:tcPr>
+          <w:p>
+            <w:pPr/>
+            <w:r>
+              <w:t xml:space="preserve">IS NULL</w:t>
+            </w:r>
+          </w:p>
+        </w:tc>
+      </w:tr>
+      <w:tr>
+        <w:trPr>
+          <w:trHeight w:val="530" w:hRule="atLeast"/>
+        </w:trPr>
+        <w:tc>
+          <w:tcPr>
+            <w:tcW w:w="2000" w:type="dxa"/>
+          </w:tcPr>
+          <w:p>
+            <w:pPr/>
+            <w:r>
+              <w:t xml:space="preserve">version</w:t>
+            </w:r>
+          </w:p>
+        </w:tc>
+        <w:tc>
+          <w:tcPr>
+            <w:tcW w:w="2000" w:type="dxa"/>
+          </w:tcPr>
+          <w:p>
+            <w:pPr/>
+            <w:r>
+              <w:t xml:space="preserve">int</w:t>
+            </w:r>
+          </w:p>
+        </w:tc>
+        <w:tc>
+          <w:tcPr>
+            <w:tcW w:w="2000" w:type="dxa"/>
+          </w:tcPr>
+          <w:p>
+            <w:pPr/>
+            <w:r>
+              <w:t xml:space="preserve">-</w:t>
+            </w:r>
+          </w:p>
+        </w:tc>
+        <w:tc>
+          <w:tcPr>
+            <w:tcW w:w="2000" w:type="dxa"/>
+          </w:tcPr>
+          <w:p>
+            <w:pPr/>
+            <w:r>
+              <w:t xml:space="preserve">NOT NULL</w:t>
+            </w:r>
+          </w:p>
+        </w:tc>
+      </w:tr>
+      <w:tr>
+        <w:trPr>
+          <w:trHeight w:val="530" w:hRule="atLeast"/>
+        </w:trPr>
+        <w:tc>
+          <w:tcPr>
+            <w:tcW w:w="2000" w:type="dxa"/>
+          </w:tcPr>
+          <w:p>
+            <w:pPr/>
+            <w:r>
+              <w:t xml:space="preserve">is_active</w:t>
+            </w:r>
+          </w:p>
+        </w:tc>
+        <w:tc>
+          <w:tcPr>
+            <w:tcW w:w="2000" w:type="dxa"/>
+          </w:tcPr>
+          <w:p>
+            <w:pPr/>
+            <w:r>
+              <w:t xml:space="preserve">bit</w:t>
+            </w:r>
+          </w:p>
+        </w:tc>
+        <w:tc>
+          <w:tcPr>
+            <w:tcW w:w="2000" w:type="dxa"/>
+          </w:tcPr>
+          <w:p>
+            <w:pPr/>
+            <w:r>
+              <w:t xml:space="preserve">-</w:t>
+            </w:r>
+          </w:p>
+        </w:tc>
+        <w:tc>
+          <w:tcPr>
+            <w:tcW w:w="2000" w:type="dxa"/>
+          </w:tcPr>
+          <w:p>
+            <w:pPr/>
+            <w:r>
+              <w:t xml:space="preserve">NOT NULL</w:t>
+            </w:r>
+          </w:p>
+        </w:tc>
+      </w:tr>
+      <w:tr>
+        <w:trPr>
+          <w:trHeight w:val="530" w:hRule="atLeast"/>
+        </w:trPr>
+        <w:tc>
+          <w:tcPr>
+            <w:tcW w:w="2000" w:type="dxa"/>
+          </w:tcPr>
+          <w:p>
+            <w:pPr/>
+            <w:r>
+              <w:t xml:space="preserve">is_deleted</w:t>
+            </w:r>
+          </w:p>
+        </w:tc>
+        <w:tc>
+          <w:tcPr>
+            <w:tcW w:w="2000" w:type="dxa"/>
+          </w:tcPr>
+          <w:p>
+            <w:pPr/>
+            <w:r>
+              <w:t xml:space="preserve">bit</w:t>
+            </w:r>
+          </w:p>
+        </w:tc>
+        <w:tc>
+          <w:tcPr>
+            <w:tcW w:w="2000" w:type="dxa"/>
+          </w:tcPr>
+          <w:p>
+            <w:pPr/>
+            <w:r>
+              <w:t xml:space="preserve">-</w:t>
+            </w:r>
+          </w:p>
+        </w:tc>
+        <w:tc>
+          <w:tcPr>
+            <w:tcW w:w="2000" w:type="dxa"/>
+          </w:tcPr>
+          <w:p>
+            <w:pPr/>
+            <w:r>
+              <w:t xml:space="preserve">NOT NULL</w:t>
+            </w:r>
+          </w:p>
+        </w:tc>
+      </w:tr>
+      <w:tr>
+        <w:trPr>
+          <w:trHeight w:val="530" w:hRule="atLeast"/>
+        </w:trPr>
+        <w:tc>
+          <w:tcPr>
+            <w:tcW w:w="2000" w:type="dxa"/>
+          </w:tcPr>
+          <w:p>
+            <w:pPr/>
+            <w:r>
+              <w:t xml:space="preserve">code</w:t>
+            </w:r>
+          </w:p>
+        </w:tc>
+        <w:tc>
+          <w:tcPr>
+            <w:tcW w:w="2000" w:type="dxa"/>
+          </w:tcPr>
+          <w:p>
+            <w:pPr/>
+            <w:r>
+              <w:t xml:space="preserve">varchar</w:t>
+            </w:r>
+          </w:p>
+        </w:tc>
+        <w:tc>
+          <w:tcPr>
+            <w:tcW w:w="2000" w:type="dxa"/>
+          </w:tcPr>
+          <w:p>
+            <w:pPr/>
+            <w:r>
+              <w:t xml:space="preserve">30</w:t>
+            </w:r>
+          </w:p>
+        </w:tc>
+        <w:tc>
+          <w:tcPr>
+            <w:tcW w:w="2000" w:type="dxa"/>
+          </w:tcPr>
+          <w:p>
+            <w:pPr/>
+            <w:r>
+              <w:t xml:space="preserve">NOT NULL</w:t>
+            </w:r>
+          </w:p>
+        </w:tc>
+      </w:tr>
+      <w:tr>
+        <w:trPr>
+          <w:trHeight w:val="530" w:hRule="atLeast"/>
+        </w:trPr>
+        <w:tc>
+          <w:tcPr>
+            <w:tcW w:w="2000" w:type="dxa"/>
+          </w:tcPr>
+          <w:p>
+            <w:pPr/>
+            <w:r>
+              <w:t xml:space="preserve">name</w:t>
+            </w:r>
+          </w:p>
+        </w:tc>
+        <w:tc>
+          <w:tcPr>
+            <w:tcW w:w="2000" w:type="dxa"/>
+          </w:tcPr>
+          <w:p>
+            <w:pPr/>
+            <w:r>
+              <w:t xml:space="preserve">nvarchar</w:t>
+            </w:r>
+          </w:p>
+        </w:tc>
+        <w:tc>
+          <w:tcPr>
+            <w:tcW w:w="2000" w:type="dxa"/>
+          </w:tcPr>
+          <w:p>
+            <w:pPr/>
+            <w:r>
+              <w:t xml:space="preserve">200</w:t>
+            </w:r>
+          </w:p>
+        </w:tc>
+        <w:tc>
+          <w:tcPr>
+            <w:tcW w:w="2000" w:type="dxa"/>
+          </w:tcPr>
+          <w:p>
+            <w:pPr/>
+            <w:r>
+              <w:t xml:space="preserve">NOT NULL</w:t>
+            </w:r>
+          </w:p>
+        </w:tc>
+      </w:tr>
+      <w:tr>
+        <w:trPr>
+          <w:trHeight w:val="530" w:hRule="atLeast"/>
+        </w:trPr>
+        <w:tc>
+          <w:tcPr>
+            <w:tcW w:w="2000" w:type="dxa"/>
+          </w:tcPr>
+          <w:p>
+            <w:pPr/>
+            <w:r>
+              <w:t xml:space="preserve">custom_fields</w:t>
+            </w:r>
+          </w:p>
+        </w:tc>
+        <w:tc>
+          <w:tcPr>
+            <w:tcW w:w="2000" w:type="dxa"/>
+          </w:tcPr>
+          <w:p>
+            <w:pPr/>
+            <w:r>
+              <w:t xml:space="preserve">nvarchar</w:t>
+            </w:r>
+          </w:p>
+        </w:tc>
+        <w:tc>
+          <w:tcPr>
+            <w:tcW w:w="2000" w:type="dxa"/>
+          </w:tcPr>
+          <w:p>
+            <w:pPr/>
+            <w:r>
+              <w:t xml:space="preserve">MAX</w:t>
+            </w:r>
+          </w:p>
+        </w:tc>
+        <w:tc>
+          <w:tcPr>
+            <w:tcW w:w="2000" w:type="dxa"/>
+          </w:tcPr>
+          <w:p>
+            <w:pPr/>
+            <w:r>
+              <w:t xml:space="preserve">IS NULL</w:t>
             </w:r>
           </w:p>
         </w:tc>
@@ -31144,7 +32895,7 @@
       </w:r>
     </w:p>
     <w:sectPr>
-      <w:footerReference xmlns:r="http://schemas.openxmlformats.org/officeDocument/2006/relationships" w:type="default" r:id="Rddedd212df834b47"/>
+      <w:footerReference xmlns:r="http://schemas.openxmlformats.org/officeDocument/2006/relationships" w:type="default" r:id="Rf6d85d8ff1484579"/>
       <w:pgSz w:w="11906" w:h="16838"/>
       <w:pgMar w:top="1440" w:right="1440" w:bottom="1440" w:left="1440" w:header="720" w:footer="720" w:gutter="0"/>
     </w:sectPr>

</xml_diff>

<commit_message>
feat(md): add fund account and income expense category pages
WU-MD-020b: shared FundSetupPage for /md/fund-accounts (8.20-8.22) and
/md/income-expense-categories (8.42-8.44), menu, trilingual texts and
error codes, Vitest and Playwright (MD-FUND-UI-001~005), docgen.

Co-Authored-By: Claude Opus 5.5 <noreply@anthropic.com>
</commit_message>
<xml_diff>
--- a/docs/99-output/MyERP_SDS.docx
+++ b/docs/99-output/MyERP_SDS.docx
@@ -31854,6 +31854,63 @@
         <w:pStyle w:val="Heading5"/>
       </w:pPr>
       <w:r>
+        <w:t xml:space="preserve">4.2.1.8.20 Fund Account View Interface</w:t>
+      </w:r>
+    </w:p>
+    <w:p>
+      <w:pPr>
+        <w:jc w:val="center"/>
+      </w:pPr>
+      <w:r>
+        <w:rPr>
+          <w:i/>
+        </w:rPr>
+        <w:t xml:space="preserve">[Pending] System screenshot of Fund Account View Interface.</w:t>
+      </w:r>
+    </w:p>
+    <w:p>
+      <w:pPr>
+        <w:pStyle w:val="Heading5"/>
+      </w:pPr>
+      <w:r>
+        <w:t xml:space="preserve">4.2.1.8.21 Fund Account Create Interface</w:t>
+      </w:r>
+    </w:p>
+    <w:p>
+      <w:pPr>
+        <w:jc w:val="center"/>
+      </w:pPr>
+      <w:r>
+        <w:rPr>
+          <w:i/>
+        </w:rPr>
+        <w:t xml:space="preserve">[Pending] System screenshot of Fund Account Create Interface.</w:t>
+      </w:r>
+    </w:p>
+    <w:p>
+      <w:pPr>
+        <w:pStyle w:val="Heading5"/>
+      </w:pPr>
+      <w:r>
+        <w:t xml:space="preserve">4.2.1.8.22 Fund Account Edit Interface</w:t>
+      </w:r>
+    </w:p>
+    <w:p>
+      <w:pPr>
+        <w:jc w:val="center"/>
+      </w:pPr>
+      <w:r>
+        <w:rPr>
+          <w:i/>
+        </w:rPr>
+        <w:t xml:space="preserve">[Pending] System screenshot of Fund Account Edit Interface.</w:t>
+      </w:r>
+    </w:p>
+    <w:p>
+      <w:pPr>
+        <w:pStyle w:val="Heading5"/>
+      </w:pPr>
+      <w:r>
         <w:t xml:space="preserve">4.2.1.8.30 Client Category View Interface</w:t>
       </w:r>
     </w:p>
@@ -32075,6 +32132,63 @@
           <w:i/>
         </w:rPr>
         <w:t xml:space="preserve">[Pending] System screenshot of Item Brand Edit Interface.</w:t>
+      </w:r>
+    </w:p>
+    <w:p>
+      <w:pPr>
+        <w:pStyle w:val="Heading5"/>
+      </w:pPr>
+      <w:r>
+        <w:t xml:space="preserve">4.2.1.8.42 Income Expense Category View Interface</w:t>
+      </w:r>
+    </w:p>
+    <w:p>
+      <w:pPr>
+        <w:jc w:val="center"/>
+      </w:pPr>
+      <w:r>
+        <w:rPr>
+          <w:i/>
+        </w:rPr>
+        <w:t xml:space="preserve">[Pending] System screenshot of Income Expense Category View Interface.</w:t>
+      </w:r>
+    </w:p>
+    <w:p>
+      <w:pPr>
+        <w:pStyle w:val="Heading5"/>
+      </w:pPr>
+      <w:r>
+        <w:t xml:space="preserve">4.2.1.8.43 Income Expense Category Create Interface</w:t>
+      </w:r>
+    </w:p>
+    <w:p>
+      <w:pPr>
+        <w:jc w:val="center"/>
+      </w:pPr>
+      <w:r>
+        <w:rPr>
+          <w:i/>
+        </w:rPr>
+        <w:t xml:space="preserve">[Pending] System screenshot of Income Expense Category Create Interface.</w:t>
+      </w:r>
+    </w:p>
+    <w:p>
+      <w:pPr>
+        <w:pStyle w:val="Heading5"/>
+      </w:pPr>
+      <w:r>
+        <w:t xml:space="preserve">4.2.1.8.44 Income Expense Category Edit Interface</w:t>
+      </w:r>
+    </w:p>
+    <w:p>
+      <w:pPr>
+        <w:jc w:val="center"/>
+      </w:pPr>
+      <w:r>
+        <w:rPr>
+          <w:i/>
+        </w:rPr>
+        <w:t xml:space="preserve">[Pending] System screenshot of Income Expense Category Edit Interface.</w:t>
       </w:r>
     </w:p>
     <w:p>
@@ -32895,7 +33009,7 @@
       </w:r>
     </w:p>
     <w:sectPr>
-      <w:footerReference xmlns:r="http://schemas.openxmlformats.org/officeDocument/2006/relationships" w:type="default" r:id="Rf6d85d8ff1484579"/>
+      <w:footerReference xmlns:r="http://schemas.openxmlformats.org/officeDocument/2006/relationships" w:type="default" r:id="R8c63fb811f39493a"/>
       <w:pgSz w:w="11906" w:h="16838"/>
       <w:pgMar w:top="1440" w:right="1440" w:bottom="1440" w:left="1440" w:header="720" w:footer="720" w:gutter="0"/>
     </w:sectPr>

</xml_diff>

<commit_message>
feat(md): add process category and process pages
WU-MD-021b: shared ProcessPage for /md/process-categories (8.51-8.53) and
/md/processes (8.27-8.29) with sort order, process count, category filter,
active-only category/unit options and validated standard rate; menu,
trilingual texts and error codes, Vitest and Playwright (MD-PROC-UI-001~005),
sub-function tables and docgen regenerated with database.

Co-Authored-By: Claude Opus 5.5 <noreply@anthropic.com>
</commit_message>
<xml_diff>
--- a/docs/99-output/MyERP_SDS.docx
+++ b/docs/99-output/MyERP_SDS.docx
@@ -9591,6 +9591,1659 @@
             <w:pPr/>
             <w:r>
               <w:t xml:space="preserve">IS NULL</w:t>
+            </w:r>
+          </w:p>
+        </w:tc>
+      </w:tr>
+      <w:tr>
+        <w:trPr>
+          <w:trHeight w:val="530" w:hRule="atLeast"/>
+        </w:trPr>
+        <w:tc>
+          <w:tcPr>
+            <w:tcW w:w="2000" w:type="dxa"/>
+          </w:tcPr>
+          <w:p>
+            <w:pPr/>
+            <w:r>
+              <w:t xml:space="preserve">company_id</w:t>
+            </w:r>
+          </w:p>
+        </w:tc>
+        <w:tc>
+          <w:tcPr>
+            <w:tcW w:w="2000" w:type="dxa"/>
+          </w:tcPr>
+          <w:p>
+            <w:pPr/>
+            <w:r>
+              <w:t xml:space="preserve">bigint</w:t>
+            </w:r>
+          </w:p>
+        </w:tc>
+        <w:tc>
+          <w:tcPr>
+            <w:tcW w:w="2000" w:type="dxa"/>
+          </w:tcPr>
+          <w:p>
+            <w:pPr/>
+            <w:r>
+              <w:t xml:space="preserve">-</w:t>
+            </w:r>
+          </w:p>
+        </w:tc>
+        <w:tc>
+          <w:tcPr>
+            <w:tcW w:w="2000" w:type="dxa"/>
+          </w:tcPr>
+          <w:p>
+            <w:pPr/>
+            <w:r>
+              <w:t xml:space="preserve">NOT NULL</w:t>
+            </w:r>
+          </w:p>
+        </w:tc>
+      </w:tr>
+      <w:tr>
+        <w:trPr>
+          <w:trHeight w:val="530" w:hRule="atLeast"/>
+        </w:trPr>
+        <w:tc>
+          <w:tcPr>
+            <w:tcW w:w="2000" w:type="dxa"/>
+          </w:tcPr>
+          <w:p>
+            <w:pPr/>
+            <w:r>
+              <w:t xml:space="preserve">created_at</w:t>
+            </w:r>
+          </w:p>
+        </w:tc>
+        <w:tc>
+          <w:tcPr>
+            <w:tcW w:w="2000" w:type="dxa"/>
+          </w:tcPr>
+          <w:p>
+            <w:pPr/>
+            <w:r>
+              <w:t xml:space="preserve">datetime2</w:t>
+            </w:r>
+          </w:p>
+        </w:tc>
+        <w:tc>
+          <w:tcPr>
+            <w:tcW w:w="2000" w:type="dxa"/>
+          </w:tcPr>
+          <w:p>
+            <w:pPr/>
+            <w:r>
+              <w:t xml:space="preserve">(6)</w:t>
+            </w:r>
+          </w:p>
+        </w:tc>
+        <w:tc>
+          <w:tcPr>
+            <w:tcW w:w="2000" w:type="dxa"/>
+          </w:tcPr>
+          <w:p>
+            <w:pPr/>
+            <w:r>
+              <w:t xml:space="preserve">NOT NULL</w:t>
+            </w:r>
+          </w:p>
+        </w:tc>
+      </w:tr>
+      <w:tr>
+        <w:trPr>
+          <w:trHeight w:val="530" w:hRule="atLeast"/>
+        </w:trPr>
+        <w:tc>
+          <w:tcPr>
+            <w:tcW w:w="2000" w:type="dxa"/>
+          </w:tcPr>
+          <w:p>
+            <w:pPr/>
+            <w:r>
+              <w:t xml:space="preserve">created_by</w:t>
+            </w:r>
+          </w:p>
+        </w:tc>
+        <w:tc>
+          <w:tcPr>
+            <w:tcW w:w="2000" w:type="dxa"/>
+          </w:tcPr>
+          <w:p>
+            <w:pPr/>
+            <w:r>
+              <w:t xml:space="preserve">bigint</w:t>
+            </w:r>
+          </w:p>
+        </w:tc>
+        <w:tc>
+          <w:tcPr>
+            <w:tcW w:w="2000" w:type="dxa"/>
+          </w:tcPr>
+          <w:p>
+            <w:pPr/>
+            <w:r>
+              <w:t xml:space="preserve">-</w:t>
+            </w:r>
+          </w:p>
+        </w:tc>
+        <w:tc>
+          <w:tcPr>
+            <w:tcW w:w="2000" w:type="dxa"/>
+          </w:tcPr>
+          <w:p>
+            <w:pPr/>
+            <w:r>
+              <w:t xml:space="preserve">NOT NULL</w:t>
+            </w:r>
+          </w:p>
+        </w:tc>
+      </w:tr>
+      <w:tr>
+        <w:trPr>
+          <w:trHeight w:val="530" w:hRule="atLeast"/>
+        </w:trPr>
+        <w:tc>
+          <w:tcPr>
+            <w:tcW w:w="2000" w:type="dxa"/>
+          </w:tcPr>
+          <w:p>
+            <w:pPr/>
+            <w:r>
+              <w:t xml:space="preserve">updated_at</w:t>
+            </w:r>
+          </w:p>
+        </w:tc>
+        <w:tc>
+          <w:tcPr>
+            <w:tcW w:w="2000" w:type="dxa"/>
+          </w:tcPr>
+          <w:p>
+            <w:pPr/>
+            <w:r>
+              <w:t xml:space="preserve">datetime2</w:t>
+            </w:r>
+          </w:p>
+        </w:tc>
+        <w:tc>
+          <w:tcPr>
+            <w:tcW w:w="2000" w:type="dxa"/>
+          </w:tcPr>
+          <w:p>
+            <w:pPr/>
+            <w:r>
+              <w:t xml:space="preserve">(6)</w:t>
+            </w:r>
+          </w:p>
+        </w:tc>
+        <w:tc>
+          <w:tcPr>
+            <w:tcW w:w="2000" w:type="dxa"/>
+          </w:tcPr>
+          <w:p>
+            <w:pPr/>
+            <w:r>
+              <w:t xml:space="preserve">IS NULL</w:t>
+            </w:r>
+          </w:p>
+        </w:tc>
+      </w:tr>
+      <w:tr>
+        <w:trPr>
+          <w:trHeight w:val="530" w:hRule="atLeast"/>
+        </w:trPr>
+        <w:tc>
+          <w:tcPr>
+            <w:tcW w:w="2000" w:type="dxa"/>
+          </w:tcPr>
+          <w:p>
+            <w:pPr/>
+            <w:r>
+              <w:t xml:space="preserve">updated_by</w:t>
+            </w:r>
+          </w:p>
+        </w:tc>
+        <w:tc>
+          <w:tcPr>
+            <w:tcW w:w="2000" w:type="dxa"/>
+          </w:tcPr>
+          <w:p>
+            <w:pPr/>
+            <w:r>
+              <w:t xml:space="preserve">bigint</w:t>
+            </w:r>
+          </w:p>
+        </w:tc>
+        <w:tc>
+          <w:tcPr>
+            <w:tcW w:w="2000" w:type="dxa"/>
+          </w:tcPr>
+          <w:p>
+            <w:pPr/>
+            <w:r>
+              <w:t xml:space="preserve">-</w:t>
+            </w:r>
+          </w:p>
+        </w:tc>
+        <w:tc>
+          <w:tcPr>
+            <w:tcW w:w="2000" w:type="dxa"/>
+          </w:tcPr>
+          <w:p>
+            <w:pPr/>
+            <w:r>
+              <w:t xml:space="preserve">IS NULL</w:t>
+            </w:r>
+          </w:p>
+        </w:tc>
+      </w:tr>
+      <w:tr>
+        <w:trPr>
+          <w:trHeight w:val="530" w:hRule="atLeast"/>
+        </w:trPr>
+        <w:tc>
+          <w:tcPr>
+            <w:tcW w:w="2000" w:type="dxa"/>
+          </w:tcPr>
+          <w:p>
+            <w:pPr/>
+            <w:r>
+              <w:t xml:space="preserve">version</w:t>
+            </w:r>
+          </w:p>
+        </w:tc>
+        <w:tc>
+          <w:tcPr>
+            <w:tcW w:w="2000" w:type="dxa"/>
+          </w:tcPr>
+          <w:p>
+            <w:pPr/>
+            <w:r>
+              <w:t xml:space="preserve">int</w:t>
+            </w:r>
+          </w:p>
+        </w:tc>
+        <w:tc>
+          <w:tcPr>
+            <w:tcW w:w="2000" w:type="dxa"/>
+          </w:tcPr>
+          <w:p>
+            <w:pPr/>
+            <w:r>
+              <w:t xml:space="preserve">-</w:t>
+            </w:r>
+          </w:p>
+        </w:tc>
+        <w:tc>
+          <w:tcPr>
+            <w:tcW w:w="2000" w:type="dxa"/>
+          </w:tcPr>
+          <w:p>
+            <w:pPr/>
+            <w:r>
+              <w:t xml:space="preserve">NOT NULL</w:t>
+            </w:r>
+          </w:p>
+        </w:tc>
+      </w:tr>
+      <w:tr>
+        <w:trPr>
+          <w:trHeight w:val="530" w:hRule="atLeast"/>
+        </w:trPr>
+        <w:tc>
+          <w:tcPr>
+            <w:tcW w:w="2000" w:type="dxa"/>
+          </w:tcPr>
+          <w:p>
+            <w:pPr/>
+            <w:r>
+              <w:t xml:space="preserve">is_active</w:t>
+            </w:r>
+          </w:p>
+        </w:tc>
+        <w:tc>
+          <w:tcPr>
+            <w:tcW w:w="2000" w:type="dxa"/>
+          </w:tcPr>
+          <w:p>
+            <w:pPr/>
+            <w:r>
+              <w:t xml:space="preserve">bit</w:t>
+            </w:r>
+          </w:p>
+        </w:tc>
+        <w:tc>
+          <w:tcPr>
+            <w:tcW w:w="2000" w:type="dxa"/>
+          </w:tcPr>
+          <w:p>
+            <w:pPr/>
+            <w:r>
+              <w:t xml:space="preserve">-</w:t>
+            </w:r>
+          </w:p>
+        </w:tc>
+        <w:tc>
+          <w:tcPr>
+            <w:tcW w:w="2000" w:type="dxa"/>
+          </w:tcPr>
+          <w:p>
+            <w:pPr/>
+            <w:r>
+              <w:t xml:space="preserve">NOT NULL</w:t>
+            </w:r>
+          </w:p>
+        </w:tc>
+      </w:tr>
+      <w:tr>
+        <w:trPr>
+          <w:trHeight w:val="530" w:hRule="atLeast"/>
+        </w:trPr>
+        <w:tc>
+          <w:tcPr>
+            <w:tcW w:w="2000" w:type="dxa"/>
+          </w:tcPr>
+          <w:p>
+            <w:pPr/>
+            <w:r>
+              <w:t xml:space="preserve">is_deleted</w:t>
+            </w:r>
+          </w:p>
+        </w:tc>
+        <w:tc>
+          <w:tcPr>
+            <w:tcW w:w="2000" w:type="dxa"/>
+          </w:tcPr>
+          <w:p>
+            <w:pPr/>
+            <w:r>
+              <w:t xml:space="preserve">bit</w:t>
+            </w:r>
+          </w:p>
+        </w:tc>
+        <w:tc>
+          <w:tcPr>
+            <w:tcW w:w="2000" w:type="dxa"/>
+          </w:tcPr>
+          <w:p>
+            <w:pPr/>
+            <w:r>
+              <w:t xml:space="preserve">-</w:t>
+            </w:r>
+          </w:p>
+        </w:tc>
+        <w:tc>
+          <w:tcPr>
+            <w:tcW w:w="2000" w:type="dxa"/>
+          </w:tcPr>
+          <w:p>
+            <w:pPr/>
+            <w:r>
+              <w:t xml:space="preserve">NOT NULL</w:t>
+            </w:r>
+          </w:p>
+        </w:tc>
+      </w:tr>
+      <w:tr>
+        <w:trPr>
+          <w:trHeight w:val="530" w:hRule="atLeast"/>
+        </w:trPr>
+        <w:tc>
+          <w:tcPr>
+            <w:tcW w:w="2000" w:type="dxa"/>
+          </w:tcPr>
+          <w:p>
+            <w:pPr/>
+            <w:r>
+              <w:t xml:space="preserve">code</w:t>
+            </w:r>
+          </w:p>
+        </w:tc>
+        <w:tc>
+          <w:tcPr>
+            <w:tcW w:w="2000" w:type="dxa"/>
+          </w:tcPr>
+          <w:p>
+            <w:pPr/>
+            <w:r>
+              <w:t xml:space="preserve">varchar</w:t>
+            </w:r>
+          </w:p>
+        </w:tc>
+        <w:tc>
+          <w:tcPr>
+            <w:tcW w:w="2000" w:type="dxa"/>
+          </w:tcPr>
+          <w:p>
+            <w:pPr/>
+            <w:r>
+              <w:t xml:space="preserve">30</w:t>
+            </w:r>
+          </w:p>
+        </w:tc>
+        <w:tc>
+          <w:tcPr>
+            <w:tcW w:w="2000" w:type="dxa"/>
+          </w:tcPr>
+          <w:p>
+            <w:pPr/>
+            <w:r>
+              <w:t xml:space="preserve">NOT NULL</w:t>
+            </w:r>
+          </w:p>
+        </w:tc>
+      </w:tr>
+      <w:tr>
+        <w:trPr>
+          <w:trHeight w:val="530" w:hRule="atLeast"/>
+        </w:trPr>
+        <w:tc>
+          <w:tcPr>
+            <w:tcW w:w="2000" w:type="dxa"/>
+          </w:tcPr>
+          <w:p>
+            <w:pPr/>
+            <w:r>
+              <w:t xml:space="preserve">name</w:t>
+            </w:r>
+          </w:p>
+        </w:tc>
+        <w:tc>
+          <w:tcPr>
+            <w:tcW w:w="2000" w:type="dxa"/>
+          </w:tcPr>
+          <w:p>
+            <w:pPr/>
+            <w:r>
+              <w:t xml:space="preserve">nvarchar</w:t>
+            </w:r>
+          </w:p>
+        </w:tc>
+        <w:tc>
+          <w:tcPr>
+            <w:tcW w:w="2000" w:type="dxa"/>
+          </w:tcPr>
+          <w:p>
+            <w:pPr/>
+            <w:r>
+              <w:t xml:space="preserve">200</w:t>
+            </w:r>
+          </w:p>
+        </w:tc>
+        <w:tc>
+          <w:tcPr>
+            <w:tcW w:w="2000" w:type="dxa"/>
+          </w:tcPr>
+          <w:p>
+            <w:pPr/>
+            <w:r>
+              <w:t xml:space="preserve">NOT NULL</w:t>
+            </w:r>
+          </w:p>
+        </w:tc>
+      </w:tr>
+      <w:tr>
+        <w:trPr>
+          <w:trHeight w:val="530" w:hRule="atLeast"/>
+        </w:trPr>
+        <w:tc>
+          <w:tcPr>
+            <w:tcW w:w="2000" w:type="dxa"/>
+          </w:tcPr>
+          <w:p>
+            <w:pPr/>
+            <w:r>
+              <w:t xml:space="preserve">custom_fields</w:t>
+            </w:r>
+          </w:p>
+        </w:tc>
+        <w:tc>
+          <w:tcPr>
+            <w:tcW w:w="2000" w:type="dxa"/>
+          </w:tcPr>
+          <w:p>
+            <w:pPr/>
+            <w:r>
+              <w:t xml:space="preserve">nvarchar</w:t>
+            </w:r>
+          </w:p>
+        </w:tc>
+        <w:tc>
+          <w:tcPr>
+            <w:tcW w:w="2000" w:type="dxa"/>
+          </w:tcPr>
+          <w:p>
+            <w:pPr/>
+            <w:r>
+              <w:t xml:space="preserve">MAX</w:t>
+            </w:r>
+          </w:p>
+        </w:tc>
+        <w:tc>
+          <w:tcPr>
+            <w:tcW w:w="2000" w:type="dxa"/>
+          </w:tcPr>
+          <w:p>
+            <w:pPr/>
+            <w:r>
+              <w:t xml:space="preserve">IS NULL</w:t>
+            </w:r>
+          </w:p>
+        </w:tc>
+      </w:tr>
+    </w:tbl>
+    <w:p/>
+    <w:p>
+      <w:pPr/>
+      <w:r>
+        <w:t xml:space="preserve">Table Name: md_process</w:t>
+      </w:r>
+    </w:p>
+    <w:p>
+      <w:pPr/>
+      <w:r>
+        <w:t xml:space="preserve">Primary Key: id</w:t>
+      </w:r>
+    </w:p>
+    <w:p>
+      <w:pPr/>
+      <w:r>
+        <w:t xml:space="preserve">This table stores the production processes with their standard piece rates.</w:t>
+      </w:r>
+    </w:p>
+    <w:tbl>
+      <w:tblPr>
+        <w:tblStyle w:val="TableGrid"/>
+        <w:tblW w:w="8000" w:type="dxa"/>
+        <w:jc w:val="left"/>
+        <w:tblBorders>
+          <w:top w:val="single" w:color="000000" w:sz="4" w:space="0"/>
+          <w:left w:val="single" w:color="000000" w:sz="4" w:space="0"/>
+          <w:bottom w:val="single" w:color="000000" w:sz="4" w:space="0"/>
+          <w:right w:val="single" w:color="000000" w:sz="4" w:space="0"/>
+          <w:insideH w:val="single" w:color="000000" w:sz="4" w:space="0"/>
+          <w:insideV w:val="single" w:color="000000" w:sz="4" w:space="0"/>
+        </w:tblBorders>
+        <w:tblLayout w:type="fixed"/>
+        <w:tblCellMar>
+          <w:top w:w="100" w:type="dxa"/>
+          <w:left w:w="100" w:type="dxa"/>
+          <w:bottom w:w="100" w:type="dxa"/>
+          <w:right w:w="100" w:type="dxa"/>
+        </w:tblCellMar>
+      </w:tblPr>
+      <w:tblGrid>
+        <w:gridCol w:w="2000"/>
+        <w:gridCol w:w="2000"/>
+        <w:gridCol w:w="2000"/>
+        <w:gridCol w:w="2000"/>
+      </w:tblGrid>
+      <w:tr>
+        <w:trPr>
+          <w:trHeight w:val="530" w:hRule="atLeast"/>
+        </w:trPr>
+        <w:tc>
+          <w:tcPr>
+            <w:tcW w:w="2000" w:type="dxa"/>
+          </w:tcPr>
+          <w:p>
+            <w:pPr>
+              <w:jc w:val="center"/>
+            </w:pPr>
+            <w:r>
+              <w:rPr>
+                <w:b/>
+              </w:rPr>
+              <w:t xml:space="preserve">Name of Attribute</w:t>
+            </w:r>
+          </w:p>
+        </w:tc>
+        <w:tc>
+          <w:tcPr>
+            <w:tcW w:w="2000" w:type="dxa"/>
+          </w:tcPr>
+          <w:p>
+            <w:pPr>
+              <w:jc w:val="center"/>
+            </w:pPr>
+            <w:r>
+              <w:rPr>
+                <w:b/>
+              </w:rPr>
+              <w:t xml:space="preserve">Data Type</w:t>
+            </w:r>
+          </w:p>
+        </w:tc>
+        <w:tc>
+          <w:tcPr>
+            <w:tcW w:w="2000" w:type="dxa"/>
+          </w:tcPr>
+          <w:p>
+            <w:pPr>
+              <w:jc w:val="center"/>
+            </w:pPr>
+            <w:r>
+              <w:rPr>
+                <w:b/>
+              </w:rPr>
+              <w:t xml:space="preserve">Size</w:t>
+            </w:r>
+          </w:p>
+        </w:tc>
+        <w:tc>
+          <w:tcPr>
+            <w:tcW w:w="2000" w:type="dxa"/>
+          </w:tcPr>
+          <w:p>
+            <w:pPr>
+              <w:jc w:val="center"/>
+            </w:pPr>
+            <w:r>
+              <w:rPr>
+                <w:b/>
+              </w:rPr>
+              <w:t xml:space="preserve">PK/FK/IS NULL/ NOT NULL</w:t>
+            </w:r>
+          </w:p>
+        </w:tc>
+      </w:tr>
+      <w:tr>
+        <w:trPr>
+          <w:trHeight w:val="530" w:hRule="atLeast"/>
+        </w:trPr>
+        <w:tc>
+          <w:tcPr>
+            <w:tcW w:w="2000" w:type="dxa"/>
+          </w:tcPr>
+          <w:p>
+            <w:pPr/>
+            <w:r>
+              <w:t xml:space="preserve">id</w:t>
+            </w:r>
+          </w:p>
+        </w:tc>
+        <w:tc>
+          <w:tcPr>
+            <w:tcW w:w="2000" w:type="dxa"/>
+          </w:tcPr>
+          <w:p>
+            <w:pPr/>
+            <w:r>
+              <w:t xml:space="preserve">bigint</w:t>
+            </w:r>
+          </w:p>
+        </w:tc>
+        <w:tc>
+          <w:tcPr>
+            <w:tcW w:w="2000" w:type="dxa"/>
+          </w:tcPr>
+          <w:p>
+            <w:pPr/>
+            <w:r>
+              <w:t xml:space="preserve">-</w:t>
+            </w:r>
+          </w:p>
+        </w:tc>
+        <w:tc>
+          <w:tcPr>
+            <w:tcW w:w="2000" w:type="dxa"/>
+          </w:tcPr>
+          <w:p>
+            <w:pPr/>
+            <w:r>
+              <w:t xml:space="preserve">PK, NOT NULL</w:t>
+            </w:r>
+          </w:p>
+        </w:tc>
+      </w:tr>
+      <w:tr>
+        <w:trPr>
+          <w:trHeight w:val="530" w:hRule="atLeast"/>
+        </w:trPr>
+        <w:tc>
+          <w:tcPr>
+            <w:tcW w:w="2000" w:type="dxa"/>
+          </w:tcPr>
+          <w:p>
+            <w:pPr/>
+            <w:r>
+              <w:t xml:space="preserve">category_id</w:t>
+            </w:r>
+          </w:p>
+        </w:tc>
+        <w:tc>
+          <w:tcPr>
+            <w:tcW w:w="2000" w:type="dxa"/>
+          </w:tcPr>
+          <w:p>
+            <w:pPr/>
+            <w:r>
+              <w:t xml:space="preserve">bigint</w:t>
+            </w:r>
+          </w:p>
+        </w:tc>
+        <w:tc>
+          <w:tcPr>
+            <w:tcW w:w="2000" w:type="dxa"/>
+          </w:tcPr>
+          <w:p>
+            <w:pPr/>
+            <w:r>
+              <w:t xml:space="preserve">-</w:t>
+            </w:r>
+          </w:p>
+        </w:tc>
+        <w:tc>
+          <w:tcPr>
+            <w:tcW w:w="2000" w:type="dxa"/>
+          </w:tcPr>
+          <w:p>
+            <w:pPr/>
+            <w:r>
+              <w:t xml:space="preserve">FK, IS NULL</w:t>
+            </w:r>
+          </w:p>
+        </w:tc>
+      </w:tr>
+      <w:tr>
+        <w:trPr>
+          <w:trHeight w:val="530" w:hRule="atLeast"/>
+        </w:trPr>
+        <w:tc>
+          <w:tcPr>
+            <w:tcW w:w="2000" w:type="dxa"/>
+          </w:tcPr>
+          <w:p>
+            <w:pPr/>
+            <w:r>
+              <w:t xml:space="preserve">uom_id</w:t>
+            </w:r>
+          </w:p>
+        </w:tc>
+        <w:tc>
+          <w:tcPr>
+            <w:tcW w:w="2000" w:type="dxa"/>
+          </w:tcPr>
+          <w:p>
+            <w:pPr/>
+            <w:r>
+              <w:t xml:space="preserve">bigint</w:t>
+            </w:r>
+          </w:p>
+        </w:tc>
+        <w:tc>
+          <w:tcPr>
+            <w:tcW w:w="2000" w:type="dxa"/>
+          </w:tcPr>
+          <w:p>
+            <w:pPr/>
+            <w:r>
+              <w:t xml:space="preserve">-</w:t>
+            </w:r>
+          </w:p>
+        </w:tc>
+        <w:tc>
+          <w:tcPr>
+            <w:tcW w:w="2000" w:type="dxa"/>
+          </w:tcPr>
+          <w:p>
+            <w:pPr/>
+            <w:r>
+              <w:t xml:space="preserve">FK, IS NULL</w:t>
+            </w:r>
+          </w:p>
+        </w:tc>
+      </w:tr>
+      <w:tr>
+        <w:trPr>
+          <w:trHeight w:val="530" w:hRule="atLeast"/>
+        </w:trPr>
+        <w:tc>
+          <w:tcPr>
+            <w:tcW w:w="2000" w:type="dxa"/>
+          </w:tcPr>
+          <w:p>
+            <w:pPr/>
+            <w:r>
+              <w:t xml:space="preserve">standard_rate</w:t>
+            </w:r>
+          </w:p>
+        </w:tc>
+        <w:tc>
+          <w:tcPr>
+            <w:tcW w:w="2000" w:type="dxa"/>
+          </w:tcPr>
+          <w:p>
+            <w:pPr/>
+            <w:r>
+              <w:t xml:space="preserve">decimal</w:t>
+            </w:r>
+          </w:p>
+        </w:tc>
+        <w:tc>
+          <w:tcPr>
+            <w:tcW w:w="2000" w:type="dxa"/>
+          </w:tcPr>
+          <w:p>
+            <w:pPr/>
+            <w:r>
+              <w:t xml:space="preserve">(19,6)</w:t>
+            </w:r>
+          </w:p>
+        </w:tc>
+        <w:tc>
+          <w:tcPr>
+            <w:tcW w:w="2000" w:type="dxa"/>
+          </w:tcPr>
+          <w:p>
+            <w:pPr/>
+            <w:r>
+              <w:t xml:space="preserve">NOT NULL</w:t>
+            </w:r>
+          </w:p>
+        </w:tc>
+      </w:tr>
+      <w:tr>
+        <w:trPr>
+          <w:trHeight w:val="530" w:hRule="atLeast"/>
+        </w:trPr>
+        <w:tc>
+          <w:tcPr>
+            <w:tcW w:w="2000" w:type="dxa"/>
+          </w:tcPr>
+          <w:p>
+            <w:pPr/>
+            <w:r>
+              <w:t xml:space="preserve">sort_order</w:t>
+            </w:r>
+          </w:p>
+        </w:tc>
+        <w:tc>
+          <w:tcPr>
+            <w:tcW w:w="2000" w:type="dxa"/>
+          </w:tcPr>
+          <w:p>
+            <w:pPr/>
+            <w:r>
+              <w:t xml:space="preserve">int</w:t>
+            </w:r>
+          </w:p>
+        </w:tc>
+        <w:tc>
+          <w:tcPr>
+            <w:tcW w:w="2000" w:type="dxa"/>
+          </w:tcPr>
+          <w:p>
+            <w:pPr/>
+            <w:r>
+              <w:t xml:space="preserve">-</w:t>
+            </w:r>
+          </w:p>
+        </w:tc>
+        <w:tc>
+          <w:tcPr>
+            <w:tcW w:w="2000" w:type="dxa"/>
+          </w:tcPr>
+          <w:p>
+            <w:pPr/>
+            <w:r>
+              <w:t xml:space="preserve">NOT NULL</w:t>
+            </w:r>
+          </w:p>
+        </w:tc>
+      </w:tr>
+      <w:tr>
+        <w:trPr>
+          <w:trHeight w:val="530" w:hRule="atLeast"/>
+        </w:trPr>
+        <w:tc>
+          <w:tcPr>
+            <w:tcW w:w="2000" w:type="dxa"/>
+          </w:tcPr>
+          <w:p>
+            <w:pPr/>
+            <w:r>
+              <w:t xml:space="preserve">company_id</w:t>
+            </w:r>
+          </w:p>
+        </w:tc>
+        <w:tc>
+          <w:tcPr>
+            <w:tcW w:w="2000" w:type="dxa"/>
+          </w:tcPr>
+          <w:p>
+            <w:pPr/>
+            <w:r>
+              <w:t xml:space="preserve">bigint</w:t>
+            </w:r>
+          </w:p>
+        </w:tc>
+        <w:tc>
+          <w:tcPr>
+            <w:tcW w:w="2000" w:type="dxa"/>
+          </w:tcPr>
+          <w:p>
+            <w:pPr/>
+            <w:r>
+              <w:t xml:space="preserve">-</w:t>
+            </w:r>
+          </w:p>
+        </w:tc>
+        <w:tc>
+          <w:tcPr>
+            <w:tcW w:w="2000" w:type="dxa"/>
+          </w:tcPr>
+          <w:p>
+            <w:pPr/>
+            <w:r>
+              <w:t xml:space="preserve">FK, NOT NULL</w:t>
+            </w:r>
+          </w:p>
+        </w:tc>
+      </w:tr>
+      <w:tr>
+        <w:trPr>
+          <w:trHeight w:val="530" w:hRule="atLeast"/>
+        </w:trPr>
+        <w:tc>
+          <w:tcPr>
+            <w:tcW w:w="2000" w:type="dxa"/>
+          </w:tcPr>
+          <w:p>
+            <w:pPr/>
+            <w:r>
+              <w:t xml:space="preserve">created_at</w:t>
+            </w:r>
+          </w:p>
+        </w:tc>
+        <w:tc>
+          <w:tcPr>
+            <w:tcW w:w="2000" w:type="dxa"/>
+          </w:tcPr>
+          <w:p>
+            <w:pPr/>
+            <w:r>
+              <w:t xml:space="preserve">datetime2</w:t>
+            </w:r>
+          </w:p>
+        </w:tc>
+        <w:tc>
+          <w:tcPr>
+            <w:tcW w:w="2000" w:type="dxa"/>
+          </w:tcPr>
+          <w:p>
+            <w:pPr/>
+            <w:r>
+              <w:t xml:space="preserve">(6)</w:t>
+            </w:r>
+          </w:p>
+        </w:tc>
+        <w:tc>
+          <w:tcPr>
+            <w:tcW w:w="2000" w:type="dxa"/>
+          </w:tcPr>
+          <w:p>
+            <w:pPr/>
+            <w:r>
+              <w:t xml:space="preserve">NOT NULL</w:t>
+            </w:r>
+          </w:p>
+        </w:tc>
+      </w:tr>
+      <w:tr>
+        <w:trPr>
+          <w:trHeight w:val="530" w:hRule="atLeast"/>
+        </w:trPr>
+        <w:tc>
+          <w:tcPr>
+            <w:tcW w:w="2000" w:type="dxa"/>
+          </w:tcPr>
+          <w:p>
+            <w:pPr/>
+            <w:r>
+              <w:t xml:space="preserve">created_by</w:t>
+            </w:r>
+          </w:p>
+        </w:tc>
+        <w:tc>
+          <w:tcPr>
+            <w:tcW w:w="2000" w:type="dxa"/>
+          </w:tcPr>
+          <w:p>
+            <w:pPr/>
+            <w:r>
+              <w:t xml:space="preserve">bigint</w:t>
+            </w:r>
+          </w:p>
+        </w:tc>
+        <w:tc>
+          <w:tcPr>
+            <w:tcW w:w="2000" w:type="dxa"/>
+          </w:tcPr>
+          <w:p>
+            <w:pPr/>
+            <w:r>
+              <w:t xml:space="preserve">-</w:t>
+            </w:r>
+          </w:p>
+        </w:tc>
+        <w:tc>
+          <w:tcPr>
+            <w:tcW w:w="2000" w:type="dxa"/>
+          </w:tcPr>
+          <w:p>
+            <w:pPr/>
+            <w:r>
+              <w:t xml:space="preserve">NOT NULL</w:t>
+            </w:r>
+          </w:p>
+        </w:tc>
+      </w:tr>
+      <w:tr>
+        <w:trPr>
+          <w:trHeight w:val="530" w:hRule="atLeast"/>
+        </w:trPr>
+        <w:tc>
+          <w:tcPr>
+            <w:tcW w:w="2000" w:type="dxa"/>
+          </w:tcPr>
+          <w:p>
+            <w:pPr/>
+            <w:r>
+              <w:t xml:space="preserve">updated_at</w:t>
+            </w:r>
+          </w:p>
+        </w:tc>
+        <w:tc>
+          <w:tcPr>
+            <w:tcW w:w="2000" w:type="dxa"/>
+          </w:tcPr>
+          <w:p>
+            <w:pPr/>
+            <w:r>
+              <w:t xml:space="preserve">datetime2</w:t>
+            </w:r>
+          </w:p>
+        </w:tc>
+        <w:tc>
+          <w:tcPr>
+            <w:tcW w:w="2000" w:type="dxa"/>
+          </w:tcPr>
+          <w:p>
+            <w:pPr/>
+            <w:r>
+              <w:t xml:space="preserve">(6)</w:t>
+            </w:r>
+          </w:p>
+        </w:tc>
+        <w:tc>
+          <w:tcPr>
+            <w:tcW w:w="2000" w:type="dxa"/>
+          </w:tcPr>
+          <w:p>
+            <w:pPr/>
+            <w:r>
+              <w:t xml:space="preserve">IS NULL</w:t>
+            </w:r>
+          </w:p>
+        </w:tc>
+      </w:tr>
+      <w:tr>
+        <w:trPr>
+          <w:trHeight w:val="530" w:hRule="atLeast"/>
+        </w:trPr>
+        <w:tc>
+          <w:tcPr>
+            <w:tcW w:w="2000" w:type="dxa"/>
+          </w:tcPr>
+          <w:p>
+            <w:pPr/>
+            <w:r>
+              <w:t xml:space="preserve">updated_by</w:t>
+            </w:r>
+          </w:p>
+        </w:tc>
+        <w:tc>
+          <w:tcPr>
+            <w:tcW w:w="2000" w:type="dxa"/>
+          </w:tcPr>
+          <w:p>
+            <w:pPr/>
+            <w:r>
+              <w:t xml:space="preserve">bigint</w:t>
+            </w:r>
+          </w:p>
+        </w:tc>
+        <w:tc>
+          <w:tcPr>
+            <w:tcW w:w="2000" w:type="dxa"/>
+          </w:tcPr>
+          <w:p>
+            <w:pPr/>
+            <w:r>
+              <w:t xml:space="preserve">-</w:t>
+            </w:r>
+          </w:p>
+        </w:tc>
+        <w:tc>
+          <w:tcPr>
+            <w:tcW w:w="2000" w:type="dxa"/>
+          </w:tcPr>
+          <w:p>
+            <w:pPr/>
+            <w:r>
+              <w:t xml:space="preserve">IS NULL</w:t>
+            </w:r>
+          </w:p>
+        </w:tc>
+      </w:tr>
+      <w:tr>
+        <w:trPr>
+          <w:trHeight w:val="530" w:hRule="atLeast"/>
+        </w:trPr>
+        <w:tc>
+          <w:tcPr>
+            <w:tcW w:w="2000" w:type="dxa"/>
+          </w:tcPr>
+          <w:p>
+            <w:pPr/>
+            <w:r>
+              <w:t xml:space="preserve">version</w:t>
+            </w:r>
+          </w:p>
+        </w:tc>
+        <w:tc>
+          <w:tcPr>
+            <w:tcW w:w="2000" w:type="dxa"/>
+          </w:tcPr>
+          <w:p>
+            <w:pPr/>
+            <w:r>
+              <w:t xml:space="preserve">int</w:t>
+            </w:r>
+          </w:p>
+        </w:tc>
+        <w:tc>
+          <w:tcPr>
+            <w:tcW w:w="2000" w:type="dxa"/>
+          </w:tcPr>
+          <w:p>
+            <w:pPr/>
+            <w:r>
+              <w:t xml:space="preserve">-</w:t>
+            </w:r>
+          </w:p>
+        </w:tc>
+        <w:tc>
+          <w:tcPr>
+            <w:tcW w:w="2000" w:type="dxa"/>
+          </w:tcPr>
+          <w:p>
+            <w:pPr/>
+            <w:r>
+              <w:t xml:space="preserve">NOT NULL</w:t>
+            </w:r>
+          </w:p>
+        </w:tc>
+      </w:tr>
+      <w:tr>
+        <w:trPr>
+          <w:trHeight w:val="530" w:hRule="atLeast"/>
+        </w:trPr>
+        <w:tc>
+          <w:tcPr>
+            <w:tcW w:w="2000" w:type="dxa"/>
+          </w:tcPr>
+          <w:p>
+            <w:pPr/>
+            <w:r>
+              <w:t xml:space="preserve">is_active</w:t>
+            </w:r>
+          </w:p>
+        </w:tc>
+        <w:tc>
+          <w:tcPr>
+            <w:tcW w:w="2000" w:type="dxa"/>
+          </w:tcPr>
+          <w:p>
+            <w:pPr/>
+            <w:r>
+              <w:t xml:space="preserve">bit</w:t>
+            </w:r>
+          </w:p>
+        </w:tc>
+        <w:tc>
+          <w:tcPr>
+            <w:tcW w:w="2000" w:type="dxa"/>
+          </w:tcPr>
+          <w:p>
+            <w:pPr/>
+            <w:r>
+              <w:t xml:space="preserve">-</w:t>
+            </w:r>
+          </w:p>
+        </w:tc>
+        <w:tc>
+          <w:tcPr>
+            <w:tcW w:w="2000" w:type="dxa"/>
+          </w:tcPr>
+          <w:p>
+            <w:pPr/>
+            <w:r>
+              <w:t xml:space="preserve">NOT NULL</w:t>
+            </w:r>
+          </w:p>
+        </w:tc>
+      </w:tr>
+      <w:tr>
+        <w:trPr>
+          <w:trHeight w:val="530" w:hRule="atLeast"/>
+        </w:trPr>
+        <w:tc>
+          <w:tcPr>
+            <w:tcW w:w="2000" w:type="dxa"/>
+          </w:tcPr>
+          <w:p>
+            <w:pPr/>
+            <w:r>
+              <w:t xml:space="preserve">is_deleted</w:t>
+            </w:r>
+          </w:p>
+        </w:tc>
+        <w:tc>
+          <w:tcPr>
+            <w:tcW w:w="2000" w:type="dxa"/>
+          </w:tcPr>
+          <w:p>
+            <w:pPr/>
+            <w:r>
+              <w:t xml:space="preserve">bit</w:t>
+            </w:r>
+          </w:p>
+        </w:tc>
+        <w:tc>
+          <w:tcPr>
+            <w:tcW w:w="2000" w:type="dxa"/>
+          </w:tcPr>
+          <w:p>
+            <w:pPr/>
+            <w:r>
+              <w:t xml:space="preserve">-</w:t>
+            </w:r>
+          </w:p>
+        </w:tc>
+        <w:tc>
+          <w:tcPr>
+            <w:tcW w:w="2000" w:type="dxa"/>
+          </w:tcPr>
+          <w:p>
+            <w:pPr/>
+            <w:r>
+              <w:t xml:space="preserve">NOT NULL</w:t>
+            </w:r>
+          </w:p>
+        </w:tc>
+      </w:tr>
+      <w:tr>
+        <w:trPr>
+          <w:trHeight w:val="530" w:hRule="atLeast"/>
+        </w:trPr>
+        <w:tc>
+          <w:tcPr>
+            <w:tcW w:w="2000" w:type="dxa"/>
+          </w:tcPr>
+          <w:p>
+            <w:pPr/>
+            <w:r>
+              <w:t xml:space="preserve">code</w:t>
+            </w:r>
+          </w:p>
+        </w:tc>
+        <w:tc>
+          <w:tcPr>
+            <w:tcW w:w="2000" w:type="dxa"/>
+          </w:tcPr>
+          <w:p>
+            <w:pPr/>
+            <w:r>
+              <w:t xml:space="preserve">varchar</w:t>
+            </w:r>
+          </w:p>
+        </w:tc>
+        <w:tc>
+          <w:tcPr>
+            <w:tcW w:w="2000" w:type="dxa"/>
+          </w:tcPr>
+          <w:p>
+            <w:pPr/>
+            <w:r>
+              <w:t xml:space="preserve">30</w:t>
+            </w:r>
+          </w:p>
+        </w:tc>
+        <w:tc>
+          <w:tcPr>
+            <w:tcW w:w="2000" w:type="dxa"/>
+          </w:tcPr>
+          <w:p>
+            <w:pPr/>
+            <w:r>
+              <w:t xml:space="preserve">NOT NULL</w:t>
+            </w:r>
+          </w:p>
+        </w:tc>
+      </w:tr>
+      <w:tr>
+        <w:trPr>
+          <w:trHeight w:val="530" w:hRule="atLeast"/>
+        </w:trPr>
+        <w:tc>
+          <w:tcPr>
+            <w:tcW w:w="2000" w:type="dxa"/>
+          </w:tcPr>
+          <w:p>
+            <w:pPr/>
+            <w:r>
+              <w:t xml:space="preserve">name</w:t>
+            </w:r>
+          </w:p>
+        </w:tc>
+        <w:tc>
+          <w:tcPr>
+            <w:tcW w:w="2000" w:type="dxa"/>
+          </w:tcPr>
+          <w:p>
+            <w:pPr/>
+            <w:r>
+              <w:t xml:space="preserve">nvarchar</w:t>
+            </w:r>
+          </w:p>
+        </w:tc>
+        <w:tc>
+          <w:tcPr>
+            <w:tcW w:w="2000" w:type="dxa"/>
+          </w:tcPr>
+          <w:p>
+            <w:pPr/>
+            <w:r>
+              <w:t xml:space="preserve">200</w:t>
+            </w:r>
+          </w:p>
+        </w:tc>
+        <w:tc>
+          <w:tcPr>
+            <w:tcW w:w="2000" w:type="dxa"/>
+          </w:tcPr>
+          <w:p>
+            <w:pPr/>
+            <w:r>
+              <w:t xml:space="preserve">NOT NULL</w:t>
+            </w:r>
+          </w:p>
+        </w:tc>
+      </w:tr>
+      <w:tr>
+        <w:trPr>
+          <w:trHeight w:val="530" w:hRule="atLeast"/>
+        </w:trPr>
+        <w:tc>
+          <w:tcPr>
+            <w:tcW w:w="2000" w:type="dxa"/>
+          </w:tcPr>
+          <w:p>
+            <w:pPr/>
+            <w:r>
+              <w:t xml:space="preserve">custom_fields</w:t>
+            </w:r>
+          </w:p>
+        </w:tc>
+        <w:tc>
+          <w:tcPr>
+            <w:tcW w:w="2000" w:type="dxa"/>
+          </w:tcPr>
+          <w:p>
+            <w:pPr/>
+            <w:r>
+              <w:t xml:space="preserve">nvarchar</w:t>
+            </w:r>
+          </w:p>
+        </w:tc>
+        <w:tc>
+          <w:tcPr>
+            <w:tcW w:w="2000" w:type="dxa"/>
+          </w:tcPr>
+          <w:p>
+            <w:pPr/>
+            <w:r>
+              <w:t xml:space="preserve">MAX</w:t>
+            </w:r>
+          </w:p>
+        </w:tc>
+        <w:tc>
+          <w:tcPr>
+            <w:tcW w:w="2000" w:type="dxa"/>
+          </w:tcPr>
+          <w:p>
+            <w:pPr/>
+            <w:r>
+              <w:t xml:space="preserve">IS NULL</w:t>
+            </w:r>
+          </w:p>
+        </w:tc>
+      </w:tr>
+    </w:tbl>
+    <w:p/>
+    <w:p>
+      <w:pPr/>
+      <w:r>
+        <w:t xml:space="preserve">Table Name: md_process_category</w:t>
+      </w:r>
+    </w:p>
+    <w:p>
+      <w:pPr/>
+      <w:r>
+        <w:t xml:space="preserve">Primary Key: id</w:t>
+      </w:r>
+    </w:p>
+    <w:p>
+      <w:pPr/>
+      <w:r>
+        <w:t xml:space="preserve">This table stores the process categories used to group production processes.</w:t>
+      </w:r>
+    </w:p>
+    <w:tbl>
+      <w:tblPr>
+        <w:tblStyle w:val="TableGrid"/>
+        <w:tblW w:w="8000" w:type="dxa"/>
+        <w:jc w:val="left"/>
+        <w:tblBorders>
+          <w:top w:val="single" w:color="000000" w:sz="4" w:space="0"/>
+          <w:left w:val="single" w:color="000000" w:sz="4" w:space="0"/>
+          <w:bottom w:val="single" w:color="000000" w:sz="4" w:space="0"/>
+          <w:right w:val="single" w:color="000000" w:sz="4" w:space="0"/>
+          <w:insideH w:val="single" w:color="000000" w:sz="4" w:space="0"/>
+          <w:insideV w:val="single" w:color="000000" w:sz="4" w:space="0"/>
+        </w:tblBorders>
+        <w:tblLayout w:type="fixed"/>
+        <w:tblCellMar>
+          <w:top w:w="100" w:type="dxa"/>
+          <w:left w:w="100" w:type="dxa"/>
+          <w:bottom w:w="100" w:type="dxa"/>
+          <w:right w:w="100" w:type="dxa"/>
+        </w:tblCellMar>
+      </w:tblPr>
+      <w:tblGrid>
+        <w:gridCol w:w="2000"/>
+        <w:gridCol w:w="2000"/>
+        <w:gridCol w:w="2000"/>
+        <w:gridCol w:w="2000"/>
+      </w:tblGrid>
+      <w:tr>
+        <w:trPr>
+          <w:trHeight w:val="530" w:hRule="atLeast"/>
+        </w:trPr>
+        <w:tc>
+          <w:tcPr>
+            <w:tcW w:w="2000" w:type="dxa"/>
+          </w:tcPr>
+          <w:p>
+            <w:pPr>
+              <w:jc w:val="center"/>
+            </w:pPr>
+            <w:r>
+              <w:rPr>
+                <w:b/>
+              </w:rPr>
+              <w:t xml:space="preserve">Name of Attribute</w:t>
+            </w:r>
+          </w:p>
+        </w:tc>
+        <w:tc>
+          <w:tcPr>
+            <w:tcW w:w="2000" w:type="dxa"/>
+          </w:tcPr>
+          <w:p>
+            <w:pPr>
+              <w:jc w:val="center"/>
+            </w:pPr>
+            <w:r>
+              <w:rPr>
+                <w:b/>
+              </w:rPr>
+              <w:t xml:space="preserve">Data Type</w:t>
+            </w:r>
+          </w:p>
+        </w:tc>
+        <w:tc>
+          <w:tcPr>
+            <w:tcW w:w="2000" w:type="dxa"/>
+          </w:tcPr>
+          <w:p>
+            <w:pPr>
+              <w:jc w:val="center"/>
+            </w:pPr>
+            <w:r>
+              <w:rPr>
+                <w:b/>
+              </w:rPr>
+              <w:t xml:space="preserve">Size</w:t>
+            </w:r>
+          </w:p>
+        </w:tc>
+        <w:tc>
+          <w:tcPr>
+            <w:tcW w:w="2000" w:type="dxa"/>
+          </w:tcPr>
+          <w:p>
+            <w:pPr>
+              <w:jc w:val="center"/>
+            </w:pPr>
+            <w:r>
+              <w:rPr>
+                <w:b/>
+              </w:rPr>
+              <w:t xml:space="preserve">PK/FK/IS NULL/ NOT NULL</w:t>
+            </w:r>
+          </w:p>
+        </w:tc>
+      </w:tr>
+      <w:tr>
+        <w:trPr>
+          <w:trHeight w:val="530" w:hRule="atLeast"/>
+        </w:trPr>
+        <w:tc>
+          <w:tcPr>
+            <w:tcW w:w="2000" w:type="dxa"/>
+          </w:tcPr>
+          <w:p>
+            <w:pPr/>
+            <w:r>
+              <w:t xml:space="preserve">id</w:t>
+            </w:r>
+          </w:p>
+        </w:tc>
+        <w:tc>
+          <w:tcPr>
+            <w:tcW w:w="2000" w:type="dxa"/>
+          </w:tcPr>
+          <w:p>
+            <w:pPr/>
+            <w:r>
+              <w:t xml:space="preserve">bigint</w:t>
+            </w:r>
+          </w:p>
+        </w:tc>
+        <w:tc>
+          <w:tcPr>
+            <w:tcW w:w="2000" w:type="dxa"/>
+          </w:tcPr>
+          <w:p>
+            <w:pPr/>
+            <w:r>
+              <w:t xml:space="preserve">-</w:t>
+            </w:r>
+          </w:p>
+        </w:tc>
+        <w:tc>
+          <w:tcPr>
+            <w:tcW w:w="2000" w:type="dxa"/>
+          </w:tcPr>
+          <w:p>
+            <w:pPr/>
+            <w:r>
+              <w:t xml:space="preserve">PK, NOT NULL</w:t>
+            </w:r>
+          </w:p>
+        </w:tc>
+      </w:tr>
+      <w:tr>
+        <w:trPr>
+          <w:trHeight w:val="530" w:hRule="atLeast"/>
+        </w:trPr>
+        <w:tc>
+          <w:tcPr>
+            <w:tcW w:w="2000" w:type="dxa"/>
+          </w:tcPr>
+          <w:p>
+            <w:pPr/>
+            <w:r>
+              <w:t xml:space="preserve">sort_order</w:t>
+            </w:r>
+          </w:p>
+        </w:tc>
+        <w:tc>
+          <w:tcPr>
+            <w:tcW w:w="2000" w:type="dxa"/>
+          </w:tcPr>
+          <w:p>
+            <w:pPr/>
+            <w:r>
+              <w:t xml:space="preserve">int</w:t>
+            </w:r>
+          </w:p>
+        </w:tc>
+        <w:tc>
+          <w:tcPr>
+            <w:tcW w:w="2000" w:type="dxa"/>
+          </w:tcPr>
+          <w:p>
+            <w:pPr/>
+            <w:r>
+              <w:t xml:space="preserve">-</w:t>
+            </w:r>
+          </w:p>
+        </w:tc>
+        <w:tc>
+          <w:tcPr>
+            <w:tcW w:w="2000" w:type="dxa"/>
+          </w:tcPr>
+          <w:p>
+            <w:pPr/>
+            <w:r>
+              <w:t xml:space="preserve">NOT NULL</w:t>
             </w:r>
           </w:p>
         </w:tc>
@@ -31904,6 +33557,63 @@
           <w:i/>
         </w:rPr>
         <w:t xml:space="preserve">[Pending] System screenshot of Fund Account Edit Interface.</w:t>
+      </w:r>
+    </w:p>
+    <w:p>
+      <w:pPr>
+        <w:pStyle w:val="Heading5"/>
+      </w:pPr>
+      <w:r>
+        <w:t xml:space="preserve">4.2.1.8.27 Process View Interface</w:t>
+      </w:r>
+    </w:p>
+    <w:p>
+      <w:pPr>
+        <w:jc w:val="center"/>
+      </w:pPr>
+      <w:r>
+        <w:rPr>
+          <w:i/>
+        </w:rPr>
+        <w:t xml:space="preserve">[Pending] System screenshot of Process View Interface.</w:t>
+      </w:r>
+    </w:p>
+    <w:p>
+      <w:pPr>
+        <w:pStyle w:val="Heading5"/>
+      </w:pPr>
+      <w:r>
+        <w:t xml:space="preserve">4.2.1.8.28 Process Create Interface</w:t>
+      </w:r>
+    </w:p>
+    <w:p>
+      <w:pPr>
+        <w:jc w:val="center"/>
+      </w:pPr>
+      <w:r>
+        <w:rPr>
+          <w:i/>
+        </w:rPr>
+        <w:t xml:space="preserve">[Pending] System screenshot of Process Create Interface.</w:t>
+      </w:r>
+    </w:p>
+    <w:p>
+      <w:pPr>
+        <w:pStyle w:val="Heading5"/>
+      </w:pPr>
+      <w:r>
+        <w:t xml:space="preserve">4.2.1.8.29 Process Edit Interface</w:t>
+      </w:r>
+    </w:p>
+    <w:p>
+      <w:pPr>
+        <w:jc w:val="center"/>
+      </w:pPr>
+      <w:r>
+        <w:rPr>
+          <w:i/>
+        </w:rPr>
+        <w:t xml:space="preserve">[Pending] System screenshot of Process Edit Interface.</w:t>
       </w:r>
     </w:p>
     <w:p>
@@ -32303,6 +34013,63 @@
           <w:i/>
         </w:rPr>
         <w:t xml:space="preserve">[Pending] System screenshot of Settlement Method Edit Interface.</w:t>
+      </w:r>
+    </w:p>
+    <w:p>
+      <w:pPr>
+        <w:pStyle w:val="Heading5"/>
+      </w:pPr>
+      <w:r>
+        <w:t xml:space="preserve">4.2.1.8.51 Process Category View Interface</w:t>
+      </w:r>
+    </w:p>
+    <w:p>
+      <w:pPr>
+        <w:jc w:val="center"/>
+      </w:pPr>
+      <w:r>
+        <w:rPr>
+          <w:i/>
+        </w:rPr>
+        <w:t xml:space="preserve">[Pending] System screenshot of Process Category View Interface.</w:t>
+      </w:r>
+    </w:p>
+    <w:p>
+      <w:pPr>
+        <w:pStyle w:val="Heading5"/>
+      </w:pPr>
+      <w:r>
+        <w:t xml:space="preserve">4.2.1.8.52 Process Category Create Interface</w:t>
+      </w:r>
+    </w:p>
+    <w:p>
+      <w:pPr>
+        <w:jc w:val="center"/>
+      </w:pPr>
+      <w:r>
+        <w:rPr>
+          <w:i/>
+        </w:rPr>
+        <w:t xml:space="preserve">[Pending] System screenshot of Process Category Create Interface.</w:t>
+      </w:r>
+    </w:p>
+    <w:p>
+      <w:pPr>
+        <w:pStyle w:val="Heading5"/>
+      </w:pPr>
+      <w:r>
+        <w:t xml:space="preserve">4.2.1.8.53 Process Category Edit Interface</w:t>
+      </w:r>
+    </w:p>
+    <w:p>
+      <w:pPr>
+        <w:jc w:val="center"/>
+      </w:pPr>
+      <w:r>
+        <w:rPr>
+          <w:i/>
+        </w:rPr>
+        <w:t xml:space="preserve">[Pending] System screenshot of Process Category Edit Interface.</w:t>
       </w:r>
     </w:p>
     <w:p>
@@ -33009,7 +34776,7 @@
       </w:r>
     </w:p>
     <w:sectPr>
-      <w:footerReference xmlns:r="http://schemas.openxmlformats.org/officeDocument/2006/relationships" w:type="default" r:id="R8c63fb811f39493a"/>
+      <w:footerReference xmlns:r="http://schemas.openxmlformats.org/officeDocument/2006/relationships" w:type="default" r:id="R7c77119d4b194383"/>
       <w:pgSz w:w="11906" w:h="16838"/>
       <w:pgMar w:top="1440" w:right="1440" w:bottom="1440" w:left="1440" w:header="720" w:footer="720" w:gutter="0"/>
     </w:sectPr>

</xml_diff>

<commit_message>
feat(md): add customer import preview dialog
</commit_message>
<xml_diff>
--- a/docs/99-output/MyERP_SDS.docx
+++ b/docs/99-output/MyERP_SDS.docx
@@ -3068,6 +3068,857 @@
     <w:p>
       <w:pPr/>
       <w:r>
+        <w:t xml:space="preserve">Table Name: md_customer_address</w:t>
+      </w:r>
+    </w:p>
+    <w:p>
+      <w:pPr/>
+      <w:r>
+        <w:t xml:space="preserve">Primary Key: id</w:t>
+      </w:r>
+    </w:p>
+    <w:p>
+      <w:pPr/>
+      <w:r>
+        <w:t xml:space="preserve">This table stores the delivery addresses of clients.</w:t>
+      </w:r>
+    </w:p>
+    <w:tbl>
+      <w:tblPr>
+        <w:tblStyle w:val="TableGrid"/>
+        <w:tblW w:w="8000" w:type="dxa"/>
+        <w:jc w:val="left"/>
+        <w:tblBorders>
+          <w:top w:val="single" w:color="000000" w:sz="4" w:space="0"/>
+          <w:left w:val="single" w:color="000000" w:sz="4" w:space="0"/>
+          <w:bottom w:val="single" w:color="000000" w:sz="4" w:space="0"/>
+          <w:right w:val="single" w:color="000000" w:sz="4" w:space="0"/>
+          <w:insideH w:val="single" w:color="000000" w:sz="4" w:space="0"/>
+          <w:insideV w:val="single" w:color="000000" w:sz="4" w:space="0"/>
+        </w:tblBorders>
+        <w:tblLayout w:type="fixed"/>
+        <w:tblCellMar>
+          <w:top w:w="100" w:type="dxa"/>
+          <w:left w:w="100" w:type="dxa"/>
+          <w:bottom w:w="100" w:type="dxa"/>
+          <w:right w:w="100" w:type="dxa"/>
+        </w:tblCellMar>
+      </w:tblPr>
+      <w:tblGrid>
+        <w:gridCol w:w="2000"/>
+        <w:gridCol w:w="2000"/>
+        <w:gridCol w:w="2000"/>
+        <w:gridCol w:w="2000"/>
+      </w:tblGrid>
+      <w:tr>
+        <w:trPr>
+          <w:trHeight w:val="530" w:hRule="atLeast"/>
+        </w:trPr>
+        <w:tc>
+          <w:tcPr>
+            <w:tcW w:w="2000" w:type="dxa"/>
+          </w:tcPr>
+          <w:p>
+            <w:pPr>
+              <w:jc w:val="center"/>
+            </w:pPr>
+            <w:r>
+              <w:rPr>
+                <w:b/>
+              </w:rPr>
+              <w:t xml:space="preserve">Name of Attribute</w:t>
+            </w:r>
+          </w:p>
+        </w:tc>
+        <w:tc>
+          <w:tcPr>
+            <w:tcW w:w="2000" w:type="dxa"/>
+          </w:tcPr>
+          <w:p>
+            <w:pPr>
+              <w:jc w:val="center"/>
+            </w:pPr>
+            <w:r>
+              <w:rPr>
+                <w:b/>
+              </w:rPr>
+              <w:t xml:space="preserve">Data Type</w:t>
+            </w:r>
+          </w:p>
+        </w:tc>
+        <w:tc>
+          <w:tcPr>
+            <w:tcW w:w="2000" w:type="dxa"/>
+          </w:tcPr>
+          <w:p>
+            <w:pPr>
+              <w:jc w:val="center"/>
+            </w:pPr>
+            <w:r>
+              <w:rPr>
+                <w:b/>
+              </w:rPr>
+              <w:t xml:space="preserve">Size</w:t>
+            </w:r>
+          </w:p>
+        </w:tc>
+        <w:tc>
+          <w:tcPr>
+            <w:tcW w:w="2000" w:type="dxa"/>
+          </w:tcPr>
+          <w:p>
+            <w:pPr>
+              <w:jc w:val="center"/>
+            </w:pPr>
+            <w:r>
+              <w:rPr>
+                <w:b/>
+              </w:rPr>
+              <w:t xml:space="preserve">PK/FK/IS NULL/ NOT NULL</w:t>
+            </w:r>
+          </w:p>
+        </w:tc>
+      </w:tr>
+      <w:tr>
+        <w:trPr>
+          <w:trHeight w:val="530" w:hRule="atLeast"/>
+        </w:trPr>
+        <w:tc>
+          <w:tcPr>
+            <w:tcW w:w="2000" w:type="dxa"/>
+          </w:tcPr>
+          <w:p>
+            <w:pPr/>
+            <w:r>
+              <w:t xml:space="preserve">id</w:t>
+            </w:r>
+          </w:p>
+        </w:tc>
+        <w:tc>
+          <w:tcPr>
+            <w:tcW w:w="2000" w:type="dxa"/>
+          </w:tcPr>
+          <w:p>
+            <w:pPr/>
+            <w:r>
+              <w:t xml:space="preserve">bigint</w:t>
+            </w:r>
+          </w:p>
+        </w:tc>
+        <w:tc>
+          <w:tcPr>
+            <w:tcW w:w="2000" w:type="dxa"/>
+          </w:tcPr>
+          <w:p>
+            <w:pPr/>
+            <w:r>
+              <w:t xml:space="preserve">-</w:t>
+            </w:r>
+          </w:p>
+        </w:tc>
+        <w:tc>
+          <w:tcPr>
+            <w:tcW w:w="2000" w:type="dxa"/>
+          </w:tcPr>
+          <w:p>
+            <w:pPr/>
+            <w:r>
+              <w:t xml:space="preserve">PK, NOT NULL</w:t>
+            </w:r>
+          </w:p>
+        </w:tc>
+      </w:tr>
+      <w:tr>
+        <w:trPr>
+          <w:trHeight w:val="530" w:hRule="atLeast"/>
+        </w:trPr>
+        <w:tc>
+          <w:tcPr>
+            <w:tcW w:w="2000" w:type="dxa"/>
+          </w:tcPr>
+          <w:p>
+            <w:pPr/>
+            <w:r>
+              <w:t xml:space="preserve">address</w:t>
+            </w:r>
+          </w:p>
+        </w:tc>
+        <w:tc>
+          <w:tcPr>
+            <w:tcW w:w="2000" w:type="dxa"/>
+          </w:tcPr>
+          <w:p>
+            <w:pPr/>
+            <w:r>
+              <w:t xml:space="preserve">nvarchar</w:t>
+            </w:r>
+          </w:p>
+        </w:tc>
+        <w:tc>
+          <w:tcPr>
+            <w:tcW w:w="2000" w:type="dxa"/>
+          </w:tcPr>
+          <w:p>
+            <w:pPr/>
+            <w:r>
+              <w:t xml:space="preserve">300</w:t>
+            </w:r>
+          </w:p>
+        </w:tc>
+        <w:tc>
+          <w:tcPr>
+            <w:tcW w:w="2000" w:type="dxa"/>
+          </w:tcPr>
+          <w:p>
+            <w:pPr/>
+            <w:r>
+              <w:t xml:space="preserve">NOT NULL</w:t>
+            </w:r>
+          </w:p>
+        </w:tc>
+      </w:tr>
+      <w:tr>
+        <w:trPr>
+          <w:trHeight w:val="530" w:hRule="atLeast"/>
+        </w:trPr>
+        <w:tc>
+          <w:tcPr>
+            <w:tcW w:w="2000" w:type="dxa"/>
+          </w:tcPr>
+          <w:p>
+            <w:pPr/>
+            <w:r>
+              <w:t xml:space="preserve">postal_code</w:t>
+            </w:r>
+          </w:p>
+        </w:tc>
+        <w:tc>
+          <w:tcPr>
+            <w:tcW w:w="2000" w:type="dxa"/>
+          </w:tcPr>
+          <w:p>
+            <w:pPr/>
+            <w:r>
+              <w:t xml:space="preserve">varchar</w:t>
+            </w:r>
+          </w:p>
+        </w:tc>
+        <w:tc>
+          <w:tcPr>
+            <w:tcW w:w="2000" w:type="dxa"/>
+          </w:tcPr>
+          <w:p>
+            <w:pPr/>
+            <w:r>
+              <w:t xml:space="preserve">20</w:t>
+            </w:r>
+          </w:p>
+        </w:tc>
+        <w:tc>
+          <w:tcPr>
+            <w:tcW w:w="2000" w:type="dxa"/>
+          </w:tcPr>
+          <w:p>
+            <w:pPr/>
+            <w:r>
+              <w:t xml:space="preserve">IS NULL</w:t>
+            </w:r>
+          </w:p>
+        </w:tc>
+      </w:tr>
+      <w:tr>
+        <w:trPr>
+          <w:trHeight w:val="530" w:hRule="atLeast"/>
+        </w:trPr>
+        <w:tc>
+          <w:tcPr>
+            <w:tcW w:w="2000" w:type="dxa"/>
+          </w:tcPr>
+          <w:p>
+            <w:pPr/>
+            <w:r>
+              <w:t xml:space="preserve">recipient</w:t>
+            </w:r>
+          </w:p>
+        </w:tc>
+        <w:tc>
+          <w:tcPr>
+            <w:tcW w:w="2000" w:type="dxa"/>
+          </w:tcPr>
+          <w:p>
+            <w:pPr/>
+            <w:r>
+              <w:t xml:space="preserve">nvarchar</w:t>
+            </w:r>
+          </w:p>
+        </w:tc>
+        <w:tc>
+          <w:tcPr>
+            <w:tcW w:w="2000" w:type="dxa"/>
+          </w:tcPr>
+          <w:p>
+            <w:pPr/>
+            <w:r>
+              <w:t xml:space="preserve">100</w:t>
+            </w:r>
+          </w:p>
+        </w:tc>
+        <w:tc>
+          <w:tcPr>
+            <w:tcW w:w="2000" w:type="dxa"/>
+          </w:tcPr>
+          <w:p>
+            <w:pPr/>
+            <w:r>
+              <w:t xml:space="preserve">IS NULL</w:t>
+            </w:r>
+          </w:p>
+        </w:tc>
+      </w:tr>
+      <w:tr>
+        <w:trPr>
+          <w:trHeight w:val="530" w:hRule="atLeast"/>
+        </w:trPr>
+        <w:tc>
+          <w:tcPr>
+            <w:tcW w:w="2000" w:type="dxa"/>
+          </w:tcPr>
+          <w:p>
+            <w:pPr/>
+            <w:r>
+              <w:t xml:space="preserve">phone</w:t>
+            </w:r>
+          </w:p>
+        </w:tc>
+        <w:tc>
+          <w:tcPr>
+            <w:tcW w:w="2000" w:type="dxa"/>
+          </w:tcPr>
+          <w:p>
+            <w:pPr/>
+            <w:r>
+              <w:t xml:space="preserve">nvarchar</w:t>
+            </w:r>
+          </w:p>
+        </w:tc>
+        <w:tc>
+          <w:tcPr>
+            <w:tcW w:w="2000" w:type="dxa"/>
+          </w:tcPr>
+          <w:p>
+            <w:pPr/>
+            <w:r>
+              <w:t xml:space="preserve">50</w:t>
+            </w:r>
+          </w:p>
+        </w:tc>
+        <w:tc>
+          <w:tcPr>
+            <w:tcW w:w="2000" w:type="dxa"/>
+          </w:tcPr>
+          <w:p>
+            <w:pPr/>
+            <w:r>
+              <w:t xml:space="preserve">IS NULL</w:t>
+            </w:r>
+          </w:p>
+        </w:tc>
+      </w:tr>
+      <w:tr>
+        <w:trPr>
+          <w:trHeight w:val="530" w:hRule="atLeast"/>
+        </w:trPr>
+        <w:tc>
+          <w:tcPr>
+            <w:tcW w:w="2000" w:type="dxa"/>
+          </w:tcPr>
+          <w:p>
+            <w:pPr/>
+            <w:r>
+              <w:t xml:space="preserve">company_id</w:t>
+            </w:r>
+          </w:p>
+        </w:tc>
+        <w:tc>
+          <w:tcPr>
+            <w:tcW w:w="2000" w:type="dxa"/>
+          </w:tcPr>
+          <w:p>
+            <w:pPr/>
+            <w:r>
+              <w:t xml:space="preserve">bigint</w:t>
+            </w:r>
+          </w:p>
+        </w:tc>
+        <w:tc>
+          <w:tcPr>
+            <w:tcW w:w="2000" w:type="dxa"/>
+          </w:tcPr>
+          <w:p>
+            <w:pPr/>
+            <w:r>
+              <w:t xml:space="preserve">-</w:t>
+            </w:r>
+          </w:p>
+        </w:tc>
+        <w:tc>
+          <w:tcPr>
+            <w:tcW w:w="2000" w:type="dxa"/>
+          </w:tcPr>
+          <w:p>
+            <w:pPr/>
+            <w:r>
+              <w:t xml:space="preserve">FK, NOT NULL</w:t>
+            </w:r>
+          </w:p>
+        </w:tc>
+      </w:tr>
+      <w:tr>
+        <w:trPr>
+          <w:trHeight w:val="530" w:hRule="atLeast"/>
+        </w:trPr>
+        <w:tc>
+          <w:tcPr>
+            <w:tcW w:w="2000" w:type="dxa"/>
+          </w:tcPr>
+          <w:p>
+            <w:pPr/>
+            <w:r>
+              <w:t xml:space="preserve">created_at</w:t>
+            </w:r>
+          </w:p>
+        </w:tc>
+        <w:tc>
+          <w:tcPr>
+            <w:tcW w:w="2000" w:type="dxa"/>
+          </w:tcPr>
+          <w:p>
+            <w:pPr/>
+            <w:r>
+              <w:t xml:space="preserve">datetime2</w:t>
+            </w:r>
+          </w:p>
+        </w:tc>
+        <w:tc>
+          <w:tcPr>
+            <w:tcW w:w="2000" w:type="dxa"/>
+          </w:tcPr>
+          <w:p>
+            <w:pPr/>
+            <w:r>
+              <w:t xml:space="preserve">(6)</w:t>
+            </w:r>
+          </w:p>
+        </w:tc>
+        <w:tc>
+          <w:tcPr>
+            <w:tcW w:w="2000" w:type="dxa"/>
+          </w:tcPr>
+          <w:p>
+            <w:pPr/>
+            <w:r>
+              <w:t xml:space="preserve">NOT NULL</w:t>
+            </w:r>
+          </w:p>
+        </w:tc>
+      </w:tr>
+      <w:tr>
+        <w:trPr>
+          <w:trHeight w:val="530" w:hRule="atLeast"/>
+        </w:trPr>
+        <w:tc>
+          <w:tcPr>
+            <w:tcW w:w="2000" w:type="dxa"/>
+          </w:tcPr>
+          <w:p>
+            <w:pPr/>
+            <w:r>
+              <w:t xml:space="preserve">created_by</w:t>
+            </w:r>
+          </w:p>
+        </w:tc>
+        <w:tc>
+          <w:tcPr>
+            <w:tcW w:w="2000" w:type="dxa"/>
+          </w:tcPr>
+          <w:p>
+            <w:pPr/>
+            <w:r>
+              <w:t xml:space="preserve">bigint</w:t>
+            </w:r>
+          </w:p>
+        </w:tc>
+        <w:tc>
+          <w:tcPr>
+            <w:tcW w:w="2000" w:type="dxa"/>
+          </w:tcPr>
+          <w:p>
+            <w:pPr/>
+            <w:r>
+              <w:t xml:space="preserve">-</w:t>
+            </w:r>
+          </w:p>
+        </w:tc>
+        <w:tc>
+          <w:tcPr>
+            <w:tcW w:w="2000" w:type="dxa"/>
+          </w:tcPr>
+          <w:p>
+            <w:pPr/>
+            <w:r>
+              <w:t xml:space="preserve">NOT NULL</w:t>
+            </w:r>
+          </w:p>
+        </w:tc>
+      </w:tr>
+      <w:tr>
+        <w:trPr>
+          <w:trHeight w:val="530" w:hRule="atLeast"/>
+        </w:trPr>
+        <w:tc>
+          <w:tcPr>
+            <w:tcW w:w="2000" w:type="dxa"/>
+          </w:tcPr>
+          <w:p>
+            <w:pPr/>
+            <w:r>
+              <w:t xml:space="preserve">updated_at</w:t>
+            </w:r>
+          </w:p>
+        </w:tc>
+        <w:tc>
+          <w:tcPr>
+            <w:tcW w:w="2000" w:type="dxa"/>
+          </w:tcPr>
+          <w:p>
+            <w:pPr/>
+            <w:r>
+              <w:t xml:space="preserve">datetime2</w:t>
+            </w:r>
+          </w:p>
+        </w:tc>
+        <w:tc>
+          <w:tcPr>
+            <w:tcW w:w="2000" w:type="dxa"/>
+          </w:tcPr>
+          <w:p>
+            <w:pPr/>
+            <w:r>
+              <w:t xml:space="preserve">(6)</w:t>
+            </w:r>
+          </w:p>
+        </w:tc>
+        <w:tc>
+          <w:tcPr>
+            <w:tcW w:w="2000" w:type="dxa"/>
+          </w:tcPr>
+          <w:p>
+            <w:pPr/>
+            <w:r>
+              <w:t xml:space="preserve">IS NULL</w:t>
+            </w:r>
+          </w:p>
+        </w:tc>
+      </w:tr>
+      <w:tr>
+        <w:trPr>
+          <w:trHeight w:val="530" w:hRule="atLeast"/>
+        </w:trPr>
+        <w:tc>
+          <w:tcPr>
+            <w:tcW w:w="2000" w:type="dxa"/>
+          </w:tcPr>
+          <w:p>
+            <w:pPr/>
+            <w:r>
+              <w:t xml:space="preserve">updated_by</w:t>
+            </w:r>
+          </w:p>
+        </w:tc>
+        <w:tc>
+          <w:tcPr>
+            <w:tcW w:w="2000" w:type="dxa"/>
+          </w:tcPr>
+          <w:p>
+            <w:pPr/>
+            <w:r>
+              <w:t xml:space="preserve">bigint</w:t>
+            </w:r>
+          </w:p>
+        </w:tc>
+        <w:tc>
+          <w:tcPr>
+            <w:tcW w:w="2000" w:type="dxa"/>
+          </w:tcPr>
+          <w:p>
+            <w:pPr/>
+            <w:r>
+              <w:t xml:space="preserve">-</w:t>
+            </w:r>
+          </w:p>
+        </w:tc>
+        <w:tc>
+          <w:tcPr>
+            <w:tcW w:w="2000" w:type="dxa"/>
+          </w:tcPr>
+          <w:p>
+            <w:pPr/>
+            <w:r>
+              <w:t xml:space="preserve">IS NULL</w:t>
+            </w:r>
+          </w:p>
+        </w:tc>
+      </w:tr>
+      <w:tr>
+        <w:trPr>
+          <w:trHeight w:val="530" w:hRule="atLeast"/>
+        </w:trPr>
+        <w:tc>
+          <w:tcPr>
+            <w:tcW w:w="2000" w:type="dxa"/>
+          </w:tcPr>
+          <w:p>
+            <w:pPr/>
+            <w:r>
+              <w:t xml:space="preserve">version</w:t>
+            </w:r>
+          </w:p>
+        </w:tc>
+        <w:tc>
+          <w:tcPr>
+            <w:tcW w:w="2000" w:type="dxa"/>
+          </w:tcPr>
+          <w:p>
+            <w:pPr/>
+            <w:r>
+              <w:t xml:space="preserve">int</w:t>
+            </w:r>
+          </w:p>
+        </w:tc>
+        <w:tc>
+          <w:tcPr>
+            <w:tcW w:w="2000" w:type="dxa"/>
+          </w:tcPr>
+          <w:p>
+            <w:pPr/>
+            <w:r>
+              <w:t xml:space="preserve">-</w:t>
+            </w:r>
+          </w:p>
+        </w:tc>
+        <w:tc>
+          <w:tcPr>
+            <w:tcW w:w="2000" w:type="dxa"/>
+          </w:tcPr>
+          <w:p>
+            <w:pPr/>
+            <w:r>
+              <w:t xml:space="preserve">NOT NULL</w:t>
+            </w:r>
+          </w:p>
+        </w:tc>
+      </w:tr>
+      <w:tr>
+        <w:trPr>
+          <w:trHeight w:val="530" w:hRule="atLeast"/>
+        </w:trPr>
+        <w:tc>
+          <w:tcPr>
+            <w:tcW w:w="2000" w:type="dxa"/>
+          </w:tcPr>
+          <w:p>
+            <w:pPr/>
+            <w:r>
+              <w:t xml:space="preserve">is_active</w:t>
+            </w:r>
+          </w:p>
+        </w:tc>
+        <w:tc>
+          <w:tcPr>
+            <w:tcW w:w="2000" w:type="dxa"/>
+          </w:tcPr>
+          <w:p>
+            <w:pPr/>
+            <w:r>
+              <w:t xml:space="preserve">bit</w:t>
+            </w:r>
+          </w:p>
+        </w:tc>
+        <w:tc>
+          <w:tcPr>
+            <w:tcW w:w="2000" w:type="dxa"/>
+          </w:tcPr>
+          <w:p>
+            <w:pPr/>
+            <w:r>
+              <w:t xml:space="preserve">-</w:t>
+            </w:r>
+          </w:p>
+        </w:tc>
+        <w:tc>
+          <w:tcPr>
+            <w:tcW w:w="2000" w:type="dxa"/>
+          </w:tcPr>
+          <w:p>
+            <w:pPr/>
+            <w:r>
+              <w:t xml:space="preserve">NOT NULL</w:t>
+            </w:r>
+          </w:p>
+        </w:tc>
+      </w:tr>
+      <w:tr>
+        <w:trPr>
+          <w:trHeight w:val="530" w:hRule="atLeast"/>
+        </w:trPr>
+        <w:tc>
+          <w:tcPr>
+            <w:tcW w:w="2000" w:type="dxa"/>
+          </w:tcPr>
+          <w:p>
+            <w:pPr/>
+            <w:r>
+              <w:t xml:space="preserve">is_deleted</w:t>
+            </w:r>
+          </w:p>
+        </w:tc>
+        <w:tc>
+          <w:tcPr>
+            <w:tcW w:w="2000" w:type="dxa"/>
+          </w:tcPr>
+          <w:p>
+            <w:pPr/>
+            <w:r>
+              <w:t xml:space="preserve">bit</w:t>
+            </w:r>
+          </w:p>
+        </w:tc>
+        <w:tc>
+          <w:tcPr>
+            <w:tcW w:w="2000" w:type="dxa"/>
+          </w:tcPr>
+          <w:p>
+            <w:pPr/>
+            <w:r>
+              <w:t xml:space="preserve">-</w:t>
+            </w:r>
+          </w:p>
+        </w:tc>
+        <w:tc>
+          <w:tcPr>
+            <w:tcW w:w="2000" w:type="dxa"/>
+          </w:tcPr>
+          <w:p>
+            <w:pPr/>
+            <w:r>
+              <w:t xml:space="preserve">NOT NULL</w:t>
+            </w:r>
+          </w:p>
+        </w:tc>
+      </w:tr>
+      <w:tr>
+        <w:trPr>
+          <w:trHeight w:val="530" w:hRule="atLeast"/>
+        </w:trPr>
+        <w:tc>
+          <w:tcPr>
+            <w:tcW w:w="2000" w:type="dxa"/>
+          </w:tcPr>
+          <w:p>
+            <w:pPr/>
+            <w:r>
+              <w:t xml:space="preserve">customer_id</w:t>
+            </w:r>
+          </w:p>
+        </w:tc>
+        <w:tc>
+          <w:tcPr>
+            <w:tcW w:w="2000" w:type="dxa"/>
+          </w:tcPr>
+          <w:p>
+            <w:pPr/>
+            <w:r>
+              <w:t xml:space="preserve">bigint</w:t>
+            </w:r>
+          </w:p>
+        </w:tc>
+        <w:tc>
+          <w:tcPr>
+            <w:tcW w:w="2000" w:type="dxa"/>
+          </w:tcPr>
+          <w:p>
+            <w:pPr/>
+            <w:r>
+              <w:t xml:space="preserve">-</w:t>
+            </w:r>
+          </w:p>
+        </w:tc>
+        <w:tc>
+          <w:tcPr>
+            <w:tcW w:w="2000" w:type="dxa"/>
+          </w:tcPr>
+          <w:p>
+            <w:pPr/>
+            <w:r>
+              <w:t xml:space="preserve">FK, NOT NULL</w:t>
+            </w:r>
+          </w:p>
+        </w:tc>
+      </w:tr>
+      <w:tr>
+        <w:trPr>
+          <w:trHeight w:val="530" w:hRule="atLeast"/>
+        </w:trPr>
+        <w:tc>
+          <w:tcPr>
+            <w:tcW w:w="2000" w:type="dxa"/>
+          </w:tcPr>
+          <w:p>
+            <w:pPr/>
+            <w:r>
+              <w:t xml:space="preserve">is_default</w:t>
+            </w:r>
+          </w:p>
+        </w:tc>
+        <w:tc>
+          <w:tcPr>
+            <w:tcW w:w="2000" w:type="dxa"/>
+          </w:tcPr>
+          <w:p>
+            <w:pPr/>
+            <w:r>
+              <w:t xml:space="preserve">bit</w:t>
+            </w:r>
+          </w:p>
+        </w:tc>
+        <w:tc>
+          <w:tcPr>
+            <w:tcW w:w="2000" w:type="dxa"/>
+          </w:tcPr>
+          <w:p>
+            <w:pPr/>
+            <w:r>
+              <w:t xml:space="preserve">-</w:t>
+            </w:r>
+          </w:p>
+        </w:tc>
+        <w:tc>
+          <w:tcPr>
+            <w:tcW w:w="2000" w:type="dxa"/>
+          </w:tcPr>
+          <w:p>
+            <w:pPr/>
+            <w:r>
+              <w:t xml:space="preserve">NOT NULL</w:t>
+            </w:r>
+          </w:p>
+        </w:tc>
+      </w:tr>
+    </w:tbl>
+    <w:p/>
+    <w:p>
+      <w:pPr/>
+      <w:r>
         <w:t xml:space="preserve">Table Name: md_customer_category</w:t>
       </w:r>
     </w:p>
@@ -3763,6 +4614,1004 @@
             <w:pPr/>
             <w:r>
               <w:t xml:space="preserve">NOT NULL</w:t>
+            </w:r>
+          </w:p>
+        </w:tc>
+      </w:tr>
+    </w:tbl>
+    <w:p/>
+    <w:p>
+      <w:pPr/>
+      <w:r>
+        <w:t xml:space="preserve">Table Name: md_customer_contact</w:t>
+      </w:r>
+    </w:p>
+    <w:p>
+      <w:pPr/>
+      <w:r>
+        <w:t xml:space="preserve">Primary Key: id</w:t>
+      </w:r>
+    </w:p>
+    <w:p>
+      <w:pPr/>
+      <w:r>
+        <w:t xml:space="preserve">This table stores the contact persons of clients.</w:t>
+      </w:r>
+    </w:p>
+    <w:tbl>
+      <w:tblPr>
+        <w:tblStyle w:val="TableGrid"/>
+        <w:tblW w:w="8000" w:type="dxa"/>
+        <w:jc w:val="left"/>
+        <w:tblBorders>
+          <w:top w:val="single" w:color="000000" w:sz="4" w:space="0"/>
+          <w:left w:val="single" w:color="000000" w:sz="4" w:space="0"/>
+          <w:bottom w:val="single" w:color="000000" w:sz="4" w:space="0"/>
+          <w:right w:val="single" w:color="000000" w:sz="4" w:space="0"/>
+          <w:insideH w:val="single" w:color="000000" w:sz="4" w:space="0"/>
+          <w:insideV w:val="single" w:color="000000" w:sz="4" w:space="0"/>
+        </w:tblBorders>
+        <w:tblLayout w:type="fixed"/>
+        <w:tblCellMar>
+          <w:top w:w="100" w:type="dxa"/>
+          <w:left w:w="100" w:type="dxa"/>
+          <w:bottom w:w="100" w:type="dxa"/>
+          <w:right w:w="100" w:type="dxa"/>
+        </w:tblCellMar>
+      </w:tblPr>
+      <w:tblGrid>
+        <w:gridCol w:w="2000"/>
+        <w:gridCol w:w="2000"/>
+        <w:gridCol w:w="2000"/>
+        <w:gridCol w:w="2000"/>
+      </w:tblGrid>
+      <w:tr>
+        <w:trPr>
+          <w:trHeight w:val="530" w:hRule="atLeast"/>
+        </w:trPr>
+        <w:tc>
+          <w:tcPr>
+            <w:tcW w:w="2000" w:type="dxa"/>
+          </w:tcPr>
+          <w:p>
+            <w:pPr>
+              <w:jc w:val="center"/>
+            </w:pPr>
+            <w:r>
+              <w:rPr>
+                <w:b/>
+              </w:rPr>
+              <w:t xml:space="preserve">Name of Attribute</w:t>
+            </w:r>
+          </w:p>
+        </w:tc>
+        <w:tc>
+          <w:tcPr>
+            <w:tcW w:w="2000" w:type="dxa"/>
+          </w:tcPr>
+          <w:p>
+            <w:pPr>
+              <w:jc w:val="center"/>
+            </w:pPr>
+            <w:r>
+              <w:rPr>
+                <w:b/>
+              </w:rPr>
+              <w:t xml:space="preserve">Data Type</w:t>
+            </w:r>
+          </w:p>
+        </w:tc>
+        <w:tc>
+          <w:tcPr>
+            <w:tcW w:w="2000" w:type="dxa"/>
+          </w:tcPr>
+          <w:p>
+            <w:pPr>
+              <w:jc w:val="center"/>
+            </w:pPr>
+            <w:r>
+              <w:rPr>
+                <w:b/>
+              </w:rPr>
+              <w:t xml:space="preserve">Size</w:t>
+            </w:r>
+          </w:p>
+        </w:tc>
+        <w:tc>
+          <w:tcPr>
+            <w:tcW w:w="2000" w:type="dxa"/>
+          </w:tcPr>
+          <w:p>
+            <w:pPr>
+              <w:jc w:val="center"/>
+            </w:pPr>
+            <w:r>
+              <w:rPr>
+                <w:b/>
+              </w:rPr>
+              <w:t xml:space="preserve">PK/FK/IS NULL/ NOT NULL</w:t>
+            </w:r>
+          </w:p>
+        </w:tc>
+      </w:tr>
+      <w:tr>
+        <w:trPr>
+          <w:trHeight w:val="530" w:hRule="atLeast"/>
+        </w:trPr>
+        <w:tc>
+          <w:tcPr>
+            <w:tcW w:w="2000" w:type="dxa"/>
+          </w:tcPr>
+          <w:p>
+            <w:pPr/>
+            <w:r>
+              <w:t xml:space="preserve">id</w:t>
+            </w:r>
+          </w:p>
+        </w:tc>
+        <w:tc>
+          <w:tcPr>
+            <w:tcW w:w="2000" w:type="dxa"/>
+          </w:tcPr>
+          <w:p>
+            <w:pPr/>
+            <w:r>
+              <w:t xml:space="preserve">bigint</w:t>
+            </w:r>
+          </w:p>
+        </w:tc>
+        <w:tc>
+          <w:tcPr>
+            <w:tcW w:w="2000" w:type="dxa"/>
+          </w:tcPr>
+          <w:p>
+            <w:pPr/>
+            <w:r>
+              <w:t xml:space="preserve">-</w:t>
+            </w:r>
+          </w:p>
+        </w:tc>
+        <w:tc>
+          <w:tcPr>
+            <w:tcW w:w="2000" w:type="dxa"/>
+          </w:tcPr>
+          <w:p>
+            <w:pPr/>
+            <w:r>
+              <w:t xml:space="preserve">PK, NOT NULL</w:t>
+            </w:r>
+          </w:p>
+        </w:tc>
+      </w:tr>
+      <w:tr>
+        <w:trPr>
+          <w:trHeight w:val="530" w:hRule="atLeast"/>
+        </w:trPr>
+        <w:tc>
+          <w:tcPr>
+            <w:tcW w:w="2000" w:type="dxa"/>
+          </w:tcPr>
+          <w:p>
+            <w:pPr/>
+            <w:r>
+              <w:t xml:space="preserve">company_id</w:t>
+            </w:r>
+          </w:p>
+        </w:tc>
+        <w:tc>
+          <w:tcPr>
+            <w:tcW w:w="2000" w:type="dxa"/>
+          </w:tcPr>
+          <w:p>
+            <w:pPr/>
+            <w:r>
+              <w:t xml:space="preserve">bigint</w:t>
+            </w:r>
+          </w:p>
+        </w:tc>
+        <w:tc>
+          <w:tcPr>
+            <w:tcW w:w="2000" w:type="dxa"/>
+          </w:tcPr>
+          <w:p>
+            <w:pPr/>
+            <w:r>
+              <w:t xml:space="preserve">-</w:t>
+            </w:r>
+          </w:p>
+        </w:tc>
+        <w:tc>
+          <w:tcPr>
+            <w:tcW w:w="2000" w:type="dxa"/>
+          </w:tcPr>
+          <w:p>
+            <w:pPr/>
+            <w:r>
+              <w:t xml:space="preserve">FK, NOT NULL</w:t>
+            </w:r>
+          </w:p>
+        </w:tc>
+      </w:tr>
+      <w:tr>
+        <w:trPr>
+          <w:trHeight w:val="530" w:hRule="atLeast"/>
+        </w:trPr>
+        <w:tc>
+          <w:tcPr>
+            <w:tcW w:w="2000" w:type="dxa"/>
+          </w:tcPr>
+          <w:p>
+            <w:pPr/>
+            <w:r>
+              <w:t xml:space="preserve">created_at</w:t>
+            </w:r>
+          </w:p>
+        </w:tc>
+        <w:tc>
+          <w:tcPr>
+            <w:tcW w:w="2000" w:type="dxa"/>
+          </w:tcPr>
+          <w:p>
+            <w:pPr/>
+            <w:r>
+              <w:t xml:space="preserve">datetime2</w:t>
+            </w:r>
+          </w:p>
+        </w:tc>
+        <w:tc>
+          <w:tcPr>
+            <w:tcW w:w="2000" w:type="dxa"/>
+          </w:tcPr>
+          <w:p>
+            <w:pPr/>
+            <w:r>
+              <w:t xml:space="preserve">(6)</w:t>
+            </w:r>
+          </w:p>
+        </w:tc>
+        <w:tc>
+          <w:tcPr>
+            <w:tcW w:w="2000" w:type="dxa"/>
+          </w:tcPr>
+          <w:p>
+            <w:pPr/>
+            <w:r>
+              <w:t xml:space="preserve">NOT NULL</w:t>
+            </w:r>
+          </w:p>
+        </w:tc>
+      </w:tr>
+      <w:tr>
+        <w:trPr>
+          <w:trHeight w:val="530" w:hRule="atLeast"/>
+        </w:trPr>
+        <w:tc>
+          <w:tcPr>
+            <w:tcW w:w="2000" w:type="dxa"/>
+          </w:tcPr>
+          <w:p>
+            <w:pPr/>
+            <w:r>
+              <w:t xml:space="preserve">created_by</w:t>
+            </w:r>
+          </w:p>
+        </w:tc>
+        <w:tc>
+          <w:tcPr>
+            <w:tcW w:w="2000" w:type="dxa"/>
+          </w:tcPr>
+          <w:p>
+            <w:pPr/>
+            <w:r>
+              <w:t xml:space="preserve">bigint</w:t>
+            </w:r>
+          </w:p>
+        </w:tc>
+        <w:tc>
+          <w:tcPr>
+            <w:tcW w:w="2000" w:type="dxa"/>
+          </w:tcPr>
+          <w:p>
+            <w:pPr/>
+            <w:r>
+              <w:t xml:space="preserve">-</w:t>
+            </w:r>
+          </w:p>
+        </w:tc>
+        <w:tc>
+          <w:tcPr>
+            <w:tcW w:w="2000" w:type="dxa"/>
+          </w:tcPr>
+          <w:p>
+            <w:pPr/>
+            <w:r>
+              <w:t xml:space="preserve">NOT NULL</w:t>
+            </w:r>
+          </w:p>
+        </w:tc>
+      </w:tr>
+      <w:tr>
+        <w:trPr>
+          <w:trHeight w:val="530" w:hRule="atLeast"/>
+        </w:trPr>
+        <w:tc>
+          <w:tcPr>
+            <w:tcW w:w="2000" w:type="dxa"/>
+          </w:tcPr>
+          <w:p>
+            <w:pPr/>
+            <w:r>
+              <w:t xml:space="preserve">updated_at</w:t>
+            </w:r>
+          </w:p>
+        </w:tc>
+        <w:tc>
+          <w:tcPr>
+            <w:tcW w:w="2000" w:type="dxa"/>
+          </w:tcPr>
+          <w:p>
+            <w:pPr/>
+            <w:r>
+              <w:t xml:space="preserve">datetime2</w:t>
+            </w:r>
+          </w:p>
+        </w:tc>
+        <w:tc>
+          <w:tcPr>
+            <w:tcW w:w="2000" w:type="dxa"/>
+          </w:tcPr>
+          <w:p>
+            <w:pPr/>
+            <w:r>
+              <w:t xml:space="preserve">(6)</w:t>
+            </w:r>
+          </w:p>
+        </w:tc>
+        <w:tc>
+          <w:tcPr>
+            <w:tcW w:w="2000" w:type="dxa"/>
+          </w:tcPr>
+          <w:p>
+            <w:pPr/>
+            <w:r>
+              <w:t xml:space="preserve">IS NULL</w:t>
+            </w:r>
+          </w:p>
+        </w:tc>
+      </w:tr>
+      <w:tr>
+        <w:trPr>
+          <w:trHeight w:val="530" w:hRule="atLeast"/>
+        </w:trPr>
+        <w:tc>
+          <w:tcPr>
+            <w:tcW w:w="2000" w:type="dxa"/>
+          </w:tcPr>
+          <w:p>
+            <w:pPr/>
+            <w:r>
+              <w:t xml:space="preserve">updated_by</w:t>
+            </w:r>
+          </w:p>
+        </w:tc>
+        <w:tc>
+          <w:tcPr>
+            <w:tcW w:w="2000" w:type="dxa"/>
+          </w:tcPr>
+          <w:p>
+            <w:pPr/>
+            <w:r>
+              <w:t xml:space="preserve">bigint</w:t>
+            </w:r>
+          </w:p>
+        </w:tc>
+        <w:tc>
+          <w:tcPr>
+            <w:tcW w:w="2000" w:type="dxa"/>
+          </w:tcPr>
+          <w:p>
+            <w:pPr/>
+            <w:r>
+              <w:t xml:space="preserve">-</w:t>
+            </w:r>
+          </w:p>
+        </w:tc>
+        <w:tc>
+          <w:tcPr>
+            <w:tcW w:w="2000" w:type="dxa"/>
+          </w:tcPr>
+          <w:p>
+            <w:pPr/>
+            <w:r>
+              <w:t xml:space="preserve">IS NULL</w:t>
+            </w:r>
+          </w:p>
+        </w:tc>
+      </w:tr>
+      <w:tr>
+        <w:trPr>
+          <w:trHeight w:val="530" w:hRule="atLeast"/>
+        </w:trPr>
+        <w:tc>
+          <w:tcPr>
+            <w:tcW w:w="2000" w:type="dxa"/>
+          </w:tcPr>
+          <w:p>
+            <w:pPr/>
+            <w:r>
+              <w:t xml:space="preserve">version</w:t>
+            </w:r>
+          </w:p>
+        </w:tc>
+        <w:tc>
+          <w:tcPr>
+            <w:tcW w:w="2000" w:type="dxa"/>
+          </w:tcPr>
+          <w:p>
+            <w:pPr/>
+            <w:r>
+              <w:t xml:space="preserve">int</w:t>
+            </w:r>
+          </w:p>
+        </w:tc>
+        <w:tc>
+          <w:tcPr>
+            <w:tcW w:w="2000" w:type="dxa"/>
+          </w:tcPr>
+          <w:p>
+            <w:pPr/>
+            <w:r>
+              <w:t xml:space="preserve">-</w:t>
+            </w:r>
+          </w:p>
+        </w:tc>
+        <w:tc>
+          <w:tcPr>
+            <w:tcW w:w="2000" w:type="dxa"/>
+          </w:tcPr>
+          <w:p>
+            <w:pPr/>
+            <w:r>
+              <w:t xml:space="preserve">NOT NULL</w:t>
+            </w:r>
+          </w:p>
+        </w:tc>
+      </w:tr>
+      <w:tr>
+        <w:trPr>
+          <w:trHeight w:val="530" w:hRule="atLeast"/>
+        </w:trPr>
+        <w:tc>
+          <w:tcPr>
+            <w:tcW w:w="2000" w:type="dxa"/>
+          </w:tcPr>
+          <w:p>
+            <w:pPr/>
+            <w:r>
+              <w:t xml:space="preserve">is_active</w:t>
+            </w:r>
+          </w:p>
+        </w:tc>
+        <w:tc>
+          <w:tcPr>
+            <w:tcW w:w="2000" w:type="dxa"/>
+          </w:tcPr>
+          <w:p>
+            <w:pPr/>
+            <w:r>
+              <w:t xml:space="preserve">bit</w:t>
+            </w:r>
+          </w:p>
+        </w:tc>
+        <w:tc>
+          <w:tcPr>
+            <w:tcW w:w="2000" w:type="dxa"/>
+          </w:tcPr>
+          <w:p>
+            <w:pPr/>
+            <w:r>
+              <w:t xml:space="preserve">-</w:t>
+            </w:r>
+          </w:p>
+        </w:tc>
+        <w:tc>
+          <w:tcPr>
+            <w:tcW w:w="2000" w:type="dxa"/>
+          </w:tcPr>
+          <w:p>
+            <w:pPr/>
+            <w:r>
+              <w:t xml:space="preserve">NOT NULL</w:t>
+            </w:r>
+          </w:p>
+        </w:tc>
+      </w:tr>
+      <w:tr>
+        <w:trPr>
+          <w:trHeight w:val="530" w:hRule="atLeast"/>
+        </w:trPr>
+        <w:tc>
+          <w:tcPr>
+            <w:tcW w:w="2000" w:type="dxa"/>
+          </w:tcPr>
+          <w:p>
+            <w:pPr/>
+            <w:r>
+              <w:t xml:space="preserve">is_deleted</w:t>
+            </w:r>
+          </w:p>
+        </w:tc>
+        <w:tc>
+          <w:tcPr>
+            <w:tcW w:w="2000" w:type="dxa"/>
+          </w:tcPr>
+          <w:p>
+            <w:pPr/>
+            <w:r>
+              <w:t xml:space="preserve">bit</w:t>
+            </w:r>
+          </w:p>
+        </w:tc>
+        <w:tc>
+          <w:tcPr>
+            <w:tcW w:w="2000" w:type="dxa"/>
+          </w:tcPr>
+          <w:p>
+            <w:pPr/>
+            <w:r>
+              <w:t xml:space="preserve">-</w:t>
+            </w:r>
+          </w:p>
+        </w:tc>
+        <w:tc>
+          <w:tcPr>
+            <w:tcW w:w="2000" w:type="dxa"/>
+          </w:tcPr>
+          <w:p>
+            <w:pPr/>
+            <w:r>
+              <w:t xml:space="preserve">NOT NULL</w:t>
+            </w:r>
+          </w:p>
+        </w:tc>
+      </w:tr>
+      <w:tr>
+        <w:trPr>
+          <w:trHeight w:val="530" w:hRule="atLeast"/>
+        </w:trPr>
+        <w:tc>
+          <w:tcPr>
+            <w:tcW w:w="2000" w:type="dxa"/>
+          </w:tcPr>
+          <w:p>
+            <w:pPr/>
+            <w:r>
+              <w:t xml:space="preserve">customer_id</w:t>
+            </w:r>
+          </w:p>
+        </w:tc>
+        <w:tc>
+          <w:tcPr>
+            <w:tcW w:w="2000" w:type="dxa"/>
+          </w:tcPr>
+          <w:p>
+            <w:pPr/>
+            <w:r>
+              <w:t xml:space="preserve">bigint</w:t>
+            </w:r>
+          </w:p>
+        </w:tc>
+        <w:tc>
+          <w:tcPr>
+            <w:tcW w:w="2000" w:type="dxa"/>
+          </w:tcPr>
+          <w:p>
+            <w:pPr/>
+            <w:r>
+              <w:t xml:space="preserve">-</w:t>
+            </w:r>
+          </w:p>
+        </w:tc>
+        <w:tc>
+          <w:tcPr>
+            <w:tcW w:w="2000" w:type="dxa"/>
+          </w:tcPr>
+          <w:p>
+            <w:pPr/>
+            <w:r>
+              <w:t xml:space="preserve">FK, NOT NULL</w:t>
+            </w:r>
+          </w:p>
+        </w:tc>
+      </w:tr>
+      <w:tr>
+        <w:trPr>
+          <w:trHeight w:val="530" w:hRule="atLeast"/>
+        </w:trPr>
+        <w:tc>
+          <w:tcPr>
+            <w:tcW w:w="2000" w:type="dxa"/>
+          </w:tcPr>
+          <w:p>
+            <w:pPr/>
+            <w:r>
+              <w:t xml:space="preserve">is_default</w:t>
+            </w:r>
+          </w:p>
+        </w:tc>
+        <w:tc>
+          <w:tcPr>
+            <w:tcW w:w="2000" w:type="dxa"/>
+          </w:tcPr>
+          <w:p>
+            <w:pPr/>
+            <w:r>
+              <w:t xml:space="preserve">bit</w:t>
+            </w:r>
+          </w:p>
+        </w:tc>
+        <w:tc>
+          <w:tcPr>
+            <w:tcW w:w="2000" w:type="dxa"/>
+          </w:tcPr>
+          <w:p>
+            <w:pPr/>
+            <w:r>
+              <w:t xml:space="preserve">-</w:t>
+            </w:r>
+          </w:p>
+        </w:tc>
+        <w:tc>
+          <w:tcPr>
+            <w:tcW w:w="2000" w:type="dxa"/>
+          </w:tcPr>
+          <w:p>
+            <w:pPr/>
+            <w:r>
+              <w:t xml:space="preserve">NOT NULL</w:t>
+            </w:r>
+          </w:p>
+        </w:tc>
+      </w:tr>
+      <w:tr>
+        <w:trPr>
+          <w:trHeight w:val="530" w:hRule="atLeast"/>
+        </w:trPr>
+        <w:tc>
+          <w:tcPr>
+            <w:tcW w:w="2000" w:type="dxa"/>
+          </w:tcPr>
+          <w:p>
+            <w:pPr/>
+            <w:r>
+              <w:t xml:space="preserve">name</w:t>
+            </w:r>
+          </w:p>
+        </w:tc>
+        <w:tc>
+          <w:tcPr>
+            <w:tcW w:w="2000" w:type="dxa"/>
+          </w:tcPr>
+          <w:p>
+            <w:pPr/>
+            <w:r>
+              <w:t xml:space="preserve">nvarchar</w:t>
+            </w:r>
+          </w:p>
+        </w:tc>
+        <w:tc>
+          <w:tcPr>
+            <w:tcW w:w="2000" w:type="dxa"/>
+          </w:tcPr>
+          <w:p>
+            <w:pPr/>
+            <w:r>
+              <w:t xml:space="preserve">100</w:t>
+            </w:r>
+          </w:p>
+        </w:tc>
+        <w:tc>
+          <w:tcPr>
+            <w:tcW w:w="2000" w:type="dxa"/>
+          </w:tcPr>
+          <w:p>
+            <w:pPr/>
+            <w:r>
+              <w:t xml:space="preserve">NOT NULL</w:t>
+            </w:r>
+          </w:p>
+        </w:tc>
+      </w:tr>
+      <w:tr>
+        <w:trPr>
+          <w:trHeight w:val="530" w:hRule="atLeast"/>
+        </w:trPr>
+        <w:tc>
+          <w:tcPr>
+            <w:tcW w:w="2000" w:type="dxa"/>
+          </w:tcPr>
+          <w:p>
+            <w:pPr/>
+            <w:r>
+              <w:t xml:space="preserve">position</w:t>
+            </w:r>
+          </w:p>
+        </w:tc>
+        <w:tc>
+          <w:tcPr>
+            <w:tcW w:w="2000" w:type="dxa"/>
+          </w:tcPr>
+          <w:p>
+            <w:pPr/>
+            <w:r>
+              <w:t xml:space="preserve">nvarchar</w:t>
+            </w:r>
+          </w:p>
+        </w:tc>
+        <w:tc>
+          <w:tcPr>
+            <w:tcW w:w="2000" w:type="dxa"/>
+          </w:tcPr>
+          <w:p>
+            <w:pPr/>
+            <w:r>
+              <w:t xml:space="preserve">100</w:t>
+            </w:r>
+          </w:p>
+        </w:tc>
+        <w:tc>
+          <w:tcPr>
+            <w:tcW w:w="2000" w:type="dxa"/>
+          </w:tcPr>
+          <w:p>
+            <w:pPr/>
+            <w:r>
+              <w:t xml:space="preserve">IS NULL</w:t>
+            </w:r>
+          </w:p>
+        </w:tc>
+      </w:tr>
+      <w:tr>
+        <w:trPr>
+          <w:trHeight w:val="530" w:hRule="atLeast"/>
+        </w:trPr>
+        <w:tc>
+          <w:tcPr>
+            <w:tcW w:w="2000" w:type="dxa"/>
+          </w:tcPr>
+          <w:p>
+            <w:pPr/>
+            <w:r>
+              <w:t xml:space="preserve">mobile</w:t>
+            </w:r>
+          </w:p>
+        </w:tc>
+        <w:tc>
+          <w:tcPr>
+            <w:tcW w:w="2000" w:type="dxa"/>
+          </w:tcPr>
+          <w:p>
+            <w:pPr/>
+            <w:r>
+              <w:t xml:space="preserve">nvarchar</w:t>
+            </w:r>
+          </w:p>
+        </w:tc>
+        <w:tc>
+          <w:tcPr>
+            <w:tcW w:w="2000" w:type="dxa"/>
+          </w:tcPr>
+          <w:p>
+            <w:pPr/>
+            <w:r>
+              <w:t xml:space="preserve">50</w:t>
+            </w:r>
+          </w:p>
+        </w:tc>
+        <w:tc>
+          <w:tcPr>
+            <w:tcW w:w="2000" w:type="dxa"/>
+          </w:tcPr>
+          <w:p>
+            <w:pPr/>
+            <w:r>
+              <w:t xml:space="preserve">IS NULL</w:t>
+            </w:r>
+          </w:p>
+        </w:tc>
+      </w:tr>
+      <w:tr>
+        <w:trPr>
+          <w:trHeight w:val="530" w:hRule="atLeast"/>
+        </w:trPr>
+        <w:tc>
+          <w:tcPr>
+            <w:tcW w:w="2000" w:type="dxa"/>
+          </w:tcPr>
+          <w:p>
+            <w:pPr/>
+            <w:r>
+              <w:t xml:space="preserve">phone</w:t>
+            </w:r>
+          </w:p>
+        </w:tc>
+        <w:tc>
+          <w:tcPr>
+            <w:tcW w:w="2000" w:type="dxa"/>
+          </w:tcPr>
+          <w:p>
+            <w:pPr/>
+            <w:r>
+              <w:t xml:space="preserve">nvarchar</w:t>
+            </w:r>
+          </w:p>
+        </w:tc>
+        <w:tc>
+          <w:tcPr>
+            <w:tcW w:w="2000" w:type="dxa"/>
+          </w:tcPr>
+          <w:p>
+            <w:pPr/>
+            <w:r>
+              <w:t xml:space="preserve">50</w:t>
+            </w:r>
+          </w:p>
+        </w:tc>
+        <w:tc>
+          <w:tcPr>
+            <w:tcW w:w="2000" w:type="dxa"/>
+          </w:tcPr>
+          <w:p>
+            <w:pPr/>
+            <w:r>
+              <w:t xml:space="preserve">IS NULL</w:t>
+            </w:r>
+          </w:p>
+        </w:tc>
+      </w:tr>
+      <w:tr>
+        <w:trPr>
+          <w:trHeight w:val="530" w:hRule="atLeast"/>
+        </w:trPr>
+        <w:tc>
+          <w:tcPr>
+            <w:tcW w:w="2000" w:type="dxa"/>
+          </w:tcPr>
+          <w:p>
+            <w:pPr/>
+            <w:r>
+              <w:t xml:space="preserve">email</w:t>
+            </w:r>
+          </w:p>
+        </w:tc>
+        <w:tc>
+          <w:tcPr>
+            <w:tcW w:w="2000" w:type="dxa"/>
+          </w:tcPr>
+          <w:p>
+            <w:pPr/>
+            <w:r>
+              <w:t xml:space="preserve">varchar</w:t>
+            </w:r>
+          </w:p>
+        </w:tc>
+        <w:tc>
+          <w:tcPr>
+            <w:tcW w:w="2000" w:type="dxa"/>
+          </w:tcPr>
+          <w:p>
+            <w:pPr/>
+            <w:r>
+              <w:t xml:space="preserve">200</w:t>
+            </w:r>
+          </w:p>
+        </w:tc>
+        <w:tc>
+          <w:tcPr>
+            <w:tcW w:w="2000" w:type="dxa"/>
+          </w:tcPr>
+          <w:p>
+            <w:pPr/>
+            <w:r>
+              <w:t xml:space="preserve">IS NULL</w:t>
+            </w:r>
+          </w:p>
+        </w:tc>
+      </w:tr>
+      <w:tr>
+        <w:trPr>
+          <w:trHeight w:val="530" w:hRule="atLeast"/>
+        </w:trPr>
+        <w:tc>
+          <w:tcPr>
+            <w:tcW w:w="2000" w:type="dxa"/>
+          </w:tcPr>
+          <w:p>
+            <w:pPr/>
+            <w:r>
+              <w:t xml:space="preserve">messaging_id</w:t>
+            </w:r>
+          </w:p>
+        </w:tc>
+        <w:tc>
+          <w:tcPr>
+            <w:tcW w:w="2000" w:type="dxa"/>
+          </w:tcPr>
+          <w:p>
+            <w:pPr/>
+            <w:r>
+              <w:t xml:space="preserve">nvarchar</w:t>
+            </w:r>
+          </w:p>
+        </w:tc>
+        <w:tc>
+          <w:tcPr>
+            <w:tcW w:w="2000" w:type="dxa"/>
+          </w:tcPr>
+          <w:p>
+            <w:pPr/>
+            <w:r>
+              <w:t xml:space="preserve">100</w:t>
+            </w:r>
+          </w:p>
+        </w:tc>
+        <w:tc>
+          <w:tcPr>
+            <w:tcW w:w="2000" w:type="dxa"/>
+          </w:tcPr>
+          <w:p>
+            <w:pPr/>
+            <w:r>
+              <w:t xml:space="preserve">IS NULL</w:t>
+            </w:r>
+          </w:p>
+        </w:tc>
+      </w:tr>
+      <w:tr>
+        <w:trPr>
+          <w:trHeight w:val="530" w:hRule="atLeast"/>
+        </w:trPr>
+        <w:tc>
+          <w:tcPr>
+            <w:tcW w:w="2000" w:type="dxa"/>
+          </w:tcPr>
+          <w:p>
+            <w:pPr/>
+            <w:r>
+              <w:t xml:space="preserve">note</w:t>
+            </w:r>
+          </w:p>
+        </w:tc>
+        <w:tc>
+          <w:tcPr>
+            <w:tcW w:w="2000" w:type="dxa"/>
+          </w:tcPr>
+          <w:p>
+            <w:pPr/>
+            <w:r>
+              <w:t xml:space="preserve">nvarchar</w:t>
+            </w:r>
+          </w:p>
+        </w:tc>
+        <w:tc>
+          <w:tcPr>
+            <w:tcW w:w="2000" w:type="dxa"/>
+          </w:tcPr>
+          <w:p>
+            <w:pPr/>
+            <w:r>
+              <w:t xml:space="preserve">500</w:t>
+            </w:r>
+          </w:p>
+        </w:tc>
+        <w:tc>
+          <w:tcPr>
+            <w:tcW w:w="2000" w:type="dxa"/>
+          </w:tcPr>
+          <w:p>
+            <w:pPr/>
+            <w:r>
+              <w:t xml:space="preserve">IS NULL</w:t>
             </w:r>
           </w:p>
         </w:tc>
@@ -33329,6 +35178,44 @@
           <w:i/>
         </w:rPr>
         <w:t xml:space="preserve">[Pending] System screenshot of Client Edit Interface.</w:t>
+      </w:r>
+    </w:p>
+    <w:p>
+      <w:pPr>
+        <w:pStyle w:val="Heading5"/>
+      </w:pPr>
+      <w:r>
+        <w:t xml:space="preserve">4.2.1.8.4 Client Contact Management Interface</w:t>
+      </w:r>
+    </w:p>
+    <w:p>
+      <w:pPr>
+        <w:jc w:val="center"/>
+      </w:pPr>
+      <w:r>
+        <w:rPr>
+          <w:i/>
+        </w:rPr>
+        <w:t xml:space="preserve">[Pending] System screenshot of Client Contact Management Interface.</w:t>
+      </w:r>
+    </w:p>
+    <w:p>
+      <w:pPr>
+        <w:pStyle w:val="Heading5"/>
+      </w:pPr>
+      <w:r>
+        <w:t xml:space="preserve">4.2.1.8.5 Client Import Interface</w:t>
+      </w:r>
+    </w:p>
+    <w:p>
+      <w:pPr>
+        <w:jc w:val="center"/>
+      </w:pPr>
+      <w:r>
+        <w:rPr>
+          <w:i/>
+        </w:rPr>
+        <w:t xml:space="preserve">[Pending] System screenshot of Client Import Interface.</w:t>
       </w:r>
     </w:p>
     <w:p>
@@ -34776,7 +36663,7 @@
       </w:r>
     </w:p>
     <w:sectPr>
-      <w:footerReference xmlns:r="http://schemas.openxmlformats.org/officeDocument/2006/relationships" w:type="default" r:id="R7c77119d4b194383"/>
+      <w:footerReference xmlns:r="http://schemas.openxmlformats.org/officeDocument/2006/relationships" w:type="default" r:id="Rf34b531da5d04ac6"/>
       <w:pgSz w:w="11906" w:h="16838"/>
       <w:pgMar w:top="1440" w:right="1440" w:bottom="1440" w:left="1440" w:header="720" w:footer="720" w:gutter="0"/>
     </w:sectPr>

</xml_diff>

<commit_message>
feat(md): add supplier contacts
- md_supplier_contact with company-scoped composite FK, single default
  per supplier and default-active CHECK; SupplierContactService and
  /api/v1/md/suppliers/{supplierId}/contacts (ADR-043, no address table)
- Shared PartnerContactDialog/PartnerContactApi; supplier rows open a
  contacts-only dialog guarded by MD.SUPPLIER.VIEW/EDIT
- REQ_F4118.43.1-4, REQ_DS43.130, interface 8.9; tests MD-SUP-CONT-*

Co-Authored-By: Claude Opus 5.5 <noreply@anthropic.com>
</commit_message>
<xml_diff>
--- a/docs/99-output/MyERP_SDS.docx
+++ b/docs/99-output/MyERP_SDS.docx
@@ -16506,6 +16506,1004 @@
     <w:p>
       <w:pPr/>
       <w:r>
+        <w:t xml:space="preserve">Table Name: md_supplier_contact</w:t>
+      </w:r>
+    </w:p>
+    <w:p>
+      <w:pPr/>
+      <w:r>
+        <w:t xml:space="preserve">Primary Key: id</w:t>
+      </w:r>
+    </w:p>
+    <w:p>
+      <w:pPr/>
+      <w:r>
+        <w:t xml:space="preserve">This table stores the contact persons of suppliers.</w:t>
+      </w:r>
+    </w:p>
+    <w:tbl>
+      <w:tblPr>
+        <w:tblStyle w:val="TableGrid"/>
+        <w:tblW w:w="8000" w:type="dxa"/>
+        <w:jc w:val="left"/>
+        <w:tblBorders>
+          <w:top w:val="single" w:color="000000" w:sz="4" w:space="0"/>
+          <w:left w:val="single" w:color="000000" w:sz="4" w:space="0"/>
+          <w:bottom w:val="single" w:color="000000" w:sz="4" w:space="0"/>
+          <w:right w:val="single" w:color="000000" w:sz="4" w:space="0"/>
+          <w:insideH w:val="single" w:color="000000" w:sz="4" w:space="0"/>
+          <w:insideV w:val="single" w:color="000000" w:sz="4" w:space="0"/>
+        </w:tblBorders>
+        <w:tblLayout w:type="fixed"/>
+        <w:tblCellMar>
+          <w:top w:w="100" w:type="dxa"/>
+          <w:left w:w="100" w:type="dxa"/>
+          <w:bottom w:w="100" w:type="dxa"/>
+          <w:right w:w="100" w:type="dxa"/>
+        </w:tblCellMar>
+      </w:tblPr>
+      <w:tblGrid>
+        <w:gridCol w:w="2000"/>
+        <w:gridCol w:w="2000"/>
+        <w:gridCol w:w="2000"/>
+        <w:gridCol w:w="2000"/>
+      </w:tblGrid>
+      <w:tr>
+        <w:trPr>
+          <w:trHeight w:val="530" w:hRule="atLeast"/>
+        </w:trPr>
+        <w:tc>
+          <w:tcPr>
+            <w:tcW w:w="2000" w:type="dxa"/>
+          </w:tcPr>
+          <w:p>
+            <w:pPr>
+              <w:jc w:val="center"/>
+            </w:pPr>
+            <w:r>
+              <w:rPr>
+                <w:b/>
+              </w:rPr>
+              <w:t xml:space="preserve">Name of Attribute</w:t>
+            </w:r>
+          </w:p>
+        </w:tc>
+        <w:tc>
+          <w:tcPr>
+            <w:tcW w:w="2000" w:type="dxa"/>
+          </w:tcPr>
+          <w:p>
+            <w:pPr>
+              <w:jc w:val="center"/>
+            </w:pPr>
+            <w:r>
+              <w:rPr>
+                <w:b/>
+              </w:rPr>
+              <w:t xml:space="preserve">Data Type</w:t>
+            </w:r>
+          </w:p>
+        </w:tc>
+        <w:tc>
+          <w:tcPr>
+            <w:tcW w:w="2000" w:type="dxa"/>
+          </w:tcPr>
+          <w:p>
+            <w:pPr>
+              <w:jc w:val="center"/>
+            </w:pPr>
+            <w:r>
+              <w:rPr>
+                <w:b/>
+              </w:rPr>
+              <w:t xml:space="preserve">Size</w:t>
+            </w:r>
+          </w:p>
+        </w:tc>
+        <w:tc>
+          <w:tcPr>
+            <w:tcW w:w="2000" w:type="dxa"/>
+          </w:tcPr>
+          <w:p>
+            <w:pPr>
+              <w:jc w:val="center"/>
+            </w:pPr>
+            <w:r>
+              <w:rPr>
+                <w:b/>
+              </w:rPr>
+              <w:t xml:space="preserve">PK/FK/IS NULL/ NOT NULL</w:t>
+            </w:r>
+          </w:p>
+        </w:tc>
+      </w:tr>
+      <w:tr>
+        <w:trPr>
+          <w:trHeight w:val="530" w:hRule="atLeast"/>
+        </w:trPr>
+        <w:tc>
+          <w:tcPr>
+            <w:tcW w:w="2000" w:type="dxa"/>
+          </w:tcPr>
+          <w:p>
+            <w:pPr/>
+            <w:r>
+              <w:t xml:space="preserve">id</w:t>
+            </w:r>
+          </w:p>
+        </w:tc>
+        <w:tc>
+          <w:tcPr>
+            <w:tcW w:w="2000" w:type="dxa"/>
+          </w:tcPr>
+          <w:p>
+            <w:pPr/>
+            <w:r>
+              <w:t xml:space="preserve">bigint</w:t>
+            </w:r>
+          </w:p>
+        </w:tc>
+        <w:tc>
+          <w:tcPr>
+            <w:tcW w:w="2000" w:type="dxa"/>
+          </w:tcPr>
+          <w:p>
+            <w:pPr/>
+            <w:r>
+              <w:t xml:space="preserve">-</w:t>
+            </w:r>
+          </w:p>
+        </w:tc>
+        <w:tc>
+          <w:tcPr>
+            <w:tcW w:w="2000" w:type="dxa"/>
+          </w:tcPr>
+          <w:p>
+            <w:pPr/>
+            <w:r>
+              <w:t xml:space="preserve">PK, NOT NULL</w:t>
+            </w:r>
+          </w:p>
+        </w:tc>
+      </w:tr>
+      <w:tr>
+        <w:trPr>
+          <w:trHeight w:val="530" w:hRule="atLeast"/>
+        </w:trPr>
+        <w:tc>
+          <w:tcPr>
+            <w:tcW w:w="2000" w:type="dxa"/>
+          </w:tcPr>
+          <w:p>
+            <w:pPr/>
+            <w:r>
+              <w:t xml:space="preserve">company_id</w:t>
+            </w:r>
+          </w:p>
+        </w:tc>
+        <w:tc>
+          <w:tcPr>
+            <w:tcW w:w="2000" w:type="dxa"/>
+          </w:tcPr>
+          <w:p>
+            <w:pPr/>
+            <w:r>
+              <w:t xml:space="preserve">bigint</w:t>
+            </w:r>
+          </w:p>
+        </w:tc>
+        <w:tc>
+          <w:tcPr>
+            <w:tcW w:w="2000" w:type="dxa"/>
+          </w:tcPr>
+          <w:p>
+            <w:pPr/>
+            <w:r>
+              <w:t xml:space="preserve">-</w:t>
+            </w:r>
+          </w:p>
+        </w:tc>
+        <w:tc>
+          <w:tcPr>
+            <w:tcW w:w="2000" w:type="dxa"/>
+          </w:tcPr>
+          <w:p>
+            <w:pPr/>
+            <w:r>
+              <w:t xml:space="preserve">FK, NOT NULL</w:t>
+            </w:r>
+          </w:p>
+        </w:tc>
+      </w:tr>
+      <w:tr>
+        <w:trPr>
+          <w:trHeight w:val="530" w:hRule="atLeast"/>
+        </w:trPr>
+        <w:tc>
+          <w:tcPr>
+            <w:tcW w:w="2000" w:type="dxa"/>
+          </w:tcPr>
+          <w:p>
+            <w:pPr/>
+            <w:r>
+              <w:t xml:space="preserve">created_at</w:t>
+            </w:r>
+          </w:p>
+        </w:tc>
+        <w:tc>
+          <w:tcPr>
+            <w:tcW w:w="2000" w:type="dxa"/>
+          </w:tcPr>
+          <w:p>
+            <w:pPr/>
+            <w:r>
+              <w:t xml:space="preserve">datetime2</w:t>
+            </w:r>
+          </w:p>
+        </w:tc>
+        <w:tc>
+          <w:tcPr>
+            <w:tcW w:w="2000" w:type="dxa"/>
+          </w:tcPr>
+          <w:p>
+            <w:pPr/>
+            <w:r>
+              <w:t xml:space="preserve">(6)</w:t>
+            </w:r>
+          </w:p>
+        </w:tc>
+        <w:tc>
+          <w:tcPr>
+            <w:tcW w:w="2000" w:type="dxa"/>
+          </w:tcPr>
+          <w:p>
+            <w:pPr/>
+            <w:r>
+              <w:t xml:space="preserve">NOT NULL</w:t>
+            </w:r>
+          </w:p>
+        </w:tc>
+      </w:tr>
+      <w:tr>
+        <w:trPr>
+          <w:trHeight w:val="530" w:hRule="atLeast"/>
+        </w:trPr>
+        <w:tc>
+          <w:tcPr>
+            <w:tcW w:w="2000" w:type="dxa"/>
+          </w:tcPr>
+          <w:p>
+            <w:pPr/>
+            <w:r>
+              <w:t xml:space="preserve">created_by</w:t>
+            </w:r>
+          </w:p>
+        </w:tc>
+        <w:tc>
+          <w:tcPr>
+            <w:tcW w:w="2000" w:type="dxa"/>
+          </w:tcPr>
+          <w:p>
+            <w:pPr/>
+            <w:r>
+              <w:t xml:space="preserve">bigint</w:t>
+            </w:r>
+          </w:p>
+        </w:tc>
+        <w:tc>
+          <w:tcPr>
+            <w:tcW w:w="2000" w:type="dxa"/>
+          </w:tcPr>
+          <w:p>
+            <w:pPr/>
+            <w:r>
+              <w:t xml:space="preserve">-</w:t>
+            </w:r>
+          </w:p>
+        </w:tc>
+        <w:tc>
+          <w:tcPr>
+            <w:tcW w:w="2000" w:type="dxa"/>
+          </w:tcPr>
+          <w:p>
+            <w:pPr/>
+            <w:r>
+              <w:t xml:space="preserve">NOT NULL</w:t>
+            </w:r>
+          </w:p>
+        </w:tc>
+      </w:tr>
+      <w:tr>
+        <w:trPr>
+          <w:trHeight w:val="530" w:hRule="atLeast"/>
+        </w:trPr>
+        <w:tc>
+          <w:tcPr>
+            <w:tcW w:w="2000" w:type="dxa"/>
+          </w:tcPr>
+          <w:p>
+            <w:pPr/>
+            <w:r>
+              <w:t xml:space="preserve">updated_at</w:t>
+            </w:r>
+          </w:p>
+        </w:tc>
+        <w:tc>
+          <w:tcPr>
+            <w:tcW w:w="2000" w:type="dxa"/>
+          </w:tcPr>
+          <w:p>
+            <w:pPr/>
+            <w:r>
+              <w:t xml:space="preserve">datetime2</w:t>
+            </w:r>
+          </w:p>
+        </w:tc>
+        <w:tc>
+          <w:tcPr>
+            <w:tcW w:w="2000" w:type="dxa"/>
+          </w:tcPr>
+          <w:p>
+            <w:pPr/>
+            <w:r>
+              <w:t xml:space="preserve">(6)</w:t>
+            </w:r>
+          </w:p>
+        </w:tc>
+        <w:tc>
+          <w:tcPr>
+            <w:tcW w:w="2000" w:type="dxa"/>
+          </w:tcPr>
+          <w:p>
+            <w:pPr/>
+            <w:r>
+              <w:t xml:space="preserve">IS NULL</w:t>
+            </w:r>
+          </w:p>
+        </w:tc>
+      </w:tr>
+      <w:tr>
+        <w:trPr>
+          <w:trHeight w:val="530" w:hRule="atLeast"/>
+        </w:trPr>
+        <w:tc>
+          <w:tcPr>
+            <w:tcW w:w="2000" w:type="dxa"/>
+          </w:tcPr>
+          <w:p>
+            <w:pPr/>
+            <w:r>
+              <w:t xml:space="preserve">updated_by</w:t>
+            </w:r>
+          </w:p>
+        </w:tc>
+        <w:tc>
+          <w:tcPr>
+            <w:tcW w:w="2000" w:type="dxa"/>
+          </w:tcPr>
+          <w:p>
+            <w:pPr/>
+            <w:r>
+              <w:t xml:space="preserve">bigint</w:t>
+            </w:r>
+          </w:p>
+        </w:tc>
+        <w:tc>
+          <w:tcPr>
+            <w:tcW w:w="2000" w:type="dxa"/>
+          </w:tcPr>
+          <w:p>
+            <w:pPr/>
+            <w:r>
+              <w:t xml:space="preserve">-</w:t>
+            </w:r>
+          </w:p>
+        </w:tc>
+        <w:tc>
+          <w:tcPr>
+            <w:tcW w:w="2000" w:type="dxa"/>
+          </w:tcPr>
+          <w:p>
+            <w:pPr/>
+            <w:r>
+              <w:t xml:space="preserve">IS NULL</w:t>
+            </w:r>
+          </w:p>
+        </w:tc>
+      </w:tr>
+      <w:tr>
+        <w:trPr>
+          <w:trHeight w:val="530" w:hRule="atLeast"/>
+        </w:trPr>
+        <w:tc>
+          <w:tcPr>
+            <w:tcW w:w="2000" w:type="dxa"/>
+          </w:tcPr>
+          <w:p>
+            <w:pPr/>
+            <w:r>
+              <w:t xml:space="preserve">version</w:t>
+            </w:r>
+          </w:p>
+        </w:tc>
+        <w:tc>
+          <w:tcPr>
+            <w:tcW w:w="2000" w:type="dxa"/>
+          </w:tcPr>
+          <w:p>
+            <w:pPr/>
+            <w:r>
+              <w:t xml:space="preserve">int</w:t>
+            </w:r>
+          </w:p>
+        </w:tc>
+        <w:tc>
+          <w:tcPr>
+            <w:tcW w:w="2000" w:type="dxa"/>
+          </w:tcPr>
+          <w:p>
+            <w:pPr/>
+            <w:r>
+              <w:t xml:space="preserve">-</w:t>
+            </w:r>
+          </w:p>
+        </w:tc>
+        <w:tc>
+          <w:tcPr>
+            <w:tcW w:w="2000" w:type="dxa"/>
+          </w:tcPr>
+          <w:p>
+            <w:pPr/>
+            <w:r>
+              <w:t xml:space="preserve">NOT NULL</w:t>
+            </w:r>
+          </w:p>
+        </w:tc>
+      </w:tr>
+      <w:tr>
+        <w:trPr>
+          <w:trHeight w:val="530" w:hRule="atLeast"/>
+        </w:trPr>
+        <w:tc>
+          <w:tcPr>
+            <w:tcW w:w="2000" w:type="dxa"/>
+          </w:tcPr>
+          <w:p>
+            <w:pPr/>
+            <w:r>
+              <w:t xml:space="preserve">is_active</w:t>
+            </w:r>
+          </w:p>
+        </w:tc>
+        <w:tc>
+          <w:tcPr>
+            <w:tcW w:w="2000" w:type="dxa"/>
+          </w:tcPr>
+          <w:p>
+            <w:pPr/>
+            <w:r>
+              <w:t xml:space="preserve">bit</w:t>
+            </w:r>
+          </w:p>
+        </w:tc>
+        <w:tc>
+          <w:tcPr>
+            <w:tcW w:w="2000" w:type="dxa"/>
+          </w:tcPr>
+          <w:p>
+            <w:pPr/>
+            <w:r>
+              <w:t xml:space="preserve">-</w:t>
+            </w:r>
+          </w:p>
+        </w:tc>
+        <w:tc>
+          <w:tcPr>
+            <w:tcW w:w="2000" w:type="dxa"/>
+          </w:tcPr>
+          <w:p>
+            <w:pPr/>
+            <w:r>
+              <w:t xml:space="preserve">NOT NULL</w:t>
+            </w:r>
+          </w:p>
+        </w:tc>
+      </w:tr>
+      <w:tr>
+        <w:trPr>
+          <w:trHeight w:val="530" w:hRule="atLeast"/>
+        </w:trPr>
+        <w:tc>
+          <w:tcPr>
+            <w:tcW w:w="2000" w:type="dxa"/>
+          </w:tcPr>
+          <w:p>
+            <w:pPr/>
+            <w:r>
+              <w:t xml:space="preserve">is_deleted</w:t>
+            </w:r>
+          </w:p>
+        </w:tc>
+        <w:tc>
+          <w:tcPr>
+            <w:tcW w:w="2000" w:type="dxa"/>
+          </w:tcPr>
+          <w:p>
+            <w:pPr/>
+            <w:r>
+              <w:t xml:space="preserve">bit</w:t>
+            </w:r>
+          </w:p>
+        </w:tc>
+        <w:tc>
+          <w:tcPr>
+            <w:tcW w:w="2000" w:type="dxa"/>
+          </w:tcPr>
+          <w:p>
+            <w:pPr/>
+            <w:r>
+              <w:t xml:space="preserve">-</w:t>
+            </w:r>
+          </w:p>
+        </w:tc>
+        <w:tc>
+          <w:tcPr>
+            <w:tcW w:w="2000" w:type="dxa"/>
+          </w:tcPr>
+          <w:p>
+            <w:pPr/>
+            <w:r>
+              <w:t xml:space="preserve">NOT NULL</w:t>
+            </w:r>
+          </w:p>
+        </w:tc>
+      </w:tr>
+      <w:tr>
+        <w:trPr>
+          <w:trHeight w:val="530" w:hRule="atLeast"/>
+        </w:trPr>
+        <w:tc>
+          <w:tcPr>
+            <w:tcW w:w="2000" w:type="dxa"/>
+          </w:tcPr>
+          <w:p>
+            <w:pPr/>
+            <w:r>
+              <w:t xml:space="preserve">supplier_id</w:t>
+            </w:r>
+          </w:p>
+        </w:tc>
+        <w:tc>
+          <w:tcPr>
+            <w:tcW w:w="2000" w:type="dxa"/>
+          </w:tcPr>
+          <w:p>
+            <w:pPr/>
+            <w:r>
+              <w:t xml:space="preserve">bigint</w:t>
+            </w:r>
+          </w:p>
+        </w:tc>
+        <w:tc>
+          <w:tcPr>
+            <w:tcW w:w="2000" w:type="dxa"/>
+          </w:tcPr>
+          <w:p>
+            <w:pPr/>
+            <w:r>
+              <w:t xml:space="preserve">-</w:t>
+            </w:r>
+          </w:p>
+        </w:tc>
+        <w:tc>
+          <w:tcPr>
+            <w:tcW w:w="2000" w:type="dxa"/>
+          </w:tcPr>
+          <w:p>
+            <w:pPr/>
+            <w:r>
+              <w:t xml:space="preserve">FK, NOT NULL</w:t>
+            </w:r>
+          </w:p>
+        </w:tc>
+      </w:tr>
+      <w:tr>
+        <w:trPr>
+          <w:trHeight w:val="530" w:hRule="atLeast"/>
+        </w:trPr>
+        <w:tc>
+          <w:tcPr>
+            <w:tcW w:w="2000" w:type="dxa"/>
+          </w:tcPr>
+          <w:p>
+            <w:pPr/>
+            <w:r>
+              <w:t xml:space="preserve">is_default</w:t>
+            </w:r>
+          </w:p>
+        </w:tc>
+        <w:tc>
+          <w:tcPr>
+            <w:tcW w:w="2000" w:type="dxa"/>
+          </w:tcPr>
+          <w:p>
+            <w:pPr/>
+            <w:r>
+              <w:t xml:space="preserve">bit</w:t>
+            </w:r>
+          </w:p>
+        </w:tc>
+        <w:tc>
+          <w:tcPr>
+            <w:tcW w:w="2000" w:type="dxa"/>
+          </w:tcPr>
+          <w:p>
+            <w:pPr/>
+            <w:r>
+              <w:t xml:space="preserve">-</w:t>
+            </w:r>
+          </w:p>
+        </w:tc>
+        <w:tc>
+          <w:tcPr>
+            <w:tcW w:w="2000" w:type="dxa"/>
+          </w:tcPr>
+          <w:p>
+            <w:pPr/>
+            <w:r>
+              <w:t xml:space="preserve">NOT NULL</w:t>
+            </w:r>
+          </w:p>
+        </w:tc>
+      </w:tr>
+      <w:tr>
+        <w:trPr>
+          <w:trHeight w:val="530" w:hRule="atLeast"/>
+        </w:trPr>
+        <w:tc>
+          <w:tcPr>
+            <w:tcW w:w="2000" w:type="dxa"/>
+          </w:tcPr>
+          <w:p>
+            <w:pPr/>
+            <w:r>
+              <w:t xml:space="preserve">name</w:t>
+            </w:r>
+          </w:p>
+        </w:tc>
+        <w:tc>
+          <w:tcPr>
+            <w:tcW w:w="2000" w:type="dxa"/>
+          </w:tcPr>
+          <w:p>
+            <w:pPr/>
+            <w:r>
+              <w:t xml:space="preserve">nvarchar</w:t>
+            </w:r>
+          </w:p>
+        </w:tc>
+        <w:tc>
+          <w:tcPr>
+            <w:tcW w:w="2000" w:type="dxa"/>
+          </w:tcPr>
+          <w:p>
+            <w:pPr/>
+            <w:r>
+              <w:t xml:space="preserve">100</w:t>
+            </w:r>
+          </w:p>
+        </w:tc>
+        <w:tc>
+          <w:tcPr>
+            <w:tcW w:w="2000" w:type="dxa"/>
+          </w:tcPr>
+          <w:p>
+            <w:pPr/>
+            <w:r>
+              <w:t xml:space="preserve">NOT NULL</w:t>
+            </w:r>
+          </w:p>
+        </w:tc>
+      </w:tr>
+      <w:tr>
+        <w:trPr>
+          <w:trHeight w:val="530" w:hRule="atLeast"/>
+        </w:trPr>
+        <w:tc>
+          <w:tcPr>
+            <w:tcW w:w="2000" w:type="dxa"/>
+          </w:tcPr>
+          <w:p>
+            <w:pPr/>
+            <w:r>
+              <w:t xml:space="preserve">position</w:t>
+            </w:r>
+          </w:p>
+        </w:tc>
+        <w:tc>
+          <w:tcPr>
+            <w:tcW w:w="2000" w:type="dxa"/>
+          </w:tcPr>
+          <w:p>
+            <w:pPr/>
+            <w:r>
+              <w:t xml:space="preserve">nvarchar</w:t>
+            </w:r>
+          </w:p>
+        </w:tc>
+        <w:tc>
+          <w:tcPr>
+            <w:tcW w:w="2000" w:type="dxa"/>
+          </w:tcPr>
+          <w:p>
+            <w:pPr/>
+            <w:r>
+              <w:t xml:space="preserve">100</w:t>
+            </w:r>
+          </w:p>
+        </w:tc>
+        <w:tc>
+          <w:tcPr>
+            <w:tcW w:w="2000" w:type="dxa"/>
+          </w:tcPr>
+          <w:p>
+            <w:pPr/>
+            <w:r>
+              <w:t xml:space="preserve">IS NULL</w:t>
+            </w:r>
+          </w:p>
+        </w:tc>
+      </w:tr>
+      <w:tr>
+        <w:trPr>
+          <w:trHeight w:val="530" w:hRule="atLeast"/>
+        </w:trPr>
+        <w:tc>
+          <w:tcPr>
+            <w:tcW w:w="2000" w:type="dxa"/>
+          </w:tcPr>
+          <w:p>
+            <w:pPr/>
+            <w:r>
+              <w:t xml:space="preserve">mobile</w:t>
+            </w:r>
+          </w:p>
+        </w:tc>
+        <w:tc>
+          <w:tcPr>
+            <w:tcW w:w="2000" w:type="dxa"/>
+          </w:tcPr>
+          <w:p>
+            <w:pPr/>
+            <w:r>
+              <w:t xml:space="preserve">nvarchar</w:t>
+            </w:r>
+          </w:p>
+        </w:tc>
+        <w:tc>
+          <w:tcPr>
+            <w:tcW w:w="2000" w:type="dxa"/>
+          </w:tcPr>
+          <w:p>
+            <w:pPr/>
+            <w:r>
+              <w:t xml:space="preserve">50</w:t>
+            </w:r>
+          </w:p>
+        </w:tc>
+        <w:tc>
+          <w:tcPr>
+            <w:tcW w:w="2000" w:type="dxa"/>
+          </w:tcPr>
+          <w:p>
+            <w:pPr/>
+            <w:r>
+              <w:t xml:space="preserve">IS NULL</w:t>
+            </w:r>
+          </w:p>
+        </w:tc>
+      </w:tr>
+      <w:tr>
+        <w:trPr>
+          <w:trHeight w:val="530" w:hRule="atLeast"/>
+        </w:trPr>
+        <w:tc>
+          <w:tcPr>
+            <w:tcW w:w="2000" w:type="dxa"/>
+          </w:tcPr>
+          <w:p>
+            <w:pPr/>
+            <w:r>
+              <w:t xml:space="preserve">phone</w:t>
+            </w:r>
+          </w:p>
+        </w:tc>
+        <w:tc>
+          <w:tcPr>
+            <w:tcW w:w="2000" w:type="dxa"/>
+          </w:tcPr>
+          <w:p>
+            <w:pPr/>
+            <w:r>
+              <w:t xml:space="preserve">nvarchar</w:t>
+            </w:r>
+          </w:p>
+        </w:tc>
+        <w:tc>
+          <w:tcPr>
+            <w:tcW w:w="2000" w:type="dxa"/>
+          </w:tcPr>
+          <w:p>
+            <w:pPr/>
+            <w:r>
+              <w:t xml:space="preserve">50</w:t>
+            </w:r>
+          </w:p>
+        </w:tc>
+        <w:tc>
+          <w:tcPr>
+            <w:tcW w:w="2000" w:type="dxa"/>
+          </w:tcPr>
+          <w:p>
+            <w:pPr/>
+            <w:r>
+              <w:t xml:space="preserve">IS NULL</w:t>
+            </w:r>
+          </w:p>
+        </w:tc>
+      </w:tr>
+      <w:tr>
+        <w:trPr>
+          <w:trHeight w:val="530" w:hRule="atLeast"/>
+        </w:trPr>
+        <w:tc>
+          <w:tcPr>
+            <w:tcW w:w="2000" w:type="dxa"/>
+          </w:tcPr>
+          <w:p>
+            <w:pPr/>
+            <w:r>
+              <w:t xml:space="preserve">email</w:t>
+            </w:r>
+          </w:p>
+        </w:tc>
+        <w:tc>
+          <w:tcPr>
+            <w:tcW w:w="2000" w:type="dxa"/>
+          </w:tcPr>
+          <w:p>
+            <w:pPr/>
+            <w:r>
+              <w:t xml:space="preserve">varchar</w:t>
+            </w:r>
+          </w:p>
+        </w:tc>
+        <w:tc>
+          <w:tcPr>
+            <w:tcW w:w="2000" w:type="dxa"/>
+          </w:tcPr>
+          <w:p>
+            <w:pPr/>
+            <w:r>
+              <w:t xml:space="preserve">200</w:t>
+            </w:r>
+          </w:p>
+        </w:tc>
+        <w:tc>
+          <w:tcPr>
+            <w:tcW w:w="2000" w:type="dxa"/>
+          </w:tcPr>
+          <w:p>
+            <w:pPr/>
+            <w:r>
+              <w:t xml:space="preserve">IS NULL</w:t>
+            </w:r>
+          </w:p>
+        </w:tc>
+      </w:tr>
+      <w:tr>
+        <w:trPr>
+          <w:trHeight w:val="530" w:hRule="atLeast"/>
+        </w:trPr>
+        <w:tc>
+          <w:tcPr>
+            <w:tcW w:w="2000" w:type="dxa"/>
+          </w:tcPr>
+          <w:p>
+            <w:pPr/>
+            <w:r>
+              <w:t xml:space="preserve">messaging_id</w:t>
+            </w:r>
+          </w:p>
+        </w:tc>
+        <w:tc>
+          <w:tcPr>
+            <w:tcW w:w="2000" w:type="dxa"/>
+          </w:tcPr>
+          <w:p>
+            <w:pPr/>
+            <w:r>
+              <w:t xml:space="preserve">nvarchar</w:t>
+            </w:r>
+          </w:p>
+        </w:tc>
+        <w:tc>
+          <w:tcPr>
+            <w:tcW w:w="2000" w:type="dxa"/>
+          </w:tcPr>
+          <w:p>
+            <w:pPr/>
+            <w:r>
+              <w:t xml:space="preserve">100</w:t>
+            </w:r>
+          </w:p>
+        </w:tc>
+        <w:tc>
+          <w:tcPr>
+            <w:tcW w:w="2000" w:type="dxa"/>
+          </w:tcPr>
+          <w:p>
+            <w:pPr/>
+            <w:r>
+              <w:t xml:space="preserve">IS NULL</w:t>
+            </w:r>
+          </w:p>
+        </w:tc>
+      </w:tr>
+      <w:tr>
+        <w:trPr>
+          <w:trHeight w:val="530" w:hRule="atLeast"/>
+        </w:trPr>
+        <w:tc>
+          <w:tcPr>
+            <w:tcW w:w="2000" w:type="dxa"/>
+          </w:tcPr>
+          <w:p>
+            <w:pPr/>
+            <w:r>
+              <w:t xml:space="preserve">note</w:t>
+            </w:r>
+          </w:p>
+        </w:tc>
+        <w:tc>
+          <w:tcPr>
+            <w:tcW w:w="2000" w:type="dxa"/>
+          </w:tcPr>
+          <w:p>
+            <w:pPr/>
+            <w:r>
+              <w:t xml:space="preserve">nvarchar</w:t>
+            </w:r>
+          </w:p>
+        </w:tc>
+        <w:tc>
+          <w:tcPr>
+            <w:tcW w:w="2000" w:type="dxa"/>
+          </w:tcPr>
+          <w:p>
+            <w:pPr/>
+            <w:r>
+              <w:t xml:space="preserve">500</w:t>
+            </w:r>
+          </w:p>
+        </w:tc>
+        <w:tc>
+          <w:tcPr>
+            <w:tcW w:w="2000" w:type="dxa"/>
+          </w:tcPr>
+          <w:p>
+            <w:pPr/>
+            <w:r>
+              <w:t xml:space="preserve">IS NULL</w:t>
+            </w:r>
+          </w:p>
+        </w:tc>
+      </w:tr>
+    </w:tbl>
+    <w:p/>
+    <w:p>
+      <w:pPr/>
+      <w:r>
         <w:t xml:space="preserve">Table Name: md_tax_code</w:t>
       </w:r>
     </w:p>
@@ -35273,6 +36271,25 @@
           <w:i/>
         </w:rPr>
         <w:t xml:space="preserve">[Pending] System screenshot of Supplier Edit Interface.</w:t>
+      </w:r>
+    </w:p>
+    <w:p>
+      <w:pPr>
+        <w:pStyle w:val="Heading5"/>
+      </w:pPr>
+      <w:r>
+        <w:t xml:space="preserve">4.2.1.8.9 Supplier Contact Management Interface</w:t>
+      </w:r>
+    </w:p>
+    <w:p>
+      <w:pPr>
+        <w:jc w:val="center"/>
+      </w:pPr>
+      <w:r>
+        <w:rPr>
+          <w:i/>
+        </w:rPr>
+        <w:t xml:space="preserve">[Pending] System screenshot of Supplier Contact Management Interface.</w:t>
       </w:r>
     </w:p>
     <w:p>
@@ -36663,7 +37680,7 @@
       </w:r>
     </w:p>
     <w:sectPr>
-      <w:footerReference xmlns:r="http://schemas.openxmlformats.org/officeDocument/2006/relationships" w:type="default" r:id="Rf34b531da5d04ac6"/>
+      <w:footerReference xmlns:r="http://schemas.openxmlformats.org/officeDocument/2006/relationships" w:type="default" r:id="Ref7c5298e11d4d14"/>
       <w:pgSz w:w="11906" w:h="16838"/>
       <w:pgMar w:top="1440" w:right="1440" w:bottom="1440" w:left="1440" w:header="720" w:footer="720" w:gutter="0"/>
     </w:sectPr>

</xml_diff>

<commit_message>
feat(md): add supplier import
- Extract PartnerImportService<TPartner,TCategory> from customer import
  (read-only preview, company lock, single transaction, code-idempotent
  skip); SupplierImportService imports suppliers with one default contact,
  no address columns (ADR-043/044)
- /api/v1/md/suppliers/import template/preview/commit guarded by
  MD.SUPPLIER.IMPORT; MD.SUPPLIER_IMPORT.HAS_ERRORS
- Shared PartnerImportDialog/PartnerImportService keyed by partner kind;
  supplier list shows the import entry; three-language texts
- REQ_F4118.2.7, interface 8.10; tests MD-SUP-IMP-001..003

Co-Authored-By: Claude Opus 5.5 <noreply@anthropic.com>
</commit_message>
<xml_diff>
--- a/docs/99-output/MyERP_SDS.docx
+++ b/docs/99-output/MyERP_SDS.docx
@@ -36290,6 +36290,25 @@
           <w:i/>
         </w:rPr>
         <w:t xml:space="preserve">[Pending] System screenshot of Supplier Contact Management Interface.</w:t>
+      </w:r>
+    </w:p>
+    <w:p>
+      <w:pPr>
+        <w:pStyle w:val="Heading5"/>
+      </w:pPr>
+      <w:r>
+        <w:t xml:space="preserve">4.2.1.8.10 Supplier Import Interface</w:t>
+      </w:r>
+    </w:p>
+    <w:p>
+      <w:pPr>
+        <w:jc w:val="center"/>
+      </w:pPr>
+      <w:r>
+        <w:rPr>
+          <w:i/>
+        </w:rPr>
+        <w:t xml:space="preserve">[Pending] System screenshot of Supplier Import Interface.</w:t>
       </w:r>
     </w:p>
     <w:p>
@@ -37680,7 +37699,7 @@
       </w:r>
     </w:p>
     <w:sectPr>
-      <w:footerReference xmlns:r="http://schemas.openxmlformats.org/officeDocument/2006/relationships" w:type="default" r:id="Ref7c5298e11d4d14"/>
+      <w:footerReference xmlns:r="http://schemas.openxmlformats.org/officeDocument/2006/relationships" w:type="default" r:id="Rd74fdfd02b3349f6"/>
       <w:pgSz w:w="11906" w:h="16838"/>
       <w:pgMar w:top="1440" w:right="1440" w:bottom="1440" w:left="1440" w:header="720" w:footer="720" w:gutter="0"/>
     </w:sectPr>

</xml_diff>

<commit_message>
feat(md): add item images backend
WU-MD-013a (ADR-045): md_item_image with content-based PNG/JPEG checks,
2 MB / 16-4096 px / 10 per item limits, exactly one primary image,
upload/content(ETag)/update/delete API under MD.ITEM.VIEW/EDIT.
Move ImageInspector to MyERP.Shared.Infrastructure.Imaging for reuse.

Co-Authored-By: Claude Opus 5.5 <noreply@anthropic.com>
</commit_message>
<xml_diff>
--- a/docs/99-output/MyERP_SDS.docx
+++ b/docs/99-output/MyERP_SDS.docx
@@ -10375,6 +10375,906 @@
             <w:pPr/>
             <w:r>
               <w:t xml:space="preserve">IS NULL</w:t>
+            </w:r>
+          </w:p>
+        </w:tc>
+      </w:tr>
+    </w:tbl>
+    <w:p/>
+    <w:p>
+      <w:pPr/>
+      <w:r>
+        <w:t xml:space="preserve">Table Name: md_item_image</w:t>
+      </w:r>
+    </w:p>
+    <w:p>
+      <w:pPr/>
+      <w:r>
+        <w:t xml:space="preserve">Primary Key: id</w:t>
+      </w:r>
+    </w:p>
+    <w:p>
+      <w:pPr/>
+      <w:r>
+        <w:t xml:space="preserve">This table stores the images of products.</w:t>
+      </w:r>
+    </w:p>
+    <w:tbl>
+      <w:tblPr>
+        <w:tblStyle w:val="TableGrid"/>
+        <w:tblW w:w="8000" w:type="dxa"/>
+        <w:jc w:val="left"/>
+        <w:tblBorders>
+          <w:top w:val="single" w:color="000000" w:sz="4" w:space="0"/>
+          <w:left w:val="single" w:color="000000" w:sz="4" w:space="0"/>
+          <w:bottom w:val="single" w:color="000000" w:sz="4" w:space="0"/>
+          <w:right w:val="single" w:color="000000" w:sz="4" w:space="0"/>
+          <w:insideH w:val="single" w:color="000000" w:sz="4" w:space="0"/>
+          <w:insideV w:val="single" w:color="000000" w:sz="4" w:space="0"/>
+        </w:tblBorders>
+        <w:tblLayout w:type="fixed"/>
+        <w:tblCellMar>
+          <w:top w:w="100" w:type="dxa"/>
+          <w:left w:w="100" w:type="dxa"/>
+          <w:bottom w:w="100" w:type="dxa"/>
+          <w:right w:w="100" w:type="dxa"/>
+        </w:tblCellMar>
+      </w:tblPr>
+      <w:tblGrid>
+        <w:gridCol w:w="2000"/>
+        <w:gridCol w:w="2000"/>
+        <w:gridCol w:w="2000"/>
+        <w:gridCol w:w="2000"/>
+      </w:tblGrid>
+      <w:tr>
+        <w:trPr>
+          <w:trHeight w:val="530" w:hRule="atLeast"/>
+        </w:trPr>
+        <w:tc>
+          <w:tcPr>
+            <w:tcW w:w="2000" w:type="dxa"/>
+          </w:tcPr>
+          <w:p>
+            <w:pPr>
+              <w:jc w:val="center"/>
+            </w:pPr>
+            <w:r>
+              <w:rPr>
+                <w:b/>
+              </w:rPr>
+              <w:t xml:space="preserve">Name of Attribute</w:t>
+            </w:r>
+          </w:p>
+        </w:tc>
+        <w:tc>
+          <w:tcPr>
+            <w:tcW w:w="2000" w:type="dxa"/>
+          </w:tcPr>
+          <w:p>
+            <w:pPr>
+              <w:jc w:val="center"/>
+            </w:pPr>
+            <w:r>
+              <w:rPr>
+                <w:b/>
+              </w:rPr>
+              <w:t xml:space="preserve">Data Type</w:t>
+            </w:r>
+          </w:p>
+        </w:tc>
+        <w:tc>
+          <w:tcPr>
+            <w:tcW w:w="2000" w:type="dxa"/>
+          </w:tcPr>
+          <w:p>
+            <w:pPr>
+              <w:jc w:val="center"/>
+            </w:pPr>
+            <w:r>
+              <w:rPr>
+                <w:b/>
+              </w:rPr>
+              <w:t xml:space="preserve">Size</w:t>
+            </w:r>
+          </w:p>
+        </w:tc>
+        <w:tc>
+          <w:tcPr>
+            <w:tcW w:w="2000" w:type="dxa"/>
+          </w:tcPr>
+          <w:p>
+            <w:pPr>
+              <w:jc w:val="center"/>
+            </w:pPr>
+            <w:r>
+              <w:rPr>
+                <w:b/>
+              </w:rPr>
+              <w:t xml:space="preserve">PK/FK/IS NULL/ NOT NULL</w:t>
+            </w:r>
+          </w:p>
+        </w:tc>
+      </w:tr>
+      <w:tr>
+        <w:trPr>
+          <w:trHeight w:val="530" w:hRule="atLeast"/>
+        </w:trPr>
+        <w:tc>
+          <w:tcPr>
+            <w:tcW w:w="2000" w:type="dxa"/>
+          </w:tcPr>
+          <w:p>
+            <w:pPr/>
+            <w:r>
+              <w:t xml:space="preserve">id</w:t>
+            </w:r>
+          </w:p>
+        </w:tc>
+        <w:tc>
+          <w:tcPr>
+            <w:tcW w:w="2000" w:type="dxa"/>
+          </w:tcPr>
+          <w:p>
+            <w:pPr/>
+            <w:r>
+              <w:t xml:space="preserve">bigint</w:t>
+            </w:r>
+          </w:p>
+        </w:tc>
+        <w:tc>
+          <w:tcPr>
+            <w:tcW w:w="2000" w:type="dxa"/>
+          </w:tcPr>
+          <w:p>
+            <w:pPr/>
+            <w:r>
+              <w:t xml:space="preserve">-</w:t>
+            </w:r>
+          </w:p>
+        </w:tc>
+        <w:tc>
+          <w:tcPr>
+            <w:tcW w:w="2000" w:type="dxa"/>
+          </w:tcPr>
+          <w:p>
+            <w:pPr/>
+            <w:r>
+              <w:t xml:space="preserve">PK, NOT NULL</w:t>
+            </w:r>
+          </w:p>
+        </w:tc>
+      </w:tr>
+      <w:tr>
+        <w:trPr>
+          <w:trHeight w:val="530" w:hRule="atLeast"/>
+        </w:trPr>
+        <w:tc>
+          <w:tcPr>
+            <w:tcW w:w="2000" w:type="dxa"/>
+          </w:tcPr>
+          <w:p>
+            <w:pPr/>
+            <w:r>
+              <w:t xml:space="preserve">item_id</w:t>
+            </w:r>
+          </w:p>
+        </w:tc>
+        <w:tc>
+          <w:tcPr>
+            <w:tcW w:w="2000" w:type="dxa"/>
+          </w:tcPr>
+          <w:p>
+            <w:pPr/>
+            <w:r>
+              <w:t xml:space="preserve">bigint</w:t>
+            </w:r>
+          </w:p>
+        </w:tc>
+        <w:tc>
+          <w:tcPr>
+            <w:tcW w:w="2000" w:type="dxa"/>
+          </w:tcPr>
+          <w:p>
+            <w:pPr/>
+            <w:r>
+              <w:t xml:space="preserve">-</w:t>
+            </w:r>
+          </w:p>
+        </w:tc>
+        <w:tc>
+          <w:tcPr>
+            <w:tcW w:w="2000" w:type="dxa"/>
+          </w:tcPr>
+          <w:p>
+            <w:pPr/>
+            <w:r>
+              <w:t xml:space="preserve">FK, NOT NULL</w:t>
+            </w:r>
+          </w:p>
+        </w:tc>
+      </w:tr>
+      <w:tr>
+        <w:trPr>
+          <w:trHeight w:val="530" w:hRule="atLeast"/>
+        </w:trPr>
+        <w:tc>
+          <w:tcPr>
+            <w:tcW w:w="2000" w:type="dxa"/>
+          </w:tcPr>
+          <w:p>
+            <w:pPr/>
+            <w:r>
+              <w:t xml:space="preserve">content_type</w:t>
+            </w:r>
+          </w:p>
+        </w:tc>
+        <w:tc>
+          <w:tcPr>
+            <w:tcW w:w="2000" w:type="dxa"/>
+          </w:tcPr>
+          <w:p>
+            <w:pPr/>
+            <w:r>
+              <w:t xml:space="preserve">varchar</w:t>
+            </w:r>
+          </w:p>
+        </w:tc>
+        <w:tc>
+          <w:tcPr>
+            <w:tcW w:w="2000" w:type="dxa"/>
+          </w:tcPr>
+          <w:p>
+            <w:pPr/>
+            <w:r>
+              <w:t xml:space="preserve">30</w:t>
+            </w:r>
+          </w:p>
+        </w:tc>
+        <w:tc>
+          <w:tcPr>
+            <w:tcW w:w="2000" w:type="dxa"/>
+          </w:tcPr>
+          <w:p>
+            <w:pPr/>
+            <w:r>
+              <w:t xml:space="preserve">NOT NULL</w:t>
+            </w:r>
+          </w:p>
+        </w:tc>
+      </w:tr>
+      <w:tr>
+        <w:trPr>
+          <w:trHeight w:val="530" w:hRule="atLeast"/>
+        </w:trPr>
+        <w:tc>
+          <w:tcPr>
+            <w:tcW w:w="2000" w:type="dxa"/>
+          </w:tcPr>
+          <w:p>
+            <w:pPr/>
+            <w:r>
+              <w:t xml:space="preserve">file_name</w:t>
+            </w:r>
+          </w:p>
+        </w:tc>
+        <w:tc>
+          <w:tcPr>
+            <w:tcW w:w="2000" w:type="dxa"/>
+          </w:tcPr>
+          <w:p>
+            <w:pPr/>
+            <w:r>
+              <w:t xml:space="preserve">nvarchar</w:t>
+            </w:r>
+          </w:p>
+        </w:tc>
+        <w:tc>
+          <w:tcPr>
+            <w:tcW w:w="2000" w:type="dxa"/>
+          </w:tcPr>
+          <w:p>
+            <w:pPr/>
+            <w:r>
+              <w:t xml:space="preserve">200</w:t>
+            </w:r>
+          </w:p>
+        </w:tc>
+        <w:tc>
+          <w:tcPr>
+            <w:tcW w:w="2000" w:type="dxa"/>
+          </w:tcPr>
+          <w:p>
+            <w:pPr/>
+            <w:r>
+              <w:t xml:space="preserve">NOT NULL</w:t>
+            </w:r>
+          </w:p>
+        </w:tc>
+      </w:tr>
+      <w:tr>
+        <w:trPr>
+          <w:trHeight w:val="530" w:hRule="atLeast"/>
+        </w:trPr>
+        <w:tc>
+          <w:tcPr>
+            <w:tcW w:w="2000" w:type="dxa"/>
+          </w:tcPr>
+          <w:p>
+            <w:pPr/>
+            <w:r>
+              <w:t xml:space="preserve">size_bytes</w:t>
+            </w:r>
+          </w:p>
+        </w:tc>
+        <w:tc>
+          <w:tcPr>
+            <w:tcW w:w="2000" w:type="dxa"/>
+          </w:tcPr>
+          <w:p>
+            <w:pPr/>
+            <w:r>
+              <w:t xml:space="preserve">int</w:t>
+            </w:r>
+          </w:p>
+        </w:tc>
+        <w:tc>
+          <w:tcPr>
+            <w:tcW w:w="2000" w:type="dxa"/>
+          </w:tcPr>
+          <w:p>
+            <w:pPr/>
+            <w:r>
+              <w:t xml:space="preserve">-</w:t>
+            </w:r>
+          </w:p>
+        </w:tc>
+        <w:tc>
+          <w:tcPr>
+            <w:tcW w:w="2000" w:type="dxa"/>
+          </w:tcPr>
+          <w:p>
+            <w:pPr/>
+            <w:r>
+              <w:t xml:space="preserve">NOT NULL</w:t>
+            </w:r>
+          </w:p>
+        </w:tc>
+      </w:tr>
+      <w:tr>
+        <w:trPr>
+          <w:trHeight w:val="530" w:hRule="atLeast"/>
+        </w:trPr>
+        <w:tc>
+          <w:tcPr>
+            <w:tcW w:w="2000" w:type="dxa"/>
+          </w:tcPr>
+          <w:p>
+            <w:pPr/>
+            <w:r>
+              <w:t xml:space="preserve">width</w:t>
+            </w:r>
+          </w:p>
+        </w:tc>
+        <w:tc>
+          <w:tcPr>
+            <w:tcW w:w="2000" w:type="dxa"/>
+          </w:tcPr>
+          <w:p>
+            <w:pPr/>
+            <w:r>
+              <w:t xml:space="preserve">int</w:t>
+            </w:r>
+          </w:p>
+        </w:tc>
+        <w:tc>
+          <w:tcPr>
+            <w:tcW w:w="2000" w:type="dxa"/>
+          </w:tcPr>
+          <w:p>
+            <w:pPr/>
+            <w:r>
+              <w:t xml:space="preserve">-</w:t>
+            </w:r>
+          </w:p>
+        </w:tc>
+        <w:tc>
+          <w:tcPr>
+            <w:tcW w:w="2000" w:type="dxa"/>
+          </w:tcPr>
+          <w:p>
+            <w:pPr/>
+            <w:r>
+              <w:t xml:space="preserve">NOT NULL</w:t>
+            </w:r>
+          </w:p>
+        </w:tc>
+      </w:tr>
+      <w:tr>
+        <w:trPr>
+          <w:trHeight w:val="530" w:hRule="atLeast"/>
+        </w:trPr>
+        <w:tc>
+          <w:tcPr>
+            <w:tcW w:w="2000" w:type="dxa"/>
+          </w:tcPr>
+          <w:p>
+            <w:pPr/>
+            <w:r>
+              <w:t xml:space="preserve">height</w:t>
+            </w:r>
+          </w:p>
+        </w:tc>
+        <w:tc>
+          <w:tcPr>
+            <w:tcW w:w="2000" w:type="dxa"/>
+          </w:tcPr>
+          <w:p>
+            <w:pPr/>
+            <w:r>
+              <w:t xml:space="preserve">int</w:t>
+            </w:r>
+          </w:p>
+        </w:tc>
+        <w:tc>
+          <w:tcPr>
+            <w:tcW w:w="2000" w:type="dxa"/>
+          </w:tcPr>
+          <w:p>
+            <w:pPr/>
+            <w:r>
+              <w:t xml:space="preserve">-</w:t>
+            </w:r>
+          </w:p>
+        </w:tc>
+        <w:tc>
+          <w:tcPr>
+            <w:tcW w:w="2000" w:type="dxa"/>
+          </w:tcPr>
+          <w:p>
+            <w:pPr/>
+            <w:r>
+              <w:t xml:space="preserve">NOT NULL</w:t>
+            </w:r>
+          </w:p>
+        </w:tc>
+      </w:tr>
+      <w:tr>
+        <w:trPr>
+          <w:trHeight w:val="530" w:hRule="atLeast"/>
+        </w:trPr>
+        <w:tc>
+          <w:tcPr>
+            <w:tcW w:w="2000" w:type="dxa"/>
+          </w:tcPr>
+          <w:p>
+            <w:pPr/>
+            <w:r>
+              <w:t xml:space="preserve">content</w:t>
+            </w:r>
+          </w:p>
+        </w:tc>
+        <w:tc>
+          <w:tcPr>
+            <w:tcW w:w="2000" w:type="dxa"/>
+          </w:tcPr>
+          <w:p>
+            <w:pPr/>
+            <w:r>
+              <w:t xml:space="preserve">varbinary</w:t>
+            </w:r>
+          </w:p>
+        </w:tc>
+        <w:tc>
+          <w:tcPr>
+            <w:tcW w:w="2000" w:type="dxa"/>
+          </w:tcPr>
+          <w:p>
+            <w:pPr/>
+            <w:r>
+              <w:t xml:space="preserve">MAX</w:t>
+            </w:r>
+          </w:p>
+        </w:tc>
+        <w:tc>
+          <w:tcPr>
+            <w:tcW w:w="2000" w:type="dxa"/>
+          </w:tcPr>
+          <w:p>
+            <w:pPr/>
+            <w:r>
+              <w:t xml:space="preserve">NOT NULL</w:t>
+            </w:r>
+          </w:p>
+        </w:tc>
+      </w:tr>
+      <w:tr>
+        <w:trPr>
+          <w:trHeight w:val="530" w:hRule="atLeast"/>
+        </w:trPr>
+        <w:tc>
+          <w:tcPr>
+            <w:tcW w:w="2000" w:type="dxa"/>
+          </w:tcPr>
+          <w:p>
+            <w:pPr/>
+            <w:r>
+              <w:t xml:space="preserve">sort_order</w:t>
+            </w:r>
+          </w:p>
+        </w:tc>
+        <w:tc>
+          <w:tcPr>
+            <w:tcW w:w="2000" w:type="dxa"/>
+          </w:tcPr>
+          <w:p>
+            <w:pPr/>
+            <w:r>
+              <w:t xml:space="preserve">int</w:t>
+            </w:r>
+          </w:p>
+        </w:tc>
+        <w:tc>
+          <w:tcPr>
+            <w:tcW w:w="2000" w:type="dxa"/>
+          </w:tcPr>
+          <w:p>
+            <w:pPr/>
+            <w:r>
+              <w:t xml:space="preserve">-</w:t>
+            </w:r>
+          </w:p>
+        </w:tc>
+        <w:tc>
+          <w:tcPr>
+            <w:tcW w:w="2000" w:type="dxa"/>
+          </w:tcPr>
+          <w:p>
+            <w:pPr/>
+            <w:r>
+              <w:t xml:space="preserve">NOT NULL</w:t>
+            </w:r>
+          </w:p>
+        </w:tc>
+      </w:tr>
+      <w:tr>
+        <w:trPr>
+          <w:trHeight w:val="530" w:hRule="atLeast"/>
+        </w:trPr>
+        <w:tc>
+          <w:tcPr>
+            <w:tcW w:w="2000" w:type="dxa"/>
+          </w:tcPr>
+          <w:p>
+            <w:pPr/>
+            <w:r>
+              <w:t xml:space="preserve">is_primary</w:t>
+            </w:r>
+          </w:p>
+        </w:tc>
+        <w:tc>
+          <w:tcPr>
+            <w:tcW w:w="2000" w:type="dxa"/>
+          </w:tcPr>
+          <w:p>
+            <w:pPr/>
+            <w:r>
+              <w:t xml:space="preserve">bit</w:t>
+            </w:r>
+          </w:p>
+        </w:tc>
+        <w:tc>
+          <w:tcPr>
+            <w:tcW w:w="2000" w:type="dxa"/>
+          </w:tcPr>
+          <w:p>
+            <w:pPr/>
+            <w:r>
+              <w:t xml:space="preserve">-</w:t>
+            </w:r>
+          </w:p>
+        </w:tc>
+        <w:tc>
+          <w:tcPr>
+            <w:tcW w:w="2000" w:type="dxa"/>
+          </w:tcPr>
+          <w:p>
+            <w:pPr/>
+            <w:r>
+              <w:t xml:space="preserve">NOT NULL</w:t>
+            </w:r>
+          </w:p>
+        </w:tc>
+      </w:tr>
+      <w:tr>
+        <w:trPr>
+          <w:trHeight w:val="530" w:hRule="atLeast"/>
+        </w:trPr>
+        <w:tc>
+          <w:tcPr>
+            <w:tcW w:w="2000" w:type="dxa"/>
+          </w:tcPr>
+          <w:p>
+            <w:pPr/>
+            <w:r>
+              <w:t xml:space="preserve">company_id</w:t>
+            </w:r>
+          </w:p>
+        </w:tc>
+        <w:tc>
+          <w:tcPr>
+            <w:tcW w:w="2000" w:type="dxa"/>
+          </w:tcPr>
+          <w:p>
+            <w:pPr/>
+            <w:r>
+              <w:t xml:space="preserve">bigint</w:t>
+            </w:r>
+          </w:p>
+        </w:tc>
+        <w:tc>
+          <w:tcPr>
+            <w:tcW w:w="2000" w:type="dxa"/>
+          </w:tcPr>
+          <w:p>
+            <w:pPr/>
+            <w:r>
+              <w:t xml:space="preserve">-</w:t>
+            </w:r>
+          </w:p>
+        </w:tc>
+        <w:tc>
+          <w:tcPr>
+            <w:tcW w:w="2000" w:type="dxa"/>
+          </w:tcPr>
+          <w:p>
+            <w:pPr/>
+            <w:r>
+              <w:t xml:space="preserve">FK, NOT NULL</w:t>
+            </w:r>
+          </w:p>
+        </w:tc>
+      </w:tr>
+      <w:tr>
+        <w:trPr>
+          <w:trHeight w:val="530" w:hRule="atLeast"/>
+        </w:trPr>
+        <w:tc>
+          <w:tcPr>
+            <w:tcW w:w="2000" w:type="dxa"/>
+          </w:tcPr>
+          <w:p>
+            <w:pPr/>
+            <w:r>
+              <w:t xml:space="preserve">created_at</w:t>
+            </w:r>
+          </w:p>
+        </w:tc>
+        <w:tc>
+          <w:tcPr>
+            <w:tcW w:w="2000" w:type="dxa"/>
+          </w:tcPr>
+          <w:p>
+            <w:pPr/>
+            <w:r>
+              <w:t xml:space="preserve">datetime2</w:t>
+            </w:r>
+          </w:p>
+        </w:tc>
+        <w:tc>
+          <w:tcPr>
+            <w:tcW w:w="2000" w:type="dxa"/>
+          </w:tcPr>
+          <w:p>
+            <w:pPr/>
+            <w:r>
+              <w:t xml:space="preserve">(6)</w:t>
+            </w:r>
+          </w:p>
+        </w:tc>
+        <w:tc>
+          <w:tcPr>
+            <w:tcW w:w="2000" w:type="dxa"/>
+          </w:tcPr>
+          <w:p>
+            <w:pPr/>
+            <w:r>
+              <w:t xml:space="preserve">NOT NULL</w:t>
+            </w:r>
+          </w:p>
+        </w:tc>
+      </w:tr>
+      <w:tr>
+        <w:trPr>
+          <w:trHeight w:val="530" w:hRule="atLeast"/>
+        </w:trPr>
+        <w:tc>
+          <w:tcPr>
+            <w:tcW w:w="2000" w:type="dxa"/>
+          </w:tcPr>
+          <w:p>
+            <w:pPr/>
+            <w:r>
+              <w:t xml:space="preserve">created_by</w:t>
+            </w:r>
+          </w:p>
+        </w:tc>
+        <w:tc>
+          <w:tcPr>
+            <w:tcW w:w="2000" w:type="dxa"/>
+          </w:tcPr>
+          <w:p>
+            <w:pPr/>
+            <w:r>
+              <w:t xml:space="preserve">bigint</w:t>
+            </w:r>
+          </w:p>
+        </w:tc>
+        <w:tc>
+          <w:tcPr>
+            <w:tcW w:w="2000" w:type="dxa"/>
+          </w:tcPr>
+          <w:p>
+            <w:pPr/>
+            <w:r>
+              <w:t xml:space="preserve">-</w:t>
+            </w:r>
+          </w:p>
+        </w:tc>
+        <w:tc>
+          <w:tcPr>
+            <w:tcW w:w="2000" w:type="dxa"/>
+          </w:tcPr>
+          <w:p>
+            <w:pPr/>
+            <w:r>
+              <w:t xml:space="preserve">NOT NULL</w:t>
+            </w:r>
+          </w:p>
+        </w:tc>
+      </w:tr>
+      <w:tr>
+        <w:trPr>
+          <w:trHeight w:val="530" w:hRule="atLeast"/>
+        </w:trPr>
+        <w:tc>
+          <w:tcPr>
+            <w:tcW w:w="2000" w:type="dxa"/>
+          </w:tcPr>
+          <w:p>
+            <w:pPr/>
+            <w:r>
+              <w:t xml:space="preserve">updated_at</w:t>
+            </w:r>
+          </w:p>
+        </w:tc>
+        <w:tc>
+          <w:tcPr>
+            <w:tcW w:w="2000" w:type="dxa"/>
+          </w:tcPr>
+          <w:p>
+            <w:pPr/>
+            <w:r>
+              <w:t xml:space="preserve">datetime2</w:t>
+            </w:r>
+          </w:p>
+        </w:tc>
+        <w:tc>
+          <w:tcPr>
+            <w:tcW w:w="2000" w:type="dxa"/>
+          </w:tcPr>
+          <w:p>
+            <w:pPr/>
+            <w:r>
+              <w:t xml:space="preserve">(6)</w:t>
+            </w:r>
+          </w:p>
+        </w:tc>
+        <w:tc>
+          <w:tcPr>
+            <w:tcW w:w="2000" w:type="dxa"/>
+          </w:tcPr>
+          <w:p>
+            <w:pPr/>
+            <w:r>
+              <w:t xml:space="preserve">IS NULL</w:t>
+            </w:r>
+          </w:p>
+        </w:tc>
+      </w:tr>
+      <w:tr>
+        <w:trPr>
+          <w:trHeight w:val="530" w:hRule="atLeast"/>
+        </w:trPr>
+        <w:tc>
+          <w:tcPr>
+            <w:tcW w:w="2000" w:type="dxa"/>
+          </w:tcPr>
+          <w:p>
+            <w:pPr/>
+            <w:r>
+              <w:t xml:space="preserve">updated_by</w:t>
+            </w:r>
+          </w:p>
+        </w:tc>
+        <w:tc>
+          <w:tcPr>
+            <w:tcW w:w="2000" w:type="dxa"/>
+          </w:tcPr>
+          <w:p>
+            <w:pPr/>
+            <w:r>
+              <w:t xml:space="preserve">bigint</w:t>
+            </w:r>
+          </w:p>
+        </w:tc>
+        <w:tc>
+          <w:tcPr>
+            <w:tcW w:w="2000" w:type="dxa"/>
+          </w:tcPr>
+          <w:p>
+            <w:pPr/>
+            <w:r>
+              <w:t xml:space="preserve">-</w:t>
+            </w:r>
+          </w:p>
+        </w:tc>
+        <w:tc>
+          <w:tcPr>
+            <w:tcW w:w="2000" w:type="dxa"/>
+          </w:tcPr>
+          <w:p>
+            <w:pPr/>
+            <w:r>
+              <w:t xml:space="preserve">IS NULL</w:t>
+            </w:r>
+          </w:p>
+        </w:tc>
+      </w:tr>
+      <w:tr>
+        <w:trPr>
+          <w:trHeight w:val="530" w:hRule="atLeast"/>
+        </w:trPr>
+        <w:tc>
+          <w:tcPr>
+            <w:tcW w:w="2000" w:type="dxa"/>
+          </w:tcPr>
+          <w:p>
+            <w:pPr/>
+            <w:r>
+              <w:t xml:space="preserve">version</w:t>
+            </w:r>
+          </w:p>
+        </w:tc>
+        <w:tc>
+          <w:tcPr>
+            <w:tcW w:w="2000" w:type="dxa"/>
+          </w:tcPr>
+          <w:p>
+            <w:pPr/>
+            <w:r>
+              <w:t xml:space="preserve">int</w:t>
+            </w:r>
+          </w:p>
+        </w:tc>
+        <w:tc>
+          <w:tcPr>
+            <w:tcW w:w="2000" w:type="dxa"/>
+          </w:tcPr>
+          <w:p>
+            <w:pPr/>
+            <w:r>
+              <w:t xml:space="preserve">-</w:t>
+            </w:r>
+          </w:p>
+        </w:tc>
+        <w:tc>
+          <w:tcPr>
+            <w:tcW w:w="2000" w:type="dxa"/>
+          </w:tcPr>
+          <w:p>
+            <w:pPr/>
+            <w:r>
+              <w:t xml:space="preserve">NOT NULL</w:t>
             </w:r>
           </w:p>
         </w:tc>
@@ -37699,7 +38599,7 @@
       </w:r>
     </w:p>
     <w:sectPr>
-      <w:footerReference xmlns:r="http://schemas.openxmlformats.org/officeDocument/2006/relationships" w:type="default" r:id="Rd74fdfd02b3349f6"/>
+      <w:footerReference xmlns:r="http://schemas.openxmlformats.org/officeDocument/2006/relationships" w:type="default" r:id="Rc478ff5934b240fe"/>
       <w:pgSz w:w="11906" w:h="16838"/>
       <w:pgMar w:top="1440" w:right="1440" w:bottom="1440" w:left="1440" w:header="720" w:footer="720" w:gutter="0"/>
     </w:sectPr>

</xml_diff>

<commit_message>
feat(md): add item attributes backend
WU-MD-013b (ADR-045 11-13): md_item_attribute definitions (sort order,
item count, delete blocked when used) and md_item_attribute_value
(one value per item x attribute). API /api/v1/md/item-attributes under
MD.ITEM_ATTRIBUTE.* and GET/PUT /api/v1/md/items/{itemId}/attributes
(bulk replace, max 50, new attributes must be active, company applock).
REQ_F4118.45.1-6, REQ_DS43.132-133, MD-ATTR-001..004.

Co-Authored-By: Claude Opus 5.5 <noreply@anthropic.com>
</commit_message>
<xml_diff>
--- a/docs/99-output/MyERP_SDS.docx
+++ b/docs/99-output/MyERP_SDS.docx
@@ -8896,6 +8896,1365 @@
             <w:pPr/>
             <w:r>
               <w:t xml:space="preserve">bit</w:t>
+            </w:r>
+          </w:p>
+        </w:tc>
+        <w:tc>
+          <w:tcPr>
+            <w:tcW w:w="2000" w:type="dxa"/>
+          </w:tcPr>
+          <w:p>
+            <w:pPr/>
+            <w:r>
+              <w:t xml:space="preserve">-</w:t>
+            </w:r>
+          </w:p>
+        </w:tc>
+        <w:tc>
+          <w:tcPr>
+            <w:tcW w:w="2000" w:type="dxa"/>
+          </w:tcPr>
+          <w:p>
+            <w:pPr/>
+            <w:r>
+              <w:t xml:space="preserve">NOT NULL</w:t>
+            </w:r>
+          </w:p>
+        </w:tc>
+      </w:tr>
+    </w:tbl>
+    <w:p/>
+    <w:p>
+      <w:pPr/>
+      <w:r>
+        <w:t xml:space="preserve">Table Name: md_item_attribute</w:t>
+      </w:r>
+    </w:p>
+    <w:p>
+      <w:pPr/>
+      <w:r>
+        <w:t xml:space="preserve">Primary Key: id</w:t>
+      </w:r>
+    </w:p>
+    <w:p>
+      <w:pPr/>
+      <w:r>
+        <w:t xml:space="preserve">This table stores the attribute definitions of products.</w:t>
+      </w:r>
+    </w:p>
+    <w:tbl>
+      <w:tblPr>
+        <w:tblStyle w:val="TableGrid"/>
+        <w:tblW w:w="8000" w:type="dxa"/>
+        <w:jc w:val="left"/>
+        <w:tblBorders>
+          <w:top w:val="single" w:color="000000" w:sz="4" w:space="0"/>
+          <w:left w:val="single" w:color="000000" w:sz="4" w:space="0"/>
+          <w:bottom w:val="single" w:color="000000" w:sz="4" w:space="0"/>
+          <w:right w:val="single" w:color="000000" w:sz="4" w:space="0"/>
+          <w:insideH w:val="single" w:color="000000" w:sz="4" w:space="0"/>
+          <w:insideV w:val="single" w:color="000000" w:sz="4" w:space="0"/>
+        </w:tblBorders>
+        <w:tblLayout w:type="fixed"/>
+        <w:tblCellMar>
+          <w:top w:w="100" w:type="dxa"/>
+          <w:left w:w="100" w:type="dxa"/>
+          <w:bottom w:w="100" w:type="dxa"/>
+          <w:right w:w="100" w:type="dxa"/>
+        </w:tblCellMar>
+      </w:tblPr>
+      <w:tblGrid>
+        <w:gridCol w:w="2000"/>
+        <w:gridCol w:w="2000"/>
+        <w:gridCol w:w="2000"/>
+        <w:gridCol w:w="2000"/>
+      </w:tblGrid>
+      <w:tr>
+        <w:trPr>
+          <w:trHeight w:val="530" w:hRule="atLeast"/>
+        </w:trPr>
+        <w:tc>
+          <w:tcPr>
+            <w:tcW w:w="2000" w:type="dxa"/>
+          </w:tcPr>
+          <w:p>
+            <w:pPr>
+              <w:jc w:val="center"/>
+            </w:pPr>
+            <w:r>
+              <w:rPr>
+                <w:b/>
+              </w:rPr>
+              <w:t xml:space="preserve">Name of Attribute</w:t>
+            </w:r>
+          </w:p>
+        </w:tc>
+        <w:tc>
+          <w:tcPr>
+            <w:tcW w:w="2000" w:type="dxa"/>
+          </w:tcPr>
+          <w:p>
+            <w:pPr>
+              <w:jc w:val="center"/>
+            </w:pPr>
+            <w:r>
+              <w:rPr>
+                <w:b/>
+              </w:rPr>
+              <w:t xml:space="preserve">Data Type</w:t>
+            </w:r>
+          </w:p>
+        </w:tc>
+        <w:tc>
+          <w:tcPr>
+            <w:tcW w:w="2000" w:type="dxa"/>
+          </w:tcPr>
+          <w:p>
+            <w:pPr>
+              <w:jc w:val="center"/>
+            </w:pPr>
+            <w:r>
+              <w:rPr>
+                <w:b/>
+              </w:rPr>
+              <w:t xml:space="preserve">Size</w:t>
+            </w:r>
+          </w:p>
+        </w:tc>
+        <w:tc>
+          <w:tcPr>
+            <w:tcW w:w="2000" w:type="dxa"/>
+          </w:tcPr>
+          <w:p>
+            <w:pPr>
+              <w:jc w:val="center"/>
+            </w:pPr>
+            <w:r>
+              <w:rPr>
+                <w:b/>
+              </w:rPr>
+              <w:t xml:space="preserve">PK/FK/IS NULL/ NOT NULL</w:t>
+            </w:r>
+          </w:p>
+        </w:tc>
+      </w:tr>
+      <w:tr>
+        <w:trPr>
+          <w:trHeight w:val="530" w:hRule="atLeast"/>
+        </w:trPr>
+        <w:tc>
+          <w:tcPr>
+            <w:tcW w:w="2000" w:type="dxa"/>
+          </w:tcPr>
+          <w:p>
+            <w:pPr/>
+            <w:r>
+              <w:t xml:space="preserve">id</w:t>
+            </w:r>
+          </w:p>
+        </w:tc>
+        <w:tc>
+          <w:tcPr>
+            <w:tcW w:w="2000" w:type="dxa"/>
+          </w:tcPr>
+          <w:p>
+            <w:pPr/>
+            <w:r>
+              <w:t xml:space="preserve">bigint</w:t>
+            </w:r>
+          </w:p>
+        </w:tc>
+        <w:tc>
+          <w:tcPr>
+            <w:tcW w:w="2000" w:type="dxa"/>
+          </w:tcPr>
+          <w:p>
+            <w:pPr/>
+            <w:r>
+              <w:t xml:space="preserve">-</w:t>
+            </w:r>
+          </w:p>
+        </w:tc>
+        <w:tc>
+          <w:tcPr>
+            <w:tcW w:w="2000" w:type="dxa"/>
+          </w:tcPr>
+          <w:p>
+            <w:pPr/>
+            <w:r>
+              <w:t xml:space="preserve">PK, NOT NULL</w:t>
+            </w:r>
+          </w:p>
+        </w:tc>
+      </w:tr>
+      <w:tr>
+        <w:trPr>
+          <w:trHeight w:val="530" w:hRule="atLeast"/>
+        </w:trPr>
+        <w:tc>
+          <w:tcPr>
+            <w:tcW w:w="2000" w:type="dxa"/>
+          </w:tcPr>
+          <w:p>
+            <w:pPr/>
+            <w:r>
+              <w:t xml:space="preserve">sort_order</w:t>
+            </w:r>
+          </w:p>
+        </w:tc>
+        <w:tc>
+          <w:tcPr>
+            <w:tcW w:w="2000" w:type="dxa"/>
+          </w:tcPr>
+          <w:p>
+            <w:pPr/>
+            <w:r>
+              <w:t xml:space="preserve">int</w:t>
+            </w:r>
+          </w:p>
+        </w:tc>
+        <w:tc>
+          <w:tcPr>
+            <w:tcW w:w="2000" w:type="dxa"/>
+          </w:tcPr>
+          <w:p>
+            <w:pPr/>
+            <w:r>
+              <w:t xml:space="preserve">-</w:t>
+            </w:r>
+          </w:p>
+        </w:tc>
+        <w:tc>
+          <w:tcPr>
+            <w:tcW w:w="2000" w:type="dxa"/>
+          </w:tcPr>
+          <w:p>
+            <w:pPr/>
+            <w:r>
+              <w:t xml:space="preserve">NOT NULL</w:t>
+            </w:r>
+          </w:p>
+        </w:tc>
+      </w:tr>
+      <w:tr>
+        <w:trPr>
+          <w:trHeight w:val="530" w:hRule="atLeast"/>
+        </w:trPr>
+        <w:tc>
+          <w:tcPr>
+            <w:tcW w:w="2000" w:type="dxa"/>
+          </w:tcPr>
+          <w:p>
+            <w:pPr/>
+            <w:r>
+              <w:t xml:space="preserve">company_id</w:t>
+            </w:r>
+          </w:p>
+        </w:tc>
+        <w:tc>
+          <w:tcPr>
+            <w:tcW w:w="2000" w:type="dxa"/>
+          </w:tcPr>
+          <w:p>
+            <w:pPr/>
+            <w:r>
+              <w:t xml:space="preserve">bigint</w:t>
+            </w:r>
+          </w:p>
+        </w:tc>
+        <w:tc>
+          <w:tcPr>
+            <w:tcW w:w="2000" w:type="dxa"/>
+          </w:tcPr>
+          <w:p>
+            <w:pPr/>
+            <w:r>
+              <w:t xml:space="preserve">-</w:t>
+            </w:r>
+          </w:p>
+        </w:tc>
+        <w:tc>
+          <w:tcPr>
+            <w:tcW w:w="2000" w:type="dxa"/>
+          </w:tcPr>
+          <w:p>
+            <w:pPr/>
+            <w:r>
+              <w:t xml:space="preserve">NOT NULL</w:t>
+            </w:r>
+          </w:p>
+        </w:tc>
+      </w:tr>
+      <w:tr>
+        <w:trPr>
+          <w:trHeight w:val="530" w:hRule="atLeast"/>
+        </w:trPr>
+        <w:tc>
+          <w:tcPr>
+            <w:tcW w:w="2000" w:type="dxa"/>
+          </w:tcPr>
+          <w:p>
+            <w:pPr/>
+            <w:r>
+              <w:t xml:space="preserve">created_at</w:t>
+            </w:r>
+          </w:p>
+        </w:tc>
+        <w:tc>
+          <w:tcPr>
+            <w:tcW w:w="2000" w:type="dxa"/>
+          </w:tcPr>
+          <w:p>
+            <w:pPr/>
+            <w:r>
+              <w:t xml:space="preserve">datetime2</w:t>
+            </w:r>
+          </w:p>
+        </w:tc>
+        <w:tc>
+          <w:tcPr>
+            <w:tcW w:w="2000" w:type="dxa"/>
+          </w:tcPr>
+          <w:p>
+            <w:pPr/>
+            <w:r>
+              <w:t xml:space="preserve">(6)</w:t>
+            </w:r>
+          </w:p>
+        </w:tc>
+        <w:tc>
+          <w:tcPr>
+            <w:tcW w:w="2000" w:type="dxa"/>
+          </w:tcPr>
+          <w:p>
+            <w:pPr/>
+            <w:r>
+              <w:t xml:space="preserve">NOT NULL</w:t>
+            </w:r>
+          </w:p>
+        </w:tc>
+      </w:tr>
+      <w:tr>
+        <w:trPr>
+          <w:trHeight w:val="530" w:hRule="atLeast"/>
+        </w:trPr>
+        <w:tc>
+          <w:tcPr>
+            <w:tcW w:w="2000" w:type="dxa"/>
+          </w:tcPr>
+          <w:p>
+            <w:pPr/>
+            <w:r>
+              <w:t xml:space="preserve">created_by</w:t>
+            </w:r>
+          </w:p>
+        </w:tc>
+        <w:tc>
+          <w:tcPr>
+            <w:tcW w:w="2000" w:type="dxa"/>
+          </w:tcPr>
+          <w:p>
+            <w:pPr/>
+            <w:r>
+              <w:t xml:space="preserve">bigint</w:t>
+            </w:r>
+          </w:p>
+        </w:tc>
+        <w:tc>
+          <w:tcPr>
+            <w:tcW w:w="2000" w:type="dxa"/>
+          </w:tcPr>
+          <w:p>
+            <w:pPr/>
+            <w:r>
+              <w:t xml:space="preserve">-</w:t>
+            </w:r>
+          </w:p>
+        </w:tc>
+        <w:tc>
+          <w:tcPr>
+            <w:tcW w:w="2000" w:type="dxa"/>
+          </w:tcPr>
+          <w:p>
+            <w:pPr/>
+            <w:r>
+              <w:t xml:space="preserve">NOT NULL</w:t>
+            </w:r>
+          </w:p>
+        </w:tc>
+      </w:tr>
+      <w:tr>
+        <w:trPr>
+          <w:trHeight w:val="530" w:hRule="atLeast"/>
+        </w:trPr>
+        <w:tc>
+          <w:tcPr>
+            <w:tcW w:w="2000" w:type="dxa"/>
+          </w:tcPr>
+          <w:p>
+            <w:pPr/>
+            <w:r>
+              <w:t xml:space="preserve">updated_at</w:t>
+            </w:r>
+          </w:p>
+        </w:tc>
+        <w:tc>
+          <w:tcPr>
+            <w:tcW w:w="2000" w:type="dxa"/>
+          </w:tcPr>
+          <w:p>
+            <w:pPr/>
+            <w:r>
+              <w:t xml:space="preserve">datetime2</w:t>
+            </w:r>
+          </w:p>
+        </w:tc>
+        <w:tc>
+          <w:tcPr>
+            <w:tcW w:w="2000" w:type="dxa"/>
+          </w:tcPr>
+          <w:p>
+            <w:pPr/>
+            <w:r>
+              <w:t xml:space="preserve">(6)</w:t>
+            </w:r>
+          </w:p>
+        </w:tc>
+        <w:tc>
+          <w:tcPr>
+            <w:tcW w:w="2000" w:type="dxa"/>
+          </w:tcPr>
+          <w:p>
+            <w:pPr/>
+            <w:r>
+              <w:t xml:space="preserve">IS NULL</w:t>
+            </w:r>
+          </w:p>
+        </w:tc>
+      </w:tr>
+      <w:tr>
+        <w:trPr>
+          <w:trHeight w:val="530" w:hRule="atLeast"/>
+        </w:trPr>
+        <w:tc>
+          <w:tcPr>
+            <w:tcW w:w="2000" w:type="dxa"/>
+          </w:tcPr>
+          <w:p>
+            <w:pPr/>
+            <w:r>
+              <w:t xml:space="preserve">updated_by</w:t>
+            </w:r>
+          </w:p>
+        </w:tc>
+        <w:tc>
+          <w:tcPr>
+            <w:tcW w:w="2000" w:type="dxa"/>
+          </w:tcPr>
+          <w:p>
+            <w:pPr/>
+            <w:r>
+              <w:t xml:space="preserve">bigint</w:t>
+            </w:r>
+          </w:p>
+        </w:tc>
+        <w:tc>
+          <w:tcPr>
+            <w:tcW w:w="2000" w:type="dxa"/>
+          </w:tcPr>
+          <w:p>
+            <w:pPr/>
+            <w:r>
+              <w:t xml:space="preserve">-</w:t>
+            </w:r>
+          </w:p>
+        </w:tc>
+        <w:tc>
+          <w:tcPr>
+            <w:tcW w:w="2000" w:type="dxa"/>
+          </w:tcPr>
+          <w:p>
+            <w:pPr/>
+            <w:r>
+              <w:t xml:space="preserve">IS NULL</w:t>
+            </w:r>
+          </w:p>
+        </w:tc>
+      </w:tr>
+      <w:tr>
+        <w:trPr>
+          <w:trHeight w:val="530" w:hRule="atLeast"/>
+        </w:trPr>
+        <w:tc>
+          <w:tcPr>
+            <w:tcW w:w="2000" w:type="dxa"/>
+          </w:tcPr>
+          <w:p>
+            <w:pPr/>
+            <w:r>
+              <w:t xml:space="preserve">version</w:t>
+            </w:r>
+          </w:p>
+        </w:tc>
+        <w:tc>
+          <w:tcPr>
+            <w:tcW w:w="2000" w:type="dxa"/>
+          </w:tcPr>
+          <w:p>
+            <w:pPr/>
+            <w:r>
+              <w:t xml:space="preserve">int</w:t>
+            </w:r>
+          </w:p>
+        </w:tc>
+        <w:tc>
+          <w:tcPr>
+            <w:tcW w:w="2000" w:type="dxa"/>
+          </w:tcPr>
+          <w:p>
+            <w:pPr/>
+            <w:r>
+              <w:t xml:space="preserve">-</w:t>
+            </w:r>
+          </w:p>
+        </w:tc>
+        <w:tc>
+          <w:tcPr>
+            <w:tcW w:w="2000" w:type="dxa"/>
+          </w:tcPr>
+          <w:p>
+            <w:pPr/>
+            <w:r>
+              <w:t xml:space="preserve">NOT NULL</w:t>
+            </w:r>
+          </w:p>
+        </w:tc>
+      </w:tr>
+      <w:tr>
+        <w:trPr>
+          <w:trHeight w:val="530" w:hRule="atLeast"/>
+        </w:trPr>
+        <w:tc>
+          <w:tcPr>
+            <w:tcW w:w="2000" w:type="dxa"/>
+          </w:tcPr>
+          <w:p>
+            <w:pPr/>
+            <w:r>
+              <w:t xml:space="preserve">is_active</w:t>
+            </w:r>
+          </w:p>
+        </w:tc>
+        <w:tc>
+          <w:tcPr>
+            <w:tcW w:w="2000" w:type="dxa"/>
+          </w:tcPr>
+          <w:p>
+            <w:pPr/>
+            <w:r>
+              <w:t xml:space="preserve">bit</w:t>
+            </w:r>
+          </w:p>
+        </w:tc>
+        <w:tc>
+          <w:tcPr>
+            <w:tcW w:w="2000" w:type="dxa"/>
+          </w:tcPr>
+          <w:p>
+            <w:pPr/>
+            <w:r>
+              <w:t xml:space="preserve">-</w:t>
+            </w:r>
+          </w:p>
+        </w:tc>
+        <w:tc>
+          <w:tcPr>
+            <w:tcW w:w="2000" w:type="dxa"/>
+          </w:tcPr>
+          <w:p>
+            <w:pPr/>
+            <w:r>
+              <w:t xml:space="preserve">NOT NULL</w:t>
+            </w:r>
+          </w:p>
+        </w:tc>
+      </w:tr>
+      <w:tr>
+        <w:trPr>
+          <w:trHeight w:val="530" w:hRule="atLeast"/>
+        </w:trPr>
+        <w:tc>
+          <w:tcPr>
+            <w:tcW w:w="2000" w:type="dxa"/>
+          </w:tcPr>
+          <w:p>
+            <w:pPr/>
+            <w:r>
+              <w:t xml:space="preserve">is_deleted</w:t>
+            </w:r>
+          </w:p>
+        </w:tc>
+        <w:tc>
+          <w:tcPr>
+            <w:tcW w:w="2000" w:type="dxa"/>
+          </w:tcPr>
+          <w:p>
+            <w:pPr/>
+            <w:r>
+              <w:t xml:space="preserve">bit</w:t>
+            </w:r>
+          </w:p>
+        </w:tc>
+        <w:tc>
+          <w:tcPr>
+            <w:tcW w:w="2000" w:type="dxa"/>
+          </w:tcPr>
+          <w:p>
+            <w:pPr/>
+            <w:r>
+              <w:t xml:space="preserve">-</w:t>
+            </w:r>
+          </w:p>
+        </w:tc>
+        <w:tc>
+          <w:tcPr>
+            <w:tcW w:w="2000" w:type="dxa"/>
+          </w:tcPr>
+          <w:p>
+            <w:pPr/>
+            <w:r>
+              <w:t xml:space="preserve">NOT NULL</w:t>
+            </w:r>
+          </w:p>
+        </w:tc>
+      </w:tr>
+      <w:tr>
+        <w:trPr>
+          <w:trHeight w:val="530" w:hRule="atLeast"/>
+        </w:trPr>
+        <w:tc>
+          <w:tcPr>
+            <w:tcW w:w="2000" w:type="dxa"/>
+          </w:tcPr>
+          <w:p>
+            <w:pPr/>
+            <w:r>
+              <w:t xml:space="preserve">code</w:t>
+            </w:r>
+          </w:p>
+        </w:tc>
+        <w:tc>
+          <w:tcPr>
+            <w:tcW w:w="2000" w:type="dxa"/>
+          </w:tcPr>
+          <w:p>
+            <w:pPr/>
+            <w:r>
+              <w:t xml:space="preserve">varchar</w:t>
+            </w:r>
+          </w:p>
+        </w:tc>
+        <w:tc>
+          <w:tcPr>
+            <w:tcW w:w="2000" w:type="dxa"/>
+          </w:tcPr>
+          <w:p>
+            <w:pPr/>
+            <w:r>
+              <w:t xml:space="preserve">30</w:t>
+            </w:r>
+          </w:p>
+        </w:tc>
+        <w:tc>
+          <w:tcPr>
+            <w:tcW w:w="2000" w:type="dxa"/>
+          </w:tcPr>
+          <w:p>
+            <w:pPr/>
+            <w:r>
+              <w:t xml:space="preserve">NOT NULL</w:t>
+            </w:r>
+          </w:p>
+        </w:tc>
+      </w:tr>
+      <w:tr>
+        <w:trPr>
+          <w:trHeight w:val="530" w:hRule="atLeast"/>
+        </w:trPr>
+        <w:tc>
+          <w:tcPr>
+            <w:tcW w:w="2000" w:type="dxa"/>
+          </w:tcPr>
+          <w:p>
+            <w:pPr/>
+            <w:r>
+              <w:t xml:space="preserve">name</w:t>
+            </w:r>
+          </w:p>
+        </w:tc>
+        <w:tc>
+          <w:tcPr>
+            <w:tcW w:w="2000" w:type="dxa"/>
+          </w:tcPr>
+          <w:p>
+            <w:pPr/>
+            <w:r>
+              <w:t xml:space="preserve">nvarchar</w:t>
+            </w:r>
+          </w:p>
+        </w:tc>
+        <w:tc>
+          <w:tcPr>
+            <w:tcW w:w="2000" w:type="dxa"/>
+          </w:tcPr>
+          <w:p>
+            <w:pPr/>
+            <w:r>
+              <w:t xml:space="preserve">200</w:t>
+            </w:r>
+          </w:p>
+        </w:tc>
+        <w:tc>
+          <w:tcPr>
+            <w:tcW w:w="2000" w:type="dxa"/>
+          </w:tcPr>
+          <w:p>
+            <w:pPr/>
+            <w:r>
+              <w:t xml:space="preserve">NOT NULL</w:t>
+            </w:r>
+          </w:p>
+        </w:tc>
+      </w:tr>
+      <w:tr>
+        <w:trPr>
+          <w:trHeight w:val="530" w:hRule="atLeast"/>
+        </w:trPr>
+        <w:tc>
+          <w:tcPr>
+            <w:tcW w:w="2000" w:type="dxa"/>
+          </w:tcPr>
+          <w:p>
+            <w:pPr/>
+            <w:r>
+              <w:t xml:space="preserve">custom_fields</w:t>
+            </w:r>
+          </w:p>
+        </w:tc>
+        <w:tc>
+          <w:tcPr>
+            <w:tcW w:w="2000" w:type="dxa"/>
+          </w:tcPr>
+          <w:p>
+            <w:pPr/>
+            <w:r>
+              <w:t xml:space="preserve">nvarchar</w:t>
+            </w:r>
+          </w:p>
+        </w:tc>
+        <w:tc>
+          <w:tcPr>
+            <w:tcW w:w="2000" w:type="dxa"/>
+          </w:tcPr>
+          <w:p>
+            <w:pPr/>
+            <w:r>
+              <w:t xml:space="preserve">MAX</w:t>
+            </w:r>
+          </w:p>
+        </w:tc>
+        <w:tc>
+          <w:tcPr>
+            <w:tcW w:w="2000" w:type="dxa"/>
+          </w:tcPr>
+          <w:p>
+            <w:pPr/>
+            <w:r>
+              <w:t xml:space="preserve">IS NULL</w:t>
+            </w:r>
+          </w:p>
+        </w:tc>
+      </w:tr>
+    </w:tbl>
+    <w:p/>
+    <w:p>
+      <w:pPr/>
+      <w:r>
+        <w:t xml:space="preserve">Table Name: md_item_attribute_value</w:t>
+      </w:r>
+    </w:p>
+    <w:p>
+      <w:pPr/>
+      <w:r>
+        <w:t xml:space="preserve">Primary Key: id</w:t>
+      </w:r>
+    </w:p>
+    <w:p>
+      <w:pPr/>
+      <w:r>
+        <w:t xml:space="preserve">This table stores the attribute values of products.</w:t>
+      </w:r>
+    </w:p>
+    <w:tbl>
+      <w:tblPr>
+        <w:tblStyle w:val="TableGrid"/>
+        <w:tblW w:w="8000" w:type="dxa"/>
+        <w:jc w:val="left"/>
+        <w:tblBorders>
+          <w:top w:val="single" w:color="000000" w:sz="4" w:space="0"/>
+          <w:left w:val="single" w:color="000000" w:sz="4" w:space="0"/>
+          <w:bottom w:val="single" w:color="000000" w:sz="4" w:space="0"/>
+          <w:right w:val="single" w:color="000000" w:sz="4" w:space="0"/>
+          <w:insideH w:val="single" w:color="000000" w:sz="4" w:space="0"/>
+          <w:insideV w:val="single" w:color="000000" w:sz="4" w:space="0"/>
+        </w:tblBorders>
+        <w:tblLayout w:type="fixed"/>
+        <w:tblCellMar>
+          <w:top w:w="100" w:type="dxa"/>
+          <w:left w:w="100" w:type="dxa"/>
+          <w:bottom w:w="100" w:type="dxa"/>
+          <w:right w:w="100" w:type="dxa"/>
+        </w:tblCellMar>
+      </w:tblPr>
+      <w:tblGrid>
+        <w:gridCol w:w="2000"/>
+        <w:gridCol w:w="2000"/>
+        <w:gridCol w:w="2000"/>
+        <w:gridCol w:w="2000"/>
+      </w:tblGrid>
+      <w:tr>
+        <w:trPr>
+          <w:trHeight w:val="530" w:hRule="atLeast"/>
+        </w:trPr>
+        <w:tc>
+          <w:tcPr>
+            <w:tcW w:w="2000" w:type="dxa"/>
+          </w:tcPr>
+          <w:p>
+            <w:pPr>
+              <w:jc w:val="center"/>
+            </w:pPr>
+            <w:r>
+              <w:rPr>
+                <w:b/>
+              </w:rPr>
+              <w:t xml:space="preserve">Name of Attribute</w:t>
+            </w:r>
+          </w:p>
+        </w:tc>
+        <w:tc>
+          <w:tcPr>
+            <w:tcW w:w="2000" w:type="dxa"/>
+          </w:tcPr>
+          <w:p>
+            <w:pPr>
+              <w:jc w:val="center"/>
+            </w:pPr>
+            <w:r>
+              <w:rPr>
+                <w:b/>
+              </w:rPr>
+              <w:t xml:space="preserve">Data Type</w:t>
+            </w:r>
+          </w:p>
+        </w:tc>
+        <w:tc>
+          <w:tcPr>
+            <w:tcW w:w="2000" w:type="dxa"/>
+          </w:tcPr>
+          <w:p>
+            <w:pPr>
+              <w:jc w:val="center"/>
+            </w:pPr>
+            <w:r>
+              <w:rPr>
+                <w:b/>
+              </w:rPr>
+              <w:t xml:space="preserve">Size</w:t>
+            </w:r>
+          </w:p>
+        </w:tc>
+        <w:tc>
+          <w:tcPr>
+            <w:tcW w:w="2000" w:type="dxa"/>
+          </w:tcPr>
+          <w:p>
+            <w:pPr>
+              <w:jc w:val="center"/>
+            </w:pPr>
+            <w:r>
+              <w:rPr>
+                <w:b/>
+              </w:rPr>
+              <w:t xml:space="preserve">PK/FK/IS NULL/ NOT NULL</w:t>
+            </w:r>
+          </w:p>
+        </w:tc>
+      </w:tr>
+      <w:tr>
+        <w:trPr>
+          <w:trHeight w:val="530" w:hRule="atLeast"/>
+        </w:trPr>
+        <w:tc>
+          <w:tcPr>
+            <w:tcW w:w="2000" w:type="dxa"/>
+          </w:tcPr>
+          <w:p>
+            <w:pPr/>
+            <w:r>
+              <w:t xml:space="preserve">id</w:t>
+            </w:r>
+          </w:p>
+        </w:tc>
+        <w:tc>
+          <w:tcPr>
+            <w:tcW w:w="2000" w:type="dxa"/>
+          </w:tcPr>
+          <w:p>
+            <w:pPr/>
+            <w:r>
+              <w:t xml:space="preserve">bigint</w:t>
+            </w:r>
+          </w:p>
+        </w:tc>
+        <w:tc>
+          <w:tcPr>
+            <w:tcW w:w="2000" w:type="dxa"/>
+          </w:tcPr>
+          <w:p>
+            <w:pPr/>
+            <w:r>
+              <w:t xml:space="preserve">-</w:t>
+            </w:r>
+          </w:p>
+        </w:tc>
+        <w:tc>
+          <w:tcPr>
+            <w:tcW w:w="2000" w:type="dxa"/>
+          </w:tcPr>
+          <w:p>
+            <w:pPr/>
+            <w:r>
+              <w:t xml:space="preserve">PK, NOT NULL</w:t>
+            </w:r>
+          </w:p>
+        </w:tc>
+      </w:tr>
+      <w:tr>
+        <w:trPr>
+          <w:trHeight w:val="530" w:hRule="atLeast"/>
+        </w:trPr>
+        <w:tc>
+          <w:tcPr>
+            <w:tcW w:w="2000" w:type="dxa"/>
+          </w:tcPr>
+          <w:p>
+            <w:pPr/>
+            <w:r>
+              <w:t xml:space="preserve">item_id</w:t>
+            </w:r>
+          </w:p>
+        </w:tc>
+        <w:tc>
+          <w:tcPr>
+            <w:tcW w:w="2000" w:type="dxa"/>
+          </w:tcPr>
+          <w:p>
+            <w:pPr/>
+            <w:r>
+              <w:t xml:space="preserve">bigint</w:t>
+            </w:r>
+          </w:p>
+        </w:tc>
+        <w:tc>
+          <w:tcPr>
+            <w:tcW w:w="2000" w:type="dxa"/>
+          </w:tcPr>
+          <w:p>
+            <w:pPr/>
+            <w:r>
+              <w:t xml:space="preserve">-</w:t>
+            </w:r>
+          </w:p>
+        </w:tc>
+        <w:tc>
+          <w:tcPr>
+            <w:tcW w:w="2000" w:type="dxa"/>
+          </w:tcPr>
+          <w:p>
+            <w:pPr/>
+            <w:r>
+              <w:t xml:space="preserve">FK, NOT NULL</w:t>
+            </w:r>
+          </w:p>
+        </w:tc>
+      </w:tr>
+      <w:tr>
+        <w:trPr>
+          <w:trHeight w:val="530" w:hRule="atLeast"/>
+        </w:trPr>
+        <w:tc>
+          <w:tcPr>
+            <w:tcW w:w="2000" w:type="dxa"/>
+          </w:tcPr>
+          <w:p>
+            <w:pPr/>
+            <w:r>
+              <w:t xml:space="preserve">attribute_id</w:t>
+            </w:r>
+          </w:p>
+        </w:tc>
+        <w:tc>
+          <w:tcPr>
+            <w:tcW w:w="2000" w:type="dxa"/>
+          </w:tcPr>
+          <w:p>
+            <w:pPr/>
+            <w:r>
+              <w:t xml:space="preserve">bigint</w:t>
+            </w:r>
+          </w:p>
+        </w:tc>
+        <w:tc>
+          <w:tcPr>
+            <w:tcW w:w="2000" w:type="dxa"/>
+          </w:tcPr>
+          <w:p>
+            <w:pPr/>
+            <w:r>
+              <w:t xml:space="preserve">-</w:t>
+            </w:r>
+          </w:p>
+        </w:tc>
+        <w:tc>
+          <w:tcPr>
+            <w:tcW w:w="2000" w:type="dxa"/>
+          </w:tcPr>
+          <w:p>
+            <w:pPr/>
+            <w:r>
+              <w:t xml:space="preserve">FK, NOT NULL</w:t>
+            </w:r>
+          </w:p>
+        </w:tc>
+      </w:tr>
+      <w:tr>
+        <w:trPr>
+          <w:trHeight w:val="530" w:hRule="atLeast"/>
+        </w:trPr>
+        <w:tc>
+          <w:tcPr>
+            <w:tcW w:w="2000" w:type="dxa"/>
+          </w:tcPr>
+          <w:p>
+            <w:pPr/>
+            <w:r>
+              <w:t xml:space="preserve">value</w:t>
+            </w:r>
+          </w:p>
+        </w:tc>
+        <w:tc>
+          <w:tcPr>
+            <w:tcW w:w="2000" w:type="dxa"/>
+          </w:tcPr>
+          <w:p>
+            <w:pPr/>
+            <w:r>
+              <w:t xml:space="preserve">nvarchar</w:t>
+            </w:r>
+          </w:p>
+        </w:tc>
+        <w:tc>
+          <w:tcPr>
+            <w:tcW w:w="2000" w:type="dxa"/>
+          </w:tcPr>
+          <w:p>
+            <w:pPr/>
+            <w:r>
+              <w:t xml:space="preserve">200</w:t>
+            </w:r>
+          </w:p>
+        </w:tc>
+        <w:tc>
+          <w:tcPr>
+            <w:tcW w:w="2000" w:type="dxa"/>
+          </w:tcPr>
+          <w:p>
+            <w:pPr/>
+            <w:r>
+              <w:t xml:space="preserve">NOT NULL</w:t>
+            </w:r>
+          </w:p>
+        </w:tc>
+      </w:tr>
+      <w:tr>
+        <w:trPr>
+          <w:trHeight w:val="530" w:hRule="atLeast"/>
+        </w:trPr>
+        <w:tc>
+          <w:tcPr>
+            <w:tcW w:w="2000" w:type="dxa"/>
+          </w:tcPr>
+          <w:p>
+            <w:pPr/>
+            <w:r>
+              <w:t xml:space="preserve">company_id</w:t>
+            </w:r>
+          </w:p>
+        </w:tc>
+        <w:tc>
+          <w:tcPr>
+            <w:tcW w:w="2000" w:type="dxa"/>
+          </w:tcPr>
+          <w:p>
+            <w:pPr/>
+            <w:r>
+              <w:t xml:space="preserve">bigint</w:t>
+            </w:r>
+          </w:p>
+        </w:tc>
+        <w:tc>
+          <w:tcPr>
+            <w:tcW w:w="2000" w:type="dxa"/>
+          </w:tcPr>
+          <w:p>
+            <w:pPr/>
+            <w:r>
+              <w:t xml:space="preserve">-</w:t>
+            </w:r>
+          </w:p>
+        </w:tc>
+        <w:tc>
+          <w:tcPr>
+            <w:tcW w:w="2000" w:type="dxa"/>
+          </w:tcPr>
+          <w:p>
+            <w:pPr/>
+            <w:r>
+              <w:t xml:space="preserve">FK, NOT NULL</w:t>
+            </w:r>
+          </w:p>
+        </w:tc>
+      </w:tr>
+      <w:tr>
+        <w:trPr>
+          <w:trHeight w:val="530" w:hRule="atLeast"/>
+        </w:trPr>
+        <w:tc>
+          <w:tcPr>
+            <w:tcW w:w="2000" w:type="dxa"/>
+          </w:tcPr>
+          <w:p>
+            <w:pPr/>
+            <w:r>
+              <w:t xml:space="preserve">created_at</w:t>
+            </w:r>
+          </w:p>
+        </w:tc>
+        <w:tc>
+          <w:tcPr>
+            <w:tcW w:w="2000" w:type="dxa"/>
+          </w:tcPr>
+          <w:p>
+            <w:pPr/>
+            <w:r>
+              <w:t xml:space="preserve">datetime2</w:t>
+            </w:r>
+          </w:p>
+        </w:tc>
+        <w:tc>
+          <w:tcPr>
+            <w:tcW w:w="2000" w:type="dxa"/>
+          </w:tcPr>
+          <w:p>
+            <w:pPr/>
+            <w:r>
+              <w:t xml:space="preserve">(6)</w:t>
+            </w:r>
+          </w:p>
+        </w:tc>
+        <w:tc>
+          <w:tcPr>
+            <w:tcW w:w="2000" w:type="dxa"/>
+          </w:tcPr>
+          <w:p>
+            <w:pPr/>
+            <w:r>
+              <w:t xml:space="preserve">NOT NULL</w:t>
+            </w:r>
+          </w:p>
+        </w:tc>
+      </w:tr>
+      <w:tr>
+        <w:trPr>
+          <w:trHeight w:val="530" w:hRule="atLeast"/>
+        </w:trPr>
+        <w:tc>
+          <w:tcPr>
+            <w:tcW w:w="2000" w:type="dxa"/>
+          </w:tcPr>
+          <w:p>
+            <w:pPr/>
+            <w:r>
+              <w:t xml:space="preserve">created_by</w:t>
+            </w:r>
+          </w:p>
+        </w:tc>
+        <w:tc>
+          <w:tcPr>
+            <w:tcW w:w="2000" w:type="dxa"/>
+          </w:tcPr>
+          <w:p>
+            <w:pPr/>
+            <w:r>
+              <w:t xml:space="preserve">bigint</w:t>
+            </w:r>
+          </w:p>
+        </w:tc>
+        <w:tc>
+          <w:tcPr>
+            <w:tcW w:w="2000" w:type="dxa"/>
+          </w:tcPr>
+          <w:p>
+            <w:pPr/>
+            <w:r>
+              <w:t xml:space="preserve">-</w:t>
+            </w:r>
+          </w:p>
+        </w:tc>
+        <w:tc>
+          <w:tcPr>
+            <w:tcW w:w="2000" w:type="dxa"/>
+          </w:tcPr>
+          <w:p>
+            <w:pPr/>
+            <w:r>
+              <w:t xml:space="preserve">NOT NULL</w:t>
+            </w:r>
+          </w:p>
+        </w:tc>
+      </w:tr>
+      <w:tr>
+        <w:trPr>
+          <w:trHeight w:val="530" w:hRule="atLeast"/>
+        </w:trPr>
+        <w:tc>
+          <w:tcPr>
+            <w:tcW w:w="2000" w:type="dxa"/>
+          </w:tcPr>
+          <w:p>
+            <w:pPr/>
+            <w:r>
+              <w:t xml:space="preserve">updated_at</w:t>
+            </w:r>
+          </w:p>
+        </w:tc>
+        <w:tc>
+          <w:tcPr>
+            <w:tcW w:w="2000" w:type="dxa"/>
+          </w:tcPr>
+          <w:p>
+            <w:pPr/>
+            <w:r>
+              <w:t xml:space="preserve">datetime2</w:t>
+            </w:r>
+          </w:p>
+        </w:tc>
+        <w:tc>
+          <w:tcPr>
+            <w:tcW w:w="2000" w:type="dxa"/>
+          </w:tcPr>
+          <w:p>
+            <w:pPr/>
+            <w:r>
+              <w:t xml:space="preserve">(6)</w:t>
+            </w:r>
+          </w:p>
+        </w:tc>
+        <w:tc>
+          <w:tcPr>
+            <w:tcW w:w="2000" w:type="dxa"/>
+          </w:tcPr>
+          <w:p>
+            <w:pPr/>
+            <w:r>
+              <w:t xml:space="preserve">IS NULL</w:t>
+            </w:r>
+          </w:p>
+        </w:tc>
+      </w:tr>
+      <w:tr>
+        <w:trPr>
+          <w:trHeight w:val="530" w:hRule="atLeast"/>
+        </w:trPr>
+        <w:tc>
+          <w:tcPr>
+            <w:tcW w:w="2000" w:type="dxa"/>
+          </w:tcPr>
+          <w:p>
+            <w:pPr/>
+            <w:r>
+              <w:t xml:space="preserve">updated_by</w:t>
+            </w:r>
+          </w:p>
+        </w:tc>
+        <w:tc>
+          <w:tcPr>
+            <w:tcW w:w="2000" w:type="dxa"/>
+          </w:tcPr>
+          <w:p>
+            <w:pPr/>
+            <w:r>
+              <w:t xml:space="preserve">bigint</w:t>
+            </w:r>
+          </w:p>
+        </w:tc>
+        <w:tc>
+          <w:tcPr>
+            <w:tcW w:w="2000" w:type="dxa"/>
+          </w:tcPr>
+          <w:p>
+            <w:pPr/>
+            <w:r>
+              <w:t xml:space="preserve">-</w:t>
+            </w:r>
+          </w:p>
+        </w:tc>
+        <w:tc>
+          <w:tcPr>
+            <w:tcW w:w="2000" w:type="dxa"/>
+          </w:tcPr>
+          <w:p>
+            <w:pPr/>
+            <w:r>
+              <w:t xml:space="preserve">IS NULL</w:t>
+            </w:r>
+          </w:p>
+        </w:tc>
+      </w:tr>
+      <w:tr>
+        <w:trPr>
+          <w:trHeight w:val="530" w:hRule="atLeast"/>
+        </w:trPr>
+        <w:tc>
+          <w:tcPr>
+            <w:tcW w:w="2000" w:type="dxa"/>
+          </w:tcPr>
+          <w:p>
+            <w:pPr/>
+            <w:r>
+              <w:t xml:space="preserve">version</w:t>
+            </w:r>
+          </w:p>
+        </w:tc>
+        <w:tc>
+          <w:tcPr>
+            <w:tcW w:w="2000" w:type="dxa"/>
+          </w:tcPr>
+          <w:p>
+            <w:pPr/>
+            <w:r>
+              <w:t xml:space="preserve">int</w:t>
             </w:r>
           </w:p>
         </w:tc>
@@ -38599,7 +39958,7 @@
       </w:r>
     </w:p>
     <w:sectPr>
-      <w:footerReference xmlns:r="http://schemas.openxmlformats.org/officeDocument/2006/relationships" w:type="default" r:id="Rc478ff5934b240fe"/>
+      <w:footerReference xmlns:r="http://schemas.openxmlformats.org/officeDocument/2006/relationships" w:type="default" r:id="R03eb3af5da8d49fc"/>
       <w:pgSz w:w="11906" w:h="16838"/>
       <w:pgMar w:top="1440" w:right="1440" w:bottom="1440" w:left="1440" w:header="720" w:footer="720" w:gutter="0"/>
     </w:sectPr>

</xml_diff>

<commit_message>
feat(md): complete item image and attribute UI
</commit_message>
<xml_diff>
--- a/docs/99-output/MyERP_SDS.docx
+++ b/docs/99-output/MyERP_SDS.docx
@@ -38625,6 +38625,44 @@
           <w:i/>
         </w:rPr>
         <w:t xml:space="preserve">[Pending] System screenshot of Item Edit Interface.</w:t>
+      </w:r>
+    </w:p>
+    <w:p>
+      <w:pPr>
+        <w:pStyle w:val="Heading5"/>
+      </w:pPr>
+      <w:r>
+        <w:t xml:space="preserve">4.2.1.8.15 Product Image Interface</w:t>
+      </w:r>
+    </w:p>
+    <w:p>
+      <w:pPr>
+        <w:jc w:val="center"/>
+      </w:pPr>
+      <w:r>
+        <w:rPr>
+          <w:i/>
+        </w:rPr>
+        <w:t xml:space="preserve">[Pending] System screenshot of Product Image Interface.</w:t>
+      </w:r>
+    </w:p>
+    <w:p>
+      <w:pPr>
+        <w:pStyle w:val="Heading5"/>
+      </w:pPr>
+      <w:r>
+        <w:t xml:space="preserve">4.2.1.8.16 Product Details Interface</w:t>
+      </w:r>
+    </w:p>
+    <w:p>
+      <w:pPr>
+        <w:jc w:val="center"/>
+      </w:pPr>
+      <w:r>
+        <w:rPr>
+          <w:i/>
+        </w:rPr>
+        <w:t xml:space="preserve">[Pending] System screenshot of Product Details Interface.</w:t>
       </w:r>
     </w:p>
     <w:p>
@@ -39958,7 +39996,7 @@
       </w:r>
     </w:p>
     <w:sectPr>
-      <w:footerReference xmlns:r="http://schemas.openxmlformats.org/officeDocument/2006/relationships" w:type="default" r:id="R03eb3af5da8d49fc"/>
+      <w:footerReference xmlns:r="http://schemas.openxmlformats.org/officeDocument/2006/relationships" w:type="default" r:id="Rca9cc1007a1e4571"/>
       <w:pgSz w:w="11906" w:h="16838"/>
       <w:pgMar w:top="1440" w:right="1440" w:bottom="1440" w:left="1440" w:header="720" w:footer="720" w:gutter="0"/>
     </w:sectPr>

</xml_diff>

<commit_message>
feat(md): complete item import backend
</commit_message>
<xml_diff>
--- a/docs/99-output/MyERP_SDS.docx
+++ b/docs/99-output/MyERP_SDS.docx
@@ -38625,6 +38625,25 @@
           <w:i/>
         </w:rPr>
         <w:t xml:space="preserve">[Pending] System screenshot of Item Edit Interface.</w:t>
+      </w:r>
+    </w:p>
+    <w:p>
+      <w:pPr>
+        <w:pStyle w:val="Heading5"/>
+      </w:pPr>
+      <w:r>
+        <w:t xml:space="preserve">4.2.1.8.14 Item Import Interface</w:t>
+      </w:r>
+    </w:p>
+    <w:p>
+      <w:pPr>
+        <w:jc w:val="center"/>
+      </w:pPr>
+      <w:r>
+        <w:rPr>
+          <w:i/>
+        </w:rPr>
+        <w:t xml:space="preserve">[Pending] System screenshot of Item Import Interface.</w:t>
       </w:r>
     </w:p>
     <w:p>
@@ -39996,7 +40015,7 @@
       </w:r>
     </w:p>
     <w:sectPr>
-      <w:footerReference xmlns:r="http://schemas.openxmlformats.org/officeDocument/2006/relationships" w:type="default" r:id="Rca9cc1007a1e4571"/>
+      <w:footerReference xmlns:r="http://schemas.openxmlformats.org/officeDocument/2006/relationships" w:type="default" r:id="R2de7cb527f3945fa"/>
       <w:pgSz w:w="11906" w:h="16838"/>
       <w:pgMar w:top="1440" w:right="1440" w:bottom="1440" w:left="1440" w:header="720" w:footer="720" w:gutter="0"/>
     </w:sectPr>

</xml_diff>

<commit_message>
feat(md): complete item import UI
</commit_message>
<xml_diff>
--- a/docs/99-output/MyERP_SDS.docx
+++ b/docs/99-output/MyERP_SDS.docx
@@ -46,7 +46,7 @@
         <w:jc w:val="center"/>
       </w:pPr>
       <w:r>
-        <w:t xml:space="preserve">Date: 12 October 2026</w:t>
+        <w:t xml:space="preserve">Date: 13 October 2026</w:t>
       </w:r>
     </w:p>
     <w:p/>
@@ -40015,7 +40015,7 @@
       </w:r>
     </w:p>
     <w:sectPr>
-      <w:footerReference xmlns:r="http://schemas.openxmlformats.org/officeDocument/2006/relationships" w:type="default" r:id="R2de7cb527f3945fa"/>
+      <w:footerReference xmlns:r="http://schemas.openxmlformats.org/officeDocument/2006/relationships" w:type="default" r:id="Ra37bcf465aec4ea2"/>
       <w:pgSz w:w="11906" w:h="16838"/>
       <w:pgMar w:top="1440" w:right="1440" w:bottom="1440" w:left="1440" w:header="720" w:footer="720" w:gutter="0"/>
     </w:sectPr>

</xml_diff>

<commit_message>
feat(md): complete customer approval and deletion
- md_customer.review_status (Pending/Approved/Rejected); existing rows migrate to Approved
- submit to SYS approval workflow (MD.CUSTOMER), result handler writes back in-transaction
- versioned soft delete; pending -> 422, referenced via ICustomerUsage -> 409
- ICustomerLookup.RequireApprovedAsync contract for transaction modules
- customer page review column, submit/delete actions, trilingual errors (ADR-046)
- stabilize shared-ui pagination test under full-suite load

Co-Authored-By: Claude Opus 5.5 <noreply@anthropic.com>
</commit_message>
<xml_diff>
--- a/docs/99-output/MyERP_SDS.docx
+++ b/docs/99-output/MyERP_SDS.docx
@@ -3048,6 +3048,55 @@
             <w:pPr/>
             <w:r>
               <w:t xml:space="preserve">-</w:t>
+            </w:r>
+          </w:p>
+        </w:tc>
+        <w:tc>
+          <w:tcPr>
+            <w:tcW w:w="2000" w:type="dxa"/>
+          </w:tcPr>
+          <w:p>
+            <w:pPr/>
+            <w:r>
+              <w:t xml:space="preserve">NOT NULL</w:t>
+            </w:r>
+          </w:p>
+        </w:tc>
+      </w:tr>
+      <w:tr>
+        <w:trPr>
+          <w:trHeight w:val="530" w:hRule="atLeast"/>
+        </w:trPr>
+        <w:tc>
+          <w:tcPr>
+            <w:tcW w:w="2000" w:type="dxa"/>
+          </w:tcPr>
+          <w:p>
+            <w:pPr/>
+            <w:r>
+              <w:t xml:space="preserve">review_status</w:t>
+            </w:r>
+          </w:p>
+        </w:tc>
+        <w:tc>
+          <w:tcPr>
+            <w:tcW w:w="2000" w:type="dxa"/>
+          </w:tcPr>
+          <w:p>
+            <w:pPr/>
+            <w:r>
+              <w:t xml:space="preserve">varchar</w:t>
+            </w:r>
+          </w:p>
+        </w:tc>
+        <w:tc>
+          <w:tcPr>
+            <w:tcW w:w="2000" w:type="dxa"/>
+          </w:tcPr>
+          <w:p>
+            <w:pPr/>
+            <w:r>
+              <w:t xml:space="preserve">16</w:t>
             </w:r>
           </w:p>
         </w:tc>
@@ -40015,7 +40064,7 @@
       </w:r>
     </w:p>
     <w:sectPr>
-      <w:footerReference xmlns:r="http://schemas.openxmlformats.org/officeDocument/2006/relationships" w:type="default" r:id="Ra37bcf465aec4ea2"/>
+      <w:footerReference xmlns:r="http://schemas.openxmlformats.org/officeDocument/2006/relationships" w:type="default" r:id="R598844b3cc2a47f1"/>
       <w:pgSz w:w="11906" w:h="16838"/>
       <w:pgMar w:top="1440" w:right="1440" w:bottom="1440" w:left="1440" w:header="720" w:footer="720" w:gutter="0"/>
     </w:sectPr>

</xml_diff>

<commit_message>
feat(md): complete supplier approval and deletion
- md_supplier.review_status (Pending/Approved/Rejected); existing rows migrate to Approved
- submit to SYS approval workflow (MD.SUPPLIER), result handler writes back in-transaction
- versioned soft delete; pending -> 422, referenced via ISupplierUsage -> 409
- ISupplierLookup.RequireApprovedAsync contract for PUR
- share review status, approval services and delete across customers and suppliers
- supplier page review column, submit/delete actions, trilingual errors (ADR-046)

Co-Authored-By: Claude Opus 5.5 <noreply@anthropic.com>
</commit_message>
<xml_diff>
--- a/docs/99-output/MyERP_SDS.docx
+++ b/docs/99-output/MyERP_SDS.docx
@@ -18101,6 +18101,55 @@
             <w:pPr/>
             <w:r>
               <w:t xml:space="preserve">IS NULL</w:t>
+            </w:r>
+          </w:p>
+        </w:tc>
+      </w:tr>
+      <w:tr>
+        <w:trPr>
+          <w:trHeight w:val="530" w:hRule="atLeast"/>
+        </w:trPr>
+        <w:tc>
+          <w:tcPr>
+            <w:tcW w:w="2000" w:type="dxa"/>
+          </w:tcPr>
+          <w:p>
+            <w:pPr/>
+            <w:r>
+              <w:t xml:space="preserve">review_status</w:t>
+            </w:r>
+          </w:p>
+        </w:tc>
+        <w:tc>
+          <w:tcPr>
+            <w:tcW w:w="2000" w:type="dxa"/>
+          </w:tcPr>
+          <w:p>
+            <w:pPr/>
+            <w:r>
+              <w:t xml:space="preserve">varchar</w:t>
+            </w:r>
+          </w:p>
+        </w:tc>
+        <w:tc>
+          <w:tcPr>
+            <w:tcW w:w="2000" w:type="dxa"/>
+          </w:tcPr>
+          <w:p>
+            <w:pPr/>
+            <w:r>
+              <w:t xml:space="preserve">16</w:t>
+            </w:r>
+          </w:p>
+        </w:tc>
+        <w:tc>
+          <w:tcPr>
+            <w:tcW w:w="2000" w:type="dxa"/>
+          </w:tcPr>
+          <w:p>
+            <w:pPr/>
+            <w:r>
+              <w:t xml:space="preserve">NOT NULL</w:t>
             </w:r>
           </w:p>
         </w:tc>
@@ -40064,7 +40113,7 @@
       </w:r>
     </w:p>
     <w:sectPr>
-      <w:footerReference xmlns:r="http://schemas.openxmlformats.org/officeDocument/2006/relationships" w:type="default" r:id="R598844b3cc2a47f1"/>
+      <w:footerReference xmlns:r="http://schemas.openxmlformats.org/officeDocument/2006/relationships" w:type="default" r:id="R7655af97fba646c9"/>
       <w:pgSz w:w="11906" w:h="16838"/>
       <w:pgMar w:top="1440" w:right="1440" w:bottom="1440" w:left="1440" w:header="720" w:footer="720" w:gutter="0"/>
     </w:sectPr>

</xml_diff>

<commit_message>
feat(md): add partner default payment term and settlement method
- md_customer/md_supplier gain nullable default_payment_term_id and
  default_settlement_method_id with same-company composite FKs (ADR-047)
- API create/update/response carry both ids; payment setup used as a
  partner default cannot be deleted; lookups expose default codes
- PartnerList dropdowns and list column, i18n, Vitest, Playwright, docgen

Co-Authored-By: Claude Opus 5.5 <noreply@anthropic.com>
</commit_message>
<xml_diff>
--- a/docs/99-output/MyERP_SDS.docx
+++ b/docs/99-output/MyERP_SDS.docx
@@ -3112,6 +3112,104 @@
           </w:p>
         </w:tc>
       </w:tr>
+      <w:tr>
+        <w:trPr>
+          <w:trHeight w:val="530" w:hRule="atLeast"/>
+        </w:trPr>
+        <w:tc>
+          <w:tcPr>
+            <w:tcW w:w="2000" w:type="dxa"/>
+          </w:tcPr>
+          <w:p>
+            <w:pPr/>
+            <w:r>
+              <w:t xml:space="preserve">default_payment_term_id</w:t>
+            </w:r>
+          </w:p>
+        </w:tc>
+        <w:tc>
+          <w:tcPr>
+            <w:tcW w:w="2000" w:type="dxa"/>
+          </w:tcPr>
+          <w:p>
+            <w:pPr/>
+            <w:r>
+              <w:t xml:space="preserve">bigint</w:t>
+            </w:r>
+          </w:p>
+        </w:tc>
+        <w:tc>
+          <w:tcPr>
+            <w:tcW w:w="2000" w:type="dxa"/>
+          </w:tcPr>
+          <w:p>
+            <w:pPr/>
+            <w:r>
+              <w:t xml:space="preserve">-</w:t>
+            </w:r>
+          </w:p>
+        </w:tc>
+        <w:tc>
+          <w:tcPr>
+            <w:tcW w:w="2000" w:type="dxa"/>
+          </w:tcPr>
+          <w:p>
+            <w:pPr/>
+            <w:r>
+              <w:t xml:space="preserve">FK, IS NULL</w:t>
+            </w:r>
+          </w:p>
+        </w:tc>
+      </w:tr>
+      <w:tr>
+        <w:trPr>
+          <w:trHeight w:val="530" w:hRule="atLeast"/>
+        </w:trPr>
+        <w:tc>
+          <w:tcPr>
+            <w:tcW w:w="2000" w:type="dxa"/>
+          </w:tcPr>
+          <w:p>
+            <w:pPr/>
+            <w:r>
+              <w:t xml:space="preserve">default_settlement_method_id</w:t>
+            </w:r>
+          </w:p>
+        </w:tc>
+        <w:tc>
+          <w:tcPr>
+            <w:tcW w:w="2000" w:type="dxa"/>
+          </w:tcPr>
+          <w:p>
+            <w:pPr/>
+            <w:r>
+              <w:t xml:space="preserve">bigint</w:t>
+            </w:r>
+          </w:p>
+        </w:tc>
+        <w:tc>
+          <w:tcPr>
+            <w:tcW w:w="2000" w:type="dxa"/>
+          </w:tcPr>
+          <w:p>
+            <w:pPr/>
+            <w:r>
+              <w:t xml:space="preserve">-</w:t>
+            </w:r>
+          </w:p>
+        </w:tc>
+        <w:tc>
+          <w:tcPr>
+            <w:tcW w:w="2000" w:type="dxa"/>
+          </w:tcPr>
+          <w:p>
+            <w:pPr/>
+            <w:r>
+              <w:t xml:space="preserve">FK, IS NULL</w:t>
+            </w:r>
+          </w:p>
+        </w:tc>
+      </w:tr>
     </w:tbl>
     <w:p/>
     <w:p>
@@ -18150,6 +18248,104 @@
             <w:pPr/>
             <w:r>
               <w:t xml:space="preserve">NOT NULL</w:t>
+            </w:r>
+          </w:p>
+        </w:tc>
+      </w:tr>
+      <w:tr>
+        <w:trPr>
+          <w:trHeight w:val="530" w:hRule="atLeast"/>
+        </w:trPr>
+        <w:tc>
+          <w:tcPr>
+            <w:tcW w:w="2000" w:type="dxa"/>
+          </w:tcPr>
+          <w:p>
+            <w:pPr/>
+            <w:r>
+              <w:t xml:space="preserve">default_payment_term_id</w:t>
+            </w:r>
+          </w:p>
+        </w:tc>
+        <w:tc>
+          <w:tcPr>
+            <w:tcW w:w="2000" w:type="dxa"/>
+          </w:tcPr>
+          <w:p>
+            <w:pPr/>
+            <w:r>
+              <w:t xml:space="preserve">bigint</w:t>
+            </w:r>
+          </w:p>
+        </w:tc>
+        <w:tc>
+          <w:tcPr>
+            <w:tcW w:w="2000" w:type="dxa"/>
+          </w:tcPr>
+          <w:p>
+            <w:pPr/>
+            <w:r>
+              <w:t xml:space="preserve">-</w:t>
+            </w:r>
+          </w:p>
+        </w:tc>
+        <w:tc>
+          <w:tcPr>
+            <w:tcW w:w="2000" w:type="dxa"/>
+          </w:tcPr>
+          <w:p>
+            <w:pPr/>
+            <w:r>
+              <w:t xml:space="preserve">FK, IS NULL</w:t>
+            </w:r>
+          </w:p>
+        </w:tc>
+      </w:tr>
+      <w:tr>
+        <w:trPr>
+          <w:trHeight w:val="530" w:hRule="atLeast"/>
+        </w:trPr>
+        <w:tc>
+          <w:tcPr>
+            <w:tcW w:w="2000" w:type="dxa"/>
+          </w:tcPr>
+          <w:p>
+            <w:pPr/>
+            <w:r>
+              <w:t xml:space="preserve">default_settlement_method_id</w:t>
+            </w:r>
+          </w:p>
+        </w:tc>
+        <w:tc>
+          <w:tcPr>
+            <w:tcW w:w="2000" w:type="dxa"/>
+          </w:tcPr>
+          <w:p>
+            <w:pPr/>
+            <w:r>
+              <w:t xml:space="preserve">bigint</w:t>
+            </w:r>
+          </w:p>
+        </w:tc>
+        <w:tc>
+          <w:tcPr>
+            <w:tcW w:w="2000" w:type="dxa"/>
+          </w:tcPr>
+          <w:p>
+            <w:pPr/>
+            <w:r>
+              <w:t xml:space="preserve">-</w:t>
+            </w:r>
+          </w:p>
+        </w:tc>
+        <w:tc>
+          <w:tcPr>
+            <w:tcW w:w="2000" w:type="dxa"/>
+          </w:tcPr>
+          <w:p>
+            <w:pPr/>
+            <w:r>
+              <w:t xml:space="preserve">FK, IS NULL</w:t>
             </w:r>
           </w:p>
         </w:tc>
@@ -40113,7 +40309,7 @@
       </w:r>
     </w:p>
     <w:sectPr>
-      <w:footerReference xmlns:r="http://schemas.openxmlformats.org/officeDocument/2006/relationships" w:type="default" r:id="R7655af97fba646c9"/>
+      <w:footerReference xmlns:r="http://schemas.openxmlformats.org/officeDocument/2006/relationships" w:type="default" r:id="R3131152a930b4c24"/>
       <w:pgSz w:w="11906" w:h="16838"/>
       <w:pgMar w:top="1440" w:right="1440" w:bottom="1440" w:left="1440" w:header="720" w:footer="720" w:gutter="0"/>
     </w:sectPr>

</xml_diff>

<commit_message>
feat(inv): persist guarded master references
</commit_message>
<xml_diff>
--- a/docs/99-output/MyERP_SDS.docx
+++ b/docs/99-output/MyERP_SDS.docx
@@ -610,6 +610,808 @@
         <w:t xml:space="preserve">Figure 4.1.1 Entity Relationship Diagram (Part 1)</w:t>
       </w:r>
     </w:p>
+    <w:p>
+      <w:pPr/>
+      <w:r>
+        <w:t xml:space="preserve">Table Name: inv_reference</w:t>
+      </w:r>
+    </w:p>
+    <w:p>
+      <w:pPr/>
+      <w:r>
+        <w:t xml:space="preserve">Primary Key: id</w:t>
+      </w:r>
+    </w:p>
+    <w:p>
+      <w:pPr/>
+      <w:r>
+        <w:t xml:space="preserve">This table stores immutable inventory source references to master items, warehouses and optional locations.</w:t>
+      </w:r>
+    </w:p>
+    <w:tbl>
+      <w:tblPr>
+        <w:tblStyle w:val="TableGrid"/>
+        <w:tblW w:w="8000" w:type="dxa"/>
+        <w:jc w:val="left"/>
+        <w:tblBorders>
+          <w:top w:val="single" w:color="000000" w:sz="4" w:space="0"/>
+          <w:left w:val="single" w:color="000000" w:sz="4" w:space="0"/>
+          <w:bottom w:val="single" w:color="000000" w:sz="4" w:space="0"/>
+          <w:right w:val="single" w:color="000000" w:sz="4" w:space="0"/>
+          <w:insideH w:val="single" w:color="000000" w:sz="4" w:space="0"/>
+          <w:insideV w:val="single" w:color="000000" w:sz="4" w:space="0"/>
+        </w:tblBorders>
+        <w:tblLayout w:type="fixed"/>
+        <w:tblCellMar>
+          <w:top w:w="100" w:type="dxa"/>
+          <w:left w:w="100" w:type="dxa"/>
+          <w:bottom w:w="100" w:type="dxa"/>
+          <w:right w:w="100" w:type="dxa"/>
+        </w:tblCellMar>
+      </w:tblPr>
+      <w:tblGrid>
+        <w:gridCol w:w="2000"/>
+        <w:gridCol w:w="2000"/>
+        <w:gridCol w:w="2000"/>
+        <w:gridCol w:w="2000"/>
+      </w:tblGrid>
+      <w:tr>
+        <w:trPr>
+          <w:trHeight w:val="530" w:hRule="atLeast"/>
+        </w:trPr>
+        <w:tc>
+          <w:tcPr>
+            <w:tcW w:w="2000" w:type="dxa"/>
+          </w:tcPr>
+          <w:p>
+            <w:pPr>
+              <w:jc w:val="center"/>
+            </w:pPr>
+            <w:r>
+              <w:rPr>
+                <w:b/>
+              </w:rPr>
+              <w:t xml:space="preserve">Name of Attribute</w:t>
+            </w:r>
+          </w:p>
+        </w:tc>
+        <w:tc>
+          <w:tcPr>
+            <w:tcW w:w="2000" w:type="dxa"/>
+          </w:tcPr>
+          <w:p>
+            <w:pPr>
+              <w:jc w:val="center"/>
+            </w:pPr>
+            <w:r>
+              <w:rPr>
+                <w:b/>
+              </w:rPr>
+              <w:t xml:space="preserve">Data Type</w:t>
+            </w:r>
+          </w:p>
+        </w:tc>
+        <w:tc>
+          <w:tcPr>
+            <w:tcW w:w="2000" w:type="dxa"/>
+          </w:tcPr>
+          <w:p>
+            <w:pPr>
+              <w:jc w:val="center"/>
+            </w:pPr>
+            <w:r>
+              <w:rPr>
+                <w:b/>
+              </w:rPr>
+              <w:t xml:space="preserve">Size</w:t>
+            </w:r>
+          </w:p>
+        </w:tc>
+        <w:tc>
+          <w:tcPr>
+            <w:tcW w:w="2000" w:type="dxa"/>
+          </w:tcPr>
+          <w:p>
+            <w:pPr>
+              <w:jc w:val="center"/>
+            </w:pPr>
+            <w:r>
+              <w:rPr>
+                <w:b/>
+              </w:rPr>
+              <w:t xml:space="preserve">PK/FK/IS NULL/ NOT NULL</w:t>
+            </w:r>
+          </w:p>
+        </w:tc>
+      </w:tr>
+      <w:tr>
+        <w:trPr>
+          <w:trHeight w:val="530" w:hRule="atLeast"/>
+        </w:trPr>
+        <w:tc>
+          <w:tcPr>
+            <w:tcW w:w="2000" w:type="dxa"/>
+          </w:tcPr>
+          <w:p>
+            <w:pPr/>
+            <w:r>
+              <w:t xml:space="preserve">id</w:t>
+            </w:r>
+          </w:p>
+        </w:tc>
+        <w:tc>
+          <w:tcPr>
+            <w:tcW w:w="2000" w:type="dxa"/>
+          </w:tcPr>
+          <w:p>
+            <w:pPr/>
+            <w:r>
+              <w:t xml:space="preserve">bigint</w:t>
+            </w:r>
+          </w:p>
+        </w:tc>
+        <w:tc>
+          <w:tcPr>
+            <w:tcW w:w="2000" w:type="dxa"/>
+          </w:tcPr>
+          <w:p>
+            <w:pPr/>
+            <w:r>
+              <w:t xml:space="preserve">-</w:t>
+            </w:r>
+          </w:p>
+        </w:tc>
+        <w:tc>
+          <w:tcPr>
+            <w:tcW w:w="2000" w:type="dxa"/>
+          </w:tcPr>
+          <w:p>
+            <w:pPr/>
+            <w:r>
+              <w:t xml:space="preserve">PK, NOT NULL</w:t>
+            </w:r>
+          </w:p>
+        </w:tc>
+      </w:tr>
+      <w:tr>
+        <w:trPr>
+          <w:trHeight w:val="530" w:hRule="atLeast"/>
+        </w:trPr>
+        <w:tc>
+          <w:tcPr>
+            <w:tcW w:w="2000" w:type="dxa"/>
+          </w:tcPr>
+          <w:p>
+            <w:pPr/>
+            <w:r>
+              <w:t xml:space="preserve">source_key</w:t>
+            </w:r>
+          </w:p>
+        </w:tc>
+        <w:tc>
+          <w:tcPr>
+            <w:tcW w:w="2000" w:type="dxa"/>
+          </w:tcPr>
+          <w:p>
+            <w:pPr/>
+            <w:r>
+              <w:t xml:space="preserve">varchar</w:t>
+            </w:r>
+          </w:p>
+        </w:tc>
+        <w:tc>
+          <w:tcPr>
+            <w:tcW w:w="2000" w:type="dxa"/>
+          </w:tcPr>
+          <w:p>
+            <w:pPr/>
+            <w:r>
+              <w:t xml:space="preserve">100</w:t>
+            </w:r>
+          </w:p>
+        </w:tc>
+        <w:tc>
+          <w:tcPr>
+            <w:tcW w:w="2000" w:type="dxa"/>
+          </w:tcPr>
+          <w:p>
+            <w:pPr/>
+            <w:r>
+              <w:t xml:space="preserve">NOT NULL</w:t>
+            </w:r>
+          </w:p>
+        </w:tc>
+      </w:tr>
+      <w:tr>
+        <w:trPr>
+          <w:trHeight w:val="530" w:hRule="atLeast"/>
+        </w:trPr>
+        <w:tc>
+          <w:tcPr>
+            <w:tcW w:w="2000" w:type="dxa"/>
+          </w:tcPr>
+          <w:p>
+            <w:pPr/>
+            <w:r>
+              <w:t xml:space="preserve">item_id</w:t>
+            </w:r>
+          </w:p>
+        </w:tc>
+        <w:tc>
+          <w:tcPr>
+            <w:tcW w:w="2000" w:type="dxa"/>
+          </w:tcPr>
+          <w:p>
+            <w:pPr/>
+            <w:r>
+              <w:t xml:space="preserve">bigint</w:t>
+            </w:r>
+          </w:p>
+        </w:tc>
+        <w:tc>
+          <w:tcPr>
+            <w:tcW w:w="2000" w:type="dxa"/>
+          </w:tcPr>
+          <w:p>
+            <w:pPr/>
+            <w:r>
+              <w:t xml:space="preserve">-</w:t>
+            </w:r>
+          </w:p>
+        </w:tc>
+        <w:tc>
+          <w:tcPr>
+            <w:tcW w:w="2000" w:type="dxa"/>
+          </w:tcPr>
+          <w:p>
+            <w:pPr/>
+            <w:r>
+              <w:t xml:space="preserve">NOT NULL</w:t>
+            </w:r>
+          </w:p>
+        </w:tc>
+      </w:tr>
+      <w:tr>
+        <w:trPr>
+          <w:trHeight w:val="530" w:hRule="atLeast"/>
+        </w:trPr>
+        <w:tc>
+          <w:tcPr>
+            <w:tcW w:w="2000" w:type="dxa"/>
+          </w:tcPr>
+          <w:p>
+            <w:pPr/>
+            <w:r>
+              <w:t xml:space="preserve">item_code</w:t>
+            </w:r>
+          </w:p>
+        </w:tc>
+        <w:tc>
+          <w:tcPr>
+            <w:tcW w:w="2000" w:type="dxa"/>
+          </w:tcPr>
+          <w:p>
+            <w:pPr/>
+            <w:r>
+              <w:t xml:space="preserve">varchar</w:t>
+            </w:r>
+          </w:p>
+        </w:tc>
+        <w:tc>
+          <w:tcPr>
+            <w:tcW w:w="2000" w:type="dxa"/>
+          </w:tcPr>
+          <w:p>
+            <w:pPr/>
+            <w:r>
+              <w:t xml:space="preserve">30</w:t>
+            </w:r>
+          </w:p>
+        </w:tc>
+        <w:tc>
+          <w:tcPr>
+            <w:tcW w:w="2000" w:type="dxa"/>
+          </w:tcPr>
+          <w:p>
+            <w:pPr/>
+            <w:r>
+              <w:t xml:space="preserve">NOT NULL</w:t>
+            </w:r>
+          </w:p>
+        </w:tc>
+      </w:tr>
+      <w:tr>
+        <w:trPr>
+          <w:trHeight w:val="530" w:hRule="atLeast"/>
+        </w:trPr>
+        <w:tc>
+          <w:tcPr>
+            <w:tcW w:w="2000" w:type="dxa"/>
+          </w:tcPr>
+          <w:p>
+            <w:pPr/>
+            <w:r>
+              <w:t xml:space="preserve">warehouse_id</w:t>
+            </w:r>
+          </w:p>
+        </w:tc>
+        <w:tc>
+          <w:tcPr>
+            <w:tcW w:w="2000" w:type="dxa"/>
+          </w:tcPr>
+          <w:p>
+            <w:pPr/>
+            <w:r>
+              <w:t xml:space="preserve">bigint</w:t>
+            </w:r>
+          </w:p>
+        </w:tc>
+        <w:tc>
+          <w:tcPr>
+            <w:tcW w:w="2000" w:type="dxa"/>
+          </w:tcPr>
+          <w:p>
+            <w:pPr/>
+            <w:r>
+              <w:t xml:space="preserve">-</w:t>
+            </w:r>
+          </w:p>
+        </w:tc>
+        <w:tc>
+          <w:tcPr>
+            <w:tcW w:w="2000" w:type="dxa"/>
+          </w:tcPr>
+          <w:p>
+            <w:pPr/>
+            <w:r>
+              <w:t xml:space="preserve">NOT NULL</w:t>
+            </w:r>
+          </w:p>
+        </w:tc>
+      </w:tr>
+      <w:tr>
+        <w:trPr>
+          <w:trHeight w:val="530" w:hRule="atLeast"/>
+        </w:trPr>
+        <w:tc>
+          <w:tcPr>
+            <w:tcW w:w="2000" w:type="dxa"/>
+          </w:tcPr>
+          <w:p>
+            <w:pPr/>
+            <w:r>
+              <w:t xml:space="preserve">warehouse_code</w:t>
+            </w:r>
+          </w:p>
+        </w:tc>
+        <w:tc>
+          <w:tcPr>
+            <w:tcW w:w="2000" w:type="dxa"/>
+          </w:tcPr>
+          <w:p>
+            <w:pPr/>
+            <w:r>
+              <w:t xml:space="preserve">varchar</w:t>
+            </w:r>
+          </w:p>
+        </w:tc>
+        <w:tc>
+          <w:tcPr>
+            <w:tcW w:w="2000" w:type="dxa"/>
+          </w:tcPr>
+          <w:p>
+            <w:pPr/>
+            <w:r>
+              <w:t xml:space="preserve">30</w:t>
+            </w:r>
+          </w:p>
+        </w:tc>
+        <w:tc>
+          <w:tcPr>
+            <w:tcW w:w="2000" w:type="dxa"/>
+          </w:tcPr>
+          <w:p>
+            <w:pPr/>
+            <w:r>
+              <w:t xml:space="preserve">NOT NULL</w:t>
+            </w:r>
+          </w:p>
+        </w:tc>
+      </w:tr>
+      <w:tr>
+        <w:trPr>
+          <w:trHeight w:val="530" w:hRule="atLeast"/>
+        </w:trPr>
+        <w:tc>
+          <w:tcPr>
+            <w:tcW w:w="2000" w:type="dxa"/>
+          </w:tcPr>
+          <w:p>
+            <w:pPr/>
+            <w:r>
+              <w:t xml:space="preserve">location_id</w:t>
+            </w:r>
+          </w:p>
+        </w:tc>
+        <w:tc>
+          <w:tcPr>
+            <w:tcW w:w="2000" w:type="dxa"/>
+          </w:tcPr>
+          <w:p>
+            <w:pPr/>
+            <w:r>
+              <w:t xml:space="preserve">bigint</w:t>
+            </w:r>
+          </w:p>
+        </w:tc>
+        <w:tc>
+          <w:tcPr>
+            <w:tcW w:w="2000" w:type="dxa"/>
+          </w:tcPr>
+          <w:p>
+            <w:pPr/>
+            <w:r>
+              <w:t xml:space="preserve">-</w:t>
+            </w:r>
+          </w:p>
+        </w:tc>
+        <w:tc>
+          <w:tcPr>
+            <w:tcW w:w="2000" w:type="dxa"/>
+          </w:tcPr>
+          <w:p>
+            <w:pPr/>
+            <w:r>
+              <w:t xml:space="preserve">IS NULL</w:t>
+            </w:r>
+          </w:p>
+        </w:tc>
+      </w:tr>
+      <w:tr>
+        <w:trPr>
+          <w:trHeight w:val="530" w:hRule="atLeast"/>
+        </w:trPr>
+        <w:tc>
+          <w:tcPr>
+            <w:tcW w:w="2000" w:type="dxa"/>
+          </w:tcPr>
+          <w:p>
+            <w:pPr/>
+            <w:r>
+              <w:t xml:space="preserve">location_code</w:t>
+            </w:r>
+          </w:p>
+        </w:tc>
+        <w:tc>
+          <w:tcPr>
+            <w:tcW w:w="2000" w:type="dxa"/>
+          </w:tcPr>
+          <w:p>
+            <w:pPr/>
+            <w:r>
+              <w:t xml:space="preserve">varchar</w:t>
+            </w:r>
+          </w:p>
+        </w:tc>
+        <w:tc>
+          <w:tcPr>
+            <w:tcW w:w="2000" w:type="dxa"/>
+          </w:tcPr>
+          <w:p>
+            <w:pPr/>
+            <w:r>
+              <w:t xml:space="preserve">30</w:t>
+            </w:r>
+          </w:p>
+        </w:tc>
+        <w:tc>
+          <w:tcPr>
+            <w:tcW w:w="2000" w:type="dxa"/>
+          </w:tcPr>
+          <w:p>
+            <w:pPr/>
+            <w:r>
+              <w:t xml:space="preserve">IS NULL</w:t>
+            </w:r>
+          </w:p>
+        </w:tc>
+      </w:tr>
+      <w:tr>
+        <w:trPr>
+          <w:trHeight w:val="530" w:hRule="atLeast"/>
+        </w:trPr>
+        <w:tc>
+          <w:tcPr>
+            <w:tcW w:w="2000" w:type="dxa"/>
+          </w:tcPr>
+          <w:p>
+            <w:pPr/>
+            <w:r>
+              <w:t xml:space="preserve">company_id</w:t>
+            </w:r>
+          </w:p>
+        </w:tc>
+        <w:tc>
+          <w:tcPr>
+            <w:tcW w:w="2000" w:type="dxa"/>
+          </w:tcPr>
+          <w:p>
+            <w:pPr/>
+            <w:r>
+              <w:t xml:space="preserve">bigint</w:t>
+            </w:r>
+          </w:p>
+        </w:tc>
+        <w:tc>
+          <w:tcPr>
+            <w:tcW w:w="2000" w:type="dxa"/>
+          </w:tcPr>
+          <w:p>
+            <w:pPr/>
+            <w:r>
+              <w:t xml:space="preserve">-</w:t>
+            </w:r>
+          </w:p>
+        </w:tc>
+        <w:tc>
+          <w:tcPr>
+            <w:tcW w:w="2000" w:type="dxa"/>
+          </w:tcPr>
+          <w:p>
+            <w:pPr/>
+            <w:r>
+              <w:t xml:space="preserve">NOT NULL</w:t>
+            </w:r>
+          </w:p>
+        </w:tc>
+      </w:tr>
+      <w:tr>
+        <w:trPr>
+          <w:trHeight w:val="530" w:hRule="atLeast"/>
+        </w:trPr>
+        <w:tc>
+          <w:tcPr>
+            <w:tcW w:w="2000" w:type="dxa"/>
+          </w:tcPr>
+          <w:p>
+            <w:pPr/>
+            <w:r>
+              <w:t xml:space="preserve">created_at</w:t>
+            </w:r>
+          </w:p>
+        </w:tc>
+        <w:tc>
+          <w:tcPr>
+            <w:tcW w:w="2000" w:type="dxa"/>
+          </w:tcPr>
+          <w:p>
+            <w:pPr/>
+            <w:r>
+              <w:t xml:space="preserve">datetime2</w:t>
+            </w:r>
+          </w:p>
+        </w:tc>
+        <w:tc>
+          <w:tcPr>
+            <w:tcW w:w="2000" w:type="dxa"/>
+          </w:tcPr>
+          <w:p>
+            <w:pPr/>
+            <w:r>
+              <w:t xml:space="preserve">(6)</w:t>
+            </w:r>
+          </w:p>
+        </w:tc>
+        <w:tc>
+          <w:tcPr>
+            <w:tcW w:w="2000" w:type="dxa"/>
+          </w:tcPr>
+          <w:p>
+            <w:pPr/>
+            <w:r>
+              <w:t xml:space="preserve">NOT NULL</w:t>
+            </w:r>
+          </w:p>
+        </w:tc>
+      </w:tr>
+      <w:tr>
+        <w:trPr>
+          <w:trHeight w:val="530" w:hRule="atLeast"/>
+        </w:trPr>
+        <w:tc>
+          <w:tcPr>
+            <w:tcW w:w="2000" w:type="dxa"/>
+          </w:tcPr>
+          <w:p>
+            <w:pPr/>
+            <w:r>
+              <w:t xml:space="preserve">created_by</w:t>
+            </w:r>
+          </w:p>
+        </w:tc>
+        <w:tc>
+          <w:tcPr>
+            <w:tcW w:w="2000" w:type="dxa"/>
+          </w:tcPr>
+          <w:p>
+            <w:pPr/>
+            <w:r>
+              <w:t xml:space="preserve">bigint</w:t>
+            </w:r>
+          </w:p>
+        </w:tc>
+        <w:tc>
+          <w:tcPr>
+            <w:tcW w:w="2000" w:type="dxa"/>
+          </w:tcPr>
+          <w:p>
+            <w:pPr/>
+            <w:r>
+              <w:t xml:space="preserve">-</w:t>
+            </w:r>
+          </w:p>
+        </w:tc>
+        <w:tc>
+          <w:tcPr>
+            <w:tcW w:w="2000" w:type="dxa"/>
+          </w:tcPr>
+          <w:p>
+            <w:pPr/>
+            <w:r>
+              <w:t xml:space="preserve">NOT NULL</w:t>
+            </w:r>
+          </w:p>
+        </w:tc>
+      </w:tr>
+      <w:tr>
+        <w:trPr>
+          <w:trHeight w:val="530" w:hRule="atLeast"/>
+        </w:trPr>
+        <w:tc>
+          <w:tcPr>
+            <w:tcW w:w="2000" w:type="dxa"/>
+          </w:tcPr>
+          <w:p>
+            <w:pPr/>
+            <w:r>
+              <w:t xml:space="preserve">updated_at</w:t>
+            </w:r>
+          </w:p>
+        </w:tc>
+        <w:tc>
+          <w:tcPr>
+            <w:tcW w:w="2000" w:type="dxa"/>
+          </w:tcPr>
+          <w:p>
+            <w:pPr/>
+            <w:r>
+              <w:t xml:space="preserve">datetime2</w:t>
+            </w:r>
+          </w:p>
+        </w:tc>
+        <w:tc>
+          <w:tcPr>
+            <w:tcW w:w="2000" w:type="dxa"/>
+          </w:tcPr>
+          <w:p>
+            <w:pPr/>
+            <w:r>
+              <w:t xml:space="preserve">(6)</w:t>
+            </w:r>
+          </w:p>
+        </w:tc>
+        <w:tc>
+          <w:tcPr>
+            <w:tcW w:w="2000" w:type="dxa"/>
+          </w:tcPr>
+          <w:p>
+            <w:pPr/>
+            <w:r>
+              <w:t xml:space="preserve">IS NULL</w:t>
+            </w:r>
+          </w:p>
+        </w:tc>
+      </w:tr>
+      <w:tr>
+        <w:trPr>
+          <w:trHeight w:val="530" w:hRule="atLeast"/>
+        </w:trPr>
+        <w:tc>
+          <w:tcPr>
+            <w:tcW w:w="2000" w:type="dxa"/>
+          </w:tcPr>
+          <w:p>
+            <w:pPr/>
+            <w:r>
+              <w:t xml:space="preserve">updated_by</w:t>
+            </w:r>
+          </w:p>
+        </w:tc>
+        <w:tc>
+          <w:tcPr>
+            <w:tcW w:w="2000" w:type="dxa"/>
+          </w:tcPr>
+          <w:p>
+            <w:pPr/>
+            <w:r>
+              <w:t xml:space="preserve">bigint</w:t>
+            </w:r>
+          </w:p>
+        </w:tc>
+        <w:tc>
+          <w:tcPr>
+            <w:tcW w:w="2000" w:type="dxa"/>
+          </w:tcPr>
+          <w:p>
+            <w:pPr/>
+            <w:r>
+              <w:t xml:space="preserve">-</w:t>
+            </w:r>
+          </w:p>
+        </w:tc>
+        <w:tc>
+          <w:tcPr>
+            <w:tcW w:w="2000" w:type="dxa"/>
+          </w:tcPr>
+          <w:p>
+            <w:pPr/>
+            <w:r>
+              <w:t xml:space="preserve">IS NULL</w:t>
+            </w:r>
+          </w:p>
+        </w:tc>
+      </w:tr>
+      <w:tr>
+        <w:trPr>
+          <w:trHeight w:val="530" w:hRule="atLeast"/>
+        </w:trPr>
+        <w:tc>
+          <w:tcPr>
+            <w:tcW w:w="2000" w:type="dxa"/>
+          </w:tcPr>
+          <w:p>
+            <w:pPr/>
+            <w:r>
+              <w:t xml:space="preserve">version</w:t>
+            </w:r>
+          </w:p>
+        </w:tc>
+        <w:tc>
+          <w:tcPr>
+            <w:tcW w:w="2000" w:type="dxa"/>
+          </w:tcPr>
+          <w:p>
+            <w:pPr/>
+            <w:r>
+              <w:t xml:space="preserve">int</w:t>
+            </w:r>
+          </w:p>
+        </w:tc>
+        <w:tc>
+          <w:tcPr>
+            <w:tcW w:w="2000" w:type="dxa"/>
+          </w:tcPr>
+          <w:p>
+            <w:pPr/>
+            <w:r>
+              <w:t xml:space="preserve">-</w:t>
+            </w:r>
+          </w:p>
+        </w:tc>
+        <w:tc>
+          <w:tcPr>
+            <w:tcW w:w="2000" w:type="dxa"/>
+          </w:tcPr>
+          <w:p>
+            <w:pPr/>
+            <w:r>
+              <w:t xml:space="preserve">NOT NULL</w:t>
+            </w:r>
+          </w:p>
+        </w:tc>
+      </w:tr>
+    </w:tbl>
+    <w:p/>
     <w:p>
       <w:pPr/>
       <w:r>
@@ -40309,7 +41111,7 @@
       </w:r>
     </w:p>
     <w:sectPr>
-      <w:footerReference xmlns:r="http://schemas.openxmlformats.org/officeDocument/2006/relationships" w:type="default" r:id="R73a280399d38461c"/>
+      <w:footerReference xmlns:r="http://schemas.openxmlformats.org/officeDocument/2006/relationships" w:type="default" r:id="Re9ad4cc27e5a4faa"/>
       <w:pgSz w:w="11906" w:h="16838"/>
       <w:pgMar w:top="1440" w:right="1440" w:bottom="1440" w:left="1440" w:header="720" w:footer="720" w:gutter="0"/>
     </w:sectPr>

</xml_diff>

<commit_message>
feat(inv): add immutable stock ledger and posting service
</commit_message>
<xml_diff>
--- a/docs/99-output/MyERP_SDS.docx
+++ b/docs/99-output/MyERP_SDS.docx
@@ -1161,6 +1161,1053 @@
             <w:pPr/>
             <w:r>
               <w:t xml:space="preserve">NOT NULL</w:t>
+            </w:r>
+          </w:p>
+        </w:tc>
+      </w:tr>
+      <w:tr>
+        <w:trPr>
+          <w:trHeight w:val="530" w:hRule="atLeast"/>
+        </w:trPr>
+        <w:tc>
+          <w:tcPr>
+            <w:tcW w:w="2000" w:type="dxa"/>
+          </w:tcPr>
+          <w:p>
+            <w:pPr/>
+            <w:r>
+              <w:t xml:space="preserve">created_at</w:t>
+            </w:r>
+          </w:p>
+        </w:tc>
+        <w:tc>
+          <w:tcPr>
+            <w:tcW w:w="2000" w:type="dxa"/>
+          </w:tcPr>
+          <w:p>
+            <w:pPr/>
+            <w:r>
+              <w:t xml:space="preserve">datetime2</w:t>
+            </w:r>
+          </w:p>
+        </w:tc>
+        <w:tc>
+          <w:tcPr>
+            <w:tcW w:w="2000" w:type="dxa"/>
+          </w:tcPr>
+          <w:p>
+            <w:pPr/>
+            <w:r>
+              <w:t xml:space="preserve">(6)</w:t>
+            </w:r>
+          </w:p>
+        </w:tc>
+        <w:tc>
+          <w:tcPr>
+            <w:tcW w:w="2000" w:type="dxa"/>
+          </w:tcPr>
+          <w:p>
+            <w:pPr/>
+            <w:r>
+              <w:t xml:space="preserve">NOT NULL</w:t>
+            </w:r>
+          </w:p>
+        </w:tc>
+      </w:tr>
+      <w:tr>
+        <w:trPr>
+          <w:trHeight w:val="530" w:hRule="atLeast"/>
+        </w:trPr>
+        <w:tc>
+          <w:tcPr>
+            <w:tcW w:w="2000" w:type="dxa"/>
+          </w:tcPr>
+          <w:p>
+            <w:pPr/>
+            <w:r>
+              <w:t xml:space="preserve">created_by</w:t>
+            </w:r>
+          </w:p>
+        </w:tc>
+        <w:tc>
+          <w:tcPr>
+            <w:tcW w:w="2000" w:type="dxa"/>
+          </w:tcPr>
+          <w:p>
+            <w:pPr/>
+            <w:r>
+              <w:t xml:space="preserve">bigint</w:t>
+            </w:r>
+          </w:p>
+        </w:tc>
+        <w:tc>
+          <w:tcPr>
+            <w:tcW w:w="2000" w:type="dxa"/>
+          </w:tcPr>
+          <w:p>
+            <w:pPr/>
+            <w:r>
+              <w:t xml:space="preserve">-</w:t>
+            </w:r>
+          </w:p>
+        </w:tc>
+        <w:tc>
+          <w:tcPr>
+            <w:tcW w:w="2000" w:type="dxa"/>
+          </w:tcPr>
+          <w:p>
+            <w:pPr/>
+            <w:r>
+              <w:t xml:space="preserve">NOT NULL</w:t>
+            </w:r>
+          </w:p>
+        </w:tc>
+      </w:tr>
+      <w:tr>
+        <w:trPr>
+          <w:trHeight w:val="530" w:hRule="atLeast"/>
+        </w:trPr>
+        <w:tc>
+          <w:tcPr>
+            <w:tcW w:w="2000" w:type="dxa"/>
+          </w:tcPr>
+          <w:p>
+            <w:pPr/>
+            <w:r>
+              <w:t xml:space="preserve">updated_at</w:t>
+            </w:r>
+          </w:p>
+        </w:tc>
+        <w:tc>
+          <w:tcPr>
+            <w:tcW w:w="2000" w:type="dxa"/>
+          </w:tcPr>
+          <w:p>
+            <w:pPr/>
+            <w:r>
+              <w:t xml:space="preserve">datetime2</w:t>
+            </w:r>
+          </w:p>
+        </w:tc>
+        <w:tc>
+          <w:tcPr>
+            <w:tcW w:w="2000" w:type="dxa"/>
+          </w:tcPr>
+          <w:p>
+            <w:pPr/>
+            <w:r>
+              <w:t xml:space="preserve">(6)</w:t>
+            </w:r>
+          </w:p>
+        </w:tc>
+        <w:tc>
+          <w:tcPr>
+            <w:tcW w:w="2000" w:type="dxa"/>
+          </w:tcPr>
+          <w:p>
+            <w:pPr/>
+            <w:r>
+              <w:t xml:space="preserve">IS NULL</w:t>
+            </w:r>
+          </w:p>
+        </w:tc>
+      </w:tr>
+      <w:tr>
+        <w:trPr>
+          <w:trHeight w:val="530" w:hRule="atLeast"/>
+        </w:trPr>
+        <w:tc>
+          <w:tcPr>
+            <w:tcW w:w="2000" w:type="dxa"/>
+          </w:tcPr>
+          <w:p>
+            <w:pPr/>
+            <w:r>
+              <w:t xml:space="preserve">updated_by</w:t>
+            </w:r>
+          </w:p>
+        </w:tc>
+        <w:tc>
+          <w:tcPr>
+            <w:tcW w:w="2000" w:type="dxa"/>
+          </w:tcPr>
+          <w:p>
+            <w:pPr/>
+            <w:r>
+              <w:t xml:space="preserve">bigint</w:t>
+            </w:r>
+          </w:p>
+        </w:tc>
+        <w:tc>
+          <w:tcPr>
+            <w:tcW w:w="2000" w:type="dxa"/>
+          </w:tcPr>
+          <w:p>
+            <w:pPr/>
+            <w:r>
+              <w:t xml:space="preserve">-</w:t>
+            </w:r>
+          </w:p>
+        </w:tc>
+        <w:tc>
+          <w:tcPr>
+            <w:tcW w:w="2000" w:type="dxa"/>
+          </w:tcPr>
+          <w:p>
+            <w:pPr/>
+            <w:r>
+              <w:t xml:space="preserve">IS NULL</w:t>
+            </w:r>
+          </w:p>
+        </w:tc>
+      </w:tr>
+      <w:tr>
+        <w:trPr>
+          <w:trHeight w:val="530" w:hRule="atLeast"/>
+        </w:trPr>
+        <w:tc>
+          <w:tcPr>
+            <w:tcW w:w="2000" w:type="dxa"/>
+          </w:tcPr>
+          <w:p>
+            <w:pPr/>
+            <w:r>
+              <w:t xml:space="preserve">version</w:t>
+            </w:r>
+          </w:p>
+        </w:tc>
+        <w:tc>
+          <w:tcPr>
+            <w:tcW w:w="2000" w:type="dxa"/>
+          </w:tcPr>
+          <w:p>
+            <w:pPr/>
+            <w:r>
+              <w:t xml:space="preserve">int</w:t>
+            </w:r>
+          </w:p>
+        </w:tc>
+        <w:tc>
+          <w:tcPr>
+            <w:tcW w:w="2000" w:type="dxa"/>
+          </w:tcPr>
+          <w:p>
+            <w:pPr/>
+            <w:r>
+              <w:t xml:space="preserve">-</w:t>
+            </w:r>
+          </w:p>
+        </w:tc>
+        <w:tc>
+          <w:tcPr>
+            <w:tcW w:w="2000" w:type="dxa"/>
+          </w:tcPr>
+          <w:p>
+            <w:pPr/>
+            <w:r>
+              <w:t xml:space="preserve">NOT NULL</w:t>
+            </w:r>
+          </w:p>
+        </w:tc>
+      </w:tr>
+    </w:tbl>
+    <w:p/>
+    <w:p>
+      <w:pPr/>
+      <w:r>
+        <w:t xml:space="preserve">Table Name: inv_stock_movement</w:t>
+      </w:r>
+    </w:p>
+    <w:p>
+      <w:pPr/>
+      <w:r>
+        <w:t xml:space="preserve">Primary Key: id</w:t>
+      </w:r>
+    </w:p>
+    <w:p>
+      <w:pPr/>
+      <w:r>
+        <w:t xml:space="preserve">This table stores append-only inventory receipts and issues from approved source documents.</w:t>
+      </w:r>
+    </w:p>
+    <w:tbl>
+      <w:tblPr>
+        <w:tblStyle w:val="TableGrid"/>
+        <w:tblW w:w="8000" w:type="dxa"/>
+        <w:jc w:val="left"/>
+        <w:tblBorders>
+          <w:top w:val="single" w:color="000000" w:sz="4" w:space="0"/>
+          <w:left w:val="single" w:color="000000" w:sz="4" w:space="0"/>
+          <w:bottom w:val="single" w:color="000000" w:sz="4" w:space="0"/>
+          <w:right w:val="single" w:color="000000" w:sz="4" w:space="0"/>
+          <w:insideH w:val="single" w:color="000000" w:sz="4" w:space="0"/>
+          <w:insideV w:val="single" w:color="000000" w:sz="4" w:space="0"/>
+        </w:tblBorders>
+        <w:tblLayout w:type="fixed"/>
+        <w:tblCellMar>
+          <w:top w:w="100" w:type="dxa"/>
+          <w:left w:w="100" w:type="dxa"/>
+          <w:bottom w:w="100" w:type="dxa"/>
+          <w:right w:w="100" w:type="dxa"/>
+        </w:tblCellMar>
+      </w:tblPr>
+      <w:tblGrid>
+        <w:gridCol w:w="2000"/>
+        <w:gridCol w:w="2000"/>
+        <w:gridCol w:w="2000"/>
+        <w:gridCol w:w="2000"/>
+      </w:tblGrid>
+      <w:tr>
+        <w:trPr>
+          <w:trHeight w:val="530" w:hRule="atLeast"/>
+        </w:trPr>
+        <w:tc>
+          <w:tcPr>
+            <w:tcW w:w="2000" w:type="dxa"/>
+          </w:tcPr>
+          <w:p>
+            <w:pPr>
+              <w:jc w:val="center"/>
+            </w:pPr>
+            <w:r>
+              <w:rPr>
+                <w:b/>
+              </w:rPr>
+              <w:t xml:space="preserve">Name of Attribute</w:t>
+            </w:r>
+          </w:p>
+        </w:tc>
+        <w:tc>
+          <w:tcPr>
+            <w:tcW w:w="2000" w:type="dxa"/>
+          </w:tcPr>
+          <w:p>
+            <w:pPr>
+              <w:jc w:val="center"/>
+            </w:pPr>
+            <w:r>
+              <w:rPr>
+                <w:b/>
+              </w:rPr>
+              <w:t xml:space="preserve">Data Type</w:t>
+            </w:r>
+          </w:p>
+        </w:tc>
+        <w:tc>
+          <w:tcPr>
+            <w:tcW w:w="2000" w:type="dxa"/>
+          </w:tcPr>
+          <w:p>
+            <w:pPr>
+              <w:jc w:val="center"/>
+            </w:pPr>
+            <w:r>
+              <w:rPr>
+                <w:b/>
+              </w:rPr>
+              <w:t xml:space="preserve">Size</w:t>
+            </w:r>
+          </w:p>
+        </w:tc>
+        <w:tc>
+          <w:tcPr>
+            <w:tcW w:w="2000" w:type="dxa"/>
+          </w:tcPr>
+          <w:p>
+            <w:pPr>
+              <w:jc w:val="center"/>
+            </w:pPr>
+            <w:r>
+              <w:rPr>
+                <w:b/>
+              </w:rPr>
+              <w:t xml:space="preserve">PK/FK/IS NULL/ NOT NULL</w:t>
+            </w:r>
+          </w:p>
+        </w:tc>
+      </w:tr>
+      <w:tr>
+        <w:trPr>
+          <w:trHeight w:val="530" w:hRule="atLeast"/>
+        </w:trPr>
+        <w:tc>
+          <w:tcPr>
+            <w:tcW w:w="2000" w:type="dxa"/>
+          </w:tcPr>
+          <w:p>
+            <w:pPr/>
+            <w:r>
+              <w:t xml:space="preserve">id</w:t>
+            </w:r>
+          </w:p>
+        </w:tc>
+        <w:tc>
+          <w:tcPr>
+            <w:tcW w:w="2000" w:type="dxa"/>
+          </w:tcPr>
+          <w:p>
+            <w:pPr/>
+            <w:r>
+              <w:t xml:space="preserve">bigint</w:t>
+            </w:r>
+          </w:p>
+        </w:tc>
+        <w:tc>
+          <w:tcPr>
+            <w:tcW w:w="2000" w:type="dxa"/>
+          </w:tcPr>
+          <w:p>
+            <w:pPr/>
+            <w:r>
+              <w:t xml:space="preserve">-</w:t>
+            </w:r>
+          </w:p>
+        </w:tc>
+        <w:tc>
+          <w:tcPr>
+            <w:tcW w:w="2000" w:type="dxa"/>
+          </w:tcPr>
+          <w:p>
+            <w:pPr/>
+            <w:r>
+              <w:t xml:space="preserve">PK, NOT NULL</w:t>
+            </w:r>
+          </w:p>
+        </w:tc>
+      </w:tr>
+      <w:tr>
+        <w:trPr>
+          <w:trHeight w:val="530" w:hRule="atLeast"/>
+        </w:trPr>
+        <w:tc>
+          <w:tcPr>
+            <w:tcW w:w="2000" w:type="dxa"/>
+          </w:tcPr>
+          <w:p>
+            <w:pPr/>
+            <w:r>
+              <w:t xml:space="preserve">source_type</w:t>
+            </w:r>
+          </w:p>
+        </w:tc>
+        <w:tc>
+          <w:tcPr>
+            <w:tcW w:w="2000" w:type="dxa"/>
+          </w:tcPr>
+          <w:p>
+            <w:pPr/>
+            <w:r>
+              <w:t xml:space="preserve">varchar</w:t>
+            </w:r>
+          </w:p>
+        </w:tc>
+        <w:tc>
+          <w:tcPr>
+            <w:tcW w:w="2000" w:type="dxa"/>
+          </w:tcPr>
+          <w:p>
+            <w:pPr/>
+            <w:r>
+              <w:t xml:space="preserve">30</w:t>
+            </w:r>
+          </w:p>
+        </w:tc>
+        <w:tc>
+          <w:tcPr>
+            <w:tcW w:w="2000" w:type="dxa"/>
+          </w:tcPr>
+          <w:p>
+            <w:pPr/>
+            <w:r>
+              <w:t xml:space="preserve">NOT NULL</w:t>
+            </w:r>
+          </w:p>
+        </w:tc>
+      </w:tr>
+      <w:tr>
+        <w:trPr>
+          <w:trHeight w:val="530" w:hRule="atLeast"/>
+        </w:trPr>
+        <w:tc>
+          <w:tcPr>
+            <w:tcW w:w="2000" w:type="dxa"/>
+          </w:tcPr>
+          <w:p>
+            <w:pPr/>
+            <w:r>
+              <w:t xml:space="preserve">source_id</w:t>
+            </w:r>
+          </w:p>
+        </w:tc>
+        <w:tc>
+          <w:tcPr>
+            <w:tcW w:w="2000" w:type="dxa"/>
+          </w:tcPr>
+          <w:p>
+            <w:pPr/>
+            <w:r>
+              <w:t xml:space="preserve">bigint</w:t>
+            </w:r>
+          </w:p>
+        </w:tc>
+        <w:tc>
+          <w:tcPr>
+            <w:tcW w:w="2000" w:type="dxa"/>
+          </w:tcPr>
+          <w:p>
+            <w:pPr/>
+            <w:r>
+              <w:t xml:space="preserve">-</w:t>
+            </w:r>
+          </w:p>
+        </w:tc>
+        <w:tc>
+          <w:tcPr>
+            <w:tcW w:w="2000" w:type="dxa"/>
+          </w:tcPr>
+          <w:p>
+            <w:pPr/>
+            <w:r>
+              <w:t xml:space="preserve">NOT NULL</w:t>
+            </w:r>
+          </w:p>
+        </w:tc>
+      </w:tr>
+      <w:tr>
+        <w:trPr>
+          <w:trHeight w:val="530" w:hRule="atLeast"/>
+        </w:trPr>
+        <w:tc>
+          <w:tcPr>
+            <w:tcW w:w="2000" w:type="dxa"/>
+          </w:tcPr>
+          <w:p>
+            <w:pPr/>
+            <w:r>
+              <w:t xml:space="preserve">source_line_no</w:t>
+            </w:r>
+          </w:p>
+        </w:tc>
+        <w:tc>
+          <w:tcPr>
+            <w:tcW w:w="2000" w:type="dxa"/>
+          </w:tcPr>
+          <w:p>
+            <w:pPr/>
+            <w:r>
+              <w:t xml:space="preserve">int</w:t>
+            </w:r>
+          </w:p>
+        </w:tc>
+        <w:tc>
+          <w:tcPr>
+            <w:tcW w:w="2000" w:type="dxa"/>
+          </w:tcPr>
+          <w:p>
+            <w:pPr/>
+            <w:r>
+              <w:t xml:space="preserve">-</w:t>
+            </w:r>
+          </w:p>
+        </w:tc>
+        <w:tc>
+          <w:tcPr>
+            <w:tcW w:w="2000" w:type="dxa"/>
+          </w:tcPr>
+          <w:p>
+            <w:pPr/>
+            <w:r>
+              <w:t xml:space="preserve">NOT NULL</w:t>
+            </w:r>
+          </w:p>
+        </w:tc>
+      </w:tr>
+      <w:tr>
+        <w:trPr>
+          <w:trHeight w:val="530" w:hRule="atLeast"/>
+        </w:trPr>
+        <w:tc>
+          <w:tcPr>
+            <w:tcW w:w="2000" w:type="dxa"/>
+          </w:tcPr>
+          <w:p>
+            <w:pPr/>
+            <w:r>
+              <w:t xml:space="preserve">direction</w:t>
+            </w:r>
+          </w:p>
+        </w:tc>
+        <w:tc>
+          <w:tcPr>
+            <w:tcW w:w="2000" w:type="dxa"/>
+          </w:tcPr>
+          <w:p>
+            <w:pPr/>
+            <w:r>
+              <w:t xml:space="preserve">varchar</w:t>
+            </w:r>
+          </w:p>
+        </w:tc>
+        <w:tc>
+          <w:tcPr>
+            <w:tcW w:w="2000" w:type="dxa"/>
+          </w:tcPr>
+          <w:p>
+            <w:pPr/>
+            <w:r>
+              <w:t xml:space="preserve">10</w:t>
+            </w:r>
+          </w:p>
+        </w:tc>
+        <w:tc>
+          <w:tcPr>
+            <w:tcW w:w="2000" w:type="dxa"/>
+          </w:tcPr>
+          <w:p>
+            <w:pPr/>
+            <w:r>
+              <w:t xml:space="preserve">NOT NULL</w:t>
+            </w:r>
+          </w:p>
+        </w:tc>
+      </w:tr>
+      <w:tr>
+        <w:trPr>
+          <w:trHeight w:val="530" w:hRule="atLeast"/>
+        </w:trPr>
+        <w:tc>
+          <w:tcPr>
+            <w:tcW w:w="2000" w:type="dxa"/>
+          </w:tcPr>
+          <w:p>
+            <w:pPr/>
+            <w:r>
+              <w:t xml:space="preserve">reference_id</w:t>
+            </w:r>
+          </w:p>
+        </w:tc>
+        <w:tc>
+          <w:tcPr>
+            <w:tcW w:w="2000" w:type="dxa"/>
+          </w:tcPr>
+          <w:p>
+            <w:pPr/>
+            <w:r>
+              <w:t xml:space="preserve">bigint</w:t>
+            </w:r>
+          </w:p>
+        </w:tc>
+        <w:tc>
+          <w:tcPr>
+            <w:tcW w:w="2000" w:type="dxa"/>
+          </w:tcPr>
+          <w:p>
+            <w:pPr/>
+            <w:r>
+              <w:t xml:space="preserve">-</w:t>
+            </w:r>
+          </w:p>
+        </w:tc>
+        <w:tc>
+          <w:tcPr>
+            <w:tcW w:w="2000" w:type="dxa"/>
+          </w:tcPr>
+          <w:p>
+            <w:pPr/>
+            <w:r>
+              <w:t xml:space="preserve">FK, NOT NULL</w:t>
+            </w:r>
+          </w:p>
+        </w:tc>
+      </w:tr>
+      <w:tr>
+        <w:trPr>
+          <w:trHeight w:val="530" w:hRule="atLeast"/>
+        </w:trPr>
+        <w:tc>
+          <w:tcPr>
+            <w:tcW w:w="2000" w:type="dxa"/>
+          </w:tcPr>
+          <w:p>
+            <w:pPr/>
+            <w:r>
+              <w:t xml:space="preserve">item_id</w:t>
+            </w:r>
+          </w:p>
+        </w:tc>
+        <w:tc>
+          <w:tcPr>
+            <w:tcW w:w="2000" w:type="dxa"/>
+          </w:tcPr>
+          <w:p>
+            <w:pPr/>
+            <w:r>
+              <w:t xml:space="preserve">bigint</w:t>
+            </w:r>
+          </w:p>
+        </w:tc>
+        <w:tc>
+          <w:tcPr>
+            <w:tcW w:w="2000" w:type="dxa"/>
+          </w:tcPr>
+          <w:p>
+            <w:pPr/>
+            <w:r>
+              <w:t xml:space="preserve">-</w:t>
+            </w:r>
+          </w:p>
+        </w:tc>
+        <w:tc>
+          <w:tcPr>
+            <w:tcW w:w="2000" w:type="dxa"/>
+          </w:tcPr>
+          <w:p>
+            <w:pPr/>
+            <w:r>
+              <w:t xml:space="preserve">NOT NULL</w:t>
+            </w:r>
+          </w:p>
+        </w:tc>
+      </w:tr>
+      <w:tr>
+        <w:trPr>
+          <w:trHeight w:val="530" w:hRule="atLeast"/>
+        </w:trPr>
+        <w:tc>
+          <w:tcPr>
+            <w:tcW w:w="2000" w:type="dxa"/>
+          </w:tcPr>
+          <w:p>
+            <w:pPr/>
+            <w:r>
+              <w:t xml:space="preserve">warehouse_id</w:t>
+            </w:r>
+          </w:p>
+        </w:tc>
+        <w:tc>
+          <w:tcPr>
+            <w:tcW w:w="2000" w:type="dxa"/>
+          </w:tcPr>
+          <w:p>
+            <w:pPr/>
+            <w:r>
+              <w:t xml:space="preserve">bigint</w:t>
+            </w:r>
+          </w:p>
+        </w:tc>
+        <w:tc>
+          <w:tcPr>
+            <w:tcW w:w="2000" w:type="dxa"/>
+          </w:tcPr>
+          <w:p>
+            <w:pPr/>
+            <w:r>
+              <w:t xml:space="preserve">-</w:t>
+            </w:r>
+          </w:p>
+        </w:tc>
+        <w:tc>
+          <w:tcPr>
+            <w:tcW w:w="2000" w:type="dxa"/>
+          </w:tcPr>
+          <w:p>
+            <w:pPr/>
+            <w:r>
+              <w:t xml:space="preserve">NOT NULL</w:t>
+            </w:r>
+          </w:p>
+        </w:tc>
+      </w:tr>
+      <w:tr>
+        <w:trPr>
+          <w:trHeight w:val="530" w:hRule="atLeast"/>
+        </w:trPr>
+        <w:tc>
+          <w:tcPr>
+            <w:tcW w:w="2000" w:type="dxa"/>
+          </w:tcPr>
+          <w:p>
+            <w:pPr/>
+            <w:r>
+              <w:t xml:space="preserve">location_id</w:t>
+            </w:r>
+          </w:p>
+        </w:tc>
+        <w:tc>
+          <w:tcPr>
+            <w:tcW w:w="2000" w:type="dxa"/>
+          </w:tcPr>
+          <w:p>
+            <w:pPr/>
+            <w:r>
+              <w:t xml:space="preserve">bigint</w:t>
+            </w:r>
+          </w:p>
+        </w:tc>
+        <w:tc>
+          <w:tcPr>
+            <w:tcW w:w="2000" w:type="dxa"/>
+          </w:tcPr>
+          <w:p>
+            <w:pPr/>
+            <w:r>
+              <w:t xml:space="preserve">-</w:t>
+            </w:r>
+          </w:p>
+        </w:tc>
+        <w:tc>
+          <w:tcPr>
+            <w:tcW w:w="2000" w:type="dxa"/>
+          </w:tcPr>
+          <w:p>
+            <w:pPr/>
+            <w:r>
+              <w:t xml:space="preserve">IS NULL</w:t>
+            </w:r>
+          </w:p>
+        </w:tc>
+      </w:tr>
+      <w:tr>
+        <w:trPr>
+          <w:trHeight w:val="530" w:hRule="atLeast"/>
+        </w:trPr>
+        <w:tc>
+          <w:tcPr>
+            <w:tcW w:w="2000" w:type="dxa"/>
+          </w:tcPr>
+          <w:p>
+            <w:pPr/>
+            <w:r>
+              <w:t xml:space="preserve">quantity</w:t>
+            </w:r>
+          </w:p>
+        </w:tc>
+        <w:tc>
+          <w:tcPr>
+            <w:tcW w:w="2000" w:type="dxa"/>
+          </w:tcPr>
+          <w:p>
+            <w:pPr/>
+            <w:r>
+              <w:t xml:space="preserve">decimal</w:t>
+            </w:r>
+          </w:p>
+        </w:tc>
+        <w:tc>
+          <w:tcPr>
+            <w:tcW w:w="2000" w:type="dxa"/>
+          </w:tcPr>
+          <w:p>
+            <w:pPr/>
+            <w:r>
+              <w:t xml:space="preserve">(19,6)</w:t>
+            </w:r>
+          </w:p>
+        </w:tc>
+        <w:tc>
+          <w:tcPr>
+            <w:tcW w:w="2000" w:type="dxa"/>
+          </w:tcPr>
+          <w:p>
+            <w:pPr/>
+            <w:r>
+              <w:t xml:space="preserve">NOT NULL</w:t>
+            </w:r>
+          </w:p>
+        </w:tc>
+      </w:tr>
+      <w:tr>
+        <w:trPr>
+          <w:trHeight w:val="530" w:hRule="atLeast"/>
+        </w:trPr>
+        <w:tc>
+          <w:tcPr>
+            <w:tcW w:w="2000" w:type="dxa"/>
+          </w:tcPr>
+          <w:p>
+            <w:pPr/>
+            <w:r>
+              <w:t xml:space="preserve">unit_cost</w:t>
+            </w:r>
+          </w:p>
+        </w:tc>
+        <w:tc>
+          <w:tcPr>
+            <w:tcW w:w="2000" w:type="dxa"/>
+          </w:tcPr>
+          <w:p>
+            <w:pPr/>
+            <w:r>
+              <w:t xml:space="preserve">decimal</w:t>
+            </w:r>
+          </w:p>
+        </w:tc>
+        <w:tc>
+          <w:tcPr>
+            <w:tcW w:w="2000" w:type="dxa"/>
+          </w:tcPr>
+          <w:p>
+            <w:pPr/>
+            <w:r>
+              <w:t xml:space="preserve">(19,6)</w:t>
+            </w:r>
+          </w:p>
+        </w:tc>
+        <w:tc>
+          <w:tcPr>
+            <w:tcW w:w="2000" w:type="dxa"/>
+          </w:tcPr>
+          <w:p>
+            <w:pPr/>
+            <w:r>
+              <w:t xml:space="preserve">IS NULL</w:t>
+            </w:r>
+          </w:p>
+        </w:tc>
+      </w:tr>
+      <w:tr>
+        <w:trPr>
+          <w:trHeight w:val="530" w:hRule="atLeast"/>
+        </w:trPr>
+        <w:tc>
+          <w:tcPr>
+            <w:tcW w:w="2000" w:type="dxa"/>
+          </w:tcPr>
+          <w:p>
+            <w:pPr/>
+            <w:r>
+              <w:t xml:space="preserve">business_date</w:t>
+            </w:r>
+          </w:p>
+        </w:tc>
+        <w:tc>
+          <w:tcPr>
+            <w:tcW w:w="2000" w:type="dxa"/>
+          </w:tcPr>
+          <w:p>
+            <w:pPr/>
+            <w:r>
+              <w:t xml:space="preserve">date</w:t>
+            </w:r>
+          </w:p>
+        </w:tc>
+        <w:tc>
+          <w:tcPr>
+            <w:tcW w:w="2000" w:type="dxa"/>
+          </w:tcPr>
+          <w:p>
+            <w:pPr/>
+            <w:r>
+              <w:t xml:space="preserve">-</w:t>
+            </w:r>
+          </w:p>
+        </w:tc>
+        <w:tc>
+          <w:tcPr>
+            <w:tcW w:w="2000" w:type="dxa"/>
+          </w:tcPr>
+          <w:p>
+            <w:pPr/>
+            <w:r>
+              <w:t xml:space="preserve">NOT NULL</w:t>
+            </w:r>
+          </w:p>
+        </w:tc>
+      </w:tr>
+      <w:tr>
+        <w:trPr>
+          <w:trHeight w:val="530" w:hRule="atLeast"/>
+        </w:trPr>
+        <w:tc>
+          <w:tcPr>
+            <w:tcW w:w="2000" w:type="dxa"/>
+          </w:tcPr>
+          <w:p>
+            <w:pPr/>
+            <w:r>
+              <w:t xml:space="preserve">posted_at</w:t>
+            </w:r>
+          </w:p>
+        </w:tc>
+        <w:tc>
+          <w:tcPr>
+            <w:tcW w:w="2000" w:type="dxa"/>
+          </w:tcPr>
+          <w:p>
+            <w:pPr/>
+            <w:r>
+              <w:t xml:space="preserve">datetime2</w:t>
+            </w:r>
+          </w:p>
+        </w:tc>
+        <w:tc>
+          <w:tcPr>
+            <w:tcW w:w="2000" w:type="dxa"/>
+          </w:tcPr>
+          <w:p>
+            <w:pPr/>
+            <w:r>
+              <w:t xml:space="preserve">(6)</w:t>
+            </w:r>
+          </w:p>
+        </w:tc>
+        <w:tc>
+          <w:tcPr>
+            <w:tcW w:w="2000" w:type="dxa"/>
+          </w:tcPr>
+          <w:p>
+            <w:pPr/>
+            <w:r>
+              <w:t xml:space="preserve">NOT NULL</w:t>
+            </w:r>
+          </w:p>
+        </w:tc>
+      </w:tr>
+      <w:tr>
+        <w:trPr>
+          <w:trHeight w:val="530" w:hRule="atLeast"/>
+        </w:trPr>
+        <w:tc>
+          <w:tcPr>
+            <w:tcW w:w="2000" w:type="dxa"/>
+          </w:tcPr>
+          <w:p>
+            <w:pPr/>
+            <w:r>
+              <w:t xml:space="preserve">company_id</w:t>
+            </w:r>
+          </w:p>
+        </w:tc>
+        <w:tc>
+          <w:tcPr>
+            <w:tcW w:w="2000" w:type="dxa"/>
+          </w:tcPr>
+          <w:p>
+            <w:pPr/>
+            <w:r>
+              <w:t xml:space="preserve">bigint</w:t>
+            </w:r>
+          </w:p>
+        </w:tc>
+        <w:tc>
+          <w:tcPr>
+            <w:tcW w:w="2000" w:type="dxa"/>
+          </w:tcPr>
+          <w:p>
+            <w:pPr/>
+            <w:r>
+              <w:t xml:space="preserve">-</w:t>
+            </w:r>
+          </w:p>
+        </w:tc>
+        <w:tc>
+          <w:tcPr>
+            <w:tcW w:w="2000" w:type="dxa"/>
+          </w:tcPr>
+          <w:p>
+            <w:pPr/>
+            <w:r>
+              <w:t xml:space="preserve">FK, NOT NULL</w:t>
             </w:r>
           </w:p>
         </w:tc>
@@ -41111,7 +42158,7 @@
       </w:r>
     </w:p>
     <w:sectPr>
-      <w:footerReference xmlns:r="http://schemas.openxmlformats.org/officeDocument/2006/relationships" w:type="default" r:id="Re9ad4cc27e5a4faa"/>
+      <w:footerReference xmlns:r="http://schemas.openxmlformats.org/officeDocument/2006/relationships" w:type="default" r:id="R47774cab5ce64435"/>
       <w:pgSz w:w="11906" w:h="16838"/>
       <w:pgMar w:top="1440" w:right="1440" w:bottom="1440" w:left="1440" w:header="720" w:footer="720" w:gutter="0"/>
     </w:sectPr>

</xml_diff>

<commit_message>
feat(inv): add other receipt backend with approval-driven posting
WU-INV-004a: inv_other_receipt/line migration, draft CRUD with in-transaction
numbering, SYS submit and approval result handler that post OTHER_RECEIPT
stock movements in the same transaction, /api/v1/inv/other-receipts API,
24 SQL/API integration tests (INV-REC-001..005), ADR-055 and docs.

Co-Authored-By: Claude Opus 5.5 <noreply@anthropic.com>
</commit_message>
<xml_diff>
--- a/docs/99-output/MyERP_SDS.docx
+++ b/docs/99-output/MyERP_SDS.docx
@@ -613,6 +613,1708 @@
     <w:p>
       <w:pPr/>
       <w:r>
+        <w:t xml:space="preserve">Table Name: inv_other_receipt</w:t>
+      </w:r>
+    </w:p>
+    <w:p>
+      <w:pPr/>
+      <w:r>
+        <w:t xml:space="preserve">Primary Key: id</w:t>
+      </w:r>
+    </w:p>
+    <w:p>
+      <w:pPr/>
+      <w:r>
+        <w:t xml:space="preserve">This table stores company-scoped other receipt headers, document numbers and approval state.</w:t>
+      </w:r>
+    </w:p>
+    <w:tbl>
+      <w:tblPr>
+        <w:tblStyle w:val="TableGrid"/>
+        <w:tblW w:w="8000" w:type="dxa"/>
+        <w:jc w:val="left"/>
+        <w:tblBorders>
+          <w:top w:val="single" w:color="000000" w:sz="4" w:space="0"/>
+          <w:left w:val="single" w:color="000000" w:sz="4" w:space="0"/>
+          <w:bottom w:val="single" w:color="000000" w:sz="4" w:space="0"/>
+          <w:right w:val="single" w:color="000000" w:sz="4" w:space="0"/>
+          <w:insideH w:val="single" w:color="000000" w:sz="4" w:space="0"/>
+          <w:insideV w:val="single" w:color="000000" w:sz="4" w:space="0"/>
+        </w:tblBorders>
+        <w:tblLayout w:type="fixed"/>
+        <w:tblCellMar>
+          <w:top w:w="100" w:type="dxa"/>
+          <w:left w:w="100" w:type="dxa"/>
+          <w:bottom w:w="100" w:type="dxa"/>
+          <w:right w:w="100" w:type="dxa"/>
+        </w:tblCellMar>
+      </w:tblPr>
+      <w:tblGrid>
+        <w:gridCol w:w="2000"/>
+        <w:gridCol w:w="2000"/>
+        <w:gridCol w:w="2000"/>
+        <w:gridCol w:w="2000"/>
+      </w:tblGrid>
+      <w:tr>
+        <w:trPr>
+          <w:trHeight w:val="530" w:hRule="atLeast"/>
+        </w:trPr>
+        <w:tc>
+          <w:tcPr>
+            <w:tcW w:w="2000" w:type="dxa"/>
+          </w:tcPr>
+          <w:p>
+            <w:pPr>
+              <w:jc w:val="center"/>
+            </w:pPr>
+            <w:r>
+              <w:rPr>
+                <w:b/>
+              </w:rPr>
+              <w:t xml:space="preserve">Name of Attribute</w:t>
+            </w:r>
+          </w:p>
+        </w:tc>
+        <w:tc>
+          <w:tcPr>
+            <w:tcW w:w="2000" w:type="dxa"/>
+          </w:tcPr>
+          <w:p>
+            <w:pPr>
+              <w:jc w:val="center"/>
+            </w:pPr>
+            <w:r>
+              <w:rPr>
+                <w:b/>
+              </w:rPr>
+              <w:t xml:space="preserve">Data Type</w:t>
+            </w:r>
+          </w:p>
+        </w:tc>
+        <w:tc>
+          <w:tcPr>
+            <w:tcW w:w="2000" w:type="dxa"/>
+          </w:tcPr>
+          <w:p>
+            <w:pPr>
+              <w:jc w:val="center"/>
+            </w:pPr>
+            <w:r>
+              <w:rPr>
+                <w:b/>
+              </w:rPr>
+              <w:t xml:space="preserve">Size</w:t>
+            </w:r>
+          </w:p>
+        </w:tc>
+        <w:tc>
+          <w:tcPr>
+            <w:tcW w:w="2000" w:type="dxa"/>
+          </w:tcPr>
+          <w:p>
+            <w:pPr>
+              <w:jc w:val="center"/>
+            </w:pPr>
+            <w:r>
+              <w:rPr>
+                <w:b/>
+              </w:rPr>
+              <w:t xml:space="preserve">PK/FK/IS NULL/ NOT NULL</w:t>
+            </w:r>
+          </w:p>
+        </w:tc>
+      </w:tr>
+      <w:tr>
+        <w:trPr>
+          <w:trHeight w:val="530" w:hRule="atLeast"/>
+        </w:trPr>
+        <w:tc>
+          <w:tcPr>
+            <w:tcW w:w="2000" w:type="dxa"/>
+          </w:tcPr>
+          <w:p>
+            <w:pPr/>
+            <w:r>
+              <w:t xml:space="preserve">id</w:t>
+            </w:r>
+          </w:p>
+        </w:tc>
+        <w:tc>
+          <w:tcPr>
+            <w:tcW w:w="2000" w:type="dxa"/>
+          </w:tcPr>
+          <w:p>
+            <w:pPr/>
+            <w:r>
+              <w:t xml:space="preserve">bigint</w:t>
+            </w:r>
+          </w:p>
+        </w:tc>
+        <w:tc>
+          <w:tcPr>
+            <w:tcW w:w="2000" w:type="dxa"/>
+          </w:tcPr>
+          <w:p>
+            <w:pPr/>
+            <w:r>
+              <w:t xml:space="preserve">-</w:t>
+            </w:r>
+          </w:p>
+        </w:tc>
+        <w:tc>
+          <w:tcPr>
+            <w:tcW w:w="2000" w:type="dxa"/>
+          </w:tcPr>
+          <w:p>
+            <w:pPr/>
+            <w:r>
+              <w:t xml:space="preserve">PK, NOT NULL</w:t>
+            </w:r>
+          </w:p>
+        </w:tc>
+      </w:tr>
+      <w:tr>
+        <w:trPr>
+          <w:trHeight w:val="530" w:hRule="atLeast"/>
+        </w:trPr>
+        <w:tc>
+          <w:tcPr>
+            <w:tcW w:w="2000" w:type="dxa"/>
+          </w:tcPr>
+          <w:p>
+            <w:pPr/>
+            <w:r>
+              <w:t xml:space="preserve">document_no</w:t>
+            </w:r>
+          </w:p>
+        </w:tc>
+        <w:tc>
+          <w:tcPr>
+            <w:tcW w:w="2000" w:type="dxa"/>
+          </w:tcPr>
+          <w:p>
+            <w:pPr/>
+            <w:r>
+              <w:t xml:space="preserve">varchar</w:t>
+            </w:r>
+          </w:p>
+        </w:tc>
+        <w:tc>
+          <w:tcPr>
+            <w:tcW w:w="2000" w:type="dxa"/>
+          </w:tcPr>
+          <w:p>
+            <w:pPr/>
+            <w:r>
+              <w:t xml:space="preserve">30</w:t>
+            </w:r>
+          </w:p>
+        </w:tc>
+        <w:tc>
+          <w:tcPr>
+            <w:tcW w:w="2000" w:type="dxa"/>
+          </w:tcPr>
+          <w:p>
+            <w:pPr/>
+            <w:r>
+              <w:t xml:space="preserve">NOT NULL</w:t>
+            </w:r>
+          </w:p>
+        </w:tc>
+      </w:tr>
+      <w:tr>
+        <w:trPr>
+          <w:trHeight w:val="530" w:hRule="atLeast"/>
+        </w:trPr>
+        <w:tc>
+          <w:tcPr>
+            <w:tcW w:w="2000" w:type="dxa"/>
+          </w:tcPr>
+          <w:p>
+            <w:pPr/>
+            <w:r>
+              <w:t xml:space="preserve">business_date</w:t>
+            </w:r>
+          </w:p>
+        </w:tc>
+        <w:tc>
+          <w:tcPr>
+            <w:tcW w:w="2000" w:type="dxa"/>
+          </w:tcPr>
+          <w:p>
+            <w:pPr/>
+            <w:r>
+              <w:t xml:space="preserve">date</w:t>
+            </w:r>
+          </w:p>
+        </w:tc>
+        <w:tc>
+          <w:tcPr>
+            <w:tcW w:w="2000" w:type="dxa"/>
+          </w:tcPr>
+          <w:p>
+            <w:pPr/>
+            <w:r>
+              <w:t xml:space="preserve">-</w:t>
+            </w:r>
+          </w:p>
+        </w:tc>
+        <w:tc>
+          <w:tcPr>
+            <w:tcW w:w="2000" w:type="dxa"/>
+          </w:tcPr>
+          <w:p>
+            <w:pPr/>
+            <w:r>
+              <w:t xml:space="preserve">NOT NULL</w:t>
+            </w:r>
+          </w:p>
+        </w:tc>
+      </w:tr>
+      <w:tr>
+        <w:trPr>
+          <w:trHeight w:val="530" w:hRule="atLeast"/>
+        </w:trPr>
+        <w:tc>
+          <w:tcPr>
+            <w:tcW w:w="2000" w:type="dxa"/>
+          </w:tcPr>
+          <w:p>
+            <w:pPr/>
+            <w:r>
+              <w:t xml:space="preserve">status</w:t>
+            </w:r>
+          </w:p>
+        </w:tc>
+        <w:tc>
+          <w:tcPr>
+            <w:tcW w:w="2000" w:type="dxa"/>
+          </w:tcPr>
+          <w:p>
+            <w:pPr/>
+            <w:r>
+              <w:t xml:space="preserve">varchar</w:t>
+            </w:r>
+          </w:p>
+        </w:tc>
+        <w:tc>
+          <w:tcPr>
+            <w:tcW w:w="2000" w:type="dxa"/>
+          </w:tcPr>
+          <w:p>
+            <w:pPr/>
+            <w:r>
+              <w:t xml:space="preserve">30</w:t>
+            </w:r>
+          </w:p>
+        </w:tc>
+        <w:tc>
+          <w:tcPr>
+            <w:tcW w:w="2000" w:type="dxa"/>
+          </w:tcPr>
+          <w:p>
+            <w:pPr/>
+            <w:r>
+              <w:t xml:space="preserve">NOT NULL</w:t>
+            </w:r>
+          </w:p>
+        </w:tc>
+      </w:tr>
+      <w:tr>
+        <w:trPr>
+          <w:trHeight w:val="530" w:hRule="atLeast"/>
+        </w:trPr>
+        <w:tc>
+          <w:tcPr>
+            <w:tcW w:w="2000" w:type="dxa"/>
+          </w:tcPr>
+          <w:p>
+            <w:pPr/>
+            <w:r>
+              <w:t xml:space="preserve">remark</w:t>
+            </w:r>
+          </w:p>
+        </w:tc>
+        <w:tc>
+          <w:tcPr>
+            <w:tcW w:w="2000" w:type="dxa"/>
+          </w:tcPr>
+          <w:p>
+            <w:pPr/>
+            <w:r>
+              <w:t xml:space="preserve">nvarchar</w:t>
+            </w:r>
+          </w:p>
+        </w:tc>
+        <w:tc>
+          <w:tcPr>
+            <w:tcW w:w="2000" w:type="dxa"/>
+          </w:tcPr>
+          <w:p>
+            <w:pPr/>
+            <w:r>
+              <w:t xml:space="preserve">500</w:t>
+            </w:r>
+          </w:p>
+        </w:tc>
+        <w:tc>
+          <w:tcPr>
+            <w:tcW w:w="2000" w:type="dxa"/>
+          </w:tcPr>
+          <w:p>
+            <w:pPr/>
+            <w:r>
+              <w:t xml:space="preserve">IS NULL</w:t>
+            </w:r>
+          </w:p>
+        </w:tc>
+      </w:tr>
+      <w:tr>
+        <w:trPr>
+          <w:trHeight w:val="530" w:hRule="atLeast"/>
+        </w:trPr>
+        <w:tc>
+          <w:tcPr>
+            <w:tcW w:w="2000" w:type="dxa"/>
+          </w:tcPr>
+          <w:p>
+            <w:pPr/>
+            <w:r>
+              <w:t xml:space="preserve">custom_fields</w:t>
+            </w:r>
+          </w:p>
+        </w:tc>
+        <w:tc>
+          <w:tcPr>
+            <w:tcW w:w="2000" w:type="dxa"/>
+          </w:tcPr>
+          <w:p>
+            <w:pPr/>
+            <w:r>
+              <w:t xml:space="preserve">nvarchar</w:t>
+            </w:r>
+          </w:p>
+        </w:tc>
+        <w:tc>
+          <w:tcPr>
+            <w:tcW w:w="2000" w:type="dxa"/>
+          </w:tcPr>
+          <w:p>
+            <w:pPr/>
+            <w:r>
+              <w:t xml:space="preserve">MAX</w:t>
+            </w:r>
+          </w:p>
+        </w:tc>
+        <w:tc>
+          <w:tcPr>
+            <w:tcW w:w="2000" w:type="dxa"/>
+          </w:tcPr>
+          <w:p>
+            <w:pPr/>
+            <w:r>
+              <w:t xml:space="preserve">IS NULL</w:t>
+            </w:r>
+          </w:p>
+        </w:tc>
+      </w:tr>
+      <w:tr>
+        <w:trPr>
+          <w:trHeight w:val="530" w:hRule="atLeast"/>
+        </w:trPr>
+        <w:tc>
+          <w:tcPr>
+            <w:tcW w:w="2000" w:type="dxa"/>
+          </w:tcPr>
+          <w:p>
+            <w:pPr/>
+            <w:r>
+              <w:t xml:space="preserve">posted_at</w:t>
+            </w:r>
+          </w:p>
+        </w:tc>
+        <w:tc>
+          <w:tcPr>
+            <w:tcW w:w="2000" w:type="dxa"/>
+          </w:tcPr>
+          <w:p>
+            <w:pPr/>
+            <w:r>
+              <w:t xml:space="preserve">datetime2</w:t>
+            </w:r>
+          </w:p>
+        </w:tc>
+        <w:tc>
+          <w:tcPr>
+            <w:tcW w:w="2000" w:type="dxa"/>
+          </w:tcPr>
+          <w:p>
+            <w:pPr/>
+            <w:r>
+              <w:t xml:space="preserve">(6)</w:t>
+            </w:r>
+          </w:p>
+        </w:tc>
+        <w:tc>
+          <w:tcPr>
+            <w:tcW w:w="2000" w:type="dxa"/>
+          </w:tcPr>
+          <w:p>
+            <w:pPr/>
+            <w:r>
+              <w:t xml:space="preserve">IS NULL</w:t>
+            </w:r>
+          </w:p>
+        </w:tc>
+      </w:tr>
+      <w:tr>
+        <w:trPr>
+          <w:trHeight w:val="530" w:hRule="atLeast"/>
+        </w:trPr>
+        <w:tc>
+          <w:tcPr>
+            <w:tcW w:w="2000" w:type="dxa"/>
+          </w:tcPr>
+          <w:p>
+            <w:pPr/>
+            <w:r>
+              <w:t xml:space="preserve">is_deleted</w:t>
+            </w:r>
+          </w:p>
+        </w:tc>
+        <w:tc>
+          <w:tcPr>
+            <w:tcW w:w="2000" w:type="dxa"/>
+          </w:tcPr>
+          <w:p>
+            <w:pPr/>
+            <w:r>
+              <w:t xml:space="preserve">bit</w:t>
+            </w:r>
+          </w:p>
+        </w:tc>
+        <w:tc>
+          <w:tcPr>
+            <w:tcW w:w="2000" w:type="dxa"/>
+          </w:tcPr>
+          <w:p>
+            <w:pPr/>
+            <w:r>
+              <w:t xml:space="preserve">-</w:t>
+            </w:r>
+          </w:p>
+        </w:tc>
+        <w:tc>
+          <w:tcPr>
+            <w:tcW w:w="2000" w:type="dxa"/>
+          </w:tcPr>
+          <w:p>
+            <w:pPr/>
+            <w:r>
+              <w:t xml:space="preserve">NOT NULL</w:t>
+            </w:r>
+          </w:p>
+        </w:tc>
+      </w:tr>
+      <w:tr>
+        <w:trPr>
+          <w:trHeight w:val="530" w:hRule="atLeast"/>
+        </w:trPr>
+        <w:tc>
+          <w:tcPr>
+            <w:tcW w:w="2000" w:type="dxa"/>
+          </w:tcPr>
+          <w:p>
+            <w:pPr/>
+            <w:r>
+              <w:t xml:space="preserve">deleted_at</w:t>
+            </w:r>
+          </w:p>
+        </w:tc>
+        <w:tc>
+          <w:tcPr>
+            <w:tcW w:w="2000" w:type="dxa"/>
+          </w:tcPr>
+          <w:p>
+            <w:pPr/>
+            <w:r>
+              <w:t xml:space="preserve">datetime2</w:t>
+            </w:r>
+          </w:p>
+        </w:tc>
+        <w:tc>
+          <w:tcPr>
+            <w:tcW w:w="2000" w:type="dxa"/>
+          </w:tcPr>
+          <w:p>
+            <w:pPr/>
+            <w:r>
+              <w:t xml:space="preserve">(6)</w:t>
+            </w:r>
+          </w:p>
+        </w:tc>
+        <w:tc>
+          <w:tcPr>
+            <w:tcW w:w="2000" w:type="dxa"/>
+          </w:tcPr>
+          <w:p>
+            <w:pPr/>
+            <w:r>
+              <w:t xml:space="preserve">IS NULL</w:t>
+            </w:r>
+          </w:p>
+        </w:tc>
+      </w:tr>
+      <w:tr>
+        <w:trPr>
+          <w:trHeight w:val="530" w:hRule="atLeast"/>
+        </w:trPr>
+        <w:tc>
+          <w:tcPr>
+            <w:tcW w:w="2000" w:type="dxa"/>
+          </w:tcPr>
+          <w:p>
+            <w:pPr/>
+            <w:r>
+              <w:t xml:space="preserve">company_id</w:t>
+            </w:r>
+          </w:p>
+        </w:tc>
+        <w:tc>
+          <w:tcPr>
+            <w:tcW w:w="2000" w:type="dxa"/>
+          </w:tcPr>
+          <w:p>
+            <w:pPr/>
+            <w:r>
+              <w:t xml:space="preserve">bigint</w:t>
+            </w:r>
+          </w:p>
+        </w:tc>
+        <w:tc>
+          <w:tcPr>
+            <w:tcW w:w="2000" w:type="dxa"/>
+          </w:tcPr>
+          <w:p>
+            <w:pPr/>
+            <w:r>
+              <w:t xml:space="preserve">-</w:t>
+            </w:r>
+          </w:p>
+        </w:tc>
+        <w:tc>
+          <w:tcPr>
+            <w:tcW w:w="2000" w:type="dxa"/>
+          </w:tcPr>
+          <w:p>
+            <w:pPr/>
+            <w:r>
+              <w:t xml:space="preserve">NOT NULL</w:t>
+            </w:r>
+          </w:p>
+        </w:tc>
+      </w:tr>
+      <w:tr>
+        <w:trPr>
+          <w:trHeight w:val="530" w:hRule="atLeast"/>
+        </w:trPr>
+        <w:tc>
+          <w:tcPr>
+            <w:tcW w:w="2000" w:type="dxa"/>
+          </w:tcPr>
+          <w:p>
+            <w:pPr/>
+            <w:r>
+              <w:t xml:space="preserve">created_at</w:t>
+            </w:r>
+          </w:p>
+        </w:tc>
+        <w:tc>
+          <w:tcPr>
+            <w:tcW w:w="2000" w:type="dxa"/>
+          </w:tcPr>
+          <w:p>
+            <w:pPr/>
+            <w:r>
+              <w:t xml:space="preserve">datetime2</w:t>
+            </w:r>
+          </w:p>
+        </w:tc>
+        <w:tc>
+          <w:tcPr>
+            <w:tcW w:w="2000" w:type="dxa"/>
+          </w:tcPr>
+          <w:p>
+            <w:pPr/>
+            <w:r>
+              <w:t xml:space="preserve">(6)</w:t>
+            </w:r>
+          </w:p>
+        </w:tc>
+        <w:tc>
+          <w:tcPr>
+            <w:tcW w:w="2000" w:type="dxa"/>
+          </w:tcPr>
+          <w:p>
+            <w:pPr/>
+            <w:r>
+              <w:t xml:space="preserve">NOT NULL</w:t>
+            </w:r>
+          </w:p>
+        </w:tc>
+      </w:tr>
+      <w:tr>
+        <w:trPr>
+          <w:trHeight w:val="530" w:hRule="atLeast"/>
+        </w:trPr>
+        <w:tc>
+          <w:tcPr>
+            <w:tcW w:w="2000" w:type="dxa"/>
+          </w:tcPr>
+          <w:p>
+            <w:pPr/>
+            <w:r>
+              <w:t xml:space="preserve">created_by</w:t>
+            </w:r>
+          </w:p>
+        </w:tc>
+        <w:tc>
+          <w:tcPr>
+            <w:tcW w:w="2000" w:type="dxa"/>
+          </w:tcPr>
+          <w:p>
+            <w:pPr/>
+            <w:r>
+              <w:t xml:space="preserve">bigint</w:t>
+            </w:r>
+          </w:p>
+        </w:tc>
+        <w:tc>
+          <w:tcPr>
+            <w:tcW w:w="2000" w:type="dxa"/>
+          </w:tcPr>
+          <w:p>
+            <w:pPr/>
+            <w:r>
+              <w:t xml:space="preserve">-</w:t>
+            </w:r>
+          </w:p>
+        </w:tc>
+        <w:tc>
+          <w:tcPr>
+            <w:tcW w:w="2000" w:type="dxa"/>
+          </w:tcPr>
+          <w:p>
+            <w:pPr/>
+            <w:r>
+              <w:t xml:space="preserve">NOT NULL</w:t>
+            </w:r>
+          </w:p>
+        </w:tc>
+      </w:tr>
+      <w:tr>
+        <w:trPr>
+          <w:trHeight w:val="530" w:hRule="atLeast"/>
+        </w:trPr>
+        <w:tc>
+          <w:tcPr>
+            <w:tcW w:w="2000" w:type="dxa"/>
+          </w:tcPr>
+          <w:p>
+            <w:pPr/>
+            <w:r>
+              <w:t xml:space="preserve">updated_at</w:t>
+            </w:r>
+          </w:p>
+        </w:tc>
+        <w:tc>
+          <w:tcPr>
+            <w:tcW w:w="2000" w:type="dxa"/>
+          </w:tcPr>
+          <w:p>
+            <w:pPr/>
+            <w:r>
+              <w:t xml:space="preserve">datetime2</w:t>
+            </w:r>
+          </w:p>
+        </w:tc>
+        <w:tc>
+          <w:tcPr>
+            <w:tcW w:w="2000" w:type="dxa"/>
+          </w:tcPr>
+          <w:p>
+            <w:pPr/>
+            <w:r>
+              <w:t xml:space="preserve">(6)</w:t>
+            </w:r>
+          </w:p>
+        </w:tc>
+        <w:tc>
+          <w:tcPr>
+            <w:tcW w:w="2000" w:type="dxa"/>
+          </w:tcPr>
+          <w:p>
+            <w:pPr/>
+            <w:r>
+              <w:t xml:space="preserve">IS NULL</w:t>
+            </w:r>
+          </w:p>
+        </w:tc>
+      </w:tr>
+      <w:tr>
+        <w:trPr>
+          <w:trHeight w:val="530" w:hRule="atLeast"/>
+        </w:trPr>
+        <w:tc>
+          <w:tcPr>
+            <w:tcW w:w="2000" w:type="dxa"/>
+          </w:tcPr>
+          <w:p>
+            <w:pPr/>
+            <w:r>
+              <w:t xml:space="preserve">updated_by</w:t>
+            </w:r>
+          </w:p>
+        </w:tc>
+        <w:tc>
+          <w:tcPr>
+            <w:tcW w:w="2000" w:type="dxa"/>
+          </w:tcPr>
+          <w:p>
+            <w:pPr/>
+            <w:r>
+              <w:t xml:space="preserve">bigint</w:t>
+            </w:r>
+          </w:p>
+        </w:tc>
+        <w:tc>
+          <w:tcPr>
+            <w:tcW w:w="2000" w:type="dxa"/>
+          </w:tcPr>
+          <w:p>
+            <w:pPr/>
+            <w:r>
+              <w:t xml:space="preserve">-</w:t>
+            </w:r>
+          </w:p>
+        </w:tc>
+        <w:tc>
+          <w:tcPr>
+            <w:tcW w:w="2000" w:type="dxa"/>
+          </w:tcPr>
+          <w:p>
+            <w:pPr/>
+            <w:r>
+              <w:t xml:space="preserve">IS NULL</w:t>
+            </w:r>
+          </w:p>
+        </w:tc>
+      </w:tr>
+      <w:tr>
+        <w:trPr>
+          <w:trHeight w:val="530" w:hRule="atLeast"/>
+        </w:trPr>
+        <w:tc>
+          <w:tcPr>
+            <w:tcW w:w="2000" w:type="dxa"/>
+          </w:tcPr>
+          <w:p>
+            <w:pPr/>
+            <w:r>
+              <w:t xml:space="preserve">version</w:t>
+            </w:r>
+          </w:p>
+        </w:tc>
+        <w:tc>
+          <w:tcPr>
+            <w:tcW w:w="2000" w:type="dxa"/>
+          </w:tcPr>
+          <w:p>
+            <w:pPr/>
+            <w:r>
+              <w:t xml:space="preserve">int</w:t>
+            </w:r>
+          </w:p>
+        </w:tc>
+        <w:tc>
+          <w:tcPr>
+            <w:tcW w:w="2000" w:type="dxa"/>
+          </w:tcPr>
+          <w:p>
+            <w:pPr/>
+            <w:r>
+              <w:t xml:space="preserve">-</w:t>
+            </w:r>
+          </w:p>
+        </w:tc>
+        <w:tc>
+          <w:tcPr>
+            <w:tcW w:w="2000" w:type="dxa"/>
+          </w:tcPr>
+          <w:p>
+            <w:pPr/>
+            <w:r>
+              <w:t xml:space="preserve">NOT NULL</w:t>
+            </w:r>
+          </w:p>
+        </w:tc>
+      </w:tr>
+    </w:tbl>
+    <w:p/>
+    <w:p>
+      <w:pPr/>
+      <w:r>
+        <w:t xml:space="preserve">Table Name: inv_other_receipt_line</w:t>
+      </w:r>
+    </w:p>
+    <w:p>
+      <w:pPr/>
+      <w:r>
+        <w:t xml:space="preserve">Primary Key: id</w:t>
+      </w:r>
+    </w:p>
+    <w:p>
+      <w:pPr/>
+      <w:r>
+        <w:t xml:space="preserve">This table stores the ordered item, warehouse, optional location, quantity and cost snapshot of each other receipt.</w:t>
+      </w:r>
+    </w:p>
+    <w:tbl>
+      <w:tblPr>
+        <w:tblStyle w:val="TableGrid"/>
+        <w:tblW w:w="8000" w:type="dxa"/>
+        <w:jc w:val="left"/>
+        <w:tblBorders>
+          <w:top w:val="single" w:color="000000" w:sz="4" w:space="0"/>
+          <w:left w:val="single" w:color="000000" w:sz="4" w:space="0"/>
+          <w:bottom w:val="single" w:color="000000" w:sz="4" w:space="0"/>
+          <w:right w:val="single" w:color="000000" w:sz="4" w:space="0"/>
+          <w:insideH w:val="single" w:color="000000" w:sz="4" w:space="0"/>
+          <w:insideV w:val="single" w:color="000000" w:sz="4" w:space="0"/>
+        </w:tblBorders>
+        <w:tblLayout w:type="fixed"/>
+        <w:tblCellMar>
+          <w:top w:w="100" w:type="dxa"/>
+          <w:left w:w="100" w:type="dxa"/>
+          <w:bottom w:w="100" w:type="dxa"/>
+          <w:right w:w="100" w:type="dxa"/>
+        </w:tblCellMar>
+      </w:tblPr>
+      <w:tblGrid>
+        <w:gridCol w:w="2000"/>
+        <w:gridCol w:w="2000"/>
+        <w:gridCol w:w="2000"/>
+        <w:gridCol w:w="2000"/>
+      </w:tblGrid>
+      <w:tr>
+        <w:trPr>
+          <w:trHeight w:val="530" w:hRule="atLeast"/>
+        </w:trPr>
+        <w:tc>
+          <w:tcPr>
+            <w:tcW w:w="2000" w:type="dxa"/>
+          </w:tcPr>
+          <w:p>
+            <w:pPr>
+              <w:jc w:val="center"/>
+            </w:pPr>
+            <w:r>
+              <w:rPr>
+                <w:b/>
+              </w:rPr>
+              <w:t xml:space="preserve">Name of Attribute</w:t>
+            </w:r>
+          </w:p>
+        </w:tc>
+        <w:tc>
+          <w:tcPr>
+            <w:tcW w:w="2000" w:type="dxa"/>
+          </w:tcPr>
+          <w:p>
+            <w:pPr>
+              <w:jc w:val="center"/>
+            </w:pPr>
+            <w:r>
+              <w:rPr>
+                <w:b/>
+              </w:rPr>
+              <w:t xml:space="preserve">Data Type</w:t>
+            </w:r>
+          </w:p>
+        </w:tc>
+        <w:tc>
+          <w:tcPr>
+            <w:tcW w:w="2000" w:type="dxa"/>
+          </w:tcPr>
+          <w:p>
+            <w:pPr>
+              <w:jc w:val="center"/>
+            </w:pPr>
+            <w:r>
+              <w:rPr>
+                <w:b/>
+              </w:rPr>
+              <w:t xml:space="preserve">Size</w:t>
+            </w:r>
+          </w:p>
+        </w:tc>
+        <w:tc>
+          <w:tcPr>
+            <w:tcW w:w="2000" w:type="dxa"/>
+          </w:tcPr>
+          <w:p>
+            <w:pPr>
+              <w:jc w:val="center"/>
+            </w:pPr>
+            <w:r>
+              <w:rPr>
+                <w:b/>
+              </w:rPr>
+              <w:t xml:space="preserve">PK/FK/IS NULL/ NOT NULL</w:t>
+            </w:r>
+          </w:p>
+        </w:tc>
+      </w:tr>
+      <w:tr>
+        <w:trPr>
+          <w:trHeight w:val="530" w:hRule="atLeast"/>
+        </w:trPr>
+        <w:tc>
+          <w:tcPr>
+            <w:tcW w:w="2000" w:type="dxa"/>
+          </w:tcPr>
+          <w:p>
+            <w:pPr/>
+            <w:r>
+              <w:t xml:space="preserve">id</w:t>
+            </w:r>
+          </w:p>
+        </w:tc>
+        <w:tc>
+          <w:tcPr>
+            <w:tcW w:w="2000" w:type="dxa"/>
+          </w:tcPr>
+          <w:p>
+            <w:pPr/>
+            <w:r>
+              <w:t xml:space="preserve">bigint</w:t>
+            </w:r>
+          </w:p>
+        </w:tc>
+        <w:tc>
+          <w:tcPr>
+            <w:tcW w:w="2000" w:type="dxa"/>
+          </w:tcPr>
+          <w:p>
+            <w:pPr/>
+            <w:r>
+              <w:t xml:space="preserve">-</w:t>
+            </w:r>
+          </w:p>
+        </w:tc>
+        <w:tc>
+          <w:tcPr>
+            <w:tcW w:w="2000" w:type="dxa"/>
+          </w:tcPr>
+          <w:p>
+            <w:pPr/>
+            <w:r>
+              <w:t xml:space="preserve">PK, NOT NULL</w:t>
+            </w:r>
+          </w:p>
+        </w:tc>
+      </w:tr>
+      <w:tr>
+        <w:trPr>
+          <w:trHeight w:val="530" w:hRule="atLeast"/>
+        </w:trPr>
+        <w:tc>
+          <w:tcPr>
+            <w:tcW w:w="2000" w:type="dxa"/>
+          </w:tcPr>
+          <w:p>
+            <w:pPr/>
+            <w:r>
+              <w:t xml:space="preserve">receipt_id</w:t>
+            </w:r>
+          </w:p>
+        </w:tc>
+        <w:tc>
+          <w:tcPr>
+            <w:tcW w:w="2000" w:type="dxa"/>
+          </w:tcPr>
+          <w:p>
+            <w:pPr/>
+            <w:r>
+              <w:t xml:space="preserve">bigint</w:t>
+            </w:r>
+          </w:p>
+        </w:tc>
+        <w:tc>
+          <w:tcPr>
+            <w:tcW w:w="2000" w:type="dxa"/>
+          </w:tcPr>
+          <w:p>
+            <w:pPr/>
+            <w:r>
+              <w:t xml:space="preserve">-</w:t>
+            </w:r>
+          </w:p>
+        </w:tc>
+        <w:tc>
+          <w:tcPr>
+            <w:tcW w:w="2000" w:type="dxa"/>
+          </w:tcPr>
+          <w:p>
+            <w:pPr/>
+            <w:r>
+              <w:t xml:space="preserve">FK, NOT NULL</w:t>
+            </w:r>
+          </w:p>
+        </w:tc>
+      </w:tr>
+      <w:tr>
+        <w:trPr>
+          <w:trHeight w:val="530" w:hRule="atLeast"/>
+        </w:trPr>
+        <w:tc>
+          <w:tcPr>
+            <w:tcW w:w="2000" w:type="dxa"/>
+          </w:tcPr>
+          <w:p>
+            <w:pPr/>
+            <w:r>
+              <w:t xml:space="preserve">line_no</w:t>
+            </w:r>
+          </w:p>
+        </w:tc>
+        <w:tc>
+          <w:tcPr>
+            <w:tcW w:w="2000" w:type="dxa"/>
+          </w:tcPr>
+          <w:p>
+            <w:pPr/>
+            <w:r>
+              <w:t xml:space="preserve">int</w:t>
+            </w:r>
+          </w:p>
+        </w:tc>
+        <w:tc>
+          <w:tcPr>
+            <w:tcW w:w="2000" w:type="dxa"/>
+          </w:tcPr>
+          <w:p>
+            <w:pPr/>
+            <w:r>
+              <w:t xml:space="preserve">-</w:t>
+            </w:r>
+          </w:p>
+        </w:tc>
+        <w:tc>
+          <w:tcPr>
+            <w:tcW w:w="2000" w:type="dxa"/>
+          </w:tcPr>
+          <w:p>
+            <w:pPr/>
+            <w:r>
+              <w:t xml:space="preserve">NOT NULL</w:t>
+            </w:r>
+          </w:p>
+        </w:tc>
+      </w:tr>
+      <w:tr>
+        <w:trPr>
+          <w:trHeight w:val="530" w:hRule="atLeast"/>
+        </w:trPr>
+        <w:tc>
+          <w:tcPr>
+            <w:tcW w:w="2000" w:type="dxa"/>
+          </w:tcPr>
+          <w:p>
+            <w:pPr/>
+            <w:r>
+              <w:t xml:space="preserve">item_id</w:t>
+            </w:r>
+          </w:p>
+        </w:tc>
+        <w:tc>
+          <w:tcPr>
+            <w:tcW w:w="2000" w:type="dxa"/>
+          </w:tcPr>
+          <w:p>
+            <w:pPr/>
+            <w:r>
+              <w:t xml:space="preserve">bigint</w:t>
+            </w:r>
+          </w:p>
+        </w:tc>
+        <w:tc>
+          <w:tcPr>
+            <w:tcW w:w="2000" w:type="dxa"/>
+          </w:tcPr>
+          <w:p>
+            <w:pPr/>
+            <w:r>
+              <w:t xml:space="preserve">-</w:t>
+            </w:r>
+          </w:p>
+        </w:tc>
+        <w:tc>
+          <w:tcPr>
+            <w:tcW w:w="2000" w:type="dxa"/>
+          </w:tcPr>
+          <w:p>
+            <w:pPr/>
+            <w:r>
+              <w:t xml:space="preserve">NOT NULL</w:t>
+            </w:r>
+          </w:p>
+        </w:tc>
+      </w:tr>
+      <w:tr>
+        <w:trPr>
+          <w:trHeight w:val="530" w:hRule="atLeast"/>
+        </w:trPr>
+        <w:tc>
+          <w:tcPr>
+            <w:tcW w:w="2000" w:type="dxa"/>
+          </w:tcPr>
+          <w:p>
+            <w:pPr/>
+            <w:r>
+              <w:t xml:space="preserve">warehouse_id</w:t>
+            </w:r>
+          </w:p>
+        </w:tc>
+        <w:tc>
+          <w:tcPr>
+            <w:tcW w:w="2000" w:type="dxa"/>
+          </w:tcPr>
+          <w:p>
+            <w:pPr/>
+            <w:r>
+              <w:t xml:space="preserve">bigint</w:t>
+            </w:r>
+          </w:p>
+        </w:tc>
+        <w:tc>
+          <w:tcPr>
+            <w:tcW w:w="2000" w:type="dxa"/>
+          </w:tcPr>
+          <w:p>
+            <w:pPr/>
+            <w:r>
+              <w:t xml:space="preserve">-</w:t>
+            </w:r>
+          </w:p>
+        </w:tc>
+        <w:tc>
+          <w:tcPr>
+            <w:tcW w:w="2000" w:type="dxa"/>
+          </w:tcPr>
+          <w:p>
+            <w:pPr/>
+            <w:r>
+              <w:t xml:space="preserve">NOT NULL</w:t>
+            </w:r>
+          </w:p>
+        </w:tc>
+      </w:tr>
+      <w:tr>
+        <w:trPr>
+          <w:trHeight w:val="530" w:hRule="atLeast"/>
+        </w:trPr>
+        <w:tc>
+          <w:tcPr>
+            <w:tcW w:w="2000" w:type="dxa"/>
+          </w:tcPr>
+          <w:p>
+            <w:pPr/>
+            <w:r>
+              <w:t xml:space="preserve">location_id</w:t>
+            </w:r>
+          </w:p>
+        </w:tc>
+        <w:tc>
+          <w:tcPr>
+            <w:tcW w:w="2000" w:type="dxa"/>
+          </w:tcPr>
+          <w:p>
+            <w:pPr/>
+            <w:r>
+              <w:t xml:space="preserve">bigint</w:t>
+            </w:r>
+          </w:p>
+        </w:tc>
+        <w:tc>
+          <w:tcPr>
+            <w:tcW w:w="2000" w:type="dxa"/>
+          </w:tcPr>
+          <w:p>
+            <w:pPr/>
+            <w:r>
+              <w:t xml:space="preserve">-</w:t>
+            </w:r>
+          </w:p>
+        </w:tc>
+        <w:tc>
+          <w:tcPr>
+            <w:tcW w:w="2000" w:type="dxa"/>
+          </w:tcPr>
+          <w:p>
+            <w:pPr/>
+            <w:r>
+              <w:t xml:space="preserve">IS NULL</w:t>
+            </w:r>
+          </w:p>
+        </w:tc>
+      </w:tr>
+      <w:tr>
+        <w:trPr>
+          <w:trHeight w:val="530" w:hRule="atLeast"/>
+        </w:trPr>
+        <w:tc>
+          <w:tcPr>
+            <w:tcW w:w="2000" w:type="dxa"/>
+          </w:tcPr>
+          <w:p>
+            <w:pPr/>
+            <w:r>
+              <w:t xml:space="preserve">quantity</w:t>
+            </w:r>
+          </w:p>
+        </w:tc>
+        <w:tc>
+          <w:tcPr>
+            <w:tcW w:w="2000" w:type="dxa"/>
+          </w:tcPr>
+          <w:p>
+            <w:pPr/>
+            <w:r>
+              <w:t xml:space="preserve">decimal</w:t>
+            </w:r>
+          </w:p>
+        </w:tc>
+        <w:tc>
+          <w:tcPr>
+            <w:tcW w:w="2000" w:type="dxa"/>
+          </w:tcPr>
+          <w:p>
+            <w:pPr/>
+            <w:r>
+              <w:t xml:space="preserve">(19,6)</w:t>
+            </w:r>
+          </w:p>
+        </w:tc>
+        <w:tc>
+          <w:tcPr>
+            <w:tcW w:w="2000" w:type="dxa"/>
+          </w:tcPr>
+          <w:p>
+            <w:pPr/>
+            <w:r>
+              <w:t xml:space="preserve">NOT NULL</w:t>
+            </w:r>
+          </w:p>
+        </w:tc>
+      </w:tr>
+      <w:tr>
+        <w:trPr>
+          <w:trHeight w:val="530" w:hRule="atLeast"/>
+        </w:trPr>
+        <w:tc>
+          <w:tcPr>
+            <w:tcW w:w="2000" w:type="dxa"/>
+          </w:tcPr>
+          <w:p>
+            <w:pPr/>
+            <w:r>
+              <w:t xml:space="preserve">unit_cost</w:t>
+            </w:r>
+          </w:p>
+        </w:tc>
+        <w:tc>
+          <w:tcPr>
+            <w:tcW w:w="2000" w:type="dxa"/>
+          </w:tcPr>
+          <w:p>
+            <w:pPr/>
+            <w:r>
+              <w:t xml:space="preserve">decimal</w:t>
+            </w:r>
+          </w:p>
+        </w:tc>
+        <w:tc>
+          <w:tcPr>
+            <w:tcW w:w="2000" w:type="dxa"/>
+          </w:tcPr>
+          <w:p>
+            <w:pPr/>
+            <w:r>
+              <w:t xml:space="preserve">(19,6)</w:t>
+            </w:r>
+          </w:p>
+        </w:tc>
+        <w:tc>
+          <w:tcPr>
+            <w:tcW w:w="2000" w:type="dxa"/>
+          </w:tcPr>
+          <w:p>
+            <w:pPr/>
+            <w:r>
+              <w:t xml:space="preserve">NOT NULL</w:t>
+            </w:r>
+          </w:p>
+        </w:tc>
+      </w:tr>
+      <w:tr>
+        <w:trPr>
+          <w:trHeight w:val="530" w:hRule="atLeast"/>
+        </w:trPr>
+        <w:tc>
+          <w:tcPr>
+            <w:tcW w:w="2000" w:type="dxa"/>
+          </w:tcPr>
+          <w:p>
+            <w:pPr/>
+            <w:r>
+              <w:t xml:space="preserve">amount</w:t>
+            </w:r>
+          </w:p>
+        </w:tc>
+        <w:tc>
+          <w:tcPr>
+            <w:tcW w:w="2000" w:type="dxa"/>
+          </w:tcPr>
+          <w:p>
+            <w:pPr/>
+            <w:r>
+              <w:t xml:space="preserve">decimal</w:t>
+            </w:r>
+          </w:p>
+        </w:tc>
+        <w:tc>
+          <w:tcPr>
+            <w:tcW w:w="2000" w:type="dxa"/>
+          </w:tcPr>
+          <w:p>
+            <w:pPr/>
+            <w:r>
+              <w:t xml:space="preserve">(19,4)</w:t>
+            </w:r>
+          </w:p>
+        </w:tc>
+        <w:tc>
+          <w:tcPr>
+            <w:tcW w:w="2000" w:type="dxa"/>
+          </w:tcPr>
+          <w:p>
+            <w:pPr/>
+            <w:r>
+              <w:t xml:space="preserve">NOT NULL</w:t>
+            </w:r>
+          </w:p>
+        </w:tc>
+      </w:tr>
+      <w:tr>
+        <w:trPr>
+          <w:trHeight w:val="530" w:hRule="atLeast"/>
+        </w:trPr>
+        <w:tc>
+          <w:tcPr>
+            <w:tcW w:w="2000" w:type="dxa"/>
+          </w:tcPr>
+          <w:p>
+            <w:pPr/>
+            <w:r>
+              <w:t xml:space="preserve">company_id</w:t>
+            </w:r>
+          </w:p>
+        </w:tc>
+        <w:tc>
+          <w:tcPr>
+            <w:tcW w:w="2000" w:type="dxa"/>
+          </w:tcPr>
+          <w:p>
+            <w:pPr/>
+            <w:r>
+              <w:t xml:space="preserve">bigint</w:t>
+            </w:r>
+          </w:p>
+        </w:tc>
+        <w:tc>
+          <w:tcPr>
+            <w:tcW w:w="2000" w:type="dxa"/>
+          </w:tcPr>
+          <w:p>
+            <w:pPr/>
+            <w:r>
+              <w:t xml:space="preserve">-</w:t>
+            </w:r>
+          </w:p>
+        </w:tc>
+        <w:tc>
+          <w:tcPr>
+            <w:tcW w:w="2000" w:type="dxa"/>
+          </w:tcPr>
+          <w:p>
+            <w:pPr/>
+            <w:r>
+              <w:t xml:space="preserve">FK, NOT NULL</w:t>
+            </w:r>
+          </w:p>
+        </w:tc>
+      </w:tr>
+      <w:tr>
+        <w:trPr>
+          <w:trHeight w:val="530" w:hRule="atLeast"/>
+        </w:trPr>
+        <w:tc>
+          <w:tcPr>
+            <w:tcW w:w="2000" w:type="dxa"/>
+          </w:tcPr>
+          <w:p>
+            <w:pPr/>
+            <w:r>
+              <w:t xml:space="preserve">created_at</w:t>
+            </w:r>
+          </w:p>
+        </w:tc>
+        <w:tc>
+          <w:tcPr>
+            <w:tcW w:w="2000" w:type="dxa"/>
+          </w:tcPr>
+          <w:p>
+            <w:pPr/>
+            <w:r>
+              <w:t xml:space="preserve">datetime2</w:t>
+            </w:r>
+          </w:p>
+        </w:tc>
+        <w:tc>
+          <w:tcPr>
+            <w:tcW w:w="2000" w:type="dxa"/>
+          </w:tcPr>
+          <w:p>
+            <w:pPr/>
+            <w:r>
+              <w:t xml:space="preserve">(6)</w:t>
+            </w:r>
+          </w:p>
+        </w:tc>
+        <w:tc>
+          <w:tcPr>
+            <w:tcW w:w="2000" w:type="dxa"/>
+          </w:tcPr>
+          <w:p>
+            <w:pPr/>
+            <w:r>
+              <w:t xml:space="preserve">NOT NULL</w:t>
+            </w:r>
+          </w:p>
+        </w:tc>
+      </w:tr>
+      <w:tr>
+        <w:trPr>
+          <w:trHeight w:val="530" w:hRule="atLeast"/>
+        </w:trPr>
+        <w:tc>
+          <w:tcPr>
+            <w:tcW w:w="2000" w:type="dxa"/>
+          </w:tcPr>
+          <w:p>
+            <w:pPr/>
+            <w:r>
+              <w:t xml:space="preserve">created_by</w:t>
+            </w:r>
+          </w:p>
+        </w:tc>
+        <w:tc>
+          <w:tcPr>
+            <w:tcW w:w="2000" w:type="dxa"/>
+          </w:tcPr>
+          <w:p>
+            <w:pPr/>
+            <w:r>
+              <w:t xml:space="preserve">bigint</w:t>
+            </w:r>
+          </w:p>
+        </w:tc>
+        <w:tc>
+          <w:tcPr>
+            <w:tcW w:w="2000" w:type="dxa"/>
+          </w:tcPr>
+          <w:p>
+            <w:pPr/>
+            <w:r>
+              <w:t xml:space="preserve">-</w:t>
+            </w:r>
+          </w:p>
+        </w:tc>
+        <w:tc>
+          <w:tcPr>
+            <w:tcW w:w="2000" w:type="dxa"/>
+          </w:tcPr>
+          <w:p>
+            <w:pPr/>
+            <w:r>
+              <w:t xml:space="preserve">NOT NULL</w:t>
+            </w:r>
+          </w:p>
+        </w:tc>
+      </w:tr>
+      <w:tr>
+        <w:trPr>
+          <w:trHeight w:val="530" w:hRule="atLeast"/>
+        </w:trPr>
+        <w:tc>
+          <w:tcPr>
+            <w:tcW w:w="2000" w:type="dxa"/>
+          </w:tcPr>
+          <w:p>
+            <w:pPr/>
+            <w:r>
+              <w:t xml:space="preserve">updated_at</w:t>
+            </w:r>
+          </w:p>
+        </w:tc>
+        <w:tc>
+          <w:tcPr>
+            <w:tcW w:w="2000" w:type="dxa"/>
+          </w:tcPr>
+          <w:p>
+            <w:pPr/>
+            <w:r>
+              <w:t xml:space="preserve">datetime2</w:t>
+            </w:r>
+          </w:p>
+        </w:tc>
+        <w:tc>
+          <w:tcPr>
+            <w:tcW w:w="2000" w:type="dxa"/>
+          </w:tcPr>
+          <w:p>
+            <w:pPr/>
+            <w:r>
+              <w:t xml:space="preserve">(6)</w:t>
+            </w:r>
+          </w:p>
+        </w:tc>
+        <w:tc>
+          <w:tcPr>
+            <w:tcW w:w="2000" w:type="dxa"/>
+          </w:tcPr>
+          <w:p>
+            <w:pPr/>
+            <w:r>
+              <w:t xml:space="preserve">IS NULL</w:t>
+            </w:r>
+          </w:p>
+        </w:tc>
+      </w:tr>
+      <w:tr>
+        <w:trPr>
+          <w:trHeight w:val="530" w:hRule="atLeast"/>
+        </w:trPr>
+        <w:tc>
+          <w:tcPr>
+            <w:tcW w:w="2000" w:type="dxa"/>
+          </w:tcPr>
+          <w:p>
+            <w:pPr/>
+            <w:r>
+              <w:t xml:space="preserve">updated_by</w:t>
+            </w:r>
+          </w:p>
+        </w:tc>
+        <w:tc>
+          <w:tcPr>
+            <w:tcW w:w="2000" w:type="dxa"/>
+          </w:tcPr>
+          <w:p>
+            <w:pPr/>
+            <w:r>
+              <w:t xml:space="preserve">bigint</w:t>
+            </w:r>
+          </w:p>
+        </w:tc>
+        <w:tc>
+          <w:tcPr>
+            <w:tcW w:w="2000" w:type="dxa"/>
+          </w:tcPr>
+          <w:p>
+            <w:pPr/>
+            <w:r>
+              <w:t xml:space="preserve">-</w:t>
+            </w:r>
+          </w:p>
+        </w:tc>
+        <w:tc>
+          <w:tcPr>
+            <w:tcW w:w="2000" w:type="dxa"/>
+          </w:tcPr>
+          <w:p>
+            <w:pPr/>
+            <w:r>
+              <w:t xml:space="preserve">IS NULL</w:t>
+            </w:r>
+          </w:p>
+        </w:tc>
+      </w:tr>
+      <w:tr>
+        <w:trPr>
+          <w:trHeight w:val="530" w:hRule="atLeast"/>
+        </w:trPr>
+        <w:tc>
+          <w:tcPr>
+            <w:tcW w:w="2000" w:type="dxa"/>
+          </w:tcPr>
+          <w:p>
+            <w:pPr/>
+            <w:r>
+              <w:t xml:space="preserve">version</w:t>
+            </w:r>
+          </w:p>
+        </w:tc>
+        <w:tc>
+          <w:tcPr>
+            <w:tcW w:w="2000" w:type="dxa"/>
+          </w:tcPr>
+          <w:p>
+            <w:pPr/>
+            <w:r>
+              <w:t xml:space="preserve">int</w:t>
+            </w:r>
+          </w:p>
+        </w:tc>
+        <w:tc>
+          <w:tcPr>
+            <w:tcW w:w="2000" w:type="dxa"/>
+          </w:tcPr>
+          <w:p>
+            <w:pPr/>
+            <w:r>
+              <w:t xml:space="preserve">-</w:t>
+            </w:r>
+          </w:p>
+        </w:tc>
+        <w:tc>
+          <w:tcPr>
+            <w:tcW w:w="2000" w:type="dxa"/>
+          </w:tcPr>
+          <w:p>
+            <w:pPr/>
+            <w:r>
+              <w:t xml:space="preserve">NOT NULL</w:t>
+            </w:r>
+          </w:p>
+        </w:tc>
+      </w:tr>
+    </w:tbl>
+    <w:p/>
+    <w:p>
+      <w:pPr/>
+      <w:r>
         <w:t xml:space="preserve">Table Name: inv_reference</w:t>
       </w:r>
     </w:p>
@@ -40513,6 +42215,71 @@
           <w:i/>
         </w:rPr>
         <w:t xml:space="preserve">[Pending] System screenshot of Personal Settings Interface.</w:t>
+      </w:r>
+    </w:p>
+    <w:p>
+      <w:pPr>
+        <w:pStyle w:val="Heading4"/>
+      </w:pPr>
+      <w:r>
+        <w:t xml:space="preserve">4.2.1.5 Inventory Module</w:t>
+      </w:r>
+    </w:p>
+    <w:p>
+      <w:pPr>
+        <w:pStyle w:val="Heading5"/>
+      </w:pPr>
+      <w:r>
+        <w:t xml:space="preserve">4.2.1.5.2 Other Inbound Create Interface</w:t>
+      </w:r>
+    </w:p>
+    <w:p>
+      <w:pPr>
+        <w:jc w:val="center"/>
+      </w:pPr>
+      <w:r>
+        <w:rPr>
+          <w:i/>
+        </w:rPr>
+        <w:t xml:space="preserve">[Pending] System screenshot of Other Inbound Create Interface.</w:t>
+      </w:r>
+    </w:p>
+    <w:p>
+      <w:pPr>
+        <w:pStyle w:val="Heading5"/>
+      </w:pPr>
+      <w:r>
+        <w:t xml:space="preserve">4.2.1.5.3 Other Inbound View Interface</w:t>
+      </w:r>
+    </w:p>
+    <w:p>
+      <w:pPr>
+        <w:jc w:val="center"/>
+      </w:pPr>
+      <w:r>
+        <w:rPr>
+          <w:i/>
+        </w:rPr>
+        <w:t xml:space="preserve">[Pending] System screenshot of Other Inbound View Interface.</w:t>
+      </w:r>
+    </w:p>
+    <w:p>
+      <w:pPr>
+        <w:pStyle w:val="Heading5"/>
+      </w:pPr>
+      <w:r>
+        <w:t xml:space="preserve">4.2.1.5.4 Other Inbound Edit Interface</w:t>
+      </w:r>
+    </w:p>
+    <w:p>
+      <w:pPr>
+        <w:jc w:val="center"/>
+      </w:pPr>
+      <w:r>
+        <w:rPr>
+          <w:i/>
+        </w:rPr>
+        <w:t xml:space="preserve">[Pending] System screenshot of Other Inbound Edit Interface.</w:t>
       </w:r>
     </w:p>
     <w:p>
@@ -42158,7 +43925,7 @@
       </w:r>
     </w:p>
     <w:sectPr>
-      <w:footerReference xmlns:r="http://schemas.openxmlformats.org/officeDocument/2006/relationships" w:type="default" r:id="R47774cab5ce64435"/>
+      <w:footerReference xmlns:r="http://schemas.openxmlformats.org/officeDocument/2006/relationships" w:type="default" r:id="R5d0eb3193f814ae0"/>
       <w:pgSz w:w="11906" w:h="16838"/>
       <w:pgMar w:top="1440" w:right="1440" w:bottom="1440" w:left="1440" w:header="720" w:footer="720" w:gutter="0"/>
     </w:sectPr>

</xml_diff>

<commit_message>
feat(inv): add approval-driven other issue backend
</commit_message>
<xml_diff>
--- a/docs/99-output/MyERP_SDS.docx
+++ b/docs/99-output/MyERP_SDS.docx
@@ -613,6 +613,1708 @@
     <w:p>
       <w:pPr/>
       <w:r>
+        <w:t xml:space="preserve">Table Name: inv_other_issue</w:t>
+      </w:r>
+    </w:p>
+    <w:p>
+      <w:pPr/>
+      <w:r>
+        <w:t xml:space="preserve">Primary Key: id</w:t>
+      </w:r>
+    </w:p>
+    <w:p>
+      <w:pPr/>
+      <w:r>
+        <w:t xml:space="preserve">This table stores company-scoped other issue headers, document numbers and approval state.</w:t>
+      </w:r>
+    </w:p>
+    <w:tbl>
+      <w:tblPr>
+        <w:tblStyle w:val="TableGrid"/>
+        <w:tblW w:w="8000" w:type="dxa"/>
+        <w:jc w:val="left"/>
+        <w:tblBorders>
+          <w:top w:val="single" w:color="000000" w:sz="4" w:space="0"/>
+          <w:left w:val="single" w:color="000000" w:sz="4" w:space="0"/>
+          <w:bottom w:val="single" w:color="000000" w:sz="4" w:space="0"/>
+          <w:right w:val="single" w:color="000000" w:sz="4" w:space="0"/>
+          <w:insideH w:val="single" w:color="000000" w:sz="4" w:space="0"/>
+          <w:insideV w:val="single" w:color="000000" w:sz="4" w:space="0"/>
+        </w:tblBorders>
+        <w:tblLayout w:type="fixed"/>
+        <w:tblCellMar>
+          <w:top w:w="100" w:type="dxa"/>
+          <w:left w:w="100" w:type="dxa"/>
+          <w:bottom w:w="100" w:type="dxa"/>
+          <w:right w:w="100" w:type="dxa"/>
+        </w:tblCellMar>
+      </w:tblPr>
+      <w:tblGrid>
+        <w:gridCol w:w="2000"/>
+        <w:gridCol w:w="2000"/>
+        <w:gridCol w:w="2000"/>
+        <w:gridCol w:w="2000"/>
+      </w:tblGrid>
+      <w:tr>
+        <w:trPr>
+          <w:trHeight w:val="530" w:hRule="atLeast"/>
+        </w:trPr>
+        <w:tc>
+          <w:tcPr>
+            <w:tcW w:w="2000" w:type="dxa"/>
+          </w:tcPr>
+          <w:p>
+            <w:pPr>
+              <w:jc w:val="center"/>
+            </w:pPr>
+            <w:r>
+              <w:rPr>
+                <w:b/>
+              </w:rPr>
+              <w:t xml:space="preserve">Name of Attribute</w:t>
+            </w:r>
+          </w:p>
+        </w:tc>
+        <w:tc>
+          <w:tcPr>
+            <w:tcW w:w="2000" w:type="dxa"/>
+          </w:tcPr>
+          <w:p>
+            <w:pPr>
+              <w:jc w:val="center"/>
+            </w:pPr>
+            <w:r>
+              <w:rPr>
+                <w:b/>
+              </w:rPr>
+              <w:t xml:space="preserve">Data Type</w:t>
+            </w:r>
+          </w:p>
+        </w:tc>
+        <w:tc>
+          <w:tcPr>
+            <w:tcW w:w="2000" w:type="dxa"/>
+          </w:tcPr>
+          <w:p>
+            <w:pPr>
+              <w:jc w:val="center"/>
+            </w:pPr>
+            <w:r>
+              <w:rPr>
+                <w:b/>
+              </w:rPr>
+              <w:t xml:space="preserve">Size</w:t>
+            </w:r>
+          </w:p>
+        </w:tc>
+        <w:tc>
+          <w:tcPr>
+            <w:tcW w:w="2000" w:type="dxa"/>
+          </w:tcPr>
+          <w:p>
+            <w:pPr>
+              <w:jc w:val="center"/>
+            </w:pPr>
+            <w:r>
+              <w:rPr>
+                <w:b/>
+              </w:rPr>
+              <w:t xml:space="preserve">PK/FK/IS NULL/ NOT NULL</w:t>
+            </w:r>
+          </w:p>
+        </w:tc>
+      </w:tr>
+      <w:tr>
+        <w:trPr>
+          <w:trHeight w:val="530" w:hRule="atLeast"/>
+        </w:trPr>
+        <w:tc>
+          <w:tcPr>
+            <w:tcW w:w="2000" w:type="dxa"/>
+          </w:tcPr>
+          <w:p>
+            <w:pPr/>
+            <w:r>
+              <w:t xml:space="preserve">id</w:t>
+            </w:r>
+          </w:p>
+        </w:tc>
+        <w:tc>
+          <w:tcPr>
+            <w:tcW w:w="2000" w:type="dxa"/>
+          </w:tcPr>
+          <w:p>
+            <w:pPr/>
+            <w:r>
+              <w:t xml:space="preserve">bigint</w:t>
+            </w:r>
+          </w:p>
+        </w:tc>
+        <w:tc>
+          <w:tcPr>
+            <w:tcW w:w="2000" w:type="dxa"/>
+          </w:tcPr>
+          <w:p>
+            <w:pPr/>
+            <w:r>
+              <w:t xml:space="preserve">-</w:t>
+            </w:r>
+          </w:p>
+        </w:tc>
+        <w:tc>
+          <w:tcPr>
+            <w:tcW w:w="2000" w:type="dxa"/>
+          </w:tcPr>
+          <w:p>
+            <w:pPr/>
+            <w:r>
+              <w:t xml:space="preserve">PK, NOT NULL</w:t>
+            </w:r>
+          </w:p>
+        </w:tc>
+      </w:tr>
+      <w:tr>
+        <w:trPr>
+          <w:trHeight w:val="530" w:hRule="atLeast"/>
+        </w:trPr>
+        <w:tc>
+          <w:tcPr>
+            <w:tcW w:w="2000" w:type="dxa"/>
+          </w:tcPr>
+          <w:p>
+            <w:pPr/>
+            <w:r>
+              <w:t xml:space="preserve">document_no</w:t>
+            </w:r>
+          </w:p>
+        </w:tc>
+        <w:tc>
+          <w:tcPr>
+            <w:tcW w:w="2000" w:type="dxa"/>
+          </w:tcPr>
+          <w:p>
+            <w:pPr/>
+            <w:r>
+              <w:t xml:space="preserve">varchar</w:t>
+            </w:r>
+          </w:p>
+        </w:tc>
+        <w:tc>
+          <w:tcPr>
+            <w:tcW w:w="2000" w:type="dxa"/>
+          </w:tcPr>
+          <w:p>
+            <w:pPr/>
+            <w:r>
+              <w:t xml:space="preserve">30</w:t>
+            </w:r>
+          </w:p>
+        </w:tc>
+        <w:tc>
+          <w:tcPr>
+            <w:tcW w:w="2000" w:type="dxa"/>
+          </w:tcPr>
+          <w:p>
+            <w:pPr/>
+            <w:r>
+              <w:t xml:space="preserve">NOT NULL</w:t>
+            </w:r>
+          </w:p>
+        </w:tc>
+      </w:tr>
+      <w:tr>
+        <w:trPr>
+          <w:trHeight w:val="530" w:hRule="atLeast"/>
+        </w:trPr>
+        <w:tc>
+          <w:tcPr>
+            <w:tcW w:w="2000" w:type="dxa"/>
+          </w:tcPr>
+          <w:p>
+            <w:pPr/>
+            <w:r>
+              <w:t xml:space="preserve">business_date</w:t>
+            </w:r>
+          </w:p>
+        </w:tc>
+        <w:tc>
+          <w:tcPr>
+            <w:tcW w:w="2000" w:type="dxa"/>
+          </w:tcPr>
+          <w:p>
+            <w:pPr/>
+            <w:r>
+              <w:t xml:space="preserve">date</w:t>
+            </w:r>
+          </w:p>
+        </w:tc>
+        <w:tc>
+          <w:tcPr>
+            <w:tcW w:w="2000" w:type="dxa"/>
+          </w:tcPr>
+          <w:p>
+            <w:pPr/>
+            <w:r>
+              <w:t xml:space="preserve">-</w:t>
+            </w:r>
+          </w:p>
+        </w:tc>
+        <w:tc>
+          <w:tcPr>
+            <w:tcW w:w="2000" w:type="dxa"/>
+          </w:tcPr>
+          <w:p>
+            <w:pPr/>
+            <w:r>
+              <w:t xml:space="preserve">NOT NULL</w:t>
+            </w:r>
+          </w:p>
+        </w:tc>
+      </w:tr>
+      <w:tr>
+        <w:trPr>
+          <w:trHeight w:val="530" w:hRule="atLeast"/>
+        </w:trPr>
+        <w:tc>
+          <w:tcPr>
+            <w:tcW w:w="2000" w:type="dxa"/>
+          </w:tcPr>
+          <w:p>
+            <w:pPr/>
+            <w:r>
+              <w:t xml:space="preserve">status</w:t>
+            </w:r>
+          </w:p>
+        </w:tc>
+        <w:tc>
+          <w:tcPr>
+            <w:tcW w:w="2000" w:type="dxa"/>
+          </w:tcPr>
+          <w:p>
+            <w:pPr/>
+            <w:r>
+              <w:t xml:space="preserve">varchar</w:t>
+            </w:r>
+          </w:p>
+        </w:tc>
+        <w:tc>
+          <w:tcPr>
+            <w:tcW w:w="2000" w:type="dxa"/>
+          </w:tcPr>
+          <w:p>
+            <w:pPr/>
+            <w:r>
+              <w:t xml:space="preserve">30</w:t>
+            </w:r>
+          </w:p>
+        </w:tc>
+        <w:tc>
+          <w:tcPr>
+            <w:tcW w:w="2000" w:type="dxa"/>
+          </w:tcPr>
+          <w:p>
+            <w:pPr/>
+            <w:r>
+              <w:t xml:space="preserve">NOT NULL</w:t>
+            </w:r>
+          </w:p>
+        </w:tc>
+      </w:tr>
+      <w:tr>
+        <w:trPr>
+          <w:trHeight w:val="530" w:hRule="atLeast"/>
+        </w:trPr>
+        <w:tc>
+          <w:tcPr>
+            <w:tcW w:w="2000" w:type="dxa"/>
+          </w:tcPr>
+          <w:p>
+            <w:pPr/>
+            <w:r>
+              <w:t xml:space="preserve">remark</w:t>
+            </w:r>
+          </w:p>
+        </w:tc>
+        <w:tc>
+          <w:tcPr>
+            <w:tcW w:w="2000" w:type="dxa"/>
+          </w:tcPr>
+          <w:p>
+            <w:pPr/>
+            <w:r>
+              <w:t xml:space="preserve">nvarchar</w:t>
+            </w:r>
+          </w:p>
+        </w:tc>
+        <w:tc>
+          <w:tcPr>
+            <w:tcW w:w="2000" w:type="dxa"/>
+          </w:tcPr>
+          <w:p>
+            <w:pPr/>
+            <w:r>
+              <w:t xml:space="preserve">500</w:t>
+            </w:r>
+          </w:p>
+        </w:tc>
+        <w:tc>
+          <w:tcPr>
+            <w:tcW w:w="2000" w:type="dxa"/>
+          </w:tcPr>
+          <w:p>
+            <w:pPr/>
+            <w:r>
+              <w:t xml:space="preserve">IS NULL</w:t>
+            </w:r>
+          </w:p>
+        </w:tc>
+      </w:tr>
+      <w:tr>
+        <w:trPr>
+          <w:trHeight w:val="530" w:hRule="atLeast"/>
+        </w:trPr>
+        <w:tc>
+          <w:tcPr>
+            <w:tcW w:w="2000" w:type="dxa"/>
+          </w:tcPr>
+          <w:p>
+            <w:pPr/>
+            <w:r>
+              <w:t xml:space="preserve">custom_fields</w:t>
+            </w:r>
+          </w:p>
+        </w:tc>
+        <w:tc>
+          <w:tcPr>
+            <w:tcW w:w="2000" w:type="dxa"/>
+          </w:tcPr>
+          <w:p>
+            <w:pPr/>
+            <w:r>
+              <w:t xml:space="preserve">nvarchar</w:t>
+            </w:r>
+          </w:p>
+        </w:tc>
+        <w:tc>
+          <w:tcPr>
+            <w:tcW w:w="2000" w:type="dxa"/>
+          </w:tcPr>
+          <w:p>
+            <w:pPr/>
+            <w:r>
+              <w:t xml:space="preserve">MAX</w:t>
+            </w:r>
+          </w:p>
+        </w:tc>
+        <w:tc>
+          <w:tcPr>
+            <w:tcW w:w="2000" w:type="dxa"/>
+          </w:tcPr>
+          <w:p>
+            <w:pPr/>
+            <w:r>
+              <w:t xml:space="preserve">IS NULL</w:t>
+            </w:r>
+          </w:p>
+        </w:tc>
+      </w:tr>
+      <w:tr>
+        <w:trPr>
+          <w:trHeight w:val="530" w:hRule="atLeast"/>
+        </w:trPr>
+        <w:tc>
+          <w:tcPr>
+            <w:tcW w:w="2000" w:type="dxa"/>
+          </w:tcPr>
+          <w:p>
+            <w:pPr/>
+            <w:r>
+              <w:t xml:space="preserve">posted_at</w:t>
+            </w:r>
+          </w:p>
+        </w:tc>
+        <w:tc>
+          <w:tcPr>
+            <w:tcW w:w="2000" w:type="dxa"/>
+          </w:tcPr>
+          <w:p>
+            <w:pPr/>
+            <w:r>
+              <w:t xml:space="preserve">datetime2</w:t>
+            </w:r>
+          </w:p>
+        </w:tc>
+        <w:tc>
+          <w:tcPr>
+            <w:tcW w:w="2000" w:type="dxa"/>
+          </w:tcPr>
+          <w:p>
+            <w:pPr/>
+            <w:r>
+              <w:t xml:space="preserve">(6)</w:t>
+            </w:r>
+          </w:p>
+        </w:tc>
+        <w:tc>
+          <w:tcPr>
+            <w:tcW w:w="2000" w:type="dxa"/>
+          </w:tcPr>
+          <w:p>
+            <w:pPr/>
+            <w:r>
+              <w:t xml:space="preserve">IS NULL</w:t>
+            </w:r>
+          </w:p>
+        </w:tc>
+      </w:tr>
+      <w:tr>
+        <w:trPr>
+          <w:trHeight w:val="530" w:hRule="atLeast"/>
+        </w:trPr>
+        <w:tc>
+          <w:tcPr>
+            <w:tcW w:w="2000" w:type="dxa"/>
+          </w:tcPr>
+          <w:p>
+            <w:pPr/>
+            <w:r>
+              <w:t xml:space="preserve">is_deleted</w:t>
+            </w:r>
+          </w:p>
+        </w:tc>
+        <w:tc>
+          <w:tcPr>
+            <w:tcW w:w="2000" w:type="dxa"/>
+          </w:tcPr>
+          <w:p>
+            <w:pPr/>
+            <w:r>
+              <w:t xml:space="preserve">bit</w:t>
+            </w:r>
+          </w:p>
+        </w:tc>
+        <w:tc>
+          <w:tcPr>
+            <w:tcW w:w="2000" w:type="dxa"/>
+          </w:tcPr>
+          <w:p>
+            <w:pPr/>
+            <w:r>
+              <w:t xml:space="preserve">-</w:t>
+            </w:r>
+          </w:p>
+        </w:tc>
+        <w:tc>
+          <w:tcPr>
+            <w:tcW w:w="2000" w:type="dxa"/>
+          </w:tcPr>
+          <w:p>
+            <w:pPr/>
+            <w:r>
+              <w:t xml:space="preserve">NOT NULL</w:t>
+            </w:r>
+          </w:p>
+        </w:tc>
+      </w:tr>
+      <w:tr>
+        <w:trPr>
+          <w:trHeight w:val="530" w:hRule="atLeast"/>
+        </w:trPr>
+        <w:tc>
+          <w:tcPr>
+            <w:tcW w:w="2000" w:type="dxa"/>
+          </w:tcPr>
+          <w:p>
+            <w:pPr/>
+            <w:r>
+              <w:t xml:space="preserve">deleted_at</w:t>
+            </w:r>
+          </w:p>
+        </w:tc>
+        <w:tc>
+          <w:tcPr>
+            <w:tcW w:w="2000" w:type="dxa"/>
+          </w:tcPr>
+          <w:p>
+            <w:pPr/>
+            <w:r>
+              <w:t xml:space="preserve">datetime2</w:t>
+            </w:r>
+          </w:p>
+        </w:tc>
+        <w:tc>
+          <w:tcPr>
+            <w:tcW w:w="2000" w:type="dxa"/>
+          </w:tcPr>
+          <w:p>
+            <w:pPr/>
+            <w:r>
+              <w:t xml:space="preserve">(6)</w:t>
+            </w:r>
+          </w:p>
+        </w:tc>
+        <w:tc>
+          <w:tcPr>
+            <w:tcW w:w="2000" w:type="dxa"/>
+          </w:tcPr>
+          <w:p>
+            <w:pPr/>
+            <w:r>
+              <w:t xml:space="preserve">IS NULL</w:t>
+            </w:r>
+          </w:p>
+        </w:tc>
+      </w:tr>
+      <w:tr>
+        <w:trPr>
+          <w:trHeight w:val="530" w:hRule="atLeast"/>
+        </w:trPr>
+        <w:tc>
+          <w:tcPr>
+            <w:tcW w:w="2000" w:type="dxa"/>
+          </w:tcPr>
+          <w:p>
+            <w:pPr/>
+            <w:r>
+              <w:t xml:space="preserve">company_id</w:t>
+            </w:r>
+          </w:p>
+        </w:tc>
+        <w:tc>
+          <w:tcPr>
+            <w:tcW w:w="2000" w:type="dxa"/>
+          </w:tcPr>
+          <w:p>
+            <w:pPr/>
+            <w:r>
+              <w:t xml:space="preserve">bigint</w:t>
+            </w:r>
+          </w:p>
+        </w:tc>
+        <w:tc>
+          <w:tcPr>
+            <w:tcW w:w="2000" w:type="dxa"/>
+          </w:tcPr>
+          <w:p>
+            <w:pPr/>
+            <w:r>
+              <w:t xml:space="preserve">-</w:t>
+            </w:r>
+          </w:p>
+        </w:tc>
+        <w:tc>
+          <w:tcPr>
+            <w:tcW w:w="2000" w:type="dxa"/>
+          </w:tcPr>
+          <w:p>
+            <w:pPr/>
+            <w:r>
+              <w:t xml:space="preserve">NOT NULL</w:t>
+            </w:r>
+          </w:p>
+        </w:tc>
+      </w:tr>
+      <w:tr>
+        <w:trPr>
+          <w:trHeight w:val="530" w:hRule="atLeast"/>
+        </w:trPr>
+        <w:tc>
+          <w:tcPr>
+            <w:tcW w:w="2000" w:type="dxa"/>
+          </w:tcPr>
+          <w:p>
+            <w:pPr/>
+            <w:r>
+              <w:t xml:space="preserve">created_at</w:t>
+            </w:r>
+          </w:p>
+        </w:tc>
+        <w:tc>
+          <w:tcPr>
+            <w:tcW w:w="2000" w:type="dxa"/>
+          </w:tcPr>
+          <w:p>
+            <w:pPr/>
+            <w:r>
+              <w:t xml:space="preserve">datetime2</w:t>
+            </w:r>
+          </w:p>
+        </w:tc>
+        <w:tc>
+          <w:tcPr>
+            <w:tcW w:w="2000" w:type="dxa"/>
+          </w:tcPr>
+          <w:p>
+            <w:pPr/>
+            <w:r>
+              <w:t xml:space="preserve">(6)</w:t>
+            </w:r>
+          </w:p>
+        </w:tc>
+        <w:tc>
+          <w:tcPr>
+            <w:tcW w:w="2000" w:type="dxa"/>
+          </w:tcPr>
+          <w:p>
+            <w:pPr/>
+            <w:r>
+              <w:t xml:space="preserve">NOT NULL</w:t>
+            </w:r>
+          </w:p>
+        </w:tc>
+      </w:tr>
+      <w:tr>
+        <w:trPr>
+          <w:trHeight w:val="530" w:hRule="atLeast"/>
+        </w:trPr>
+        <w:tc>
+          <w:tcPr>
+            <w:tcW w:w="2000" w:type="dxa"/>
+          </w:tcPr>
+          <w:p>
+            <w:pPr/>
+            <w:r>
+              <w:t xml:space="preserve">created_by</w:t>
+            </w:r>
+          </w:p>
+        </w:tc>
+        <w:tc>
+          <w:tcPr>
+            <w:tcW w:w="2000" w:type="dxa"/>
+          </w:tcPr>
+          <w:p>
+            <w:pPr/>
+            <w:r>
+              <w:t xml:space="preserve">bigint</w:t>
+            </w:r>
+          </w:p>
+        </w:tc>
+        <w:tc>
+          <w:tcPr>
+            <w:tcW w:w="2000" w:type="dxa"/>
+          </w:tcPr>
+          <w:p>
+            <w:pPr/>
+            <w:r>
+              <w:t xml:space="preserve">-</w:t>
+            </w:r>
+          </w:p>
+        </w:tc>
+        <w:tc>
+          <w:tcPr>
+            <w:tcW w:w="2000" w:type="dxa"/>
+          </w:tcPr>
+          <w:p>
+            <w:pPr/>
+            <w:r>
+              <w:t xml:space="preserve">NOT NULL</w:t>
+            </w:r>
+          </w:p>
+        </w:tc>
+      </w:tr>
+      <w:tr>
+        <w:trPr>
+          <w:trHeight w:val="530" w:hRule="atLeast"/>
+        </w:trPr>
+        <w:tc>
+          <w:tcPr>
+            <w:tcW w:w="2000" w:type="dxa"/>
+          </w:tcPr>
+          <w:p>
+            <w:pPr/>
+            <w:r>
+              <w:t xml:space="preserve">updated_at</w:t>
+            </w:r>
+          </w:p>
+        </w:tc>
+        <w:tc>
+          <w:tcPr>
+            <w:tcW w:w="2000" w:type="dxa"/>
+          </w:tcPr>
+          <w:p>
+            <w:pPr/>
+            <w:r>
+              <w:t xml:space="preserve">datetime2</w:t>
+            </w:r>
+          </w:p>
+        </w:tc>
+        <w:tc>
+          <w:tcPr>
+            <w:tcW w:w="2000" w:type="dxa"/>
+          </w:tcPr>
+          <w:p>
+            <w:pPr/>
+            <w:r>
+              <w:t xml:space="preserve">(6)</w:t>
+            </w:r>
+          </w:p>
+        </w:tc>
+        <w:tc>
+          <w:tcPr>
+            <w:tcW w:w="2000" w:type="dxa"/>
+          </w:tcPr>
+          <w:p>
+            <w:pPr/>
+            <w:r>
+              <w:t xml:space="preserve">IS NULL</w:t>
+            </w:r>
+          </w:p>
+        </w:tc>
+      </w:tr>
+      <w:tr>
+        <w:trPr>
+          <w:trHeight w:val="530" w:hRule="atLeast"/>
+        </w:trPr>
+        <w:tc>
+          <w:tcPr>
+            <w:tcW w:w="2000" w:type="dxa"/>
+          </w:tcPr>
+          <w:p>
+            <w:pPr/>
+            <w:r>
+              <w:t xml:space="preserve">updated_by</w:t>
+            </w:r>
+          </w:p>
+        </w:tc>
+        <w:tc>
+          <w:tcPr>
+            <w:tcW w:w="2000" w:type="dxa"/>
+          </w:tcPr>
+          <w:p>
+            <w:pPr/>
+            <w:r>
+              <w:t xml:space="preserve">bigint</w:t>
+            </w:r>
+          </w:p>
+        </w:tc>
+        <w:tc>
+          <w:tcPr>
+            <w:tcW w:w="2000" w:type="dxa"/>
+          </w:tcPr>
+          <w:p>
+            <w:pPr/>
+            <w:r>
+              <w:t xml:space="preserve">-</w:t>
+            </w:r>
+          </w:p>
+        </w:tc>
+        <w:tc>
+          <w:tcPr>
+            <w:tcW w:w="2000" w:type="dxa"/>
+          </w:tcPr>
+          <w:p>
+            <w:pPr/>
+            <w:r>
+              <w:t xml:space="preserve">IS NULL</w:t>
+            </w:r>
+          </w:p>
+        </w:tc>
+      </w:tr>
+      <w:tr>
+        <w:trPr>
+          <w:trHeight w:val="530" w:hRule="atLeast"/>
+        </w:trPr>
+        <w:tc>
+          <w:tcPr>
+            <w:tcW w:w="2000" w:type="dxa"/>
+          </w:tcPr>
+          <w:p>
+            <w:pPr/>
+            <w:r>
+              <w:t xml:space="preserve">version</w:t>
+            </w:r>
+          </w:p>
+        </w:tc>
+        <w:tc>
+          <w:tcPr>
+            <w:tcW w:w="2000" w:type="dxa"/>
+          </w:tcPr>
+          <w:p>
+            <w:pPr/>
+            <w:r>
+              <w:t xml:space="preserve">int</w:t>
+            </w:r>
+          </w:p>
+        </w:tc>
+        <w:tc>
+          <w:tcPr>
+            <w:tcW w:w="2000" w:type="dxa"/>
+          </w:tcPr>
+          <w:p>
+            <w:pPr/>
+            <w:r>
+              <w:t xml:space="preserve">-</w:t>
+            </w:r>
+          </w:p>
+        </w:tc>
+        <w:tc>
+          <w:tcPr>
+            <w:tcW w:w="2000" w:type="dxa"/>
+          </w:tcPr>
+          <w:p>
+            <w:pPr/>
+            <w:r>
+              <w:t xml:space="preserve">NOT NULL</w:t>
+            </w:r>
+          </w:p>
+        </w:tc>
+      </w:tr>
+    </w:tbl>
+    <w:p/>
+    <w:p>
+      <w:pPr/>
+      <w:r>
+        <w:t xml:space="preserve">Table Name: inv_other_issue_line</w:t>
+      </w:r>
+    </w:p>
+    <w:p>
+      <w:pPr/>
+      <w:r>
+        <w:t xml:space="preserve">Primary Key: id</w:t>
+      </w:r>
+    </w:p>
+    <w:p>
+      <w:pPr/>
+      <w:r>
+        <w:t xml:space="preserve">This table stores ordered stock issue lines with quantity and estimated approval amount.</w:t>
+      </w:r>
+    </w:p>
+    <w:tbl>
+      <w:tblPr>
+        <w:tblStyle w:val="TableGrid"/>
+        <w:tblW w:w="8000" w:type="dxa"/>
+        <w:jc w:val="left"/>
+        <w:tblBorders>
+          <w:top w:val="single" w:color="000000" w:sz="4" w:space="0"/>
+          <w:left w:val="single" w:color="000000" w:sz="4" w:space="0"/>
+          <w:bottom w:val="single" w:color="000000" w:sz="4" w:space="0"/>
+          <w:right w:val="single" w:color="000000" w:sz="4" w:space="0"/>
+          <w:insideH w:val="single" w:color="000000" w:sz="4" w:space="0"/>
+          <w:insideV w:val="single" w:color="000000" w:sz="4" w:space="0"/>
+        </w:tblBorders>
+        <w:tblLayout w:type="fixed"/>
+        <w:tblCellMar>
+          <w:top w:w="100" w:type="dxa"/>
+          <w:left w:w="100" w:type="dxa"/>
+          <w:bottom w:w="100" w:type="dxa"/>
+          <w:right w:w="100" w:type="dxa"/>
+        </w:tblCellMar>
+      </w:tblPr>
+      <w:tblGrid>
+        <w:gridCol w:w="2000"/>
+        <w:gridCol w:w="2000"/>
+        <w:gridCol w:w="2000"/>
+        <w:gridCol w:w="2000"/>
+      </w:tblGrid>
+      <w:tr>
+        <w:trPr>
+          <w:trHeight w:val="530" w:hRule="atLeast"/>
+        </w:trPr>
+        <w:tc>
+          <w:tcPr>
+            <w:tcW w:w="2000" w:type="dxa"/>
+          </w:tcPr>
+          <w:p>
+            <w:pPr>
+              <w:jc w:val="center"/>
+            </w:pPr>
+            <w:r>
+              <w:rPr>
+                <w:b/>
+              </w:rPr>
+              <w:t xml:space="preserve">Name of Attribute</w:t>
+            </w:r>
+          </w:p>
+        </w:tc>
+        <w:tc>
+          <w:tcPr>
+            <w:tcW w:w="2000" w:type="dxa"/>
+          </w:tcPr>
+          <w:p>
+            <w:pPr>
+              <w:jc w:val="center"/>
+            </w:pPr>
+            <w:r>
+              <w:rPr>
+                <w:b/>
+              </w:rPr>
+              <w:t xml:space="preserve">Data Type</w:t>
+            </w:r>
+          </w:p>
+        </w:tc>
+        <w:tc>
+          <w:tcPr>
+            <w:tcW w:w="2000" w:type="dxa"/>
+          </w:tcPr>
+          <w:p>
+            <w:pPr>
+              <w:jc w:val="center"/>
+            </w:pPr>
+            <w:r>
+              <w:rPr>
+                <w:b/>
+              </w:rPr>
+              <w:t xml:space="preserve">Size</w:t>
+            </w:r>
+          </w:p>
+        </w:tc>
+        <w:tc>
+          <w:tcPr>
+            <w:tcW w:w="2000" w:type="dxa"/>
+          </w:tcPr>
+          <w:p>
+            <w:pPr>
+              <w:jc w:val="center"/>
+            </w:pPr>
+            <w:r>
+              <w:rPr>
+                <w:b/>
+              </w:rPr>
+              <w:t xml:space="preserve">PK/FK/IS NULL/ NOT NULL</w:t>
+            </w:r>
+          </w:p>
+        </w:tc>
+      </w:tr>
+      <w:tr>
+        <w:trPr>
+          <w:trHeight w:val="530" w:hRule="atLeast"/>
+        </w:trPr>
+        <w:tc>
+          <w:tcPr>
+            <w:tcW w:w="2000" w:type="dxa"/>
+          </w:tcPr>
+          <w:p>
+            <w:pPr/>
+            <w:r>
+              <w:t xml:space="preserve">id</w:t>
+            </w:r>
+          </w:p>
+        </w:tc>
+        <w:tc>
+          <w:tcPr>
+            <w:tcW w:w="2000" w:type="dxa"/>
+          </w:tcPr>
+          <w:p>
+            <w:pPr/>
+            <w:r>
+              <w:t xml:space="preserve">bigint</w:t>
+            </w:r>
+          </w:p>
+        </w:tc>
+        <w:tc>
+          <w:tcPr>
+            <w:tcW w:w="2000" w:type="dxa"/>
+          </w:tcPr>
+          <w:p>
+            <w:pPr/>
+            <w:r>
+              <w:t xml:space="preserve">-</w:t>
+            </w:r>
+          </w:p>
+        </w:tc>
+        <w:tc>
+          <w:tcPr>
+            <w:tcW w:w="2000" w:type="dxa"/>
+          </w:tcPr>
+          <w:p>
+            <w:pPr/>
+            <w:r>
+              <w:t xml:space="preserve">PK, NOT NULL</w:t>
+            </w:r>
+          </w:p>
+        </w:tc>
+      </w:tr>
+      <w:tr>
+        <w:trPr>
+          <w:trHeight w:val="530" w:hRule="atLeast"/>
+        </w:trPr>
+        <w:tc>
+          <w:tcPr>
+            <w:tcW w:w="2000" w:type="dxa"/>
+          </w:tcPr>
+          <w:p>
+            <w:pPr/>
+            <w:r>
+              <w:t xml:space="preserve">issue_id</w:t>
+            </w:r>
+          </w:p>
+        </w:tc>
+        <w:tc>
+          <w:tcPr>
+            <w:tcW w:w="2000" w:type="dxa"/>
+          </w:tcPr>
+          <w:p>
+            <w:pPr/>
+            <w:r>
+              <w:t xml:space="preserve">bigint</w:t>
+            </w:r>
+          </w:p>
+        </w:tc>
+        <w:tc>
+          <w:tcPr>
+            <w:tcW w:w="2000" w:type="dxa"/>
+          </w:tcPr>
+          <w:p>
+            <w:pPr/>
+            <w:r>
+              <w:t xml:space="preserve">-</w:t>
+            </w:r>
+          </w:p>
+        </w:tc>
+        <w:tc>
+          <w:tcPr>
+            <w:tcW w:w="2000" w:type="dxa"/>
+          </w:tcPr>
+          <w:p>
+            <w:pPr/>
+            <w:r>
+              <w:t xml:space="preserve">FK, NOT NULL</w:t>
+            </w:r>
+          </w:p>
+        </w:tc>
+      </w:tr>
+      <w:tr>
+        <w:trPr>
+          <w:trHeight w:val="530" w:hRule="atLeast"/>
+        </w:trPr>
+        <w:tc>
+          <w:tcPr>
+            <w:tcW w:w="2000" w:type="dxa"/>
+          </w:tcPr>
+          <w:p>
+            <w:pPr/>
+            <w:r>
+              <w:t xml:space="preserve">line_no</w:t>
+            </w:r>
+          </w:p>
+        </w:tc>
+        <w:tc>
+          <w:tcPr>
+            <w:tcW w:w="2000" w:type="dxa"/>
+          </w:tcPr>
+          <w:p>
+            <w:pPr/>
+            <w:r>
+              <w:t xml:space="preserve">int</w:t>
+            </w:r>
+          </w:p>
+        </w:tc>
+        <w:tc>
+          <w:tcPr>
+            <w:tcW w:w="2000" w:type="dxa"/>
+          </w:tcPr>
+          <w:p>
+            <w:pPr/>
+            <w:r>
+              <w:t xml:space="preserve">-</w:t>
+            </w:r>
+          </w:p>
+        </w:tc>
+        <w:tc>
+          <w:tcPr>
+            <w:tcW w:w="2000" w:type="dxa"/>
+          </w:tcPr>
+          <w:p>
+            <w:pPr/>
+            <w:r>
+              <w:t xml:space="preserve">NOT NULL</w:t>
+            </w:r>
+          </w:p>
+        </w:tc>
+      </w:tr>
+      <w:tr>
+        <w:trPr>
+          <w:trHeight w:val="530" w:hRule="atLeast"/>
+        </w:trPr>
+        <w:tc>
+          <w:tcPr>
+            <w:tcW w:w="2000" w:type="dxa"/>
+          </w:tcPr>
+          <w:p>
+            <w:pPr/>
+            <w:r>
+              <w:t xml:space="preserve">item_id</w:t>
+            </w:r>
+          </w:p>
+        </w:tc>
+        <w:tc>
+          <w:tcPr>
+            <w:tcW w:w="2000" w:type="dxa"/>
+          </w:tcPr>
+          <w:p>
+            <w:pPr/>
+            <w:r>
+              <w:t xml:space="preserve">bigint</w:t>
+            </w:r>
+          </w:p>
+        </w:tc>
+        <w:tc>
+          <w:tcPr>
+            <w:tcW w:w="2000" w:type="dxa"/>
+          </w:tcPr>
+          <w:p>
+            <w:pPr/>
+            <w:r>
+              <w:t xml:space="preserve">-</w:t>
+            </w:r>
+          </w:p>
+        </w:tc>
+        <w:tc>
+          <w:tcPr>
+            <w:tcW w:w="2000" w:type="dxa"/>
+          </w:tcPr>
+          <w:p>
+            <w:pPr/>
+            <w:r>
+              <w:t xml:space="preserve">NOT NULL</w:t>
+            </w:r>
+          </w:p>
+        </w:tc>
+      </w:tr>
+      <w:tr>
+        <w:trPr>
+          <w:trHeight w:val="530" w:hRule="atLeast"/>
+        </w:trPr>
+        <w:tc>
+          <w:tcPr>
+            <w:tcW w:w="2000" w:type="dxa"/>
+          </w:tcPr>
+          <w:p>
+            <w:pPr/>
+            <w:r>
+              <w:t xml:space="preserve">warehouse_id</w:t>
+            </w:r>
+          </w:p>
+        </w:tc>
+        <w:tc>
+          <w:tcPr>
+            <w:tcW w:w="2000" w:type="dxa"/>
+          </w:tcPr>
+          <w:p>
+            <w:pPr/>
+            <w:r>
+              <w:t xml:space="preserve">bigint</w:t>
+            </w:r>
+          </w:p>
+        </w:tc>
+        <w:tc>
+          <w:tcPr>
+            <w:tcW w:w="2000" w:type="dxa"/>
+          </w:tcPr>
+          <w:p>
+            <w:pPr/>
+            <w:r>
+              <w:t xml:space="preserve">-</w:t>
+            </w:r>
+          </w:p>
+        </w:tc>
+        <w:tc>
+          <w:tcPr>
+            <w:tcW w:w="2000" w:type="dxa"/>
+          </w:tcPr>
+          <w:p>
+            <w:pPr/>
+            <w:r>
+              <w:t xml:space="preserve">NOT NULL</w:t>
+            </w:r>
+          </w:p>
+        </w:tc>
+      </w:tr>
+      <w:tr>
+        <w:trPr>
+          <w:trHeight w:val="530" w:hRule="atLeast"/>
+        </w:trPr>
+        <w:tc>
+          <w:tcPr>
+            <w:tcW w:w="2000" w:type="dxa"/>
+          </w:tcPr>
+          <w:p>
+            <w:pPr/>
+            <w:r>
+              <w:t xml:space="preserve">location_id</w:t>
+            </w:r>
+          </w:p>
+        </w:tc>
+        <w:tc>
+          <w:tcPr>
+            <w:tcW w:w="2000" w:type="dxa"/>
+          </w:tcPr>
+          <w:p>
+            <w:pPr/>
+            <w:r>
+              <w:t xml:space="preserve">bigint</w:t>
+            </w:r>
+          </w:p>
+        </w:tc>
+        <w:tc>
+          <w:tcPr>
+            <w:tcW w:w="2000" w:type="dxa"/>
+          </w:tcPr>
+          <w:p>
+            <w:pPr/>
+            <w:r>
+              <w:t xml:space="preserve">-</w:t>
+            </w:r>
+          </w:p>
+        </w:tc>
+        <w:tc>
+          <w:tcPr>
+            <w:tcW w:w="2000" w:type="dxa"/>
+          </w:tcPr>
+          <w:p>
+            <w:pPr/>
+            <w:r>
+              <w:t xml:space="preserve">IS NULL</w:t>
+            </w:r>
+          </w:p>
+        </w:tc>
+      </w:tr>
+      <w:tr>
+        <w:trPr>
+          <w:trHeight w:val="530" w:hRule="atLeast"/>
+        </w:trPr>
+        <w:tc>
+          <w:tcPr>
+            <w:tcW w:w="2000" w:type="dxa"/>
+          </w:tcPr>
+          <w:p>
+            <w:pPr/>
+            <w:r>
+              <w:t xml:space="preserve">quantity</w:t>
+            </w:r>
+          </w:p>
+        </w:tc>
+        <w:tc>
+          <w:tcPr>
+            <w:tcW w:w="2000" w:type="dxa"/>
+          </w:tcPr>
+          <w:p>
+            <w:pPr/>
+            <w:r>
+              <w:t xml:space="preserve">decimal</w:t>
+            </w:r>
+          </w:p>
+        </w:tc>
+        <w:tc>
+          <w:tcPr>
+            <w:tcW w:w="2000" w:type="dxa"/>
+          </w:tcPr>
+          <w:p>
+            <w:pPr/>
+            <w:r>
+              <w:t xml:space="preserve">(19,6)</w:t>
+            </w:r>
+          </w:p>
+        </w:tc>
+        <w:tc>
+          <w:tcPr>
+            <w:tcW w:w="2000" w:type="dxa"/>
+          </w:tcPr>
+          <w:p>
+            <w:pPr/>
+            <w:r>
+              <w:t xml:space="preserve">NOT NULL</w:t>
+            </w:r>
+          </w:p>
+        </w:tc>
+      </w:tr>
+      <w:tr>
+        <w:trPr>
+          <w:trHeight w:val="530" w:hRule="atLeast"/>
+        </w:trPr>
+        <w:tc>
+          <w:tcPr>
+            <w:tcW w:w="2000" w:type="dxa"/>
+          </w:tcPr>
+          <w:p>
+            <w:pPr/>
+            <w:r>
+              <w:t xml:space="preserve">unit_cost</w:t>
+            </w:r>
+          </w:p>
+        </w:tc>
+        <w:tc>
+          <w:tcPr>
+            <w:tcW w:w="2000" w:type="dxa"/>
+          </w:tcPr>
+          <w:p>
+            <w:pPr/>
+            <w:r>
+              <w:t xml:space="preserve">decimal</w:t>
+            </w:r>
+          </w:p>
+        </w:tc>
+        <w:tc>
+          <w:tcPr>
+            <w:tcW w:w="2000" w:type="dxa"/>
+          </w:tcPr>
+          <w:p>
+            <w:pPr/>
+            <w:r>
+              <w:t xml:space="preserve">(19,6)</w:t>
+            </w:r>
+          </w:p>
+        </w:tc>
+        <w:tc>
+          <w:tcPr>
+            <w:tcW w:w="2000" w:type="dxa"/>
+          </w:tcPr>
+          <w:p>
+            <w:pPr/>
+            <w:r>
+              <w:t xml:space="preserve">NOT NULL</w:t>
+            </w:r>
+          </w:p>
+        </w:tc>
+      </w:tr>
+      <w:tr>
+        <w:trPr>
+          <w:trHeight w:val="530" w:hRule="atLeast"/>
+        </w:trPr>
+        <w:tc>
+          <w:tcPr>
+            <w:tcW w:w="2000" w:type="dxa"/>
+          </w:tcPr>
+          <w:p>
+            <w:pPr/>
+            <w:r>
+              <w:t xml:space="preserve">amount</w:t>
+            </w:r>
+          </w:p>
+        </w:tc>
+        <w:tc>
+          <w:tcPr>
+            <w:tcW w:w="2000" w:type="dxa"/>
+          </w:tcPr>
+          <w:p>
+            <w:pPr/>
+            <w:r>
+              <w:t xml:space="preserve">decimal</w:t>
+            </w:r>
+          </w:p>
+        </w:tc>
+        <w:tc>
+          <w:tcPr>
+            <w:tcW w:w="2000" w:type="dxa"/>
+          </w:tcPr>
+          <w:p>
+            <w:pPr/>
+            <w:r>
+              <w:t xml:space="preserve">(19,4)</w:t>
+            </w:r>
+          </w:p>
+        </w:tc>
+        <w:tc>
+          <w:tcPr>
+            <w:tcW w:w="2000" w:type="dxa"/>
+          </w:tcPr>
+          <w:p>
+            <w:pPr/>
+            <w:r>
+              <w:t xml:space="preserve">NOT NULL</w:t>
+            </w:r>
+          </w:p>
+        </w:tc>
+      </w:tr>
+      <w:tr>
+        <w:trPr>
+          <w:trHeight w:val="530" w:hRule="atLeast"/>
+        </w:trPr>
+        <w:tc>
+          <w:tcPr>
+            <w:tcW w:w="2000" w:type="dxa"/>
+          </w:tcPr>
+          <w:p>
+            <w:pPr/>
+            <w:r>
+              <w:t xml:space="preserve">company_id</w:t>
+            </w:r>
+          </w:p>
+        </w:tc>
+        <w:tc>
+          <w:tcPr>
+            <w:tcW w:w="2000" w:type="dxa"/>
+          </w:tcPr>
+          <w:p>
+            <w:pPr/>
+            <w:r>
+              <w:t xml:space="preserve">bigint</w:t>
+            </w:r>
+          </w:p>
+        </w:tc>
+        <w:tc>
+          <w:tcPr>
+            <w:tcW w:w="2000" w:type="dxa"/>
+          </w:tcPr>
+          <w:p>
+            <w:pPr/>
+            <w:r>
+              <w:t xml:space="preserve">-</w:t>
+            </w:r>
+          </w:p>
+        </w:tc>
+        <w:tc>
+          <w:tcPr>
+            <w:tcW w:w="2000" w:type="dxa"/>
+          </w:tcPr>
+          <w:p>
+            <w:pPr/>
+            <w:r>
+              <w:t xml:space="preserve">FK, NOT NULL</w:t>
+            </w:r>
+          </w:p>
+        </w:tc>
+      </w:tr>
+      <w:tr>
+        <w:trPr>
+          <w:trHeight w:val="530" w:hRule="atLeast"/>
+        </w:trPr>
+        <w:tc>
+          <w:tcPr>
+            <w:tcW w:w="2000" w:type="dxa"/>
+          </w:tcPr>
+          <w:p>
+            <w:pPr/>
+            <w:r>
+              <w:t xml:space="preserve">created_at</w:t>
+            </w:r>
+          </w:p>
+        </w:tc>
+        <w:tc>
+          <w:tcPr>
+            <w:tcW w:w="2000" w:type="dxa"/>
+          </w:tcPr>
+          <w:p>
+            <w:pPr/>
+            <w:r>
+              <w:t xml:space="preserve">datetime2</w:t>
+            </w:r>
+          </w:p>
+        </w:tc>
+        <w:tc>
+          <w:tcPr>
+            <w:tcW w:w="2000" w:type="dxa"/>
+          </w:tcPr>
+          <w:p>
+            <w:pPr/>
+            <w:r>
+              <w:t xml:space="preserve">(6)</w:t>
+            </w:r>
+          </w:p>
+        </w:tc>
+        <w:tc>
+          <w:tcPr>
+            <w:tcW w:w="2000" w:type="dxa"/>
+          </w:tcPr>
+          <w:p>
+            <w:pPr/>
+            <w:r>
+              <w:t xml:space="preserve">NOT NULL</w:t>
+            </w:r>
+          </w:p>
+        </w:tc>
+      </w:tr>
+      <w:tr>
+        <w:trPr>
+          <w:trHeight w:val="530" w:hRule="atLeast"/>
+        </w:trPr>
+        <w:tc>
+          <w:tcPr>
+            <w:tcW w:w="2000" w:type="dxa"/>
+          </w:tcPr>
+          <w:p>
+            <w:pPr/>
+            <w:r>
+              <w:t xml:space="preserve">created_by</w:t>
+            </w:r>
+          </w:p>
+        </w:tc>
+        <w:tc>
+          <w:tcPr>
+            <w:tcW w:w="2000" w:type="dxa"/>
+          </w:tcPr>
+          <w:p>
+            <w:pPr/>
+            <w:r>
+              <w:t xml:space="preserve">bigint</w:t>
+            </w:r>
+          </w:p>
+        </w:tc>
+        <w:tc>
+          <w:tcPr>
+            <w:tcW w:w="2000" w:type="dxa"/>
+          </w:tcPr>
+          <w:p>
+            <w:pPr/>
+            <w:r>
+              <w:t xml:space="preserve">-</w:t>
+            </w:r>
+          </w:p>
+        </w:tc>
+        <w:tc>
+          <w:tcPr>
+            <w:tcW w:w="2000" w:type="dxa"/>
+          </w:tcPr>
+          <w:p>
+            <w:pPr/>
+            <w:r>
+              <w:t xml:space="preserve">NOT NULL</w:t>
+            </w:r>
+          </w:p>
+        </w:tc>
+      </w:tr>
+      <w:tr>
+        <w:trPr>
+          <w:trHeight w:val="530" w:hRule="atLeast"/>
+        </w:trPr>
+        <w:tc>
+          <w:tcPr>
+            <w:tcW w:w="2000" w:type="dxa"/>
+          </w:tcPr>
+          <w:p>
+            <w:pPr/>
+            <w:r>
+              <w:t xml:space="preserve">updated_at</w:t>
+            </w:r>
+          </w:p>
+        </w:tc>
+        <w:tc>
+          <w:tcPr>
+            <w:tcW w:w="2000" w:type="dxa"/>
+          </w:tcPr>
+          <w:p>
+            <w:pPr/>
+            <w:r>
+              <w:t xml:space="preserve">datetime2</w:t>
+            </w:r>
+          </w:p>
+        </w:tc>
+        <w:tc>
+          <w:tcPr>
+            <w:tcW w:w="2000" w:type="dxa"/>
+          </w:tcPr>
+          <w:p>
+            <w:pPr/>
+            <w:r>
+              <w:t xml:space="preserve">(6)</w:t>
+            </w:r>
+          </w:p>
+        </w:tc>
+        <w:tc>
+          <w:tcPr>
+            <w:tcW w:w="2000" w:type="dxa"/>
+          </w:tcPr>
+          <w:p>
+            <w:pPr/>
+            <w:r>
+              <w:t xml:space="preserve">IS NULL</w:t>
+            </w:r>
+          </w:p>
+        </w:tc>
+      </w:tr>
+      <w:tr>
+        <w:trPr>
+          <w:trHeight w:val="530" w:hRule="atLeast"/>
+        </w:trPr>
+        <w:tc>
+          <w:tcPr>
+            <w:tcW w:w="2000" w:type="dxa"/>
+          </w:tcPr>
+          <w:p>
+            <w:pPr/>
+            <w:r>
+              <w:t xml:space="preserve">updated_by</w:t>
+            </w:r>
+          </w:p>
+        </w:tc>
+        <w:tc>
+          <w:tcPr>
+            <w:tcW w:w="2000" w:type="dxa"/>
+          </w:tcPr>
+          <w:p>
+            <w:pPr/>
+            <w:r>
+              <w:t xml:space="preserve">bigint</w:t>
+            </w:r>
+          </w:p>
+        </w:tc>
+        <w:tc>
+          <w:tcPr>
+            <w:tcW w:w="2000" w:type="dxa"/>
+          </w:tcPr>
+          <w:p>
+            <w:pPr/>
+            <w:r>
+              <w:t xml:space="preserve">-</w:t>
+            </w:r>
+          </w:p>
+        </w:tc>
+        <w:tc>
+          <w:tcPr>
+            <w:tcW w:w="2000" w:type="dxa"/>
+          </w:tcPr>
+          <w:p>
+            <w:pPr/>
+            <w:r>
+              <w:t xml:space="preserve">IS NULL</w:t>
+            </w:r>
+          </w:p>
+        </w:tc>
+      </w:tr>
+      <w:tr>
+        <w:trPr>
+          <w:trHeight w:val="530" w:hRule="atLeast"/>
+        </w:trPr>
+        <w:tc>
+          <w:tcPr>
+            <w:tcW w:w="2000" w:type="dxa"/>
+          </w:tcPr>
+          <w:p>
+            <w:pPr/>
+            <w:r>
+              <w:t xml:space="preserve">version</w:t>
+            </w:r>
+          </w:p>
+        </w:tc>
+        <w:tc>
+          <w:tcPr>
+            <w:tcW w:w="2000" w:type="dxa"/>
+          </w:tcPr>
+          <w:p>
+            <w:pPr/>
+            <w:r>
+              <w:t xml:space="preserve">int</w:t>
+            </w:r>
+          </w:p>
+        </w:tc>
+        <w:tc>
+          <w:tcPr>
+            <w:tcW w:w="2000" w:type="dxa"/>
+          </w:tcPr>
+          <w:p>
+            <w:pPr/>
+            <w:r>
+              <w:t xml:space="preserve">-</w:t>
+            </w:r>
+          </w:p>
+        </w:tc>
+        <w:tc>
+          <w:tcPr>
+            <w:tcW w:w="2000" w:type="dxa"/>
+          </w:tcPr>
+          <w:p>
+            <w:pPr/>
+            <w:r>
+              <w:t xml:space="preserve">NOT NULL</w:t>
+            </w:r>
+          </w:p>
+        </w:tc>
+      </w:tr>
+    </w:tbl>
+    <w:p/>
+    <w:p>
+      <w:pPr/>
+      <w:r>
         <w:t xml:space="preserve">Table Name: inv_other_receipt</w:t>
       </w:r>
     </w:p>
@@ -42280,6 +43982,63 @@
           <w:i/>
         </w:rPr>
         <w:t xml:space="preserve">[Pending] System screenshot of Other Inbound Edit Interface.</w:t>
+      </w:r>
+    </w:p>
+    <w:p>
+      <w:pPr>
+        <w:pStyle w:val="Heading5"/>
+      </w:pPr>
+      <w:r>
+        <w:t xml:space="preserve">4.2.1.5.5 Other Outbound Create Interface</w:t>
+      </w:r>
+    </w:p>
+    <w:p>
+      <w:pPr>
+        <w:jc w:val="center"/>
+      </w:pPr>
+      <w:r>
+        <w:rPr>
+          <w:i/>
+        </w:rPr>
+        <w:t xml:space="preserve">[Pending] System screenshot of Other Outbound Create Interface.</w:t>
+      </w:r>
+    </w:p>
+    <w:p>
+      <w:pPr>
+        <w:pStyle w:val="Heading5"/>
+      </w:pPr>
+      <w:r>
+        <w:t xml:space="preserve">4.2.1.5.6 Other Outbound View Interface</w:t>
+      </w:r>
+    </w:p>
+    <w:p>
+      <w:pPr>
+        <w:jc w:val="center"/>
+      </w:pPr>
+      <w:r>
+        <w:rPr>
+          <w:i/>
+        </w:rPr>
+        <w:t xml:space="preserve">[Pending] System screenshot of Other Outbound View Interface.</w:t>
+      </w:r>
+    </w:p>
+    <w:p>
+      <w:pPr>
+        <w:pStyle w:val="Heading5"/>
+      </w:pPr>
+      <w:r>
+        <w:t xml:space="preserve">4.2.1.5.7 Other Outbound Edit Interface</w:t>
+      </w:r>
+    </w:p>
+    <w:p>
+      <w:pPr>
+        <w:jc w:val="center"/>
+      </w:pPr>
+      <w:r>
+        <w:rPr>
+          <w:i/>
+        </w:rPr>
+        <w:t xml:space="preserve">[Pending] System screenshot of Other Outbound Edit Interface.</w:t>
       </w:r>
     </w:p>
     <w:p>
@@ -43925,7 +45684,7 @@
       </w:r>
     </w:p>
     <w:sectPr>
-      <w:footerReference xmlns:r="http://schemas.openxmlformats.org/officeDocument/2006/relationships" w:type="default" r:id="Rc4412c99277d44c1"/>
+      <w:footerReference xmlns:r="http://schemas.openxmlformats.org/officeDocument/2006/relationships" w:type="default" r:id="R3f6eee962cac4d09"/>
       <w:pgSz w:w="11906" w:h="16838"/>
       <w:pgMar w:top="1440" w:right="1440" w:bottom="1440" w:left="1440" w:header="720" w:footer="720" w:gutter="0"/>
     </w:sectPr>

</xml_diff>

<commit_message>
feat(inv): add stock query page with print and safe CSV export
Completes WU-INV-006b and closes WU-INV-006: trilingual /inv/stock-query with permission-scoped balance and movement tabs, MD names, filtered print and formula-safe CSV (numeric values kept numeric), Vitest and Playwright INV-QRY-004.

Co-Authored-By: Claude Opus 5.5 <noreply@anthropic.com>
</commit_message>
<xml_diff>
--- a/docs/99-output/MyERP_SDS.docx
+++ b/docs/99-output/MyERP_SDS.docx
@@ -43925,6 +43925,25 @@
       </w:pPr>
       <w:r>
         <w:t xml:space="preserve">4.2.1.5 Inventory Module</w:t>
+      </w:r>
+    </w:p>
+    <w:p>
+      <w:pPr>
+        <w:pStyle w:val="Heading5"/>
+      </w:pPr>
+      <w:r>
+        <w:t xml:space="preserve">4.2.1.5.1 Inventory View Interface</w:t>
+      </w:r>
+    </w:p>
+    <w:p>
+      <w:pPr>
+        <w:jc w:val="center"/>
+      </w:pPr>
+      <w:r>
+        <w:rPr>
+          <w:i/>
+        </w:rPr>
+        <w:t xml:space="preserve">[Pending] System screenshot of Inventory View Interface.</w:t>
       </w:r>
     </w:p>
     <w:p>
@@ -45684,7 +45703,7 @@
       </w:r>
     </w:p>
     <w:sectPr>
-      <w:footerReference xmlns:r="http://schemas.openxmlformats.org/officeDocument/2006/relationships" w:type="default" r:id="R213acbf7a3b949f4"/>
+      <w:footerReference xmlns:r="http://schemas.openxmlformats.org/officeDocument/2006/relationships" w:type="default" r:id="R7ba5334c5b194fd4"/>
       <w:pgSz w:w="11906" w:h="16838"/>
       <w:pgMar w:top="1440" w:right="1440" w:bottom="1440" w:left="1440" w:header="720" w:footer="720" w:gutter="0"/>
     </w:sectPr>

</xml_diff>

<commit_message>
feat(inv): add opening stock preview and idempotent posting API
WU-INV-007a (ADR-059): inv_opening_stock tables, per-line preview errors,
request-key idempotent submit posting OPENING_STOCK movements in one
transaction, list/detail endpoints and real SQL/HTTP tests.

Co-Authored-By: Claude Opus 5.5 <noreply@anthropic.com>
</commit_message>
<xml_diff>
--- a/docs/99-output/MyERP_SDS.docx
+++ b/docs/99-output/MyERP_SDS.docx
@@ -610,6 +610,1561 @@
         <w:t xml:space="preserve">Figure 4.1.1 Entity Relationship Diagram (Part 1)</w:t>
       </w:r>
     </w:p>
+    <w:p>
+      <w:pPr/>
+      <w:r>
+        <w:t xml:space="preserve">Table Name: inv_opening_stock</w:t>
+      </w:r>
+    </w:p>
+    <w:p>
+      <w:pPr/>
+      <w:r>
+        <w:t xml:space="preserve">Primary Key: id</w:t>
+      </w:r>
+    </w:p>
+    <w:p>
+      <w:pPr/>
+      <w:r>
+        <w:t xml:space="preserve">This table stores immutable product initial stock batches with the idempotent request key, opening date and posting time.</w:t>
+      </w:r>
+    </w:p>
+    <w:tbl>
+      <w:tblPr>
+        <w:tblStyle w:val="TableGrid"/>
+        <w:tblW w:w="8000" w:type="dxa"/>
+        <w:jc w:val="left"/>
+        <w:tblBorders>
+          <w:top w:val="single" w:color="000000" w:sz="4" w:space="0"/>
+          <w:left w:val="single" w:color="000000" w:sz="4" w:space="0"/>
+          <w:bottom w:val="single" w:color="000000" w:sz="4" w:space="0"/>
+          <w:right w:val="single" w:color="000000" w:sz="4" w:space="0"/>
+          <w:insideH w:val="single" w:color="000000" w:sz="4" w:space="0"/>
+          <w:insideV w:val="single" w:color="000000" w:sz="4" w:space="0"/>
+        </w:tblBorders>
+        <w:tblLayout w:type="fixed"/>
+        <w:tblCellMar>
+          <w:top w:w="100" w:type="dxa"/>
+          <w:left w:w="100" w:type="dxa"/>
+          <w:bottom w:w="100" w:type="dxa"/>
+          <w:right w:w="100" w:type="dxa"/>
+        </w:tblCellMar>
+      </w:tblPr>
+      <w:tblGrid>
+        <w:gridCol w:w="2000"/>
+        <w:gridCol w:w="2000"/>
+        <w:gridCol w:w="2000"/>
+        <w:gridCol w:w="2000"/>
+      </w:tblGrid>
+      <w:tr>
+        <w:trPr>
+          <w:trHeight w:val="530" w:hRule="atLeast"/>
+        </w:trPr>
+        <w:tc>
+          <w:tcPr>
+            <w:tcW w:w="2000" w:type="dxa"/>
+          </w:tcPr>
+          <w:p>
+            <w:pPr>
+              <w:jc w:val="center"/>
+            </w:pPr>
+            <w:r>
+              <w:rPr>
+                <w:b/>
+              </w:rPr>
+              <w:t xml:space="preserve">Name of Attribute</w:t>
+            </w:r>
+          </w:p>
+        </w:tc>
+        <w:tc>
+          <w:tcPr>
+            <w:tcW w:w="2000" w:type="dxa"/>
+          </w:tcPr>
+          <w:p>
+            <w:pPr>
+              <w:jc w:val="center"/>
+            </w:pPr>
+            <w:r>
+              <w:rPr>
+                <w:b/>
+              </w:rPr>
+              <w:t xml:space="preserve">Data Type</w:t>
+            </w:r>
+          </w:p>
+        </w:tc>
+        <w:tc>
+          <w:tcPr>
+            <w:tcW w:w="2000" w:type="dxa"/>
+          </w:tcPr>
+          <w:p>
+            <w:pPr>
+              <w:jc w:val="center"/>
+            </w:pPr>
+            <w:r>
+              <w:rPr>
+                <w:b/>
+              </w:rPr>
+              <w:t xml:space="preserve">Size</w:t>
+            </w:r>
+          </w:p>
+        </w:tc>
+        <w:tc>
+          <w:tcPr>
+            <w:tcW w:w="2000" w:type="dxa"/>
+          </w:tcPr>
+          <w:p>
+            <w:pPr>
+              <w:jc w:val="center"/>
+            </w:pPr>
+            <w:r>
+              <w:rPr>
+                <w:b/>
+              </w:rPr>
+              <w:t xml:space="preserve">PK/FK/IS NULL/ NOT NULL</w:t>
+            </w:r>
+          </w:p>
+        </w:tc>
+      </w:tr>
+      <w:tr>
+        <w:trPr>
+          <w:trHeight w:val="530" w:hRule="atLeast"/>
+        </w:trPr>
+        <w:tc>
+          <w:tcPr>
+            <w:tcW w:w="2000" w:type="dxa"/>
+          </w:tcPr>
+          <w:p>
+            <w:pPr/>
+            <w:r>
+              <w:t xml:space="preserve">id</w:t>
+            </w:r>
+          </w:p>
+        </w:tc>
+        <w:tc>
+          <w:tcPr>
+            <w:tcW w:w="2000" w:type="dxa"/>
+          </w:tcPr>
+          <w:p>
+            <w:pPr/>
+            <w:r>
+              <w:t xml:space="preserve">bigint</w:t>
+            </w:r>
+          </w:p>
+        </w:tc>
+        <w:tc>
+          <w:tcPr>
+            <w:tcW w:w="2000" w:type="dxa"/>
+          </w:tcPr>
+          <w:p>
+            <w:pPr/>
+            <w:r>
+              <w:t xml:space="preserve">-</w:t>
+            </w:r>
+          </w:p>
+        </w:tc>
+        <w:tc>
+          <w:tcPr>
+            <w:tcW w:w="2000" w:type="dxa"/>
+          </w:tcPr>
+          <w:p>
+            <w:pPr/>
+            <w:r>
+              <w:t xml:space="preserve">PK, NOT NULL</w:t>
+            </w:r>
+          </w:p>
+        </w:tc>
+      </w:tr>
+      <w:tr>
+        <w:trPr>
+          <w:trHeight w:val="530" w:hRule="atLeast"/>
+        </w:trPr>
+        <w:tc>
+          <w:tcPr>
+            <w:tcW w:w="2000" w:type="dxa"/>
+          </w:tcPr>
+          <w:p>
+            <w:pPr/>
+            <w:r>
+              <w:t xml:space="preserve">request_key</w:t>
+            </w:r>
+          </w:p>
+        </w:tc>
+        <w:tc>
+          <w:tcPr>
+            <w:tcW w:w="2000" w:type="dxa"/>
+          </w:tcPr>
+          <w:p>
+            <w:pPr/>
+            <w:r>
+              <w:t xml:space="preserve">varchar</w:t>
+            </w:r>
+          </w:p>
+        </w:tc>
+        <w:tc>
+          <w:tcPr>
+            <w:tcW w:w="2000" w:type="dxa"/>
+          </w:tcPr>
+          <w:p>
+            <w:pPr/>
+            <w:r>
+              <w:t xml:space="preserve">64</w:t>
+            </w:r>
+          </w:p>
+        </w:tc>
+        <w:tc>
+          <w:tcPr>
+            <w:tcW w:w="2000" w:type="dxa"/>
+          </w:tcPr>
+          <w:p>
+            <w:pPr/>
+            <w:r>
+              <w:t xml:space="preserve">NOT NULL</w:t>
+            </w:r>
+          </w:p>
+        </w:tc>
+      </w:tr>
+      <w:tr>
+        <w:trPr>
+          <w:trHeight w:val="530" w:hRule="atLeast"/>
+        </w:trPr>
+        <w:tc>
+          <w:tcPr>
+            <w:tcW w:w="2000" w:type="dxa"/>
+          </w:tcPr>
+          <w:p>
+            <w:pPr/>
+            <w:r>
+              <w:t xml:space="preserve">opening_date</w:t>
+            </w:r>
+          </w:p>
+        </w:tc>
+        <w:tc>
+          <w:tcPr>
+            <w:tcW w:w="2000" w:type="dxa"/>
+          </w:tcPr>
+          <w:p>
+            <w:pPr/>
+            <w:r>
+              <w:t xml:space="preserve">date</w:t>
+            </w:r>
+          </w:p>
+        </w:tc>
+        <w:tc>
+          <w:tcPr>
+            <w:tcW w:w="2000" w:type="dxa"/>
+          </w:tcPr>
+          <w:p>
+            <w:pPr/>
+            <w:r>
+              <w:t xml:space="preserve">-</w:t>
+            </w:r>
+          </w:p>
+        </w:tc>
+        <w:tc>
+          <w:tcPr>
+            <w:tcW w:w="2000" w:type="dxa"/>
+          </w:tcPr>
+          <w:p>
+            <w:pPr/>
+            <w:r>
+              <w:t xml:space="preserve">NOT NULL</w:t>
+            </w:r>
+          </w:p>
+        </w:tc>
+      </w:tr>
+      <w:tr>
+        <w:trPr>
+          <w:trHeight w:val="530" w:hRule="atLeast"/>
+        </w:trPr>
+        <w:tc>
+          <w:tcPr>
+            <w:tcW w:w="2000" w:type="dxa"/>
+          </w:tcPr>
+          <w:p>
+            <w:pPr/>
+            <w:r>
+              <w:t xml:space="preserve">remark</w:t>
+            </w:r>
+          </w:p>
+        </w:tc>
+        <w:tc>
+          <w:tcPr>
+            <w:tcW w:w="2000" w:type="dxa"/>
+          </w:tcPr>
+          <w:p>
+            <w:pPr/>
+            <w:r>
+              <w:t xml:space="preserve">nvarchar</w:t>
+            </w:r>
+          </w:p>
+        </w:tc>
+        <w:tc>
+          <w:tcPr>
+            <w:tcW w:w="2000" w:type="dxa"/>
+          </w:tcPr>
+          <w:p>
+            <w:pPr/>
+            <w:r>
+              <w:t xml:space="preserve">500</w:t>
+            </w:r>
+          </w:p>
+        </w:tc>
+        <w:tc>
+          <w:tcPr>
+            <w:tcW w:w="2000" w:type="dxa"/>
+          </w:tcPr>
+          <w:p>
+            <w:pPr/>
+            <w:r>
+              <w:t xml:space="preserve">IS NULL</w:t>
+            </w:r>
+          </w:p>
+        </w:tc>
+      </w:tr>
+      <w:tr>
+        <w:trPr>
+          <w:trHeight w:val="530" w:hRule="atLeast"/>
+        </w:trPr>
+        <w:tc>
+          <w:tcPr>
+            <w:tcW w:w="2000" w:type="dxa"/>
+          </w:tcPr>
+          <w:p>
+            <w:pPr/>
+            <w:r>
+              <w:t xml:space="preserve">custom_fields</w:t>
+            </w:r>
+          </w:p>
+        </w:tc>
+        <w:tc>
+          <w:tcPr>
+            <w:tcW w:w="2000" w:type="dxa"/>
+          </w:tcPr>
+          <w:p>
+            <w:pPr/>
+            <w:r>
+              <w:t xml:space="preserve">nvarchar</w:t>
+            </w:r>
+          </w:p>
+        </w:tc>
+        <w:tc>
+          <w:tcPr>
+            <w:tcW w:w="2000" w:type="dxa"/>
+          </w:tcPr>
+          <w:p>
+            <w:pPr/>
+            <w:r>
+              <w:t xml:space="preserve">MAX</w:t>
+            </w:r>
+          </w:p>
+        </w:tc>
+        <w:tc>
+          <w:tcPr>
+            <w:tcW w:w="2000" w:type="dxa"/>
+          </w:tcPr>
+          <w:p>
+            <w:pPr/>
+            <w:r>
+              <w:t xml:space="preserve">IS NULL</w:t>
+            </w:r>
+          </w:p>
+        </w:tc>
+      </w:tr>
+      <w:tr>
+        <w:trPr>
+          <w:trHeight w:val="530" w:hRule="atLeast"/>
+        </w:trPr>
+        <w:tc>
+          <w:tcPr>
+            <w:tcW w:w="2000" w:type="dxa"/>
+          </w:tcPr>
+          <w:p>
+            <w:pPr/>
+            <w:r>
+              <w:t xml:space="preserve">posted_at</w:t>
+            </w:r>
+          </w:p>
+        </w:tc>
+        <w:tc>
+          <w:tcPr>
+            <w:tcW w:w="2000" w:type="dxa"/>
+          </w:tcPr>
+          <w:p>
+            <w:pPr/>
+            <w:r>
+              <w:t xml:space="preserve">datetime2</w:t>
+            </w:r>
+          </w:p>
+        </w:tc>
+        <w:tc>
+          <w:tcPr>
+            <w:tcW w:w="2000" w:type="dxa"/>
+          </w:tcPr>
+          <w:p>
+            <w:pPr/>
+            <w:r>
+              <w:t xml:space="preserve">(6)</w:t>
+            </w:r>
+          </w:p>
+        </w:tc>
+        <w:tc>
+          <w:tcPr>
+            <w:tcW w:w="2000" w:type="dxa"/>
+          </w:tcPr>
+          <w:p>
+            <w:pPr/>
+            <w:r>
+              <w:t xml:space="preserve">NOT NULL</w:t>
+            </w:r>
+          </w:p>
+        </w:tc>
+      </w:tr>
+      <w:tr>
+        <w:trPr>
+          <w:trHeight w:val="530" w:hRule="atLeast"/>
+        </w:trPr>
+        <w:tc>
+          <w:tcPr>
+            <w:tcW w:w="2000" w:type="dxa"/>
+          </w:tcPr>
+          <w:p>
+            <w:pPr/>
+            <w:r>
+              <w:t xml:space="preserve">company_id</w:t>
+            </w:r>
+          </w:p>
+        </w:tc>
+        <w:tc>
+          <w:tcPr>
+            <w:tcW w:w="2000" w:type="dxa"/>
+          </w:tcPr>
+          <w:p>
+            <w:pPr/>
+            <w:r>
+              <w:t xml:space="preserve">bigint</w:t>
+            </w:r>
+          </w:p>
+        </w:tc>
+        <w:tc>
+          <w:tcPr>
+            <w:tcW w:w="2000" w:type="dxa"/>
+          </w:tcPr>
+          <w:p>
+            <w:pPr/>
+            <w:r>
+              <w:t xml:space="preserve">-</w:t>
+            </w:r>
+          </w:p>
+        </w:tc>
+        <w:tc>
+          <w:tcPr>
+            <w:tcW w:w="2000" w:type="dxa"/>
+          </w:tcPr>
+          <w:p>
+            <w:pPr/>
+            <w:r>
+              <w:t xml:space="preserve">NOT NULL</w:t>
+            </w:r>
+          </w:p>
+        </w:tc>
+      </w:tr>
+      <w:tr>
+        <w:trPr>
+          <w:trHeight w:val="530" w:hRule="atLeast"/>
+        </w:trPr>
+        <w:tc>
+          <w:tcPr>
+            <w:tcW w:w="2000" w:type="dxa"/>
+          </w:tcPr>
+          <w:p>
+            <w:pPr/>
+            <w:r>
+              <w:t xml:space="preserve">created_at</w:t>
+            </w:r>
+          </w:p>
+        </w:tc>
+        <w:tc>
+          <w:tcPr>
+            <w:tcW w:w="2000" w:type="dxa"/>
+          </w:tcPr>
+          <w:p>
+            <w:pPr/>
+            <w:r>
+              <w:t xml:space="preserve">datetime2</w:t>
+            </w:r>
+          </w:p>
+        </w:tc>
+        <w:tc>
+          <w:tcPr>
+            <w:tcW w:w="2000" w:type="dxa"/>
+          </w:tcPr>
+          <w:p>
+            <w:pPr/>
+            <w:r>
+              <w:t xml:space="preserve">(6)</w:t>
+            </w:r>
+          </w:p>
+        </w:tc>
+        <w:tc>
+          <w:tcPr>
+            <w:tcW w:w="2000" w:type="dxa"/>
+          </w:tcPr>
+          <w:p>
+            <w:pPr/>
+            <w:r>
+              <w:t xml:space="preserve">NOT NULL</w:t>
+            </w:r>
+          </w:p>
+        </w:tc>
+      </w:tr>
+      <w:tr>
+        <w:trPr>
+          <w:trHeight w:val="530" w:hRule="atLeast"/>
+        </w:trPr>
+        <w:tc>
+          <w:tcPr>
+            <w:tcW w:w="2000" w:type="dxa"/>
+          </w:tcPr>
+          <w:p>
+            <w:pPr/>
+            <w:r>
+              <w:t xml:space="preserve">created_by</w:t>
+            </w:r>
+          </w:p>
+        </w:tc>
+        <w:tc>
+          <w:tcPr>
+            <w:tcW w:w="2000" w:type="dxa"/>
+          </w:tcPr>
+          <w:p>
+            <w:pPr/>
+            <w:r>
+              <w:t xml:space="preserve">bigint</w:t>
+            </w:r>
+          </w:p>
+        </w:tc>
+        <w:tc>
+          <w:tcPr>
+            <w:tcW w:w="2000" w:type="dxa"/>
+          </w:tcPr>
+          <w:p>
+            <w:pPr/>
+            <w:r>
+              <w:t xml:space="preserve">-</w:t>
+            </w:r>
+          </w:p>
+        </w:tc>
+        <w:tc>
+          <w:tcPr>
+            <w:tcW w:w="2000" w:type="dxa"/>
+          </w:tcPr>
+          <w:p>
+            <w:pPr/>
+            <w:r>
+              <w:t xml:space="preserve">NOT NULL</w:t>
+            </w:r>
+          </w:p>
+        </w:tc>
+      </w:tr>
+      <w:tr>
+        <w:trPr>
+          <w:trHeight w:val="530" w:hRule="atLeast"/>
+        </w:trPr>
+        <w:tc>
+          <w:tcPr>
+            <w:tcW w:w="2000" w:type="dxa"/>
+          </w:tcPr>
+          <w:p>
+            <w:pPr/>
+            <w:r>
+              <w:t xml:space="preserve">updated_at</w:t>
+            </w:r>
+          </w:p>
+        </w:tc>
+        <w:tc>
+          <w:tcPr>
+            <w:tcW w:w="2000" w:type="dxa"/>
+          </w:tcPr>
+          <w:p>
+            <w:pPr/>
+            <w:r>
+              <w:t xml:space="preserve">datetime2</w:t>
+            </w:r>
+          </w:p>
+        </w:tc>
+        <w:tc>
+          <w:tcPr>
+            <w:tcW w:w="2000" w:type="dxa"/>
+          </w:tcPr>
+          <w:p>
+            <w:pPr/>
+            <w:r>
+              <w:t xml:space="preserve">(6)</w:t>
+            </w:r>
+          </w:p>
+        </w:tc>
+        <w:tc>
+          <w:tcPr>
+            <w:tcW w:w="2000" w:type="dxa"/>
+          </w:tcPr>
+          <w:p>
+            <w:pPr/>
+            <w:r>
+              <w:t xml:space="preserve">IS NULL</w:t>
+            </w:r>
+          </w:p>
+        </w:tc>
+      </w:tr>
+      <w:tr>
+        <w:trPr>
+          <w:trHeight w:val="530" w:hRule="atLeast"/>
+        </w:trPr>
+        <w:tc>
+          <w:tcPr>
+            <w:tcW w:w="2000" w:type="dxa"/>
+          </w:tcPr>
+          <w:p>
+            <w:pPr/>
+            <w:r>
+              <w:t xml:space="preserve">updated_by</w:t>
+            </w:r>
+          </w:p>
+        </w:tc>
+        <w:tc>
+          <w:tcPr>
+            <w:tcW w:w="2000" w:type="dxa"/>
+          </w:tcPr>
+          <w:p>
+            <w:pPr/>
+            <w:r>
+              <w:t xml:space="preserve">bigint</w:t>
+            </w:r>
+          </w:p>
+        </w:tc>
+        <w:tc>
+          <w:tcPr>
+            <w:tcW w:w="2000" w:type="dxa"/>
+          </w:tcPr>
+          <w:p>
+            <w:pPr/>
+            <w:r>
+              <w:t xml:space="preserve">-</w:t>
+            </w:r>
+          </w:p>
+        </w:tc>
+        <w:tc>
+          <w:tcPr>
+            <w:tcW w:w="2000" w:type="dxa"/>
+          </w:tcPr>
+          <w:p>
+            <w:pPr/>
+            <w:r>
+              <w:t xml:space="preserve">IS NULL</w:t>
+            </w:r>
+          </w:p>
+        </w:tc>
+      </w:tr>
+      <w:tr>
+        <w:trPr>
+          <w:trHeight w:val="530" w:hRule="atLeast"/>
+        </w:trPr>
+        <w:tc>
+          <w:tcPr>
+            <w:tcW w:w="2000" w:type="dxa"/>
+          </w:tcPr>
+          <w:p>
+            <w:pPr/>
+            <w:r>
+              <w:t xml:space="preserve">version</w:t>
+            </w:r>
+          </w:p>
+        </w:tc>
+        <w:tc>
+          <w:tcPr>
+            <w:tcW w:w="2000" w:type="dxa"/>
+          </w:tcPr>
+          <w:p>
+            <w:pPr/>
+            <w:r>
+              <w:t xml:space="preserve">int</w:t>
+            </w:r>
+          </w:p>
+        </w:tc>
+        <w:tc>
+          <w:tcPr>
+            <w:tcW w:w="2000" w:type="dxa"/>
+          </w:tcPr>
+          <w:p>
+            <w:pPr/>
+            <w:r>
+              <w:t xml:space="preserve">-</w:t>
+            </w:r>
+          </w:p>
+        </w:tc>
+        <w:tc>
+          <w:tcPr>
+            <w:tcW w:w="2000" w:type="dxa"/>
+          </w:tcPr>
+          <w:p>
+            <w:pPr/>
+            <w:r>
+              <w:t xml:space="preserve">NOT NULL</w:t>
+            </w:r>
+          </w:p>
+        </w:tc>
+      </w:tr>
+    </w:tbl>
+    <w:p/>
+    <w:p>
+      <w:pPr/>
+      <w:r>
+        <w:t xml:space="preserve">Table Name: inv_opening_stock_line</w:t>
+      </w:r>
+    </w:p>
+    <w:p>
+      <w:pPr/>
+      <w:r>
+        <w:t xml:space="preserve">Primary Key: id</w:t>
+      </w:r>
+    </w:p>
+    <w:p>
+      <w:pPr/>
+      <w:r>
+        <w:t xml:space="preserve">This table stores one opening quantity and unit cost per item, warehouse and optional location.</w:t>
+      </w:r>
+    </w:p>
+    <w:tbl>
+      <w:tblPr>
+        <w:tblStyle w:val="TableGrid"/>
+        <w:tblW w:w="8000" w:type="dxa"/>
+        <w:jc w:val="left"/>
+        <w:tblBorders>
+          <w:top w:val="single" w:color="000000" w:sz="4" w:space="0"/>
+          <w:left w:val="single" w:color="000000" w:sz="4" w:space="0"/>
+          <w:bottom w:val="single" w:color="000000" w:sz="4" w:space="0"/>
+          <w:right w:val="single" w:color="000000" w:sz="4" w:space="0"/>
+          <w:insideH w:val="single" w:color="000000" w:sz="4" w:space="0"/>
+          <w:insideV w:val="single" w:color="000000" w:sz="4" w:space="0"/>
+        </w:tblBorders>
+        <w:tblLayout w:type="fixed"/>
+        <w:tblCellMar>
+          <w:top w:w="100" w:type="dxa"/>
+          <w:left w:w="100" w:type="dxa"/>
+          <w:bottom w:w="100" w:type="dxa"/>
+          <w:right w:w="100" w:type="dxa"/>
+        </w:tblCellMar>
+      </w:tblPr>
+      <w:tblGrid>
+        <w:gridCol w:w="2000"/>
+        <w:gridCol w:w="2000"/>
+        <w:gridCol w:w="2000"/>
+        <w:gridCol w:w="2000"/>
+      </w:tblGrid>
+      <w:tr>
+        <w:trPr>
+          <w:trHeight w:val="530" w:hRule="atLeast"/>
+        </w:trPr>
+        <w:tc>
+          <w:tcPr>
+            <w:tcW w:w="2000" w:type="dxa"/>
+          </w:tcPr>
+          <w:p>
+            <w:pPr>
+              <w:jc w:val="center"/>
+            </w:pPr>
+            <w:r>
+              <w:rPr>
+                <w:b/>
+              </w:rPr>
+              <w:t xml:space="preserve">Name of Attribute</w:t>
+            </w:r>
+          </w:p>
+        </w:tc>
+        <w:tc>
+          <w:tcPr>
+            <w:tcW w:w="2000" w:type="dxa"/>
+          </w:tcPr>
+          <w:p>
+            <w:pPr>
+              <w:jc w:val="center"/>
+            </w:pPr>
+            <w:r>
+              <w:rPr>
+                <w:b/>
+              </w:rPr>
+              <w:t xml:space="preserve">Data Type</w:t>
+            </w:r>
+          </w:p>
+        </w:tc>
+        <w:tc>
+          <w:tcPr>
+            <w:tcW w:w="2000" w:type="dxa"/>
+          </w:tcPr>
+          <w:p>
+            <w:pPr>
+              <w:jc w:val="center"/>
+            </w:pPr>
+            <w:r>
+              <w:rPr>
+                <w:b/>
+              </w:rPr>
+              <w:t xml:space="preserve">Size</w:t>
+            </w:r>
+          </w:p>
+        </w:tc>
+        <w:tc>
+          <w:tcPr>
+            <w:tcW w:w="2000" w:type="dxa"/>
+          </w:tcPr>
+          <w:p>
+            <w:pPr>
+              <w:jc w:val="center"/>
+            </w:pPr>
+            <w:r>
+              <w:rPr>
+                <w:b/>
+              </w:rPr>
+              <w:t xml:space="preserve">PK/FK/IS NULL/ NOT NULL</w:t>
+            </w:r>
+          </w:p>
+        </w:tc>
+      </w:tr>
+      <w:tr>
+        <w:trPr>
+          <w:trHeight w:val="530" w:hRule="atLeast"/>
+        </w:trPr>
+        <w:tc>
+          <w:tcPr>
+            <w:tcW w:w="2000" w:type="dxa"/>
+          </w:tcPr>
+          <w:p>
+            <w:pPr/>
+            <w:r>
+              <w:t xml:space="preserve">id</w:t>
+            </w:r>
+          </w:p>
+        </w:tc>
+        <w:tc>
+          <w:tcPr>
+            <w:tcW w:w="2000" w:type="dxa"/>
+          </w:tcPr>
+          <w:p>
+            <w:pPr/>
+            <w:r>
+              <w:t xml:space="preserve">bigint</w:t>
+            </w:r>
+          </w:p>
+        </w:tc>
+        <w:tc>
+          <w:tcPr>
+            <w:tcW w:w="2000" w:type="dxa"/>
+          </w:tcPr>
+          <w:p>
+            <w:pPr/>
+            <w:r>
+              <w:t xml:space="preserve">-</w:t>
+            </w:r>
+          </w:p>
+        </w:tc>
+        <w:tc>
+          <w:tcPr>
+            <w:tcW w:w="2000" w:type="dxa"/>
+          </w:tcPr>
+          <w:p>
+            <w:pPr/>
+            <w:r>
+              <w:t xml:space="preserve">PK, NOT NULL</w:t>
+            </w:r>
+          </w:p>
+        </w:tc>
+      </w:tr>
+      <w:tr>
+        <w:trPr>
+          <w:trHeight w:val="530" w:hRule="atLeast"/>
+        </w:trPr>
+        <w:tc>
+          <w:tcPr>
+            <w:tcW w:w="2000" w:type="dxa"/>
+          </w:tcPr>
+          <w:p>
+            <w:pPr/>
+            <w:r>
+              <w:t xml:space="preserve">opening_stock_id</w:t>
+            </w:r>
+          </w:p>
+        </w:tc>
+        <w:tc>
+          <w:tcPr>
+            <w:tcW w:w="2000" w:type="dxa"/>
+          </w:tcPr>
+          <w:p>
+            <w:pPr/>
+            <w:r>
+              <w:t xml:space="preserve">bigint</w:t>
+            </w:r>
+          </w:p>
+        </w:tc>
+        <w:tc>
+          <w:tcPr>
+            <w:tcW w:w="2000" w:type="dxa"/>
+          </w:tcPr>
+          <w:p>
+            <w:pPr/>
+            <w:r>
+              <w:t xml:space="preserve">-</w:t>
+            </w:r>
+          </w:p>
+        </w:tc>
+        <w:tc>
+          <w:tcPr>
+            <w:tcW w:w="2000" w:type="dxa"/>
+          </w:tcPr>
+          <w:p>
+            <w:pPr/>
+            <w:r>
+              <w:t xml:space="preserve">FK, NOT NULL</w:t>
+            </w:r>
+          </w:p>
+        </w:tc>
+      </w:tr>
+      <w:tr>
+        <w:trPr>
+          <w:trHeight w:val="530" w:hRule="atLeast"/>
+        </w:trPr>
+        <w:tc>
+          <w:tcPr>
+            <w:tcW w:w="2000" w:type="dxa"/>
+          </w:tcPr>
+          <w:p>
+            <w:pPr/>
+            <w:r>
+              <w:t xml:space="preserve">line_no</w:t>
+            </w:r>
+          </w:p>
+        </w:tc>
+        <w:tc>
+          <w:tcPr>
+            <w:tcW w:w="2000" w:type="dxa"/>
+          </w:tcPr>
+          <w:p>
+            <w:pPr/>
+            <w:r>
+              <w:t xml:space="preserve">int</w:t>
+            </w:r>
+          </w:p>
+        </w:tc>
+        <w:tc>
+          <w:tcPr>
+            <w:tcW w:w="2000" w:type="dxa"/>
+          </w:tcPr>
+          <w:p>
+            <w:pPr/>
+            <w:r>
+              <w:t xml:space="preserve">-</w:t>
+            </w:r>
+          </w:p>
+        </w:tc>
+        <w:tc>
+          <w:tcPr>
+            <w:tcW w:w="2000" w:type="dxa"/>
+          </w:tcPr>
+          <w:p>
+            <w:pPr/>
+            <w:r>
+              <w:t xml:space="preserve">NOT NULL</w:t>
+            </w:r>
+          </w:p>
+        </w:tc>
+      </w:tr>
+      <w:tr>
+        <w:trPr>
+          <w:trHeight w:val="530" w:hRule="atLeast"/>
+        </w:trPr>
+        <w:tc>
+          <w:tcPr>
+            <w:tcW w:w="2000" w:type="dxa"/>
+          </w:tcPr>
+          <w:p>
+            <w:pPr/>
+            <w:r>
+              <w:t xml:space="preserve">item_id</w:t>
+            </w:r>
+          </w:p>
+        </w:tc>
+        <w:tc>
+          <w:tcPr>
+            <w:tcW w:w="2000" w:type="dxa"/>
+          </w:tcPr>
+          <w:p>
+            <w:pPr/>
+            <w:r>
+              <w:t xml:space="preserve">bigint</w:t>
+            </w:r>
+          </w:p>
+        </w:tc>
+        <w:tc>
+          <w:tcPr>
+            <w:tcW w:w="2000" w:type="dxa"/>
+          </w:tcPr>
+          <w:p>
+            <w:pPr/>
+            <w:r>
+              <w:t xml:space="preserve">-</w:t>
+            </w:r>
+          </w:p>
+        </w:tc>
+        <w:tc>
+          <w:tcPr>
+            <w:tcW w:w="2000" w:type="dxa"/>
+          </w:tcPr>
+          <w:p>
+            <w:pPr/>
+            <w:r>
+              <w:t xml:space="preserve">NOT NULL</w:t>
+            </w:r>
+          </w:p>
+        </w:tc>
+      </w:tr>
+      <w:tr>
+        <w:trPr>
+          <w:trHeight w:val="530" w:hRule="atLeast"/>
+        </w:trPr>
+        <w:tc>
+          <w:tcPr>
+            <w:tcW w:w="2000" w:type="dxa"/>
+          </w:tcPr>
+          <w:p>
+            <w:pPr/>
+            <w:r>
+              <w:t xml:space="preserve">warehouse_id</w:t>
+            </w:r>
+          </w:p>
+        </w:tc>
+        <w:tc>
+          <w:tcPr>
+            <w:tcW w:w="2000" w:type="dxa"/>
+          </w:tcPr>
+          <w:p>
+            <w:pPr/>
+            <w:r>
+              <w:t xml:space="preserve">bigint</w:t>
+            </w:r>
+          </w:p>
+        </w:tc>
+        <w:tc>
+          <w:tcPr>
+            <w:tcW w:w="2000" w:type="dxa"/>
+          </w:tcPr>
+          <w:p>
+            <w:pPr/>
+            <w:r>
+              <w:t xml:space="preserve">-</w:t>
+            </w:r>
+          </w:p>
+        </w:tc>
+        <w:tc>
+          <w:tcPr>
+            <w:tcW w:w="2000" w:type="dxa"/>
+          </w:tcPr>
+          <w:p>
+            <w:pPr/>
+            <w:r>
+              <w:t xml:space="preserve">NOT NULL</w:t>
+            </w:r>
+          </w:p>
+        </w:tc>
+      </w:tr>
+      <w:tr>
+        <w:trPr>
+          <w:trHeight w:val="530" w:hRule="atLeast"/>
+        </w:trPr>
+        <w:tc>
+          <w:tcPr>
+            <w:tcW w:w="2000" w:type="dxa"/>
+          </w:tcPr>
+          <w:p>
+            <w:pPr/>
+            <w:r>
+              <w:t xml:space="preserve">location_id</w:t>
+            </w:r>
+          </w:p>
+        </w:tc>
+        <w:tc>
+          <w:tcPr>
+            <w:tcW w:w="2000" w:type="dxa"/>
+          </w:tcPr>
+          <w:p>
+            <w:pPr/>
+            <w:r>
+              <w:t xml:space="preserve">bigint</w:t>
+            </w:r>
+          </w:p>
+        </w:tc>
+        <w:tc>
+          <w:tcPr>
+            <w:tcW w:w="2000" w:type="dxa"/>
+          </w:tcPr>
+          <w:p>
+            <w:pPr/>
+            <w:r>
+              <w:t xml:space="preserve">-</w:t>
+            </w:r>
+          </w:p>
+        </w:tc>
+        <w:tc>
+          <w:tcPr>
+            <w:tcW w:w="2000" w:type="dxa"/>
+          </w:tcPr>
+          <w:p>
+            <w:pPr/>
+            <w:r>
+              <w:t xml:space="preserve">IS NULL</w:t>
+            </w:r>
+          </w:p>
+        </w:tc>
+      </w:tr>
+      <w:tr>
+        <w:trPr>
+          <w:trHeight w:val="530" w:hRule="atLeast"/>
+        </w:trPr>
+        <w:tc>
+          <w:tcPr>
+            <w:tcW w:w="2000" w:type="dxa"/>
+          </w:tcPr>
+          <w:p>
+            <w:pPr/>
+            <w:r>
+              <w:t xml:space="preserve">quantity</w:t>
+            </w:r>
+          </w:p>
+        </w:tc>
+        <w:tc>
+          <w:tcPr>
+            <w:tcW w:w="2000" w:type="dxa"/>
+          </w:tcPr>
+          <w:p>
+            <w:pPr/>
+            <w:r>
+              <w:t xml:space="preserve">decimal</w:t>
+            </w:r>
+          </w:p>
+        </w:tc>
+        <w:tc>
+          <w:tcPr>
+            <w:tcW w:w="2000" w:type="dxa"/>
+          </w:tcPr>
+          <w:p>
+            <w:pPr/>
+            <w:r>
+              <w:t xml:space="preserve">(19,6)</w:t>
+            </w:r>
+          </w:p>
+        </w:tc>
+        <w:tc>
+          <w:tcPr>
+            <w:tcW w:w="2000" w:type="dxa"/>
+          </w:tcPr>
+          <w:p>
+            <w:pPr/>
+            <w:r>
+              <w:t xml:space="preserve">NOT NULL</w:t>
+            </w:r>
+          </w:p>
+        </w:tc>
+      </w:tr>
+      <w:tr>
+        <w:trPr>
+          <w:trHeight w:val="530" w:hRule="atLeast"/>
+        </w:trPr>
+        <w:tc>
+          <w:tcPr>
+            <w:tcW w:w="2000" w:type="dxa"/>
+          </w:tcPr>
+          <w:p>
+            <w:pPr/>
+            <w:r>
+              <w:t xml:space="preserve">unit_cost</w:t>
+            </w:r>
+          </w:p>
+        </w:tc>
+        <w:tc>
+          <w:tcPr>
+            <w:tcW w:w="2000" w:type="dxa"/>
+          </w:tcPr>
+          <w:p>
+            <w:pPr/>
+            <w:r>
+              <w:t xml:space="preserve">decimal</w:t>
+            </w:r>
+          </w:p>
+        </w:tc>
+        <w:tc>
+          <w:tcPr>
+            <w:tcW w:w="2000" w:type="dxa"/>
+          </w:tcPr>
+          <w:p>
+            <w:pPr/>
+            <w:r>
+              <w:t xml:space="preserve">(19,6)</w:t>
+            </w:r>
+          </w:p>
+        </w:tc>
+        <w:tc>
+          <w:tcPr>
+            <w:tcW w:w="2000" w:type="dxa"/>
+          </w:tcPr>
+          <w:p>
+            <w:pPr/>
+            <w:r>
+              <w:t xml:space="preserve">NOT NULL</w:t>
+            </w:r>
+          </w:p>
+        </w:tc>
+      </w:tr>
+      <w:tr>
+        <w:trPr>
+          <w:trHeight w:val="530" w:hRule="atLeast"/>
+        </w:trPr>
+        <w:tc>
+          <w:tcPr>
+            <w:tcW w:w="2000" w:type="dxa"/>
+          </w:tcPr>
+          <w:p>
+            <w:pPr/>
+            <w:r>
+              <w:t xml:space="preserve">amount</w:t>
+            </w:r>
+          </w:p>
+        </w:tc>
+        <w:tc>
+          <w:tcPr>
+            <w:tcW w:w="2000" w:type="dxa"/>
+          </w:tcPr>
+          <w:p>
+            <w:pPr/>
+            <w:r>
+              <w:t xml:space="preserve">decimal</w:t>
+            </w:r>
+          </w:p>
+        </w:tc>
+        <w:tc>
+          <w:tcPr>
+            <w:tcW w:w="2000" w:type="dxa"/>
+          </w:tcPr>
+          <w:p>
+            <w:pPr/>
+            <w:r>
+              <w:t xml:space="preserve">(19,4)</w:t>
+            </w:r>
+          </w:p>
+        </w:tc>
+        <w:tc>
+          <w:tcPr>
+            <w:tcW w:w="2000" w:type="dxa"/>
+          </w:tcPr>
+          <w:p>
+            <w:pPr/>
+            <w:r>
+              <w:t xml:space="preserve">NOT NULL</w:t>
+            </w:r>
+          </w:p>
+        </w:tc>
+      </w:tr>
+      <w:tr>
+        <w:trPr>
+          <w:trHeight w:val="530" w:hRule="atLeast"/>
+        </w:trPr>
+        <w:tc>
+          <w:tcPr>
+            <w:tcW w:w="2000" w:type="dxa"/>
+          </w:tcPr>
+          <w:p>
+            <w:pPr/>
+            <w:r>
+              <w:t xml:space="preserve">company_id</w:t>
+            </w:r>
+          </w:p>
+        </w:tc>
+        <w:tc>
+          <w:tcPr>
+            <w:tcW w:w="2000" w:type="dxa"/>
+          </w:tcPr>
+          <w:p>
+            <w:pPr/>
+            <w:r>
+              <w:t xml:space="preserve">bigint</w:t>
+            </w:r>
+          </w:p>
+        </w:tc>
+        <w:tc>
+          <w:tcPr>
+            <w:tcW w:w="2000" w:type="dxa"/>
+          </w:tcPr>
+          <w:p>
+            <w:pPr/>
+            <w:r>
+              <w:t xml:space="preserve">-</w:t>
+            </w:r>
+          </w:p>
+        </w:tc>
+        <w:tc>
+          <w:tcPr>
+            <w:tcW w:w="2000" w:type="dxa"/>
+          </w:tcPr>
+          <w:p>
+            <w:pPr/>
+            <w:r>
+              <w:t xml:space="preserve">FK, NOT NULL</w:t>
+            </w:r>
+          </w:p>
+        </w:tc>
+      </w:tr>
+      <w:tr>
+        <w:trPr>
+          <w:trHeight w:val="530" w:hRule="atLeast"/>
+        </w:trPr>
+        <w:tc>
+          <w:tcPr>
+            <w:tcW w:w="2000" w:type="dxa"/>
+          </w:tcPr>
+          <w:p>
+            <w:pPr/>
+            <w:r>
+              <w:t xml:space="preserve">created_at</w:t>
+            </w:r>
+          </w:p>
+        </w:tc>
+        <w:tc>
+          <w:tcPr>
+            <w:tcW w:w="2000" w:type="dxa"/>
+          </w:tcPr>
+          <w:p>
+            <w:pPr/>
+            <w:r>
+              <w:t xml:space="preserve">datetime2</w:t>
+            </w:r>
+          </w:p>
+        </w:tc>
+        <w:tc>
+          <w:tcPr>
+            <w:tcW w:w="2000" w:type="dxa"/>
+          </w:tcPr>
+          <w:p>
+            <w:pPr/>
+            <w:r>
+              <w:t xml:space="preserve">(6)</w:t>
+            </w:r>
+          </w:p>
+        </w:tc>
+        <w:tc>
+          <w:tcPr>
+            <w:tcW w:w="2000" w:type="dxa"/>
+          </w:tcPr>
+          <w:p>
+            <w:pPr/>
+            <w:r>
+              <w:t xml:space="preserve">NOT NULL</w:t>
+            </w:r>
+          </w:p>
+        </w:tc>
+      </w:tr>
+      <w:tr>
+        <w:trPr>
+          <w:trHeight w:val="530" w:hRule="atLeast"/>
+        </w:trPr>
+        <w:tc>
+          <w:tcPr>
+            <w:tcW w:w="2000" w:type="dxa"/>
+          </w:tcPr>
+          <w:p>
+            <w:pPr/>
+            <w:r>
+              <w:t xml:space="preserve">created_by</w:t>
+            </w:r>
+          </w:p>
+        </w:tc>
+        <w:tc>
+          <w:tcPr>
+            <w:tcW w:w="2000" w:type="dxa"/>
+          </w:tcPr>
+          <w:p>
+            <w:pPr/>
+            <w:r>
+              <w:t xml:space="preserve">bigint</w:t>
+            </w:r>
+          </w:p>
+        </w:tc>
+        <w:tc>
+          <w:tcPr>
+            <w:tcW w:w="2000" w:type="dxa"/>
+          </w:tcPr>
+          <w:p>
+            <w:pPr/>
+            <w:r>
+              <w:t xml:space="preserve">-</w:t>
+            </w:r>
+          </w:p>
+        </w:tc>
+        <w:tc>
+          <w:tcPr>
+            <w:tcW w:w="2000" w:type="dxa"/>
+          </w:tcPr>
+          <w:p>
+            <w:pPr/>
+            <w:r>
+              <w:t xml:space="preserve">NOT NULL</w:t>
+            </w:r>
+          </w:p>
+        </w:tc>
+      </w:tr>
+      <w:tr>
+        <w:trPr>
+          <w:trHeight w:val="530" w:hRule="atLeast"/>
+        </w:trPr>
+        <w:tc>
+          <w:tcPr>
+            <w:tcW w:w="2000" w:type="dxa"/>
+          </w:tcPr>
+          <w:p>
+            <w:pPr/>
+            <w:r>
+              <w:t xml:space="preserve">updated_at</w:t>
+            </w:r>
+          </w:p>
+        </w:tc>
+        <w:tc>
+          <w:tcPr>
+            <w:tcW w:w="2000" w:type="dxa"/>
+          </w:tcPr>
+          <w:p>
+            <w:pPr/>
+            <w:r>
+              <w:t xml:space="preserve">datetime2</w:t>
+            </w:r>
+          </w:p>
+        </w:tc>
+        <w:tc>
+          <w:tcPr>
+            <w:tcW w:w="2000" w:type="dxa"/>
+          </w:tcPr>
+          <w:p>
+            <w:pPr/>
+            <w:r>
+              <w:t xml:space="preserve">(6)</w:t>
+            </w:r>
+          </w:p>
+        </w:tc>
+        <w:tc>
+          <w:tcPr>
+            <w:tcW w:w="2000" w:type="dxa"/>
+          </w:tcPr>
+          <w:p>
+            <w:pPr/>
+            <w:r>
+              <w:t xml:space="preserve">IS NULL</w:t>
+            </w:r>
+          </w:p>
+        </w:tc>
+      </w:tr>
+      <w:tr>
+        <w:trPr>
+          <w:trHeight w:val="530" w:hRule="atLeast"/>
+        </w:trPr>
+        <w:tc>
+          <w:tcPr>
+            <w:tcW w:w="2000" w:type="dxa"/>
+          </w:tcPr>
+          <w:p>
+            <w:pPr/>
+            <w:r>
+              <w:t xml:space="preserve">updated_by</w:t>
+            </w:r>
+          </w:p>
+        </w:tc>
+        <w:tc>
+          <w:tcPr>
+            <w:tcW w:w="2000" w:type="dxa"/>
+          </w:tcPr>
+          <w:p>
+            <w:pPr/>
+            <w:r>
+              <w:t xml:space="preserve">bigint</w:t>
+            </w:r>
+          </w:p>
+        </w:tc>
+        <w:tc>
+          <w:tcPr>
+            <w:tcW w:w="2000" w:type="dxa"/>
+          </w:tcPr>
+          <w:p>
+            <w:pPr/>
+            <w:r>
+              <w:t xml:space="preserve">-</w:t>
+            </w:r>
+          </w:p>
+        </w:tc>
+        <w:tc>
+          <w:tcPr>
+            <w:tcW w:w="2000" w:type="dxa"/>
+          </w:tcPr>
+          <w:p>
+            <w:pPr/>
+            <w:r>
+              <w:t xml:space="preserve">IS NULL</w:t>
+            </w:r>
+          </w:p>
+        </w:tc>
+      </w:tr>
+      <w:tr>
+        <w:trPr>
+          <w:trHeight w:val="530" w:hRule="atLeast"/>
+        </w:trPr>
+        <w:tc>
+          <w:tcPr>
+            <w:tcW w:w="2000" w:type="dxa"/>
+          </w:tcPr>
+          <w:p>
+            <w:pPr/>
+            <w:r>
+              <w:t xml:space="preserve">version</w:t>
+            </w:r>
+          </w:p>
+        </w:tc>
+        <w:tc>
+          <w:tcPr>
+            <w:tcW w:w="2000" w:type="dxa"/>
+          </w:tcPr>
+          <w:p>
+            <w:pPr/>
+            <w:r>
+              <w:t xml:space="preserve">int</w:t>
+            </w:r>
+          </w:p>
+        </w:tc>
+        <w:tc>
+          <w:tcPr>
+            <w:tcW w:w="2000" w:type="dxa"/>
+          </w:tcPr>
+          <w:p>
+            <w:pPr/>
+            <w:r>
+              <w:t xml:space="preserve">-</w:t>
+            </w:r>
+          </w:p>
+        </w:tc>
+        <w:tc>
+          <w:tcPr>
+            <w:tcW w:w="2000" w:type="dxa"/>
+          </w:tcPr>
+          <w:p>
+            <w:pPr/>
+            <w:r>
+              <w:t xml:space="preserve">NOT NULL</w:t>
+            </w:r>
+          </w:p>
+        </w:tc>
+      </w:tr>
+    </w:tbl>
+    <w:p/>
     <w:p>
       <w:pPr/>
       <w:r>
@@ -45703,7 +47258,7 @@
       </w:r>
     </w:p>
     <w:sectPr>
-      <w:footerReference xmlns:r="http://schemas.openxmlformats.org/officeDocument/2006/relationships" w:type="default" r:id="R7ba5334c5b194fd4"/>
+      <w:footerReference xmlns:r="http://schemas.openxmlformats.org/officeDocument/2006/relationships" w:type="default" r:id="Rb6e78ac83f7f4215"/>
       <w:pgSz w:w="11906" w:h="16838"/>
       <w:pgMar w:top="1440" w:right="1440" w:bottom="1440" w:left="1440" w:header="720" w:footer="720" w:gutter="0"/>
     </w:sectPr>

</xml_diff>

<commit_message>
feat(inv): add opening stock pages with preview and idempotent submit
Completes WU-INV-007b and closes WU-INV-007: trilingual /inv/opening-stocks list
(date/item/warehouse/keyword filters, detail with MD names, print, formula-safe CSV)
and /new batch input. Preview shows per-line trilingual errors; submit is enabled
only for a clean, unchanged preview. Each batch uses one crypto.randomUUID request
key reused on retry; 409 rotates the key and requires re-preview, 422 re-previews.
Registers the inv i18n scope in the test fixture. Vitest + Playwright INV-OPN-007.

Co-Authored-By: Claude Opus 5.5 <noreply@anthropic.com>
</commit_message>
<xml_diff>
--- a/docs/99-output/MyERP_SDS.docx
+++ b/docs/99-output/MyERP_SDS.docx
@@ -45613,6 +45613,44 @@
           <w:i/>
         </w:rPr>
         <w:t xml:space="preserve">[Pending] System screenshot of Other Outbound Edit Interface.</w:t>
+      </w:r>
+    </w:p>
+    <w:p>
+      <w:pPr>
+        <w:pStyle w:val="Heading5"/>
+      </w:pPr>
+      <w:r>
+        <w:t xml:space="preserve">4.2.1.5.8 Product Initial Stock View Interface</w:t>
+      </w:r>
+    </w:p>
+    <w:p>
+      <w:pPr>
+        <w:jc w:val="center"/>
+      </w:pPr>
+      <w:r>
+        <w:rPr>
+          <w:i/>
+        </w:rPr>
+        <w:t xml:space="preserve">[Pending] System screenshot of Product Initial Stock View Interface.</w:t>
+      </w:r>
+    </w:p>
+    <w:p>
+      <w:pPr>
+        <w:pStyle w:val="Heading5"/>
+      </w:pPr>
+      <w:r>
+        <w:t xml:space="preserve">4.2.1.5.9 Product Initial Stock Create Interface</w:t>
+      </w:r>
+    </w:p>
+    <w:p>
+      <w:pPr>
+        <w:jc w:val="center"/>
+      </w:pPr>
+      <w:r>
+        <w:rPr>
+          <w:i/>
+        </w:rPr>
+        <w:t xml:space="preserve">[Pending] System screenshot of Product Initial Stock Create Interface.</w:t>
       </w:r>
     </w:p>
     <w:p>
@@ -47258,7 +47296,7 @@
       </w:r>
     </w:p>
     <w:sectPr>
-      <w:footerReference xmlns:r="http://schemas.openxmlformats.org/officeDocument/2006/relationships" w:type="default" r:id="Rb6e78ac83f7f4215"/>
+      <w:footerReference xmlns:r="http://schemas.openxmlformats.org/officeDocument/2006/relationships" w:type="default" r:id="Rb847b51a8f4f4dc7"/>
       <w:pgSz w:w="11906" w:h="16838"/>
       <w:pgMar w:top="1440" w:right="1440" w:bottom="1440" w:left="1440" w:header="720" w:footer="720" w:gutter="0"/>
     </w:sectPr>

</xml_diff>

<commit_message>
feat(md): add item lot/serial tracking mode for inventory tracking
WU-INV-008a (ADR-060 splits WU-INV-008 into 008a/008b/008c).
- md_item.tracking_mode None/Lot/Serial with CHECK; migration MasterData_ItemTrackingMode
- change locked (409 MD.ITEM.TRACKING_MODE_LOCKED) once IItemUsage reports use;
  exclusive md_item lock excludes INV writers holding the shared lock
- InventoryReferenceCodes.TrackingMode for INV via MD contract
- item page: trilingual tracking column and dropdown
- MD-ITEM-TRK-001..006; backend 853/853, frontend 613/613, E2E 142 passed

Co-Authored-By: Claude Opus 5.5 <noreply@anthropic.com>
</commit_message>
<xml_diff>
--- a/docs/99-output/MyERP_SDS.docx
+++ b/docs/99-output/MyERP_SDS.docx
@@ -15862,6 +15862,55 @@
             <w:pPr/>
             <w:r>
               <w:t xml:space="preserve">-</w:t>
+            </w:r>
+          </w:p>
+        </w:tc>
+        <w:tc>
+          <w:tcPr>
+            <w:tcW w:w="2000" w:type="dxa"/>
+          </w:tcPr>
+          <w:p>
+            <w:pPr/>
+            <w:r>
+              <w:t xml:space="preserve">NOT NULL</w:t>
+            </w:r>
+          </w:p>
+        </w:tc>
+      </w:tr>
+      <w:tr>
+        <w:trPr>
+          <w:trHeight w:val="530" w:hRule="atLeast"/>
+        </w:trPr>
+        <w:tc>
+          <w:tcPr>
+            <w:tcW w:w="2000" w:type="dxa"/>
+          </w:tcPr>
+          <w:p>
+            <w:pPr/>
+            <w:r>
+              <w:t xml:space="preserve">tracking_mode</w:t>
+            </w:r>
+          </w:p>
+        </w:tc>
+        <w:tc>
+          <w:tcPr>
+            <w:tcW w:w="2000" w:type="dxa"/>
+          </w:tcPr>
+          <w:p>
+            <w:pPr/>
+            <w:r>
+              <w:t xml:space="preserve">varchar</w:t>
+            </w:r>
+          </w:p>
+        </w:tc>
+        <w:tc>
+          <w:tcPr>
+            <w:tcW w:w="2000" w:type="dxa"/>
+          </w:tcPr>
+          <w:p>
+            <w:pPr/>
+            <w:r>
+              <w:t xml:space="preserve">30</w:t>
             </w:r>
           </w:p>
         </w:tc>
@@ -47296,7 +47345,7 @@
       </w:r>
     </w:p>
     <w:sectPr>
-      <w:footerReference xmlns:r="http://schemas.openxmlformats.org/officeDocument/2006/relationships" w:type="default" r:id="Rb847b51a8f4f4dc7"/>
+      <w:footerReference xmlns:r="http://schemas.openxmlformats.org/officeDocument/2006/relationships" w:type="default" r:id="R7c547ee52b98458d"/>
       <w:pgSz w:w="11906" w:h="16838"/>
       <w:pgMar w:top="1440" w:right="1440" w:bottom="1440" w:left="1440" w:header="720" w:footer="720" w:gutter="0"/>
     </w:sectPr>

</xml_diff>

<commit_message>
feat(inv): add lot and serial tracking backend with trace API
- inv_lot, inv_serial, append-only inv_stock_movement_tracking and
  document line tracking tables (migration Inventory_LotSerial)
- posting contract Tracking: mode checks, lot dates, per-location lot/serial
  availability, serial in-stock guard with inv_tracking lock, replay snapshot
- other receipt/issue and opening stock capture lot/serial numbers
- GET /api/v1/inv/tracking/lots|serials (INV.TRACKING.VIEW)
- INV-LOT-001..015 real SQL/HTTP tests; docs REQ_F4115.24.x, REQ_DS43.142-147

Co-Authored-By: Claude Opus 5.5 <noreply@anthropic.com>
</commit_message>
<xml_diff>
--- a/docs/99-output/MyERP_SDS.docx
+++ b/docs/99-output/MyERP_SDS.docx
@@ -613,6 +613,661 @@
     <w:p>
       <w:pPr/>
       <w:r>
+        <w:t xml:space="preserve">Table Name: inv_lot</w:t>
+      </w:r>
+    </w:p>
+    <w:p>
+      <w:pPr/>
+      <w:r>
+        <w:t xml:space="preserve">Primary Key: id</w:t>
+      </w:r>
+    </w:p>
+    <w:p>
+      <w:pPr/>
+      <w:r>
+        <w:t xml:space="preserve">This table stores company-scoped lot numbers per item with optional manufacture and expiry dates.</w:t>
+      </w:r>
+    </w:p>
+    <w:tbl>
+      <w:tblPr>
+        <w:tblStyle w:val="TableGrid"/>
+        <w:tblW w:w="8000" w:type="dxa"/>
+        <w:jc w:val="left"/>
+        <w:tblBorders>
+          <w:top w:val="single" w:color="000000" w:sz="4" w:space="0"/>
+          <w:left w:val="single" w:color="000000" w:sz="4" w:space="0"/>
+          <w:bottom w:val="single" w:color="000000" w:sz="4" w:space="0"/>
+          <w:right w:val="single" w:color="000000" w:sz="4" w:space="0"/>
+          <w:insideH w:val="single" w:color="000000" w:sz="4" w:space="0"/>
+          <w:insideV w:val="single" w:color="000000" w:sz="4" w:space="0"/>
+        </w:tblBorders>
+        <w:tblLayout w:type="fixed"/>
+        <w:tblCellMar>
+          <w:top w:w="100" w:type="dxa"/>
+          <w:left w:w="100" w:type="dxa"/>
+          <w:bottom w:w="100" w:type="dxa"/>
+          <w:right w:w="100" w:type="dxa"/>
+        </w:tblCellMar>
+      </w:tblPr>
+      <w:tblGrid>
+        <w:gridCol w:w="2000"/>
+        <w:gridCol w:w="2000"/>
+        <w:gridCol w:w="2000"/>
+        <w:gridCol w:w="2000"/>
+      </w:tblGrid>
+      <w:tr>
+        <w:trPr>
+          <w:trHeight w:val="530" w:hRule="atLeast"/>
+        </w:trPr>
+        <w:tc>
+          <w:tcPr>
+            <w:tcW w:w="2000" w:type="dxa"/>
+          </w:tcPr>
+          <w:p>
+            <w:pPr>
+              <w:jc w:val="center"/>
+            </w:pPr>
+            <w:r>
+              <w:rPr>
+                <w:b/>
+              </w:rPr>
+              <w:t xml:space="preserve">Name of Attribute</w:t>
+            </w:r>
+          </w:p>
+        </w:tc>
+        <w:tc>
+          <w:tcPr>
+            <w:tcW w:w="2000" w:type="dxa"/>
+          </w:tcPr>
+          <w:p>
+            <w:pPr>
+              <w:jc w:val="center"/>
+            </w:pPr>
+            <w:r>
+              <w:rPr>
+                <w:b/>
+              </w:rPr>
+              <w:t xml:space="preserve">Data Type</w:t>
+            </w:r>
+          </w:p>
+        </w:tc>
+        <w:tc>
+          <w:tcPr>
+            <w:tcW w:w="2000" w:type="dxa"/>
+          </w:tcPr>
+          <w:p>
+            <w:pPr>
+              <w:jc w:val="center"/>
+            </w:pPr>
+            <w:r>
+              <w:rPr>
+                <w:b/>
+              </w:rPr>
+              <w:t xml:space="preserve">Size</w:t>
+            </w:r>
+          </w:p>
+        </w:tc>
+        <w:tc>
+          <w:tcPr>
+            <w:tcW w:w="2000" w:type="dxa"/>
+          </w:tcPr>
+          <w:p>
+            <w:pPr>
+              <w:jc w:val="center"/>
+            </w:pPr>
+            <w:r>
+              <w:rPr>
+                <w:b/>
+              </w:rPr>
+              <w:t xml:space="preserve">PK/FK/IS NULL/ NOT NULL</w:t>
+            </w:r>
+          </w:p>
+        </w:tc>
+      </w:tr>
+      <w:tr>
+        <w:trPr>
+          <w:trHeight w:val="530" w:hRule="atLeast"/>
+        </w:trPr>
+        <w:tc>
+          <w:tcPr>
+            <w:tcW w:w="2000" w:type="dxa"/>
+          </w:tcPr>
+          <w:p>
+            <w:pPr/>
+            <w:r>
+              <w:t xml:space="preserve">id</w:t>
+            </w:r>
+          </w:p>
+        </w:tc>
+        <w:tc>
+          <w:tcPr>
+            <w:tcW w:w="2000" w:type="dxa"/>
+          </w:tcPr>
+          <w:p>
+            <w:pPr/>
+            <w:r>
+              <w:t xml:space="preserve">bigint</w:t>
+            </w:r>
+          </w:p>
+        </w:tc>
+        <w:tc>
+          <w:tcPr>
+            <w:tcW w:w="2000" w:type="dxa"/>
+          </w:tcPr>
+          <w:p>
+            <w:pPr/>
+            <w:r>
+              <w:t xml:space="preserve">-</w:t>
+            </w:r>
+          </w:p>
+        </w:tc>
+        <w:tc>
+          <w:tcPr>
+            <w:tcW w:w="2000" w:type="dxa"/>
+          </w:tcPr>
+          <w:p>
+            <w:pPr/>
+            <w:r>
+              <w:t xml:space="preserve">PK, NOT NULL</w:t>
+            </w:r>
+          </w:p>
+        </w:tc>
+      </w:tr>
+      <w:tr>
+        <w:trPr>
+          <w:trHeight w:val="530" w:hRule="atLeast"/>
+        </w:trPr>
+        <w:tc>
+          <w:tcPr>
+            <w:tcW w:w="2000" w:type="dxa"/>
+          </w:tcPr>
+          <w:p>
+            <w:pPr/>
+            <w:r>
+              <w:t xml:space="preserve">item_id</w:t>
+            </w:r>
+          </w:p>
+        </w:tc>
+        <w:tc>
+          <w:tcPr>
+            <w:tcW w:w="2000" w:type="dxa"/>
+          </w:tcPr>
+          <w:p>
+            <w:pPr/>
+            <w:r>
+              <w:t xml:space="preserve">bigint</w:t>
+            </w:r>
+          </w:p>
+        </w:tc>
+        <w:tc>
+          <w:tcPr>
+            <w:tcW w:w="2000" w:type="dxa"/>
+          </w:tcPr>
+          <w:p>
+            <w:pPr/>
+            <w:r>
+              <w:t xml:space="preserve">-</w:t>
+            </w:r>
+          </w:p>
+        </w:tc>
+        <w:tc>
+          <w:tcPr>
+            <w:tcW w:w="2000" w:type="dxa"/>
+          </w:tcPr>
+          <w:p>
+            <w:pPr/>
+            <w:r>
+              <w:t xml:space="preserve">NOT NULL</w:t>
+            </w:r>
+          </w:p>
+        </w:tc>
+      </w:tr>
+      <w:tr>
+        <w:trPr>
+          <w:trHeight w:val="530" w:hRule="atLeast"/>
+        </w:trPr>
+        <w:tc>
+          <w:tcPr>
+            <w:tcW w:w="2000" w:type="dxa"/>
+          </w:tcPr>
+          <w:p>
+            <w:pPr/>
+            <w:r>
+              <w:t xml:space="preserve">lot_no</w:t>
+            </w:r>
+          </w:p>
+        </w:tc>
+        <w:tc>
+          <w:tcPr>
+            <w:tcW w:w="2000" w:type="dxa"/>
+          </w:tcPr>
+          <w:p>
+            <w:pPr/>
+            <w:r>
+              <w:t xml:space="preserve">nvarchar</w:t>
+            </w:r>
+          </w:p>
+        </w:tc>
+        <w:tc>
+          <w:tcPr>
+            <w:tcW w:w="2000" w:type="dxa"/>
+          </w:tcPr>
+          <w:p>
+            <w:pPr/>
+            <w:r>
+              <w:t xml:space="preserve">50</w:t>
+            </w:r>
+          </w:p>
+        </w:tc>
+        <w:tc>
+          <w:tcPr>
+            <w:tcW w:w="2000" w:type="dxa"/>
+          </w:tcPr>
+          <w:p>
+            <w:pPr/>
+            <w:r>
+              <w:t xml:space="preserve">NOT NULL</w:t>
+            </w:r>
+          </w:p>
+        </w:tc>
+      </w:tr>
+      <w:tr>
+        <w:trPr>
+          <w:trHeight w:val="530" w:hRule="atLeast"/>
+        </w:trPr>
+        <w:tc>
+          <w:tcPr>
+            <w:tcW w:w="2000" w:type="dxa"/>
+          </w:tcPr>
+          <w:p>
+            <w:pPr/>
+            <w:r>
+              <w:t xml:space="preserve">manufacture_date</w:t>
+            </w:r>
+          </w:p>
+        </w:tc>
+        <w:tc>
+          <w:tcPr>
+            <w:tcW w:w="2000" w:type="dxa"/>
+          </w:tcPr>
+          <w:p>
+            <w:pPr/>
+            <w:r>
+              <w:t xml:space="preserve">date</w:t>
+            </w:r>
+          </w:p>
+        </w:tc>
+        <w:tc>
+          <w:tcPr>
+            <w:tcW w:w="2000" w:type="dxa"/>
+          </w:tcPr>
+          <w:p>
+            <w:pPr/>
+            <w:r>
+              <w:t xml:space="preserve">-</w:t>
+            </w:r>
+          </w:p>
+        </w:tc>
+        <w:tc>
+          <w:tcPr>
+            <w:tcW w:w="2000" w:type="dxa"/>
+          </w:tcPr>
+          <w:p>
+            <w:pPr/>
+            <w:r>
+              <w:t xml:space="preserve">IS NULL</w:t>
+            </w:r>
+          </w:p>
+        </w:tc>
+      </w:tr>
+      <w:tr>
+        <w:trPr>
+          <w:trHeight w:val="530" w:hRule="atLeast"/>
+        </w:trPr>
+        <w:tc>
+          <w:tcPr>
+            <w:tcW w:w="2000" w:type="dxa"/>
+          </w:tcPr>
+          <w:p>
+            <w:pPr/>
+            <w:r>
+              <w:t xml:space="preserve">expiry_date</w:t>
+            </w:r>
+          </w:p>
+        </w:tc>
+        <w:tc>
+          <w:tcPr>
+            <w:tcW w:w="2000" w:type="dxa"/>
+          </w:tcPr>
+          <w:p>
+            <w:pPr/>
+            <w:r>
+              <w:t xml:space="preserve">date</w:t>
+            </w:r>
+          </w:p>
+        </w:tc>
+        <w:tc>
+          <w:tcPr>
+            <w:tcW w:w="2000" w:type="dxa"/>
+          </w:tcPr>
+          <w:p>
+            <w:pPr/>
+            <w:r>
+              <w:t xml:space="preserve">-</w:t>
+            </w:r>
+          </w:p>
+        </w:tc>
+        <w:tc>
+          <w:tcPr>
+            <w:tcW w:w="2000" w:type="dxa"/>
+          </w:tcPr>
+          <w:p>
+            <w:pPr/>
+            <w:r>
+              <w:t xml:space="preserve">IS NULL</w:t>
+            </w:r>
+          </w:p>
+        </w:tc>
+      </w:tr>
+      <w:tr>
+        <w:trPr>
+          <w:trHeight w:val="530" w:hRule="atLeast"/>
+        </w:trPr>
+        <w:tc>
+          <w:tcPr>
+            <w:tcW w:w="2000" w:type="dxa"/>
+          </w:tcPr>
+          <w:p>
+            <w:pPr/>
+            <w:r>
+              <w:t xml:space="preserve">company_id</w:t>
+            </w:r>
+          </w:p>
+        </w:tc>
+        <w:tc>
+          <w:tcPr>
+            <w:tcW w:w="2000" w:type="dxa"/>
+          </w:tcPr>
+          <w:p>
+            <w:pPr/>
+            <w:r>
+              <w:t xml:space="preserve">bigint</w:t>
+            </w:r>
+          </w:p>
+        </w:tc>
+        <w:tc>
+          <w:tcPr>
+            <w:tcW w:w="2000" w:type="dxa"/>
+          </w:tcPr>
+          <w:p>
+            <w:pPr/>
+            <w:r>
+              <w:t xml:space="preserve">-</w:t>
+            </w:r>
+          </w:p>
+        </w:tc>
+        <w:tc>
+          <w:tcPr>
+            <w:tcW w:w="2000" w:type="dxa"/>
+          </w:tcPr>
+          <w:p>
+            <w:pPr/>
+            <w:r>
+              <w:t xml:space="preserve">NOT NULL</w:t>
+            </w:r>
+          </w:p>
+        </w:tc>
+      </w:tr>
+      <w:tr>
+        <w:trPr>
+          <w:trHeight w:val="530" w:hRule="atLeast"/>
+        </w:trPr>
+        <w:tc>
+          <w:tcPr>
+            <w:tcW w:w="2000" w:type="dxa"/>
+          </w:tcPr>
+          <w:p>
+            <w:pPr/>
+            <w:r>
+              <w:t xml:space="preserve">created_at</w:t>
+            </w:r>
+          </w:p>
+        </w:tc>
+        <w:tc>
+          <w:tcPr>
+            <w:tcW w:w="2000" w:type="dxa"/>
+          </w:tcPr>
+          <w:p>
+            <w:pPr/>
+            <w:r>
+              <w:t xml:space="preserve">datetime2</w:t>
+            </w:r>
+          </w:p>
+        </w:tc>
+        <w:tc>
+          <w:tcPr>
+            <w:tcW w:w="2000" w:type="dxa"/>
+          </w:tcPr>
+          <w:p>
+            <w:pPr/>
+            <w:r>
+              <w:t xml:space="preserve">(6)</w:t>
+            </w:r>
+          </w:p>
+        </w:tc>
+        <w:tc>
+          <w:tcPr>
+            <w:tcW w:w="2000" w:type="dxa"/>
+          </w:tcPr>
+          <w:p>
+            <w:pPr/>
+            <w:r>
+              <w:t xml:space="preserve">NOT NULL</w:t>
+            </w:r>
+          </w:p>
+        </w:tc>
+      </w:tr>
+      <w:tr>
+        <w:trPr>
+          <w:trHeight w:val="530" w:hRule="atLeast"/>
+        </w:trPr>
+        <w:tc>
+          <w:tcPr>
+            <w:tcW w:w="2000" w:type="dxa"/>
+          </w:tcPr>
+          <w:p>
+            <w:pPr/>
+            <w:r>
+              <w:t xml:space="preserve">created_by</w:t>
+            </w:r>
+          </w:p>
+        </w:tc>
+        <w:tc>
+          <w:tcPr>
+            <w:tcW w:w="2000" w:type="dxa"/>
+          </w:tcPr>
+          <w:p>
+            <w:pPr/>
+            <w:r>
+              <w:t xml:space="preserve">bigint</w:t>
+            </w:r>
+          </w:p>
+        </w:tc>
+        <w:tc>
+          <w:tcPr>
+            <w:tcW w:w="2000" w:type="dxa"/>
+          </w:tcPr>
+          <w:p>
+            <w:pPr/>
+            <w:r>
+              <w:t xml:space="preserve">-</w:t>
+            </w:r>
+          </w:p>
+        </w:tc>
+        <w:tc>
+          <w:tcPr>
+            <w:tcW w:w="2000" w:type="dxa"/>
+          </w:tcPr>
+          <w:p>
+            <w:pPr/>
+            <w:r>
+              <w:t xml:space="preserve">NOT NULL</w:t>
+            </w:r>
+          </w:p>
+        </w:tc>
+      </w:tr>
+      <w:tr>
+        <w:trPr>
+          <w:trHeight w:val="530" w:hRule="atLeast"/>
+        </w:trPr>
+        <w:tc>
+          <w:tcPr>
+            <w:tcW w:w="2000" w:type="dxa"/>
+          </w:tcPr>
+          <w:p>
+            <w:pPr/>
+            <w:r>
+              <w:t xml:space="preserve">updated_at</w:t>
+            </w:r>
+          </w:p>
+        </w:tc>
+        <w:tc>
+          <w:tcPr>
+            <w:tcW w:w="2000" w:type="dxa"/>
+          </w:tcPr>
+          <w:p>
+            <w:pPr/>
+            <w:r>
+              <w:t xml:space="preserve">datetime2</w:t>
+            </w:r>
+          </w:p>
+        </w:tc>
+        <w:tc>
+          <w:tcPr>
+            <w:tcW w:w="2000" w:type="dxa"/>
+          </w:tcPr>
+          <w:p>
+            <w:pPr/>
+            <w:r>
+              <w:t xml:space="preserve">(6)</w:t>
+            </w:r>
+          </w:p>
+        </w:tc>
+        <w:tc>
+          <w:tcPr>
+            <w:tcW w:w="2000" w:type="dxa"/>
+          </w:tcPr>
+          <w:p>
+            <w:pPr/>
+            <w:r>
+              <w:t xml:space="preserve">IS NULL</w:t>
+            </w:r>
+          </w:p>
+        </w:tc>
+      </w:tr>
+      <w:tr>
+        <w:trPr>
+          <w:trHeight w:val="530" w:hRule="atLeast"/>
+        </w:trPr>
+        <w:tc>
+          <w:tcPr>
+            <w:tcW w:w="2000" w:type="dxa"/>
+          </w:tcPr>
+          <w:p>
+            <w:pPr/>
+            <w:r>
+              <w:t xml:space="preserve">updated_by</w:t>
+            </w:r>
+          </w:p>
+        </w:tc>
+        <w:tc>
+          <w:tcPr>
+            <w:tcW w:w="2000" w:type="dxa"/>
+          </w:tcPr>
+          <w:p>
+            <w:pPr/>
+            <w:r>
+              <w:t xml:space="preserve">bigint</w:t>
+            </w:r>
+          </w:p>
+        </w:tc>
+        <w:tc>
+          <w:tcPr>
+            <w:tcW w:w="2000" w:type="dxa"/>
+          </w:tcPr>
+          <w:p>
+            <w:pPr/>
+            <w:r>
+              <w:t xml:space="preserve">-</w:t>
+            </w:r>
+          </w:p>
+        </w:tc>
+        <w:tc>
+          <w:tcPr>
+            <w:tcW w:w="2000" w:type="dxa"/>
+          </w:tcPr>
+          <w:p>
+            <w:pPr/>
+            <w:r>
+              <w:t xml:space="preserve">IS NULL</w:t>
+            </w:r>
+          </w:p>
+        </w:tc>
+      </w:tr>
+      <w:tr>
+        <w:trPr>
+          <w:trHeight w:val="530" w:hRule="atLeast"/>
+        </w:trPr>
+        <w:tc>
+          <w:tcPr>
+            <w:tcW w:w="2000" w:type="dxa"/>
+          </w:tcPr>
+          <w:p>
+            <w:pPr/>
+            <w:r>
+              <w:t xml:space="preserve">version</w:t>
+            </w:r>
+          </w:p>
+        </w:tc>
+        <w:tc>
+          <w:tcPr>
+            <w:tcW w:w="2000" w:type="dxa"/>
+          </w:tcPr>
+          <w:p>
+            <w:pPr/>
+            <w:r>
+              <w:t xml:space="preserve">int</w:t>
+            </w:r>
+          </w:p>
+        </w:tc>
+        <w:tc>
+          <w:tcPr>
+            <w:tcW w:w="2000" w:type="dxa"/>
+          </w:tcPr>
+          <w:p>
+            <w:pPr/>
+            <w:r>
+              <w:t xml:space="preserve">-</w:t>
+            </w:r>
+          </w:p>
+        </w:tc>
+        <w:tc>
+          <w:tcPr>
+            <w:tcW w:w="2000" w:type="dxa"/>
+          </w:tcPr>
+          <w:p>
+            <w:pPr/>
+            <w:r>
+              <w:t xml:space="preserve">NOT NULL</w:t>
+            </w:r>
+          </w:p>
+        </w:tc>
+      </w:tr>
+    </w:tbl>
+    <w:p/>
+    <w:p>
+      <w:pPr/>
+      <w:r>
         <w:t xml:space="preserve">Table Name: inv_opening_stock</w:t>
       </w:r>
     </w:p>
@@ -2168,6 +2823,808 @@
     <w:p>
       <w:pPr/>
       <w:r>
+        <w:t xml:space="preserve">Table Name: inv_opening_stock_line_tracking</w:t>
+      </w:r>
+    </w:p>
+    <w:p>
+      <w:pPr/>
+      <w:r>
+        <w:t xml:space="preserve">Primary Key: id</w:t>
+      </w:r>
+    </w:p>
+    <w:p>
+      <w:pPr/>
+      <w:r>
+        <w:t xml:space="preserve">This table stores the lot or serial numbers of product initial stock lines.</w:t>
+      </w:r>
+    </w:p>
+    <w:tbl>
+      <w:tblPr>
+        <w:tblStyle w:val="TableGrid"/>
+        <w:tblW w:w="8000" w:type="dxa"/>
+        <w:jc w:val="left"/>
+        <w:tblBorders>
+          <w:top w:val="single" w:color="000000" w:sz="4" w:space="0"/>
+          <w:left w:val="single" w:color="000000" w:sz="4" w:space="0"/>
+          <w:bottom w:val="single" w:color="000000" w:sz="4" w:space="0"/>
+          <w:right w:val="single" w:color="000000" w:sz="4" w:space="0"/>
+          <w:insideH w:val="single" w:color="000000" w:sz="4" w:space="0"/>
+          <w:insideV w:val="single" w:color="000000" w:sz="4" w:space="0"/>
+        </w:tblBorders>
+        <w:tblLayout w:type="fixed"/>
+        <w:tblCellMar>
+          <w:top w:w="100" w:type="dxa"/>
+          <w:left w:w="100" w:type="dxa"/>
+          <w:bottom w:w="100" w:type="dxa"/>
+          <w:right w:w="100" w:type="dxa"/>
+        </w:tblCellMar>
+      </w:tblPr>
+      <w:tblGrid>
+        <w:gridCol w:w="2000"/>
+        <w:gridCol w:w="2000"/>
+        <w:gridCol w:w="2000"/>
+        <w:gridCol w:w="2000"/>
+      </w:tblGrid>
+      <w:tr>
+        <w:trPr>
+          <w:trHeight w:val="530" w:hRule="atLeast"/>
+        </w:trPr>
+        <w:tc>
+          <w:tcPr>
+            <w:tcW w:w="2000" w:type="dxa"/>
+          </w:tcPr>
+          <w:p>
+            <w:pPr>
+              <w:jc w:val="center"/>
+            </w:pPr>
+            <w:r>
+              <w:rPr>
+                <w:b/>
+              </w:rPr>
+              <w:t xml:space="preserve">Name of Attribute</w:t>
+            </w:r>
+          </w:p>
+        </w:tc>
+        <w:tc>
+          <w:tcPr>
+            <w:tcW w:w="2000" w:type="dxa"/>
+          </w:tcPr>
+          <w:p>
+            <w:pPr>
+              <w:jc w:val="center"/>
+            </w:pPr>
+            <w:r>
+              <w:rPr>
+                <w:b/>
+              </w:rPr>
+              <w:t xml:space="preserve">Data Type</w:t>
+            </w:r>
+          </w:p>
+        </w:tc>
+        <w:tc>
+          <w:tcPr>
+            <w:tcW w:w="2000" w:type="dxa"/>
+          </w:tcPr>
+          <w:p>
+            <w:pPr>
+              <w:jc w:val="center"/>
+            </w:pPr>
+            <w:r>
+              <w:rPr>
+                <w:b/>
+              </w:rPr>
+              <w:t xml:space="preserve">Size</w:t>
+            </w:r>
+          </w:p>
+        </w:tc>
+        <w:tc>
+          <w:tcPr>
+            <w:tcW w:w="2000" w:type="dxa"/>
+          </w:tcPr>
+          <w:p>
+            <w:pPr>
+              <w:jc w:val="center"/>
+            </w:pPr>
+            <w:r>
+              <w:rPr>
+                <w:b/>
+              </w:rPr>
+              <w:t xml:space="preserve">PK/FK/IS NULL/ NOT NULL</w:t>
+            </w:r>
+          </w:p>
+        </w:tc>
+      </w:tr>
+      <w:tr>
+        <w:trPr>
+          <w:trHeight w:val="530" w:hRule="atLeast"/>
+        </w:trPr>
+        <w:tc>
+          <w:tcPr>
+            <w:tcW w:w="2000" w:type="dxa"/>
+          </w:tcPr>
+          <w:p>
+            <w:pPr/>
+            <w:r>
+              <w:t xml:space="preserve">id</w:t>
+            </w:r>
+          </w:p>
+        </w:tc>
+        <w:tc>
+          <w:tcPr>
+            <w:tcW w:w="2000" w:type="dxa"/>
+          </w:tcPr>
+          <w:p>
+            <w:pPr/>
+            <w:r>
+              <w:t xml:space="preserve">bigint</w:t>
+            </w:r>
+          </w:p>
+        </w:tc>
+        <w:tc>
+          <w:tcPr>
+            <w:tcW w:w="2000" w:type="dxa"/>
+          </w:tcPr>
+          <w:p>
+            <w:pPr/>
+            <w:r>
+              <w:t xml:space="preserve">-</w:t>
+            </w:r>
+          </w:p>
+        </w:tc>
+        <w:tc>
+          <w:tcPr>
+            <w:tcW w:w="2000" w:type="dxa"/>
+          </w:tcPr>
+          <w:p>
+            <w:pPr/>
+            <w:r>
+              <w:t xml:space="preserve">PK, NOT NULL</w:t>
+            </w:r>
+          </w:p>
+        </w:tc>
+      </w:tr>
+      <w:tr>
+        <w:trPr>
+          <w:trHeight w:val="530" w:hRule="atLeast"/>
+        </w:trPr>
+        <w:tc>
+          <w:tcPr>
+            <w:tcW w:w="2000" w:type="dxa"/>
+          </w:tcPr>
+          <w:p>
+            <w:pPr/>
+            <w:r>
+              <w:t xml:space="preserve">line_id</w:t>
+            </w:r>
+          </w:p>
+        </w:tc>
+        <w:tc>
+          <w:tcPr>
+            <w:tcW w:w="2000" w:type="dxa"/>
+          </w:tcPr>
+          <w:p>
+            <w:pPr/>
+            <w:r>
+              <w:t xml:space="preserve">bigint</w:t>
+            </w:r>
+          </w:p>
+        </w:tc>
+        <w:tc>
+          <w:tcPr>
+            <w:tcW w:w="2000" w:type="dxa"/>
+          </w:tcPr>
+          <w:p>
+            <w:pPr/>
+            <w:r>
+              <w:t xml:space="preserve">-</w:t>
+            </w:r>
+          </w:p>
+        </w:tc>
+        <w:tc>
+          <w:tcPr>
+            <w:tcW w:w="2000" w:type="dxa"/>
+          </w:tcPr>
+          <w:p>
+            <w:pPr/>
+            <w:r>
+              <w:t xml:space="preserve">FK, NOT NULL</w:t>
+            </w:r>
+          </w:p>
+        </w:tc>
+      </w:tr>
+      <w:tr>
+        <w:trPr>
+          <w:trHeight w:val="530" w:hRule="atLeast"/>
+        </w:trPr>
+        <w:tc>
+          <w:tcPr>
+            <w:tcW w:w="2000" w:type="dxa"/>
+          </w:tcPr>
+          <w:p>
+            <w:pPr/>
+            <w:r>
+              <w:t xml:space="preserve">seq_no</w:t>
+            </w:r>
+          </w:p>
+        </w:tc>
+        <w:tc>
+          <w:tcPr>
+            <w:tcW w:w="2000" w:type="dxa"/>
+          </w:tcPr>
+          <w:p>
+            <w:pPr/>
+            <w:r>
+              <w:t xml:space="preserve">int</w:t>
+            </w:r>
+          </w:p>
+        </w:tc>
+        <w:tc>
+          <w:tcPr>
+            <w:tcW w:w="2000" w:type="dxa"/>
+          </w:tcPr>
+          <w:p>
+            <w:pPr/>
+            <w:r>
+              <w:t xml:space="preserve">-</w:t>
+            </w:r>
+          </w:p>
+        </w:tc>
+        <w:tc>
+          <w:tcPr>
+            <w:tcW w:w="2000" w:type="dxa"/>
+          </w:tcPr>
+          <w:p>
+            <w:pPr/>
+            <w:r>
+              <w:t xml:space="preserve">NOT NULL</w:t>
+            </w:r>
+          </w:p>
+        </w:tc>
+      </w:tr>
+      <w:tr>
+        <w:trPr>
+          <w:trHeight w:val="530" w:hRule="atLeast"/>
+        </w:trPr>
+        <w:tc>
+          <w:tcPr>
+            <w:tcW w:w="2000" w:type="dxa"/>
+          </w:tcPr>
+          <w:p>
+            <w:pPr/>
+            <w:r>
+              <w:t xml:space="preserve">lot_no</w:t>
+            </w:r>
+          </w:p>
+        </w:tc>
+        <w:tc>
+          <w:tcPr>
+            <w:tcW w:w="2000" w:type="dxa"/>
+          </w:tcPr>
+          <w:p>
+            <w:pPr/>
+            <w:r>
+              <w:t xml:space="preserve">nvarchar</w:t>
+            </w:r>
+          </w:p>
+        </w:tc>
+        <w:tc>
+          <w:tcPr>
+            <w:tcW w:w="2000" w:type="dxa"/>
+          </w:tcPr>
+          <w:p>
+            <w:pPr/>
+            <w:r>
+              <w:t xml:space="preserve">50</w:t>
+            </w:r>
+          </w:p>
+        </w:tc>
+        <w:tc>
+          <w:tcPr>
+            <w:tcW w:w="2000" w:type="dxa"/>
+          </w:tcPr>
+          <w:p>
+            <w:pPr/>
+            <w:r>
+              <w:t xml:space="preserve">IS NULL</w:t>
+            </w:r>
+          </w:p>
+        </w:tc>
+      </w:tr>
+      <w:tr>
+        <w:trPr>
+          <w:trHeight w:val="530" w:hRule="atLeast"/>
+        </w:trPr>
+        <w:tc>
+          <w:tcPr>
+            <w:tcW w:w="2000" w:type="dxa"/>
+          </w:tcPr>
+          <w:p>
+            <w:pPr/>
+            <w:r>
+              <w:t xml:space="preserve">serial_no</w:t>
+            </w:r>
+          </w:p>
+        </w:tc>
+        <w:tc>
+          <w:tcPr>
+            <w:tcW w:w="2000" w:type="dxa"/>
+          </w:tcPr>
+          <w:p>
+            <w:pPr/>
+            <w:r>
+              <w:t xml:space="preserve">nvarchar</w:t>
+            </w:r>
+          </w:p>
+        </w:tc>
+        <w:tc>
+          <w:tcPr>
+            <w:tcW w:w="2000" w:type="dxa"/>
+          </w:tcPr>
+          <w:p>
+            <w:pPr/>
+            <w:r>
+              <w:t xml:space="preserve">100</w:t>
+            </w:r>
+          </w:p>
+        </w:tc>
+        <w:tc>
+          <w:tcPr>
+            <w:tcW w:w="2000" w:type="dxa"/>
+          </w:tcPr>
+          <w:p>
+            <w:pPr/>
+            <w:r>
+              <w:t xml:space="preserve">IS NULL</w:t>
+            </w:r>
+          </w:p>
+        </w:tc>
+      </w:tr>
+      <w:tr>
+        <w:trPr>
+          <w:trHeight w:val="530" w:hRule="atLeast"/>
+        </w:trPr>
+        <w:tc>
+          <w:tcPr>
+            <w:tcW w:w="2000" w:type="dxa"/>
+          </w:tcPr>
+          <w:p>
+            <w:pPr/>
+            <w:r>
+              <w:t xml:space="preserve">quantity</w:t>
+            </w:r>
+          </w:p>
+        </w:tc>
+        <w:tc>
+          <w:tcPr>
+            <w:tcW w:w="2000" w:type="dxa"/>
+          </w:tcPr>
+          <w:p>
+            <w:pPr/>
+            <w:r>
+              <w:t xml:space="preserve">decimal</w:t>
+            </w:r>
+          </w:p>
+        </w:tc>
+        <w:tc>
+          <w:tcPr>
+            <w:tcW w:w="2000" w:type="dxa"/>
+          </w:tcPr>
+          <w:p>
+            <w:pPr/>
+            <w:r>
+              <w:t xml:space="preserve">(19,6)</w:t>
+            </w:r>
+          </w:p>
+        </w:tc>
+        <w:tc>
+          <w:tcPr>
+            <w:tcW w:w="2000" w:type="dxa"/>
+          </w:tcPr>
+          <w:p>
+            <w:pPr/>
+            <w:r>
+              <w:t xml:space="preserve">NOT NULL</w:t>
+            </w:r>
+          </w:p>
+        </w:tc>
+      </w:tr>
+      <w:tr>
+        <w:trPr>
+          <w:trHeight w:val="530" w:hRule="atLeast"/>
+        </w:trPr>
+        <w:tc>
+          <w:tcPr>
+            <w:tcW w:w="2000" w:type="dxa"/>
+          </w:tcPr>
+          <w:p>
+            <w:pPr/>
+            <w:r>
+              <w:t xml:space="preserve">manufacture_date</w:t>
+            </w:r>
+          </w:p>
+        </w:tc>
+        <w:tc>
+          <w:tcPr>
+            <w:tcW w:w="2000" w:type="dxa"/>
+          </w:tcPr>
+          <w:p>
+            <w:pPr/>
+            <w:r>
+              <w:t xml:space="preserve">date</w:t>
+            </w:r>
+          </w:p>
+        </w:tc>
+        <w:tc>
+          <w:tcPr>
+            <w:tcW w:w="2000" w:type="dxa"/>
+          </w:tcPr>
+          <w:p>
+            <w:pPr/>
+            <w:r>
+              <w:t xml:space="preserve">-</w:t>
+            </w:r>
+          </w:p>
+        </w:tc>
+        <w:tc>
+          <w:tcPr>
+            <w:tcW w:w="2000" w:type="dxa"/>
+          </w:tcPr>
+          <w:p>
+            <w:pPr/>
+            <w:r>
+              <w:t xml:space="preserve">IS NULL</w:t>
+            </w:r>
+          </w:p>
+        </w:tc>
+      </w:tr>
+      <w:tr>
+        <w:trPr>
+          <w:trHeight w:val="530" w:hRule="atLeast"/>
+        </w:trPr>
+        <w:tc>
+          <w:tcPr>
+            <w:tcW w:w="2000" w:type="dxa"/>
+          </w:tcPr>
+          <w:p>
+            <w:pPr/>
+            <w:r>
+              <w:t xml:space="preserve">expiry_date</w:t>
+            </w:r>
+          </w:p>
+        </w:tc>
+        <w:tc>
+          <w:tcPr>
+            <w:tcW w:w="2000" w:type="dxa"/>
+          </w:tcPr>
+          <w:p>
+            <w:pPr/>
+            <w:r>
+              <w:t xml:space="preserve">date</w:t>
+            </w:r>
+          </w:p>
+        </w:tc>
+        <w:tc>
+          <w:tcPr>
+            <w:tcW w:w="2000" w:type="dxa"/>
+          </w:tcPr>
+          <w:p>
+            <w:pPr/>
+            <w:r>
+              <w:t xml:space="preserve">-</w:t>
+            </w:r>
+          </w:p>
+        </w:tc>
+        <w:tc>
+          <w:tcPr>
+            <w:tcW w:w="2000" w:type="dxa"/>
+          </w:tcPr>
+          <w:p>
+            <w:pPr/>
+            <w:r>
+              <w:t xml:space="preserve">IS NULL</w:t>
+            </w:r>
+          </w:p>
+        </w:tc>
+      </w:tr>
+      <w:tr>
+        <w:trPr>
+          <w:trHeight w:val="530" w:hRule="atLeast"/>
+        </w:trPr>
+        <w:tc>
+          <w:tcPr>
+            <w:tcW w:w="2000" w:type="dxa"/>
+          </w:tcPr>
+          <w:p>
+            <w:pPr/>
+            <w:r>
+              <w:t xml:space="preserve">company_id</w:t>
+            </w:r>
+          </w:p>
+        </w:tc>
+        <w:tc>
+          <w:tcPr>
+            <w:tcW w:w="2000" w:type="dxa"/>
+          </w:tcPr>
+          <w:p>
+            <w:pPr/>
+            <w:r>
+              <w:t xml:space="preserve">bigint</w:t>
+            </w:r>
+          </w:p>
+        </w:tc>
+        <w:tc>
+          <w:tcPr>
+            <w:tcW w:w="2000" w:type="dxa"/>
+          </w:tcPr>
+          <w:p>
+            <w:pPr/>
+            <w:r>
+              <w:t xml:space="preserve">-</w:t>
+            </w:r>
+          </w:p>
+        </w:tc>
+        <w:tc>
+          <w:tcPr>
+            <w:tcW w:w="2000" w:type="dxa"/>
+          </w:tcPr>
+          <w:p>
+            <w:pPr/>
+            <w:r>
+              <w:t xml:space="preserve">FK, NOT NULL</w:t>
+            </w:r>
+          </w:p>
+        </w:tc>
+      </w:tr>
+      <w:tr>
+        <w:trPr>
+          <w:trHeight w:val="530" w:hRule="atLeast"/>
+        </w:trPr>
+        <w:tc>
+          <w:tcPr>
+            <w:tcW w:w="2000" w:type="dxa"/>
+          </w:tcPr>
+          <w:p>
+            <w:pPr/>
+            <w:r>
+              <w:t xml:space="preserve">created_at</w:t>
+            </w:r>
+          </w:p>
+        </w:tc>
+        <w:tc>
+          <w:tcPr>
+            <w:tcW w:w="2000" w:type="dxa"/>
+          </w:tcPr>
+          <w:p>
+            <w:pPr/>
+            <w:r>
+              <w:t xml:space="preserve">datetime2</w:t>
+            </w:r>
+          </w:p>
+        </w:tc>
+        <w:tc>
+          <w:tcPr>
+            <w:tcW w:w="2000" w:type="dxa"/>
+          </w:tcPr>
+          <w:p>
+            <w:pPr/>
+            <w:r>
+              <w:t xml:space="preserve">(6)</w:t>
+            </w:r>
+          </w:p>
+        </w:tc>
+        <w:tc>
+          <w:tcPr>
+            <w:tcW w:w="2000" w:type="dxa"/>
+          </w:tcPr>
+          <w:p>
+            <w:pPr/>
+            <w:r>
+              <w:t xml:space="preserve">NOT NULL</w:t>
+            </w:r>
+          </w:p>
+        </w:tc>
+      </w:tr>
+      <w:tr>
+        <w:trPr>
+          <w:trHeight w:val="530" w:hRule="atLeast"/>
+        </w:trPr>
+        <w:tc>
+          <w:tcPr>
+            <w:tcW w:w="2000" w:type="dxa"/>
+          </w:tcPr>
+          <w:p>
+            <w:pPr/>
+            <w:r>
+              <w:t xml:space="preserve">created_by</w:t>
+            </w:r>
+          </w:p>
+        </w:tc>
+        <w:tc>
+          <w:tcPr>
+            <w:tcW w:w="2000" w:type="dxa"/>
+          </w:tcPr>
+          <w:p>
+            <w:pPr/>
+            <w:r>
+              <w:t xml:space="preserve">bigint</w:t>
+            </w:r>
+          </w:p>
+        </w:tc>
+        <w:tc>
+          <w:tcPr>
+            <w:tcW w:w="2000" w:type="dxa"/>
+          </w:tcPr>
+          <w:p>
+            <w:pPr/>
+            <w:r>
+              <w:t xml:space="preserve">-</w:t>
+            </w:r>
+          </w:p>
+        </w:tc>
+        <w:tc>
+          <w:tcPr>
+            <w:tcW w:w="2000" w:type="dxa"/>
+          </w:tcPr>
+          <w:p>
+            <w:pPr/>
+            <w:r>
+              <w:t xml:space="preserve">NOT NULL</w:t>
+            </w:r>
+          </w:p>
+        </w:tc>
+      </w:tr>
+      <w:tr>
+        <w:trPr>
+          <w:trHeight w:val="530" w:hRule="atLeast"/>
+        </w:trPr>
+        <w:tc>
+          <w:tcPr>
+            <w:tcW w:w="2000" w:type="dxa"/>
+          </w:tcPr>
+          <w:p>
+            <w:pPr/>
+            <w:r>
+              <w:t xml:space="preserve">updated_at</w:t>
+            </w:r>
+          </w:p>
+        </w:tc>
+        <w:tc>
+          <w:tcPr>
+            <w:tcW w:w="2000" w:type="dxa"/>
+          </w:tcPr>
+          <w:p>
+            <w:pPr/>
+            <w:r>
+              <w:t xml:space="preserve">datetime2</w:t>
+            </w:r>
+          </w:p>
+        </w:tc>
+        <w:tc>
+          <w:tcPr>
+            <w:tcW w:w="2000" w:type="dxa"/>
+          </w:tcPr>
+          <w:p>
+            <w:pPr/>
+            <w:r>
+              <w:t xml:space="preserve">(6)</w:t>
+            </w:r>
+          </w:p>
+        </w:tc>
+        <w:tc>
+          <w:tcPr>
+            <w:tcW w:w="2000" w:type="dxa"/>
+          </w:tcPr>
+          <w:p>
+            <w:pPr/>
+            <w:r>
+              <w:t xml:space="preserve">IS NULL</w:t>
+            </w:r>
+          </w:p>
+        </w:tc>
+      </w:tr>
+      <w:tr>
+        <w:trPr>
+          <w:trHeight w:val="530" w:hRule="atLeast"/>
+        </w:trPr>
+        <w:tc>
+          <w:tcPr>
+            <w:tcW w:w="2000" w:type="dxa"/>
+          </w:tcPr>
+          <w:p>
+            <w:pPr/>
+            <w:r>
+              <w:t xml:space="preserve">updated_by</w:t>
+            </w:r>
+          </w:p>
+        </w:tc>
+        <w:tc>
+          <w:tcPr>
+            <w:tcW w:w="2000" w:type="dxa"/>
+          </w:tcPr>
+          <w:p>
+            <w:pPr/>
+            <w:r>
+              <w:t xml:space="preserve">bigint</w:t>
+            </w:r>
+          </w:p>
+        </w:tc>
+        <w:tc>
+          <w:tcPr>
+            <w:tcW w:w="2000" w:type="dxa"/>
+          </w:tcPr>
+          <w:p>
+            <w:pPr/>
+            <w:r>
+              <w:t xml:space="preserve">-</w:t>
+            </w:r>
+          </w:p>
+        </w:tc>
+        <w:tc>
+          <w:tcPr>
+            <w:tcW w:w="2000" w:type="dxa"/>
+          </w:tcPr>
+          <w:p>
+            <w:pPr/>
+            <w:r>
+              <w:t xml:space="preserve">IS NULL</w:t>
+            </w:r>
+          </w:p>
+        </w:tc>
+      </w:tr>
+      <w:tr>
+        <w:trPr>
+          <w:trHeight w:val="530" w:hRule="atLeast"/>
+        </w:trPr>
+        <w:tc>
+          <w:tcPr>
+            <w:tcW w:w="2000" w:type="dxa"/>
+          </w:tcPr>
+          <w:p>
+            <w:pPr/>
+            <w:r>
+              <w:t xml:space="preserve">version</w:t>
+            </w:r>
+          </w:p>
+        </w:tc>
+        <w:tc>
+          <w:tcPr>
+            <w:tcW w:w="2000" w:type="dxa"/>
+          </w:tcPr>
+          <w:p>
+            <w:pPr/>
+            <w:r>
+              <w:t xml:space="preserve">int</w:t>
+            </w:r>
+          </w:p>
+        </w:tc>
+        <w:tc>
+          <w:tcPr>
+            <w:tcW w:w="2000" w:type="dxa"/>
+          </w:tcPr>
+          <w:p>
+            <w:pPr/>
+            <w:r>
+              <w:t xml:space="preserve">-</w:t>
+            </w:r>
+          </w:p>
+        </w:tc>
+        <w:tc>
+          <w:tcPr>
+            <w:tcW w:w="2000" w:type="dxa"/>
+          </w:tcPr>
+          <w:p>
+            <w:pPr/>
+            <w:r>
+              <w:t xml:space="preserve">NOT NULL</w:t>
+            </w:r>
+          </w:p>
+        </w:tc>
+      </w:tr>
+    </w:tbl>
+    <w:p/>
+    <w:p>
+      <w:pPr/>
+      <w:r>
         <w:t xml:space="preserve">Table Name: inv_other_issue</w:t>
       </w:r>
     </w:p>
@@ -3870,6 +5327,710 @@
     <w:p>
       <w:pPr/>
       <w:r>
+        <w:t xml:space="preserve">Table Name: inv_other_issue_line_tracking</w:t>
+      </w:r>
+    </w:p>
+    <w:p>
+      <w:pPr/>
+      <w:r>
+        <w:t xml:space="preserve">Primary Key: id</w:t>
+      </w:r>
+    </w:p>
+    <w:p>
+      <w:pPr/>
+      <w:r>
+        <w:t xml:space="preserve">This table stores the lot or serial numbers selected on other issue lines.</w:t>
+      </w:r>
+    </w:p>
+    <w:tbl>
+      <w:tblPr>
+        <w:tblStyle w:val="TableGrid"/>
+        <w:tblW w:w="8000" w:type="dxa"/>
+        <w:jc w:val="left"/>
+        <w:tblBorders>
+          <w:top w:val="single" w:color="000000" w:sz="4" w:space="0"/>
+          <w:left w:val="single" w:color="000000" w:sz="4" w:space="0"/>
+          <w:bottom w:val="single" w:color="000000" w:sz="4" w:space="0"/>
+          <w:right w:val="single" w:color="000000" w:sz="4" w:space="0"/>
+          <w:insideH w:val="single" w:color="000000" w:sz="4" w:space="0"/>
+          <w:insideV w:val="single" w:color="000000" w:sz="4" w:space="0"/>
+        </w:tblBorders>
+        <w:tblLayout w:type="fixed"/>
+        <w:tblCellMar>
+          <w:top w:w="100" w:type="dxa"/>
+          <w:left w:w="100" w:type="dxa"/>
+          <w:bottom w:w="100" w:type="dxa"/>
+          <w:right w:w="100" w:type="dxa"/>
+        </w:tblCellMar>
+      </w:tblPr>
+      <w:tblGrid>
+        <w:gridCol w:w="2000"/>
+        <w:gridCol w:w="2000"/>
+        <w:gridCol w:w="2000"/>
+        <w:gridCol w:w="2000"/>
+      </w:tblGrid>
+      <w:tr>
+        <w:trPr>
+          <w:trHeight w:val="530" w:hRule="atLeast"/>
+        </w:trPr>
+        <w:tc>
+          <w:tcPr>
+            <w:tcW w:w="2000" w:type="dxa"/>
+          </w:tcPr>
+          <w:p>
+            <w:pPr>
+              <w:jc w:val="center"/>
+            </w:pPr>
+            <w:r>
+              <w:rPr>
+                <w:b/>
+              </w:rPr>
+              <w:t xml:space="preserve">Name of Attribute</w:t>
+            </w:r>
+          </w:p>
+        </w:tc>
+        <w:tc>
+          <w:tcPr>
+            <w:tcW w:w="2000" w:type="dxa"/>
+          </w:tcPr>
+          <w:p>
+            <w:pPr>
+              <w:jc w:val="center"/>
+            </w:pPr>
+            <w:r>
+              <w:rPr>
+                <w:b/>
+              </w:rPr>
+              <w:t xml:space="preserve">Data Type</w:t>
+            </w:r>
+          </w:p>
+        </w:tc>
+        <w:tc>
+          <w:tcPr>
+            <w:tcW w:w="2000" w:type="dxa"/>
+          </w:tcPr>
+          <w:p>
+            <w:pPr>
+              <w:jc w:val="center"/>
+            </w:pPr>
+            <w:r>
+              <w:rPr>
+                <w:b/>
+              </w:rPr>
+              <w:t xml:space="preserve">Size</w:t>
+            </w:r>
+          </w:p>
+        </w:tc>
+        <w:tc>
+          <w:tcPr>
+            <w:tcW w:w="2000" w:type="dxa"/>
+          </w:tcPr>
+          <w:p>
+            <w:pPr>
+              <w:jc w:val="center"/>
+            </w:pPr>
+            <w:r>
+              <w:rPr>
+                <w:b/>
+              </w:rPr>
+              <w:t xml:space="preserve">PK/FK/IS NULL/ NOT NULL</w:t>
+            </w:r>
+          </w:p>
+        </w:tc>
+      </w:tr>
+      <w:tr>
+        <w:trPr>
+          <w:trHeight w:val="530" w:hRule="atLeast"/>
+        </w:trPr>
+        <w:tc>
+          <w:tcPr>
+            <w:tcW w:w="2000" w:type="dxa"/>
+          </w:tcPr>
+          <w:p>
+            <w:pPr/>
+            <w:r>
+              <w:t xml:space="preserve">id</w:t>
+            </w:r>
+          </w:p>
+        </w:tc>
+        <w:tc>
+          <w:tcPr>
+            <w:tcW w:w="2000" w:type="dxa"/>
+          </w:tcPr>
+          <w:p>
+            <w:pPr/>
+            <w:r>
+              <w:t xml:space="preserve">bigint</w:t>
+            </w:r>
+          </w:p>
+        </w:tc>
+        <w:tc>
+          <w:tcPr>
+            <w:tcW w:w="2000" w:type="dxa"/>
+          </w:tcPr>
+          <w:p>
+            <w:pPr/>
+            <w:r>
+              <w:t xml:space="preserve">-</w:t>
+            </w:r>
+          </w:p>
+        </w:tc>
+        <w:tc>
+          <w:tcPr>
+            <w:tcW w:w="2000" w:type="dxa"/>
+          </w:tcPr>
+          <w:p>
+            <w:pPr/>
+            <w:r>
+              <w:t xml:space="preserve">PK, NOT NULL</w:t>
+            </w:r>
+          </w:p>
+        </w:tc>
+      </w:tr>
+      <w:tr>
+        <w:trPr>
+          <w:trHeight w:val="530" w:hRule="atLeast"/>
+        </w:trPr>
+        <w:tc>
+          <w:tcPr>
+            <w:tcW w:w="2000" w:type="dxa"/>
+          </w:tcPr>
+          <w:p>
+            <w:pPr/>
+            <w:r>
+              <w:t xml:space="preserve">line_id</w:t>
+            </w:r>
+          </w:p>
+        </w:tc>
+        <w:tc>
+          <w:tcPr>
+            <w:tcW w:w="2000" w:type="dxa"/>
+          </w:tcPr>
+          <w:p>
+            <w:pPr/>
+            <w:r>
+              <w:t xml:space="preserve">bigint</w:t>
+            </w:r>
+          </w:p>
+        </w:tc>
+        <w:tc>
+          <w:tcPr>
+            <w:tcW w:w="2000" w:type="dxa"/>
+          </w:tcPr>
+          <w:p>
+            <w:pPr/>
+            <w:r>
+              <w:t xml:space="preserve">-</w:t>
+            </w:r>
+          </w:p>
+        </w:tc>
+        <w:tc>
+          <w:tcPr>
+            <w:tcW w:w="2000" w:type="dxa"/>
+          </w:tcPr>
+          <w:p>
+            <w:pPr/>
+            <w:r>
+              <w:t xml:space="preserve">FK, NOT NULL</w:t>
+            </w:r>
+          </w:p>
+        </w:tc>
+      </w:tr>
+      <w:tr>
+        <w:trPr>
+          <w:trHeight w:val="530" w:hRule="atLeast"/>
+        </w:trPr>
+        <w:tc>
+          <w:tcPr>
+            <w:tcW w:w="2000" w:type="dxa"/>
+          </w:tcPr>
+          <w:p>
+            <w:pPr/>
+            <w:r>
+              <w:t xml:space="preserve">seq_no</w:t>
+            </w:r>
+          </w:p>
+        </w:tc>
+        <w:tc>
+          <w:tcPr>
+            <w:tcW w:w="2000" w:type="dxa"/>
+          </w:tcPr>
+          <w:p>
+            <w:pPr/>
+            <w:r>
+              <w:t xml:space="preserve">int</w:t>
+            </w:r>
+          </w:p>
+        </w:tc>
+        <w:tc>
+          <w:tcPr>
+            <w:tcW w:w="2000" w:type="dxa"/>
+          </w:tcPr>
+          <w:p>
+            <w:pPr/>
+            <w:r>
+              <w:t xml:space="preserve">-</w:t>
+            </w:r>
+          </w:p>
+        </w:tc>
+        <w:tc>
+          <w:tcPr>
+            <w:tcW w:w="2000" w:type="dxa"/>
+          </w:tcPr>
+          <w:p>
+            <w:pPr/>
+            <w:r>
+              <w:t xml:space="preserve">NOT NULL</w:t>
+            </w:r>
+          </w:p>
+        </w:tc>
+      </w:tr>
+      <w:tr>
+        <w:trPr>
+          <w:trHeight w:val="530" w:hRule="atLeast"/>
+        </w:trPr>
+        <w:tc>
+          <w:tcPr>
+            <w:tcW w:w="2000" w:type="dxa"/>
+          </w:tcPr>
+          <w:p>
+            <w:pPr/>
+            <w:r>
+              <w:t xml:space="preserve">lot_no</w:t>
+            </w:r>
+          </w:p>
+        </w:tc>
+        <w:tc>
+          <w:tcPr>
+            <w:tcW w:w="2000" w:type="dxa"/>
+          </w:tcPr>
+          <w:p>
+            <w:pPr/>
+            <w:r>
+              <w:t xml:space="preserve">nvarchar</w:t>
+            </w:r>
+          </w:p>
+        </w:tc>
+        <w:tc>
+          <w:tcPr>
+            <w:tcW w:w="2000" w:type="dxa"/>
+          </w:tcPr>
+          <w:p>
+            <w:pPr/>
+            <w:r>
+              <w:t xml:space="preserve">50</w:t>
+            </w:r>
+          </w:p>
+        </w:tc>
+        <w:tc>
+          <w:tcPr>
+            <w:tcW w:w="2000" w:type="dxa"/>
+          </w:tcPr>
+          <w:p>
+            <w:pPr/>
+            <w:r>
+              <w:t xml:space="preserve">IS NULL</w:t>
+            </w:r>
+          </w:p>
+        </w:tc>
+      </w:tr>
+      <w:tr>
+        <w:trPr>
+          <w:trHeight w:val="530" w:hRule="atLeast"/>
+        </w:trPr>
+        <w:tc>
+          <w:tcPr>
+            <w:tcW w:w="2000" w:type="dxa"/>
+          </w:tcPr>
+          <w:p>
+            <w:pPr/>
+            <w:r>
+              <w:t xml:space="preserve">serial_no</w:t>
+            </w:r>
+          </w:p>
+        </w:tc>
+        <w:tc>
+          <w:tcPr>
+            <w:tcW w:w="2000" w:type="dxa"/>
+          </w:tcPr>
+          <w:p>
+            <w:pPr/>
+            <w:r>
+              <w:t xml:space="preserve">nvarchar</w:t>
+            </w:r>
+          </w:p>
+        </w:tc>
+        <w:tc>
+          <w:tcPr>
+            <w:tcW w:w="2000" w:type="dxa"/>
+          </w:tcPr>
+          <w:p>
+            <w:pPr/>
+            <w:r>
+              <w:t xml:space="preserve">100</w:t>
+            </w:r>
+          </w:p>
+        </w:tc>
+        <w:tc>
+          <w:tcPr>
+            <w:tcW w:w="2000" w:type="dxa"/>
+          </w:tcPr>
+          <w:p>
+            <w:pPr/>
+            <w:r>
+              <w:t xml:space="preserve">IS NULL</w:t>
+            </w:r>
+          </w:p>
+        </w:tc>
+      </w:tr>
+      <w:tr>
+        <w:trPr>
+          <w:trHeight w:val="530" w:hRule="atLeast"/>
+        </w:trPr>
+        <w:tc>
+          <w:tcPr>
+            <w:tcW w:w="2000" w:type="dxa"/>
+          </w:tcPr>
+          <w:p>
+            <w:pPr/>
+            <w:r>
+              <w:t xml:space="preserve">quantity</w:t>
+            </w:r>
+          </w:p>
+        </w:tc>
+        <w:tc>
+          <w:tcPr>
+            <w:tcW w:w="2000" w:type="dxa"/>
+          </w:tcPr>
+          <w:p>
+            <w:pPr/>
+            <w:r>
+              <w:t xml:space="preserve">decimal</w:t>
+            </w:r>
+          </w:p>
+        </w:tc>
+        <w:tc>
+          <w:tcPr>
+            <w:tcW w:w="2000" w:type="dxa"/>
+          </w:tcPr>
+          <w:p>
+            <w:pPr/>
+            <w:r>
+              <w:t xml:space="preserve">(19,6)</w:t>
+            </w:r>
+          </w:p>
+        </w:tc>
+        <w:tc>
+          <w:tcPr>
+            <w:tcW w:w="2000" w:type="dxa"/>
+          </w:tcPr>
+          <w:p>
+            <w:pPr/>
+            <w:r>
+              <w:t xml:space="preserve">NOT NULL</w:t>
+            </w:r>
+          </w:p>
+        </w:tc>
+      </w:tr>
+      <w:tr>
+        <w:trPr>
+          <w:trHeight w:val="530" w:hRule="atLeast"/>
+        </w:trPr>
+        <w:tc>
+          <w:tcPr>
+            <w:tcW w:w="2000" w:type="dxa"/>
+          </w:tcPr>
+          <w:p>
+            <w:pPr/>
+            <w:r>
+              <w:t xml:space="preserve">company_id</w:t>
+            </w:r>
+          </w:p>
+        </w:tc>
+        <w:tc>
+          <w:tcPr>
+            <w:tcW w:w="2000" w:type="dxa"/>
+          </w:tcPr>
+          <w:p>
+            <w:pPr/>
+            <w:r>
+              <w:t xml:space="preserve">bigint</w:t>
+            </w:r>
+          </w:p>
+        </w:tc>
+        <w:tc>
+          <w:tcPr>
+            <w:tcW w:w="2000" w:type="dxa"/>
+          </w:tcPr>
+          <w:p>
+            <w:pPr/>
+            <w:r>
+              <w:t xml:space="preserve">-</w:t>
+            </w:r>
+          </w:p>
+        </w:tc>
+        <w:tc>
+          <w:tcPr>
+            <w:tcW w:w="2000" w:type="dxa"/>
+          </w:tcPr>
+          <w:p>
+            <w:pPr/>
+            <w:r>
+              <w:t xml:space="preserve">FK, NOT NULL</w:t>
+            </w:r>
+          </w:p>
+        </w:tc>
+      </w:tr>
+      <w:tr>
+        <w:trPr>
+          <w:trHeight w:val="530" w:hRule="atLeast"/>
+        </w:trPr>
+        <w:tc>
+          <w:tcPr>
+            <w:tcW w:w="2000" w:type="dxa"/>
+          </w:tcPr>
+          <w:p>
+            <w:pPr/>
+            <w:r>
+              <w:t xml:space="preserve">created_at</w:t>
+            </w:r>
+          </w:p>
+        </w:tc>
+        <w:tc>
+          <w:tcPr>
+            <w:tcW w:w="2000" w:type="dxa"/>
+          </w:tcPr>
+          <w:p>
+            <w:pPr/>
+            <w:r>
+              <w:t xml:space="preserve">datetime2</w:t>
+            </w:r>
+          </w:p>
+        </w:tc>
+        <w:tc>
+          <w:tcPr>
+            <w:tcW w:w="2000" w:type="dxa"/>
+          </w:tcPr>
+          <w:p>
+            <w:pPr/>
+            <w:r>
+              <w:t xml:space="preserve">(6)</w:t>
+            </w:r>
+          </w:p>
+        </w:tc>
+        <w:tc>
+          <w:tcPr>
+            <w:tcW w:w="2000" w:type="dxa"/>
+          </w:tcPr>
+          <w:p>
+            <w:pPr/>
+            <w:r>
+              <w:t xml:space="preserve">NOT NULL</w:t>
+            </w:r>
+          </w:p>
+        </w:tc>
+      </w:tr>
+      <w:tr>
+        <w:trPr>
+          <w:trHeight w:val="530" w:hRule="atLeast"/>
+        </w:trPr>
+        <w:tc>
+          <w:tcPr>
+            <w:tcW w:w="2000" w:type="dxa"/>
+          </w:tcPr>
+          <w:p>
+            <w:pPr/>
+            <w:r>
+              <w:t xml:space="preserve">created_by</w:t>
+            </w:r>
+          </w:p>
+        </w:tc>
+        <w:tc>
+          <w:tcPr>
+            <w:tcW w:w="2000" w:type="dxa"/>
+          </w:tcPr>
+          <w:p>
+            <w:pPr/>
+            <w:r>
+              <w:t xml:space="preserve">bigint</w:t>
+            </w:r>
+          </w:p>
+        </w:tc>
+        <w:tc>
+          <w:tcPr>
+            <w:tcW w:w="2000" w:type="dxa"/>
+          </w:tcPr>
+          <w:p>
+            <w:pPr/>
+            <w:r>
+              <w:t xml:space="preserve">-</w:t>
+            </w:r>
+          </w:p>
+        </w:tc>
+        <w:tc>
+          <w:tcPr>
+            <w:tcW w:w="2000" w:type="dxa"/>
+          </w:tcPr>
+          <w:p>
+            <w:pPr/>
+            <w:r>
+              <w:t xml:space="preserve">NOT NULL</w:t>
+            </w:r>
+          </w:p>
+        </w:tc>
+      </w:tr>
+      <w:tr>
+        <w:trPr>
+          <w:trHeight w:val="530" w:hRule="atLeast"/>
+        </w:trPr>
+        <w:tc>
+          <w:tcPr>
+            <w:tcW w:w="2000" w:type="dxa"/>
+          </w:tcPr>
+          <w:p>
+            <w:pPr/>
+            <w:r>
+              <w:t xml:space="preserve">updated_at</w:t>
+            </w:r>
+          </w:p>
+        </w:tc>
+        <w:tc>
+          <w:tcPr>
+            <w:tcW w:w="2000" w:type="dxa"/>
+          </w:tcPr>
+          <w:p>
+            <w:pPr/>
+            <w:r>
+              <w:t xml:space="preserve">datetime2</w:t>
+            </w:r>
+          </w:p>
+        </w:tc>
+        <w:tc>
+          <w:tcPr>
+            <w:tcW w:w="2000" w:type="dxa"/>
+          </w:tcPr>
+          <w:p>
+            <w:pPr/>
+            <w:r>
+              <w:t xml:space="preserve">(6)</w:t>
+            </w:r>
+          </w:p>
+        </w:tc>
+        <w:tc>
+          <w:tcPr>
+            <w:tcW w:w="2000" w:type="dxa"/>
+          </w:tcPr>
+          <w:p>
+            <w:pPr/>
+            <w:r>
+              <w:t xml:space="preserve">IS NULL</w:t>
+            </w:r>
+          </w:p>
+        </w:tc>
+      </w:tr>
+      <w:tr>
+        <w:trPr>
+          <w:trHeight w:val="530" w:hRule="atLeast"/>
+        </w:trPr>
+        <w:tc>
+          <w:tcPr>
+            <w:tcW w:w="2000" w:type="dxa"/>
+          </w:tcPr>
+          <w:p>
+            <w:pPr/>
+            <w:r>
+              <w:t xml:space="preserve">updated_by</w:t>
+            </w:r>
+          </w:p>
+        </w:tc>
+        <w:tc>
+          <w:tcPr>
+            <w:tcW w:w="2000" w:type="dxa"/>
+          </w:tcPr>
+          <w:p>
+            <w:pPr/>
+            <w:r>
+              <w:t xml:space="preserve">bigint</w:t>
+            </w:r>
+          </w:p>
+        </w:tc>
+        <w:tc>
+          <w:tcPr>
+            <w:tcW w:w="2000" w:type="dxa"/>
+          </w:tcPr>
+          <w:p>
+            <w:pPr/>
+            <w:r>
+              <w:t xml:space="preserve">-</w:t>
+            </w:r>
+          </w:p>
+        </w:tc>
+        <w:tc>
+          <w:tcPr>
+            <w:tcW w:w="2000" w:type="dxa"/>
+          </w:tcPr>
+          <w:p>
+            <w:pPr/>
+            <w:r>
+              <w:t xml:space="preserve">IS NULL</w:t>
+            </w:r>
+          </w:p>
+        </w:tc>
+      </w:tr>
+      <w:tr>
+        <w:trPr>
+          <w:trHeight w:val="530" w:hRule="atLeast"/>
+        </w:trPr>
+        <w:tc>
+          <w:tcPr>
+            <w:tcW w:w="2000" w:type="dxa"/>
+          </w:tcPr>
+          <w:p>
+            <w:pPr/>
+            <w:r>
+              <w:t xml:space="preserve">version</w:t>
+            </w:r>
+          </w:p>
+        </w:tc>
+        <w:tc>
+          <w:tcPr>
+            <w:tcW w:w="2000" w:type="dxa"/>
+          </w:tcPr>
+          <w:p>
+            <w:pPr/>
+            <w:r>
+              <w:t xml:space="preserve">int</w:t>
+            </w:r>
+          </w:p>
+        </w:tc>
+        <w:tc>
+          <w:tcPr>
+            <w:tcW w:w="2000" w:type="dxa"/>
+          </w:tcPr>
+          <w:p>
+            <w:pPr/>
+            <w:r>
+              <w:t xml:space="preserve">-</w:t>
+            </w:r>
+          </w:p>
+        </w:tc>
+        <w:tc>
+          <w:tcPr>
+            <w:tcW w:w="2000" w:type="dxa"/>
+          </w:tcPr>
+          <w:p>
+            <w:pPr/>
+            <w:r>
+              <w:t xml:space="preserve">NOT NULL</w:t>
+            </w:r>
+          </w:p>
+        </w:tc>
+      </w:tr>
+    </w:tbl>
+    <w:p/>
+    <w:p>
+      <w:pPr/>
+      <w:r>
         <w:t xml:space="preserve">Table Name: inv_other_receipt</w:t>
       </w:r>
     </w:p>
@@ -5572,6 +7733,808 @@
     <w:p>
       <w:pPr/>
       <w:r>
+        <w:t xml:space="preserve">Table Name: inv_other_receipt_line_tracking</w:t>
+      </w:r>
+    </w:p>
+    <w:p>
+      <w:pPr/>
+      <w:r>
+        <w:t xml:space="preserve">Primary Key: id</w:t>
+      </w:r>
+    </w:p>
+    <w:p>
+      <w:pPr/>
+      <w:r>
+        <w:t xml:space="preserve">This table stores the lot or serial numbers entered on other receipt lines.</w:t>
+      </w:r>
+    </w:p>
+    <w:tbl>
+      <w:tblPr>
+        <w:tblStyle w:val="TableGrid"/>
+        <w:tblW w:w="8000" w:type="dxa"/>
+        <w:jc w:val="left"/>
+        <w:tblBorders>
+          <w:top w:val="single" w:color="000000" w:sz="4" w:space="0"/>
+          <w:left w:val="single" w:color="000000" w:sz="4" w:space="0"/>
+          <w:bottom w:val="single" w:color="000000" w:sz="4" w:space="0"/>
+          <w:right w:val="single" w:color="000000" w:sz="4" w:space="0"/>
+          <w:insideH w:val="single" w:color="000000" w:sz="4" w:space="0"/>
+          <w:insideV w:val="single" w:color="000000" w:sz="4" w:space="0"/>
+        </w:tblBorders>
+        <w:tblLayout w:type="fixed"/>
+        <w:tblCellMar>
+          <w:top w:w="100" w:type="dxa"/>
+          <w:left w:w="100" w:type="dxa"/>
+          <w:bottom w:w="100" w:type="dxa"/>
+          <w:right w:w="100" w:type="dxa"/>
+        </w:tblCellMar>
+      </w:tblPr>
+      <w:tblGrid>
+        <w:gridCol w:w="2000"/>
+        <w:gridCol w:w="2000"/>
+        <w:gridCol w:w="2000"/>
+        <w:gridCol w:w="2000"/>
+      </w:tblGrid>
+      <w:tr>
+        <w:trPr>
+          <w:trHeight w:val="530" w:hRule="atLeast"/>
+        </w:trPr>
+        <w:tc>
+          <w:tcPr>
+            <w:tcW w:w="2000" w:type="dxa"/>
+          </w:tcPr>
+          <w:p>
+            <w:pPr>
+              <w:jc w:val="center"/>
+            </w:pPr>
+            <w:r>
+              <w:rPr>
+                <w:b/>
+              </w:rPr>
+              <w:t xml:space="preserve">Name of Attribute</w:t>
+            </w:r>
+          </w:p>
+        </w:tc>
+        <w:tc>
+          <w:tcPr>
+            <w:tcW w:w="2000" w:type="dxa"/>
+          </w:tcPr>
+          <w:p>
+            <w:pPr>
+              <w:jc w:val="center"/>
+            </w:pPr>
+            <w:r>
+              <w:rPr>
+                <w:b/>
+              </w:rPr>
+              <w:t xml:space="preserve">Data Type</w:t>
+            </w:r>
+          </w:p>
+        </w:tc>
+        <w:tc>
+          <w:tcPr>
+            <w:tcW w:w="2000" w:type="dxa"/>
+          </w:tcPr>
+          <w:p>
+            <w:pPr>
+              <w:jc w:val="center"/>
+            </w:pPr>
+            <w:r>
+              <w:rPr>
+                <w:b/>
+              </w:rPr>
+              <w:t xml:space="preserve">Size</w:t>
+            </w:r>
+          </w:p>
+        </w:tc>
+        <w:tc>
+          <w:tcPr>
+            <w:tcW w:w="2000" w:type="dxa"/>
+          </w:tcPr>
+          <w:p>
+            <w:pPr>
+              <w:jc w:val="center"/>
+            </w:pPr>
+            <w:r>
+              <w:rPr>
+                <w:b/>
+              </w:rPr>
+              <w:t xml:space="preserve">PK/FK/IS NULL/ NOT NULL</w:t>
+            </w:r>
+          </w:p>
+        </w:tc>
+      </w:tr>
+      <w:tr>
+        <w:trPr>
+          <w:trHeight w:val="530" w:hRule="atLeast"/>
+        </w:trPr>
+        <w:tc>
+          <w:tcPr>
+            <w:tcW w:w="2000" w:type="dxa"/>
+          </w:tcPr>
+          <w:p>
+            <w:pPr/>
+            <w:r>
+              <w:t xml:space="preserve">id</w:t>
+            </w:r>
+          </w:p>
+        </w:tc>
+        <w:tc>
+          <w:tcPr>
+            <w:tcW w:w="2000" w:type="dxa"/>
+          </w:tcPr>
+          <w:p>
+            <w:pPr/>
+            <w:r>
+              <w:t xml:space="preserve">bigint</w:t>
+            </w:r>
+          </w:p>
+        </w:tc>
+        <w:tc>
+          <w:tcPr>
+            <w:tcW w:w="2000" w:type="dxa"/>
+          </w:tcPr>
+          <w:p>
+            <w:pPr/>
+            <w:r>
+              <w:t xml:space="preserve">-</w:t>
+            </w:r>
+          </w:p>
+        </w:tc>
+        <w:tc>
+          <w:tcPr>
+            <w:tcW w:w="2000" w:type="dxa"/>
+          </w:tcPr>
+          <w:p>
+            <w:pPr/>
+            <w:r>
+              <w:t xml:space="preserve">PK, NOT NULL</w:t>
+            </w:r>
+          </w:p>
+        </w:tc>
+      </w:tr>
+      <w:tr>
+        <w:trPr>
+          <w:trHeight w:val="530" w:hRule="atLeast"/>
+        </w:trPr>
+        <w:tc>
+          <w:tcPr>
+            <w:tcW w:w="2000" w:type="dxa"/>
+          </w:tcPr>
+          <w:p>
+            <w:pPr/>
+            <w:r>
+              <w:t xml:space="preserve">line_id</w:t>
+            </w:r>
+          </w:p>
+        </w:tc>
+        <w:tc>
+          <w:tcPr>
+            <w:tcW w:w="2000" w:type="dxa"/>
+          </w:tcPr>
+          <w:p>
+            <w:pPr/>
+            <w:r>
+              <w:t xml:space="preserve">bigint</w:t>
+            </w:r>
+          </w:p>
+        </w:tc>
+        <w:tc>
+          <w:tcPr>
+            <w:tcW w:w="2000" w:type="dxa"/>
+          </w:tcPr>
+          <w:p>
+            <w:pPr/>
+            <w:r>
+              <w:t xml:space="preserve">-</w:t>
+            </w:r>
+          </w:p>
+        </w:tc>
+        <w:tc>
+          <w:tcPr>
+            <w:tcW w:w="2000" w:type="dxa"/>
+          </w:tcPr>
+          <w:p>
+            <w:pPr/>
+            <w:r>
+              <w:t xml:space="preserve">FK, NOT NULL</w:t>
+            </w:r>
+          </w:p>
+        </w:tc>
+      </w:tr>
+      <w:tr>
+        <w:trPr>
+          <w:trHeight w:val="530" w:hRule="atLeast"/>
+        </w:trPr>
+        <w:tc>
+          <w:tcPr>
+            <w:tcW w:w="2000" w:type="dxa"/>
+          </w:tcPr>
+          <w:p>
+            <w:pPr/>
+            <w:r>
+              <w:t xml:space="preserve">seq_no</w:t>
+            </w:r>
+          </w:p>
+        </w:tc>
+        <w:tc>
+          <w:tcPr>
+            <w:tcW w:w="2000" w:type="dxa"/>
+          </w:tcPr>
+          <w:p>
+            <w:pPr/>
+            <w:r>
+              <w:t xml:space="preserve">int</w:t>
+            </w:r>
+          </w:p>
+        </w:tc>
+        <w:tc>
+          <w:tcPr>
+            <w:tcW w:w="2000" w:type="dxa"/>
+          </w:tcPr>
+          <w:p>
+            <w:pPr/>
+            <w:r>
+              <w:t xml:space="preserve">-</w:t>
+            </w:r>
+          </w:p>
+        </w:tc>
+        <w:tc>
+          <w:tcPr>
+            <w:tcW w:w="2000" w:type="dxa"/>
+          </w:tcPr>
+          <w:p>
+            <w:pPr/>
+            <w:r>
+              <w:t xml:space="preserve">NOT NULL</w:t>
+            </w:r>
+          </w:p>
+        </w:tc>
+      </w:tr>
+      <w:tr>
+        <w:trPr>
+          <w:trHeight w:val="530" w:hRule="atLeast"/>
+        </w:trPr>
+        <w:tc>
+          <w:tcPr>
+            <w:tcW w:w="2000" w:type="dxa"/>
+          </w:tcPr>
+          <w:p>
+            <w:pPr/>
+            <w:r>
+              <w:t xml:space="preserve">lot_no</w:t>
+            </w:r>
+          </w:p>
+        </w:tc>
+        <w:tc>
+          <w:tcPr>
+            <w:tcW w:w="2000" w:type="dxa"/>
+          </w:tcPr>
+          <w:p>
+            <w:pPr/>
+            <w:r>
+              <w:t xml:space="preserve">nvarchar</w:t>
+            </w:r>
+          </w:p>
+        </w:tc>
+        <w:tc>
+          <w:tcPr>
+            <w:tcW w:w="2000" w:type="dxa"/>
+          </w:tcPr>
+          <w:p>
+            <w:pPr/>
+            <w:r>
+              <w:t xml:space="preserve">50</w:t>
+            </w:r>
+          </w:p>
+        </w:tc>
+        <w:tc>
+          <w:tcPr>
+            <w:tcW w:w="2000" w:type="dxa"/>
+          </w:tcPr>
+          <w:p>
+            <w:pPr/>
+            <w:r>
+              <w:t xml:space="preserve">IS NULL</w:t>
+            </w:r>
+          </w:p>
+        </w:tc>
+      </w:tr>
+      <w:tr>
+        <w:trPr>
+          <w:trHeight w:val="530" w:hRule="atLeast"/>
+        </w:trPr>
+        <w:tc>
+          <w:tcPr>
+            <w:tcW w:w="2000" w:type="dxa"/>
+          </w:tcPr>
+          <w:p>
+            <w:pPr/>
+            <w:r>
+              <w:t xml:space="preserve">serial_no</w:t>
+            </w:r>
+          </w:p>
+        </w:tc>
+        <w:tc>
+          <w:tcPr>
+            <w:tcW w:w="2000" w:type="dxa"/>
+          </w:tcPr>
+          <w:p>
+            <w:pPr/>
+            <w:r>
+              <w:t xml:space="preserve">nvarchar</w:t>
+            </w:r>
+          </w:p>
+        </w:tc>
+        <w:tc>
+          <w:tcPr>
+            <w:tcW w:w="2000" w:type="dxa"/>
+          </w:tcPr>
+          <w:p>
+            <w:pPr/>
+            <w:r>
+              <w:t xml:space="preserve">100</w:t>
+            </w:r>
+          </w:p>
+        </w:tc>
+        <w:tc>
+          <w:tcPr>
+            <w:tcW w:w="2000" w:type="dxa"/>
+          </w:tcPr>
+          <w:p>
+            <w:pPr/>
+            <w:r>
+              <w:t xml:space="preserve">IS NULL</w:t>
+            </w:r>
+          </w:p>
+        </w:tc>
+      </w:tr>
+      <w:tr>
+        <w:trPr>
+          <w:trHeight w:val="530" w:hRule="atLeast"/>
+        </w:trPr>
+        <w:tc>
+          <w:tcPr>
+            <w:tcW w:w="2000" w:type="dxa"/>
+          </w:tcPr>
+          <w:p>
+            <w:pPr/>
+            <w:r>
+              <w:t xml:space="preserve">quantity</w:t>
+            </w:r>
+          </w:p>
+        </w:tc>
+        <w:tc>
+          <w:tcPr>
+            <w:tcW w:w="2000" w:type="dxa"/>
+          </w:tcPr>
+          <w:p>
+            <w:pPr/>
+            <w:r>
+              <w:t xml:space="preserve">decimal</w:t>
+            </w:r>
+          </w:p>
+        </w:tc>
+        <w:tc>
+          <w:tcPr>
+            <w:tcW w:w="2000" w:type="dxa"/>
+          </w:tcPr>
+          <w:p>
+            <w:pPr/>
+            <w:r>
+              <w:t xml:space="preserve">(19,6)</w:t>
+            </w:r>
+          </w:p>
+        </w:tc>
+        <w:tc>
+          <w:tcPr>
+            <w:tcW w:w="2000" w:type="dxa"/>
+          </w:tcPr>
+          <w:p>
+            <w:pPr/>
+            <w:r>
+              <w:t xml:space="preserve">NOT NULL</w:t>
+            </w:r>
+          </w:p>
+        </w:tc>
+      </w:tr>
+      <w:tr>
+        <w:trPr>
+          <w:trHeight w:val="530" w:hRule="atLeast"/>
+        </w:trPr>
+        <w:tc>
+          <w:tcPr>
+            <w:tcW w:w="2000" w:type="dxa"/>
+          </w:tcPr>
+          <w:p>
+            <w:pPr/>
+            <w:r>
+              <w:t xml:space="preserve">manufacture_date</w:t>
+            </w:r>
+          </w:p>
+        </w:tc>
+        <w:tc>
+          <w:tcPr>
+            <w:tcW w:w="2000" w:type="dxa"/>
+          </w:tcPr>
+          <w:p>
+            <w:pPr/>
+            <w:r>
+              <w:t xml:space="preserve">date</w:t>
+            </w:r>
+          </w:p>
+        </w:tc>
+        <w:tc>
+          <w:tcPr>
+            <w:tcW w:w="2000" w:type="dxa"/>
+          </w:tcPr>
+          <w:p>
+            <w:pPr/>
+            <w:r>
+              <w:t xml:space="preserve">-</w:t>
+            </w:r>
+          </w:p>
+        </w:tc>
+        <w:tc>
+          <w:tcPr>
+            <w:tcW w:w="2000" w:type="dxa"/>
+          </w:tcPr>
+          <w:p>
+            <w:pPr/>
+            <w:r>
+              <w:t xml:space="preserve">IS NULL</w:t>
+            </w:r>
+          </w:p>
+        </w:tc>
+      </w:tr>
+      <w:tr>
+        <w:trPr>
+          <w:trHeight w:val="530" w:hRule="atLeast"/>
+        </w:trPr>
+        <w:tc>
+          <w:tcPr>
+            <w:tcW w:w="2000" w:type="dxa"/>
+          </w:tcPr>
+          <w:p>
+            <w:pPr/>
+            <w:r>
+              <w:t xml:space="preserve">expiry_date</w:t>
+            </w:r>
+          </w:p>
+        </w:tc>
+        <w:tc>
+          <w:tcPr>
+            <w:tcW w:w="2000" w:type="dxa"/>
+          </w:tcPr>
+          <w:p>
+            <w:pPr/>
+            <w:r>
+              <w:t xml:space="preserve">date</w:t>
+            </w:r>
+          </w:p>
+        </w:tc>
+        <w:tc>
+          <w:tcPr>
+            <w:tcW w:w="2000" w:type="dxa"/>
+          </w:tcPr>
+          <w:p>
+            <w:pPr/>
+            <w:r>
+              <w:t xml:space="preserve">-</w:t>
+            </w:r>
+          </w:p>
+        </w:tc>
+        <w:tc>
+          <w:tcPr>
+            <w:tcW w:w="2000" w:type="dxa"/>
+          </w:tcPr>
+          <w:p>
+            <w:pPr/>
+            <w:r>
+              <w:t xml:space="preserve">IS NULL</w:t>
+            </w:r>
+          </w:p>
+        </w:tc>
+      </w:tr>
+      <w:tr>
+        <w:trPr>
+          <w:trHeight w:val="530" w:hRule="atLeast"/>
+        </w:trPr>
+        <w:tc>
+          <w:tcPr>
+            <w:tcW w:w="2000" w:type="dxa"/>
+          </w:tcPr>
+          <w:p>
+            <w:pPr/>
+            <w:r>
+              <w:t xml:space="preserve">company_id</w:t>
+            </w:r>
+          </w:p>
+        </w:tc>
+        <w:tc>
+          <w:tcPr>
+            <w:tcW w:w="2000" w:type="dxa"/>
+          </w:tcPr>
+          <w:p>
+            <w:pPr/>
+            <w:r>
+              <w:t xml:space="preserve">bigint</w:t>
+            </w:r>
+          </w:p>
+        </w:tc>
+        <w:tc>
+          <w:tcPr>
+            <w:tcW w:w="2000" w:type="dxa"/>
+          </w:tcPr>
+          <w:p>
+            <w:pPr/>
+            <w:r>
+              <w:t xml:space="preserve">-</w:t>
+            </w:r>
+          </w:p>
+        </w:tc>
+        <w:tc>
+          <w:tcPr>
+            <w:tcW w:w="2000" w:type="dxa"/>
+          </w:tcPr>
+          <w:p>
+            <w:pPr/>
+            <w:r>
+              <w:t xml:space="preserve">FK, NOT NULL</w:t>
+            </w:r>
+          </w:p>
+        </w:tc>
+      </w:tr>
+      <w:tr>
+        <w:trPr>
+          <w:trHeight w:val="530" w:hRule="atLeast"/>
+        </w:trPr>
+        <w:tc>
+          <w:tcPr>
+            <w:tcW w:w="2000" w:type="dxa"/>
+          </w:tcPr>
+          <w:p>
+            <w:pPr/>
+            <w:r>
+              <w:t xml:space="preserve">created_at</w:t>
+            </w:r>
+          </w:p>
+        </w:tc>
+        <w:tc>
+          <w:tcPr>
+            <w:tcW w:w="2000" w:type="dxa"/>
+          </w:tcPr>
+          <w:p>
+            <w:pPr/>
+            <w:r>
+              <w:t xml:space="preserve">datetime2</w:t>
+            </w:r>
+          </w:p>
+        </w:tc>
+        <w:tc>
+          <w:tcPr>
+            <w:tcW w:w="2000" w:type="dxa"/>
+          </w:tcPr>
+          <w:p>
+            <w:pPr/>
+            <w:r>
+              <w:t xml:space="preserve">(6)</w:t>
+            </w:r>
+          </w:p>
+        </w:tc>
+        <w:tc>
+          <w:tcPr>
+            <w:tcW w:w="2000" w:type="dxa"/>
+          </w:tcPr>
+          <w:p>
+            <w:pPr/>
+            <w:r>
+              <w:t xml:space="preserve">NOT NULL</w:t>
+            </w:r>
+          </w:p>
+        </w:tc>
+      </w:tr>
+      <w:tr>
+        <w:trPr>
+          <w:trHeight w:val="530" w:hRule="atLeast"/>
+        </w:trPr>
+        <w:tc>
+          <w:tcPr>
+            <w:tcW w:w="2000" w:type="dxa"/>
+          </w:tcPr>
+          <w:p>
+            <w:pPr/>
+            <w:r>
+              <w:t xml:space="preserve">created_by</w:t>
+            </w:r>
+          </w:p>
+        </w:tc>
+        <w:tc>
+          <w:tcPr>
+            <w:tcW w:w="2000" w:type="dxa"/>
+          </w:tcPr>
+          <w:p>
+            <w:pPr/>
+            <w:r>
+              <w:t xml:space="preserve">bigint</w:t>
+            </w:r>
+          </w:p>
+        </w:tc>
+        <w:tc>
+          <w:tcPr>
+            <w:tcW w:w="2000" w:type="dxa"/>
+          </w:tcPr>
+          <w:p>
+            <w:pPr/>
+            <w:r>
+              <w:t xml:space="preserve">-</w:t>
+            </w:r>
+          </w:p>
+        </w:tc>
+        <w:tc>
+          <w:tcPr>
+            <w:tcW w:w="2000" w:type="dxa"/>
+          </w:tcPr>
+          <w:p>
+            <w:pPr/>
+            <w:r>
+              <w:t xml:space="preserve">NOT NULL</w:t>
+            </w:r>
+          </w:p>
+        </w:tc>
+      </w:tr>
+      <w:tr>
+        <w:trPr>
+          <w:trHeight w:val="530" w:hRule="atLeast"/>
+        </w:trPr>
+        <w:tc>
+          <w:tcPr>
+            <w:tcW w:w="2000" w:type="dxa"/>
+          </w:tcPr>
+          <w:p>
+            <w:pPr/>
+            <w:r>
+              <w:t xml:space="preserve">updated_at</w:t>
+            </w:r>
+          </w:p>
+        </w:tc>
+        <w:tc>
+          <w:tcPr>
+            <w:tcW w:w="2000" w:type="dxa"/>
+          </w:tcPr>
+          <w:p>
+            <w:pPr/>
+            <w:r>
+              <w:t xml:space="preserve">datetime2</w:t>
+            </w:r>
+          </w:p>
+        </w:tc>
+        <w:tc>
+          <w:tcPr>
+            <w:tcW w:w="2000" w:type="dxa"/>
+          </w:tcPr>
+          <w:p>
+            <w:pPr/>
+            <w:r>
+              <w:t xml:space="preserve">(6)</w:t>
+            </w:r>
+          </w:p>
+        </w:tc>
+        <w:tc>
+          <w:tcPr>
+            <w:tcW w:w="2000" w:type="dxa"/>
+          </w:tcPr>
+          <w:p>
+            <w:pPr/>
+            <w:r>
+              <w:t xml:space="preserve">IS NULL</w:t>
+            </w:r>
+          </w:p>
+        </w:tc>
+      </w:tr>
+      <w:tr>
+        <w:trPr>
+          <w:trHeight w:val="530" w:hRule="atLeast"/>
+        </w:trPr>
+        <w:tc>
+          <w:tcPr>
+            <w:tcW w:w="2000" w:type="dxa"/>
+          </w:tcPr>
+          <w:p>
+            <w:pPr/>
+            <w:r>
+              <w:t xml:space="preserve">updated_by</w:t>
+            </w:r>
+          </w:p>
+        </w:tc>
+        <w:tc>
+          <w:tcPr>
+            <w:tcW w:w="2000" w:type="dxa"/>
+          </w:tcPr>
+          <w:p>
+            <w:pPr/>
+            <w:r>
+              <w:t xml:space="preserve">bigint</w:t>
+            </w:r>
+          </w:p>
+        </w:tc>
+        <w:tc>
+          <w:tcPr>
+            <w:tcW w:w="2000" w:type="dxa"/>
+          </w:tcPr>
+          <w:p>
+            <w:pPr/>
+            <w:r>
+              <w:t xml:space="preserve">-</w:t>
+            </w:r>
+          </w:p>
+        </w:tc>
+        <w:tc>
+          <w:tcPr>
+            <w:tcW w:w="2000" w:type="dxa"/>
+          </w:tcPr>
+          <w:p>
+            <w:pPr/>
+            <w:r>
+              <w:t xml:space="preserve">IS NULL</w:t>
+            </w:r>
+          </w:p>
+        </w:tc>
+      </w:tr>
+      <w:tr>
+        <w:trPr>
+          <w:trHeight w:val="530" w:hRule="atLeast"/>
+        </w:trPr>
+        <w:tc>
+          <w:tcPr>
+            <w:tcW w:w="2000" w:type="dxa"/>
+          </w:tcPr>
+          <w:p>
+            <w:pPr/>
+            <w:r>
+              <w:t xml:space="preserve">version</w:t>
+            </w:r>
+          </w:p>
+        </w:tc>
+        <w:tc>
+          <w:tcPr>
+            <w:tcW w:w="2000" w:type="dxa"/>
+          </w:tcPr>
+          <w:p>
+            <w:pPr/>
+            <w:r>
+              <w:t xml:space="preserve">int</w:t>
+            </w:r>
+          </w:p>
+        </w:tc>
+        <w:tc>
+          <w:tcPr>
+            <w:tcW w:w="2000" w:type="dxa"/>
+          </w:tcPr>
+          <w:p>
+            <w:pPr/>
+            <w:r>
+              <w:t xml:space="preserve">-</w:t>
+            </w:r>
+          </w:p>
+        </w:tc>
+        <w:tc>
+          <w:tcPr>
+            <w:tcW w:w="2000" w:type="dxa"/>
+          </w:tcPr>
+          <w:p>
+            <w:pPr/>
+            <w:r>
+              <w:t xml:space="preserve">NOT NULL</w:t>
+            </w:r>
+          </w:p>
+        </w:tc>
+      </w:tr>
+    </w:tbl>
+    <w:p/>
+    <w:p>
+      <w:pPr/>
+      <w:r>
         <w:t xml:space="preserve">Table Name: inv_reference</w:t>
       </w:r>
     </w:p>
@@ -6071,6 +9034,563 @@
             <w:pPr/>
             <w:r>
               <w:t xml:space="preserve">IS NULL</w:t>
+            </w:r>
+          </w:p>
+        </w:tc>
+      </w:tr>
+      <w:tr>
+        <w:trPr>
+          <w:trHeight w:val="530" w:hRule="atLeast"/>
+        </w:trPr>
+        <w:tc>
+          <w:tcPr>
+            <w:tcW w:w="2000" w:type="dxa"/>
+          </w:tcPr>
+          <w:p>
+            <w:pPr/>
+            <w:r>
+              <w:t xml:space="preserve">company_id</w:t>
+            </w:r>
+          </w:p>
+        </w:tc>
+        <w:tc>
+          <w:tcPr>
+            <w:tcW w:w="2000" w:type="dxa"/>
+          </w:tcPr>
+          <w:p>
+            <w:pPr/>
+            <w:r>
+              <w:t xml:space="preserve">bigint</w:t>
+            </w:r>
+          </w:p>
+        </w:tc>
+        <w:tc>
+          <w:tcPr>
+            <w:tcW w:w="2000" w:type="dxa"/>
+          </w:tcPr>
+          <w:p>
+            <w:pPr/>
+            <w:r>
+              <w:t xml:space="preserve">-</w:t>
+            </w:r>
+          </w:p>
+        </w:tc>
+        <w:tc>
+          <w:tcPr>
+            <w:tcW w:w="2000" w:type="dxa"/>
+          </w:tcPr>
+          <w:p>
+            <w:pPr/>
+            <w:r>
+              <w:t xml:space="preserve">NOT NULL</w:t>
+            </w:r>
+          </w:p>
+        </w:tc>
+      </w:tr>
+      <w:tr>
+        <w:trPr>
+          <w:trHeight w:val="530" w:hRule="atLeast"/>
+        </w:trPr>
+        <w:tc>
+          <w:tcPr>
+            <w:tcW w:w="2000" w:type="dxa"/>
+          </w:tcPr>
+          <w:p>
+            <w:pPr/>
+            <w:r>
+              <w:t xml:space="preserve">created_at</w:t>
+            </w:r>
+          </w:p>
+        </w:tc>
+        <w:tc>
+          <w:tcPr>
+            <w:tcW w:w="2000" w:type="dxa"/>
+          </w:tcPr>
+          <w:p>
+            <w:pPr/>
+            <w:r>
+              <w:t xml:space="preserve">datetime2</w:t>
+            </w:r>
+          </w:p>
+        </w:tc>
+        <w:tc>
+          <w:tcPr>
+            <w:tcW w:w="2000" w:type="dxa"/>
+          </w:tcPr>
+          <w:p>
+            <w:pPr/>
+            <w:r>
+              <w:t xml:space="preserve">(6)</w:t>
+            </w:r>
+          </w:p>
+        </w:tc>
+        <w:tc>
+          <w:tcPr>
+            <w:tcW w:w="2000" w:type="dxa"/>
+          </w:tcPr>
+          <w:p>
+            <w:pPr/>
+            <w:r>
+              <w:t xml:space="preserve">NOT NULL</w:t>
+            </w:r>
+          </w:p>
+        </w:tc>
+      </w:tr>
+      <w:tr>
+        <w:trPr>
+          <w:trHeight w:val="530" w:hRule="atLeast"/>
+        </w:trPr>
+        <w:tc>
+          <w:tcPr>
+            <w:tcW w:w="2000" w:type="dxa"/>
+          </w:tcPr>
+          <w:p>
+            <w:pPr/>
+            <w:r>
+              <w:t xml:space="preserve">created_by</w:t>
+            </w:r>
+          </w:p>
+        </w:tc>
+        <w:tc>
+          <w:tcPr>
+            <w:tcW w:w="2000" w:type="dxa"/>
+          </w:tcPr>
+          <w:p>
+            <w:pPr/>
+            <w:r>
+              <w:t xml:space="preserve">bigint</w:t>
+            </w:r>
+          </w:p>
+        </w:tc>
+        <w:tc>
+          <w:tcPr>
+            <w:tcW w:w="2000" w:type="dxa"/>
+          </w:tcPr>
+          <w:p>
+            <w:pPr/>
+            <w:r>
+              <w:t xml:space="preserve">-</w:t>
+            </w:r>
+          </w:p>
+        </w:tc>
+        <w:tc>
+          <w:tcPr>
+            <w:tcW w:w="2000" w:type="dxa"/>
+          </w:tcPr>
+          <w:p>
+            <w:pPr/>
+            <w:r>
+              <w:t xml:space="preserve">NOT NULL</w:t>
+            </w:r>
+          </w:p>
+        </w:tc>
+      </w:tr>
+      <w:tr>
+        <w:trPr>
+          <w:trHeight w:val="530" w:hRule="atLeast"/>
+        </w:trPr>
+        <w:tc>
+          <w:tcPr>
+            <w:tcW w:w="2000" w:type="dxa"/>
+          </w:tcPr>
+          <w:p>
+            <w:pPr/>
+            <w:r>
+              <w:t xml:space="preserve">updated_at</w:t>
+            </w:r>
+          </w:p>
+        </w:tc>
+        <w:tc>
+          <w:tcPr>
+            <w:tcW w:w="2000" w:type="dxa"/>
+          </w:tcPr>
+          <w:p>
+            <w:pPr/>
+            <w:r>
+              <w:t xml:space="preserve">datetime2</w:t>
+            </w:r>
+          </w:p>
+        </w:tc>
+        <w:tc>
+          <w:tcPr>
+            <w:tcW w:w="2000" w:type="dxa"/>
+          </w:tcPr>
+          <w:p>
+            <w:pPr/>
+            <w:r>
+              <w:t xml:space="preserve">(6)</w:t>
+            </w:r>
+          </w:p>
+        </w:tc>
+        <w:tc>
+          <w:tcPr>
+            <w:tcW w:w="2000" w:type="dxa"/>
+          </w:tcPr>
+          <w:p>
+            <w:pPr/>
+            <w:r>
+              <w:t xml:space="preserve">IS NULL</w:t>
+            </w:r>
+          </w:p>
+        </w:tc>
+      </w:tr>
+      <w:tr>
+        <w:trPr>
+          <w:trHeight w:val="530" w:hRule="atLeast"/>
+        </w:trPr>
+        <w:tc>
+          <w:tcPr>
+            <w:tcW w:w="2000" w:type="dxa"/>
+          </w:tcPr>
+          <w:p>
+            <w:pPr/>
+            <w:r>
+              <w:t xml:space="preserve">updated_by</w:t>
+            </w:r>
+          </w:p>
+        </w:tc>
+        <w:tc>
+          <w:tcPr>
+            <w:tcW w:w="2000" w:type="dxa"/>
+          </w:tcPr>
+          <w:p>
+            <w:pPr/>
+            <w:r>
+              <w:t xml:space="preserve">bigint</w:t>
+            </w:r>
+          </w:p>
+        </w:tc>
+        <w:tc>
+          <w:tcPr>
+            <w:tcW w:w="2000" w:type="dxa"/>
+          </w:tcPr>
+          <w:p>
+            <w:pPr/>
+            <w:r>
+              <w:t xml:space="preserve">-</w:t>
+            </w:r>
+          </w:p>
+        </w:tc>
+        <w:tc>
+          <w:tcPr>
+            <w:tcW w:w="2000" w:type="dxa"/>
+          </w:tcPr>
+          <w:p>
+            <w:pPr/>
+            <w:r>
+              <w:t xml:space="preserve">IS NULL</w:t>
+            </w:r>
+          </w:p>
+        </w:tc>
+      </w:tr>
+      <w:tr>
+        <w:trPr>
+          <w:trHeight w:val="530" w:hRule="atLeast"/>
+        </w:trPr>
+        <w:tc>
+          <w:tcPr>
+            <w:tcW w:w="2000" w:type="dxa"/>
+          </w:tcPr>
+          <w:p>
+            <w:pPr/>
+            <w:r>
+              <w:t xml:space="preserve">version</w:t>
+            </w:r>
+          </w:p>
+        </w:tc>
+        <w:tc>
+          <w:tcPr>
+            <w:tcW w:w="2000" w:type="dxa"/>
+          </w:tcPr>
+          <w:p>
+            <w:pPr/>
+            <w:r>
+              <w:t xml:space="preserve">int</w:t>
+            </w:r>
+          </w:p>
+        </w:tc>
+        <w:tc>
+          <w:tcPr>
+            <w:tcW w:w="2000" w:type="dxa"/>
+          </w:tcPr>
+          <w:p>
+            <w:pPr/>
+            <w:r>
+              <w:t xml:space="preserve">-</w:t>
+            </w:r>
+          </w:p>
+        </w:tc>
+        <w:tc>
+          <w:tcPr>
+            <w:tcW w:w="2000" w:type="dxa"/>
+          </w:tcPr>
+          <w:p>
+            <w:pPr/>
+            <w:r>
+              <w:t xml:space="preserve">NOT NULL</w:t>
+            </w:r>
+          </w:p>
+        </w:tc>
+      </w:tr>
+    </w:tbl>
+    <w:p/>
+    <w:p>
+      <w:pPr/>
+      <w:r>
+        <w:t xml:space="preserve">Table Name: inv_serial</w:t>
+      </w:r>
+    </w:p>
+    <w:p>
+      <w:pPr/>
+      <w:r>
+        <w:t xml:space="preserve">Primary Key: id</w:t>
+      </w:r>
+    </w:p>
+    <w:p>
+      <w:pPr/>
+      <w:r>
+        <w:t xml:space="preserve">This table stores company-scoped serial numbers per item, each representing one base unit.</w:t>
+      </w:r>
+    </w:p>
+    <w:tbl>
+      <w:tblPr>
+        <w:tblStyle w:val="TableGrid"/>
+        <w:tblW w:w="8000" w:type="dxa"/>
+        <w:jc w:val="left"/>
+        <w:tblBorders>
+          <w:top w:val="single" w:color="000000" w:sz="4" w:space="0"/>
+          <w:left w:val="single" w:color="000000" w:sz="4" w:space="0"/>
+          <w:bottom w:val="single" w:color="000000" w:sz="4" w:space="0"/>
+          <w:right w:val="single" w:color="000000" w:sz="4" w:space="0"/>
+          <w:insideH w:val="single" w:color="000000" w:sz="4" w:space="0"/>
+          <w:insideV w:val="single" w:color="000000" w:sz="4" w:space="0"/>
+        </w:tblBorders>
+        <w:tblLayout w:type="fixed"/>
+        <w:tblCellMar>
+          <w:top w:w="100" w:type="dxa"/>
+          <w:left w:w="100" w:type="dxa"/>
+          <w:bottom w:w="100" w:type="dxa"/>
+          <w:right w:w="100" w:type="dxa"/>
+        </w:tblCellMar>
+      </w:tblPr>
+      <w:tblGrid>
+        <w:gridCol w:w="2000"/>
+        <w:gridCol w:w="2000"/>
+        <w:gridCol w:w="2000"/>
+        <w:gridCol w:w="2000"/>
+      </w:tblGrid>
+      <w:tr>
+        <w:trPr>
+          <w:trHeight w:val="530" w:hRule="atLeast"/>
+        </w:trPr>
+        <w:tc>
+          <w:tcPr>
+            <w:tcW w:w="2000" w:type="dxa"/>
+          </w:tcPr>
+          <w:p>
+            <w:pPr>
+              <w:jc w:val="center"/>
+            </w:pPr>
+            <w:r>
+              <w:rPr>
+                <w:b/>
+              </w:rPr>
+              <w:t xml:space="preserve">Name of Attribute</w:t>
+            </w:r>
+          </w:p>
+        </w:tc>
+        <w:tc>
+          <w:tcPr>
+            <w:tcW w:w="2000" w:type="dxa"/>
+          </w:tcPr>
+          <w:p>
+            <w:pPr>
+              <w:jc w:val="center"/>
+            </w:pPr>
+            <w:r>
+              <w:rPr>
+                <w:b/>
+              </w:rPr>
+              <w:t xml:space="preserve">Data Type</w:t>
+            </w:r>
+          </w:p>
+        </w:tc>
+        <w:tc>
+          <w:tcPr>
+            <w:tcW w:w="2000" w:type="dxa"/>
+          </w:tcPr>
+          <w:p>
+            <w:pPr>
+              <w:jc w:val="center"/>
+            </w:pPr>
+            <w:r>
+              <w:rPr>
+                <w:b/>
+              </w:rPr>
+              <w:t xml:space="preserve">Size</w:t>
+            </w:r>
+          </w:p>
+        </w:tc>
+        <w:tc>
+          <w:tcPr>
+            <w:tcW w:w="2000" w:type="dxa"/>
+          </w:tcPr>
+          <w:p>
+            <w:pPr>
+              <w:jc w:val="center"/>
+            </w:pPr>
+            <w:r>
+              <w:rPr>
+                <w:b/>
+              </w:rPr>
+              <w:t xml:space="preserve">PK/FK/IS NULL/ NOT NULL</w:t>
+            </w:r>
+          </w:p>
+        </w:tc>
+      </w:tr>
+      <w:tr>
+        <w:trPr>
+          <w:trHeight w:val="530" w:hRule="atLeast"/>
+        </w:trPr>
+        <w:tc>
+          <w:tcPr>
+            <w:tcW w:w="2000" w:type="dxa"/>
+          </w:tcPr>
+          <w:p>
+            <w:pPr/>
+            <w:r>
+              <w:t xml:space="preserve">id</w:t>
+            </w:r>
+          </w:p>
+        </w:tc>
+        <w:tc>
+          <w:tcPr>
+            <w:tcW w:w="2000" w:type="dxa"/>
+          </w:tcPr>
+          <w:p>
+            <w:pPr/>
+            <w:r>
+              <w:t xml:space="preserve">bigint</w:t>
+            </w:r>
+          </w:p>
+        </w:tc>
+        <w:tc>
+          <w:tcPr>
+            <w:tcW w:w="2000" w:type="dxa"/>
+          </w:tcPr>
+          <w:p>
+            <w:pPr/>
+            <w:r>
+              <w:t xml:space="preserve">-</w:t>
+            </w:r>
+          </w:p>
+        </w:tc>
+        <w:tc>
+          <w:tcPr>
+            <w:tcW w:w="2000" w:type="dxa"/>
+          </w:tcPr>
+          <w:p>
+            <w:pPr/>
+            <w:r>
+              <w:t xml:space="preserve">PK, NOT NULL</w:t>
+            </w:r>
+          </w:p>
+        </w:tc>
+      </w:tr>
+      <w:tr>
+        <w:trPr>
+          <w:trHeight w:val="530" w:hRule="atLeast"/>
+        </w:trPr>
+        <w:tc>
+          <w:tcPr>
+            <w:tcW w:w="2000" w:type="dxa"/>
+          </w:tcPr>
+          <w:p>
+            <w:pPr/>
+            <w:r>
+              <w:t xml:space="preserve">item_id</w:t>
+            </w:r>
+          </w:p>
+        </w:tc>
+        <w:tc>
+          <w:tcPr>
+            <w:tcW w:w="2000" w:type="dxa"/>
+          </w:tcPr>
+          <w:p>
+            <w:pPr/>
+            <w:r>
+              <w:t xml:space="preserve">bigint</w:t>
+            </w:r>
+          </w:p>
+        </w:tc>
+        <w:tc>
+          <w:tcPr>
+            <w:tcW w:w="2000" w:type="dxa"/>
+          </w:tcPr>
+          <w:p>
+            <w:pPr/>
+            <w:r>
+              <w:t xml:space="preserve">-</w:t>
+            </w:r>
+          </w:p>
+        </w:tc>
+        <w:tc>
+          <w:tcPr>
+            <w:tcW w:w="2000" w:type="dxa"/>
+          </w:tcPr>
+          <w:p>
+            <w:pPr/>
+            <w:r>
+              <w:t xml:space="preserve">NOT NULL</w:t>
+            </w:r>
+          </w:p>
+        </w:tc>
+      </w:tr>
+      <w:tr>
+        <w:trPr>
+          <w:trHeight w:val="530" w:hRule="atLeast"/>
+        </w:trPr>
+        <w:tc>
+          <w:tcPr>
+            <w:tcW w:w="2000" w:type="dxa"/>
+          </w:tcPr>
+          <w:p>
+            <w:pPr/>
+            <w:r>
+              <w:t xml:space="preserve">serial_no</w:t>
+            </w:r>
+          </w:p>
+        </w:tc>
+        <w:tc>
+          <w:tcPr>
+            <w:tcW w:w="2000" w:type="dxa"/>
+          </w:tcPr>
+          <w:p>
+            <w:pPr/>
+            <w:r>
+              <w:t xml:space="preserve">nvarchar</w:t>
+            </w:r>
+          </w:p>
+        </w:tc>
+        <w:tc>
+          <w:tcPr>
+            <w:tcW w:w="2000" w:type="dxa"/>
+          </w:tcPr>
+          <w:p>
+            <w:pPr/>
+            <w:r>
+              <w:t xml:space="preserve">100</w:t>
+            </w:r>
+          </w:p>
+        </w:tc>
+        <w:tc>
+          <w:tcPr>
+            <w:tcW w:w="2000" w:type="dxa"/>
+          </w:tcPr>
+          <w:p>
+            <w:pPr/>
+            <w:r>
+              <w:t xml:space="preserve">NOT NULL</w:t>
             </w:r>
           </w:p>
         </w:tc>
@@ -7107,6 +10627,661 @@
             <w:pPr/>
             <w:r>
               <w:t xml:space="preserve">(6)</w:t>
+            </w:r>
+          </w:p>
+        </w:tc>
+        <w:tc>
+          <w:tcPr>
+            <w:tcW w:w="2000" w:type="dxa"/>
+          </w:tcPr>
+          <w:p>
+            <w:pPr/>
+            <w:r>
+              <w:t xml:space="preserve">NOT NULL</w:t>
+            </w:r>
+          </w:p>
+        </w:tc>
+      </w:tr>
+      <w:tr>
+        <w:trPr>
+          <w:trHeight w:val="530" w:hRule="atLeast"/>
+        </w:trPr>
+        <w:tc>
+          <w:tcPr>
+            <w:tcW w:w="2000" w:type="dxa"/>
+          </w:tcPr>
+          <w:p>
+            <w:pPr/>
+            <w:r>
+              <w:t xml:space="preserve">company_id</w:t>
+            </w:r>
+          </w:p>
+        </w:tc>
+        <w:tc>
+          <w:tcPr>
+            <w:tcW w:w="2000" w:type="dxa"/>
+          </w:tcPr>
+          <w:p>
+            <w:pPr/>
+            <w:r>
+              <w:t xml:space="preserve">bigint</w:t>
+            </w:r>
+          </w:p>
+        </w:tc>
+        <w:tc>
+          <w:tcPr>
+            <w:tcW w:w="2000" w:type="dxa"/>
+          </w:tcPr>
+          <w:p>
+            <w:pPr/>
+            <w:r>
+              <w:t xml:space="preserve">-</w:t>
+            </w:r>
+          </w:p>
+        </w:tc>
+        <w:tc>
+          <w:tcPr>
+            <w:tcW w:w="2000" w:type="dxa"/>
+          </w:tcPr>
+          <w:p>
+            <w:pPr/>
+            <w:r>
+              <w:t xml:space="preserve">FK, NOT NULL</w:t>
+            </w:r>
+          </w:p>
+        </w:tc>
+      </w:tr>
+      <w:tr>
+        <w:trPr>
+          <w:trHeight w:val="530" w:hRule="atLeast"/>
+        </w:trPr>
+        <w:tc>
+          <w:tcPr>
+            <w:tcW w:w="2000" w:type="dxa"/>
+          </w:tcPr>
+          <w:p>
+            <w:pPr/>
+            <w:r>
+              <w:t xml:space="preserve">created_at</w:t>
+            </w:r>
+          </w:p>
+        </w:tc>
+        <w:tc>
+          <w:tcPr>
+            <w:tcW w:w="2000" w:type="dxa"/>
+          </w:tcPr>
+          <w:p>
+            <w:pPr/>
+            <w:r>
+              <w:t xml:space="preserve">datetime2</w:t>
+            </w:r>
+          </w:p>
+        </w:tc>
+        <w:tc>
+          <w:tcPr>
+            <w:tcW w:w="2000" w:type="dxa"/>
+          </w:tcPr>
+          <w:p>
+            <w:pPr/>
+            <w:r>
+              <w:t xml:space="preserve">(6)</w:t>
+            </w:r>
+          </w:p>
+        </w:tc>
+        <w:tc>
+          <w:tcPr>
+            <w:tcW w:w="2000" w:type="dxa"/>
+          </w:tcPr>
+          <w:p>
+            <w:pPr/>
+            <w:r>
+              <w:t xml:space="preserve">NOT NULL</w:t>
+            </w:r>
+          </w:p>
+        </w:tc>
+      </w:tr>
+      <w:tr>
+        <w:trPr>
+          <w:trHeight w:val="530" w:hRule="atLeast"/>
+        </w:trPr>
+        <w:tc>
+          <w:tcPr>
+            <w:tcW w:w="2000" w:type="dxa"/>
+          </w:tcPr>
+          <w:p>
+            <w:pPr/>
+            <w:r>
+              <w:t xml:space="preserve">created_by</w:t>
+            </w:r>
+          </w:p>
+        </w:tc>
+        <w:tc>
+          <w:tcPr>
+            <w:tcW w:w="2000" w:type="dxa"/>
+          </w:tcPr>
+          <w:p>
+            <w:pPr/>
+            <w:r>
+              <w:t xml:space="preserve">bigint</w:t>
+            </w:r>
+          </w:p>
+        </w:tc>
+        <w:tc>
+          <w:tcPr>
+            <w:tcW w:w="2000" w:type="dxa"/>
+          </w:tcPr>
+          <w:p>
+            <w:pPr/>
+            <w:r>
+              <w:t xml:space="preserve">-</w:t>
+            </w:r>
+          </w:p>
+        </w:tc>
+        <w:tc>
+          <w:tcPr>
+            <w:tcW w:w="2000" w:type="dxa"/>
+          </w:tcPr>
+          <w:p>
+            <w:pPr/>
+            <w:r>
+              <w:t xml:space="preserve">NOT NULL</w:t>
+            </w:r>
+          </w:p>
+        </w:tc>
+      </w:tr>
+      <w:tr>
+        <w:trPr>
+          <w:trHeight w:val="530" w:hRule="atLeast"/>
+        </w:trPr>
+        <w:tc>
+          <w:tcPr>
+            <w:tcW w:w="2000" w:type="dxa"/>
+          </w:tcPr>
+          <w:p>
+            <w:pPr/>
+            <w:r>
+              <w:t xml:space="preserve">updated_at</w:t>
+            </w:r>
+          </w:p>
+        </w:tc>
+        <w:tc>
+          <w:tcPr>
+            <w:tcW w:w="2000" w:type="dxa"/>
+          </w:tcPr>
+          <w:p>
+            <w:pPr/>
+            <w:r>
+              <w:t xml:space="preserve">datetime2</w:t>
+            </w:r>
+          </w:p>
+        </w:tc>
+        <w:tc>
+          <w:tcPr>
+            <w:tcW w:w="2000" w:type="dxa"/>
+          </w:tcPr>
+          <w:p>
+            <w:pPr/>
+            <w:r>
+              <w:t xml:space="preserve">(6)</w:t>
+            </w:r>
+          </w:p>
+        </w:tc>
+        <w:tc>
+          <w:tcPr>
+            <w:tcW w:w="2000" w:type="dxa"/>
+          </w:tcPr>
+          <w:p>
+            <w:pPr/>
+            <w:r>
+              <w:t xml:space="preserve">IS NULL</w:t>
+            </w:r>
+          </w:p>
+        </w:tc>
+      </w:tr>
+      <w:tr>
+        <w:trPr>
+          <w:trHeight w:val="530" w:hRule="atLeast"/>
+        </w:trPr>
+        <w:tc>
+          <w:tcPr>
+            <w:tcW w:w="2000" w:type="dxa"/>
+          </w:tcPr>
+          <w:p>
+            <w:pPr/>
+            <w:r>
+              <w:t xml:space="preserve">updated_by</w:t>
+            </w:r>
+          </w:p>
+        </w:tc>
+        <w:tc>
+          <w:tcPr>
+            <w:tcW w:w="2000" w:type="dxa"/>
+          </w:tcPr>
+          <w:p>
+            <w:pPr/>
+            <w:r>
+              <w:t xml:space="preserve">bigint</w:t>
+            </w:r>
+          </w:p>
+        </w:tc>
+        <w:tc>
+          <w:tcPr>
+            <w:tcW w:w="2000" w:type="dxa"/>
+          </w:tcPr>
+          <w:p>
+            <w:pPr/>
+            <w:r>
+              <w:t xml:space="preserve">-</w:t>
+            </w:r>
+          </w:p>
+        </w:tc>
+        <w:tc>
+          <w:tcPr>
+            <w:tcW w:w="2000" w:type="dxa"/>
+          </w:tcPr>
+          <w:p>
+            <w:pPr/>
+            <w:r>
+              <w:t xml:space="preserve">IS NULL</w:t>
+            </w:r>
+          </w:p>
+        </w:tc>
+      </w:tr>
+      <w:tr>
+        <w:trPr>
+          <w:trHeight w:val="530" w:hRule="atLeast"/>
+        </w:trPr>
+        <w:tc>
+          <w:tcPr>
+            <w:tcW w:w="2000" w:type="dxa"/>
+          </w:tcPr>
+          <w:p>
+            <w:pPr/>
+            <w:r>
+              <w:t xml:space="preserve">version</w:t>
+            </w:r>
+          </w:p>
+        </w:tc>
+        <w:tc>
+          <w:tcPr>
+            <w:tcW w:w="2000" w:type="dxa"/>
+          </w:tcPr>
+          <w:p>
+            <w:pPr/>
+            <w:r>
+              <w:t xml:space="preserve">int</w:t>
+            </w:r>
+          </w:p>
+        </w:tc>
+        <w:tc>
+          <w:tcPr>
+            <w:tcW w:w="2000" w:type="dxa"/>
+          </w:tcPr>
+          <w:p>
+            <w:pPr/>
+            <w:r>
+              <w:t xml:space="preserve">-</w:t>
+            </w:r>
+          </w:p>
+        </w:tc>
+        <w:tc>
+          <w:tcPr>
+            <w:tcW w:w="2000" w:type="dxa"/>
+          </w:tcPr>
+          <w:p>
+            <w:pPr/>
+            <w:r>
+              <w:t xml:space="preserve">NOT NULL</w:t>
+            </w:r>
+          </w:p>
+        </w:tc>
+      </w:tr>
+    </w:tbl>
+    <w:p/>
+    <w:p>
+      <w:pPr/>
+      <w:r>
+        <w:t xml:space="preserve">Table Name: inv_stock_movement_tracking</w:t>
+      </w:r>
+    </w:p>
+    <w:p>
+      <w:pPr/>
+      <w:r>
+        <w:t xml:space="preserve">Primary Key: id</w:t>
+      </w:r>
+    </w:p>
+    <w:p>
+      <w:pPr/>
+      <w:r>
+        <w:t xml:space="preserve">This table stores append-only lot or serial quantities of each stock movement.</w:t>
+      </w:r>
+    </w:p>
+    <w:tbl>
+      <w:tblPr>
+        <w:tblStyle w:val="TableGrid"/>
+        <w:tblW w:w="8000" w:type="dxa"/>
+        <w:jc w:val="left"/>
+        <w:tblBorders>
+          <w:top w:val="single" w:color="000000" w:sz="4" w:space="0"/>
+          <w:left w:val="single" w:color="000000" w:sz="4" w:space="0"/>
+          <w:bottom w:val="single" w:color="000000" w:sz="4" w:space="0"/>
+          <w:right w:val="single" w:color="000000" w:sz="4" w:space="0"/>
+          <w:insideH w:val="single" w:color="000000" w:sz="4" w:space="0"/>
+          <w:insideV w:val="single" w:color="000000" w:sz="4" w:space="0"/>
+        </w:tblBorders>
+        <w:tblLayout w:type="fixed"/>
+        <w:tblCellMar>
+          <w:top w:w="100" w:type="dxa"/>
+          <w:left w:w="100" w:type="dxa"/>
+          <w:bottom w:w="100" w:type="dxa"/>
+          <w:right w:w="100" w:type="dxa"/>
+        </w:tblCellMar>
+      </w:tblPr>
+      <w:tblGrid>
+        <w:gridCol w:w="2000"/>
+        <w:gridCol w:w="2000"/>
+        <w:gridCol w:w="2000"/>
+        <w:gridCol w:w="2000"/>
+      </w:tblGrid>
+      <w:tr>
+        <w:trPr>
+          <w:trHeight w:val="530" w:hRule="atLeast"/>
+        </w:trPr>
+        <w:tc>
+          <w:tcPr>
+            <w:tcW w:w="2000" w:type="dxa"/>
+          </w:tcPr>
+          <w:p>
+            <w:pPr>
+              <w:jc w:val="center"/>
+            </w:pPr>
+            <w:r>
+              <w:rPr>
+                <w:b/>
+              </w:rPr>
+              <w:t xml:space="preserve">Name of Attribute</w:t>
+            </w:r>
+          </w:p>
+        </w:tc>
+        <w:tc>
+          <w:tcPr>
+            <w:tcW w:w="2000" w:type="dxa"/>
+          </w:tcPr>
+          <w:p>
+            <w:pPr>
+              <w:jc w:val="center"/>
+            </w:pPr>
+            <w:r>
+              <w:rPr>
+                <w:b/>
+              </w:rPr>
+              <w:t xml:space="preserve">Data Type</w:t>
+            </w:r>
+          </w:p>
+        </w:tc>
+        <w:tc>
+          <w:tcPr>
+            <w:tcW w:w="2000" w:type="dxa"/>
+          </w:tcPr>
+          <w:p>
+            <w:pPr>
+              <w:jc w:val="center"/>
+            </w:pPr>
+            <w:r>
+              <w:rPr>
+                <w:b/>
+              </w:rPr>
+              <w:t xml:space="preserve">Size</w:t>
+            </w:r>
+          </w:p>
+        </w:tc>
+        <w:tc>
+          <w:tcPr>
+            <w:tcW w:w="2000" w:type="dxa"/>
+          </w:tcPr>
+          <w:p>
+            <w:pPr>
+              <w:jc w:val="center"/>
+            </w:pPr>
+            <w:r>
+              <w:rPr>
+                <w:b/>
+              </w:rPr>
+              <w:t xml:space="preserve">PK/FK/IS NULL/ NOT NULL</w:t>
+            </w:r>
+          </w:p>
+        </w:tc>
+      </w:tr>
+      <w:tr>
+        <w:trPr>
+          <w:trHeight w:val="530" w:hRule="atLeast"/>
+        </w:trPr>
+        <w:tc>
+          <w:tcPr>
+            <w:tcW w:w="2000" w:type="dxa"/>
+          </w:tcPr>
+          <w:p>
+            <w:pPr/>
+            <w:r>
+              <w:t xml:space="preserve">id</w:t>
+            </w:r>
+          </w:p>
+        </w:tc>
+        <w:tc>
+          <w:tcPr>
+            <w:tcW w:w="2000" w:type="dxa"/>
+          </w:tcPr>
+          <w:p>
+            <w:pPr/>
+            <w:r>
+              <w:t xml:space="preserve">bigint</w:t>
+            </w:r>
+          </w:p>
+        </w:tc>
+        <w:tc>
+          <w:tcPr>
+            <w:tcW w:w="2000" w:type="dxa"/>
+          </w:tcPr>
+          <w:p>
+            <w:pPr/>
+            <w:r>
+              <w:t xml:space="preserve">-</w:t>
+            </w:r>
+          </w:p>
+        </w:tc>
+        <w:tc>
+          <w:tcPr>
+            <w:tcW w:w="2000" w:type="dxa"/>
+          </w:tcPr>
+          <w:p>
+            <w:pPr/>
+            <w:r>
+              <w:t xml:space="preserve">PK, NOT NULL</w:t>
+            </w:r>
+          </w:p>
+        </w:tc>
+      </w:tr>
+      <w:tr>
+        <w:trPr>
+          <w:trHeight w:val="530" w:hRule="atLeast"/>
+        </w:trPr>
+        <w:tc>
+          <w:tcPr>
+            <w:tcW w:w="2000" w:type="dxa"/>
+          </w:tcPr>
+          <w:p>
+            <w:pPr/>
+            <w:r>
+              <w:t xml:space="preserve">movement_id</w:t>
+            </w:r>
+          </w:p>
+        </w:tc>
+        <w:tc>
+          <w:tcPr>
+            <w:tcW w:w="2000" w:type="dxa"/>
+          </w:tcPr>
+          <w:p>
+            <w:pPr/>
+            <w:r>
+              <w:t xml:space="preserve">bigint</w:t>
+            </w:r>
+          </w:p>
+        </w:tc>
+        <w:tc>
+          <w:tcPr>
+            <w:tcW w:w="2000" w:type="dxa"/>
+          </w:tcPr>
+          <w:p>
+            <w:pPr/>
+            <w:r>
+              <w:t xml:space="preserve">-</w:t>
+            </w:r>
+          </w:p>
+        </w:tc>
+        <w:tc>
+          <w:tcPr>
+            <w:tcW w:w="2000" w:type="dxa"/>
+          </w:tcPr>
+          <w:p>
+            <w:pPr/>
+            <w:r>
+              <w:t xml:space="preserve">FK, NOT NULL</w:t>
+            </w:r>
+          </w:p>
+        </w:tc>
+      </w:tr>
+      <w:tr>
+        <w:trPr>
+          <w:trHeight w:val="530" w:hRule="atLeast"/>
+        </w:trPr>
+        <w:tc>
+          <w:tcPr>
+            <w:tcW w:w="2000" w:type="dxa"/>
+          </w:tcPr>
+          <w:p>
+            <w:pPr/>
+            <w:r>
+              <w:t xml:space="preserve">lot_id</w:t>
+            </w:r>
+          </w:p>
+        </w:tc>
+        <w:tc>
+          <w:tcPr>
+            <w:tcW w:w="2000" w:type="dxa"/>
+          </w:tcPr>
+          <w:p>
+            <w:pPr/>
+            <w:r>
+              <w:t xml:space="preserve">bigint</w:t>
+            </w:r>
+          </w:p>
+        </w:tc>
+        <w:tc>
+          <w:tcPr>
+            <w:tcW w:w="2000" w:type="dxa"/>
+          </w:tcPr>
+          <w:p>
+            <w:pPr/>
+            <w:r>
+              <w:t xml:space="preserve">-</w:t>
+            </w:r>
+          </w:p>
+        </w:tc>
+        <w:tc>
+          <w:tcPr>
+            <w:tcW w:w="2000" w:type="dxa"/>
+          </w:tcPr>
+          <w:p>
+            <w:pPr/>
+            <w:r>
+              <w:t xml:space="preserve">FK, IS NULL</w:t>
+            </w:r>
+          </w:p>
+        </w:tc>
+      </w:tr>
+      <w:tr>
+        <w:trPr>
+          <w:trHeight w:val="530" w:hRule="atLeast"/>
+        </w:trPr>
+        <w:tc>
+          <w:tcPr>
+            <w:tcW w:w="2000" w:type="dxa"/>
+          </w:tcPr>
+          <w:p>
+            <w:pPr/>
+            <w:r>
+              <w:t xml:space="preserve">serial_id</w:t>
+            </w:r>
+          </w:p>
+        </w:tc>
+        <w:tc>
+          <w:tcPr>
+            <w:tcW w:w="2000" w:type="dxa"/>
+          </w:tcPr>
+          <w:p>
+            <w:pPr/>
+            <w:r>
+              <w:t xml:space="preserve">bigint</w:t>
+            </w:r>
+          </w:p>
+        </w:tc>
+        <w:tc>
+          <w:tcPr>
+            <w:tcW w:w="2000" w:type="dxa"/>
+          </w:tcPr>
+          <w:p>
+            <w:pPr/>
+            <w:r>
+              <w:t xml:space="preserve">-</w:t>
+            </w:r>
+          </w:p>
+        </w:tc>
+        <w:tc>
+          <w:tcPr>
+            <w:tcW w:w="2000" w:type="dxa"/>
+          </w:tcPr>
+          <w:p>
+            <w:pPr/>
+            <w:r>
+              <w:t xml:space="preserve">FK, IS NULL</w:t>
+            </w:r>
+          </w:p>
+        </w:tc>
+      </w:tr>
+      <w:tr>
+        <w:trPr>
+          <w:trHeight w:val="530" w:hRule="atLeast"/>
+        </w:trPr>
+        <w:tc>
+          <w:tcPr>
+            <w:tcW w:w="2000" w:type="dxa"/>
+          </w:tcPr>
+          <w:p>
+            <w:pPr/>
+            <w:r>
+              <w:t xml:space="preserve">quantity</w:t>
+            </w:r>
+          </w:p>
+        </w:tc>
+        <w:tc>
+          <w:tcPr>
+            <w:tcW w:w="2000" w:type="dxa"/>
+          </w:tcPr>
+          <w:p>
+            <w:pPr/>
+            <w:r>
+              <w:t xml:space="preserve">decimal</w:t>
+            </w:r>
+          </w:p>
+        </w:tc>
+        <w:tc>
+          <w:tcPr>
+            <w:tcW w:w="2000" w:type="dxa"/>
+          </w:tcPr>
+          <w:p>
+            <w:pPr/>
+            <w:r>
+              <w:t xml:space="preserve">(19,6)</w:t>
             </w:r>
           </w:p>
         </w:tc>
@@ -47345,7 +51520,7 @@
       </w:r>
     </w:p>
     <w:sectPr>
-      <w:footerReference xmlns:r="http://schemas.openxmlformats.org/officeDocument/2006/relationships" w:type="default" r:id="R7c547ee52b98458d"/>
+      <w:footerReference xmlns:r="http://schemas.openxmlformats.org/officeDocument/2006/relationships" w:type="default" r:id="Rf558d0fc62054fe5"/>
       <w:pgSz w:w="11906" w:h="16838"/>
       <w:pgMar w:top="1440" w:right="1440" w:bottom="1440" w:left="1440" w:header="720" w:footer="720" w:gutter="0"/>
     </w:sectPr>

</xml_diff>

<commit_message>
feat(inv): add lot and serial tracking UI
</commit_message>
<xml_diff>
--- a/docs/99-output/MyERP_SDS.docx
+++ b/docs/99-output/MyERP_SDS.docx
@@ -49875,6 +49875,25 @@
           <w:i/>
         </w:rPr>
         <w:t xml:space="preserve">[Pending] System screenshot of Product Initial Stock Create Interface.</w:t>
+      </w:r>
+    </w:p>
+    <w:p>
+      <w:pPr>
+        <w:pStyle w:val="Heading5"/>
+      </w:pPr>
+      <w:r>
+        <w:t xml:space="preserve">4.2.1.5.10 Lot and Serial Trace Interface</w:t>
+      </w:r>
+    </w:p>
+    <w:p>
+      <w:pPr>
+        <w:jc w:val="center"/>
+      </w:pPr>
+      <w:r>
+        <w:rPr>
+          <w:i/>
+        </w:rPr>
+        <w:t xml:space="preserve">[Pending] System screenshot of Lot and Serial Trace Interface.</w:t>
       </w:r>
     </w:p>
     <w:p>
@@ -51520,7 +51539,7 @@
       </w:r>
     </w:p>
     <w:sectPr>
-      <w:footerReference xmlns:r="http://schemas.openxmlformats.org/officeDocument/2006/relationships" w:type="default" r:id="Rf558d0fc62054fe5"/>
+      <w:footerReference xmlns:r="http://schemas.openxmlformats.org/officeDocument/2006/relationships" w:type="default" r:id="R2dba80d2b46f4f92"/>
       <w:pgSz w:w="11906" w:h="16838"/>
       <w:pgMar w:top="1440" w:right="1440" w:bottom="1440" w:left="1440" w:header="720" w:footer="720" w:gutter="0"/>
     </w:sectPr>

</xml_diff>

<commit_message>
feat(inv): add inventory transfer backend
Add inv_transfer header/line/tracking tables (Inventory_Transfer migration),
/api/v1/inv/transfers draft CRUD, submit and soft delete, and SYS approval
handler that posts equal Out/In movements with lot/serial relocation in one
transaction. INV-TRF-001..008 covered by SQL and HTTP integration tests.

Co-Authored-By: Claude Opus 5.5 <noreply@anthropic.com>
</commit_message>
<xml_diff>
--- a/docs/99-output/MyERP_SDS.docx
+++ b/docs/99-output/MyERP_SDS.docx
@@ -46,7 +46,7 @@
         <w:jc w:val="center"/>
       </w:pPr>
       <w:r>
-        <w:t xml:space="preserve">Date: 13 October 2026</w:t>
+        <w:t xml:space="preserve">Date: 14 October 2026</w:t>
       </w:r>
     </w:p>
     <w:p/>
@@ -11596,6 +11596,2412 @@
     <w:p>
       <w:pPr/>
       <w:r>
+        <w:t xml:space="preserve">Table Name: inv_transfer</w:t>
+      </w:r>
+    </w:p>
+    <w:p>
+      <w:pPr/>
+      <w:r>
+        <w:t xml:space="preserve">Primary Key: id</w:t>
+      </w:r>
+    </w:p>
+    <w:p>
+      <w:pPr/>
+      <w:r>
+        <w:t xml:space="preserve">This table stores company-scoped inventory transfer headers and their approval and posting state.</w:t>
+      </w:r>
+    </w:p>
+    <w:tbl>
+      <w:tblPr>
+        <w:tblStyle w:val="TableGrid"/>
+        <w:tblW w:w="8000" w:type="dxa"/>
+        <w:jc w:val="left"/>
+        <w:tblBorders>
+          <w:top w:val="single" w:color="000000" w:sz="4" w:space="0"/>
+          <w:left w:val="single" w:color="000000" w:sz="4" w:space="0"/>
+          <w:bottom w:val="single" w:color="000000" w:sz="4" w:space="0"/>
+          <w:right w:val="single" w:color="000000" w:sz="4" w:space="0"/>
+          <w:insideH w:val="single" w:color="000000" w:sz="4" w:space="0"/>
+          <w:insideV w:val="single" w:color="000000" w:sz="4" w:space="0"/>
+        </w:tblBorders>
+        <w:tblLayout w:type="fixed"/>
+        <w:tblCellMar>
+          <w:top w:w="100" w:type="dxa"/>
+          <w:left w:w="100" w:type="dxa"/>
+          <w:bottom w:w="100" w:type="dxa"/>
+          <w:right w:w="100" w:type="dxa"/>
+        </w:tblCellMar>
+      </w:tblPr>
+      <w:tblGrid>
+        <w:gridCol w:w="2000"/>
+        <w:gridCol w:w="2000"/>
+        <w:gridCol w:w="2000"/>
+        <w:gridCol w:w="2000"/>
+      </w:tblGrid>
+      <w:tr>
+        <w:trPr>
+          <w:trHeight w:val="530" w:hRule="atLeast"/>
+        </w:trPr>
+        <w:tc>
+          <w:tcPr>
+            <w:tcW w:w="2000" w:type="dxa"/>
+          </w:tcPr>
+          <w:p>
+            <w:pPr>
+              <w:jc w:val="center"/>
+            </w:pPr>
+            <w:r>
+              <w:rPr>
+                <w:b/>
+              </w:rPr>
+              <w:t xml:space="preserve">Name of Attribute</w:t>
+            </w:r>
+          </w:p>
+        </w:tc>
+        <w:tc>
+          <w:tcPr>
+            <w:tcW w:w="2000" w:type="dxa"/>
+          </w:tcPr>
+          <w:p>
+            <w:pPr>
+              <w:jc w:val="center"/>
+            </w:pPr>
+            <w:r>
+              <w:rPr>
+                <w:b/>
+              </w:rPr>
+              <w:t xml:space="preserve">Data Type</w:t>
+            </w:r>
+          </w:p>
+        </w:tc>
+        <w:tc>
+          <w:tcPr>
+            <w:tcW w:w="2000" w:type="dxa"/>
+          </w:tcPr>
+          <w:p>
+            <w:pPr>
+              <w:jc w:val="center"/>
+            </w:pPr>
+            <w:r>
+              <w:rPr>
+                <w:b/>
+              </w:rPr>
+              <w:t xml:space="preserve">Size</w:t>
+            </w:r>
+          </w:p>
+        </w:tc>
+        <w:tc>
+          <w:tcPr>
+            <w:tcW w:w="2000" w:type="dxa"/>
+          </w:tcPr>
+          <w:p>
+            <w:pPr>
+              <w:jc w:val="center"/>
+            </w:pPr>
+            <w:r>
+              <w:rPr>
+                <w:b/>
+              </w:rPr>
+              <w:t xml:space="preserve">PK/FK/IS NULL/ NOT NULL</w:t>
+            </w:r>
+          </w:p>
+        </w:tc>
+      </w:tr>
+      <w:tr>
+        <w:trPr>
+          <w:trHeight w:val="530" w:hRule="atLeast"/>
+        </w:trPr>
+        <w:tc>
+          <w:tcPr>
+            <w:tcW w:w="2000" w:type="dxa"/>
+          </w:tcPr>
+          <w:p>
+            <w:pPr/>
+            <w:r>
+              <w:t xml:space="preserve">id</w:t>
+            </w:r>
+          </w:p>
+        </w:tc>
+        <w:tc>
+          <w:tcPr>
+            <w:tcW w:w="2000" w:type="dxa"/>
+          </w:tcPr>
+          <w:p>
+            <w:pPr/>
+            <w:r>
+              <w:t xml:space="preserve">bigint</w:t>
+            </w:r>
+          </w:p>
+        </w:tc>
+        <w:tc>
+          <w:tcPr>
+            <w:tcW w:w="2000" w:type="dxa"/>
+          </w:tcPr>
+          <w:p>
+            <w:pPr/>
+            <w:r>
+              <w:t xml:space="preserve">-</w:t>
+            </w:r>
+          </w:p>
+        </w:tc>
+        <w:tc>
+          <w:tcPr>
+            <w:tcW w:w="2000" w:type="dxa"/>
+          </w:tcPr>
+          <w:p>
+            <w:pPr/>
+            <w:r>
+              <w:t xml:space="preserve">PK, NOT NULL</w:t>
+            </w:r>
+          </w:p>
+        </w:tc>
+      </w:tr>
+      <w:tr>
+        <w:trPr>
+          <w:trHeight w:val="530" w:hRule="atLeast"/>
+        </w:trPr>
+        <w:tc>
+          <w:tcPr>
+            <w:tcW w:w="2000" w:type="dxa"/>
+          </w:tcPr>
+          <w:p>
+            <w:pPr/>
+            <w:r>
+              <w:t xml:space="preserve">document_no</w:t>
+            </w:r>
+          </w:p>
+        </w:tc>
+        <w:tc>
+          <w:tcPr>
+            <w:tcW w:w="2000" w:type="dxa"/>
+          </w:tcPr>
+          <w:p>
+            <w:pPr/>
+            <w:r>
+              <w:t xml:space="preserve">varchar</w:t>
+            </w:r>
+          </w:p>
+        </w:tc>
+        <w:tc>
+          <w:tcPr>
+            <w:tcW w:w="2000" w:type="dxa"/>
+          </w:tcPr>
+          <w:p>
+            <w:pPr/>
+            <w:r>
+              <w:t xml:space="preserve">30</w:t>
+            </w:r>
+          </w:p>
+        </w:tc>
+        <w:tc>
+          <w:tcPr>
+            <w:tcW w:w="2000" w:type="dxa"/>
+          </w:tcPr>
+          <w:p>
+            <w:pPr/>
+            <w:r>
+              <w:t xml:space="preserve">NOT NULL</w:t>
+            </w:r>
+          </w:p>
+        </w:tc>
+      </w:tr>
+      <w:tr>
+        <w:trPr>
+          <w:trHeight w:val="530" w:hRule="atLeast"/>
+        </w:trPr>
+        <w:tc>
+          <w:tcPr>
+            <w:tcW w:w="2000" w:type="dxa"/>
+          </w:tcPr>
+          <w:p>
+            <w:pPr/>
+            <w:r>
+              <w:t xml:space="preserve">business_date</w:t>
+            </w:r>
+          </w:p>
+        </w:tc>
+        <w:tc>
+          <w:tcPr>
+            <w:tcW w:w="2000" w:type="dxa"/>
+          </w:tcPr>
+          <w:p>
+            <w:pPr/>
+            <w:r>
+              <w:t xml:space="preserve">date</w:t>
+            </w:r>
+          </w:p>
+        </w:tc>
+        <w:tc>
+          <w:tcPr>
+            <w:tcW w:w="2000" w:type="dxa"/>
+          </w:tcPr>
+          <w:p>
+            <w:pPr/>
+            <w:r>
+              <w:t xml:space="preserve">-</w:t>
+            </w:r>
+          </w:p>
+        </w:tc>
+        <w:tc>
+          <w:tcPr>
+            <w:tcW w:w="2000" w:type="dxa"/>
+          </w:tcPr>
+          <w:p>
+            <w:pPr/>
+            <w:r>
+              <w:t xml:space="preserve">NOT NULL</w:t>
+            </w:r>
+          </w:p>
+        </w:tc>
+      </w:tr>
+      <w:tr>
+        <w:trPr>
+          <w:trHeight w:val="530" w:hRule="atLeast"/>
+        </w:trPr>
+        <w:tc>
+          <w:tcPr>
+            <w:tcW w:w="2000" w:type="dxa"/>
+          </w:tcPr>
+          <w:p>
+            <w:pPr/>
+            <w:r>
+              <w:t xml:space="preserve">status</w:t>
+            </w:r>
+          </w:p>
+        </w:tc>
+        <w:tc>
+          <w:tcPr>
+            <w:tcW w:w="2000" w:type="dxa"/>
+          </w:tcPr>
+          <w:p>
+            <w:pPr/>
+            <w:r>
+              <w:t xml:space="preserve">varchar</w:t>
+            </w:r>
+          </w:p>
+        </w:tc>
+        <w:tc>
+          <w:tcPr>
+            <w:tcW w:w="2000" w:type="dxa"/>
+          </w:tcPr>
+          <w:p>
+            <w:pPr/>
+            <w:r>
+              <w:t xml:space="preserve">30</w:t>
+            </w:r>
+          </w:p>
+        </w:tc>
+        <w:tc>
+          <w:tcPr>
+            <w:tcW w:w="2000" w:type="dxa"/>
+          </w:tcPr>
+          <w:p>
+            <w:pPr/>
+            <w:r>
+              <w:t xml:space="preserve">NOT NULL</w:t>
+            </w:r>
+          </w:p>
+        </w:tc>
+      </w:tr>
+      <w:tr>
+        <w:trPr>
+          <w:trHeight w:val="530" w:hRule="atLeast"/>
+        </w:trPr>
+        <w:tc>
+          <w:tcPr>
+            <w:tcW w:w="2000" w:type="dxa"/>
+          </w:tcPr>
+          <w:p>
+            <w:pPr/>
+            <w:r>
+              <w:t xml:space="preserve">remark</w:t>
+            </w:r>
+          </w:p>
+        </w:tc>
+        <w:tc>
+          <w:tcPr>
+            <w:tcW w:w="2000" w:type="dxa"/>
+          </w:tcPr>
+          <w:p>
+            <w:pPr/>
+            <w:r>
+              <w:t xml:space="preserve">nvarchar</w:t>
+            </w:r>
+          </w:p>
+        </w:tc>
+        <w:tc>
+          <w:tcPr>
+            <w:tcW w:w="2000" w:type="dxa"/>
+          </w:tcPr>
+          <w:p>
+            <w:pPr/>
+            <w:r>
+              <w:t xml:space="preserve">500</w:t>
+            </w:r>
+          </w:p>
+        </w:tc>
+        <w:tc>
+          <w:tcPr>
+            <w:tcW w:w="2000" w:type="dxa"/>
+          </w:tcPr>
+          <w:p>
+            <w:pPr/>
+            <w:r>
+              <w:t xml:space="preserve">IS NULL</w:t>
+            </w:r>
+          </w:p>
+        </w:tc>
+      </w:tr>
+      <w:tr>
+        <w:trPr>
+          <w:trHeight w:val="530" w:hRule="atLeast"/>
+        </w:trPr>
+        <w:tc>
+          <w:tcPr>
+            <w:tcW w:w="2000" w:type="dxa"/>
+          </w:tcPr>
+          <w:p>
+            <w:pPr/>
+            <w:r>
+              <w:t xml:space="preserve">custom_fields</w:t>
+            </w:r>
+          </w:p>
+        </w:tc>
+        <w:tc>
+          <w:tcPr>
+            <w:tcW w:w="2000" w:type="dxa"/>
+          </w:tcPr>
+          <w:p>
+            <w:pPr/>
+            <w:r>
+              <w:t xml:space="preserve">nvarchar</w:t>
+            </w:r>
+          </w:p>
+        </w:tc>
+        <w:tc>
+          <w:tcPr>
+            <w:tcW w:w="2000" w:type="dxa"/>
+          </w:tcPr>
+          <w:p>
+            <w:pPr/>
+            <w:r>
+              <w:t xml:space="preserve">MAX</w:t>
+            </w:r>
+          </w:p>
+        </w:tc>
+        <w:tc>
+          <w:tcPr>
+            <w:tcW w:w="2000" w:type="dxa"/>
+          </w:tcPr>
+          <w:p>
+            <w:pPr/>
+            <w:r>
+              <w:t xml:space="preserve">IS NULL</w:t>
+            </w:r>
+          </w:p>
+        </w:tc>
+      </w:tr>
+      <w:tr>
+        <w:trPr>
+          <w:trHeight w:val="530" w:hRule="atLeast"/>
+        </w:trPr>
+        <w:tc>
+          <w:tcPr>
+            <w:tcW w:w="2000" w:type="dxa"/>
+          </w:tcPr>
+          <w:p>
+            <w:pPr/>
+            <w:r>
+              <w:t xml:space="preserve">posted_at</w:t>
+            </w:r>
+          </w:p>
+        </w:tc>
+        <w:tc>
+          <w:tcPr>
+            <w:tcW w:w="2000" w:type="dxa"/>
+          </w:tcPr>
+          <w:p>
+            <w:pPr/>
+            <w:r>
+              <w:t xml:space="preserve">datetime2</w:t>
+            </w:r>
+          </w:p>
+        </w:tc>
+        <w:tc>
+          <w:tcPr>
+            <w:tcW w:w="2000" w:type="dxa"/>
+          </w:tcPr>
+          <w:p>
+            <w:pPr/>
+            <w:r>
+              <w:t xml:space="preserve">(6)</w:t>
+            </w:r>
+          </w:p>
+        </w:tc>
+        <w:tc>
+          <w:tcPr>
+            <w:tcW w:w="2000" w:type="dxa"/>
+          </w:tcPr>
+          <w:p>
+            <w:pPr/>
+            <w:r>
+              <w:t xml:space="preserve">IS NULL</w:t>
+            </w:r>
+          </w:p>
+        </w:tc>
+      </w:tr>
+      <w:tr>
+        <w:trPr>
+          <w:trHeight w:val="530" w:hRule="atLeast"/>
+        </w:trPr>
+        <w:tc>
+          <w:tcPr>
+            <w:tcW w:w="2000" w:type="dxa"/>
+          </w:tcPr>
+          <w:p>
+            <w:pPr/>
+            <w:r>
+              <w:t xml:space="preserve">is_deleted</w:t>
+            </w:r>
+          </w:p>
+        </w:tc>
+        <w:tc>
+          <w:tcPr>
+            <w:tcW w:w="2000" w:type="dxa"/>
+          </w:tcPr>
+          <w:p>
+            <w:pPr/>
+            <w:r>
+              <w:t xml:space="preserve">bit</w:t>
+            </w:r>
+          </w:p>
+        </w:tc>
+        <w:tc>
+          <w:tcPr>
+            <w:tcW w:w="2000" w:type="dxa"/>
+          </w:tcPr>
+          <w:p>
+            <w:pPr/>
+            <w:r>
+              <w:t xml:space="preserve">-</w:t>
+            </w:r>
+          </w:p>
+        </w:tc>
+        <w:tc>
+          <w:tcPr>
+            <w:tcW w:w="2000" w:type="dxa"/>
+          </w:tcPr>
+          <w:p>
+            <w:pPr/>
+            <w:r>
+              <w:t xml:space="preserve">NOT NULL</w:t>
+            </w:r>
+          </w:p>
+        </w:tc>
+      </w:tr>
+      <w:tr>
+        <w:trPr>
+          <w:trHeight w:val="530" w:hRule="atLeast"/>
+        </w:trPr>
+        <w:tc>
+          <w:tcPr>
+            <w:tcW w:w="2000" w:type="dxa"/>
+          </w:tcPr>
+          <w:p>
+            <w:pPr/>
+            <w:r>
+              <w:t xml:space="preserve">deleted_at</w:t>
+            </w:r>
+          </w:p>
+        </w:tc>
+        <w:tc>
+          <w:tcPr>
+            <w:tcW w:w="2000" w:type="dxa"/>
+          </w:tcPr>
+          <w:p>
+            <w:pPr/>
+            <w:r>
+              <w:t xml:space="preserve">datetime2</w:t>
+            </w:r>
+          </w:p>
+        </w:tc>
+        <w:tc>
+          <w:tcPr>
+            <w:tcW w:w="2000" w:type="dxa"/>
+          </w:tcPr>
+          <w:p>
+            <w:pPr/>
+            <w:r>
+              <w:t xml:space="preserve">(6)</w:t>
+            </w:r>
+          </w:p>
+        </w:tc>
+        <w:tc>
+          <w:tcPr>
+            <w:tcW w:w="2000" w:type="dxa"/>
+          </w:tcPr>
+          <w:p>
+            <w:pPr/>
+            <w:r>
+              <w:t xml:space="preserve">IS NULL</w:t>
+            </w:r>
+          </w:p>
+        </w:tc>
+      </w:tr>
+      <w:tr>
+        <w:trPr>
+          <w:trHeight w:val="530" w:hRule="atLeast"/>
+        </w:trPr>
+        <w:tc>
+          <w:tcPr>
+            <w:tcW w:w="2000" w:type="dxa"/>
+          </w:tcPr>
+          <w:p>
+            <w:pPr/>
+            <w:r>
+              <w:t xml:space="preserve">company_id</w:t>
+            </w:r>
+          </w:p>
+        </w:tc>
+        <w:tc>
+          <w:tcPr>
+            <w:tcW w:w="2000" w:type="dxa"/>
+          </w:tcPr>
+          <w:p>
+            <w:pPr/>
+            <w:r>
+              <w:t xml:space="preserve">bigint</w:t>
+            </w:r>
+          </w:p>
+        </w:tc>
+        <w:tc>
+          <w:tcPr>
+            <w:tcW w:w="2000" w:type="dxa"/>
+          </w:tcPr>
+          <w:p>
+            <w:pPr/>
+            <w:r>
+              <w:t xml:space="preserve">-</w:t>
+            </w:r>
+          </w:p>
+        </w:tc>
+        <w:tc>
+          <w:tcPr>
+            <w:tcW w:w="2000" w:type="dxa"/>
+          </w:tcPr>
+          <w:p>
+            <w:pPr/>
+            <w:r>
+              <w:t xml:space="preserve">NOT NULL</w:t>
+            </w:r>
+          </w:p>
+        </w:tc>
+      </w:tr>
+      <w:tr>
+        <w:trPr>
+          <w:trHeight w:val="530" w:hRule="atLeast"/>
+        </w:trPr>
+        <w:tc>
+          <w:tcPr>
+            <w:tcW w:w="2000" w:type="dxa"/>
+          </w:tcPr>
+          <w:p>
+            <w:pPr/>
+            <w:r>
+              <w:t xml:space="preserve">created_at</w:t>
+            </w:r>
+          </w:p>
+        </w:tc>
+        <w:tc>
+          <w:tcPr>
+            <w:tcW w:w="2000" w:type="dxa"/>
+          </w:tcPr>
+          <w:p>
+            <w:pPr/>
+            <w:r>
+              <w:t xml:space="preserve">datetime2</w:t>
+            </w:r>
+          </w:p>
+        </w:tc>
+        <w:tc>
+          <w:tcPr>
+            <w:tcW w:w="2000" w:type="dxa"/>
+          </w:tcPr>
+          <w:p>
+            <w:pPr/>
+            <w:r>
+              <w:t xml:space="preserve">(6)</w:t>
+            </w:r>
+          </w:p>
+        </w:tc>
+        <w:tc>
+          <w:tcPr>
+            <w:tcW w:w="2000" w:type="dxa"/>
+          </w:tcPr>
+          <w:p>
+            <w:pPr/>
+            <w:r>
+              <w:t xml:space="preserve">NOT NULL</w:t>
+            </w:r>
+          </w:p>
+        </w:tc>
+      </w:tr>
+      <w:tr>
+        <w:trPr>
+          <w:trHeight w:val="530" w:hRule="atLeast"/>
+        </w:trPr>
+        <w:tc>
+          <w:tcPr>
+            <w:tcW w:w="2000" w:type="dxa"/>
+          </w:tcPr>
+          <w:p>
+            <w:pPr/>
+            <w:r>
+              <w:t xml:space="preserve">created_by</w:t>
+            </w:r>
+          </w:p>
+        </w:tc>
+        <w:tc>
+          <w:tcPr>
+            <w:tcW w:w="2000" w:type="dxa"/>
+          </w:tcPr>
+          <w:p>
+            <w:pPr/>
+            <w:r>
+              <w:t xml:space="preserve">bigint</w:t>
+            </w:r>
+          </w:p>
+        </w:tc>
+        <w:tc>
+          <w:tcPr>
+            <w:tcW w:w="2000" w:type="dxa"/>
+          </w:tcPr>
+          <w:p>
+            <w:pPr/>
+            <w:r>
+              <w:t xml:space="preserve">-</w:t>
+            </w:r>
+          </w:p>
+        </w:tc>
+        <w:tc>
+          <w:tcPr>
+            <w:tcW w:w="2000" w:type="dxa"/>
+          </w:tcPr>
+          <w:p>
+            <w:pPr/>
+            <w:r>
+              <w:t xml:space="preserve">NOT NULL</w:t>
+            </w:r>
+          </w:p>
+        </w:tc>
+      </w:tr>
+      <w:tr>
+        <w:trPr>
+          <w:trHeight w:val="530" w:hRule="atLeast"/>
+        </w:trPr>
+        <w:tc>
+          <w:tcPr>
+            <w:tcW w:w="2000" w:type="dxa"/>
+          </w:tcPr>
+          <w:p>
+            <w:pPr/>
+            <w:r>
+              <w:t xml:space="preserve">updated_at</w:t>
+            </w:r>
+          </w:p>
+        </w:tc>
+        <w:tc>
+          <w:tcPr>
+            <w:tcW w:w="2000" w:type="dxa"/>
+          </w:tcPr>
+          <w:p>
+            <w:pPr/>
+            <w:r>
+              <w:t xml:space="preserve">datetime2</w:t>
+            </w:r>
+          </w:p>
+        </w:tc>
+        <w:tc>
+          <w:tcPr>
+            <w:tcW w:w="2000" w:type="dxa"/>
+          </w:tcPr>
+          <w:p>
+            <w:pPr/>
+            <w:r>
+              <w:t xml:space="preserve">(6)</w:t>
+            </w:r>
+          </w:p>
+        </w:tc>
+        <w:tc>
+          <w:tcPr>
+            <w:tcW w:w="2000" w:type="dxa"/>
+          </w:tcPr>
+          <w:p>
+            <w:pPr/>
+            <w:r>
+              <w:t xml:space="preserve">IS NULL</w:t>
+            </w:r>
+          </w:p>
+        </w:tc>
+      </w:tr>
+      <w:tr>
+        <w:trPr>
+          <w:trHeight w:val="530" w:hRule="atLeast"/>
+        </w:trPr>
+        <w:tc>
+          <w:tcPr>
+            <w:tcW w:w="2000" w:type="dxa"/>
+          </w:tcPr>
+          <w:p>
+            <w:pPr/>
+            <w:r>
+              <w:t xml:space="preserve">updated_by</w:t>
+            </w:r>
+          </w:p>
+        </w:tc>
+        <w:tc>
+          <w:tcPr>
+            <w:tcW w:w="2000" w:type="dxa"/>
+          </w:tcPr>
+          <w:p>
+            <w:pPr/>
+            <w:r>
+              <w:t xml:space="preserve">bigint</w:t>
+            </w:r>
+          </w:p>
+        </w:tc>
+        <w:tc>
+          <w:tcPr>
+            <w:tcW w:w="2000" w:type="dxa"/>
+          </w:tcPr>
+          <w:p>
+            <w:pPr/>
+            <w:r>
+              <w:t xml:space="preserve">-</w:t>
+            </w:r>
+          </w:p>
+        </w:tc>
+        <w:tc>
+          <w:tcPr>
+            <w:tcW w:w="2000" w:type="dxa"/>
+          </w:tcPr>
+          <w:p>
+            <w:pPr/>
+            <w:r>
+              <w:t xml:space="preserve">IS NULL</w:t>
+            </w:r>
+          </w:p>
+        </w:tc>
+      </w:tr>
+      <w:tr>
+        <w:trPr>
+          <w:trHeight w:val="530" w:hRule="atLeast"/>
+        </w:trPr>
+        <w:tc>
+          <w:tcPr>
+            <w:tcW w:w="2000" w:type="dxa"/>
+          </w:tcPr>
+          <w:p>
+            <w:pPr/>
+            <w:r>
+              <w:t xml:space="preserve">version</w:t>
+            </w:r>
+          </w:p>
+        </w:tc>
+        <w:tc>
+          <w:tcPr>
+            <w:tcW w:w="2000" w:type="dxa"/>
+          </w:tcPr>
+          <w:p>
+            <w:pPr/>
+            <w:r>
+              <w:t xml:space="preserve">int</w:t>
+            </w:r>
+          </w:p>
+        </w:tc>
+        <w:tc>
+          <w:tcPr>
+            <w:tcW w:w="2000" w:type="dxa"/>
+          </w:tcPr>
+          <w:p>
+            <w:pPr/>
+            <w:r>
+              <w:t xml:space="preserve">-</w:t>
+            </w:r>
+          </w:p>
+        </w:tc>
+        <w:tc>
+          <w:tcPr>
+            <w:tcW w:w="2000" w:type="dxa"/>
+          </w:tcPr>
+          <w:p>
+            <w:pPr/>
+            <w:r>
+              <w:t xml:space="preserve">NOT NULL</w:t>
+            </w:r>
+          </w:p>
+        </w:tc>
+      </w:tr>
+    </w:tbl>
+    <w:p/>
+    <w:p>
+      <w:pPr/>
+      <w:r>
+        <w:t xml:space="preserve">Table Name: inv_transfer_line</w:t>
+      </w:r>
+    </w:p>
+    <w:p>
+      <w:pPr/>
+      <w:r>
+        <w:t xml:space="preserve">Primary Key: id</w:t>
+      </w:r>
+    </w:p>
+    <w:p>
+      <w:pPr/>
+      <w:r>
+        <w:t xml:space="preserve">This table stores one item, source and destination stock key and equal transfer quantity per line.</w:t>
+      </w:r>
+    </w:p>
+    <w:tbl>
+      <w:tblPr>
+        <w:tblStyle w:val="TableGrid"/>
+        <w:tblW w:w="8000" w:type="dxa"/>
+        <w:jc w:val="left"/>
+        <w:tblBorders>
+          <w:top w:val="single" w:color="000000" w:sz="4" w:space="0"/>
+          <w:left w:val="single" w:color="000000" w:sz="4" w:space="0"/>
+          <w:bottom w:val="single" w:color="000000" w:sz="4" w:space="0"/>
+          <w:right w:val="single" w:color="000000" w:sz="4" w:space="0"/>
+          <w:insideH w:val="single" w:color="000000" w:sz="4" w:space="0"/>
+          <w:insideV w:val="single" w:color="000000" w:sz="4" w:space="0"/>
+        </w:tblBorders>
+        <w:tblLayout w:type="fixed"/>
+        <w:tblCellMar>
+          <w:top w:w="100" w:type="dxa"/>
+          <w:left w:w="100" w:type="dxa"/>
+          <w:bottom w:w="100" w:type="dxa"/>
+          <w:right w:w="100" w:type="dxa"/>
+        </w:tblCellMar>
+      </w:tblPr>
+      <w:tblGrid>
+        <w:gridCol w:w="2000"/>
+        <w:gridCol w:w="2000"/>
+        <w:gridCol w:w="2000"/>
+        <w:gridCol w:w="2000"/>
+      </w:tblGrid>
+      <w:tr>
+        <w:trPr>
+          <w:trHeight w:val="530" w:hRule="atLeast"/>
+        </w:trPr>
+        <w:tc>
+          <w:tcPr>
+            <w:tcW w:w="2000" w:type="dxa"/>
+          </w:tcPr>
+          <w:p>
+            <w:pPr>
+              <w:jc w:val="center"/>
+            </w:pPr>
+            <w:r>
+              <w:rPr>
+                <w:b/>
+              </w:rPr>
+              <w:t xml:space="preserve">Name of Attribute</w:t>
+            </w:r>
+          </w:p>
+        </w:tc>
+        <w:tc>
+          <w:tcPr>
+            <w:tcW w:w="2000" w:type="dxa"/>
+          </w:tcPr>
+          <w:p>
+            <w:pPr>
+              <w:jc w:val="center"/>
+            </w:pPr>
+            <w:r>
+              <w:rPr>
+                <w:b/>
+              </w:rPr>
+              <w:t xml:space="preserve">Data Type</w:t>
+            </w:r>
+          </w:p>
+        </w:tc>
+        <w:tc>
+          <w:tcPr>
+            <w:tcW w:w="2000" w:type="dxa"/>
+          </w:tcPr>
+          <w:p>
+            <w:pPr>
+              <w:jc w:val="center"/>
+            </w:pPr>
+            <w:r>
+              <w:rPr>
+                <w:b/>
+              </w:rPr>
+              <w:t xml:space="preserve">Size</w:t>
+            </w:r>
+          </w:p>
+        </w:tc>
+        <w:tc>
+          <w:tcPr>
+            <w:tcW w:w="2000" w:type="dxa"/>
+          </w:tcPr>
+          <w:p>
+            <w:pPr>
+              <w:jc w:val="center"/>
+            </w:pPr>
+            <w:r>
+              <w:rPr>
+                <w:b/>
+              </w:rPr>
+              <w:t xml:space="preserve">PK/FK/IS NULL/ NOT NULL</w:t>
+            </w:r>
+          </w:p>
+        </w:tc>
+      </w:tr>
+      <w:tr>
+        <w:trPr>
+          <w:trHeight w:val="530" w:hRule="atLeast"/>
+        </w:trPr>
+        <w:tc>
+          <w:tcPr>
+            <w:tcW w:w="2000" w:type="dxa"/>
+          </w:tcPr>
+          <w:p>
+            <w:pPr/>
+            <w:r>
+              <w:t xml:space="preserve">id</w:t>
+            </w:r>
+          </w:p>
+        </w:tc>
+        <w:tc>
+          <w:tcPr>
+            <w:tcW w:w="2000" w:type="dxa"/>
+          </w:tcPr>
+          <w:p>
+            <w:pPr/>
+            <w:r>
+              <w:t xml:space="preserve">bigint</w:t>
+            </w:r>
+          </w:p>
+        </w:tc>
+        <w:tc>
+          <w:tcPr>
+            <w:tcW w:w="2000" w:type="dxa"/>
+          </w:tcPr>
+          <w:p>
+            <w:pPr/>
+            <w:r>
+              <w:t xml:space="preserve">-</w:t>
+            </w:r>
+          </w:p>
+        </w:tc>
+        <w:tc>
+          <w:tcPr>
+            <w:tcW w:w="2000" w:type="dxa"/>
+          </w:tcPr>
+          <w:p>
+            <w:pPr/>
+            <w:r>
+              <w:t xml:space="preserve">PK, NOT NULL</w:t>
+            </w:r>
+          </w:p>
+        </w:tc>
+      </w:tr>
+      <w:tr>
+        <w:trPr>
+          <w:trHeight w:val="530" w:hRule="atLeast"/>
+        </w:trPr>
+        <w:tc>
+          <w:tcPr>
+            <w:tcW w:w="2000" w:type="dxa"/>
+          </w:tcPr>
+          <w:p>
+            <w:pPr/>
+            <w:r>
+              <w:t xml:space="preserve">transfer_id</w:t>
+            </w:r>
+          </w:p>
+        </w:tc>
+        <w:tc>
+          <w:tcPr>
+            <w:tcW w:w="2000" w:type="dxa"/>
+          </w:tcPr>
+          <w:p>
+            <w:pPr/>
+            <w:r>
+              <w:t xml:space="preserve">bigint</w:t>
+            </w:r>
+          </w:p>
+        </w:tc>
+        <w:tc>
+          <w:tcPr>
+            <w:tcW w:w="2000" w:type="dxa"/>
+          </w:tcPr>
+          <w:p>
+            <w:pPr/>
+            <w:r>
+              <w:t xml:space="preserve">-</w:t>
+            </w:r>
+          </w:p>
+        </w:tc>
+        <w:tc>
+          <w:tcPr>
+            <w:tcW w:w="2000" w:type="dxa"/>
+          </w:tcPr>
+          <w:p>
+            <w:pPr/>
+            <w:r>
+              <w:t xml:space="preserve">FK, NOT NULL</w:t>
+            </w:r>
+          </w:p>
+        </w:tc>
+      </w:tr>
+      <w:tr>
+        <w:trPr>
+          <w:trHeight w:val="530" w:hRule="atLeast"/>
+        </w:trPr>
+        <w:tc>
+          <w:tcPr>
+            <w:tcW w:w="2000" w:type="dxa"/>
+          </w:tcPr>
+          <w:p>
+            <w:pPr/>
+            <w:r>
+              <w:t xml:space="preserve">line_no</w:t>
+            </w:r>
+          </w:p>
+        </w:tc>
+        <w:tc>
+          <w:tcPr>
+            <w:tcW w:w="2000" w:type="dxa"/>
+          </w:tcPr>
+          <w:p>
+            <w:pPr/>
+            <w:r>
+              <w:t xml:space="preserve">int</w:t>
+            </w:r>
+          </w:p>
+        </w:tc>
+        <w:tc>
+          <w:tcPr>
+            <w:tcW w:w="2000" w:type="dxa"/>
+          </w:tcPr>
+          <w:p>
+            <w:pPr/>
+            <w:r>
+              <w:t xml:space="preserve">-</w:t>
+            </w:r>
+          </w:p>
+        </w:tc>
+        <w:tc>
+          <w:tcPr>
+            <w:tcW w:w="2000" w:type="dxa"/>
+          </w:tcPr>
+          <w:p>
+            <w:pPr/>
+            <w:r>
+              <w:t xml:space="preserve">NOT NULL</w:t>
+            </w:r>
+          </w:p>
+        </w:tc>
+      </w:tr>
+      <w:tr>
+        <w:trPr>
+          <w:trHeight w:val="530" w:hRule="atLeast"/>
+        </w:trPr>
+        <w:tc>
+          <w:tcPr>
+            <w:tcW w:w="2000" w:type="dxa"/>
+          </w:tcPr>
+          <w:p>
+            <w:pPr/>
+            <w:r>
+              <w:t xml:space="preserve">item_id</w:t>
+            </w:r>
+          </w:p>
+        </w:tc>
+        <w:tc>
+          <w:tcPr>
+            <w:tcW w:w="2000" w:type="dxa"/>
+          </w:tcPr>
+          <w:p>
+            <w:pPr/>
+            <w:r>
+              <w:t xml:space="preserve">bigint</w:t>
+            </w:r>
+          </w:p>
+        </w:tc>
+        <w:tc>
+          <w:tcPr>
+            <w:tcW w:w="2000" w:type="dxa"/>
+          </w:tcPr>
+          <w:p>
+            <w:pPr/>
+            <w:r>
+              <w:t xml:space="preserve">-</w:t>
+            </w:r>
+          </w:p>
+        </w:tc>
+        <w:tc>
+          <w:tcPr>
+            <w:tcW w:w="2000" w:type="dxa"/>
+          </w:tcPr>
+          <w:p>
+            <w:pPr/>
+            <w:r>
+              <w:t xml:space="preserve">NOT NULL</w:t>
+            </w:r>
+          </w:p>
+        </w:tc>
+      </w:tr>
+      <w:tr>
+        <w:trPr>
+          <w:trHeight w:val="530" w:hRule="atLeast"/>
+        </w:trPr>
+        <w:tc>
+          <w:tcPr>
+            <w:tcW w:w="2000" w:type="dxa"/>
+          </w:tcPr>
+          <w:p>
+            <w:pPr/>
+            <w:r>
+              <w:t xml:space="preserve">source_warehouse_id</w:t>
+            </w:r>
+          </w:p>
+        </w:tc>
+        <w:tc>
+          <w:tcPr>
+            <w:tcW w:w="2000" w:type="dxa"/>
+          </w:tcPr>
+          <w:p>
+            <w:pPr/>
+            <w:r>
+              <w:t xml:space="preserve">bigint</w:t>
+            </w:r>
+          </w:p>
+        </w:tc>
+        <w:tc>
+          <w:tcPr>
+            <w:tcW w:w="2000" w:type="dxa"/>
+          </w:tcPr>
+          <w:p>
+            <w:pPr/>
+            <w:r>
+              <w:t xml:space="preserve">-</w:t>
+            </w:r>
+          </w:p>
+        </w:tc>
+        <w:tc>
+          <w:tcPr>
+            <w:tcW w:w="2000" w:type="dxa"/>
+          </w:tcPr>
+          <w:p>
+            <w:pPr/>
+            <w:r>
+              <w:t xml:space="preserve">NOT NULL</w:t>
+            </w:r>
+          </w:p>
+        </w:tc>
+      </w:tr>
+      <w:tr>
+        <w:trPr>
+          <w:trHeight w:val="530" w:hRule="atLeast"/>
+        </w:trPr>
+        <w:tc>
+          <w:tcPr>
+            <w:tcW w:w="2000" w:type="dxa"/>
+          </w:tcPr>
+          <w:p>
+            <w:pPr/>
+            <w:r>
+              <w:t xml:space="preserve">source_location_id</w:t>
+            </w:r>
+          </w:p>
+        </w:tc>
+        <w:tc>
+          <w:tcPr>
+            <w:tcW w:w="2000" w:type="dxa"/>
+          </w:tcPr>
+          <w:p>
+            <w:pPr/>
+            <w:r>
+              <w:t xml:space="preserve">bigint</w:t>
+            </w:r>
+          </w:p>
+        </w:tc>
+        <w:tc>
+          <w:tcPr>
+            <w:tcW w:w="2000" w:type="dxa"/>
+          </w:tcPr>
+          <w:p>
+            <w:pPr/>
+            <w:r>
+              <w:t xml:space="preserve">-</w:t>
+            </w:r>
+          </w:p>
+        </w:tc>
+        <w:tc>
+          <w:tcPr>
+            <w:tcW w:w="2000" w:type="dxa"/>
+          </w:tcPr>
+          <w:p>
+            <w:pPr/>
+            <w:r>
+              <w:t xml:space="preserve">IS NULL</w:t>
+            </w:r>
+          </w:p>
+        </w:tc>
+      </w:tr>
+      <w:tr>
+        <w:trPr>
+          <w:trHeight w:val="530" w:hRule="atLeast"/>
+        </w:trPr>
+        <w:tc>
+          <w:tcPr>
+            <w:tcW w:w="2000" w:type="dxa"/>
+          </w:tcPr>
+          <w:p>
+            <w:pPr/>
+            <w:r>
+              <w:t xml:space="preserve">destination_warehouse_id</w:t>
+            </w:r>
+          </w:p>
+        </w:tc>
+        <w:tc>
+          <w:tcPr>
+            <w:tcW w:w="2000" w:type="dxa"/>
+          </w:tcPr>
+          <w:p>
+            <w:pPr/>
+            <w:r>
+              <w:t xml:space="preserve">bigint</w:t>
+            </w:r>
+          </w:p>
+        </w:tc>
+        <w:tc>
+          <w:tcPr>
+            <w:tcW w:w="2000" w:type="dxa"/>
+          </w:tcPr>
+          <w:p>
+            <w:pPr/>
+            <w:r>
+              <w:t xml:space="preserve">-</w:t>
+            </w:r>
+          </w:p>
+        </w:tc>
+        <w:tc>
+          <w:tcPr>
+            <w:tcW w:w="2000" w:type="dxa"/>
+          </w:tcPr>
+          <w:p>
+            <w:pPr/>
+            <w:r>
+              <w:t xml:space="preserve">NOT NULL</w:t>
+            </w:r>
+          </w:p>
+        </w:tc>
+      </w:tr>
+      <w:tr>
+        <w:trPr>
+          <w:trHeight w:val="530" w:hRule="atLeast"/>
+        </w:trPr>
+        <w:tc>
+          <w:tcPr>
+            <w:tcW w:w="2000" w:type="dxa"/>
+          </w:tcPr>
+          <w:p>
+            <w:pPr/>
+            <w:r>
+              <w:t xml:space="preserve">destination_location_id</w:t>
+            </w:r>
+          </w:p>
+        </w:tc>
+        <w:tc>
+          <w:tcPr>
+            <w:tcW w:w="2000" w:type="dxa"/>
+          </w:tcPr>
+          <w:p>
+            <w:pPr/>
+            <w:r>
+              <w:t xml:space="preserve">bigint</w:t>
+            </w:r>
+          </w:p>
+        </w:tc>
+        <w:tc>
+          <w:tcPr>
+            <w:tcW w:w="2000" w:type="dxa"/>
+          </w:tcPr>
+          <w:p>
+            <w:pPr/>
+            <w:r>
+              <w:t xml:space="preserve">-</w:t>
+            </w:r>
+          </w:p>
+        </w:tc>
+        <w:tc>
+          <w:tcPr>
+            <w:tcW w:w="2000" w:type="dxa"/>
+          </w:tcPr>
+          <w:p>
+            <w:pPr/>
+            <w:r>
+              <w:t xml:space="preserve">IS NULL</w:t>
+            </w:r>
+          </w:p>
+        </w:tc>
+      </w:tr>
+      <w:tr>
+        <w:trPr>
+          <w:trHeight w:val="530" w:hRule="atLeast"/>
+        </w:trPr>
+        <w:tc>
+          <w:tcPr>
+            <w:tcW w:w="2000" w:type="dxa"/>
+          </w:tcPr>
+          <w:p>
+            <w:pPr/>
+            <w:r>
+              <w:t xml:space="preserve">quantity</w:t>
+            </w:r>
+          </w:p>
+        </w:tc>
+        <w:tc>
+          <w:tcPr>
+            <w:tcW w:w="2000" w:type="dxa"/>
+          </w:tcPr>
+          <w:p>
+            <w:pPr/>
+            <w:r>
+              <w:t xml:space="preserve">decimal</w:t>
+            </w:r>
+          </w:p>
+        </w:tc>
+        <w:tc>
+          <w:tcPr>
+            <w:tcW w:w="2000" w:type="dxa"/>
+          </w:tcPr>
+          <w:p>
+            <w:pPr/>
+            <w:r>
+              <w:t xml:space="preserve">(19,6)</w:t>
+            </w:r>
+          </w:p>
+        </w:tc>
+        <w:tc>
+          <w:tcPr>
+            <w:tcW w:w="2000" w:type="dxa"/>
+          </w:tcPr>
+          <w:p>
+            <w:pPr/>
+            <w:r>
+              <w:t xml:space="preserve">NOT NULL</w:t>
+            </w:r>
+          </w:p>
+        </w:tc>
+      </w:tr>
+      <w:tr>
+        <w:trPr>
+          <w:trHeight w:val="530" w:hRule="atLeast"/>
+        </w:trPr>
+        <w:tc>
+          <w:tcPr>
+            <w:tcW w:w="2000" w:type="dxa"/>
+          </w:tcPr>
+          <w:p>
+            <w:pPr/>
+            <w:r>
+              <w:t xml:space="preserve">company_id</w:t>
+            </w:r>
+          </w:p>
+        </w:tc>
+        <w:tc>
+          <w:tcPr>
+            <w:tcW w:w="2000" w:type="dxa"/>
+          </w:tcPr>
+          <w:p>
+            <w:pPr/>
+            <w:r>
+              <w:t xml:space="preserve">bigint</w:t>
+            </w:r>
+          </w:p>
+        </w:tc>
+        <w:tc>
+          <w:tcPr>
+            <w:tcW w:w="2000" w:type="dxa"/>
+          </w:tcPr>
+          <w:p>
+            <w:pPr/>
+            <w:r>
+              <w:t xml:space="preserve">-</w:t>
+            </w:r>
+          </w:p>
+        </w:tc>
+        <w:tc>
+          <w:tcPr>
+            <w:tcW w:w="2000" w:type="dxa"/>
+          </w:tcPr>
+          <w:p>
+            <w:pPr/>
+            <w:r>
+              <w:t xml:space="preserve">FK, NOT NULL</w:t>
+            </w:r>
+          </w:p>
+        </w:tc>
+      </w:tr>
+      <w:tr>
+        <w:trPr>
+          <w:trHeight w:val="530" w:hRule="atLeast"/>
+        </w:trPr>
+        <w:tc>
+          <w:tcPr>
+            <w:tcW w:w="2000" w:type="dxa"/>
+          </w:tcPr>
+          <w:p>
+            <w:pPr/>
+            <w:r>
+              <w:t xml:space="preserve">created_at</w:t>
+            </w:r>
+          </w:p>
+        </w:tc>
+        <w:tc>
+          <w:tcPr>
+            <w:tcW w:w="2000" w:type="dxa"/>
+          </w:tcPr>
+          <w:p>
+            <w:pPr/>
+            <w:r>
+              <w:t xml:space="preserve">datetime2</w:t>
+            </w:r>
+          </w:p>
+        </w:tc>
+        <w:tc>
+          <w:tcPr>
+            <w:tcW w:w="2000" w:type="dxa"/>
+          </w:tcPr>
+          <w:p>
+            <w:pPr/>
+            <w:r>
+              <w:t xml:space="preserve">(6)</w:t>
+            </w:r>
+          </w:p>
+        </w:tc>
+        <w:tc>
+          <w:tcPr>
+            <w:tcW w:w="2000" w:type="dxa"/>
+          </w:tcPr>
+          <w:p>
+            <w:pPr/>
+            <w:r>
+              <w:t xml:space="preserve">NOT NULL</w:t>
+            </w:r>
+          </w:p>
+        </w:tc>
+      </w:tr>
+      <w:tr>
+        <w:trPr>
+          <w:trHeight w:val="530" w:hRule="atLeast"/>
+        </w:trPr>
+        <w:tc>
+          <w:tcPr>
+            <w:tcW w:w="2000" w:type="dxa"/>
+          </w:tcPr>
+          <w:p>
+            <w:pPr/>
+            <w:r>
+              <w:t xml:space="preserve">created_by</w:t>
+            </w:r>
+          </w:p>
+        </w:tc>
+        <w:tc>
+          <w:tcPr>
+            <w:tcW w:w="2000" w:type="dxa"/>
+          </w:tcPr>
+          <w:p>
+            <w:pPr/>
+            <w:r>
+              <w:t xml:space="preserve">bigint</w:t>
+            </w:r>
+          </w:p>
+        </w:tc>
+        <w:tc>
+          <w:tcPr>
+            <w:tcW w:w="2000" w:type="dxa"/>
+          </w:tcPr>
+          <w:p>
+            <w:pPr/>
+            <w:r>
+              <w:t xml:space="preserve">-</w:t>
+            </w:r>
+          </w:p>
+        </w:tc>
+        <w:tc>
+          <w:tcPr>
+            <w:tcW w:w="2000" w:type="dxa"/>
+          </w:tcPr>
+          <w:p>
+            <w:pPr/>
+            <w:r>
+              <w:t xml:space="preserve">NOT NULL</w:t>
+            </w:r>
+          </w:p>
+        </w:tc>
+      </w:tr>
+      <w:tr>
+        <w:trPr>
+          <w:trHeight w:val="530" w:hRule="atLeast"/>
+        </w:trPr>
+        <w:tc>
+          <w:tcPr>
+            <w:tcW w:w="2000" w:type="dxa"/>
+          </w:tcPr>
+          <w:p>
+            <w:pPr/>
+            <w:r>
+              <w:t xml:space="preserve">updated_at</w:t>
+            </w:r>
+          </w:p>
+        </w:tc>
+        <w:tc>
+          <w:tcPr>
+            <w:tcW w:w="2000" w:type="dxa"/>
+          </w:tcPr>
+          <w:p>
+            <w:pPr/>
+            <w:r>
+              <w:t xml:space="preserve">datetime2</w:t>
+            </w:r>
+          </w:p>
+        </w:tc>
+        <w:tc>
+          <w:tcPr>
+            <w:tcW w:w="2000" w:type="dxa"/>
+          </w:tcPr>
+          <w:p>
+            <w:pPr/>
+            <w:r>
+              <w:t xml:space="preserve">(6)</w:t>
+            </w:r>
+          </w:p>
+        </w:tc>
+        <w:tc>
+          <w:tcPr>
+            <w:tcW w:w="2000" w:type="dxa"/>
+          </w:tcPr>
+          <w:p>
+            <w:pPr/>
+            <w:r>
+              <w:t xml:space="preserve">IS NULL</w:t>
+            </w:r>
+          </w:p>
+        </w:tc>
+      </w:tr>
+      <w:tr>
+        <w:trPr>
+          <w:trHeight w:val="530" w:hRule="atLeast"/>
+        </w:trPr>
+        <w:tc>
+          <w:tcPr>
+            <w:tcW w:w="2000" w:type="dxa"/>
+          </w:tcPr>
+          <w:p>
+            <w:pPr/>
+            <w:r>
+              <w:t xml:space="preserve">updated_by</w:t>
+            </w:r>
+          </w:p>
+        </w:tc>
+        <w:tc>
+          <w:tcPr>
+            <w:tcW w:w="2000" w:type="dxa"/>
+          </w:tcPr>
+          <w:p>
+            <w:pPr/>
+            <w:r>
+              <w:t xml:space="preserve">bigint</w:t>
+            </w:r>
+          </w:p>
+        </w:tc>
+        <w:tc>
+          <w:tcPr>
+            <w:tcW w:w="2000" w:type="dxa"/>
+          </w:tcPr>
+          <w:p>
+            <w:pPr/>
+            <w:r>
+              <w:t xml:space="preserve">-</w:t>
+            </w:r>
+          </w:p>
+        </w:tc>
+        <w:tc>
+          <w:tcPr>
+            <w:tcW w:w="2000" w:type="dxa"/>
+          </w:tcPr>
+          <w:p>
+            <w:pPr/>
+            <w:r>
+              <w:t xml:space="preserve">IS NULL</w:t>
+            </w:r>
+          </w:p>
+        </w:tc>
+      </w:tr>
+      <w:tr>
+        <w:trPr>
+          <w:trHeight w:val="530" w:hRule="atLeast"/>
+        </w:trPr>
+        <w:tc>
+          <w:tcPr>
+            <w:tcW w:w="2000" w:type="dxa"/>
+          </w:tcPr>
+          <w:p>
+            <w:pPr/>
+            <w:r>
+              <w:t xml:space="preserve">version</w:t>
+            </w:r>
+          </w:p>
+        </w:tc>
+        <w:tc>
+          <w:tcPr>
+            <w:tcW w:w="2000" w:type="dxa"/>
+          </w:tcPr>
+          <w:p>
+            <w:pPr/>
+            <w:r>
+              <w:t xml:space="preserve">int</w:t>
+            </w:r>
+          </w:p>
+        </w:tc>
+        <w:tc>
+          <w:tcPr>
+            <w:tcW w:w="2000" w:type="dxa"/>
+          </w:tcPr>
+          <w:p>
+            <w:pPr/>
+            <w:r>
+              <w:t xml:space="preserve">-</w:t>
+            </w:r>
+          </w:p>
+        </w:tc>
+        <w:tc>
+          <w:tcPr>
+            <w:tcW w:w="2000" w:type="dxa"/>
+          </w:tcPr>
+          <w:p>
+            <w:pPr/>
+            <w:r>
+              <w:t xml:space="preserve">NOT NULL</w:t>
+            </w:r>
+          </w:p>
+        </w:tc>
+      </w:tr>
+    </w:tbl>
+    <w:p/>
+    <w:p>
+      <w:pPr/>
+      <w:r>
+        <w:t xml:space="preserve">Table Name: inv_transfer_line_tracking</w:t>
+      </w:r>
+    </w:p>
+    <w:p>
+      <w:pPr/>
+      <w:r>
+        <w:t xml:space="preserve">Primary Key: id</w:t>
+      </w:r>
+    </w:p>
+    <w:p>
+      <w:pPr/>
+      <w:r>
+        <w:t xml:space="preserve">This table stores the lot or serial numbers carried unchanged from source to destination.</w:t>
+      </w:r>
+    </w:p>
+    <w:tbl>
+      <w:tblPr>
+        <w:tblStyle w:val="TableGrid"/>
+        <w:tblW w:w="8000" w:type="dxa"/>
+        <w:jc w:val="left"/>
+        <w:tblBorders>
+          <w:top w:val="single" w:color="000000" w:sz="4" w:space="0"/>
+          <w:left w:val="single" w:color="000000" w:sz="4" w:space="0"/>
+          <w:bottom w:val="single" w:color="000000" w:sz="4" w:space="0"/>
+          <w:right w:val="single" w:color="000000" w:sz="4" w:space="0"/>
+          <w:insideH w:val="single" w:color="000000" w:sz="4" w:space="0"/>
+          <w:insideV w:val="single" w:color="000000" w:sz="4" w:space="0"/>
+        </w:tblBorders>
+        <w:tblLayout w:type="fixed"/>
+        <w:tblCellMar>
+          <w:top w:w="100" w:type="dxa"/>
+          <w:left w:w="100" w:type="dxa"/>
+          <w:bottom w:w="100" w:type="dxa"/>
+          <w:right w:w="100" w:type="dxa"/>
+        </w:tblCellMar>
+      </w:tblPr>
+      <w:tblGrid>
+        <w:gridCol w:w="2000"/>
+        <w:gridCol w:w="2000"/>
+        <w:gridCol w:w="2000"/>
+        <w:gridCol w:w="2000"/>
+      </w:tblGrid>
+      <w:tr>
+        <w:trPr>
+          <w:trHeight w:val="530" w:hRule="atLeast"/>
+        </w:trPr>
+        <w:tc>
+          <w:tcPr>
+            <w:tcW w:w="2000" w:type="dxa"/>
+          </w:tcPr>
+          <w:p>
+            <w:pPr>
+              <w:jc w:val="center"/>
+            </w:pPr>
+            <w:r>
+              <w:rPr>
+                <w:b/>
+              </w:rPr>
+              <w:t xml:space="preserve">Name of Attribute</w:t>
+            </w:r>
+          </w:p>
+        </w:tc>
+        <w:tc>
+          <w:tcPr>
+            <w:tcW w:w="2000" w:type="dxa"/>
+          </w:tcPr>
+          <w:p>
+            <w:pPr>
+              <w:jc w:val="center"/>
+            </w:pPr>
+            <w:r>
+              <w:rPr>
+                <w:b/>
+              </w:rPr>
+              <w:t xml:space="preserve">Data Type</w:t>
+            </w:r>
+          </w:p>
+        </w:tc>
+        <w:tc>
+          <w:tcPr>
+            <w:tcW w:w="2000" w:type="dxa"/>
+          </w:tcPr>
+          <w:p>
+            <w:pPr>
+              <w:jc w:val="center"/>
+            </w:pPr>
+            <w:r>
+              <w:rPr>
+                <w:b/>
+              </w:rPr>
+              <w:t xml:space="preserve">Size</w:t>
+            </w:r>
+          </w:p>
+        </w:tc>
+        <w:tc>
+          <w:tcPr>
+            <w:tcW w:w="2000" w:type="dxa"/>
+          </w:tcPr>
+          <w:p>
+            <w:pPr>
+              <w:jc w:val="center"/>
+            </w:pPr>
+            <w:r>
+              <w:rPr>
+                <w:b/>
+              </w:rPr>
+              <w:t xml:space="preserve">PK/FK/IS NULL/ NOT NULL</w:t>
+            </w:r>
+          </w:p>
+        </w:tc>
+      </w:tr>
+      <w:tr>
+        <w:trPr>
+          <w:trHeight w:val="530" w:hRule="atLeast"/>
+        </w:trPr>
+        <w:tc>
+          <w:tcPr>
+            <w:tcW w:w="2000" w:type="dxa"/>
+          </w:tcPr>
+          <w:p>
+            <w:pPr/>
+            <w:r>
+              <w:t xml:space="preserve">id</w:t>
+            </w:r>
+          </w:p>
+        </w:tc>
+        <w:tc>
+          <w:tcPr>
+            <w:tcW w:w="2000" w:type="dxa"/>
+          </w:tcPr>
+          <w:p>
+            <w:pPr/>
+            <w:r>
+              <w:t xml:space="preserve">bigint</w:t>
+            </w:r>
+          </w:p>
+        </w:tc>
+        <w:tc>
+          <w:tcPr>
+            <w:tcW w:w="2000" w:type="dxa"/>
+          </w:tcPr>
+          <w:p>
+            <w:pPr/>
+            <w:r>
+              <w:t xml:space="preserve">-</w:t>
+            </w:r>
+          </w:p>
+        </w:tc>
+        <w:tc>
+          <w:tcPr>
+            <w:tcW w:w="2000" w:type="dxa"/>
+          </w:tcPr>
+          <w:p>
+            <w:pPr/>
+            <w:r>
+              <w:t xml:space="preserve">PK, NOT NULL</w:t>
+            </w:r>
+          </w:p>
+        </w:tc>
+      </w:tr>
+      <w:tr>
+        <w:trPr>
+          <w:trHeight w:val="530" w:hRule="atLeast"/>
+        </w:trPr>
+        <w:tc>
+          <w:tcPr>
+            <w:tcW w:w="2000" w:type="dxa"/>
+          </w:tcPr>
+          <w:p>
+            <w:pPr/>
+            <w:r>
+              <w:t xml:space="preserve">line_id</w:t>
+            </w:r>
+          </w:p>
+        </w:tc>
+        <w:tc>
+          <w:tcPr>
+            <w:tcW w:w="2000" w:type="dxa"/>
+          </w:tcPr>
+          <w:p>
+            <w:pPr/>
+            <w:r>
+              <w:t xml:space="preserve">bigint</w:t>
+            </w:r>
+          </w:p>
+        </w:tc>
+        <w:tc>
+          <w:tcPr>
+            <w:tcW w:w="2000" w:type="dxa"/>
+          </w:tcPr>
+          <w:p>
+            <w:pPr/>
+            <w:r>
+              <w:t xml:space="preserve">-</w:t>
+            </w:r>
+          </w:p>
+        </w:tc>
+        <w:tc>
+          <w:tcPr>
+            <w:tcW w:w="2000" w:type="dxa"/>
+          </w:tcPr>
+          <w:p>
+            <w:pPr/>
+            <w:r>
+              <w:t xml:space="preserve">FK, NOT NULL</w:t>
+            </w:r>
+          </w:p>
+        </w:tc>
+      </w:tr>
+      <w:tr>
+        <w:trPr>
+          <w:trHeight w:val="530" w:hRule="atLeast"/>
+        </w:trPr>
+        <w:tc>
+          <w:tcPr>
+            <w:tcW w:w="2000" w:type="dxa"/>
+          </w:tcPr>
+          <w:p>
+            <w:pPr/>
+            <w:r>
+              <w:t xml:space="preserve">seq_no</w:t>
+            </w:r>
+          </w:p>
+        </w:tc>
+        <w:tc>
+          <w:tcPr>
+            <w:tcW w:w="2000" w:type="dxa"/>
+          </w:tcPr>
+          <w:p>
+            <w:pPr/>
+            <w:r>
+              <w:t xml:space="preserve">int</w:t>
+            </w:r>
+          </w:p>
+        </w:tc>
+        <w:tc>
+          <w:tcPr>
+            <w:tcW w:w="2000" w:type="dxa"/>
+          </w:tcPr>
+          <w:p>
+            <w:pPr/>
+            <w:r>
+              <w:t xml:space="preserve">-</w:t>
+            </w:r>
+          </w:p>
+        </w:tc>
+        <w:tc>
+          <w:tcPr>
+            <w:tcW w:w="2000" w:type="dxa"/>
+          </w:tcPr>
+          <w:p>
+            <w:pPr/>
+            <w:r>
+              <w:t xml:space="preserve">NOT NULL</w:t>
+            </w:r>
+          </w:p>
+        </w:tc>
+      </w:tr>
+      <w:tr>
+        <w:trPr>
+          <w:trHeight w:val="530" w:hRule="atLeast"/>
+        </w:trPr>
+        <w:tc>
+          <w:tcPr>
+            <w:tcW w:w="2000" w:type="dxa"/>
+          </w:tcPr>
+          <w:p>
+            <w:pPr/>
+            <w:r>
+              <w:t xml:space="preserve">lot_no</w:t>
+            </w:r>
+          </w:p>
+        </w:tc>
+        <w:tc>
+          <w:tcPr>
+            <w:tcW w:w="2000" w:type="dxa"/>
+          </w:tcPr>
+          <w:p>
+            <w:pPr/>
+            <w:r>
+              <w:t xml:space="preserve">nvarchar</w:t>
+            </w:r>
+          </w:p>
+        </w:tc>
+        <w:tc>
+          <w:tcPr>
+            <w:tcW w:w="2000" w:type="dxa"/>
+          </w:tcPr>
+          <w:p>
+            <w:pPr/>
+            <w:r>
+              <w:t xml:space="preserve">50</w:t>
+            </w:r>
+          </w:p>
+        </w:tc>
+        <w:tc>
+          <w:tcPr>
+            <w:tcW w:w="2000" w:type="dxa"/>
+          </w:tcPr>
+          <w:p>
+            <w:pPr/>
+            <w:r>
+              <w:t xml:space="preserve">IS NULL</w:t>
+            </w:r>
+          </w:p>
+        </w:tc>
+      </w:tr>
+      <w:tr>
+        <w:trPr>
+          <w:trHeight w:val="530" w:hRule="atLeast"/>
+        </w:trPr>
+        <w:tc>
+          <w:tcPr>
+            <w:tcW w:w="2000" w:type="dxa"/>
+          </w:tcPr>
+          <w:p>
+            <w:pPr/>
+            <w:r>
+              <w:t xml:space="preserve">serial_no</w:t>
+            </w:r>
+          </w:p>
+        </w:tc>
+        <w:tc>
+          <w:tcPr>
+            <w:tcW w:w="2000" w:type="dxa"/>
+          </w:tcPr>
+          <w:p>
+            <w:pPr/>
+            <w:r>
+              <w:t xml:space="preserve">nvarchar</w:t>
+            </w:r>
+          </w:p>
+        </w:tc>
+        <w:tc>
+          <w:tcPr>
+            <w:tcW w:w="2000" w:type="dxa"/>
+          </w:tcPr>
+          <w:p>
+            <w:pPr/>
+            <w:r>
+              <w:t xml:space="preserve">100</w:t>
+            </w:r>
+          </w:p>
+        </w:tc>
+        <w:tc>
+          <w:tcPr>
+            <w:tcW w:w="2000" w:type="dxa"/>
+          </w:tcPr>
+          <w:p>
+            <w:pPr/>
+            <w:r>
+              <w:t xml:space="preserve">IS NULL</w:t>
+            </w:r>
+          </w:p>
+        </w:tc>
+      </w:tr>
+      <w:tr>
+        <w:trPr>
+          <w:trHeight w:val="530" w:hRule="atLeast"/>
+        </w:trPr>
+        <w:tc>
+          <w:tcPr>
+            <w:tcW w:w="2000" w:type="dxa"/>
+          </w:tcPr>
+          <w:p>
+            <w:pPr/>
+            <w:r>
+              <w:t xml:space="preserve">quantity</w:t>
+            </w:r>
+          </w:p>
+        </w:tc>
+        <w:tc>
+          <w:tcPr>
+            <w:tcW w:w="2000" w:type="dxa"/>
+          </w:tcPr>
+          <w:p>
+            <w:pPr/>
+            <w:r>
+              <w:t xml:space="preserve">decimal</w:t>
+            </w:r>
+          </w:p>
+        </w:tc>
+        <w:tc>
+          <w:tcPr>
+            <w:tcW w:w="2000" w:type="dxa"/>
+          </w:tcPr>
+          <w:p>
+            <w:pPr/>
+            <w:r>
+              <w:t xml:space="preserve">(19,6)</w:t>
+            </w:r>
+          </w:p>
+        </w:tc>
+        <w:tc>
+          <w:tcPr>
+            <w:tcW w:w="2000" w:type="dxa"/>
+          </w:tcPr>
+          <w:p>
+            <w:pPr/>
+            <w:r>
+              <w:t xml:space="preserve">NOT NULL</w:t>
+            </w:r>
+          </w:p>
+        </w:tc>
+      </w:tr>
+      <w:tr>
+        <w:trPr>
+          <w:trHeight w:val="530" w:hRule="atLeast"/>
+        </w:trPr>
+        <w:tc>
+          <w:tcPr>
+            <w:tcW w:w="2000" w:type="dxa"/>
+          </w:tcPr>
+          <w:p>
+            <w:pPr/>
+            <w:r>
+              <w:t xml:space="preserve">company_id</w:t>
+            </w:r>
+          </w:p>
+        </w:tc>
+        <w:tc>
+          <w:tcPr>
+            <w:tcW w:w="2000" w:type="dxa"/>
+          </w:tcPr>
+          <w:p>
+            <w:pPr/>
+            <w:r>
+              <w:t xml:space="preserve">bigint</w:t>
+            </w:r>
+          </w:p>
+        </w:tc>
+        <w:tc>
+          <w:tcPr>
+            <w:tcW w:w="2000" w:type="dxa"/>
+          </w:tcPr>
+          <w:p>
+            <w:pPr/>
+            <w:r>
+              <w:t xml:space="preserve">-</w:t>
+            </w:r>
+          </w:p>
+        </w:tc>
+        <w:tc>
+          <w:tcPr>
+            <w:tcW w:w="2000" w:type="dxa"/>
+          </w:tcPr>
+          <w:p>
+            <w:pPr/>
+            <w:r>
+              <w:t xml:space="preserve">FK, NOT NULL</w:t>
+            </w:r>
+          </w:p>
+        </w:tc>
+      </w:tr>
+      <w:tr>
+        <w:trPr>
+          <w:trHeight w:val="530" w:hRule="atLeast"/>
+        </w:trPr>
+        <w:tc>
+          <w:tcPr>
+            <w:tcW w:w="2000" w:type="dxa"/>
+          </w:tcPr>
+          <w:p>
+            <w:pPr/>
+            <w:r>
+              <w:t xml:space="preserve">created_at</w:t>
+            </w:r>
+          </w:p>
+        </w:tc>
+        <w:tc>
+          <w:tcPr>
+            <w:tcW w:w="2000" w:type="dxa"/>
+          </w:tcPr>
+          <w:p>
+            <w:pPr/>
+            <w:r>
+              <w:t xml:space="preserve">datetime2</w:t>
+            </w:r>
+          </w:p>
+        </w:tc>
+        <w:tc>
+          <w:tcPr>
+            <w:tcW w:w="2000" w:type="dxa"/>
+          </w:tcPr>
+          <w:p>
+            <w:pPr/>
+            <w:r>
+              <w:t xml:space="preserve">(6)</w:t>
+            </w:r>
+          </w:p>
+        </w:tc>
+        <w:tc>
+          <w:tcPr>
+            <w:tcW w:w="2000" w:type="dxa"/>
+          </w:tcPr>
+          <w:p>
+            <w:pPr/>
+            <w:r>
+              <w:t xml:space="preserve">NOT NULL</w:t>
+            </w:r>
+          </w:p>
+        </w:tc>
+      </w:tr>
+      <w:tr>
+        <w:trPr>
+          <w:trHeight w:val="530" w:hRule="atLeast"/>
+        </w:trPr>
+        <w:tc>
+          <w:tcPr>
+            <w:tcW w:w="2000" w:type="dxa"/>
+          </w:tcPr>
+          <w:p>
+            <w:pPr/>
+            <w:r>
+              <w:t xml:space="preserve">created_by</w:t>
+            </w:r>
+          </w:p>
+        </w:tc>
+        <w:tc>
+          <w:tcPr>
+            <w:tcW w:w="2000" w:type="dxa"/>
+          </w:tcPr>
+          <w:p>
+            <w:pPr/>
+            <w:r>
+              <w:t xml:space="preserve">bigint</w:t>
+            </w:r>
+          </w:p>
+        </w:tc>
+        <w:tc>
+          <w:tcPr>
+            <w:tcW w:w="2000" w:type="dxa"/>
+          </w:tcPr>
+          <w:p>
+            <w:pPr/>
+            <w:r>
+              <w:t xml:space="preserve">-</w:t>
+            </w:r>
+          </w:p>
+        </w:tc>
+        <w:tc>
+          <w:tcPr>
+            <w:tcW w:w="2000" w:type="dxa"/>
+          </w:tcPr>
+          <w:p>
+            <w:pPr/>
+            <w:r>
+              <w:t xml:space="preserve">NOT NULL</w:t>
+            </w:r>
+          </w:p>
+        </w:tc>
+      </w:tr>
+      <w:tr>
+        <w:trPr>
+          <w:trHeight w:val="530" w:hRule="atLeast"/>
+        </w:trPr>
+        <w:tc>
+          <w:tcPr>
+            <w:tcW w:w="2000" w:type="dxa"/>
+          </w:tcPr>
+          <w:p>
+            <w:pPr/>
+            <w:r>
+              <w:t xml:space="preserve">updated_at</w:t>
+            </w:r>
+          </w:p>
+        </w:tc>
+        <w:tc>
+          <w:tcPr>
+            <w:tcW w:w="2000" w:type="dxa"/>
+          </w:tcPr>
+          <w:p>
+            <w:pPr/>
+            <w:r>
+              <w:t xml:space="preserve">datetime2</w:t>
+            </w:r>
+          </w:p>
+        </w:tc>
+        <w:tc>
+          <w:tcPr>
+            <w:tcW w:w="2000" w:type="dxa"/>
+          </w:tcPr>
+          <w:p>
+            <w:pPr/>
+            <w:r>
+              <w:t xml:space="preserve">(6)</w:t>
+            </w:r>
+          </w:p>
+        </w:tc>
+        <w:tc>
+          <w:tcPr>
+            <w:tcW w:w="2000" w:type="dxa"/>
+          </w:tcPr>
+          <w:p>
+            <w:pPr/>
+            <w:r>
+              <w:t xml:space="preserve">IS NULL</w:t>
+            </w:r>
+          </w:p>
+        </w:tc>
+      </w:tr>
+      <w:tr>
+        <w:trPr>
+          <w:trHeight w:val="530" w:hRule="atLeast"/>
+        </w:trPr>
+        <w:tc>
+          <w:tcPr>
+            <w:tcW w:w="2000" w:type="dxa"/>
+          </w:tcPr>
+          <w:p>
+            <w:pPr/>
+            <w:r>
+              <w:t xml:space="preserve">updated_by</w:t>
+            </w:r>
+          </w:p>
+        </w:tc>
+        <w:tc>
+          <w:tcPr>
+            <w:tcW w:w="2000" w:type="dxa"/>
+          </w:tcPr>
+          <w:p>
+            <w:pPr/>
+            <w:r>
+              <w:t xml:space="preserve">bigint</w:t>
+            </w:r>
+          </w:p>
+        </w:tc>
+        <w:tc>
+          <w:tcPr>
+            <w:tcW w:w="2000" w:type="dxa"/>
+          </w:tcPr>
+          <w:p>
+            <w:pPr/>
+            <w:r>
+              <w:t xml:space="preserve">-</w:t>
+            </w:r>
+          </w:p>
+        </w:tc>
+        <w:tc>
+          <w:tcPr>
+            <w:tcW w:w="2000" w:type="dxa"/>
+          </w:tcPr>
+          <w:p>
+            <w:pPr/>
+            <w:r>
+              <w:t xml:space="preserve">IS NULL</w:t>
+            </w:r>
+          </w:p>
+        </w:tc>
+      </w:tr>
+      <w:tr>
+        <w:trPr>
+          <w:trHeight w:val="530" w:hRule="atLeast"/>
+        </w:trPr>
+        <w:tc>
+          <w:tcPr>
+            <w:tcW w:w="2000" w:type="dxa"/>
+          </w:tcPr>
+          <w:p>
+            <w:pPr/>
+            <w:r>
+              <w:t xml:space="preserve">version</w:t>
+            </w:r>
+          </w:p>
+        </w:tc>
+        <w:tc>
+          <w:tcPr>
+            <w:tcW w:w="2000" w:type="dxa"/>
+          </w:tcPr>
+          <w:p>
+            <w:pPr/>
+            <w:r>
+              <w:t xml:space="preserve">int</w:t>
+            </w:r>
+          </w:p>
+        </w:tc>
+        <w:tc>
+          <w:tcPr>
+            <w:tcW w:w="2000" w:type="dxa"/>
+          </w:tcPr>
+          <w:p>
+            <w:pPr/>
+            <w:r>
+              <w:t xml:space="preserve">-</w:t>
+            </w:r>
+          </w:p>
+        </w:tc>
+        <w:tc>
+          <w:tcPr>
+            <w:tcW w:w="2000" w:type="dxa"/>
+          </w:tcPr>
+          <w:p>
+            <w:pPr/>
+            <w:r>
+              <w:t xml:space="preserve">NOT NULL</w:t>
+            </w:r>
+          </w:p>
+        </w:tc>
+      </w:tr>
+    </w:tbl>
+    <w:p/>
+    <w:p>
+      <w:pPr/>
+      <w:r>
         <w:t xml:space="preserve">Table Name: md_account</w:t>
       </w:r>
     </w:p>
@@ -49894,6 +52300,63 @@
           <w:i/>
         </w:rPr>
         <w:t xml:space="preserve">[Pending] System screenshot of Lot and Serial Trace Interface.</w:t>
+      </w:r>
+    </w:p>
+    <w:p>
+      <w:pPr>
+        <w:pStyle w:val="Heading5"/>
+      </w:pPr>
+      <w:r>
+        <w:t xml:space="preserve">4.2.1.5.15 Inventory Transfer Create Interface</w:t>
+      </w:r>
+    </w:p>
+    <w:p>
+      <w:pPr>
+        <w:jc w:val="center"/>
+      </w:pPr>
+      <w:r>
+        <w:rPr>
+          <w:i/>
+        </w:rPr>
+        <w:t xml:space="preserve">[Pending] System screenshot of Inventory Transfer Create Interface.</w:t>
+      </w:r>
+    </w:p>
+    <w:p>
+      <w:pPr>
+        <w:pStyle w:val="Heading5"/>
+      </w:pPr>
+      <w:r>
+        <w:t xml:space="preserve">4.2.1.5.16 Inventory Transfer View Interface</w:t>
+      </w:r>
+    </w:p>
+    <w:p>
+      <w:pPr>
+        <w:jc w:val="center"/>
+      </w:pPr>
+      <w:r>
+        <w:rPr>
+          <w:i/>
+        </w:rPr>
+        <w:t xml:space="preserve">[Pending] System screenshot of Inventory Transfer View Interface.</w:t>
+      </w:r>
+    </w:p>
+    <w:p>
+      <w:pPr>
+        <w:pStyle w:val="Heading5"/>
+      </w:pPr>
+      <w:r>
+        <w:t xml:space="preserve">4.2.1.5.17 Inventory Transfer Edit Interface</w:t>
+      </w:r>
+    </w:p>
+    <w:p>
+      <w:pPr>
+        <w:jc w:val="center"/>
+      </w:pPr>
+      <w:r>
+        <w:rPr>
+          <w:i/>
+        </w:rPr>
+        <w:t xml:space="preserve">[Pending] System screenshot of Inventory Transfer Edit Interface.</w:t>
       </w:r>
     </w:p>
     <w:p>
@@ -51539,7 +54002,7 @@
       </w:r>
     </w:p>
     <w:sectPr>
-      <w:footerReference xmlns:r="http://schemas.openxmlformats.org/officeDocument/2006/relationships" w:type="default" r:id="R2dba80d2b46f4f92"/>
+      <w:footerReference xmlns:r="http://schemas.openxmlformats.org/officeDocument/2006/relationships" w:type="default" r:id="Re3a313c926df44ff"/>
       <w:pgSz w:w="11906" w:h="16838"/>
       <w:pgMar w:top="1440" w:right="1440" w:bottom="1440" w:left="1440" w:header="720" w:footer="720" w:gutter="0"/>
     </w:sectPr>

</xml_diff>

<commit_message>
feat(inv): add stocktake snapshot, count and refresh backend
WU-INV-010a1: inv_stocktake tables (REQ_DS43.151-153, migration
Inventory_Stocktake), MD IItemCategoryScope contract and batch warehouse
validation, snapshot from the movement ledger, item+warehouse exclusivity
under a company stocktake lock, whole-set count saving with added lines,
refresh-snapshot, soft delete, list/detail API and INV.STOCKTAKE.* view/
create/edit/delete permissions. Submit, approval posting and variance
report follow in WU-INV-010a2.

Co-Authored-By: Claude Opus 5.5 <noreply@anthropic.com>
</commit_message>
<xml_diff>
--- a/docs/99-output/MyERP_SDS.docx
+++ b/docs/99-output/MyERP_SDS.docx
@@ -11293,6 +11293,2706 @@
             <w:pPr/>
             <w:r>
               <w:t xml:space="preserve">NOT NULL</w:t>
+            </w:r>
+          </w:p>
+        </w:tc>
+      </w:tr>
+      <w:tr>
+        <w:trPr>
+          <w:trHeight w:val="530" w:hRule="atLeast"/>
+        </w:trPr>
+        <w:tc>
+          <w:tcPr>
+            <w:tcW w:w="2000" w:type="dxa"/>
+          </w:tcPr>
+          <w:p>
+            <w:pPr/>
+            <w:r>
+              <w:t xml:space="preserve">company_id</w:t>
+            </w:r>
+          </w:p>
+        </w:tc>
+        <w:tc>
+          <w:tcPr>
+            <w:tcW w:w="2000" w:type="dxa"/>
+          </w:tcPr>
+          <w:p>
+            <w:pPr/>
+            <w:r>
+              <w:t xml:space="preserve">bigint</w:t>
+            </w:r>
+          </w:p>
+        </w:tc>
+        <w:tc>
+          <w:tcPr>
+            <w:tcW w:w="2000" w:type="dxa"/>
+          </w:tcPr>
+          <w:p>
+            <w:pPr/>
+            <w:r>
+              <w:t xml:space="preserve">-</w:t>
+            </w:r>
+          </w:p>
+        </w:tc>
+        <w:tc>
+          <w:tcPr>
+            <w:tcW w:w="2000" w:type="dxa"/>
+          </w:tcPr>
+          <w:p>
+            <w:pPr/>
+            <w:r>
+              <w:t xml:space="preserve">FK, NOT NULL</w:t>
+            </w:r>
+          </w:p>
+        </w:tc>
+      </w:tr>
+      <w:tr>
+        <w:trPr>
+          <w:trHeight w:val="530" w:hRule="atLeast"/>
+        </w:trPr>
+        <w:tc>
+          <w:tcPr>
+            <w:tcW w:w="2000" w:type="dxa"/>
+          </w:tcPr>
+          <w:p>
+            <w:pPr/>
+            <w:r>
+              <w:t xml:space="preserve">created_at</w:t>
+            </w:r>
+          </w:p>
+        </w:tc>
+        <w:tc>
+          <w:tcPr>
+            <w:tcW w:w="2000" w:type="dxa"/>
+          </w:tcPr>
+          <w:p>
+            <w:pPr/>
+            <w:r>
+              <w:t xml:space="preserve">datetime2</w:t>
+            </w:r>
+          </w:p>
+        </w:tc>
+        <w:tc>
+          <w:tcPr>
+            <w:tcW w:w="2000" w:type="dxa"/>
+          </w:tcPr>
+          <w:p>
+            <w:pPr/>
+            <w:r>
+              <w:t xml:space="preserve">(6)</w:t>
+            </w:r>
+          </w:p>
+        </w:tc>
+        <w:tc>
+          <w:tcPr>
+            <w:tcW w:w="2000" w:type="dxa"/>
+          </w:tcPr>
+          <w:p>
+            <w:pPr/>
+            <w:r>
+              <w:t xml:space="preserve">NOT NULL</w:t>
+            </w:r>
+          </w:p>
+        </w:tc>
+      </w:tr>
+      <w:tr>
+        <w:trPr>
+          <w:trHeight w:val="530" w:hRule="atLeast"/>
+        </w:trPr>
+        <w:tc>
+          <w:tcPr>
+            <w:tcW w:w="2000" w:type="dxa"/>
+          </w:tcPr>
+          <w:p>
+            <w:pPr/>
+            <w:r>
+              <w:t xml:space="preserve">created_by</w:t>
+            </w:r>
+          </w:p>
+        </w:tc>
+        <w:tc>
+          <w:tcPr>
+            <w:tcW w:w="2000" w:type="dxa"/>
+          </w:tcPr>
+          <w:p>
+            <w:pPr/>
+            <w:r>
+              <w:t xml:space="preserve">bigint</w:t>
+            </w:r>
+          </w:p>
+        </w:tc>
+        <w:tc>
+          <w:tcPr>
+            <w:tcW w:w="2000" w:type="dxa"/>
+          </w:tcPr>
+          <w:p>
+            <w:pPr/>
+            <w:r>
+              <w:t xml:space="preserve">-</w:t>
+            </w:r>
+          </w:p>
+        </w:tc>
+        <w:tc>
+          <w:tcPr>
+            <w:tcW w:w="2000" w:type="dxa"/>
+          </w:tcPr>
+          <w:p>
+            <w:pPr/>
+            <w:r>
+              <w:t xml:space="preserve">NOT NULL</w:t>
+            </w:r>
+          </w:p>
+        </w:tc>
+      </w:tr>
+      <w:tr>
+        <w:trPr>
+          <w:trHeight w:val="530" w:hRule="atLeast"/>
+        </w:trPr>
+        <w:tc>
+          <w:tcPr>
+            <w:tcW w:w="2000" w:type="dxa"/>
+          </w:tcPr>
+          <w:p>
+            <w:pPr/>
+            <w:r>
+              <w:t xml:space="preserve">updated_at</w:t>
+            </w:r>
+          </w:p>
+        </w:tc>
+        <w:tc>
+          <w:tcPr>
+            <w:tcW w:w="2000" w:type="dxa"/>
+          </w:tcPr>
+          <w:p>
+            <w:pPr/>
+            <w:r>
+              <w:t xml:space="preserve">datetime2</w:t>
+            </w:r>
+          </w:p>
+        </w:tc>
+        <w:tc>
+          <w:tcPr>
+            <w:tcW w:w="2000" w:type="dxa"/>
+          </w:tcPr>
+          <w:p>
+            <w:pPr/>
+            <w:r>
+              <w:t xml:space="preserve">(6)</w:t>
+            </w:r>
+          </w:p>
+        </w:tc>
+        <w:tc>
+          <w:tcPr>
+            <w:tcW w:w="2000" w:type="dxa"/>
+          </w:tcPr>
+          <w:p>
+            <w:pPr/>
+            <w:r>
+              <w:t xml:space="preserve">IS NULL</w:t>
+            </w:r>
+          </w:p>
+        </w:tc>
+      </w:tr>
+      <w:tr>
+        <w:trPr>
+          <w:trHeight w:val="530" w:hRule="atLeast"/>
+        </w:trPr>
+        <w:tc>
+          <w:tcPr>
+            <w:tcW w:w="2000" w:type="dxa"/>
+          </w:tcPr>
+          <w:p>
+            <w:pPr/>
+            <w:r>
+              <w:t xml:space="preserve">updated_by</w:t>
+            </w:r>
+          </w:p>
+        </w:tc>
+        <w:tc>
+          <w:tcPr>
+            <w:tcW w:w="2000" w:type="dxa"/>
+          </w:tcPr>
+          <w:p>
+            <w:pPr/>
+            <w:r>
+              <w:t xml:space="preserve">bigint</w:t>
+            </w:r>
+          </w:p>
+        </w:tc>
+        <w:tc>
+          <w:tcPr>
+            <w:tcW w:w="2000" w:type="dxa"/>
+          </w:tcPr>
+          <w:p>
+            <w:pPr/>
+            <w:r>
+              <w:t xml:space="preserve">-</w:t>
+            </w:r>
+          </w:p>
+        </w:tc>
+        <w:tc>
+          <w:tcPr>
+            <w:tcW w:w="2000" w:type="dxa"/>
+          </w:tcPr>
+          <w:p>
+            <w:pPr/>
+            <w:r>
+              <w:t xml:space="preserve">IS NULL</w:t>
+            </w:r>
+          </w:p>
+        </w:tc>
+      </w:tr>
+      <w:tr>
+        <w:trPr>
+          <w:trHeight w:val="530" w:hRule="atLeast"/>
+        </w:trPr>
+        <w:tc>
+          <w:tcPr>
+            <w:tcW w:w="2000" w:type="dxa"/>
+          </w:tcPr>
+          <w:p>
+            <w:pPr/>
+            <w:r>
+              <w:t xml:space="preserve">version</w:t>
+            </w:r>
+          </w:p>
+        </w:tc>
+        <w:tc>
+          <w:tcPr>
+            <w:tcW w:w="2000" w:type="dxa"/>
+          </w:tcPr>
+          <w:p>
+            <w:pPr/>
+            <w:r>
+              <w:t xml:space="preserve">int</w:t>
+            </w:r>
+          </w:p>
+        </w:tc>
+        <w:tc>
+          <w:tcPr>
+            <w:tcW w:w="2000" w:type="dxa"/>
+          </w:tcPr>
+          <w:p>
+            <w:pPr/>
+            <w:r>
+              <w:t xml:space="preserve">-</w:t>
+            </w:r>
+          </w:p>
+        </w:tc>
+        <w:tc>
+          <w:tcPr>
+            <w:tcW w:w="2000" w:type="dxa"/>
+          </w:tcPr>
+          <w:p>
+            <w:pPr/>
+            <w:r>
+              <w:t xml:space="preserve">NOT NULL</w:t>
+            </w:r>
+          </w:p>
+        </w:tc>
+      </w:tr>
+    </w:tbl>
+    <w:p/>
+    <w:p>
+      <w:pPr/>
+      <w:r>
+        <w:t xml:space="preserve">Table Name: inv_stocktake</w:t>
+      </w:r>
+    </w:p>
+    <w:p>
+      <w:pPr/>
+      <w:r>
+        <w:t xml:space="preserve">Primary Key: id</w:t>
+      </w:r>
+    </w:p>
+    <w:p>
+      <w:pPr/>
+      <w:r>
+        <w:t xml:space="preserve">This table stores company-scoped stocktake headers, their count scope, snapshot marker and approval and posting state.</w:t>
+      </w:r>
+    </w:p>
+    <w:tbl>
+      <w:tblPr>
+        <w:tblStyle w:val="TableGrid"/>
+        <w:tblW w:w="8000" w:type="dxa"/>
+        <w:jc w:val="left"/>
+        <w:tblBorders>
+          <w:top w:val="single" w:color="000000" w:sz="4" w:space="0"/>
+          <w:left w:val="single" w:color="000000" w:sz="4" w:space="0"/>
+          <w:bottom w:val="single" w:color="000000" w:sz="4" w:space="0"/>
+          <w:right w:val="single" w:color="000000" w:sz="4" w:space="0"/>
+          <w:insideH w:val="single" w:color="000000" w:sz="4" w:space="0"/>
+          <w:insideV w:val="single" w:color="000000" w:sz="4" w:space="0"/>
+        </w:tblBorders>
+        <w:tblLayout w:type="fixed"/>
+        <w:tblCellMar>
+          <w:top w:w="100" w:type="dxa"/>
+          <w:left w:w="100" w:type="dxa"/>
+          <w:bottom w:w="100" w:type="dxa"/>
+          <w:right w:w="100" w:type="dxa"/>
+        </w:tblCellMar>
+      </w:tblPr>
+      <w:tblGrid>
+        <w:gridCol w:w="2000"/>
+        <w:gridCol w:w="2000"/>
+        <w:gridCol w:w="2000"/>
+        <w:gridCol w:w="2000"/>
+      </w:tblGrid>
+      <w:tr>
+        <w:trPr>
+          <w:trHeight w:val="530" w:hRule="atLeast"/>
+        </w:trPr>
+        <w:tc>
+          <w:tcPr>
+            <w:tcW w:w="2000" w:type="dxa"/>
+          </w:tcPr>
+          <w:p>
+            <w:pPr>
+              <w:jc w:val="center"/>
+            </w:pPr>
+            <w:r>
+              <w:rPr>
+                <w:b/>
+              </w:rPr>
+              <w:t xml:space="preserve">Name of Attribute</w:t>
+            </w:r>
+          </w:p>
+        </w:tc>
+        <w:tc>
+          <w:tcPr>
+            <w:tcW w:w="2000" w:type="dxa"/>
+          </w:tcPr>
+          <w:p>
+            <w:pPr>
+              <w:jc w:val="center"/>
+            </w:pPr>
+            <w:r>
+              <w:rPr>
+                <w:b/>
+              </w:rPr>
+              <w:t xml:space="preserve">Data Type</w:t>
+            </w:r>
+          </w:p>
+        </w:tc>
+        <w:tc>
+          <w:tcPr>
+            <w:tcW w:w="2000" w:type="dxa"/>
+          </w:tcPr>
+          <w:p>
+            <w:pPr>
+              <w:jc w:val="center"/>
+            </w:pPr>
+            <w:r>
+              <w:rPr>
+                <w:b/>
+              </w:rPr>
+              <w:t xml:space="preserve">Size</w:t>
+            </w:r>
+          </w:p>
+        </w:tc>
+        <w:tc>
+          <w:tcPr>
+            <w:tcW w:w="2000" w:type="dxa"/>
+          </w:tcPr>
+          <w:p>
+            <w:pPr>
+              <w:jc w:val="center"/>
+            </w:pPr>
+            <w:r>
+              <w:rPr>
+                <w:b/>
+              </w:rPr>
+              <w:t xml:space="preserve">PK/FK/IS NULL/ NOT NULL</w:t>
+            </w:r>
+          </w:p>
+        </w:tc>
+      </w:tr>
+      <w:tr>
+        <w:trPr>
+          <w:trHeight w:val="530" w:hRule="atLeast"/>
+        </w:trPr>
+        <w:tc>
+          <w:tcPr>
+            <w:tcW w:w="2000" w:type="dxa"/>
+          </w:tcPr>
+          <w:p>
+            <w:pPr/>
+            <w:r>
+              <w:t xml:space="preserve">id</w:t>
+            </w:r>
+          </w:p>
+        </w:tc>
+        <w:tc>
+          <w:tcPr>
+            <w:tcW w:w="2000" w:type="dxa"/>
+          </w:tcPr>
+          <w:p>
+            <w:pPr/>
+            <w:r>
+              <w:t xml:space="preserve">bigint</w:t>
+            </w:r>
+          </w:p>
+        </w:tc>
+        <w:tc>
+          <w:tcPr>
+            <w:tcW w:w="2000" w:type="dxa"/>
+          </w:tcPr>
+          <w:p>
+            <w:pPr/>
+            <w:r>
+              <w:t xml:space="preserve">-</w:t>
+            </w:r>
+          </w:p>
+        </w:tc>
+        <w:tc>
+          <w:tcPr>
+            <w:tcW w:w="2000" w:type="dxa"/>
+          </w:tcPr>
+          <w:p>
+            <w:pPr/>
+            <w:r>
+              <w:t xml:space="preserve">PK, NOT NULL</w:t>
+            </w:r>
+          </w:p>
+        </w:tc>
+      </w:tr>
+      <w:tr>
+        <w:trPr>
+          <w:trHeight w:val="530" w:hRule="atLeast"/>
+        </w:trPr>
+        <w:tc>
+          <w:tcPr>
+            <w:tcW w:w="2000" w:type="dxa"/>
+          </w:tcPr>
+          <w:p>
+            <w:pPr/>
+            <w:r>
+              <w:t xml:space="preserve">document_no</w:t>
+            </w:r>
+          </w:p>
+        </w:tc>
+        <w:tc>
+          <w:tcPr>
+            <w:tcW w:w="2000" w:type="dxa"/>
+          </w:tcPr>
+          <w:p>
+            <w:pPr/>
+            <w:r>
+              <w:t xml:space="preserve">varchar</w:t>
+            </w:r>
+          </w:p>
+        </w:tc>
+        <w:tc>
+          <w:tcPr>
+            <w:tcW w:w="2000" w:type="dxa"/>
+          </w:tcPr>
+          <w:p>
+            <w:pPr/>
+            <w:r>
+              <w:t xml:space="preserve">30</w:t>
+            </w:r>
+          </w:p>
+        </w:tc>
+        <w:tc>
+          <w:tcPr>
+            <w:tcW w:w="2000" w:type="dxa"/>
+          </w:tcPr>
+          <w:p>
+            <w:pPr/>
+            <w:r>
+              <w:t xml:space="preserve">NOT NULL</w:t>
+            </w:r>
+          </w:p>
+        </w:tc>
+      </w:tr>
+      <w:tr>
+        <w:trPr>
+          <w:trHeight w:val="530" w:hRule="atLeast"/>
+        </w:trPr>
+        <w:tc>
+          <w:tcPr>
+            <w:tcW w:w="2000" w:type="dxa"/>
+          </w:tcPr>
+          <w:p>
+            <w:pPr/>
+            <w:r>
+              <w:t xml:space="preserve">business_date</w:t>
+            </w:r>
+          </w:p>
+        </w:tc>
+        <w:tc>
+          <w:tcPr>
+            <w:tcW w:w="2000" w:type="dxa"/>
+          </w:tcPr>
+          <w:p>
+            <w:pPr/>
+            <w:r>
+              <w:t xml:space="preserve">date</w:t>
+            </w:r>
+          </w:p>
+        </w:tc>
+        <w:tc>
+          <w:tcPr>
+            <w:tcW w:w="2000" w:type="dxa"/>
+          </w:tcPr>
+          <w:p>
+            <w:pPr/>
+            <w:r>
+              <w:t xml:space="preserve">-</w:t>
+            </w:r>
+          </w:p>
+        </w:tc>
+        <w:tc>
+          <w:tcPr>
+            <w:tcW w:w="2000" w:type="dxa"/>
+          </w:tcPr>
+          <w:p>
+            <w:pPr/>
+            <w:r>
+              <w:t xml:space="preserve">NOT NULL</w:t>
+            </w:r>
+          </w:p>
+        </w:tc>
+      </w:tr>
+      <w:tr>
+        <w:trPr>
+          <w:trHeight w:val="530" w:hRule="atLeast"/>
+        </w:trPr>
+        <w:tc>
+          <w:tcPr>
+            <w:tcW w:w="2000" w:type="dxa"/>
+          </w:tcPr>
+          <w:p>
+            <w:pPr/>
+            <w:r>
+              <w:t xml:space="preserve">status</w:t>
+            </w:r>
+          </w:p>
+        </w:tc>
+        <w:tc>
+          <w:tcPr>
+            <w:tcW w:w="2000" w:type="dxa"/>
+          </w:tcPr>
+          <w:p>
+            <w:pPr/>
+            <w:r>
+              <w:t xml:space="preserve">varchar</w:t>
+            </w:r>
+          </w:p>
+        </w:tc>
+        <w:tc>
+          <w:tcPr>
+            <w:tcW w:w="2000" w:type="dxa"/>
+          </w:tcPr>
+          <w:p>
+            <w:pPr/>
+            <w:r>
+              <w:t xml:space="preserve">30</w:t>
+            </w:r>
+          </w:p>
+        </w:tc>
+        <w:tc>
+          <w:tcPr>
+            <w:tcW w:w="2000" w:type="dxa"/>
+          </w:tcPr>
+          <w:p>
+            <w:pPr/>
+            <w:r>
+              <w:t xml:space="preserve">NOT NULL</w:t>
+            </w:r>
+          </w:p>
+        </w:tc>
+      </w:tr>
+      <w:tr>
+        <w:trPr>
+          <w:trHeight w:val="530" w:hRule="atLeast"/>
+        </w:trPr>
+        <w:tc>
+          <w:tcPr>
+            <w:tcW w:w="2000" w:type="dxa"/>
+          </w:tcPr>
+          <w:p>
+            <w:pPr/>
+            <w:r>
+              <w:t xml:space="preserve">scope_json</w:t>
+            </w:r>
+          </w:p>
+        </w:tc>
+        <w:tc>
+          <w:tcPr>
+            <w:tcW w:w="2000" w:type="dxa"/>
+          </w:tcPr>
+          <w:p>
+            <w:pPr/>
+            <w:r>
+              <w:t xml:space="preserve">nvarchar</w:t>
+            </w:r>
+          </w:p>
+        </w:tc>
+        <w:tc>
+          <w:tcPr>
+            <w:tcW w:w="2000" w:type="dxa"/>
+          </w:tcPr>
+          <w:p>
+            <w:pPr/>
+            <w:r>
+              <w:t xml:space="preserve">MAX</w:t>
+            </w:r>
+          </w:p>
+        </w:tc>
+        <w:tc>
+          <w:tcPr>
+            <w:tcW w:w="2000" w:type="dxa"/>
+          </w:tcPr>
+          <w:p>
+            <w:pPr/>
+            <w:r>
+              <w:t xml:space="preserve">NOT NULL</w:t>
+            </w:r>
+          </w:p>
+        </w:tc>
+      </w:tr>
+      <w:tr>
+        <w:trPr>
+          <w:trHeight w:val="530" w:hRule="atLeast"/>
+        </w:trPr>
+        <w:tc>
+          <w:tcPr>
+            <w:tcW w:w="2000" w:type="dxa"/>
+          </w:tcPr>
+          <w:p>
+            <w:pPr/>
+            <w:r>
+              <w:t xml:space="preserve">snapshot_at</w:t>
+            </w:r>
+          </w:p>
+        </w:tc>
+        <w:tc>
+          <w:tcPr>
+            <w:tcW w:w="2000" w:type="dxa"/>
+          </w:tcPr>
+          <w:p>
+            <w:pPr/>
+            <w:r>
+              <w:t xml:space="preserve">datetime2</w:t>
+            </w:r>
+          </w:p>
+        </w:tc>
+        <w:tc>
+          <w:tcPr>
+            <w:tcW w:w="2000" w:type="dxa"/>
+          </w:tcPr>
+          <w:p>
+            <w:pPr/>
+            <w:r>
+              <w:t xml:space="preserve">(6)</w:t>
+            </w:r>
+          </w:p>
+        </w:tc>
+        <w:tc>
+          <w:tcPr>
+            <w:tcW w:w="2000" w:type="dxa"/>
+          </w:tcPr>
+          <w:p>
+            <w:pPr/>
+            <w:r>
+              <w:t xml:space="preserve">NOT NULL</w:t>
+            </w:r>
+          </w:p>
+        </w:tc>
+      </w:tr>
+      <w:tr>
+        <w:trPr>
+          <w:trHeight w:val="530" w:hRule="atLeast"/>
+        </w:trPr>
+        <w:tc>
+          <w:tcPr>
+            <w:tcW w:w="2000" w:type="dxa"/>
+          </w:tcPr>
+          <w:p>
+            <w:pPr/>
+            <w:r>
+              <w:t xml:space="preserve">snapshot_movement_id</w:t>
+            </w:r>
+          </w:p>
+        </w:tc>
+        <w:tc>
+          <w:tcPr>
+            <w:tcW w:w="2000" w:type="dxa"/>
+          </w:tcPr>
+          <w:p>
+            <w:pPr/>
+            <w:r>
+              <w:t xml:space="preserve">bigint</w:t>
+            </w:r>
+          </w:p>
+        </w:tc>
+        <w:tc>
+          <w:tcPr>
+            <w:tcW w:w="2000" w:type="dxa"/>
+          </w:tcPr>
+          <w:p>
+            <w:pPr/>
+            <w:r>
+              <w:t xml:space="preserve">-</w:t>
+            </w:r>
+          </w:p>
+        </w:tc>
+        <w:tc>
+          <w:tcPr>
+            <w:tcW w:w="2000" w:type="dxa"/>
+          </w:tcPr>
+          <w:p>
+            <w:pPr/>
+            <w:r>
+              <w:t xml:space="preserve">IS NULL</w:t>
+            </w:r>
+          </w:p>
+        </w:tc>
+      </w:tr>
+      <w:tr>
+        <w:trPr>
+          <w:trHeight w:val="530" w:hRule="atLeast"/>
+        </w:trPr>
+        <w:tc>
+          <w:tcPr>
+            <w:tcW w:w="2000" w:type="dxa"/>
+          </w:tcPr>
+          <w:p>
+            <w:pPr/>
+            <w:r>
+              <w:t xml:space="preserve">remark</w:t>
+            </w:r>
+          </w:p>
+        </w:tc>
+        <w:tc>
+          <w:tcPr>
+            <w:tcW w:w="2000" w:type="dxa"/>
+          </w:tcPr>
+          <w:p>
+            <w:pPr/>
+            <w:r>
+              <w:t xml:space="preserve">nvarchar</w:t>
+            </w:r>
+          </w:p>
+        </w:tc>
+        <w:tc>
+          <w:tcPr>
+            <w:tcW w:w="2000" w:type="dxa"/>
+          </w:tcPr>
+          <w:p>
+            <w:pPr/>
+            <w:r>
+              <w:t xml:space="preserve">1000</w:t>
+            </w:r>
+          </w:p>
+        </w:tc>
+        <w:tc>
+          <w:tcPr>
+            <w:tcW w:w="2000" w:type="dxa"/>
+          </w:tcPr>
+          <w:p>
+            <w:pPr/>
+            <w:r>
+              <w:t xml:space="preserve">IS NULL</w:t>
+            </w:r>
+          </w:p>
+        </w:tc>
+      </w:tr>
+      <w:tr>
+        <w:trPr>
+          <w:trHeight w:val="530" w:hRule="atLeast"/>
+        </w:trPr>
+        <w:tc>
+          <w:tcPr>
+            <w:tcW w:w="2000" w:type="dxa"/>
+          </w:tcPr>
+          <w:p>
+            <w:pPr/>
+            <w:r>
+              <w:t xml:space="preserve">custom_fields</w:t>
+            </w:r>
+          </w:p>
+        </w:tc>
+        <w:tc>
+          <w:tcPr>
+            <w:tcW w:w="2000" w:type="dxa"/>
+          </w:tcPr>
+          <w:p>
+            <w:pPr/>
+            <w:r>
+              <w:t xml:space="preserve">nvarchar</w:t>
+            </w:r>
+          </w:p>
+        </w:tc>
+        <w:tc>
+          <w:tcPr>
+            <w:tcW w:w="2000" w:type="dxa"/>
+          </w:tcPr>
+          <w:p>
+            <w:pPr/>
+            <w:r>
+              <w:t xml:space="preserve">MAX</w:t>
+            </w:r>
+          </w:p>
+        </w:tc>
+        <w:tc>
+          <w:tcPr>
+            <w:tcW w:w="2000" w:type="dxa"/>
+          </w:tcPr>
+          <w:p>
+            <w:pPr/>
+            <w:r>
+              <w:t xml:space="preserve">IS NULL</w:t>
+            </w:r>
+          </w:p>
+        </w:tc>
+      </w:tr>
+      <w:tr>
+        <w:trPr>
+          <w:trHeight w:val="530" w:hRule="atLeast"/>
+        </w:trPr>
+        <w:tc>
+          <w:tcPr>
+            <w:tcW w:w="2000" w:type="dxa"/>
+          </w:tcPr>
+          <w:p>
+            <w:pPr/>
+            <w:r>
+              <w:t xml:space="preserve">posted_at</w:t>
+            </w:r>
+          </w:p>
+        </w:tc>
+        <w:tc>
+          <w:tcPr>
+            <w:tcW w:w="2000" w:type="dxa"/>
+          </w:tcPr>
+          <w:p>
+            <w:pPr/>
+            <w:r>
+              <w:t xml:space="preserve">datetime2</w:t>
+            </w:r>
+          </w:p>
+        </w:tc>
+        <w:tc>
+          <w:tcPr>
+            <w:tcW w:w="2000" w:type="dxa"/>
+          </w:tcPr>
+          <w:p>
+            <w:pPr/>
+            <w:r>
+              <w:t xml:space="preserve">(6)</w:t>
+            </w:r>
+          </w:p>
+        </w:tc>
+        <w:tc>
+          <w:tcPr>
+            <w:tcW w:w="2000" w:type="dxa"/>
+          </w:tcPr>
+          <w:p>
+            <w:pPr/>
+            <w:r>
+              <w:t xml:space="preserve">IS NULL</w:t>
+            </w:r>
+          </w:p>
+        </w:tc>
+      </w:tr>
+      <w:tr>
+        <w:trPr>
+          <w:trHeight w:val="530" w:hRule="atLeast"/>
+        </w:trPr>
+        <w:tc>
+          <w:tcPr>
+            <w:tcW w:w="2000" w:type="dxa"/>
+          </w:tcPr>
+          <w:p>
+            <w:pPr/>
+            <w:r>
+              <w:t xml:space="preserve">is_deleted</w:t>
+            </w:r>
+          </w:p>
+        </w:tc>
+        <w:tc>
+          <w:tcPr>
+            <w:tcW w:w="2000" w:type="dxa"/>
+          </w:tcPr>
+          <w:p>
+            <w:pPr/>
+            <w:r>
+              <w:t xml:space="preserve">bit</w:t>
+            </w:r>
+          </w:p>
+        </w:tc>
+        <w:tc>
+          <w:tcPr>
+            <w:tcW w:w="2000" w:type="dxa"/>
+          </w:tcPr>
+          <w:p>
+            <w:pPr/>
+            <w:r>
+              <w:t xml:space="preserve">-</w:t>
+            </w:r>
+          </w:p>
+        </w:tc>
+        <w:tc>
+          <w:tcPr>
+            <w:tcW w:w="2000" w:type="dxa"/>
+          </w:tcPr>
+          <w:p>
+            <w:pPr/>
+            <w:r>
+              <w:t xml:space="preserve">NOT NULL</w:t>
+            </w:r>
+          </w:p>
+        </w:tc>
+      </w:tr>
+      <w:tr>
+        <w:trPr>
+          <w:trHeight w:val="530" w:hRule="atLeast"/>
+        </w:trPr>
+        <w:tc>
+          <w:tcPr>
+            <w:tcW w:w="2000" w:type="dxa"/>
+          </w:tcPr>
+          <w:p>
+            <w:pPr/>
+            <w:r>
+              <w:t xml:space="preserve">deleted_at</w:t>
+            </w:r>
+          </w:p>
+        </w:tc>
+        <w:tc>
+          <w:tcPr>
+            <w:tcW w:w="2000" w:type="dxa"/>
+          </w:tcPr>
+          <w:p>
+            <w:pPr/>
+            <w:r>
+              <w:t xml:space="preserve">datetime2</w:t>
+            </w:r>
+          </w:p>
+        </w:tc>
+        <w:tc>
+          <w:tcPr>
+            <w:tcW w:w="2000" w:type="dxa"/>
+          </w:tcPr>
+          <w:p>
+            <w:pPr/>
+            <w:r>
+              <w:t xml:space="preserve">(6)</w:t>
+            </w:r>
+          </w:p>
+        </w:tc>
+        <w:tc>
+          <w:tcPr>
+            <w:tcW w:w="2000" w:type="dxa"/>
+          </w:tcPr>
+          <w:p>
+            <w:pPr/>
+            <w:r>
+              <w:t xml:space="preserve">IS NULL</w:t>
+            </w:r>
+          </w:p>
+        </w:tc>
+      </w:tr>
+      <w:tr>
+        <w:trPr>
+          <w:trHeight w:val="530" w:hRule="atLeast"/>
+        </w:trPr>
+        <w:tc>
+          <w:tcPr>
+            <w:tcW w:w="2000" w:type="dxa"/>
+          </w:tcPr>
+          <w:p>
+            <w:pPr/>
+            <w:r>
+              <w:t xml:space="preserve">company_id</w:t>
+            </w:r>
+          </w:p>
+        </w:tc>
+        <w:tc>
+          <w:tcPr>
+            <w:tcW w:w="2000" w:type="dxa"/>
+          </w:tcPr>
+          <w:p>
+            <w:pPr/>
+            <w:r>
+              <w:t xml:space="preserve">bigint</w:t>
+            </w:r>
+          </w:p>
+        </w:tc>
+        <w:tc>
+          <w:tcPr>
+            <w:tcW w:w="2000" w:type="dxa"/>
+          </w:tcPr>
+          <w:p>
+            <w:pPr/>
+            <w:r>
+              <w:t xml:space="preserve">-</w:t>
+            </w:r>
+          </w:p>
+        </w:tc>
+        <w:tc>
+          <w:tcPr>
+            <w:tcW w:w="2000" w:type="dxa"/>
+          </w:tcPr>
+          <w:p>
+            <w:pPr/>
+            <w:r>
+              <w:t xml:space="preserve">NOT NULL</w:t>
+            </w:r>
+          </w:p>
+        </w:tc>
+      </w:tr>
+      <w:tr>
+        <w:trPr>
+          <w:trHeight w:val="530" w:hRule="atLeast"/>
+        </w:trPr>
+        <w:tc>
+          <w:tcPr>
+            <w:tcW w:w="2000" w:type="dxa"/>
+          </w:tcPr>
+          <w:p>
+            <w:pPr/>
+            <w:r>
+              <w:t xml:space="preserve">created_at</w:t>
+            </w:r>
+          </w:p>
+        </w:tc>
+        <w:tc>
+          <w:tcPr>
+            <w:tcW w:w="2000" w:type="dxa"/>
+          </w:tcPr>
+          <w:p>
+            <w:pPr/>
+            <w:r>
+              <w:t xml:space="preserve">datetime2</w:t>
+            </w:r>
+          </w:p>
+        </w:tc>
+        <w:tc>
+          <w:tcPr>
+            <w:tcW w:w="2000" w:type="dxa"/>
+          </w:tcPr>
+          <w:p>
+            <w:pPr/>
+            <w:r>
+              <w:t xml:space="preserve">(6)</w:t>
+            </w:r>
+          </w:p>
+        </w:tc>
+        <w:tc>
+          <w:tcPr>
+            <w:tcW w:w="2000" w:type="dxa"/>
+          </w:tcPr>
+          <w:p>
+            <w:pPr/>
+            <w:r>
+              <w:t xml:space="preserve">NOT NULL</w:t>
+            </w:r>
+          </w:p>
+        </w:tc>
+      </w:tr>
+      <w:tr>
+        <w:trPr>
+          <w:trHeight w:val="530" w:hRule="atLeast"/>
+        </w:trPr>
+        <w:tc>
+          <w:tcPr>
+            <w:tcW w:w="2000" w:type="dxa"/>
+          </w:tcPr>
+          <w:p>
+            <w:pPr/>
+            <w:r>
+              <w:t xml:space="preserve">created_by</w:t>
+            </w:r>
+          </w:p>
+        </w:tc>
+        <w:tc>
+          <w:tcPr>
+            <w:tcW w:w="2000" w:type="dxa"/>
+          </w:tcPr>
+          <w:p>
+            <w:pPr/>
+            <w:r>
+              <w:t xml:space="preserve">bigint</w:t>
+            </w:r>
+          </w:p>
+        </w:tc>
+        <w:tc>
+          <w:tcPr>
+            <w:tcW w:w="2000" w:type="dxa"/>
+          </w:tcPr>
+          <w:p>
+            <w:pPr/>
+            <w:r>
+              <w:t xml:space="preserve">-</w:t>
+            </w:r>
+          </w:p>
+        </w:tc>
+        <w:tc>
+          <w:tcPr>
+            <w:tcW w:w="2000" w:type="dxa"/>
+          </w:tcPr>
+          <w:p>
+            <w:pPr/>
+            <w:r>
+              <w:t xml:space="preserve">NOT NULL</w:t>
+            </w:r>
+          </w:p>
+        </w:tc>
+      </w:tr>
+      <w:tr>
+        <w:trPr>
+          <w:trHeight w:val="530" w:hRule="atLeast"/>
+        </w:trPr>
+        <w:tc>
+          <w:tcPr>
+            <w:tcW w:w="2000" w:type="dxa"/>
+          </w:tcPr>
+          <w:p>
+            <w:pPr/>
+            <w:r>
+              <w:t xml:space="preserve">updated_at</w:t>
+            </w:r>
+          </w:p>
+        </w:tc>
+        <w:tc>
+          <w:tcPr>
+            <w:tcW w:w="2000" w:type="dxa"/>
+          </w:tcPr>
+          <w:p>
+            <w:pPr/>
+            <w:r>
+              <w:t xml:space="preserve">datetime2</w:t>
+            </w:r>
+          </w:p>
+        </w:tc>
+        <w:tc>
+          <w:tcPr>
+            <w:tcW w:w="2000" w:type="dxa"/>
+          </w:tcPr>
+          <w:p>
+            <w:pPr/>
+            <w:r>
+              <w:t xml:space="preserve">(6)</w:t>
+            </w:r>
+          </w:p>
+        </w:tc>
+        <w:tc>
+          <w:tcPr>
+            <w:tcW w:w="2000" w:type="dxa"/>
+          </w:tcPr>
+          <w:p>
+            <w:pPr/>
+            <w:r>
+              <w:t xml:space="preserve">IS NULL</w:t>
+            </w:r>
+          </w:p>
+        </w:tc>
+      </w:tr>
+      <w:tr>
+        <w:trPr>
+          <w:trHeight w:val="530" w:hRule="atLeast"/>
+        </w:trPr>
+        <w:tc>
+          <w:tcPr>
+            <w:tcW w:w="2000" w:type="dxa"/>
+          </w:tcPr>
+          <w:p>
+            <w:pPr/>
+            <w:r>
+              <w:t xml:space="preserve">updated_by</w:t>
+            </w:r>
+          </w:p>
+        </w:tc>
+        <w:tc>
+          <w:tcPr>
+            <w:tcW w:w="2000" w:type="dxa"/>
+          </w:tcPr>
+          <w:p>
+            <w:pPr/>
+            <w:r>
+              <w:t xml:space="preserve">bigint</w:t>
+            </w:r>
+          </w:p>
+        </w:tc>
+        <w:tc>
+          <w:tcPr>
+            <w:tcW w:w="2000" w:type="dxa"/>
+          </w:tcPr>
+          <w:p>
+            <w:pPr/>
+            <w:r>
+              <w:t xml:space="preserve">-</w:t>
+            </w:r>
+          </w:p>
+        </w:tc>
+        <w:tc>
+          <w:tcPr>
+            <w:tcW w:w="2000" w:type="dxa"/>
+          </w:tcPr>
+          <w:p>
+            <w:pPr/>
+            <w:r>
+              <w:t xml:space="preserve">IS NULL</w:t>
+            </w:r>
+          </w:p>
+        </w:tc>
+      </w:tr>
+      <w:tr>
+        <w:trPr>
+          <w:trHeight w:val="530" w:hRule="atLeast"/>
+        </w:trPr>
+        <w:tc>
+          <w:tcPr>
+            <w:tcW w:w="2000" w:type="dxa"/>
+          </w:tcPr>
+          <w:p>
+            <w:pPr/>
+            <w:r>
+              <w:t xml:space="preserve">version</w:t>
+            </w:r>
+          </w:p>
+        </w:tc>
+        <w:tc>
+          <w:tcPr>
+            <w:tcW w:w="2000" w:type="dxa"/>
+          </w:tcPr>
+          <w:p>
+            <w:pPr/>
+            <w:r>
+              <w:t xml:space="preserve">int</w:t>
+            </w:r>
+          </w:p>
+        </w:tc>
+        <w:tc>
+          <w:tcPr>
+            <w:tcW w:w="2000" w:type="dxa"/>
+          </w:tcPr>
+          <w:p>
+            <w:pPr/>
+            <w:r>
+              <w:t xml:space="preserve">-</w:t>
+            </w:r>
+          </w:p>
+        </w:tc>
+        <w:tc>
+          <w:tcPr>
+            <w:tcW w:w="2000" w:type="dxa"/>
+          </w:tcPr>
+          <w:p>
+            <w:pPr/>
+            <w:r>
+              <w:t xml:space="preserve">NOT NULL</w:t>
+            </w:r>
+          </w:p>
+        </w:tc>
+      </w:tr>
+    </w:tbl>
+    <w:p/>
+    <w:p>
+      <w:pPr/>
+      <w:r>
+        <w:t xml:space="preserve">Table Name: inv_stocktake_line</w:t>
+      </w:r>
+    </w:p>
+    <w:p>
+      <w:pPr/>
+      <w:r>
+        <w:t xml:space="preserve">Primary Key: id</w:t>
+      </w:r>
+    </w:p>
+    <w:p>
+      <w:pPr/>
+      <w:r>
+        <w:t xml:space="preserve">This table stores the snapshot book quantity and counted quantity of each item, warehouse and location stock key.</w:t>
+      </w:r>
+    </w:p>
+    <w:tbl>
+      <w:tblPr>
+        <w:tblStyle w:val="TableGrid"/>
+        <w:tblW w:w="8000" w:type="dxa"/>
+        <w:jc w:val="left"/>
+        <w:tblBorders>
+          <w:top w:val="single" w:color="000000" w:sz="4" w:space="0"/>
+          <w:left w:val="single" w:color="000000" w:sz="4" w:space="0"/>
+          <w:bottom w:val="single" w:color="000000" w:sz="4" w:space="0"/>
+          <w:right w:val="single" w:color="000000" w:sz="4" w:space="0"/>
+          <w:insideH w:val="single" w:color="000000" w:sz="4" w:space="0"/>
+          <w:insideV w:val="single" w:color="000000" w:sz="4" w:space="0"/>
+        </w:tblBorders>
+        <w:tblLayout w:type="fixed"/>
+        <w:tblCellMar>
+          <w:top w:w="100" w:type="dxa"/>
+          <w:left w:w="100" w:type="dxa"/>
+          <w:bottom w:w="100" w:type="dxa"/>
+          <w:right w:w="100" w:type="dxa"/>
+        </w:tblCellMar>
+      </w:tblPr>
+      <w:tblGrid>
+        <w:gridCol w:w="2000"/>
+        <w:gridCol w:w="2000"/>
+        <w:gridCol w:w="2000"/>
+        <w:gridCol w:w="2000"/>
+      </w:tblGrid>
+      <w:tr>
+        <w:trPr>
+          <w:trHeight w:val="530" w:hRule="atLeast"/>
+        </w:trPr>
+        <w:tc>
+          <w:tcPr>
+            <w:tcW w:w="2000" w:type="dxa"/>
+          </w:tcPr>
+          <w:p>
+            <w:pPr>
+              <w:jc w:val="center"/>
+            </w:pPr>
+            <w:r>
+              <w:rPr>
+                <w:b/>
+              </w:rPr>
+              <w:t xml:space="preserve">Name of Attribute</w:t>
+            </w:r>
+          </w:p>
+        </w:tc>
+        <w:tc>
+          <w:tcPr>
+            <w:tcW w:w="2000" w:type="dxa"/>
+          </w:tcPr>
+          <w:p>
+            <w:pPr>
+              <w:jc w:val="center"/>
+            </w:pPr>
+            <w:r>
+              <w:rPr>
+                <w:b/>
+              </w:rPr>
+              <w:t xml:space="preserve">Data Type</w:t>
+            </w:r>
+          </w:p>
+        </w:tc>
+        <w:tc>
+          <w:tcPr>
+            <w:tcW w:w="2000" w:type="dxa"/>
+          </w:tcPr>
+          <w:p>
+            <w:pPr>
+              <w:jc w:val="center"/>
+            </w:pPr>
+            <w:r>
+              <w:rPr>
+                <w:b/>
+              </w:rPr>
+              <w:t xml:space="preserve">Size</w:t>
+            </w:r>
+          </w:p>
+        </w:tc>
+        <w:tc>
+          <w:tcPr>
+            <w:tcW w:w="2000" w:type="dxa"/>
+          </w:tcPr>
+          <w:p>
+            <w:pPr>
+              <w:jc w:val="center"/>
+            </w:pPr>
+            <w:r>
+              <w:rPr>
+                <w:b/>
+              </w:rPr>
+              <w:t xml:space="preserve">PK/FK/IS NULL/ NOT NULL</w:t>
+            </w:r>
+          </w:p>
+        </w:tc>
+      </w:tr>
+      <w:tr>
+        <w:trPr>
+          <w:trHeight w:val="530" w:hRule="atLeast"/>
+        </w:trPr>
+        <w:tc>
+          <w:tcPr>
+            <w:tcW w:w="2000" w:type="dxa"/>
+          </w:tcPr>
+          <w:p>
+            <w:pPr/>
+            <w:r>
+              <w:t xml:space="preserve">id</w:t>
+            </w:r>
+          </w:p>
+        </w:tc>
+        <w:tc>
+          <w:tcPr>
+            <w:tcW w:w="2000" w:type="dxa"/>
+          </w:tcPr>
+          <w:p>
+            <w:pPr/>
+            <w:r>
+              <w:t xml:space="preserve">bigint</w:t>
+            </w:r>
+          </w:p>
+        </w:tc>
+        <w:tc>
+          <w:tcPr>
+            <w:tcW w:w="2000" w:type="dxa"/>
+          </w:tcPr>
+          <w:p>
+            <w:pPr/>
+            <w:r>
+              <w:t xml:space="preserve">-</w:t>
+            </w:r>
+          </w:p>
+        </w:tc>
+        <w:tc>
+          <w:tcPr>
+            <w:tcW w:w="2000" w:type="dxa"/>
+          </w:tcPr>
+          <w:p>
+            <w:pPr/>
+            <w:r>
+              <w:t xml:space="preserve">PK, NOT NULL</w:t>
+            </w:r>
+          </w:p>
+        </w:tc>
+      </w:tr>
+      <w:tr>
+        <w:trPr>
+          <w:trHeight w:val="530" w:hRule="atLeast"/>
+        </w:trPr>
+        <w:tc>
+          <w:tcPr>
+            <w:tcW w:w="2000" w:type="dxa"/>
+          </w:tcPr>
+          <w:p>
+            <w:pPr/>
+            <w:r>
+              <w:t xml:space="preserve">stocktake_id</w:t>
+            </w:r>
+          </w:p>
+        </w:tc>
+        <w:tc>
+          <w:tcPr>
+            <w:tcW w:w="2000" w:type="dxa"/>
+          </w:tcPr>
+          <w:p>
+            <w:pPr/>
+            <w:r>
+              <w:t xml:space="preserve">bigint</w:t>
+            </w:r>
+          </w:p>
+        </w:tc>
+        <w:tc>
+          <w:tcPr>
+            <w:tcW w:w="2000" w:type="dxa"/>
+          </w:tcPr>
+          <w:p>
+            <w:pPr/>
+            <w:r>
+              <w:t xml:space="preserve">-</w:t>
+            </w:r>
+          </w:p>
+        </w:tc>
+        <w:tc>
+          <w:tcPr>
+            <w:tcW w:w="2000" w:type="dxa"/>
+          </w:tcPr>
+          <w:p>
+            <w:pPr/>
+            <w:r>
+              <w:t xml:space="preserve">FK, NOT NULL</w:t>
+            </w:r>
+          </w:p>
+        </w:tc>
+      </w:tr>
+      <w:tr>
+        <w:trPr>
+          <w:trHeight w:val="530" w:hRule="atLeast"/>
+        </w:trPr>
+        <w:tc>
+          <w:tcPr>
+            <w:tcW w:w="2000" w:type="dxa"/>
+          </w:tcPr>
+          <w:p>
+            <w:pPr/>
+            <w:r>
+              <w:t xml:space="preserve">line_no</w:t>
+            </w:r>
+          </w:p>
+        </w:tc>
+        <w:tc>
+          <w:tcPr>
+            <w:tcW w:w="2000" w:type="dxa"/>
+          </w:tcPr>
+          <w:p>
+            <w:pPr/>
+            <w:r>
+              <w:t xml:space="preserve">int</w:t>
+            </w:r>
+          </w:p>
+        </w:tc>
+        <w:tc>
+          <w:tcPr>
+            <w:tcW w:w="2000" w:type="dxa"/>
+          </w:tcPr>
+          <w:p>
+            <w:pPr/>
+            <w:r>
+              <w:t xml:space="preserve">-</w:t>
+            </w:r>
+          </w:p>
+        </w:tc>
+        <w:tc>
+          <w:tcPr>
+            <w:tcW w:w="2000" w:type="dxa"/>
+          </w:tcPr>
+          <w:p>
+            <w:pPr/>
+            <w:r>
+              <w:t xml:space="preserve">NOT NULL</w:t>
+            </w:r>
+          </w:p>
+        </w:tc>
+      </w:tr>
+      <w:tr>
+        <w:trPr>
+          <w:trHeight w:val="530" w:hRule="atLeast"/>
+        </w:trPr>
+        <w:tc>
+          <w:tcPr>
+            <w:tcW w:w="2000" w:type="dxa"/>
+          </w:tcPr>
+          <w:p>
+            <w:pPr/>
+            <w:r>
+              <w:t xml:space="preserve">item_id</w:t>
+            </w:r>
+          </w:p>
+        </w:tc>
+        <w:tc>
+          <w:tcPr>
+            <w:tcW w:w="2000" w:type="dxa"/>
+          </w:tcPr>
+          <w:p>
+            <w:pPr/>
+            <w:r>
+              <w:t xml:space="preserve">bigint</w:t>
+            </w:r>
+          </w:p>
+        </w:tc>
+        <w:tc>
+          <w:tcPr>
+            <w:tcW w:w="2000" w:type="dxa"/>
+          </w:tcPr>
+          <w:p>
+            <w:pPr/>
+            <w:r>
+              <w:t xml:space="preserve">-</w:t>
+            </w:r>
+          </w:p>
+        </w:tc>
+        <w:tc>
+          <w:tcPr>
+            <w:tcW w:w="2000" w:type="dxa"/>
+          </w:tcPr>
+          <w:p>
+            <w:pPr/>
+            <w:r>
+              <w:t xml:space="preserve">NOT NULL</w:t>
+            </w:r>
+          </w:p>
+        </w:tc>
+      </w:tr>
+      <w:tr>
+        <w:trPr>
+          <w:trHeight w:val="530" w:hRule="atLeast"/>
+        </w:trPr>
+        <w:tc>
+          <w:tcPr>
+            <w:tcW w:w="2000" w:type="dxa"/>
+          </w:tcPr>
+          <w:p>
+            <w:pPr/>
+            <w:r>
+              <w:t xml:space="preserve">warehouse_id</w:t>
+            </w:r>
+          </w:p>
+        </w:tc>
+        <w:tc>
+          <w:tcPr>
+            <w:tcW w:w="2000" w:type="dxa"/>
+          </w:tcPr>
+          <w:p>
+            <w:pPr/>
+            <w:r>
+              <w:t xml:space="preserve">bigint</w:t>
+            </w:r>
+          </w:p>
+        </w:tc>
+        <w:tc>
+          <w:tcPr>
+            <w:tcW w:w="2000" w:type="dxa"/>
+          </w:tcPr>
+          <w:p>
+            <w:pPr/>
+            <w:r>
+              <w:t xml:space="preserve">-</w:t>
+            </w:r>
+          </w:p>
+        </w:tc>
+        <w:tc>
+          <w:tcPr>
+            <w:tcW w:w="2000" w:type="dxa"/>
+          </w:tcPr>
+          <w:p>
+            <w:pPr/>
+            <w:r>
+              <w:t xml:space="preserve">NOT NULL</w:t>
+            </w:r>
+          </w:p>
+        </w:tc>
+      </w:tr>
+      <w:tr>
+        <w:trPr>
+          <w:trHeight w:val="530" w:hRule="atLeast"/>
+        </w:trPr>
+        <w:tc>
+          <w:tcPr>
+            <w:tcW w:w="2000" w:type="dxa"/>
+          </w:tcPr>
+          <w:p>
+            <w:pPr/>
+            <w:r>
+              <w:t xml:space="preserve">location_id</w:t>
+            </w:r>
+          </w:p>
+        </w:tc>
+        <w:tc>
+          <w:tcPr>
+            <w:tcW w:w="2000" w:type="dxa"/>
+          </w:tcPr>
+          <w:p>
+            <w:pPr/>
+            <w:r>
+              <w:t xml:space="preserve">bigint</w:t>
+            </w:r>
+          </w:p>
+        </w:tc>
+        <w:tc>
+          <w:tcPr>
+            <w:tcW w:w="2000" w:type="dxa"/>
+          </w:tcPr>
+          <w:p>
+            <w:pPr/>
+            <w:r>
+              <w:t xml:space="preserve">-</w:t>
+            </w:r>
+          </w:p>
+        </w:tc>
+        <w:tc>
+          <w:tcPr>
+            <w:tcW w:w="2000" w:type="dxa"/>
+          </w:tcPr>
+          <w:p>
+            <w:pPr/>
+            <w:r>
+              <w:t xml:space="preserve">IS NULL</w:t>
+            </w:r>
+          </w:p>
+        </w:tc>
+      </w:tr>
+      <w:tr>
+        <w:trPr>
+          <w:trHeight w:val="530" w:hRule="atLeast"/>
+        </w:trPr>
+        <w:tc>
+          <w:tcPr>
+            <w:tcW w:w="2000" w:type="dxa"/>
+          </w:tcPr>
+          <w:p>
+            <w:pPr/>
+            <w:r>
+              <w:t xml:space="preserve">tracking_mode</w:t>
+            </w:r>
+          </w:p>
+        </w:tc>
+        <w:tc>
+          <w:tcPr>
+            <w:tcW w:w="2000" w:type="dxa"/>
+          </w:tcPr>
+          <w:p>
+            <w:pPr/>
+            <w:r>
+              <w:t xml:space="preserve">varchar</w:t>
+            </w:r>
+          </w:p>
+        </w:tc>
+        <w:tc>
+          <w:tcPr>
+            <w:tcW w:w="2000" w:type="dxa"/>
+          </w:tcPr>
+          <w:p>
+            <w:pPr/>
+            <w:r>
+              <w:t xml:space="preserve">10</w:t>
+            </w:r>
+          </w:p>
+        </w:tc>
+        <w:tc>
+          <w:tcPr>
+            <w:tcW w:w="2000" w:type="dxa"/>
+          </w:tcPr>
+          <w:p>
+            <w:pPr/>
+            <w:r>
+              <w:t xml:space="preserve">NOT NULL</w:t>
+            </w:r>
+          </w:p>
+        </w:tc>
+      </w:tr>
+      <w:tr>
+        <w:trPr>
+          <w:trHeight w:val="530" w:hRule="atLeast"/>
+        </w:trPr>
+        <w:tc>
+          <w:tcPr>
+            <w:tcW w:w="2000" w:type="dxa"/>
+          </w:tcPr>
+          <w:p>
+            <w:pPr/>
+            <w:r>
+              <w:t xml:space="preserve">book_quantity</w:t>
+            </w:r>
+          </w:p>
+        </w:tc>
+        <w:tc>
+          <w:tcPr>
+            <w:tcW w:w="2000" w:type="dxa"/>
+          </w:tcPr>
+          <w:p>
+            <w:pPr/>
+            <w:r>
+              <w:t xml:space="preserve">decimal</w:t>
+            </w:r>
+          </w:p>
+        </w:tc>
+        <w:tc>
+          <w:tcPr>
+            <w:tcW w:w="2000" w:type="dxa"/>
+          </w:tcPr>
+          <w:p>
+            <w:pPr/>
+            <w:r>
+              <w:t xml:space="preserve">(19,6)</w:t>
+            </w:r>
+          </w:p>
+        </w:tc>
+        <w:tc>
+          <w:tcPr>
+            <w:tcW w:w="2000" w:type="dxa"/>
+          </w:tcPr>
+          <w:p>
+            <w:pPr/>
+            <w:r>
+              <w:t xml:space="preserve">NOT NULL</w:t>
+            </w:r>
+          </w:p>
+        </w:tc>
+      </w:tr>
+      <w:tr>
+        <w:trPr>
+          <w:trHeight w:val="530" w:hRule="atLeast"/>
+        </w:trPr>
+        <w:tc>
+          <w:tcPr>
+            <w:tcW w:w="2000" w:type="dxa"/>
+          </w:tcPr>
+          <w:p>
+            <w:pPr/>
+            <w:r>
+              <w:t xml:space="preserve">counted_quantity</w:t>
+            </w:r>
+          </w:p>
+        </w:tc>
+        <w:tc>
+          <w:tcPr>
+            <w:tcW w:w="2000" w:type="dxa"/>
+          </w:tcPr>
+          <w:p>
+            <w:pPr/>
+            <w:r>
+              <w:t xml:space="preserve">decimal</w:t>
+            </w:r>
+          </w:p>
+        </w:tc>
+        <w:tc>
+          <w:tcPr>
+            <w:tcW w:w="2000" w:type="dxa"/>
+          </w:tcPr>
+          <w:p>
+            <w:pPr/>
+            <w:r>
+              <w:t xml:space="preserve">(19,6)</w:t>
+            </w:r>
+          </w:p>
+        </w:tc>
+        <w:tc>
+          <w:tcPr>
+            <w:tcW w:w="2000" w:type="dxa"/>
+          </w:tcPr>
+          <w:p>
+            <w:pPr/>
+            <w:r>
+              <w:t xml:space="preserve">IS NULL</w:t>
+            </w:r>
+          </w:p>
+        </w:tc>
+      </w:tr>
+      <w:tr>
+        <w:trPr>
+          <w:trHeight w:val="530" w:hRule="atLeast"/>
+        </w:trPr>
+        <w:tc>
+          <w:tcPr>
+            <w:tcW w:w="2000" w:type="dxa"/>
+          </w:tcPr>
+          <w:p>
+            <w:pPr/>
+            <w:r>
+              <w:t xml:space="preserve">is_added</w:t>
+            </w:r>
+          </w:p>
+        </w:tc>
+        <w:tc>
+          <w:tcPr>
+            <w:tcW w:w="2000" w:type="dxa"/>
+          </w:tcPr>
+          <w:p>
+            <w:pPr/>
+            <w:r>
+              <w:t xml:space="preserve">bit</w:t>
+            </w:r>
+          </w:p>
+        </w:tc>
+        <w:tc>
+          <w:tcPr>
+            <w:tcW w:w="2000" w:type="dxa"/>
+          </w:tcPr>
+          <w:p>
+            <w:pPr/>
+            <w:r>
+              <w:t xml:space="preserve">-</w:t>
+            </w:r>
+          </w:p>
+        </w:tc>
+        <w:tc>
+          <w:tcPr>
+            <w:tcW w:w="2000" w:type="dxa"/>
+          </w:tcPr>
+          <w:p>
+            <w:pPr/>
+            <w:r>
+              <w:t xml:space="preserve">NOT NULL</w:t>
+            </w:r>
+          </w:p>
+        </w:tc>
+      </w:tr>
+      <w:tr>
+        <w:trPr>
+          <w:trHeight w:val="530" w:hRule="atLeast"/>
+        </w:trPr>
+        <w:tc>
+          <w:tcPr>
+            <w:tcW w:w="2000" w:type="dxa"/>
+          </w:tcPr>
+          <w:p>
+            <w:pPr/>
+            <w:r>
+              <w:t xml:space="preserve">recount_required</w:t>
+            </w:r>
+          </w:p>
+        </w:tc>
+        <w:tc>
+          <w:tcPr>
+            <w:tcW w:w="2000" w:type="dxa"/>
+          </w:tcPr>
+          <w:p>
+            <w:pPr/>
+            <w:r>
+              <w:t xml:space="preserve">bit</w:t>
+            </w:r>
+          </w:p>
+        </w:tc>
+        <w:tc>
+          <w:tcPr>
+            <w:tcW w:w="2000" w:type="dxa"/>
+          </w:tcPr>
+          <w:p>
+            <w:pPr/>
+            <w:r>
+              <w:t xml:space="preserve">-</w:t>
+            </w:r>
+          </w:p>
+        </w:tc>
+        <w:tc>
+          <w:tcPr>
+            <w:tcW w:w="2000" w:type="dxa"/>
+          </w:tcPr>
+          <w:p>
+            <w:pPr/>
+            <w:r>
+              <w:t xml:space="preserve">NOT NULL</w:t>
+            </w:r>
+          </w:p>
+        </w:tc>
+      </w:tr>
+      <w:tr>
+        <w:trPr>
+          <w:trHeight w:val="530" w:hRule="atLeast"/>
+        </w:trPr>
+        <w:tc>
+          <w:tcPr>
+            <w:tcW w:w="2000" w:type="dxa"/>
+          </w:tcPr>
+          <w:p>
+            <w:pPr/>
+            <w:r>
+              <w:t xml:space="preserve">company_id</w:t>
+            </w:r>
+          </w:p>
+        </w:tc>
+        <w:tc>
+          <w:tcPr>
+            <w:tcW w:w="2000" w:type="dxa"/>
+          </w:tcPr>
+          <w:p>
+            <w:pPr/>
+            <w:r>
+              <w:t xml:space="preserve">bigint</w:t>
+            </w:r>
+          </w:p>
+        </w:tc>
+        <w:tc>
+          <w:tcPr>
+            <w:tcW w:w="2000" w:type="dxa"/>
+          </w:tcPr>
+          <w:p>
+            <w:pPr/>
+            <w:r>
+              <w:t xml:space="preserve">-</w:t>
+            </w:r>
+          </w:p>
+        </w:tc>
+        <w:tc>
+          <w:tcPr>
+            <w:tcW w:w="2000" w:type="dxa"/>
+          </w:tcPr>
+          <w:p>
+            <w:pPr/>
+            <w:r>
+              <w:t xml:space="preserve">FK, NOT NULL</w:t>
+            </w:r>
+          </w:p>
+        </w:tc>
+      </w:tr>
+      <w:tr>
+        <w:trPr>
+          <w:trHeight w:val="530" w:hRule="atLeast"/>
+        </w:trPr>
+        <w:tc>
+          <w:tcPr>
+            <w:tcW w:w="2000" w:type="dxa"/>
+          </w:tcPr>
+          <w:p>
+            <w:pPr/>
+            <w:r>
+              <w:t xml:space="preserve">created_at</w:t>
+            </w:r>
+          </w:p>
+        </w:tc>
+        <w:tc>
+          <w:tcPr>
+            <w:tcW w:w="2000" w:type="dxa"/>
+          </w:tcPr>
+          <w:p>
+            <w:pPr/>
+            <w:r>
+              <w:t xml:space="preserve">datetime2</w:t>
+            </w:r>
+          </w:p>
+        </w:tc>
+        <w:tc>
+          <w:tcPr>
+            <w:tcW w:w="2000" w:type="dxa"/>
+          </w:tcPr>
+          <w:p>
+            <w:pPr/>
+            <w:r>
+              <w:t xml:space="preserve">(6)</w:t>
+            </w:r>
+          </w:p>
+        </w:tc>
+        <w:tc>
+          <w:tcPr>
+            <w:tcW w:w="2000" w:type="dxa"/>
+          </w:tcPr>
+          <w:p>
+            <w:pPr/>
+            <w:r>
+              <w:t xml:space="preserve">NOT NULL</w:t>
+            </w:r>
+          </w:p>
+        </w:tc>
+      </w:tr>
+      <w:tr>
+        <w:trPr>
+          <w:trHeight w:val="530" w:hRule="atLeast"/>
+        </w:trPr>
+        <w:tc>
+          <w:tcPr>
+            <w:tcW w:w="2000" w:type="dxa"/>
+          </w:tcPr>
+          <w:p>
+            <w:pPr/>
+            <w:r>
+              <w:t xml:space="preserve">created_by</w:t>
+            </w:r>
+          </w:p>
+        </w:tc>
+        <w:tc>
+          <w:tcPr>
+            <w:tcW w:w="2000" w:type="dxa"/>
+          </w:tcPr>
+          <w:p>
+            <w:pPr/>
+            <w:r>
+              <w:t xml:space="preserve">bigint</w:t>
+            </w:r>
+          </w:p>
+        </w:tc>
+        <w:tc>
+          <w:tcPr>
+            <w:tcW w:w="2000" w:type="dxa"/>
+          </w:tcPr>
+          <w:p>
+            <w:pPr/>
+            <w:r>
+              <w:t xml:space="preserve">-</w:t>
+            </w:r>
+          </w:p>
+        </w:tc>
+        <w:tc>
+          <w:tcPr>
+            <w:tcW w:w="2000" w:type="dxa"/>
+          </w:tcPr>
+          <w:p>
+            <w:pPr/>
+            <w:r>
+              <w:t xml:space="preserve">NOT NULL</w:t>
+            </w:r>
+          </w:p>
+        </w:tc>
+      </w:tr>
+      <w:tr>
+        <w:trPr>
+          <w:trHeight w:val="530" w:hRule="atLeast"/>
+        </w:trPr>
+        <w:tc>
+          <w:tcPr>
+            <w:tcW w:w="2000" w:type="dxa"/>
+          </w:tcPr>
+          <w:p>
+            <w:pPr/>
+            <w:r>
+              <w:t xml:space="preserve">updated_at</w:t>
+            </w:r>
+          </w:p>
+        </w:tc>
+        <w:tc>
+          <w:tcPr>
+            <w:tcW w:w="2000" w:type="dxa"/>
+          </w:tcPr>
+          <w:p>
+            <w:pPr/>
+            <w:r>
+              <w:t xml:space="preserve">datetime2</w:t>
+            </w:r>
+          </w:p>
+        </w:tc>
+        <w:tc>
+          <w:tcPr>
+            <w:tcW w:w="2000" w:type="dxa"/>
+          </w:tcPr>
+          <w:p>
+            <w:pPr/>
+            <w:r>
+              <w:t xml:space="preserve">(6)</w:t>
+            </w:r>
+          </w:p>
+        </w:tc>
+        <w:tc>
+          <w:tcPr>
+            <w:tcW w:w="2000" w:type="dxa"/>
+          </w:tcPr>
+          <w:p>
+            <w:pPr/>
+            <w:r>
+              <w:t xml:space="preserve">IS NULL</w:t>
+            </w:r>
+          </w:p>
+        </w:tc>
+      </w:tr>
+      <w:tr>
+        <w:trPr>
+          <w:trHeight w:val="530" w:hRule="atLeast"/>
+        </w:trPr>
+        <w:tc>
+          <w:tcPr>
+            <w:tcW w:w="2000" w:type="dxa"/>
+          </w:tcPr>
+          <w:p>
+            <w:pPr/>
+            <w:r>
+              <w:t xml:space="preserve">updated_by</w:t>
+            </w:r>
+          </w:p>
+        </w:tc>
+        <w:tc>
+          <w:tcPr>
+            <w:tcW w:w="2000" w:type="dxa"/>
+          </w:tcPr>
+          <w:p>
+            <w:pPr/>
+            <w:r>
+              <w:t xml:space="preserve">bigint</w:t>
+            </w:r>
+          </w:p>
+        </w:tc>
+        <w:tc>
+          <w:tcPr>
+            <w:tcW w:w="2000" w:type="dxa"/>
+          </w:tcPr>
+          <w:p>
+            <w:pPr/>
+            <w:r>
+              <w:t xml:space="preserve">-</w:t>
+            </w:r>
+          </w:p>
+        </w:tc>
+        <w:tc>
+          <w:tcPr>
+            <w:tcW w:w="2000" w:type="dxa"/>
+          </w:tcPr>
+          <w:p>
+            <w:pPr/>
+            <w:r>
+              <w:t xml:space="preserve">IS NULL</w:t>
+            </w:r>
+          </w:p>
+        </w:tc>
+      </w:tr>
+      <w:tr>
+        <w:trPr>
+          <w:trHeight w:val="530" w:hRule="atLeast"/>
+        </w:trPr>
+        <w:tc>
+          <w:tcPr>
+            <w:tcW w:w="2000" w:type="dxa"/>
+          </w:tcPr>
+          <w:p>
+            <w:pPr/>
+            <w:r>
+              <w:t xml:space="preserve">version</w:t>
+            </w:r>
+          </w:p>
+        </w:tc>
+        <w:tc>
+          <w:tcPr>
+            <w:tcW w:w="2000" w:type="dxa"/>
+          </w:tcPr>
+          <w:p>
+            <w:pPr/>
+            <w:r>
+              <w:t xml:space="preserve">int</w:t>
+            </w:r>
+          </w:p>
+        </w:tc>
+        <w:tc>
+          <w:tcPr>
+            <w:tcW w:w="2000" w:type="dxa"/>
+          </w:tcPr>
+          <w:p>
+            <w:pPr/>
+            <w:r>
+              <w:t xml:space="preserve">-</w:t>
+            </w:r>
+          </w:p>
+        </w:tc>
+        <w:tc>
+          <w:tcPr>
+            <w:tcW w:w="2000" w:type="dxa"/>
+          </w:tcPr>
+          <w:p>
+            <w:pPr/>
+            <w:r>
+              <w:t xml:space="preserve">NOT NULL</w:t>
+            </w:r>
+          </w:p>
+        </w:tc>
+      </w:tr>
+    </w:tbl>
+    <w:p/>
+    <w:p>
+      <w:pPr/>
+      <w:r>
+        <w:t xml:space="preserve">Table Name: inv_stocktake_line_tracking</w:t>
+      </w:r>
+    </w:p>
+    <w:p>
+      <w:pPr/>
+      <w:r>
+        <w:t xml:space="preserve">Primary Key: id</w:t>
+      </w:r>
+    </w:p>
+    <w:p>
+      <w:pPr/>
+      <w:r>
+        <w:t xml:space="preserve">This table stores the snapshot book quantity and counted quantity of each lot or serial number in a stocktake line.</w:t>
+      </w:r>
+    </w:p>
+    <w:tbl>
+      <w:tblPr>
+        <w:tblStyle w:val="TableGrid"/>
+        <w:tblW w:w="8000" w:type="dxa"/>
+        <w:jc w:val="left"/>
+        <w:tblBorders>
+          <w:top w:val="single" w:color="000000" w:sz="4" w:space="0"/>
+          <w:left w:val="single" w:color="000000" w:sz="4" w:space="0"/>
+          <w:bottom w:val="single" w:color="000000" w:sz="4" w:space="0"/>
+          <w:right w:val="single" w:color="000000" w:sz="4" w:space="0"/>
+          <w:insideH w:val="single" w:color="000000" w:sz="4" w:space="0"/>
+          <w:insideV w:val="single" w:color="000000" w:sz="4" w:space="0"/>
+        </w:tblBorders>
+        <w:tblLayout w:type="fixed"/>
+        <w:tblCellMar>
+          <w:top w:w="100" w:type="dxa"/>
+          <w:left w:w="100" w:type="dxa"/>
+          <w:bottom w:w="100" w:type="dxa"/>
+          <w:right w:w="100" w:type="dxa"/>
+        </w:tblCellMar>
+      </w:tblPr>
+      <w:tblGrid>
+        <w:gridCol w:w="2000"/>
+        <w:gridCol w:w="2000"/>
+        <w:gridCol w:w="2000"/>
+        <w:gridCol w:w="2000"/>
+      </w:tblGrid>
+      <w:tr>
+        <w:trPr>
+          <w:trHeight w:val="530" w:hRule="atLeast"/>
+        </w:trPr>
+        <w:tc>
+          <w:tcPr>
+            <w:tcW w:w="2000" w:type="dxa"/>
+          </w:tcPr>
+          <w:p>
+            <w:pPr>
+              <w:jc w:val="center"/>
+            </w:pPr>
+            <w:r>
+              <w:rPr>
+                <w:b/>
+              </w:rPr>
+              <w:t xml:space="preserve">Name of Attribute</w:t>
+            </w:r>
+          </w:p>
+        </w:tc>
+        <w:tc>
+          <w:tcPr>
+            <w:tcW w:w="2000" w:type="dxa"/>
+          </w:tcPr>
+          <w:p>
+            <w:pPr>
+              <w:jc w:val="center"/>
+            </w:pPr>
+            <w:r>
+              <w:rPr>
+                <w:b/>
+              </w:rPr>
+              <w:t xml:space="preserve">Data Type</w:t>
+            </w:r>
+          </w:p>
+        </w:tc>
+        <w:tc>
+          <w:tcPr>
+            <w:tcW w:w="2000" w:type="dxa"/>
+          </w:tcPr>
+          <w:p>
+            <w:pPr>
+              <w:jc w:val="center"/>
+            </w:pPr>
+            <w:r>
+              <w:rPr>
+                <w:b/>
+              </w:rPr>
+              <w:t xml:space="preserve">Size</w:t>
+            </w:r>
+          </w:p>
+        </w:tc>
+        <w:tc>
+          <w:tcPr>
+            <w:tcW w:w="2000" w:type="dxa"/>
+          </w:tcPr>
+          <w:p>
+            <w:pPr>
+              <w:jc w:val="center"/>
+            </w:pPr>
+            <w:r>
+              <w:rPr>
+                <w:b/>
+              </w:rPr>
+              <w:t xml:space="preserve">PK/FK/IS NULL/ NOT NULL</w:t>
+            </w:r>
+          </w:p>
+        </w:tc>
+      </w:tr>
+      <w:tr>
+        <w:trPr>
+          <w:trHeight w:val="530" w:hRule="atLeast"/>
+        </w:trPr>
+        <w:tc>
+          <w:tcPr>
+            <w:tcW w:w="2000" w:type="dxa"/>
+          </w:tcPr>
+          <w:p>
+            <w:pPr/>
+            <w:r>
+              <w:t xml:space="preserve">id</w:t>
+            </w:r>
+          </w:p>
+        </w:tc>
+        <w:tc>
+          <w:tcPr>
+            <w:tcW w:w="2000" w:type="dxa"/>
+          </w:tcPr>
+          <w:p>
+            <w:pPr/>
+            <w:r>
+              <w:t xml:space="preserve">bigint</w:t>
+            </w:r>
+          </w:p>
+        </w:tc>
+        <w:tc>
+          <w:tcPr>
+            <w:tcW w:w="2000" w:type="dxa"/>
+          </w:tcPr>
+          <w:p>
+            <w:pPr/>
+            <w:r>
+              <w:t xml:space="preserve">-</w:t>
+            </w:r>
+          </w:p>
+        </w:tc>
+        <w:tc>
+          <w:tcPr>
+            <w:tcW w:w="2000" w:type="dxa"/>
+          </w:tcPr>
+          <w:p>
+            <w:pPr/>
+            <w:r>
+              <w:t xml:space="preserve">PK, NOT NULL</w:t>
+            </w:r>
+          </w:p>
+        </w:tc>
+      </w:tr>
+      <w:tr>
+        <w:trPr>
+          <w:trHeight w:val="530" w:hRule="atLeast"/>
+        </w:trPr>
+        <w:tc>
+          <w:tcPr>
+            <w:tcW w:w="2000" w:type="dxa"/>
+          </w:tcPr>
+          <w:p>
+            <w:pPr/>
+            <w:r>
+              <w:t xml:space="preserve">line_id</w:t>
+            </w:r>
+          </w:p>
+        </w:tc>
+        <w:tc>
+          <w:tcPr>
+            <w:tcW w:w="2000" w:type="dxa"/>
+          </w:tcPr>
+          <w:p>
+            <w:pPr/>
+            <w:r>
+              <w:t xml:space="preserve">bigint</w:t>
+            </w:r>
+          </w:p>
+        </w:tc>
+        <w:tc>
+          <w:tcPr>
+            <w:tcW w:w="2000" w:type="dxa"/>
+          </w:tcPr>
+          <w:p>
+            <w:pPr/>
+            <w:r>
+              <w:t xml:space="preserve">-</w:t>
+            </w:r>
+          </w:p>
+        </w:tc>
+        <w:tc>
+          <w:tcPr>
+            <w:tcW w:w="2000" w:type="dxa"/>
+          </w:tcPr>
+          <w:p>
+            <w:pPr/>
+            <w:r>
+              <w:t xml:space="preserve">FK, NOT NULL</w:t>
+            </w:r>
+          </w:p>
+        </w:tc>
+      </w:tr>
+      <w:tr>
+        <w:trPr>
+          <w:trHeight w:val="530" w:hRule="atLeast"/>
+        </w:trPr>
+        <w:tc>
+          <w:tcPr>
+            <w:tcW w:w="2000" w:type="dxa"/>
+          </w:tcPr>
+          <w:p>
+            <w:pPr/>
+            <w:r>
+              <w:t xml:space="preserve">seq_no</w:t>
+            </w:r>
+          </w:p>
+        </w:tc>
+        <w:tc>
+          <w:tcPr>
+            <w:tcW w:w="2000" w:type="dxa"/>
+          </w:tcPr>
+          <w:p>
+            <w:pPr/>
+            <w:r>
+              <w:t xml:space="preserve">int</w:t>
+            </w:r>
+          </w:p>
+        </w:tc>
+        <w:tc>
+          <w:tcPr>
+            <w:tcW w:w="2000" w:type="dxa"/>
+          </w:tcPr>
+          <w:p>
+            <w:pPr/>
+            <w:r>
+              <w:t xml:space="preserve">-</w:t>
+            </w:r>
+          </w:p>
+        </w:tc>
+        <w:tc>
+          <w:tcPr>
+            <w:tcW w:w="2000" w:type="dxa"/>
+          </w:tcPr>
+          <w:p>
+            <w:pPr/>
+            <w:r>
+              <w:t xml:space="preserve">NOT NULL</w:t>
+            </w:r>
+          </w:p>
+        </w:tc>
+      </w:tr>
+      <w:tr>
+        <w:trPr>
+          <w:trHeight w:val="530" w:hRule="atLeast"/>
+        </w:trPr>
+        <w:tc>
+          <w:tcPr>
+            <w:tcW w:w="2000" w:type="dxa"/>
+          </w:tcPr>
+          <w:p>
+            <w:pPr/>
+            <w:r>
+              <w:t xml:space="preserve">lot_no</w:t>
+            </w:r>
+          </w:p>
+        </w:tc>
+        <w:tc>
+          <w:tcPr>
+            <w:tcW w:w="2000" w:type="dxa"/>
+          </w:tcPr>
+          <w:p>
+            <w:pPr/>
+            <w:r>
+              <w:t xml:space="preserve">nvarchar</w:t>
+            </w:r>
+          </w:p>
+        </w:tc>
+        <w:tc>
+          <w:tcPr>
+            <w:tcW w:w="2000" w:type="dxa"/>
+          </w:tcPr>
+          <w:p>
+            <w:pPr/>
+            <w:r>
+              <w:t xml:space="preserve">50</w:t>
+            </w:r>
+          </w:p>
+        </w:tc>
+        <w:tc>
+          <w:tcPr>
+            <w:tcW w:w="2000" w:type="dxa"/>
+          </w:tcPr>
+          <w:p>
+            <w:pPr/>
+            <w:r>
+              <w:t xml:space="preserve">IS NULL</w:t>
+            </w:r>
+          </w:p>
+        </w:tc>
+      </w:tr>
+      <w:tr>
+        <w:trPr>
+          <w:trHeight w:val="530" w:hRule="atLeast"/>
+        </w:trPr>
+        <w:tc>
+          <w:tcPr>
+            <w:tcW w:w="2000" w:type="dxa"/>
+          </w:tcPr>
+          <w:p>
+            <w:pPr/>
+            <w:r>
+              <w:t xml:space="preserve">serial_no</w:t>
+            </w:r>
+          </w:p>
+        </w:tc>
+        <w:tc>
+          <w:tcPr>
+            <w:tcW w:w="2000" w:type="dxa"/>
+          </w:tcPr>
+          <w:p>
+            <w:pPr/>
+            <w:r>
+              <w:t xml:space="preserve">nvarchar</w:t>
+            </w:r>
+          </w:p>
+        </w:tc>
+        <w:tc>
+          <w:tcPr>
+            <w:tcW w:w="2000" w:type="dxa"/>
+          </w:tcPr>
+          <w:p>
+            <w:pPr/>
+            <w:r>
+              <w:t xml:space="preserve">100</w:t>
+            </w:r>
+          </w:p>
+        </w:tc>
+        <w:tc>
+          <w:tcPr>
+            <w:tcW w:w="2000" w:type="dxa"/>
+          </w:tcPr>
+          <w:p>
+            <w:pPr/>
+            <w:r>
+              <w:t xml:space="preserve">IS NULL</w:t>
+            </w:r>
+          </w:p>
+        </w:tc>
+      </w:tr>
+      <w:tr>
+        <w:trPr>
+          <w:trHeight w:val="530" w:hRule="atLeast"/>
+        </w:trPr>
+        <w:tc>
+          <w:tcPr>
+            <w:tcW w:w="2000" w:type="dxa"/>
+          </w:tcPr>
+          <w:p>
+            <w:pPr/>
+            <w:r>
+              <w:t xml:space="preserve">book_quantity</w:t>
+            </w:r>
+          </w:p>
+        </w:tc>
+        <w:tc>
+          <w:tcPr>
+            <w:tcW w:w="2000" w:type="dxa"/>
+          </w:tcPr>
+          <w:p>
+            <w:pPr/>
+            <w:r>
+              <w:t xml:space="preserve">decimal</w:t>
+            </w:r>
+          </w:p>
+        </w:tc>
+        <w:tc>
+          <w:tcPr>
+            <w:tcW w:w="2000" w:type="dxa"/>
+          </w:tcPr>
+          <w:p>
+            <w:pPr/>
+            <w:r>
+              <w:t xml:space="preserve">(19,6)</w:t>
+            </w:r>
+          </w:p>
+        </w:tc>
+        <w:tc>
+          <w:tcPr>
+            <w:tcW w:w="2000" w:type="dxa"/>
+          </w:tcPr>
+          <w:p>
+            <w:pPr/>
+            <w:r>
+              <w:t xml:space="preserve">NOT NULL</w:t>
+            </w:r>
+          </w:p>
+        </w:tc>
+      </w:tr>
+      <w:tr>
+        <w:trPr>
+          <w:trHeight w:val="530" w:hRule="atLeast"/>
+        </w:trPr>
+        <w:tc>
+          <w:tcPr>
+            <w:tcW w:w="2000" w:type="dxa"/>
+          </w:tcPr>
+          <w:p>
+            <w:pPr/>
+            <w:r>
+              <w:t xml:space="preserve">counted_quantity</w:t>
+            </w:r>
+          </w:p>
+        </w:tc>
+        <w:tc>
+          <w:tcPr>
+            <w:tcW w:w="2000" w:type="dxa"/>
+          </w:tcPr>
+          <w:p>
+            <w:pPr/>
+            <w:r>
+              <w:t xml:space="preserve">decimal</w:t>
+            </w:r>
+          </w:p>
+        </w:tc>
+        <w:tc>
+          <w:tcPr>
+            <w:tcW w:w="2000" w:type="dxa"/>
+          </w:tcPr>
+          <w:p>
+            <w:pPr/>
+            <w:r>
+              <w:t xml:space="preserve">(19,6)</w:t>
+            </w:r>
+          </w:p>
+        </w:tc>
+        <w:tc>
+          <w:tcPr>
+            <w:tcW w:w="2000" w:type="dxa"/>
+          </w:tcPr>
+          <w:p>
+            <w:pPr/>
+            <w:r>
+              <w:t xml:space="preserve">IS NULL</w:t>
             </w:r>
           </w:p>
         </w:tc>
@@ -52357,6 +55057,44 @@
           <w:i/>
         </w:rPr>
         <w:t xml:space="preserve">[Pending] System screenshot of Inventory Transfer Edit Interface.</w:t>
+      </w:r>
+    </w:p>
+    <w:p>
+      <w:pPr>
+        <w:pStyle w:val="Heading5"/>
+      </w:pPr>
+      <w:r>
+        <w:t xml:space="preserve">4.2.1.5.18 Stocktake Create Interface</w:t>
+      </w:r>
+    </w:p>
+    <w:p>
+      <w:pPr>
+        <w:jc w:val="center"/>
+      </w:pPr>
+      <w:r>
+        <w:rPr>
+          <w:i/>
+        </w:rPr>
+        <w:t xml:space="preserve">[Pending] System screenshot of Stocktake Create Interface.</w:t>
+      </w:r>
+    </w:p>
+    <w:p>
+      <w:pPr>
+        <w:pStyle w:val="Heading5"/>
+      </w:pPr>
+      <w:r>
+        <w:t xml:space="preserve">4.2.1.5.24 Stocktake View Interface</w:t>
+      </w:r>
+    </w:p>
+    <w:p>
+      <w:pPr>
+        <w:jc w:val="center"/>
+      </w:pPr>
+      <w:r>
+        <w:rPr>
+          <w:i/>
+        </w:rPr>
+        <w:t xml:space="preserve">[Pending] System screenshot of Stocktake View Interface.</w:t>
       </w:r>
     </w:p>
     <w:p>
@@ -54002,7 +56740,7 @@
       </w:r>
     </w:p>
     <w:sectPr>
-      <w:footerReference xmlns:r="http://schemas.openxmlformats.org/officeDocument/2006/relationships" w:type="default" r:id="R33b04c4452c54751"/>
+      <w:footerReference xmlns:r="http://schemas.openxmlformats.org/officeDocument/2006/relationships" w:type="default" r:id="R423eea918c51433c"/>
       <w:pgSz w:w="11906" w:h="16838"/>
       <w:pgMar w:top="1440" w:right="1440" w:bottom="1440" w:left="1440" w:header="720" w:footer="720" w:gutter="0"/>
     </w:sectPr>

</xml_diff>

<commit_message>
fix(inv): reserve baseline interface numbers and renumber extensions
</commit_message>
<xml_diff>
--- a/docs/99-output/MyERP_SDS.docx
+++ b/docs/99-output/MyERP_SDS.docx
@@ -54950,63 +54950,6 @@
         <w:pStyle w:val="Heading5"/>
       </w:pPr>
       <w:r>
-        <w:t xml:space="preserve">4.2.1.5.8 Product Initial Stock View Interface</w:t>
-      </w:r>
-    </w:p>
-    <w:p>
-      <w:pPr>
-        <w:jc w:val="center"/>
-      </w:pPr>
-      <w:r>
-        <w:rPr>
-          <w:i/>
-        </w:rPr>
-        <w:t xml:space="preserve">[Pending] System screenshot of Product Initial Stock View Interface.</w:t>
-      </w:r>
-    </w:p>
-    <w:p>
-      <w:pPr>
-        <w:pStyle w:val="Heading5"/>
-      </w:pPr>
-      <w:r>
-        <w:t xml:space="preserve">4.2.1.5.9 Product Initial Stock Create Interface</w:t>
-      </w:r>
-    </w:p>
-    <w:p>
-      <w:pPr>
-        <w:jc w:val="center"/>
-      </w:pPr>
-      <w:r>
-        <w:rPr>
-          <w:i/>
-        </w:rPr>
-        <w:t xml:space="preserve">[Pending] System screenshot of Product Initial Stock Create Interface.</w:t>
-      </w:r>
-    </w:p>
-    <w:p>
-      <w:pPr>
-        <w:pStyle w:val="Heading5"/>
-      </w:pPr>
-      <w:r>
-        <w:t xml:space="preserve">4.2.1.5.10 Lot and Serial Trace Interface</w:t>
-      </w:r>
-    </w:p>
-    <w:p>
-      <w:pPr>
-        <w:jc w:val="center"/>
-      </w:pPr>
-      <w:r>
-        <w:rPr>
-          <w:i/>
-        </w:rPr>
-        <w:t xml:space="preserve">[Pending] System screenshot of Lot and Serial Trace Interface.</w:t>
-      </w:r>
-    </w:p>
-    <w:p>
-      <w:pPr>
-        <w:pStyle w:val="Heading5"/>
-      </w:pPr>
-      <w:r>
         <w:t xml:space="preserve">4.2.1.5.15 Inventory Transfer Create Interface</w:t>
       </w:r>
     </w:p>
@@ -55076,6 +55019,63 @@
           <w:i/>
         </w:rPr>
         <w:t xml:space="preserve">[Pending] System screenshot of Stocktake Create Interface.</w:t>
+      </w:r>
+    </w:p>
+    <w:p>
+      <w:pPr>
+        <w:pStyle w:val="Heading5"/>
+      </w:pPr>
+      <w:r>
+        <w:t xml:space="preserve">4.2.1.5.21 Product Initial Stock View Interface</w:t>
+      </w:r>
+    </w:p>
+    <w:p>
+      <w:pPr>
+        <w:jc w:val="center"/>
+      </w:pPr>
+      <w:r>
+        <w:rPr>
+          <w:i/>
+        </w:rPr>
+        <w:t xml:space="preserve">[Pending] System screenshot of Product Initial Stock View Interface.</w:t>
+      </w:r>
+    </w:p>
+    <w:p>
+      <w:pPr>
+        <w:pStyle w:val="Heading5"/>
+      </w:pPr>
+      <w:r>
+        <w:t xml:space="preserve">4.2.1.5.22 Product Initial Stock Create Interface</w:t>
+      </w:r>
+    </w:p>
+    <w:p>
+      <w:pPr>
+        <w:jc w:val="center"/>
+      </w:pPr>
+      <w:r>
+        <w:rPr>
+          <w:i/>
+        </w:rPr>
+        <w:t xml:space="preserve">[Pending] System screenshot of Product Initial Stock Create Interface.</w:t>
+      </w:r>
+    </w:p>
+    <w:p>
+      <w:pPr>
+        <w:pStyle w:val="Heading5"/>
+      </w:pPr>
+      <w:r>
+        <w:t xml:space="preserve">4.2.1.5.23 Lot and Serial Trace Interface</w:t>
+      </w:r>
+    </w:p>
+    <w:p>
+      <w:pPr>
+        <w:jc w:val="center"/>
+      </w:pPr>
+      <w:r>
+        <w:rPr>
+          <w:i/>
+        </w:rPr>
+        <w:t xml:space="preserve">[Pending] System screenshot of Lot and Serial Trace Interface.</w:t>
       </w:r>
     </w:p>
     <w:p>
@@ -56740,7 +56740,7 @@
       </w:r>
     </w:p>
     <w:sectPr>
-      <w:footerReference xmlns:r="http://schemas.openxmlformats.org/officeDocument/2006/relationships" w:type="default" r:id="R6830aa051418408e"/>
+      <w:footerReference xmlns:r="http://schemas.openxmlformats.org/officeDocument/2006/relationships" w:type="default" r:id="R5fe2ea670fa44724"/>
       <w:pgSz w:w="11906" w:h="16838"/>
       <w:pgMar w:top="1440" w:right="1440" w:bottom="1440" w:left="1440" w:header="720" w:footer="720" w:gutter="0"/>
     </w:sectPr>

</xml_diff>

<commit_message>
docs(inv): define inventory valuation design
</commit_message>
<xml_diff>
--- a/docs/99-output/MyERP_SDS.docx
+++ b/docs/99-output/MyERP_SDS.docx
@@ -55095,6 +55095,25 @@
           <w:i/>
         </w:rPr>
         <w:t xml:space="preserve">[Pending] System screenshot of Stocktake View Interface.</w:t>
+      </w:r>
+    </w:p>
+    <w:p>
+      <w:pPr>
+        <w:pStyle w:val="Heading5"/>
+      </w:pPr>
+      <w:r>
+        <w:t xml:space="preserve">4.2.1.5.25 Inventory Valuation View Interface</w:t>
+      </w:r>
+    </w:p>
+    <w:p>
+      <w:pPr>
+        <w:jc w:val="center"/>
+      </w:pPr>
+      <w:r>
+        <w:rPr>
+          <w:i/>
+        </w:rPr>
+        <w:t xml:space="preserve">[Pending] System screenshot of Inventory Valuation View Interface.</w:t>
       </w:r>
     </w:p>
     <w:p>
@@ -56740,7 +56759,7 @@
       </w:r>
     </w:p>
     <w:sectPr>
-      <w:footerReference xmlns:r="http://schemas.openxmlformats.org/officeDocument/2006/relationships" w:type="default" r:id="R5fe2ea670fa44724"/>
+      <w:footerReference xmlns:r="http://schemas.openxmlformats.org/officeDocument/2006/relationships" w:type="default" r:id="Rc67a112e69934d6f"/>
       <w:pgSz w:w="11906" w:h="16838"/>
       <w:pgMar w:top="1440" w:right="1440" w:bottom="1440" w:left="1440" w:header="720" w:footer="720" w:gutter="0"/>
     </w:sectPr>

</xml_diff>

<commit_message>
feat(inv): use authorized selectors in receipt and issue forms
</commit_message>
<xml_diff>
--- a/docs/99-output/MyERP_SDS.docx
+++ b/docs/99-output/MyERP_SDS.docx
@@ -55019,6 +55019,25 @@
           <w:i/>
         </w:rPr>
         <w:t xml:space="preserve">[Pending] System screenshot of Stocktake Create Interface.</w:t>
+      </w:r>
+    </w:p>
+    <w:p>
+      <w:pPr>
+        <w:pStyle w:val="Heading5"/>
+      </w:pPr>
+      <w:r>
+        <w:t xml:space="preserve">4.2.1.5.20 Select Data Interface</w:t>
+      </w:r>
+    </w:p>
+    <w:p>
+      <w:pPr>
+        <w:jc w:val="center"/>
+      </w:pPr>
+      <w:r>
+        <w:rPr>
+          <w:i/>
+        </w:rPr>
+        <w:t xml:space="preserve">[Pending] System screenshot of Select Data Interface.</w:t>
       </w:r>
     </w:p>
     <w:p>
@@ -56759,7 +56778,7 @@
       </w:r>
     </w:p>
     <w:sectPr>
-      <w:footerReference xmlns:r="http://schemas.openxmlformats.org/officeDocument/2006/relationships" w:type="default" r:id="Rfaa8b54d75274154"/>
+      <w:footerReference xmlns:r="http://schemas.openxmlformats.org/officeDocument/2006/relationships" w:type="default" r:id="Rd3b18711cabd48fc"/>
       <w:pgSz w:w="11906" w:h="16838"/>
       <w:pgMar w:top="1440" w:right="1440" w:bottom="1440" w:left="1440" w:header="720" w:footer="720" w:gutter="0"/>
     </w:sectPr>

</xml_diff>

<commit_message>
feat(inv): use authorized selectors in transfer and opening forms
</commit_message>
<xml_diff>
--- a/docs/99-output/MyERP_SDS.docx
+++ b/docs/99-output/MyERP_SDS.docx
@@ -46,7 +46,7 @@
         <w:jc w:val="center"/>
       </w:pPr>
       <w:r>
-        <w:t xml:space="preserve">Date: 14 October 2026</w:t>
+        <w:t xml:space="preserve">Date: 15 October 2026</w:t>
       </w:r>
     </w:p>
     <w:p/>
@@ -56778,7 +56778,7 @@
       </w:r>
     </w:p>
     <w:sectPr>
-      <w:footerReference xmlns:r="http://schemas.openxmlformats.org/officeDocument/2006/relationships" w:type="default" r:id="Rd3b18711cabd48fc"/>
+      <w:footerReference xmlns:r="http://schemas.openxmlformats.org/officeDocument/2006/relationships" w:type="default" r:id="R348758ab6eba44c2"/>
       <w:pgSz w:w="11906" w:h="16838"/>
       <w:pgMar w:top="1440" w:right="1440" w:bottom="1440" w:left="1440" w:header="720" w:footer="720" w:gutter="0"/>
     </w:sectPr>

</xml_diff>

<commit_message>
docs(inv): define assembly posting contract and test scenarios
</commit_message>
<xml_diff>
--- a/docs/99-output/MyERP_SDS.docx
+++ b/docs/99-output/MyERP_SDS.docx
@@ -54943,6 +54943,63 @@
           <w:i/>
         </w:rPr>
         <w:t xml:space="preserve">[Pending] System screenshot of Other Outbound Edit Interface.</w:t>
+      </w:r>
+    </w:p>
+    <w:p>
+      <w:pPr>
+        <w:pStyle w:val="Heading5"/>
+      </w:pPr>
+      <w:r>
+        <w:t xml:space="preserve">4.2.1.5.9 Product Assembly View Interface</w:t>
+      </w:r>
+    </w:p>
+    <w:p>
+      <w:pPr>
+        <w:jc w:val="center"/>
+      </w:pPr>
+      <w:r>
+        <w:rPr>
+          <w:i/>
+        </w:rPr>
+        <w:t xml:space="preserve">[Pending] System screenshot of Product Assembly View Interface.</w:t>
+      </w:r>
+    </w:p>
+    <w:p>
+      <w:pPr>
+        <w:pStyle w:val="Heading5"/>
+      </w:pPr>
+      <w:r>
+        <w:t xml:space="preserve">4.2.1.5.10 Product Assembly Create Interface</w:t>
+      </w:r>
+    </w:p>
+    <w:p>
+      <w:pPr>
+        <w:jc w:val="center"/>
+      </w:pPr>
+      <w:r>
+        <w:rPr>
+          <w:i/>
+        </w:rPr>
+        <w:t xml:space="preserve">[Pending] System screenshot of Product Assembly Create Interface.</w:t>
+      </w:r>
+    </w:p>
+    <w:p>
+      <w:pPr>
+        <w:pStyle w:val="Heading5"/>
+      </w:pPr>
+      <w:r>
+        <w:t xml:space="preserve">4.2.1.5.11 Product Assembly Edit Interface</w:t>
+      </w:r>
+    </w:p>
+    <w:p>
+      <w:pPr>
+        <w:jc w:val="center"/>
+      </w:pPr>
+      <w:r>
+        <w:rPr>
+          <w:i/>
+        </w:rPr>
+        <w:t xml:space="preserve">[Pending] System screenshot of Product Assembly Edit Interface.</w:t>
       </w:r>
     </w:p>
     <w:p>
@@ -56778,7 +56835,7 @@
       </w:r>
     </w:p>
     <w:sectPr>
-      <w:footerReference xmlns:r="http://schemas.openxmlformats.org/officeDocument/2006/relationships" w:type="default" r:id="Re3725217773e4341"/>
+      <w:footerReference xmlns:r="http://schemas.openxmlformats.org/officeDocument/2006/relationships" w:type="default" r:id="R7aad631f975d492c"/>
       <w:pgSz w:w="11906" w:h="16838"/>
       <w:pgMar w:top="1440" w:right="1440" w:bottom="1440" w:left="1440" w:header="720" w:footer="720" w:gutter="0"/>
     </w:sectPr>

</xml_diff>

<commit_message>
feat(inv): add assembly draft documents and API
</commit_message>
<xml_diff>
--- a/docs/99-output/MyERP_SDS.docx
+++ b/docs/99-output/MyERP_SDS.docx
@@ -610,6 +610,2412 @@
         <w:t xml:space="preserve">Figure 4.1.1 Entity Relationship Diagram (Part 1)</w:t>
       </w:r>
     </w:p>
+    <w:p>
+      <w:pPr/>
+      <w:r>
+        <w:t xml:space="preserve">Table Name: inv_assembly</w:t>
+      </w:r>
+    </w:p>
+    <w:p>
+      <w:pPr/>
+      <w:r>
+        <w:t xml:space="preserve">Primary Key: id</w:t>
+      </w:r>
+    </w:p>
+    <w:p>
+      <w:pPr/>
+      <w:r>
+        <w:t xml:space="preserve">This table stores company-scoped assembly headers, draft state, approval state and posting time.</w:t>
+      </w:r>
+    </w:p>
+    <w:tbl>
+      <w:tblPr>
+        <w:tblStyle w:val="TableGrid"/>
+        <w:tblW w:w="8000" w:type="dxa"/>
+        <w:jc w:val="left"/>
+        <w:tblBorders>
+          <w:top w:val="single" w:color="000000" w:sz="4" w:space="0"/>
+          <w:left w:val="single" w:color="000000" w:sz="4" w:space="0"/>
+          <w:bottom w:val="single" w:color="000000" w:sz="4" w:space="0"/>
+          <w:right w:val="single" w:color="000000" w:sz="4" w:space="0"/>
+          <w:insideH w:val="single" w:color="000000" w:sz="4" w:space="0"/>
+          <w:insideV w:val="single" w:color="000000" w:sz="4" w:space="0"/>
+        </w:tblBorders>
+        <w:tblLayout w:type="fixed"/>
+        <w:tblCellMar>
+          <w:top w:w="100" w:type="dxa"/>
+          <w:left w:w="100" w:type="dxa"/>
+          <w:bottom w:w="100" w:type="dxa"/>
+          <w:right w:w="100" w:type="dxa"/>
+        </w:tblCellMar>
+      </w:tblPr>
+      <w:tblGrid>
+        <w:gridCol w:w="2000"/>
+        <w:gridCol w:w="2000"/>
+        <w:gridCol w:w="2000"/>
+        <w:gridCol w:w="2000"/>
+      </w:tblGrid>
+      <w:tr>
+        <w:trPr>
+          <w:trHeight w:val="530" w:hRule="atLeast"/>
+        </w:trPr>
+        <w:tc>
+          <w:tcPr>
+            <w:tcW w:w="2000" w:type="dxa"/>
+          </w:tcPr>
+          <w:p>
+            <w:pPr>
+              <w:jc w:val="center"/>
+            </w:pPr>
+            <w:r>
+              <w:rPr>
+                <w:b/>
+              </w:rPr>
+              <w:t xml:space="preserve">Name of Attribute</w:t>
+            </w:r>
+          </w:p>
+        </w:tc>
+        <w:tc>
+          <w:tcPr>
+            <w:tcW w:w="2000" w:type="dxa"/>
+          </w:tcPr>
+          <w:p>
+            <w:pPr>
+              <w:jc w:val="center"/>
+            </w:pPr>
+            <w:r>
+              <w:rPr>
+                <w:b/>
+              </w:rPr>
+              <w:t xml:space="preserve">Data Type</w:t>
+            </w:r>
+          </w:p>
+        </w:tc>
+        <w:tc>
+          <w:tcPr>
+            <w:tcW w:w="2000" w:type="dxa"/>
+          </w:tcPr>
+          <w:p>
+            <w:pPr>
+              <w:jc w:val="center"/>
+            </w:pPr>
+            <w:r>
+              <w:rPr>
+                <w:b/>
+              </w:rPr>
+              <w:t xml:space="preserve">Size</w:t>
+            </w:r>
+          </w:p>
+        </w:tc>
+        <w:tc>
+          <w:tcPr>
+            <w:tcW w:w="2000" w:type="dxa"/>
+          </w:tcPr>
+          <w:p>
+            <w:pPr>
+              <w:jc w:val="center"/>
+            </w:pPr>
+            <w:r>
+              <w:rPr>
+                <w:b/>
+              </w:rPr>
+              <w:t xml:space="preserve">PK/FK/IS NULL/ NOT NULL</w:t>
+            </w:r>
+          </w:p>
+        </w:tc>
+      </w:tr>
+      <w:tr>
+        <w:trPr>
+          <w:trHeight w:val="530" w:hRule="atLeast"/>
+        </w:trPr>
+        <w:tc>
+          <w:tcPr>
+            <w:tcW w:w="2000" w:type="dxa"/>
+          </w:tcPr>
+          <w:p>
+            <w:pPr/>
+            <w:r>
+              <w:t xml:space="preserve">id</w:t>
+            </w:r>
+          </w:p>
+        </w:tc>
+        <w:tc>
+          <w:tcPr>
+            <w:tcW w:w="2000" w:type="dxa"/>
+          </w:tcPr>
+          <w:p>
+            <w:pPr/>
+            <w:r>
+              <w:t xml:space="preserve">bigint</w:t>
+            </w:r>
+          </w:p>
+        </w:tc>
+        <w:tc>
+          <w:tcPr>
+            <w:tcW w:w="2000" w:type="dxa"/>
+          </w:tcPr>
+          <w:p>
+            <w:pPr/>
+            <w:r>
+              <w:t xml:space="preserve">-</w:t>
+            </w:r>
+          </w:p>
+        </w:tc>
+        <w:tc>
+          <w:tcPr>
+            <w:tcW w:w="2000" w:type="dxa"/>
+          </w:tcPr>
+          <w:p>
+            <w:pPr/>
+            <w:r>
+              <w:t xml:space="preserve">PK, NOT NULL</w:t>
+            </w:r>
+          </w:p>
+        </w:tc>
+      </w:tr>
+      <w:tr>
+        <w:trPr>
+          <w:trHeight w:val="530" w:hRule="atLeast"/>
+        </w:trPr>
+        <w:tc>
+          <w:tcPr>
+            <w:tcW w:w="2000" w:type="dxa"/>
+          </w:tcPr>
+          <w:p>
+            <w:pPr/>
+            <w:r>
+              <w:t xml:space="preserve">document_no</w:t>
+            </w:r>
+          </w:p>
+        </w:tc>
+        <w:tc>
+          <w:tcPr>
+            <w:tcW w:w="2000" w:type="dxa"/>
+          </w:tcPr>
+          <w:p>
+            <w:pPr/>
+            <w:r>
+              <w:t xml:space="preserve">varchar</w:t>
+            </w:r>
+          </w:p>
+        </w:tc>
+        <w:tc>
+          <w:tcPr>
+            <w:tcW w:w="2000" w:type="dxa"/>
+          </w:tcPr>
+          <w:p>
+            <w:pPr/>
+            <w:r>
+              <w:t xml:space="preserve">30</w:t>
+            </w:r>
+          </w:p>
+        </w:tc>
+        <w:tc>
+          <w:tcPr>
+            <w:tcW w:w="2000" w:type="dxa"/>
+          </w:tcPr>
+          <w:p>
+            <w:pPr/>
+            <w:r>
+              <w:t xml:space="preserve">NOT NULL</w:t>
+            </w:r>
+          </w:p>
+        </w:tc>
+      </w:tr>
+      <w:tr>
+        <w:trPr>
+          <w:trHeight w:val="530" w:hRule="atLeast"/>
+        </w:trPr>
+        <w:tc>
+          <w:tcPr>
+            <w:tcW w:w="2000" w:type="dxa"/>
+          </w:tcPr>
+          <w:p>
+            <w:pPr/>
+            <w:r>
+              <w:t xml:space="preserve">business_date</w:t>
+            </w:r>
+          </w:p>
+        </w:tc>
+        <w:tc>
+          <w:tcPr>
+            <w:tcW w:w="2000" w:type="dxa"/>
+          </w:tcPr>
+          <w:p>
+            <w:pPr/>
+            <w:r>
+              <w:t xml:space="preserve">date</w:t>
+            </w:r>
+          </w:p>
+        </w:tc>
+        <w:tc>
+          <w:tcPr>
+            <w:tcW w:w="2000" w:type="dxa"/>
+          </w:tcPr>
+          <w:p>
+            <w:pPr/>
+            <w:r>
+              <w:t xml:space="preserve">-</w:t>
+            </w:r>
+          </w:p>
+        </w:tc>
+        <w:tc>
+          <w:tcPr>
+            <w:tcW w:w="2000" w:type="dxa"/>
+          </w:tcPr>
+          <w:p>
+            <w:pPr/>
+            <w:r>
+              <w:t xml:space="preserve">NOT NULL</w:t>
+            </w:r>
+          </w:p>
+        </w:tc>
+      </w:tr>
+      <w:tr>
+        <w:trPr>
+          <w:trHeight w:val="530" w:hRule="atLeast"/>
+        </w:trPr>
+        <w:tc>
+          <w:tcPr>
+            <w:tcW w:w="2000" w:type="dxa"/>
+          </w:tcPr>
+          <w:p>
+            <w:pPr/>
+            <w:r>
+              <w:t xml:space="preserve">status</w:t>
+            </w:r>
+          </w:p>
+        </w:tc>
+        <w:tc>
+          <w:tcPr>
+            <w:tcW w:w="2000" w:type="dxa"/>
+          </w:tcPr>
+          <w:p>
+            <w:pPr/>
+            <w:r>
+              <w:t xml:space="preserve">varchar</w:t>
+            </w:r>
+          </w:p>
+        </w:tc>
+        <w:tc>
+          <w:tcPr>
+            <w:tcW w:w="2000" w:type="dxa"/>
+          </w:tcPr>
+          <w:p>
+            <w:pPr/>
+            <w:r>
+              <w:t xml:space="preserve">30</w:t>
+            </w:r>
+          </w:p>
+        </w:tc>
+        <w:tc>
+          <w:tcPr>
+            <w:tcW w:w="2000" w:type="dxa"/>
+          </w:tcPr>
+          <w:p>
+            <w:pPr/>
+            <w:r>
+              <w:t xml:space="preserve">NOT NULL</w:t>
+            </w:r>
+          </w:p>
+        </w:tc>
+      </w:tr>
+      <w:tr>
+        <w:trPr>
+          <w:trHeight w:val="530" w:hRule="atLeast"/>
+        </w:trPr>
+        <w:tc>
+          <w:tcPr>
+            <w:tcW w:w="2000" w:type="dxa"/>
+          </w:tcPr>
+          <w:p>
+            <w:pPr/>
+            <w:r>
+              <w:t xml:space="preserve">remark</w:t>
+            </w:r>
+          </w:p>
+        </w:tc>
+        <w:tc>
+          <w:tcPr>
+            <w:tcW w:w="2000" w:type="dxa"/>
+          </w:tcPr>
+          <w:p>
+            <w:pPr/>
+            <w:r>
+              <w:t xml:space="preserve">nvarchar</w:t>
+            </w:r>
+          </w:p>
+        </w:tc>
+        <w:tc>
+          <w:tcPr>
+            <w:tcW w:w="2000" w:type="dxa"/>
+          </w:tcPr>
+          <w:p>
+            <w:pPr/>
+            <w:r>
+              <w:t xml:space="preserve">1000</w:t>
+            </w:r>
+          </w:p>
+        </w:tc>
+        <w:tc>
+          <w:tcPr>
+            <w:tcW w:w="2000" w:type="dxa"/>
+          </w:tcPr>
+          <w:p>
+            <w:pPr/>
+            <w:r>
+              <w:t xml:space="preserve">IS NULL</w:t>
+            </w:r>
+          </w:p>
+        </w:tc>
+      </w:tr>
+      <w:tr>
+        <w:trPr>
+          <w:trHeight w:val="530" w:hRule="atLeast"/>
+        </w:trPr>
+        <w:tc>
+          <w:tcPr>
+            <w:tcW w:w="2000" w:type="dxa"/>
+          </w:tcPr>
+          <w:p>
+            <w:pPr/>
+            <w:r>
+              <w:t xml:space="preserve">custom_fields</w:t>
+            </w:r>
+          </w:p>
+        </w:tc>
+        <w:tc>
+          <w:tcPr>
+            <w:tcW w:w="2000" w:type="dxa"/>
+          </w:tcPr>
+          <w:p>
+            <w:pPr/>
+            <w:r>
+              <w:t xml:space="preserve">nvarchar</w:t>
+            </w:r>
+          </w:p>
+        </w:tc>
+        <w:tc>
+          <w:tcPr>
+            <w:tcW w:w="2000" w:type="dxa"/>
+          </w:tcPr>
+          <w:p>
+            <w:pPr/>
+            <w:r>
+              <w:t xml:space="preserve">MAX</w:t>
+            </w:r>
+          </w:p>
+        </w:tc>
+        <w:tc>
+          <w:tcPr>
+            <w:tcW w:w="2000" w:type="dxa"/>
+          </w:tcPr>
+          <w:p>
+            <w:pPr/>
+            <w:r>
+              <w:t xml:space="preserve">IS NULL</w:t>
+            </w:r>
+          </w:p>
+        </w:tc>
+      </w:tr>
+      <w:tr>
+        <w:trPr>
+          <w:trHeight w:val="530" w:hRule="atLeast"/>
+        </w:trPr>
+        <w:tc>
+          <w:tcPr>
+            <w:tcW w:w="2000" w:type="dxa"/>
+          </w:tcPr>
+          <w:p>
+            <w:pPr/>
+            <w:r>
+              <w:t xml:space="preserve">posted_at</w:t>
+            </w:r>
+          </w:p>
+        </w:tc>
+        <w:tc>
+          <w:tcPr>
+            <w:tcW w:w="2000" w:type="dxa"/>
+          </w:tcPr>
+          <w:p>
+            <w:pPr/>
+            <w:r>
+              <w:t xml:space="preserve">datetime2</w:t>
+            </w:r>
+          </w:p>
+        </w:tc>
+        <w:tc>
+          <w:tcPr>
+            <w:tcW w:w="2000" w:type="dxa"/>
+          </w:tcPr>
+          <w:p>
+            <w:pPr/>
+            <w:r>
+              <w:t xml:space="preserve">(6)</w:t>
+            </w:r>
+          </w:p>
+        </w:tc>
+        <w:tc>
+          <w:tcPr>
+            <w:tcW w:w="2000" w:type="dxa"/>
+          </w:tcPr>
+          <w:p>
+            <w:pPr/>
+            <w:r>
+              <w:t xml:space="preserve">IS NULL</w:t>
+            </w:r>
+          </w:p>
+        </w:tc>
+      </w:tr>
+      <w:tr>
+        <w:trPr>
+          <w:trHeight w:val="530" w:hRule="atLeast"/>
+        </w:trPr>
+        <w:tc>
+          <w:tcPr>
+            <w:tcW w:w="2000" w:type="dxa"/>
+          </w:tcPr>
+          <w:p>
+            <w:pPr/>
+            <w:r>
+              <w:t xml:space="preserve">is_deleted</w:t>
+            </w:r>
+          </w:p>
+        </w:tc>
+        <w:tc>
+          <w:tcPr>
+            <w:tcW w:w="2000" w:type="dxa"/>
+          </w:tcPr>
+          <w:p>
+            <w:pPr/>
+            <w:r>
+              <w:t xml:space="preserve">bit</w:t>
+            </w:r>
+          </w:p>
+        </w:tc>
+        <w:tc>
+          <w:tcPr>
+            <w:tcW w:w="2000" w:type="dxa"/>
+          </w:tcPr>
+          <w:p>
+            <w:pPr/>
+            <w:r>
+              <w:t xml:space="preserve">-</w:t>
+            </w:r>
+          </w:p>
+        </w:tc>
+        <w:tc>
+          <w:tcPr>
+            <w:tcW w:w="2000" w:type="dxa"/>
+          </w:tcPr>
+          <w:p>
+            <w:pPr/>
+            <w:r>
+              <w:t xml:space="preserve">NOT NULL</w:t>
+            </w:r>
+          </w:p>
+        </w:tc>
+      </w:tr>
+      <w:tr>
+        <w:trPr>
+          <w:trHeight w:val="530" w:hRule="atLeast"/>
+        </w:trPr>
+        <w:tc>
+          <w:tcPr>
+            <w:tcW w:w="2000" w:type="dxa"/>
+          </w:tcPr>
+          <w:p>
+            <w:pPr/>
+            <w:r>
+              <w:t xml:space="preserve">deleted_at</w:t>
+            </w:r>
+          </w:p>
+        </w:tc>
+        <w:tc>
+          <w:tcPr>
+            <w:tcW w:w="2000" w:type="dxa"/>
+          </w:tcPr>
+          <w:p>
+            <w:pPr/>
+            <w:r>
+              <w:t xml:space="preserve">datetime2</w:t>
+            </w:r>
+          </w:p>
+        </w:tc>
+        <w:tc>
+          <w:tcPr>
+            <w:tcW w:w="2000" w:type="dxa"/>
+          </w:tcPr>
+          <w:p>
+            <w:pPr/>
+            <w:r>
+              <w:t xml:space="preserve">(6)</w:t>
+            </w:r>
+          </w:p>
+        </w:tc>
+        <w:tc>
+          <w:tcPr>
+            <w:tcW w:w="2000" w:type="dxa"/>
+          </w:tcPr>
+          <w:p>
+            <w:pPr/>
+            <w:r>
+              <w:t xml:space="preserve">IS NULL</w:t>
+            </w:r>
+          </w:p>
+        </w:tc>
+      </w:tr>
+      <w:tr>
+        <w:trPr>
+          <w:trHeight w:val="530" w:hRule="atLeast"/>
+        </w:trPr>
+        <w:tc>
+          <w:tcPr>
+            <w:tcW w:w="2000" w:type="dxa"/>
+          </w:tcPr>
+          <w:p>
+            <w:pPr/>
+            <w:r>
+              <w:t xml:space="preserve">company_id</w:t>
+            </w:r>
+          </w:p>
+        </w:tc>
+        <w:tc>
+          <w:tcPr>
+            <w:tcW w:w="2000" w:type="dxa"/>
+          </w:tcPr>
+          <w:p>
+            <w:pPr/>
+            <w:r>
+              <w:t xml:space="preserve">bigint</w:t>
+            </w:r>
+          </w:p>
+        </w:tc>
+        <w:tc>
+          <w:tcPr>
+            <w:tcW w:w="2000" w:type="dxa"/>
+          </w:tcPr>
+          <w:p>
+            <w:pPr/>
+            <w:r>
+              <w:t xml:space="preserve">-</w:t>
+            </w:r>
+          </w:p>
+        </w:tc>
+        <w:tc>
+          <w:tcPr>
+            <w:tcW w:w="2000" w:type="dxa"/>
+          </w:tcPr>
+          <w:p>
+            <w:pPr/>
+            <w:r>
+              <w:t xml:space="preserve">NOT NULL</w:t>
+            </w:r>
+          </w:p>
+        </w:tc>
+      </w:tr>
+      <w:tr>
+        <w:trPr>
+          <w:trHeight w:val="530" w:hRule="atLeast"/>
+        </w:trPr>
+        <w:tc>
+          <w:tcPr>
+            <w:tcW w:w="2000" w:type="dxa"/>
+          </w:tcPr>
+          <w:p>
+            <w:pPr/>
+            <w:r>
+              <w:t xml:space="preserve">created_at</w:t>
+            </w:r>
+          </w:p>
+        </w:tc>
+        <w:tc>
+          <w:tcPr>
+            <w:tcW w:w="2000" w:type="dxa"/>
+          </w:tcPr>
+          <w:p>
+            <w:pPr/>
+            <w:r>
+              <w:t xml:space="preserve">datetime2</w:t>
+            </w:r>
+          </w:p>
+        </w:tc>
+        <w:tc>
+          <w:tcPr>
+            <w:tcW w:w="2000" w:type="dxa"/>
+          </w:tcPr>
+          <w:p>
+            <w:pPr/>
+            <w:r>
+              <w:t xml:space="preserve">(6)</w:t>
+            </w:r>
+          </w:p>
+        </w:tc>
+        <w:tc>
+          <w:tcPr>
+            <w:tcW w:w="2000" w:type="dxa"/>
+          </w:tcPr>
+          <w:p>
+            <w:pPr/>
+            <w:r>
+              <w:t xml:space="preserve">NOT NULL</w:t>
+            </w:r>
+          </w:p>
+        </w:tc>
+      </w:tr>
+      <w:tr>
+        <w:trPr>
+          <w:trHeight w:val="530" w:hRule="atLeast"/>
+        </w:trPr>
+        <w:tc>
+          <w:tcPr>
+            <w:tcW w:w="2000" w:type="dxa"/>
+          </w:tcPr>
+          <w:p>
+            <w:pPr/>
+            <w:r>
+              <w:t xml:space="preserve">created_by</w:t>
+            </w:r>
+          </w:p>
+        </w:tc>
+        <w:tc>
+          <w:tcPr>
+            <w:tcW w:w="2000" w:type="dxa"/>
+          </w:tcPr>
+          <w:p>
+            <w:pPr/>
+            <w:r>
+              <w:t xml:space="preserve">bigint</w:t>
+            </w:r>
+          </w:p>
+        </w:tc>
+        <w:tc>
+          <w:tcPr>
+            <w:tcW w:w="2000" w:type="dxa"/>
+          </w:tcPr>
+          <w:p>
+            <w:pPr/>
+            <w:r>
+              <w:t xml:space="preserve">-</w:t>
+            </w:r>
+          </w:p>
+        </w:tc>
+        <w:tc>
+          <w:tcPr>
+            <w:tcW w:w="2000" w:type="dxa"/>
+          </w:tcPr>
+          <w:p>
+            <w:pPr/>
+            <w:r>
+              <w:t xml:space="preserve">NOT NULL</w:t>
+            </w:r>
+          </w:p>
+        </w:tc>
+      </w:tr>
+      <w:tr>
+        <w:trPr>
+          <w:trHeight w:val="530" w:hRule="atLeast"/>
+        </w:trPr>
+        <w:tc>
+          <w:tcPr>
+            <w:tcW w:w="2000" w:type="dxa"/>
+          </w:tcPr>
+          <w:p>
+            <w:pPr/>
+            <w:r>
+              <w:t xml:space="preserve">updated_at</w:t>
+            </w:r>
+          </w:p>
+        </w:tc>
+        <w:tc>
+          <w:tcPr>
+            <w:tcW w:w="2000" w:type="dxa"/>
+          </w:tcPr>
+          <w:p>
+            <w:pPr/>
+            <w:r>
+              <w:t xml:space="preserve">datetime2</w:t>
+            </w:r>
+          </w:p>
+        </w:tc>
+        <w:tc>
+          <w:tcPr>
+            <w:tcW w:w="2000" w:type="dxa"/>
+          </w:tcPr>
+          <w:p>
+            <w:pPr/>
+            <w:r>
+              <w:t xml:space="preserve">(6)</w:t>
+            </w:r>
+          </w:p>
+        </w:tc>
+        <w:tc>
+          <w:tcPr>
+            <w:tcW w:w="2000" w:type="dxa"/>
+          </w:tcPr>
+          <w:p>
+            <w:pPr/>
+            <w:r>
+              <w:t xml:space="preserve">IS NULL</w:t>
+            </w:r>
+          </w:p>
+        </w:tc>
+      </w:tr>
+      <w:tr>
+        <w:trPr>
+          <w:trHeight w:val="530" w:hRule="atLeast"/>
+        </w:trPr>
+        <w:tc>
+          <w:tcPr>
+            <w:tcW w:w="2000" w:type="dxa"/>
+          </w:tcPr>
+          <w:p>
+            <w:pPr/>
+            <w:r>
+              <w:t xml:space="preserve">updated_by</w:t>
+            </w:r>
+          </w:p>
+        </w:tc>
+        <w:tc>
+          <w:tcPr>
+            <w:tcW w:w="2000" w:type="dxa"/>
+          </w:tcPr>
+          <w:p>
+            <w:pPr/>
+            <w:r>
+              <w:t xml:space="preserve">bigint</w:t>
+            </w:r>
+          </w:p>
+        </w:tc>
+        <w:tc>
+          <w:tcPr>
+            <w:tcW w:w="2000" w:type="dxa"/>
+          </w:tcPr>
+          <w:p>
+            <w:pPr/>
+            <w:r>
+              <w:t xml:space="preserve">-</w:t>
+            </w:r>
+          </w:p>
+        </w:tc>
+        <w:tc>
+          <w:tcPr>
+            <w:tcW w:w="2000" w:type="dxa"/>
+          </w:tcPr>
+          <w:p>
+            <w:pPr/>
+            <w:r>
+              <w:t xml:space="preserve">IS NULL</w:t>
+            </w:r>
+          </w:p>
+        </w:tc>
+      </w:tr>
+      <w:tr>
+        <w:trPr>
+          <w:trHeight w:val="530" w:hRule="atLeast"/>
+        </w:trPr>
+        <w:tc>
+          <w:tcPr>
+            <w:tcW w:w="2000" w:type="dxa"/>
+          </w:tcPr>
+          <w:p>
+            <w:pPr/>
+            <w:r>
+              <w:t xml:space="preserve">version</w:t>
+            </w:r>
+          </w:p>
+        </w:tc>
+        <w:tc>
+          <w:tcPr>
+            <w:tcW w:w="2000" w:type="dxa"/>
+          </w:tcPr>
+          <w:p>
+            <w:pPr/>
+            <w:r>
+              <w:t xml:space="preserve">int</w:t>
+            </w:r>
+          </w:p>
+        </w:tc>
+        <w:tc>
+          <w:tcPr>
+            <w:tcW w:w="2000" w:type="dxa"/>
+          </w:tcPr>
+          <w:p>
+            <w:pPr/>
+            <w:r>
+              <w:t xml:space="preserve">-</w:t>
+            </w:r>
+          </w:p>
+        </w:tc>
+        <w:tc>
+          <w:tcPr>
+            <w:tcW w:w="2000" w:type="dxa"/>
+          </w:tcPr>
+          <w:p>
+            <w:pPr/>
+            <w:r>
+              <w:t xml:space="preserve">NOT NULL</w:t>
+            </w:r>
+          </w:p>
+        </w:tc>
+      </w:tr>
+    </w:tbl>
+    <w:p/>
+    <w:p>
+      <w:pPr/>
+      <w:r>
+        <w:t xml:space="preserve">Table Name: inv_assembly_line</w:t>
+      </w:r>
+    </w:p>
+    <w:p>
+      <w:pPr/>
+      <w:r>
+        <w:t xml:space="preserve">Primary Key: id</w:t>
+      </w:r>
+    </w:p>
+    <w:p>
+      <w:pPr/>
+      <w:r>
+        <w:t xml:space="preserve">This table stores one finished item or component per assembly line and its posted unit cost.</w:t>
+      </w:r>
+    </w:p>
+    <w:tbl>
+      <w:tblPr>
+        <w:tblStyle w:val="TableGrid"/>
+        <w:tblW w:w="8000" w:type="dxa"/>
+        <w:jc w:val="left"/>
+        <w:tblBorders>
+          <w:top w:val="single" w:color="000000" w:sz="4" w:space="0"/>
+          <w:left w:val="single" w:color="000000" w:sz="4" w:space="0"/>
+          <w:bottom w:val="single" w:color="000000" w:sz="4" w:space="0"/>
+          <w:right w:val="single" w:color="000000" w:sz="4" w:space="0"/>
+          <w:insideH w:val="single" w:color="000000" w:sz="4" w:space="0"/>
+          <w:insideV w:val="single" w:color="000000" w:sz="4" w:space="0"/>
+        </w:tblBorders>
+        <w:tblLayout w:type="fixed"/>
+        <w:tblCellMar>
+          <w:top w:w="100" w:type="dxa"/>
+          <w:left w:w="100" w:type="dxa"/>
+          <w:bottom w:w="100" w:type="dxa"/>
+          <w:right w:w="100" w:type="dxa"/>
+        </w:tblCellMar>
+      </w:tblPr>
+      <w:tblGrid>
+        <w:gridCol w:w="2000"/>
+        <w:gridCol w:w="2000"/>
+        <w:gridCol w:w="2000"/>
+        <w:gridCol w:w="2000"/>
+      </w:tblGrid>
+      <w:tr>
+        <w:trPr>
+          <w:trHeight w:val="530" w:hRule="atLeast"/>
+        </w:trPr>
+        <w:tc>
+          <w:tcPr>
+            <w:tcW w:w="2000" w:type="dxa"/>
+          </w:tcPr>
+          <w:p>
+            <w:pPr>
+              <w:jc w:val="center"/>
+            </w:pPr>
+            <w:r>
+              <w:rPr>
+                <w:b/>
+              </w:rPr>
+              <w:t xml:space="preserve">Name of Attribute</w:t>
+            </w:r>
+          </w:p>
+        </w:tc>
+        <w:tc>
+          <w:tcPr>
+            <w:tcW w:w="2000" w:type="dxa"/>
+          </w:tcPr>
+          <w:p>
+            <w:pPr>
+              <w:jc w:val="center"/>
+            </w:pPr>
+            <w:r>
+              <w:rPr>
+                <w:b/>
+              </w:rPr>
+              <w:t xml:space="preserve">Data Type</w:t>
+            </w:r>
+          </w:p>
+        </w:tc>
+        <w:tc>
+          <w:tcPr>
+            <w:tcW w:w="2000" w:type="dxa"/>
+          </w:tcPr>
+          <w:p>
+            <w:pPr>
+              <w:jc w:val="center"/>
+            </w:pPr>
+            <w:r>
+              <w:rPr>
+                <w:b/>
+              </w:rPr>
+              <w:t xml:space="preserve">Size</w:t>
+            </w:r>
+          </w:p>
+        </w:tc>
+        <w:tc>
+          <w:tcPr>
+            <w:tcW w:w="2000" w:type="dxa"/>
+          </w:tcPr>
+          <w:p>
+            <w:pPr>
+              <w:jc w:val="center"/>
+            </w:pPr>
+            <w:r>
+              <w:rPr>
+                <w:b/>
+              </w:rPr>
+              <w:t xml:space="preserve">PK/FK/IS NULL/ NOT NULL</w:t>
+            </w:r>
+          </w:p>
+        </w:tc>
+      </w:tr>
+      <w:tr>
+        <w:trPr>
+          <w:trHeight w:val="530" w:hRule="atLeast"/>
+        </w:trPr>
+        <w:tc>
+          <w:tcPr>
+            <w:tcW w:w="2000" w:type="dxa"/>
+          </w:tcPr>
+          <w:p>
+            <w:pPr/>
+            <w:r>
+              <w:t xml:space="preserve">id</w:t>
+            </w:r>
+          </w:p>
+        </w:tc>
+        <w:tc>
+          <w:tcPr>
+            <w:tcW w:w="2000" w:type="dxa"/>
+          </w:tcPr>
+          <w:p>
+            <w:pPr/>
+            <w:r>
+              <w:t xml:space="preserve">bigint</w:t>
+            </w:r>
+          </w:p>
+        </w:tc>
+        <w:tc>
+          <w:tcPr>
+            <w:tcW w:w="2000" w:type="dxa"/>
+          </w:tcPr>
+          <w:p>
+            <w:pPr/>
+            <w:r>
+              <w:t xml:space="preserve">-</w:t>
+            </w:r>
+          </w:p>
+        </w:tc>
+        <w:tc>
+          <w:tcPr>
+            <w:tcW w:w="2000" w:type="dxa"/>
+          </w:tcPr>
+          <w:p>
+            <w:pPr/>
+            <w:r>
+              <w:t xml:space="preserve">PK, NOT NULL</w:t>
+            </w:r>
+          </w:p>
+        </w:tc>
+      </w:tr>
+      <w:tr>
+        <w:trPr>
+          <w:trHeight w:val="530" w:hRule="atLeast"/>
+        </w:trPr>
+        <w:tc>
+          <w:tcPr>
+            <w:tcW w:w="2000" w:type="dxa"/>
+          </w:tcPr>
+          <w:p>
+            <w:pPr/>
+            <w:r>
+              <w:t xml:space="preserve">assembly_id</w:t>
+            </w:r>
+          </w:p>
+        </w:tc>
+        <w:tc>
+          <w:tcPr>
+            <w:tcW w:w="2000" w:type="dxa"/>
+          </w:tcPr>
+          <w:p>
+            <w:pPr/>
+            <w:r>
+              <w:t xml:space="preserve">bigint</w:t>
+            </w:r>
+          </w:p>
+        </w:tc>
+        <w:tc>
+          <w:tcPr>
+            <w:tcW w:w="2000" w:type="dxa"/>
+          </w:tcPr>
+          <w:p>
+            <w:pPr/>
+            <w:r>
+              <w:t xml:space="preserve">-</w:t>
+            </w:r>
+          </w:p>
+        </w:tc>
+        <w:tc>
+          <w:tcPr>
+            <w:tcW w:w="2000" w:type="dxa"/>
+          </w:tcPr>
+          <w:p>
+            <w:pPr/>
+            <w:r>
+              <w:t xml:space="preserve">FK, NOT NULL</w:t>
+            </w:r>
+          </w:p>
+        </w:tc>
+      </w:tr>
+      <w:tr>
+        <w:trPr>
+          <w:trHeight w:val="530" w:hRule="atLeast"/>
+        </w:trPr>
+        <w:tc>
+          <w:tcPr>
+            <w:tcW w:w="2000" w:type="dxa"/>
+          </w:tcPr>
+          <w:p>
+            <w:pPr/>
+            <w:r>
+              <w:t xml:space="preserve">line_no</w:t>
+            </w:r>
+          </w:p>
+        </w:tc>
+        <w:tc>
+          <w:tcPr>
+            <w:tcW w:w="2000" w:type="dxa"/>
+          </w:tcPr>
+          <w:p>
+            <w:pPr/>
+            <w:r>
+              <w:t xml:space="preserve">int</w:t>
+            </w:r>
+          </w:p>
+        </w:tc>
+        <w:tc>
+          <w:tcPr>
+            <w:tcW w:w="2000" w:type="dxa"/>
+          </w:tcPr>
+          <w:p>
+            <w:pPr/>
+            <w:r>
+              <w:t xml:space="preserve">-</w:t>
+            </w:r>
+          </w:p>
+        </w:tc>
+        <w:tc>
+          <w:tcPr>
+            <w:tcW w:w="2000" w:type="dxa"/>
+          </w:tcPr>
+          <w:p>
+            <w:pPr/>
+            <w:r>
+              <w:t xml:space="preserve">NOT NULL</w:t>
+            </w:r>
+          </w:p>
+        </w:tc>
+      </w:tr>
+      <w:tr>
+        <w:trPr>
+          <w:trHeight w:val="530" w:hRule="atLeast"/>
+        </w:trPr>
+        <w:tc>
+          <w:tcPr>
+            <w:tcW w:w="2000" w:type="dxa"/>
+          </w:tcPr>
+          <w:p>
+            <w:pPr/>
+            <w:r>
+              <w:t xml:space="preserve">role</w:t>
+            </w:r>
+          </w:p>
+        </w:tc>
+        <w:tc>
+          <w:tcPr>
+            <w:tcW w:w="2000" w:type="dxa"/>
+          </w:tcPr>
+          <w:p>
+            <w:pPr/>
+            <w:r>
+              <w:t xml:space="preserve">varchar</w:t>
+            </w:r>
+          </w:p>
+        </w:tc>
+        <w:tc>
+          <w:tcPr>
+            <w:tcW w:w="2000" w:type="dxa"/>
+          </w:tcPr>
+          <w:p>
+            <w:pPr/>
+            <w:r>
+              <w:t xml:space="preserve">20</w:t>
+            </w:r>
+          </w:p>
+        </w:tc>
+        <w:tc>
+          <w:tcPr>
+            <w:tcW w:w="2000" w:type="dxa"/>
+          </w:tcPr>
+          <w:p>
+            <w:pPr/>
+            <w:r>
+              <w:t xml:space="preserve">NOT NULL</w:t>
+            </w:r>
+          </w:p>
+        </w:tc>
+      </w:tr>
+      <w:tr>
+        <w:trPr>
+          <w:trHeight w:val="530" w:hRule="atLeast"/>
+        </w:trPr>
+        <w:tc>
+          <w:tcPr>
+            <w:tcW w:w="2000" w:type="dxa"/>
+          </w:tcPr>
+          <w:p>
+            <w:pPr/>
+            <w:r>
+              <w:t xml:space="preserve">item_id</w:t>
+            </w:r>
+          </w:p>
+        </w:tc>
+        <w:tc>
+          <w:tcPr>
+            <w:tcW w:w="2000" w:type="dxa"/>
+          </w:tcPr>
+          <w:p>
+            <w:pPr/>
+            <w:r>
+              <w:t xml:space="preserve">bigint</w:t>
+            </w:r>
+          </w:p>
+        </w:tc>
+        <w:tc>
+          <w:tcPr>
+            <w:tcW w:w="2000" w:type="dxa"/>
+          </w:tcPr>
+          <w:p>
+            <w:pPr/>
+            <w:r>
+              <w:t xml:space="preserve">-</w:t>
+            </w:r>
+          </w:p>
+        </w:tc>
+        <w:tc>
+          <w:tcPr>
+            <w:tcW w:w="2000" w:type="dxa"/>
+          </w:tcPr>
+          <w:p>
+            <w:pPr/>
+            <w:r>
+              <w:t xml:space="preserve">NOT NULL</w:t>
+            </w:r>
+          </w:p>
+        </w:tc>
+      </w:tr>
+      <w:tr>
+        <w:trPr>
+          <w:trHeight w:val="530" w:hRule="atLeast"/>
+        </w:trPr>
+        <w:tc>
+          <w:tcPr>
+            <w:tcW w:w="2000" w:type="dxa"/>
+          </w:tcPr>
+          <w:p>
+            <w:pPr/>
+            <w:r>
+              <w:t xml:space="preserve">warehouse_id</w:t>
+            </w:r>
+          </w:p>
+        </w:tc>
+        <w:tc>
+          <w:tcPr>
+            <w:tcW w:w="2000" w:type="dxa"/>
+          </w:tcPr>
+          <w:p>
+            <w:pPr/>
+            <w:r>
+              <w:t xml:space="preserve">bigint</w:t>
+            </w:r>
+          </w:p>
+        </w:tc>
+        <w:tc>
+          <w:tcPr>
+            <w:tcW w:w="2000" w:type="dxa"/>
+          </w:tcPr>
+          <w:p>
+            <w:pPr/>
+            <w:r>
+              <w:t xml:space="preserve">-</w:t>
+            </w:r>
+          </w:p>
+        </w:tc>
+        <w:tc>
+          <w:tcPr>
+            <w:tcW w:w="2000" w:type="dxa"/>
+          </w:tcPr>
+          <w:p>
+            <w:pPr/>
+            <w:r>
+              <w:t xml:space="preserve">NOT NULL</w:t>
+            </w:r>
+          </w:p>
+        </w:tc>
+      </w:tr>
+      <w:tr>
+        <w:trPr>
+          <w:trHeight w:val="530" w:hRule="atLeast"/>
+        </w:trPr>
+        <w:tc>
+          <w:tcPr>
+            <w:tcW w:w="2000" w:type="dxa"/>
+          </w:tcPr>
+          <w:p>
+            <w:pPr/>
+            <w:r>
+              <w:t xml:space="preserve">location_id</w:t>
+            </w:r>
+          </w:p>
+        </w:tc>
+        <w:tc>
+          <w:tcPr>
+            <w:tcW w:w="2000" w:type="dxa"/>
+          </w:tcPr>
+          <w:p>
+            <w:pPr/>
+            <w:r>
+              <w:t xml:space="preserve">bigint</w:t>
+            </w:r>
+          </w:p>
+        </w:tc>
+        <w:tc>
+          <w:tcPr>
+            <w:tcW w:w="2000" w:type="dxa"/>
+          </w:tcPr>
+          <w:p>
+            <w:pPr/>
+            <w:r>
+              <w:t xml:space="preserve">-</w:t>
+            </w:r>
+          </w:p>
+        </w:tc>
+        <w:tc>
+          <w:tcPr>
+            <w:tcW w:w="2000" w:type="dxa"/>
+          </w:tcPr>
+          <w:p>
+            <w:pPr/>
+            <w:r>
+              <w:t xml:space="preserve">IS NULL</w:t>
+            </w:r>
+          </w:p>
+        </w:tc>
+      </w:tr>
+      <w:tr>
+        <w:trPr>
+          <w:trHeight w:val="530" w:hRule="atLeast"/>
+        </w:trPr>
+        <w:tc>
+          <w:tcPr>
+            <w:tcW w:w="2000" w:type="dxa"/>
+          </w:tcPr>
+          <w:p>
+            <w:pPr/>
+            <w:r>
+              <w:t xml:space="preserve">quantity</w:t>
+            </w:r>
+          </w:p>
+        </w:tc>
+        <w:tc>
+          <w:tcPr>
+            <w:tcW w:w="2000" w:type="dxa"/>
+          </w:tcPr>
+          <w:p>
+            <w:pPr/>
+            <w:r>
+              <w:t xml:space="preserve">decimal</w:t>
+            </w:r>
+          </w:p>
+        </w:tc>
+        <w:tc>
+          <w:tcPr>
+            <w:tcW w:w="2000" w:type="dxa"/>
+          </w:tcPr>
+          <w:p>
+            <w:pPr/>
+            <w:r>
+              <w:t xml:space="preserve">(19,6)</w:t>
+            </w:r>
+          </w:p>
+        </w:tc>
+        <w:tc>
+          <w:tcPr>
+            <w:tcW w:w="2000" w:type="dxa"/>
+          </w:tcPr>
+          <w:p>
+            <w:pPr/>
+            <w:r>
+              <w:t xml:space="preserve">NOT NULL</w:t>
+            </w:r>
+          </w:p>
+        </w:tc>
+      </w:tr>
+      <w:tr>
+        <w:trPr>
+          <w:trHeight w:val="530" w:hRule="atLeast"/>
+        </w:trPr>
+        <w:tc>
+          <w:tcPr>
+            <w:tcW w:w="2000" w:type="dxa"/>
+          </w:tcPr>
+          <w:p>
+            <w:pPr/>
+            <w:r>
+              <w:t xml:space="preserve">posted_unit_cost</w:t>
+            </w:r>
+          </w:p>
+        </w:tc>
+        <w:tc>
+          <w:tcPr>
+            <w:tcW w:w="2000" w:type="dxa"/>
+          </w:tcPr>
+          <w:p>
+            <w:pPr/>
+            <w:r>
+              <w:t xml:space="preserve">decimal</w:t>
+            </w:r>
+          </w:p>
+        </w:tc>
+        <w:tc>
+          <w:tcPr>
+            <w:tcW w:w="2000" w:type="dxa"/>
+          </w:tcPr>
+          <w:p>
+            <w:pPr/>
+            <w:r>
+              <w:t xml:space="preserve">(19,6)</w:t>
+            </w:r>
+          </w:p>
+        </w:tc>
+        <w:tc>
+          <w:tcPr>
+            <w:tcW w:w="2000" w:type="dxa"/>
+          </w:tcPr>
+          <w:p>
+            <w:pPr/>
+            <w:r>
+              <w:t xml:space="preserve">IS NULL</w:t>
+            </w:r>
+          </w:p>
+        </w:tc>
+      </w:tr>
+      <w:tr>
+        <w:trPr>
+          <w:trHeight w:val="530" w:hRule="atLeast"/>
+        </w:trPr>
+        <w:tc>
+          <w:tcPr>
+            <w:tcW w:w="2000" w:type="dxa"/>
+          </w:tcPr>
+          <w:p>
+            <w:pPr/>
+            <w:r>
+              <w:t xml:space="preserve">company_id</w:t>
+            </w:r>
+          </w:p>
+        </w:tc>
+        <w:tc>
+          <w:tcPr>
+            <w:tcW w:w="2000" w:type="dxa"/>
+          </w:tcPr>
+          <w:p>
+            <w:pPr/>
+            <w:r>
+              <w:t xml:space="preserve">bigint</w:t>
+            </w:r>
+          </w:p>
+        </w:tc>
+        <w:tc>
+          <w:tcPr>
+            <w:tcW w:w="2000" w:type="dxa"/>
+          </w:tcPr>
+          <w:p>
+            <w:pPr/>
+            <w:r>
+              <w:t xml:space="preserve">-</w:t>
+            </w:r>
+          </w:p>
+        </w:tc>
+        <w:tc>
+          <w:tcPr>
+            <w:tcW w:w="2000" w:type="dxa"/>
+          </w:tcPr>
+          <w:p>
+            <w:pPr/>
+            <w:r>
+              <w:t xml:space="preserve">FK, NOT NULL</w:t>
+            </w:r>
+          </w:p>
+        </w:tc>
+      </w:tr>
+      <w:tr>
+        <w:trPr>
+          <w:trHeight w:val="530" w:hRule="atLeast"/>
+        </w:trPr>
+        <w:tc>
+          <w:tcPr>
+            <w:tcW w:w="2000" w:type="dxa"/>
+          </w:tcPr>
+          <w:p>
+            <w:pPr/>
+            <w:r>
+              <w:t xml:space="preserve">created_at</w:t>
+            </w:r>
+          </w:p>
+        </w:tc>
+        <w:tc>
+          <w:tcPr>
+            <w:tcW w:w="2000" w:type="dxa"/>
+          </w:tcPr>
+          <w:p>
+            <w:pPr/>
+            <w:r>
+              <w:t xml:space="preserve">datetime2</w:t>
+            </w:r>
+          </w:p>
+        </w:tc>
+        <w:tc>
+          <w:tcPr>
+            <w:tcW w:w="2000" w:type="dxa"/>
+          </w:tcPr>
+          <w:p>
+            <w:pPr/>
+            <w:r>
+              <w:t xml:space="preserve">(6)</w:t>
+            </w:r>
+          </w:p>
+        </w:tc>
+        <w:tc>
+          <w:tcPr>
+            <w:tcW w:w="2000" w:type="dxa"/>
+          </w:tcPr>
+          <w:p>
+            <w:pPr/>
+            <w:r>
+              <w:t xml:space="preserve">NOT NULL</w:t>
+            </w:r>
+          </w:p>
+        </w:tc>
+      </w:tr>
+      <w:tr>
+        <w:trPr>
+          <w:trHeight w:val="530" w:hRule="atLeast"/>
+        </w:trPr>
+        <w:tc>
+          <w:tcPr>
+            <w:tcW w:w="2000" w:type="dxa"/>
+          </w:tcPr>
+          <w:p>
+            <w:pPr/>
+            <w:r>
+              <w:t xml:space="preserve">created_by</w:t>
+            </w:r>
+          </w:p>
+        </w:tc>
+        <w:tc>
+          <w:tcPr>
+            <w:tcW w:w="2000" w:type="dxa"/>
+          </w:tcPr>
+          <w:p>
+            <w:pPr/>
+            <w:r>
+              <w:t xml:space="preserve">bigint</w:t>
+            </w:r>
+          </w:p>
+        </w:tc>
+        <w:tc>
+          <w:tcPr>
+            <w:tcW w:w="2000" w:type="dxa"/>
+          </w:tcPr>
+          <w:p>
+            <w:pPr/>
+            <w:r>
+              <w:t xml:space="preserve">-</w:t>
+            </w:r>
+          </w:p>
+        </w:tc>
+        <w:tc>
+          <w:tcPr>
+            <w:tcW w:w="2000" w:type="dxa"/>
+          </w:tcPr>
+          <w:p>
+            <w:pPr/>
+            <w:r>
+              <w:t xml:space="preserve">NOT NULL</w:t>
+            </w:r>
+          </w:p>
+        </w:tc>
+      </w:tr>
+      <w:tr>
+        <w:trPr>
+          <w:trHeight w:val="530" w:hRule="atLeast"/>
+        </w:trPr>
+        <w:tc>
+          <w:tcPr>
+            <w:tcW w:w="2000" w:type="dxa"/>
+          </w:tcPr>
+          <w:p>
+            <w:pPr/>
+            <w:r>
+              <w:t xml:space="preserve">updated_at</w:t>
+            </w:r>
+          </w:p>
+        </w:tc>
+        <w:tc>
+          <w:tcPr>
+            <w:tcW w:w="2000" w:type="dxa"/>
+          </w:tcPr>
+          <w:p>
+            <w:pPr/>
+            <w:r>
+              <w:t xml:space="preserve">datetime2</w:t>
+            </w:r>
+          </w:p>
+        </w:tc>
+        <w:tc>
+          <w:tcPr>
+            <w:tcW w:w="2000" w:type="dxa"/>
+          </w:tcPr>
+          <w:p>
+            <w:pPr/>
+            <w:r>
+              <w:t xml:space="preserve">(6)</w:t>
+            </w:r>
+          </w:p>
+        </w:tc>
+        <w:tc>
+          <w:tcPr>
+            <w:tcW w:w="2000" w:type="dxa"/>
+          </w:tcPr>
+          <w:p>
+            <w:pPr/>
+            <w:r>
+              <w:t xml:space="preserve">IS NULL</w:t>
+            </w:r>
+          </w:p>
+        </w:tc>
+      </w:tr>
+      <w:tr>
+        <w:trPr>
+          <w:trHeight w:val="530" w:hRule="atLeast"/>
+        </w:trPr>
+        <w:tc>
+          <w:tcPr>
+            <w:tcW w:w="2000" w:type="dxa"/>
+          </w:tcPr>
+          <w:p>
+            <w:pPr/>
+            <w:r>
+              <w:t xml:space="preserve">updated_by</w:t>
+            </w:r>
+          </w:p>
+        </w:tc>
+        <w:tc>
+          <w:tcPr>
+            <w:tcW w:w="2000" w:type="dxa"/>
+          </w:tcPr>
+          <w:p>
+            <w:pPr/>
+            <w:r>
+              <w:t xml:space="preserve">bigint</w:t>
+            </w:r>
+          </w:p>
+        </w:tc>
+        <w:tc>
+          <w:tcPr>
+            <w:tcW w:w="2000" w:type="dxa"/>
+          </w:tcPr>
+          <w:p>
+            <w:pPr/>
+            <w:r>
+              <w:t xml:space="preserve">-</w:t>
+            </w:r>
+          </w:p>
+        </w:tc>
+        <w:tc>
+          <w:tcPr>
+            <w:tcW w:w="2000" w:type="dxa"/>
+          </w:tcPr>
+          <w:p>
+            <w:pPr/>
+            <w:r>
+              <w:t xml:space="preserve">IS NULL</w:t>
+            </w:r>
+          </w:p>
+        </w:tc>
+      </w:tr>
+      <w:tr>
+        <w:trPr>
+          <w:trHeight w:val="530" w:hRule="atLeast"/>
+        </w:trPr>
+        <w:tc>
+          <w:tcPr>
+            <w:tcW w:w="2000" w:type="dxa"/>
+          </w:tcPr>
+          <w:p>
+            <w:pPr/>
+            <w:r>
+              <w:t xml:space="preserve">version</w:t>
+            </w:r>
+          </w:p>
+        </w:tc>
+        <w:tc>
+          <w:tcPr>
+            <w:tcW w:w="2000" w:type="dxa"/>
+          </w:tcPr>
+          <w:p>
+            <w:pPr/>
+            <w:r>
+              <w:t xml:space="preserve">int</w:t>
+            </w:r>
+          </w:p>
+        </w:tc>
+        <w:tc>
+          <w:tcPr>
+            <w:tcW w:w="2000" w:type="dxa"/>
+          </w:tcPr>
+          <w:p>
+            <w:pPr/>
+            <w:r>
+              <w:t xml:space="preserve">-</w:t>
+            </w:r>
+          </w:p>
+        </w:tc>
+        <w:tc>
+          <w:tcPr>
+            <w:tcW w:w="2000" w:type="dxa"/>
+          </w:tcPr>
+          <w:p>
+            <w:pPr/>
+            <w:r>
+              <w:t xml:space="preserve">NOT NULL</w:t>
+            </w:r>
+          </w:p>
+        </w:tc>
+      </w:tr>
+    </w:tbl>
+    <w:p/>
+    <w:p>
+      <w:pPr/>
+      <w:r>
+        <w:t xml:space="preserve">Table Name: inv_assembly_line_tracking</w:t>
+      </w:r>
+    </w:p>
+    <w:p>
+      <w:pPr/>
+      <w:r>
+        <w:t xml:space="preserve">Primary Key: id</w:t>
+      </w:r>
+    </w:p>
+    <w:p>
+      <w:pPr/>
+      <w:r>
+        <w:t xml:space="preserve">This table stores the lot or serial quantities selected for each assembly line.</w:t>
+      </w:r>
+    </w:p>
+    <w:tbl>
+      <w:tblPr>
+        <w:tblStyle w:val="TableGrid"/>
+        <w:tblW w:w="8000" w:type="dxa"/>
+        <w:jc w:val="left"/>
+        <w:tblBorders>
+          <w:top w:val="single" w:color="000000" w:sz="4" w:space="0"/>
+          <w:left w:val="single" w:color="000000" w:sz="4" w:space="0"/>
+          <w:bottom w:val="single" w:color="000000" w:sz="4" w:space="0"/>
+          <w:right w:val="single" w:color="000000" w:sz="4" w:space="0"/>
+          <w:insideH w:val="single" w:color="000000" w:sz="4" w:space="0"/>
+          <w:insideV w:val="single" w:color="000000" w:sz="4" w:space="0"/>
+        </w:tblBorders>
+        <w:tblLayout w:type="fixed"/>
+        <w:tblCellMar>
+          <w:top w:w="100" w:type="dxa"/>
+          <w:left w:w="100" w:type="dxa"/>
+          <w:bottom w:w="100" w:type="dxa"/>
+          <w:right w:w="100" w:type="dxa"/>
+        </w:tblCellMar>
+      </w:tblPr>
+      <w:tblGrid>
+        <w:gridCol w:w="2000"/>
+        <w:gridCol w:w="2000"/>
+        <w:gridCol w:w="2000"/>
+        <w:gridCol w:w="2000"/>
+      </w:tblGrid>
+      <w:tr>
+        <w:trPr>
+          <w:trHeight w:val="530" w:hRule="atLeast"/>
+        </w:trPr>
+        <w:tc>
+          <w:tcPr>
+            <w:tcW w:w="2000" w:type="dxa"/>
+          </w:tcPr>
+          <w:p>
+            <w:pPr>
+              <w:jc w:val="center"/>
+            </w:pPr>
+            <w:r>
+              <w:rPr>
+                <w:b/>
+              </w:rPr>
+              <w:t xml:space="preserve">Name of Attribute</w:t>
+            </w:r>
+          </w:p>
+        </w:tc>
+        <w:tc>
+          <w:tcPr>
+            <w:tcW w:w="2000" w:type="dxa"/>
+          </w:tcPr>
+          <w:p>
+            <w:pPr>
+              <w:jc w:val="center"/>
+            </w:pPr>
+            <w:r>
+              <w:rPr>
+                <w:b/>
+              </w:rPr>
+              <w:t xml:space="preserve">Data Type</w:t>
+            </w:r>
+          </w:p>
+        </w:tc>
+        <w:tc>
+          <w:tcPr>
+            <w:tcW w:w="2000" w:type="dxa"/>
+          </w:tcPr>
+          <w:p>
+            <w:pPr>
+              <w:jc w:val="center"/>
+            </w:pPr>
+            <w:r>
+              <w:rPr>
+                <w:b/>
+              </w:rPr>
+              <w:t xml:space="preserve">Size</w:t>
+            </w:r>
+          </w:p>
+        </w:tc>
+        <w:tc>
+          <w:tcPr>
+            <w:tcW w:w="2000" w:type="dxa"/>
+          </w:tcPr>
+          <w:p>
+            <w:pPr>
+              <w:jc w:val="center"/>
+            </w:pPr>
+            <w:r>
+              <w:rPr>
+                <w:b/>
+              </w:rPr>
+              <w:t xml:space="preserve">PK/FK/IS NULL/ NOT NULL</w:t>
+            </w:r>
+          </w:p>
+        </w:tc>
+      </w:tr>
+      <w:tr>
+        <w:trPr>
+          <w:trHeight w:val="530" w:hRule="atLeast"/>
+        </w:trPr>
+        <w:tc>
+          <w:tcPr>
+            <w:tcW w:w="2000" w:type="dxa"/>
+          </w:tcPr>
+          <w:p>
+            <w:pPr/>
+            <w:r>
+              <w:t xml:space="preserve">id</w:t>
+            </w:r>
+          </w:p>
+        </w:tc>
+        <w:tc>
+          <w:tcPr>
+            <w:tcW w:w="2000" w:type="dxa"/>
+          </w:tcPr>
+          <w:p>
+            <w:pPr/>
+            <w:r>
+              <w:t xml:space="preserve">bigint</w:t>
+            </w:r>
+          </w:p>
+        </w:tc>
+        <w:tc>
+          <w:tcPr>
+            <w:tcW w:w="2000" w:type="dxa"/>
+          </w:tcPr>
+          <w:p>
+            <w:pPr/>
+            <w:r>
+              <w:t xml:space="preserve">-</w:t>
+            </w:r>
+          </w:p>
+        </w:tc>
+        <w:tc>
+          <w:tcPr>
+            <w:tcW w:w="2000" w:type="dxa"/>
+          </w:tcPr>
+          <w:p>
+            <w:pPr/>
+            <w:r>
+              <w:t xml:space="preserve">PK, NOT NULL</w:t>
+            </w:r>
+          </w:p>
+        </w:tc>
+      </w:tr>
+      <w:tr>
+        <w:trPr>
+          <w:trHeight w:val="530" w:hRule="atLeast"/>
+        </w:trPr>
+        <w:tc>
+          <w:tcPr>
+            <w:tcW w:w="2000" w:type="dxa"/>
+          </w:tcPr>
+          <w:p>
+            <w:pPr/>
+            <w:r>
+              <w:t xml:space="preserve">line_id</w:t>
+            </w:r>
+          </w:p>
+        </w:tc>
+        <w:tc>
+          <w:tcPr>
+            <w:tcW w:w="2000" w:type="dxa"/>
+          </w:tcPr>
+          <w:p>
+            <w:pPr/>
+            <w:r>
+              <w:t xml:space="preserve">bigint</w:t>
+            </w:r>
+          </w:p>
+        </w:tc>
+        <w:tc>
+          <w:tcPr>
+            <w:tcW w:w="2000" w:type="dxa"/>
+          </w:tcPr>
+          <w:p>
+            <w:pPr/>
+            <w:r>
+              <w:t xml:space="preserve">-</w:t>
+            </w:r>
+          </w:p>
+        </w:tc>
+        <w:tc>
+          <w:tcPr>
+            <w:tcW w:w="2000" w:type="dxa"/>
+          </w:tcPr>
+          <w:p>
+            <w:pPr/>
+            <w:r>
+              <w:t xml:space="preserve">FK, NOT NULL</w:t>
+            </w:r>
+          </w:p>
+        </w:tc>
+      </w:tr>
+      <w:tr>
+        <w:trPr>
+          <w:trHeight w:val="530" w:hRule="atLeast"/>
+        </w:trPr>
+        <w:tc>
+          <w:tcPr>
+            <w:tcW w:w="2000" w:type="dxa"/>
+          </w:tcPr>
+          <w:p>
+            <w:pPr/>
+            <w:r>
+              <w:t xml:space="preserve">seq_no</w:t>
+            </w:r>
+          </w:p>
+        </w:tc>
+        <w:tc>
+          <w:tcPr>
+            <w:tcW w:w="2000" w:type="dxa"/>
+          </w:tcPr>
+          <w:p>
+            <w:pPr/>
+            <w:r>
+              <w:t xml:space="preserve">int</w:t>
+            </w:r>
+          </w:p>
+        </w:tc>
+        <w:tc>
+          <w:tcPr>
+            <w:tcW w:w="2000" w:type="dxa"/>
+          </w:tcPr>
+          <w:p>
+            <w:pPr/>
+            <w:r>
+              <w:t xml:space="preserve">-</w:t>
+            </w:r>
+          </w:p>
+        </w:tc>
+        <w:tc>
+          <w:tcPr>
+            <w:tcW w:w="2000" w:type="dxa"/>
+          </w:tcPr>
+          <w:p>
+            <w:pPr/>
+            <w:r>
+              <w:t xml:space="preserve">NOT NULL</w:t>
+            </w:r>
+          </w:p>
+        </w:tc>
+      </w:tr>
+      <w:tr>
+        <w:trPr>
+          <w:trHeight w:val="530" w:hRule="atLeast"/>
+        </w:trPr>
+        <w:tc>
+          <w:tcPr>
+            <w:tcW w:w="2000" w:type="dxa"/>
+          </w:tcPr>
+          <w:p>
+            <w:pPr/>
+            <w:r>
+              <w:t xml:space="preserve">lot_no</w:t>
+            </w:r>
+          </w:p>
+        </w:tc>
+        <w:tc>
+          <w:tcPr>
+            <w:tcW w:w="2000" w:type="dxa"/>
+          </w:tcPr>
+          <w:p>
+            <w:pPr/>
+            <w:r>
+              <w:t xml:space="preserve">nvarchar</w:t>
+            </w:r>
+          </w:p>
+        </w:tc>
+        <w:tc>
+          <w:tcPr>
+            <w:tcW w:w="2000" w:type="dxa"/>
+          </w:tcPr>
+          <w:p>
+            <w:pPr/>
+            <w:r>
+              <w:t xml:space="preserve">50</w:t>
+            </w:r>
+          </w:p>
+        </w:tc>
+        <w:tc>
+          <w:tcPr>
+            <w:tcW w:w="2000" w:type="dxa"/>
+          </w:tcPr>
+          <w:p>
+            <w:pPr/>
+            <w:r>
+              <w:t xml:space="preserve">IS NULL</w:t>
+            </w:r>
+          </w:p>
+        </w:tc>
+      </w:tr>
+      <w:tr>
+        <w:trPr>
+          <w:trHeight w:val="530" w:hRule="atLeast"/>
+        </w:trPr>
+        <w:tc>
+          <w:tcPr>
+            <w:tcW w:w="2000" w:type="dxa"/>
+          </w:tcPr>
+          <w:p>
+            <w:pPr/>
+            <w:r>
+              <w:t xml:space="preserve">serial_no</w:t>
+            </w:r>
+          </w:p>
+        </w:tc>
+        <w:tc>
+          <w:tcPr>
+            <w:tcW w:w="2000" w:type="dxa"/>
+          </w:tcPr>
+          <w:p>
+            <w:pPr/>
+            <w:r>
+              <w:t xml:space="preserve">nvarchar</w:t>
+            </w:r>
+          </w:p>
+        </w:tc>
+        <w:tc>
+          <w:tcPr>
+            <w:tcW w:w="2000" w:type="dxa"/>
+          </w:tcPr>
+          <w:p>
+            <w:pPr/>
+            <w:r>
+              <w:t xml:space="preserve">100</w:t>
+            </w:r>
+          </w:p>
+        </w:tc>
+        <w:tc>
+          <w:tcPr>
+            <w:tcW w:w="2000" w:type="dxa"/>
+          </w:tcPr>
+          <w:p>
+            <w:pPr/>
+            <w:r>
+              <w:t xml:space="preserve">IS NULL</w:t>
+            </w:r>
+          </w:p>
+        </w:tc>
+      </w:tr>
+      <w:tr>
+        <w:trPr>
+          <w:trHeight w:val="530" w:hRule="atLeast"/>
+        </w:trPr>
+        <w:tc>
+          <w:tcPr>
+            <w:tcW w:w="2000" w:type="dxa"/>
+          </w:tcPr>
+          <w:p>
+            <w:pPr/>
+            <w:r>
+              <w:t xml:space="preserve">quantity</w:t>
+            </w:r>
+          </w:p>
+        </w:tc>
+        <w:tc>
+          <w:tcPr>
+            <w:tcW w:w="2000" w:type="dxa"/>
+          </w:tcPr>
+          <w:p>
+            <w:pPr/>
+            <w:r>
+              <w:t xml:space="preserve">decimal</w:t>
+            </w:r>
+          </w:p>
+        </w:tc>
+        <w:tc>
+          <w:tcPr>
+            <w:tcW w:w="2000" w:type="dxa"/>
+          </w:tcPr>
+          <w:p>
+            <w:pPr/>
+            <w:r>
+              <w:t xml:space="preserve">(19,6)</w:t>
+            </w:r>
+          </w:p>
+        </w:tc>
+        <w:tc>
+          <w:tcPr>
+            <w:tcW w:w="2000" w:type="dxa"/>
+          </w:tcPr>
+          <w:p>
+            <w:pPr/>
+            <w:r>
+              <w:t xml:space="preserve">NOT NULL</w:t>
+            </w:r>
+          </w:p>
+        </w:tc>
+      </w:tr>
+      <w:tr>
+        <w:trPr>
+          <w:trHeight w:val="530" w:hRule="atLeast"/>
+        </w:trPr>
+        <w:tc>
+          <w:tcPr>
+            <w:tcW w:w="2000" w:type="dxa"/>
+          </w:tcPr>
+          <w:p>
+            <w:pPr/>
+            <w:r>
+              <w:t xml:space="preserve">company_id</w:t>
+            </w:r>
+          </w:p>
+        </w:tc>
+        <w:tc>
+          <w:tcPr>
+            <w:tcW w:w="2000" w:type="dxa"/>
+          </w:tcPr>
+          <w:p>
+            <w:pPr/>
+            <w:r>
+              <w:t xml:space="preserve">bigint</w:t>
+            </w:r>
+          </w:p>
+        </w:tc>
+        <w:tc>
+          <w:tcPr>
+            <w:tcW w:w="2000" w:type="dxa"/>
+          </w:tcPr>
+          <w:p>
+            <w:pPr/>
+            <w:r>
+              <w:t xml:space="preserve">-</w:t>
+            </w:r>
+          </w:p>
+        </w:tc>
+        <w:tc>
+          <w:tcPr>
+            <w:tcW w:w="2000" w:type="dxa"/>
+          </w:tcPr>
+          <w:p>
+            <w:pPr/>
+            <w:r>
+              <w:t xml:space="preserve">FK, NOT NULL</w:t>
+            </w:r>
+          </w:p>
+        </w:tc>
+      </w:tr>
+      <w:tr>
+        <w:trPr>
+          <w:trHeight w:val="530" w:hRule="atLeast"/>
+        </w:trPr>
+        <w:tc>
+          <w:tcPr>
+            <w:tcW w:w="2000" w:type="dxa"/>
+          </w:tcPr>
+          <w:p>
+            <w:pPr/>
+            <w:r>
+              <w:t xml:space="preserve">created_at</w:t>
+            </w:r>
+          </w:p>
+        </w:tc>
+        <w:tc>
+          <w:tcPr>
+            <w:tcW w:w="2000" w:type="dxa"/>
+          </w:tcPr>
+          <w:p>
+            <w:pPr/>
+            <w:r>
+              <w:t xml:space="preserve">datetime2</w:t>
+            </w:r>
+          </w:p>
+        </w:tc>
+        <w:tc>
+          <w:tcPr>
+            <w:tcW w:w="2000" w:type="dxa"/>
+          </w:tcPr>
+          <w:p>
+            <w:pPr/>
+            <w:r>
+              <w:t xml:space="preserve">(6)</w:t>
+            </w:r>
+          </w:p>
+        </w:tc>
+        <w:tc>
+          <w:tcPr>
+            <w:tcW w:w="2000" w:type="dxa"/>
+          </w:tcPr>
+          <w:p>
+            <w:pPr/>
+            <w:r>
+              <w:t xml:space="preserve">NOT NULL</w:t>
+            </w:r>
+          </w:p>
+        </w:tc>
+      </w:tr>
+      <w:tr>
+        <w:trPr>
+          <w:trHeight w:val="530" w:hRule="atLeast"/>
+        </w:trPr>
+        <w:tc>
+          <w:tcPr>
+            <w:tcW w:w="2000" w:type="dxa"/>
+          </w:tcPr>
+          <w:p>
+            <w:pPr/>
+            <w:r>
+              <w:t xml:space="preserve">created_by</w:t>
+            </w:r>
+          </w:p>
+        </w:tc>
+        <w:tc>
+          <w:tcPr>
+            <w:tcW w:w="2000" w:type="dxa"/>
+          </w:tcPr>
+          <w:p>
+            <w:pPr/>
+            <w:r>
+              <w:t xml:space="preserve">bigint</w:t>
+            </w:r>
+          </w:p>
+        </w:tc>
+        <w:tc>
+          <w:tcPr>
+            <w:tcW w:w="2000" w:type="dxa"/>
+          </w:tcPr>
+          <w:p>
+            <w:pPr/>
+            <w:r>
+              <w:t xml:space="preserve">-</w:t>
+            </w:r>
+          </w:p>
+        </w:tc>
+        <w:tc>
+          <w:tcPr>
+            <w:tcW w:w="2000" w:type="dxa"/>
+          </w:tcPr>
+          <w:p>
+            <w:pPr/>
+            <w:r>
+              <w:t xml:space="preserve">NOT NULL</w:t>
+            </w:r>
+          </w:p>
+        </w:tc>
+      </w:tr>
+      <w:tr>
+        <w:trPr>
+          <w:trHeight w:val="530" w:hRule="atLeast"/>
+        </w:trPr>
+        <w:tc>
+          <w:tcPr>
+            <w:tcW w:w="2000" w:type="dxa"/>
+          </w:tcPr>
+          <w:p>
+            <w:pPr/>
+            <w:r>
+              <w:t xml:space="preserve">updated_at</w:t>
+            </w:r>
+          </w:p>
+        </w:tc>
+        <w:tc>
+          <w:tcPr>
+            <w:tcW w:w="2000" w:type="dxa"/>
+          </w:tcPr>
+          <w:p>
+            <w:pPr/>
+            <w:r>
+              <w:t xml:space="preserve">datetime2</w:t>
+            </w:r>
+          </w:p>
+        </w:tc>
+        <w:tc>
+          <w:tcPr>
+            <w:tcW w:w="2000" w:type="dxa"/>
+          </w:tcPr>
+          <w:p>
+            <w:pPr/>
+            <w:r>
+              <w:t xml:space="preserve">(6)</w:t>
+            </w:r>
+          </w:p>
+        </w:tc>
+        <w:tc>
+          <w:tcPr>
+            <w:tcW w:w="2000" w:type="dxa"/>
+          </w:tcPr>
+          <w:p>
+            <w:pPr/>
+            <w:r>
+              <w:t xml:space="preserve">IS NULL</w:t>
+            </w:r>
+          </w:p>
+        </w:tc>
+      </w:tr>
+      <w:tr>
+        <w:trPr>
+          <w:trHeight w:val="530" w:hRule="atLeast"/>
+        </w:trPr>
+        <w:tc>
+          <w:tcPr>
+            <w:tcW w:w="2000" w:type="dxa"/>
+          </w:tcPr>
+          <w:p>
+            <w:pPr/>
+            <w:r>
+              <w:t xml:space="preserve">updated_by</w:t>
+            </w:r>
+          </w:p>
+        </w:tc>
+        <w:tc>
+          <w:tcPr>
+            <w:tcW w:w="2000" w:type="dxa"/>
+          </w:tcPr>
+          <w:p>
+            <w:pPr/>
+            <w:r>
+              <w:t xml:space="preserve">bigint</w:t>
+            </w:r>
+          </w:p>
+        </w:tc>
+        <w:tc>
+          <w:tcPr>
+            <w:tcW w:w="2000" w:type="dxa"/>
+          </w:tcPr>
+          <w:p>
+            <w:pPr/>
+            <w:r>
+              <w:t xml:space="preserve">-</w:t>
+            </w:r>
+          </w:p>
+        </w:tc>
+        <w:tc>
+          <w:tcPr>
+            <w:tcW w:w="2000" w:type="dxa"/>
+          </w:tcPr>
+          <w:p>
+            <w:pPr/>
+            <w:r>
+              <w:t xml:space="preserve">IS NULL</w:t>
+            </w:r>
+          </w:p>
+        </w:tc>
+      </w:tr>
+      <w:tr>
+        <w:trPr>
+          <w:trHeight w:val="530" w:hRule="atLeast"/>
+        </w:trPr>
+        <w:tc>
+          <w:tcPr>
+            <w:tcW w:w="2000" w:type="dxa"/>
+          </w:tcPr>
+          <w:p>
+            <w:pPr/>
+            <w:r>
+              <w:t xml:space="preserve">version</w:t>
+            </w:r>
+          </w:p>
+        </w:tc>
+        <w:tc>
+          <w:tcPr>
+            <w:tcW w:w="2000" w:type="dxa"/>
+          </w:tcPr>
+          <w:p>
+            <w:pPr/>
+            <w:r>
+              <w:t xml:space="preserve">int</w:t>
+            </w:r>
+          </w:p>
+        </w:tc>
+        <w:tc>
+          <w:tcPr>
+            <w:tcW w:w="2000" w:type="dxa"/>
+          </w:tcPr>
+          <w:p>
+            <w:pPr/>
+            <w:r>
+              <w:t xml:space="preserve">-</w:t>
+            </w:r>
+          </w:p>
+        </w:tc>
+        <w:tc>
+          <w:tcPr>
+            <w:tcW w:w="2000" w:type="dxa"/>
+          </w:tcPr>
+          <w:p>
+            <w:pPr/>
+            <w:r>
+              <w:t xml:space="preserve">NOT NULL</w:t>
+            </w:r>
+          </w:p>
+        </w:tc>
+      </w:tr>
+    </w:tbl>
+    <w:p/>
     <w:p>
       <w:pPr/>
       <w:r>
@@ -56835,7 +59241,7 @@
       </w:r>
     </w:p>
     <w:sectPr>
-      <w:footerReference xmlns:r="http://schemas.openxmlformats.org/officeDocument/2006/relationships" w:type="default" r:id="R7aad631f975d492c"/>
+      <w:footerReference xmlns:r="http://schemas.openxmlformats.org/officeDocument/2006/relationships" w:type="default" r:id="Ra5ecfdea9a4f47e3"/>
       <w:pgSz w:w="11906" w:h="16838"/>
       <w:pgMar w:top="1440" w:right="1440" w:bottom="1440" w:left="1440" w:header="720" w:footer="720" w:gutter="0"/>
     </w:sectPr>

</xml_diff>

<commit_message>
feat(inv): advance assembly UI and QA coverage
</commit_message>
<xml_diff>
--- a/docs/99-output/MyERP_SDS.docx
+++ b/docs/99-output/MyERP_SDS.docx
@@ -46,7 +46,7 @@
         <w:jc w:val="center"/>
       </w:pPr>
       <w:r>
-        <w:t xml:space="preserve">Date: 15 October 2026</w:t>
+        <w:t xml:space="preserve">Date: 16 October 2026</w:t>
       </w:r>
     </w:p>
     <w:p/>
@@ -59241,7 +59241,7 @@
       </w:r>
     </w:p>
     <w:sectPr>
-      <w:footerReference xmlns:r="http://schemas.openxmlformats.org/officeDocument/2006/relationships" w:type="default" r:id="R08d03c8cd7314108"/>
+      <w:footerReference xmlns:r="http://schemas.openxmlformats.org/officeDocument/2006/relationships" w:type="default" r:id="R37e1fdb44cb24f5e"/>
       <w:pgSz w:w="11906" w:h="16838"/>
       <w:pgMar w:top="1440" w:right="1440" w:bottom="1440" w:left="1440" w:header="720" w:footer="720" w:gutter="0"/>
     </w:sectPr>

</xml_diff>

<commit_message>
feat(inv): add safety stock filters and backend edge coverage
</commit_message>
<xml_diff>
--- a/docs/99-output/MyERP_SDS.docx
+++ b/docs/99-output/MyERP_SDS.docx
@@ -11429,6 +11429,759 @@
             <w:pPr/>
             <w:r>
               <w:t xml:space="preserve">30</w:t>
+            </w:r>
+          </w:p>
+        </w:tc>
+        <w:tc>
+          <w:tcPr>
+            <w:tcW w:w="2000" w:type="dxa"/>
+          </w:tcPr>
+          <w:p>
+            <w:pPr/>
+            <w:r>
+              <w:t xml:space="preserve">IS NULL</w:t>
+            </w:r>
+          </w:p>
+        </w:tc>
+      </w:tr>
+      <w:tr>
+        <w:trPr>
+          <w:trHeight w:val="530" w:hRule="atLeast"/>
+        </w:trPr>
+        <w:tc>
+          <w:tcPr>
+            <w:tcW w:w="2000" w:type="dxa"/>
+          </w:tcPr>
+          <w:p>
+            <w:pPr/>
+            <w:r>
+              <w:t xml:space="preserve">company_id</w:t>
+            </w:r>
+          </w:p>
+        </w:tc>
+        <w:tc>
+          <w:tcPr>
+            <w:tcW w:w="2000" w:type="dxa"/>
+          </w:tcPr>
+          <w:p>
+            <w:pPr/>
+            <w:r>
+              <w:t xml:space="preserve">bigint</w:t>
+            </w:r>
+          </w:p>
+        </w:tc>
+        <w:tc>
+          <w:tcPr>
+            <w:tcW w:w="2000" w:type="dxa"/>
+          </w:tcPr>
+          <w:p>
+            <w:pPr/>
+            <w:r>
+              <w:t xml:space="preserve">-</w:t>
+            </w:r>
+          </w:p>
+        </w:tc>
+        <w:tc>
+          <w:tcPr>
+            <w:tcW w:w="2000" w:type="dxa"/>
+          </w:tcPr>
+          <w:p>
+            <w:pPr/>
+            <w:r>
+              <w:t xml:space="preserve">NOT NULL</w:t>
+            </w:r>
+          </w:p>
+        </w:tc>
+      </w:tr>
+      <w:tr>
+        <w:trPr>
+          <w:trHeight w:val="530" w:hRule="atLeast"/>
+        </w:trPr>
+        <w:tc>
+          <w:tcPr>
+            <w:tcW w:w="2000" w:type="dxa"/>
+          </w:tcPr>
+          <w:p>
+            <w:pPr/>
+            <w:r>
+              <w:t xml:space="preserve">created_at</w:t>
+            </w:r>
+          </w:p>
+        </w:tc>
+        <w:tc>
+          <w:tcPr>
+            <w:tcW w:w="2000" w:type="dxa"/>
+          </w:tcPr>
+          <w:p>
+            <w:pPr/>
+            <w:r>
+              <w:t xml:space="preserve">datetime2</w:t>
+            </w:r>
+          </w:p>
+        </w:tc>
+        <w:tc>
+          <w:tcPr>
+            <w:tcW w:w="2000" w:type="dxa"/>
+          </w:tcPr>
+          <w:p>
+            <w:pPr/>
+            <w:r>
+              <w:t xml:space="preserve">(6)</w:t>
+            </w:r>
+          </w:p>
+        </w:tc>
+        <w:tc>
+          <w:tcPr>
+            <w:tcW w:w="2000" w:type="dxa"/>
+          </w:tcPr>
+          <w:p>
+            <w:pPr/>
+            <w:r>
+              <w:t xml:space="preserve">NOT NULL</w:t>
+            </w:r>
+          </w:p>
+        </w:tc>
+      </w:tr>
+      <w:tr>
+        <w:trPr>
+          <w:trHeight w:val="530" w:hRule="atLeast"/>
+        </w:trPr>
+        <w:tc>
+          <w:tcPr>
+            <w:tcW w:w="2000" w:type="dxa"/>
+          </w:tcPr>
+          <w:p>
+            <w:pPr/>
+            <w:r>
+              <w:t xml:space="preserve">created_by</w:t>
+            </w:r>
+          </w:p>
+        </w:tc>
+        <w:tc>
+          <w:tcPr>
+            <w:tcW w:w="2000" w:type="dxa"/>
+          </w:tcPr>
+          <w:p>
+            <w:pPr/>
+            <w:r>
+              <w:t xml:space="preserve">bigint</w:t>
+            </w:r>
+          </w:p>
+        </w:tc>
+        <w:tc>
+          <w:tcPr>
+            <w:tcW w:w="2000" w:type="dxa"/>
+          </w:tcPr>
+          <w:p>
+            <w:pPr/>
+            <w:r>
+              <w:t xml:space="preserve">-</w:t>
+            </w:r>
+          </w:p>
+        </w:tc>
+        <w:tc>
+          <w:tcPr>
+            <w:tcW w:w="2000" w:type="dxa"/>
+          </w:tcPr>
+          <w:p>
+            <w:pPr/>
+            <w:r>
+              <w:t xml:space="preserve">NOT NULL</w:t>
+            </w:r>
+          </w:p>
+        </w:tc>
+      </w:tr>
+      <w:tr>
+        <w:trPr>
+          <w:trHeight w:val="530" w:hRule="atLeast"/>
+        </w:trPr>
+        <w:tc>
+          <w:tcPr>
+            <w:tcW w:w="2000" w:type="dxa"/>
+          </w:tcPr>
+          <w:p>
+            <w:pPr/>
+            <w:r>
+              <w:t xml:space="preserve">updated_at</w:t>
+            </w:r>
+          </w:p>
+        </w:tc>
+        <w:tc>
+          <w:tcPr>
+            <w:tcW w:w="2000" w:type="dxa"/>
+          </w:tcPr>
+          <w:p>
+            <w:pPr/>
+            <w:r>
+              <w:t xml:space="preserve">datetime2</w:t>
+            </w:r>
+          </w:p>
+        </w:tc>
+        <w:tc>
+          <w:tcPr>
+            <w:tcW w:w="2000" w:type="dxa"/>
+          </w:tcPr>
+          <w:p>
+            <w:pPr/>
+            <w:r>
+              <w:t xml:space="preserve">(6)</w:t>
+            </w:r>
+          </w:p>
+        </w:tc>
+        <w:tc>
+          <w:tcPr>
+            <w:tcW w:w="2000" w:type="dxa"/>
+          </w:tcPr>
+          <w:p>
+            <w:pPr/>
+            <w:r>
+              <w:t xml:space="preserve">IS NULL</w:t>
+            </w:r>
+          </w:p>
+        </w:tc>
+      </w:tr>
+      <w:tr>
+        <w:trPr>
+          <w:trHeight w:val="530" w:hRule="atLeast"/>
+        </w:trPr>
+        <w:tc>
+          <w:tcPr>
+            <w:tcW w:w="2000" w:type="dxa"/>
+          </w:tcPr>
+          <w:p>
+            <w:pPr/>
+            <w:r>
+              <w:t xml:space="preserve">updated_by</w:t>
+            </w:r>
+          </w:p>
+        </w:tc>
+        <w:tc>
+          <w:tcPr>
+            <w:tcW w:w="2000" w:type="dxa"/>
+          </w:tcPr>
+          <w:p>
+            <w:pPr/>
+            <w:r>
+              <w:t xml:space="preserve">bigint</w:t>
+            </w:r>
+          </w:p>
+        </w:tc>
+        <w:tc>
+          <w:tcPr>
+            <w:tcW w:w="2000" w:type="dxa"/>
+          </w:tcPr>
+          <w:p>
+            <w:pPr/>
+            <w:r>
+              <w:t xml:space="preserve">-</w:t>
+            </w:r>
+          </w:p>
+        </w:tc>
+        <w:tc>
+          <w:tcPr>
+            <w:tcW w:w="2000" w:type="dxa"/>
+          </w:tcPr>
+          <w:p>
+            <w:pPr/>
+            <w:r>
+              <w:t xml:space="preserve">IS NULL</w:t>
+            </w:r>
+          </w:p>
+        </w:tc>
+      </w:tr>
+      <w:tr>
+        <w:trPr>
+          <w:trHeight w:val="530" w:hRule="atLeast"/>
+        </w:trPr>
+        <w:tc>
+          <w:tcPr>
+            <w:tcW w:w="2000" w:type="dxa"/>
+          </w:tcPr>
+          <w:p>
+            <w:pPr/>
+            <w:r>
+              <w:t xml:space="preserve">version</w:t>
+            </w:r>
+          </w:p>
+        </w:tc>
+        <w:tc>
+          <w:tcPr>
+            <w:tcW w:w="2000" w:type="dxa"/>
+          </w:tcPr>
+          <w:p>
+            <w:pPr/>
+            <w:r>
+              <w:t xml:space="preserve">int</w:t>
+            </w:r>
+          </w:p>
+        </w:tc>
+        <w:tc>
+          <w:tcPr>
+            <w:tcW w:w="2000" w:type="dxa"/>
+          </w:tcPr>
+          <w:p>
+            <w:pPr/>
+            <w:r>
+              <w:t xml:space="preserve">-</w:t>
+            </w:r>
+          </w:p>
+        </w:tc>
+        <w:tc>
+          <w:tcPr>
+            <w:tcW w:w="2000" w:type="dxa"/>
+          </w:tcPr>
+          <w:p>
+            <w:pPr/>
+            <w:r>
+              <w:t xml:space="preserve">NOT NULL</w:t>
+            </w:r>
+          </w:p>
+        </w:tc>
+      </w:tr>
+    </w:tbl>
+    <w:p/>
+    <w:p>
+      <w:pPr/>
+      <w:r>
+        <w:t xml:space="preserve">Table Name: inv_safety_stock_threshold</w:t>
+      </w:r>
+    </w:p>
+    <w:p>
+      <w:pPr/>
+      <w:r>
+        <w:t xml:space="preserve">Primary Key: id</w:t>
+      </w:r>
+    </w:p>
+    <w:p>
+      <w:pPr/>
+      <w:r>
+        <w:t xml:space="preserve">This table stores one company item and warehouse minimum stock quantity and its audit history.</w:t>
+      </w:r>
+    </w:p>
+    <w:tbl>
+      <w:tblPr>
+        <w:tblStyle w:val="TableGrid"/>
+        <w:tblW w:w="8000" w:type="dxa"/>
+        <w:jc w:val="left"/>
+        <w:tblBorders>
+          <w:top w:val="single" w:color="000000" w:sz="4" w:space="0"/>
+          <w:left w:val="single" w:color="000000" w:sz="4" w:space="0"/>
+          <w:bottom w:val="single" w:color="000000" w:sz="4" w:space="0"/>
+          <w:right w:val="single" w:color="000000" w:sz="4" w:space="0"/>
+          <w:insideH w:val="single" w:color="000000" w:sz="4" w:space="0"/>
+          <w:insideV w:val="single" w:color="000000" w:sz="4" w:space="0"/>
+        </w:tblBorders>
+        <w:tblLayout w:type="fixed"/>
+        <w:tblCellMar>
+          <w:top w:w="100" w:type="dxa"/>
+          <w:left w:w="100" w:type="dxa"/>
+          <w:bottom w:w="100" w:type="dxa"/>
+          <w:right w:w="100" w:type="dxa"/>
+        </w:tblCellMar>
+      </w:tblPr>
+      <w:tblGrid>
+        <w:gridCol w:w="2000"/>
+        <w:gridCol w:w="2000"/>
+        <w:gridCol w:w="2000"/>
+        <w:gridCol w:w="2000"/>
+      </w:tblGrid>
+      <w:tr>
+        <w:trPr>
+          <w:trHeight w:val="530" w:hRule="atLeast"/>
+        </w:trPr>
+        <w:tc>
+          <w:tcPr>
+            <w:tcW w:w="2000" w:type="dxa"/>
+          </w:tcPr>
+          <w:p>
+            <w:pPr>
+              <w:jc w:val="center"/>
+            </w:pPr>
+            <w:r>
+              <w:rPr>
+                <w:b/>
+              </w:rPr>
+              <w:t xml:space="preserve">Name of Attribute</w:t>
+            </w:r>
+          </w:p>
+        </w:tc>
+        <w:tc>
+          <w:tcPr>
+            <w:tcW w:w="2000" w:type="dxa"/>
+          </w:tcPr>
+          <w:p>
+            <w:pPr>
+              <w:jc w:val="center"/>
+            </w:pPr>
+            <w:r>
+              <w:rPr>
+                <w:b/>
+              </w:rPr>
+              <w:t xml:space="preserve">Data Type</w:t>
+            </w:r>
+          </w:p>
+        </w:tc>
+        <w:tc>
+          <w:tcPr>
+            <w:tcW w:w="2000" w:type="dxa"/>
+          </w:tcPr>
+          <w:p>
+            <w:pPr>
+              <w:jc w:val="center"/>
+            </w:pPr>
+            <w:r>
+              <w:rPr>
+                <w:b/>
+              </w:rPr>
+              <w:t xml:space="preserve">Size</w:t>
+            </w:r>
+          </w:p>
+        </w:tc>
+        <w:tc>
+          <w:tcPr>
+            <w:tcW w:w="2000" w:type="dxa"/>
+          </w:tcPr>
+          <w:p>
+            <w:pPr>
+              <w:jc w:val="center"/>
+            </w:pPr>
+            <w:r>
+              <w:rPr>
+                <w:b/>
+              </w:rPr>
+              <w:t xml:space="preserve">PK/FK/IS NULL/ NOT NULL</w:t>
+            </w:r>
+          </w:p>
+        </w:tc>
+      </w:tr>
+      <w:tr>
+        <w:trPr>
+          <w:trHeight w:val="530" w:hRule="atLeast"/>
+        </w:trPr>
+        <w:tc>
+          <w:tcPr>
+            <w:tcW w:w="2000" w:type="dxa"/>
+          </w:tcPr>
+          <w:p>
+            <w:pPr/>
+            <w:r>
+              <w:t xml:space="preserve">id</w:t>
+            </w:r>
+          </w:p>
+        </w:tc>
+        <w:tc>
+          <w:tcPr>
+            <w:tcW w:w="2000" w:type="dxa"/>
+          </w:tcPr>
+          <w:p>
+            <w:pPr/>
+            <w:r>
+              <w:t xml:space="preserve">bigint</w:t>
+            </w:r>
+          </w:p>
+        </w:tc>
+        <w:tc>
+          <w:tcPr>
+            <w:tcW w:w="2000" w:type="dxa"/>
+          </w:tcPr>
+          <w:p>
+            <w:pPr/>
+            <w:r>
+              <w:t xml:space="preserve">-</w:t>
+            </w:r>
+          </w:p>
+        </w:tc>
+        <w:tc>
+          <w:tcPr>
+            <w:tcW w:w="2000" w:type="dxa"/>
+          </w:tcPr>
+          <w:p>
+            <w:pPr/>
+            <w:r>
+              <w:t xml:space="preserve">PK, NOT NULL</w:t>
+            </w:r>
+          </w:p>
+        </w:tc>
+      </w:tr>
+      <w:tr>
+        <w:trPr>
+          <w:trHeight w:val="530" w:hRule="atLeast"/>
+        </w:trPr>
+        <w:tc>
+          <w:tcPr>
+            <w:tcW w:w="2000" w:type="dxa"/>
+          </w:tcPr>
+          <w:p>
+            <w:pPr/>
+            <w:r>
+              <w:t xml:space="preserve">item_id</w:t>
+            </w:r>
+          </w:p>
+        </w:tc>
+        <w:tc>
+          <w:tcPr>
+            <w:tcW w:w="2000" w:type="dxa"/>
+          </w:tcPr>
+          <w:p>
+            <w:pPr/>
+            <w:r>
+              <w:t xml:space="preserve">bigint</w:t>
+            </w:r>
+          </w:p>
+        </w:tc>
+        <w:tc>
+          <w:tcPr>
+            <w:tcW w:w="2000" w:type="dxa"/>
+          </w:tcPr>
+          <w:p>
+            <w:pPr/>
+            <w:r>
+              <w:t xml:space="preserve">-</w:t>
+            </w:r>
+          </w:p>
+        </w:tc>
+        <w:tc>
+          <w:tcPr>
+            <w:tcW w:w="2000" w:type="dxa"/>
+          </w:tcPr>
+          <w:p>
+            <w:pPr/>
+            <w:r>
+              <w:t xml:space="preserve">NOT NULL</w:t>
+            </w:r>
+          </w:p>
+        </w:tc>
+      </w:tr>
+      <w:tr>
+        <w:trPr>
+          <w:trHeight w:val="530" w:hRule="atLeast"/>
+        </w:trPr>
+        <w:tc>
+          <w:tcPr>
+            <w:tcW w:w="2000" w:type="dxa"/>
+          </w:tcPr>
+          <w:p>
+            <w:pPr/>
+            <w:r>
+              <w:t xml:space="preserve">warehouse_id</w:t>
+            </w:r>
+          </w:p>
+        </w:tc>
+        <w:tc>
+          <w:tcPr>
+            <w:tcW w:w="2000" w:type="dxa"/>
+          </w:tcPr>
+          <w:p>
+            <w:pPr/>
+            <w:r>
+              <w:t xml:space="preserve">bigint</w:t>
+            </w:r>
+          </w:p>
+        </w:tc>
+        <w:tc>
+          <w:tcPr>
+            <w:tcW w:w="2000" w:type="dxa"/>
+          </w:tcPr>
+          <w:p>
+            <w:pPr/>
+            <w:r>
+              <w:t xml:space="preserve">-</w:t>
+            </w:r>
+          </w:p>
+        </w:tc>
+        <w:tc>
+          <w:tcPr>
+            <w:tcW w:w="2000" w:type="dxa"/>
+          </w:tcPr>
+          <w:p>
+            <w:pPr/>
+            <w:r>
+              <w:t xml:space="preserve">NOT NULL</w:t>
+            </w:r>
+          </w:p>
+        </w:tc>
+      </w:tr>
+      <w:tr>
+        <w:trPr>
+          <w:trHeight w:val="530" w:hRule="atLeast"/>
+        </w:trPr>
+        <w:tc>
+          <w:tcPr>
+            <w:tcW w:w="2000" w:type="dxa"/>
+          </w:tcPr>
+          <w:p>
+            <w:pPr/>
+            <w:r>
+              <w:t xml:space="preserve">minimum_quantity</w:t>
+            </w:r>
+          </w:p>
+        </w:tc>
+        <w:tc>
+          <w:tcPr>
+            <w:tcW w:w="2000" w:type="dxa"/>
+          </w:tcPr>
+          <w:p>
+            <w:pPr/>
+            <w:r>
+              <w:t xml:space="preserve">decimal</w:t>
+            </w:r>
+          </w:p>
+        </w:tc>
+        <w:tc>
+          <w:tcPr>
+            <w:tcW w:w="2000" w:type="dxa"/>
+          </w:tcPr>
+          <w:p>
+            <w:pPr/>
+            <w:r>
+              <w:t xml:space="preserve">(19,6)</w:t>
+            </w:r>
+          </w:p>
+        </w:tc>
+        <w:tc>
+          <w:tcPr>
+            <w:tcW w:w="2000" w:type="dxa"/>
+          </w:tcPr>
+          <w:p>
+            <w:pPr/>
+            <w:r>
+              <w:t xml:space="preserve">NOT NULL</w:t>
+            </w:r>
+          </w:p>
+        </w:tc>
+      </w:tr>
+      <w:tr>
+        <w:trPr>
+          <w:trHeight w:val="530" w:hRule="atLeast"/>
+        </w:trPr>
+        <w:tc>
+          <w:tcPr>
+            <w:tcW w:w="2000" w:type="dxa"/>
+          </w:tcPr>
+          <w:p>
+            <w:pPr/>
+            <w:r>
+              <w:t xml:space="preserve">is_deleted</w:t>
+            </w:r>
+          </w:p>
+        </w:tc>
+        <w:tc>
+          <w:tcPr>
+            <w:tcW w:w="2000" w:type="dxa"/>
+          </w:tcPr>
+          <w:p>
+            <w:pPr/>
+            <w:r>
+              <w:t xml:space="preserve">bit</w:t>
+            </w:r>
+          </w:p>
+        </w:tc>
+        <w:tc>
+          <w:tcPr>
+            <w:tcW w:w="2000" w:type="dxa"/>
+          </w:tcPr>
+          <w:p>
+            <w:pPr/>
+            <w:r>
+              <w:t xml:space="preserve">-</w:t>
+            </w:r>
+          </w:p>
+        </w:tc>
+        <w:tc>
+          <w:tcPr>
+            <w:tcW w:w="2000" w:type="dxa"/>
+          </w:tcPr>
+          <w:p>
+            <w:pPr/>
+            <w:r>
+              <w:t xml:space="preserve">NOT NULL</w:t>
+            </w:r>
+          </w:p>
+        </w:tc>
+      </w:tr>
+      <w:tr>
+        <w:trPr>
+          <w:trHeight w:val="530" w:hRule="atLeast"/>
+        </w:trPr>
+        <w:tc>
+          <w:tcPr>
+            <w:tcW w:w="2000" w:type="dxa"/>
+          </w:tcPr>
+          <w:p>
+            <w:pPr/>
+            <w:r>
+              <w:t xml:space="preserve">deleted_at</w:t>
+            </w:r>
+          </w:p>
+        </w:tc>
+        <w:tc>
+          <w:tcPr>
+            <w:tcW w:w="2000" w:type="dxa"/>
+          </w:tcPr>
+          <w:p>
+            <w:pPr/>
+            <w:r>
+              <w:t xml:space="preserve">datetime2</w:t>
+            </w:r>
+          </w:p>
+        </w:tc>
+        <w:tc>
+          <w:tcPr>
+            <w:tcW w:w="2000" w:type="dxa"/>
+          </w:tcPr>
+          <w:p>
+            <w:pPr/>
+            <w:r>
+              <w:t xml:space="preserve">(6)</w:t>
+            </w:r>
+          </w:p>
+        </w:tc>
+        <w:tc>
+          <w:tcPr>
+            <w:tcW w:w="2000" w:type="dxa"/>
+          </w:tcPr>
+          <w:p>
+            <w:pPr/>
+            <w:r>
+              <w:t xml:space="preserve">IS NULL</w:t>
+            </w:r>
+          </w:p>
+        </w:tc>
+      </w:tr>
+      <w:tr>
+        <w:trPr>
+          <w:trHeight w:val="530" w:hRule="atLeast"/>
+        </w:trPr>
+        <w:tc>
+          <w:tcPr>
+            <w:tcW w:w="2000" w:type="dxa"/>
+          </w:tcPr>
+          <w:p>
+            <w:pPr/>
+            <w:r>
+              <w:t xml:space="preserve">deleted_by</w:t>
+            </w:r>
+          </w:p>
+        </w:tc>
+        <w:tc>
+          <w:tcPr>
+            <w:tcW w:w="2000" w:type="dxa"/>
+          </w:tcPr>
+          <w:p>
+            <w:pPr/>
+            <w:r>
+              <w:t xml:space="preserve">bigint</w:t>
+            </w:r>
+          </w:p>
+        </w:tc>
+        <w:tc>
+          <w:tcPr>
+            <w:tcW w:w="2000" w:type="dxa"/>
+          </w:tcPr>
+          <w:p>
+            <w:pPr/>
+            <w:r>
+              <w:t xml:space="preserve">-</w:t>
             </w:r>
           </w:p>
         </w:tc>
@@ -57596,6 +58349,25 @@
           <w:i/>
         </w:rPr>
         <w:t xml:space="preserve">[Pending] System screenshot of Inventory Valuation View Interface.</w:t>
+      </w:r>
+    </w:p>
+    <w:p>
+      <w:pPr>
+        <w:pStyle w:val="Heading5"/>
+      </w:pPr>
+      <w:r>
+        <w:t xml:space="preserve">4.2.1.5.26 Safety Stock View Interface</w:t>
+      </w:r>
+    </w:p>
+    <w:p>
+      <w:pPr>
+        <w:jc w:val="center"/>
+      </w:pPr>
+      <w:r>
+        <w:rPr>
+          <w:i/>
+        </w:rPr>
+        <w:t xml:space="preserve">[Pending] System screenshot of Safety Stock View Interface.</w:t>
       </w:r>
     </w:p>
     <w:p>
@@ -59241,7 +60013,7 @@
       </w:r>
     </w:p>
     <w:sectPr>
-      <w:footerReference xmlns:r="http://schemas.openxmlformats.org/officeDocument/2006/relationships" w:type="default" r:id="R37e1fdb44cb24f5e"/>
+      <w:footerReference xmlns:r="http://schemas.openxmlformats.org/officeDocument/2006/relationships" w:type="default" r:id="R879f78f6bee54c55"/>
       <w:pgSz w:w="11906" w:h="16838"/>
       <w:pgMar w:top="1440" w:right="1440" w:bottom="1440" w:left="1440" w:header="720" w:footer="720" w:gutter="0"/>
     </w:sectPr>

</xml_diff>

<commit_message>
feat(inv): complete safety stock page and QA
</commit_message>
<xml_diff>
--- a/docs/99-output/MyERP_SDS.docx
+++ b/docs/99-output/MyERP_SDS.docx
@@ -46,7 +46,7 @@
         <w:jc w:val="center"/>
       </w:pPr>
       <w:r>
-        <w:t xml:space="preserve">Date: 16 October 2026</w:t>
+        <w:t xml:space="preserve">Date: 18 October 2026</w:t>
       </w:r>
     </w:p>
     <w:p/>
@@ -60013,7 +60013,7 @@
       </w:r>
     </w:p>
     <w:sectPr>
-      <w:footerReference xmlns:r="http://schemas.openxmlformats.org/officeDocument/2006/relationships" w:type="default" r:id="Rfbacfa00f7794386"/>
+      <w:footerReference xmlns:r="http://schemas.openxmlformats.org/officeDocument/2006/relationships" w:type="default" r:id="Re74fcd0138634b3c"/>
       <w:pgSz w:w="11906" w:h="16838"/>
       <w:pgMar w:top="1440" w:right="1440" w:bottom="1440" w:left="1440" w:header="720" w:footer="720" w:gutter="0"/>
     </w:sectPr>

</xml_diff>

<commit_message>
docs(inv): define inventory report and export contract
</commit_message>
<xml_diff>
--- a/docs/99-output/MyERP_SDS.docx
+++ b/docs/99-output/MyERP_SDS.docx
@@ -58368,6 +58368,25 @@
           <w:i/>
         </w:rPr>
         <w:t xml:space="preserve">[Pending] System screenshot of Safety Stock View Interface.</w:t>
+      </w:r>
+    </w:p>
+    <w:p>
+      <w:pPr>
+        <w:pStyle w:val="Heading5"/>
+      </w:pPr>
+      <w:r>
+        <w:t xml:space="preserve">4.2.1.5.27 Inventory Movement Report View Interface</w:t>
+      </w:r>
+    </w:p>
+    <w:p>
+      <w:pPr>
+        <w:jc w:val="center"/>
+      </w:pPr>
+      <w:r>
+        <w:rPr>
+          <w:i/>
+        </w:rPr>
+        <w:t xml:space="preserve">[Pending] System screenshot of Inventory Movement Report View Interface.</w:t>
       </w:r>
     </w:p>
     <w:p>
@@ -60013,7 +60032,7 @@
       </w:r>
     </w:p>
     <w:sectPr>
-      <w:footerReference xmlns:r="http://schemas.openxmlformats.org/officeDocument/2006/relationships" w:type="default" r:id="Re74fcd0138634b3c"/>
+      <w:footerReference xmlns:r="http://schemas.openxmlformats.org/officeDocument/2006/relationships" w:type="default" r:id="R604383c047954ef6"/>
       <w:pgSz w:w="11906" w:h="16838"/>
       <w:pgMar w:top="1440" w:right="1440" w:bottom="1440" w:left="1440" w:header="720" w:footer="720" w:gutter="0"/>
     </w:sectPr>

</xml_diff>

<commit_message>
docs(inv): define disassembly design and acceptance cases
</commit_message>
<xml_diff>
--- a/docs/99-output/MyERP_SDS.docx
+++ b/docs/99-output/MyERP_SDS.docx
@@ -58159,6 +58159,63 @@
           <w:i/>
         </w:rPr>
         <w:t xml:space="preserve">[Pending] System screenshot of Product Assembly Edit Interface.</w:t>
+      </w:r>
+    </w:p>
+    <w:p>
+      <w:pPr>
+        <w:pStyle w:val="Heading5"/>
+      </w:pPr>
+      <w:r>
+        <w:t xml:space="preserve">4.2.1.5.12 Product Disassembly View Interface</w:t>
+      </w:r>
+    </w:p>
+    <w:p>
+      <w:pPr>
+        <w:jc w:val="center"/>
+      </w:pPr>
+      <w:r>
+        <w:rPr>
+          <w:i/>
+        </w:rPr>
+        <w:t xml:space="preserve">[Pending] System screenshot of Product Disassembly View Interface.</w:t>
+      </w:r>
+    </w:p>
+    <w:p>
+      <w:pPr>
+        <w:pStyle w:val="Heading5"/>
+      </w:pPr>
+      <w:r>
+        <w:t xml:space="preserve">4.2.1.5.13 Product Disassembly Create Interface</w:t>
+      </w:r>
+    </w:p>
+    <w:p>
+      <w:pPr>
+        <w:jc w:val="center"/>
+      </w:pPr>
+      <w:r>
+        <w:rPr>
+          <w:i/>
+        </w:rPr>
+        <w:t xml:space="preserve">[Pending] System screenshot of Product Disassembly Create Interface.</w:t>
+      </w:r>
+    </w:p>
+    <w:p>
+      <w:pPr>
+        <w:pStyle w:val="Heading5"/>
+      </w:pPr>
+      <w:r>
+        <w:t xml:space="preserve">4.2.1.5.14 Product Disassembly Edit Interface</w:t>
+      </w:r>
+    </w:p>
+    <w:p>
+      <w:pPr>
+        <w:jc w:val="center"/>
+      </w:pPr>
+      <w:r>
+        <w:rPr>
+          <w:i/>
+        </w:rPr>
+        <w:t xml:space="preserve">[Pending] System screenshot of Product Disassembly Edit Interface.</w:t>
       </w:r>
     </w:p>
     <w:p>
@@ -60032,7 +60089,7 @@
       </w:r>
     </w:p>
     <w:sectPr>
-      <w:footerReference xmlns:r="http://schemas.openxmlformats.org/officeDocument/2006/relationships" w:type="default" r:id="R9ec225fb89a845ea"/>
+      <w:footerReference xmlns:r="http://schemas.openxmlformats.org/officeDocument/2006/relationships" w:type="default" r:id="R3dfa9d52f7c94e61"/>
       <w:pgSz w:w="11906" w:h="16838"/>
       <w:pgMar w:top="1440" w:right="1440" w:bottom="1440" w:left="1440" w:header="720" w:footer="720" w:gutter="0"/>
     </w:sectPr>

</xml_diff>

<commit_message>
feat(inv): add disassembly draft backend
</commit_message>
<xml_diff>
--- a/docs/99-output/MyERP_SDS.docx
+++ b/docs/99-output/MyERP_SDS.docx
@@ -2328,6 +2328,2461 @@
       <w:pPr/>
       <w:r>
         <w:t xml:space="preserve">This table stores the lot or serial quantities selected for each assembly line.</w:t>
+      </w:r>
+    </w:p>
+    <w:tbl>
+      <w:tblPr>
+        <w:tblStyle w:val="TableGrid"/>
+        <w:tblW w:w="8000" w:type="dxa"/>
+        <w:jc w:val="left"/>
+        <w:tblBorders>
+          <w:top w:val="single" w:color="000000" w:sz="4" w:space="0"/>
+          <w:left w:val="single" w:color="000000" w:sz="4" w:space="0"/>
+          <w:bottom w:val="single" w:color="000000" w:sz="4" w:space="0"/>
+          <w:right w:val="single" w:color="000000" w:sz="4" w:space="0"/>
+          <w:insideH w:val="single" w:color="000000" w:sz="4" w:space="0"/>
+          <w:insideV w:val="single" w:color="000000" w:sz="4" w:space="0"/>
+        </w:tblBorders>
+        <w:tblLayout w:type="fixed"/>
+        <w:tblCellMar>
+          <w:top w:w="100" w:type="dxa"/>
+          <w:left w:w="100" w:type="dxa"/>
+          <w:bottom w:w="100" w:type="dxa"/>
+          <w:right w:w="100" w:type="dxa"/>
+        </w:tblCellMar>
+      </w:tblPr>
+      <w:tblGrid>
+        <w:gridCol w:w="2000"/>
+        <w:gridCol w:w="2000"/>
+        <w:gridCol w:w="2000"/>
+        <w:gridCol w:w="2000"/>
+      </w:tblGrid>
+      <w:tr>
+        <w:trPr>
+          <w:trHeight w:val="530" w:hRule="atLeast"/>
+        </w:trPr>
+        <w:tc>
+          <w:tcPr>
+            <w:tcW w:w="2000" w:type="dxa"/>
+          </w:tcPr>
+          <w:p>
+            <w:pPr>
+              <w:jc w:val="center"/>
+            </w:pPr>
+            <w:r>
+              <w:rPr>
+                <w:b/>
+              </w:rPr>
+              <w:t xml:space="preserve">Name of Attribute</w:t>
+            </w:r>
+          </w:p>
+        </w:tc>
+        <w:tc>
+          <w:tcPr>
+            <w:tcW w:w="2000" w:type="dxa"/>
+          </w:tcPr>
+          <w:p>
+            <w:pPr>
+              <w:jc w:val="center"/>
+            </w:pPr>
+            <w:r>
+              <w:rPr>
+                <w:b/>
+              </w:rPr>
+              <w:t xml:space="preserve">Data Type</w:t>
+            </w:r>
+          </w:p>
+        </w:tc>
+        <w:tc>
+          <w:tcPr>
+            <w:tcW w:w="2000" w:type="dxa"/>
+          </w:tcPr>
+          <w:p>
+            <w:pPr>
+              <w:jc w:val="center"/>
+            </w:pPr>
+            <w:r>
+              <w:rPr>
+                <w:b/>
+              </w:rPr>
+              <w:t xml:space="preserve">Size</w:t>
+            </w:r>
+          </w:p>
+        </w:tc>
+        <w:tc>
+          <w:tcPr>
+            <w:tcW w:w="2000" w:type="dxa"/>
+          </w:tcPr>
+          <w:p>
+            <w:pPr>
+              <w:jc w:val="center"/>
+            </w:pPr>
+            <w:r>
+              <w:rPr>
+                <w:b/>
+              </w:rPr>
+              <w:t xml:space="preserve">PK/FK/IS NULL/ NOT NULL</w:t>
+            </w:r>
+          </w:p>
+        </w:tc>
+      </w:tr>
+      <w:tr>
+        <w:trPr>
+          <w:trHeight w:val="530" w:hRule="atLeast"/>
+        </w:trPr>
+        <w:tc>
+          <w:tcPr>
+            <w:tcW w:w="2000" w:type="dxa"/>
+          </w:tcPr>
+          <w:p>
+            <w:pPr/>
+            <w:r>
+              <w:t xml:space="preserve">id</w:t>
+            </w:r>
+          </w:p>
+        </w:tc>
+        <w:tc>
+          <w:tcPr>
+            <w:tcW w:w="2000" w:type="dxa"/>
+          </w:tcPr>
+          <w:p>
+            <w:pPr/>
+            <w:r>
+              <w:t xml:space="preserve">bigint</w:t>
+            </w:r>
+          </w:p>
+        </w:tc>
+        <w:tc>
+          <w:tcPr>
+            <w:tcW w:w="2000" w:type="dxa"/>
+          </w:tcPr>
+          <w:p>
+            <w:pPr/>
+            <w:r>
+              <w:t xml:space="preserve">-</w:t>
+            </w:r>
+          </w:p>
+        </w:tc>
+        <w:tc>
+          <w:tcPr>
+            <w:tcW w:w="2000" w:type="dxa"/>
+          </w:tcPr>
+          <w:p>
+            <w:pPr/>
+            <w:r>
+              <w:t xml:space="preserve">PK, NOT NULL</w:t>
+            </w:r>
+          </w:p>
+        </w:tc>
+      </w:tr>
+      <w:tr>
+        <w:trPr>
+          <w:trHeight w:val="530" w:hRule="atLeast"/>
+        </w:trPr>
+        <w:tc>
+          <w:tcPr>
+            <w:tcW w:w="2000" w:type="dxa"/>
+          </w:tcPr>
+          <w:p>
+            <w:pPr/>
+            <w:r>
+              <w:t xml:space="preserve">line_id</w:t>
+            </w:r>
+          </w:p>
+        </w:tc>
+        <w:tc>
+          <w:tcPr>
+            <w:tcW w:w="2000" w:type="dxa"/>
+          </w:tcPr>
+          <w:p>
+            <w:pPr/>
+            <w:r>
+              <w:t xml:space="preserve">bigint</w:t>
+            </w:r>
+          </w:p>
+        </w:tc>
+        <w:tc>
+          <w:tcPr>
+            <w:tcW w:w="2000" w:type="dxa"/>
+          </w:tcPr>
+          <w:p>
+            <w:pPr/>
+            <w:r>
+              <w:t xml:space="preserve">-</w:t>
+            </w:r>
+          </w:p>
+        </w:tc>
+        <w:tc>
+          <w:tcPr>
+            <w:tcW w:w="2000" w:type="dxa"/>
+          </w:tcPr>
+          <w:p>
+            <w:pPr/>
+            <w:r>
+              <w:t xml:space="preserve">FK, NOT NULL</w:t>
+            </w:r>
+          </w:p>
+        </w:tc>
+      </w:tr>
+      <w:tr>
+        <w:trPr>
+          <w:trHeight w:val="530" w:hRule="atLeast"/>
+        </w:trPr>
+        <w:tc>
+          <w:tcPr>
+            <w:tcW w:w="2000" w:type="dxa"/>
+          </w:tcPr>
+          <w:p>
+            <w:pPr/>
+            <w:r>
+              <w:t xml:space="preserve">seq_no</w:t>
+            </w:r>
+          </w:p>
+        </w:tc>
+        <w:tc>
+          <w:tcPr>
+            <w:tcW w:w="2000" w:type="dxa"/>
+          </w:tcPr>
+          <w:p>
+            <w:pPr/>
+            <w:r>
+              <w:t xml:space="preserve">int</w:t>
+            </w:r>
+          </w:p>
+        </w:tc>
+        <w:tc>
+          <w:tcPr>
+            <w:tcW w:w="2000" w:type="dxa"/>
+          </w:tcPr>
+          <w:p>
+            <w:pPr/>
+            <w:r>
+              <w:t xml:space="preserve">-</w:t>
+            </w:r>
+          </w:p>
+        </w:tc>
+        <w:tc>
+          <w:tcPr>
+            <w:tcW w:w="2000" w:type="dxa"/>
+          </w:tcPr>
+          <w:p>
+            <w:pPr/>
+            <w:r>
+              <w:t xml:space="preserve">NOT NULL</w:t>
+            </w:r>
+          </w:p>
+        </w:tc>
+      </w:tr>
+      <w:tr>
+        <w:trPr>
+          <w:trHeight w:val="530" w:hRule="atLeast"/>
+        </w:trPr>
+        <w:tc>
+          <w:tcPr>
+            <w:tcW w:w="2000" w:type="dxa"/>
+          </w:tcPr>
+          <w:p>
+            <w:pPr/>
+            <w:r>
+              <w:t xml:space="preserve">lot_no</w:t>
+            </w:r>
+          </w:p>
+        </w:tc>
+        <w:tc>
+          <w:tcPr>
+            <w:tcW w:w="2000" w:type="dxa"/>
+          </w:tcPr>
+          <w:p>
+            <w:pPr/>
+            <w:r>
+              <w:t xml:space="preserve">nvarchar</w:t>
+            </w:r>
+          </w:p>
+        </w:tc>
+        <w:tc>
+          <w:tcPr>
+            <w:tcW w:w="2000" w:type="dxa"/>
+          </w:tcPr>
+          <w:p>
+            <w:pPr/>
+            <w:r>
+              <w:t xml:space="preserve">50</w:t>
+            </w:r>
+          </w:p>
+        </w:tc>
+        <w:tc>
+          <w:tcPr>
+            <w:tcW w:w="2000" w:type="dxa"/>
+          </w:tcPr>
+          <w:p>
+            <w:pPr/>
+            <w:r>
+              <w:t xml:space="preserve">IS NULL</w:t>
+            </w:r>
+          </w:p>
+        </w:tc>
+      </w:tr>
+      <w:tr>
+        <w:trPr>
+          <w:trHeight w:val="530" w:hRule="atLeast"/>
+        </w:trPr>
+        <w:tc>
+          <w:tcPr>
+            <w:tcW w:w="2000" w:type="dxa"/>
+          </w:tcPr>
+          <w:p>
+            <w:pPr/>
+            <w:r>
+              <w:t xml:space="preserve">serial_no</w:t>
+            </w:r>
+          </w:p>
+        </w:tc>
+        <w:tc>
+          <w:tcPr>
+            <w:tcW w:w="2000" w:type="dxa"/>
+          </w:tcPr>
+          <w:p>
+            <w:pPr/>
+            <w:r>
+              <w:t xml:space="preserve">nvarchar</w:t>
+            </w:r>
+          </w:p>
+        </w:tc>
+        <w:tc>
+          <w:tcPr>
+            <w:tcW w:w="2000" w:type="dxa"/>
+          </w:tcPr>
+          <w:p>
+            <w:pPr/>
+            <w:r>
+              <w:t xml:space="preserve">100</w:t>
+            </w:r>
+          </w:p>
+        </w:tc>
+        <w:tc>
+          <w:tcPr>
+            <w:tcW w:w="2000" w:type="dxa"/>
+          </w:tcPr>
+          <w:p>
+            <w:pPr/>
+            <w:r>
+              <w:t xml:space="preserve">IS NULL</w:t>
+            </w:r>
+          </w:p>
+        </w:tc>
+      </w:tr>
+      <w:tr>
+        <w:trPr>
+          <w:trHeight w:val="530" w:hRule="atLeast"/>
+        </w:trPr>
+        <w:tc>
+          <w:tcPr>
+            <w:tcW w:w="2000" w:type="dxa"/>
+          </w:tcPr>
+          <w:p>
+            <w:pPr/>
+            <w:r>
+              <w:t xml:space="preserve">quantity</w:t>
+            </w:r>
+          </w:p>
+        </w:tc>
+        <w:tc>
+          <w:tcPr>
+            <w:tcW w:w="2000" w:type="dxa"/>
+          </w:tcPr>
+          <w:p>
+            <w:pPr/>
+            <w:r>
+              <w:t xml:space="preserve">decimal</w:t>
+            </w:r>
+          </w:p>
+        </w:tc>
+        <w:tc>
+          <w:tcPr>
+            <w:tcW w:w="2000" w:type="dxa"/>
+          </w:tcPr>
+          <w:p>
+            <w:pPr/>
+            <w:r>
+              <w:t xml:space="preserve">(19,6)</w:t>
+            </w:r>
+          </w:p>
+        </w:tc>
+        <w:tc>
+          <w:tcPr>
+            <w:tcW w:w="2000" w:type="dxa"/>
+          </w:tcPr>
+          <w:p>
+            <w:pPr/>
+            <w:r>
+              <w:t xml:space="preserve">NOT NULL</w:t>
+            </w:r>
+          </w:p>
+        </w:tc>
+      </w:tr>
+      <w:tr>
+        <w:trPr>
+          <w:trHeight w:val="530" w:hRule="atLeast"/>
+        </w:trPr>
+        <w:tc>
+          <w:tcPr>
+            <w:tcW w:w="2000" w:type="dxa"/>
+          </w:tcPr>
+          <w:p>
+            <w:pPr/>
+            <w:r>
+              <w:t xml:space="preserve">company_id</w:t>
+            </w:r>
+          </w:p>
+        </w:tc>
+        <w:tc>
+          <w:tcPr>
+            <w:tcW w:w="2000" w:type="dxa"/>
+          </w:tcPr>
+          <w:p>
+            <w:pPr/>
+            <w:r>
+              <w:t xml:space="preserve">bigint</w:t>
+            </w:r>
+          </w:p>
+        </w:tc>
+        <w:tc>
+          <w:tcPr>
+            <w:tcW w:w="2000" w:type="dxa"/>
+          </w:tcPr>
+          <w:p>
+            <w:pPr/>
+            <w:r>
+              <w:t xml:space="preserve">-</w:t>
+            </w:r>
+          </w:p>
+        </w:tc>
+        <w:tc>
+          <w:tcPr>
+            <w:tcW w:w="2000" w:type="dxa"/>
+          </w:tcPr>
+          <w:p>
+            <w:pPr/>
+            <w:r>
+              <w:t xml:space="preserve">FK, NOT NULL</w:t>
+            </w:r>
+          </w:p>
+        </w:tc>
+      </w:tr>
+      <w:tr>
+        <w:trPr>
+          <w:trHeight w:val="530" w:hRule="atLeast"/>
+        </w:trPr>
+        <w:tc>
+          <w:tcPr>
+            <w:tcW w:w="2000" w:type="dxa"/>
+          </w:tcPr>
+          <w:p>
+            <w:pPr/>
+            <w:r>
+              <w:t xml:space="preserve">created_at</w:t>
+            </w:r>
+          </w:p>
+        </w:tc>
+        <w:tc>
+          <w:tcPr>
+            <w:tcW w:w="2000" w:type="dxa"/>
+          </w:tcPr>
+          <w:p>
+            <w:pPr/>
+            <w:r>
+              <w:t xml:space="preserve">datetime2</w:t>
+            </w:r>
+          </w:p>
+        </w:tc>
+        <w:tc>
+          <w:tcPr>
+            <w:tcW w:w="2000" w:type="dxa"/>
+          </w:tcPr>
+          <w:p>
+            <w:pPr/>
+            <w:r>
+              <w:t xml:space="preserve">(6)</w:t>
+            </w:r>
+          </w:p>
+        </w:tc>
+        <w:tc>
+          <w:tcPr>
+            <w:tcW w:w="2000" w:type="dxa"/>
+          </w:tcPr>
+          <w:p>
+            <w:pPr/>
+            <w:r>
+              <w:t xml:space="preserve">NOT NULL</w:t>
+            </w:r>
+          </w:p>
+        </w:tc>
+      </w:tr>
+      <w:tr>
+        <w:trPr>
+          <w:trHeight w:val="530" w:hRule="atLeast"/>
+        </w:trPr>
+        <w:tc>
+          <w:tcPr>
+            <w:tcW w:w="2000" w:type="dxa"/>
+          </w:tcPr>
+          <w:p>
+            <w:pPr/>
+            <w:r>
+              <w:t xml:space="preserve">created_by</w:t>
+            </w:r>
+          </w:p>
+        </w:tc>
+        <w:tc>
+          <w:tcPr>
+            <w:tcW w:w="2000" w:type="dxa"/>
+          </w:tcPr>
+          <w:p>
+            <w:pPr/>
+            <w:r>
+              <w:t xml:space="preserve">bigint</w:t>
+            </w:r>
+          </w:p>
+        </w:tc>
+        <w:tc>
+          <w:tcPr>
+            <w:tcW w:w="2000" w:type="dxa"/>
+          </w:tcPr>
+          <w:p>
+            <w:pPr/>
+            <w:r>
+              <w:t xml:space="preserve">-</w:t>
+            </w:r>
+          </w:p>
+        </w:tc>
+        <w:tc>
+          <w:tcPr>
+            <w:tcW w:w="2000" w:type="dxa"/>
+          </w:tcPr>
+          <w:p>
+            <w:pPr/>
+            <w:r>
+              <w:t xml:space="preserve">NOT NULL</w:t>
+            </w:r>
+          </w:p>
+        </w:tc>
+      </w:tr>
+      <w:tr>
+        <w:trPr>
+          <w:trHeight w:val="530" w:hRule="atLeast"/>
+        </w:trPr>
+        <w:tc>
+          <w:tcPr>
+            <w:tcW w:w="2000" w:type="dxa"/>
+          </w:tcPr>
+          <w:p>
+            <w:pPr/>
+            <w:r>
+              <w:t xml:space="preserve">updated_at</w:t>
+            </w:r>
+          </w:p>
+        </w:tc>
+        <w:tc>
+          <w:tcPr>
+            <w:tcW w:w="2000" w:type="dxa"/>
+          </w:tcPr>
+          <w:p>
+            <w:pPr/>
+            <w:r>
+              <w:t xml:space="preserve">datetime2</w:t>
+            </w:r>
+          </w:p>
+        </w:tc>
+        <w:tc>
+          <w:tcPr>
+            <w:tcW w:w="2000" w:type="dxa"/>
+          </w:tcPr>
+          <w:p>
+            <w:pPr/>
+            <w:r>
+              <w:t xml:space="preserve">(6)</w:t>
+            </w:r>
+          </w:p>
+        </w:tc>
+        <w:tc>
+          <w:tcPr>
+            <w:tcW w:w="2000" w:type="dxa"/>
+          </w:tcPr>
+          <w:p>
+            <w:pPr/>
+            <w:r>
+              <w:t xml:space="preserve">IS NULL</w:t>
+            </w:r>
+          </w:p>
+        </w:tc>
+      </w:tr>
+      <w:tr>
+        <w:trPr>
+          <w:trHeight w:val="530" w:hRule="atLeast"/>
+        </w:trPr>
+        <w:tc>
+          <w:tcPr>
+            <w:tcW w:w="2000" w:type="dxa"/>
+          </w:tcPr>
+          <w:p>
+            <w:pPr/>
+            <w:r>
+              <w:t xml:space="preserve">updated_by</w:t>
+            </w:r>
+          </w:p>
+        </w:tc>
+        <w:tc>
+          <w:tcPr>
+            <w:tcW w:w="2000" w:type="dxa"/>
+          </w:tcPr>
+          <w:p>
+            <w:pPr/>
+            <w:r>
+              <w:t xml:space="preserve">bigint</w:t>
+            </w:r>
+          </w:p>
+        </w:tc>
+        <w:tc>
+          <w:tcPr>
+            <w:tcW w:w="2000" w:type="dxa"/>
+          </w:tcPr>
+          <w:p>
+            <w:pPr/>
+            <w:r>
+              <w:t xml:space="preserve">-</w:t>
+            </w:r>
+          </w:p>
+        </w:tc>
+        <w:tc>
+          <w:tcPr>
+            <w:tcW w:w="2000" w:type="dxa"/>
+          </w:tcPr>
+          <w:p>
+            <w:pPr/>
+            <w:r>
+              <w:t xml:space="preserve">IS NULL</w:t>
+            </w:r>
+          </w:p>
+        </w:tc>
+      </w:tr>
+      <w:tr>
+        <w:trPr>
+          <w:trHeight w:val="530" w:hRule="atLeast"/>
+        </w:trPr>
+        <w:tc>
+          <w:tcPr>
+            <w:tcW w:w="2000" w:type="dxa"/>
+          </w:tcPr>
+          <w:p>
+            <w:pPr/>
+            <w:r>
+              <w:t xml:space="preserve">version</w:t>
+            </w:r>
+          </w:p>
+        </w:tc>
+        <w:tc>
+          <w:tcPr>
+            <w:tcW w:w="2000" w:type="dxa"/>
+          </w:tcPr>
+          <w:p>
+            <w:pPr/>
+            <w:r>
+              <w:t xml:space="preserve">int</w:t>
+            </w:r>
+          </w:p>
+        </w:tc>
+        <w:tc>
+          <w:tcPr>
+            <w:tcW w:w="2000" w:type="dxa"/>
+          </w:tcPr>
+          <w:p>
+            <w:pPr/>
+            <w:r>
+              <w:t xml:space="preserve">-</w:t>
+            </w:r>
+          </w:p>
+        </w:tc>
+        <w:tc>
+          <w:tcPr>
+            <w:tcW w:w="2000" w:type="dxa"/>
+          </w:tcPr>
+          <w:p>
+            <w:pPr/>
+            <w:r>
+              <w:t xml:space="preserve">NOT NULL</w:t>
+            </w:r>
+          </w:p>
+        </w:tc>
+      </w:tr>
+    </w:tbl>
+    <w:p/>
+    <w:p>
+      <w:pPr/>
+      <w:r>
+        <w:t xml:space="preserve">Table Name: inv_disassembly</w:t>
+      </w:r>
+    </w:p>
+    <w:p>
+      <w:pPr/>
+      <w:r>
+        <w:t xml:space="preserve">Primary Key: id</w:t>
+      </w:r>
+    </w:p>
+    <w:p>
+      <w:pPr/>
+      <w:r>
+        <w:t xml:space="preserve">This table stores company-scoped disassembly headers, document status and posting time.</w:t>
+      </w:r>
+    </w:p>
+    <w:tbl>
+      <w:tblPr>
+        <w:tblStyle w:val="TableGrid"/>
+        <w:tblW w:w="8000" w:type="dxa"/>
+        <w:jc w:val="left"/>
+        <w:tblBorders>
+          <w:top w:val="single" w:color="000000" w:sz="4" w:space="0"/>
+          <w:left w:val="single" w:color="000000" w:sz="4" w:space="0"/>
+          <w:bottom w:val="single" w:color="000000" w:sz="4" w:space="0"/>
+          <w:right w:val="single" w:color="000000" w:sz="4" w:space="0"/>
+          <w:insideH w:val="single" w:color="000000" w:sz="4" w:space="0"/>
+          <w:insideV w:val="single" w:color="000000" w:sz="4" w:space="0"/>
+        </w:tblBorders>
+        <w:tblLayout w:type="fixed"/>
+        <w:tblCellMar>
+          <w:top w:w="100" w:type="dxa"/>
+          <w:left w:w="100" w:type="dxa"/>
+          <w:bottom w:w="100" w:type="dxa"/>
+          <w:right w:w="100" w:type="dxa"/>
+        </w:tblCellMar>
+      </w:tblPr>
+      <w:tblGrid>
+        <w:gridCol w:w="2000"/>
+        <w:gridCol w:w="2000"/>
+        <w:gridCol w:w="2000"/>
+        <w:gridCol w:w="2000"/>
+      </w:tblGrid>
+      <w:tr>
+        <w:trPr>
+          <w:trHeight w:val="530" w:hRule="atLeast"/>
+        </w:trPr>
+        <w:tc>
+          <w:tcPr>
+            <w:tcW w:w="2000" w:type="dxa"/>
+          </w:tcPr>
+          <w:p>
+            <w:pPr>
+              <w:jc w:val="center"/>
+            </w:pPr>
+            <w:r>
+              <w:rPr>
+                <w:b/>
+              </w:rPr>
+              <w:t xml:space="preserve">Name of Attribute</w:t>
+            </w:r>
+          </w:p>
+        </w:tc>
+        <w:tc>
+          <w:tcPr>
+            <w:tcW w:w="2000" w:type="dxa"/>
+          </w:tcPr>
+          <w:p>
+            <w:pPr>
+              <w:jc w:val="center"/>
+            </w:pPr>
+            <w:r>
+              <w:rPr>
+                <w:b/>
+              </w:rPr>
+              <w:t xml:space="preserve">Data Type</w:t>
+            </w:r>
+          </w:p>
+        </w:tc>
+        <w:tc>
+          <w:tcPr>
+            <w:tcW w:w="2000" w:type="dxa"/>
+          </w:tcPr>
+          <w:p>
+            <w:pPr>
+              <w:jc w:val="center"/>
+            </w:pPr>
+            <w:r>
+              <w:rPr>
+                <w:b/>
+              </w:rPr>
+              <w:t xml:space="preserve">Size</w:t>
+            </w:r>
+          </w:p>
+        </w:tc>
+        <w:tc>
+          <w:tcPr>
+            <w:tcW w:w="2000" w:type="dxa"/>
+          </w:tcPr>
+          <w:p>
+            <w:pPr>
+              <w:jc w:val="center"/>
+            </w:pPr>
+            <w:r>
+              <w:rPr>
+                <w:b/>
+              </w:rPr>
+              <w:t xml:space="preserve">PK/FK/IS NULL/ NOT NULL</w:t>
+            </w:r>
+          </w:p>
+        </w:tc>
+      </w:tr>
+      <w:tr>
+        <w:trPr>
+          <w:trHeight w:val="530" w:hRule="atLeast"/>
+        </w:trPr>
+        <w:tc>
+          <w:tcPr>
+            <w:tcW w:w="2000" w:type="dxa"/>
+          </w:tcPr>
+          <w:p>
+            <w:pPr/>
+            <w:r>
+              <w:t xml:space="preserve">id</w:t>
+            </w:r>
+          </w:p>
+        </w:tc>
+        <w:tc>
+          <w:tcPr>
+            <w:tcW w:w="2000" w:type="dxa"/>
+          </w:tcPr>
+          <w:p>
+            <w:pPr/>
+            <w:r>
+              <w:t xml:space="preserve">bigint</w:t>
+            </w:r>
+          </w:p>
+        </w:tc>
+        <w:tc>
+          <w:tcPr>
+            <w:tcW w:w="2000" w:type="dxa"/>
+          </w:tcPr>
+          <w:p>
+            <w:pPr/>
+            <w:r>
+              <w:t xml:space="preserve">-</w:t>
+            </w:r>
+          </w:p>
+        </w:tc>
+        <w:tc>
+          <w:tcPr>
+            <w:tcW w:w="2000" w:type="dxa"/>
+          </w:tcPr>
+          <w:p>
+            <w:pPr/>
+            <w:r>
+              <w:t xml:space="preserve">PK, NOT NULL</w:t>
+            </w:r>
+          </w:p>
+        </w:tc>
+      </w:tr>
+      <w:tr>
+        <w:trPr>
+          <w:trHeight w:val="530" w:hRule="atLeast"/>
+        </w:trPr>
+        <w:tc>
+          <w:tcPr>
+            <w:tcW w:w="2000" w:type="dxa"/>
+          </w:tcPr>
+          <w:p>
+            <w:pPr/>
+            <w:r>
+              <w:t xml:space="preserve">document_no</w:t>
+            </w:r>
+          </w:p>
+        </w:tc>
+        <w:tc>
+          <w:tcPr>
+            <w:tcW w:w="2000" w:type="dxa"/>
+          </w:tcPr>
+          <w:p>
+            <w:pPr/>
+            <w:r>
+              <w:t xml:space="preserve">varchar</w:t>
+            </w:r>
+          </w:p>
+        </w:tc>
+        <w:tc>
+          <w:tcPr>
+            <w:tcW w:w="2000" w:type="dxa"/>
+          </w:tcPr>
+          <w:p>
+            <w:pPr/>
+            <w:r>
+              <w:t xml:space="preserve">30</w:t>
+            </w:r>
+          </w:p>
+        </w:tc>
+        <w:tc>
+          <w:tcPr>
+            <w:tcW w:w="2000" w:type="dxa"/>
+          </w:tcPr>
+          <w:p>
+            <w:pPr/>
+            <w:r>
+              <w:t xml:space="preserve">NOT NULL</w:t>
+            </w:r>
+          </w:p>
+        </w:tc>
+      </w:tr>
+      <w:tr>
+        <w:trPr>
+          <w:trHeight w:val="530" w:hRule="atLeast"/>
+        </w:trPr>
+        <w:tc>
+          <w:tcPr>
+            <w:tcW w:w="2000" w:type="dxa"/>
+          </w:tcPr>
+          <w:p>
+            <w:pPr/>
+            <w:r>
+              <w:t xml:space="preserve">business_date</w:t>
+            </w:r>
+          </w:p>
+        </w:tc>
+        <w:tc>
+          <w:tcPr>
+            <w:tcW w:w="2000" w:type="dxa"/>
+          </w:tcPr>
+          <w:p>
+            <w:pPr/>
+            <w:r>
+              <w:t xml:space="preserve">date</w:t>
+            </w:r>
+          </w:p>
+        </w:tc>
+        <w:tc>
+          <w:tcPr>
+            <w:tcW w:w="2000" w:type="dxa"/>
+          </w:tcPr>
+          <w:p>
+            <w:pPr/>
+            <w:r>
+              <w:t xml:space="preserve">-</w:t>
+            </w:r>
+          </w:p>
+        </w:tc>
+        <w:tc>
+          <w:tcPr>
+            <w:tcW w:w="2000" w:type="dxa"/>
+          </w:tcPr>
+          <w:p>
+            <w:pPr/>
+            <w:r>
+              <w:t xml:space="preserve">NOT NULL</w:t>
+            </w:r>
+          </w:p>
+        </w:tc>
+      </w:tr>
+      <w:tr>
+        <w:trPr>
+          <w:trHeight w:val="530" w:hRule="atLeast"/>
+        </w:trPr>
+        <w:tc>
+          <w:tcPr>
+            <w:tcW w:w="2000" w:type="dxa"/>
+          </w:tcPr>
+          <w:p>
+            <w:pPr/>
+            <w:r>
+              <w:t xml:space="preserve">status</w:t>
+            </w:r>
+          </w:p>
+        </w:tc>
+        <w:tc>
+          <w:tcPr>
+            <w:tcW w:w="2000" w:type="dxa"/>
+          </w:tcPr>
+          <w:p>
+            <w:pPr/>
+            <w:r>
+              <w:t xml:space="preserve">varchar</w:t>
+            </w:r>
+          </w:p>
+        </w:tc>
+        <w:tc>
+          <w:tcPr>
+            <w:tcW w:w="2000" w:type="dxa"/>
+          </w:tcPr>
+          <w:p>
+            <w:pPr/>
+            <w:r>
+              <w:t xml:space="preserve">30</w:t>
+            </w:r>
+          </w:p>
+        </w:tc>
+        <w:tc>
+          <w:tcPr>
+            <w:tcW w:w="2000" w:type="dxa"/>
+          </w:tcPr>
+          <w:p>
+            <w:pPr/>
+            <w:r>
+              <w:t xml:space="preserve">NOT NULL</w:t>
+            </w:r>
+          </w:p>
+        </w:tc>
+      </w:tr>
+      <w:tr>
+        <w:trPr>
+          <w:trHeight w:val="530" w:hRule="atLeast"/>
+        </w:trPr>
+        <w:tc>
+          <w:tcPr>
+            <w:tcW w:w="2000" w:type="dxa"/>
+          </w:tcPr>
+          <w:p>
+            <w:pPr/>
+            <w:r>
+              <w:t xml:space="preserve">remark</w:t>
+            </w:r>
+          </w:p>
+        </w:tc>
+        <w:tc>
+          <w:tcPr>
+            <w:tcW w:w="2000" w:type="dxa"/>
+          </w:tcPr>
+          <w:p>
+            <w:pPr/>
+            <w:r>
+              <w:t xml:space="preserve">nvarchar</w:t>
+            </w:r>
+          </w:p>
+        </w:tc>
+        <w:tc>
+          <w:tcPr>
+            <w:tcW w:w="2000" w:type="dxa"/>
+          </w:tcPr>
+          <w:p>
+            <w:pPr/>
+            <w:r>
+              <w:t xml:space="preserve">1000</w:t>
+            </w:r>
+          </w:p>
+        </w:tc>
+        <w:tc>
+          <w:tcPr>
+            <w:tcW w:w="2000" w:type="dxa"/>
+          </w:tcPr>
+          <w:p>
+            <w:pPr/>
+            <w:r>
+              <w:t xml:space="preserve">IS NULL</w:t>
+            </w:r>
+          </w:p>
+        </w:tc>
+      </w:tr>
+      <w:tr>
+        <w:trPr>
+          <w:trHeight w:val="530" w:hRule="atLeast"/>
+        </w:trPr>
+        <w:tc>
+          <w:tcPr>
+            <w:tcW w:w="2000" w:type="dxa"/>
+          </w:tcPr>
+          <w:p>
+            <w:pPr/>
+            <w:r>
+              <w:t xml:space="preserve">custom_fields</w:t>
+            </w:r>
+          </w:p>
+        </w:tc>
+        <w:tc>
+          <w:tcPr>
+            <w:tcW w:w="2000" w:type="dxa"/>
+          </w:tcPr>
+          <w:p>
+            <w:pPr/>
+            <w:r>
+              <w:t xml:space="preserve">nvarchar</w:t>
+            </w:r>
+          </w:p>
+        </w:tc>
+        <w:tc>
+          <w:tcPr>
+            <w:tcW w:w="2000" w:type="dxa"/>
+          </w:tcPr>
+          <w:p>
+            <w:pPr/>
+            <w:r>
+              <w:t xml:space="preserve">MAX</w:t>
+            </w:r>
+          </w:p>
+        </w:tc>
+        <w:tc>
+          <w:tcPr>
+            <w:tcW w:w="2000" w:type="dxa"/>
+          </w:tcPr>
+          <w:p>
+            <w:pPr/>
+            <w:r>
+              <w:t xml:space="preserve">IS NULL</w:t>
+            </w:r>
+          </w:p>
+        </w:tc>
+      </w:tr>
+      <w:tr>
+        <w:trPr>
+          <w:trHeight w:val="530" w:hRule="atLeast"/>
+        </w:trPr>
+        <w:tc>
+          <w:tcPr>
+            <w:tcW w:w="2000" w:type="dxa"/>
+          </w:tcPr>
+          <w:p>
+            <w:pPr/>
+            <w:r>
+              <w:t xml:space="preserve">posted_at</w:t>
+            </w:r>
+          </w:p>
+        </w:tc>
+        <w:tc>
+          <w:tcPr>
+            <w:tcW w:w="2000" w:type="dxa"/>
+          </w:tcPr>
+          <w:p>
+            <w:pPr/>
+            <w:r>
+              <w:t xml:space="preserve">datetime2</w:t>
+            </w:r>
+          </w:p>
+        </w:tc>
+        <w:tc>
+          <w:tcPr>
+            <w:tcW w:w="2000" w:type="dxa"/>
+          </w:tcPr>
+          <w:p>
+            <w:pPr/>
+            <w:r>
+              <w:t xml:space="preserve">(6)</w:t>
+            </w:r>
+          </w:p>
+        </w:tc>
+        <w:tc>
+          <w:tcPr>
+            <w:tcW w:w="2000" w:type="dxa"/>
+          </w:tcPr>
+          <w:p>
+            <w:pPr/>
+            <w:r>
+              <w:t xml:space="preserve">IS NULL</w:t>
+            </w:r>
+          </w:p>
+        </w:tc>
+      </w:tr>
+      <w:tr>
+        <w:trPr>
+          <w:trHeight w:val="530" w:hRule="atLeast"/>
+        </w:trPr>
+        <w:tc>
+          <w:tcPr>
+            <w:tcW w:w="2000" w:type="dxa"/>
+          </w:tcPr>
+          <w:p>
+            <w:pPr/>
+            <w:r>
+              <w:t xml:space="preserve">is_deleted</w:t>
+            </w:r>
+          </w:p>
+        </w:tc>
+        <w:tc>
+          <w:tcPr>
+            <w:tcW w:w="2000" w:type="dxa"/>
+          </w:tcPr>
+          <w:p>
+            <w:pPr/>
+            <w:r>
+              <w:t xml:space="preserve">bit</w:t>
+            </w:r>
+          </w:p>
+        </w:tc>
+        <w:tc>
+          <w:tcPr>
+            <w:tcW w:w="2000" w:type="dxa"/>
+          </w:tcPr>
+          <w:p>
+            <w:pPr/>
+            <w:r>
+              <w:t xml:space="preserve">-</w:t>
+            </w:r>
+          </w:p>
+        </w:tc>
+        <w:tc>
+          <w:tcPr>
+            <w:tcW w:w="2000" w:type="dxa"/>
+          </w:tcPr>
+          <w:p>
+            <w:pPr/>
+            <w:r>
+              <w:t xml:space="preserve">NOT NULL</w:t>
+            </w:r>
+          </w:p>
+        </w:tc>
+      </w:tr>
+      <w:tr>
+        <w:trPr>
+          <w:trHeight w:val="530" w:hRule="atLeast"/>
+        </w:trPr>
+        <w:tc>
+          <w:tcPr>
+            <w:tcW w:w="2000" w:type="dxa"/>
+          </w:tcPr>
+          <w:p>
+            <w:pPr/>
+            <w:r>
+              <w:t xml:space="preserve">deleted_at</w:t>
+            </w:r>
+          </w:p>
+        </w:tc>
+        <w:tc>
+          <w:tcPr>
+            <w:tcW w:w="2000" w:type="dxa"/>
+          </w:tcPr>
+          <w:p>
+            <w:pPr/>
+            <w:r>
+              <w:t xml:space="preserve">datetime2</w:t>
+            </w:r>
+          </w:p>
+        </w:tc>
+        <w:tc>
+          <w:tcPr>
+            <w:tcW w:w="2000" w:type="dxa"/>
+          </w:tcPr>
+          <w:p>
+            <w:pPr/>
+            <w:r>
+              <w:t xml:space="preserve">(6)</w:t>
+            </w:r>
+          </w:p>
+        </w:tc>
+        <w:tc>
+          <w:tcPr>
+            <w:tcW w:w="2000" w:type="dxa"/>
+          </w:tcPr>
+          <w:p>
+            <w:pPr/>
+            <w:r>
+              <w:t xml:space="preserve">IS NULL</w:t>
+            </w:r>
+          </w:p>
+        </w:tc>
+      </w:tr>
+      <w:tr>
+        <w:trPr>
+          <w:trHeight w:val="530" w:hRule="atLeast"/>
+        </w:trPr>
+        <w:tc>
+          <w:tcPr>
+            <w:tcW w:w="2000" w:type="dxa"/>
+          </w:tcPr>
+          <w:p>
+            <w:pPr/>
+            <w:r>
+              <w:t xml:space="preserve">company_id</w:t>
+            </w:r>
+          </w:p>
+        </w:tc>
+        <w:tc>
+          <w:tcPr>
+            <w:tcW w:w="2000" w:type="dxa"/>
+          </w:tcPr>
+          <w:p>
+            <w:pPr/>
+            <w:r>
+              <w:t xml:space="preserve">bigint</w:t>
+            </w:r>
+          </w:p>
+        </w:tc>
+        <w:tc>
+          <w:tcPr>
+            <w:tcW w:w="2000" w:type="dxa"/>
+          </w:tcPr>
+          <w:p>
+            <w:pPr/>
+            <w:r>
+              <w:t xml:space="preserve">-</w:t>
+            </w:r>
+          </w:p>
+        </w:tc>
+        <w:tc>
+          <w:tcPr>
+            <w:tcW w:w="2000" w:type="dxa"/>
+          </w:tcPr>
+          <w:p>
+            <w:pPr/>
+            <w:r>
+              <w:t xml:space="preserve">NOT NULL</w:t>
+            </w:r>
+          </w:p>
+        </w:tc>
+      </w:tr>
+      <w:tr>
+        <w:trPr>
+          <w:trHeight w:val="530" w:hRule="atLeast"/>
+        </w:trPr>
+        <w:tc>
+          <w:tcPr>
+            <w:tcW w:w="2000" w:type="dxa"/>
+          </w:tcPr>
+          <w:p>
+            <w:pPr/>
+            <w:r>
+              <w:t xml:space="preserve">created_at</w:t>
+            </w:r>
+          </w:p>
+        </w:tc>
+        <w:tc>
+          <w:tcPr>
+            <w:tcW w:w="2000" w:type="dxa"/>
+          </w:tcPr>
+          <w:p>
+            <w:pPr/>
+            <w:r>
+              <w:t xml:space="preserve">datetime2</w:t>
+            </w:r>
+          </w:p>
+        </w:tc>
+        <w:tc>
+          <w:tcPr>
+            <w:tcW w:w="2000" w:type="dxa"/>
+          </w:tcPr>
+          <w:p>
+            <w:pPr/>
+            <w:r>
+              <w:t xml:space="preserve">(6)</w:t>
+            </w:r>
+          </w:p>
+        </w:tc>
+        <w:tc>
+          <w:tcPr>
+            <w:tcW w:w="2000" w:type="dxa"/>
+          </w:tcPr>
+          <w:p>
+            <w:pPr/>
+            <w:r>
+              <w:t xml:space="preserve">NOT NULL</w:t>
+            </w:r>
+          </w:p>
+        </w:tc>
+      </w:tr>
+      <w:tr>
+        <w:trPr>
+          <w:trHeight w:val="530" w:hRule="atLeast"/>
+        </w:trPr>
+        <w:tc>
+          <w:tcPr>
+            <w:tcW w:w="2000" w:type="dxa"/>
+          </w:tcPr>
+          <w:p>
+            <w:pPr/>
+            <w:r>
+              <w:t xml:space="preserve">created_by</w:t>
+            </w:r>
+          </w:p>
+        </w:tc>
+        <w:tc>
+          <w:tcPr>
+            <w:tcW w:w="2000" w:type="dxa"/>
+          </w:tcPr>
+          <w:p>
+            <w:pPr/>
+            <w:r>
+              <w:t xml:space="preserve">bigint</w:t>
+            </w:r>
+          </w:p>
+        </w:tc>
+        <w:tc>
+          <w:tcPr>
+            <w:tcW w:w="2000" w:type="dxa"/>
+          </w:tcPr>
+          <w:p>
+            <w:pPr/>
+            <w:r>
+              <w:t xml:space="preserve">-</w:t>
+            </w:r>
+          </w:p>
+        </w:tc>
+        <w:tc>
+          <w:tcPr>
+            <w:tcW w:w="2000" w:type="dxa"/>
+          </w:tcPr>
+          <w:p>
+            <w:pPr/>
+            <w:r>
+              <w:t xml:space="preserve">NOT NULL</w:t>
+            </w:r>
+          </w:p>
+        </w:tc>
+      </w:tr>
+      <w:tr>
+        <w:trPr>
+          <w:trHeight w:val="530" w:hRule="atLeast"/>
+        </w:trPr>
+        <w:tc>
+          <w:tcPr>
+            <w:tcW w:w="2000" w:type="dxa"/>
+          </w:tcPr>
+          <w:p>
+            <w:pPr/>
+            <w:r>
+              <w:t xml:space="preserve">updated_at</w:t>
+            </w:r>
+          </w:p>
+        </w:tc>
+        <w:tc>
+          <w:tcPr>
+            <w:tcW w:w="2000" w:type="dxa"/>
+          </w:tcPr>
+          <w:p>
+            <w:pPr/>
+            <w:r>
+              <w:t xml:space="preserve">datetime2</w:t>
+            </w:r>
+          </w:p>
+        </w:tc>
+        <w:tc>
+          <w:tcPr>
+            <w:tcW w:w="2000" w:type="dxa"/>
+          </w:tcPr>
+          <w:p>
+            <w:pPr/>
+            <w:r>
+              <w:t xml:space="preserve">(6)</w:t>
+            </w:r>
+          </w:p>
+        </w:tc>
+        <w:tc>
+          <w:tcPr>
+            <w:tcW w:w="2000" w:type="dxa"/>
+          </w:tcPr>
+          <w:p>
+            <w:pPr/>
+            <w:r>
+              <w:t xml:space="preserve">IS NULL</w:t>
+            </w:r>
+          </w:p>
+        </w:tc>
+      </w:tr>
+      <w:tr>
+        <w:trPr>
+          <w:trHeight w:val="530" w:hRule="atLeast"/>
+        </w:trPr>
+        <w:tc>
+          <w:tcPr>
+            <w:tcW w:w="2000" w:type="dxa"/>
+          </w:tcPr>
+          <w:p>
+            <w:pPr/>
+            <w:r>
+              <w:t xml:space="preserve">updated_by</w:t>
+            </w:r>
+          </w:p>
+        </w:tc>
+        <w:tc>
+          <w:tcPr>
+            <w:tcW w:w="2000" w:type="dxa"/>
+          </w:tcPr>
+          <w:p>
+            <w:pPr/>
+            <w:r>
+              <w:t xml:space="preserve">bigint</w:t>
+            </w:r>
+          </w:p>
+        </w:tc>
+        <w:tc>
+          <w:tcPr>
+            <w:tcW w:w="2000" w:type="dxa"/>
+          </w:tcPr>
+          <w:p>
+            <w:pPr/>
+            <w:r>
+              <w:t xml:space="preserve">-</w:t>
+            </w:r>
+          </w:p>
+        </w:tc>
+        <w:tc>
+          <w:tcPr>
+            <w:tcW w:w="2000" w:type="dxa"/>
+          </w:tcPr>
+          <w:p>
+            <w:pPr/>
+            <w:r>
+              <w:t xml:space="preserve">IS NULL</w:t>
+            </w:r>
+          </w:p>
+        </w:tc>
+      </w:tr>
+      <w:tr>
+        <w:trPr>
+          <w:trHeight w:val="530" w:hRule="atLeast"/>
+        </w:trPr>
+        <w:tc>
+          <w:tcPr>
+            <w:tcW w:w="2000" w:type="dxa"/>
+          </w:tcPr>
+          <w:p>
+            <w:pPr/>
+            <w:r>
+              <w:t xml:space="preserve">version</w:t>
+            </w:r>
+          </w:p>
+        </w:tc>
+        <w:tc>
+          <w:tcPr>
+            <w:tcW w:w="2000" w:type="dxa"/>
+          </w:tcPr>
+          <w:p>
+            <w:pPr/>
+            <w:r>
+              <w:t xml:space="preserve">int</w:t>
+            </w:r>
+          </w:p>
+        </w:tc>
+        <w:tc>
+          <w:tcPr>
+            <w:tcW w:w="2000" w:type="dxa"/>
+          </w:tcPr>
+          <w:p>
+            <w:pPr/>
+            <w:r>
+              <w:t xml:space="preserve">-</w:t>
+            </w:r>
+          </w:p>
+        </w:tc>
+        <w:tc>
+          <w:tcPr>
+            <w:tcW w:w="2000" w:type="dxa"/>
+          </w:tcPr>
+          <w:p>
+            <w:pPr/>
+            <w:r>
+              <w:t xml:space="preserve">NOT NULL</w:t>
+            </w:r>
+          </w:p>
+        </w:tc>
+      </w:tr>
+    </w:tbl>
+    <w:p/>
+    <w:p>
+      <w:pPr/>
+      <w:r>
+        <w:t xml:space="preserve">Table Name: inv_disassembly_line</w:t>
+      </w:r>
+    </w:p>
+    <w:p>
+      <w:pPr/>
+      <w:r>
+        <w:t xml:space="preserve">Primary Key: id</w:t>
+      </w:r>
+    </w:p>
+    <w:p>
+      <w:pPr/>
+      <w:r>
+        <w:t xml:space="preserve">This table stores the finished source and component destinations with allocation weight and posted unit cost.</w:t>
+      </w:r>
+    </w:p>
+    <w:tbl>
+      <w:tblPr>
+        <w:tblStyle w:val="TableGrid"/>
+        <w:tblW w:w="8000" w:type="dxa"/>
+        <w:jc w:val="left"/>
+        <w:tblBorders>
+          <w:top w:val="single" w:color="000000" w:sz="4" w:space="0"/>
+          <w:left w:val="single" w:color="000000" w:sz="4" w:space="0"/>
+          <w:bottom w:val="single" w:color="000000" w:sz="4" w:space="0"/>
+          <w:right w:val="single" w:color="000000" w:sz="4" w:space="0"/>
+          <w:insideH w:val="single" w:color="000000" w:sz="4" w:space="0"/>
+          <w:insideV w:val="single" w:color="000000" w:sz="4" w:space="0"/>
+        </w:tblBorders>
+        <w:tblLayout w:type="fixed"/>
+        <w:tblCellMar>
+          <w:top w:w="100" w:type="dxa"/>
+          <w:left w:w="100" w:type="dxa"/>
+          <w:bottom w:w="100" w:type="dxa"/>
+          <w:right w:w="100" w:type="dxa"/>
+        </w:tblCellMar>
+      </w:tblPr>
+      <w:tblGrid>
+        <w:gridCol w:w="2000"/>
+        <w:gridCol w:w="2000"/>
+        <w:gridCol w:w="2000"/>
+        <w:gridCol w:w="2000"/>
+      </w:tblGrid>
+      <w:tr>
+        <w:trPr>
+          <w:trHeight w:val="530" w:hRule="atLeast"/>
+        </w:trPr>
+        <w:tc>
+          <w:tcPr>
+            <w:tcW w:w="2000" w:type="dxa"/>
+          </w:tcPr>
+          <w:p>
+            <w:pPr>
+              <w:jc w:val="center"/>
+            </w:pPr>
+            <w:r>
+              <w:rPr>
+                <w:b/>
+              </w:rPr>
+              <w:t xml:space="preserve">Name of Attribute</w:t>
+            </w:r>
+          </w:p>
+        </w:tc>
+        <w:tc>
+          <w:tcPr>
+            <w:tcW w:w="2000" w:type="dxa"/>
+          </w:tcPr>
+          <w:p>
+            <w:pPr>
+              <w:jc w:val="center"/>
+            </w:pPr>
+            <w:r>
+              <w:rPr>
+                <w:b/>
+              </w:rPr>
+              <w:t xml:space="preserve">Data Type</w:t>
+            </w:r>
+          </w:p>
+        </w:tc>
+        <w:tc>
+          <w:tcPr>
+            <w:tcW w:w="2000" w:type="dxa"/>
+          </w:tcPr>
+          <w:p>
+            <w:pPr>
+              <w:jc w:val="center"/>
+            </w:pPr>
+            <w:r>
+              <w:rPr>
+                <w:b/>
+              </w:rPr>
+              <w:t xml:space="preserve">Size</w:t>
+            </w:r>
+          </w:p>
+        </w:tc>
+        <w:tc>
+          <w:tcPr>
+            <w:tcW w:w="2000" w:type="dxa"/>
+          </w:tcPr>
+          <w:p>
+            <w:pPr>
+              <w:jc w:val="center"/>
+            </w:pPr>
+            <w:r>
+              <w:rPr>
+                <w:b/>
+              </w:rPr>
+              <w:t xml:space="preserve">PK/FK/IS NULL/ NOT NULL</w:t>
+            </w:r>
+          </w:p>
+        </w:tc>
+      </w:tr>
+      <w:tr>
+        <w:trPr>
+          <w:trHeight w:val="530" w:hRule="atLeast"/>
+        </w:trPr>
+        <w:tc>
+          <w:tcPr>
+            <w:tcW w:w="2000" w:type="dxa"/>
+          </w:tcPr>
+          <w:p>
+            <w:pPr/>
+            <w:r>
+              <w:t xml:space="preserve">id</w:t>
+            </w:r>
+          </w:p>
+        </w:tc>
+        <w:tc>
+          <w:tcPr>
+            <w:tcW w:w="2000" w:type="dxa"/>
+          </w:tcPr>
+          <w:p>
+            <w:pPr/>
+            <w:r>
+              <w:t xml:space="preserve">bigint</w:t>
+            </w:r>
+          </w:p>
+        </w:tc>
+        <w:tc>
+          <w:tcPr>
+            <w:tcW w:w="2000" w:type="dxa"/>
+          </w:tcPr>
+          <w:p>
+            <w:pPr/>
+            <w:r>
+              <w:t xml:space="preserve">-</w:t>
+            </w:r>
+          </w:p>
+        </w:tc>
+        <w:tc>
+          <w:tcPr>
+            <w:tcW w:w="2000" w:type="dxa"/>
+          </w:tcPr>
+          <w:p>
+            <w:pPr/>
+            <w:r>
+              <w:t xml:space="preserve">PK, NOT NULL</w:t>
+            </w:r>
+          </w:p>
+        </w:tc>
+      </w:tr>
+      <w:tr>
+        <w:trPr>
+          <w:trHeight w:val="530" w:hRule="atLeast"/>
+        </w:trPr>
+        <w:tc>
+          <w:tcPr>
+            <w:tcW w:w="2000" w:type="dxa"/>
+          </w:tcPr>
+          <w:p>
+            <w:pPr/>
+            <w:r>
+              <w:t xml:space="preserve">disassembly_id</w:t>
+            </w:r>
+          </w:p>
+        </w:tc>
+        <w:tc>
+          <w:tcPr>
+            <w:tcW w:w="2000" w:type="dxa"/>
+          </w:tcPr>
+          <w:p>
+            <w:pPr/>
+            <w:r>
+              <w:t xml:space="preserve">bigint</w:t>
+            </w:r>
+          </w:p>
+        </w:tc>
+        <w:tc>
+          <w:tcPr>
+            <w:tcW w:w="2000" w:type="dxa"/>
+          </w:tcPr>
+          <w:p>
+            <w:pPr/>
+            <w:r>
+              <w:t xml:space="preserve">-</w:t>
+            </w:r>
+          </w:p>
+        </w:tc>
+        <w:tc>
+          <w:tcPr>
+            <w:tcW w:w="2000" w:type="dxa"/>
+          </w:tcPr>
+          <w:p>
+            <w:pPr/>
+            <w:r>
+              <w:t xml:space="preserve">FK, NOT NULL</w:t>
+            </w:r>
+          </w:p>
+        </w:tc>
+      </w:tr>
+      <w:tr>
+        <w:trPr>
+          <w:trHeight w:val="530" w:hRule="atLeast"/>
+        </w:trPr>
+        <w:tc>
+          <w:tcPr>
+            <w:tcW w:w="2000" w:type="dxa"/>
+          </w:tcPr>
+          <w:p>
+            <w:pPr/>
+            <w:r>
+              <w:t xml:space="preserve">line_no</w:t>
+            </w:r>
+          </w:p>
+        </w:tc>
+        <w:tc>
+          <w:tcPr>
+            <w:tcW w:w="2000" w:type="dxa"/>
+          </w:tcPr>
+          <w:p>
+            <w:pPr/>
+            <w:r>
+              <w:t xml:space="preserve">int</w:t>
+            </w:r>
+          </w:p>
+        </w:tc>
+        <w:tc>
+          <w:tcPr>
+            <w:tcW w:w="2000" w:type="dxa"/>
+          </w:tcPr>
+          <w:p>
+            <w:pPr/>
+            <w:r>
+              <w:t xml:space="preserve">-</w:t>
+            </w:r>
+          </w:p>
+        </w:tc>
+        <w:tc>
+          <w:tcPr>
+            <w:tcW w:w="2000" w:type="dxa"/>
+          </w:tcPr>
+          <w:p>
+            <w:pPr/>
+            <w:r>
+              <w:t xml:space="preserve">NOT NULL</w:t>
+            </w:r>
+          </w:p>
+        </w:tc>
+      </w:tr>
+      <w:tr>
+        <w:trPr>
+          <w:trHeight w:val="530" w:hRule="atLeast"/>
+        </w:trPr>
+        <w:tc>
+          <w:tcPr>
+            <w:tcW w:w="2000" w:type="dxa"/>
+          </w:tcPr>
+          <w:p>
+            <w:pPr/>
+            <w:r>
+              <w:t xml:space="preserve">role</w:t>
+            </w:r>
+          </w:p>
+        </w:tc>
+        <w:tc>
+          <w:tcPr>
+            <w:tcW w:w="2000" w:type="dxa"/>
+          </w:tcPr>
+          <w:p>
+            <w:pPr/>
+            <w:r>
+              <w:t xml:space="preserve">varchar</w:t>
+            </w:r>
+          </w:p>
+        </w:tc>
+        <w:tc>
+          <w:tcPr>
+            <w:tcW w:w="2000" w:type="dxa"/>
+          </w:tcPr>
+          <w:p>
+            <w:pPr/>
+            <w:r>
+              <w:t xml:space="preserve">20</w:t>
+            </w:r>
+          </w:p>
+        </w:tc>
+        <w:tc>
+          <w:tcPr>
+            <w:tcW w:w="2000" w:type="dxa"/>
+          </w:tcPr>
+          <w:p>
+            <w:pPr/>
+            <w:r>
+              <w:t xml:space="preserve">NOT NULL</w:t>
+            </w:r>
+          </w:p>
+        </w:tc>
+      </w:tr>
+      <w:tr>
+        <w:trPr>
+          <w:trHeight w:val="530" w:hRule="atLeast"/>
+        </w:trPr>
+        <w:tc>
+          <w:tcPr>
+            <w:tcW w:w="2000" w:type="dxa"/>
+          </w:tcPr>
+          <w:p>
+            <w:pPr/>
+            <w:r>
+              <w:t xml:space="preserve">item_id</w:t>
+            </w:r>
+          </w:p>
+        </w:tc>
+        <w:tc>
+          <w:tcPr>
+            <w:tcW w:w="2000" w:type="dxa"/>
+          </w:tcPr>
+          <w:p>
+            <w:pPr/>
+            <w:r>
+              <w:t xml:space="preserve">bigint</w:t>
+            </w:r>
+          </w:p>
+        </w:tc>
+        <w:tc>
+          <w:tcPr>
+            <w:tcW w:w="2000" w:type="dxa"/>
+          </w:tcPr>
+          <w:p>
+            <w:pPr/>
+            <w:r>
+              <w:t xml:space="preserve">-</w:t>
+            </w:r>
+          </w:p>
+        </w:tc>
+        <w:tc>
+          <w:tcPr>
+            <w:tcW w:w="2000" w:type="dxa"/>
+          </w:tcPr>
+          <w:p>
+            <w:pPr/>
+            <w:r>
+              <w:t xml:space="preserve">NOT NULL</w:t>
+            </w:r>
+          </w:p>
+        </w:tc>
+      </w:tr>
+      <w:tr>
+        <w:trPr>
+          <w:trHeight w:val="530" w:hRule="atLeast"/>
+        </w:trPr>
+        <w:tc>
+          <w:tcPr>
+            <w:tcW w:w="2000" w:type="dxa"/>
+          </w:tcPr>
+          <w:p>
+            <w:pPr/>
+            <w:r>
+              <w:t xml:space="preserve">warehouse_id</w:t>
+            </w:r>
+          </w:p>
+        </w:tc>
+        <w:tc>
+          <w:tcPr>
+            <w:tcW w:w="2000" w:type="dxa"/>
+          </w:tcPr>
+          <w:p>
+            <w:pPr/>
+            <w:r>
+              <w:t xml:space="preserve">bigint</w:t>
+            </w:r>
+          </w:p>
+        </w:tc>
+        <w:tc>
+          <w:tcPr>
+            <w:tcW w:w="2000" w:type="dxa"/>
+          </w:tcPr>
+          <w:p>
+            <w:pPr/>
+            <w:r>
+              <w:t xml:space="preserve">-</w:t>
+            </w:r>
+          </w:p>
+        </w:tc>
+        <w:tc>
+          <w:tcPr>
+            <w:tcW w:w="2000" w:type="dxa"/>
+          </w:tcPr>
+          <w:p>
+            <w:pPr/>
+            <w:r>
+              <w:t xml:space="preserve">NOT NULL</w:t>
+            </w:r>
+          </w:p>
+        </w:tc>
+      </w:tr>
+      <w:tr>
+        <w:trPr>
+          <w:trHeight w:val="530" w:hRule="atLeast"/>
+        </w:trPr>
+        <w:tc>
+          <w:tcPr>
+            <w:tcW w:w="2000" w:type="dxa"/>
+          </w:tcPr>
+          <w:p>
+            <w:pPr/>
+            <w:r>
+              <w:t xml:space="preserve">location_id</w:t>
+            </w:r>
+          </w:p>
+        </w:tc>
+        <w:tc>
+          <w:tcPr>
+            <w:tcW w:w="2000" w:type="dxa"/>
+          </w:tcPr>
+          <w:p>
+            <w:pPr/>
+            <w:r>
+              <w:t xml:space="preserve">bigint</w:t>
+            </w:r>
+          </w:p>
+        </w:tc>
+        <w:tc>
+          <w:tcPr>
+            <w:tcW w:w="2000" w:type="dxa"/>
+          </w:tcPr>
+          <w:p>
+            <w:pPr/>
+            <w:r>
+              <w:t xml:space="preserve">-</w:t>
+            </w:r>
+          </w:p>
+        </w:tc>
+        <w:tc>
+          <w:tcPr>
+            <w:tcW w:w="2000" w:type="dxa"/>
+          </w:tcPr>
+          <w:p>
+            <w:pPr/>
+            <w:r>
+              <w:t xml:space="preserve">IS NULL</w:t>
+            </w:r>
+          </w:p>
+        </w:tc>
+      </w:tr>
+      <w:tr>
+        <w:trPr>
+          <w:trHeight w:val="530" w:hRule="atLeast"/>
+        </w:trPr>
+        <w:tc>
+          <w:tcPr>
+            <w:tcW w:w="2000" w:type="dxa"/>
+          </w:tcPr>
+          <w:p>
+            <w:pPr/>
+            <w:r>
+              <w:t xml:space="preserve">quantity</w:t>
+            </w:r>
+          </w:p>
+        </w:tc>
+        <w:tc>
+          <w:tcPr>
+            <w:tcW w:w="2000" w:type="dxa"/>
+          </w:tcPr>
+          <w:p>
+            <w:pPr/>
+            <w:r>
+              <w:t xml:space="preserve">decimal</w:t>
+            </w:r>
+          </w:p>
+        </w:tc>
+        <w:tc>
+          <w:tcPr>
+            <w:tcW w:w="2000" w:type="dxa"/>
+          </w:tcPr>
+          <w:p>
+            <w:pPr/>
+            <w:r>
+              <w:t xml:space="preserve">(19,6)</w:t>
+            </w:r>
+          </w:p>
+        </w:tc>
+        <w:tc>
+          <w:tcPr>
+            <w:tcW w:w="2000" w:type="dxa"/>
+          </w:tcPr>
+          <w:p>
+            <w:pPr/>
+            <w:r>
+              <w:t xml:space="preserve">NOT NULL</w:t>
+            </w:r>
+          </w:p>
+        </w:tc>
+      </w:tr>
+      <w:tr>
+        <w:trPr>
+          <w:trHeight w:val="530" w:hRule="atLeast"/>
+        </w:trPr>
+        <w:tc>
+          <w:tcPr>
+            <w:tcW w:w="2000" w:type="dxa"/>
+          </w:tcPr>
+          <w:p>
+            <w:pPr/>
+            <w:r>
+              <w:t xml:space="preserve">allocation_weight</w:t>
+            </w:r>
+          </w:p>
+        </w:tc>
+        <w:tc>
+          <w:tcPr>
+            <w:tcW w:w="2000" w:type="dxa"/>
+          </w:tcPr>
+          <w:p>
+            <w:pPr/>
+            <w:r>
+              <w:t xml:space="preserve">decimal</w:t>
+            </w:r>
+          </w:p>
+        </w:tc>
+        <w:tc>
+          <w:tcPr>
+            <w:tcW w:w="2000" w:type="dxa"/>
+          </w:tcPr>
+          <w:p>
+            <w:pPr/>
+            <w:r>
+              <w:t xml:space="preserve">(19,6)</w:t>
+            </w:r>
+          </w:p>
+        </w:tc>
+        <w:tc>
+          <w:tcPr>
+            <w:tcW w:w="2000" w:type="dxa"/>
+          </w:tcPr>
+          <w:p>
+            <w:pPr/>
+            <w:r>
+              <w:t xml:space="preserve">IS NULL</w:t>
+            </w:r>
+          </w:p>
+        </w:tc>
+      </w:tr>
+      <w:tr>
+        <w:trPr>
+          <w:trHeight w:val="530" w:hRule="atLeast"/>
+        </w:trPr>
+        <w:tc>
+          <w:tcPr>
+            <w:tcW w:w="2000" w:type="dxa"/>
+          </w:tcPr>
+          <w:p>
+            <w:pPr/>
+            <w:r>
+              <w:t xml:space="preserve">posted_unit_cost</w:t>
+            </w:r>
+          </w:p>
+        </w:tc>
+        <w:tc>
+          <w:tcPr>
+            <w:tcW w:w="2000" w:type="dxa"/>
+          </w:tcPr>
+          <w:p>
+            <w:pPr/>
+            <w:r>
+              <w:t xml:space="preserve">decimal</w:t>
+            </w:r>
+          </w:p>
+        </w:tc>
+        <w:tc>
+          <w:tcPr>
+            <w:tcW w:w="2000" w:type="dxa"/>
+          </w:tcPr>
+          <w:p>
+            <w:pPr/>
+            <w:r>
+              <w:t xml:space="preserve">(19,6)</w:t>
+            </w:r>
+          </w:p>
+        </w:tc>
+        <w:tc>
+          <w:tcPr>
+            <w:tcW w:w="2000" w:type="dxa"/>
+          </w:tcPr>
+          <w:p>
+            <w:pPr/>
+            <w:r>
+              <w:t xml:space="preserve">IS NULL</w:t>
+            </w:r>
+          </w:p>
+        </w:tc>
+      </w:tr>
+      <w:tr>
+        <w:trPr>
+          <w:trHeight w:val="530" w:hRule="atLeast"/>
+        </w:trPr>
+        <w:tc>
+          <w:tcPr>
+            <w:tcW w:w="2000" w:type="dxa"/>
+          </w:tcPr>
+          <w:p>
+            <w:pPr/>
+            <w:r>
+              <w:t xml:space="preserve">company_id</w:t>
+            </w:r>
+          </w:p>
+        </w:tc>
+        <w:tc>
+          <w:tcPr>
+            <w:tcW w:w="2000" w:type="dxa"/>
+          </w:tcPr>
+          <w:p>
+            <w:pPr/>
+            <w:r>
+              <w:t xml:space="preserve">bigint</w:t>
+            </w:r>
+          </w:p>
+        </w:tc>
+        <w:tc>
+          <w:tcPr>
+            <w:tcW w:w="2000" w:type="dxa"/>
+          </w:tcPr>
+          <w:p>
+            <w:pPr/>
+            <w:r>
+              <w:t xml:space="preserve">-</w:t>
+            </w:r>
+          </w:p>
+        </w:tc>
+        <w:tc>
+          <w:tcPr>
+            <w:tcW w:w="2000" w:type="dxa"/>
+          </w:tcPr>
+          <w:p>
+            <w:pPr/>
+            <w:r>
+              <w:t xml:space="preserve">FK, NOT NULL</w:t>
+            </w:r>
+          </w:p>
+        </w:tc>
+      </w:tr>
+      <w:tr>
+        <w:trPr>
+          <w:trHeight w:val="530" w:hRule="atLeast"/>
+        </w:trPr>
+        <w:tc>
+          <w:tcPr>
+            <w:tcW w:w="2000" w:type="dxa"/>
+          </w:tcPr>
+          <w:p>
+            <w:pPr/>
+            <w:r>
+              <w:t xml:space="preserve">created_at</w:t>
+            </w:r>
+          </w:p>
+        </w:tc>
+        <w:tc>
+          <w:tcPr>
+            <w:tcW w:w="2000" w:type="dxa"/>
+          </w:tcPr>
+          <w:p>
+            <w:pPr/>
+            <w:r>
+              <w:t xml:space="preserve">datetime2</w:t>
+            </w:r>
+          </w:p>
+        </w:tc>
+        <w:tc>
+          <w:tcPr>
+            <w:tcW w:w="2000" w:type="dxa"/>
+          </w:tcPr>
+          <w:p>
+            <w:pPr/>
+            <w:r>
+              <w:t xml:space="preserve">(6)</w:t>
+            </w:r>
+          </w:p>
+        </w:tc>
+        <w:tc>
+          <w:tcPr>
+            <w:tcW w:w="2000" w:type="dxa"/>
+          </w:tcPr>
+          <w:p>
+            <w:pPr/>
+            <w:r>
+              <w:t xml:space="preserve">NOT NULL</w:t>
+            </w:r>
+          </w:p>
+        </w:tc>
+      </w:tr>
+      <w:tr>
+        <w:trPr>
+          <w:trHeight w:val="530" w:hRule="atLeast"/>
+        </w:trPr>
+        <w:tc>
+          <w:tcPr>
+            <w:tcW w:w="2000" w:type="dxa"/>
+          </w:tcPr>
+          <w:p>
+            <w:pPr/>
+            <w:r>
+              <w:t xml:space="preserve">created_by</w:t>
+            </w:r>
+          </w:p>
+        </w:tc>
+        <w:tc>
+          <w:tcPr>
+            <w:tcW w:w="2000" w:type="dxa"/>
+          </w:tcPr>
+          <w:p>
+            <w:pPr/>
+            <w:r>
+              <w:t xml:space="preserve">bigint</w:t>
+            </w:r>
+          </w:p>
+        </w:tc>
+        <w:tc>
+          <w:tcPr>
+            <w:tcW w:w="2000" w:type="dxa"/>
+          </w:tcPr>
+          <w:p>
+            <w:pPr/>
+            <w:r>
+              <w:t xml:space="preserve">-</w:t>
+            </w:r>
+          </w:p>
+        </w:tc>
+        <w:tc>
+          <w:tcPr>
+            <w:tcW w:w="2000" w:type="dxa"/>
+          </w:tcPr>
+          <w:p>
+            <w:pPr/>
+            <w:r>
+              <w:t xml:space="preserve">NOT NULL</w:t>
+            </w:r>
+          </w:p>
+        </w:tc>
+      </w:tr>
+      <w:tr>
+        <w:trPr>
+          <w:trHeight w:val="530" w:hRule="atLeast"/>
+        </w:trPr>
+        <w:tc>
+          <w:tcPr>
+            <w:tcW w:w="2000" w:type="dxa"/>
+          </w:tcPr>
+          <w:p>
+            <w:pPr/>
+            <w:r>
+              <w:t xml:space="preserve">updated_at</w:t>
+            </w:r>
+          </w:p>
+        </w:tc>
+        <w:tc>
+          <w:tcPr>
+            <w:tcW w:w="2000" w:type="dxa"/>
+          </w:tcPr>
+          <w:p>
+            <w:pPr/>
+            <w:r>
+              <w:t xml:space="preserve">datetime2</w:t>
+            </w:r>
+          </w:p>
+        </w:tc>
+        <w:tc>
+          <w:tcPr>
+            <w:tcW w:w="2000" w:type="dxa"/>
+          </w:tcPr>
+          <w:p>
+            <w:pPr/>
+            <w:r>
+              <w:t xml:space="preserve">(6)</w:t>
+            </w:r>
+          </w:p>
+        </w:tc>
+        <w:tc>
+          <w:tcPr>
+            <w:tcW w:w="2000" w:type="dxa"/>
+          </w:tcPr>
+          <w:p>
+            <w:pPr/>
+            <w:r>
+              <w:t xml:space="preserve">IS NULL</w:t>
+            </w:r>
+          </w:p>
+        </w:tc>
+      </w:tr>
+      <w:tr>
+        <w:trPr>
+          <w:trHeight w:val="530" w:hRule="atLeast"/>
+        </w:trPr>
+        <w:tc>
+          <w:tcPr>
+            <w:tcW w:w="2000" w:type="dxa"/>
+          </w:tcPr>
+          <w:p>
+            <w:pPr/>
+            <w:r>
+              <w:t xml:space="preserve">updated_by</w:t>
+            </w:r>
+          </w:p>
+        </w:tc>
+        <w:tc>
+          <w:tcPr>
+            <w:tcW w:w="2000" w:type="dxa"/>
+          </w:tcPr>
+          <w:p>
+            <w:pPr/>
+            <w:r>
+              <w:t xml:space="preserve">bigint</w:t>
+            </w:r>
+          </w:p>
+        </w:tc>
+        <w:tc>
+          <w:tcPr>
+            <w:tcW w:w="2000" w:type="dxa"/>
+          </w:tcPr>
+          <w:p>
+            <w:pPr/>
+            <w:r>
+              <w:t xml:space="preserve">-</w:t>
+            </w:r>
+          </w:p>
+        </w:tc>
+        <w:tc>
+          <w:tcPr>
+            <w:tcW w:w="2000" w:type="dxa"/>
+          </w:tcPr>
+          <w:p>
+            <w:pPr/>
+            <w:r>
+              <w:t xml:space="preserve">IS NULL</w:t>
+            </w:r>
+          </w:p>
+        </w:tc>
+      </w:tr>
+      <w:tr>
+        <w:trPr>
+          <w:trHeight w:val="530" w:hRule="atLeast"/>
+        </w:trPr>
+        <w:tc>
+          <w:tcPr>
+            <w:tcW w:w="2000" w:type="dxa"/>
+          </w:tcPr>
+          <w:p>
+            <w:pPr/>
+            <w:r>
+              <w:t xml:space="preserve">version</w:t>
+            </w:r>
+          </w:p>
+        </w:tc>
+        <w:tc>
+          <w:tcPr>
+            <w:tcW w:w="2000" w:type="dxa"/>
+          </w:tcPr>
+          <w:p>
+            <w:pPr/>
+            <w:r>
+              <w:t xml:space="preserve">int</w:t>
+            </w:r>
+          </w:p>
+        </w:tc>
+        <w:tc>
+          <w:tcPr>
+            <w:tcW w:w="2000" w:type="dxa"/>
+          </w:tcPr>
+          <w:p>
+            <w:pPr/>
+            <w:r>
+              <w:t xml:space="preserve">-</w:t>
+            </w:r>
+          </w:p>
+        </w:tc>
+        <w:tc>
+          <w:tcPr>
+            <w:tcW w:w="2000" w:type="dxa"/>
+          </w:tcPr>
+          <w:p>
+            <w:pPr/>
+            <w:r>
+              <w:t xml:space="preserve">NOT NULL</w:t>
+            </w:r>
+          </w:p>
+        </w:tc>
+      </w:tr>
+    </w:tbl>
+    <w:p/>
+    <w:p>
+      <w:pPr/>
+      <w:r>
+        <w:t xml:space="preserve">Table Name: inv_disassembly_line_tracking</w:t>
+      </w:r>
+    </w:p>
+    <w:p>
+      <w:pPr/>
+      <w:r>
+        <w:t xml:space="preserve">Primary Key: id</w:t>
+      </w:r>
+    </w:p>
+    <w:p>
+      <w:pPr/>
+      <w:r>
+        <w:t xml:space="preserve">This table stores selected lot or serial quantities for each disassembly line.</w:t>
       </w:r>
     </w:p>
     <w:tbl>
@@ -60089,7 +62544,7 @@
       </w:r>
     </w:p>
     <w:sectPr>
-      <w:footerReference xmlns:r="http://schemas.openxmlformats.org/officeDocument/2006/relationships" w:type="default" r:id="R3dfa9d52f7c94e61"/>
+      <w:footerReference xmlns:r="http://schemas.openxmlformats.org/officeDocument/2006/relationships" w:type="default" r:id="R42613940946242f4"/>
       <w:pgSz w:w="11906" w:h="16838"/>
       <w:pgMar w:top="1440" w:right="1440" w:bottom="1440" w:left="1440" w:header="720" w:footer="720" w:gutter="0"/>
     </w:sectPr>

</xml_diff>

<commit_message>
feat(inv): complete disassembly frontend and QA
</commit_message>
<xml_diff>
--- a/docs/99-output/MyERP_SDS.docx
+++ b/docs/99-output/MyERP_SDS.docx
@@ -46,7 +46,7 @@
         <w:jc w:val="center"/>
       </w:pPr>
       <w:r>
-        <w:t xml:space="preserve">Date: 18 October 2026</w:t>
+        <w:t xml:space="preserve">Date: 19 October 2026</w:t>
       </w:r>
     </w:p>
     <w:p/>
@@ -62544,7 +62544,7 @@
       </w:r>
     </w:p>
     <w:sectPr>
-      <w:footerReference xmlns:r="http://schemas.openxmlformats.org/officeDocument/2006/relationships" w:type="default" r:id="R01dc3d094e414e11"/>
+      <w:footerReference xmlns:r="http://schemas.openxmlformats.org/officeDocument/2006/relationships" w:type="default" r:id="Rf90259c3d8e34408"/>
       <w:pgSz w:w="11906" w:h="16838"/>
       <w:pgMar w:top="1440" w:right="1440" w:bottom="1440" w:left="1440" w:header="720" w:footer="720" w:gutter="0"/>
     </w:sectPr>

</xml_diff>

<commit_message>
docs(pur): define requisition design and acceptance scenarios
</commit_message>
<xml_diff>
--- a/docs/99-output/MyERP_SDS.docx
+++ b/docs/99-output/MyERP_SDS.docx
@@ -60416,6 +60416,71 @@
           <w:i/>
         </w:rPr>
         <w:t xml:space="preserve">[Pending] System screenshot of Personal Settings Interface.</w:t>
+      </w:r>
+    </w:p>
+    <w:p>
+      <w:pPr>
+        <w:pStyle w:val="Heading4"/>
+      </w:pPr>
+      <w:r>
+        <w:t xml:space="preserve">4.2.1.4 Purchase Module</w:t>
+      </w:r>
+    </w:p>
+    <w:p>
+      <w:pPr>
+        <w:pStyle w:val="Heading5"/>
+      </w:pPr>
+      <w:r>
+        <w:t xml:space="preserve">4.2.1.4.8 Purchase Requisition View Interface</w:t>
+      </w:r>
+    </w:p>
+    <w:p>
+      <w:pPr>
+        <w:jc w:val="center"/>
+      </w:pPr>
+      <w:r>
+        <w:rPr>
+          <w:i/>
+        </w:rPr>
+        <w:t xml:space="preserve">[Pending] System screenshot of Purchase Requisition View Interface.</w:t>
+      </w:r>
+    </w:p>
+    <w:p>
+      <w:pPr>
+        <w:pStyle w:val="Heading5"/>
+      </w:pPr>
+      <w:r>
+        <w:t xml:space="preserve">4.2.1.4.9 Purchase Requisition Create Interface</w:t>
+      </w:r>
+    </w:p>
+    <w:p>
+      <w:pPr>
+        <w:jc w:val="center"/>
+      </w:pPr>
+      <w:r>
+        <w:rPr>
+          <w:i/>
+        </w:rPr>
+        <w:t xml:space="preserve">[Pending] System screenshot of Purchase Requisition Create Interface.</w:t>
+      </w:r>
+    </w:p>
+    <w:p>
+      <w:pPr>
+        <w:pStyle w:val="Heading5"/>
+      </w:pPr>
+      <w:r>
+        <w:t xml:space="preserve">4.2.1.4.10 Purchase Requisition Edit Interface</w:t>
+      </w:r>
+    </w:p>
+    <w:p>
+      <w:pPr>
+        <w:jc w:val="center"/>
+      </w:pPr>
+      <w:r>
+        <w:rPr>
+          <w:i/>
+        </w:rPr>
+        <w:t xml:space="preserve">[Pending] System screenshot of Purchase Requisition Edit Interface.</w:t>
       </w:r>
     </w:p>
     <w:p>
@@ -62544,7 +62609,7 @@
       </w:r>
     </w:p>
     <w:sectPr>
-      <w:footerReference xmlns:r="http://schemas.openxmlformats.org/officeDocument/2006/relationships" w:type="default" r:id="R913a532c225a44b8"/>
+      <w:footerReference xmlns:r="http://schemas.openxmlformats.org/officeDocument/2006/relationships" w:type="default" r:id="R862300029bca41aa"/>
       <w:pgSz w:w="11906" w:h="16838"/>
       <w:pgMar w:top="1440" w:right="1440" w:bottom="1440" w:left="1440" w:header="720" w:footer="720" w:gutter="0"/>
     </w:sectPr>

</xml_diff>

<commit_message>
feat(pur): add requisition draft schema
</commit_message>
<xml_diff>
--- a/docs/99-output/MyERP_SDS.docx
+++ b/docs/99-output/MyERP_SDS.docx
@@ -45516,6 +45516,1659 @@
             <w:pPr/>
             <w:r>
               <w:t xml:space="preserve">IS NULL</w:t>
+            </w:r>
+          </w:p>
+        </w:tc>
+      </w:tr>
+    </w:tbl>
+    <w:p/>
+    <w:p>
+      <w:pPr/>
+      <w:r>
+        <w:t xml:space="preserve">Table Name: pur_requisition</w:t>
+      </w:r>
+    </w:p>
+    <w:p>
+      <w:pPr/>
+      <w:r>
+        <w:t xml:space="preserve">Primary Key: id</w:t>
+      </w:r>
+    </w:p>
+    <w:p>
+      <w:pPr/>
+      <w:r>
+        <w:t xml:space="preserve">This table stores company-scoped purchase requisition headers, document numbers and approval state.</w:t>
+      </w:r>
+    </w:p>
+    <w:tbl>
+      <w:tblPr>
+        <w:tblStyle w:val="TableGrid"/>
+        <w:tblW w:w="8000" w:type="dxa"/>
+        <w:jc w:val="left"/>
+        <w:tblBorders>
+          <w:top w:val="single" w:color="000000" w:sz="4" w:space="0"/>
+          <w:left w:val="single" w:color="000000" w:sz="4" w:space="0"/>
+          <w:bottom w:val="single" w:color="000000" w:sz="4" w:space="0"/>
+          <w:right w:val="single" w:color="000000" w:sz="4" w:space="0"/>
+          <w:insideH w:val="single" w:color="000000" w:sz="4" w:space="0"/>
+          <w:insideV w:val="single" w:color="000000" w:sz="4" w:space="0"/>
+        </w:tblBorders>
+        <w:tblLayout w:type="fixed"/>
+        <w:tblCellMar>
+          <w:top w:w="100" w:type="dxa"/>
+          <w:left w:w="100" w:type="dxa"/>
+          <w:bottom w:w="100" w:type="dxa"/>
+          <w:right w:w="100" w:type="dxa"/>
+        </w:tblCellMar>
+      </w:tblPr>
+      <w:tblGrid>
+        <w:gridCol w:w="2000"/>
+        <w:gridCol w:w="2000"/>
+        <w:gridCol w:w="2000"/>
+        <w:gridCol w:w="2000"/>
+      </w:tblGrid>
+      <w:tr>
+        <w:trPr>
+          <w:trHeight w:val="530" w:hRule="atLeast"/>
+        </w:trPr>
+        <w:tc>
+          <w:tcPr>
+            <w:tcW w:w="2000" w:type="dxa"/>
+          </w:tcPr>
+          <w:p>
+            <w:pPr>
+              <w:jc w:val="center"/>
+            </w:pPr>
+            <w:r>
+              <w:rPr>
+                <w:b/>
+              </w:rPr>
+              <w:t xml:space="preserve">Name of Attribute</w:t>
+            </w:r>
+          </w:p>
+        </w:tc>
+        <w:tc>
+          <w:tcPr>
+            <w:tcW w:w="2000" w:type="dxa"/>
+          </w:tcPr>
+          <w:p>
+            <w:pPr>
+              <w:jc w:val="center"/>
+            </w:pPr>
+            <w:r>
+              <w:rPr>
+                <w:b/>
+              </w:rPr>
+              <w:t xml:space="preserve">Data Type</w:t>
+            </w:r>
+          </w:p>
+        </w:tc>
+        <w:tc>
+          <w:tcPr>
+            <w:tcW w:w="2000" w:type="dxa"/>
+          </w:tcPr>
+          <w:p>
+            <w:pPr>
+              <w:jc w:val="center"/>
+            </w:pPr>
+            <w:r>
+              <w:rPr>
+                <w:b/>
+              </w:rPr>
+              <w:t xml:space="preserve">Size</w:t>
+            </w:r>
+          </w:p>
+        </w:tc>
+        <w:tc>
+          <w:tcPr>
+            <w:tcW w:w="2000" w:type="dxa"/>
+          </w:tcPr>
+          <w:p>
+            <w:pPr>
+              <w:jc w:val="center"/>
+            </w:pPr>
+            <w:r>
+              <w:rPr>
+                <w:b/>
+              </w:rPr>
+              <w:t xml:space="preserve">PK/FK/IS NULL/ NOT NULL</w:t>
+            </w:r>
+          </w:p>
+        </w:tc>
+      </w:tr>
+      <w:tr>
+        <w:trPr>
+          <w:trHeight w:val="530" w:hRule="atLeast"/>
+        </w:trPr>
+        <w:tc>
+          <w:tcPr>
+            <w:tcW w:w="2000" w:type="dxa"/>
+          </w:tcPr>
+          <w:p>
+            <w:pPr/>
+            <w:r>
+              <w:t xml:space="preserve">id</w:t>
+            </w:r>
+          </w:p>
+        </w:tc>
+        <w:tc>
+          <w:tcPr>
+            <w:tcW w:w="2000" w:type="dxa"/>
+          </w:tcPr>
+          <w:p>
+            <w:pPr/>
+            <w:r>
+              <w:t xml:space="preserve">bigint</w:t>
+            </w:r>
+          </w:p>
+        </w:tc>
+        <w:tc>
+          <w:tcPr>
+            <w:tcW w:w="2000" w:type="dxa"/>
+          </w:tcPr>
+          <w:p>
+            <w:pPr/>
+            <w:r>
+              <w:t xml:space="preserve">-</w:t>
+            </w:r>
+          </w:p>
+        </w:tc>
+        <w:tc>
+          <w:tcPr>
+            <w:tcW w:w="2000" w:type="dxa"/>
+          </w:tcPr>
+          <w:p>
+            <w:pPr/>
+            <w:r>
+              <w:t xml:space="preserve">PK, NOT NULL</w:t>
+            </w:r>
+          </w:p>
+        </w:tc>
+      </w:tr>
+      <w:tr>
+        <w:trPr>
+          <w:trHeight w:val="530" w:hRule="atLeast"/>
+        </w:trPr>
+        <w:tc>
+          <w:tcPr>
+            <w:tcW w:w="2000" w:type="dxa"/>
+          </w:tcPr>
+          <w:p>
+            <w:pPr/>
+            <w:r>
+              <w:t xml:space="preserve">document_no</w:t>
+            </w:r>
+          </w:p>
+        </w:tc>
+        <w:tc>
+          <w:tcPr>
+            <w:tcW w:w="2000" w:type="dxa"/>
+          </w:tcPr>
+          <w:p>
+            <w:pPr/>
+            <w:r>
+              <w:t xml:space="preserve">varchar</w:t>
+            </w:r>
+          </w:p>
+        </w:tc>
+        <w:tc>
+          <w:tcPr>
+            <w:tcW w:w="2000" w:type="dxa"/>
+          </w:tcPr>
+          <w:p>
+            <w:pPr/>
+            <w:r>
+              <w:t xml:space="preserve">30</w:t>
+            </w:r>
+          </w:p>
+        </w:tc>
+        <w:tc>
+          <w:tcPr>
+            <w:tcW w:w="2000" w:type="dxa"/>
+          </w:tcPr>
+          <w:p>
+            <w:pPr/>
+            <w:r>
+              <w:t xml:space="preserve">NOT NULL</w:t>
+            </w:r>
+          </w:p>
+        </w:tc>
+      </w:tr>
+      <w:tr>
+        <w:trPr>
+          <w:trHeight w:val="530" w:hRule="atLeast"/>
+        </w:trPr>
+        <w:tc>
+          <w:tcPr>
+            <w:tcW w:w="2000" w:type="dxa"/>
+          </w:tcPr>
+          <w:p>
+            <w:pPr/>
+            <w:r>
+              <w:t xml:space="preserve">business_date</w:t>
+            </w:r>
+          </w:p>
+        </w:tc>
+        <w:tc>
+          <w:tcPr>
+            <w:tcW w:w="2000" w:type="dxa"/>
+          </w:tcPr>
+          <w:p>
+            <w:pPr/>
+            <w:r>
+              <w:t xml:space="preserve">date</w:t>
+            </w:r>
+          </w:p>
+        </w:tc>
+        <w:tc>
+          <w:tcPr>
+            <w:tcW w:w="2000" w:type="dxa"/>
+          </w:tcPr>
+          <w:p>
+            <w:pPr/>
+            <w:r>
+              <w:t xml:space="preserve">-</w:t>
+            </w:r>
+          </w:p>
+        </w:tc>
+        <w:tc>
+          <w:tcPr>
+            <w:tcW w:w="2000" w:type="dxa"/>
+          </w:tcPr>
+          <w:p>
+            <w:pPr/>
+            <w:r>
+              <w:t xml:space="preserve">NOT NULL</w:t>
+            </w:r>
+          </w:p>
+        </w:tc>
+      </w:tr>
+      <w:tr>
+        <w:trPr>
+          <w:trHeight w:val="530" w:hRule="atLeast"/>
+        </w:trPr>
+        <w:tc>
+          <w:tcPr>
+            <w:tcW w:w="2000" w:type="dxa"/>
+          </w:tcPr>
+          <w:p>
+            <w:pPr/>
+            <w:r>
+              <w:t xml:space="preserve">requester_id</w:t>
+            </w:r>
+          </w:p>
+        </w:tc>
+        <w:tc>
+          <w:tcPr>
+            <w:tcW w:w="2000" w:type="dxa"/>
+          </w:tcPr>
+          <w:p>
+            <w:pPr/>
+            <w:r>
+              <w:t xml:space="preserve">bigint</w:t>
+            </w:r>
+          </w:p>
+        </w:tc>
+        <w:tc>
+          <w:tcPr>
+            <w:tcW w:w="2000" w:type="dxa"/>
+          </w:tcPr>
+          <w:p>
+            <w:pPr/>
+            <w:r>
+              <w:t xml:space="preserve">-</w:t>
+            </w:r>
+          </w:p>
+        </w:tc>
+        <w:tc>
+          <w:tcPr>
+            <w:tcW w:w="2000" w:type="dxa"/>
+          </w:tcPr>
+          <w:p>
+            <w:pPr/>
+            <w:r>
+              <w:t xml:space="preserve">NOT NULL</w:t>
+            </w:r>
+          </w:p>
+        </w:tc>
+      </w:tr>
+      <w:tr>
+        <w:trPr>
+          <w:trHeight w:val="530" w:hRule="atLeast"/>
+        </w:trPr>
+        <w:tc>
+          <w:tcPr>
+            <w:tcW w:w="2000" w:type="dxa"/>
+          </w:tcPr>
+          <w:p>
+            <w:pPr/>
+            <w:r>
+              <w:t xml:space="preserve">status</w:t>
+            </w:r>
+          </w:p>
+        </w:tc>
+        <w:tc>
+          <w:tcPr>
+            <w:tcW w:w="2000" w:type="dxa"/>
+          </w:tcPr>
+          <w:p>
+            <w:pPr/>
+            <w:r>
+              <w:t xml:space="preserve">varchar</w:t>
+            </w:r>
+          </w:p>
+        </w:tc>
+        <w:tc>
+          <w:tcPr>
+            <w:tcW w:w="2000" w:type="dxa"/>
+          </w:tcPr>
+          <w:p>
+            <w:pPr/>
+            <w:r>
+              <w:t xml:space="preserve">30</w:t>
+            </w:r>
+          </w:p>
+        </w:tc>
+        <w:tc>
+          <w:tcPr>
+            <w:tcW w:w="2000" w:type="dxa"/>
+          </w:tcPr>
+          <w:p>
+            <w:pPr/>
+            <w:r>
+              <w:t xml:space="preserve">NOT NULL</w:t>
+            </w:r>
+          </w:p>
+        </w:tc>
+      </w:tr>
+      <w:tr>
+        <w:trPr>
+          <w:trHeight w:val="530" w:hRule="atLeast"/>
+        </w:trPr>
+        <w:tc>
+          <w:tcPr>
+            <w:tcW w:w="2000" w:type="dxa"/>
+          </w:tcPr>
+          <w:p>
+            <w:pPr/>
+            <w:r>
+              <w:t xml:space="preserve">remark</w:t>
+            </w:r>
+          </w:p>
+        </w:tc>
+        <w:tc>
+          <w:tcPr>
+            <w:tcW w:w="2000" w:type="dxa"/>
+          </w:tcPr>
+          <w:p>
+            <w:pPr/>
+            <w:r>
+              <w:t xml:space="preserve">nvarchar</w:t>
+            </w:r>
+          </w:p>
+        </w:tc>
+        <w:tc>
+          <w:tcPr>
+            <w:tcW w:w="2000" w:type="dxa"/>
+          </w:tcPr>
+          <w:p>
+            <w:pPr/>
+            <w:r>
+              <w:t xml:space="preserve">500</w:t>
+            </w:r>
+          </w:p>
+        </w:tc>
+        <w:tc>
+          <w:tcPr>
+            <w:tcW w:w="2000" w:type="dxa"/>
+          </w:tcPr>
+          <w:p>
+            <w:pPr/>
+            <w:r>
+              <w:t xml:space="preserve">IS NULL</w:t>
+            </w:r>
+          </w:p>
+        </w:tc>
+      </w:tr>
+      <w:tr>
+        <w:trPr>
+          <w:trHeight w:val="530" w:hRule="atLeast"/>
+        </w:trPr>
+        <w:tc>
+          <w:tcPr>
+            <w:tcW w:w="2000" w:type="dxa"/>
+          </w:tcPr>
+          <w:p>
+            <w:pPr/>
+            <w:r>
+              <w:t xml:space="preserve">custom_fields</w:t>
+            </w:r>
+          </w:p>
+        </w:tc>
+        <w:tc>
+          <w:tcPr>
+            <w:tcW w:w="2000" w:type="dxa"/>
+          </w:tcPr>
+          <w:p>
+            <w:pPr/>
+            <w:r>
+              <w:t xml:space="preserve">nvarchar</w:t>
+            </w:r>
+          </w:p>
+        </w:tc>
+        <w:tc>
+          <w:tcPr>
+            <w:tcW w:w="2000" w:type="dxa"/>
+          </w:tcPr>
+          <w:p>
+            <w:pPr/>
+            <w:r>
+              <w:t xml:space="preserve">MAX</w:t>
+            </w:r>
+          </w:p>
+        </w:tc>
+        <w:tc>
+          <w:tcPr>
+            <w:tcW w:w="2000" w:type="dxa"/>
+          </w:tcPr>
+          <w:p>
+            <w:pPr/>
+            <w:r>
+              <w:t xml:space="preserve">IS NULL</w:t>
+            </w:r>
+          </w:p>
+        </w:tc>
+      </w:tr>
+      <w:tr>
+        <w:trPr>
+          <w:trHeight w:val="530" w:hRule="atLeast"/>
+        </w:trPr>
+        <w:tc>
+          <w:tcPr>
+            <w:tcW w:w="2000" w:type="dxa"/>
+          </w:tcPr>
+          <w:p>
+            <w:pPr/>
+            <w:r>
+              <w:t xml:space="preserve">is_deleted</w:t>
+            </w:r>
+          </w:p>
+        </w:tc>
+        <w:tc>
+          <w:tcPr>
+            <w:tcW w:w="2000" w:type="dxa"/>
+          </w:tcPr>
+          <w:p>
+            <w:pPr/>
+            <w:r>
+              <w:t xml:space="preserve">bit</w:t>
+            </w:r>
+          </w:p>
+        </w:tc>
+        <w:tc>
+          <w:tcPr>
+            <w:tcW w:w="2000" w:type="dxa"/>
+          </w:tcPr>
+          <w:p>
+            <w:pPr/>
+            <w:r>
+              <w:t xml:space="preserve">-</w:t>
+            </w:r>
+          </w:p>
+        </w:tc>
+        <w:tc>
+          <w:tcPr>
+            <w:tcW w:w="2000" w:type="dxa"/>
+          </w:tcPr>
+          <w:p>
+            <w:pPr/>
+            <w:r>
+              <w:t xml:space="preserve">NOT NULL</w:t>
+            </w:r>
+          </w:p>
+        </w:tc>
+      </w:tr>
+      <w:tr>
+        <w:trPr>
+          <w:trHeight w:val="530" w:hRule="atLeast"/>
+        </w:trPr>
+        <w:tc>
+          <w:tcPr>
+            <w:tcW w:w="2000" w:type="dxa"/>
+          </w:tcPr>
+          <w:p>
+            <w:pPr/>
+            <w:r>
+              <w:t xml:space="preserve">deleted_at</w:t>
+            </w:r>
+          </w:p>
+        </w:tc>
+        <w:tc>
+          <w:tcPr>
+            <w:tcW w:w="2000" w:type="dxa"/>
+          </w:tcPr>
+          <w:p>
+            <w:pPr/>
+            <w:r>
+              <w:t xml:space="preserve">datetime2</w:t>
+            </w:r>
+          </w:p>
+        </w:tc>
+        <w:tc>
+          <w:tcPr>
+            <w:tcW w:w="2000" w:type="dxa"/>
+          </w:tcPr>
+          <w:p>
+            <w:pPr/>
+            <w:r>
+              <w:t xml:space="preserve">(6)</w:t>
+            </w:r>
+          </w:p>
+        </w:tc>
+        <w:tc>
+          <w:tcPr>
+            <w:tcW w:w="2000" w:type="dxa"/>
+          </w:tcPr>
+          <w:p>
+            <w:pPr/>
+            <w:r>
+              <w:t xml:space="preserve">IS NULL</w:t>
+            </w:r>
+          </w:p>
+        </w:tc>
+      </w:tr>
+      <w:tr>
+        <w:trPr>
+          <w:trHeight w:val="530" w:hRule="atLeast"/>
+        </w:trPr>
+        <w:tc>
+          <w:tcPr>
+            <w:tcW w:w="2000" w:type="dxa"/>
+          </w:tcPr>
+          <w:p>
+            <w:pPr/>
+            <w:r>
+              <w:t xml:space="preserve">company_id</w:t>
+            </w:r>
+          </w:p>
+        </w:tc>
+        <w:tc>
+          <w:tcPr>
+            <w:tcW w:w="2000" w:type="dxa"/>
+          </w:tcPr>
+          <w:p>
+            <w:pPr/>
+            <w:r>
+              <w:t xml:space="preserve">bigint</w:t>
+            </w:r>
+          </w:p>
+        </w:tc>
+        <w:tc>
+          <w:tcPr>
+            <w:tcW w:w="2000" w:type="dxa"/>
+          </w:tcPr>
+          <w:p>
+            <w:pPr/>
+            <w:r>
+              <w:t xml:space="preserve">-</w:t>
+            </w:r>
+          </w:p>
+        </w:tc>
+        <w:tc>
+          <w:tcPr>
+            <w:tcW w:w="2000" w:type="dxa"/>
+          </w:tcPr>
+          <w:p>
+            <w:pPr/>
+            <w:r>
+              <w:t xml:space="preserve">NOT NULL</w:t>
+            </w:r>
+          </w:p>
+        </w:tc>
+      </w:tr>
+      <w:tr>
+        <w:trPr>
+          <w:trHeight w:val="530" w:hRule="atLeast"/>
+        </w:trPr>
+        <w:tc>
+          <w:tcPr>
+            <w:tcW w:w="2000" w:type="dxa"/>
+          </w:tcPr>
+          <w:p>
+            <w:pPr/>
+            <w:r>
+              <w:t xml:space="preserve">created_at</w:t>
+            </w:r>
+          </w:p>
+        </w:tc>
+        <w:tc>
+          <w:tcPr>
+            <w:tcW w:w="2000" w:type="dxa"/>
+          </w:tcPr>
+          <w:p>
+            <w:pPr/>
+            <w:r>
+              <w:t xml:space="preserve">datetime2</w:t>
+            </w:r>
+          </w:p>
+        </w:tc>
+        <w:tc>
+          <w:tcPr>
+            <w:tcW w:w="2000" w:type="dxa"/>
+          </w:tcPr>
+          <w:p>
+            <w:pPr/>
+            <w:r>
+              <w:t xml:space="preserve">(6)</w:t>
+            </w:r>
+          </w:p>
+        </w:tc>
+        <w:tc>
+          <w:tcPr>
+            <w:tcW w:w="2000" w:type="dxa"/>
+          </w:tcPr>
+          <w:p>
+            <w:pPr/>
+            <w:r>
+              <w:t xml:space="preserve">NOT NULL</w:t>
+            </w:r>
+          </w:p>
+        </w:tc>
+      </w:tr>
+      <w:tr>
+        <w:trPr>
+          <w:trHeight w:val="530" w:hRule="atLeast"/>
+        </w:trPr>
+        <w:tc>
+          <w:tcPr>
+            <w:tcW w:w="2000" w:type="dxa"/>
+          </w:tcPr>
+          <w:p>
+            <w:pPr/>
+            <w:r>
+              <w:t xml:space="preserve">created_by</w:t>
+            </w:r>
+          </w:p>
+        </w:tc>
+        <w:tc>
+          <w:tcPr>
+            <w:tcW w:w="2000" w:type="dxa"/>
+          </w:tcPr>
+          <w:p>
+            <w:pPr/>
+            <w:r>
+              <w:t xml:space="preserve">bigint</w:t>
+            </w:r>
+          </w:p>
+        </w:tc>
+        <w:tc>
+          <w:tcPr>
+            <w:tcW w:w="2000" w:type="dxa"/>
+          </w:tcPr>
+          <w:p>
+            <w:pPr/>
+            <w:r>
+              <w:t xml:space="preserve">-</w:t>
+            </w:r>
+          </w:p>
+        </w:tc>
+        <w:tc>
+          <w:tcPr>
+            <w:tcW w:w="2000" w:type="dxa"/>
+          </w:tcPr>
+          <w:p>
+            <w:pPr/>
+            <w:r>
+              <w:t xml:space="preserve">NOT NULL</w:t>
+            </w:r>
+          </w:p>
+        </w:tc>
+      </w:tr>
+      <w:tr>
+        <w:trPr>
+          <w:trHeight w:val="530" w:hRule="atLeast"/>
+        </w:trPr>
+        <w:tc>
+          <w:tcPr>
+            <w:tcW w:w="2000" w:type="dxa"/>
+          </w:tcPr>
+          <w:p>
+            <w:pPr/>
+            <w:r>
+              <w:t xml:space="preserve">updated_at</w:t>
+            </w:r>
+          </w:p>
+        </w:tc>
+        <w:tc>
+          <w:tcPr>
+            <w:tcW w:w="2000" w:type="dxa"/>
+          </w:tcPr>
+          <w:p>
+            <w:pPr/>
+            <w:r>
+              <w:t xml:space="preserve">datetime2</w:t>
+            </w:r>
+          </w:p>
+        </w:tc>
+        <w:tc>
+          <w:tcPr>
+            <w:tcW w:w="2000" w:type="dxa"/>
+          </w:tcPr>
+          <w:p>
+            <w:pPr/>
+            <w:r>
+              <w:t xml:space="preserve">(6)</w:t>
+            </w:r>
+          </w:p>
+        </w:tc>
+        <w:tc>
+          <w:tcPr>
+            <w:tcW w:w="2000" w:type="dxa"/>
+          </w:tcPr>
+          <w:p>
+            <w:pPr/>
+            <w:r>
+              <w:t xml:space="preserve">IS NULL</w:t>
+            </w:r>
+          </w:p>
+        </w:tc>
+      </w:tr>
+      <w:tr>
+        <w:trPr>
+          <w:trHeight w:val="530" w:hRule="atLeast"/>
+        </w:trPr>
+        <w:tc>
+          <w:tcPr>
+            <w:tcW w:w="2000" w:type="dxa"/>
+          </w:tcPr>
+          <w:p>
+            <w:pPr/>
+            <w:r>
+              <w:t xml:space="preserve">updated_by</w:t>
+            </w:r>
+          </w:p>
+        </w:tc>
+        <w:tc>
+          <w:tcPr>
+            <w:tcW w:w="2000" w:type="dxa"/>
+          </w:tcPr>
+          <w:p>
+            <w:pPr/>
+            <w:r>
+              <w:t xml:space="preserve">bigint</w:t>
+            </w:r>
+          </w:p>
+        </w:tc>
+        <w:tc>
+          <w:tcPr>
+            <w:tcW w:w="2000" w:type="dxa"/>
+          </w:tcPr>
+          <w:p>
+            <w:pPr/>
+            <w:r>
+              <w:t xml:space="preserve">-</w:t>
+            </w:r>
+          </w:p>
+        </w:tc>
+        <w:tc>
+          <w:tcPr>
+            <w:tcW w:w="2000" w:type="dxa"/>
+          </w:tcPr>
+          <w:p>
+            <w:pPr/>
+            <w:r>
+              <w:t xml:space="preserve">IS NULL</w:t>
+            </w:r>
+          </w:p>
+        </w:tc>
+      </w:tr>
+      <w:tr>
+        <w:trPr>
+          <w:trHeight w:val="530" w:hRule="atLeast"/>
+        </w:trPr>
+        <w:tc>
+          <w:tcPr>
+            <w:tcW w:w="2000" w:type="dxa"/>
+          </w:tcPr>
+          <w:p>
+            <w:pPr/>
+            <w:r>
+              <w:t xml:space="preserve">version</w:t>
+            </w:r>
+          </w:p>
+        </w:tc>
+        <w:tc>
+          <w:tcPr>
+            <w:tcW w:w="2000" w:type="dxa"/>
+          </w:tcPr>
+          <w:p>
+            <w:pPr/>
+            <w:r>
+              <w:t xml:space="preserve">int</w:t>
+            </w:r>
+          </w:p>
+        </w:tc>
+        <w:tc>
+          <w:tcPr>
+            <w:tcW w:w="2000" w:type="dxa"/>
+          </w:tcPr>
+          <w:p>
+            <w:pPr/>
+            <w:r>
+              <w:t xml:space="preserve">-</w:t>
+            </w:r>
+          </w:p>
+        </w:tc>
+        <w:tc>
+          <w:tcPr>
+            <w:tcW w:w="2000" w:type="dxa"/>
+          </w:tcPr>
+          <w:p>
+            <w:pPr/>
+            <w:r>
+              <w:t xml:space="preserve">NOT NULL</w:t>
+            </w:r>
+          </w:p>
+        </w:tc>
+      </w:tr>
+    </w:tbl>
+    <w:p/>
+    <w:p>
+      <w:pPr/>
+      <w:r>
+        <w:t xml:space="preserve">Table Name: pur_requisition_line</w:t>
+      </w:r>
+    </w:p>
+    <w:p>
+      <w:pPr/>
+      <w:r>
+        <w:t xml:space="preserve">Primary Key: id</w:t>
+      </w:r>
+    </w:p>
+    <w:p>
+      <w:pPr/>
+      <w:r>
+        <w:t xml:space="preserve">This table stores ordered item demand, required dates, quantities and downstream order consumption.</w:t>
+      </w:r>
+    </w:p>
+    <w:tbl>
+      <w:tblPr>
+        <w:tblStyle w:val="TableGrid"/>
+        <w:tblW w:w="8000" w:type="dxa"/>
+        <w:jc w:val="left"/>
+        <w:tblBorders>
+          <w:top w:val="single" w:color="000000" w:sz="4" w:space="0"/>
+          <w:left w:val="single" w:color="000000" w:sz="4" w:space="0"/>
+          <w:bottom w:val="single" w:color="000000" w:sz="4" w:space="0"/>
+          <w:right w:val="single" w:color="000000" w:sz="4" w:space="0"/>
+          <w:insideH w:val="single" w:color="000000" w:sz="4" w:space="0"/>
+          <w:insideV w:val="single" w:color="000000" w:sz="4" w:space="0"/>
+        </w:tblBorders>
+        <w:tblLayout w:type="fixed"/>
+        <w:tblCellMar>
+          <w:top w:w="100" w:type="dxa"/>
+          <w:left w:w="100" w:type="dxa"/>
+          <w:bottom w:w="100" w:type="dxa"/>
+          <w:right w:w="100" w:type="dxa"/>
+        </w:tblCellMar>
+      </w:tblPr>
+      <w:tblGrid>
+        <w:gridCol w:w="2000"/>
+        <w:gridCol w:w="2000"/>
+        <w:gridCol w:w="2000"/>
+        <w:gridCol w:w="2000"/>
+      </w:tblGrid>
+      <w:tr>
+        <w:trPr>
+          <w:trHeight w:val="530" w:hRule="atLeast"/>
+        </w:trPr>
+        <w:tc>
+          <w:tcPr>
+            <w:tcW w:w="2000" w:type="dxa"/>
+          </w:tcPr>
+          <w:p>
+            <w:pPr>
+              <w:jc w:val="center"/>
+            </w:pPr>
+            <w:r>
+              <w:rPr>
+                <w:b/>
+              </w:rPr>
+              <w:t xml:space="preserve">Name of Attribute</w:t>
+            </w:r>
+          </w:p>
+        </w:tc>
+        <w:tc>
+          <w:tcPr>
+            <w:tcW w:w="2000" w:type="dxa"/>
+          </w:tcPr>
+          <w:p>
+            <w:pPr>
+              <w:jc w:val="center"/>
+            </w:pPr>
+            <w:r>
+              <w:rPr>
+                <w:b/>
+              </w:rPr>
+              <w:t xml:space="preserve">Data Type</w:t>
+            </w:r>
+          </w:p>
+        </w:tc>
+        <w:tc>
+          <w:tcPr>
+            <w:tcW w:w="2000" w:type="dxa"/>
+          </w:tcPr>
+          <w:p>
+            <w:pPr>
+              <w:jc w:val="center"/>
+            </w:pPr>
+            <w:r>
+              <w:rPr>
+                <w:b/>
+              </w:rPr>
+              <w:t xml:space="preserve">Size</w:t>
+            </w:r>
+          </w:p>
+        </w:tc>
+        <w:tc>
+          <w:tcPr>
+            <w:tcW w:w="2000" w:type="dxa"/>
+          </w:tcPr>
+          <w:p>
+            <w:pPr>
+              <w:jc w:val="center"/>
+            </w:pPr>
+            <w:r>
+              <w:rPr>
+                <w:b/>
+              </w:rPr>
+              <w:t xml:space="preserve">PK/FK/IS NULL/ NOT NULL</w:t>
+            </w:r>
+          </w:p>
+        </w:tc>
+      </w:tr>
+      <w:tr>
+        <w:trPr>
+          <w:trHeight w:val="530" w:hRule="atLeast"/>
+        </w:trPr>
+        <w:tc>
+          <w:tcPr>
+            <w:tcW w:w="2000" w:type="dxa"/>
+          </w:tcPr>
+          <w:p>
+            <w:pPr/>
+            <w:r>
+              <w:t xml:space="preserve">id</w:t>
+            </w:r>
+          </w:p>
+        </w:tc>
+        <w:tc>
+          <w:tcPr>
+            <w:tcW w:w="2000" w:type="dxa"/>
+          </w:tcPr>
+          <w:p>
+            <w:pPr/>
+            <w:r>
+              <w:t xml:space="preserve">bigint</w:t>
+            </w:r>
+          </w:p>
+        </w:tc>
+        <w:tc>
+          <w:tcPr>
+            <w:tcW w:w="2000" w:type="dxa"/>
+          </w:tcPr>
+          <w:p>
+            <w:pPr/>
+            <w:r>
+              <w:t xml:space="preserve">-</w:t>
+            </w:r>
+          </w:p>
+        </w:tc>
+        <w:tc>
+          <w:tcPr>
+            <w:tcW w:w="2000" w:type="dxa"/>
+          </w:tcPr>
+          <w:p>
+            <w:pPr/>
+            <w:r>
+              <w:t xml:space="preserve">PK, NOT NULL</w:t>
+            </w:r>
+          </w:p>
+        </w:tc>
+      </w:tr>
+      <w:tr>
+        <w:trPr>
+          <w:trHeight w:val="530" w:hRule="atLeast"/>
+        </w:trPr>
+        <w:tc>
+          <w:tcPr>
+            <w:tcW w:w="2000" w:type="dxa"/>
+          </w:tcPr>
+          <w:p>
+            <w:pPr/>
+            <w:r>
+              <w:t xml:space="preserve">requisition_id</w:t>
+            </w:r>
+          </w:p>
+        </w:tc>
+        <w:tc>
+          <w:tcPr>
+            <w:tcW w:w="2000" w:type="dxa"/>
+          </w:tcPr>
+          <w:p>
+            <w:pPr/>
+            <w:r>
+              <w:t xml:space="preserve">bigint</w:t>
+            </w:r>
+          </w:p>
+        </w:tc>
+        <w:tc>
+          <w:tcPr>
+            <w:tcW w:w="2000" w:type="dxa"/>
+          </w:tcPr>
+          <w:p>
+            <w:pPr/>
+            <w:r>
+              <w:t xml:space="preserve">-</w:t>
+            </w:r>
+          </w:p>
+        </w:tc>
+        <w:tc>
+          <w:tcPr>
+            <w:tcW w:w="2000" w:type="dxa"/>
+          </w:tcPr>
+          <w:p>
+            <w:pPr/>
+            <w:r>
+              <w:t xml:space="preserve">FK, NOT NULL</w:t>
+            </w:r>
+          </w:p>
+        </w:tc>
+      </w:tr>
+      <w:tr>
+        <w:trPr>
+          <w:trHeight w:val="530" w:hRule="atLeast"/>
+        </w:trPr>
+        <w:tc>
+          <w:tcPr>
+            <w:tcW w:w="2000" w:type="dxa"/>
+          </w:tcPr>
+          <w:p>
+            <w:pPr/>
+            <w:r>
+              <w:t xml:space="preserve">line_no</w:t>
+            </w:r>
+          </w:p>
+        </w:tc>
+        <w:tc>
+          <w:tcPr>
+            <w:tcW w:w="2000" w:type="dxa"/>
+          </w:tcPr>
+          <w:p>
+            <w:pPr/>
+            <w:r>
+              <w:t xml:space="preserve">int</w:t>
+            </w:r>
+          </w:p>
+        </w:tc>
+        <w:tc>
+          <w:tcPr>
+            <w:tcW w:w="2000" w:type="dxa"/>
+          </w:tcPr>
+          <w:p>
+            <w:pPr/>
+            <w:r>
+              <w:t xml:space="preserve">-</w:t>
+            </w:r>
+          </w:p>
+        </w:tc>
+        <w:tc>
+          <w:tcPr>
+            <w:tcW w:w="2000" w:type="dxa"/>
+          </w:tcPr>
+          <w:p>
+            <w:pPr/>
+            <w:r>
+              <w:t xml:space="preserve">NOT NULL</w:t>
+            </w:r>
+          </w:p>
+        </w:tc>
+      </w:tr>
+      <w:tr>
+        <w:trPr>
+          <w:trHeight w:val="530" w:hRule="atLeast"/>
+        </w:trPr>
+        <w:tc>
+          <w:tcPr>
+            <w:tcW w:w="2000" w:type="dxa"/>
+          </w:tcPr>
+          <w:p>
+            <w:pPr/>
+            <w:r>
+              <w:t xml:space="preserve">item_id</w:t>
+            </w:r>
+          </w:p>
+        </w:tc>
+        <w:tc>
+          <w:tcPr>
+            <w:tcW w:w="2000" w:type="dxa"/>
+          </w:tcPr>
+          <w:p>
+            <w:pPr/>
+            <w:r>
+              <w:t xml:space="preserve">bigint</w:t>
+            </w:r>
+          </w:p>
+        </w:tc>
+        <w:tc>
+          <w:tcPr>
+            <w:tcW w:w="2000" w:type="dxa"/>
+          </w:tcPr>
+          <w:p>
+            <w:pPr/>
+            <w:r>
+              <w:t xml:space="preserve">-</w:t>
+            </w:r>
+          </w:p>
+        </w:tc>
+        <w:tc>
+          <w:tcPr>
+            <w:tcW w:w="2000" w:type="dxa"/>
+          </w:tcPr>
+          <w:p>
+            <w:pPr/>
+            <w:r>
+              <w:t xml:space="preserve">NOT NULL</w:t>
+            </w:r>
+          </w:p>
+        </w:tc>
+      </w:tr>
+      <w:tr>
+        <w:trPr>
+          <w:trHeight w:val="530" w:hRule="atLeast"/>
+        </w:trPr>
+        <w:tc>
+          <w:tcPr>
+            <w:tcW w:w="2000" w:type="dxa"/>
+          </w:tcPr>
+          <w:p>
+            <w:pPr/>
+            <w:r>
+              <w:t xml:space="preserve">required_date</w:t>
+            </w:r>
+          </w:p>
+        </w:tc>
+        <w:tc>
+          <w:tcPr>
+            <w:tcW w:w="2000" w:type="dxa"/>
+          </w:tcPr>
+          <w:p>
+            <w:pPr/>
+            <w:r>
+              <w:t xml:space="preserve">date</w:t>
+            </w:r>
+          </w:p>
+        </w:tc>
+        <w:tc>
+          <w:tcPr>
+            <w:tcW w:w="2000" w:type="dxa"/>
+          </w:tcPr>
+          <w:p>
+            <w:pPr/>
+            <w:r>
+              <w:t xml:space="preserve">-</w:t>
+            </w:r>
+          </w:p>
+        </w:tc>
+        <w:tc>
+          <w:tcPr>
+            <w:tcW w:w="2000" w:type="dxa"/>
+          </w:tcPr>
+          <w:p>
+            <w:pPr/>
+            <w:r>
+              <w:t xml:space="preserve">NOT NULL</w:t>
+            </w:r>
+          </w:p>
+        </w:tc>
+      </w:tr>
+      <w:tr>
+        <w:trPr>
+          <w:trHeight w:val="530" w:hRule="atLeast"/>
+        </w:trPr>
+        <w:tc>
+          <w:tcPr>
+            <w:tcW w:w="2000" w:type="dxa"/>
+          </w:tcPr>
+          <w:p>
+            <w:pPr/>
+            <w:r>
+              <w:t xml:space="preserve">quantity</w:t>
+            </w:r>
+          </w:p>
+        </w:tc>
+        <w:tc>
+          <w:tcPr>
+            <w:tcW w:w="2000" w:type="dxa"/>
+          </w:tcPr>
+          <w:p>
+            <w:pPr/>
+            <w:r>
+              <w:t xml:space="preserve">decimal</w:t>
+            </w:r>
+          </w:p>
+        </w:tc>
+        <w:tc>
+          <w:tcPr>
+            <w:tcW w:w="2000" w:type="dxa"/>
+          </w:tcPr>
+          <w:p>
+            <w:pPr/>
+            <w:r>
+              <w:t xml:space="preserve">(19,6)</w:t>
+            </w:r>
+          </w:p>
+        </w:tc>
+        <w:tc>
+          <w:tcPr>
+            <w:tcW w:w="2000" w:type="dxa"/>
+          </w:tcPr>
+          <w:p>
+            <w:pPr/>
+            <w:r>
+              <w:t xml:space="preserve">NOT NULL</w:t>
+            </w:r>
+          </w:p>
+        </w:tc>
+      </w:tr>
+      <w:tr>
+        <w:trPr>
+          <w:trHeight w:val="530" w:hRule="atLeast"/>
+        </w:trPr>
+        <w:tc>
+          <w:tcPr>
+            <w:tcW w:w="2000" w:type="dxa"/>
+          </w:tcPr>
+          <w:p>
+            <w:pPr/>
+            <w:r>
+              <w:t xml:space="preserve">ordered_quantity</w:t>
+            </w:r>
+          </w:p>
+        </w:tc>
+        <w:tc>
+          <w:tcPr>
+            <w:tcW w:w="2000" w:type="dxa"/>
+          </w:tcPr>
+          <w:p>
+            <w:pPr/>
+            <w:r>
+              <w:t xml:space="preserve">decimal</w:t>
+            </w:r>
+          </w:p>
+        </w:tc>
+        <w:tc>
+          <w:tcPr>
+            <w:tcW w:w="2000" w:type="dxa"/>
+          </w:tcPr>
+          <w:p>
+            <w:pPr/>
+            <w:r>
+              <w:t xml:space="preserve">(19,6)</w:t>
+            </w:r>
+          </w:p>
+        </w:tc>
+        <w:tc>
+          <w:tcPr>
+            <w:tcW w:w="2000" w:type="dxa"/>
+          </w:tcPr>
+          <w:p>
+            <w:pPr/>
+            <w:r>
+              <w:t xml:space="preserve">NOT NULL</w:t>
+            </w:r>
+          </w:p>
+        </w:tc>
+      </w:tr>
+      <w:tr>
+        <w:trPr>
+          <w:trHeight w:val="530" w:hRule="atLeast"/>
+        </w:trPr>
+        <w:tc>
+          <w:tcPr>
+            <w:tcW w:w="2000" w:type="dxa"/>
+          </w:tcPr>
+          <w:p>
+            <w:pPr/>
+            <w:r>
+              <w:t xml:space="preserve">remark</w:t>
+            </w:r>
+          </w:p>
+        </w:tc>
+        <w:tc>
+          <w:tcPr>
+            <w:tcW w:w="2000" w:type="dxa"/>
+          </w:tcPr>
+          <w:p>
+            <w:pPr/>
+            <w:r>
+              <w:t xml:space="preserve">nvarchar</w:t>
+            </w:r>
+          </w:p>
+        </w:tc>
+        <w:tc>
+          <w:tcPr>
+            <w:tcW w:w="2000" w:type="dxa"/>
+          </w:tcPr>
+          <w:p>
+            <w:pPr/>
+            <w:r>
+              <w:t xml:space="preserve">500</w:t>
+            </w:r>
+          </w:p>
+        </w:tc>
+        <w:tc>
+          <w:tcPr>
+            <w:tcW w:w="2000" w:type="dxa"/>
+          </w:tcPr>
+          <w:p>
+            <w:pPr/>
+            <w:r>
+              <w:t xml:space="preserve">IS NULL</w:t>
+            </w:r>
+          </w:p>
+        </w:tc>
+      </w:tr>
+      <w:tr>
+        <w:trPr>
+          <w:trHeight w:val="530" w:hRule="atLeast"/>
+        </w:trPr>
+        <w:tc>
+          <w:tcPr>
+            <w:tcW w:w="2000" w:type="dxa"/>
+          </w:tcPr>
+          <w:p>
+            <w:pPr/>
+            <w:r>
+              <w:t xml:space="preserve">company_id</w:t>
+            </w:r>
+          </w:p>
+        </w:tc>
+        <w:tc>
+          <w:tcPr>
+            <w:tcW w:w="2000" w:type="dxa"/>
+          </w:tcPr>
+          <w:p>
+            <w:pPr/>
+            <w:r>
+              <w:t xml:space="preserve">bigint</w:t>
+            </w:r>
+          </w:p>
+        </w:tc>
+        <w:tc>
+          <w:tcPr>
+            <w:tcW w:w="2000" w:type="dxa"/>
+          </w:tcPr>
+          <w:p>
+            <w:pPr/>
+            <w:r>
+              <w:t xml:space="preserve">-</w:t>
+            </w:r>
+          </w:p>
+        </w:tc>
+        <w:tc>
+          <w:tcPr>
+            <w:tcW w:w="2000" w:type="dxa"/>
+          </w:tcPr>
+          <w:p>
+            <w:pPr/>
+            <w:r>
+              <w:t xml:space="preserve">FK, NOT NULL</w:t>
+            </w:r>
+          </w:p>
+        </w:tc>
+      </w:tr>
+      <w:tr>
+        <w:trPr>
+          <w:trHeight w:val="530" w:hRule="atLeast"/>
+        </w:trPr>
+        <w:tc>
+          <w:tcPr>
+            <w:tcW w:w="2000" w:type="dxa"/>
+          </w:tcPr>
+          <w:p>
+            <w:pPr/>
+            <w:r>
+              <w:t xml:space="preserve">created_at</w:t>
+            </w:r>
+          </w:p>
+        </w:tc>
+        <w:tc>
+          <w:tcPr>
+            <w:tcW w:w="2000" w:type="dxa"/>
+          </w:tcPr>
+          <w:p>
+            <w:pPr/>
+            <w:r>
+              <w:t xml:space="preserve">datetime2</w:t>
+            </w:r>
+          </w:p>
+        </w:tc>
+        <w:tc>
+          <w:tcPr>
+            <w:tcW w:w="2000" w:type="dxa"/>
+          </w:tcPr>
+          <w:p>
+            <w:pPr/>
+            <w:r>
+              <w:t xml:space="preserve">(6)</w:t>
+            </w:r>
+          </w:p>
+        </w:tc>
+        <w:tc>
+          <w:tcPr>
+            <w:tcW w:w="2000" w:type="dxa"/>
+          </w:tcPr>
+          <w:p>
+            <w:pPr/>
+            <w:r>
+              <w:t xml:space="preserve">NOT NULL</w:t>
+            </w:r>
+          </w:p>
+        </w:tc>
+      </w:tr>
+      <w:tr>
+        <w:trPr>
+          <w:trHeight w:val="530" w:hRule="atLeast"/>
+        </w:trPr>
+        <w:tc>
+          <w:tcPr>
+            <w:tcW w:w="2000" w:type="dxa"/>
+          </w:tcPr>
+          <w:p>
+            <w:pPr/>
+            <w:r>
+              <w:t xml:space="preserve">created_by</w:t>
+            </w:r>
+          </w:p>
+        </w:tc>
+        <w:tc>
+          <w:tcPr>
+            <w:tcW w:w="2000" w:type="dxa"/>
+          </w:tcPr>
+          <w:p>
+            <w:pPr/>
+            <w:r>
+              <w:t xml:space="preserve">bigint</w:t>
+            </w:r>
+          </w:p>
+        </w:tc>
+        <w:tc>
+          <w:tcPr>
+            <w:tcW w:w="2000" w:type="dxa"/>
+          </w:tcPr>
+          <w:p>
+            <w:pPr/>
+            <w:r>
+              <w:t xml:space="preserve">-</w:t>
+            </w:r>
+          </w:p>
+        </w:tc>
+        <w:tc>
+          <w:tcPr>
+            <w:tcW w:w="2000" w:type="dxa"/>
+          </w:tcPr>
+          <w:p>
+            <w:pPr/>
+            <w:r>
+              <w:t xml:space="preserve">NOT NULL</w:t>
+            </w:r>
+          </w:p>
+        </w:tc>
+      </w:tr>
+      <w:tr>
+        <w:trPr>
+          <w:trHeight w:val="530" w:hRule="atLeast"/>
+        </w:trPr>
+        <w:tc>
+          <w:tcPr>
+            <w:tcW w:w="2000" w:type="dxa"/>
+          </w:tcPr>
+          <w:p>
+            <w:pPr/>
+            <w:r>
+              <w:t xml:space="preserve">updated_at</w:t>
+            </w:r>
+          </w:p>
+        </w:tc>
+        <w:tc>
+          <w:tcPr>
+            <w:tcW w:w="2000" w:type="dxa"/>
+          </w:tcPr>
+          <w:p>
+            <w:pPr/>
+            <w:r>
+              <w:t xml:space="preserve">datetime2</w:t>
+            </w:r>
+          </w:p>
+        </w:tc>
+        <w:tc>
+          <w:tcPr>
+            <w:tcW w:w="2000" w:type="dxa"/>
+          </w:tcPr>
+          <w:p>
+            <w:pPr/>
+            <w:r>
+              <w:t xml:space="preserve">(6)</w:t>
+            </w:r>
+          </w:p>
+        </w:tc>
+        <w:tc>
+          <w:tcPr>
+            <w:tcW w:w="2000" w:type="dxa"/>
+          </w:tcPr>
+          <w:p>
+            <w:pPr/>
+            <w:r>
+              <w:t xml:space="preserve">IS NULL</w:t>
+            </w:r>
+          </w:p>
+        </w:tc>
+      </w:tr>
+      <w:tr>
+        <w:trPr>
+          <w:trHeight w:val="530" w:hRule="atLeast"/>
+        </w:trPr>
+        <w:tc>
+          <w:tcPr>
+            <w:tcW w:w="2000" w:type="dxa"/>
+          </w:tcPr>
+          <w:p>
+            <w:pPr/>
+            <w:r>
+              <w:t xml:space="preserve">updated_by</w:t>
+            </w:r>
+          </w:p>
+        </w:tc>
+        <w:tc>
+          <w:tcPr>
+            <w:tcW w:w="2000" w:type="dxa"/>
+          </w:tcPr>
+          <w:p>
+            <w:pPr/>
+            <w:r>
+              <w:t xml:space="preserve">bigint</w:t>
+            </w:r>
+          </w:p>
+        </w:tc>
+        <w:tc>
+          <w:tcPr>
+            <w:tcW w:w="2000" w:type="dxa"/>
+          </w:tcPr>
+          <w:p>
+            <w:pPr/>
+            <w:r>
+              <w:t xml:space="preserve">-</w:t>
+            </w:r>
+          </w:p>
+        </w:tc>
+        <w:tc>
+          <w:tcPr>
+            <w:tcW w:w="2000" w:type="dxa"/>
+          </w:tcPr>
+          <w:p>
+            <w:pPr/>
+            <w:r>
+              <w:t xml:space="preserve">IS NULL</w:t>
+            </w:r>
+          </w:p>
+        </w:tc>
+      </w:tr>
+      <w:tr>
+        <w:trPr>
+          <w:trHeight w:val="530" w:hRule="atLeast"/>
+        </w:trPr>
+        <w:tc>
+          <w:tcPr>
+            <w:tcW w:w="2000" w:type="dxa"/>
+          </w:tcPr>
+          <w:p>
+            <w:pPr/>
+            <w:r>
+              <w:t xml:space="preserve">version</w:t>
+            </w:r>
+          </w:p>
+        </w:tc>
+        <w:tc>
+          <w:tcPr>
+            <w:tcW w:w="2000" w:type="dxa"/>
+          </w:tcPr>
+          <w:p>
+            <w:pPr/>
+            <w:r>
+              <w:t xml:space="preserve">int</w:t>
+            </w:r>
+          </w:p>
+        </w:tc>
+        <w:tc>
+          <w:tcPr>
+            <w:tcW w:w="2000" w:type="dxa"/>
+          </w:tcPr>
+          <w:p>
+            <w:pPr/>
+            <w:r>
+              <w:t xml:space="preserve">-</w:t>
+            </w:r>
+          </w:p>
+        </w:tc>
+        <w:tc>
+          <w:tcPr>
+            <w:tcW w:w="2000" w:type="dxa"/>
+          </w:tcPr>
+          <w:p>
+            <w:pPr/>
+            <w:r>
+              <w:t xml:space="preserve">NOT NULL</w:t>
             </w:r>
           </w:p>
         </w:tc>
@@ -62609,7 +64262,7 @@
       </w:r>
     </w:p>
     <w:sectPr>
-      <w:footerReference xmlns:r="http://schemas.openxmlformats.org/officeDocument/2006/relationships" w:type="default" r:id="R862300029bca41aa"/>
+      <w:footerReference xmlns:r="http://schemas.openxmlformats.org/officeDocument/2006/relationships" w:type="default" r:id="R73524a71a6cb474e"/>
       <w:pgSz w:w="11906" w:h="16838"/>
       <w:pgMar w:top="1440" w:right="1440" w:bottom="1440" w:left="1440" w:header="720" w:footer="720" w:gutter="0"/>
     </w:sectPr>

</xml_diff>

<commit_message>
feat(pur): enforce requisition read data scope
</commit_message>
<xml_diff>
--- a/docs/99-output/MyERP_SDS.docx
+++ b/docs/99-output/MyERP_SDS.docx
@@ -46367,6 +46367,104 @@
             <w:pPr/>
             <w:r>
               <w:t xml:space="preserve">NOT NULL</w:t>
+            </w:r>
+          </w:p>
+        </w:tc>
+      </w:tr>
+      <w:tr>
+        <w:trPr>
+          <w:trHeight w:val="530" w:hRule="atLeast"/>
+        </w:trPr>
+        <w:tc>
+          <w:tcPr>
+            <w:tcW w:w="2000" w:type="dxa"/>
+          </w:tcPr>
+          <w:p>
+            <w:pPr/>
+            <w:r>
+              <w:t xml:space="preserve">branch_id</w:t>
+            </w:r>
+          </w:p>
+        </w:tc>
+        <w:tc>
+          <w:tcPr>
+            <w:tcW w:w="2000" w:type="dxa"/>
+          </w:tcPr>
+          <w:p>
+            <w:pPr/>
+            <w:r>
+              <w:t xml:space="preserve">bigint</w:t>
+            </w:r>
+          </w:p>
+        </w:tc>
+        <w:tc>
+          <w:tcPr>
+            <w:tcW w:w="2000" w:type="dxa"/>
+          </w:tcPr>
+          <w:p>
+            <w:pPr/>
+            <w:r>
+              <w:t xml:space="preserve">-</w:t>
+            </w:r>
+          </w:p>
+        </w:tc>
+        <w:tc>
+          <w:tcPr>
+            <w:tcW w:w="2000" w:type="dxa"/>
+          </w:tcPr>
+          <w:p>
+            <w:pPr/>
+            <w:r>
+              <w:t xml:space="preserve">IS NULL</w:t>
+            </w:r>
+          </w:p>
+        </w:tc>
+      </w:tr>
+      <w:tr>
+        <w:trPr>
+          <w:trHeight w:val="530" w:hRule="atLeast"/>
+        </w:trPr>
+        <w:tc>
+          <w:tcPr>
+            <w:tcW w:w="2000" w:type="dxa"/>
+          </w:tcPr>
+          <w:p>
+            <w:pPr/>
+            <w:r>
+              <w:t xml:space="preserve">department_id</w:t>
+            </w:r>
+          </w:p>
+        </w:tc>
+        <w:tc>
+          <w:tcPr>
+            <w:tcW w:w="2000" w:type="dxa"/>
+          </w:tcPr>
+          <w:p>
+            <w:pPr/>
+            <w:r>
+              <w:t xml:space="preserve">bigint</w:t>
+            </w:r>
+          </w:p>
+        </w:tc>
+        <w:tc>
+          <w:tcPr>
+            <w:tcW w:w="2000" w:type="dxa"/>
+          </w:tcPr>
+          <w:p>
+            <w:pPr/>
+            <w:r>
+              <w:t xml:space="preserve">-</w:t>
+            </w:r>
+          </w:p>
+        </w:tc>
+        <w:tc>
+          <w:tcPr>
+            <w:tcW w:w="2000" w:type="dxa"/>
+          </w:tcPr>
+          <w:p>
+            <w:pPr/>
+            <w:r>
+              <w:t xml:space="preserve">IS NULL</w:t>
             </w:r>
           </w:p>
         </w:tc>
@@ -64262,7 +64360,7 @@
       </w:r>
     </w:p>
     <w:sectPr>
-      <w:footerReference xmlns:r="http://schemas.openxmlformats.org/officeDocument/2006/relationships" w:type="default" r:id="R73524a71a6cb474e"/>
+      <w:footerReference xmlns:r="http://schemas.openxmlformats.org/officeDocument/2006/relationships" w:type="default" r:id="Rd37923a467dd478a"/>
       <w:pgSz w:w="11906" w:h="16838"/>
       <w:pgMar w:top="1440" w:right="1440" w:bottom="1440" w:left="1440" w:header="720" w:footer="720" w:gutter="0"/>
     </w:sectPr>

</xml_diff>

<commit_message>
feat(pur): add requisition submission workflow
</commit_message>
<xml_diff>
--- a/docs/99-output/MyERP_SDS.docx
+++ b/docs/99-output/MyERP_SDS.docx
@@ -46,7 +46,7 @@
         <w:jc w:val="center"/>
       </w:pPr>
       <w:r>
-        <w:t xml:space="preserve">Date: 19 October 2026</w:t>
+        <w:t xml:space="preserve">Date: 20 October 2026</w:t>
       </w:r>
     </w:p>
     <w:p/>
@@ -64360,7 +64360,7 @@
       </w:r>
     </w:p>
     <w:sectPr>
-      <w:footerReference xmlns:r="http://schemas.openxmlformats.org/officeDocument/2006/relationships" w:type="default" r:id="R88417917b9c84ea9"/>
+      <w:footerReference xmlns:r="http://schemas.openxmlformats.org/officeDocument/2006/relationships" w:type="default" r:id="Rf7c24b94568048d7"/>
       <w:pgSz w:w="11906" w:h="16838"/>
       <w:pgMar w:top="1440" w:right="1440" w:bottom="1440" w:left="1440" w:header="720" w:footer="720" w:gutter="0"/>
     </w:sectPr>

</xml_diff>

<commit_message>
feat(pur): complete safe requisition CSV export
</commit_message>
<xml_diff>
--- a/docs/99-output/MyERP_SDS.docx
+++ b/docs/99-output/MyERP_SDS.docx
@@ -46,7 +46,7 @@
         <w:jc w:val="center"/>
       </w:pPr>
       <w:r>
-        <w:t xml:space="preserve">Date: 20 October 2026</w:t>
+        <w:t xml:space="preserve">Date: 21 October 2026</w:t>
       </w:r>
     </w:p>
     <w:p/>
@@ -64360,7 +64360,7 @@
       </w:r>
     </w:p>
     <w:sectPr>
-      <w:footerReference xmlns:r="http://schemas.openxmlformats.org/officeDocument/2006/relationships" w:type="default" r:id="Rb433a0adeca74c00"/>
+      <w:footerReference xmlns:r="http://schemas.openxmlformats.org/officeDocument/2006/relationships" w:type="default" r:id="Rccc88b6f161d4bbe"/>
       <w:pgSz w:w="11906" w:h="16838"/>
       <w:pgMar w:top="1440" w:right="1440" w:bottom="1440" w:left="1440" w:header="720" w:footer="720" w:gutter="0"/>
     </w:sectPr>

</xml_diff>

<commit_message>
docs(pur): define rfq quotation and award baseline
</commit_message>
<xml_diff>
--- a/docs/99-output/MyERP_SDS.docx
+++ b/docs/99-output/MyERP_SDS.docx
@@ -62232,6 +62232,101 @@
           <w:i/>
         </w:rPr>
         <w:t xml:space="preserve">[Pending] System screenshot of Purchase Requisition Edit Interface.</w:t>
+      </w:r>
+    </w:p>
+    <w:p>
+      <w:pPr>
+        <w:pStyle w:val="Heading5"/>
+      </w:pPr>
+      <w:r>
+        <w:t xml:space="preserve">4.2.1.4.11 Request for Quotation View Interface</w:t>
+      </w:r>
+    </w:p>
+    <w:p>
+      <w:pPr>
+        <w:jc w:val="center"/>
+      </w:pPr>
+      <w:r>
+        <w:rPr>
+          <w:i/>
+        </w:rPr>
+        <w:t xml:space="preserve">[Pending] System screenshot of Request for Quotation View Interface.</w:t>
+      </w:r>
+    </w:p>
+    <w:p>
+      <w:pPr>
+        <w:pStyle w:val="Heading5"/>
+      </w:pPr>
+      <w:r>
+        <w:t xml:space="preserve">4.2.1.4.12 Request for Quotation Create Interface</w:t>
+      </w:r>
+    </w:p>
+    <w:p>
+      <w:pPr>
+        <w:jc w:val="center"/>
+      </w:pPr>
+      <w:r>
+        <w:rPr>
+          <w:i/>
+        </w:rPr>
+        <w:t xml:space="preserve">[Pending] System screenshot of Request for Quotation Create Interface.</w:t>
+      </w:r>
+    </w:p>
+    <w:p>
+      <w:pPr>
+        <w:pStyle w:val="Heading5"/>
+      </w:pPr>
+      <w:r>
+        <w:t xml:space="preserve">4.2.1.4.13 Request for Quotation Edit Interface</w:t>
+      </w:r>
+    </w:p>
+    <w:p>
+      <w:pPr>
+        <w:jc w:val="center"/>
+      </w:pPr>
+      <w:r>
+        <w:rPr>
+          <w:i/>
+        </w:rPr>
+        <w:t xml:space="preserve">[Pending] System screenshot of Request for Quotation Edit Interface.</w:t>
+      </w:r>
+    </w:p>
+    <w:p>
+      <w:pPr>
+        <w:pStyle w:val="Heading5"/>
+      </w:pPr>
+      <w:r>
+        <w:t xml:space="preserve">4.2.1.4.14 Supplier Quotation Edit Interface</w:t>
+      </w:r>
+    </w:p>
+    <w:p>
+      <w:pPr>
+        <w:jc w:val="center"/>
+      </w:pPr>
+      <w:r>
+        <w:rPr>
+          <w:i/>
+        </w:rPr>
+        <w:t xml:space="preserve">[Pending] System screenshot of Supplier Quotation Edit Interface.</w:t>
+      </w:r>
+    </w:p>
+    <w:p>
+      <w:pPr>
+        <w:pStyle w:val="Heading5"/>
+      </w:pPr>
+      <w:r>
+        <w:t xml:space="preserve">4.2.1.4.15 Quotation Comparison Interface</w:t>
+      </w:r>
+    </w:p>
+    <w:p>
+      <w:pPr>
+        <w:jc w:val="center"/>
+      </w:pPr>
+      <w:r>
+        <w:rPr>
+          <w:i/>
+        </w:rPr>
+        <w:t xml:space="preserve">[Pending] System screenshot of Quotation Comparison Interface.</w:t>
       </w:r>
     </w:p>
     <w:p>
@@ -64360,7 +64455,7 @@
       </w:r>
     </w:p>
     <w:sectPr>
-      <w:footerReference xmlns:r="http://schemas.openxmlformats.org/officeDocument/2006/relationships" w:type="default" r:id="Rccc88b6f161d4bbe"/>
+      <w:footerReference xmlns:r="http://schemas.openxmlformats.org/officeDocument/2006/relationships" w:type="default" r:id="Rb8a3b4dd67bb4b61"/>
       <w:pgSz w:w="11906" w:h="16838"/>
       <w:pgMar w:top="1440" w:right="1440" w:bottom="1440" w:left="1440" w:header="720" w:footer="720" w:gutter="0"/>
     </w:sectPr>

</xml_diff>

<commit_message>
feat(pur): add quotation draft schema and SQL guards
</commit_message>
<xml_diff>
--- a/docs/99-output/MyERP_SDS.docx
+++ b/docs/99-output/MyERP_SDS.docx
@@ -46891,6 +46891,2559 @@
             <w:pPr/>
             <w:r>
               <w:t xml:space="preserve">ordered_quantity</w:t>
+            </w:r>
+          </w:p>
+        </w:tc>
+        <w:tc>
+          <w:tcPr>
+            <w:tcW w:w="2000" w:type="dxa"/>
+          </w:tcPr>
+          <w:p>
+            <w:pPr/>
+            <w:r>
+              <w:t xml:space="preserve">decimal</w:t>
+            </w:r>
+          </w:p>
+        </w:tc>
+        <w:tc>
+          <w:tcPr>
+            <w:tcW w:w="2000" w:type="dxa"/>
+          </w:tcPr>
+          <w:p>
+            <w:pPr/>
+            <w:r>
+              <w:t xml:space="preserve">(19,6)</w:t>
+            </w:r>
+          </w:p>
+        </w:tc>
+        <w:tc>
+          <w:tcPr>
+            <w:tcW w:w="2000" w:type="dxa"/>
+          </w:tcPr>
+          <w:p>
+            <w:pPr/>
+            <w:r>
+              <w:t xml:space="preserve">NOT NULL</w:t>
+            </w:r>
+          </w:p>
+        </w:tc>
+      </w:tr>
+      <w:tr>
+        <w:trPr>
+          <w:trHeight w:val="530" w:hRule="atLeast"/>
+        </w:trPr>
+        <w:tc>
+          <w:tcPr>
+            <w:tcW w:w="2000" w:type="dxa"/>
+          </w:tcPr>
+          <w:p>
+            <w:pPr/>
+            <w:r>
+              <w:t xml:space="preserve">remark</w:t>
+            </w:r>
+          </w:p>
+        </w:tc>
+        <w:tc>
+          <w:tcPr>
+            <w:tcW w:w="2000" w:type="dxa"/>
+          </w:tcPr>
+          <w:p>
+            <w:pPr/>
+            <w:r>
+              <w:t xml:space="preserve">nvarchar</w:t>
+            </w:r>
+          </w:p>
+        </w:tc>
+        <w:tc>
+          <w:tcPr>
+            <w:tcW w:w="2000" w:type="dxa"/>
+          </w:tcPr>
+          <w:p>
+            <w:pPr/>
+            <w:r>
+              <w:t xml:space="preserve">500</w:t>
+            </w:r>
+          </w:p>
+        </w:tc>
+        <w:tc>
+          <w:tcPr>
+            <w:tcW w:w="2000" w:type="dxa"/>
+          </w:tcPr>
+          <w:p>
+            <w:pPr/>
+            <w:r>
+              <w:t xml:space="preserve">IS NULL</w:t>
+            </w:r>
+          </w:p>
+        </w:tc>
+      </w:tr>
+      <w:tr>
+        <w:trPr>
+          <w:trHeight w:val="530" w:hRule="atLeast"/>
+        </w:trPr>
+        <w:tc>
+          <w:tcPr>
+            <w:tcW w:w="2000" w:type="dxa"/>
+          </w:tcPr>
+          <w:p>
+            <w:pPr/>
+            <w:r>
+              <w:t xml:space="preserve">company_id</w:t>
+            </w:r>
+          </w:p>
+        </w:tc>
+        <w:tc>
+          <w:tcPr>
+            <w:tcW w:w="2000" w:type="dxa"/>
+          </w:tcPr>
+          <w:p>
+            <w:pPr/>
+            <w:r>
+              <w:t xml:space="preserve">bigint</w:t>
+            </w:r>
+          </w:p>
+        </w:tc>
+        <w:tc>
+          <w:tcPr>
+            <w:tcW w:w="2000" w:type="dxa"/>
+          </w:tcPr>
+          <w:p>
+            <w:pPr/>
+            <w:r>
+              <w:t xml:space="preserve">-</w:t>
+            </w:r>
+          </w:p>
+        </w:tc>
+        <w:tc>
+          <w:tcPr>
+            <w:tcW w:w="2000" w:type="dxa"/>
+          </w:tcPr>
+          <w:p>
+            <w:pPr/>
+            <w:r>
+              <w:t xml:space="preserve">FK, NOT NULL</w:t>
+            </w:r>
+          </w:p>
+        </w:tc>
+      </w:tr>
+      <w:tr>
+        <w:trPr>
+          <w:trHeight w:val="530" w:hRule="atLeast"/>
+        </w:trPr>
+        <w:tc>
+          <w:tcPr>
+            <w:tcW w:w="2000" w:type="dxa"/>
+          </w:tcPr>
+          <w:p>
+            <w:pPr/>
+            <w:r>
+              <w:t xml:space="preserve">created_at</w:t>
+            </w:r>
+          </w:p>
+        </w:tc>
+        <w:tc>
+          <w:tcPr>
+            <w:tcW w:w="2000" w:type="dxa"/>
+          </w:tcPr>
+          <w:p>
+            <w:pPr/>
+            <w:r>
+              <w:t xml:space="preserve">datetime2</w:t>
+            </w:r>
+          </w:p>
+        </w:tc>
+        <w:tc>
+          <w:tcPr>
+            <w:tcW w:w="2000" w:type="dxa"/>
+          </w:tcPr>
+          <w:p>
+            <w:pPr/>
+            <w:r>
+              <w:t xml:space="preserve">(6)</w:t>
+            </w:r>
+          </w:p>
+        </w:tc>
+        <w:tc>
+          <w:tcPr>
+            <w:tcW w:w="2000" w:type="dxa"/>
+          </w:tcPr>
+          <w:p>
+            <w:pPr/>
+            <w:r>
+              <w:t xml:space="preserve">NOT NULL</w:t>
+            </w:r>
+          </w:p>
+        </w:tc>
+      </w:tr>
+      <w:tr>
+        <w:trPr>
+          <w:trHeight w:val="530" w:hRule="atLeast"/>
+        </w:trPr>
+        <w:tc>
+          <w:tcPr>
+            <w:tcW w:w="2000" w:type="dxa"/>
+          </w:tcPr>
+          <w:p>
+            <w:pPr/>
+            <w:r>
+              <w:t xml:space="preserve">created_by</w:t>
+            </w:r>
+          </w:p>
+        </w:tc>
+        <w:tc>
+          <w:tcPr>
+            <w:tcW w:w="2000" w:type="dxa"/>
+          </w:tcPr>
+          <w:p>
+            <w:pPr/>
+            <w:r>
+              <w:t xml:space="preserve">bigint</w:t>
+            </w:r>
+          </w:p>
+        </w:tc>
+        <w:tc>
+          <w:tcPr>
+            <w:tcW w:w="2000" w:type="dxa"/>
+          </w:tcPr>
+          <w:p>
+            <w:pPr/>
+            <w:r>
+              <w:t xml:space="preserve">-</w:t>
+            </w:r>
+          </w:p>
+        </w:tc>
+        <w:tc>
+          <w:tcPr>
+            <w:tcW w:w="2000" w:type="dxa"/>
+          </w:tcPr>
+          <w:p>
+            <w:pPr/>
+            <w:r>
+              <w:t xml:space="preserve">NOT NULL</w:t>
+            </w:r>
+          </w:p>
+        </w:tc>
+      </w:tr>
+      <w:tr>
+        <w:trPr>
+          <w:trHeight w:val="530" w:hRule="atLeast"/>
+        </w:trPr>
+        <w:tc>
+          <w:tcPr>
+            <w:tcW w:w="2000" w:type="dxa"/>
+          </w:tcPr>
+          <w:p>
+            <w:pPr/>
+            <w:r>
+              <w:t xml:space="preserve">updated_at</w:t>
+            </w:r>
+          </w:p>
+        </w:tc>
+        <w:tc>
+          <w:tcPr>
+            <w:tcW w:w="2000" w:type="dxa"/>
+          </w:tcPr>
+          <w:p>
+            <w:pPr/>
+            <w:r>
+              <w:t xml:space="preserve">datetime2</w:t>
+            </w:r>
+          </w:p>
+        </w:tc>
+        <w:tc>
+          <w:tcPr>
+            <w:tcW w:w="2000" w:type="dxa"/>
+          </w:tcPr>
+          <w:p>
+            <w:pPr/>
+            <w:r>
+              <w:t xml:space="preserve">(6)</w:t>
+            </w:r>
+          </w:p>
+        </w:tc>
+        <w:tc>
+          <w:tcPr>
+            <w:tcW w:w="2000" w:type="dxa"/>
+          </w:tcPr>
+          <w:p>
+            <w:pPr/>
+            <w:r>
+              <w:t xml:space="preserve">IS NULL</w:t>
+            </w:r>
+          </w:p>
+        </w:tc>
+      </w:tr>
+      <w:tr>
+        <w:trPr>
+          <w:trHeight w:val="530" w:hRule="atLeast"/>
+        </w:trPr>
+        <w:tc>
+          <w:tcPr>
+            <w:tcW w:w="2000" w:type="dxa"/>
+          </w:tcPr>
+          <w:p>
+            <w:pPr/>
+            <w:r>
+              <w:t xml:space="preserve">updated_by</w:t>
+            </w:r>
+          </w:p>
+        </w:tc>
+        <w:tc>
+          <w:tcPr>
+            <w:tcW w:w="2000" w:type="dxa"/>
+          </w:tcPr>
+          <w:p>
+            <w:pPr/>
+            <w:r>
+              <w:t xml:space="preserve">bigint</w:t>
+            </w:r>
+          </w:p>
+        </w:tc>
+        <w:tc>
+          <w:tcPr>
+            <w:tcW w:w="2000" w:type="dxa"/>
+          </w:tcPr>
+          <w:p>
+            <w:pPr/>
+            <w:r>
+              <w:t xml:space="preserve">-</w:t>
+            </w:r>
+          </w:p>
+        </w:tc>
+        <w:tc>
+          <w:tcPr>
+            <w:tcW w:w="2000" w:type="dxa"/>
+          </w:tcPr>
+          <w:p>
+            <w:pPr/>
+            <w:r>
+              <w:t xml:space="preserve">IS NULL</w:t>
+            </w:r>
+          </w:p>
+        </w:tc>
+      </w:tr>
+      <w:tr>
+        <w:trPr>
+          <w:trHeight w:val="530" w:hRule="atLeast"/>
+        </w:trPr>
+        <w:tc>
+          <w:tcPr>
+            <w:tcW w:w="2000" w:type="dxa"/>
+          </w:tcPr>
+          <w:p>
+            <w:pPr/>
+            <w:r>
+              <w:t xml:space="preserve">version</w:t>
+            </w:r>
+          </w:p>
+        </w:tc>
+        <w:tc>
+          <w:tcPr>
+            <w:tcW w:w="2000" w:type="dxa"/>
+          </w:tcPr>
+          <w:p>
+            <w:pPr/>
+            <w:r>
+              <w:t xml:space="preserve">int</w:t>
+            </w:r>
+          </w:p>
+        </w:tc>
+        <w:tc>
+          <w:tcPr>
+            <w:tcW w:w="2000" w:type="dxa"/>
+          </w:tcPr>
+          <w:p>
+            <w:pPr/>
+            <w:r>
+              <w:t xml:space="preserve">-</w:t>
+            </w:r>
+          </w:p>
+        </w:tc>
+        <w:tc>
+          <w:tcPr>
+            <w:tcW w:w="2000" w:type="dxa"/>
+          </w:tcPr>
+          <w:p>
+            <w:pPr/>
+            <w:r>
+              <w:t xml:space="preserve">NOT NULL</w:t>
+            </w:r>
+          </w:p>
+        </w:tc>
+      </w:tr>
+    </w:tbl>
+    <w:p/>
+    <w:p>
+      <w:pPr/>
+      <w:r>
+        <w:t xml:space="preserve">Table Name: pur_rfq</w:t>
+      </w:r>
+    </w:p>
+    <w:p>
+      <w:pPr/>
+      <w:r>
+        <w:t xml:space="preserve">Primary Key: id</w:t>
+      </w:r>
+    </w:p>
+    <w:p>
+      <w:pPr/>
+      <w:r>
+        <w:t xml:space="preserve">This table stores company-scoped requests for quotation, document numbers, deadlines and send state.</w:t>
+      </w:r>
+    </w:p>
+    <w:tbl>
+      <w:tblPr>
+        <w:tblStyle w:val="TableGrid"/>
+        <w:tblW w:w="8000" w:type="dxa"/>
+        <w:jc w:val="left"/>
+        <w:tblBorders>
+          <w:top w:val="single" w:color="000000" w:sz="4" w:space="0"/>
+          <w:left w:val="single" w:color="000000" w:sz="4" w:space="0"/>
+          <w:bottom w:val="single" w:color="000000" w:sz="4" w:space="0"/>
+          <w:right w:val="single" w:color="000000" w:sz="4" w:space="0"/>
+          <w:insideH w:val="single" w:color="000000" w:sz="4" w:space="0"/>
+          <w:insideV w:val="single" w:color="000000" w:sz="4" w:space="0"/>
+        </w:tblBorders>
+        <w:tblLayout w:type="fixed"/>
+        <w:tblCellMar>
+          <w:top w:w="100" w:type="dxa"/>
+          <w:left w:w="100" w:type="dxa"/>
+          <w:bottom w:w="100" w:type="dxa"/>
+          <w:right w:w="100" w:type="dxa"/>
+        </w:tblCellMar>
+      </w:tblPr>
+      <w:tblGrid>
+        <w:gridCol w:w="2000"/>
+        <w:gridCol w:w="2000"/>
+        <w:gridCol w:w="2000"/>
+        <w:gridCol w:w="2000"/>
+      </w:tblGrid>
+      <w:tr>
+        <w:trPr>
+          <w:trHeight w:val="530" w:hRule="atLeast"/>
+        </w:trPr>
+        <w:tc>
+          <w:tcPr>
+            <w:tcW w:w="2000" w:type="dxa"/>
+          </w:tcPr>
+          <w:p>
+            <w:pPr>
+              <w:jc w:val="center"/>
+            </w:pPr>
+            <w:r>
+              <w:rPr>
+                <w:b/>
+              </w:rPr>
+              <w:t xml:space="preserve">Name of Attribute</w:t>
+            </w:r>
+          </w:p>
+        </w:tc>
+        <w:tc>
+          <w:tcPr>
+            <w:tcW w:w="2000" w:type="dxa"/>
+          </w:tcPr>
+          <w:p>
+            <w:pPr>
+              <w:jc w:val="center"/>
+            </w:pPr>
+            <w:r>
+              <w:rPr>
+                <w:b/>
+              </w:rPr>
+              <w:t xml:space="preserve">Data Type</w:t>
+            </w:r>
+          </w:p>
+        </w:tc>
+        <w:tc>
+          <w:tcPr>
+            <w:tcW w:w="2000" w:type="dxa"/>
+          </w:tcPr>
+          <w:p>
+            <w:pPr>
+              <w:jc w:val="center"/>
+            </w:pPr>
+            <w:r>
+              <w:rPr>
+                <w:b/>
+              </w:rPr>
+              <w:t xml:space="preserve">Size</w:t>
+            </w:r>
+          </w:p>
+        </w:tc>
+        <w:tc>
+          <w:tcPr>
+            <w:tcW w:w="2000" w:type="dxa"/>
+          </w:tcPr>
+          <w:p>
+            <w:pPr>
+              <w:jc w:val="center"/>
+            </w:pPr>
+            <w:r>
+              <w:rPr>
+                <w:b/>
+              </w:rPr>
+              <w:t xml:space="preserve">PK/FK/IS NULL/ NOT NULL</w:t>
+            </w:r>
+          </w:p>
+        </w:tc>
+      </w:tr>
+      <w:tr>
+        <w:trPr>
+          <w:trHeight w:val="530" w:hRule="atLeast"/>
+        </w:trPr>
+        <w:tc>
+          <w:tcPr>
+            <w:tcW w:w="2000" w:type="dxa"/>
+          </w:tcPr>
+          <w:p>
+            <w:pPr/>
+            <w:r>
+              <w:t xml:space="preserve">id</w:t>
+            </w:r>
+          </w:p>
+        </w:tc>
+        <w:tc>
+          <w:tcPr>
+            <w:tcW w:w="2000" w:type="dxa"/>
+          </w:tcPr>
+          <w:p>
+            <w:pPr/>
+            <w:r>
+              <w:t xml:space="preserve">bigint</w:t>
+            </w:r>
+          </w:p>
+        </w:tc>
+        <w:tc>
+          <w:tcPr>
+            <w:tcW w:w="2000" w:type="dxa"/>
+          </w:tcPr>
+          <w:p>
+            <w:pPr/>
+            <w:r>
+              <w:t xml:space="preserve">-</w:t>
+            </w:r>
+          </w:p>
+        </w:tc>
+        <w:tc>
+          <w:tcPr>
+            <w:tcW w:w="2000" w:type="dxa"/>
+          </w:tcPr>
+          <w:p>
+            <w:pPr/>
+            <w:r>
+              <w:t xml:space="preserve">PK, NOT NULL</w:t>
+            </w:r>
+          </w:p>
+        </w:tc>
+      </w:tr>
+      <w:tr>
+        <w:trPr>
+          <w:trHeight w:val="530" w:hRule="atLeast"/>
+        </w:trPr>
+        <w:tc>
+          <w:tcPr>
+            <w:tcW w:w="2000" w:type="dxa"/>
+          </w:tcPr>
+          <w:p>
+            <w:pPr/>
+            <w:r>
+              <w:t xml:space="preserve">document_no</w:t>
+            </w:r>
+          </w:p>
+        </w:tc>
+        <w:tc>
+          <w:tcPr>
+            <w:tcW w:w="2000" w:type="dxa"/>
+          </w:tcPr>
+          <w:p>
+            <w:pPr/>
+            <w:r>
+              <w:t xml:space="preserve">varchar</w:t>
+            </w:r>
+          </w:p>
+        </w:tc>
+        <w:tc>
+          <w:tcPr>
+            <w:tcW w:w="2000" w:type="dxa"/>
+          </w:tcPr>
+          <w:p>
+            <w:pPr/>
+            <w:r>
+              <w:t xml:space="preserve">30</w:t>
+            </w:r>
+          </w:p>
+        </w:tc>
+        <w:tc>
+          <w:tcPr>
+            <w:tcW w:w="2000" w:type="dxa"/>
+          </w:tcPr>
+          <w:p>
+            <w:pPr/>
+            <w:r>
+              <w:t xml:space="preserve">NOT NULL</w:t>
+            </w:r>
+          </w:p>
+        </w:tc>
+      </w:tr>
+      <w:tr>
+        <w:trPr>
+          <w:trHeight w:val="530" w:hRule="atLeast"/>
+        </w:trPr>
+        <w:tc>
+          <w:tcPr>
+            <w:tcW w:w="2000" w:type="dxa"/>
+          </w:tcPr>
+          <w:p>
+            <w:pPr/>
+            <w:r>
+              <w:t xml:space="preserve">business_date</w:t>
+            </w:r>
+          </w:p>
+        </w:tc>
+        <w:tc>
+          <w:tcPr>
+            <w:tcW w:w="2000" w:type="dxa"/>
+          </w:tcPr>
+          <w:p>
+            <w:pPr/>
+            <w:r>
+              <w:t xml:space="preserve">date</w:t>
+            </w:r>
+          </w:p>
+        </w:tc>
+        <w:tc>
+          <w:tcPr>
+            <w:tcW w:w="2000" w:type="dxa"/>
+          </w:tcPr>
+          <w:p>
+            <w:pPr/>
+            <w:r>
+              <w:t xml:space="preserve">-</w:t>
+            </w:r>
+          </w:p>
+        </w:tc>
+        <w:tc>
+          <w:tcPr>
+            <w:tcW w:w="2000" w:type="dxa"/>
+          </w:tcPr>
+          <w:p>
+            <w:pPr/>
+            <w:r>
+              <w:t xml:space="preserve">NOT NULL</w:t>
+            </w:r>
+          </w:p>
+        </w:tc>
+      </w:tr>
+      <w:tr>
+        <w:trPr>
+          <w:trHeight w:val="530" w:hRule="atLeast"/>
+        </w:trPr>
+        <w:tc>
+          <w:tcPr>
+            <w:tcW w:w="2000" w:type="dxa"/>
+          </w:tcPr>
+          <w:p>
+            <w:pPr/>
+            <w:r>
+              <w:t xml:space="preserve">reply_deadline</w:t>
+            </w:r>
+          </w:p>
+        </w:tc>
+        <w:tc>
+          <w:tcPr>
+            <w:tcW w:w="2000" w:type="dxa"/>
+          </w:tcPr>
+          <w:p>
+            <w:pPr/>
+            <w:r>
+              <w:t xml:space="preserve">date</w:t>
+            </w:r>
+          </w:p>
+        </w:tc>
+        <w:tc>
+          <w:tcPr>
+            <w:tcW w:w="2000" w:type="dxa"/>
+          </w:tcPr>
+          <w:p>
+            <w:pPr/>
+            <w:r>
+              <w:t xml:space="preserve">-</w:t>
+            </w:r>
+          </w:p>
+        </w:tc>
+        <w:tc>
+          <w:tcPr>
+            <w:tcW w:w="2000" w:type="dxa"/>
+          </w:tcPr>
+          <w:p>
+            <w:pPr/>
+            <w:r>
+              <w:t xml:space="preserve">NOT NULL</w:t>
+            </w:r>
+          </w:p>
+        </w:tc>
+      </w:tr>
+      <w:tr>
+        <w:trPr>
+          <w:trHeight w:val="530" w:hRule="atLeast"/>
+        </w:trPr>
+        <w:tc>
+          <w:tcPr>
+            <w:tcW w:w="2000" w:type="dxa"/>
+          </w:tcPr>
+          <w:p>
+            <w:pPr/>
+            <w:r>
+              <w:t xml:space="preserve">owner_id</w:t>
+            </w:r>
+          </w:p>
+        </w:tc>
+        <w:tc>
+          <w:tcPr>
+            <w:tcW w:w="2000" w:type="dxa"/>
+          </w:tcPr>
+          <w:p>
+            <w:pPr/>
+            <w:r>
+              <w:t xml:space="preserve">bigint</w:t>
+            </w:r>
+          </w:p>
+        </w:tc>
+        <w:tc>
+          <w:tcPr>
+            <w:tcW w:w="2000" w:type="dxa"/>
+          </w:tcPr>
+          <w:p>
+            <w:pPr/>
+            <w:r>
+              <w:t xml:space="preserve">-</w:t>
+            </w:r>
+          </w:p>
+        </w:tc>
+        <w:tc>
+          <w:tcPr>
+            <w:tcW w:w="2000" w:type="dxa"/>
+          </w:tcPr>
+          <w:p>
+            <w:pPr/>
+            <w:r>
+              <w:t xml:space="preserve">NOT NULL</w:t>
+            </w:r>
+          </w:p>
+        </w:tc>
+      </w:tr>
+      <w:tr>
+        <w:trPr>
+          <w:trHeight w:val="530" w:hRule="atLeast"/>
+        </w:trPr>
+        <w:tc>
+          <w:tcPr>
+            <w:tcW w:w="2000" w:type="dxa"/>
+          </w:tcPr>
+          <w:p>
+            <w:pPr/>
+            <w:r>
+              <w:t xml:space="preserve">branch_id</w:t>
+            </w:r>
+          </w:p>
+        </w:tc>
+        <w:tc>
+          <w:tcPr>
+            <w:tcW w:w="2000" w:type="dxa"/>
+          </w:tcPr>
+          <w:p>
+            <w:pPr/>
+            <w:r>
+              <w:t xml:space="preserve">bigint</w:t>
+            </w:r>
+          </w:p>
+        </w:tc>
+        <w:tc>
+          <w:tcPr>
+            <w:tcW w:w="2000" w:type="dxa"/>
+          </w:tcPr>
+          <w:p>
+            <w:pPr/>
+            <w:r>
+              <w:t xml:space="preserve">-</w:t>
+            </w:r>
+          </w:p>
+        </w:tc>
+        <w:tc>
+          <w:tcPr>
+            <w:tcW w:w="2000" w:type="dxa"/>
+          </w:tcPr>
+          <w:p>
+            <w:pPr/>
+            <w:r>
+              <w:t xml:space="preserve">IS NULL</w:t>
+            </w:r>
+          </w:p>
+        </w:tc>
+      </w:tr>
+      <w:tr>
+        <w:trPr>
+          <w:trHeight w:val="530" w:hRule="atLeast"/>
+        </w:trPr>
+        <w:tc>
+          <w:tcPr>
+            <w:tcW w:w="2000" w:type="dxa"/>
+          </w:tcPr>
+          <w:p>
+            <w:pPr/>
+            <w:r>
+              <w:t xml:space="preserve">department_id</w:t>
+            </w:r>
+          </w:p>
+        </w:tc>
+        <w:tc>
+          <w:tcPr>
+            <w:tcW w:w="2000" w:type="dxa"/>
+          </w:tcPr>
+          <w:p>
+            <w:pPr/>
+            <w:r>
+              <w:t xml:space="preserve">bigint</w:t>
+            </w:r>
+          </w:p>
+        </w:tc>
+        <w:tc>
+          <w:tcPr>
+            <w:tcW w:w="2000" w:type="dxa"/>
+          </w:tcPr>
+          <w:p>
+            <w:pPr/>
+            <w:r>
+              <w:t xml:space="preserve">-</w:t>
+            </w:r>
+          </w:p>
+        </w:tc>
+        <w:tc>
+          <w:tcPr>
+            <w:tcW w:w="2000" w:type="dxa"/>
+          </w:tcPr>
+          <w:p>
+            <w:pPr/>
+            <w:r>
+              <w:t xml:space="preserve">IS NULL</w:t>
+            </w:r>
+          </w:p>
+        </w:tc>
+      </w:tr>
+      <w:tr>
+        <w:trPr>
+          <w:trHeight w:val="530" w:hRule="atLeast"/>
+        </w:trPr>
+        <w:tc>
+          <w:tcPr>
+            <w:tcW w:w="2000" w:type="dxa"/>
+          </w:tcPr>
+          <w:p>
+            <w:pPr/>
+            <w:r>
+              <w:t xml:space="preserve">status</w:t>
+            </w:r>
+          </w:p>
+        </w:tc>
+        <w:tc>
+          <w:tcPr>
+            <w:tcW w:w="2000" w:type="dxa"/>
+          </w:tcPr>
+          <w:p>
+            <w:pPr/>
+            <w:r>
+              <w:t xml:space="preserve">varchar</w:t>
+            </w:r>
+          </w:p>
+        </w:tc>
+        <w:tc>
+          <w:tcPr>
+            <w:tcW w:w="2000" w:type="dxa"/>
+          </w:tcPr>
+          <w:p>
+            <w:pPr/>
+            <w:r>
+              <w:t xml:space="preserve">30</w:t>
+            </w:r>
+          </w:p>
+        </w:tc>
+        <w:tc>
+          <w:tcPr>
+            <w:tcW w:w="2000" w:type="dxa"/>
+          </w:tcPr>
+          <w:p>
+            <w:pPr/>
+            <w:r>
+              <w:t xml:space="preserve">NOT NULL</w:t>
+            </w:r>
+          </w:p>
+        </w:tc>
+      </w:tr>
+      <w:tr>
+        <w:trPr>
+          <w:trHeight w:val="530" w:hRule="atLeast"/>
+        </w:trPr>
+        <w:tc>
+          <w:tcPr>
+            <w:tcW w:w="2000" w:type="dxa"/>
+          </w:tcPr>
+          <w:p>
+            <w:pPr/>
+            <w:r>
+              <w:t xml:space="preserve">remark</w:t>
+            </w:r>
+          </w:p>
+        </w:tc>
+        <w:tc>
+          <w:tcPr>
+            <w:tcW w:w="2000" w:type="dxa"/>
+          </w:tcPr>
+          <w:p>
+            <w:pPr/>
+            <w:r>
+              <w:t xml:space="preserve">nvarchar</w:t>
+            </w:r>
+          </w:p>
+        </w:tc>
+        <w:tc>
+          <w:tcPr>
+            <w:tcW w:w="2000" w:type="dxa"/>
+          </w:tcPr>
+          <w:p>
+            <w:pPr/>
+            <w:r>
+              <w:t xml:space="preserve">500</w:t>
+            </w:r>
+          </w:p>
+        </w:tc>
+        <w:tc>
+          <w:tcPr>
+            <w:tcW w:w="2000" w:type="dxa"/>
+          </w:tcPr>
+          <w:p>
+            <w:pPr/>
+            <w:r>
+              <w:t xml:space="preserve">IS NULL</w:t>
+            </w:r>
+          </w:p>
+        </w:tc>
+      </w:tr>
+      <w:tr>
+        <w:trPr>
+          <w:trHeight w:val="530" w:hRule="atLeast"/>
+        </w:trPr>
+        <w:tc>
+          <w:tcPr>
+            <w:tcW w:w="2000" w:type="dxa"/>
+          </w:tcPr>
+          <w:p>
+            <w:pPr/>
+            <w:r>
+              <w:t xml:space="preserve">custom_fields</w:t>
+            </w:r>
+          </w:p>
+        </w:tc>
+        <w:tc>
+          <w:tcPr>
+            <w:tcW w:w="2000" w:type="dxa"/>
+          </w:tcPr>
+          <w:p>
+            <w:pPr/>
+            <w:r>
+              <w:t xml:space="preserve">nvarchar</w:t>
+            </w:r>
+          </w:p>
+        </w:tc>
+        <w:tc>
+          <w:tcPr>
+            <w:tcW w:w="2000" w:type="dxa"/>
+          </w:tcPr>
+          <w:p>
+            <w:pPr/>
+            <w:r>
+              <w:t xml:space="preserve">MAX</w:t>
+            </w:r>
+          </w:p>
+        </w:tc>
+        <w:tc>
+          <w:tcPr>
+            <w:tcW w:w="2000" w:type="dxa"/>
+          </w:tcPr>
+          <w:p>
+            <w:pPr/>
+            <w:r>
+              <w:t xml:space="preserve">IS NULL</w:t>
+            </w:r>
+          </w:p>
+        </w:tc>
+      </w:tr>
+      <w:tr>
+        <w:trPr>
+          <w:trHeight w:val="530" w:hRule="atLeast"/>
+        </w:trPr>
+        <w:tc>
+          <w:tcPr>
+            <w:tcW w:w="2000" w:type="dxa"/>
+          </w:tcPr>
+          <w:p>
+            <w:pPr/>
+            <w:r>
+              <w:t xml:space="preserve">is_deleted</w:t>
+            </w:r>
+          </w:p>
+        </w:tc>
+        <w:tc>
+          <w:tcPr>
+            <w:tcW w:w="2000" w:type="dxa"/>
+          </w:tcPr>
+          <w:p>
+            <w:pPr/>
+            <w:r>
+              <w:t xml:space="preserve">bit</w:t>
+            </w:r>
+          </w:p>
+        </w:tc>
+        <w:tc>
+          <w:tcPr>
+            <w:tcW w:w="2000" w:type="dxa"/>
+          </w:tcPr>
+          <w:p>
+            <w:pPr/>
+            <w:r>
+              <w:t xml:space="preserve">-</w:t>
+            </w:r>
+          </w:p>
+        </w:tc>
+        <w:tc>
+          <w:tcPr>
+            <w:tcW w:w="2000" w:type="dxa"/>
+          </w:tcPr>
+          <w:p>
+            <w:pPr/>
+            <w:r>
+              <w:t xml:space="preserve">NOT NULL</w:t>
+            </w:r>
+          </w:p>
+        </w:tc>
+      </w:tr>
+      <w:tr>
+        <w:trPr>
+          <w:trHeight w:val="530" w:hRule="atLeast"/>
+        </w:trPr>
+        <w:tc>
+          <w:tcPr>
+            <w:tcW w:w="2000" w:type="dxa"/>
+          </w:tcPr>
+          <w:p>
+            <w:pPr/>
+            <w:r>
+              <w:t xml:space="preserve">deleted_at</w:t>
+            </w:r>
+          </w:p>
+        </w:tc>
+        <w:tc>
+          <w:tcPr>
+            <w:tcW w:w="2000" w:type="dxa"/>
+          </w:tcPr>
+          <w:p>
+            <w:pPr/>
+            <w:r>
+              <w:t xml:space="preserve">datetime2</w:t>
+            </w:r>
+          </w:p>
+        </w:tc>
+        <w:tc>
+          <w:tcPr>
+            <w:tcW w:w="2000" w:type="dxa"/>
+          </w:tcPr>
+          <w:p>
+            <w:pPr/>
+            <w:r>
+              <w:t xml:space="preserve">(6)</w:t>
+            </w:r>
+          </w:p>
+        </w:tc>
+        <w:tc>
+          <w:tcPr>
+            <w:tcW w:w="2000" w:type="dxa"/>
+          </w:tcPr>
+          <w:p>
+            <w:pPr/>
+            <w:r>
+              <w:t xml:space="preserve">IS NULL</w:t>
+            </w:r>
+          </w:p>
+        </w:tc>
+      </w:tr>
+      <w:tr>
+        <w:trPr>
+          <w:trHeight w:val="530" w:hRule="atLeast"/>
+        </w:trPr>
+        <w:tc>
+          <w:tcPr>
+            <w:tcW w:w="2000" w:type="dxa"/>
+          </w:tcPr>
+          <w:p>
+            <w:pPr/>
+            <w:r>
+              <w:t xml:space="preserve">sent_at</w:t>
+            </w:r>
+          </w:p>
+        </w:tc>
+        <w:tc>
+          <w:tcPr>
+            <w:tcW w:w="2000" w:type="dxa"/>
+          </w:tcPr>
+          <w:p>
+            <w:pPr/>
+            <w:r>
+              <w:t xml:space="preserve">datetime2</w:t>
+            </w:r>
+          </w:p>
+        </w:tc>
+        <w:tc>
+          <w:tcPr>
+            <w:tcW w:w="2000" w:type="dxa"/>
+          </w:tcPr>
+          <w:p>
+            <w:pPr/>
+            <w:r>
+              <w:t xml:space="preserve">(6)</w:t>
+            </w:r>
+          </w:p>
+        </w:tc>
+        <w:tc>
+          <w:tcPr>
+            <w:tcW w:w="2000" w:type="dxa"/>
+          </w:tcPr>
+          <w:p>
+            <w:pPr/>
+            <w:r>
+              <w:t xml:space="preserve">IS NULL</w:t>
+            </w:r>
+          </w:p>
+        </w:tc>
+      </w:tr>
+      <w:tr>
+        <w:trPr>
+          <w:trHeight w:val="530" w:hRule="atLeast"/>
+        </w:trPr>
+        <w:tc>
+          <w:tcPr>
+            <w:tcW w:w="2000" w:type="dxa"/>
+          </w:tcPr>
+          <w:p>
+            <w:pPr/>
+            <w:r>
+              <w:t xml:space="preserve">company_id</w:t>
+            </w:r>
+          </w:p>
+        </w:tc>
+        <w:tc>
+          <w:tcPr>
+            <w:tcW w:w="2000" w:type="dxa"/>
+          </w:tcPr>
+          <w:p>
+            <w:pPr/>
+            <w:r>
+              <w:t xml:space="preserve">bigint</w:t>
+            </w:r>
+          </w:p>
+        </w:tc>
+        <w:tc>
+          <w:tcPr>
+            <w:tcW w:w="2000" w:type="dxa"/>
+          </w:tcPr>
+          <w:p>
+            <w:pPr/>
+            <w:r>
+              <w:t xml:space="preserve">-</w:t>
+            </w:r>
+          </w:p>
+        </w:tc>
+        <w:tc>
+          <w:tcPr>
+            <w:tcW w:w="2000" w:type="dxa"/>
+          </w:tcPr>
+          <w:p>
+            <w:pPr/>
+            <w:r>
+              <w:t xml:space="preserve">NOT NULL</w:t>
+            </w:r>
+          </w:p>
+        </w:tc>
+      </w:tr>
+      <w:tr>
+        <w:trPr>
+          <w:trHeight w:val="530" w:hRule="atLeast"/>
+        </w:trPr>
+        <w:tc>
+          <w:tcPr>
+            <w:tcW w:w="2000" w:type="dxa"/>
+          </w:tcPr>
+          <w:p>
+            <w:pPr/>
+            <w:r>
+              <w:t xml:space="preserve">created_at</w:t>
+            </w:r>
+          </w:p>
+        </w:tc>
+        <w:tc>
+          <w:tcPr>
+            <w:tcW w:w="2000" w:type="dxa"/>
+          </w:tcPr>
+          <w:p>
+            <w:pPr/>
+            <w:r>
+              <w:t xml:space="preserve">datetime2</w:t>
+            </w:r>
+          </w:p>
+        </w:tc>
+        <w:tc>
+          <w:tcPr>
+            <w:tcW w:w="2000" w:type="dxa"/>
+          </w:tcPr>
+          <w:p>
+            <w:pPr/>
+            <w:r>
+              <w:t xml:space="preserve">(6)</w:t>
+            </w:r>
+          </w:p>
+        </w:tc>
+        <w:tc>
+          <w:tcPr>
+            <w:tcW w:w="2000" w:type="dxa"/>
+          </w:tcPr>
+          <w:p>
+            <w:pPr/>
+            <w:r>
+              <w:t xml:space="preserve">NOT NULL</w:t>
+            </w:r>
+          </w:p>
+        </w:tc>
+      </w:tr>
+      <w:tr>
+        <w:trPr>
+          <w:trHeight w:val="530" w:hRule="atLeast"/>
+        </w:trPr>
+        <w:tc>
+          <w:tcPr>
+            <w:tcW w:w="2000" w:type="dxa"/>
+          </w:tcPr>
+          <w:p>
+            <w:pPr/>
+            <w:r>
+              <w:t xml:space="preserve">created_by</w:t>
+            </w:r>
+          </w:p>
+        </w:tc>
+        <w:tc>
+          <w:tcPr>
+            <w:tcW w:w="2000" w:type="dxa"/>
+          </w:tcPr>
+          <w:p>
+            <w:pPr/>
+            <w:r>
+              <w:t xml:space="preserve">bigint</w:t>
+            </w:r>
+          </w:p>
+        </w:tc>
+        <w:tc>
+          <w:tcPr>
+            <w:tcW w:w="2000" w:type="dxa"/>
+          </w:tcPr>
+          <w:p>
+            <w:pPr/>
+            <w:r>
+              <w:t xml:space="preserve">-</w:t>
+            </w:r>
+          </w:p>
+        </w:tc>
+        <w:tc>
+          <w:tcPr>
+            <w:tcW w:w="2000" w:type="dxa"/>
+          </w:tcPr>
+          <w:p>
+            <w:pPr/>
+            <w:r>
+              <w:t xml:space="preserve">NOT NULL</w:t>
+            </w:r>
+          </w:p>
+        </w:tc>
+      </w:tr>
+      <w:tr>
+        <w:trPr>
+          <w:trHeight w:val="530" w:hRule="atLeast"/>
+        </w:trPr>
+        <w:tc>
+          <w:tcPr>
+            <w:tcW w:w="2000" w:type="dxa"/>
+          </w:tcPr>
+          <w:p>
+            <w:pPr/>
+            <w:r>
+              <w:t xml:space="preserve">updated_at</w:t>
+            </w:r>
+          </w:p>
+        </w:tc>
+        <w:tc>
+          <w:tcPr>
+            <w:tcW w:w="2000" w:type="dxa"/>
+          </w:tcPr>
+          <w:p>
+            <w:pPr/>
+            <w:r>
+              <w:t xml:space="preserve">datetime2</w:t>
+            </w:r>
+          </w:p>
+        </w:tc>
+        <w:tc>
+          <w:tcPr>
+            <w:tcW w:w="2000" w:type="dxa"/>
+          </w:tcPr>
+          <w:p>
+            <w:pPr/>
+            <w:r>
+              <w:t xml:space="preserve">(6)</w:t>
+            </w:r>
+          </w:p>
+        </w:tc>
+        <w:tc>
+          <w:tcPr>
+            <w:tcW w:w="2000" w:type="dxa"/>
+          </w:tcPr>
+          <w:p>
+            <w:pPr/>
+            <w:r>
+              <w:t xml:space="preserve">IS NULL</w:t>
+            </w:r>
+          </w:p>
+        </w:tc>
+      </w:tr>
+      <w:tr>
+        <w:trPr>
+          <w:trHeight w:val="530" w:hRule="atLeast"/>
+        </w:trPr>
+        <w:tc>
+          <w:tcPr>
+            <w:tcW w:w="2000" w:type="dxa"/>
+          </w:tcPr>
+          <w:p>
+            <w:pPr/>
+            <w:r>
+              <w:t xml:space="preserve">updated_by</w:t>
+            </w:r>
+          </w:p>
+        </w:tc>
+        <w:tc>
+          <w:tcPr>
+            <w:tcW w:w="2000" w:type="dxa"/>
+          </w:tcPr>
+          <w:p>
+            <w:pPr/>
+            <w:r>
+              <w:t xml:space="preserve">bigint</w:t>
+            </w:r>
+          </w:p>
+        </w:tc>
+        <w:tc>
+          <w:tcPr>
+            <w:tcW w:w="2000" w:type="dxa"/>
+          </w:tcPr>
+          <w:p>
+            <w:pPr/>
+            <w:r>
+              <w:t xml:space="preserve">-</w:t>
+            </w:r>
+          </w:p>
+        </w:tc>
+        <w:tc>
+          <w:tcPr>
+            <w:tcW w:w="2000" w:type="dxa"/>
+          </w:tcPr>
+          <w:p>
+            <w:pPr/>
+            <w:r>
+              <w:t xml:space="preserve">IS NULL</w:t>
+            </w:r>
+          </w:p>
+        </w:tc>
+      </w:tr>
+      <w:tr>
+        <w:trPr>
+          <w:trHeight w:val="530" w:hRule="atLeast"/>
+        </w:trPr>
+        <w:tc>
+          <w:tcPr>
+            <w:tcW w:w="2000" w:type="dxa"/>
+          </w:tcPr>
+          <w:p>
+            <w:pPr/>
+            <w:r>
+              <w:t xml:space="preserve">version</w:t>
+            </w:r>
+          </w:p>
+        </w:tc>
+        <w:tc>
+          <w:tcPr>
+            <w:tcW w:w="2000" w:type="dxa"/>
+          </w:tcPr>
+          <w:p>
+            <w:pPr/>
+            <w:r>
+              <w:t xml:space="preserve">int</w:t>
+            </w:r>
+          </w:p>
+        </w:tc>
+        <w:tc>
+          <w:tcPr>
+            <w:tcW w:w="2000" w:type="dxa"/>
+          </w:tcPr>
+          <w:p>
+            <w:pPr/>
+            <w:r>
+              <w:t xml:space="preserve">-</w:t>
+            </w:r>
+          </w:p>
+        </w:tc>
+        <w:tc>
+          <w:tcPr>
+            <w:tcW w:w="2000" w:type="dxa"/>
+          </w:tcPr>
+          <w:p>
+            <w:pPr/>
+            <w:r>
+              <w:t xml:space="preserve">NOT NULL</w:t>
+            </w:r>
+          </w:p>
+        </w:tc>
+      </w:tr>
+    </w:tbl>
+    <w:p/>
+    <w:p>
+      <w:pPr/>
+      <w:r>
+        <w:t xml:space="preserve">Table Name: pur_rfq_invitation</w:t>
+      </w:r>
+    </w:p>
+    <w:p>
+      <w:pPr/>
+      <w:r>
+        <w:t xml:space="preserve">Primary Key: id</w:t>
+      </w:r>
+    </w:p>
+    <w:p>
+      <w:pPr/>
+      <w:r>
+        <w:t xml:space="preserve">This table stores invited supplier IDs and send-time name snapshots.</w:t>
+      </w:r>
+    </w:p>
+    <w:tbl>
+      <w:tblPr>
+        <w:tblStyle w:val="TableGrid"/>
+        <w:tblW w:w="8000" w:type="dxa"/>
+        <w:jc w:val="left"/>
+        <w:tblBorders>
+          <w:top w:val="single" w:color="000000" w:sz="4" w:space="0"/>
+          <w:left w:val="single" w:color="000000" w:sz="4" w:space="0"/>
+          <w:bottom w:val="single" w:color="000000" w:sz="4" w:space="0"/>
+          <w:right w:val="single" w:color="000000" w:sz="4" w:space="0"/>
+          <w:insideH w:val="single" w:color="000000" w:sz="4" w:space="0"/>
+          <w:insideV w:val="single" w:color="000000" w:sz="4" w:space="0"/>
+        </w:tblBorders>
+        <w:tblLayout w:type="fixed"/>
+        <w:tblCellMar>
+          <w:top w:w="100" w:type="dxa"/>
+          <w:left w:w="100" w:type="dxa"/>
+          <w:bottom w:w="100" w:type="dxa"/>
+          <w:right w:w="100" w:type="dxa"/>
+        </w:tblCellMar>
+      </w:tblPr>
+      <w:tblGrid>
+        <w:gridCol w:w="2000"/>
+        <w:gridCol w:w="2000"/>
+        <w:gridCol w:w="2000"/>
+        <w:gridCol w:w="2000"/>
+      </w:tblGrid>
+      <w:tr>
+        <w:trPr>
+          <w:trHeight w:val="530" w:hRule="atLeast"/>
+        </w:trPr>
+        <w:tc>
+          <w:tcPr>
+            <w:tcW w:w="2000" w:type="dxa"/>
+          </w:tcPr>
+          <w:p>
+            <w:pPr>
+              <w:jc w:val="center"/>
+            </w:pPr>
+            <w:r>
+              <w:rPr>
+                <w:b/>
+              </w:rPr>
+              <w:t xml:space="preserve">Name of Attribute</w:t>
+            </w:r>
+          </w:p>
+        </w:tc>
+        <w:tc>
+          <w:tcPr>
+            <w:tcW w:w="2000" w:type="dxa"/>
+          </w:tcPr>
+          <w:p>
+            <w:pPr>
+              <w:jc w:val="center"/>
+            </w:pPr>
+            <w:r>
+              <w:rPr>
+                <w:b/>
+              </w:rPr>
+              <w:t xml:space="preserve">Data Type</w:t>
+            </w:r>
+          </w:p>
+        </w:tc>
+        <w:tc>
+          <w:tcPr>
+            <w:tcW w:w="2000" w:type="dxa"/>
+          </w:tcPr>
+          <w:p>
+            <w:pPr>
+              <w:jc w:val="center"/>
+            </w:pPr>
+            <w:r>
+              <w:rPr>
+                <w:b/>
+              </w:rPr>
+              <w:t xml:space="preserve">Size</w:t>
+            </w:r>
+          </w:p>
+        </w:tc>
+        <w:tc>
+          <w:tcPr>
+            <w:tcW w:w="2000" w:type="dxa"/>
+          </w:tcPr>
+          <w:p>
+            <w:pPr>
+              <w:jc w:val="center"/>
+            </w:pPr>
+            <w:r>
+              <w:rPr>
+                <w:b/>
+              </w:rPr>
+              <w:t xml:space="preserve">PK/FK/IS NULL/ NOT NULL</w:t>
+            </w:r>
+          </w:p>
+        </w:tc>
+      </w:tr>
+      <w:tr>
+        <w:trPr>
+          <w:trHeight w:val="530" w:hRule="atLeast"/>
+        </w:trPr>
+        <w:tc>
+          <w:tcPr>
+            <w:tcW w:w="2000" w:type="dxa"/>
+          </w:tcPr>
+          <w:p>
+            <w:pPr/>
+            <w:r>
+              <w:t xml:space="preserve">id</w:t>
+            </w:r>
+          </w:p>
+        </w:tc>
+        <w:tc>
+          <w:tcPr>
+            <w:tcW w:w="2000" w:type="dxa"/>
+          </w:tcPr>
+          <w:p>
+            <w:pPr/>
+            <w:r>
+              <w:t xml:space="preserve">bigint</w:t>
+            </w:r>
+          </w:p>
+        </w:tc>
+        <w:tc>
+          <w:tcPr>
+            <w:tcW w:w="2000" w:type="dxa"/>
+          </w:tcPr>
+          <w:p>
+            <w:pPr/>
+            <w:r>
+              <w:t xml:space="preserve">-</w:t>
+            </w:r>
+          </w:p>
+        </w:tc>
+        <w:tc>
+          <w:tcPr>
+            <w:tcW w:w="2000" w:type="dxa"/>
+          </w:tcPr>
+          <w:p>
+            <w:pPr/>
+            <w:r>
+              <w:t xml:space="preserve">PK, NOT NULL</w:t>
+            </w:r>
+          </w:p>
+        </w:tc>
+      </w:tr>
+      <w:tr>
+        <w:trPr>
+          <w:trHeight w:val="530" w:hRule="atLeast"/>
+        </w:trPr>
+        <w:tc>
+          <w:tcPr>
+            <w:tcW w:w="2000" w:type="dxa"/>
+          </w:tcPr>
+          <w:p>
+            <w:pPr/>
+            <w:r>
+              <w:t xml:space="preserve">rfq_id</w:t>
+            </w:r>
+          </w:p>
+        </w:tc>
+        <w:tc>
+          <w:tcPr>
+            <w:tcW w:w="2000" w:type="dxa"/>
+          </w:tcPr>
+          <w:p>
+            <w:pPr/>
+            <w:r>
+              <w:t xml:space="preserve">bigint</w:t>
+            </w:r>
+          </w:p>
+        </w:tc>
+        <w:tc>
+          <w:tcPr>
+            <w:tcW w:w="2000" w:type="dxa"/>
+          </w:tcPr>
+          <w:p>
+            <w:pPr/>
+            <w:r>
+              <w:t xml:space="preserve">-</w:t>
+            </w:r>
+          </w:p>
+        </w:tc>
+        <w:tc>
+          <w:tcPr>
+            <w:tcW w:w="2000" w:type="dxa"/>
+          </w:tcPr>
+          <w:p>
+            <w:pPr/>
+            <w:r>
+              <w:t xml:space="preserve">FK, NOT NULL</w:t>
+            </w:r>
+          </w:p>
+        </w:tc>
+      </w:tr>
+      <w:tr>
+        <w:trPr>
+          <w:trHeight w:val="530" w:hRule="atLeast"/>
+        </w:trPr>
+        <w:tc>
+          <w:tcPr>
+            <w:tcW w:w="2000" w:type="dxa"/>
+          </w:tcPr>
+          <w:p>
+            <w:pPr/>
+            <w:r>
+              <w:t xml:space="preserve">supplier_id</w:t>
+            </w:r>
+          </w:p>
+        </w:tc>
+        <w:tc>
+          <w:tcPr>
+            <w:tcW w:w="2000" w:type="dxa"/>
+          </w:tcPr>
+          <w:p>
+            <w:pPr/>
+            <w:r>
+              <w:t xml:space="preserve">bigint</w:t>
+            </w:r>
+          </w:p>
+        </w:tc>
+        <w:tc>
+          <w:tcPr>
+            <w:tcW w:w="2000" w:type="dxa"/>
+          </w:tcPr>
+          <w:p>
+            <w:pPr/>
+            <w:r>
+              <w:t xml:space="preserve">-</w:t>
+            </w:r>
+          </w:p>
+        </w:tc>
+        <w:tc>
+          <w:tcPr>
+            <w:tcW w:w="2000" w:type="dxa"/>
+          </w:tcPr>
+          <w:p>
+            <w:pPr/>
+            <w:r>
+              <w:t xml:space="preserve">NOT NULL</w:t>
+            </w:r>
+          </w:p>
+        </w:tc>
+      </w:tr>
+      <w:tr>
+        <w:trPr>
+          <w:trHeight w:val="530" w:hRule="atLeast"/>
+        </w:trPr>
+        <w:tc>
+          <w:tcPr>
+            <w:tcW w:w="2000" w:type="dxa"/>
+          </w:tcPr>
+          <w:p>
+            <w:pPr/>
+            <w:r>
+              <w:t xml:space="preserve">supplier_code_snapshot</w:t>
+            </w:r>
+          </w:p>
+        </w:tc>
+        <w:tc>
+          <w:tcPr>
+            <w:tcW w:w="2000" w:type="dxa"/>
+          </w:tcPr>
+          <w:p>
+            <w:pPr/>
+            <w:r>
+              <w:t xml:space="preserve">varchar</w:t>
+            </w:r>
+          </w:p>
+        </w:tc>
+        <w:tc>
+          <w:tcPr>
+            <w:tcW w:w="2000" w:type="dxa"/>
+          </w:tcPr>
+          <w:p>
+            <w:pPr/>
+            <w:r>
+              <w:t xml:space="preserve">30</w:t>
+            </w:r>
+          </w:p>
+        </w:tc>
+        <w:tc>
+          <w:tcPr>
+            <w:tcW w:w="2000" w:type="dxa"/>
+          </w:tcPr>
+          <w:p>
+            <w:pPr/>
+            <w:r>
+              <w:t xml:space="preserve">IS NULL</w:t>
+            </w:r>
+          </w:p>
+        </w:tc>
+      </w:tr>
+      <w:tr>
+        <w:trPr>
+          <w:trHeight w:val="530" w:hRule="atLeast"/>
+        </w:trPr>
+        <w:tc>
+          <w:tcPr>
+            <w:tcW w:w="2000" w:type="dxa"/>
+          </w:tcPr>
+          <w:p>
+            <w:pPr/>
+            <w:r>
+              <w:t xml:space="preserve">supplier_name_snapshot</w:t>
+            </w:r>
+          </w:p>
+        </w:tc>
+        <w:tc>
+          <w:tcPr>
+            <w:tcW w:w="2000" w:type="dxa"/>
+          </w:tcPr>
+          <w:p>
+            <w:pPr/>
+            <w:r>
+              <w:t xml:space="preserve">nvarchar</w:t>
+            </w:r>
+          </w:p>
+        </w:tc>
+        <w:tc>
+          <w:tcPr>
+            <w:tcW w:w="2000" w:type="dxa"/>
+          </w:tcPr>
+          <w:p>
+            <w:pPr/>
+            <w:r>
+              <w:t xml:space="preserve">200</w:t>
+            </w:r>
+          </w:p>
+        </w:tc>
+        <w:tc>
+          <w:tcPr>
+            <w:tcW w:w="2000" w:type="dxa"/>
+          </w:tcPr>
+          <w:p>
+            <w:pPr/>
+            <w:r>
+              <w:t xml:space="preserve">IS NULL</w:t>
+            </w:r>
+          </w:p>
+        </w:tc>
+      </w:tr>
+      <w:tr>
+        <w:trPr>
+          <w:trHeight w:val="530" w:hRule="atLeast"/>
+        </w:trPr>
+        <w:tc>
+          <w:tcPr>
+            <w:tcW w:w="2000" w:type="dxa"/>
+          </w:tcPr>
+          <w:p>
+            <w:pPr/>
+            <w:r>
+              <w:t xml:space="preserve">sent_at</w:t>
+            </w:r>
+          </w:p>
+        </w:tc>
+        <w:tc>
+          <w:tcPr>
+            <w:tcW w:w="2000" w:type="dxa"/>
+          </w:tcPr>
+          <w:p>
+            <w:pPr/>
+            <w:r>
+              <w:t xml:space="preserve">datetime2</w:t>
+            </w:r>
+          </w:p>
+        </w:tc>
+        <w:tc>
+          <w:tcPr>
+            <w:tcW w:w="2000" w:type="dxa"/>
+          </w:tcPr>
+          <w:p>
+            <w:pPr/>
+            <w:r>
+              <w:t xml:space="preserve">(6)</w:t>
+            </w:r>
+          </w:p>
+        </w:tc>
+        <w:tc>
+          <w:tcPr>
+            <w:tcW w:w="2000" w:type="dxa"/>
+          </w:tcPr>
+          <w:p>
+            <w:pPr/>
+            <w:r>
+              <w:t xml:space="preserve">IS NULL</w:t>
+            </w:r>
+          </w:p>
+        </w:tc>
+      </w:tr>
+      <w:tr>
+        <w:trPr>
+          <w:trHeight w:val="530" w:hRule="atLeast"/>
+        </w:trPr>
+        <w:tc>
+          <w:tcPr>
+            <w:tcW w:w="2000" w:type="dxa"/>
+          </w:tcPr>
+          <w:p>
+            <w:pPr/>
+            <w:r>
+              <w:t xml:space="preserve">company_id</w:t>
+            </w:r>
+          </w:p>
+        </w:tc>
+        <w:tc>
+          <w:tcPr>
+            <w:tcW w:w="2000" w:type="dxa"/>
+          </w:tcPr>
+          <w:p>
+            <w:pPr/>
+            <w:r>
+              <w:t xml:space="preserve">bigint</w:t>
+            </w:r>
+          </w:p>
+        </w:tc>
+        <w:tc>
+          <w:tcPr>
+            <w:tcW w:w="2000" w:type="dxa"/>
+          </w:tcPr>
+          <w:p>
+            <w:pPr/>
+            <w:r>
+              <w:t xml:space="preserve">-</w:t>
+            </w:r>
+          </w:p>
+        </w:tc>
+        <w:tc>
+          <w:tcPr>
+            <w:tcW w:w="2000" w:type="dxa"/>
+          </w:tcPr>
+          <w:p>
+            <w:pPr/>
+            <w:r>
+              <w:t xml:space="preserve">FK, NOT NULL</w:t>
+            </w:r>
+          </w:p>
+        </w:tc>
+      </w:tr>
+      <w:tr>
+        <w:trPr>
+          <w:trHeight w:val="530" w:hRule="atLeast"/>
+        </w:trPr>
+        <w:tc>
+          <w:tcPr>
+            <w:tcW w:w="2000" w:type="dxa"/>
+          </w:tcPr>
+          <w:p>
+            <w:pPr/>
+            <w:r>
+              <w:t xml:space="preserve">created_at</w:t>
+            </w:r>
+          </w:p>
+        </w:tc>
+        <w:tc>
+          <w:tcPr>
+            <w:tcW w:w="2000" w:type="dxa"/>
+          </w:tcPr>
+          <w:p>
+            <w:pPr/>
+            <w:r>
+              <w:t xml:space="preserve">datetime2</w:t>
+            </w:r>
+          </w:p>
+        </w:tc>
+        <w:tc>
+          <w:tcPr>
+            <w:tcW w:w="2000" w:type="dxa"/>
+          </w:tcPr>
+          <w:p>
+            <w:pPr/>
+            <w:r>
+              <w:t xml:space="preserve">(6)</w:t>
+            </w:r>
+          </w:p>
+        </w:tc>
+        <w:tc>
+          <w:tcPr>
+            <w:tcW w:w="2000" w:type="dxa"/>
+          </w:tcPr>
+          <w:p>
+            <w:pPr/>
+            <w:r>
+              <w:t xml:space="preserve">NOT NULL</w:t>
+            </w:r>
+          </w:p>
+        </w:tc>
+      </w:tr>
+      <w:tr>
+        <w:trPr>
+          <w:trHeight w:val="530" w:hRule="atLeast"/>
+        </w:trPr>
+        <w:tc>
+          <w:tcPr>
+            <w:tcW w:w="2000" w:type="dxa"/>
+          </w:tcPr>
+          <w:p>
+            <w:pPr/>
+            <w:r>
+              <w:t xml:space="preserve">created_by</w:t>
+            </w:r>
+          </w:p>
+        </w:tc>
+        <w:tc>
+          <w:tcPr>
+            <w:tcW w:w="2000" w:type="dxa"/>
+          </w:tcPr>
+          <w:p>
+            <w:pPr/>
+            <w:r>
+              <w:t xml:space="preserve">bigint</w:t>
+            </w:r>
+          </w:p>
+        </w:tc>
+        <w:tc>
+          <w:tcPr>
+            <w:tcW w:w="2000" w:type="dxa"/>
+          </w:tcPr>
+          <w:p>
+            <w:pPr/>
+            <w:r>
+              <w:t xml:space="preserve">-</w:t>
+            </w:r>
+          </w:p>
+        </w:tc>
+        <w:tc>
+          <w:tcPr>
+            <w:tcW w:w="2000" w:type="dxa"/>
+          </w:tcPr>
+          <w:p>
+            <w:pPr/>
+            <w:r>
+              <w:t xml:space="preserve">NOT NULL</w:t>
+            </w:r>
+          </w:p>
+        </w:tc>
+      </w:tr>
+      <w:tr>
+        <w:trPr>
+          <w:trHeight w:val="530" w:hRule="atLeast"/>
+        </w:trPr>
+        <w:tc>
+          <w:tcPr>
+            <w:tcW w:w="2000" w:type="dxa"/>
+          </w:tcPr>
+          <w:p>
+            <w:pPr/>
+            <w:r>
+              <w:t xml:space="preserve">updated_at</w:t>
+            </w:r>
+          </w:p>
+        </w:tc>
+        <w:tc>
+          <w:tcPr>
+            <w:tcW w:w="2000" w:type="dxa"/>
+          </w:tcPr>
+          <w:p>
+            <w:pPr/>
+            <w:r>
+              <w:t xml:space="preserve">datetime2</w:t>
+            </w:r>
+          </w:p>
+        </w:tc>
+        <w:tc>
+          <w:tcPr>
+            <w:tcW w:w="2000" w:type="dxa"/>
+          </w:tcPr>
+          <w:p>
+            <w:pPr/>
+            <w:r>
+              <w:t xml:space="preserve">(6)</w:t>
+            </w:r>
+          </w:p>
+        </w:tc>
+        <w:tc>
+          <w:tcPr>
+            <w:tcW w:w="2000" w:type="dxa"/>
+          </w:tcPr>
+          <w:p>
+            <w:pPr/>
+            <w:r>
+              <w:t xml:space="preserve">IS NULL</w:t>
+            </w:r>
+          </w:p>
+        </w:tc>
+      </w:tr>
+      <w:tr>
+        <w:trPr>
+          <w:trHeight w:val="530" w:hRule="atLeast"/>
+        </w:trPr>
+        <w:tc>
+          <w:tcPr>
+            <w:tcW w:w="2000" w:type="dxa"/>
+          </w:tcPr>
+          <w:p>
+            <w:pPr/>
+            <w:r>
+              <w:t xml:space="preserve">updated_by</w:t>
+            </w:r>
+          </w:p>
+        </w:tc>
+        <w:tc>
+          <w:tcPr>
+            <w:tcW w:w="2000" w:type="dxa"/>
+          </w:tcPr>
+          <w:p>
+            <w:pPr/>
+            <w:r>
+              <w:t xml:space="preserve">bigint</w:t>
+            </w:r>
+          </w:p>
+        </w:tc>
+        <w:tc>
+          <w:tcPr>
+            <w:tcW w:w="2000" w:type="dxa"/>
+          </w:tcPr>
+          <w:p>
+            <w:pPr/>
+            <w:r>
+              <w:t xml:space="preserve">-</w:t>
+            </w:r>
+          </w:p>
+        </w:tc>
+        <w:tc>
+          <w:tcPr>
+            <w:tcW w:w="2000" w:type="dxa"/>
+          </w:tcPr>
+          <w:p>
+            <w:pPr/>
+            <w:r>
+              <w:t xml:space="preserve">IS NULL</w:t>
+            </w:r>
+          </w:p>
+        </w:tc>
+      </w:tr>
+      <w:tr>
+        <w:trPr>
+          <w:trHeight w:val="530" w:hRule="atLeast"/>
+        </w:trPr>
+        <w:tc>
+          <w:tcPr>
+            <w:tcW w:w="2000" w:type="dxa"/>
+          </w:tcPr>
+          <w:p>
+            <w:pPr/>
+            <w:r>
+              <w:t xml:space="preserve">version</w:t>
+            </w:r>
+          </w:p>
+        </w:tc>
+        <w:tc>
+          <w:tcPr>
+            <w:tcW w:w="2000" w:type="dxa"/>
+          </w:tcPr>
+          <w:p>
+            <w:pPr/>
+            <w:r>
+              <w:t xml:space="preserve">int</w:t>
+            </w:r>
+          </w:p>
+        </w:tc>
+        <w:tc>
+          <w:tcPr>
+            <w:tcW w:w="2000" w:type="dxa"/>
+          </w:tcPr>
+          <w:p>
+            <w:pPr/>
+            <w:r>
+              <w:t xml:space="preserve">-</w:t>
+            </w:r>
+          </w:p>
+        </w:tc>
+        <w:tc>
+          <w:tcPr>
+            <w:tcW w:w="2000" w:type="dxa"/>
+          </w:tcPr>
+          <w:p>
+            <w:pPr/>
+            <w:r>
+              <w:t xml:space="preserve">NOT NULL</w:t>
+            </w:r>
+          </w:p>
+        </w:tc>
+      </w:tr>
+    </w:tbl>
+    <w:p/>
+    <w:p>
+      <w:pPr/>
+      <w:r>
+        <w:t xml:space="preserve">Table Name: pur_rfq_line</w:t>
+      </w:r>
+    </w:p>
+    <w:p>
+      <w:pPr/>
+      <w:r>
+        <w:t xml:space="preserve">Primary Key: id</w:t>
+      </w:r>
+    </w:p>
+    <w:p>
+      <w:pPr/>
+      <w:r>
+        <w:t xml:space="preserve">This table stores item demand, quantities and optional requisition line references for requests for quotation.</w:t>
+      </w:r>
+    </w:p>
+    <w:tbl>
+      <w:tblPr>
+        <w:tblStyle w:val="TableGrid"/>
+        <w:tblW w:w="8000" w:type="dxa"/>
+        <w:jc w:val="left"/>
+        <w:tblBorders>
+          <w:top w:val="single" w:color="000000" w:sz="4" w:space="0"/>
+          <w:left w:val="single" w:color="000000" w:sz="4" w:space="0"/>
+          <w:bottom w:val="single" w:color="000000" w:sz="4" w:space="0"/>
+          <w:right w:val="single" w:color="000000" w:sz="4" w:space="0"/>
+          <w:insideH w:val="single" w:color="000000" w:sz="4" w:space="0"/>
+          <w:insideV w:val="single" w:color="000000" w:sz="4" w:space="0"/>
+        </w:tblBorders>
+        <w:tblLayout w:type="fixed"/>
+        <w:tblCellMar>
+          <w:top w:w="100" w:type="dxa"/>
+          <w:left w:w="100" w:type="dxa"/>
+          <w:bottom w:w="100" w:type="dxa"/>
+          <w:right w:w="100" w:type="dxa"/>
+        </w:tblCellMar>
+      </w:tblPr>
+      <w:tblGrid>
+        <w:gridCol w:w="2000"/>
+        <w:gridCol w:w="2000"/>
+        <w:gridCol w:w="2000"/>
+        <w:gridCol w:w="2000"/>
+      </w:tblGrid>
+      <w:tr>
+        <w:trPr>
+          <w:trHeight w:val="530" w:hRule="atLeast"/>
+        </w:trPr>
+        <w:tc>
+          <w:tcPr>
+            <w:tcW w:w="2000" w:type="dxa"/>
+          </w:tcPr>
+          <w:p>
+            <w:pPr>
+              <w:jc w:val="center"/>
+            </w:pPr>
+            <w:r>
+              <w:rPr>
+                <w:b/>
+              </w:rPr>
+              <w:t xml:space="preserve">Name of Attribute</w:t>
+            </w:r>
+          </w:p>
+        </w:tc>
+        <w:tc>
+          <w:tcPr>
+            <w:tcW w:w="2000" w:type="dxa"/>
+          </w:tcPr>
+          <w:p>
+            <w:pPr>
+              <w:jc w:val="center"/>
+            </w:pPr>
+            <w:r>
+              <w:rPr>
+                <w:b/>
+              </w:rPr>
+              <w:t xml:space="preserve">Data Type</w:t>
+            </w:r>
+          </w:p>
+        </w:tc>
+        <w:tc>
+          <w:tcPr>
+            <w:tcW w:w="2000" w:type="dxa"/>
+          </w:tcPr>
+          <w:p>
+            <w:pPr>
+              <w:jc w:val="center"/>
+            </w:pPr>
+            <w:r>
+              <w:rPr>
+                <w:b/>
+              </w:rPr>
+              <w:t xml:space="preserve">Size</w:t>
+            </w:r>
+          </w:p>
+        </w:tc>
+        <w:tc>
+          <w:tcPr>
+            <w:tcW w:w="2000" w:type="dxa"/>
+          </w:tcPr>
+          <w:p>
+            <w:pPr>
+              <w:jc w:val="center"/>
+            </w:pPr>
+            <w:r>
+              <w:rPr>
+                <w:b/>
+              </w:rPr>
+              <w:t xml:space="preserve">PK/FK/IS NULL/ NOT NULL</w:t>
+            </w:r>
+          </w:p>
+        </w:tc>
+      </w:tr>
+      <w:tr>
+        <w:trPr>
+          <w:trHeight w:val="530" w:hRule="atLeast"/>
+        </w:trPr>
+        <w:tc>
+          <w:tcPr>
+            <w:tcW w:w="2000" w:type="dxa"/>
+          </w:tcPr>
+          <w:p>
+            <w:pPr/>
+            <w:r>
+              <w:t xml:space="preserve">id</w:t>
+            </w:r>
+          </w:p>
+        </w:tc>
+        <w:tc>
+          <w:tcPr>
+            <w:tcW w:w="2000" w:type="dxa"/>
+          </w:tcPr>
+          <w:p>
+            <w:pPr/>
+            <w:r>
+              <w:t xml:space="preserve">bigint</w:t>
+            </w:r>
+          </w:p>
+        </w:tc>
+        <w:tc>
+          <w:tcPr>
+            <w:tcW w:w="2000" w:type="dxa"/>
+          </w:tcPr>
+          <w:p>
+            <w:pPr/>
+            <w:r>
+              <w:t xml:space="preserve">-</w:t>
+            </w:r>
+          </w:p>
+        </w:tc>
+        <w:tc>
+          <w:tcPr>
+            <w:tcW w:w="2000" w:type="dxa"/>
+          </w:tcPr>
+          <w:p>
+            <w:pPr/>
+            <w:r>
+              <w:t xml:space="preserve">PK, NOT NULL</w:t>
+            </w:r>
+          </w:p>
+        </w:tc>
+      </w:tr>
+      <w:tr>
+        <w:trPr>
+          <w:trHeight w:val="530" w:hRule="atLeast"/>
+        </w:trPr>
+        <w:tc>
+          <w:tcPr>
+            <w:tcW w:w="2000" w:type="dxa"/>
+          </w:tcPr>
+          <w:p>
+            <w:pPr/>
+            <w:r>
+              <w:t xml:space="preserve">rfq_id</w:t>
+            </w:r>
+          </w:p>
+        </w:tc>
+        <w:tc>
+          <w:tcPr>
+            <w:tcW w:w="2000" w:type="dxa"/>
+          </w:tcPr>
+          <w:p>
+            <w:pPr/>
+            <w:r>
+              <w:t xml:space="preserve">bigint</w:t>
+            </w:r>
+          </w:p>
+        </w:tc>
+        <w:tc>
+          <w:tcPr>
+            <w:tcW w:w="2000" w:type="dxa"/>
+          </w:tcPr>
+          <w:p>
+            <w:pPr/>
+            <w:r>
+              <w:t xml:space="preserve">-</w:t>
+            </w:r>
+          </w:p>
+        </w:tc>
+        <w:tc>
+          <w:tcPr>
+            <w:tcW w:w="2000" w:type="dxa"/>
+          </w:tcPr>
+          <w:p>
+            <w:pPr/>
+            <w:r>
+              <w:t xml:space="preserve">FK, NOT NULL</w:t>
+            </w:r>
+          </w:p>
+        </w:tc>
+      </w:tr>
+      <w:tr>
+        <w:trPr>
+          <w:trHeight w:val="530" w:hRule="atLeast"/>
+        </w:trPr>
+        <w:tc>
+          <w:tcPr>
+            <w:tcW w:w="2000" w:type="dxa"/>
+          </w:tcPr>
+          <w:p>
+            <w:pPr/>
+            <w:r>
+              <w:t xml:space="preserve">line_no</w:t>
+            </w:r>
+          </w:p>
+        </w:tc>
+        <w:tc>
+          <w:tcPr>
+            <w:tcW w:w="2000" w:type="dxa"/>
+          </w:tcPr>
+          <w:p>
+            <w:pPr/>
+            <w:r>
+              <w:t xml:space="preserve">int</w:t>
+            </w:r>
+          </w:p>
+        </w:tc>
+        <w:tc>
+          <w:tcPr>
+            <w:tcW w:w="2000" w:type="dxa"/>
+          </w:tcPr>
+          <w:p>
+            <w:pPr/>
+            <w:r>
+              <w:t xml:space="preserve">-</w:t>
+            </w:r>
+          </w:p>
+        </w:tc>
+        <w:tc>
+          <w:tcPr>
+            <w:tcW w:w="2000" w:type="dxa"/>
+          </w:tcPr>
+          <w:p>
+            <w:pPr/>
+            <w:r>
+              <w:t xml:space="preserve">NOT NULL</w:t>
+            </w:r>
+          </w:p>
+        </w:tc>
+      </w:tr>
+      <w:tr>
+        <w:trPr>
+          <w:trHeight w:val="530" w:hRule="atLeast"/>
+        </w:trPr>
+        <w:tc>
+          <w:tcPr>
+            <w:tcW w:w="2000" w:type="dxa"/>
+          </w:tcPr>
+          <w:p>
+            <w:pPr/>
+            <w:r>
+              <w:t xml:space="preserve">item_id</w:t>
+            </w:r>
+          </w:p>
+        </w:tc>
+        <w:tc>
+          <w:tcPr>
+            <w:tcW w:w="2000" w:type="dxa"/>
+          </w:tcPr>
+          <w:p>
+            <w:pPr/>
+            <w:r>
+              <w:t xml:space="preserve">bigint</w:t>
+            </w:r>
+          </w:p>
+        </w:tc>
+        <w:tc>
+          <w:tcPr>
+            <w:tcW w:w="2000" w:type="dxa"/>
+          </w:tcPr>
+          <w:p>
+            <w:pPr/>
+            <w:r>
+              <w:t xml:space="preserve">-</w:t>
+            </w:r>
+          </w:p>
+        </w:tc>
+        <w:tc>
+          <w:tcPr>
+            <w:tcW w:w="2000" w:type="dxa"/>
+          </w:tcPr>
+          <w:p>
+            <w:pPr/>
+            <w:r>
+              <w:t xml:space="preserve">NOT NULL</w:t>
+            </w:r>
+          </w:p>
+        </w:tc>
+      </w:tr>
+      <w:tr>
+        <w:trPr>
+          <w:trHeight w:val="530" w:hRule="atLeast"/>
+        </w:trPr>
+        <w:tc>
+          <w:tcPr>
+            <w:tcW w:w="2000" w:type="dxa"/>
+          </w:tcPr>
+          <w:p>
+            <w:pPr/>
+            <w:r>
+              <w:t xml:space="preserve">requisition_line_id</w:t>
+            </w:r>
+          </w:p>
+        </w:tc>
+        <w:tc>
+          <w:tcPr>
+            <w:tcW w:w="2000" w:type="dxa"/>
+          </w:tcPr>
+          <w:p>
+            <w:pPr/>
+            <w:r>
+              <w:t xml:space="preserve">bigint</w:t>
+            </w:r>
+          </w:p>
+        </w:tc>
+        <w:tc>
+          <w:tcPr>
+            <w:tcW w:w="2000" w:type="dxa"/>
+          </w:tcPr>
+          <w:p>
+            <w:pPr/>
+            <w:r>
+              <w:t xml:space="preserve">-</w:t>
+            </w:r>
+          </w:p>
+        </w:tc>
+        <w:tc>
+          <w:tcPr>
+            <w:tcW w:w="2000" w:type="dxa"/>
+          </w:tcPr>
+          <w:p>
+            <w:pPr/>
+            <w:r>
+              <w:t xml:space="preserve">FK, IS NULL</w:t>
+            </w:r>
+          </w:p>
+        </w:tc>
+      </w:tr>
+      <w:tr>
+        <w:trPr>
+          <w:trHeight w:val="530" w:hRule="atLeast"/>
+        </w:trPr>
+        <w:tc>
+          <w:tcPr>
+            <w:tcW w:w="2000" w:type="dxa"/>
+          </w:tcPr>
+          <w:p>
+            <w:pPr/>
+            <w:r>
+              <w:t xml:space="preserve">required_date</w:t>
+            </w:r>
+          </w:p>
+        </w:tc>
+        <w:tc>
+          <w:tcPr>
+            <w:tcW w:w="2000" w:type="dxa"/>
+          </w:tcPr>
+          <w:p>
+            <w:pPr/>
+            <w:r>
+              <w:t xml:space="preserve">date</w:t>
+            </w:r>
+          </w:p>
+        </w:tc>
+        <w:tc>
+          <w:tcPr>
+            <w:tcW w:w="2000" w:type="dxa"/>
+          </w:tcPr>
+          <w:p>
+            <w:pPr/>
+            <w:r>
+              <w:t xml:space="preserve">-</w:t>
+            </w:r>
+          </w:p>
+        </w:tc>
+        <w:tc>
+          <w:tcPr>
+            <w:tcW w:w="2000" w:type="dxa"/>
+          </w:tcPr>
+          <w:p>
+            <w:pPr/>
+            <w:r>
+              <w:t xml:space="preserve">NOT NULL</w:t>
+            </w:r>
+          </w:p>
+        </w:tc>
+      </w:tr>
+      <w:tr>
+        <w:trPr>
+          <w:trHeight w:val="530" w:hRule="atLeast"/>
+        </w:trPr>
+        <w:tc>
+          <w:tcPr>
+            <w:tcW w:w="2000" w:type="dxa"/>
+          </w:tcPr>
+          <w:p>
+            <w:pPr/>
+            <w:r>
+              <w:t xml:space="preserve">quantity</w:t>
             </w:r>
           </w:p>
         </w:tc>
@@ -64455,7 +67008,7 @@
       </w:r>
     </w:p>
     <w:sectPr>
-      <w:footerReference xmlns:r="http://schemas.openxmlformats.org/officeDocument/2006/relationships" w:type="default" r:id="Rb8a3b4dd67bb4b61"/>
+      <w:footerReference xmlns:r="http://schemas.openxmlformats.org/officeDocument/2006/relationships" w:type="default" r:id="R8a9e1a7e2d734789"/>
       <w:pgSz w:w="11906" w:h="16838"/>
       <w:pgMar w:top="1440" w:right="1440" w:bottom="1440" w:left="1440" w:header="720" w:footer="720" w:gutter="0"/>
     </w:sectPr>

</xml_diff>

<commit_message>
feat(pur): add immutable supplier quotation schema
</commit_message>
<xml_diff>
--- a/docs/99-output/MyERP_SDS.docx
+++ b/docs/99-output/MyERP_SDS.docx
@@ -45525,6 +45525,1414 @@
     <w:p>
       <w:pPr/>
       <w:r>
+        <w:t xml:space="preserve">Table Name: pur_quotation_line</w:t>
+      </w:r>
+    </w:p>
+    <w:p>
+      <w:pPr/>
+      <w:r>
+        <w:t xml:space="preserve">Primary Key: id</w:t>
+      </w:r>
+    </w:p>
+    <w:p>
+      <w:pPr/>
+      <w:r>
+        <w:t xml:space="preserve">This table stores immutable per-line prices, currencies and tax references.</w:t>
+      </w:r>
+    </w:p>
+    <w:tbl>
+      <w:tblPr>
+        <w:tblStyle w:val="TableGrid"/>
+        <w:tblW w:w="8000" w:type="dxa"/>
+        <w:jc w:val="left"/>
+        <w:tblBorders>
+          <w:top w:val="single" w:color="000000" w:sz="4" w:space="0"/>
+          <w:left w:val="single" w:color="000000" w:sz="4" w:space="0"/>
+          <w:bottom w:val="single" w:color="000000" w:sz="4" w:space="0"/>
+          <w:right w:val="single" w:color="000000" w:sz="4" w:space="0"/>
+          <w:insideH w:val="single" w:color="000000" w:sz="4" w:space="0"/>
+          <w:insideV w:val="single" w:color="000000" w:sz="4" w:space="0"/>
+        </w:tblBorders>
+        <w:tblLayout w:type="fixed"/>
+        <w:tblCellMar>
+          <w:top w:w="100" w:type="dxa"/>
+          <w:left w:w="100" w:type="dxa"/>
+          <w:bottom w:w="100" w:type="dxa"/>
+          <w:right w:w="100" w:type="dxa"/>
+        </w:tblCellMar>
+      </w:tblPr>
+      <w:tblGrid>
+        <w:gridCol w:w="2000"/>
+        <w:gridCol w:w="2000"/>
+        <w:gridCol w:w="2000"/>
+        <w:gridCol w:w="2000"/>
+      </w:tblGrid>
+      <w:tr>
+        <w:trPr>
+          <w:trHeight w:val="530" w:hRule="atLeast"/>
+        </w:trPr>
+        <w:tc>
+          <w:tcPr>
+            <w:tcW w:w="2000" w:type="dxa"/>
+          </w:tcPr>
+          <w:p>
+            <w:pPr>
+              <w:jc w:val="center"/>
+            </w:pPr>
+            <w:r>
+              <w:rPr>
+                <w:b/>
+              </w:rPr>
+              <w:t xml:space="preserve">Name of Attribute</w:t>
+            </w:r>
+          </w:p>
+        </w:tc>
+        <w:tc>
+          <w:tcPr>
+            <w:tcW w:w="2000" w:type="dxa"/>
+          </w:tcPr>
+          <w:p>
+            <w:pPr>
+              <w:jc w:val="center"/>
+            </w:pPr>
+            <w:r>
+              <w:rPr>
+                <w:b/>
+              </w:rPr>
+              <w:t xml:space="preserve">Data Type</w:t>
+            </w:r>
+          </w:p>
+        </w:tc>
+        <w:tc>
+          <w:tcPr>
+            <w:tcW w:w="2000" w:type="dxa"/>
+          </w:tcPr>
+          <w:p>
+            <w:pPr>
+              <w:jc w:val="center"/>
+            </w:pPr>
+            <w:r>
+              <w:rPr>
+                <w:b/>
+              </w:rPr>
+              <w:t xml:space="preserve">Size</w:t>
+            </w:r>
+          </w:p>
+        </w:tc>
+        <w:tc>
+          <w:tcPr>
+            <w:tcW w:w="2000" w:type="dxa"/>
+          </w:tcPr>
+          <w:p>
+            <w:pPr>
+              <w:jc w:val="center"/>
+            </w:pPr>
+            <w:r>
+              <w:rPr>
+                <w:b/>
+              </w:rPr>
+              <w:t xml:space="preserve">PK/FK/IS NULL/ NOT NULL</w:t>
+            </w:r>
+          </w:p>
+        </w:tc>
+      </w:tr>
+      <w:tr>
+        <w:trPr>
+          <w:trHeight w:val="530" w:hRule="atLeast"/>
+        </w:trPr>
+        <w:tc>
+          <w:tcPr>
+            <w:tcW w:w="2000" w:type="dxa"/>
+          </w:tcPr>
+          <w:p>
+            <w:pPr/>
+            <w:r>
+              <w:t xml:space="preserve">id</w:t>
+            </w:r>
+          </w:p>
+        </w:tc>
+        <w:tc>
+          <w:tcPr>
+            <w:tcW w:w="2000" w:type="dxa"/>
+          </w:tcPr>
+          <w:p>
+            <w:pPr/>
+            <w:r>
+              <w:t xml:space="preserve">bigint</w:t>
+            </w:r>
+          </w:p>
+        </w:tc>
+        <w:tc>
+          <w:tcPr>
+            <w:tcW w:w="2000" w:type="dxa"/>
+          </w:tcPr>
+          <w:p>
+            <w:pPr/>
+            <w:r>
+              <w:t xml:space="preserve">-</w:t>
+            </w:r>
+          </w:p>
+        </w:tc>
+        <w:tc>
+          <w:tcPr>
+            <w:tcW w:w="2000" w:type="dxa"/>
+          </w:tcPr>
+          <w:p>
+            <w:pPr/>
+            <w:r>
+              <w:t xml:space="preserve">PK, NOT NULL</w:t>
+            </w:r>
+          </w:p>
+        </w:tc>
+      </w:tr>
+      <w:tr>
+        <w:trPr>
+          <w:trHeight w:val="530" w:hRule="atLeast"/>
+        </w:trPr>
+        <w:tc>
+          <w:tcPr>
+            <w:tcW w:w="2000" w:type="dxa"/>
+          </w:tcPr>
+          <w:p>
+            <w:pPr/>
+            <w:r>
+              <w:t xml:space="preserve">revision_id</w:t>
+            </w:r>
+          </w:p>
+        </w:tc>
+        <w:tc>
+          <w:tcPr>
+            <w:tcW w:w="2000" w:type="dxa"/>
+          </w:tcPr>
+          <w:p>
+            <w:pPr/>
+            <w:r>
+              <w:t xml:space="preserve">bigint</w:t>
+            </w:r>
+          </w:p>
+        </w:tc>
+        <w:tc>
+          <w:tcPr>
+            <w:tcW w:w="2000" w:type="dxa"/>
+          </w:tcPr>
+          <w:p>
+            <w:pPr/>
+            <w:r>
+              <w:t xml:space="preserve">-</w:t>
+            </w:r>
+          </w:p>
+        </w:tc>
+        <w:tc>
+          <w:tcPr>
+            <w:tcW w:w="2000" w:type="dxa"/>
+          </w:tcPr>
+          <w:p>
+            <w:pPr/>
+            <w:r>
+              <w:t xml:space="preserve">FK, NOT NULL</w:t>
+            </w:r>
+          </w:p>
+        </w:tc>
+      </w:tr>
+      <w:tr>
+        <w:trPr>
+          <w:trHeight w:val="530" w:hRule="atLeast"/>
+        </w:trPr>
+        <w:tc>
+          <w:tcPr>
+            <w:tcW w:w="2000" w:type="dxa"/>
+          </w:tcPr>
+          <w:p>
+            <w:pPr/>
+            <w:r>
+              <w:t xml:space="preserve">rfq_line_id</w:t>
+            </w:r>
+          </w:p>
+        </w:tc>
+        <w:tc>
+          <w:tcPr>
+            <w:tcW w:w="2000" w:type="dxa"/>
+          </w:tcPr>
+          <w:p>
+            <w:pPr/>
+            <w:r>
+              <w:t xml:space="preserve">bigint</w:t>
+            </w:r>
+          </w:p>
+        </w:tc>
+        <w:tc>
+          <w:tcPr>
+            <w:tcW w:w="2000" w:type="dxa"/>
+          </w:tcPr>
+          <w:p>
+            <w:pPr/>
+            <w:r>
+              <w:t xml:space="preserve">-</w:t>
+            </w:r>
+          </w:p>
+        </w:tc>
+        <w:tc>
+          <w:tcPr>
+            <w:tcW w:w="2000" w:type="dxa"/>
+          </w:tcPr>
+          <w:p>
+            <w:pPr/>
+            <w:r>
+              <w:t xml:space="preserve">FK, NOT NULL</w:t>
+            </w:r>
+          </w:p>
+        </w:tc>
+      </w:tr>
+      <w:tr>
+        <w:trPr>
+          <w:trHeight w:val="530" w:hRule="atLeast"/>
+        </w:trPr>
+        <w:tc>
+          <w:tcPr>
+            <w:tcW w:w="2000" w:type="dxa"/>
+          </w:tcPr>
+          <w:p>
+            <w:pPr/>
+            <w:r>
+              <w:t xml:space="preserve">unit_price</w:t>
+            </w:r>
+          </w:p>
+        </w:tc>
+        <w:tc>
+          <w:tcPr>
+            <w:tcW w:w="2000" w:type="dxa"/>
+          </w:tcPr>
+          <w:p>
+            <w:pPr/>
+            <w:r>
+              <w:t xml:space="preserve">decimal</w:t>
+            </w:r>
+          </w:p>
+        </w:tc>
+        <w:tc>
+          <w:tcPr>
+            <w:tcW w:w="2000" w:type="dxa"/>
+          </w:tcPr>
+          <w:p>
+            <w:pPr/>
+            <w:r>
+              <w:t xml:space="preserve">(19,6)</w:t>
+            </w:r>
+          </w:p>
+        </w:tc>
+        <w:tc>
+          <w:tcPr>
+            <w:tcW w:w="2000" w:type="dxa"/>
+          </w:tcPr>
+          <w:p>
+            <w:pPr/>
+            <w:r>
+              <w:t xml:space="preserve">NOT NULL</w:t>
+            </w:r>
+          </w:p>
+        </w:tc>
+      </w:tr>
+      <w:tr>
+        <w:trPr>
+          <w:trHeight w:val="530" w:hRule="atLeast"/>
+        </w:trPr>
+        <w:tc>
+          <w:tcPr>
+            <w:tcW w:w="2000" w:type="dxa"/>
+          </w:tcPr>
+          <w:p>
+            <w:pPr/>
+            <w:r>
+              <w:t xml:space="preserve">currency_code</w:t>
+            </w:r>
+          </w:p>
+        </w:tc>
+        <w:tc>
+          <w:tcPr>
+            <w:tcW w:w="2000" w:type="dxa"/>
+          </w:tcPr>
+          <w:p>
+            <w:pPr/>
+            <w:r>
+              <w:t xml:space="preserve">char</w:t>
+            </w:r>
+          </w:p>
+        </w:tc>
+        <w:tc>
+          <w:tcPr>
+            <w:tcW w:w="2000" w:type="dxa"/>
+          </w:tcPr>
+          <w:p>
+            <w:pPr/>
+            <w:r>
+              <w:t xml:space="preserve">3</w:t>
+            </w:r>
+          </w:p>
+        </w:tc>
+        <w:tc>
+          <w:tcPr>
+            <w:tcW w:w="2000" w:type="dxa"/>
+          </w:tcPr>
+          <w:p>
+            <w:pPr/>
+            <w:r>
+              <w:t xml:space="preserve">NOT NULL</w:t>
+            </w:r>
+          </w:p>
+        </w:tc>
+      </w:tr>
+      <w:tr>
+        <w:trPr>
+          <w:trHeight w:val="530" w:hRule="atLeast"/>
+        </w:trPr>
+        <w:tc>
+          <w:tcPr>
+            <w:tcW w:w="2000" w:type="dxa"/>
+          </w:tcPr>
+          <w:p>
+            <w:pPr/>
+            <w:r>
+              <w:t xml:space="preserve">tax_rate_id</w:t>
+            </w:r>
+          </w:p>
+        </w:tc>
+        <w:tc>
+          <w:tcPr>
+            <w:tcW w:w="2000" w:type="dxa"/>
+          </w:tcPr>
+          <w:p>
+            <w:pPr/>
+            <w:r>
+              <w:t xml:space="preserve">bigint</w:t>
+            </w:r>
+          </w:p>
+        </w:tc>
+        <w:tc>
+          <w:tcPr>
+            <w:tcW w:w="2000" w:type="dxa"/>
+          </w:tcPr>
+          <w:p>
+            <w:pPr/>
+            <w:r>
+              <w:t xml:space="preserve">-</w:t>
+            </w:r>
+          </w:p>
+        </w:tc>
+        <w:tc>
+          <w:tcPr>
+            <w:tcW w:w="2000" w:type="dxa"/>
+          </w:tcPr>
+          <w:p>
+            <w:pPr/>
+            <w:r>
+              <w:t xml:space="preserve">NOT NULL</w:t>
+            </w:r>
+          </w:p>
+        </w:tc>
+      </w:tr>
+      <w:tr>
+        <w:trPr>
+          <w:trHeight w:val="530" w:hRule="atLeast"/>
+        </w:trPr>
+        <w:tc>
+          <w:tcPr>
+            <w:tcW w:w="2000" w:type="dxa"/>
+          </w:tcPr>
+          <w:p>
+            <w:pPr/>
+            <w:r>
+              <w:t xml:space="preserve">company_id</w:t>
+            </w:r>
+          </w:p>
+        </w:tc>
+        <w:tc>
+          <w:tcPr>
+            <w:tcW w:w="2000" w:type="dxa"/>
+          </w:tcPr>
+          <w:p>
+            <w:pPr/>
+            <w:r>
+              <w:t xml:space="preserve">bigint</w:t>
+            </w:r>
+          </w:p>
+        </w:tc>
+        <w:tc>
+          <w:tcPr>
+            <w:tcW w:w="2000" w:type="dxa"/>
+          </w:tcPr>
+          <w:p>
+            <w:pPr/>
+            <w:r>
+              <w:t xml:space="preserve">-</w:t>
+            </w:r>
+          </w:p>
+        </w:tc>
+        <w:tc>
+          <w:tcPr>
+            <w:tcW w:w="2000" w:type="dxa"/>
+          </w:tcPr>
+          <w:p>
+            <w:pPr/>
+            <w:r>
+              <w:t xml:space="preserve">FK, NOT NULL</w:t>
+            </w:r>
+          </w:p>
+        </w:tc>
+      </w:tr>
+      <w:tr>
+        <w:trPr>
+          <w:trHeight w:val="530" w:hRule="atLeast"/>
+        </w:trPr>
+        <w:tc>
+          <w:tcPr>
+            <w:tcW w:w="2000" w:type="dxa"/>
+          </w:tcPr>
+          <w:p>
+            <w:pPr/>
+            <w:r>
+              <w:t xml:space="preserve">created_at</w:t>
+            </w:r>
+          </w:p>
+        </w:tc>
+        <w:tc>
+          <w:tcPr>
+            <w:tcW w:w="2000" w:type="dxa"/>
+          </w:tcPr>
+          <w:p>
+            <w:pPr/>
+            <w:r>
+              <w:t xml:space="preserve">datetime2</w:t>
+            </w:r>
+          </w:p>
+        </w:tc>
+        <w:tc>
+          <w:tcPr>
+            <w:tcW w:w="2000" w:type="dxa"/>
+          </w:tcPr>
+          <w:p>
+            <w:pPr/>
+            <w:r>
+              <w:t xml:space="preserve">(6)</w:t>
+            </w:r>
+          </w:p>
+        </w:tc>
+        <w:tc>
+          <w:tcPr>
+            <w:tcW w:w="2000" w:type="dxa"/>
+          </w:tcPr>
+          <w:p>
+            <w:pPr/>
+            <w:r>
+              <w:t xml:space="preserve">NOT NULL</w:t>
+            </w:r>
+          </w:p>
+        </w:tc>
+      </w:tr>
+      <w:tr>
+        <w:trPr>
+          <w:trHeight w:val="530" w:hRule="atLeast"/>
+        </w:trPr>
+        <w:tc>
+          <w:tcPr>
+            <w:tcW w:w="2000" w:type="dxa"/>
+          </w:tcPr>
+          <w:p>
+            <w:pPr/>
+            <w:r>
+              <w:t xml:space="preserve">created_by</w:t>
+            </w:r>
+          </w:p>
+        </w:tc>
+        <w:tc>
+          <w:tcPr>
+            <w:tcW w:w="2000" w:type="dxa"/>
+          </w:tcPr>
+          <w:p>
+            <w:pPr/>
+            <w:r>
+              <w:t xml:space="preserve">bigint</w:t>
+            </w:r>
+          </w:p>
+        </w:tc>
+        <w:tc>
+          <w:tcPr>
+            <w:tcW w:w="2000" w:type="dxa"/>
+          </w:tcPr>
+          <w:p>
+            <w:pPr/>
+            <w:r>
+              <w:t xml:space="preserve">-</w:t>
+            </w:r>
+          </w:p>
+        </w:tc>
+        <w:tc>
+          <w:tcPr>
+            <w:tcW w:w="2000" w:type="dxa"/>
+          </w:tcPr>
+          <w:p>
+            <w:pPr/>
+            <w:r>
+              <w:t xml:space="preserve">NOT NULL</w:t>
+            </w:r>
+          </w:p>
+        </w:tc>
+      </w:tr>
+      <w:tr>
+        <w:trPr>
+          <w:trHeight w:val="530" w:hRule="atLeast"/>
+        </w:trPr>
+        <w:tc>
+          <w:tcPr>
+            <w:tcW w:w="2000" w:type="dxa"/>
+          </w:tcPr>
+          <w:p>
+            <w:pPr/>
+            <w:r>
+              <w:t xml:space="preserve">updated_at</w:t>
+            </w:r>
+          </w:p>
+        </w:tc>
+        <w:tc>
+          <w:tcPr>
+            <w:tcW w:w="2000" w:type="dxa"/>
+          </w:tcPr>
+          <w:p>
+            <w:pPr/>
+            <w:r>
+              <w:t xml:space="preserve">datetime2</w:t>
+            </w:r>
+          </w:p>
+        </w:tc>
+        <w:tc>
+          <w:tcPr>
+            <w:tcW w:w="2000" w:type="dxa"/>
+          </w:tcPr>
+          <w:p>
+            <w:pPr/>
+            <w:r>
+              <w:t xml:space="preserve">(6)</w:t>
+            </w:r>
+          </w:p>
+        </w:tc>
+        <w:tc>
+          <w:tcPr>
+            <w:tcW w:w="2000" w:type="dxa"/>
+          </w:tcPr>
+          <w:p>
+            <w:pPr/>
+            <w:r>
+              <w:t xml:space="preserve">IS NULL</w:t>
+            </w:r>
+          </w:p>
+        </w:tc>
+      </w:tr>
+      <w:tr>
+        <w:trPr>
+          <w:trHeight w:val="530" w:hRule="atLeast"/>
+        </w:trPr>
+        <w:tc>
+          <w:tcPr>
+            <w:tcW w:w="2000" w:type="dxa"/>
+          </w:tcPr>
+          <w:p>
+            <w:pPr/>
+            <w:r>
+              <w:t xml:space="preserve">updated_by</w:t>
+            </w:r>
+          </w:p>
+        </w:tc>
+        <w:tc>
+          <w:tcPr>
+            <w:tcW w:w="2000" w:type="dxa"/>
+          </w:tcPr>
+          <w:p>
+            <w:pPr/>
+            <w:r>
+              <w:t xml:space="preserve">bigint</w:t>
+            </w:r>
+          </w:p>
+        </w:tc>
+        <w:tc>
+          <w:tcPr>
+            <w:tcW w:w="2000" w:type="dxa"/>
+          </w:tcPr>
+          <w:p>
+            <w:pPr/>
+            <w:r>
+              <w:t xml:space="preserve">-</w:t>
+            </w:r>
+          </w:p>
+        </w:tc>
+        <w:tc>
+          <w:tcPr>
+            <w:tcW w:w="2000" w:type="dxa"/>
+          </w:tcPr>
+          <w:p>
+            <w:pPr/>
+            <w:r>
+              <w:t xml:space="preserve">IS NULL</w:t>
+            </w:r>
+          </w:p>
+        </w:tc>
+      </w:tr>
+      <w:tr>
+        <w:trPr>
+          <w:trHeight w:val="530" w:hRule="atLeast"/>
+        </w:trPr>
+        <w:tc>
+          <w:tcPr>
+            <w:tcW w:w="2000" w:type="dxa"/>
+          </w:tcPr>
+          <w:p>
+            <w:pPr/>
+            <w:r>
+              <w:t xml:space="preserve">version</w:t>
+            </w:r>
+          </w:p>
+        </w:tc>
+        <w:tc>
+          <w:tcPr>
+            <w:tcW w:w="2000" w:type="dxa"/>
+          </w:tcPr>
+          <w:p>
+            <w:pPr/>
+            <w:r>
+              <w:t xml:space="preserve">int</w:t>
+            </w:r>
+          </w:p>
+        </w:tc>
+        <w:tc>
+          <w:tcPr>
+            <w:tcW w:w="2000" w:type="dxa"/>
+          </w:tcPr>
+          <w:p>
+            <w:pPr/>
+            <w:r>
+              <w:t xml:space="preserve">-</w:t>
+            </w:r>
+          </w:p>
+        </w:tc>
+        <w:tc>
+          <w:tcPr>
+            <w:tcW w:w="2000" w:type="dxa"/>
+          </w:tcPr>
+          <w:p>
+            <w:pPr/>
+            <w:r>
+              <w:t xml:space="preserve">NOT NULL</w:t>
+            </w:r>
+          </w:p>
+        </w:tc>
+      </w:tr>
+    </w:tbl>
+    <w:p/>
+    <w:p>
+      <w:pPr/>
+      <w:r>
+        <w:t xml:space="preserve">Table Name: pur_quotation_revision</w:t>
+      </w:r>
+    </w:p>
+    <w:p>
+      <w:pPr/>
+      <w:r>
+        <w:t xml:space="preserve">Primary Key: id</w:t>
+      </w:r>
+    </w:p>
+    <w:p>
+      <w:pPr/>
+      <w:r>
+        <w:t xml:space="preserve">This table stores immutable dated quotation revisions.</w:t>
+      </w:r>
+    </w:p>
+    <w:tbl>
+      <w:tblPr>
+        <w:tblStyle w:val="TableGrid"/>
+        <w:tblW w:w="8000" w:type="dxa"/>
+        <w:jc w:val="left"/>
+        <w:tblBorders>
+          <w:top w:val="single" w:color="000000" w:sz="4" w:space="0"/>
+          <w:left w:val="single" w:color="000000" w:sz="4" w:space="0"/>
+          <w:bottom w:val="single" w:color="000000" w:sz="4" w:space="0"/>
+          <w:right w:val="single" w:color="000000" w:sz="4" w:space="0"/>
+          <w:insideH w:val="single" w:color="000000" w:sz="4" w:space="0"/>
+          <w:insideV w:val="single" w:color="000000" w:sz="4" w:space="0"/>
+        </w:tblBorders>
+        <w:tblLayout w:type="fixed"/>
+        <w:tblCellMar>
+          <w:top w:w="100" w:type="dxa"/>
+          <w:left w:w="100" w:type="dxa"/>
+          <w:bottom w:w="100" w:type="dxa"/>
+          <w:right w:w="100" w:type="dxa"/>
+        </w:tblCellMar>
+      </w:tblPr>
+      <w:tblGrid>
+        <w:gridCol w:w="2000"/>
+        <w:gridCol w:w="2000"/>
+        <w:gridCol w:w="2000"/>
+        <w:gridCol w:w="2000"/>
+      </w:tblGrid>
+      <w:tr>
+        <w:trPr>
+          <w:trHeight w:val="530" w:hRule="atLeast"/>
+        </w:trPr>
+        <w:tc>
+          <w:tcPr>
+            <w:tcW w:w="2000" w:type="dxa"/>
+          </w:tcPr>
+          <w:p>
+            <w:pPr>
+              <w:jc w:val="center"/>
+            </w:pPr>
+            <w:r>
+              <w:rPr>
+                <w:b/>
+              </w:rPr>
+              <w:t xml:space="preserve">Name of Attribute</w:t>
+            </w:r>
+          </w:p>
+        </w:tc>
+        <w:tc>
+          <w:tcPr>
+            <w:tcW w:w="2000" w:type="dxa"/>
+          </w:tcPr>
+          <w:p>
+            <w:pPr>
+              <w:jc w:val="center"/>
+            </w:pPr>
+            <w:r>
+              <w:rPr>
+                <w:b/>
+              </w:rPr>
+              <w:t xml:space="preserve">Data Type</w:t>
+            </w:r>
+          </w:p>
+        </w:tc>
+        <w:tc>
+          <w:tcPr>
+            <w:tcW w:w="2000" w:type="dxa"/>
+          </w:tcPr>
+          <w:p>
+            <w:pPr>
+              <w:jc w:val="center"/>
+            </w:pPr>
+            <w:r>
+              <w:rPr>
+                <w:b/>
+              </w:rPr>
+              <w:t xml:space="preserve">Size</w:t>
+            </w:r>
+          </w:p>
+        </w:tc>
+        <w:tc>
+          <w:tcPr>
+            <w:tcW w:w="2000" w:type="dxa"/>
+          </w:tcPr>
+          <w:p>
+            <w:pPr>
+              <w:jc w:val="center"/>
+            </w:pPr>
+            <w:r>
+              <w:rPr>
+                <w:b/>
+              </w:rPr>
+              <w:t xml:space="preserve">PK/FK/IS NULL/ NOT NULL</w:t>
+            </w:r>
+          </w:p>
+        </w:tc>
+      </w:tr>
+      <w:tr>
+        <w:trPr>
+          <w:trHeight w:val="530" w:hRule="atLeast"/>
+        </w:trPr>
+        <w:tc>
+          <w:tcPr>
+            <w:tcW w:w="2000" w:type="dxa"/>
+          </w:tcPr>
+          <w:p>
+            <w:pPr/>
+            <w:r>
+              <w:t xml:space="preserve">id</w:t>
+            </w:r>
+          </w:p>
+        </w:tc>
+        <w:tc>
+          <w:tcPr>
+            <w:tcW w:w="2000" w:type="dxa"/>
+          </w:tcPr>
+          <w:p>
+            <w:pPr/>
+            <w:r>
+              <w:t xml:space="preserve">bigint</w:t>
+            </w:r>
+          </w:p>
+        </w:tc>
+        <w:tc>
+          <w:tcPr>
+            <w:tcW w:w="2000" w:type="dxa"/>
+          </w:tcPr>
+          <w:p>
+            <w:pPr/>
+            <w:r>
+              <w:t xml:space="preserve">-</w:t>
+            </w:r>
+          </w:p>
+        </w:tc>
+        <w:tc>
+          <w:tcPr>
+            <w:tcW w:w="2000" w:type="dxa"/>
+          </w:tcPr>
+          <w:p>
+            <w:pPr/>
+            <w:r>
+              <w:t xml:space="preserve">PK, NOT NULL</w:t>
+            </w:r>
+          </w:p>
+        </w:tc>
+      </w:tr>
+      <w:tr>
+        <w:trPr>
+          <w:trHeight w:val="530" w:hRule="atLeast"/>
+        </w:trPr>
+        <w:tc>
+          <w:tcPr>
+            <w:tcW w:w="2000" w:type="dxa"/>
+          </w:tcPr>
+          <w:p>
+            <w:pPr/>
+            <w:r>
+              <w:t xml:space="preserve">quotation_id</w:t>
+            </w:r>
+          </w:p>
+        </w:tc>
+        <w:tc>
+          <w:tcPr>
+            <w:tcW w:w="2000" w:type="dxa"/>
+          </w:tcPr>
+          <w:p>
+            <w:pPr/>
+            <w:r>
+              <w:t xml:space="preserve">bigint</w:t>
+            </w:r>
+          </w:p>
+        </w:tc>
+        <w:tc>
+          <w:tcPr>
+            <w:tcW w:w="2000" w:type="dxa"/>
+          </w:tcPr>
+          <w:p>
+            <w:pPr/>
+            <w:r>
+              <w:t xml:space="preserve">-</w:t>
+            </w:r>
+          </w:p>
+        </w:tc>
+        <w:tc>
+          <w:tcPr>
+            <w:tcW w:w="2000" w:type="dxa"/>
+          </w:tcPr>
+          <w:p>
+            <w:pPr/>
+            <w:r>
+              <w:t xml:space="preserve">FK, NOT NULL</w:t>
+            </w:r>
+          </w:p>
+        </w:tc>
+      </w:tr>
+      <w:tr>
+        <w:trPr>
+          <w:trHeight w:val="530" w:hRule="atLeast"/>
+        </w:trPr>
+        <w:tc>
+          <w:tcPr>
+            <w:tcW w:w="2000" w:type="dxa"/>
+          </w:tcPr>
+          <w:p>
+            <w:pPr/>
+            <w:r>
+              <w:t xml:space="preserve">revision_no</w:t>
+            </w:r>
+          </w:p>
+        </w:tc>
+        <w:tc>
+          <w:tcPr>
+            <w:tcW w:w="2000" w:type="dxa"/>
+          </w:tcPr>
+          <w:p>
+            <w:pPr/>
+            <w:r>
+              <w:t xml:space="preserve">int</w:t>
+            </w:r>
+          </w:p>
+        </w:tc>
+        <w:tc>
+          <w:tcPr>
+            <w:tcW w:w="2000" w:type="dxa"/>
+          </w:tcPr>
+          <w:p>
+            <w:pPr/>
+            <w:r>
+              <w:t xml:space="preserve">-</w:t>
+            </w:r>
+          </w:p>
+        </w:tc>
+        <w:tc>
+          <w:tcPr>
+            <w:tcW w:w="2000" w:type="dxa"/>
+          </w:tcPr>
+          <w:p>
+            <w:pPr/>
+            <w:r>
+              <w:t xml:space="preserve">NOT NULL</w:t>
+            </w:r>
+          </w:p>
+        </w:tc>
+      </w:tr>
+      <w:tr>
+        <w:trPr>
+          <w:trHeight w:val="530" w:hRule="atLeast"/>
+        </w:trPr>
+        <w:tc>
+          <w:tcPr>
+            <w:tcW w:w="2000" w:type="dxa"/>
+          </w:tcPr>
+          <w:p>
+            <w:pPr/>
+            <w:r>
+              <w:t xml:space="preserve">quote_date</w:t>
+            </w:r>
+          </w:p>
+        </w:tc>
+        <w:tc>
+          <w:tcPr>
+            <w:tcW w:w="2000" w:type="dxa"/>
+          </w:tcPr>
+          <w:p>
+            <w:pPr/>
+            <w:r>
+              <w:t xml:space="preserve">date</w:t>
+            </w:r>
+          </w:p>
+        </w:tc>
+        <w:tc>
+          <w:tcPr>
+            <w:tcW w:w="2000" w:type="dxa"/>
+          </w:tcPr>
+          <w:p>
+            <w:pPr/>
+            <w:r>
+              <w:t xml:space="preserve">-</w:t>
+            </w:r>
+          </w:p>
+        </w:tc>
+        <w:tc>
+          <w:tcPr>
+            <w:tcW w:w="2000" w:type="dxa"/>
+          </w:tcPr>
+          <w:p>
+            <w:pPr/>
+            <w:r>
+              <w:t xml:space="preserve">NOT NULL</w:t>
+            </w:r>
+          </w:p>
+        </w:tc>
+      </w:tr>
+      <w:tr>
+        <w:trPr>
+          <w:trHeight w:val="530" w:hRule="atLeast"/>
+        </w:trPr>
+        <w:tc>
+          <w:tcPr>
+            <w:tcW w:w="2000" w:type="dxa"/>
+          </w:tcPr>
+          <w:p>
+            <w:pPr/>
+            <w:r>
+              <w:t xml:space="preserve">valid_until</w:t>
+            </w:r>
+          </w:p>
+        </w:tc>
+        <w:tc>
+          <w:tcPr>
+            <w:tcW w:w="2000" w:type="dxa"/>
+          </w:tcPr>
+          <w:p>
+            <w:pPr/>
+            <w:r>
+              <w:t xml:space="preserve">date</w:t>
+            </w:r>
+          </w:p>
+        </w:tc>
+        <w:tc>
+          <w:tcPr>
+            <w:tcW w:w="2000" w:type="dxa"/>
+          </w:tcPr>
+          <w:p>
+            <w:pPr/>
+            <w:r>
+              <w:t xml:space="preserve">-</w:t>
+            </w:r>
+          </w:p>
+        </w:tc>
+        <w:tc>
+          <w:tcPr>
+            <w:tcW w:w="2000" w:type="dxa"/>
+          </w:tcPr>
+          <w:p>
+            <w:pPr/>
+            <w:r>
+              <w:t xml:space="preserve">NOT NULL</w:t>
+            </w:r>
+          </w:p>
+        </w:tc>
+      </w:tr>
+      <w:tr>
+        <w:trPr>
+          <w:trHeight w:val="530" w:hRule="atLeast"/>
+        </w:trPr>
+        <w:tc>
+          <w:tcPr>
+            <w:tcW w:w="2000" w:type="dxa"/>
+          </w:tcPr>
+          <w:p>
+            <w:pPr/>
+            <w:r>
+              <w:t xml:space="preserve">remark</w:t>
+            </w:r>
+          </w:p>
+        </w:tc>
+        <w:tc>
+          <w:tcPr>
+            <w:tcW w:w="2000" w:type="dxa"/>
+          </w:tcPr>
+          <w:p>
+            <w:pPr/>
+            <w:r>
+              <w:t xml:space="preserve">nvarchar</w:t>
+            </w:r>
+          </w:p>
+        </w:tc>
+        <w:tc>
+          <w:tcPr>
+            <w:tcW w:w="2000" w:type="dxa"/>
+          </w:tcPr>
+          <w:p>
+            <w:pPr/>
+            <w:r>
+              <w:t xml:space="preserve">500</w:t>
+            </w:r>
+          </w:p>
+        </w:tc>
+        <w:tc>
+          <w:tcPr>
+            <w:tcW w:w="2000" w:type="dxa"/>
+          </w:tcPr>
+          <w:p>
+            <w:pPr/>
+            <w:r>
+              <w:t xml:space="preserve">IS NULL</w:t>
+            </w:r>
+          </w:p>
+        </w:tc>
+      </w:tr>
+      <w:tr>
+        <w:trPr>
+          <w:trHeight w:val="530" w:hRule="atLeast"/>
+        </w:trPr>
+        <w:tc>
+          <w:tcPr>
+            <w:tcW w:w="2000" w:type="dxa"/>
+          </w:tcPr>
+          <w:p>
+            <w:pPr/>
+            <w:r>
+              <w:t xml:space="preserve">company_id</w:t>
+            </w:r>
+          </w:p>
+        </w:tc>
+        <w:tc>
+          <w:tcPr>
+            <w:tcW w:w="2000" w:type="dxa"/>
+          </w:tcPr>
+          <w:p>
+            <w:pPr/>
+            <w:r>
+              <w:t xml:space="preserve">bigint</w:t>
+            </w:r>
+          </w:p>
+        </w:tc>
+        <w:tc>
+          <w:tcPr>
+            <w:tcW w:w="2000" w:type="dxa"/>
+          </w:tcPr>
+          <w:p>
+            <w:pPr/>
+            <w:r>
+              <w:t xml:space="preserve">-</w:t>
+            </w:r>
+          </w:p>
+        </w:tc>
+        <w:tc>
+          <w:tcPr>
+            <w:tcW w:w="2000" w:type="dxa"/>
+          </w:tcPr>
+          <w:p>
+            <w:pPr/>
+            <w:r>
+              <w:t xml:space="preserve">FK, NOT NULL</w:t>
+            </w:r>
+          </w:p>
+        </w:tc>
+      </w:tr>
+      <w:tr>
+        <w:trPr>
+          <w:trHeight w:val="530" w:hRule="atLeast"/>
+        </w:trPr>
+        <w:tc>
+          <w:tcPr>
+            <w:tcW w:w="2000" w:type="dxa"/>
+          </w:tcPr>
+          <w:p>
+            <w:pPr/>
+            <w:r>
+              <w:t xml:space="preserve">created_at</w:t>
+            </w:r>
+          </w:p>
+        </w:tc>
+        <w:tc>
+          <w:tcPr>
+            <w:tcW w:w="2000" w:type="dxa"/>
+          </w:tcPr>
+          <w:p>
+            <w:pPr/>
+            <w:r>
+              <w:t xml:space="preserve">datetime2</w:t>
+            </w:r>
+          </w:p>
+        </w:tc>
+        <w:tc>
+          <w:tcPr>
+            <w:tcW w:w="2000" w:type="dxa"/>
+          </w:tcPr>
+          <w:p>
+            <w:pPr/>
+            <w:r>
+              <w:t xml:space="preserve">(6)</w:t>
+            </w:r>
+          </w:p>
+        </w:tc>
+        <w:tc>
+          <w:tcPr>
+            <w:tcW w:w="2000" w:type="dxa"/>
+          </w:tcPr>
+          <w:p>
+            <w:pPr/>
+            <w:r>
+              <w:t xml:space="preserve">NOT NULL</w:t>
+            </w:r>
+          </w:p>
+        </w:tc>
+      </w:tr>
+      <w:tr>
+        <w:trPr>
+          <w:trHeight w:val="530" w:hRule="atLeast"/>
+        </w:trPr>
+        <w:tc>
+          <w:tcPr>
+            <w:tcW w:w="2000" w:type="dxa"/>
+          </w:tcPr>
+          <w:p>
+            <w:pPr/>
+            <w:r>
+              <w:t xml:space="preserve">created_by</w:t>
+            </w:r>
+          </w:p>
+        </w:tc>
+        <w:tc>
+          <w:tcPr>
+            <w:tcW w:w="2000" w:type="dxa"/>
+          </w:tcPr>
+          <w:p>
+            <w:pPr/>
+            <w:r>
+              <w:t xml:space="preserve">bigint</w:t>
+            </w:r>
+          </w:p>
+        </w:tc>
+        <w:tc>
+          <w:tcPr>
+            <w:tcW w:w="2000" w:type="dxa"/>
+          </w:tcPr>
+          <w:p>
+            <w:pPr/>
+            <w:r>
+              <w:t xml:space="preserve">-</w:t>
+            </w:r>
+          </w:p>
+        </w:tc>
+        <w:tc>
+          <w:tcPr>
+            <w:tcW w:w="2000" w:type="dxa"/>
+          </w:tcPr>
+          <w:p>
+            <w:pPr/>
+            <w:r>
+              <w:t xml:space="preserve">NOT NULL</w:t>
+            </w:r>
+          </w:p>
+        </w:tc>
+      </w:tr>
+      <w:tr>
+        <w:trPr>
+          <w:trHeight w:val="530" w:hRule="atLeast"/>
+        </w:trPr>
+        <w:tc>
+          <w:tcPr>
+            <w:tcW w:w="2000" w:type="dxa"/>
+          </w:tcPr>
+          <w:p>
+            <w:pPr/>
+            <w:r>
+              <w:t xml:space="preserve">updated_at</w:t>
+            </w:r>
+          </w:p>
+        </w:tc>
+        <w:tc>
+          <w:tcPr>
+            <w:tcW w:w="2000" w:type="dxa"/>
+          </w:tcPr>
+          <w:p>
+            <w:pPr/>
+            <w:r>
+              <w:t xml:space="preserve">datetime2</w:t>
+            </w:r>
+          </w:p>
+        </w:tc>
+        <w:tc>
+          <w:tcPr>
+            <w:tcW w:w="2000" w:type="dxa"/>
+          </w:tcPr>
+          <w:p>
+            <w:pPr/>
+            <w:r>
+              <w:t xml:space="preserve">(6)</w:t>
+            </w:r>
+          </w:p>
+        </w:tc>
+        <w:tc>
+          <w:tcPr>
+            <w:tcW w:w="2000" w:type="dxa"/>
+          </w:tcPr>
+          <w:p>
+            <w:pPr/>
+            <w:r>
+              <w:t xml:space="preserve">IS NULL</w:t>
+            </w:r>
+          </w:p>
+        </w:tc>
+      </w:tr>
+      <w:tr>
+        <w:trPr>
+          <w:trHeight w:val="530" w:hRule="atLeast"/>
+        </w:trPr>
+        <w:tc>
+          <w:tcPr>
+            <w:tcW w:w="2000" w:type="dxa"/>
+          </w:tcPr>
+          <w:p>
+            <w:pPr/>
+            <w:r>
+              <w:t xml:space="preserve">updated_by</w:t>
+            </w:r>
+          </w:p>
+        </w:tc>
+        <w:tc>
+          <w:tcPr>
+            <w:tcW w:w="2000" w:type="dxa"/>
+          </w:tcPr>
+          <w:p>
+            <w:pPr/>
+            <w:r>
+              <w:t xml:space="preserve">bigint</w:t>
+            </w:r>
+          </w:p>
+        </w:tc>
+        <w:tc>
+          <w:tcPr>
+            <w:tcW w:w="2000" w:type="dxa"/>
+          </w:tcPr>
+          <w:p>
+            <w:pPr/>
+            <w:r>
+              <w:t xml:space="preserve">-</w:t>
+            </w:r>
+          </w:p>
+        </w:tc>
+        <w:tc>
+          <w:tcPr>
+            <w:tcW w:w="2000" w:type="dxa"/>
+          </w:tcPr>
+          <w:p>
+            <w:pPr/>
+            <w:r>
+              <w:t xml:space="preserve">IS NULL</w:t>
+            </w:r>
+          </w:p>
+        </w:tc>
+      </w:tr>
+      <w:tr>
+        <w:trPr>
+          <w:trHeight w:val="530" w:hRule="atLeast"/>
+        </w:trPr>
+        <w:tc>
+          <w:tcPr>
+            <w:tcW w:w="2000" w:type="dxa"/>
+          </w:tcPr>
+          <w:p>
+            <w:pPr/>
+            <w:r>
+              <w:t xml:space="preserve">version</w:t>
+            </w:r>
+          </w:p>
+        </w:tc>
+        <w:tc>
+          <w:tcPr>
+            <w:tcW w:w="2000" w:type="dxa"/>
+          </w:tcPr>
+          <w:p>
+            <w:pPr/>
+            <w:r>
+              <w:t xml:space="preserve">int</w:t>
+            </w:r>
+          </w:p>
+        </w:tc>
+        <w:tc>
+          <w:tcPr>
+            <w:tcW w:w="2000" w:type="dxa"/>
+          </w:tcPr>
+          <w:p>
+            <w:pPr/>
+            <w:r>
+              <w:t xml:space="preserve">-</w:t>
+            </w:r>
+          </w:p>
+        </w:tc>
+        <w:tc>
+          <w:tcPr>
+            <w:tcW w:w="2000" w:type="dxa"/>
+          </w:tcPr>
+          <w:p>
+            <w:pPr/>
+            <w:r>
+              <w:t xml:space="preserve">NOT NULL</w:t>
+            </w:r>
+          </w:p>
+        </w:tc>
+      </w:tr>
+    </w:tbl>
+    <w:p/>
+    <w:p>
+      <w:pPr/>
+      <w:r>
         <w:t xml:space="preserve">Table Name: pur_requisition</w:t>
       </w:r>
     </w:p>
@@ -49526,6 +50934,661 @@
             <w:pPr/>
             <w:r>
               <w:t xml:space="preserve">IS NULL</w:t>
+            </w:r>
+          </w:p>
+        </w:tc>
+      </w:tr>
+      <w:tr>
+        <w:trPr>
+          <w:trHeight w:val="530" w:hRule="atLeast"/>
+        </w:trPr>
+        <w:tc>
+          <w:tcPr>
+            <w:tcW w:w="2000" w:type="dxa"/>
+          </w:tcPr>
+          <w:p>
+            <w:pPr/>
+            <w:r>
+              <w:t xml:space="preserve">company_id</w:t>
+            </w:r>
+          </w:p>
+        </w:tc>
+        <w:tc>
+          <w:tcPr>
+            <w:tcW w:w="2000" w:type="dxa"/>
+          </w:tcPr>
+          <w:p>
+            <w:pPr/>
+            <w:r>
+              <w:t xml:space="preserve">bigint</w:t>
+            </w:r>
+          </w:p>
+        </w:tc>
+        <w:tc>
+          <w:tcPr>
+            <w:tcW w:w="2000" w:type="dxa"/>
+          </w:tcPr>
+          <w:p>
+            <w:pPr/>
+            <w:r>
+              <w:t xml:space="preserve">-</w:t>
+            </w:r>
+          </w:p>
+        </w:tc>
+        <w:tc>
+          <w:tcPr>
+            <w:tcW w:w="2000" w:type="dxa"/>
+          </w:tcPr>
+          <w:p>
+            <w:pPr/>
+            <w:r>
+              <w:t xml:space="preserve">FK, NOT NULL</w:t>
+            </w:r>
+          </w:p>
+        </w:tc>
+      </w:tr>
+      <w:tr>
+        <w:trPr>
+          <w:trHeight w:val="530" w:hRule="atLeast"/>
+        </w:trPr>
+        <w:tc>
+          <w:tcPr>
+            <w:tcW w:w="2000" w:type="dxa"/>
+          </w:tcPr>
+          <w:p>
+            <w:pPr/>
+            <w:r>
+              <w:t xml:space="preserve">created_at</w:t>
+            </w:r>
+          </w:p>
+        </w:tc>
+        <w:tc>
+          <w:tcPr>
+            <w:tcW w:w="2000" w:type="dxa"/>
+          </w:tcPr>
+          <w:p>
+            <w:pPr/>
+            <w:r>
+              <w:t xml:space="preserve">datetime2</w:t>
+            </w:r>
+          </w:p>
+        </w:tc>
+        <w:tc>
+          <w:tcPr>
+            <w:tcW w:w="2000" w:type="dxa"/>
+          </w:tcPr>
+          <w:p>
+            <w:pPr/>
+            <w:r>
+              <w:t xml:space="preserve">(6)</w:t>
+            </w:r>
+          </w:p>
+        </w:tc>
+        <w:tc>
+          <w:tcPr>
+            <w:tcW w:w="2000" w:type="dxa"/>
+          </w:tcPr>
+          <w:p>
+            <w:pPr/>
+            <w:r>
+              <w:t xml:space="preserve">NOT NULL</w:t>
+            </w:r>
+          </w:p>
+        </w:tc>
+      </w:tr>
+      <w:tr>
+        <w:trPr>
+          <w:trHeight w:val="530" w:hRule="atLeast"/>
+        </w:trPr>
+        <w:tc>
+          <w:tcPr>
+            <w:tcW w:w="2000" w:type="dxa"/>
+          </w:tcPr>
+          <w:p>
+            <w:pPr/>
+            <w:r>
+              <w:t xml:space="preserve">created_by</w:t>
+            </w:r>
+          </w:p>
+        </w:tc>
+        <w:tc>
+          <w:tcPr>
+            <w:tcW w:w="2000" w:type="dxa"/>
+          </w:tcPr>
+          <w:p>
+            <w:pPr/>
+            <w:r>
+              <w:t xml:space="preserve">bigint</w:t>
+            </w:r>
+          </w:p>
+        </w:tc>
+        <w:tc>
+          <w:tcPr>
+            <w:tcW w:w="2000" w:type="dxa"/>
+          </w:tcPr>
+          <w:p>
+            <w:pPr/>
+            <w:r>
+              <w:t xml:space="preserve">-</w:t>
+            </w:r>
+          </w:p>
+        </w:tc>
+        <w:tc>
+          <w:tcPr>
+            <w:tcW w:w="2000" w:type="dxa"/>
+          </w:tcPr>
+          <w:p>
+            <w:pPr/>
+            <w:r>
+              <w:t xml:space="preserve">NOT NULL</w:t>
+            </w:r>
+          </w:p>
+        </w:tc>
+      </w:tr>
+      <w:tr>
+        <w:trPr>
+          <w:trHeight w:val="530" w:hRule="atLeast"/>
+        </w:trPr>
+        <w:tc>
+          <w:tcPr>
+            <w:tcW w:w="2000" w:type="dxa"/>
+          </w:tcPr>
+          <w:p>
+            <w:pPr/>
+            <w:r>
+              <w:t xml:space="preserve">updated_at</w:t>
+            </w:r>
+          </w:p>
+        </w:tc>
+        <w:tc>
+          <w:tcPr>
+            <w:tcW w:w="2000" w:type="dxa"/>
+          </w:tcPr>
+          <w:p>
+            <w:pPr/>
+            <w:r>
+              <w:t xml:space="preserve">datetime2</w:t>
+            </w:r>
+          </w:p>
+        </w:tc>
+        <w:tc>
+          <w:tcPr>
+            <w:tcW w:w="2000" w:type="dxa"/>
+          </w:tcPr>
+          <w:p>
+            <w:pPr/>
+            <w:r>
+              <w:t xml:space="preserve">(6)</w:t>
+            </w:r>
+          </w:p>
+        </w:tc>
+        <w:tc>
+          <w:tcPr>
+            <w:tcW w:w="2000" w:type="dxa"/>
+          </w:tcPr>
+          <w:p>
+            <w:pPr/>
+            <w:r>
+              <w:t xml:space="preserve">IS NULL</w:t>
+            </w:r>
+          </w:p>
+        </w:tc>
+      </w:tr>
+      <w:tr>
+        <w:trPr>
+          <w:trHeight w:val="530" w:hRule="atLeast"/>
+        </w:trPr>
+        <w:tc>
+          <w:tcPr>
+            <w:tcW w:w="2000" w:type="dxa"/>
+          </w:tcPr>
+          <w:p>
+            <w:pPr/>
+            <w:r>
+              <w:t xml:space="preserve">updated_by</w:t>
+            </w:r>
+          </w:p>
+        </w:tc>
+        <w:tc>
+          <w:tcPr>
+            <w:tcW w:w="2000" w:type="dxa"/>
+          </w:tcPr>
+          <w:p>
+            <w:pPr/>
+            <w:r>
+              <w:t xml:space="preserve">bigint</w:t>
+            </w:r>
+          </w:p>
+        </w:tc>
+        <w:tc>
+          <w:tcPr>
+            <w:tcW w:w="2000" w:type="dxa"/>
+          </w:tcPr>
+          <w:p>
+            <w:pPr/>
+            <w:r>
+              <w:t xml:space="preserve">-</w:t>
+            </w:r>
+          </w:p>
+        </w:tc>
+        <w:tc>
+          <w:tcPr>
+            <w:tcW w:w="2000" w:type="dxa"/>
+          </w:tcPr>
+          <w:p>
+            <w:pPr/>
+            <w:r>
+              <w:t xml:space="preserve">IS NULL</w:t>
+            </w:r>
+          </w:p>
+        </w:tc>
+      </w:tr>
+      <w:tr>
+        <w:trPr>
+          <w:trHeight w:val="530" w:hRule="atLeast"/>
+        </w:trPr>
+        <w:tc>
+          <w:tcPr>
+            <w:tcW w:w="2000" w:type="dxa"/>
+          </w:tcPr>
+          <w:p>
+            <w:pPr/>
+            <w:r>
+              <w:t xml:space="preserve">version</w:t>
+            </w:r>
+          </w:p>
+        </w:tc>
+        <w:tc>
+          <w:tcPr>
+            <w:tcW w:w="2000" w:type="dxa"/>
+          </w:tcPr>
+          <w:p>
+            <w:pPr/>
+            <w:r>
+              <w:t xml:space="preserve">int</w:t>
+            </w:r>
+          </w:p>
+        </w:tc>
+        <w:tc>
+          <w:tcPr>
+            <w:tcW w:w="2000" w:type="dxa"/>
+          </w:tcPr>
+          <w:p>
+            <w:pPr/>
+            <w:r>
+              <w:t xml:space="preserve">-</w:t>
+            </w:r>
+          </w:p>
+        </w:tc>
+        <w:tc>
+          <w:tcPr>
+            <w:tcW w:w="2000" w:type="dxa"/>
+          </w:tcPr>
+          <w:p>
+            <w:pPr/>
+            <w:r>
+              <w:t xml:space="preserve">NOT NULL</w:t>
+            </w:r>
+          </w:p>
+        </w:tc>
+      </w:tr>
+    </w:tbl>
+    <w:p/>
+    <w:p>
+      <w:pPr/>
+      <w:r>
+        <w:t xml:space="preserve">Table Name: pur_supplier_quotation</w:t>
+      </w:r>
+    </w:p>
+    <w:p>
+      <w:pPr/>
+      <w:r>
+        <w:t xml:space="preserve">Primary Key: id</w:t>
+      </w:r>
+    </w:p>
+    <w:p>
+      <w:pPr/>
+      <w:r>
+        <w:t xml:space="preserve">This table stores one company-scoped supplier quotation header per RFQ invitation.</w:t>
+      </w:r>
+    </w:p>
+    <w:tbl>
+      <w:tblPr>
+        <w:tblStyle w:val="TableGrid"/>
+        <w:tblW w:w="8000" w:type="dxa"/>
+        <w:jc w:val="left"/>
+        <w:tblBorders>
+          <w:top w:val="single" w:color="000000" w:sz="4" w:space="0"/>
+          <w:left w:val="single" w:color="000000" w:sz="4" w:space="0"/>
+          <w:bottom w:val="single" w:color="000000" w:sz="4" w:space="0"/>
+          <w:right w:val="single" w:color="000000" w:sz="4" w:space="0"/>
+          <w:insideH w:val="single" w:color="000000" w:sz="4" w:space="0"/>
+          <w:insideV w:val="single" w:color="000000" w:sz="4" w:space="0"/>
+        </w:tblBorders>
+        <w:tblLayout w:type="fixed"/>
+        <w:tblCellMar>
+          <w:top w:w="100" w:type="dxa"/>
+          <w:left w:w="100" w:type="dxa"/>
+          <w:bottom w:w="100" w:type="dxa"/>
+          <w:right w:w="100" w:type="dxa"/>
+        </w:tblCellMar>
+      </w:tblPr>
+      <w:tblGrid>
+        <w:gridCol w:w="2000"/>
+        <w:gridCol w:w="2000"/>
+        <w:gridCol w:w="2000"/>
+        <w:gridCol w:w="2000"/>
+      </w:tblGrid>
+      <w:tr>
+        <w:trPr>
+          <w:trHeight w:val="530" w:hRule="atLeast"/>
+        </w:trPr>
+        <w:tc>
+          <w:tcPr>
+            <w:tcW w:w="2000" w:type="dxa"/>
+          </w:tcPr>
+          <w:p>
+            <w:pPr>
+              <w:jc w:val="center"/>
+            </w:pPr>
+            <w:r>
+              <w:rPr>
+                <w:b/>
+              </w:rPr>
+              <w:t xml:space="preserve">Name of Attribute</w:t>
+            </w:r>
+          </w:p>
+        </w:tc>
+        <w:tc>
+          <w:tcPr>
+            <w:tcW w:w="2000" w:type="dxa"/>
+          </w:tcPr>
+          <w:p>
+            <w:pPr>
+              <w:jc w:val="center"/>
+            </w:pPr>
+            <w:r>
+              <w:rPr>
+                <w:b/>
+              </w:rPr>
+              <w:t xml:space="preserve">Data Type</w:t>
+            </w:r>
+          </w:p>
+        </w:tc>
+        <w:tc>
+          <w:tcPr>
+            <w:tcW w:w="2000" w:type="dxa"/>
+          </w:tcPr>
+          <w:p>
+            <w:pPr>
+              <w:jc w:val="center"/>
+            </w:pPr>
+            <w:r>
+              <w:rPr>
+                <w:b/>
+              </w:rPr>
+              <w:t xml:space="preserve">Size</w:t>
+            </w:r>
+          </w:p>
+        </w:tc>
+        <w:tc>
+          <w:tcPr>
+            <w:tcW w:w="2000" w:type="dxa"/>
+          </w:tcPr>
+          <w:p>
+            <w:pPr>
+              <w:jc w:val="center"/>
+            </w:pPr>
+            <w:r>
+              <w:rPr>
+                <w:b/>
+              </w:rPr>
+              <w:t xml:space="preserve">PK/FK/IS NULL/ NOT NULL</w:t>
+            </w:r>
+          </w:p>
+        </w:tc>
+      </w:tr>
+      <w:tr>
+        <w:trPr>
+          <w:trHeight w:val="530" w:hRule="atLeast"/>
+        </w:trPr>
+        <w:tc>
+          <w:tcPr>
+            <w:tcW w:w="2000" w:type="dxa"/>
+          </w:tcPr>
+          <w:p>
+            <w:pPr/>
+            <w:r>
+              <w:t xml:space="preserve">id</w:t>
+            </w:r>
+          </w:p>
+        </w:tc>
+        <w:tc>
+          <w:tcPr>
+            <w:tcW w:w="2000" w:type="dxa"/>
+          </w:tcPr>
+          <w:p>
+            <w:pPr/>
+            <w:r>
+              <w:t xml:space="preserve">bigint</w:t>
+            </w:r>
+          </w:p>
+        </w:tc>
+        <w:tc>
+          <w:tcPr>
+            <w:tcW w:w="2000" w:type="dxa"/>
+          </w:tcPr>
+          <w:p>
+            <w:pPr/>
+            <w:r>
+              <w:t xml:space="preserve">-</w:t>
+            </w:r>
+          </w:p>
+        </w:tc>
+        <w:tc>
+          <w:tcPr>
+            <w:tcW w:w="2000" w:type="dxa"/>
+          </w:tcPr>
+          <w:p>
+            <w:pPr/>
+            <w:r>
+              <w:t xml:space="preserve">PK, NOT NULL</w:t>
+            </w:r>
+          </w:p>
+        </w:tc>
+      </w:tr>
+      <w:tr>
+        <w:trPr>
+          <w:trHeight w:val="530" w:hRule="atLeast"/>
+        </w:trPr>
+        <w:tc>
+          <w:tcPr>
+            <w:tcW w:w="2000" w:type="dxa"/>
+          </w:tcPr>
+          <w:p>
+            <w:pPr/>
+            <w:r>
+              <w:t xml:space="preserve">rfq_id</w:t>
+            </w:r>
+          </w:p>
+        </w:tc>
+        <w:tc>
+          <w:tcPr>
+            <w:tcW w:w="2000" w:type="dxa"/>
+          </w:tcPr>
+          <w:p>
+            <w:pPr/>
+            <w:r>
+              <w:t xml:space="preserve">bigint</w:t>
+            </w:r>
+          </w:p>
+        </w:tc>
+        <w:tc>
+          <w:tcPr>
+            <w:tcW w:w="2000" w:type="dxa"/>
+          </w:tcPr>
+          <w:p>
+            <w:pPr/>
+            <w:r>
+              <w:t xml:space="preserve">-</w:t>
+            </w:r>
+          </w:p>
+        </w:tc>
+        <w:tc>
+          <w:tcPr>
+            <w:tcW w:w="2000" w:type="dxa"/>
+          </w:tcPr>
+          <w:p>
+            <w:pPr/>
+            <w:r>
+              <w:t xml:space="preserve">FK, NOT NULL</w:t>
+            </w:r>
+          </w:p>
+        </w:tc>
+      </w:tr>
+      <w:tr>
+        <w:trPr>
+          <w:trHeight w:val="530" w:hRule="atLeast"/>
+        </w:trPr>
+        <w:tc>
+          <w:tcPr>
+            <w:tcW w:w="2000" w:type="dxa"/>
+          </w:tcPr>
+          <w:p>
+            <w:pPr/>
+            <w:r>
+              <w:t xml:space="preserve">supplier_id</w:t>
+            </w:r>
+          </w:p>
+        </w:tc>
+        <w:tc>
+          <w:tcPr>
+            <w:tcW w:w="2000" w:type="dxa"/>
+          </w:tcPr>
+          <w:p>
+            <w:pPr/>
+            <w:r>
+              <w:t xml:space="preserve">bigint</w:t>
+            </w:r>
+          </w:p>
+        </w:tc>
+        <w:tc>
+          <w:tcPr>
+            <w:tcW w:w="2000" w:type="dxa"/>
+          </w:tcPr>
+          <w:p>
+            <w:pPr/>
+            <w:r>
+              <w:t xml:space="preserve">-</w:t>
+            </w:r>
+          </w:p>
+        </w:tc>
+        <w:tc>
+          <w:tcPr>
+            <w:tcW w:w="2000" w:type="dxa"/>
+          </w:tcPr>
+          <w:p>
+            <w:pPr/>
+            <w:r>
+              <w:t xml:space="preserve">FK, NOT NULL</w:t>
+            </w:r>
+          </w:p>
+        </w:tc>
+      </w:tr>
+      <w:tr>
+        <w:trPr>
+          <w:trHeight w:val="530" w:hRule="atLeast"/>
+        </w:trPr>
+        <w:tc>
+          <w:tcPr>
+            <w:tcW w:w="2000" w:type="dxa"/>
+          </w:tcPr>
+          <w:p>
+            <w:pPr/>
+            <w:r>
+              <w:t xml:space="preserve">current_revision_no</w:t>
+            </w:r>
+          </w:p>
+        </w:tc>
+        <w:tc>
+          <w:tcPr>
+            <w:tcW w:w="2000" w:type="dxa"/>
+          </w:tcPr>
+          <w:p>
+            <w:pPr/>
+            <w:r>
+              <w:t xml:space="preserve">int</w:t>
+            </w:r>
+          </w:p>
+        </w:tc>
+        <w:tc>
+          <w:tcPr>
+            <w:tcW w:w="2000" w:type="dxa"/>
+          </w:tcPr>
+          <w:p>
+            <w:pPr/>
+            <w:r>
+              <w:t xml:space="preserve">-</w:t>
+            </w:r>
+          </w:p>
+        </w:tc>
+        <w:tc>
+          <w:tcPr>
+            <w:tcW w:w="2000" w:type="dxa"/>
+          </w:tcPr>
+          <w:p>
+            <w:pPr/>
+            <w:r>
+              <w:t xml:space="preserve">NOT NULL</w:t>
+            </w:r>
+          </w:p>
+        </w:tc>
+      </w:tr>
+      <w:tr>
+        <w:trPr>
+          <w:trHeight w:val="530" w:hRule="atLeast"/>
+        </w:trPr>
+        <w:tc>
+          <w:tcPr>
+            <w:tcW w:w="2000" w:type="dxa"/>
+          </w:tcPr>
+          <w:p>
+            <w:pPr/>
+            <w:r>
+              <w:t xml:space="preserve">status</w:t>
+            </w:r>
+          </w:p>
+        </w:tc>
+        <w:tc>
+          <w:tcPr>
+            <w:tcW w:w="2000" w:type="dxa"/>
+          </w:tcPr>
+          <w:p>
+            <w:pPr/>
+            <w:r>
+              <w:t xml:space="preserve">varchar</w:t>
+            </w:r>
+          </w:p>
+        </w:tc>
+        <w:tc>
+          <w:tcPr>
+            <w:tcW w:w="2000" w:type="dxa"/>
+          </w:tcPr>
+          <w:p>
+            <w:pPr/>
+            <w:r>
+              <w:t xml:space="preserve">30</w:t>
+            </w:r>
+          </w:p>
+        </w:tc>
+        <w:tc>
+          <w:tcPr>
+            <w:tcW w:w="2000" w:type="dxa"/>
+          </w:tcPr>
+          <w:p>
+            <w:pPr/>
+            <w:r>
+              <w:t xml:space="preserve">NOT NULL</w:t>
             </w:r>
           </w:p>
         </w:tc>
@@ -67008,7 +69071,7 @@
       </w:r>
     </w:p>
     <w:sectPr>
-      <w:footerReference xmlns:r="http://schemas.openxmlformats.org/officeDocument/2006/relationships" w:type="default" r:id="R8a9e1a7e2d734789"/>
+      <w:footerReference xmlns:r="http://schemas.openxmlformats.org/officeDocument/2006/relationships" w:type="default" r:id="R7950abb22c7c42a7"/>
       <w:pgSz w:w="11906" w:h="16838"/>
       <w:pgMar w:top="1440" w:right="1440" w:bottom="1440" w:left="1440" w:header="720" w:footer="720" w:gutter="0"/>
     </w:sectPr>

</xml_diff>

<commit_message>
feat(pur): add RFQ award snapshots and API
</commit_message>
<xml_diff>
--- a/docs/99-output/MyERP_SDS.docx
+++ b/docs/99-output/MyERP_SDS.docx
@@ -49477,6 +49477,1543 @@
             <w:pPr/>
             <w:r>
               <w:t xml:space="preserve">NOT NULL</w:t>
+            </w:r>
+          </w:p>
+        </w:tc>
+      </w:tr>
+      <w:tr>
+        <w:trPr>
+          <w:trHeight w:val="530" w:hRule="atLeast"/>
+        </w:trPr>
+        <w:tc>
+          <w:tcPr>
+            <w:tcW w:w="2000" w:type="dxa"/>
+          </w:tcPr>
+          <w:p>
+            <w:pPr/>
+            <w:r>
+              <w:t xml:space="preserve">created_at</w:t>
+            </w:r>
+          </w:p>
+        </w:tc>
+        <w:tc>
+          <w:tcPr>
+            <w:tcW w:w="2000" w:type="dxa"/>
+          </w:tcPr>
+          <w:p>
+            <w:pPr/>
+            <w:r>
+              <w:t xml:space="preserve">datetime2</w:t>
+            </w:r>
+          </w:p>
+        </w:tc>
+        <w:tc>
+          <w:tcPr>
+            <w:tcW w:w="2000" w:type="dxa"/>
+          </w:tcPr>
+          <w:p>
+            <w:pPr/>
+            <w:r>
+              <w:t xml:space="preserve">(6)</w:t>
+            </w:r>
+          </w:p>
+        </w:tc>
+        <w:tc>
+          <w:tcPr>
+            <w:tcW w:w="2000" w:type="dxa"/>
+          </w:tcPr>
+          <w:p>
+            <w:pPr/>
+            <w:r>
+              <w:t xml:space="preserve">NOT NULL</w:t>
+            </w:r>
+          </w:p>
+        </w:tc>
+      </w:tr>
+      <w:tr>
+        <w:trPr>
+          <w:trHeight w:val="530" w:hRule="atLeast"/>
+        </w:trPr>
+        <w:tc>
+          <w:tcPr>
+            <w:tcW w:w="2000" w:type="dxa"/>
+          </w:tcPr>
+          <w:p>
+            <w:pPr/>
+            <w:r>
+              <w:t xml:space="preserve">created_by</w:t>
+            </w:r>
+          </w:p>
+        </w:tc>
+        <w:tc>
+          <w:tcPr>
+            <w:tcW w:w="2000" w:type="dxa"/>
+          </w:tcPr>
+          <w:p>
+            <w:pPr/>
+            <w:r>
+              <w:t xml:space="preserve">bigint</w:t>
+            </w:r>
+          </w:p>
+        </w:tc>
+        <w:tc>
+          <w:tcPr>
+            <w:tcW w:w="2000" w:type="dxa"/>
+          </w:tcPr>
+          <w:p>
+            <w:pPr/>
+            <w:r>
+              <w:t xml:space="preserve">-</w:t>
+            </w:r>
+          </w:p>
+        </w:tc>
+        <w:tc>
+          <w:tcPr>
+            <w:tcW w:w="2000" w:type="dxa"/>
+          </w:tcPr>
+          <w:p>
+            <w:pPr/>
+            <w:r>
+              <w:t xml:space="preserve">NOT NULL</w:t>
+            </w:r>
+          </w:p>
+        </w:tc>
+      </w:tr>
+      <w:tr>
+        <w:trPr>
+          <w:trHeight w:val="530" w:hRule="atLeast"/>
+        </w:trPr>
+        <w:tc>
+          <w:tcPr>
+            <w:tcW w:w="2000" w:type="dxa"/>
+          </w:tcPr>
+          <w:p>
+            <w:pPr/>
+            <w:r>
+              <w:t xml:space="preserve">updated_at</w:t>
+            </w:r>
+          </w:p>
+        </w:tc>
+        <w:tc>
+          <w:tcPr>
+            <w:tcW w:w="2000" w:type="dxa"/>
+          </w:tcPr>
+          <w:p>
+            <w:pPr/>
+            <w:r>
+              <w:t xml:space="preserve">datetime2</w:t>
+            </w:r>
+          </w:p>
+        </w:tc>
+        <w:tc>
+          <w:tcPr>
+            <w:tcW w:w="2000" w:type="dxa"/>
+          </w:tcPr>
+          <w:p>
+            <w:pPr/>
+            <w:r>
+              <w:t xml:space="preserve">(6)</w:t>
+            </w:r>
+          </w:p>
+        </w:tc>
+        <w:tc>
+          <w:tcPr>
+            <w:tcW w:w="2000" w:type="dxa"/>
+          </w:tcPr>
+          <w:p>
+            <w:pPr/>
+            <w:r>
+              <w:t xml:space="preserve">IS NULL</w:t>
+            </w:r>
+          </w:p>
+        </w:tc>
+      </w:tr>
+      <w:tr>
+        <w:trPr>
+          <w:trHeight w:val="530" w:hRule="atLeast"/>
+        </w:trPr>
+        <w:tc>
+          <w:tcPr>
+            <w:tcW w:w="2000" w:type="dxa"/>
+          </w:tcPr>
+          <w:p>
+            <w:pPr/>
+            <w:r>
+              <w:t xml:space="preserve">updated_by</w:t>
+            </w:r>
+          </w:p>
+        </w:tc>
+        <w:tc>
+          <w:tcPr>
+            <w:tcW w:w="2000" w:type="dxa"/>
+          </w:tcPr>
+          <w:p>
+            <w:pPr/>
+            <w:r>
+              <w:t xml:space="preserve">bigint</w:t>
+            </w:r>
+          </w:p>
+        </w:tc>
+        <w:tc>
+          <w:tcPr>
+            <w:tcW w:w="2000" w:type="dxa"/>
+          </w:tcPr>
+          <w:p>
+            <w:pPr/>
+            <w:r>
+              <w:t xml:space="preserve">-</w:t>
+            </w:r>
+          </w:p>
+        </w:tc>
+        <w:tc>
+          <w:tcPr>
+            <w:tcW w:w="2000" w:type="dxa"/>
+          </w:tcPr>
+          <w:p>
+            <w:pPr/>
+            <w:r>
+              <w:t xml:space="preserve">IS NULL</w:t>
+            </w:r>
+          </w:p>
+        </w:tc>
+      </w:tr>
+      <w:tr>
+        <w:trPr>
+          <w:trHeight w:val="530" w:hRule="atLeast"/>
+        </w:trPr>
+        <w:tc>
+          <w:tcPr>
+            <w:tcW w:w="2000" w:type="dxa"/>
+          </w:tcPr>
+          <w:p>
+            <w:pPr/>
+            <w:r>
+              <w:t xml:space="preserve">version</w:t>
+            </w:r>
+          </w:p>
+        </w:tc>
+        <w:tc>
+          <w:tcPr>
+            <w:tcW w:w="2000" w:type="dxa"/>
+          </w:tcPr>
+          <w:p>
+            <w:pPr/>
+            <w:r>
+              <w:t xml:space="preserve">int</w:t>
+            </w:r>
+          </w:p>
+        </w:tc>
+        <w:tc>
+          <w:tcPr>
+            <w:tcW w:w="2000" w:type="dxa"/>
+          </w:tcPr>
+          <w:p>
+            <w:pPr/>
+            <w:r>
+              <w:t xml:space="preserve">-</w:t>
+            </w:r>
+          </w:p>
+        </w:tc>
+        <w:tc>
+          <w:tcPr>
+            <w:tcW w:w="2000" w:type="dxa"/>
+          </w:tcPr>
+          <w:p>
+            <w:pPr/>
+            <w:r>
+              <w:t xml:space="preserve">NOT NULL</w:t>
+            </w:r>
+          </w:p>
+        </w:tc>
+      </w:tr>
+    </w:tbl>
+    <w:p/>
+    <w:p>
+      <w:pPr/>
+      <w:r>
+        <w:t xml:space="preserve">Table Name: pur_rfq_award</w:t>
+      </w:r>
+    </w:p>
+    <w:p>
+      <w:pPr/>
+      <w:r>
+        <w:t xml:space="preserve">Primary Key: id</w:t>
+      </w:r>
+    </w:p>
+    <w:p>
+      <w:pPr/>
+      <w:r>
+        <w:t xml:space="preserve">This table stores immutable per-line quotation awards and dated commercial snapshots.</w:t>
+      </w:r>
+    </w:p>
+    <w:tbl>
+      <w:tblPr>
+        <w:tblStyle w:val="TableGrid"/>
+        <w:tblW w:w="8000" w:type="dxa"/>
+        <w:jc w:val="left"/>
+        <w:tblBorders>
+          <w:top w:val="single" w:color="000000" w:sz="4" w:space="0"/>
+          <w:left w:val="single" w:color="000000" w:sz="4" w:space="0"/>
+          <w:bottom w:val="single" w:color="000000" w:sz="4" w:space="0"/>
+          <w:right w:val="single" w:color="000000" w:sz="4" w:space="0"/>
+          <w:insideH w:val="single" w:color="000000" w:sz="4" w:space="0"/>
+          <w:insideV w:val="single" w:color="000000" w:sz="4" w:space="0"/>
+        </w:tblBorders>
+        <w:tblLayout w:type="fixed"/>
+        <w:tblCellMar>
+          <w:top w:w="100" w:type="dxa"/>
+          <w:left w:w="100" w:type="dxa"/>
+          <w:bottom w:w="100" w:type="dxa"/>
+          <w:right w:w="100" w:type="dxa"/>
+        </w:tblCellMar>
+      </w:tblPr>
+      <w:tblGrid>
+        <w:gridCol w:w="2000"/>
+        <w:gridCol w:w="2000"/>
+        <w:gridCol w:w="2000"/>
+        <w:gridCol w:w="2000"/>
+      </w:tblGrid>
+      <w:tr>
+        <w:trPr>
+          <w:trHeight w:val="530" w:hRule="atLeast"/>
+        </w:trPr>
+        <w:tc>
+          <w:tcPr>
+            <w:tcW w:w="2000" w:type="dxa"/>
+          </w:tcPr>
+          <w:p>
+            <w:pPr>
+              <w:jc w:val="center"/>
+            </w:pPr>
+            <w:r>
+              <w:rPr>
+                <w:b/>
+              </w:rPr>
+              <w:t xml:space="preserve">Name of Attribute</w:t>
+            </w:r>
+          </w:p>
+        </w:tc>
+        <w:tc>
+          <w:tcPr>
+            <w:tcW w:w="2000" w:type="dxa"/>
+          </w:tcPr>
+          <w:p>
+            <w:pPr>
+              <w:jc w:val="center"/>
+            </w:pPr>
+            <w:r>
+              <w:rPr>
+                <w:b/>
+              </w:rPr>
+              <w:t xml:space="preserve">Data Type</w:t>
+            </w:r>
+          </w:p>
+        </w:tc>
+        <w:tc>
+          <w:tcPr>
+            <w:tcW w:w="2000" w:type="dxa"/>
+          </w:tcPr>
+          <w:p>
+            <w:pPr>
+              <w:jc w:val="center"/>
+            </w:pPr>
+            <w:r>
+              <w:rPr>
+                <w:b/>
+              </w:rPr>
+              <w:t xml:space="preserve">Size</w:t>
+            </w:r>
+          </w:p>
+        </w:tc>
+        <w:tc>
+          <w:tcPr>
+            <w:tcW w:w="2000" w:type="dxa"/>
+          </w:tcPr>
+          <w:p>
+            <w:pPr>
+              <w:jc w:val="center"/>
+            </w:pPr>
+            <w:r>
+              <w:rPr>
+                <w:b/>
+              </w:rPr>
+              <w:t xml:space="preserve">PK/FK/IS NULL/ NOT NULL</w:t>
+            </w:r>
+          </w:p>
+        </w:tc>
+      </w:tr>
+      <w:tr>
+        <w:trPr>
+          <w:trHeight w:val="530" w:hRule="atLeast"/>
+        </w:trPr>
+        <w:tc>
+          <w:tcPr>
+            <w:tcW w:w="2000" w:type="dxa"/>
+          </w:tcPr>
+          <w:p>
+            <w:pPr/>
+            <w:r>
+              <w:t xml:space="preserve">id</w:t>
+            </w:r>
+          </w:p>
+        </w:tc>
+        <w:tc>
+          <w:tcPr>
+            <w:tcW w:w="2000" w:type="dxa"/>
+          </w:tcPr>
+          <w:p>
+            <w:pPr/>
+            <w:r>
+              <w:t xml:space="preserve">bigint</w:t>
+            </w:r>
+          </w:p>
+        </w:tc>
+        <w:tc>
+          <w:tcPr>
+            <w:tcW w:w="2000" w:type="dxa"/>
+          </w:tcPr>
+          <w:p>
+            <w:pPr/>
+            <w:r>
+              <w:t xml:space="preserve">-</w:t>
+            </w:r>
+          </w:p>
+        </w:tc>
+        <w:tc>
+          <w:tcPr>
+            <w:tcW w:w="2000" w:type="dxa"/>
+          </w:tcPr>
+          <w:p>
+            <w:pPr/>
+            <w:r>
+              <w:t xml:space="preserve">PK, NOT NULL</w:t>
+            </w:r>
+          </w:p>
+        </w:tc>
+      </w:tr>
+      <w:tr>
+        <w:trPr>
+          <w:trHeight w:val="530" w:hRule="atLeast"/>
+        </w:trPr>
+        <w:tc>
+          <w:tcPr>
+            <w:tcW w:w="2000" w:type="dxa"/>
+          </w:tcPr>
+          <w:p>
+            <w:pPr/>
+            <w:r>
+              <w:t xml:space="preserve">rfq_id</w:t>
+            </w:r>
+          </w:p>
+        </w:tc>
+        <w:tc>
+          <w:tcPr>
+            <w:tcW w:w="2000" w:type="dxa"/>
+          </w:tcPr>
+          <w:p>
+            <w:pPr/>
+            <w:r>
+              <w:t xml:space="preserve">bigint</w:t>
+            </w:r>
+          </w:p>
+        </w:tc>
+        <w:tc>
+          <w:tcPr>
+            <w:tcW w:w="2000" w:type="dxa"/>
+          </w:tcPr>
+          <w:p>
+            <w:pPr/>
+            <w:r>
+              <w:t xml:space="preserve">-</w:t>
+            </w:r>
+          </w:p>
+        </w:tc>
+        <w:tc>
+          <w:tcPr>
+            <w:tcW w:w="2000" w:type="dxa"/>
+          </w:tcPr>
+          <w:p>
+            <w:pPr/>
+            <w:r>
+              <w:t xml:space="preserve">NOT NULL</w:t>
+            </w:r>
+          </w:p>
+        </w:tc>
+      </w:tr>
+      <w:tr>
+        <w:trPr>
+          <w:trHeight w:val="530" w:hRule="atLeast"/>
+        </w:trPr>
+        <w:tc>
+          <w:tcPr>
+            <w:tcW w:w="2000" w:type="dxa"/>
+          </w:tcPr>
+          <w:p>
+            <w:pPr/>
+            <w:r>
+              <w:t xml:space="preserve">rfq_line_id</w:t>
+            </w:r>
+          </w:p>
+        </w:tc>
+        <w:tc>
+          <w:tcPr>
+            <w:tcW w:w="2000" w:type="dxa"/>
+          </w:tcPr>
+          <w:p>
+            <w:pPr/>
+            <w:r>
+              <w:t xml:space="preserve">bigint</w:t>
+            </w:r>
+          </w:p>
+        </w:tc>
+        <w:tc>
+          <w:tcPr>
+            <w:tcW w:w="2000" w:type="dxa"/>
+          </w:tcPr>
+          <w:p>
+            <w:pPr/>
+            <w:r>
+              <w:t xml:space="preserve">-</w:t>
+            </w:r>
+          </w:p>
+        </w:tc>
+        <w:tc>
+          <w:tcPr>
+            <w:tcW w:w="2000" w:type="dxa"/>
+          </w:tcPr>
+          <w:p>
+            <w:pPr/>
+            <w:r>
+              <w:t xml:space="preserve">FK, NOT NULL</w:t>
+            </w:r>
+          </w:p>
+        </w:tc>
+      </w:tr>
+      <w:tr>
+        <w:trPr>
+          <w:trHeight w:val="530" w:hRule="atLeast"/>
+        </w:trPr>
+        <w:tc>
+          <w:tcPr>
+            <w:tcW w:w="2000" w:type="dxa"/>
+          </w:tcPr>
+          <w:p>
+            <w:pPr/>
+            <w:r>
+              <w:t xml:space="preserve">quotation_id</w:t>
+            </w:r>
+          </w:p>
+        </w:tc>
+        <w:tc>
+          <w:tcPr>
+            <w:tcW w:w="2000" w:type="dxa"/>
+          </w:tcPr>
+          <w:p>
+            <w:pPr/>
+            <w:r>
+              <w:t xml:space="preserve">bigint</w:t>
+            </w:r>
+          </w:p>
+        </w:tc>
+        <w:tc>
+          <w:tcPr>
+            <w:tcW w:w="2000" w:type="dxa"/>
+          </w:tcPr>
+          <w:p>
+            <w:pPr/>
+            <w:r>
+              <w:t xml:space="preserve">-</w:t>
+            </w:r>
+          </w:p>
+        </w:tc>
+        <w:tc>
+          <w:tcPr>
+            <w:tcW w:w="2000" w:type="dxa"/>
+          </w:tcPr>
+          <w:p>
+            <w:pPr/>
+            <w:r>
+              <w:t xml:space="preserve">NOT NULL</w:t>
+            </w:r>
+          </w:p>
+        </w:tc>
+      </w:tr>
+      <w:tr>
+        <w:trPr>
+          <w:trHeight w:val="530" w:hRule="atLeast"/>
+        </w:trPr>
+        <w:tc>
+          <w:tcPr>
+            <w:tcW w:w="2000" w:type="dxa"/>
+          </w:tcPr>
+          <w:p>
+            <w:pPr/>
+            <w:r>
+              <w:t xml:space="preserve">quotation_line_id</w:t>
+            </w:r>
+          </w:p>
+        </w:tc>
+        <w:tc>
+          <w:tcPr>
+            <w:tcW w:w="2000" w:type="dxa"/>
+          </w:tcPr>
+          <w:p>
+            <w:pPr/>
+            <w:r>
+              <w:t xml:space="preserve">bigint</w:t>
+            </w:r>
+          </w:p>
+        </w:tc>
+        <w:tc>
+          <w:tcPr>
+            <w:tcW w:w="2000" w:type="dxa"/>
+          </w:tcPr>
+          <w:p>
+            <w:pPr/>
+            <w:r>
+              <w:t xml:space="preserve">-</w:t>
+            </w:r>
+          </w:p>
+        </w:tc>
+        <w:tc>
+          <w:tcPr>
+            <w:tcW w:w="2000" w:type="dxa"/>
+          </w:tcPr>
+          <w:p>
+            <w:pPr/>
+            <w:r>
+              <w:t xml:space="preserve">FK, NOT NULL</w:t>
+            </w:r>
+          </w:p>
+        </w:tc>
+      </w:tr>
+      <w:tr>
+        <w:trPr>
+          <w:trHeight w:val="530" w:hRule="atLeast"/>
+        </w:trPr>
+        <w:tc>
+          <w:tcPr>
+            <w:tcW w:w="2000" w:type="dxa"/>
+          </w:tcPr>
+          <w:p>
+            <w:pPr/>
+            <w:r>
+              <w:t xml:space="preserve">supplier_id</w:t>
+            </w:r>
+          </w:p>
+        </w:tc>
+        <w:tc>
+          <w:tcPr>
+            <w:tcW w:w="2000" w:type="dxa"/>
+          </w:tcPr>
+          <w:p>
+            <w:pPr/>
+            <w:r>
+              <w:t xml:space="preserve">bigint</w:t>
+            </w:r>
+          </w:p>
+        </w:tc>
+        <w:tc>
+          <w:tcPr>
+            <w:tcW w:w="2000" w:type="dxa"/>
+          </w:tcPr>
+          <w:p>
+            <w:pPr/>
+            <w:r>
+              <w:t xml:space="preserve">-</w:t>
+            </w:r>
+          </w:p>
+        </w:tc>
+        <w:tc>
+          <w:tcPr>
+            <w:tcW w:w="2000" w:type="dxa"/>
+          </w:tcPr>
+          <w:p>
+            <w:pPr/>
+            <w:r>
+              <w:t xml:space="preserve">NOT NULL</w:t>
+            </w:r>
+          </w:p>
+        </w:tc>
+      </w:tr>
+      <w:tr>
+        <w:trPr>
+          <w:trHeight w:val="530" w:hRule="atLeast"/>
+        </w:trPr>
+        <w:tc>
+          <w:tcPr>
+            <w:tcW w:w="2000" w:type="dxa"/>
+          </w:tcPr>
+          <w:p>
+            <w:pPr/>
+            <w:r>
+              <w:t xml:space="preserve">reason</w:t>
+            </w:r>
+          </w:p>
+        </w:tc>
+        <w:tc>
+          <w:tcPr>
+            <w:tcW w:w="2000" w:type="dxa"/>
+          </w:tcPr>
+          <w:p>
+            <w:pPr/>
+            <w:r>
+              <w:t xml:space="preserve">nvarchar</w:t>
+            </w:r>
+          </w:p>
+        </w:tc>
+        <w:tc>
+          <w:tcPr>
+            <w:tcW w:w="2000" w:type="dxa"/>
+          </w:tcPr>
+          <w:p>
+            <w:pPr/>
+            <w:r>
+              <w:t xml:space="preserve">500</w:t>
+            </w:r>
+          </w:p>
+        </w:tc>
+        <w:tc>
+          <w:tcPr>
+            <w:tcW w:w="2000" w:type="dxa"/>
+          </w:tcPr>
+          <w:p>
+            <w:pPr/>
+            <w:r>
+              <w:t xml:space="preserve">NOT NULL</w:t>
+            </w:r>
+          </w:p>
+        </w:tc>
+      </w:tr>
+      <w:tr>
+        <w:trPr>
+          <w:trHeight w:val="530" w:hRule="atLeast"/>
+        </w:trPr>
+        <w:tc>
+          <w:tcPr>
+            <w:tcW w:w="2000" w:type="dxa"/>
+          </w:tcPr>
+          <w:p>
+            <w:pPr/>
+            <w:r>
+              <w:t xml:space="preserve">quantity</w:t>
+            </w:r>
+          </w:p>
+        </w:tc>
+        <w:tc>
+          <w:tcPr>
+            <w:tcW w:w="2000" w:type="dxa"/>
+          </w:tcPr>
+          <w:p>
+            <w:pPr/>
+            <w:r>
+              <w:t xml:space="preserve">decimal</w:t>
+            </w:r>
+          </w:p>
+        </w:tc>
+        <w:tc>
+          <w:tcPr>
+            <w:tcW w:w="2000" w:type="dxa"/>
+          </w:tcPr>
+          <w:p>
+            <w:pPr/>
+            <w:r>
+              <w:t xml:space="preserve">(19,6)</w:t>
+            </w:r>
+          </w:p>
+        </w:tc>
+        <w:tc>
+          <w:tcPr>
+            <w:tcW w:w="2000" w:type="dxa"/>
+          </w:tcPr>
+          <w:p>
+            <w:pPr/>
+            <w:r>
+              <w:t xml:space="preserve">NOT NULL</w:t>
+            </w:r>
+          </w:p>
+        </w:tc>
+      </w:tr>
+      <w:tr>
+        <w:trPr>
+          <w:trHeight w:val="530" w:hRule="atLeast"/>
+        </w:trPr>
+        <w:tc>
+          <w:tcPr>
+            <w:tcW w:w="2000" w:type="dxa"/>
+          </w:tcPr>
+          <w:p>
+            <w:pPr/>
+            <w:r>
+              <w:t xml:space="preserve">unit_price</w:t>
+            </w:r>
+          </w:p>
+        </w:tc>
+        <w:tc>
+          <w:tcPr>
+            <w:tcW w:w="2000" w:type="dxa"/>
+          </w:tcPr>
+          <w:p>
+            <w:pPr/>
+            <w:r>
+              <w:t xml:space="preserve">decimal</w:t>
+            </w:r>
+          </w:p>
+        </w:tc>
+        <w:tc>
+          <w:tcPr>
+            <w:tcW w:w="2000" w:type="dxa"/>
+          </w:tcPr>
+          <w:p>
+            <w:pPr/>
+            <w:r>
+              <w:t xml:space="preserve">(19,6)</w:t>
+            </w:r>
+          </w:p>
+        </w:tc>
+        <w:tc>
+          <w:tcPr>
+            <w:tcW w:w="2000" w:type="dxa"/>
+          </w:tcPr>
+          <w:p>
+            <w:pPr/>
+            <w:r>
+              <w:t xml:space="preserve">NOT NULL</w:t>
+            </w:r>
+          </w:p>
+        </w:tc>
+      </w:tr>
+      <w:tr>
+        <w:trPr>
+          <w:trHeight w:val="530" w:hRule="atLeast"/>
+        </w:trPr>
+        <w:tc>
+          <w:tcPr>
+            <w:tcW w:w="2000" w:type="dxa"/>
+          </w:tcPr>
+          <w:p>
+            <w:pPr/>
+            <w:r>
+              <w:t xml:space="preserve">currency_code</w:t>
+            </w:r>
+          </w:p>
+        </w:tc>
+        <w:tc>
+          <w:tcPr>
+            <w:tcW w:w="2000" w:type="dxa"/>
+          </w:tcPr>
+          <w:p>
+            <w:pPr/>
+            <w:r>
+              <w:t xml:space="preserve">char</w:t>
+            </w:r>
+          </w:p>
+        </w:tc>
+        <w:tc>
+          <w:tcPr>
+            <w:tcW w:w="2000" w:type="dxa"/>
+          </w:tcPr>
+          <w:p>
+            <w:pPr/>
+            <w:r>
+              <w:t xml:space="preserve">3</w:t>
+            </w:r>
+          </w:p>
+        </w:tc>
+        <w:tc>
+          <w:tcPr>
+            <w:tcW w:w="2000" w:type="dxa"/>
+          </w:tcPr>
+          <w:p>
+            <w:pPr/>
+            <w:r>
+              <w:t xml:space="preserve">NOT NULL</w:t>
+            </w:r>
+          </w:p>
+        </w:tc>
+      </w:tr>
+      <w:tr>
+        <w:trPr>
+          <w:trHeight w:val="530" w:hRule="atLeast"/>
+        </w:trPr>
+        <w:tc>
+          <w:tcPr>
+            <w:tcW w:w="2000" w:type="dxa"/>
+          </w:tcPr>
+          <w:p>
+            <w:pPr/>
+            <w:r>
+              <w:t xml:space="preserve">base_currency_code</w:t>
+            </w:r>
+          </w:p>
+        </w:tc>
+        <w:tc>
+          <w:tcPr>
+            <w:tcW w:w="2000" w:type="dxa"/>
+          </w:tcPr>
+          <w:p>
+            <w:pPr/>
+            <w:r>
+              <w:t xml:space="preserve">char</w:t>
+            </w:r>
+          </w:p>
+        </w:tc>
+        <w:tc>
+          <w:tcPr>
+            <w:tcW w:w="2000" w:type="dxa"/>
+          </w:tcPr>
+          <w:p>
+            <w:pPr/>
+            <w:r>
+              <w:t xml:space="preserve">3</w:t>
+            </w:r>
+          </w:p>
+        </w:tc>
+        <w:tc>
+          <w:tcPr>
+            <w:tcW w:w="2000" w:type="dxa"/>
+          </w:tcPr>
+          <w:p>
+            <w:pPr/>
+            <w:r>
+              <w:t xml:space="preserve">NOT NULL</w:t>
+            </w:r>
+          </w:p>
+        </w:tc>
+      </w:tr>
+      <w:tr>
+        <w:trPr>
+          <w:trHeight w:val="530" w:hRule="atLeast"/>
+        </w:trPr>
+        <w:tc>
+          <w:tcPr>
+            <w:tcW w:w="2000" w:type="dxa"/>
+          </w:tcPr>
+          <w:p>
+            <w:pPr/>
+            <w:r>
+              <w:t xml:space="preserve">tax_rate_id</w:t>
+            </w:r>
+          </w:p>
+        </w:tc>
+        <w:tc>
+          <w:tcPr>
+            <w:tcW w:w="2000" w:type="dxa"/>
+          </w:tcPr>
+          <w:p>
+            <w:pPr/>
+            <w:r>
+              <w:t xml:space="preserve">bigint</w:t>
+            </w:r>
+          </w:p>
+        </w:tc>
+        <w:tc>
+          <w:tcPr>
+            <w:tcW w:w="2000" w:type="dxa"/>
+          </w:tcPr>
+          <w:p>
+            <w:pPr/>
+            <w:r>
+              <w:t xml:space="preserve">-</w:t>
+            </w:r>
+          </w:p>
+        </w:tc>
+        <w:tc>
+          <w:tcPr>
+            <w:tcW w:w="2000" w:type="dxa"/>
+          </w:tcPr>
+          <w:p>
+            <w:pPr/>
+            <w:r>
+              <w:t xml:space="preserve">NOT NULL</w:t>
+            </w:r>
+          </w:p>
+        </w:tc>
+      </w:tr>
+      <w:tr>
+        <w:trPr>
+          <w:trHeight w:val="530" w:hRule="atLeast"/>
+        </w:trPr>
+        <w:tc>
+          <w:tcPr>
+            <w:tcW w:w="2000" w:type="dxa"/>
+          </w:tcPr>
+          <w:p>
+            <w:pPr/>
+            <w:r>
+              <w:t xml:space="preserve">tax_rate_percent</w:t>
+            </w:r>
+          </w:p>
+        </w:tc>
+        <w:tc>
+          <w:tcPr>
+            <w:tcW w:w="2000" w:type="dxa"/>
+          </w:tcPr>
+          <w:p>
+            <w:pPr/>
+            <w:r>
+              <w:t xml:space="preserve">decimal</w:t>
+            </w:r>
+          </w:p>
+        </w:tc>
+        <w:tc>
+          <w:tcPr>
+            <w:tcW w:w="2000" w:type="dxa"/>
+          </w:tcPr>
+          <w:p>
+            <w:pPr/>
+            <w:r>
+              <w:t xml:space="preserve">(9,4)</w:t>
+            </w:r>
+          </w:p>
+        </w:tc>
+        <w:tc>
+          <w:tcPr>
+            <w:tcW w:w="2000" w:type="dxa"/>
+          </w:tcPr>
+          <w:p>
+            <w:pPr/>
+            <w:r>
+              <w:t xml:space="preserve">NOT NULL</w:t>
+            </w:r>
+          </w:p>
+        </w:tc>
+      </w:tr>
+      <w:tr>
+        <w:trPr>
+          <w:trHeight w:val="530" w:hRule="atLeast"/>
+        </w:trPr>
+        <w:tc>
+          <w:tcPr>
+            <w:tcW w:w="2000" w:type="dxa"/>
+          </w:tcPr>
+          <w:p>
+            <w:pPr/>
+            <w:r>
+              <w:t xml:space="preserve">tax_rate_from</w:t>
+            </w:r>
+          </w:p>
+        </w:tc>
+        <w:tc>
+          <w:tcPr>
+            <w:tcW w:w="2000" w:type="dxa"/>
+          </w:tcPr>
+          <w:p>
+            <w:pPr/>
+            <w:r>
+              <w:t xml:space="preserve">date</w:t>
+            </w:r>
+          </w:p>
+        </w:tc>
+        <w:tc>
+          <w:tcPr>
+            <w:tcW w:w="2000" w:type="dxa"/>
+          </w:tcPr>
+          <w:p>
+            <w:pPr/>
+            <w:r>
+              <w:t xml:space="preserve">-</w:t>
+            </w:r>
+          </w:p>
+        </w:tc>
+        <w:tc>
+          <w:tcPr>
+            <w:tcW w:w="2000" w:type="dxa"/>
+          </w:tcPr>
+          <w:p>
+            <w:pPr/>
+            <w:r>
+              <w:t xml:space="preserve">NOT NULL</w:t>
+            </w:r>
+          </w:p>
+        </w:tc>
+      </w:tr>
+      <w:tr>
+        <w:trPr>
+          <w:trHeight w:val="530" w:hRule="atLeast"/>
+        </w:trPr>
+        <w:tc>
+          <w:tcPr>
+            <w:tcW w:w="2000" w:type="dxa"/>
+          </w:tcPr>
+          <w:p>
+            <w:pPr/>
+            <w:r>
+              <w:t xml:space="preserve">tax_rate_to</w:t>
+            </w:r>
+          </w:p>
+        </w:tc>
+        <w:tc>
+          <w:tcPr>
+            <w:tcW w:w="2000" w:type="dxa"/>
+          </w:tcPr>
+          <w:p>
+            <w:pPr/>
+            <w:r>
+              <w:t xml:space="preserve">date</w:t>
+            </w:r>
+          </w:p>
+        </w:tc>
+        <w:tc>
+          <w:tcPr>
+            <w:tcW w:w="2000" w:type="dxa"/>
+          </w:tcPr>
+          <w:p>
+            <w:pPr/>
+            <w:r>
+              <w:t xml:space="preserve">-</w:t>
+            </w:r>
+          </w:p>
+        </w:tc>
+        <w:tc>
+          <w:tcPr>
+            <w:tcW w:w="2000" w:type="dxa"/>
+          </w:tcPr>
+          <w:p>
+            <w:pPr/>
+            <w:r>
+              <w:t xml:space="preserve">IS NULL</w:t>
+            </w:r>
+          </w:p>
+        </w:tc>
+      </w:tr>
+      <w:tr>
+        <w:trPr>
+          <w:trHeight w:val="530" w:hRule="atLeast"/>
+        </w:trPr>
+        <w:tc>
+          <w:tcPr>
+            <w:tcW w:w="2000" w:type="dxa"/>
+          </w:tcPr>
+          <w:p>
+            <w:pPr/>
+            <w:r>
+              <w:t xml:space="preserve">exchange_rate</w:t>
+            </w:r>
+          </w:p>
+        </w:tc>
+        <w:tc>
+          <w:tcPr>
+            <w:tcW w:w="2000" w:type="dxa"/>
+          </w:tcPr>
+          <w:p>
+            <w:pPr/>
+            <w:r>
+              <w:t xml:space="preserve">decimal</w:t>
+            </w:r>
+          </w:p>
+        </w:tc>
+        <w:tc>
+          <w:tcPr>
+            <w:tcW w:w="2000" w:type="dxa"/>
+          </w:tcPr>
+          <w:p>
+            <w:pPr/>
+            <w:r>
+              <w:t xml:space="preserve">(19,8)</w:t>
+            </w:r>
+          </w:p>
+        </w:tc>
+        <w:tc>
+          <w:tcPr>
+            <w:tcW w:w="2000" w:type="dxa"/>
+          </w:tcPr>
+          <w:p>
+            <w:pPr/>
+            <w:r>
+              <w:t xml:space="preserve">NOT NULL</w:t>
+            </w:r>
+          </w:p>
+        </w:tc>
+      </w:tr>
+      <w:tr>
+        <w:trPr>
+          <w:trHeight w:val="530" w:hRule="atLeast"/>
+        </w:trPr>
+        <w:tc>
+          <w:tcPr>
+            <w:tcW w:w="2000" w:type="dxa"/>
+          </w:tcPr>
+          <w:p>
+            <w:pPr/>
+            <w:r>
+              <w:t xml:space="preserve">exchange_rate_id</w:t>
+            </w:r>
+          </w:p>
+        </w:tc>
+        <w:tc>
+          <w:tcPr>
+            <w:tcW w:w="2000" w:type="dxa"/>
+          </w:tcPr>
+          <w:p>
+            <w:pPr/>
+            <w:r>
+              <w:t xml:space="preserve">bigint</w:t>
+            </w:r>
+          </w:p>
+        </w:tc>
+        <w:tc>
+          <w:tcPr>
+            <w:tcW w:w="2000" w:type="dxa"/>
+          </w:tcPr>
+          <w:p>
+            <w:pPr/>
+            <w:r>
+              <w:t xml:space="preserve">-</w:t>
+            </w:r>
+          </w:p>
+        </w:tc>
+        <w:tc>
+          <w:tcPr>
+            <w:tcW w:w="2000" w:type="dxa"/>
+          </w:tcPr>
+          <w:p>
+            <w:pPr/>
+            <w:r>
+              <w:t xml:space="preserve">IS NULL</w:t>
+            </w:r>
+          </w:p>
+        </w:tc>
+      </w:tr>
+      <w:tr>
+        <w:trPr>
+          <w:trHeight w:val="530" w:hRule="atLeast"/>
+        </w:trPr>
+        <w:tc>
+          <w:tcPr>
+            <w:tcW w:w="2000" w:type="dxa"/>
+          </w:tcPr>
+          <w:p>
+            <w:pPr/>
+            <w:r>
+              <w:t xml:space="preserve">exchange_rate_from</w:t>
+            </w:r>
+          </w:p>
+        </w:tc>
+        <w:tc>
+          <w:tcPr>
+            <w:tcW w:w="2000" w:type="dxa"/>
+          </w:tcPr>
+          <w:p>
+            <w:pPr/>
+            <w:r>
+              <w:t xml:space="preserve">date</w:t>
+            </w:r>
+          </w:p>
+        </w:tc>
+        <w:tc>
+          <w:tcPr>
+            <w:tcW w:w="2000" w:type="dxa"/>
+          </w:tcPr>
+          <w:p>
+            <w:pPr/>
+            <w:r>
+              <w:t xml:space="preserve">-</w:t>
+            </w:r>
+          </w:p>
+        </w:tc>
+        <w:tc>
+          <w:tcPr>
+            <w:tcW w:w="2000" w:type="dxa"/>
+          </w:tcPr>
+          <w:p>
+            <w:pPr/>
+            <w:r>
+              <w:t xml:space="preserve">NOT NULL</w:t>
+            </w:r>
+          </w:p>
+        </w:tc>
+      </w:tr>
+      <w:tr>
+        <w:trPr>
+          <w:trHeight w:val="530" w:hRule="atLeast"/>
+        </w:trPr>
+        <w:tc>
+          <w:tcPr>
+            <w:tcW w:w="2000" w:type="dxa"/>
+          </w:tcPr>
+          <w:p>
+            <w:pPr/>
+            <w:r>
+              <w:t xml:space="preserve">exchange_rate_to</w:t>
+            </w:r>
+          </w:p>
+        </w:tc>
+        <w:tc>
+          <w:tcPr>
+            <w:tcW w:w="2000" w:type="dxa"/>
+          </w:tcPr>
+          <w:p>
+            <w:pPr/>
+            <w:r>
+              <w:t xml:space="preserve">date</w:t>
+            </w:r>
+          </w:p>
+        </w:tc>
+        <w:tc>
+          <w:tcPr>
+            <w:tcW w:w="2000" w:type="dxa"/>
+          </w:tcPr>
+          <w:p>
+            <w:pPr/>
+            <w:r>
+              <w:t xml:space="preserve">-</w:t>
+            </w:r>
+          </w:p>
+        </w:tc>
+        <w:tc>
+          <w:tcPr>
+            <w:tcW w:w="2000" w:type="dxa"/>
+          </w:tcPr>
+          <w:p>
+            <w:pPr/>
+            <w:r>
+              <w:t xml:space="preserve">IS NULL</w:t>
+            </w:r>
+          </w:p>
+        </w:tc>
+      </w:tr>
+      <w:tr>
+        <w:trPr>
+          <w:trHeight w:val="530" w:hRule="atLeast"/>
+        </w:trPr>
+        <w:tc>
+          <w:tcPr>
+            <w:tcW w:w="2000" w:type="dxa"/>
+          </w:tcPr>
+          <w:p>
+            <w:pPr/>
+            <w:r>
+              <w:t xml:space="preserve">comparison_date</w:t>
+            </w:r>
+          </w:p>
+        </w:tc>
+        <w:tc>
+          <w:tcPr>
+            <w:tcW w:w="2000" w:type="dxa"/>
+          </w:tcPr>
+          <w:p>
+            <w:pPr/>
+            <w:r>
+              <w:t xml:space="preserve">date</w:t>
+            </w:r>
+          </w:p>
+        </w:tc>
+        <w:tc>
+          <w:tcPr>
+            <w:tcW w:w="2000" w:type="dxa"/>
+          </w:tcPr>
+          <w:p>
+            <w:pPr/>
+            <w:r>
+              <w:t xml:space="preserve">-</w:t>
+            </w:r>
+          </w:p>
+        </w:tc>
+        <w:tc>
+          <w:tcPr>
+            <w:tcW w:w="2000" w:type="dxa"/>
+          </w:tcPr>
+          <w:p>
+            <w:pPr/>
+            <w:r>
+              <w:t xml:space="preserve">NOT NULL</w:t>
+            </w:r>
+          </w:p>
+        </w:tc>
+      </w:tr>
+      <w:tr>
+        <w:trPr>
+          <w:trHeight w:val="530" w:hRule="atLeast"/>
+        </w:trPr>
+        <w:tc>
+          <w:tcPr>
+            <w:tcW w:w="2000" w:type="dxa"/>
+          </w:tcPr>
+          <w:p>
+            <w:pPr/>
+            <w:r>
+              <w:t xml:space="preserve">base_net</w:t>
+            </w:r>
+          </w:p>
+        </w:tc>
+        <w:tc>
+          <w:tcPr>
+            <w:tcW w:w="2000" w:type="dxa"/>
+          </w:tcPr>
+          <w:p>
+            <w:pPr/>
+            <w:r>
+              <w:t xml:space="preserve">decimal</w:t>
+            </w:r>
+          </w:p>
+        </w:tc>
+        <w:tc>
+          <w:tcPr>
+            <w:tcW w:w="2000" w:type="dxa"/>
+          </w:tcPr>
+          <w:p>
+            <w:pPr/>
+            <w:r>
+              <w:t xml:space="preserve">(19,4)</w:t>
+            </w:r>
+          </w:p>
+        </w:tc>
+        <w:tc>
+          <w:tcPr>
+            <w:tcW w:w="2000" w:type="dxa"/>
+          </w:tcPr>
+          <w:p>
+            <w:pPr/>
+            <w:r>
+              <w:t xml:space="preserve">NOT NULL</w:t>
+            </w:r>
+          </w:p>
+        </w:tc>
+      </w:tr>
+      <w:tr>
+        <w:trPr>
+          <w:trHeight w:val="530" w:hRule="atLeast"/>
+        </w:trPr>
+        <w:tc>
+          <w:tcPr>
+            <w:tcW w:w="2000" w:type="dxa"/>
+          </w:tcPr>
+          <w:p>
+            <w:pPr/>
+            <w:r>
+              <w:t xml:space="preserve">base_tax</w:t>
+            </w:r>
+          </w:p>
+        </w:tc>
+        <w:tc>
+          <w:tcPr>
+            <w:tcW w:w="2000" w:type="dxa"/>
+          </w:tcPr>
+          <w:p>
+            <w:pPr/>
+            <w:r>
+              <w:t xml:space="preserve">decimal</w:t>
+            </w:r>
+          </w:p>
+        </w:tc>
+        <w:tc>
+          <w:tcPr>
+            <w:tcW w:w="2000" w:type="dxa"/>
+          </w:tcPr>
+          <w:p>
+            <w:pPr/>
+            <w:r>
+              <w:t xml:space="preserve">(19,4)</w:t>
+            </w:r>
+          </w:p>
+        </w:tc>
+        <w:tc>
+          <w:tcPr>
+            <w:tcW w:w="2000" w:type="dxa"/>
+          </w:tcPr>
+          <w:p>
+            <w:pPr/>
+            <w:r>
+              <w:t xml:space="preserve">NOT NULL</w:t>
+            </w:r>
+          </w:p>
+        </w:tc>
+      </w:tr>
+      <w:tr>
+        <w:trPr>
+          <w:trHeight w:val="530" w:hRule="atLeast"/>
+        </w:trPr>
+        <w:tc>
+          <w:tcPr>
+            <w:tcW w:w="2000" w:type="dxa"/>
+          </w:tcPr>
+          <w:p>
+            <w:pPr/>
+            <w:r>
+              <w:t xml:space="preserve">base_gross</w:t>
+            </w:r>
+          </w:p>
+        </w:tc>
+        <w:tc>
+          <w:tcPr>
+            <w:tcW w:w="2000" w:type="dxa"/>
+          </w:tcPr>
+          <w:p>
+            <w:pPr/>
+            <w:r>
+              <w:t xml:space="preserve">decimal</w:t>
+            </w:r>
+          </w:p>
+        </w:tc>
+        <w:tc>
+          <w:tcPr>
+            <w:tcW w:w="2000" w:type="dxa"/>
+          </w:tcPr>
+          <w:p>
+            <w:pPr/>
+            <w:r>
+              <w:t xml:space="preserve">(19,4)</w:t>
+            </w:r>
+          </w:p>
+        </w:tc>
+        <w:tc>
+          <w:tcPr>
+            <w:tcW w:w="2000" w:type="dxa"/>
+          </w:tcPr>
+          <w:p>
+            <w:pPr/>
+            <w:r>
+              <w:t xml:space="preserve">NOT NULL</w:t>
+            </w:r>
+          </w:p>
+        </w:tc>
+      </w:tr>
+      <w:tr>
+        <w:trPr>
+          <w:trHeight w:val="530" w:hRule="atLeast"/>
+        </w:trPr>
+        <w:tc>
+          <w:tcPr>
+            <w:tcW w:w="2000" w:type="dxa"/>
+          </w:tcPr>
+          <w:p>
+            <w:pPr/>
+            <w:r>
+              <w:t xml:space="preserve">company_id</w:t>
+            </w:r>
+          </w:p>
+        </w:tc>
+        <w:tc>
+          <w:tcPr>
+            <w:tcW w:w="2000" w:type="dxa"/>
+          </w:tcPr>
+          <w:p>
+            <w:pPr/>
+            <w:r>
+              <w:t xml:space="preserve">bigint</w:t>
+            </w:r>
+          </w:p>
+        </w:tc>
+        <w:tc>
+          <w:tcPr>
+            <w:tcW w:w="2000" w:type="dxa"/>
+          </w:tcPr>
+          <w:p>
+            <w:pPr/>
+            <w:r>
+              <w:t xml:space="preserve">-</w:t>
+            </w:r>
+          </w:p>
+        </w:tc>
+        <w:tc>
+          <w:tcPr>
+            <w:tcW w:w="2000" w:type="dxa"/>
+          </w:tcPr>
+          <w:p>
+            <w:pPr/>
+            <w:r>
+              <w:t xml:space="preserve">FK, NOT NULL</w:t>
             </w:r>
           </w:p>
         </w:tc>
@@ -69071,7 +70608,7 @@
       </w:r>
     </w:p>
     <w:sectPr>
-      <w:footerReference xmlns:r="http://schemas.openxmlformats.org/officeDocument/2006/relationships" w:type="default" r:id="R46e8d81826264273"/>
+      <w:footerReference xmlns:r="http://schemas.openxmlformats.org/officeDocument/2006/relationships" w:type="default" r:id="Rdfd22b4040054823"/>
       <w:pgSz w:w="11906" w:h="16838"/>
       <w:pgMar w:top="1440" w:right="1440" w:bottom="1440" w:left="1440" w:header="720" w:footer="720" w:gutter="0"/>
     </w:sectPr>

</xml_diff>